<commit_message>
Progress for today, 2 paragraphs done
</commit_message>
<xml_diff>
--- a/30077548Thesis.docx
+++ b/30077548Thesis.docx
@@ -236,7 +236,7 @@
           <w:r>
             <w:fldChar w:fldCharType="separate"/>
           </w:r>
-          <w:hyperlink w:anchor="_Toc221463506" w:history="1">
+          <w:hyperlink w:anchor="_Toc223520073" w:history="1">
             <w:r>
               <w:rPr>
                 <w:rStyle w:val="Hyperlink"/>
@@ -263,7 +263,7 @@
                 <w:noProof/>
                 <w:webHidden/>
               </w:rPr>
-              <w:instrText xml:space="preserve"> PAGEREF _Toc221463506 \h </w:instrText>
+              <w:instrText xml:space="preserve"> PAGEREF _Toc223520073 \h </w:instrText>
             </w:r>
             <w:r>
               <w:rPr>
@@ -308,7 +308,7 @@
               <w:lang w:eastAsia="en-GB"/>
             </w:rPr>
           </w:pPr>
-          <w:hyperlink w:anchor="_Toc221463507" w:history="1">
+          <w:hyperlink w:anchor="_Toc223520074" w:history="1">
             <w:r>
               <w:rPr>
                 <w:rStyle w:val="Hyperlink"/>
@@ -335,7 +335,7 @@
                 <w:noProof/>
                 <w:webHidden/>
               </w:rPr>
-              <w:instrText xml:space="preserve"> PAGEREF _Toc221463507 \h </w:instrText>
+              <w:instrText xml:space="preserve"> PAGEREF _Toc223520074 \h </w:instrText>
             </w:r>
             <w:r>
               <w:rPr>
@@ -380,7 +380,7 @@
               <w:lang w:eastAsia="en-GB"/>
             </w:rPr>
           </w:pPr>
-          <w:hyperlink w:anchor="_Toc221463508" w:history="1">
+          <w:hyperlink w:anchor="_Toc223520075" w:history="1">
             <w:r>
               <w:rPr>
                 <w:rStyle w:val="Hyperlink"/>
@@ -407,7 +407,7 @@
                 <w:noProof/>
                 <w:webHidden/>
               </w:rPr>
-              <w:instrText xml:space="preserve"> PAGEREF _Toc221463508 \h </w:instrText>
+              <w:instrText xml:space="preserve"> PAGEREF _Toc223520075 \h </w:instrText>
             </w:r>
             <w:r>
               <w:rPr>
@@ -452,7 +452,7 @@
               <w:lang w:eastAsia="en-GB"/>
             </w:rPr>
           </w:pPr>
-          <w:hyperlink w:anchor="_Toc221463509" w:history="1">
+          <w:hyperlink w:anchor="_Toc223520076" w:history="1">
             <w:r>
               <w:rPr>
                 <w:rStyle w:val="Hyperlink"/>
@@ -479,7 +479,7 @@
                 <w:noProof/>
                 <w:webHidden/>
               </w:rPr>
-              <w:instrText xml:space="preserve"> PAGEREF _Toc221463509 \h </w:instrText>
+              <w:instrText xml:space="preserve"> PAGEREF _Toc223520076 \h </w:instrText>
             </w:r>
             <w:r>
               <w:rPr>
@@ -524,7 +524,7 @@
               <w:lang w:eastAsia="en-GB"/>
             </w:rPr>
           </w:pPr>
-          <w:hyperlink w:anchor="_Toc221463510" w:history="1">
+          <w:hyperlink w:anchor="_Toc223520077" w:history="1">
             <w:r>
               <w:rPr>
                 <w:rStyle w:val="Hyperlink"/>
@@ -551,7 +551,7 @@
                 <w:noProof/>
                 <w:webHidden/>
               </w:rPr>
-              <w:instrText xml:space="preserve"> PAGEREF _Toc221463510 \h </w:instrText>
+              <w:instrText xml:space="preserve"> PAGEREF _Toc223520077 \h </w:instrText>
             </w:r>
             <w:r>
               <w:rPr>
@@ -596,7 +596,7 @@
               <w:lang w:eastAsia="en-GB"/>
             </w:rPr>
           </w:pPr>
-          <w:hyperlink w:anchor="_Toc221463511" w:history="1">
+          <w:hyperlink w:anchor="_Toc223520078" w:history="1">
             <w:r>
               <w:rPr>
                 <w:rStyle w:val="Hyperlink"/>
@@ -623,7 +623,7 @@
                 <w:noProof/>
                 <w:webHidden/>
               </w:rPr>
-              <w:instrText xml:space="preserve"> PAGEREF _Toc221463511 \h </w:instrText>
+              <w:instrText xml:space="preserve"> PAGEREF _Toc223520078 \h </w:instrText>
             </w:r>
             <w:r>
               <w:rPr>
@@ -668,7 +668,7 @@
               <w:lang w:eastAsia="en-GB"/>
             </w:rPr>
           </w:pPr>
-          <w:hyperlink w:anchor="_Toc221463512" w:history="1">
+          <w:hyperlink w:anchor="_Toc223520079" w:history="1">
             <w:r>
               <w:rPr>
                 <w:rStyle w:val="Hyperlink"/>
@@ -695,7 +695,7 @@
                 <w:noProof/>
                 <w:webHidden/>
               </w:rPr>
-              <w:instrText xml:space="preserve"> PAGEREF _Toc221463512 \h </w:instrText>
+              <w:instrText xml:space="preserve"> PAGEREF _Toc223520079 \h </w:instrText>
             </w:r>
             <w:r>
               <w:rPr>
@@ -740,7 +740,7 @@
               <w:lang w:eastAsia="en-GB"/>
             </w:rPr>
           </w:pPr>
-          <w:hyperlink w:anchor="_Toc221463513" w:history="1">
+          <w:hyperlink w:anchor="_Toc223520080" w:history="1">
             <w:r>
               <w:rPr>
                 <w:rStyle w:val="Hyperlink"/>
@@ -767,7 +767,7 @@
                 <w:noProof/>
                 <w:webHidden/>
               </w:rPr>
-              <w:instrText xml:space="preserve"> PAGEREF _Toc221463513 \h </w:instrText>
+              <w:instrText xml:space="preserve"> PAGEREF _Toc223520080 \h </w:instrText>
             </w:r>
             <w:r>
               <w:rPr>
@@ -812,7 +812,7 @@
               <w:lang w:eastAsia="en-GB"/>
             </w:rPr>
           </w:pPr>
-          <w:hyperlink w:anchor="_Toc221463514" w:history="1">
+          <w:hyperlink w:anchor="_Toc223520081" w:history="1">
             <w:r>
               <w:rPr>
                 <w:rStyle w:val="Hyperlink"/>
@@ -839,7 +839,7 @@
                 <w:noProof/>
                 <w:webHidden/>
               </w:rPr>
-              <w:instrText xml:space="preserve"> PAGEREF _Toc221463514 \h </w:instrText>
+              <w:instrText xml:space="preserve"> PAGEREF _Toc223520081 \h </w:instrText>
             </w:r>
             <w:r>
               <w:rPr>
@@ -884,7 +884,7 @@
               <w:lang w:eastAsia="en-GB"/>
             </w:rPr>
           </w:pPr>
-          <w:hyperlink w:anchor="_Toc221463515" w:history="1">
+          <w:hyperlink w:anchor="_Toc223520082" w:history="1">
             <w:r>
               <w:rPr>
                 <w:rStyle w:val="Hyperlink"/>
@@ -911,7 +911,7 @@
                 <w:noProof/>
                 <w:webHidden/>
               </w:rPr>
-              <w:instrText xml:space="preserve"> PAGEREF _Toc221463515 \h </w:instrText>
+              <w:instrText xml:space="preserve"> PAGEREF _Toc223520082 \h </w:instrText>
             </w:r>
             <w:r>
               <w:rPr>
@@ -956,7 +956,7 @@
               <w:lang w:eastAsia="en-GB"/>
             </w:rPr>
           </w:pPr>
-          <w:hyperlink w:anchor="_Toc221463516" w:history="1">
+          <w:hyperlink w:anchor="_Toc223520083" w:history="1">
             <w:r>
               <w:rPr>
                 <w:rStyle w:val="Hyperlink"/>
@@ -983,7 +983,7 @@
                 <w:noProof/>
                 <w:webHidden/>
               </w:rPr>
-              <w:instrText xml:space="preserve"> PAGEREF _Toc221463516 \h </w:instrText>
+              <w:instrText xml:space="preserve"> PAGEREF _Toc223520083 \h </w:instrText>
             </w:r>
             <w:r>
               <w:rPr>
@@ -1028,7 +1028,7 @@
               <w:lang w:eastAsia="en-GB"/>
             </w:rPr>
           </w:pPr>
-          <w:hyperlink w:anchor="_Toc221463517" w:history="1">
+          <w:hyperlink w:anchor="_Toc223520084" w:history="1">
             <w:r>
               <w:rPr>
                 <w:rStyle w:val="Hyperlink"/>
@@ -1055,7 +1055,7 @@
                 <w:noProof/>
                 <w:webHidden/>
               </w:rPr>
-              <w:instrText xml:space="preserve"> PAGEREF _Toc221463517 \h </w:instrText>
+              <w:instrText xml:space="preserve"> PAGEREF _Toc223520084 \h </w:instrText>
             </w:r>
             <w:r>
               <w:rPr>
@@ -1100,7 +1100,7 @@
               <w:lang w:eastAsia="en-GB"/>
             </w:rPr>
           </w:pPr>
-          <w:hyperlink w:anchor="_Toc221463518" w:history="1">
+          <w:hyperlink w:anchor="_Toc223520085" w:history="1">
             <w:r>
               <w:rPr>
                 <w:rStyle w:val="Hyperlink"/>
@@ -1127,7 +1127,7 @@
                 <w:noProof/>
                 <w:webHidden/>
               </w:rPr>
-              <w:instrText xml:space="preserve"> PAGEREF _Toc221463518 \h </w:instrText>
+              <w:instrText xml:space="preserve"> PAGEREF _Toc223520085 \h </w:instrText>
             </w:r>
             <w:r>
               <w:rPr>
@@ -1172,7 +1172,7 @@
               <w:lang w:eastAsia="en-GB"/>
             </w:rPr>
           </w:pPr>
-          <w:hyperlink w:anchor="_Toc221463519" w:history="1">
+          <w:hyperlink w:anchor="_Toc223520086" w:history="1">
             <w:r>
               <w:rPr>
                 <w:rStyle w:val="Hyperlink"/>
@@ -1199,7 +1199,7 @@
                 <w:noProof/>
                 <w:webHidden/>
               </w:rPr>
-              <w:instrText xml:space="preserve"> PAGEREF _Toc221463519 \h </w:instrText>
+              <w:instrText xml:space="preserve"> PAGEREF _Toc223520086 \h </w:instrText>
             </w:r>
             <w:r>
               <w:rPr>
@@ -1244,7 +1244,7 @@
               <w:lang w:eastAsia="en-GB"/>
             </w:rPr>
           </w:pPr>
-          <w:hyperlink w:anchor="_Toc221463520" w:history="1">
+          <w:hyperlink w:anchor="_Toc223520087" w:history="1">
             <w:r>
               <w:rPr>
                 <w:rStyle w:val="Hyperlink"/>
@@ -1271,7 +1271,7 @@
                 <w:noProof/>
                 <w:webHidden/>
               </w:rPr>
-              <w:instrText xml:space="preserve"> PAGEREF _Toc221463520 \h </w:instrText>
+              <w:instrText xml:space="preserve"> PAGEREF _Toc223520087 \h </w:instrText>
             </w:r>
             <w:r>
               <w:rPr>
@@ -1316,7 +1316,7 @@
               <w:lang w:eastAsia="en-GB"/>
             </w:rPr>
           </w:pPr>
-          <w:hyperlink w:anchor="_Toc221463521" w:history="1">
+          <w:hyperlink w:anchor="_Toc223520088" w:history="1">
             <w:r>
               <w:rPr>
                 <w:rStyle w:val="Hyperlink"/>
@@ -1343,7 +1343,7 @@
                 <w:noProof/>
                 <w:webHidden/>
               </w:rPr>
-              <w:instrText xml:space="preserve"> PAGEREF _Toc221463521 \h </w:instrText>
+              <w:instrText xml:space="preserve"> PAGEREF _Toc223520088 \h </w:instrText>
             </w:r>
             <w:r>
               <w:rPr>
@@ -1388,7 +1388,7 @@
               <w:lang w:eastAsia="en-GB"/>
             </w:rPr>
           </w:pPr>
-          <w:hyperlink w:anchor="_Toc221463522" w:history="1">
+          <w:hyperlink w:anchor="_Toc223520089" w:history="1">
             <w:r>
               <w:rPr>
                 <w:rStyle w:val="Hyperlink"/>
@@ -1415,7 +1415,7 @@
                 <w:noProof/>
                 <w:webHidden/>
               </w:rPr>
-              <w:instrText xml:space="preserve"> PAGEREF _Toc221463522 \h </w:instrText>
+              <w:instrText xml:space="preserve"> PAGEREF _Toc223520089 \h </w:instrText>
             </w:r>
             <w:r>
               <w:rPr>
@@ -1460,7 +1460,7 @@
               <w:lang w:eastAsia="en-GB"/>
             </w:rPr>
           </w:pPr>
-          <w:hyperlink w:anchor="_Toc221463523" w:history="1">
+          <w:hyperlink w:anchor="_Toc223520090" w:history="1">
             <w:r>
               <w:rPr>
                 <w:rStyle w:val="Hyperlink"/>
@@ -1487,7 +1487,7 @@
                 <w:noProof/>
                 <w:webHidden/>
               </w:rPr>
-              <w:instrText xml:space="preserve"> PAGEREF _Toc221463523 \h </w:instrText>
+              <w:instrText xml:space="preserve"> PAGEREF _Toc223520090 \h </w:instrText>
             </w:r>
             <w:r>
               <w:rPr>
@@ -1532,7 +1532,7 @@
               <w:lang w:eastAsia="en-GB"/>
             </w:rPr>
           </w:pPr>
-          <w:hyperlink w:anchor="_Toc221463524" w:history="1">
+          <w:hyperlink w:anchor="_Toc223520091" w:history="1">
             <w:r>
               <w:rPr>
                 <w:rStyle w:val="Hyperlink"/>
@@ -1559,7 +1559,7 @@
                 <w:noProof/>
                 <w:webHidden/>
               </w:rPr>
-              <w:instrText xml:space="preserve"> PAGEREF _Toc221463524 \h </w:instrText>
+              <w:instrText xml:space="preserve"> PAGEREF _Toc223520091 \h </w:instrText>
             </w:r>
             <w:r>
               <w:rPr>
@@ -1604,7 +1604,7 @@
               <w:lang w:eastAsia="en-GB"/>
             </w:rPr>
           </w:pPr>
-          <w:hyperlink w:anchor="_Toc221463525" w:history="1">
+          <w:hyperlink w:anchor="_Toc223520092" w:history="1">
             <w:r>
               <w:rPr>
                 <w:rStyle w:val="Hyperlink"/>
@@ -1631,7 +1631,7 @@
                 <w:noProof/>
                 <w:webHidden/>
               </w:rPr>
-              <w:instrText xml:space="preserve"> PAGEREF _Toc221463525 \h </w:instrText>
+              <w:instrText xml:space="preserve"> PAGEREF _Toc223520092 \h </w:instrText>
             </w:r>
             <w:r>
               <w:rPr>
@@ -1676,7 +1676,7 @@
               <w:lang w:eastAsia="en-GB"/>
             </w:rPr>
           </w:pPr>
-          <w:hyperlink w:anchor="_Toc221463526" w:history="1">
+          <w:hyperlink w:anchor="_Toc223520093" w:history="1">
             <w:r>
               <w:rPr>
                 <w:rStyle w:val="Hyperlink"/>
@@ -1703,7 +1703,7 @@
                 <w:noProof/>
                 <w:webHidden/>
               </w:rPr>
-              <w:instrText xml:space="preserve"> PAGEREF _Toc221463526 \h </w:instrText>
+              <w:instrText xml:space="preserve"> PAGEREF _Toc223520093 \h </w:instrText>
             </w:r>
             <w:r>
               <w:rPr>
@@ -1748,7 +1748,7 @@
               <w:lang w:eastAsia="en-GB"/>
             </w:rPr>
           </w:pPr>
-          <w:hyperlink w:anchor="_Toc221463527" w:history="1">
+          <w:hyperlink w:anchor="_Toc223520094" w:history="1">
             <w:r>
               <w:rPr>
                 <w:rStyle w:val="Hyperlink"/>
@@ -1775,7 +1775,7 @@
                 <w:noProof/>
                 <w:webHidden/>
               </w:rPr>
-              <w:instrText xml:space="preserve"> PAGEREF _Toc221463527 \h </w:instrText>
+              <w:instrText xml:space="preserve"> PAGEREF _Toc223520094 \h </w:instrText>
             </w:r>
             <w:r>
               <w:rPr>
@@ -1820,7 +1820,7 @@
               <w:lang w:eastAsia="en-GB"/>
             </w:rPr>
           </w:pPr>
-          <w:hyperlink w:anchor="_Toc221463528" w:history="1">
+          <w:hyperlink w:anchor="_Toc223520095" w:history="1">
             <w:r>
               <w:rPr>
                 <w:rStyle w:val="Hyperlink"/>
@@ -1847,7 +1847,7 @@
                 <w:noProof/>
                 <w:webHidden/>
               </w:rPr>
-              <w:instrText xml:space="preserve"> PAGEREF _Toc221463528 \h </w:instrText>
+              <w:instrText xml:space="preserve"> PAGEREF _Toc223520095 \h </w:instrText>
             </w:r>
             <w:r>
               <w:rPr>
@@ -1892,7 +1892,7 @@
               <w:lang w:eastAsia="en-GB"/>
             </w:rPr>
           </w:pPr>
-          <w:hyperlink w:anchor="_Toc221463529" w:history="1">
+          <w:hyperlink w:anchor="_Toc223520096" w:history="1">
             <w:r>
               <w:rPr>
                 <w:rStyle w:val="Hyperlink"/>
@@ -1919,7 +1919,7 @@
                 <w:noProof/>
                 <w:webHidden/>
               </w:rPr>
-              <w:instrText xml:space="preserve"> PAGEREF _Toc221463529 \h </w:instrText>
+              <w:instrText xml:space="preserve"> PAGEREF _Toc223520096 \h </w:instrText>
             </w:r>
             <w:r>
               <w:rPr>
@@ -1964,7 +1964,7 @@
               <w:lang w:eastAsia="en-GB"/>
             </w:rPr>
           </w:pPr>
-          <w:hyperlink w:anchor="_Toc221463530" w:history="1">
+          <w:hyperlink w:anchor="_Toc223520097" w:history="1">
             <w:r>
               <w:rPr>
                 <w:rStyle w:val="Hyperlink"/>
@@ -1991,7 +1991,7 @@
                 <w:noProof/>
                 <w:webHidden/>
               </w:rPr>
-              <w:instrText xml:space="preserve"> PAGEREF _Toc221463530 \h </w:instrText>
+              <w:instrText xml:space="preserve"> PAGEREF _Toc223520097 \h </w:instrText>
             </w:r>
             <w:r>
               <w:rPr>
@@ -2036,7 +2036,7 @@
               <w:lang w:eastAsia="en-GB"/>
             </w:rPr>
           </w:pPr>
-          <w:hyperlink w:anchor="_Toc221463531" w:history="1">
+          <w:hyperlink w:anchor="_Toc223520098" w:history="1">
             <w:r>
               <w:rPr>
                 <w:rStyle w:val="Hyperlink"/>
@@ -2063,7 +2063,7 @@
                 <w:noProof/>
                 <w:webHidden/>
               </w:rPr>
-              <w:instrText xml:space="preserve"> PAGEREF _Toc221463531 \h </w:instrText>
+              <w:instrText xml:space="preserve"> PAGEREF _Toc223520098 \h </w:instrText>
             </w:r>
             <w:r>
               <w:rPr>
@@ -2108,7 +2108,7 @@
               <w:lang w:eastAsia="en-GB"/>
             </w:rPr>
           </w:pPr>
-          <w:hyperlink w:anchor="_Toc221463532" w:history="1">
+          <w:hyperlink w:anchor="_Toc223520099" w:history="1">
             <w:r>
               <w:rPr>
                 <w:rStyle w:val="Hyperlink"/>
@@ -2135,7 +2135,7 @@
                 <w:noProof/>
                 <w:webHidden/>
               </w:rPr>
-              <w:instrText xml:space="preserve"> PAGEREF _Toc221463532 \h </w:instrText>
+              <w:instrText xml:space="preserve"> PAGEREF _Toc223520099 \h </w:instrText>
             </w:r>
             <w:r>
               <w:rPr>
@@ -2180,7 +2180,7 @@
               <w:lang w:eastAsia="en-GB"/>
             </w:rPr>
           </w:pPr>
-          <w:hyperlink w:anchor="_Toc221463533" w:history="1">
+          <w:hyperlink w:anchor="_Toc223520100" w:history="1">
             <w:r>
               <w:rPr>
                 <w:rStyle w:val="Hyperlink"/>
@@ -2207,7 +2207,7 @@
                 <w:noProof/>
                 <w:webHidden/>
               </w:rPr>
-              <w:instrText xml:space="preserve"> PAGEREF _Toc221463533 \h </w:instrText>
+              <w:instrText xml:space="preserve"> PAGEREF _Toc223520100 \h </w:instrText>
             </w:r>
             <w:r>
               <w:rPr>
@@ -2252,13 +2252,13 @@
               <w:lang w:eastAsia="en-GB"/>
             </w:rPr>
           </w:pPr>
-          <w:hyperlink w:anchor="_Toc221463534" w:history="1">
+          <w:hyperlink w:anchor="_Toc223520101" w:history="1">
             <w:r>
               <w:rPr>
                 <w:rStyle w:val="Hyperlink"/>
                 <w:noProof/>
               </w:rPr>
-              <w:t>Objective Based Interaction Objects</w:t>
+              <w:t>Objective Based Interactive Objects</w:t>
             </w:r>
             <w:r>
               <w:rPr>
@@ -2279,7 +2279,7 @@
                 <w:noProof/>
                 <w:webHidden/>
               </w:rPr>
-              <w:instrText xml:space="preserve"> PAGEREF _Toc221463534 \h </w:instrText>
+              <w:instrText xml:space="preserve"> PAGEREF _Toc223520101 \h </w:instrText>
             </w:r>
             <w:r>
               <w:rPr>
@@ -2324,7 +2324,7 @@
               <w:lang w:eastAsia="en-GB"/>
             </w:rPr>
           </w:pPr>
-          <w:hyperlink w:anchor="_Toc221463535" w:history="1">
+          <w:hyperlink w:anchor="_Toc223520102" w:history="1">
             <w:r>
               <w:rPr>
                 <w:rStyle w:val="Hyperlink"/>
@@ -2351,7 +2351,7 @@
                 <w:noProof/>
                 <w:webHidden/>
               </w:rPr>
-              <w:instrText xml:space="preserve"> PAGEREF _Toc221463535 \h </w:instrText>
+              <w:instrText xml:space="preserve"> PAGEREF _Toc223520102 \h </w:instrText>
             </w:r>
             <w:r>
               <w:rPr>
@@ -2396,7 +2396,7 @@
               <w:lang w:eastAsia="en-GB"/>
             </w:rPr>
           </w:pPr>
-          <w:hyperlink w:anchor="_Toc221463536" w:history="1">
+          <w:hyperlink w:anchor="_Toc223520103" w:history="1">
             <w:r>
               <w:rPr>
                 <w:rStyle w:val="Hyperlink"/>
@@ -2423,7 +2423,7 @@
                 <w:noProof/>
                 <w:webHidden/>
               </w:rPr>
-              <w:instrText xml:space="preserve"> PAGEREF _Toc221463536 \h </w:instrText>
+              <w:instrText xml:space="preserve"> PAGEREF _Toc223520103 \h </w:instrText>
             </w:r>
             <w:r>
               <w:rPr>
@@ -2444,6 +2444,366 @@
                 <w:webHidden/>
               </w:rPr>
               <w:t>18</w:t>
+            </w:r>
+            <w:r>
+              <w:rPr>
+                <w:noProof/>
+                <w:webHidden/>
+              </w:rPr>
+              <w:fldChar w:fldCharType="end"/>
+            </w:r>
+          </w:hyperlink>
+        </w:p>
+        <w:p>
+          <w:pPr>
+            <w:pStyle w:val="TOC1"/>
+            <w:tabs>
+              <w:tab w:val="right" w:leader="dot" w:pos="9016"/>
+            </w:tabs>
+            <w:rPr>
+              <w:rFonts w:eastAsiaTheme="minorEastAsia"/>
+              <w:noProof/>
+              <w:sz w:val="24"/>
+              <w:szCs w:val="24"/>
+              <w:lang w:eastAsia="en-GB"/>
+            </w:rPr>
+          </w:pPr>
+          <w:hyperlink w:anchor="_Toc223520104" w:history="1">
+            <w:r>
+              <w:rPr>
+                <w:rStyle w:val="Hyperlink"/>
+                <w:noProof/>
+              </w:rPr>
+              <w:t>Results</w:t>
+            </w:r>
+            <w:r>
+              <w:rPr>
+                <w:noProof/>
+                <w:webHidden/>
+              </w:rPr>
+              <w:tab/>
+            </w:r>
+            <w:r>
+              <w:rPr>
+                <w:noProof/>
+                <w:webHidden/>
+              </w:rPr>
+              <w:fldChar w:fldCharType="begin"/>
+            </w:r>
+            <w:r>
+              <w:rPr>
+                <w:noProof/>
+                <w:webHidden/>
+              </w:rPr>
+              <w:instrText xml:space="preserve"> PAGEREF _Toc223520104 \h </w:instrText>
+            </w:r>
+            <w:r>
+              <w:rPr>
+                <w:noProof/>
+                <w:webHidden/>
+              </w:rPr>
+            </w:r>
+            <w:r>
+              <w:rPr>
+                <w:noProof/>
+                <w:webHidden/>
+              </w:rPr>
+              <w:fldChar w:fldCharType="separate"/>
+            </w:r>
+            <w:r>
+              <w:rPr>
+                <w:noProof/>
+                <w:webHidden/>
+              </w:rPr>
+              <w:t>19</w:t>
+            </w:r>
+            <w:r>
+              <w:rPr>
+                <w:noProof/>
+                <w:webHidden/>
+              </w:rPr>
+              <w:fldChar w:fldCharType="end"/>
+            </w:r>
+          </w:hyperlink>
+        </w:p>
+        <w:p>
+          <w:pPr>
+            <w:pStyle w:val="TOC1"/>
+            <w:tabs>
+              <w:tab w:val="right" w:leader="dot" w:pos="9016"/>
+            </w:tabs>
+            <w:rPr>
+              <w:rFonts w:eastAsiaTheme="minorEastAsia"/>
+              <w:noProof/>
+              <w:sz w:val="24"/>
+              <w:szCs w:val="24"/>
+              <w:lang w:eastAsia="en-GB"/>
+            </w:rPr>
+          </w:pPr>
+          <w:hyperlink w:anchor="_Toc223520105" w:history="1">
+            <w:r>
+              <w:rPr>
+                <w:rStyle w:val="Hyperlink"/>
+                <w:noProof/>
+              </w:rPr>
+              <w:t>Critical Evaluation</w:t>
+            </w:r>
+            <w:r>
+              <w:rPr>
+                <w:noProof/>
+                <w:webHidden/>
+              </w:rPr>
+              <w:tab/>
+            </w:r>
+            <w:r>
+              <w:rPr>
+                <w:noProof/>
+                <w:webHidden/>
+              </w:rPr>
+              <w:fldChar w:fldCharType="begin"/>
+            </w:r>
+            <w:r>
+              <w:rPr>
+                <w:noProof/>
+                <w:webHidden/>
+              </w:rPr>
+              <w:instrText xml:space="preserve"> PAGEREF _Toc223520105 \h </w:instrText>
+            </w:r>
+            <w:r>
+              <w:rPr>
+                <w:noProof/>
+                <w:webHidden/>
+              </w:rPr>
+            </w:r>
+            <w:r>
+              <w:rPr>
+                <w:noProof/>
+                <w:webHidden/>
+              </w:rPr>
+              <w:fldChar w:fldCharType="separate"/>
+            </w:r>
+            <w:r>
+              <w:rPr>
+                <w:noProof/>
+                <w:webHidden/>
+              </w:rPr>
+              <w:t>20</w:t>
+            </w:r>
+            <w:r>
+              <w:rPr>
+                <w:noProof/>
+                <w:webHidden/>
+              </w:rPr>
+              <w:fldChar w:fldCharType="end"/>
+            </w:r>
+          </w:hyperlink>
+        </w:p>
+        <w:p>
+          <w:pPr>
+            <w:pStyle w:val="TOC1"/>
+            <w:tabs>
+              <w:tab w:val="right" w:leader="dot" w:pos="9016"/>
+            </w:tabs>
+            <w:rPr>
+              <w:rFonts w:eastAsiaTheme="minorEastAsia"/>
+              <w:noProof/>
+              <w:sz w:val="24"/>
+              <w:szCs w:val="24"/>
+              <w:lang w:eastAsia="en-GB"/>
+            </w:rPr>
+          </w:pPr>
+          <w:hyperlink w:anchor="_Toc223520106" w:history="1">
+            <w:r>
+              <w:rPr>
+                <w:rStyle w:val="Hyperlink"/>
+                <w:noProof/>
+              </w:rPr>
+              <w:t>Conclusions and Future Work</w:t>
+            </w:r>
+            <w:r>
+              <w:rPr>
+                <w:noProof/>
+                <w:webHidden/>
+              </w:rPr>
+              <w:tab/>
+            </w:r>
+            <w:r>
+              <w:rPr>
+                <w:noProof/>
+                <w:webHidden/>
+              </w:rPr>
+              <w:fldChar w:fldCharType="begin"/>
+            </w:r>
+            <w:r>
+              <w:rPr>
+                <w:noProof/>
+                <w:webHidden/>
+              </w:rPr>
+              <w:instrText xml:space="preserve"> PAGEREF _Toc223520106 \h </w:instrText>
+            </w:r>
+            <w:r>
+              <w:rPr>
+                <w:noProof/>
+                <w:webHidden/>
+              </w:rPr>
+            </w:r>
+            <w:r>
+              <w:rPr>
+                <w:noProof/>
+                <w:webHidden/>
+              </w:rPr>
+              <w:fldChar w:fldCharType="separate"/>
+            </w:r>
+            <w:r>
+              <w:rPr>
+                <w:noProof/>
+                <w:webHidden/>
+              </w:rPr>
+              <w:t>21</w:t>
+            </w:r>
+            <w:r>
+              <w:rPr>
+                <w:noProof/>
+                <w:webHidden/>
+              </w:rPr>
+              <w:fldChar w:fldCharType="end"/>
+            </w:r>
+          </w:hyperlink>
+        </w:p>
+        <w:p>
+          <w:pPr>
+            <w:pStyle w:val="TOC1"/>
+            <w:tabs>
+              <w:tab w:val="right" w:leader="dot" w:pos="9016"/>
+            </w:tabs>
+            <w:rPr>
+              <w:rFonts w:eastAsiaTheme="minorEastAsia"/>
+              <w:noProof/>
+              <w:sz w:val="24"/>
+              <w:szCs w:val="24"/>
+              <w:lang w:eastAsia="en-GB"/>
+            </w:rPr>
+          </w:pPr>
+          <w:hyperlink w:anchor="_Toc223520107" w:history="1">
+            <w:r>
+              <w:rPr>
+                <w:rStyle w:val="Hyperlink"/>
+                <w:noProof/>
+              </w:rPr>
+              <w:t>References</w:t>
+            </w:r>
+            <w:r>
+              <w:rPr>
+                <w:noProof/>
+                <w:webHidden/>
+              </w:rPr>
+              <w:tab/>
+            </w:r>
+            <w:r>
+              <w:rPr>
+                <w:noProof/>
+                <w:webHidden/>
+              </w:rPr>
+              <w:fldChar w:fldCharType="begin"/>
+            </w:r>
+            <w:r>
+              <w:rPr>
+                <w:noProof/>
+                <w:webHidden/>
+              </w:rPr>
+              <w:instrText xml:space="preserve"> PAGEREF _Toc223520107 \h </w:instrText>
+            </w:r>
+            <w:r>
+              <w:rPr>
+                <w:noProof/>
+                <w:webHidden/>
+              </w:rPr>
+            </w:r>
+            <w:r>
+              <w:rPr>
+                <w:noProof/>
+                <w:webHidden/>
+              </w:rPr>
+              <w:fldChar w:fldCharType="separate"/>
+            </w:r>
+            <w:r>
+              <w:rPr>
+                <w:noProof/>
+                <w:webHidden/>
+              </w:rPr>
+              <w:t>22</w:t>
+            </w:r>
+            <w:r>
+              <w:rPr>
+                <w:noProof/>
+                <w:webHidden/>
+              </w:rPr>
+              <w:fldChar w:fldCharType="end"/>
+            </w:r>
+          </w:hyperlink>
+        </w:p>
+        <w:p>
+          <w:pPr>
+            <w:pStyle w:val="TOC1"/>
+            <w:tabs>
+              <w:tab w:val="right" w:leader="dot" w:pos="9016"/>
+            </w:tabs>
+            <w:rPr>
+              <w:rFonts w:eastAsiaTheme="minorEastAsia"/>
+              <w:noProof/>
+              <w:sz w:val="24"/>
+              <w:szCs w:val="24"/>
+              <w:lang w:eastAsia="en-GB"/>
+            </w:rPr>
+          </w:pPr>
+          <w:hyperlink w:anchor="_Toc223520108" w:history="1">
+            <w:r>
+              <w:rPr>
+                <w:rStyle w:val="Hyperlink"/>
+                <w:noProof/>
+              </w:rPr>
+              <w:t>Appendix</w:t>
+            </w:r>
+            <w:r>
+              <w:rPr>
+                <w:noProof/>
+                <w:webHidden/>
+              </w:rPr>
+              <w:tab/>
+            </w:r>
+            <w:r>
+              <w:rPr>
+                <w:noProof/>
+                <w:webHidden/>
+              </w:rPr>
+              <w:fldChar w:fldCharType="begin"/>
+            </w:r>
+            <w:r>
+              <w:rPr>
+                <w:noProof/>
+                <w:webHidden/>
+              </w:rPr>
+              <w:instrText xml:space="preserve"> PAGEREF _Toc223520108 \h </w:instrText>
+            </w:r>
+            <w:r>
+              <w:rPr>
+                <w:noProof/>
+                <w:webHidden/>
+              </w:rPr>
+            </w:r>
+            <w:r>
+              <w:rPr>
+                <w:noProof/>
+                <w:webHidden/>
+              </w:rPr>
+              <w:fldChar w:fldCharType="separate"/>
+            </w:r>
+            <w:r>
+              <w:rPr>
+                <w:noProof/>
+                <w:webHidden/>
+              </w:rPr>
+              <w:t>23</w:t>
             </w:r>
             <w:r>
               <w:rPr>
@@ -2468,7 +2828,7 @@
               <w:lang w:eastAsia="en-GB"/>
             </w:rPr>
           </w:pPr>
-          <w:hyperlink w:anchor="_Toc221463537" w:history="1">
+          <w:hyperlink w:anchor="_Toc223520109" w:history="1">
             <w:r>
               <w:rPr>
                 <w:rStyle w:val="Hyperlink"/>
@@ -2495,7 +2855,7 @@
                 <w:noProof/>
                 <w:webHidden/>
               </w:rPr>
-              <w:instrText xml:space="preserve"> PAGEREF _Toc221463537 \h </w:instrText>
+              <w:instrText xml:space="preserve"> PAGEREF _Toc223520109 \h </w:instrText>
             </w:r>
             <w:r>
               <w:rPr>
@@ -2515,7 +2875,7 @@
                 <w:noProof/>
                 <w:webHidden/>
               </w:rPr>
-              <w:t>19</w:t>
+              <w:t>23</w:t>
             </w:r>
             <w:r>
               <w:rPr>
@@ -2540,7 +2900,7 @@
               <w:lang w:eastAsia="en-GB"/>
             </w:rPr>
           </w:pPr>
-          <w:hyperlink w:anchor="_Toc221463538" w:history="1">
+          <w:hyperlink w:anchor="_Toc223520110" w:history="1">
             <w:r>
               <w:rPr>
                 <w:rStyle w:val="Hyperlink"/>
@@ -2567,7 +2927,7 @@
                 <w:noProof/>
                 <w:webHidden/>
               </w:rPr>
-              <w:instrText xml:space="preserve"> PAGEREF _Toc221463538 \h </w:instrText>
+              <w:instrText xml:space="preserve"> PAGEREF _Toc223520110 \h </w:instrText>
             </w:r>
             <w:r>
               <w:rPr>
@@ -2587,7 +2947,7 @@
                 <w:noProof/>
                 <w:webHidden/>
               </w:rPr>
-              <w:t>19</w:t>
+              <w:t>23</w:t>
             </w:r>
             <w:r>
               <w:rPr>
@@ -2612,7 +2972,7 @@
               <w:lang w:eastAsia="en-GB"/>
             </w:rPr>
           </w:pPr>
-          <w:hyperlink w:anchor="_Toc221463539" w:history="1">
+          <w:hyperlink w:anchor="_Toc223520111" w:history="1">
             <w:r>
               <w:rPr>
                 <w:rStyle w:val="Hyperlink"/>
@@ -2639,7 +2999,7 @@
                 <w:noProof/>
                 <w:webHidden/>
               </w:rPr>
-              <w:instrText xml:space="preserve"> PAGEREF _Toc221463539 \h </w:instrText>
+              <w:instrText xml:space="preserve"> PAGEREF _Toc223520111 \h </w:instrText>
             </w:r>
             <w:r>
               <w:rPr>
@@ -2659,7 +3019,7 @@
                 <w:noProof/>
                 <w:webHidden/>
               </w:rPr>
-              <w:t>19</w:t>
+              <w:t>23</w:t>
             </w:r>
             <w:r>
               <w:rPr>
@@ -2684,7 +3044,7 @@
               <w:lang w:eastAsia="en-GB"/>
             </w:rPr>
           </w:pPr>
-          <w:hyperlink w:anchor="_Toc221463540" w:history="1">
+          <w:hyperlink w:anchor="_Toc223520112" w:history="1">
             <w:r>
               <w:rPr>
                 <w:rStyle w:val="Hyperlink"/>
@@ -2711,7 +3071,7 @@
                 <w:noProof/>
                 <w:webHidden/>
               </w:rPr>
-              <w:instrText xml:space="preserve"> PAGEREF _Toc221463540 \h </w:instrText>
+              <w:instrText xml:space="preserve"> PAGEREF _Toc223520112 \h </w:instrText>
             </w:r>
             <w:r>
               <w:rPr>
@@ -2731,7 +3091,7 @@
                 <w:noProof/>
                 <w:webHidden/>
               </w:rPr>
-              <w:t>19</w:t>
+              <w:t>23</w:t>
             </w:r>
             <w:r>
               <w:rPr>
@@ -2756,7 +3116,7 @@
               <w:lang w:eastAsia="en-GB"/>
             </w:rPr>
           </w:pPr>
-          <w:hyperlink w:anchor="_Toc221463541" w:history="1">
+          <w:hyperlink w:anchor="_Toc223520113" w:history="1">
             <w:r>
               <w:rPr>
                 <w:rStyle w:val="Hyperlink"/>
@@ -2783,7 +3143,7 @@
                 <w:noProof/>
                 <w:webHidden/>
               </w:rPr>
-              <w:instrText xml:space="preserve"> PAGEREF _Toc221463541 \h </w:instrText>
+              <w:instrText xml:space="preserve"> PAGEREF _Toc223520113 \h </w:instrText>
             </w:r>
             <w:r>
               <w:rPr>
@@ -2803,7 +3163,7 @@
                 <w:noProof/>
                 <w:webHidden/>
               </w:rPr>
-              <w:t>20</w:t>
+              <w:t>24</w:t>
             </w:r>
             <w:r>
               <w:rPr>
@@ -2828,7 +3188,7 @@
               <w:lang w:eastAsia="en-GB"/>
             </w:rPr>
           </w:pPr>
-          <w:hyperlink w:anchor="_Toc221463542" w:history="1">
+          <w:hyperlink w:anchor="_Toc223520114" w:history="1">
             <w:r>
               <w:rPr>
                 <w:rStyle w:val="Hyperlink"/>
@@ -2855,7 +3215,7 @@
                 <w:noProof/>
                 <w:webHidden/>
               </w:rPr>
-              <w:instrText xml:space="preserve"> PAGEREF _Toc221463542 \h </w:instrText>
+              <w:instrText xml:space="preserve"> PAGEREF _Toc223520114 \h </w:instrText>
             </w:r>
             <w:r>
               <w:rPr>
@@ -2875,7 +3235,7 @@
                 <w:noProof/>
                 <w:webHidden/>
               </w:rPr>
-              <w:t>20</w:t>
+              <w:t>24</w:t>
             </w:r>
             <w:r>
               <w:rPr>
@@ -2900,7 +3260,7 @@
               <w:lang w:eastAsia="en-GB"/>
             </w:rPr>
           </w:pPr>
-          <w:hyperlink w:anchor="_Toc221463543" w:history="1">
+          <w:hyperlink w:anchor="_Toc223520115" w:history="1">
             <w:r>
               <w:rPr>
                 <w:rStyle w:val="Hyperlink"/>
@@ -2927,7 +3287,7 @@
                 <w:noProof/>
                 <w:webHidden/>
               </w:rPr>
-              <w:instrText xml:space="preserve"> PAGEREF _Toc221463543 \h </w:instrText>
+              <w:instrText xml:space="preserve"> PAGEREF _Toc223520115 \h </w:instrText>
             </w:r>
             <w:r>
               <w:rPr>
@@ -2947,7 +3307,7 @@
                 <w:noProof/>
                 <w:webHidden/>
               </w:rPr>
-              <w:t>20</w:t>
+              <w:t>24</w:t>
             </w:r>
             <w:r>
               <w:rPr>
@@ -2972,7 +3332,7 @@
               <w:lang w:eastAsia="en-GB"/>
             </w:rPr>
           </w:pPr>
-          <w:hyperlink w:anchor="_Toc221463544" w:history="1">
+          <w:hyperlink w:anchor="_Toc223520116" w:history="1">
             <w:r>
               <w:rPr>
                 <w:rStyle w:val="Hyperlink"/>
@@ -2999,7 +3359,7 @@
                 <w:noProof/>
                 <w:webHidden/>
               </w:rPr>
-              <w:instrText xml:space="preserve"> PAGEREF _Toc221463544 \h </w:instrText>
+              <w:instrText xml:space="preserve"> PAGEREF _Toc223520116 \h </w:instrText>
             </w:r>
             <w:r>
               <w:rPr>
@@ -3019,7 +3379,7 @@
                 <w:noProof/>
                 <w:webHidden/>
               </w:rPr>
-              <w:t>21</w:t>
+              <w:t>25</w:t>
             </w:r>
             <w:r>
               <w:rPr>
@@ -3044,7 +3404,7 @@
               <w:lang w:eastAsia="en-GB"/>
             </w:rPr>
           </w:pPr>
-          <w:hyperlink w:anchor="_Toc221463545" w:history="1">
+          <w:hyperlink w:anchor="_Toc223520117" w:history="1">
             <w:r>
               <w:rPr>
                 <w:rStyle w:val="Hyperlink"/>
@@ -3071,7 +3431,7 @@
                 <w:noProof/>
                 <w:webHidden/>
               </w:rPr>
-              <w:instrText xml:space="preserve"> PAGEREF _Toc221463545 \h </w:instrText>
+              <w:instrText xml:space="preserve"> PAGEREF _Toc223520117 \h </w:instrText>
             </w:r>
             <w:r>
               <w:rPr>
@@ -3091,7 +3451,7 @@
                 <w:noProof/>
                 <w:webHidden/>
               </w:rPr>
-              <w:t>22</w:t>
+              <w:t>26</w:t>
             </w:r>
             <w:r>
               <w:rPr>
@@ -3116,7 +3476,7 @@
               <w:lang w:eastAsia="en-GB"/>
             </w:rPr>
           </w:pPr>
-          <w:hyperlink w:anchor="_Toc221463546" w:history="1">
+          <w:hyperlink w:anchor="_Toc223520118" w:history="1">
             <w:r>
               <w:rPr>
                 <w:rStyle w:val="Hyperlink"/>
@@ -3143,7 +3503,7 @@
                 <w:noProof/>
                 <w:webHidden/>
               </w:rPr>
-              <w:instrText xml:space="preserve"> PAGEREF _Toc221463546 \h </w:instrText>
+              <w:instrText xml:space="preserve"> PAGEREF _Toc223520118 \h </w:instrText>
             </w:r>
             <w:r>
               <w:rPr>
@@ -3163,7 +3523,7 @@
                 <w:noProof/>
                 <w:webHidden/>
               </w:rPr>
-              <w:t>23</w:t>
+              <w:t>27</w:t>
             </w:r>
             <w:r>
               <w:rPr>
@@ -3188,7 +3548,7 @@
               <w:lang w:eastAsia="en-GB"/>
             </w:rPr>
           </w:pPr>
-          <w:hyperlink w:anchor="_Toc221463547" w:history="1">
+          <w:hyperlink w:anchor="_Toc223520119" w:history="1">
             <w:r>
               <w:rPr>
                 <w:rStyle w:val="Hyperlink"/>
@@ -3215,7 +3575,7 @@
                 <w:noProof/>
                 <w:webHidden/>
               </w:rPr>
-              <w:instrText xml:space="preserve"> PAGEREF _Toc221463547 \h </w:instrText>
+              <w:instrText xml:space="preserve"> PAGEREF _Toc223520119 \h </w:instrText>
             </w:r>
             <w:r>
               <w:rPr>
@@ -3235,7 +3595,7 @@
                 <w:noProof/>
                 <w:webHidden/>
               </w:rPr>
-              <w:t>23</w:t>
+              <w:t>27</w:t>
             </w:r>
             <w:r>
               <w:rPr>
@@ -3260,7 +3620,7 @@
               <w:lang w:eastAsia="en-GB"/>
             </w:rPr>
           </w:pPr>
-          <w:hyperlink w:anchor="_Toc221463548" w:history="1">
+          <w:hyperlink w:anchor="_Toc223520120" w:history="1">
             <w:r>
               <w:rPr>
                 <w:rStyle w:val="Hyperlink"/>
@@ -3287,7 +3647,7 @@
                 <w:noProof/>
                 <w:webHidden/>
               </w:rPr>
-              <w:instrText xml:space="preserve"> PAGEREF _Toc221463548 \h </w:instrText>
+              <w:instrText xml:space="preserve"> PAGEREF _Toc223520120 \h </w:instrText>
             </w:r>
             <w:r>
               <w:rPr>
@@ -3307,7 +3667,7 @@
                 <w:noProof/>
                 <w:webHidden/>
               </w:rPr>
-              <w:t>24</w:t>
+              <w:t>28</w:t>
             </w:r>
             <w:r>
               <w:rPr>
@@ -3332,7 +3692,7 @@
               <w:lang w:eastAsia="en-GB"/>
             </w:rPr>
           </w:pPr>
-          <w:hyperlink w:anchor="_Toc221463549" w:history="1">
+          <w:hyperlink w:anchor="_Toc223520121" w:history="1">
             <w:r>
               <w:rPr>
                 <w:rStyle w:val="Hyperlink"/>
@@ -3359,7 +3719,7 @@
                 <w:noProof/>
                 <w:webHidden/>
               </w:rPr>
-              <w:instrText xml:space="preserve"> PAGEREF _Toc221463549 \h </w:instrText>
+              <w:instrText xml:space="preserve"> PAGEREF _Toc223520121 \h </w:instrText>
             </w:r>
             <w:r>
               <w:rPr>
@@ -3379,79 +3739,7 @@
                 <w:noProof/>
                 <w:webHidden/>
               </w:rPr>
-              <w:t>24</w:t>
-            </w:r>
-            <w:r>
-              <w:rPr>
-                <w:noProof/>
-                <w:webHidden/>
-              </w:rPr>
-              <w:fldChar w:fldCharType="end"/>
-            </w:r>
-          </w:hyperlink>
-        </w:p>
-        <w:p>
-          <w:pPr>
-            <w:pStyle w:val="TOC1"/>
-            <w:tabs>
-              <w:tab w:val="right" w:leader="dot" w:pos="9016"/>
-            </w:tabs>
-            <w:rPr>
-              <w:rFonts w:eastAsiaTheme="minorEastAsia"/>
-              <w:noProof/>
-              <w:sz w:val="24"/>
-              <w:szCs w:val="24"/>
-              <w:lang w:eastAsia="en-GB"/>
-            </w:rPr>
-          </w:pPr>
-          <w:hyperlink w:anchor="_Toc221463550" w:history="1">
-            <w:r>
-              <w:rPr>
-                <w:rStyle w:val="Hyperlink"/>
-                <w:noProof/>
-              </w:rPr>
-              <w:t>References</w:t>
-            </w:r>
-            <w:r>
-              <w:rPr>
-                <w:noProof/>
-                <w:webHidden/>
-              </w:rPr>
-              <w:tab/>
-            </w:r>
-            <w:r>
-              <w:rPr>
-                <w:noProof/>
-                <w:webHidden/>
-              </w:rPr>
-              <w:fldChar w:fldCharType="begin"/>
-            </w:r>
-            <w:r>
-              <w:rPr>
-                <w:noProof/>
-                <w:webHidden/>
-              </w:rPr>
-              <w:instrText xml:space="preserve"> PAGEREF _Toc221463550 \h </w:instrText>
-            </w:r>
-            <w:r>
-              <w:rPr>
-                <w:noProof/>
-                <w:webHidden/>
-              </w:rPr>
-            </w:r>
-            <w:r>
-              <w:rPr>
-                <w:noProof/>
-                <w:webHidden/>
-              </w:rPr>
-              <w:fldChar w:fldCharType="separate"/>
-            </w:r>
-            <w:r>
-              <w:rPr>
-                <w:noProof/>
-                <w:webHidden/>
-              </w:rPr>
-              <w:t>25</w:t>
+              <w:t>28</w:t>
             </w:r>
             <w:r>
               <w:rPr>
@@ -3492,7 +3780,7 @@
       <w:pPr>
         <w:pStyle w:val="Heading1"/>
       </w:pPr>
-      <w:bookmarkStart w:id="0" w:name="_Toc221463506"/>
+      <w:bookmarkStart w:id="0" w:name="_Toc223520073"/>
       <w:r>
         <w:lastRenderedPageBreak/>
         <w:t>List of Acro</w:t>
@@ -3675,7 +3963,7 @@
       <w:pPr>
         <w:pStyle w:val="Heading1"/>
       </w:pPr>
-      <w:bookmarkStart w:id="1" w:name="_Toc221463507"/>
+      <w:bookmarkStart w:id="1" w:name="_Toc223520074"/>
       <w:r>
         <w:lastRenderedPageBreak/>
         <w:t>Abstract</w:t>
@@ -3875,7 +4163,7 @@
       <w:pPr>
         <w:pStyle w:val="Heading1"/>
       </w:pPr>
-      <w:bookmarkStart w:id="2" w:name="_Toc221463508"/>
+      <w:bookmarkStart w:id="2" w:name="_Toc223520075"/>
       <w:r>
         <w:lastRenderedPageBreak/>
         <w:t>Introduction</w:t>
@@ -3922,13 +4210,8 @@
       <w:r>
         <w:t xml:space="preserve">. </w:t>
       </w:r>
-      <w:proofErr w:type="spellStart"/>
-      <w:r>
-        <w:t>Porcar</w:t>
-      </w:r>
-      <w:proofErr w:type="spellEnd"/>
-      <w:r>
-        <w:t xml:space="preserve"> et al., </w:t>
+      <w:r>
+        <w:t xml:space="preserve">Porcar et al., </w:t>
       </w:r>
       <w:r>
         <w:t>(</w:t>
@@ -3968,13 +4251,8 @@
       <w:r>
         <w:t xml:space="preserve">Research conducted by </w:t>
       </w:r>
-      <w:proofErr w:type="spellStart"/>
-      <w:r>
-        <w:t>Cantó</w:t>
-      </w:r>
-      <w:proofErr w:type="spellEnd"/>
-      <w:r>
-        <w:t xml:space="preserve">-Sancho et al., </w:t>
+      <w:r>
+        <w:t xml:space="preserve">Cantó-Sancho et al., </w:t>
       </w:r>
       <w:r>
         <w:t>(</w:t>
@@ -4458,7 +4736,7 @@
       <w:pPr>
         <w:pStyle w:val="Heading1"/>
       </w:pPr>
-      <w:bookmarkStart w:id="3" w:name="_Toc221463509"/>
+      <w:bookmarkStart w:id="3" w:name="_Toc223520076"/>
       <w:r>
         <w:lastRenderedPageBreak/>
         <w:t>Project Aim</w:t>
@@ -4508,7 +4786,7 @@
           <w:rFonts w:asciiTheme="minorHAnsi" w:hAnsiTheme="minorHAnsi"/>
         </w:rPr>
       </w:pPr>
-      <w:bookmarkStart w:id="4" w:name="_Toc221463510"/>
+      <w:bookmarkStart w:id="4" w:name="_Toc223520077"/>
       <w:r>
         <w:rPr>
           <w:rFonts w:asciiTheme="minorHAnsi" w:hAnsiTheme="minorHAnsi"/>
@@ -4795,7 +5073,7 @@
       <w:pPr>
         <w:pStyle w:val="Heading1"/>
       </w:pPr>
-      <w:bookmarkStart w:id="5" w:name="_Toc221463511"/>
+      <w:bookmarkStart w:id="5" w:name="_Toc223520078"/>
       <w:r>
         <w:lastRenderedPageBreak/>
         <w:t>Project Planning</w:t>
@@ -5176,7 +5454,7 @@
           <w:rFonts w:asciiTheme="minorHAnsi" w:hAnsiTheme="minorHAnsi"/>
         </w:rPr>
       </w:pPr>
-      <w:bookmarkStart w:id="6" w:name="_Toc221463512"/>
+      <w:bookmarkStart w:id="6" w:name="_Toc223520079"/>
       <w:r>
         <w:rPr>
           <w:rFonts w:asciiTheme="minorHAnsi" w:hAnsiTheme="minorHAnsi"/>
@@ -5378,7 +5656,7 @@
           <w:rFonts w:asciiTheme="minorHAnsi" w:hAnsiTheme="minorHAnsi"/>
         </w:rPr>
       </w:pPr>
-      <w:bookmarkStart w:id="7" w:name="_Toc221463513"/>
+      <w:bookmarkStart w:id="7" w:name="_Toc223520080"/>
       <w:r>
         <w:rPr>
           <w:rFonts w:asciiTheme="minorHAnsi" w:hAnsiTheme="minorHAnsi"/>
@@ -5617,21 +5895,7 @@
         <w:rPr>
           <w:rFonts w:cs="Arial"/>
         </w:rPr>
-        <w:t xml:space="preserve">Clear </w:t>
-      </w:r>
-      <w:proofErr w:type="gramStart"/>
-      <w:r>
-        <w:rPr>
-          <w:rFonts w:cs="Arial"/>
-        </w:rPr>
-        <w:t>on screen</w:t>
-      </w:r>
-      <w:proofErr w:type="gramEnd"/>
-      <w:r>
-        <w:rPr>
-          <w:rFonts w:cs="Arial"/>
-        </w:rPr>
-        <w:t xml:space="preserve"> prompts to guide and support users that aren’t familiar with VR equipment</w:t>
+        <w:t>Clear on screen prompts to guide and support users that aren’t familiar with VR equipment</w:t>
       </w:r>
     </w:p>
     <w:p>
@@ -5659,7 +5923,7 @@
           <w:rFonts w:asciiTheme="minorHAnsi" w:hAnsiTheme="minorHAnsi"/>
         </w:rPr>
       </w:pPr>
-      <w:bookmarkStart w:id="8" w:name="_Toc221463514"/>
+      <w:bookmarkStart w:id="8" w:name="_Toc223520081"/>
       <w:r>
         <w:rPr>
           <w:rFonts w:asciiTheme="minorHAnsi" w:hAnsiTheme="minorHAnsi"/>
@@ -5676,7 +5940,7 @@
           <w:rFonts w:asciiTheme="minorHAnsi" w:hAnsiTheme="minorHAnsi"/>
         </w:rPr>
       </w:pPr>
-      <w:bookmarkStart w:id="9" w:name="_Toc221463515"/>
+      <w:bookmarkStart w:id="9" w:name="_Toc223520082"/>
       <w:r>
         <w:rPr>
           <w:rFonts w:asciiTheme="minorHAnsi" w:hAnsiTheme="minorHAnsi"/>
@@ -5760,7 +6024,7 @@
           <w:rFonts w:asciiTheme="minorHAnsi" w:hAnsiTheme="minorHAnsi"/>
         </w:rPr>
       </w:pPr>
-      <w:bookmarkStart w:id="10" w:name="_Toc221463516"/>
+      <w:bookmarkStart w:id="10" w:name="_Toc223520083"/>
       <w:r>
         <w:rPr>
           <w:rFonts w:asciiTheme="minorHAnsi" w:hAnsiTheme="minorHAnsi"/>
@@ -5773,8 +6037,7 @@
       <w:pPr>
         <w:pStyle w:val="Heading3"/>
       </w:pPr>
-      <w:bookmarkStart w:id="11" w:name="_Toc221463517"/>
-      <w:proofErr w:type="spellStart"/>
+      <w:bookmarkStart w:id="11" w:name="_Toc223520084"/>
       <w:r>
         <w:t>Ey</w:t>
       </w:r>
@@ -5785,7 +6048,6 @@
         <w:t>si</w:t>
       </w:r>
       <w:bookmarkEnd w:id="11"/>
-      <w:proofErr w:type="spellEnd"/>
     </w:p>
     <w:p>
       <w:r>
@@ -5800,11 +6062,9 @@
       <w:r>
         <w:t xml:space="preserve"> discussed </w:t>
       </w:r>
-      <w:proofErr w:type="spellStart"/>
       <w:r>
         <w:t>Eyesi</w:t>
       </w:r>
-      <w:proofErr w:type="spellEnd"/>
       <w:r>
         <w:t>,</w:t>
       </w:r>
@@ -5917,15 +6177,7 @@
         <w:t xml:space="preserve">In addition to this, there is an </w:t>
       </w:r>
       <w:r>
-        <w:t>online training portal (</w:t>
-      </w:r>
-      <w:proofErr w:type="spellStart"/>
-      <w:r>
-        <w:t>vrmnet</w:t>
-      </w:r>
-      <w:proofErr w:type="spellEnd"/>
-      <w:r>
-        <w:t xml:space="preserve">) </w:t>
+        <w:t xml:space="preserve">online training portal (vrmnet) </w:t>
       </w:r>
       <w:r>
         <w:t>allowing comparison between trainees</w:t>
@@ -6060,15 +6312,7 @@
         <w:t xml:space="preserve"> </w:t>
       </w:r>
       <w:r>
-        <w:t xml:space="preserve">While </w:t>
-      </w:r>
-      <w:proofErr w:type="spellStart"/>
-      <w:r>
-        <w:t>Eyesi</w:t>
-      </w:r>
-      <w:proofErr w:type="spellEnd"/>
-      <w:r>
-        <w:t xml:space="preserve"> is effective for medical training for medical professionals, </w:t>
+        <w:t xml:space="preserve">While Eyesi is effective for medical training for medical professionals, </w:t>
       </w:r>
       <w:r>
         <w:t xml:space="preserve">similar </w:t>
@@ -6090,13 +6334,11 @@
       <w:pPr>
         <w:pStyle w:val="Heading3"/>
       </w:pPr>
-      <w:bookmarkStart w:id="12" w:name="_Toc221463518"/>
-      <w:proofErr w:type="spellStart"/>
+      <w:bookmarkStart w:id="12" w:name="_Toc223520085"/>
       <w:r>
         <w:t>OntoPhaco</w:t>
       </w:r>
       <w:bookmarkEnd w:id="12"/>
-      <w:proofErr w:type="spellEnd"/>
     </w:p>
     <w:p>
       <w:r>
@@ -6115,15 +6357,7 @@
         <w:t>d</w:t>
       </w:r>
       <w:r>
-        <w:t xml:space="preserve"> </w:t>
-      </w:r>
-      <w:proofErr w:type="spellStart"/>
-      <w:r>
-        <w:t>OntoPhaco</w:t>
-      </w:r>
-      <w:proofErr w:type="spellEnd"/>
-      <w:r>
-        <w:t>, a</w:t>
+        <w:t xml:space="preserve"> OntoPhaco, a</w:t>
       </w:r>
       <w:r>
         <w:t>n</w:t>
@@ -6256,191 +6490,173 @@
           <w:rFonts w:cs="TimesLTStd-Roman"/>
           <w:kern w:val="0"/>
         </w:rPr>
-        <w:t xml:space="preserve">Since </w:t>
-      </w:r>
-      <w:proofErr w:type="spellStart"/>
+        <w:t>Since OntoPhaco</w:t>
+      </w:r>
       <w:r>
         <w:rPr>
           <w:rFonts w:cs="TimesLTStd-Roman"/>
           <w:kern w:val="0"/>
         </w:rPr>
-        <w:t>OntoPhaco</w:t>
+        <w:t>’s</w:t>
       </w:r>
       <w:r>
         <w:rPr>
           <w:rFonts w:cs="TimesLTStd-Roman"/>
           <w:kern w:val="0"/>
         </w:rPr>
-        <w:t>’s</w:t>
-      </w:r>
-      <w:proofErr w:type="spellEnd"/>
+        <w:t xml:space="preserve"> </w:t>
+      </w:r>
+      <w:r>
+        <w:t>s</w:t>
+      </w:r>
+      <w:r>
+        <w:t xml:space="preserve">ystematic verification and validation processes </w:t>
+      </w:r>
+      <w:r>
+        <w:t>include</w:t>
+      </w:r>
+      <w:r>
+        <w:t xml:space="preserve"> </w:t>
+      </w:r>
+      <w:r>
+        <w:t xml:space="preserve">theoretical </w:t>
+      </w:r>
+      <w:r>
+        <w:t>evaluat</w:t>
+      </w:r>
+      <w:r>
+        <w:t xml:space="preserve">ion </w:t>
+      </w:r>
+      <w:r>
+        <w:t>and expert feedback</w:t>
+      </w:r>
       <w:r>
         <w:rPr>
           <w:rFonts w:cs="TimesLTStd-Roman"/>
           <w:kern w:val="0"/>
         </w:rPr>
-        <w:t xml:space="preserve"> </w:t>
-      </w:r>
-      <w:r>
-        <w:t>s</w:t>
-      </w:r>
-      <w:r>
-        <w:t xml:space="preserve">ystematic verification and validation processes </w:t>
-      </w:r>
-      <w:r>
-        <w:t>include</w:t>
-      </w:r>
-      <w:r>
-        <w:t xml:space="preserve"> </w:t>
-      </w:r>
-      <w:r>
-        <w:t xml:space="preserve">theoretical </w:t>
-      </w:r>
-      <w:r>
-        <w:t>evaluat</w:t>
-      </w:r>
-      <w:r>
-        <w:t xml:space="preserve">ion </w:t>
-      </w:r>
-      <w:r>
-        <w:t>and expert feedback</w:t>
+        <w:t xml:space="preserve">, each change, minor or major </w:t>
       </w:r>
       <w:r>
         <w:rPr>
           <w:rFonts w:cs="TimesLTStd-Roman"/>
           <w:kern w:val="0"/>
         </w:rPr>
-        <w:t xml:space="preserve">, each change, minor or major </w:t>
+        <w:t>is</w:t>
       </w:r>
       <w:r>
         <w:rPr>
           <w:rFonts w:cs="TimesLTStd-Roman"/>
           <w:kern w:val="0"/>
         </w:rPr>
-        <w:t>is</w:t>
+        <w:t xml:space="preserve"> verified and validate</w:t>
       </w:r>
       <w:r>
         <w:rPr>
           <w:rFonts w:cs="TimesLTStd-Roman"/>
           <w:kern w:val="0"/>
         </w:rPr>
-        <w:t xml:space="preserve"> verified and validate</w:t>
+        <w:t>d</w:t>
+      </w:r>
+      <w:r>
+        <w:t>.</w:t>
       </w:r>
       <w:r>
         <w:rPr>
           <w:rFonts w:cs="TimesLTStd-Roman"/>
           <w:kern w:val="0"/>
         </w:rPr>
-        <w:t>d</w:t>
-      </w:r>
-      <w:r>
-        <w:t>.</w:t>
+        <w:t xml:space="preserve"> </w:t>
       </w:r>
       <w:r>
         <w:rPr>
           <w:rFonts w:cs="TimesLTStd-Roman"/>
           <w:kern w:val="0"/>
         </w:rPr>
-        <w:t xml:space="preserve"> </w:t>
-      </w:r>
-      <w:proofErr w:type="spellStart"/>
+        <w:t>OntoPhaco demonstrates VR</w:t>
+      </w:r>
       <w:r>
         <w:rPr>
           <w:rFonts w:cs="TimesLTStd-Roman"/>
           <w:kern w:val="0"/>
         </w:rPr>
-        <w:t>OntoPhaco</w:t>
-      </w:r>
-      <w:proofErr w:type="spellEnd"/>
+        <w:t>’</w:t>
+      </w:r>
       <w:r>
         <w:rPr>
           <w:rFonts w:cs="TimesLTStd-Roman"/>
           <w:kern w:val="0"/>
         </w:rPr>
-        <w:t xml:space="preserve"> demonstrates VR</w:t>
+        <w:t xml:space="preserve">s effectiveness </w:t>
       </w:r>
       <w:r>
         <w:rPr>
           <w:rFonts w:cs="TimesLTStd-Roman"/>
           <w:kern w:val="0"/>
         </w:rPr>
-        <w:t>’</w:t>
+        <w:t xml:space="preserve">paired </w:t>
       </w:r>
       <w:r>
         <w:rPr>
           <w:rFonts w:cs="TimesLTStd-Roman"/>
           <w:kern w:val="0"/>
         </w:rPr>
-        <w:t xml:space="preserve">s effectiveness </w:t>
+        <w:t>with ontology for medical training</w:t>
       </w:r>
       <w:r>
         <w:rPr>
           <w:rFonts w:cs="TimesLTStd-Roman"/>
           <w:kern w:val="0"/>
         </w:rPr>
-        <w:t xml:space="preserve">paired </w:t>
+        <w:t>. T</w:t>
       </w:r>
       <w:r>
         <w:rPr>
           <w:rFonts w:cs="TimesLTStd-Roman"/>
           <w:kern w:val="0"/>
         </w:rPr>
-        <w:t>with ontology for medical training</w:t>
+        <w:t>his project</w:t>
       </w:r>
       <w:r>
         <w:rPr>
           <w:rFonts w:cs="TimesLTStd-Roman"/>
           <w:kern w:val="0"/>
         </w:rPr>
-        <w:t>. T</w:t>
+        <w:t xml:space="preserve"> applies similar immersi</w:t>
       </w:r>
       <w:r>
         <w:rPr>
           <w:rFonts w:cs="TimesLTStd-Roman"/>
           <w:kern w:val="0"/>
         </w:rPr>
-        <w:t>his project</w:t>
+        <w:t>ve</w:t>
       </w:r>
       <w:r>
         <w:rPr>
           <w:rFonts w:cs="TimesLTStd-Roman"/>
           <w:kern w:val="0"/>
         </w:rPr>
-        <w:t xml:space="preserve"> applies similar immersi</w:t>
+        <w:t xml:space="preserve"> and educational knowledge </w:t>
       </w:r>
       <w:r>
         <w:rPr>
           <w:rFonts w:cs="TimesLTStd-Roman"/>
           <w:kern w:val="0"/>
         </w:rPr>
-        <w:t>ve</w:t>
+        <w:t xml:space="preserve">for DES to raise awareness, </w:t>
       </w:r>
       <w:r>
         <w:rPr>
           <w:rFonts w:cs="TimesLTStd-Roman"/>
           <w:kern w:val="0"/>
         </w:rPr>
-        <w:t xml:space="preserve"> and educational knowledge </w:t>
+        <w:t xml:space="preserve">spreading the </w:t>
       </w:r>
       <w:r>
         <w:rPr>
           <w:rFonts w:cs="TimesLTStd-Roman"/>
           <w:kern w:val="0"/>
         </w:rPr>
-        <w:t xml:space="preserve">for DES to raise awareness, </w:t>
-      </w:r>
-      <w:r>
-        <w:rPr>
-          <w:rFonts w:cs="TimesLTStd-Roman"/>
-          <w:kern w:val="0"/>
-        </w:rPr>
-        <w:t xml:space="preserve">spreading the </w:t>
-      </w:r>
-      <w:r>
-        <w:rPr>
-          <w:rFonts w:cs="TimesLTStd-Roman"/>
-          <w:kern w:val="0"/>
-        </w:rPr>
         <w:t>benefits of VR use in education beyond professional training.</w:t>
       </w:r>
     </w:p>
@@ -6448,7 +6664,7 @@
       <w:pPr>
         <w:pStyle w:val="Heading3"/>
       </w:pPr>
-      <w:bookmarkStart w:id="13" w:name="_Toc221463519"/>
+      <w:bookmarkStart w:id="13" w:name="_Toc223520086"/>
       <w:r>
         <w:lastRenderedPageBreak/>
         <w:t>I</w:t>
@@ -6644,7 +6860,7 @@
       <w:pPr>
         <w:pStyle w:val="Heading3"/>
       </w:pPr>
-      <w:bookmarkStart w:id="14" w:name="_Toc221463520"/>
+      <w:bookmarkStart w:id="14" w:name="_Toc223520087"/>
       <w:r>
         <w:t>Opportunities for innovation</w:t>
       </w:r>
@@ -6654,27 +6870,17 @@
       <w:r>
         <w:t xml:space="preserve">While </w:t>
       </w:r>
-      <w:proofErr w:type="spellStart"/>
-      <w:r>
-        <w:t>Eyesi</w:t>
-      </w:r>
-      <w:proofErr w:type="spellEnd"/>
-      <w:r>
-        <w:t xml:space="preserve"> focuses on hands on surgical practices</w:t>
+      <w:r>
+        <w:t>Eyesi focuses on hands on surgical practices</w:t>
       </w:r>
       <w:r>
         <w:t xml:space="preserve">, </w:t>
       </w:r>
-      <w:proofErr w:type="spellStart"/>
       <w:r>
         <w:t>O</w:t>
       </w:r>
       <w:r>
-        <w:t>ntoPhaco</w:t>
-      </w:r>
-      <w:proofErr w:type="spellEnd"/>
-      <w:r>
-        <w:t xml:space="preserve"> focuses on the way knowledge is represented and conceptual understanding</w:t>
+        <w:t>ntoPhaco focuses on the way knowledge is represented and conceptual understanding</w:t>
       </w:r>
       <w:r>
         <w:t xml:space="preserve">. </w:t>
@@ -6772,7 +6978,7 @@
           <w:rFonts w:asciiTheme="minorHAnsi" w:hAnsiTheme="minorHAnsi"/>
         </w:rPr>
       </w:pPr>
-      <w:bookmarkStart w:id="15" w:name="_Toc221463521"/>
+      <w:bookmarkStart w:id="15" w:name="_Toc223520088"/>
       <w:r>
         <w:rPr>
           <w:rFonts w:asciiTheme="minorHAnsi" w:hAnsiTheme="minorHAnsi"/>
@@ -6785,7 +6991,7 @@
       <w:pPr>
         <w:pStyle w:val="Heading3"/>
       </w:pPr>
-      <w:bookmarkStart w:id="16" w:name="_Toc221463522"/>
+      <w:bookmarkStart w:id="16" w:name="_Toc223520089"/>
       <w:r>
         <w:t>VR in medical education</w:t>
       </w:r>
@@ -6932,19 +7138,9 @@
       <w:r>
         <w:t xml:space="preserve">Examples such as </w:t>
       </w:r>
-      <w:proofErr w:type="spellStart"/>
-      <w:r>
-        <w:t>Mediverse</w:t>
-      </w:r>
-      <w:proofErr w:type="spellEnd"/>
-      <w:r>
-        <w:t xml:space="preserve"> by </w:t>
-      </w:r>
-      <w:proofErr w:type="spellStart"/>
-      <w:r>
-        <w:t>Goggleminds</w:t>
-      </w:r>
-      <w:proofErr w:type="spellEnd"/>
+      <w:r>
+        <w:t>Mediverse by Goggleminds</w:t>
+      </w:r>
       <w:r>
         <w:t xml:space="preserve"> </w:t>
       </w:r>
@@ -6958,38 +7154,25 @@
         <w:t xml:space="preserve"> to healthcare providers and medical schools</w:t>
       </w:r>
       <w:r>
+        <w:t>. ClassVR by Systems improve</w:t>
+      </w:r>
+      <w:r>
+        <w:t>s</w:t>
+      </w:r>
+      <w:r>
+        <w:t xml:space="preserve"> student engagement</w:t>
+      </w:r>
+      <w:r>
+        <w:t xml:space="preserve"> to help teachers with educating students on learning material</w:t>
+      </w:r>
+      <w:r>
         <w:t xml:space="preserve">. </w:t>
       </w:r>
-      <w:proofErr w:type="spellStart"/>
-      <w:r>
-        <w:t>ClassVR</w:t>
-      </w:r>
-      <w:proofErr w:type="spellEnd"/>
-      <w:r>
-        <w:t xml:space="preserve"> by Systems improve</w:t>
-      </w:r>
-      <w:r>
-        <w:t>s</w:t>
-      </w:r>
-      <w:r>
-        <w:t xml:space="preserve"> student engagement</w:t>
-      </w:r>
-      <w:r>
-        <w:t xml:space="preserve"> to help teachers with educating students on learning material</w:t>
-      </w:r>
-      <w:r>
-        <w:t xml:space="preserve">. </w:t>
-      </w:r>
-      <w:r>
-        <w:t xml:space="preserve"> </w:t>
-      </w:r>
-      <w:proofErr w:type="spellStart"/>
-      <w:r>
-        <w:t>PrismsVR</w:t>
-      </w:r>
-      <w:proofErr w:type="spellEnd"/>
-      <w:r>
-        <w:t xml:space="preserve"> </w:t>
+      <w:r>
+        <w:t xml:space="preserve"> </w:t>
+      </w:r>
+      <w:r>
+        <w:t xml:space="preserve">PrismsVR </w:t>
       </w:r>
       <w:r>
         <w:t xml:space="preserve">helps students grasp core concepts in algebra and geometry, by </w:t>
@@ -7075,7 +7258,7 @@
       <w:pPr>
         <w:pStyle w:val="Heading3"/>
       </w:pPr>
-      <w:bookmarkStart w:id="17" w:name="_Toc221463523"/>
+      <w:bookmarkStart w:id="17" w:name="_Toc223520090"/>
       <w:r>
         <w:lastRenderedPageBreak/>
         <w:t>VR in Health Awareness</w:t>
@@ -7268,7 +7451,7 @@
           <w:rFonts w:asciiTheme="minorHAnsi" w:hAnsiTheme="minorHAnsi"/>
         </w:rPr>
       </w:pPr>
-      <w:bookmarkStart w:id="18" w:name="_Toc221463524"/>
+      <w:bookmarkStart w:id="18" w:name="_Toc223520091"/>
       <w:r>
         <w:rPr>
           <w:rFonts w:asciiTheme="minorHAnsi" w:hAnsiTheme="minorHAnsi"/>
@@ -7488,7 +7671,7 @@
       <w:pPr>
         <w:pStyle w:val="Heading1"/>
       </w:pPr>
-      <w:bookmarkStart w:id="19" w:name="_Toc221463525"/>
+      <w:bookmarkStart w:id="19" w:name="_Toc223520092"/>
       <w:r>
         <w:lastRenderedPageBreak/>
         <w:t>Appendices</w:t>
@@ -7499,7 +7682,7 @@
       <w:pPr>
         <w:pStyle w:val="Heading2"/>
       </w:pPr>
-      <w:bookmarkStart w:id="20" w:name="_Toc221463526"/>
+      <w:bookmarkStart w:id="20" w:name="_Toc223520093"/>
       <w:r>
         <w:t>Ethics Checklist</w:t>
       </w:r>
@@ -7641,7 +7824,7 @@
       <w:pPr>
         <w:pStyle w:val="Heading2"/>
       </w:pPr>
-      <w:bookmarkStart w:id="21" w:name="_Toc221463527"/>
+      <w:bookmarkStart w:id="21" w:name="_Toc223520094"/>
       <w:r>
         <w:lastRenderedPageBreak/>
         <w:t>Project Timeline Gant</w:t>
@@ -7837,7 +8020,7 @@
       <w:pPr>
         <w:pStyle w:val="Heading1"/>
       </w:pPr>
-      <w:bookmarkStart w:id="22" w:name="_Toc221463528"/>
+      <w:bookmarkStart w:id="22" w:name="_Toc223520095"/>
       <w:r>
         <w:lastRenderedPageBreak/>
         <w:t>Methodology</w:t>
@@ -7848,7 +8031,7 @@
       <w:pPr>
         <w:pStyle w:val="Heading2"/>
       </w:pPr>
-      <w:bookmarkStart w:id="23" w:name="_Toc221463529"/>
+      <w:bookmarkStart w:id="23" w:name="_Toc223520096"/>
       <w:r>
         <w:t>Prototype Implementation</w:t>
       </w:r>
@@ -7858,17 +8041,90 @@
       <w:pPr>
         <w:pStyle w:val="Heading3"/>
       </w:pPr>
-      <w:bookmarkStart w:id="24" w:name="_Toc221463530"/>
+      <w:bookmarkStart w:id="24" w:name="_Toc223520097"/>
       <w:r>
         <w:t>Usability and Flow</w:t>
       </w:r>
       <w:bookmarkEnd w:id="24"/>
     </w:p>
     <w:p>
+      <w:r>
+        <w:t xml:space="preserve">Establishing a </w:t>
+      </w:r>
+      <w:r>
+        <w:t xml:space="preserve">usable and smooth </w:t>
+      </w:r>
+      <w:r>
+        <w:t xml:space="preserve">experience </w:t>
+      </w:r>
+      <w:r>
+        <w:t>during use became a high priority</w:t>
+      </w:r>
+      <w:r>
+        <w:t xml:space="preserve"> in the development phase</w:t>
+      </w:r>
+      <w:r>
+        <w:t>.</w:t>
+      </w:r>
+      <w:r>
+        <w:t xml:space="preserve"> As the project aims to raise awareness of DES within a VR interactive environment, ensuring the experience was </w:t>
+      </w:r>
+      <w:r>
+        <w:t>accommodating</w:t>
+      </w:r>
+      <w:r>
+        <w:t xml:space="preserve"> was crucial so users could quickly understand how to progress through the experience. In addition to this, the experience was structured using objective based progression </w:t>
+      </w:r>
+      <w:r>
+        <w:t>where</w:t>
+      </w:r>
+      <w:r>
+        <w:t xml:space="preserve"> users needed to complete objectives to progress onto the next eventually reaching the conclusion</w:t>
+      </w:r>
+      <w:r>
+        <w:t>.</w:t>
+      </w:r>
+      <w:r>
+        <w:t xml:space="preserve"> </w:t>
+      </w:r>
+    </w:p>
+    <w:p>
+      <w:r>
+        <w:t>The objectives were divided into</w:t>
+      </w:r>
+      <w:r>
+        <w:t xml:space="preserve"> </w:t>
+      </w:r>
+      <w:r>
+        <w:t>three</w:t>
+      </w:r>
+      <w:r>
+        <w:t xml:space="preserve"> sets</w:t>
+      </w:r>
+      <w:r>
+        <w:t>,</w:t>
+      </w:r>
+      <w:r>
+        <w:t xml:space="preserve"> where one objective</w:t>
+      </w:r>
+      <w:r>
+        <w:t xml:space="preserve"> simulat</w:t>
+      </w:r>
+      <w:r>
+        <w:t>ed</w:t>
+      </w:r>
+      <w:r>
+        <w:t xml:space="preserve"> </w:t>
+      </w:r>
+      <w:r>
+        <w:t>the cause of a symptom and the other a preventative measure to revert the symptoms experienced. Each objective was kept simple so the most information could be retained on what mainly caused each symptom and how each prevention method helped. Without the flow between objectives, the experience would become confusing and impair the user’s learning on the topic of DES instead of raising awareness on the matter.</w:t>
+      </w:r>
+    </w:p>
+    <w:p>
       <w:pPr>
         <w:pStyle w:val="Heading3"/>
       </w:pPr>
-      <w:bookmarkStart w:id="25" w:name="_Toc221463531"/>
+      <w:bookmarkStart w:id="25" w:name="_Toc223520098"/>
       <w:r>
         <w:t xml:space="preserve">Environment Design and </w:t>
       </w:r>
@@ -7878,10 +8134,105 @@
       <w:bookmarkEnd w:id="25"/>
     </w:p>
     <w:p>
+      <w:r>
+        <w:t>To best relate to most users who experience DES symptoms</w:t>
+      </w:r>
+      <w:r>
+        <w:t>,</w:t>
+      </w:r>
+      <w:r>
+        <w:t xml:space="preserve"> the </w:t>
+      </w:r>
+      <w:r>
+        <w:t>level</w:t>
+      </w:r>
+      <w:r>
+        <w:t xml:space="preserve"> </w:t>
+      </w:r>
+      <w:r>
+        <w:t>was created to replicate an office or home desk style environment. The scene consisted of a desk PC setup</w:t>
+      </w:r>
+      <w:r>
+        <w:t>,</w:t>
+      </w:r>
+      <w:r>
+        <w:t xml:space="preserve"> with the camera position being inside of the desk chair. </w:t>
+      </w:r>
+      <w:r>
+        <w:t xml:space="preserve">Furthermore, the </w:t>
+      </w:r>
+      <w:r>
+        <w:t>workspace was set within a</w:t>
+      </w:r>
+      <w:r>
+        <w:t xml:space="preserve"> confined room</w:t>
+      </w:r>
+      <w:r>
+        <w:t>,</w:t>
+      </w:r>
+      <w:r>
+        <w:t xml:space="preserve"> with</w:t>
+      </w:r>
+      <w:r>
+        <w:t xml:space="preserve"> </w:t>
+      </w:r>
+      <w:r>
+        <w:t xml:space="preserve">the monitor being </w:t>
+      </w:r>
+      <w:r>
+        <w:t xml:space="preserve">at </w:t>
+      </w:r>
+      <w:r>
+        <w:t>an appropriate distance from the camera view</w:t>
+      </w:r>
+      <w:r>
+        <w:t xml:space="preserve"> </w:t>
+      </w:r>
+      <w:r>
+        <w:t>and</w:t>
+      </w:r>
+      <w:r>
+        <w:t xml:space="preserve"> the rest of the room being relatively empty</w:t>
+      </w:r>
+      <w:r>
+        <w:t xml:space="preserve">. The environment was kept simple to </w:t>
+      </w:r>
+      <w:r>
+        <w:t>reinforce</w:t>
+      </w:r>
+      <w:r>
+        <w:t xml:space="preserve"> the user</w:t>
+      </w:r>
+      <w:r>
+        <w:t>’</w:t>
+      </w:r>
+      <w:r>
+        <w:t xml:space="preserve">s focus on the symptoms of DES within the objectives </w:t>
+      </w:r>
+      <w:r>
+        <w:t>without</w:t>
+      </w:r>
+      <w:r>
+        <w:t xml:space="preserve"> be</w:t>
+      </w:r>
+      <w:r>
+        <w:t>ing</w:t>
+      </w:r>
+      <w:r>
+        <w:t xml:space="preserve"> distracted by other objects</w:t>
+      </w:r>
+      <w:r>
+        <w:t xml:space="preserve"> in the room</w:t>
+      </w:r>
+      <w:r>
+        <w:t xml:space="preserve"> when trying to relieve each symptom.</w:t>
+      </w:r>
+    </w:p>
+    <w:p>
       <w:pPr>
         <w:pStyle w:val="Heading3"/>
       </w:pPr>
-      <w:bookmarkStart w:id="26" w:name="_Toc221463532"/>
+      <w:bookmarkStart w:id="26" w:name="_Toc223520099"/>
       <w:r>
         <w:t>Objective System Implementation</w:t>
       </w:r>
@@ -7891,7 +8242,7 @@
       <w:pPr>
         <w:pStyle w:val="Heading3"/>
       </w:pPr>
-      <w:bookmarkStart w:id="27" w:name="_Toc221463533"/>
+      <w:bookmarkStart w:id="27" w:name="_Toc223520100"/>
       <w:r>
         <w:t xml:space="preserve">Player Objective </w:t>
       </w:r>
@@ -7904,7 +8255,7 @@
       <w:pPr>
         <w:pStyle w:val="Heading3"/>
       </w:pPr>
-      <w:bookmarkStart w:id="28" w:name="_Toc221463534"/>
+      <w:bookmarkStart w:id="28" w:name="_Toc223520101"/>
       <w:r>
         <w:t>Objective Based Interact</w:t>
       </w:r>
@@ -7923,7 +8274,7 @@
       <w:pPr>
         <w:pStyle w:val="Heading3"/>
       </w:pPr>
-      <w:bookmarkStart w:id="29" w:name="_Toc221463535"/>
+      <w:bookmarkStart w:id="29" w:name="_Toc223520102"/>
       <w:r>
         <w:t>Post Processing Effects</w:t>
       </w:r>
@@ -7936,7 +8287,7 @@
       <w:pPr>
         <w:pStyle w:val="Heading3"/>
       </w:pPr>
-      <w:bookmarkStart w:id="30" w:name="_Toc221463536"/>
+      <w:bookmarkStart w:id="30" w:name="_Toc223520103"/>
       <w:r>
         <w:t>Player Look Direction and Attention Detection</w:t>
       </w:r>
@@ -7959,10 +8310,12 @@
       <w:pPr>
         <w:pStyle w:val="Heading1"/>
       </w:pPr>
+      <w:bookmarkStart w:id="31" w:name="_Toc223520104"/>
       <w:r>
         <w:lastRenderedPageBreak/>
         <w:t>Results</w:t>
       </w:r>
+      <w:bookmarkEnd w:id="31"/>
     </w:p>
     <w:p>
       <w:pPr>
@@ -7981,10 +8334,12 @@
       <w:pPr>
         <w:pStyle w:val="Heading1"/>
       </w:pPr>
+      <w:bookmarkStart w:id="32" w:name="_Toc223520105"/>
       <w:r>
         <w:lastRenderedPageBreak/>
         <w:t>Critical Evaluation</w:t>
       </w:r>
+      <w:bookmarkEnd w:id="32"/>
     </w:p>
     <w:p>
       <w:pPr>
@@ -8003,34 +8358,215 @@
       <w:pPr>
         <w:pStyle w:val="Heading1"/>
       </w:pPr>
+      <w:bookmarkStart w:id="33" w:name="_Toc223520106"/>
       <w:r>
         <w:lastRenderedPageBreak/>
         <w:t>Conclusions and Future Work</w:t>
       </w:r>
+      <w:bookmarkEnd w:id="33"/>
       <w:r>
         <w:br w:type="page"/>
       </w:r>
     </w:p>
     <w:p>
       <w:pPr>
+        <w:pStyle w:val="Heading1"/>
+      </w:pPr>
+      <w:bookmarkStart w:id="34" w:name="_Toc223520107"/>
+      <w:r>
+        <w:lastRenderedPageBreak/>
+        <w:t>References</w:t>
+      </w:r>
+      <w:bookmarkEnd w:id="34"/>
+    </w:p>
+    <w:p>
+      <w:r>
+        <w:t xml:space="preserve">Cantó-Sancho, N., Porru, S., Casati, S., Ronda, E., Seguí-Crespo, M. and Carta, A. (2023) ‘Prevalence and risk factors of computer vision syndrome—assessed in office workers by a validated questionnaire’. </w:t>
+      </w:r>
+      <w:r>
+        <w:rPr>
+          <w:i/>
+          <w:iCs/>
+        </w:rPr>
+        <w:t>PeerJ</w:t>
+      </w:r>
+      <w:r>
+        <w:t xml:space="preserve"> 11, p. e14937. Available at: https://www.researchgate.net/publication/369002899_Prevalence_and_risk_factors_of_computer_vision_syndrome-assessed_in_office_workers_by_a_validated_questionnaire (Accessed: 20 October 2025).</w:t>
+      </w:r>
+    </w:p>
+    <w:p>
+      <w:r>
+        <w:t xml:space="preserve">Chandrasekhara, R.S., Low, C., Lim, Y., Low, L., Mardina, F. and Nursaleha, M. (2013) ‘Computer vision syndrome: a study of knowledge and practices in university students’. </w:t>
+      </w:r>
+      <w:r>
+        <w:rPr>
+          <w:i/>
+          <w:iCs/>
+        </w:rPr>
+        <w:t>Nepalese Journal of Ophthalmology</w:t>
+      </w:r>
+      <w:r>
+        <w:t xml:space="preserve"> 5, pp. 161–168. Available at: </w:t>
+      </w:r>
+      <w:hyperlink r:id="rId15" w:history="1">
+        <w:r>
+          <w:rPr>
+            <w:rStyle w:val="Hyperlink"/>
+          </w:rPr>
+          <w:t>https://www.nepjol.info/index.php/NEPJOPH/article/view/8707</w:t>
+        </w:r>
+      </w:hyperlink>
+      <w:r>
+        <w:t>.</w:t>
+      </w:r>
+    </w:p>
+    <w:p>
+      <w:r>
+        <w:t xml:space="preserve">Muñoz, E.G., Fabregat, R., Bacca-Acosta, J., Duque-Méndez, N. and Avila-Garzon, C. (2022) ‘Augmented Reality, Virtual Reality, and Game Technologies in Ophthalmology Training’. </w:t>
+      </w:r>
+      <w:r>
+        <w:rPr>
+          <w:i/>
+          <w:iCs/>
+        </w:rPr>
+        <w:t>Information</w:t>
+      </w:r>
+      <w:r>
+        <w:t xml:space="preserve"> 13(5), p. 222. doi: </w:t>
+      </w:r>
+      <w:hyperlink r:id="rId16" w:history="1">
+        <w:r>
+          <w:rPr>
+            <w:rStyle w:val="Hyperlink"/>
+          </w:rPr>
+          <w:t>https://doi.org/10.3390/info13050222</w:t>
+        </w:r>
+      </w:hyperlink>
+      <w:r>
+        <w:t>.</w:t>
+      </w:r>
+    </w:p>
+    <w:p>
+      <w:r>
+        <w:t>Orji, J., Hernandez, A., Selema, B. and Orji, R. (2022) ‘Virtual and augmented reality applications for promoting safety and security: A systematic review’., pp. 1–7. doi: https://doi.org/10.1109/SEGAH54908.2022.9978597.</w:t>
+      </w:r>
+    </w:p>
+    <w:p>
+      <w:r>
+        <w:t xml:space="preserve">Porcar, E., Pons, A. and Lorente, A. (2016) ‘Visual and ocular effects from the use of flat-panel displays’. </w:t>
+      </w:r>
+      <w:r>
+        <w:rPr>
+          <w:i/>
+          <w:iCs/>
+        </w:rPr>
+        <w:t>International journal of ophthalmology</w:t>
+      </w:r>
+      <w:r>
+        <w:t xml:space="preserve"> 9(6), pp. 881–5. Available at: https://pmc.ncbi.nlm.nih.gov/articles/PMC4916147/ (Accessed: 20 October 2025).</w:t>
+      </w:r>
+    </w:p>
+    <w:p>
+      <w:r>
+        <w:t xml:space="preserve">Santilli, T., Ceccacci, S., Mengoni, M. and Catia Giaconi (2025) ‘Virtual vs. traditional learning in higher education: A systematic review of comparative studies’. </w:t>
+      </w:r>
+      <w:r>
+        <w:rPr>
+          <w:i/>
+          <w:iCs/>
+        </w:rPr>
+        <w:t>Computers &amp; Education</w:t>
+      </w:r>
+      <w:r>
+        <w:t xml:space="preserve"> 227(0360-1315), p. 105214. Available at: https://www.sciencedirect.com/science/article/pii/S0360131524002288.</w:t>
+      </w:r>
+    </w:p>
+    <w:p>
+      <w:r>
+        <w:t>Sharma, M., Kumar, P. and Singh, D.K. (2024) ‘The Role of Virtual Reality in Education: A Comprehensive Review of Research and Application’. Available at: https://ieeexplore.ieee.org/document/10406461/authors#authors (Accessed: 21 October 2025).</w:t>
+      </w:r>
+    </w:p>
+    <w:p>
+      <w:r>
+        <w:t xml:space="preserve">Sheppard, A.L. and Wolffsohn, J.S. (2018) ‘Digital eye strain: prevalence, measurement and amelioration’. </w:t>
+      </w:r>
+      <w:r>
+        <w:rPr>
+          <w:i/>
+          <w:iCs/>
+        </w:rPr>
+        <w:t>BMJ Open Ophthalmology</w:t>
+      </w:r>
+      <w:r>
+        <w:t xml:space="preserve"> 3(1), p. e000146. Available at: https://bmjophth.bmj.com/content/3/1/e000146.</w:t>
+      </w:r>
+    </w:p>
+    <w:p>
+      <w:r>
+        <w:t>Vieira, F., Oliveira, E. and Rodrigues, N. (2019) ‘iSVC – digital platform for detection and prevention of computer vision syndrome’., pp. 1–7. doi: https://doi.org/10.1109/SeGAH.2019.8882438.</w:t>
+      </w:r>
+    </w:p>
+    <w:p>
+      <w:r>
+        <w:t xml:space="preserve">Wasswa, W. and Ware, J.A. (2025) ‘A Systematic Literature Review on Virtual Reality Applications in Medical Education’. </w:t>
+      </w:r>
+      <w:r>
+        <w:rPr>
+          <w:i/>
+          <w:iCs/>
+        </w:rPr>
+        <w:t>Annals of Emerging Technologies in Computing</w:t>
+      </w:r>
+      <w:r>
+        <w:t xml:space="preserve"> 9(3), pp. 50–68. doi: https://doi.org/10.33166/aetic.2025.03.004.</w:t>
+      </w:r>
+    </w:p>
+    <w:p>
+      <w:r>
+        <w:t xml:space="preserve">Youcef, B., Ahmad, M.N. and Mustapha, M. (2021) ‘OntoPhaco: An ontology for virtual reality training in ophthalmology Domain—A case study of cataract surgery’. </w:t>
+      </w:r>
+      <w:r>
+        <w:rPr>
+          <w:i/>
+          <w:iCs/>
+        </w:rPr>
+        <w:t>IEEE Access</w:t>
+      </w:r>
+      <w:r>
+        <w:t xml:space="preserve"> 9, pp. 152347–152378. doi: https://doi.org/10.1109/ACCESS.2021.3126697.</w:t>
+      </w:r>
+    </w:p>
+    <w:p/>
+    <w:p>
+      <w:pPr>
+        <w:pStyle w:val="Heading1"/>
+      </w:pPr>
+      <w:bookmarkStart w:id="35" w:name="_Toc223520108"/>
+      <w:r>
+        <w:lastRenderedPageBreak/>
+        <w:t>Appendix</w:t>
+      </w:r>
+      <w:bookmarkEnd w:id="35"/>
+    </w:p>
+    <w:p>
+      <w:pPr>
         <w:pStyle w:val="Heading2"/>
       </w:pPr>
-      <w:bookmarkStart w:id="31" w:name="_Toc221463537"/>
-      <w:r>
-        <w:lastRenderedPageBreak/>
+      <w:bookmarkStart w:id="36" w:name="_Toc223520109"/>
+      <w:r>
         <w:t>Asset Licenses and Sources</w:t>
       </w:r>
-      <w:bookmarkEnd w:id="31"/>
+      <w:bookmarkEnd w:id="36"/>
     </w:p>
     <w:p>
       <w:pPr>
         <w:pStyle w:val="Heading3"/>
       </w:pPr>
-      <w:bookmarkStart w:id="32" w:name="_Toc221463538"/>
+      <w:bookmarkStart w:id="37" w:name="_Toc223520110"/>
       <w:r>
         <w:t>Modern Office Table</w:t>
       </w:r>
-      <w:bookmarkEnd w:id="32"/>
+      <w:bookmarkEnd w:id="37"/>
     </w:p>
     <w:p>
       <w:r>
@@ -8038,7 +8574,7 @@
           <w:noProof/>
         </w:rPr>
         <w:drawing>
-          <wp:inline distT="0" distB="0" distL="0" distR="0" wp14:anchorId="535DEF85" wp14:editId="637B7A6D">
+          <wp:inline distT="0" distB="0" distL="0" distR="0" wp14:anchorId="2A3E66FD" wp14:editId="3701D32C">
             <wp:extent cx="2286000" cy="1508718"/>
             <wp:effectExtent l="0" t="0" r="0" b="0"/>
             <wp:docPr id="1355192844" name="Picture 1"/>
@@ -8053,7 +8589,7 @@
                     <pic:cNvPicPr/>
                   </pic:nvPicPr>
                   <pic:blipFill>
-                    <a:blip r:embed="rId15"/>
+                    <a:blip r:embed="rId17"/>
                     <a:stretch>
                       <a:fillRect/>
                     </a:stretch>
@@ -8078,7 +8614,7 @@
       <w:r>
         <w:t xml:space="preserve">Source: </w:t>
       </w:r>
-      <w:hyperlink r:id="rId16" w:history="1">
+      <w:hyperlink r:id="rId18" w:history="1">
         <w:r>
           <w:rPr>
             <w:rStyle w:val="Hyperlink"/>
@@ -8094,7 +8630,7 @@
       <w:r>
         <w:t xml:space="preserve">License: </w:t>
       </w:r>
-      <w:hyperlink r:id="rId17" w:history="1">
+      <w:hyperlink r:id="rId19" w:history="1">
         <w:r>
           <w:rPr>
             <w:rStyle w:val="Hyperlink"/>
@@ -8110,11 +8646,11 @@
       <w:pPr>
         <w:pStyle w:val="Heading3"/>
       </w:pPr>
-      <w:bookmarkStart w:id="33" w:name="_Toc221463539"/>
+      <w:bookmarkStart w:id="38" w:name="_Toc223520111"/>
       <w:r>
         <w:t>Free Studio Starter Pack</w:t>
       </w:r>
-      <w:bookmarkEnd w:id="33"/>
+      <w:bookmarkEnd w:id="38"/>
     </w:p>
     <w:p>
       <w:r>
@@ -8122,7 +8658,7 @@
           <w:noProof/>
         </w:rPr>
         <w:drawing>
-          <wp:inline distT="0" distB="0" distL="0" distR="0" wp14:anchorId="629A77BA" wp14:editId="21FEF9E8">
+          <wp:inline distT="0" distB="0" distL="0" distR="0" wp14:anchorId="5C0F21F7" wp14:editId="4B96D88C">
             <wp:extent cx="2286786" cy="1743075"/>
             <wp:effectExtent l="0" t="0" r="0" b="0"/>
             <wp:docPr id="612343847" name="Picture 1"/>
@@ -8137,7 +8673,7 @@
                     <pic:cNvPicPr/>
                   </pic:nvPicPr>
                   <pic:blipFill>
-                    <a:blip r:embed="rId18"/>
+                    <a:blip r:embed="rId20"/>
                     <a:stretch>
                       <a:fillRect/>
                     </a:stretch>
@@ -8162,7 +8698,7 @@
       <w:r>
         <w:t xml:space="preserve">Source: </w:t>
       </w:r>
-      <w:hyperlink r:id="rId19" w:history="1">
+      <w:hyperlink r:id="rId21" w:history="1">
         <w:r>
           <w:rPr>
             <w:rStyle w:val="Hyperlink"/>
@@ -8178,7 +8714,7 @@
       <w:r>
         <w:t xml:space="preserve">License: </w:t>
       </w:r>
-      <w:hyperlink r:id="rId20" w:history="1">
+      <w:hyperlink r:id="rId22" w:history="1">
         <w:r>
           <w:rPr>
             <w:rStyle w:val="Hyperlink"/>
@@ -8194,11 +8730,11 @@
       <w:pPr>
         <w:pStyle w:val="Heading3"/>
       </w:pPr>
-      <w:bookmarkStart w:id="34" w:name="_Toc221463540"/>
+      <w:bookmarkStart w:id="39" w:name="_Toc223520112"/>
       <w:r>
         <w:t>General Desktop Bundle</w:t>
       </w:r>
-      <w:bookmarkEnd w:id="34"/>
+      <w:bookmarkEnd w:id="39"/>
     </w:p>
     <w:p>
       <w:r>
@@ -8206,7 +8742,7 @@
           <w:noProof/>
         </w:rPr>
         <w:drawing>
-          <wp:inline distT="0" distB="0" distL="0" distR="0" wp14:anchorId="6D7751CC" wp14:editId="6195D7FA">
+          <wp:inline distT="0" distB="0" distL="0" distR="0" wp14:anchorId="74FE4833" wp14:editId="5A24C875">
             <wp:extent cx="2238375" cy="1888212"/>
             <wp:effectExtent l="0" t="0" r="0" b="0"/>
             <wp:docPr id="804909220" name="Picture 1"/>
@@ -8221,7 +8757,7 @@
                     <pic:cNvPicPr/>
                   </pic:nvPicPr>
                   <pic:blipFill>
-                    <a:blip r:embed="rId21"/>
+                    <a:blip r:embed="rId23"/>
                     <a:stretch>
                       <a:fillRect/>
                     </a:stretch>
@@ -8246,7 +8782,7 @@
       <w:r>
         <w:t xml:space="preserve">Source: </w:t>
       </w:r>
-      <w:hyperlink r:id="rId22" w:history="1">
+      <w:hyperlink r:id="rId24" w:history="1">
         <w:r>
           <w:rPr>
             <w:rStyle w:val="Hyperlink"/>
@@ -8262,7 +8798,7 @@
       <w:r>
         <w:t xml:space="preserve">License: </w:t>
       </w:r>
-      <w:hyperlink r:id="rId23" w:history="1">
+      <w:hyperlink r:id="rId25" w:history="1">
         <w:r>
           <w:rPr>
             <w:rStyle w:val="Hyperlink"/>
@@ -8278,12 +8814,12 @@
       <w:pPr>
         <w:pStyle w:val="Heading3"/>
       </w:pPr>
-      <w:bookmarkStart w:id="35" w:name="_Toc221463541"/>
+      <w:bookmarkStart w:id="40" w:name="_Toc223520113"/>
       <w:r>
         <w:lastRenderedPageBreak/>
         <w:t>General Gaming Headset</w:t>
       </w:r>
-      <w:bookmarkEnd w:id="35"/>
+      <w:bookmarkEnd w:id="40"/>
     </w:p>
     <w:p>
       <w:r>
@@ -8291,7 +8827,7 @@
           <w:noProof/>
         </w:rPr>
         <w:drawing>
-          <wp:inline distT="0" distB="0" distL="0" distR="0" wp14:anchorId="47BEA535" wp14:editId="135AAF43">
+          <wp:inline distT="0" distB="0" distL="0" distR="0" wp14:anchorId="502B1B20" wp14:editId="20BC86AD">
             <wp:extent cx="1590675" cy="1997181"/>
             <wp:effectExtent l="0" t="0" r="0" b="3175"/>
             <wp:docPr id="372541616" name="Picture 1"/>
@@ -8306,7 +8842,7 @@
                     <pic:cNvPicPr/>
                   </pic:nvPicPr>
                   <pic:blipFill>
-                    <a:blip r:embed="rId24"/>
+                    <a:blip r:embed="rId26"/>
                     <a:stretch>
                       <a:fillRect/>
                     </a:stretch>
@@ -8331,7 +8867,7 @@
       <w:r>
         <w:t xml:space="preserve">Source: </w:t>
       </w:r>
-      <w:hyperlink r:id="rId25" w:history="1">
+      <w:hyperlink r:id="rId27" w:history="1">
         <w:r>
           <w:rPr>
             <w:rStyle w:val="Hyperlink"/>
@@ -8347,7 +8883,7 @@
       <w:r>
         <w:t xml:space="preserve">License: </w:t>
       </w:r>
-      <w:hyperlink r:id="rId26" w:history="1">
+      <w:hyperlink r:id="rId28" w:history="1">
         <w:r>
           <w:rPr>
             <w:rStyle w:val="Hyperlink"/>
@@ -8363,11 +8899,11 @@
       <w:pPr>
         <w:pStyle w:val="Heading3"/>
       </w:pPr>
-      <w:bookmarkStart w:id="36" w:name="_Toc221463542"/>
+      <w:bookmarkStart w:id="41" w:name="_Toc223520114"/>
       <w:r>
         <w:t>General Gaming Chair</w:t>
       </w:r>
-      <w:bookmarkEnd w:id="36"/>
+      <w:bookmarkEnd w:id="41"/>
     </w:p>
     <w:p>
       <w:r>
@@ -8375,7 +8911,7 @@
           <w:noProof/>
         </w:rPr>
         <w:drawing>
-          <wp:inline distT="0" distB="0" distL="0" distR="0" wp14:anchorId="5CF71E70" wp14:editId="52387E56">
+          <wp:inline distT="0" distB="0" distL="0" distR="0" wp14:anchorId="7B874B79" wp14:editId="10675CBE">
             <wp:extent cx="1266825" cy="1944883"/>
             <wp:effectExtent l="0" t="0" r="0" b="0"/>
             <wp:docPr id="272120467" name="Picture 1"/>
@@ -8390,7 +8926,7 @@
                     <pic:cNvPicPr/>
                   </pic:nvPicPr>
                   <pic:blipFill>
-                    <a:blip r:embed="rId27"/>
+                    <a:blip r:embed="rId29"/>
                     <a:stretch>
                       <a:fillRect/>
                     </a:stretch>
@@ -8415,7 +8951,7 @@
       <w:r>
         <w:t xml:space="preserve">Source: </w:t>
       </w:r>
-      <w:hyperlink r:id="rId28" w:history="1">
+      <w:hyperlink r:id="rId30" w:history="1">
         <w:r>
           <w:rPr>
             <w:rStyle w:val="Hyperlink"/>
@@ -8431,7 +8967,7 @@
       <w:r>
         <w:t xml:space="preserve">License: </w:t>
       </w:r>
-      <w:hyperlink r:id="rId29" w:history="1">
+      <w:hyperlink r:id="rId31" w:history="1">
         <w:r>
           <w:rPr>
             <w:rStyle w:val="Hyperlink"/>
@@ -8447,11 +8983,11 @@
       <w:pPr>
         <w:pStyle w:val="Heading3"/>
       </w:pPr>
-      <w:bookmarkStart w:id="37" w:name="_Toc221463543"/>
+      <w:bookmarkStart w:id="42" w:name="_Toc223520115"/>
       <w:r>
         <w:t>Light Switch</w:t>
       </w:r>
-      <w:bookmarkEnd w:id="37"/>
+      <w:bookmarkEnd w:id="42"/>
     </w:p>
     <w:p>
       <w:r>
@@ -8459,7 +8995,7 @@
           <w:noProof/>
         </w:rPr>
         <w:drawing>
-          <wp:inline distT="0" distB="0" distL="0" distR="0" wp14:anchorId="407BDF3F" wp14:editId="2FBA1014">
+          <wp:inline distT="0" distB="0" distL="0" distR="0" wp14:anchorId="685D9B32" wp14:editId="6A17B384">
             <wp:extent cx="1464864" cy="1276710"/>
             <wp:effectExtent l="0" t="0" r="2540" b="0"/>
             <wp:docPr id="949745922" name="Picture 1"/>
@@ -8474,7 +9010,7 @@
                     <pic:cNvPicPr/>
                   </pic:nvPicPr>
                   <pic:blipFill rotWithShape="1">
-                    <a:blip r:embed="rId30"/>
+                    <a:blip r:embed="rId32"/>
                     <a:srcRect t="23971" b="7788"/>
                     <a:stretch>
                       <a:fillRect/>
@@ -8511,7 +9047,7 @@
       <w:r>
         <w:t xml:space="preserve"> </w:t>
       </w:r>
-      <w:hyperlink r:id="rId31" w:history="1">
+      <w:hyperlink r:id="rId33" w:history="1">
         <w:r>
           <w:rPr>
             <w:rStyle w:val="Hyperlink"/>
@@ -8527,7 +9063,7 @@
       <w:r>
         <w:t xml:space="preserve">License: </w:t>
       </w:r>
-      <w:hyperlink r:id="rId32" w:history="1">
+      <w:hyperlink r:id="rId34" w:history="1">
         <w:r>
           <w:rPr>
             <w:rStyle w:val="Hyperlink"/>
@@ -8545,18 +9081,18 @@
       <w:pPr>
         <w:pStyle w:val="Heading3"/>
       </w:pPr>
-      <w:bookmarkStart w:id="38" w:name="_Toc221463544"/>
+      <w:bookmarkStart w:id="43" w:name="_Toc223520116"/>
       <w:r>
         <w:lastRenderedPageBreak/>
         <w:t>Materials for General PC setup</w:t>
       </w:r>
-      <w:bookmarkEnd w:id="38"/>
+      <w:bookmarkEnd w:id="43"/>
     </w:p>
     <w:p>
       <w:r>
         <w:t xml:space="preserve">Source: </w:t>
       </w:r>
-      <w:hyperlink r:id="rId33" w:history="1">
+      <w:hyperlink r:id="rId35" w:history="1">
         <w:r>
           <w:rPr>
             <w:rStyle w:val="Hyperlink"/>
@@ -8570,12 +9106,9 @@
     </w:p>
     <w:p>
       <w:r>
-        <w:t>License:</w:t>
-      </w:r>
-      <w:r>
-        <w:t xml:space="preserve"> </w:t>
-      </w:r>
-      <w:hyperlink r:id="rId34" w:history="1">
+        <w:t xml:space="preserve">License: </w:t>
+      </w:r>
+      <w:hyperlink r:id="rId36" w:history="1">
         <w:r>
           <w:rPr>
             <w:rStyle w:val="Hyperlink"/>
@@ -8593,7 +9126,7 @@
           <w:noProof/>
         </w:rPr>
         <w:drawing>
-          <wp:inline distT="0" distB="0" distL="0" distR="0" wp14:anchorId="61755FB4" wp14:editId="5E3A0CDB">
+          <wp:inline distT="0" distB="0" distL="0" distR="0" wp14:anchorId="2A4EAD70" wp14:editId="27607D67">
             <wp:extent cx="4143375" cy="1769174"/>
             <wp:effectExtent l="0" t="0" r="0" b="2540"/>
             <wp:docPr id="1781374647" name="Picture 1"/>
@@ -8608,7 +9141,7 @@
                     <pic:cNvPicPr/>
                   </pic:nvPicPr>
                   <pic:blipFill>
-                    <a:blip r:embed="rId35"/>
+                    <a:blip r:embed="rId37"/>
                     <a:stretch>
                       <a:fillRect/>
                     </a:stretch>
@@ -8635,7 +9168,7 @@
           <w:noProof/>
         </w:rPr>
         <w:drawing>
-          <wp:inline distT="0" distB="0" distL="0" distR="0" wp14:anchorId="3A4F43F6" wp14:editId="66BC3461">
+          <wp:inline distT="0" distB="0" distL="0" distR="0" wp14:anchorId="3BB7987B" wp14:editId="0D618C24">
             <wp:extent cx="4152900" cy="5861733"/>
             <wp:effectExtent l="0" t="0" r="0" b="5715"/>
             <wp:docPr id="1148008169" name="Picture 1"/>
@@ -8650,7 +9183,7 @@
                     <pic:cNvPicPr/>
                   </pic:nvPicPr>
                   <pic:blipFill>
-                    <a:blip r:embed="rId36"/>
+                    <a:blip r:embed="rId38"/>
                     <a:stretch>
                       <a:fillRect/>
                     </a:stretch>
@@ -8675,12 +9208,12 @@
       <w:pPr>
         <w:pStyle w:val="Heading3"/>
       </w:pPr>
-      <w:bookmarkStart w:id="39" w:name="_Toc221463545"/>
+      <w:bookmarkStart w:id="44" w:name="_Toc223520117"/>
       <w:r>
         <w:lastRenderedPageBreak/>
         <w:t>Monitor background image</w:t>
       </w:r>
-      <w:bookmarkEnd w:id="39"/>
+      <w:bookmarkEnd w:id="44"/>
     </w:p>
     <w:p>
       <w:r>
@@ -8693,7 +9226,7 @@
           <w:noProof/>
         </w:rPr>
         <w:drawing>
-          <wp:inline distT="0" distB="0" distL="0" distR="0" wp14:anchorId="5004D115" wp14:editId="387CB04F">
+          <wp:inline distT="0" distB="0" distL="0" distR="0" wp14:anchorId="7249F24E" wp14:editId="19E18124">
             <wp:extent cx="5400675" cy="4993799"/>
             <wp:effectExtent l="0" t="0" r="0" b="0"/>
             <wp:docPr id="507242303" name="Picture 1"/>
@@ -8708,7 +9241,7 @@
                     <pic:cNvPicPr/>
                   </pic:nvPicPr>
                   <pic:blipFill>
-                    <a:blip r:embed="rId37"/>
+                    <a:blip r:embed="rId39"/>
                     <a:stretch>
                       <a:fillRect/>
                     </a:stretch>
@@ -8733,7 +9266,7 @@
       <w:r>
         <w:t xml:space="preserve">Source: </w:t>
       </w:r>
-      <w:hyperlink r:id="rId38" w:history="1">
+      <w:hyperlink r:id="rId40" w:history="1">
         <w:r>
           <w:rPr>
             <w:rStyle w:val="Hyperlink"/>
@@ -8749,7 +9282,7 @@
       <w:r>
         <w:t xml:space="preserve">License: </w:t>
       </w:r>
-      <w:hyperlink r:id="rId39" w:history="1">
+      <w:hyperlink r:id="rId41" w:history="1">
         <w:r>
           <w:rPr>
             <w:rStyle w:val="Hyperlink"/>
@@ -8771,25 +9304,12 @@
       <w:pPr>
         <w:pStyle w:val="Heading3"/>
       </w:pPr>
-      <w:bookmarkStart w:id="40" w:name="_Toc221463546"/>
+      <w:bookmarkStart w:id="45" w:name="_Toc223520118"/>
       <w:r>
         <w:lastRenderedPageBreak/>
-        <w:t xml:space="preserve">Button Hover </w:t>
-      </w:r>
-      <w:proofErr w:type="spellStart"/>
-      <w:r>
-        <w:t>Sfx</w:t>
-      </w:r>
-      <w:proofErr w:type="spellEnd"/>
-      <w:r>
-        <w:t xml:space="preserve"> by </w:t>
-      </w:r>
-      <w:proofErr w:type="spellStart"/>
-      <w:r>
-        <w:t>Fachii</w:t>
-      </w:r>
-      <w:bookmarkEnd w:id="40"/>
-      <w:proofErr w:type="spellEnd"/>
+        <w:t>Button Hover Sfx by Fachii</w:t>
+      </w:r>
+      <w:bookmarkEnd w:id="45"/>
     </w:p>
     <w:p>
       <w:r>
@@ -8797,11 +9317,11 @@
           <w:noProof/>
         </w:rPr>
         <w:drawing>
-          <wp:inline distT="0" distB="0" distL="0" distR="0" wp14:anchorId="19F49ED3" wp14:editId="178B41E2">
+          <wp:inline distT="0" distB="0" distL="0" distR="0" wp14:anchorId="7B23FDA5" wp14:editId="2EC68C4B">
             <wp:extent cx="5731510" cy="2659380"/>
             <wp:effectExtent l="0" t="0" r="2540" b="7620"/>
             <wp:docPr id="1819945004" name="Picture 2" descr="Image">
-              <a:hlinkClick xmlns:a="http://schemas.openxmlformats.org/drawingml/2006/main" r:id="rId40" tgtFrame="&quot;_blank&quot;"/>
+              <a:hlinkClick xmlns:a="http://schemas.openxmlformats.org/drawingml/2006/main" r:id="rId42" tgtFrame="&quot;_blank&quot;"/>
             </wp:docPr>
             <wp:cNvGraphicFramePr>
               <a:graphicFrameLocks xmlns:a="http://schemas.openxmlformats.org/drawingml/2006/main" noChangeAspect="1"/>
@@ -8811,14 +9331,14 @@
                 <pic:pic xmlns:pic="http://schemas.openxmlformats.org/drawingml/2006/picture">
                   <pic:nvPicPr>
                     <pic:cNvPr id="0" name="Picture 6" descr="Image">
-                      <a:hlinkClick r:id="rId40" tgtFrame="&quot;_blank&quot;"/>
+                      <a:hlinkClick r:id="rId42" tgtFrame="&quot;_blank&quot;"/>
                     </pic:cNvPr>
                     <pic:cNvPicPr>
                       <a:picLocks noChangeAspect="1" noChangeArrowheads="1"/>
                     </pic:cNvPicPr>
                   </pic:nvPicPr>
                   <pic:blipFill>
-                    <a:blip r:embed="rId41">
+                    <a:blip r:embed="rId43">
                       <a:extLst>
                         <a:ext uri="{28A0092B-C50C-407E-A947-70E740481C1C}">
                           <a14:useLocalDpi xmlns:a14="http://schemas.microsoft.com/office/drawing/2010/main" val="0"/>
@@ -8857,7 +9377,7 @@
       <w:r>
         <w:t> </w:t>
       </w:r>
-      <w:hyperlink r:id="rId42" w:history="1">
+      <w:hyperlink r:id="rId44" w:history="1">
         <w:r>
           <w:rPr>
             <w:rStyle w:val="Hyperlink"/>
@@ -8873,7 +9393,7 @@
       <w:r>
         <w:t xml:space="preserve"> </w:t>
       </w:r>
-      <w:hyperlink r:id="rId43" w:history="1">
+      <w:hyperlink r:id="rId45" w:history="1">
         <w:r>
           <w:rPr>
             <w:rStyle w:val="Hyperlink"/>
@@ -8884,36 +9404,14 @@
     </w:p>
     <w:p/>
     <w:p>
-      <w:bookmarkStart w:id="41" w:name="_Toc221463547"/>
+      <w:bookmarkStart w:id="46" w:name="_Toc223520119"/>
       <w:r>
         <w:rPr>
           <w:rStyle w:val="Heading3Char"/>
         </w:rPr>
-        <w:t xml:space="preserve">Button click </w:t>
-      </w:r>
-      <w:proofErr w:type="spellStart"/>
-      <w:r>
-        <w:rPr>
-          <w:rStyle w:val="Heading3Char"/>
-        </w:rPr>
-        <w:t>Sfx</w:t>
-      </w:r>
-      <w:proofErr w:type="spellEnd"/>
-      <w:r>
-        <w:rPr>
-          <w:rStyle w:val="Heading3Char"/>
-        </w:rPr>
-        <w:t xml:space="preserve"> by </w:t>
-      </w:r>
-      <w:proofErr w:type="spellStart"/>
-      <w:r>
-        <w:rPr>
-          <w:rStyle w:val="Heading3Char"/>
-        </w:rPr>
-        <w:t>AndrewEathan</w:t>
-      </w:r>
-      <w:bookmarkEnd w:id="41"/>
-      <w:proofErr w:type="spellEnd"/>
+        <w:t>Button click Sfx by AndrewEathan</w:t>
+      </w:r>
+      <w:bookmarkEnd w:id="46"/>
       <w:r>
         <w:t xml:space="preserve"> </w:t>
       </w:r>
@@ -8922,11 +9420,11 @@
           <w:noProof/>
         </w:rPr>
         <w:drawing>
-          <wp:inline distT="0" distB="0" distL="0" distR="0" wp14:anchorId="345485AC" wp14:editId="2DC414B4">
+          <wp:inline distT="0" distB="0" distL="0" distR="0" wp14:anchorId="1200DBB6" wp14:editId="45F98D03">
             <wp:extent cx="5731510" cy="2298065"/>
             <wp:effectExtent l="0" t="0" r="2540" b="6985"/>
             <wp:docPr id="1391107064" name="Picture 4" descr="Image">
-              <a:hlinkClick xmlns:a="http://schemas.openxmlformats.org/drawingml/2006/main" r:id="rId44" tgtFrame="&quot;_blank&quot;"/>
+              <a:hlinkClick xmlns:a="http://schemas.openxmlformats.org/drawingml/2006/main" r:id="rId46" tgtFrame="&quot;_blank&quot;"/>
             </wp:docPr>
             <wp:cNvGraphicFramePr>
               <a:graphicFrameLocks xmlns:a="http://schemas.openxmlformats.org/drawingml/2006/main" noChangeAspect="1"/>
@@ -8936,14 +9434,14 @@
                 <pic:pic xmlns:pic="http://schemas.openxmlformats.org/drawingml/2006/picture">
                   <pic:nvPicPr>
                     <pic:cNvPr id="0" name="Picture 13" descr="Image">
-                      <a:hlinkClick r:id="rId44" tgtFrame="&quot;_blank&quot;"/>
+                      <a:hlinkClick r:id="rId46" tgtFrame="&quot;_blank&quot;"/>
                     </pic:cNvPr>
                     <pic:cNvPicPr>
                       <a:picLocks noChangeAspect="1" noChangeArrowheads="1"/>
                     </pic:cNvPicPr>
                   </pic:nvPicPr>
                   <pic:blipFill>
-                    <a:blip r:embed="rId45">
+                    <a:blip r:embed="rId47">
                       <a:extLst>
                         <a:ext uri="{28A0092B-C50C-407E-A947-70E740481C1C}">
                           <a14:useLocalDpi xmlns:a14="http://schemas.microsoft.com/office/drawing/2010/main" val="0"/>
@@ -8980,7 +9478,7 @@
       <w:r>
         <w:t> </w:t>
       </w:r>
-      <w:hyperlink r:id="rId46" w:history="1">
+      <w:hyperlink r:id="rId48" w:history="1">
         <w:r>
           <w:rPr>
             <w:rStyle w:val="Hyperlink"/>
@@ -8991,68 +9489,6 @@
     </w:p>
     <w:p>
       <w:r>
-        <w:t>License: </w:t>
-      </w:r>
-      <w:hyperlink r:id="rId47" w:history="1">
-        <w:r>
-          <w:rPr>
-            <w:rStyle w:val="Hyperlink"/>
-          </w:rPr>
-          <w:t>http://creativecommons.org/publicdomain/zero/1.0/</w:t>
-        </w:r>
-      </w:hyperlink>
-    </w:p>
-    <w:p>
-      <w:pPr>
-        <w:rPr>
-          <w:rFonts w:eastAsiaTheme="majorEastAsia" w:cstheme="majorBidi"/>
-          <w:color w:val="0F4761" w:themeColor="accent1" w:themeShade="BF"/>
-          <w:sz w:val="28"/>
-          <w:szCs w:val="28"/>
-        </w:rPr>
-      </w:pPr>
-      <w:r>
-        <w:br w:type="page"/>
-      </w:r>
-    </w:p>
-    <w:p>
-      <w:pPr>
-        <w:pStyle w:val="Heading3"/>
-      </w:pPr>
-      <w:bookmarkStart w:id="42" w:name="_Toc221463548"/>
-      <w:r>
-        <w:lastRenderedPageBreak/>
-        <w:t xml:space="preserve">Light Switch </w:t>
-      </w:r>
-      <w:proofErr w:type="gramStart"/>
-      <w:r>
-        <w:t>On</w:t>
-      </w:r>
-      <w:proofErr w:type="gramEnd"/>
-      <w:r>
-        <w:t xml:space="preserve"> </w:t>
-      </w:r>
-      <w:proofErr w:type="spellStart"/>
-      <w:r>
-        <w:t>Sfx</w:t>
-      </w:r>
-      <w:bookmarkEnd w:id="42"/>
-      <w:proofErr w:type="spellEnd"/>
-    </w:p>
-    <w:p>
-      <w:r>
-        <w:t>Source: </w:t>
-      </w:r>
-      <w:hyperlink r:id="rId48" w:history="1">
-        <w:r>
-          <w:rPr>
-            <w:rStyle w:val="Hyperlink"/>
-          </w:rPr>
-          <w:t>https://freesound.org/people/tbrook/sounds/348224/</w:t>
-        </w:r>
-      </w:hyperlink>
-      <w:r>
-        <w:br/>
         <w:t>License: </w:t>
       </w:r>
       <w:hyperlink r:id="rId49" w:history="1">
@@ -9065,16 +9501,65 @@
       </w:hyperlink>
     </w:p>
     <w:p>
+      <w:pPr>
+        <w:rPr>
+          <w:rFonts w:eastAsiaTheme="majorEastAsia" w:cstheme="majorBidi"/>
+          <w:color w:val="0F4761" w:themeColor="accent1" w:themeShade="BF"/>
+          <w:sz w:val="28"/>
+          <w:szCs w:val="28"/>
+        </w:rPr>
+      </w:pPr>
+      <w:r>
+        <w:br w:type="page"/>
+      </w:r>
+    </w:p>
+    <w:p>
+      <w:pPr>
+        <w:pStyle w:val="Heading3"/>
+      </w:pPr>
+      <w:bookmarkStart w:id="47" w:name="_Toc223520120"/>
+      <w:r>
+        <w:lastRenderedPageBreak/>
+        <w:t>Light Switch On Sfx</w:t>
+      </w:r>
+      <w:bookmarkEnd w:id="47"/>
+    </w:p>
+    <w:p>
+      <w:r>
+        <w:t>Source: </w:t>
+      </w:r>
+      <w:hyperlink r:id="rId50" w:history="1">
+        <w:r>
+          <w:rPr>
+            <w:rStyle w:val="Hyperlink"/>
+          </w:rPr>
+          <w:t>https://freesound.org/people/tbrook/sounds/348224/</w:t>
+        </w:r>
+      </w:hyperlink>
+      <w:r>
+        <w:br/>
+        <w:t>License: </w:t>
+      </w:r>
+      <w:hyperlink r:id="rId51" w:history="1">
+        <w:r>
+          <w:rPr>
+            <w:rStyle w:val="Hyperlink"/>
+          </w:rPr>
+          <w:t>http://creativecommons.org/publicdomain/zero/1.0/</w:t>
+        </w:r>
+      </w:hyperlink>
+    </w:p>
+    <w:p>
       <w:r>
         <w:rPr>
           <w:noProof/>
         </w:rPr>
         <w:drawing>
-          <wp:inline distT="0" distB="0" distL="0" distR="0" wp14:anchorId="7F3C9F5A" wp14:editId="68B21188">
+          <wp:inline distT="0" distB="0" distL="0" distR="0" wp14:anchorId="11A39943" wp14:editId="4C3B6BC4">
             <wp:extent cx="5731510" cy="2829560"/>
             <wp:effectExtent l="0" t="0" r="2540" b="8890"/>
             <wp:docPr id="300778054" name="Picture 2" descr="Image">
-              <a:hlinkClick xmlns:a="http://schemas.openxmlformats.org/drawingml/2006/main" r:id="rId50" tgtFrame="&quot;_blank&quot;"/>
+              <a:hlinkClick xmlns:a="http://schemas.openxmlformats.org/drawingml/2006/main" r:id="rId52" tgtFrame="&quot;_blank&quot;"/>
             </wp:docPr>
             <wp:cNvGraphicFramePr>
               <a:graphicFrameLocks xmlns:a="http://schemas.openxmlformats.org/drawingml/2006/main" noChangeAspect="1"/>
@@ -9084,14 +9569,14 @@
                 <pic:pic xmlns:pic="http://schemas.openxmlformats.org/drawingml/2006/picture">
                   <pic:nvPicPr>
                     <pic:cNvPr id="0" name="Picture 6" descr="Image">
-                      <a:hlinkClick r:id="rId50" tgtFrame="&quot;_blank&quot;"/>
+                      <a:hlinkClick r:id="rId52" tgtFrame="&quot;_blank&quot;"/>
                     </pic:cNvPr>
                     <pic:cNvPicPr>
                       <a:picLocks noChangeAspect="1" noChangeArrowheads="1"/>
                     </pic:cNvPicPr>
                   </pic:nvPicPr>
                   <pic:blipFill>
-                    <a:blip r:embed="rId51">
+                    <a:blip r:embed="rId53">
                       <a:extLst>
                         <a:ext uri="{28A0092B-C50C-407E-A947-70E740481C1C}">
                           <a14:useLocalDpi xmlns:a14="http://schemas.microsoft.com/office/drawing/2010/main" val="0"/>
@@ -9127,22 +9612,17 @@
       <w:pPr>
         <w:pStyle w:val="Heading3"/>
       </w:pPr>
-      <w:bookmarkStart w:id="43" w:name="_Toc221463549"/>
-      <w:r>
-        <w:t xml:space="preserve">Light Switch Off </w:t>
-      </w:r>
-      <w:proofErr w:type="spellStart"/>
-      <w:r>
-        <w:t>Sfx</w:t>
-      </w:r>
-      <w:bookmarkEnd w:id="43"/>
-      <w:proofErr w:type="spellEnd"/>
+      <w:bookmarkStart w:id="48" w:name="_Toc223520121"/>
+      <w:r>
+        <w:t>Light Switch Off Sfx</w:t>
+      </w:r>
+      <w:bookmarkEnd w:id="48"/>
     </w:p>
     <w:p>
       <w:r>
         <w:t>Source: </w:t>
       </w:r>
-      <w:hyperlink r:id="rId52" w:history="1">
+      <w:hyperlink r:id="rId54" w:history="1">
         <w:r>
           <w:rPr>
             <w:rStyle w:val="Hyperlink"/>
@@ -9154,7 +9634,7 @@
         <w:br/>
         <w:t>License: </w:t>
       </w:r>
-      <w:hyperlink r:id="rId53" w:history="1">
+      <w:hyperlink r:id="rId55" w:history="1">
         <w:r>
           <w:rPr>
             <w:rStyle w:val="Hyperlink"/>
@@ -9169,11 +9649,11 @@
           <w:noProof/>
         </w:rPr>
         <w:drawing>
-          <wp:inline distT="0" distB="0" distL="0" distR="0" wp14:anchorId="301ACC80" wp14:editId="04062D87">
+          <wp:inline distT="0" distB="0" distL="0" distR="0" wp14:anchorId="1EA22289" wp14:editId="4D139D90">
             <wp:extent cx="5731510" cy="2783840"/>
             <wp:effectExtent l="0" t="0" r="2540" b="0"/>
             <wp:docPr id="1261778138" name="Picture 4" descr="Image">
-              <a:hlinkClick xmlns:a="http://schemas.openxmlformats.org/drawingml/2006/main" r:id="rId54" tgtFrame="&quot;_blank&quot;"/>
+              <a:hlinkClick xmlns:a="http://schemas.openxmlformats.org/drawingml/2006/main" r:id="rId56" tgtFrame="&quot;_blank&quot;"/>
             </wp:docPr>
             <wp:cNvGraphicFramePr>
               <a:graphicFrameLocks xmlns:a="http://schemas.openxmlformats.org/drawingml/2006/main" noChangeAspect="1"/>
@@ -9183,14 +9663,14 @@
                 <pic:pic xmlns:pic="http://schemas.openxmlformats.org/drawingml/2006/picture">
                   <pic:nvPicPr>
                     <pic:cNvPr id="0" name="Picture 13" descr="Image">
-                      <a:hlinkClick r:id="rId54" tgtFrame="&quot;_blank&quot;"/>
+                      <a:hlinkClick r:id="rId56" tgtFrame="&quot;_blank&quot;"/>
                     </pic:cNvPr>
                     <pic:cNvPicPr>
                       <a:picLocks noChangeAspect="1" noChangeArrowheads="1"/>
                     </pic:cNvPicPr>
                   </pic:nvPicPr>
                   <pic:blipFill>
-                    <a:blip r:embed="rId55">
+                    <a:blip r:embed="rId57">
                       <a:extLst>
                         <a:ext uri="{28A0092B-C50C-407E-A947-70E740481C1C}">
                           <a14:useLocalDpi xmlns:a14="http://schemas.microsoft.com/office/drawing/2010/main" val="0"/>
@@ -9223,303 +9703,6 @@
       </w:r>
     </w:p>
     <w:p/>
-    <w:p>
-      <w:r>
-        <w:br w:type="page"/>
-      </w:r>
-    </w:p>
-    <w:p>
-      <w:pPr>
-        <w:pStyle w:val="Heading1"/>
-      </w:pPr>
-      <w:bookmarkStart w:id="44" w:name="_Toc221463550"/>
-      <w:r>
-        <w:lastRenderedPageBreak/>
-        <w:t>References</w:t>
-      </w:r>
-      <w:bookmarkEnd w:id="44"/>
-    </w:p>
-    <w:p>
-      <w:proofErr w:type="spellStart"/>
-      <w:r>
-        <w:t>Cantó</w:t>
-      </w:r>
-      <w:proofErr w:type="spellEnd"/>
-      <w:r>
-        <w:t xml:space="preserve">-Sancho, N., </w:t>
-      </w:r>
-      <w:proofErr w:type="spellStart"/>
-      <w:r>
-        <w:t>Porru</w:t>
-      </w:r>
-      <w:proofErr w:type="spellEnd"/>
-      <w:r>
-        <w:t xml:space="preserve">, S., Casati, S., Ronda, E., Seguí-Crespo, M. and Carta, A. (2023) ‘Prevalence and risk factors of computer vision syndrome—assessed in office workers by a validated questionnaire’. </w:t>
-      </w:r>
-      <w:proofErr w:type="spellStart"/>
-      <w:r>
-        <w:rPr>
-          <w:i/>
-          <w:iCs/>
-        </w:rPr>
-        <w:t>PeerJ</w:t>
-      </w:r>
-      <w:proofErr w:type="spellEnd"/>
-      <w:r>
-        <w:t xml:space="preserve"> 11, p. e14937. Available at: https://www.researchgate.net/publication/369002899_Prevalence_and_risk_factors_of_computer_vision_syndrome-assessed_in_office_workers_by_a_validated_questionnaire (Accessed: 20 October 2025).</w:t>
-      </w:r>
-    </w:p>
-    <w:p>
-      <w:r>
-        <w:t xml:space="preserve">Chandrasekhara, R.S., Low, C., Lim, Y., Low, L., Mardina, F. and </w:t>
-      </w:r>
-      <w:proofErr w:type="spellStart"/>
-      <w:r>
-        <w:t>Nursaleha</w:t>
-      </w:r>
-      <w:proofErr w:type="spellEnd"/>
-      <w:r>
-        <w:t xml:space="preserve">, M. (2013) ‘Computer vision syndrome: a study of knowledge and practices in university </w:t>
-      </w:r>
-      <w:proofErr w:type="gramStart"/>
-      <w:r>
-        <w:t>students’</w:t>
-      </w:r>
-      <w:proofErr w:type="gramEnd"/>
-      <w:r>
-        <w:t xml:space="preserve">. </w:t>
-      </w:r>
-      <w:r>
-        <w:rPr>
-          <w:i/>
-          <w:iCs/>
-        </w:rPr>
-        <w:t>Nepalese Journal of Ophthalmology</w:t>
-      </w:r>
-      <w:r>
-        <w:t xml:space="preserve"> 5, pp. 161–168. Available at: </w:t>
-      </w:r>
-      <w:hyperlink r:id="rId56" w:history="1">
-        <w:r>
-          <w:rPr>
-            <w:rStyle w:val="Hyperlink"/>
-          </w:rPr>
-          <w:t>https://www.nepjol.info/index.php/NEPJOPH/article/view/8707</w:t>
-        </w:r>
-      </w:hyperlink>
-      <w:r>
-        <w:t>.</w:t>
-      </w:r>
-    </w:p>
-    <w:p>
-      <w:r>
-        <w:t xml:space="preserve">Muñoz, E.G., </w:t>
-      </w:r>
-      <w:proofErr w:type="spellStart"/>
-      <w:r>
-        <w:t>Fabregat</w:t>
-      </w:r>
-      <w:proofErr w:type="spellEnd"/>
-      <w:r>
-        <w:t xml:space="preserve">, R., Bacca-Acosta, J., Duque-Méndez, N. and Avila-Garzon, C. (2022) ‘Augmented Reality, Virtual Reality, and Game Technologies in Ophthalmology Training’. </w:t>
-      </w:r>
-      <w:r>
-        <w:rPr>
-          <w:i/>
-          <w:iCs/>
-        </w:rPr>
-        <w:t>Information</w:t>
-      </w:r>
-      <w:r>
-        <w:t xml:space="preserve"> 13(5), p. 222. </w:t>
-      </w:r>
-      <w:proofErr w:type="spellStart"/>
-      <w:r>
-        <w:t>doi</w:t>
-      </w:r>
-      <w:proofErr w:type="spellEnd"/>
-      <w:r>
-        <w:t xml:space="preserve">: </w:t>
-      </w:r>
-      <w:hyperlink r:id="rId57" w:history="1">
-        <w:r>
-          <w:rPr>
-            <w:rStyle w:val="Hyperlink"/>
-          </w:rPr>
-          <w:t>https://doi.org/10.3390/info13050222</w:t>
-        </w:r>
-      </w:hyperlink>
-      <w:r>
-        <w:t>.</w:t>
-      </w:r>
-    </w:p>
-    <w:p>
-      <w:r>
-        <w:t xml:space="preserve">Orji, J., Hernandez, A., Selema, B. and Orji, R. (2022) ‘Virtual and augmented reality applications for promoting safety and security: A systematic review’., pp. 1–7. </w:t>
-      </w:r>
-      <w:proofErr w:type="spellStart"/>
-      <w:r>
-        <w:t>doi</w:t>
-      </w:r>
-      <w:proofErr w:type="spellEnd"/>
-      <w:r>
-        <w:t>: https://doi.org/10.1109/SEGAH54908.2022.9978597.</w:t>
-      </w:r>
-    </w:p>
-    <w:p>
-      <w:proofErr w:type="spellStart"/>
-      <w:r>
-        <w:t>Porcar</w:t>
-      </w:r>
-      <w:proofErr w:type="spellEnd"/>
-      <w:r>
-        <w:t xml:space="preserve">, E., Pons, A. and Lorente, A. (2016) ‘Visual and ocular effects from the use of flat-panel </w:t>
-      </w:r>
-      <w:proofErr w:type="gramStart"/>
-      <w:r>
-        <w:t>displays’</w:t>
-      </w:r>
-      <w:proofErr w:type="gramEnd"/>
-      <w:r>
-        <w:t xml:space="preserve">. </w:t>
-      </w:r>
-      <w:r>
-        <w:rPr>
-          <w:i/>
-          <w:iCs/>
-        </w:rPr>
-        <w:t>International journal of ophthalmology</w:t>
-      </w:r>
-      <w:r>
-        <w:t xml:space="preserve"> 9(6), pp. 881–5. Available at: https://pmc.ncbi.nlm.nih.gov/articles/PMC4916147/ (Accessed: 20 October 2025).</w:t>
-      </w:r>
-    </w:p>
-    <w:p>
-      <w:r>
-        <w:t xml:space="preserve">Santilli, T., Ceccacci, S., Mengoni, M. and Catia </w:t>
-      </w:r>
-      <w:proofErr w:type="spellStart"/>
-      <w:r>
-        <w:t>Giaconi</w:t>
-      </w:r>
-      <w:proofErr w:type="spellEnd"/>
-      <w:r>
-        <w:t xml:space="preserve"> (2025) ‘Virtual vs. traditional learning in higher education: A systematic review of comparative </w:t>
-      </w:r>
-      <w:proofErr w:type="gramStart"/>
-      <w:r>
-        <w:t>studies’</w:t>
-      </w:r>
-      <w:proofErr w:type="gramEnd"/>
-      <w:r>
-        <w:t xml:space="preserve">. </w:t>
-      </w:r>
-      <w:r>
-        <w:rPr>
-          <w:i/>
-          <w:iCs/>
-        </w:rPr>
-        <w:t>Computers &amp; Education</w:t>
-      </w:r>
-      <w:r>
-        <w:t xml:space="preserve"> 227(0360-1315), p. 105214. Available at: https://www.sciencedirect.com/science/article/pii/S0360131524002288.</w:t>
-      </w:r>
-    </w:p>
-    <w:p>
-      <w:r>
-        <w:t>Sharma, M., Kumar, P. and Singh, D.K. (2024) ‘The Role of Virtual Reality in Education: A Comprehensive Review of Research and Application’. Available at: https://ieeexplore.ieee.org/document/10406461/authors#authors (Accessed: 21 October 2025).</w:t>
-      </w:r>
-    </w:p>
-    <w:p>
-      <w:r>
-        <w:t xml:space="preserve">Sheppard, A.L. and Wolffsohn, J.S. (2018) ‘Digital eye strain: prevalence, measurement and amelioration’. </w:t>
-      </w:r>
-      <w:r>
-        <w:rPr>
-          <w:i/>
-          <w:iCs/>
-        </w:rPr>
-        <w:t>BMJ Open Ophthalmology</w:t>
-      </w:r>
-      <w:r>
-        <w:t xml:space="preserve"> 3(1), p. e000146. Available at: https://bmjophth.bmj.com/content/3/1/e000146.</w:t>
-      </w:r>
-    </w:p>
-    <w:p>
-      <w:r>
-        <w:t>Vieira, F., Oliveira, E. and Rodrigues, N. (2019) ‘</w:t>
-      </w:r>
-      <w:proofErr w:type="spellStart"/>
-      <w:r>
-        <w:t>iSVC</w:t>
-      </w:r>
-      <w:proofErr w:type="spellEnd"/>
-      <w:r>
-        <w:t xml:space="preserve"> – digital platform for detection and prevention of computer vision syndrome’., pp. 1–7. </w:t>
-      </w:r>
-      <w:proofErr w:type="spellStart"/>
-      <w:r>
-        <w:t>doi</w:t>
-      </w:r>
-      <w:proofErr w:type="spellEnd"/>
-      <w:r>
-        <w:t>: https://doi.org/10.1109/SeGAH.2019.8882438.</w:t>
-      </w:r>
-    </w:p>
-    <w:p>
-      <w:r>
-        <w:t xml:space="preserve">Wasswa, W. and Ware, J.A. (2025) ‘A Systematic Literature Review on Virtual Reality Applications in Medical Education’. </w:t>
-      </w:r>
-      <w:r>
-        <w:rPr>
-          <w:i/>
-          <w:iCs/>
-        </w:rPr>
-        <w:t>Annals of Emerging Technologies in Computing</w:t>
-      </w:r>
-      <w:r>
-        <w:t xml:space="preserve"> 9(3), pp. 50–68. </w:t>
-      </w:r>
-      <w:proofErr w:type="spellStart"/>
-      <w:r>
-        <w:t>doi</w:t>
-      </w:r>
-      <w:proofErr w:type="spellEnd"/>
-      <w:r>
-        <w:t>: https://doi.org/10.33166/aetic.2025.03.004.</w:t>
-      </w:r>
-    </w:p>
-    <w:p>
-      <w:r>
-        <w:t>Youcef, B., Ahmad, M.N. and Mustapha, M. (2021) ‘</w:t>
-      </w:r>
-      <w:proofErr w:type="spellStart"/>
-      <w:r>
-        <w:t>OntoPhaco</w:t>
-      </w:r>
-      <w:proofErr w:type="spellEnd"/>
-      <w:r>
-        <w:t xml:space="preserve">: An ontology for virtual reality training in ophthalmology Domain—A case study of cataract surgery’. </w:t>
-      </w:r>
-      <w:r>
-        <w:rPr>
-          <w:i/>
-          <w:iCs/>
-        </w:rPr>
-        <w:t>IEEE Access</w:t>
-      </w:r>
-      <w:r>
-        <w:t xml:space="preserve"> 9, pp. 152347–152378. </w:t>
-      </w:r>
-      <w:proofErr w:type="spellStart"/>
-      <w:r>
-        <w:t>doi</w:t>
-      </w:r>
-      <w:proofErr w:type="spellEnd"/>
-      <w:r>
-        <w:t>: https://doi.org/10.1109/ACCESS.2021.3126697.</w:t>
-      </w:r>
-    </w:p>
     <w:p/>
     <w:sectPr>
       <w:pgSz w:w="11906" w:h="16838"/>

</xml_diff>

<commit_message>
Objective implementation system paragraph done
</commit_message>
<xml_diff>
--- a/30077548Thesis.docx
+++ b/30077548Thesis.docx
@@ -8195,12 +8195,27 @@
         <w:t xml:space="preserve"> the rest of the room being relatively empty</w:t>
       </w:r>
       <w:r>
-        <w:t xml:space="preserve">. The environment was kept simple to </w:t>
+        <w:t xml:space="preserve">. </w:t>
+      </w:r>
+      <w:r>
+        <w:t>By keeping t</w:t>
+      </w:r>
+      <w:r>
+        <w:t xml:space="preserve">he environment was kept simple </w:t>
+      </w:r>
+      <w:r>
+        <w:t>it</w:t>
+      </w:r>
+      <w:r>
+        <w:t xml:space="preserve"> </w:t>
       </w:r>
       <w:r>
         <w:t>reinforce</w:t>
       </w:r>
       <w:r>
+        <w:t>d</w:t>
+      </w:r>
+      <w:r>
         <w:t xml:space="preserve"> the user</w:t>
       </w:r>
       <w:r>
@@ -8239,6 +8254,101 @@
       <w:bookmarkEnd w:id="26"/>
     </w:p>
     <w:p>
+      <w:r>
+        <w:t>The</w:t>
+      </w:r>
+      <w:r>
+        <w:t xml:space="preserve"> objective system </w:t>
+      </w:r>
+      <w:r>
+        <w:t xml:space="preserve">was implemented </w:t>
+      </w:r>
+      <w:r>
+        <w:t xml:space="preserve">so that users could be </w:t>
+      </w:r>
+      <w:r>
+        <w:t xml:space="preserve">guided </w:t>
+      </w:r>
+      <w:r>
+        <w:t xml:space="preserve">while </w:t>
+      </w:r>
+      <w:r>
+        <w:t xml:space="preserve">receiving </w:t>
+      </w:r>
+      <w:r>
+        <w:t xml:space="preserve">the information being taught. The objective data </w:t>
+      </w:r>
+      <w:r>
+        <w:t xml:space="preserve">containing titles, IDs and descriptions </w:t>
+      </w:r>
+      <w:r>
+        <w:t>w</w:t>
+      </w:r>
+      <w:r>
+        <w:t>ere</w:t>
+      </w:r>
+      <w:r>
+        <w:t xml:space="preserve"> stored within the VRGameMode blueprint, with objectives being updated during runtime as conditions were satisfied </w:t>
+      </w:r>
+      <w:r>
+        <w:t>during</w:t>
+      </w:r>
+      <w:r>
+        <w:t xml:space="preserve"> progression. </w:t>
+      </w:r>
+      <w:r>
+        <w:t>P</w:t>
+      </w:r>
+      <w:r>
+        <w:t xml:space="preserve">rogression was </w:t>
+      </w:r>
+      <w:r>
+        <w:t>recorded</w:t>
+      </w:r>
+      <w:r>
+        <w:t xml:space="preserve"> through user gaze tracking and interactions with </w:t>
+      </w:r>
+      <w:r>
+        <w:t>interactive</w:t>
+      </w:r>
+      <w:r>
+        <w:t xml:space="preserve"> objects within the scene, the object to gaze at or interact with varied depending on what the current objective was. When a condition was satisfied, event dispatchers were implemented to signal</w:t>
+      </w:r>
+      <w:r>
+        <w:t xml:space="preserve"> system</w:t>
+      </w:r>
+      <w:r>
+        <w:t xml:space="preserve"> changes. These changes consisted of</w:t>
+      </w:r>
+      <w:r>
+        <w:t xml:space="preserve"> objective change</w:t>
+      </w:r>
+      <w:r>
+        <w:t>s</w:t>
+      </w:r>
+      <w:r>
+        <w:t xml:space="preserve">, </w:t>
+      </w:r>
+      <w:r>
+        <w:t>symptoms being triggered</w:t>
+      </w:r>
+      <w:r>
+        <w:t xml:space="preserve"> or relieved, completion of the experience and updat</w:t>
+      </w:r>
+      <w:r>
+        <w:t>ing</w:t>
+      </w:r>
+      <w:r>
+        <w:t xml:space="preserve"> the current objective displayed on the monitor object</w:t>
+      </w:r>
+      <w:r>
+        <w:t xml:space="preserve"> along with the progress bar</w:t>
+      </w:r>
+      <w:r>
+        <w:t>.</w:t>
+      </w:r>
+    </w:p>
+    <w:p>
       <w:pPr>
         <w:pStyle w:val="Heading3"/>
       </w:pPr>
@@ -8252,10 +8362,12 @@
       <w:bookmarkEnd w:id="27"/>
     </w:p>
     <w:p>
+      <w:bookmarkStart w:id="28" w:name="_Toc223520101"/>
+    </w:p>
+    <w:p>
       <w:pPr>
         <w:pStyle w:val="Heading3"/>
       </w:pPr>
-      <w:bookmarkStart w:id="28" w:name="_Toc223520101"/>
       <w:r>
         <w:t>Objective Based Interact</w:t>
       </w:r>
@@ -8271,10 +8383,12 @@
       <w:bookmarkEnd w:id="28"/>
     </w:p>
     <w:p>
+      <w:bookmarkStart w:id="29" w:name="_Toc223520102"/>
+    </w:p>
+    <w:p>
       <w:pPr>
         <w:pStyle w:val="Heading3"/>
       </w:pPr>
-      <w:bookmarkStart w:id="29" w:name="_Toc223520102"/>
       <w:r>
         <w:t>Post Processing Effects</w:t>
       </w:r>
@@ -8284,11 +8398,14 @@
       <w:bookmarkEnd w:id="29"/>
     </w:p>
     <w:p>
+      <w:bookmarkStart w:id="30" w:name="_Toc223520103"/>
+    </w:p>
+    <w:p>
       <w:pPr>
         <w:pStyle w:val="Heading3"/>
       </w:pPr>
-      <w:bookmarkStart w:id="30" w:name="_Toc223520103"/>
-      <w:r>
+      <w:r>
+        <w:lastRenderedPageBreak/>
         <w:t>Player Look Direction and Attention Detection</w:t>
       </w:r>
       <w:bookmarkEnd w:id="30"/>

</xml_diff>

<commit_message>
Another 2 paragraphs completed for prototype implementation section, last one then can move onto first set of testing
</commit_message>
<xml_diff>
--- a/30077548Thesis.docx
+++ b/30077548Thesis.docx
@@ -236,7 +236,7 @@
           <w:r>
             <w:fldChar w:fldCharType="separate"/>
           </w:r>
-          <w:hyperlink w:anchor="_Toc223520073" w:history="1">
+          <w:hyperlink w:anchor="_Toc223637876" w:history="1">
             <w:r>
               <w:rPr>
                 <w:rStyle w:val="Hyperlink"/>
@@ -263,7 +263,7 @@
                 <w:noProof/>
                 <w:webHidden/>
               </w:rPr>
-              <w:instrText xml:space="preserve"> PAGEREF _Toc223520073 \h </w:instrText>
+              <w:instrText xml:space="preserve"> PAGEREF _Toc223637876 \h </w:instrText>
             </w:r>
             <w:r>
               <w:rPr>
@@ -308,7 +308,7 @@
               <w:lang w:eastAsia="en-GB"/>
             </w:rPr>
           </w:pPr>
-          <w:hyperlink w:anchor="_Toc223520074" w:history="1">
+          <w:hyperlink w:anchor="_Toc223637877" w:history="1">
             <w:r>
               <w:rPr>
                 <w:rStyle w:val="Hyperlink"/>
@@ -335,7 +335,7 @@
                 <w:noProof/>
                 <w:webHidden/>
               </w:rPr>
-              <w:instrText xml:space="preserve"> PAGEREF _Toc223520074 \h </w:instrText>
+              <w:instrText xml:space="preserve"> PAGEREF _Toc223637877 \h </w:instrText>
             </w:r>
             <w:r>
               <w:rPr>
@@ -380,7 +380,7 @@
               <w:lang w:eastAsia="en-GB"/>
             </w:rPr>
           </w:pPr>
-          <w:hyperlink w:anchor="_Toc223520075" w:history="1">
+          <w:hyperlink w:anchor="_Toc223637878" w:history="1">
             <w:r>
               <w:rPr>
                 <w:rStyle w:val="Hyperlink"/>
@@ -407,7 +407,7 @@
                 <w:noProof/>
                 <w:webHidden/>
               </w:rPr>
-              <w:instrText xml:space="preserve"> PAGEREF _Toc223520075 \h </w:instrText>
+              <w:instrText xml:space="preserve"> PAGEREF _Toc223637878 \h </w:instrText>
             </w:r>
             <w:r>
               <w:rPr>
@@ -452,7 +452,7 @@
               <w:lang w:eastAsia="en-GB"/>
             </w:rPr>
           </w:pPr>
-          <w:hyperlink w:anchor="_Toc223520076" w:history="1">
+          <w:hyperlink w:anchor="_Toc223637879" w:history="1">
             <w:r>
               <w:rPr>
                 <w:rStyle w:val="Hyperlink"/>
@@ -479,7 +479,7 @@
                 <w:noProof/>
                 <w:webHidden/>
               </w:rPr>
-              <w:instrText xml:space="preserve"> PAGEREF _Toc223520076 \h </w:instrText>
+              <w:instrText xml:space="preserve"> PAGEREF _Toc223637879 \h </w:instrText>
             </w:r>
             <w:r>
               <w:rPr>
@@ -524,7 +524,7 @@
               <w:lang w:eastAsia="en-GB"/>
             </w:rPr>
           </w:pPr>
-          <w:hyperlink w:anchor="_Toc223520077" w:history="1">
+          <w:hyperlink w:anchor="_Toc223637880" w:history="1">
             <w:r>
               <w:rPr>
                 <w:rStyle w:val="Hyperlink"/>
@@ -551,7 +551,7 @@
                 <w:noProof/>
                 <w:webHidden/>
               </w:rPr>
-              <w:instrText xml:space="preserve"> PAGEREF _Toc223520077 \h </w:instrText>
+              <w:instrText xml:space="preserve"> PAGEREF _Toc223637880 \h </w:instrText>
             </w:r>
             <w:r>
               <w:rPr>
@@ -596,7 +596,7 @@
               <w:lang w:eastAsia="en-GB"/>
             </w:rPr>
           </w:pPr>
-          <w:hyperlink w:anchor="_Toc223520078" w:history="1">
+          <w:hyperlink w:anchor="_Toc223637881" w:history="1">
             <w:r>
               <w:rPr>
                 <w:rStyle w:val="Hyperlink"/>
@@ -623,7 +623,7 @@
                 <w:noProof/>
                 <w:webHidden/>
               </w:rPr>
-              <w:instrText xml:space="preserve"> PAGEREF _Toc223520078 \h </w:instrText>
+              <w:instrText xml:space="preserve"> PAGEREF _Toc223637881 \h </w:instrText>
             </w:r>
             <w:r>
               <w:rPr>
@@ -668,7 +668,7 @@
               <w:lang w:eastAsia="en-GB"/>
             </w:rPr>
           </w:pPr>
-          <w:hyperlink w:anchor="_Toc223520079" w:history="1">
+          <w:hyperlink w:anchor="_Toc223637882" w:history="1">
             <w:r>
               <w:rPr>
                 <w:rStyle w:val="Hyperlink"/>
@@ -695,7 +695,7 @@
                 <w:noProof/>
                 <w:webHidden/>
               </w:rPr>
-              <w:instrText xml:space="preserve"> PAGEREF _Toc223520079 \h </w:instrText>
+              <w:instrText xml:space="preserve"> PAGEREF _Toc223637882 \h </w:instrText>
             </w:r>
             <w:r>
               <w:rPr>
@@ -740,7 +740,7 @@
               <w:lang w:eastAsia="en-GB"/>
             </w:rPr>
           </w:pPr>
-          <w:hyperlink w:anchor="_Toc223520080" w:history="1">
+          <w:hyperlink w:anchor="_Toc223637883" w:history="1">
             <w:r>
               <w:rPr>
                 <w:rStyle w:val="Hyperlink"/>
@@ -767,7 +767,7 @@
                 <w:noProof/>
                 <w:webHidden/>
               </w:rPr>
-              <w:instrText xml:space="preserve"> PAGEREF _Toc223520080 \h </w:instrText>
+              <w:instrText xml:space="preserve"> PAGEREF _Toc223637883 \h </w:instrText>
             </w:r>
             <w:r>
               <w:rPr>
@@ -812,7 +812,7 @@
               <w:lang w:eastAsia="en-GB"/>
             </w:rPr>
           </w:pPr>
-          <w:hyperlink w:anchor="_Toc223520081" w:history="1">
+          <w:hyperlink w:anchor="_Toc223637884" w:history="1">
             <w:r>
               <w:rPr>
                 <w:rStyle w:val="Hyperlink"/>
@@ -839,7 +839,7 @@
                 <w:noProof/>
                 <w:webHidden/>
               </w:rPr>
-              <w:instrText xml:space="preserve"> PAGEREF _Toc223520081 \h </w:instrText>
+              <w:instrText xml:space="preserve"> PAGEREF _Toc223637884 \h </w:instrText>
             </w:r>
             <w:r>
               <w:rPr>
@@ -884,7 +884,7 @@
               <w:lang w:eastAsia="en-GB"/>
             </w:rPr>
           </w:pPr>
-          <w:hyperlink w:anchor="_Toc223520082" w:history="1">
+          <w:hyperlink w:anchor="_Toc223637885" w:history="1">
             <w:r>
               <w:rPr>
                 <w:rStyle w:val="Hyperlink"/>
@@ -911,7 +911,7 @@
                 <w:noProof/>
                 <w:webHidden/>
               </w:rPr>
-              <w:instrText xml:space="preserve"> PAGEREF _Toc223520082 \h </w:instrText>
+              <w:instrText xml:space="preserve"> PAGEREF _Toc223637885 \h </w:instrText>
             </w:r>
             <w:r>
               <w:rPr>
@@ -956,7 +956,7 @@
               <w:lang w:eastAsia="en-GB"/>
             </w:rPr>
           </w:pPr>
-          <w:hyperlink w:anchor="_Toc223520083" w:history="1">
+          <w:hyperlink w:anchor="_Toc223637886" w:history="1">
             <w:r>
               <w:rPr>
                 <w:rStyle w:val="Hyperlink"/>
@@ -983,7 +983,7 @@
                 <w:noProof/>
                 <w:webHidden/>
               </w:rPr>
-              <w:instrText xml:space="preserve"> PAGEREF _Toc223520083 \h </w:instrText>
+              <w:instrText xml:space="preserve"> PAGEREF _Toc223637886 \h </w:instrText>
             </w:r>
             <w:r>
               <w:rPr>
@@ -1028,7 +1028,7 @@
               <w:lang w:eastAsia="en-GB"/>
             </w:rPr>
           </w:pPr>
-          <w:hyperlink w:anchor="_Toc223520084" w:history="1">
+          <w:hyperlink w:anchor="_Toc223637887" w:history="1">
             <w:r>
               <w:rPr>
                 <w:rStyle w:val="Hyperlink"/>
@@ -1055,7 +1055,7 @@
                 <w:noProof/>
                 <w:webHidden/>
               </w:rPr>
-              <w:instrText xml:space="preserve"> PAGEREF _Toc223520084 \h </w:instrText>
+              <w:instrText xml:space="preserve"> PAGEREF _Toc223637887 \h </w:instrText>
             </w:r>
             <w:r>
               <w:rPr>
@@ -1100,7 +1100,7 @@
               <w:lang w:eastAsia="en-GB"/>
             </w:rPr>
           </w:pPr>
-          <w:hyperlink w:anchor="_Toc223520085" w:history="1">
+          <w:hyperlink w:anchor="_Toc223637888" w:history="1">
             <w:r>
               <w:rPr>
                 <w:rStyle w:val="Hyperlink"/>
@@ -1127,7 +1127,7 @@
                 <w:noProof/>
                 <w:webHidden/>
               </w:rPr>
-              <w:instrText xml:space="preserve"> PAGEREF _Toc223520085 \h </w:instrText>
+              <w:instrText xml:space="preserve"> PAGEREF _Toc223637888 \h </w:instrText>
             </w:r>
             <w:r>
               <w:rPr>
@@ -1172,7 +1172,7 @@
               <w:lang w:eastAsia="en-GB"/>
             </w:rPr>
           </w:pPr>
-          <w:hyperlink w:anchor="_Toc223520086" w:history="1">
+          <w:hyperlink w:anchor="_Toc223637889" w:history="1">
             <w:r>
               <w:rPr>
                 <w:rStyle w:val="Hyperlink"/>
@@ -1199,7 +1199,7 @@
                 <w:noProof/>
                 <w:webHidden/>
               </w:rPr>
-              <w:instrText xml:space="preserve"> PAGEREF _Toc223520086 \h </w:instrText>
+              <w:instrText xml:space="preserve"> PAGEREF _Toc223637889 \h </w:instrText>
             </w:r>
             <w:r>
               <w:rPr>
@@ -1244,7 +1244,7 @@
               <w:lang w:eastAsia="en-GB"/>
             </w:rPr>
           </w:pPr>
-          <w:hyperlink w:anchor="_Toc223520087" w:history="1">
+          <w:hyperlink w:anchor="_Toc223637890" w:history="1">
             <w:r>
               <w:rPr>
                 <w:rStyle w:val="Hyperlink"/>
@@ -1271,7 +1271,7 @@
                 <w:noProof/>
                 <w:webHidden/>
               </w:rPr>
-              <w:instrText xml:space="preserve"> PAGEREF _Toc223520087 \h </w:instrText>
+              <w:instrText xml:space="preserve"> PAGEREF _Toc223637890 \h </w:instrText>
             </w:r>
             <w:r>
               <w:rPr>
@@ -1316,7 +1316,7 @@
               <w:lang w:eastAsia="en-GB"/>
             </w:rPr>
           </w:pPr>
-          <w:hyperlink w:anchor="_Toc223520088" w:history="1">
+          <w:hyperlink w:anchor="_Toc223637891" w:history="1">
             <w:r>
               <w:rPr>
                 <w:rStyle w:val="Hyperlink"/>
@@ -1343,7 +1343,7 @@
                 <w:noProof/>
                 <w:webHidden/>
               </w:rPr>
-              <w:instrText xml:space="preserve"> PAGEREF _Toc223520088 \h </w:instrText>
+              <w:instrText xml:space="preserve"> PAGEREF _Toc223637891 \h </w:instrText>
             </w:r>
             <w:r>
               <w:rPr>
@@ -1388,7 +1388,7 @@
               <w:lang w:eastAsia="en-GB"/>
             </w:rPr>
           </w:pPr>
-          <w:hyperlink w:anchor="_Toc223520089" w:history="1">
+          <w:hyperlink w:anchor="_Toc223637892" w:history="1">
             <w:r>
               <w:rPr>
                 <w:rStyle w:val="Hyperlink"/>
@@ -1415,7 +1415,7 @@
                 <w:noProof/>
                 <w:webHidden/>
               </w:rPr>
-              <w:instrText xml:space="preserve"> PAGEREF _Toc223520089 \h </w:instrText>
+              <w:instrText xml:space="preserve"> PAGEREF _Toc223637892 \h </w:instrText>
             </w:r>
             <w:r>
               <w:rPr>
@@ -1460,7 +1460,7 @@
               <w:lang w:eastAsia="en-GB"/>
             </w:rPr>
           </w:pPr>
-          <w:hyperlink w:anchor="_Toc223520090" w:history="1">
+          <w:hyperlink w:anchor="_Toc223637893" w:history="1">
             <w:r>
               <w:rPr>
                 <w:rStyle w:val="Hyperlink"/>
@@ -1487,7 +1487,7 @@
                 <w:noProof/>
                 <w:webHidden/>
               </w:rPr>
-              <w:instrText xml:space="preserve"> PAGEREF _Toc223520090 \h </w:instrText>
+              <w:instrText xml:space="preserve"> PAGEREF _Toc223637893 \h </w:instrText>
             </w:r>
             <w:r>
               <w:rPr>
@@ -1532,7 +1532,7 @@
               <w:lang w:eastAsia="en-GB"/>
             </w:rPr>
           </w:pPr>
-          <w:hyperlink w:anchor="_Toc223520091" w:history="1">
+          <w:hyperlink w:anchor="_Toc223637894" w:history="1">
             <w:r>
               <w:rPr>
                 <w:rStyle w:val="Hyperlink"/>
@@ -1559,7 +1559,7 @@
                 <w:noProof/>
                 <w:webHidden/>
               </w:rPr>
-              <w:instrText xml:space="preserve"> PAGEREF _Toc223520091 \h </w:instrText>
+              <w:instrText xml:space="preserve"> PAGEREF _Toc223637894 \h </w:instrText>
             </w:r>
             <w:r>
               <w:rPr>
@@ -1604,7 +1604,7 @@
               <w:lang w:eastAsia="en-GB"/>
             </w:rPr>
           </w:pPr>
-          <w:hyperlink w:anchor="_Toc223520092" w:history="1">
+          <w:hyperlink w:anchor="_Toc223637895" w:history="1">
             <w:r>
               <w:rPr>
                 <w:rStyle w:val="Hyperlink"/>
@@ -1631,7 +1631,7 @@
                 <w:noProof/>
                 <w:webHidden/>
               </w:rPr>
-              <w:instrText xml:space="preserve"> PAGEREF _Toc223520092 \h </w:instrText>
+              <w:instrText xml:space="preserve"> PAGEREF _Toc223637895 \h </w:instrText>
             </w:r>
             <w:r>
               <w:rPr>
@@ -1676,7 +1676,7 @@
               <w:lang w:eastAsia="en-GB"/>
             </w:rPr>
           </w:pPr>
-          <w:hyperlink w:anchor="_Toc223520093" w:history="1">
+          <w:hyperlink w:anchor="_Toc223637896" w:history="1">
             <w:r>
               <w:rPr>
                 <w:rStyle w:val="Hyperlink"/>
@@ -1703,7 +1703,7 @@
                 <w:noProof/>
                 <w:webHidden/>
               </w:rPr>
-              <w:instrText xml:space="preserve"> PAGEREF _Toc223520093 \h </w:instrText>
+              <w:instrText xml:space="preserve"> PAGEREF _Toc223637896 \h </w:instrText>
             </w:r>
             <w:r>
               <w:rPr>
@@ -1748,7 +1748,7 @@
               <w:lang w:eastAsia="en-GB"/>
             </w:rPr>
           </w:pPr>
-          <w:hyperlink w:anchor="_Toc223520094" w:history="1">
+          <w:hyperlink w:anchor="_Toc223637897" w:history="1">
             <w:r>
               <w:rPr>
                 <w:rStyle w:val="Hyperlink"/>
@@ -1775,7 +1775,7 @@
                 <w:noProof/>
                 <w:webHidden/>
               </w:rPr>
-              <w:instrText xml:space="preserve"> PAGEREF _Toc223520094 \h </w:instrText>
+              <w:instrText xml:space="preserve"> PAGEREF _Toc223637897 \h </w:instrText>
             </w:r>
             <w:r>
               <w:rPr>
@@ -1820,7 +1820,7 @@
               <w:lang w:eastAsia="en-GB"/>
             </w:rPr>
           </w:pPr>
-          <w:hyperlink w:anchor="_Toc223520095" w:history="1">
+          <w:hyperlink w:anchor="_Toc223637898" w:history="1">
             <w:r>
               <w:rPr>
                 <w:rStyle w:val="Hyperlink"/>
@@ -1847,7 +1847,7 @@
                 <w:noProof/>
                 <w:webHidden/>
               </w:rPr>
-              <w:instrText xml:space="preserve"> PAGEREF _Toc223520095 \h </w:instrText>
+              <w:instrText xml:space="preserve"> PAGEREF _Toc223637898 \h </w:instrText>
             </w:r>
             <w:r>
               <w:rPr>
@@ -1892,7 +1892,7 @@
               <w:lang w:eastAsia="en-GB"/>
             </w:rPr>
           </w:pPr>
-          <w:hyperlink w:anchor="_Toc223520096" w:history="1">
+          <w:hyperlink w:anchor="_Toc223637899" w:history="1">
             <w:r>
               <w:rPr>
                 <w:rStyle w:val="Hyperlink"/>
@@ -1919,7 +1919,7 @@
                 <w:noProof/>
                 <w:webHidden/>
               </w:rPr>
-              <w:instrText xml:space="preserve"> PAGEREF _Toc223520096 \h </w:instrText>
+              <w:instrText xml:space="preserve"> PAGEREF _Toc223637899 \h </w:instrText>
             </w:r>
             <w:r>
               <w:rPr>
@@ -1964,7 +1964,7 @@
               <w:lang w:eastAsia="en-GB"/>
             </w:rPr>
           </w:pPr>
-          <w:hyperlink w:anchor="_Toc223520097" w:history="1">
+          <w:hyperlink w:anchor="_Toc223637900" w:history="1">
             <w:r>
               <w:rPr>
                 <w:rStyle w:val="Hyperlink"/>
@@ -1991,7 +1991,7 @@
                 <w:noProof/>
                 <w:webHidden/>
               </w:rPr>
-              <w:instrText xml:space="preserve"> PAGEREF _Toc223520097 \h </w:instrText>
+              <w:instrText xml:space="preserve"> PAGEREF _Toc223637900 \h </w:instrText>
             </w:r>
             <w:r>
               <w:rPr>
@@ -2036,7 +2036,7 @@
               <w:lang w:eastAsia="en-GB"/>
             </w:rPr>
           </w:pPr>
-          <w:hyperlink w:anchor="_Toc223520098" w:history="1">
+          <w:hyperlink w:anchor="_Toc223637901" w:history="1">
             <w:r>
               <w:rPr>
                 <w:rStyle w:val="Hyperlink"/>
@@ -2063,7 +2063,7 @@
                 <w:noProof/>
                 <w:webHidden/>
               </w:rPr>
-              <w:instrText xml:space="preserve"> PAGEREF _Toc223520098 \h </w:instrText>
+              <w:instrText xml:space="preserve"> PAGEREF _Toc223637901 \h </w:instrText>
             </w:r>
             <w:r>
               <w:rPr>
@@ -2108,7 +2108,7 @@
               <w:lang w:eastAsia="en-GB"/>
             </w:rPr>
           </w:pPr>
-          <w:hyperlink w:anchor="_Toc223520099" w:history="1">
+          <w:hyperlink w:anchor="_Toc223637902" w:history="1">
             <w:r>
               <w:rPr>
                 <w:rStyle w:val="Hyperlink"/>
@@ -2135,7 +2135,7 @@
                 <w:noProof/>
                 <w:webHidden/>
               </w:rPr>
-              <w:instrText xml:space="preserve"> PAGEREF _Toc223520099 \h </w:instrText>
+              <w:instrText xml:space="preserve"> PAGEREF _Toc223637902 \h </w:instrText>
             </w:r>
             <w:r>
               <w:rPr>
@@ -2180,13 +2180,13 @@
               <w:lang w:eastAsia="en-GB"/>
             </w:rPr>
           </w:pPr>
-          <w:hyperlink w:anchor="_Toc223520100" w:history="1">
+          <w:hyperlink w:anchor="_Toc223637903" w:history="1">
             <w:r>
               <w:rPr>
                 <w:rStyle w:val="Hyperlink"/>
                 <w:noProof/>
               </w:rPr>
-              <w:t>Player Objective Feedback</w:t>
+              <w:t>User Objective Feedback</w:t>
             </w:r>
             <w:r>
               <w:rPr>
@@ -2207,7 +2207,7 @@
                 <w:noProof/>
                 <w:webHidden/>
               </w:rPr>
-              <w:instrText xml:space="preserve"> PAGEREF _Toc223520100 \h </w:instrText>
+              <w:instrText xml:space="preserve"> PAGEREF _Toc223637903 \h </w:instrText>
             </w:r>
             <w:r>
               <w:rPr>
@@ -2252,7 +2252,7 @@
               <w:lang w:eastAsia="en-GB"/>
             </w:rPr>
           </w:pPr>
-          <w:hyperlink w:anchor="_Toc223520101" w:history="1">
+          <w:hyperlink w:anchor="_Toc223637904" w:history="1">
             <w:r>
               <w:rPr>
                 <w:rStyle w:val="Hyperlink"/>
@@ -2279,7 +2279,7 @@
                 <w:noProof/>
                 <w:webHidden/>
               </w:rPr>
-              <w:instrText xml:space="preserve"> PAGEREF _Toc223520101 \h </w:instrText>
+              <w:instrText xml:space="preserve"> PAGEREF _Toc223637904 \h </w:instrText>
             </w:r>
             <w:r>
               <w:rPr>
@@ -2299,7 +2299,7 @@
                 <w:noProof/>
                 <w:webHidden/>
               </w:rPr>
-              <w:t>18</w:t>
+              <w:t>19</w:t>
             </w:r>
             <w:r>
               <w:rPr>
@@ -2324,7 +2324,7 @@
               <w:lang w:eastAsia="en-GB"/>
             </w:rPr>
           </w:pPr>
-          <w:hyperlink w:anchor="_Toc223520102" w:history="1">
+          <w:hyperlink w:anchor="_Toc223637905" w:history="1">
             <w:r>
               <w:rPr>
                 <w:rStyle w:val="Hyperlink"/>
@@ -2351,7 +2351,7 @@
                 <w:noProof/>
                 <w:webHidden/>
               </w:rPr>
-              <w:instrText xml:space="preserve"> PAGEREF _Toc223520102 \h </w:instrText>
+              <w:instrText xml:space="preserve"> PAGEREF _Toc223637905 \h </w:instrText>
             </w:r>
             <w:r>
               <w:rPr>
@@ -2371,7 +2371,7 @@
                 <w:noProof/>
                 <w:webHidden/>
               </w:rPr>
-              <w:t>18</w:t>
+              <w:t>19</w:t>
             </w:r>
             <w:r>
               <w:rPr>
@@ -2396,13 +2396,13 @@
               <w:lang w:eastAsia="en-GB"/>
             </w:rPr>
           </w:pPr>
-          <w:hyperlink w:anchor="_Toc223520103" w:history="1">
+          <w:hyperlink w:anchor="_Toc223637906" w:history="1">
             <w:r>
               <w:rPr>
                 <w:rStyle w:val="Hyperlink"/>
                 <w:noProof/>
               </w:rPr>
-              <w:t>Player Look Direction and Attention Detection</w:t>
+              <w:t>User Look Direction and Attention Detection</w:t>
             </w:r>
             <w:r>
               <w:rPr>
@@ -2423,7 +2423,7 @@
                 <w:noProof/>
                 <w:webHidden/>
               </w:rPr>
-              <w:instrText xml:space="preserve"> PAGEREF _Toc223520103 \h </w:instrText>
+              <w:instrText xml:space="preserve"> PAGEREF _Toc223637906 \h </w:instrText>
             </w:r>
             <w:r>
               <w:rPr>
@@ -2443,7 +2443,79 @@
                 <w:noProof/>
                 <w:webHidden/>
               </w:rPr>
-              <w:t>18</w:t>
+              <w:t>19</w:t>
+            </w:r>
+            <w:r>
+              <w:rPr>
+                <w:noProof/>
+                <w:webHidden/>
+              </w:rPr>
+              <w:fldChar w:fldCharType="end"/>
+            </w:r>
+          </w:hyperlink>
+        </w:p>
+        <w:p>
+          <w:pPr>
+            <w:pStyle w:val="TOC2"/>
+            <w:tabs>
+              <w:tab w:val="right" w:leader="dot" w:pos="9016"/>
+            </w:tabs>
+            <w:rPr>
+              <w:rFonts w:eastAsiaTheme="minorEastAsia"/>
+              <w:noProof/>
+              <w:sz w:val="24"/>
+              <w:szCs w:val="24"/>
+              <w:lang w:eastAsia="en-GB"/>
+            </w:rPr>
+          </w:pPr>
+          <w:hyperlink w:anchor="_Toc223637907" w:history="1">
+            <w:r>
+              <w:rPr>
+                <w:rStyle w:val="Hyperlink"/>
+                <w:noProof/>
+              </w:rPr>
+              <w:t>Polish and Improvements</w:t>
+            </w:r>
+            <w:r>
+              <w:rPr>
+                <w:noProof/>
+                <w:webHidden/>
+              </w:rPr>
+              <w:tab/>
+            </w:r>
+            <w:r>
+              <w:rPr>
+                <w:noProof/>
+                <w:webHidden/>
+              </w:rPr>
+              <w:fldChar w:fldCharType="begin"/>
+            </w:r>
+            <w:r>
+              <w:rPr>
+                <w:noProof/>
+                <w:webHidden/>
+              </w:rPr>
+              <w:instrText xml:space="preserve"> PAGEREF _Toc223637907 \h </w:instrText>
+            </w:r>
+            <w:r>
+              <w:rPr>
+                <w:noProof/>
+                <w:webHidden/>
+              </w:rPr>
+            </w:r>
+            <w:r>
+              <w:rPr>
+                <w:noProof/>
+                <w:webHidden/>
+              </w:rPr>
+              <w:fldChar w:fldCharType="separate"/>
+            </w:r>
+            <w:r>
+              <w:rPr>
+                <w:noProof/>
+                <w:webHidden/>
+              </w:rPr>
+              <w:t>19</w:t>
             </w:r>
             <w:r>
               <w:rPr>
@@ -2468,7 +2540,7 @@
               <w:lang w:eastAsia="en-GB"/>
             </w:rPr>
           </w:pPr>
-          <w:hyperlink w:anchor="_Toc223520104" w:history="1">
+          <w:hyperlink w:anchor="_Toc223637908" w:history="1">
             <w:r>
               <w:rPr>
                 <w:rStyle w:val="Hyperlink"/>
@@ -2495,7 +2567,7 @@
                 <w:noProof/>
                 <w:webHidden/>
               </w:rPr>
-              <w:instrText xml:space="preserve"> PAGEREF _Toc223520104 \h </w:instrText>
+              <w:instrText xml:space="preserve"> PAGEREF _Toc223637908 \h </w:instrText>
             </w:r>
             <w:r>
               <w:rPr>
@@ -2515,7 +2587,151 @@
                 <w:noProof/>
                 <w:webHidden/>
               </w:rPr>
-              <w:t>19</w:t>
+              <w:t>20</w:t>
+            </w:r>
+            <w:r>
+              <w:rPr>
+                <w:noProof/>
+                <w:webHidden/>
+              </w:rPr>
+              <w:fldChar w:fldCharType="end"/>
+            </w:r>
+          </w:hyperlink>
+        </w:p>
+        <w:p>
+          <w:pPr>
+            <w:pStyle w:val="TOC2"/>
+            <w:tabs>
+              <w:tab w:val="right" w:leader="dot" w:pos="9016"/>
+            </w:tabs>
+            <w:rPr>
+              <w:rFonts w:eastAsiaTheme="minorEastAsia"/>
+              <w:noProof/>
+              <w:sz w:val="24"/>
+              <w:szCs w:val="24"/>
+              <w:lang w:eastAsia="en-GB"/>
+            </w:rPr>
+          </w:pPr>
+          <w:hyperlink w:anchor="_Toc223637909" w:history="1">
+            <w:r>
+              <w:rPr>
+                <w:rStyle w:val="Hyperlink"/>
+                <w:noProof/>
+              </w:rPr>
+              <w:t>First Result Set</w:t>
+            </w:r>
+            <w:r>
+              <w:rPr>
+                <w:noProof/>
+                <w:webHidden/>
+              </w:rPr>
+              <w:tab/>
+            </w:r>
+            <w:r>
+              <w:rPr>
+                <w:noProof/>
+                <w:webHidden/>
+              </w:rPr>
+              <w:fldChar w:fldCharType="begin"/>
+            </w:r>
+            <w:r>
+              <w:rPr>
+                <w:noProof/>
+                <w:webHidden/>
+              </w:rPr>
+              <w:instrText xml:space="preserve"> PAGEREF _Toc223637909 \h </w:instrText>
+            </w:r>
+            <w:r>
+              <w:rPr>
+                <w:noProof/>
+                <w:webHidden/>
+              </w:rPr>
+            </w:r>
+            <w:r>
+              <w:rPr>
+                <w:noProof/>
+                <w:webHidden/>
+              </w:rPr>
+              <w:fldChar w:fldCharType="separate"/>
+            </w:r>
+            <w:r>
+              <w:rPr>
+                <w:noProof/>
+                <w:webHidden/>
+              </w:rPr>
+              <w:t>20</w:t>
+            </w:r>
+            <w:r>
+              <w:rPr>
+                <w:noProof/>
+                <w:webHidden/>
+              </w:rPr>
+              <w:fldChar w:fldCharType="end"/>
+            </w:r>
+          </w:hyperlink>
+        </w:p>
+        <w:p>
+          <w:pPr>
+            <w:pStyle w:val="TOC2"/>
+            <w:tabs>
+              <w:tab w:val="right" w:leader="dot" w:pos="9016"/>
+            </w:tabs>
+            <w:rPr>
+              <w:rFonts w:eastAsiaTheme="minorEastAsia"/>
+              <w:noProof/>
+              <w:sz w:val="24"/>
+              <w:szCs w:val="24"/>
+              <w:lang w:eastAsia="en-GB"/>
+            </w:rPr>
+          </w:pPr>
+          <w:hyperlink w:anchor="_Toc223637910" w:history="1">
+            <w:r>
+              <w:rPr>
+                <w:rStyle w:val="Hyperlink"/>
+                <w:noProof/>
+              </w:rPr>
+              <w:t>Second Result Set</w:t>
+            </w:r>
+            <w:r>
+              <w:rPr>
+                <w:noProof/>
+                <w:webHidden/>
+              </w:rPr>
+              <w:tab/>
+            </w:r>
+            <w:r>
+              <w:rPr>
+                <w:noProof/>
+                <w:webHidden/>
+              </w:rPr>
+              <w:fldChar w:fldCharType="begin"/>
+            </w:r>
+            <w:r>
+              <w:rPr>
+                <w:noProof/>
+                <w:webHidden/>
+              </w:rPr>
+              <w:instrText xml:space="preserve"> PAGEREF _Toc223637910 \h </w:instrText>
+            </w:r>
+            <w:r>
+              <w:rPr>
+                <w:noProof/>
+                <w:webHidden/>
+              </w:rPr>
+            </w:r>
+            <w:r>
+              <w:rPr>
+                <w:noProof/>
+                <w:webHidden/>
+              </w:rPr>
+              <w:fldChar w:fldCharType="separate"/>
+            </w:r>
+            <w:r>
+              <w:rPr>
+                <w:noProof/>
+                <w:webHidden/>
+              </w:rPr>
+              <w:t>20</w:t>
             </w:r>
             <w:r>
               <w:rPr>
@@ -2540,7 +2756,7 @@
               <w:lang w:eastAsia="en-GB"/>
             </w:rPr>
           </w:pPr>
-          <w:hyperlink w:anchor="_Toc223520105" w:history="1">
+          <w:hyperlink w:anchor="_Toc223637911" w:history="1">
             <w:r>
               <w:rPr>
                 <w:rStyle w:val="Hyperlink"/>
@@ -2567,7 +2783,7 @@
                 <w:noProof/>
                 <w:webHidden/>
               </w:rPr>
-              <w:instrText xml:space="preserve"> PAGEREF _Toc223520105 \h </w:instrText>
+              <w:instrText xml:space="preserve"> PAGEREF _Toc223637911 \h </w:instrText>
             </w:r>
             <w:r>
               <w:rPr>
@@ -2587,7 +2803,7 @@
                 <w:noProof/>
                 <w:webHidden/>
               </w:rPr>
-              <w:t>20</w:t>
+              <w:t>21</w:t>
             </w:r>
             <w:r>
               <w:rPr>
@@ -2612,7 +2828,7 @@
               <w:lang w:eastAsia="en-GB"/>
             </w:rPr>
           </w:pPr>
-          <w:hyperlink w:anchor="_Toc223520106" w:history="1">
+          <w:hyperlink w:anchor="_Toc223637912" w:history="1">
             <w:r>
               <w:rPr>
                 <w:rStyle w:val="Hyperlink"/>
@@ -2639,7 +2855,7 @@
                 <w:noProof/>
                 <w:webHidden/>
               </w:rPr>
-              <w:instrText xml:space="preserve"> PAGEREF _Toc223520106 \h </w:instrText>
+              <w:instrText xml:space="preserve"> PAGEREF _Toc223637912 \h </w:instrText>
             </w:r>
             <w:r>
               <w:rPr>
@@ -2659,7 +2875,7 @@
                 <w:noProof/>
                 <w:webHidden/>
               </w:rPr>
-              <w:t>21</w:t>
+              <w:t>22</w:t>
             </w:r>
             <w:r>
               <w:rPr>
@@ -2684,7 +2900,7 @@
               <w:lang w:eastAsia="en-GB"/>
             </w:rPr>
           </w:pPr>
-          <w:hyperlink w:anchor="_Toc223520107" w:history="1">
+          <w:hyperlink w:anchor="_Toc223637913" w:history="1">
             <w:r>
               <w:rPr>
                 <w:rStyle w:val="Hyperlink"/>
@@ -2711,7 +2927,7 @@
                 <w:noProof/>
                 <w:webHidden/>
               </w:rPr>
-              <w:instrText xml:space="preserve"> PAGEREF _Toc223520107 \h </w:instrText>
+              <w:instrText xml:space="preserve"> PAGEREF _Toc223637913 \h </w:instrText>
             </w:r>
             <w:r>
               <w:rPr>
@@ -2731,7 +2947,7 @@
                 <w:noProof/>
                 <w:webHidden/>
               </w:rPr>
-              <w:t>22</w:t>
+              <w:t>23</w:t>
             </w:r>
             <w:r>
               <w:rPr>
@@ -2756,7 +2972,7 @@
               <w:lang w:eastAsia="en-GB"/>
             </w:rPr>
           </w:pPr>
-          <w:hyperlink w:anchor="_Toc223520108" w:history="1">
+          <w:hyperlink w:anchor="_Toc223637914" w:history="1">
             <w:r>
               <w:rPr>
                 <w:rStyle w:val="Hyperlink"/>
@@ -2783,7 +2999,7 @@
                 <w:noProof/>
                 <w:webHidden/>
               </w:rPr>
-              <w:instrText xml:space="preserve"> PAGEREF _Toc223520108 \h </w:instrText>
+              <w:instrText xml:space="preserve"> PAGEREF _Toc223637914 \h </w:instrText>
             </w:r>
             <w:r>
               <w:rPr>
@@ -2803,7 +3019,7 @@
                 <w:noProof/>
                 <w:webHidden/>
               </w:rPr>
-              <w:t>23</w:t>
+              <w:t>24</w:t>
             </w:r>
             <w:r>
               <w:rPr>
@@ -2828,7 +3044,7 @@
               <w:lang w:eastAsia="en-GB"/>
             </w:rPr>
           </w:pPr>
-          <w:hyperlink w:anchor="_Toc223520109" w:history="1">
+          <w:hyperlink w:anchor="_Toc223637915" w:history="1">
             <w:r>
               <w:rPr>
                 <w:rStyle w:val="Hyperlink"/>
@@ -2855,7 +3071,7 @@
                 <w:noProof/>
                 <w:webHidden/>
               </w:rPr>
-              <w:instrText xml:space="preserve"> PAGEREF _Toc223520109 \h </w:instrText>
+              <w:instrText xml:space="preserve"> PAGEREF _Toc223637915 \h </w:instrText>
             </w:r>
             <w:r>
               <w:rPr>
@@ -2875,7 +3091,7 @@
                 <w:noProof/>
                 <w:webHidden/>
               </w:rPr>
-              <w:t>23</w:t>
+              <w:t>24</w:t>
             </w:r>
             <w:r>
               <w:rPr>
@@ -2900,7 +3116,7 @@
               <w:lang w:eastAsia="en-GB"/>
             </w:rPr>
           </w:pPr>
-          <w:hyperlink w:anchor="_Toc223520110" w:history="1">
+          <w:hyperlink w:anchor="_Toc223637916" w:history="1">
             <w:r>
               <w:rPr>
                 <w:rStyle w:val="Hyperlink"/>
@@ -2927,7 +3143,7 @@
                 <w:noProof/>
                 <w:webHidden/>
               </w:rPr>
-              <w:instrText xml:space="preserve"> PAGEREF _Toc223520110 \h </w:instrText>
+              <w:instrText xml:space="preserve"> PAGEREF _Toc223637916 \h </w:instrText>
             </w:r>
             <w:r>
               <w:rPr>
@@ -2947,7 +3163,7 @@
                 <w:noProof/>
                 <w:webHidden/>
               </w:rPr>
-              <w:t>23</w:t>
+              <w:t>24</w:t>
             </w:r>
             <w:r>
               <w:rPr>
@@ -2972,7 +3188,7 @@
               <w:lang w:eastAsia="en-GB"/>
             </w:rPr>
           </w:pPr>
-          <w:hyperlink w:anchor="_Toc223520111" w:history="1">
+          <w:hyperlink w:anchor="_Toc223637917" w:history="1">
             <w:r>
               <w:rPr>
                 <w:rStyle w:val="Hyperlink"/>
@@ -2999,7 +3215,7 @@
                 <w:noProof/>
                 <w:webHidden/>
               </w:rPr>
-              <w:instrText xml:space="preserve"> PAGEREF _Toc223520111 \h </w:instrText>
+              <w:instrText xml:space="preserve"> PAGEREF _Toc223637917 \h </w:instrText>
             </w:r>
             <w:r>
               <w:rPr>
@@ -3019,7 +3235,7 @@
                 <w:noProof/>
                 <w:webHidden/>
               </w:rPr>
-              <w:t>23</w:t>
+              <w:t>24</w:t>
             </w:r>
             <w:r>
               <w:rPr>
@@ -3044,7 +3260,7 @@
               <w:lang w:eastAsia="en-GB"/>
             </w:rPr>
           </w:pPr>
-          <w:hyperlink w:anchor="_Toc223520112" w:history="1">
+          <w:hyperlink w:anchor="_Toc223637918" w:history="1">
             <w:r>
               <w:rPr>
                 <w:rStyle w:val="Hyperlink"/>
@@ -3071,7 +3287,7 @@
                 <w:noProof/>
                 <w:webHidden/>
               </w:rPr>
-              <w:instrText xml:space="preserve"> PAGEREF _Toc223520112 \h </w:instrText>
+              <w:instrText xml:space="preserve"> PAGEREF _Toc223637918 \h </w:instrText>
             </w:r>
             <w:r>
               <w:rPr>
@@ -3091,7 +3307,7 @@
                 <w:noProof/>
                 <w:webHidden/>
               </w:rPr>
-              <w:t>23</w:t>
+              <w:t>24</w:t>
             </w:r>
             <w:r>
               <w:rPr>
@@ -3116,7 +3332,7 @@
               <w:lang w:eastAsia="en-GB"/>
             </w:rPr>
           </w:pPr>
-          <w:hyperlink w:anchor="_Toc223520113" w:history="1">
+          <w:hyperlink w:anchor="_Toc223637919" w:history="1">
             <w:r>
               <w:rPr>
                 <w:rStyle w:val="Hyperlink"/>
@@ -3143,7 +3359,7 @@
                 <w:noProof/>
                 <w:webHidden/>
               </w:rPr>
-              <w:instrText xml:space="preserve"> PAGEREF _Toc223520113 \h </w:instrText>
+              <w:instrText xml:space="preserve"> PAGEREF _Toc223637919 \h </w:instrText>
             </w:r>
             <w:r>
               <w:rPr>
@@ -3163,7 +3379,7 @@
                 <w:noProof/>
                 <w:webHidden/>
               </w:rPr>
-              <w:t>24</w:t>
+              <w:t>25</w:t>
             </w:r>
             <w:r>
               <w:rPr>
@@ -3188,7 +3404,7 @@
               <w:lang w:eastAsia="en-GB"/>
             </w:rPr>
           </w:pPr>
-          <w:hyperlink w:anchor="_Toc223520114" w:history="1">
+          <w:hyperlink w:anchor="_Toc223637920" w:history="1">
             <w:r>
               <w:rPr>
                 <w:rStyle w:val="Hyperlink"/>
@@ -3215,7 +3431,7 @@
                 <w:noProof/>
                 <w:webHidden/>
               </w:rPr>
-              <w:instrText xml:space="preserve"> PAGEREF _Toc223520114 \h </w:instrText>
+              <w:instrText xml:space="preserve"> PAGEREF _Toc223637920 \h </w:instrText>
             </w:r>
             <w:r>
               <w:rPr>
@@ -3235,7 +3451,7 @@
                 <w:noProof/>
                 <w:webHidden/>
               </w:rPr>
-              <w:t>24</w:t>
+              <w:t>25</w:t>
             </w:r>
             <w:r>
               <w:rPr>
@@ -3260,7 +3476,7 @@
               <w:lang w:eastAsia="en-GB"/>
             </w:rPr>
           </w:pPr>
-          <w:hyperlink w:anchor="_Toc223520115" w:history="1">
+          <w:hyperlink w:anchor="_Toc223637921" w:history="1">
             <w:r>
               <w:rPr>
                 <w:rStyle w:val="Hyperlink"/>
@@ -3287,7 +3503,7 @@
                 <w:noProof/>
                 <w:webHidden/>
               </w:rPr>
-              <w:instrText xml:space="preserve"> PAGEREF _Toc223520115 \h </w:instrText>
+              <w:instrText xml:space="preserve"> PAGEREF _Toc223637921 \h </w:instrText>
             </w:r>
             <w:r>
               <w:rPr>
@@ -3307,7 +3523,7 @@
                 <w:noProof/>
                 <w:webHidden/>
               </w:rPr>
-              <w:t>24</w:t>
+              <w:t>25</w:t>
             </w:r>
             <w:r>
               <w:rPr>
@@ -3332,7 +3548,7 @@
               <w:lang w:eastAsia="en-GB"/>
             </w:rPr>
           </w:pPr>
-          <w:hyperlink w:anchor="_Toc223520116" w:history="1">
+          <w:hyperlink w:anchor="_Toc223637922" w:history="1">
             <w:r>
               <w:rPr>
                 <w:rStyle w:val="Hyperlink"/>
@@ -3359,7 +3575,7 @@
                 <w:noProof/>
                 <w:webHidden/>
               </w:rPr>
-              <w:instrText xml:space="preserve"> PAGEREF _Toc223520116 \h </w:instrText>
+              <w:instrText xml:space="preserve"> PAGEREF _Toc223637922 \h </w:instrText>
             </w:r>
             <w:r>
               <w:rPr>
@@ -3379,7 +3595,7 @@
                 <w:noProof/>
                 <w:webHidden/>
               </w:rPr>
-              <w:t>25</w:t>
+              <w:t>26</w:t>
             </w:r>
             <w:r>
               <w:rPr>
@@ -3404,7 +3620,7 @@
               <w:lang w:eastAsia="en-GB"/>
             </w:rPr>
           </w:pPr>
-          <w:hyperlink w:anchor="_Toc223520117" w:history="1">
+          <w:hyperlink w:anchor="_Toc223637923" w:history="1">
             <w:r>
               <w:rPr>
                 <w:rStyle w:val="Hyperlink"/>
@@ -3431,7 +3647,7 @@
                 <w:noProof/>
                 <w:webHidden/>
               </w:rPr>
-              <w:instrText xml:space="preserve"> PAGEREF _Toc223520117 \h </w:instrText>
+              <w:instrText xml:space="preserve"> PAGEREF _Toc223637923 \h </w:instrText>
             </w:r>
             <w:r>
               <w:rPr>
@@ -3451,7 +3667,7 @@
                 <w:noProof/>
                 <w:webHidden/>
               </w:rPr>
-              <w:t>26</w:t>
+              <w:t>27</w:t>
             </w:r>
             <w:r>
               <w:rPr>
@@ -3476,7 +3692,7 @@
               <w:lang w:eastAsia="en-GB"/>
             </w:rPr>
           </w:pPr>
-          <w:hyperlink w:anchor="_Toc223520118" w:history="1">
+          <w:hyperlink w:anchor="_Toc223637924" w:history="1">
             <w:r>
               <w:rPr>
                 <w:rStyle w:val="Hyperlink"/>
@@ -3503,7 +3719,7 @@
                 <w:noProof/>
                 <w:webHidden/>
               </w:rPr>
-              <w:instrText xml:space="preserve"> PAGEREF _Toc223520118 \h </w:instrText>
+              <w:instrText xml:space="preserve"> PAGEREF _Toc223637924 \h </w:instrText>
             </w:r>
             <w:r>
               <w:rPr>
@@ -3523,7 +3739,7 @@
                 <w:noProof/>
                 <w:webHidden/>
               </w:rPr>
-              <w:t>27</w:t>
+              <w:t>28</w:t>
             </w:r>
             <w:r>
               <w:rPr>
@@ -3548,7 +3764,7 @@
               <w:lang w:eastAsia="en-GB"/>
             </w:rPr>
           </w:pPr>
-          <w:hyperlink w:anchor="_Toc223520119" w:history="1">
+          <w:hyperlink w:anchor="_Toc223637925" w:history="1">
             <w:r>
               <w:rPr>
                 <w:rStyle w:val="Hyperlink"/>
@@ -3575,7 +3791,7 @@
                 <w:noProof/>
                 <w:webHidden/>
               </w:rPr>
-              <w:instrText xml:space="preserve"> PAGEREF _Toc223520119 \h </w:instrText>
+              <w:instrText xml:space="preserve"> PAGEREF _Toc223637925 \h </w:instrText>
             </w:r>
             <w:r>
               <w:rPr>
@@ -3595,7 +3811,7 @@
                 <w:noProof/>
                 <w:webHidden/>
               </w:rPr>
-              <w:t>27</w:t>
+              <w:t>28</w:t>
             </w:r>
             <w:r>
               <w:rPr>
@@ -3620,7 +3836,7 @@
               <w:lang w:eastAsia="en-GB"/>
             </w:rPr>
           </w:pPr>
-          <w:hyperlink w:anchor="_Toc223520120" w:history="1">
+          <w:hyperlink w:anchor="_Toc223637926" w:history="1">
             <w:r>
               <w:rPr>
                 <w:rStyle w:val="Hyperlink"/>
@@ -3647,7 +3863,7 @@
                 <w:noProof/>
                 <w:webHidden/>
               </w:rPr>
-              <w:instrText xml:space="preserve"> PAGEREF _Toc223520120 \h </w:instrText>
+              <w:instrText xml:space="preserve"> PAGEREF _Toc223637926 \h </w:instrText>
             </w:r>
             <w:r>
               <w:rPr>
@@ -3667,7 +3883,7 @@
                 <w:noProof/>
                 <w:webHidden/>
               </w:rPr>
-              <w:t>28</w:t>
+              <w:t>29</w:t>
             </w:r>
             <w:r>
               <w:rPr>
@@ -3692,7 +3908,7 @@
               <w:lang w:eastAsia="en-GB"/>
             </w:rPr>
           </w:pPr>
-          <w:hyperlink w:anchor="_Toc223520121" w:history="1">
+          <w:hyperlink w:anchor="_Toc223637927" w:history="1">
             <w:r>
               <w:rPr>
                 <w:rStyle w:val="Hyperlink"/>
@@ -3719,7 +3935,7 @@
                 <w:noProof/>
                 <w:webHidden/>
               </w:rPr>
-              <w:instrText xml:space="preserve"> PAGEREF _Toc223520121 \h </w:instrText>
+              <w:instrText xml:space="preserve"> PAGEREF _Toc223637927 \h </w:instrText>
             </w:r>
             <w:r>
               <w:rPr>
@@ -3739,7 +3955,7 @@
                 <w:noProof/>
                 <w:webHidden/>
               </w:rPr>
-              <w:t>28</w:t>
+              <w:t>29</w:t>
             </w:r>
             <w:r>
               <w:rPr>
@@ -3780,7 +3996,7 @@
       <w:pPr>
         <w:pStyle w:val="Heading1"/>
       </w:pPr>
-      <w:bookmarkStart w:id="0" w:name="_Toc223520073"/>
+      <w:bookmarkStart w:id="0" w:name="_Toc223637876"/>
       <w:r>
         <w:lastRenderedPageBreak/>
         <w:t>List of Acro</w:t>
@@ -3930,6 +4146,78 @@
           <w:p>
             <w:r>
               <w:t>Augmented Reality</w:t>
+            </w:r>
+          </w:p>
+        </w:tc>
+      </w:tr>
+      <w:tr>
+        <w:tc>
+          <w:tcPr>
+            <w:tcW w:w="4508" w:type="dxa"/>
+          </w:tcPr>
+          <w:p>
+            <w:r>
+              <w:t>PC</w:t>
+            </w:r>
+          </w:p>
+        </w:tc>
+        <w:tc>
+          <w:tcPr>
+            <w:tcW w:w="4508" w:type="dxa"/>
+          </w:tcPr>
+          <w:p>
+            <w:r>
+              <w:t>Personal Computer</w:t>
+            </w:r>
+          </w:p>
+        </w:tc>
+      </w:tr>
+      <w:tr>
+        <w:tc>
+          <w:tcPr>
+            <w:tcW w:w="4508" w:type="dxa"/>
+          </w:tcPr>
+          <w:p>
+            <w:r>
+              <w:t>UI</w:t>
+            </w:r>
+          </w:p>
+        </w:tc>
+        <w:tc>
+          <w:tcPr>
+            <w:tcW w:w="4508" w:type="dxa"/>
+          </w:tcPr>
+          <w:p>
+            <w:r>
+              <w:t>User Interface</w:t>
+            </w:r>
+          </w:p>
+        </w:tc>
+      </w:tr>
+      <w:tr>
+        <w:tc>
+          <w:tcPr>
+            <w:tcW w:w="4508" w:type="dxa"/>
+          </w:tcPr>
+          <w:p>
+            <w:r>
+              <w:t>HUD</w:t>
+            </w:r>
+            <w:r>
+              <w:t>s</w:t>
+            </w:r>
+          </w:p>
+        </w:tc>
+        <w:tc>
+          <w:tcPr>
+            <w:tcW w:w="4508" w:type="dxa"/>
+          </w:tcPr>
+          <w:p>
+            <w:r>
+              <w:t>Heads Up Display</w:t>
+            </w:r>
+            <w:r>
+              <w:t>s</w:t>
             </w:r>
           </w:p>
         </w:tc>
@@ -3963,7 +4251,7 @@
       <w:pPr>
         <w:pStyle w:val="Heading1"/>
       </w:pPr>
-      <w:bookmarkStart w:id="1" w:name="_Toc223520074"/>
+      <w:bookmarkStart w:id="1" w:name="_Toc223637877"/>
       <w:r>
         <w:lastRenderedPageBreak/>
         <w:t>Abstract</w:t>
@@ -4163,7 +4451,7 @@
       <w:pPr>
         <w:pStyle w:val="Heading1"/>
       </w:pPr>
-      <w:bookmarkStart w:id="2" w:name="_Toc223520075"/>
+      <w:bookmarkStart w:id="2" w:name="_Toc223637878"/>
       <w:r>
         <w:lastRenderedPageBreak/>
         <w:t>Introduction</w:t>
@@ -4210,8 +4498,13 @@
       <w:r>
         <w:t xml:space="preserve">. </w:t>
       </w:r>
-      <w:r>
-        <w:t xml:space="preserve">Porcar et al., </w:t>
+      <w:proofErr w:type="spellStart"/>
+      <w:r>
+        <w:t>Porcar</w:t>
+      </w:r>
+      <w:proofErr w:type="spellEnd"/>
+      <w:r>
+        <w:t xml:space="preserve"> et al., </w:t>
       </w:r>
       <w:r>
         <w:t>(</w:t>
@@ -4251,8 +4544,13 @@
       <w:r>
         <w:t xml:space="preserve">Research conducted by </w:t>
       </w:r>
-      <w:r>
-        <w:t xml:space="preserve">Cantó-Sancho et al., </w:t>
+      <w:proofErr w:type="spellStart"/>
+      <w:r>
+        <w:t>Cantó</w:t>
+      </w:r>
+      <w:proofErr w:type="spellEnd"/>
+      <w:r>
+        <w:t xml:space="preserve">-Sancho et al., </w:t>
       </w:r>
       <w:r>
         <w:t>(</w:t>
@@ -4736,7 +5034,7 @@
       <w:pPr>
         <w:pStyle w:val="Heading1"/>
       </w:pPr>
-      <w:bookmarkStart w:id="3" w:name="_Toc223520076"/>
+      <w:bookmarkStart w:id="3" w:name="_Toc223637879"/>
       <w:r>
         <w:lastRenderedPageBreak/>
         <w:t>Project Aim</w:t>
@@ -4786,7 +5084,7 @@
           <w:rFonts w:asciiTheme="minorHAnsi" w:hAnsiTheme="minorHAnsi"/>
         </w:rPr>
       </w:pPr>
-      <w:bookmarkStart w:id="4" w:name="_Toc223520077"/>
+      <w:bookmarkStart w:id="4" w:name="_Toc223637880"/>
       <w:r>
         <w:rPr>
           <w:rFonts w:asciiTheme="minorHAnsi" w:hAnsiTheme="minorHAnsi"/>
@@ -5073,7 +5371,7 @@
       <w:pPr>
         <w:pStyle w:val="Heading1"/>
       </w:pPr>
-      <w:bookmarkStart w:id="5" w:name="_Toc223520078"/>
+      <w:bookmarkStart w:id="5" w:name="_Toc223637881"/>
       <w:r>
         <w:lastRenderedPageBreak/>
         <w:t>Project Planning</w:t>
@@ -5454,7 +5752,7 @@
           <w:rFonts w:asciiTheme="minorHAnsi" w:hAnsiTheme="minorHAnsi"/>
         </w:rPr>
       </w:pPr>
-      <w:bookmarkStart w:id="6" w:name="_Toc223520079"/>
+      <w:bookmarkStart w:id="6" w:name="_Toc223637882"/>
       <w:r>
         <w:rPr>
           <w:rFonts w:asciiTheme="minorHAnsi" w:hAnsiTheme="minorHAnsi"/>
@@ -5656,7 +5954,7 @@
           <w:rFonts w:asciiTheme="minorHAnsi" w:hAnsiTheme="minorHAnsi"/>
         </w:rPr>
       </w:pPr>
-      <w:bookmarkStart w:id="7" w:name="_Toc223520080"/>
+      <w:bookmarkStart w:id="7" w:name="_Toc223637883"/>
       <w:r>
         <w:rPr>
           <w:rFonts w:asciiTheme="minorHAnsi" w:hAnsiTheme="minorHAnsi"/>
@@ -5895,7 +6193,21 @@
         <w:rPr>
           <w:rFonts w:cs="Arial"/>
         </w:rPr>
-        <w:t>Clear on screen prompts to guide and support users that aren’t familiar with VR equipment</w:t>
+        <w:t xml:space="preserve">Clear </w:t>
+      </w:r>
+      <w:proofErr w:type="gramStart"/>
+      <w:r>
+        <w:rPr>
+          <w:rFonts w:cs="Arial"/>
+        </w:rPr>
+        <w:t>on screen</w:t>
+      </w:r>
+      <w:proofErr w:type="gramEnd"/>
+      <w:r>
+        <w:rPr>
+          <w:rFonts w:cs="Arial"/>
+        </w:rPr>
+        <w:t xml:space="preserve"> prompts to guide and support users that aren’t familiar with VR equipment</w:t>
       </w:r>
     </w:p>
     <w:p>
@@ -5923,7 +6235,7 @@
           <w:rFonts w:asciiTheme="minorHAnsi" w:hAnsiTheme="minorHAnsi"/>
         </w:rPr>
       </w:pPr>
-      <w:bookmarkStart w:id="8" w:name="_Toc223520081"/>
+      <w:bookmarkStart w:id="8" w:name="_Toc223637884"/>
       <w:r>
         <w:rPr>
           <w:rFonts w:asciiTheme="minorHAnsi" w:hAnsiTheme="minorHAnsi"/>
@@ -5940,7 +6252,7 @@
           <w:rFonts w:asciiTheme="minorHAnsi" w:hAnsiTheme="minorHAnsi"/>
         </w:rPr>
       </w:pPr>
-      <w:bookmarkStart w:id="9" w:name="_Toc223520082"/>
+      <w:bookmarkStart w:id="9" w:name="_Toc223637885"/>
       <w:r>
         <w:rPr>
           <w:rFonts w:asciiTheme="minorHAnsi" w:hAnsiTheme="minorHAnsi"/>
@@ -6024,7 +6336,7 @@
           <w:rFonts w:asciiTheme="minorHAnsi" w:hAnsiTheme="minorHAnsi"/>
         </w:rPr>
       </w:pPr>
-      <w:bookmarkStart w:id="10" w:name="_Toc223520083"/>
+      <w:bookmarkStart w:id="10" w:name="_Toc223637886"/>
       <w:r>
         <w:rPr>
           <w:rFonts w:asciiTheme="minorHAnsi" w:hAnsiTheme="minorHAnsi"/>
@@ -6037,7 +6349,8 @@
       <w:pPr>
         <w:pStyle w:val="Heading3"/>
       </w:pPr>
-      <w:bookmarkStart w:id="11" w:name="_Toc223520084"/>
+      <w:bookmarkStart w:id="11" w:name="_Toc223637887"/>
+      <w:proofErr w:type="spellStart"/>
       <w:r>
         <w:t>Ey</w:t>
       </w:r>
@@ -6048,6 +6361,7 @@
         <w:t>si</w:t>
       </w:r>
       <w:bookmarkEnd w:id="11"/>
+      <w:proofErr w:type="spellEnd"/>
     </w:p>
     <w:p>
       <w:r>
@@ -6062,9 +6376,11 @@
       <w:r>
         <w:t xml:space="preserve"> discussed </w:t>
       </w:r>
+      <w:proofErr w:type="spellStart"/>
       <w:r>
         <w:t>Eyesi</w:t>
       </w:r>
+      <w:proofErr w:type="spellEnd"/>
       <w:r>
         <w:t>,</w:t>
       </w:r>
@@ -6177,7 +6493,15 @@
         <w:t xml:space="preserve">In addition to this, there is an </w:t>
       </w:r>
       <w:r>
-        <w:t xml:space="preserve">online training portal (vrmnet) </w:t>
+        <w:t>online training portal (</w:t>
+      </w:r>
+      <w:proofErr w:type="spellStart"/>
+      <w:r>
+        <w:t>vrmnet</w:t>
+      </w:r>
+      <w:proofErr w:type="spellEnd"/>
+      <w:r>
+        <w:t xml:space="preserve">) </w:t>
       </w:r>
       <w:r>
         <w:t>allowing comparison between trainees</w:t>
@@ -6312,7 +6636,15 @@
         <w:t xml:space="preserve"> </w:t>
       </w:r>
       <w:r>
-        <w:t xml:space="preserve">While Eyesi is effective for medical training for medical professionals, </w:t>
+        <w:t xml:space="preserve">While </w:t>
+      </w:r>
+      <w:proofErr w:type="spellStart"/>
+      <w:r>
+        <w:t>Eyesi</w:t>
+      </w:r>
+      <w:proofErr w:type="spellEnd"/>
+      <w:r>
+        <w:t xml:space="preserve"> is effective for medical training for medical professionals, </w:t>
       </w:r>
       <w:r>
         <w:t xml:space="preserve">similar </w:t>
@@ -6334,11 +6666,13 @@
       <w:pPr>
         <w:pStyle w:val="Heading3"/>
       </w:pPr>
-      <w:bookmarkStart w:id="12" w:name="_Toc223520085"/>
+      <w:bookmarkStart w:id="12" w:name="_Toc223637888"/>
+      <w:proofErr w:type="spellStart"/>
       <w:r>
         <w:t>OntoPhaco</w:t>
       </w:r>
       <w:bookmarkEnd w:id="12"/>
+      <w:proofErr w:type="spellEnd"/>
     </w:p>
     <w:p>
       <w:r>
@@ -6357,7 +6691,15 @@
         <w:t>d</w:t>
       </w:r>
       <w:r>
-        <w:t xml:space="preserve"> OntoPhaco, a</w:t>
+        <w:t xml:space="preserve"> </w:t>
+      </w:r>
+      <w:proofErr w:type="spellStart"/>
+      <w:r>
+        <w:t>OntoPhaco</w:t>
+      </w:r>
+      <w:proofErr w:type="spellEnd"/>
+      <w:r>
+        <w:t>, a</w:t>
       </w:r>
       <w:r>
         <w:t>n</w:t>
@@ -6490,173 +6832,191 @@
           <w:rFonts w:cs="TimesLTStd-Roman"/>
           <w:kern w:val="0"/>
         </w:rPr>
-        <w:t>Since OntoPhaco</w:t>
-      </w:r>
+        <w:t xml:space="preserve">Since </w:t>
+      </w:r>
+      <w:proofErr w:type="spellStart"/>
       <w:r>
         <w:rPr>
           <w:rFonts w:cs="TimesLTStd-Roman"/>
           <w:kern w:val="0"/>
         </w:rPr>
-        <w:t>’s</w:t>
+        <w:t>OntoPhaco</w:t>
       </w:r>
       <w:r>
         <w:rPr>
           <w:rFonts w:cs="TimesLTStd-Roman"/>
           <w:kern w:val="0"/>
         </w:rPr>
-        <w:t xml:space="preserve"> </w:t>
-      </w:r>
-      <w:r>
-        <w:t>s</w:t>
-      </w:r>
-      <w:r>
-        <w:t xml:space="preserve">ystematic verification and validation processes </w:t>
-      </w:r>
-      <w:r>
-        <w:t>include</w:t>
-      </w:r>
-      <w:r>
-        <w:t xml:space="preserve"> </w:t>
-      </w:r>
-      <w:r>
-        <w:t xml:space="preserve">theoretical </w:t>
-      </w:r>
-      <w:r>
-        <w:t>evaluat</w:t>
-      </w:r>
-      <w:r>
-        <w:t xml:space="preserve">ion </w:t>
-      </w:r>
-      <w:r>
-        <w:t>and expert feedback</w:t>
-      </w:r>
+        <w:t>’s</w:t>
+      </w:r>
+      <w:proofErr w:type="spellEnd"/>
       <w:r>
         <w:rPr>
           <w:rFonts w:cs="TimesLTStd-Roman"/>
           <w:kern w:val="0"/>
         </w:rPr>
-        <w:t xml:space="preserve">, each change, minor or major </w:t>
+        <w:t xml:space="preserve"> </w:t>
+      </w:r>
+      <w:r>
+        <w:t>s</w:t>
+      </w:r>
+      <w:r>
+        <w:t xml:space="preserve">ystematic verification and validation processes </w:t>
+      </w:r>
+      <w:r>
+        <w:t>include</w:t>
+      </w:r>
+      <w:r>
+        <w:t xml:space="preserve"> </w:t>
+      </w:r>
+      <w:r>
+        <w:t xml:space="preserve">theoretical </w:t>
+      </w:r>
+      <w:r>
+        <w:t>evaluat</w:t>
+      </w:r>
+      <w:r>
+        <w:t xml:space="preserve">ion </w:t>
+      </w:r>
+      <w:r>
+        <w:t>and expert feedback</w:t>
       </w:r>
       <w:r>
         <w:rPr>
           <w:rFonts w:cs="TimesLTStd-Roman"/>
           <w:kern w:val="0"/>
         </w:rPr>
-        <w:t>is</w:t>
+        <w:t xml:space="preserve">, each change, minor or major </w:t>
       </w:r>
       <w:r>
         <w:rPr>
           <w:rFonts w:cs="TimesLTStd-Roman"/>
           <w:kern w:val="0"/>
         </w:rPr>
-        <w:t xml:space="preserve"> verified and validate</w:t>
+        <w:t>is</w:t>
       </w:r>
       <w:r>
         <w:rPr>
           <w:rFonts w:cs="TimesLTStd-Roman"/>
           <w:kern w:val="0"/>
         </w:rPr>
-        <w:t>d</w:t>
-      </w:r>
-      <w:r>
-        <w:t>.</w:t>
+        <w:t xml:space="preserve"> verified and validate</w:t>
       </w:r>
       <w:r>
         <w:rPr>
           <w:rFonts w:cs="TimesLTStd-Roman"/>
           <w:kern w:val="0"/>
         </w:rPr>
-        <w:t xml:space="preserve"> </w:t>
+        <w:t>d</w:t>
+      </w:r>
+      <w:r>
+        <w:t>.</w:t>
       </w:r>
       <w:r>
         <w:rPr>
           <w:rFonts w:cs="TimesLTStd-Roman"/>
           <w:kern w:val="0"/>
         </w:rPr>
-        <w:t>OntoPhaco demonstrates VR</w:t>
-      </w:r>
+        <w:t xml:space="preserve"> </w:t>
+      </w:r>
+      <w:proofErr w:type="spellStart"/>
       <w:r>
         <w:rPr>
           <w:rFonts w:cs="TimesLTStd-Roman"/>
           <w:kern w:val="0"/>
         </w:rPr>
-        <w:t>’</w:t>
-      </w:r>
+        <w:t>OntoPhaco</w:t>
+      </w:r>
+      <w:proofErr w:type="spellEnd"/>
       <w:r>
         <w:rPr>
           <w:rFonts w:cs="TimesLTStd-Roman"/>
           <w:kern w:val="0"/>
         </w:rPr>
-        <w:t xml:space="preserve">s effectiveness </w:t>
+        <w:t xml:space="preserve"> demonstrates VR</w:t>
       </w:r>
       <w:r>
         <w:rPr>
           <w:rFonts w:cs="TimesLTStd-Roman"/>
           <w:kern w:val="0"/>
         </w:rPr>
-        <w:t xml:space="preserve">paired </w:t>
+        <w:t>’</w:t>
       </w:r>
       <w:r>
         <w:rPr>
           <w:rFonts w:cs="TimesLTStd-Roman"/>
           <w:kern w:val="0"/>
         </w:rPr>
-        <w:t>with ontology for medical training</w:t>
+        <w:t xml:space="preserve">s effectiveness </w:t>
       </w:r>
       <w:r>
         <w:rPr>
           <w:rFonts w:cs="TimesLTStd-Roman"/>
           <w:kern w:val="0"/>
         </w:rPr>
-        <w:t>. T</w:t>
+        <w:t xml:space="preserve">paired </w:t>
       </w:r>
       <w:r>
         <w:rPr>
           <w:rFonts w:cs="TimesLTStd-Roman"/>
           <w:kern w:val="0"/>
         </w:rPr>
-        <w:t>his project</w:t>
+        <w:t>with ontology for medical training</w:t>
       </w:r>
       <w:r>
         <w:rPr>
           <w:rFonts w:cs="TimesLTStd-Roman"/>
           <w:kern w:val="0"/>
         </w:rPr>
-        <w:t xml:space="preserve"> applies similar immersi</w:t>
+        <w:t>. T</w:t>
       </w:r>
       <w:r>
         <w:rPr>
           <w:rFonts w:cs="TimesLTStd-Roman"/>
           <w:kern w:val="0"/>
         </w:rPr>
-        <w:t>ve</w:t>
+        <w:t>his project</w:t>
       </w:r>
       <w:r>
         <w:rPr>
           <w:rFonts w:cs="TimesLTStd-Roman"/>
           <w:kern w:val="0"/>
         </w:rPr>
-        <w:t xml:space="preserve"> and educational knowledge </w:t>
+        <w:t xml:space="preserve"> applies similar immersi</w:t>
       </w:r>
       <w:r>
         <w:rPr>
           <w:rFonts w:cs="TimesLTStd-Roman"/>
           <w:kern w:val="0"/>
         </w:rPr>
-        <w:t xml:space="preserve">for DES to raise awareness, </w:t>
+        <w:t>ve</w:t>
       </w:r>
       <w:r>
         <w:rPr>
           <w:rFonts w:cs="TimesLTStd-Roman"/>
           <w:kern w:val="0"/>
         </w:rPr>
-        <w:t xml:space="preserve">spreading the </w:t>
+        <w:t xml:space="preserve"> and educational knowledge </w:t>
       </w:r>
       <w:r>
         <w:rPr>
           <w:rFonts w:cs="TimesLTStd-Roman"/>
           <w:kern w:val="0"/>
         </w:rPr>
+        <w:t xml:space="preserve">for DES to raise awareness, </w:t>
+      </w:r>
+      <w:r>
+        <w:rPr>
+          <w:rFonts w:cs="TimesLTStd-Roman"/>
+          <w:kern w:val="0"/>
+        </w:rPr>
+        <w:t xml:space="preserve">spreading the </w:t>
+      </w:r>
+      <w:r>
+        <w:rPr>
+          <w:rFonts w:cs="TimesLTStd-Roman"/>
+          <w:kern w:val="0"/>
+        </w:rPr>
         <w:t>benefits of VR use in education beyond professional training.</w:t>
       </w:r>
     </w:p>
@@ -6664,7 +7024,7 @@
       <w:pPr>
         <w:pStyle w:val="Heading3"/>
       </w:pPr>
-      <w:bookmarkStart w:id="13" w:name="_Toc223520086"/>
+      <w:bookmarkStart w:id="13" w:name="_Toc223637889"/>
       <w:r>
         <w:lastRenderedPageBreak/>
         <w:t>I</w:t>
@@ -6860,7 +7220,7 @@
       <w:pPr>
         <w:pStyle w:val="Heading3"/>
       </w:pPr>
-      <w:bookmarkStart w:id="14" w:name="_Toc223520087"/>
+      <w:bookmarkStart w:id="14" w:name="_Toc223637890"/>
       <w:r>
         <w:t>Opportunities for innovation</w:t>
       </w:r>
@@ -6870,17 +7230,27 @@
       <w:r>
         <w:t xml:space="preserve">While </w:t>
       </w:r>
-      <w:r>
-        <w:t>Eyesi focuses on hands on surgical practices</w:t>
+      <w:proofErr w:type="spellStart"/>
+      <w:r>
+        <w:t>Eyesi</w:t>
+      </w:r>
+      <w:proofErr w:type="spellEnd"/>
+      <w:r>
+        <w:t xml:space="preserve"> focuses on hands on surgical practices</w:t>
       </w:r>
       <w:r>
         <w:t xml:space="preserve">, </w:t>
       </w:r>
+      <w:proofErr w:type="spellStart"/>
       <w:r>
         <w:t>O</w:t>
       </w:r>
       <w:r>
-        <w:t>ntoPhaco focuses on the way knowledge is represented and conceptual understanding</w:t>
+        <w:t>ntoPhaco</w:t>
+      </w:r>
+      <w:proofErr w:type="spellEnd"/>
+      <w:r>
+        <w:t xml:space="preserve"> focuses on the way knowledge is represented and conceptual understanding</w:t>
       </w:r>
       <w:r>
         <w:t xml:space="preserve">. </w:t>
@@ -6978,7 +7348,7 @@
           <w:rFonts w:asciiTheme="minorHAnsi" w:hAnsiTheme="minorHAnsi"/>
         </w:rPr>
       </w:pPr>
-      <w:bookmarkStart w:id="15" w:name="_Toc223520088"/>
+      <w:bookmarkStart w:id="15" w:name="_Toc223637891"/>
       <w:r>
         <w:rPr>
           <w:rFonts w:asciiTheme="minorHAnsi" w:hAnsiTheme="minorHAnsi"/>
@@ -6991,7 +7361,7 @@
       <w:pPr>
         <w:pStyle w:val="Heading3"/>
       </w:pPr>
-      <w:bookmarkStart w:id="16" w:name="_Toc223520089"/>
+      <w:bookmarkStart w:id="16" w:name="_Toc223637892"/>
       <w:r>
         <w:t>VR in medical education</w:t>
       </w:r>
@@ -7138,9 +7508,19 @@
       <w:r>
         <w:t xml:space="preserve">Examples such as </w:t>
       </w:r>
-      <w:r>
-        <w:t>Mediverse by Goggleminds</w:t>
-      </w:r>
+      <w:proofErr w:type="spellStart"/>
+      <w:r>
+        <w:t>Mediverse</w:t>
+      </w:r>
+      <w:proofErr w:type="spellEnd"/>
+      <w:r>
+        <w:t xml:space="preserve"> by </w:t>
+      </w:r>
+      <w:proofErr w:type="spellStart"/>
+      <w:r>
+        <w:t>Goggleminds</w:t>
+      </w:r>
+      <w:proofErr w:type="spellEnd"/>
       <w:r>
         <w:t xml:space="preserve"> </w:t>
       </w:r>
@@ -7154,7 +7534,15 @@
         <w:t xml:space="preserve"> to healthcare providers and medical schools</w:t>
       </w:r>
       <w:r>
-        <w:t>. ClassVR by Systems improve</w:t>
+        <w:t xml:space="preserve">. </w:t>
+      </w:r>
+      <w:proofErr w:type="spellStart"/>
+      <w:r>
+        <w:t>ClassVR</w:t>
+      </w:r>
+      <w:proofErr w:type="spellEnd"/>
+      <w:r>
+        <w:t xml:space="preserve"> by Systems improve</w:t>
       </w:r>
       <w:r>
         <w:t>s</w:t>
@@ -7171,8 +7559,13 @@
       <w:r>
         <w:t xml:space="preserve"> </w:t>
       </w:r>
-      <w:r>
-        <w:t xml:space="preserve">PrismsVR </w:t>
+      <w:proofErr w:type="spellStart"/>
+      <w:r>
+        <w:t>PrismsVR</w:t>
+      </w:r>
+      <w:proofErr w:type="spellEnd"/>
+      <w:r>
+        <w:t xml:space="preserve"> </w:t>
       </w:r>
       <w:r>
         <w:t xml:space="preserve">helps students grasp core concepts in algebra and geometry, by </w:t>
@@ -7258,7 +7651,7 @@
       <w:pPr>
         <w:pStyle w:val="Heading3"/>
       </w:pPr>
-      <w:bookmarkStart w:id="17" w:name="_Toc223520090"/>
+      <w:bookmarkStart w:id="17" w:name="_Toc223637893"/>
       <w:r>
         <w:lastRenderedPageBreak/>
         <w:t>VR in Health Awareness</w:t>
@@ -7451,7 +7844,7 @@
           <w:rFonts w:asciiTheme="minorHAnsi" w:hAnsiTheme="minorHAnsi"/>
         </w:rPr>
       </w:pPr>
-      <w:bookmarkStart w:id="18" w:name="_Toc223520091"/>
+      <w:bookmarkStart w:id="18" w:name="_Toc223637894"/>
       <w:r>
         <w:rPr>
           <w:rFonts w:asciiTheme="minorHAnsi" w:hAnsiTheme="minorHAnsi"/>
@@ -7671,7 +8064,7 @@
       <w:pPr>
         <w:pStyle w:val="Heading1"/>
       </w:pPr>
-      <w:bookmarkStart w:id="19" w:name="_Toc223520092"/>
+      <w:bookmarkStart w:id="19" w:name="_Toc223637895"/>
       <w:r>
         <w:lastRenderedPageBreak/>
         <w:t>Appendices</w:t>
@@ -7682,7 +8075,7 @@
       <w:pPr>
         <w:pStyle w:val="Heading2"/>
       </w:pPr>
-      <w:bookmarkStart w:id="20" w:name="_Toc223520093"/>
+      <w:bookmarkStart w:id="20" w:name="_Toc223637896"/>
       <w:r>
         <w:t>Ethics Checklist</w:t>
       </w:r>
@@ -7824,7 +8217,7 @@
       <w:pPr>
         <w:pStyle w:val="Heading2"/>
       </w:pPr>
-      <w:bookmarkStart w:id="21" w:name="_Toc223520094"/>
+      <w:bookmarkStart w:id="21" w:name="_Toc223637897"/>
       <w:r>
         <w:lastRenderedPageBreak/>
         <w:t>Project Timeline Gant</w:t>
@@ -8020,7 +8413,7 @@
       <w:pPr>
         <w:pStyle w:val="Heading1"/>
       </w:pPr>
-      <w:bookmarkStart w:id="22" w:name="_Toc223520095"/>
+      <w:bookmarkStart w:id="22" w:name="_Toc223637898"/>
       <w:r>
         <w:lastRenderedPageBreak/>
         <w:t>Methodology</w:t>
@@ -8031,7 +8424,7 @@
       <w:pPr>
         <w:pStyle w:val="Heading2"/>
       </w:pPr>
-      <w:bookmarkStart w:id="23" w:name="_Toc223520096"/>
+      <w:bookmarkStart w:id="23" w:name="_Toc223637899"/>
       <w:r>
         <w:t>Prototype Implementation</w:t>
       </w:r>
@@ -8041,7 +8434,7 @@
       <w:pPr>
         <w:pStyle w:val="Heading3"/>
       </w:pPr>
-      <w:bookmarkStart w:id="24" w:name="_Toc223520097"/>
+      <w:bookmarkStart w:id="24" w:name="_Toc223637900"/>
       <w:r>
         <w:t>Usability and Flow</w:t>
       </w:r>
@@ -8124,7 +8517,7 @@
       <w:pPr>
         <w:pStyle w:val="Heading3"/>
       </w:pPr>
-      <w:bookmarkStart w:id="25" w:name="_Toc223520098"/>
+      <w:bookmarkStart w:id="25" w:name="_Toc223637901"/>
       <w:r>
         <w:t xml:space="preserve">Environment Design and </w:t>
       </w:r>
@@ -8150,7 +8543,19 @@
         <w:t xml:space="preserve"> </w:t>
       </w:r>
       <w:r>
-        <w:t>was created to replicate an office or home desk style environment. The scene consisted of a desk PC setup</w:t>
+        <w:t xml:space="preserve">was created to replicate an office or home desk style environment. The scene consisted of a desk PC </w:t>
+      </w:r>
+      <w:r>
+        <w:t>(</w:t>
+      </w:r>
+      <w:r>
+        <w:t>personal computer</w:t>
+      </w:r>
+      <w:r>
+        <w:t xml:space="preserve">) </w:t>
+      </w:r>
+      <w:r>
+        <w:t>setup</w:t>
       </w:r>
       <w:r>
         <w:t>,</w:t>
@@ -8247,7 +8652,7 @@
       <w:pPr>
         <w:pStyle w:val="Heading3"/>
       </w:pPr>
-      <w:bookmarkStart w:id="26" w:name="_Toc223520099"/>
+      <w:bookmarkStart w:id="26" w:name="_Toc223637902"/>
       <w:r>
         <w:t>Objective System Implementation</w:t>
       </w:r>
@@ -8288,7 +8693,15 @@
         <w:t>ere</w:t>
       </w:r>
       <w:r>
-        <w:t xml:space="preserve"> stored within the VRGameMode blueprint, with objectives being updated during runtime as conditions were satisfied </w:t>
+        <w:t xml:space="preserve"> stored within the </w:t>
+      </w:r>
+      <w:proofErr w:type="spellStart"/>
+      <w:r>
+        <w:t>VRGameMode</w:t>
+      </w:r>
+      <w:proofErr w:type="spellEnd"/>
+      <w:r>
+        <w:t xml:space="preserve"> blueprint, with objectives being updated during runtime as conditions were satisfied </w:t>
       </w:r>
       <w:r>
         <w:t>during</w:t>
@@ -8352,9 +8765,12 @@
       <w:pPr>
         <w:pStyle w:val="Heading3"/>
       </w:pPr>
-      <w:bookmarkStart w:id="27" w:name="_Toc223520100"/>
-      <w:r>
-        <w:t xml:space="preserve">Player Objective </w:t>
+      <w:bookmarkStart w:id="27" w:name="_Toc223637903"/>
+      <w:r>
+        <w:t>User</w:t>
+      </w:r>
+      <w:r>
+        <w:t xml:space="preserve"> Objective </w:t>
       </w:r>
       <w:r>
         <w:t>Feedback</w:t>
@@ -8362,12 +8778,106 @@
       <w:bookmarkEnd w:id="27"/>
     </w:p>
     <w:p>
-      <w:bookmarkStart w:id="28" w:name="_Toc223520101"/>
+      <w:r>
+        <w:t>Users</w:t>
+      </w:r>
+      <w:r>
+        <w:t xml:space="preserve"> received objective feedback through the monitor object within the level. UI</w:t>
+      </w:r>
+      <w:r>
+        <w:t xml:space="preserve"> </w:t>
+      </w:r>
+      <w:r>
+        <w:t xml:space="preserve">(User Interface) </w:t>
+      </w:r>
+      <w:r>
+        <w:t xml:space="preserve">within the level </w:t>
+      </w:r>
+      <w:r>
+        <w:t xml:space="preserve">was </w:t>
+      </w:r>
+      <w:r>
+        <w:t>chosen over traditional HUD</w:t>
+      </w:r>
+      <w:r>
+        <w:t>s</w:t>
+      </w:r>
+      <w:r>
+        <w:t xml:space="preserve"> (H</w:t>
+      </w:r>
+      <w:r>
+        <w:t xml:space="preserve">eads </w:t>
+      </w:r>
+      <w:r>
+        <w:t>U</w:t>
+      </w:r>
+      <w:r>
+        <w:t xml:space="preserve">p </w:t>
+      </w:r>
+      <w:r>
+        <w:t>D</w:t>
+      </w:r>
+      <w:r>
+        <w:t>isplay</w:t>
+      </w:r>
+      <w:r>
+        <w:t>s</w:t>
+      </w:r>
+      <w:r>
+        <w:t xml:space="preserve">) seen within video games so that the experience would be more immersive with users needing to interact and search the environment around them. The UI is implemented as a world space widget attached to the screen mesh of a monitor that uses a widget blueprint to control the information displayed. The widget consists of the current objective description to prompt users along with a </w:t>
+      </w:r>
+      <w:r>
+        <w:lastRenderedPageBreak/>
+        <w:t xml:space="preserve">progress bar that fills up green as the necessary requirements are being met to complete the objective. </w:t>
+      </w:r>
+      <w:r>
+        <w:t>Event</w:t>
+      </w:r>
+      <w:r>
+        <w:t xml:space="preserve"> dispatchers control updates to the widget updat</w:t>
+      </w:r>
+      <w:r>
+        <w:t>ing it</w:t>
+      </w:r>
+      <w:r>
+        <w:t xml:space="preserve"> in real time</w:t>
+      </w:r>
+      <w:r>
+        <w:t>. W</w:t>
+      </w:r>
+      <w:r>
+        <w:t>hen an objective is complete</w:t>
+      </w:r>
+      <w:r>
+        <w:t>,</w:t>
+      </w:r>
+      <w:r>
+        <w:t xml:space="preserve"> the progress bar resets with the objective description changing to the next. </w:t>
+      </w:r>
+      <w:r>
+        <w:t>Furthermore, when</w:t>
+      </w:r>
+      <w:r>
+        <w:t xml:space="preserve"> the experience is </w:t>
+      </w:r>
+      <w:r>
+        <w:t>completed,</w:t>
+      </w:r>
+      <w:r>
+        <w:t xml:space="preserve"> users are informed using a message that they have completed all the objectives before exiting back to the </w:t>
+      </w:r>
+      <w:r>
+        <w:t xml:space="preserve">start screen </w:t>
+      </w:r>
+      <w:r>
+        <w:t>menu.</w:t>
+      </w:r>
     </w:p>
     <w:p>
       <w:pPr>
         <w:pStyle w:val="Heading3"/>
       </w:pPr>
+      <w:bookmarkStart w:id="28" w:name="_Toc223637904"/>
       <w:r>
         <w:t>Objective Based Interact</w:t>
       </w:r>
@@ -8383,12 +8893,59 @@
       <w:bookmarkEnd w:id="28"/>
     </w:p>
     <w:p>
-      <w:bookmarkStart w:id="29" w:name="_Toc223520102"/>
+      <w:r>
+        <w:t xml:space="preserve">To enhance the </w:t>
+      </w:r>
+      <w:r>
+        <w:t>experience</w:t>
+      </w:r>
+      <w:r>
+        <w:t xml:space="preserve"> of the application, getting the user to interact with objects within the scene was important</w:t>
+      </w:r>
+      <w:r>
+        <w:t xml:space="preserve"> to increase immersion</w:t>
+      </w:r>
+      <w:r>
+        <w:t xml:space="preserve">. These interactions included staring at the screen for a certain duration, looking at an object far away or on the desk and turning a light switch on and off. By doing this, the user would replicate actual actions that cause symptoms of DES and preventative measures reinforcing the learning being undertaken. </w:t>
+      </w:r>
+    </w:p>
+    <w:p>
+      <w:r>
+        <w:t>A</w:t>
+      </w:r>
+      <w:r>
+        <w:t xml:space="preserve"> line trace channel </w:t>
+      </w:r>
+      <w:r>
+        <w:t xml:space="preserve">was used </w:t>
+      </w:r>
+      <w:r>
+        <w:t>that took the camera position as the starting location</w:t>
+      </w:r>
+      <w:r>
+        <w:t xml:space="preserve"> and a distance value multiplied by the forward vector of the camera to detect collision events with interactable objects.</w:t>
+      </w:r>
+      <w:r>
+        <w:t xml:space="preserve"> Whenever a hit was received, depending on which objective was the</w:t>
+      </w:r>
+      <w:r>
+        <w:t xml:space="preserve"> </w:t>
+      </w:r>
+      <w:r>
+        <w:t>current one it would update according to if the object being looked at was the right one to progress that specific objective. Users were notified by the UI on the monitor to which object needed to be looked at or interacted with. For the light switch, interaction using the grab trigger was needed to simulate the light switching on and off. Once the specific condition was met</w:t>
+      </w:r>
+      <w:r>
+        <w:t>,</w:t>
+      </w:r>
+      <w:r>
+        <w:t xml:space="preserve"> event dispatchers were fired from those objects to notify of objective updates.</w:t>
+      </w:r>
     </w:p>
     <w:p>
       <w:pPr>
         <w:pStyle w:val="Heading3"/>
       </w:pPr>
+      <w:bookmarkStart w:id="29" w:name="_Toc223637905"/>
       <w:r>
         <w:t>Post Processing Effects</w:t>
       </w:r>
@@ -8398,17 +8955,100 @@
       <w:bookmarkEnd w:id="29"/>
     </w:p>
     <w:p>
-      <w:bookmarkStart w:id="30" w:name="_Toc223520103"/>
+      <w:r>
+        <w:t>Simulating the symptoms of DES required enabling specific post processing effects within the camera</w:t>
+      </w:r>
+      <w:r>
+        <w:t>’s post processing component</w:t>
+      </w:r>
+      <w:r>
+        <w:t xml:space="preserve">. These effects were </w:t>
+      </w:r>
+      <w:proofErr w:type="gramStart"/>
+      <w:r>
+        <w:t>vignette</w:t>
+      </w:r>
+      <w:proofErr w:type="gramEnd"/>
+      <w:r>
+        <w:t xml:space="preserve"> to simulate eye fatigue, bloom for light sensitivity and blur for focus strain. Vignette and bloom post processing effects were triggered through adjusting their post processing variables within the camera post processing component. However, for blur a post processing material was required to create the radial blur. When objectives progressed triggering the simulation of symptoms, a timeline was used to progressively increase the value of an effect gradually over a duration. This decision was made to accommodate eyes adjusting to the changes of the camera as these effects were being triggered.</w:t>
+      </w:r>
+      <w:r>
+        <w:t xml:space="preserve"> The timeline was then used in reverse to revert the symptoms returning the camera view back to the original state it was in.</w:t>
+      </w:r>
     </w:p>
     <w:p>
       <w:pPr>
         <w:pStyle w:val="Heading3"/>
       </w:pPr>
+      <w:bookmarkStart w:id="30" w:name="_Toc223637906"/>
+      <w:r>
+        <w:t>User</w:t>
+      </w:r>
+      <w:r>
+        <w:t xml:space="preserve"> Look Direction and Attention Detection</w:t>
+      </w:r>
+      <w:bookmarkEnd w:id="30"/>
+    </w:p>
+    <w:p/>
+    <w:p>
+      <w:pPr>
+        <w:pStyle w:val="Heading2"/>
+      </w:pPr>
+      <w:bookmarkStart w:id="31" w:name="_Toc223637907"/>
+      <w:r>
+        <w:t>Polish and Improvements</w:t>
+      </w:r>
+      <w:bookmarkEnd w:id="31"/>
+    </w:p>
+    <w:p/>
+    <w:p>
+      <w:pPr>
+        <w:pStyle w:val="Heading1"/>
+      </w:pPr>
+      <w:bookmarkStart w:id="32" w:name="_Toc223637908"/>
       <w:r>
         <w:lastRenderedPageBreak/>
-        <w:t>Player Look Direction and Attention Detection</w:t>
-      </w:r>
-      <w:bookmarkEnd w:id="30"/>
+        <w:t>Results</w:t>
+      </w:r>
+      <w:bookmarkEnd w:id="32"/>
+    </w:p>
+    <w:p>
+      <w:pPr>
+        <w:pStyle w:val="Heading2"/>
+      </w:pPr>
+      <w:bookmarkStart w:id="33" w:name="_Toc223637909"/>
+      <w:r>
+        <w:t>First Result Set</w:t>
+      </w:r>
+      <w:bookmarkEnd w:id="33"/>
+    </w:p>
+    <w:p>
+      <w:pPr>
+        <w:pStyle w:val="Heading2"/>
+        <w:rPr>
+          <w:sz w:val="40"/>
+          <w:szCs w:val="40"/>
+        </w:rPr>
+      </w:pPr>
+      <w:bookmarkStart w:id="34" w:name="_Toc223637910"/>
+      <w:r>
+        <w:t>Second Result Set</w:t>
+      </w:r>
+      <w:bookmarkEnd w:id="34"/>
+      <w:r>
+        <w:br w:type="page"/>
+      </w:r>
+    </w:p>
+    <w:p>
+      <w:pPr>
+        <w:pStyle w:val="Heading1"/>
+      </w:pPr>
+      <w:bookmarkStart w:id="35" w:name="_Toc223637911"/>
+      <w:r>
+        <w:lastRenderedPageBreak/>
+        <w:t>Critical Evaluation</w:t>
+      </w:r>
+      <w:bookmarkEnd w:id="35"/>
     </w:p>
     <w:p>
       <w:pPr>
@@ -8420,6 +9060,9 @@
         </w:rPr>
       </w:pPr>
       <w:r>
+        <w:t>High word count for this, needs to be an in-depth evaluation, discuss in third person and cover all areas that help progress the project and other areas that dampened it such as outside life events etc.</w:t>
+      </w:r>
+      <w:r>
         <w:br w:type="page"/>
       </w:r>
     </w:p>
@@ -8427,60 +9070,12 @@
       <w:pPr>
         <w:pStyle w:val="Heading1"/>
       </w:pPr>
-      <w:bookmarkStart w:id="31" w:name="_Toc223520104"/>
-      <w:r>
-        <w:lastRenderedPageBreak/>
-        <w:t>Results</w:t>
-      </w:r>
-      <w:bookmarkEnd w:id="31"/>
-    </w:p>
-    <w:p>
-      <w:pPr>
-        <w:rPr>
-          <w:rFonts w:asciiTheme="majorHAnsi" w:eastAsiaTheme="majorEastAsia" w:hAnsiTheme="majorHAnsi" w:cstheme="majorBidi"/>
-          <w:color w:val="0F4761" w:themeColor="accent1" w:themeShade="BF"/>
-          <w:sz w:val="40"/>
-          <w:szCs w:val="40"/>
-        </w:rPr>
-      </w:pPr>
-      <w:r>
-        <w:br w:type="page"/>
-      </w:r>
-    </w:p>
-    <w:p>
-      <w:pPr>
-        <w:pStyle w:val="Heading1"/>
-      </w:pPr>
-      <w:bookmarkStart w:id="32" w:name="_Toc223520105"/>
-      <w:r>
-        <w:lastRenderedPageBreak/>
-        <w:t>Critical Evaluation</w:t>
-      </w:r>
-      <w:bookmarkEnd w:id="32"/>
-    </w:p>
-    <w:p>
-      <w:pPr>
-        <w:rPr>
-          <w:rFonts w:asciiTheme="majorHAnsi" w:eastAsiaTheme="majorEastAsia" w:hAnsiTheme="majorHAnsi" w:cstheme="majorBidi"/>
-          <w:color w:val="0F4761" w:themeColor="accent1" w:themeShade="BF"/>
-          <w:sz w:val="40"/>
-          <w:szCs w:val="40"/>
-        </w:rPr>
-      </w:pPr>
-      <w:r>
-        <w:br w:type="page"/>
-      </w:r>
-    </w:p>
-    <w:p>
-      <w:pPr>
-        <w:pStyle w:val="Heading1"/>
-      </w:pPr>
-      <w:bookmarkStart w:id="33" w:name="_Toc223520106"/>
+      <w:bookmarkStart w:id="36" w:name="_Toc223637912"/>
       <w:r>
         <w:lastRenderedPageBreak/>
         <w:t>Conclusions and Future Work</w:t>
       </w:r>
-      <w:bookmarkEnd w:id="33"/>
+      <w:bookmarkEnd w:id="36"/>
       <w:r>
         <w:br w:type="page"/>
       </w:r>
@@ -8489,17 +9084,31 @@
       <w:pPr>
         <w:pStyle w:val="Heading1"/>
       </w:pPr>
-      <w:bookmarkStart w:id="34" w:name="_Toc223520107"/>
+      <w:bookmarkStart w:id="37" w:name="_Toc223637913"/>
       <w:r>
         <w:lastRenderedPageBreak/>
         <w:t>References</w:t>
       </w:r>
-      <w:bookmarkEnd w:id="34"/>
-    </w:p>
-    <w:p>
-      <w:r>
-        <w:t xml:space="preserve">Cantó-Sancho, N., Porru, S., Casati, S., Ronda, E., Seguí-Crespo, M. and Carta, A. (2023) ‘Prevalence and risk factors of computer vision syndrome—assessed in office workers by a validated questionnaire’. </w:t>
-      </w:r>
+      <w:bookmarkEnd w:id="37"/>
+    </w:p>
+    <w:p>
+      <w:proofErr w:type="spellStart"/>
+      <w:r>
+        <w:t>Cantó</w:t>
+      </w:r>
+      <w:proofErr w:type="spellEnd"/>
+      <w:r>
+        <w:t xml:space="preserve">-Sancho, N., </w:t>
+      </w:r>
+      <w:proofErr w:type="spellStart"/>
+      <w:r>
+        <w:t>Porru</w:t>
+      </w:r>
+      <w:proofErr w:type="spellEnd"/>
+      <w:r>
+        <w:t xml:space="preserve">, S., Casati, S., Ronda, E., Seguí-Crespo, M. and Carta, A. (2023) ‘Prevalence and risk factors of computer vision syndrome—assessed in office workers by a validated questionnaire’. </w:t>
+      </w:r>
+      <w:proofErr w:type="spellStart"/>
       <w:r>
         <w:rPr>
           <w:i/>
@@ -8507,13 +9116,30 @@
         </w:rPr>
         <w:t>PeerJ</w:t>
       </w:r>
+      <w:proofErr w:type="spellEnd"/>
       <w:r>
         <w:t xml:space="preserve"> 11, p. e14937. Available at: https://www.researchgate.net/publication/369002899_Prevalence_and_risk_factors_of_computer_vision_syndrome-assessed_in_office_workers_by_a_validated_questionnaire (Accessed: 20 October 2025).</w:t>
       </w:r>
     </w:p>
     <w:p>
       <w:r>
-        <w:t xml:space="preserve">Chandrasekhara, R.S., Low, C., Lim, Y., Low, L., Mardina, F. and Nursaleha, M. (2013) ‘Computer vision syndrome: a study of knowledge and practices in university students’. </w:t>
+        <w:t xml:space="preserve">Chandrasekhara, R.S., Low, C., Lim, Y., Low, L., Mardina, F. and </w:t>
+      </w:r>
+      <w:proofErr w:type="spellStart"/>
+      <w:r>
+        <w:t>Nursaleha</w:t>
+      </w:r>
+      <w:proofErr w:type="spellEnd"/>
+      <w:r>
+        <w:t xml:space="preserve">, M. (2013) ‘Computer vision syndrome: a study of knowledge and practices in university </w:t>
+      </w:r>
+      <w:proofErr w:type="gramStart"/>
+      <w:r>
+        <w:t>students’</w:t>
+      </w:r>
+      <w:proofErr w:type="gramEnd"/>
+      <w:r>
+        <w:t xml:space="preserve">. </w:t>
       </w:r>
       <w:r>
         <w:rPr>
@@ -8539,7 +9165,15 @@
     </w:p>
     <w:p>
       <w:r>
-        <w:t xml:space="preserve">Muñoz, E.G., Fabregat, R., Bacca-Acosta, J., Duque-Méndez, N. and Avila-Garzon, C. (2022) ‘Augmented Reality, Virtual Reality, and Game Technologies in Ophthalmology Training’. </w:t>
+        <w:t xml:space="preserve">Muñoz, E.G., </w:t>
+      </w:r>
+      <w:proofErr w:type="spellStart"/>
+      <w:r>
+        <w:t>Fabregat</w:t>
+      </w:r>
+      <w:proofErr w:type="spellEnd"/>
+      <w:r>
+        <w:t xml:space="preserve">, R., Bacca-Acosta, J., Duque-Méndez, N. and Avila-Garzon, C. (2022) ‘Augmented Reality, Virtual Reality, and Game Technologies in Ophthalmology Training’. </w:t>
       </w:r>
       <w:r>
         <w:rPr>
@@ -8549,7 +9183,15 @@
         <w:t>Information</w:t>
       </w:r>
       <w:r>
-        <w:t xml:space="preserve"> 13(5), p. 222. doi: </w:t>
+        <w:t xml:space="preserve"> 13(5), p. 222. </w:t>
+      </w:r>
+      <w:proofErr w:type="spellStart"/>
+      <w:r>
+        <w:t>doi</w:t>
+      </w:r>
+      <w:proofErr w:type="spellEnd"/>
+      <w:r>
+        <w:t xml:space="preserve">: </w:t>
       </w:r>
       <w:hyperlink r:id="rId16" w:history="1">
         <w:r>
@@ -8565,12 +9207,33 @@
     </w:p>
     <w:p>
       <w:r>
-        <w:t>Orji, J., Hernandez, A., Selema, B. and Orji, R. (2022) ‘Virtual and augmented reality applications for promoting safety and security: A systematic review’., pp. 1–7. doi: https://doi.org/10.1109/SEGAH54908.2022.9978597.</w:t>
-      </w:r>
-    </w:p>
-    <w:p>
-      <w:r>
-        <w:t xml:space="preserve">Porcar, E., Pons, A. and Lorente, A. (2016) ‘Visual and ocular effects from the use of flat-panel displays’. </w:t>
+        <w:t xml:space="preserve">Orji, J., Hernandez, A., Selema, B. and Orji, R. (2022) ‘Virtual and augmented reality applications for promoting safety and security: A systematic review’., pp. 1–7. </w:t>
+      </w:r>
+      <w:proofErr w:type="spellStart"/>
+      <w:r>
+        <w:t>doi</w:t>
+      </w:r>
+      <w:proofErr w:type="spellEnd"/>
+      <w:r>
+        <w:t>: https://doi.org/10.1109/SEGAH54908.2022.9978597.</w:t>
+      </w:r>
+    </w:p>
+    <w:p>
+      <w:proofErr w:type="spellStart"/>
+      <w:r>
+        <w:t>Porcar</w:t>
+      </w:r>
+      <w:proofErr w:type="spellEnd"/>
+      <w:r>
+        <w:t xml:space="preserve">, E., Pons, A. and Lorente, A. (2016) ‘Visual and ocular effects from the use of flat-panel </w:t>
+      </w:r>
+      <w:proofErr w:type="gramStart"/>
+      <w:r>
+        <w:t>displays’</w:t>
+      </w:r>
+      <w:proofErr w:type="gramEnd"/>
+      <w:r>
+        <w:t xml:space="preserve">. </w:t>
       </w:r>
       <w:r>
         <w:rPr>
@@ -8585,7 +9248,23 @@
     </w:p>
     <w:p>
       <w:r>
-        <w:t xml:space="preserve">Santilli, T., Ceccacci, S., Mengoni, M. and Catia Giaconi (2025) ‘Virtual vs. traditional learning in higher education: A systematic review of comparative studies’. </w:t>
+        <w:t xml:space="preserve">Santilli, T., Ceccacci, S., Mengoni, M. and Catia </w:t>
+      </w:r>
+      <w:proofErr w:type="spellStart"/>
+      <w:r>
+        <w:t>Giaconi</w:t>
+      </w:r>
+      <w:proofErr w:type="spellEnd"/>
+      <w:r>
+        <w:t xml:space="preserve"> (2025) ‘Virtual vs. traditional learning in higher education: A systematic review of comparative </w:t>
+      </w:r>
+      <w:proofErr w:type="gramStart"/>
+      <w:r>
+        <w:t>studies’</w:t>
+      </w:r>
+      <w:proofErr w:type="gramEnd"/>
+      <w:r>
+        <w:t xml:space="preserve">. </w:t>
       </w:r>
       <w:r>
         <w:rPr>
@@ -8620,7 +9299,23 @@
     </w:p>
     <w:p>
       <w:r>
-        <w:t>Vieira, F., Oliveira, E. and Rodrigues, N. (2019) ‘iSVC – digital platform for detection and prevention of computer vision syndrome’., pp. 1–7. doi: https://doi.org/10.1109/SeGAH.2019.8882438.</w:t>
+        <w:t>Vieira, F., Oliveira, E. and Rodrigues, N. (2019) ‘</w:t>
+      </w:r>
+      <w:proofErr w:type="spellStart"/>
+      <w:r>
+        <w:t>iSVC</w:t>
+      </w:r>
+      <w:proofErr w:type="spellEnd"/>
+      <w:r>
+        <w:t xml:space="preserve"> – digital platform for detection and prevention of computer vision syndrome’., pp. 1–7. </w:t>
+      </w:r>
+      <w:proofErr w:type="spellStart"/>
+      <w:r>
+        <w:t>doi</w:t>
+      </w:r>
+      <w:proofErr w:type="spellEnd"/>
+      <w:r>
+        <w:t>: https://doi.org/10.1109/SeGAH.2019.8882438.</w:t>
       </w:r>
     </w:p>
     <w:p>
@@ -8635,12 +9330,28 @@
         <w:t>Annals of Emerging Technologies in Computing</w:t>
       </w:r>
       <w:r>
-        <w:t xml:space="preserve"> 9(3), pp. 50–68. doi: https://doi.org/10.33166/aetic.2025.03.004.</w:t>
-      </w:r>
-    </w:p>
-    <w:p>
-      <w:r>
-        <w:t xml:space="preserve">Youcef, B., Ahmad, M.N. and Mustapha, M. (2021) ‘OntoPhaco: An ontology for virtual reality training in ophthalmology Domain—A case study of cataract surgery’. </w:t>
+        <w:t xml:space="preserve"> 9(3), pp. 50–68. </w:t>
+      </w:r>
+      <w:proofErr w:type="spellStart"/>
+      <w:r>
+        <w:t>doi</w:t>
+      </w:r>
+      <w:proofErr w:type="spellEnd"/>
+      <w:r>
+        <w:t>: https://doi.org/10.33166/aetic.2025.03.004.</w:t>
+      </w:r>
+    </w:p>
+    <w:p>
+      <w:r>
+        <w:t>Youcef, B., Ahmad, M.N. and Mustapha, M. (2021) ‘</w:t>
+      </w:r>
+      <w:proofErr w:type="spellStart"/>
+      <w:r>
+        <w:t>OntoPhaco</w:t>
+      </w:r>
+      <w:proofErr w:type="spellEnd"/>
+      <w:r>
+        <w:t xml:space="preserve">: An ontology for virtual reality training in ophthalmology Domain—A case study of cataract surgery’. </w:t>
       </w:r>
       <w:r>
         <w:rPr>
@@ -8650,7 +9361,15 @@
         <w:t>IEEE Access</w:t>
       </w:r>
       <w:r>
-        <w:t xml:space="preserve"> 9, pp. 152347–152378. doi: https://doi.org/10.1109/ACCESS.2021.3126697.</w:t>
+        <w:t xml:space="preserve"> 9, pp. 152347–152378. </w:t>
+      </w:r>
+      <w:proofErr w:type="spellStart"/>
+      <w:r>
+        <w:t>doi</w:t>
+      </w:r>
+      <w:proofErr w:type="spellEnd"/>
+      <w:r>
+        <w:t>: https://doi.org/10.1109/ACCESS.2021.3126697.</w:t>
       </w:r>
     </w:p>
     <w:p/>
@@ -8658,32 +9377,32 @@
       <w:pPr>
         <w:pStyle w:val="Heading1"/>
       </w:pPr>
-      <w:bookmarkStart w:id="35" w:name="_Toc223520108"/>
+      <w:bookmarkStart w:id="38" w:name="_Toc223637914"/>
       <w:r>
         <w:lastRenderedPageBreak/>
         <w:t>Appendix</w:t>
       </w:r>
-      <w:bookmarkEnd w:id="35"/>
+      <w:bookmarkEnd w:id="38"/>
     </w:p>
     <w:p>
       <w:pPr>
         <w:pStyle w:val="Heading2"/>
       </w:pPr>
-      <w:bookmarkStart w:id="36" w:name="_Toc223520109"/>
+      <w:bookmarkStart w:id="39" w:name="_Toc223637915"/>
       <w:r>
         <w:t>Asset Licenses and Sources</w:t>
       </w:r>
-      <w:bookmarkEnd w:id="36"/>
+      <w:bookmarkEnd w:id="39"/>
     </w:p>
     <w:p>
       <w:pPr>
         <w:pStyle w:val="Heading3"/>
       </w:pPr>
-      <w:bookmarkStart w:id="37" w:name="_Toc223520110"/>
+      <w:bookmarkStart w:id="40" w:name="_Toc223637916"/>
       <w:r>
         <w:t>Modern Office Table</w:t>
       </w:r>
-      <w:bookmarkEnd w:id="37"/>
+      <w:bookmarkEnd w:id="40"/>
     </w:p>
     <w:p>
       <w:r>
@@ -8763,11 +9482,11 @@
       <w:pPr>
         <w:pStyle w:val="Heading3"/>
       </w:pPr>
-      <w:bookmarkStart w:id="38" w:name="_Toc223520111"/>
+      <w:bookmarkStart w:id="41" w:name="_Toc223637917"/>
       <w:r>
         <w:t>Free Studio Starter Pack</w:t>
       </w:r>
-      <w:bookmarkEnd w:id="38"/>
+      <w:bookmarkEnd w:id="41"/>
     </w:p>
     <w:p>
       <w:r>
@@ -8847,11 +9566,11 @@
       <w:pPr>
         <w:pStyle w:val="Heading3"/>
       </w:pPr>
-      <w:bookmarkStart w:id="39" w:name="_Toc223520112"/>
+      <w:bookmarkStart w:id="42" w:name="_Toc223637918"/>
       <w:r>
         <w:t>General Desktop Bundle</w:t>
       </w:r>
-      <w:bookmarkEnd w:id="39"/>
+      <w:bookmarkEnd w:id="42"/>
     </w:p>
     <w:p>
       <w:r>
@@ -8931,12 +9650,12 @@
       <w:pPr>
         <w:pStyle w:val="Heading3"/>
       </w:pPr>
-      <w:bookmarkStart w:id="40" w:name="_Toc223520113"/>
+      <w:bookmarkStart w:id="43" w:name="_Toc223637919"/>
       <w:r>
         <w:lastRenderedPageBreak/>
         <w:t>General Gaming Headset</w:t>
       </w:r>
-      <w:bookmarkEnd w:id="40"/>
+      <w:bookmarkEnd w:id="43"/>
     </w:p>
     <w:p>
       <w:r>
@@ -9016,11 +9735,11 @@
       <w:pPr>
         <w:pStyle w:val="Heading3"/>
       </w:pPr>
-      <w:bookmarkStart w:id="41" w:name="_Toc223520114"/>
+      <w:bookmarkStart w:id="44" w:name="_Toc223637920"/>
       <w:r>
         <w:t>General Gaming Chair</w:t>
       </w:r>
-      <w:bookmarkEnd w:id="41"/>
+      <w:bookmarkEnd w:id="44"/>
     </w:p>
     <w:p>
       <w:r>
@@ -9100,11 +9819,11 @@
       <w:pPr>
         <w:pStyle w:val="Heading3"/>
       </w:pPr>
-      <w:bookmarkStart w:id="42" w:name="_Toc223520115"/>
+      <w:bookmarkStart w:id="45" w:name="_Toc223637921"/>
       <w:r>
         <w:t>Light Switch</w:t>
       </w:r>
-      <w:bookmarkEnd w:id="42"/>
+      <w:bookmarkEnd w:id="45"/>
     </w:p>
     <w:p>
       <w:r>
@@ -9198,12 +9917,12 @@
       <w:pPr>
         <w:pStyle w:val="Heading3"/>
       </w:pPr>
-      <w:bookmarkStart w:id="43" w:name="_Toc223520116"/>
+      <w:bookmarkStart w:id="46" w:name="_Toc223637922"/>
       <w:r>
         <w:lastRenderedPageBreak/>
         <w:t>Materials for General PC setup</w:t>
       </w:r>
-      <w:bookmarkEnd w:id="43"/>
+      <w:bookmarkEnd w:id="46"/>
     </w:p>
     <w:p>
       <w:r>
@@ -9325,12 +10044,12 @@
       <w:pPr>
         <w:pStyle w:val="Heading3"/>
       </w:pPr>
-      <w:bookmarkStart w:id="44" w:name="_Toc223520117"/>
+      <w:bookmarkStart w:id="47" w:name="_Toc223637923"/>
       <w:r>
         <w:lastRenderedPageBreak/>
         <w:t>Monitor background image</w:t>
       </w:r>
-      <w:bookmarkEnd w:id="44"/>
+      <w:bookmarkEnd w:id="47"/>
     </w:p>
     <w:p>
       <w:r>
@@ -9421,12 +10140,25 @@
       <w:pPr>
         <w:pStyle w:val="Heading3"/>
       </w:pPr>
-      <w:bookmarkStart w:id="45" w:name="_Toc223520118"/>
+      <w:bookmarkStart w:id="48" w:name="_Toc223637924"/>
       <w:r>
         <w:lastRenderedPageBreak/>
-        <w:t>Button Hover Sfx by Fachii</w:t>
-      </w:r>
-      <w:bookmarkEnd w:id="45"/>
+        <w:t xml:space="preserve">Button Hover </w:t>
+      </w:r>
+      <w:proofErr w:type="spellStart"/>
+      <w:r>
+        <w:t>Sfx</w:t>
+      </w:r>
+      <w:proofErr w:type="spellEnd"/>
+      <w:r>
+        <w:t xml:space="preserve"> by </w:t>
+      </w:r>
+      <w:proofErr w:type="spellStart"/>
+      <w:r>
+        <w:t>Fachii</w:t>
+      </w:r>
+      <w:bookmarkEnd w:id="48"/>
+      <w:proofErr w:type="spellEnd"/>
     </w:p>
     <w:p>
       <w:r>
@@ -9521,14 +10253,36 @@
     </w:p>
     <w:p/>
     <w:p>
-      <w:bookmarkStart w:id="46" w:name="_Toc223520119"/>
+      <w:bookmarkStart w:id="49" w:name="_Toc223637925"/>
       <w:r>
         <w:rPr>
           <w:rStyle w:val="Heading3Char"/>
         </w:rPr>
-        <w:t>Button click Sfx by AndrewEathan</w:t>
-      </w:r>
-      <w:bookmarkEnd w:id="46"/>
+        <w:t xml:space="preserve">Button click </w:t>
+      </w:r>
+      <w:proofErr w:type="spellStart"/>
+      <w:r>
+        <w:rPr>
+          <w:rStyle w:val="Heading3Char"/>
+        </w:rPr>
+        <w:t>Sfx</w:t>
+      </w:r>
+      <w:proofErr w:type="spellEnd"/>
+      <w:r>
+        <w:rPr>
+          <w:rStyle w:val="Heading3Char"/>
+        </w:rPr>
+        <w:t xml:space="preserve"> by </w:t>
+      </w:r>
+      <w:proofErr w:type="spellStart"/>
+      <w:r>
+        <w:rPr>
+          <w:rStyle w:val="Heading3Char"/>
+        </w:rPr>
+        <w:t>AndrewEathan</w:t>
+      </w:r>
+      <w:bookmarkEnd w:id="49"/>
+      <w:proofErr w:type="spellEnd"/>
       <w:r>
         <w:t xml:space="preserve"> </w:t>
       </w:r>
@@ -9634,12 +10388,25 @@
       <w:pPr>
         <w:pStyle w:val="Heading3"/>
       </w:pPr>
-      <w:bookmarkStart w:id="47" w:name="_Toc223520120"/>
+      <w:bookmarkStart w:id="50" w:name="_Toc223637926"/>
       <w:r>
         <w:lastRenderedPageBreak/>
-        <w:t>Light Switch On Sfx</w:t>
-      </w:r>
-      <w:bookmarkEnd w:id="47"/>
+        <w:t xml:space="preserve">Light Switch </w:t>
+      </w:r>
+      <w:proofErr w:type="gramStart"/>
+      <w:r>
+        <w:t>On</w:t>
+      </w:r>
+      <w:proofErr w:type="gramEnd"/>
+      <w:r>
+        <w:t xml:space="preserve"> </w:t>
+      </w:r>
+      <w:proofErr w:type="spellStart"/>
+      <w:r>
+        <w:t>Sfx</w:t>
+      </w:r>
+      <w:bookmarkEnd w:id="50"/>
+      <w:proofErr w:type="spellEnd"/>
     </w:p>
     <w:p>
       <w:r>
@@ -9729,11 +10496,16 @@
       <w:pPr>
         <w:pStyle w:val="Heading3"/>
       </w:pPr>
-      <w:bookmarkStart w:id="48" w:name="_Toc223520121"/>
-      <w:r>
-        <w:t>Light Switch Off Sfx</w:t>
-      </w:r>
-      <w:bookmarkEnd w:id="48"/>
+      <w:bookmarkStart w:id="51" w:name="_Toc223637927"/>
+      <w:r>
+        <w:t xml:space="preserve">Light Switch Off </w:t>
+      </w:r>
+      <w:proofErr w:type="spellStart"/>
+      <w:r>
+        <w:t>Sfx</w:t>
+      </w:r>
+      <w:bookmarkEnd w:id="51"/>
+      <w:proofErr w:type="spellEnd"/>
     </w:p>
     <w:p>
       <w:r>

</xml_diff>

<commit_message>
Final paragraph of prototype section, calling it a day
</commit_message>
<xml_diff>
--- a/30077548Thesis.docx
+++ b/30077548Thesis.docx
@@ -4498,13 +4498,8 @@
       <w:r>
         <w:t xml:space="preserve">. </w:t>
       </w:r>
-      <w:proofErr w:type="spellStart"/>
-      <w:r>
-        <w:t>Porcar</w:t>
-      </w:r>
-      <w:proofErr w:type="spellEnd"/>
-      <w:r>
-        <w:t xml:space="preserve"> et al., </w:t>
+      <w:r>
+        <w:t xml:space="preserve">Porcar et al., </w:t>
       </w:r>
       <w:r>
         <w:t>(</w:t>
@@ -4544,13 +4539,8 @@
       <w:r>
         <w:t xml:space="preserve">Research conducted by </w:t>
       </w:r>
-      <w:proofErr w:type="spellStart"/>
-      <w:r>
-        <w:t>Cantó</w:t>
-      </w:r>
-      <w:proofErr w:type="spellEnd"/>
-      <w:r>
-        <w:t xml:space="preserve">-Sancho et al., </w:t>
+      <w:r>
+        <w:t xml:space="preserve">Cantó-Sancho et al., </w:t>
       </w:r>
       <w:r>
         <w:t>(</w:t>
@@ -6193,21 +6183,7 @@
         <w:rPr>
           <w:rFonts w:cs="Arial"/>
         </w:rPr>
-        <w:t xml:space="preserve">Clear </w:t>
-      </w:r>
-      <w:proofErr w:type="gramStart"/>
-      <w:r>
-        <w:rPr>
-          <w:rFonts w:cs="Arial"/>
-        </w:rPr>
-        <w:t>on screen</w:t>
-      </w:r>
-      <w:proofErr w:type="gramEnd"/>
-      <w:r>
-        <w:rPr>
-          <w:rFonts w:cs="Arial"/>
-        </w:rPr>
-        <w:t xml:space="preserve"> prompts to guide and support users that aren’t familiar with VR equipment</w:t>
+        <w:t>Clear on screen prompts to guide and support users that aren’t familiar with VR equipment</w:t>
       </w:r>
     </w:p>
     <w:p>
@@ -6350,7 +6326,6 @@
         <w:pStyle w:val="Heading3"/>
       </w:pPr>
       <w:bookmarkStart w:id="11" w:name="_Toc223637887"/>
-      <w:proofErr w:type="spellStart"/>
       <w:r>
         <w:t>Ey</w:t>
       </w:r>
@@ -6361,7 +6336,6 @@
         <w:t>si</w:t>
       </w:r>
       <w:bookmarkEnd w:id="11"/>
-      <w:proofErr w:type="spellEnd"/>
     </w:p>
     <w:p>
       <w:r>
@@ -6376,11 +6350,9 @@
       <w:r>
         <w:t xml:space="preserve"> discussed </w:t>
       </w:r>
-      <w:proofErr w:type="spellStart"/>
       <w:r>
         <w:t>Eyesi</w:t>
       </w:r>
-      <w:proofErr w:type="spellEnd"/>
       <w:r>
         <w:t>,</w:t>
       </w:r>
@@ -6493,15 +6465,7 @@
         <w:t xml:space="preserve">In addition to this, there is an </w:t>
       </w:r>
       <w:r>
-        <w:t>online training portal (</w:t>
-      </w:r>
-      <w:proofErr w:type="spellStart"/>
-      <w:r>
-        <w:t>vrmnet</w:t>
-      </w:r>
-      <w:proofErr w:type="spellEnd"/>
-      <w:r>
-        <w:t xml:space="preserve">) </w:t>
+        <w:t xml:space="preserve">online training portal (vrmnet) </w:t>
       </w:r>
       <w:r>
         <w:t>allowing comparison between trainees</w:t>
@@ -6636,15 +6600,7 @@
         <w:t xml:space="preserve"> </w:t>
       </w:r>
       <w:r>
-        <w:t xml:space="preserve">While </w:t>
-      </w:r>
-      <w:proofErr w:type="spellStart"/>
-      <w:r>
-        <w:t>Eyesi</w:t>
-      </w:r>
-      <w:proofErr w:type="spellEnd"/>
-      <w:r>
-        <w:t xml:space="preserve"> is effective for medical training for medical professionals, </w:t>
+        <w:t xml:space="preserve">While Eyesi is effective for medical training for medical professionals, </w:t>
       </w:r>
       <w:r>
         <w:t xml:space="preserve">similar </w:t>
@@ -6667,12 +6623,10 @@
         <w:pStyle w:val="Heading3"/>
       </w:pPr>
       <w:bookmarkStart w:id="12" w:name="_Toc223637888"/>
-      <w:proofErr w:type="spellStart"/>
       <w:r>
         <w:t>OntoPhaco</w:t>
       </w:r>
       <w:bookmarkEnd w:id="12"/>
-      <w:proofErr w:type="spellEnd"/>
     </w:p>
     <w:p>
       <w:r>
@@ -6691,15 +6645,7 @@
         <w:t>d</w:t>
       </w:r>
       <w:r>
-        <w:t xml:space="preserve"> </w:t>
-      </w:r>
-      <w:proofErr w:type="spellStart"/>
-      <w:r>
-        <w:t>OntoPhaco</w:t>
-      </w:r>
-      <w:proofErr w:type="spellEnd"/>
-      <w:r>
-        <w:t>, a</w:t>
+        <w:t xml:space="preserve"> OntoPhaco, a</w:t>
       </w:r>
       <w:r>
         <w:t>n</w:t>
@@ -6832,191 +6778,173 @@
           <w:rFonts w:cs="TimesLTStd-Roman"/>
           <w:kern w:val="0"/>
         </w:rPr>
-        <w:t xml:space="preserve">Since </w:t>
-      </w:r>
-      <w:proofErr w:type="spellStart"/>
+        <w:t>Since OntoPhaco</w:t>
+      </w:r>
       <w:r>
         <w:rPr>
           <w:rFonts w:cs="TimesLTStd-Roman"/>
           <w:kern w:val="0"/>
         </w:rPr>
-        <w:t>OntoPhaco</w:t>
+        <w:t>’s</w:t>
       </w:r>
       <w:r>
         <w:rPr>
           <w:rFonts w:cs="TimesLTStd-Roman"/>
           <w:kern w:val="0"/>
         </w:rPr>
-        <w:t>’s</w:t>
-      </w:r>
-      <w:proofErr w:type="spellEnd"/>
+        <w:t xml:space="preserve"> </w:t>
+      </w:r>
+      <w:r>
+        <w:t>s</w:t>
+      </w:r>
+      <w:r>
+        <w:t xml:space="preserve">ystematic verification and validation processes </w:t>
+      </w:r>
+      <w:r>
+        <w:t>include</w:t>
+      </w:r>
+      <w:r>
+        <w:t xml:space="preserve"> </w:t>
+      </w:r>
+      <w:r>
+        <w:t xml:space="preserve">theoretical </w:t>
+      </w:r>
+      <w:r>
+        <w:t>evaluat</w:t>
+      </w:r>
+      <w:r>
+        <w:t xml:space="preserve">ion </w:t>
+      </w:r>
+      <w:r>
+        <w:t>and expert feedback</w:t>
+      </w:r>
       <w:r>
         <w:rPr>
           <w:rFonts w:cs="TimesLTStd-Roman"/>
           <w:kern w:val="0"/>
         </w:rPr>
-        <w:t xml:space="preserve"> </w:t>
-      </w:r>
-      <w:r>
-        <w:t>s</w:t>
-      </w:r>
-      <w:r>
-        <w:t xml:space="preserve">ystematic verification and validation processes </w:t>
-      </w:r>
-      <w:r>
-        <w:t>include</w:t>
-      </w:r>
-      <w:r>
-        <w:t xml:space="preserve"> </w:t>
-      </w:r>
-      <w:r>
-        <w:t xml:space="preserve">theoretical </w:t>
-      </w:r>
-      <w:r>
-        <w:t>evaluat</w:t>
-      </w:r>
-      <w:r>
-        <w:t xml:space="preserve">ion </w:t>
-      </w:r>
-      <w:r>
-        <w:t>and expert feedback</w:t>
+        <w:t xml:space="preserve">, each change, minor or major </w:t>
       </w:r>
       <w:r>
         <w:rPr>
           <w:rFonts w:cs="TimesLTStd-Roman"/>
           <w:kern w:val="0"/>
         </w:rPr>
-        <w:t xml:space="preserve">, each change, minor or major </w:t>
+        <w:t>is</w:t>
       </w:r>
       <w:r>
         <w:rPr>
           <w:rFonts w:cs="TimesLTStd-Roman"/>
           <w:kern w:val="0"/>
         </w:rPr>
-        <w:t>is</w:t>
+        <w:t xml:space="preserve"> verified and validate</w:t>
       </w:r>
       <w:r>
         <w:rPr>
           <w:rFonts w:cs="TimesLTStd-Roman"/>
           <w:kern w:val="0"/>
         </w:rPr>
-        <w:t xml:space="preserve"> verified and validate</w:t>
+        <w:t>d</w:t>
+      </w:r>
+      <w:r>
+        <w:t>.</w:t>
       </w:r>
       <w:r>
         <w:rPr>
           <w:rFonts w:cs="TimesLTStd-Roman"/>
           <w:kern w:val="0"/>
         </w:rPr>
-        <w:t>d</w:t>
-      </w:r>
-      <w:r>
-        <w:t>.</w:t>
+        <w:t xml:space="preserve"> </w:t>
       </w:r>
       <w:r>
         <w:rPr>
           <w:rFonts w:cs="TimesLTStd-Roman"/>
           <w:kern w:val="0"/>
         </w:rPr>
-        <w:t xml:space="preserve"> </w:t>
-      </w:r>
-      <w:proofErr w:type="spellStart"/>
+        <w:t>OntoPhaco demonstrates VR</w:t>
+      </w:r>
       <w:r>
         <w:rPr>
           <w:rFonts w:cs="TimesLTStd-Roman"/>
           <w:kern w:val="0"/>
         </w:rPr>
-        <w:t>OntoPhaco</w:t>
-      </w:r>
-      <w:proofErr w:type="spellEnd"/>
+        <w:t>’</w:t>
+      </w:r>
       <w:r>
         <w:rPr>
           <w:rFonts w:cs="TimesLTStd-Roman"/>
           <w:kern w:val="0"/>
         </w:rPr>
-        <w:t xml:space="preserve"> demonstrates VR</w:t>
+        <w:t xml:space="preserve">s effectiveness </w:t>
       </w:r>
       <w:r>
         <w:rPr>
           <w:rFonts w:cs="TimesLTStd-Roman"/>
           <w:kern w:val="0"/>
         </w:rPr>
-        <w:t>’</w:t>
+        <w:t xml:space="preserve">paired </w:t>
       </w:r>
       <w:r>
         <w:rPr>
           <w:rFonts w:cs="TimesLTStd-Roman"/>
           <w:kern w:val="0"/>
         </w:rPr>
-        <w:t xml:space="preserve">s effectiveness </w:t>
+        <w:t>with ontology for medical training</w:t>
       </w:r>
       <w:r>
         <w:rPr>
           <w:rFonts w:cs="TimesLTStd-Roman"/>
           <w:kern w:val="0"/>
         </w:rPr>
-        <w:t xml:space="preserve">paired </w:t>
+        <w:t>. T</w:t>
       </w:r>
       <w:r>
         <w:rPr>
           <w:rFonts w:cs="TimesLTStd-Roman"/>
           <w:kern w:val="0"/>
         </w:rPr>
-        <w:t>with ontology for medical training</w:t>
+        <w:t>his project</w:t>
       </w:r>
       <w:r>
         <w:rPr>
           <w:rFonts w:cs="TimesLTStd-Roman"/>
           <w:kern w:val="0"/>
         </w:rPr>
-        <w:t>. T</w:t>
+        <w:t xml:space="preserve"> applies similar immersi</w:t>
       </w:r>
       <w:r>
         <w:rPr>
           <w:rFonts w:cs="TimesLTStd-Roman"/>
           <w:kern w:val="0"/>
         </w:rPr>
-        <w:t>his project</w:t>
+        <w:t>ve</w:t>
       </w:r>
       <w:r>
         <w:rPr>
           <w:rFonts w:cs="TimesLTStd-Roman"/>
           <w:kern w:val="0"/>
         </w:rPr>
-        <w:t xml:space="preserve"> applies similar immersi</w:t>
+        <w:t xml:space="preserve"> and educational knowledge </w:t>
       </w:r>
       <w:r>
         <w:rPr>
           <w:rFonts w:cs="TimesLTStd-Roman"/>
           <w:kern w:val="0"/>
         </w:rPr>
-        <w:t>ve</w:t>
+        <w:t xml:space="preserve">for DES to raise awareness, </w:t>
       </w:r>
       <w:r>
         <w:rPr>
           <w:rFonts w:cs="TimesLTStd-Roman"/>
           <w:kern w:val="0"/>
         </w:rPr>
-        <w:t xml:space="preserve"> and educational knowledge </w:t>
+        <w:t xml:space="preserve">spreading the </w:t>
       </w:r>
       <w:r>
         <w:rPr>
           <w:rFonts w:cs="TimesLTStd-Roman"/>
           <w:kern w:val="0"/>
         </w:rPr>
-        <w:t xml:space="preserve">for DES to raise awareness, </w:t>
-      </w:r>
-      <w:r>
-        <w:rPr>
-          <w:rFonts w:cs="TimesLTStd-Roman"/>
-          <w:kern w:val="0"/>
-        </w:rPr>
-        <w:t xml:space="preserve">spreading the </w:t>
-      </w:r>
-      <w:r>
-        <w:rPr>
-          <w:rFonts w:cs="TimesLTStd-Roman"/>
-          <w:kern w:val="0"/>
-        </w:rPr>
         <w:t>benefits of VR use in education beyond professional training.</w:t>
       </w:r>
     </w:p>
@@ -7230,27 +7158,17 @@
       <w:r>
         <w:t xml:space="preserve">While </w:t>
       </w:r>
-      <w:proofErr w:type="spellStart"/>
-      <w:r>
-        <w:t>Eyesi</w:t>
-      </w:r>
-      <w:proofErr w:type="spellEnd"/>
-      <w:r>
-        <w:t xml:space="preserve"> focuses on hands on surgical practices</w:t>
+      <w:r>
+        <w:t>Eyesi focuses on hands on surgical practices</w:t>
       </w:r>
       <w:r>
         <w:t xml:space="preserve">, </w:t>
       </w:r>
-      <w:proofErr w:type="spellStart"/>
       <w:r>
         <w:t>O</w:t>
       </w:r>
       <w:r>
-        <w:t>ntoPhaco</w:t>
-      </w:r>
-      <w:proofErr w:type="spellEnd"/>
-      <w:r>
-        <w:t xml:space="preserve"> focuses on the way knowledge is represented and conceptual understanding</w:t>
+        <w:t>ntoPhaco focuses on the way knowledge is represented and conceptual understanding</w:t>
       </w:r>
       <w:r>
         <w:t xml:space="preserve">. </w:t>
@@ -7508,19 +7426,9 @@
       <w:r>
         <w:t xml:space="preserve">Examples such as </w:t>
       </w:r>
-      <w:proofErr w:type="spellStart"/>
-      <w:r>
-        <w:t>Mediverse</w:t>
-      </w:r>
-      <w:proofErr w:type="spellEnd"/>
-      <w:r>
-        <w:t xml:space="preserve"> by </w:t>
-      </w:r>
-      <w:proofErr w:type="spellStart"/>
-      <w:r>
-        <w:t>Goggleminds</w:t>
-      </w:r>
-      <w:proofErr w:type="spellEnd"/>
+      <w:r>
+        <w:t>Mediverse by Goggleminds</w:t>
+      </w:r>
       <w:r>
         <w:t xml:space="preserve"> </w:t>
       </w:r>
@@ -7534,38 +7442,25 @@
         <w:t xml:space="preserve"> to healthcare providers and medical schools</w:t>
       </w:r>
       <w:r>
+        <w:t>. ClassVR by Systems improve</w:t>
+      </w:r>
+      <w:r>
+        <w:t>s</w:t>
+      </w:r>
+      <w:r>
+        <w:t xml:space="preserve"> student engagement</w:t>
+      </w:r>
+      <w:r>
+        <w:t xml:space="preserve"> to help teachers with educating students on learning material</w:t>
+      </w:r>
+      <w:r>
         <w:t xml:space="preserve">. </w:t>
       </w:r>
-      <w:proofErr w:type="spellStart"/>
-      <w:r>
-        <w:t>ClassVR</w:t>
-      </w:r>
-      <w:proofErr w:type="spellEnd"/>
-      <w:r>
-        <w:t xml:space="preserve"> by Systems improve</w:t>
-      </w:r>
-      <w:r>
-        <w:t>s</w:t>
-      </w:r>
-      <w:r>
-        <w:t xml:space="preserve"> student engagement</w:t>
-      </w:r>
-      <w:r>
-        <w:t xml:space="preserve"> to help teachers with educating students on learning material</w:t>
-      </w:r>
-      <w:r>
-        <w:t xml:space="preserve">. </w:t>
-      </w:r>
-      <w:r>
-        <w:t xml:space="preserve"> </w:t>
-      </w:r>
-      <w:proofErr w:type="spellStart"/>
-      <w:r>
-        <w:t>PrismsVR</w:t>
-      </w:r>
-      <w:proofErr w:type="spellEnd"/>
-      <w:r>
-        <w:t xml:space="preserve"> </w:t>
+      <w:r>
+        <w:t xml:space="preserve"> </w:t>
+      </w:r>
+      <w:r>
+        <w:t xml:space="preserve">PrismsVR </w:t>
       </w:r>
       <w:r>
         <w:t xml:space="preserve">helps students grasp core concepts in algebra and geometry, by </w:t>
@@ -8546,13 +8441,7 @@
         <w:t xml:space="preserve">was created to replicate an office or home desk style environment. The scene consisted of a desk PC </w:t>
       </w:r>
       <w:r>
-        <w:t>(</w:t>
-      </w:r>
-      <w:r>
-        <w:t>personal computer</w:t>
-      </w:r>
-      <w:r>
-        <w:t xml:space="preserve">) </w:t>
+        <w:t xml:space="preserve">(personal computer) </w:t>
       </w:r>
       <w:r>
         <w:t>setup</w:t>
@@ -8606,7 +8495,7 @@
         <w:t>By keeping t</w:t>
       </w:r>
       <w:r>
-        <w:t xml:space="preserve">he environment was kept simple </w:t>
+        <w:t xml:space="preserve">he environment simple </w:t>
       </w:r>
       <w:r>
         <w:t>it</w:t>
@@ -8693,15 +8582,7 @@
         <w:t>ere</w:t>
       </w:r>
       <w:r>
-        <w:t xml:space="preserve"> stored within the </w:t>
-      </w:r>
-      <w:proofErr w:type="spellStart"/>
-      <w:r>
-        <w:t>VRGameMode</w:t>
-      </w:r>
-      <w:proofErr w:type="spellEnd"/>
-      <w:r>
-        <w:t xml:space="preserve"> blueprint, with objectives being updated during runtime as conditions were satisfied </w:t>
+        <w:t xml:space="preserve"> stored within the VRGameMode blueprint, with objectives being updated during runtime as conditions were satisfied </w:t>
       </w:r>
       <w:r>
         <w:t>during</w:t>
@@ -8803,32 +8684,17 @@
         <w:t>s</w:t>
       </w:r>
       <w:r>
-        <w:t xml:space="preserve"> (H</w:t>
-      </w:r>
-      <w:r>
-        <w:t xml:space="preserve">eads </w:t>
-      </w:r>
-      <w:r>
-        <w:t>U</w:t>
-      </w:r>
-      <w:r>
-        <w:t xml:space="preserve">p </w:t>
-      </w:r>
-      <w:r>
-        <w:t>D</w:t>
-      </w:r>
-      <w:r>
-        <w:t>isplay</w:t>
+        <w:t xml:space="preserve"> (Heads Up Display</w:t>
       </w:r>
       <w:r>
         <w:t>s</w:t>
       </w:r>
       <w:r>
-        <w:t xml:space="preserve">) seen within video games so that the experience would be more immersive with users needing to interact and search the environment around them. The UI is implemented as a world space widget attached to the screen mesh of a monitor that uses a widget blueprint to control the information displayed. The widget consists of the current objective description to prompt users along with a </w:t>
+        <w:t xml:space="preserve">) seen within video games so that the experience would be more immersive with users needing to interact and search the environment around them. The UI is implemented as a world space widget attached to the screen mesh of a monitor that uses a widget blueprint to control the information displayed. The widget consists of the current objective description to prompt users along with a progress bar that fills up green as the necessary requirements are being met to complete the </w:t>
       </w:r>
       <w:r>
         <w:lastRenderedPageBreak/>
-        <w:t xml:space="preserve">progress bar that fills up green as the necessary requirements are being met to complete the objective. </w:t>
+        <w:t xml:space="preserve">objective. </w:t>
       </w:r>
       <w:r>
         <w:t>Event</w:t>
@@ -8920,10 +8786,10 @@
         <w:t xml:space="preserve">was used </w:t>
       </w:r>
       <w:r>
-        <w:t>that took the camera position as the starting location</w:t>
-      </w:r>
-      <w:r>
-        <w:t xml:space="preserve"> and a distance value multiplied by the forward vector of the camera to detect collision events with interactable objects.</w:t>
+        <w:t xml:space="preserve">to </w:t>
+      </w:r>
+      <w:r>
+        <w:t>detect collision events with interactable objects.</w:t>
       </w:r>
       <w:r>
         <w:t xml:space="preserve"> Whenever a hit was received, depending on which objective was the</w:t>
@@ -8962,15 +8828,7 @@
         <w:t>’s post processing component</w:t>
       </w:r>
       <w:r>
-        <w:t xml:space="preserve">. These effects were </w:t>
-      </w:r>
-      <w:proofErr w:type="gramStart"/>
-      <w:r>
-        <w:t>vignette</w:t>
-      </w:r>
-      <w:proofErr w:type="gramEnd"/>
-      <w:r>
-        <w:t xml:space="preserve"> to simulate eye fatigue, bloom for light sensitivity and blur for focus strain. Vignette and bloom post processing effects were triggered through adjusting their post processing variables within the camera post processing component. However, for blur a post processing material was required to create the radial blur. When objectives progressed triggering the simulation of symptoms, a timeline was used to progressively increase the value of an effect gradually over a duration. This decision was made to accommodate eyes adjusting to the changes of the camera as these effects were being triggered.</w:t>
+        <w:t>. These effects were vignette to simulate eye fatigue, bloom for light sensitivity and blur for focus strain. Vignette and bloom post processing effects were triggered through adjusting their post processing variables within the camera post processing component. However, for blur a post processing material was required to create the radial blur. When objectives progressed triggering the simulation of symptoms, a timeline was used to progressively increase the value of an effect gradually over a duration. This decision was made to accommodate eyes adjusting to the changes of the camera as these effects were being triggered.</w:t>
       </w:r>
       <w:r>
         <w:t xml:space="preserve"> The timeline was then used in reverse to revert the symptoms returning the camera view back to the original state it was in.</w:t>
@@ -8989,67 +8847,42 @@
       </w:r>
       <w:bookmarkEnd w:id="30"/>
     </w:p>
+    <w:p>
+      <w:r>
+        <w:t xml:space="preserve">Look direction was detected using a line trace </w:t>
+      </w:r>
+      <w:r>
+        <w:t>that took the camera position as the starting location and a distance value multiplied by the forward vector of the camera</w:t>
+      </w:r>
+      <w:r>
+        <w:t>. From there, returned hits would be checked for the object needed to progress the objective. When a successful hit was recorded, the time spent staring at the object was recorded and used to update the progress bar on the monitor. Whenever user gaze averted from the required progression object, the progress bar would reset back to zero so that progress wasn’t accumulated over multiple looks but from one continuous stare replicating the causes for symptoms.</w:t>
+      </w:r>
+    </w:p>
+    <w:p>
+      <w:pPr>
+        <w:rPr>
+          <w:rFonts w:asciiTheme="majorHAnsi" w:eastAsiaTheme="majorEastAsia" w:hAnsiTheme="majorHAnsi" w:cstheme="majorBidi"/>
+          <w:color w:val="0F4761" w:themeColor="accent1" w:themeShade="BF"/>
+          <w:sz w:val="32"/>
+          <w:szCs w:val="32"/>
+        </w:rPr>
+      </w:pPr>
+      <w:bookmarkStart w:id="31" w:name="_Toc223637907"/>
+      <w:r>
+        <w:br w:type="page"/>
+      </w:r>
+    </w:p>
+    <w:p>
+      <w:pPr>
+        <w:pStyle w:val="Heading2"/>
+      </w:pPr>
+      <w:r>
+        <w:lastRenderedPageBreak/>
+        <w:t>Polish and Improvements</w:t>
+      </w:r>
+      <w:bookmarkEnd w:id="31"/>
+    </w:p>
     <w:p/>
-    <w:p>
-      <w:pPr>
-        <w:pStyle w:val="Heading2"/>
-      </w:pPr>
-      <w:bookmarkStart w:id="31" w:name="_Toc223637907"/>
-      <w:r>
-        <w:t>Polish and Improvements</w:t>
-      </w:r>
-      <w:bookmarkEnd w:id="31"/>
-    </w:p>
-    <w:p/>
-    <w:p>
-      <w:pPr>
-        <w:pStyle w:val="Heading1"/>
-      </w:pPr>
-      <w:bookmarkStart w:id="32" w:name="_Toc223637908"/>
-      <w:r>
-        <w:lastRenderedPageBreak/>
-        <w:t>Results</w:t>
-      </w:r>
-      <w:bookmarkEnd w:id="32"/>
-    </w:p>
-    <w:p>
-      <w:pPr>
-        <w:pStyle w:val="Heading2"/>
-      </w:pPr>
-      <w:bookmarkStart w:id="33" w:name="_Toc223637909"/>
-      <w:r>
-        <w:t>First Result Set</w:t>
-      </w:r>
-      <w:bookmarkEnd w:id="33"/>
-    </w:p>
-    <w:p>
-      <w:pPr>
-        <w:pStyle w:val="Heading2"/>
-        <w:rPr>
-          <w:sz w:val="40"/>
-          <w:szCs w:val="40"/>
-        </w:rPr>
-      </w:pPr>
-      <w:bookmarkStart w:id="34" w:name="_Toc223637910"/>
-      <w:r>
-        <w:t>Second Result Set</w:t>
-      </w:r>
-      <w:bookmarkEnd w:id="34"/>
-      <w:r>
-        <w:br w:type="page"/>
-      </w:r>
-    </w:p>
-    <w:p>
-      <w:pPr>
-        <w:pStyle w:val="Heading1"/>
-      </w:pPr>
-      <w:bookmarkStart w:id="35" w:name="_Toc223637911"/>
-      <w:r>
-        <w:lastRenderedPageBreak/>
-        <w:t>Critical Evaluation</w:t>
-      </w:r>
-      <w:bookmarkEnd w:id="35"/>
-    </w:p>
     <w:p>
       <w:pPr>
         <w:rPr>
@@ -9059,6 +8892,82 @@
           <w:szCs w:val="40"/>
         </w:rPr>
       </w:pPr>
+      <w:bookmarkStart w:id="32" w:name="_Toc223637908"/>
+      <w:r>
+        <w:br w:type="page"/>
+      </w:r>
+    </w:p>
+    <w:p>
+      <w:pPr>
+        <w:pStyle w:val="Heading1"/>
+      </w:pPr>
+      <w:r>
+        <w:lastRenderedPageBreak/>
+        <w:t>Results</w:t>
+      </w:r>
+      <w:bookmarkEnd w:id="32"/>
+    </w:p>
+    <w:p>
+      <w:pPr>
+        <w:pStyle w:val="Heading2"/>
+      </w:pPr>
+      <w:bookmarkStart w:id="33" w:name="_Toc223637909"/>
+      <w:r>
+        <w:t>First Result Set</w:t>
+      </w:r>
+      <w:bookmarkEnd w:id="33"/>
+    </w:p>
+    <w:p>
+      <w:pPr>
+        <w:rPr>
+          <w:rFonts w:asciiTheme="majorHAnsi" w:eastAsiaTheme="majorEastAsia" w:hAnsiTheme="majorHAnsi" w:cstheme="majorBidi"/>
+          <w:color w:val="0F4761" w:themeColor="accent1" w:themeShade="BF"/>
+          <w:sz w:val="32"/>
+          <w:szCs w:val="32"/>
+        </w:rPr>
+      </w:pPr>
+      <w:bookmarkStart w:id="34" w:name="_Toc223637910"/>
+      <w:r>
+        <w:br w:type="page"/>
+      </w:r>
+    </w:p>
+    <w:p>
+      <w:pPr>
+        <w:pStyle w:val="Heading2"/>
+        <w:rPr>
+          <w:sz w:val="40"/>
+          <w:szCs w:val="40"/>
+        </w:rPr>
+      </w:pPr>
+      <w:r>
+        <w:lastRenderedPageBreak/>
+        <w:t>Second Result Set</w:t>
+      </w:r>
+      <w:bookmarkEnd w:id="34"/>
+      <w:r>
+        <w:br w:type="page"/>
+      </w:r>
+    </w:p>
+    <w:p>
+      <w:pPr>
+        <w:pStyle w:val="Heading1"/>
+      </w:pPr>
+      <w:bookmarkStart w:id="35" w:name="_Toc223637911"/>
+      <w:r>
+        <w:lastRenderedPageBreak/>
+        <w:t>Critical Evaluation</w:t>
+      </w:r>
+      <w:bookmarkEnd w:id="35"/>
+    </w:p>
+    <w:p>
+      <w:pPr>
+        <w:rPr>
+          <w:rFonts w:asciiTheme="majorHAnsi" w:eastAsiaTheme="majorEastAsia" w:hAnsiTheme="majorHAnsi" w:cstheme="majorBidi"/>
+          <w:color w:val="0F4761" w:themeColor="accent1" w:themeShade="BF"/>
+          <w:sz w:val="40"/>
+          <w:szCs w:val="40"/>
+        </w:rPr>
+      </w:pPr>
       <w:r>
         <w:t>High word count for this, needs to be an in-depth evaluation, discuss in third person and cover all areas that help progress the project and other areas that dampened it such as outside life events etc.</w:t>
       </w:r>
@@ -9092,23 +9001,9 @@
       <w:bookmarkEnd w:id="37"/>
     </w:p>
     <w:p>
-      <w:proofErr w:type="spellStart"/>
-      <w:r>
-        <w:t>Cantó</w:t>
-      </w:r>
-      <w:proofErr w:type="spellEnd"/>
-      <w:r>
-        <w:t xml:space="preserve">-Sancho, N., </w:t>
-      </w:r>
-      <w:proofErr w:type="spellStart"/>
-      <w:r>
-        <w:t>Porru</w:t>
-      </w:r>
-      <w:proofErr w:type="spellEnd"/>
-      <w:r>
-        <w:t xml:space="preserve">, S., Casati, S., Ronda, E., Seguí-Crespo, M. and Carta, A. (2023) ‘Prevalence and risk factors of computer vision syndrome—assessed in office workers by a validated questionnaire’. </w:t>
-      </w:r>
-      <w:proofErr w:type="spellStart"/>
+      <w:r>
+        <w:t xml:space="preserve">Cantó-Sancho, N., Porru, S., Casati, S., Ronda, E., Seguí-Crespo, M. and Carta, A. (2023) ‘Prevalence and risk factors of computer vision syndrome—assessed in office workers by a validated questionnaire’. </w:t>
+      </w:r>
       <w:r>
         <w:rPr>
           <w:i/>
@@ -9116,30 +9011,13 @@
         </w:rPr>
         <w:t>PeerJ</w:t>
       </w:r>
-      <w:proofErr w:type="spellEnd"/>
       <w:r>
         <w:t xml:space="preserve"> 11, p. e14937. Available at: https://www.researchgate.net/publication/369002899_Prevalence_and_risk_factors_of_computer_vision_syndrome-assessed_in_office_workers_by_a_validated_questionnaire (Accessed: 20 October 2025).</w:t>
       </w:r>
     </w:p>
     <w:p>
       <w:r>
-        <w:t xml:space="preserve">Chandrasekhara, R.S., Low, C., Lim, Y., Low, L., Mardina, F. and </w:t>
-      </w:r>
-      <w:proofErr w:type="spellStart"/>
-      <w:r>
-        <w:t>Nursaleha</w:t>
-      </w:r>
-      <w:proofErr w:type="spellEnd"/>
-      <w:r>
-        <w:t xml:space="preserve">, M. (2013) ‘Computer vision syndrome: a study of knowledge and practices in university </w:t>
-      </w:r>
-      <w:proofErr w:type="gramStart"/>
-      <w:r>
-        <w:t>students’</w:t>
-      </w:r>
-      <w:proofErr w:type="gramEnd"/>
-      <w:r>
-        <w:t xml:space="preserve">. </w:t>
+        <w:t xml:space="preserve">Chandrasekhara, R.S., Low, C., Lim, Y., Low, L., Mardina, F. and Nursaleha, M. (2013) ‘Computer vision syndrome: a study of knowledge and practices in university students’. </w:t>
       </w:r>
       <w:r>
         <w:rPr>
@@ -9165,15 +9043,7 @@
     </w:p>
     <w:p>
       <w:r>
-        <w:t xml:space="preserve">Muñoz, E.G., </w:t>
-      </w:r>
-      <w:proofErr w:type="spellStart"/>
-      <w:r>
-        <w:t>Fabregat</w:t>
-      </w:r>
-      <w:proofErr w:type="spellEnd"/>
-      <w:r>
-        <w:t xml:space="preserve">, R., Bacca-Acosta, J., Duque-Méndez, N. and Avila-Garzon, C. (2022) ‘Augmented Reality, Virtual Reality, and Game Technologies in Ophthalmology Training’. </w:t>
+        <w:t xml:space="preserve">Muñoz, E.G., Fabregat, R., Bacca-Acosta, J., Duque-Méndez, N. and Avila-Garzon, C. (2022) ‘Augmented Reality, Virtual Reality, and Game Technologies in Ophthalmology Training’. </w:t>
       </w:r>
       <w:r>
         <w:rPr>
@@ -9183,15 +9053,7 @@
         <w:t>Information</w:t>
       </w:r>
       <w:r>
-        <w:t xml:space="preserve"> 13(5), p. 222. </w:t>
-      </w:r>
-      <w:proofErr w:type="spellStart"/>
-      <w:r>
-        <w:t>doi</w:t>
-      </w:r>
-      <w:proofErr w:type="spellEnd"/>
-      <w:r>
-        <w:t xml:space="preserve">: </w:t>
+        <w:t xml:space="preserve"> 13(5), p. 222. doi: </w:t>
       </w:r>
       <w:hyperlink r:id="rId16" w:history="1">
         <w:r>
@@ -9207,33 +9069,12 @@
     </w:p>
     <w:p>
       <w:r>
-        <w:t xml:space="preserve">Orji, J., Hernandez, A., Selema, B. and Orji, R. (2022) ‘Virtual and augmented reality applications for promoting safety and security: A systematic review’., pp. 1–7. </w:t>
-      </w:r>
-      <w:proofErr w:type="spellStart"/>
-      <w:r>
-        <w:t>doi</w:t>
-      </w:r>
-      <w:proofErr w:type="spellEnd"/>
-      <w:r>
-        <w:t>: https://doi.org/10.1109/SEGAH54908.2022.9978597.</w:t>
-      </w:r>
-    </w:p>
-    <w:p>
-      <w:proofErr w:type="spellStart"/>
-      <w:r>
-        <w:t>Porcar</w:t>
-      </w:r>
-      <w:proofErr w:type="spellEnd"/>
-      <w:r>
-        <w:t xml:space="preserve">, E., Pons, A. and Lorente, A. (2016) ‘Visual and ocular effects from the use of flat-panel </w:t>
-      </w:r>
-      <w:proofErr w:type="gramStart"/>
-      <w:r>
-        <w:t>displays’</w:t>
-      </w:r>
-      <w:proofErr w:type="gramEnd"/>
-      <w:r>
-        <w:t xml:space="preserve">. </w:t>
+        <w:t>Orji, J., Hernandez, A., Selema, B. and Orji, R. (2022) ‘Virtual and augmented reality applications for promoting safety and security: A systematic review’., pp. 1–7. doi: https://doi.org/10.1109/SEGAH54908.2022.9978597.</w:t>
+      </w:r>
+    </w:p>
+    <w:p>
+      <w:r>
+        <w:t xml:space="preserve">Porcar, E., Pons, A. and Lorente, A. (2016) ‘Visual and ocular effects from the use of flat-panel displays’. </w:t>
       </w:r>
       <w:r>
         <w:rPr>
@@ -9248,23 +9089,7 @@
     </w:p>
     <w:p>
       <w:r>
-        <w:t xml:space="preserve">Santilli, T., Ceccacci, S., Mengoni, M. and Catia </w:t>
-      </w:r>
-      <w:proofErr w:type="spellStart"/>
-      <w:r>
-        <w:t>Giaconi</w:t>
-      </w:r>
-      <w:proofErr w:type="spellEnd"/>
-      <w:r>
-        <w:t xml:space="preserve"> (2025) ‘Virtual vs. traditional learning in higher education: A systematic review of comparative </w:t>
-      </w:r>
-      <w:proofErr w:type="gramStart"/>
-      <w:r>
-        <w:t>studies’</w:t>
-      </w:r>
-      <w:proofErr w:type="gramEnd"/>
-      <w:r>
-        <w:t xml:space="preserve">. </w:t>
+        <w:t xml:space="preserve">Santilli, T., Ceccacci, S., Mengoni, M. and Catia Giaconi (2025) ‘Virtual vs. traditional learning in higher education: A systematic review of comparative studies’. </w:t>
       </w:r>
       <w:r>
         <w:rPr>
@@ -9299,23 +9124,7 @@
     </w:p>
     <w:p>
       <w:r>
-        <w:t>Vieira, F., Oliveira, E. and Rodrigues, N. (2019) ‘</w:t>
-      </w:r>
-      <w:proofErr w:type="spellStart"/>
-      <w:r>
-        <w:t>iSVC</w:t>
-      </w:r>
-      <w:proofErr w:type="spellEnd"/>
-      <w:r>
-        <w:t xml:space="preserve"> – digital platform for detection and prevention of computer vision syndrome’., pp. 1–7. </w:t>
-      </w:r>
-      <w:proofErr w:type="spellStart"/>
-      <w:r>
-        <w:t>doi</w:t>
-      </w:r>
-      <w:proofErr w:type="spellEnd"/>
-      <w:r>
-        <w:t>: https://doi.org/10.1109/SeGAH.2019.8882438.</w:t>
+        <w:t>Vieira, F., Oliveira, E. and Rodrigues, N. (2019) ‘iSVC – digital platform for detection and prevention of computer vision syndrome’., pp. 1–7. doi: https://doi.org/10.1109/SeGAH.2019.8882438.</w:t>
       </w:r>
     </w:p>
     <w:p>
@@ -9330,28 +9139,12 @@
         <w:t>Annals of Emerging Technologies in Computing</w:t>
       </w:r>
       <w:r>
-        <w:t xml:space="preserve"> 9(3), pp. 50–68. </w:t>
-      </w:r>
-      <w:proofErr w:type="spellStart"/>
-      <w:r>
-        <w:t>doi</w:t>
-      </w:r>
-      <w:proofErr w:type="spellEnd"/>
-      <w:r>
-        <w:t>: https://doi.org/10.33166/aetic.2025.03.004.</w:t>
-      </w:r>
-    </w:p>
-    <w:p>
-      <w:r>
-        <w:t>Youcef, B., Ahmad, M.N. and Mustapha, M. (2021) ‘</w:t>
-      </w:r>
-      <w:proofErr w:type="spellStart"/>
-      <w:r>
-        <w:t>OntoPhaco</w:t>
-      </w:r>
-      <w:proofErr w:type="spellEnd"/>
-      <w:r>
-        <w:t xml:space="preserve">: An ontology for virtual reality training in ophthalmology Domain—A case study of cataract surgery’. </w:t>
+        <w:t xml:space="preserve"> 9(3), pp. 50–68. doi: https://doi.org/10.33166/aetic.2025.03.004.</w:t>
+      </w:r>
+    </w:p>
+    <w:p>
+      <w:r>
+        <w:t xml:space="preserve">Youcef, B., Ahmad, M.N. and Mustapha, M. (2021) ‘OntoPhaco: An ontology for virtual reality training in ophthalmology Domain—A case study of cataract surgery’. </w:t>
       </w:r>
       <w:r>
         <w:rPr>
@@ -9361,15 +9154,7 @@
         <w:t>IEEE Access</w:t>
       </w:r>
       <w:r>
-        <w:t xml:space="preserve"> 9, pp. 152347–152378. </w:t>
-      </w:r>
-      <w:proofErr w:type="spellStart"/>
-      <w:r>
-        <w:t>doi</w:t>
-      </w:r>
-      <w:proofErr w:type="spellEnd"/>
-      <w:r>
-        <w:t>: https://doi.org/10.1109/ACCESS.2021.3126697.</w:t>
+        <w:t xml:space="preserve"> 9, pp. 152347–152378. doi: https://doi.org/10.1109/ACCESS.2021.3126697.</w:t>
       </w:r>
     </w:p>
     <w:p/>
@@ -10143,22 +9928,9 @@
       <w:bookmarkStart w:id="48" w:name="_Toc223637924"/>
       <w:r>
         <w:lastRenderedPageBreak/>
-        <w:t xml:space="preserve">Button Hover </w:t>
-      </w:r>
-      <w:proofErr w:type="spellStart"/>
-      <w:r>
-        <w:t>Sfx</w:t>
-      </w:r>
-      <w:proofErr w:type="spellEnd"/>
-      <w:r>
-        <w:t xml:space="preserve"> by </w:t>
-      </w:r>
-      <w:proofErr w:type="spellStart"/>
-      <w:r>
-        <w:t>Fachii</w:t>
+        <w:t>Button Hover Sfx by Fachii</w:t>
       </w:r>
       <w:bookmarkEnd w:id="48"/>
-      <w:proofErr w:type="spellEnd"/>
     </w:p>
     <w:p>
       <w:r>
@@ -10258,31 +10030,9 @@
         <w:rPr>
           <w:rStyle w:val="Heading3Char"/>
         </w:rPr>
-        <w:t xml:space="preserve">Button click </w:t>
-      </w:r>
-      <w:proofErr w:type="spellStart"/>
-      <w:r>
-        <w:rPr>
-          <w:rStyle w:val="Heading3Char"/>
-        </w:rPr>
-        <w:t>Sfx</w:t>
-      </w:r>
-      <w:proofErr w:type="spellEnd"/>
-      <w:r>
-        <w:rPr>
-          <w:rStyle w:val="Heading3Char"/>
-        </w:rPr>
-        <w:t xml:space="preserve"> by </w:t>
-      </w:r>
-      <w:proofErr w:type="spellStart"/>
-      <w:r>
-        <w:rPr>
-          <w:rStyle w:val="Heading3Char"/>
-        </w:rPr>
-        <w:t>AndrewEathan</w:t>
+        <w:t>Button click Sfx by AndrewEathan</w:t>
       </w:r>
       <w:bookmarkEnd w:id="49"/>
-      <w:proofErr w:type="spellEnd"/>
       <w:r>
         <w:t xml:space="preserve"> </w:t>
       </w:r>
@@ -10391,22 +10141,9 @@
       <w:bookmarkStart w:id="50" w:name="_Toc223637926"/>
       <w:r>
         <w:lastRenderedPageBreak/>
-        <w:t xml:space="preserve">Light Switch </w:t>
-      </w:r>
-      <w:proofErr w:type="gramStart"/>
-      <w:r>
-        <w:t>On</w:t>
-      </w:r>
-      <w:proofErr w:type="gramEnd"/>
-      <w:r>
-        <w:t xml:space="preserve"> </w:t>
-      </w:r>
-      <w:proofErr w:type="spellStart"/>
-      <w:r>
-        <w:t>Sfx</w:t>
+        <w:t>Light Switch On Sfx</w:t>
       </w:r>
       <w:bookmarkEnd w:id="50"/>
-      <w:proofErr w:type="spellEnd"/>
     </w:p>
     <w:p>
       <w:r>
@@ -10498,14 +10235,9 @@
       </w:pPr>
       <w:bookmarkStart w:id="51" w:name="_Toc223637927"/>
       <w:r>
-        <w:t xml:space="preserve">Light Switch Off </w:t>
-      </w:r>
-      <w:proofErr w:type="spellStart"/>
-      <w:r>
-        <w:t>Sfx</w:t>
+        <w:t>Light Switch Off Sfx</w:t>
       </w:r>
       <w:bookmarkEnd w:id="51"/>
-      <w:proofErr w:type="spellEnd"/>
     </w:p>
     <w:p>
       <w:r>

</xml_diff>

<commit_message>
Mapped out prototype tests section
</commit_message>
<xml_diff>
--- a/30077548Thesis.docx
+++ b/30077548Thesis.docx
@@ -236,7 +236,7 @@
           <w:r>
             <w:fldChar w:fldCharType="separate"/>
           </w:r>
-          <w:hyperlink w:anchor="_Toc223637876" w:history="1">
+          <w:hyperlink w:anchor="_Toc223789485" w:history="1">
             <w:r>
               <w:rPr>
                 <w:rStyle w:val="Hyperlink"/>
@@ -263,7 +263,7 @@
                 <w:noProof/>
                 <w:webHidden/>
               </w:rPr>
-              <w:instrText xml:space="preserve"> PAGEREF _Toc223637876 \h </w:instrText>
+              <w:instrText xml:space="preserve"> PAGEREF _Toc223789485 \h </w:instrText>
             </w:r>
             <w:r>
               <w:rPr>
@@ -308,7 +308,7 @@
               <w:lang w:eastAsia="en-GB"/>
             </w:rPr>
           </w:pPr>
-          <w:hyperlink w:anchor="_Toc223637877" w:history="1">
+          <w:hyperlink w:anchor="_Toc223789486" w:history="1">
             <w:r>
               <w:rPr>
                 <w:rStyle w:val="Hyperlink"/>
@@ -335,7 +335,7 @@
                 <w:noProof/>
                 <w:webHidden/>
               </w:rPr>
-              <w:instrText xml:space="preserve"> PAGEREF _Toc223637877 \h </w:instrText>
+              <w:instrText xml:space="preserve"> PAGEREF _Toc223789486 \h </w:instrText>
             </w:r>
             <w:r>
               <w:rPr>
@@ -380,7 +380,7 @@
               <w:lang w:eastAsia="en-GB"/>
             </w:rPr>
           </w:pPr>
-          <w:hyperlink w:anchor="_Toc223637878" w:history="1">
+          <w:hyperlink w:anchor="_Toc223789487" w:history="1">
             <w:r>
               <w:rPr>
                 <w:rStyle w:val="Hyperlink"/>
@@ -407,7 +407,7 @@
                 <w:noProof/>
                 <w:webHidden/>
               </w:rPr>
-              <w:instrText xml:space="preserve"> PAGEREF _Toc223637878 \h </w:instrText>
+              <w:instrText xml:space="preserve"> PAGEREF _Toc223789487 \h </w:instrText>
             </w:r>
             <w:r>
               <w:rPr>
@@ -452,7 +452,7 @@
               <w:lang w:eastAsia="en-GB"/>
             </w:rPr>
           </w:pPr>
-          <w:hyperlink w:anchor="_Toc223637879" w:history="1">
+          <w:hyperlink w:anchor="_Toc223789488" w:history="1">
             <w:r>
               <w:rPr>
                 <w:rStyle w:val="Hyperlink"/>
@@ -479,7 +479,7 @@
                 <w:noProof/>
                 <w:webHidden/>
               </w:rPr>
-              <w:instrText xml:space="preserve"> PAGEREF _Toc223637879 \h </w:instrText>
+              <w:instrText xml:space="preserve"> PAGEREF _Toc223789488 \h </w:instrText>
             </w:r>
             <w:r>
               <w:rPr>
@@ -524,7 +524,7 @@
               <w:lang w:eastAsia="en-GB"/>
             </w:rPr>
           </w:pPr>
-          <w:hyperlink w:anchor="_Toc223637880" w:history="1">
+          <w:hyperlink w:anchor="_Toc223789489" w:history="1">
             <w:r>
               <w:rPr>
                 <w:rStyle w:val="Hyperlink"/>
@@ -551,7 +551,7 @@
                 <w:noProof/>
                 <w:webHidden/>
               </w:rPr>
-              <w:instrText xml:space="preserve"> PAGEREF _Toc223637880 \h </w:instrText>
+              <w:instrText xml:space="preserve"> PAGEREF _Toc223789489 \h </w:instrText>
             </w:r>
             <w:r>
               <w:rPr>
@@ -596,7 +596,7 @@
               <w:lang w:eastAsia="en-GB"/>
             </w:rPr>
           </w:pPr>
-          <w:hyperlink w:anchor="_Toc223637881" w:history="1">
+          <w:hyperlink w:anchor="_Toc223789490" w:history="1">
             <w:r>
               <w:rPr>
                 <w:rStyle w:val="Hyperlink"/>
@@ -623,7 +623,7 @@
                 <w:noProof/>
                 <w:webHidden/>
               </w:rPr>
-              <w:instrText xml:space="preserve"> PAGEREF _Toc223637881 \h </w:instrText>
+              <w:instrText xml:space="preserve"> PAGEREF _Toc223789490 \h </w:instrText>
             </w:r>
             <w:r>
               <w:rPr>
@@ -668,7 +668,7 @@
               <w:lang w:eastAsia="en-GB"/>
             </w:rPr>
           </w:pPr>
-          <w:hyperlink w:anchor="_Toc223637882" w:history="1">
+          <w:hyperlink w:anchor="_Toc223789491" w:history="1">
             <w:r>
               <w:rPr>
                 <w:rStyle w:val="Hyperlink"/>
@@ -695,7 +695,7 @@
                 <w:noProof/>
                 <w:webHidden/>
               </w:rPr>
-              <w:instrText xml:space="preserve"> PAGEREF _Toc223637882 \h </w:instrText>
+              <w:instrText xml:space="preserve"> PAGEREF _Toc223789491 \h </w:instrText>
             </w:r>
             <w:r>
               <w:rPr>
@@ -740,7 +740,7 @@
               <w:lang w:eastAsia="en-GB"/>
             </w:rPr>
           </w:pPr>
-          <w:hyperlink w:anchor="_Toc223637883" w:history="1">
+          <w:hyperlink w:anchor="_Toc223789492" w:history="1">
             <w:r>
               <w:rPr>
                 <w:rStyle w:val="Hyperlink"/>
@@ -767,7 +767,7 @@
                 <w:noProof/>
                 <w:webHidden/>
               </w:rPr>
-              <w:instrText xml:space="preserve"> PAGEREF _Toc223637883 \h </w:instrText>
+              <w:instrText xml:space="preserve"> PAGEREF _Toc223789492 \h </w:instrText>
             </w:r>
             <w:r>
               <w:rPr>
@@ -812,7 +812,7 @@
               <w:lang w:eastAsia="en-GB"/>
             </w:rPr>
           </w:pPr>
-          <w:hyperlink w:anchor="_Toc223637884" w:history="1">
+          <w:hyperlink w:anchor="_Toc223789493" w:history="1">
             <w:r>
               <w:rPr>
                 <w:rStyle w:val="Hyperlink"/>
@@ -839,7 +839,7 @@
                 <w:noProof/>
                 <w:webHidden/>
               </w:rPr>
-              <w:instrText xml:space="preserve"> PAGEREF _Toc223637884 \h </w:instrText>
+              <w:instrText xml:space="preserve"> PAGEREF _Toc223789493 \h </w:instrText>
             </w:r>
             <w:r>
               <w:rPr>
@@ -884,7 +884,7 @@
               <w:lang w:eastAsia="en-GB"/>
             </w:rPr>
           </w:pPr>
-          <w:hyperlink w:anchor="_Toc223637885" w:history="1">
+          <w:hyperlink w:anchor="_Toc223789494" w:history="1">
             <w:r>
               <w:rPr>
                 <w:rStyle w:val="Hyperlink"/>
@@ -911,7 +911,7 @@
                 <w:noProof/>
                 <w:webHidden/>
               </w:rPr>
-              <w:instrText xml:space="preserve"> PAGEREF _Toc223637885 \h </w:instrText>
+              <w:instrText xml:space="preserve"> PAGEREF _Toc223789494 \h </w:instrText>
             </w:r>
             <w:r>
               <w:rPr>
@@ -956,7 +956,7 @@
               <w:lang w:eastAsia="en-GB"/>
             </w:rPr>
           </w:pPr>
-          <w:hyperlink w:anchor="_Toc223637886" w:history="1">
+          <w:hyperlink w:anchor="_Toc223789495" w:history="1">
             <w:r>
               <w:rPr>
                 <w:rStyle w:val="Hyperlink"/>
@@ -983,7 +983,7 @@
                 <w:noProof/>
                 <w:webHidden/>
               </w:rPr>
-              <w:instrText xml:space="preserve"> PAGEREF _Toc223637886 \h </w:instrText>
+              <w:instrText xml:space="preserve"> PAGEREF _Toc223789495 \h </w:instrText>
             </w:r>
             <w:r>
               <w:rPr>
@@ -1028,7 +1028,7 @@
               <w:lang w:eastAsia="en-GB"/>
             </w:rPr>
           </w:pPr>
-          <w:hyperlink w:anchor="_Toc223637887" w:history="1">
+          <w:hyperlink w:anchor="_Toc223789496" w:history="1">
             <w:r>
               <w:rPr>
                 <w:rStyle w:val="Hyperlink"/>
@@ -1055,7 +1055,7 @@
                 <w:noProof/>
                 <w:webHidden/>
               </w:rPr>
-              <w:instrText xml:space="preserve"> PAGEREF _Toc223637887 \h </w:instrText>
+              <w:instrText xml:space="preserve"> PAGEREF _Toc223789496 \h </w:instrText>
             </w:r>
             <w:r>
               <w:rPr>
@@ -1100,7 +1100,7 @@
               <w:lang w:eastAsia="en-GB"/>
             </w:rPr>
           </w:pPr>
-          <w:hyperlink w:anchor="_Toc223637888" w:history="1">
+          <w:hyperlink w:anchor="_Toc223789497" w:history="1">
             <w:r>
               <w:rPr>
                 <w:rStyle w:val="Hyperlink"/>
@@ -1127,7 +1127,7 @@
                 <w:noProof/>
                 <w:webHidden/>
               </w:rPr>
-              <w:instrText xml:space="preserve"> PAGEREF _Toc223637888 \h </w:instrText>
+              <w:instrText xml:space="preserve"> PAGEREF _Toc223789497 \h </w:instrText>
             </w:r>
             <w:r>
               <w:rPr>
@@ -1172,7 +1172,7 @@
               <w:lang w:eastAsia="en-GB"/>
             </w:rPr>
           </w:pPr>
-          <w:hyperlink w:anchor="_Toc223637889" w:history="1">
+          <w:hyperlink w:anchor="_Toc223789498" w:history="1">
             <w:r>
               <w:rPr>
                 <w:rStyle w:val="Hyperlink"/>
@@ -1199,7 +1199,7 @@
                 <w:noProof/>
                 <w:webHidden/>
               </w:rPr>
-              <w:instrText xml:space="preserve"> PAGEREF _Toc223637889 \h </w:instrText>
+              <w:instrText xml:space="preserve"> PAGEREF _Toc223789498 \h </w:instrText>
             </w:r>
             <w:r>
               <w:rPr>
@@ -1244,7 +1244,7 @@
               <w:lang w:eastAsia="en-GB"/>
             </w:rPr>
           </w:pPr>
-          <w:hyperlink w:anchor="_Toc223637890" w:history="1">
+          <w:hyperlink w:anchor="_Toc223789499" w:history="1">
             <w:r>
               <w:rPr>
                 <w:rStyle w:val="Hyperlink"/>
@@ -1271,7 +1271,7 @@
                 <w:noProof/>
                 <w:webHidden/>
               </w:rPr>
-              <w:instrText xml:space="preserve"> PAGEREF _Toc223637890 \h </w:instrText>
+              <w:instrText xml:space="preserve"> PAGEREF _Toc223789499 \h </w:instrText>
             </w:r>
             <w:r>
               <w:rPr>
@@ -1316,7 +1316,7 @@
               <w:lang w:eastAsia="en-GB"/>
             </w:rPr>
           </w:pPr>
-          <w:hyperlink w:anchor="_Toc223637891" w:history="1">
+          <w:hyperlink w:anchor="_Toc223789500" w:history="1">
             <w:r>
               <w:rPr>
                 <w:rStyle w:val="Hyperlink"/>
@@ -1343,7 +1343,7 @@
                 <w:noProof/>
                 <w:webHidden/>
               </w:rPr>
-              <w:instrText xml:space="preserve"> PAGEREF _Toc223637891 \h </w:instrText>
+              <w:instrText xml:space="preserve"> PAGEREF _Toc223789500 \h </w:instrText>
             </w:r>
             <w:r>
               <w:rPr>
@@ -1388,7 +1388,7 @@
               <w:lang w:eastAsia="en-GB"/>
             </w:rPr>
           </w:pPr>
-          <w:hyperlink w:anchor="_Toc223637892" w:history="1">
+          <w:hyperlink w:anchor="_Toc223789501" w:history="1">
             <w:r>
               <w:rPr>
                 <w:rStyle w:val="Hyperlink"/>
@@ -1415,7 +1415,7 @@
                 <w:noProof/>
                 <w:webHidden/>
               </w:rPr>
-              <w:instrText xml:space="preserve"> PAGEREF _Toc223637892 \h </w:instrText>
+              <w:instrText xml:space="preserve"> PAGEREF _Toc223789501 \h </w:instrText>
             </w:r>
             <w:r>
               <w:rPr>
@@ -1460,7 +1460,7 @@
               <w:lang w:eastAsia="en-GB"/>
             </w:rPr>
           </w:pPr>
-          <w:hyperlink w:anchor="_Toc223637893" w:history="1">
+          <w:hyperlink w:anchor="_Toc223789502" w:history="1">
             <w:r>
               <w:rPr>
                 <w:rStyle w:val="Hyperlink"/>
@@ -1487,7 +1487,7 @@
                 <w:noProof/>
                 <w:webHidden/>
               </w:rPr>
-              <w:instrText xml:space="preserve"> PAGEREF _Toc223637893 \h </w:instrText>
+              <w:instrText xml:space="preserve"> PAGEREF _Toc223789502 \h </w:instrText>
             </w:r>
             <w:r>
               <w:rPr>
@@ -1532,7 +1532,7 @@
               <w:lang w:eastAsia="en-GB"/>
             </w:rPr>
           </w:pPr>
-          <w:hyperlink w:anchor="_Toc223637894" w:history="1">
+          <w:hyperlink w:anchor="_Toc223789503" w:history="1">
             <w:r>
               <w:rPr>
                 <w:rStyle w:val="Hyperlink"/>
@@ -1559,7 +1559,7 @@
                 <w:noProof/>
                 <w:webHidden/>
               </w:rPr>
-              <w:instrText xml:space="preserve"> PAGEREF _Toc223637894 \h </w:instrText>
+              <w:instrText xml:space="preserve"> PAGEREF _Toc223789503 \h </w:instrText>
             </w:r>
             <w:r>
               <w:rPr>
@@ -1604,7 +1604,7 @@
               <w:lang w:eastAsia="en-GB"/>
             </w:rPr>
           </w:pPr>
-          <w:hyperlink w:anchor="_Toc223637895" w:history="1">
+          <w:hyperlink w:anchor="_Toc223789504" w:history="1">
             <w:r>
               <w:rPr>
                 <w:rStyle w:val="Hyperlink"/>
@@ -1631,7 +1631,7 @@
                 <w:noProof/>
                 <w:webHidden/>
               </w:rPr>
-              <w:instrText xml:space="preserve"> PAGEREF _Toc223637895 \h </w:instrText>
+              <w:instrText xml:space="preserve"> PAGEREF _Toc223789504 \h </w:instrText>
             </w:r>
             <w:r>
               <w:rPr>
@@ -1676,7 +1676,7 @@
               <w:lang w:eastAsia="en-GB"/>
             </w:rPr>
           </w:pPr>
-          <w:hyperlink w:anchor="_Toc223637896" w:history="1">
+          <w:hyperlink w:anchor="_Toc223789505" w:history="1">
             <w:r>
               <w:rPr>
                 <w:rStyle w:val="Hyperlink"/>
@@ -1703,7 +1703,7 @@
                 <w:noProof/>
                 <w:webHidden/>
               </w:rPr>
-              <w:instrText xml:space="preserve"> PAGEREF _Toc223637896 \h </w:instrText>
+              <w:instrText xml:space="preserve"> PAGEREF _Toc223789505 \h </w:instrText>
             </w:r>
             <w:r>
               <w:rPr>
@@ -1748,7 +1748,7 @@
               <w:lang w:eastAsia="en-GB"/>
             </w:rPr>
           </w:pPr>
-          <w:hyperlink w:anchor="_Toc223637897" w:history="1">
+          <w:hyperlink w:anchor="_Toc223789506" w:history="1">
             <w:r>
               <w:rPr>
                 <w:rStyle w:val="Hyperlink"/>
@@ -1775,7 +1775,7 @@
                 <w:noProof/>
                 <w:webHidden/>
               </w:rPr>
-              <w:instrText xml:space="preserve"> PAGEREF _Toc223637897 \h </w:instrText>
+              <w:instrText xml:space="preserve"> PAGEREF _Toc223789506 \h </w:instrText>
             </w:r>
             <w:r>
               <w:rPr>
@@ -1820,7 +1820,7 @@
               <w:lang w:eastAsia="en-GB"/>
             </w:rPr>
           </w:pPr>
-          <w:hyperlink w:anchor="_Toc223637898" w:history="1">
+          <w:hyperlink w:anchor="_Toc223789507" w:history="1">
             <w:r>
               <w:rPr>
                 <w:rStyle w:val="Hyperlink"/>
@@ -1847,7 +1847,7 @@
                 <w:noProof/>
                 <w:webHidden/>
               </w:rPr>
-              <w:instrText xml:space="preserve"> PAGEREF _Toc223637898 \h </w:instrText>
+              <w:instrText xml:space="preserve"> PAGEREF _Toc223789507 \h </w:instrText>
             </w:r>
             <w:r>
               <w:rPr>
@@ -1892,7 +1892,7 @@
               <w:lang w:eastAsia="en-GB"/>
             </w:rPr>
           </w:pPr>
-          <w:hyperlink w:anchor="_Toc223637899" w:history="1">
+          <w:hyperlink w:anchor="_Toc223789508" w:history="1">
             <w:r>
               <w:rPr>
                 <w:rStyle w:val="Hyperlink"/>
@@ -1919,7 +1919,7 @@
                 <w:noProof/>
                 <w:webHidden/>
               </w:rPr>
-              <w:instrText xml:space="preserve"> PAGEREF _Toc223637899 \h </w:instrText>
+              <w:instrText xml:space="preserve"> PAGEREF _Toc223789508 \h </w:instrText>
             </w:r>
             <w:r>
               <w:rPr>
@@ -1964,7 +1964,7 @@
               <w:lang w:eastAsia="en-GB"/>
             </w:rPr>
           </w:pPr>
-          <w:hyperlink w:anchor="_Toc223637900" w:history="1">
+          <w:hyperlink w:anchor="_Toc223789509" w:history="1">
             <w:r>
               <w:rPr>
                 <w:rStyle w:val="Hyperlink"/>
@@ -1991,7 +1991,7 @@
                 <w:noProof/>
                 <w:webHidden/>
               </w:rPr>
-              <w:instrText xml:space="preserve"> PAGEREF _Toc223637900 \h </w:instrText>
+              <w:instrText xml:space="preserve"> PAGEREF _Toc223789509 \h </w:instrText>
             </w:r>
             <w:r>
               <w:rPr>
@@ -2036,7 +2036,7 @@
               <w:lang w:eastAsia="en-GB"/>
             </w:rPr>
           </w:pPr>
-          <w:hyperlink w:anchor="_Toc223637901" w:history="1">
+          <w:hyperlink w:anchor="_Toc223789510" w:history="1">
             <w:r>
               <w:rPr>
                 <w:rStyle w:val="Hyperlink"/>
@@ -2063,7 +2063,7 @@
                 <w:noProof/>
                 <w:webHidden/>
               </w:rPr>
-              <w:instrText xml:space="preserve"> PAGEREF _Toc223637901 \h </w:instrText>
+              <w:instrText xml:space="preserve"> PAGEREF _Toc223789510 \h </w:instrText>
             </w:r>
             <w:r>
               <w:rPr>
@@ -2108,7 +2108,7 @@
               <w:lang w:eastAsia="en-GB"/>
             </w:rPr>
           </w:pPr>
-          <w:hyperlink w:anchor="_Toc223637902" w:history="1">
+          <w:hyperlink w:anchor="_Toc223789511" w:history="1">
             <w:r>
               <w:rPr>
                 <w:rStyle w:val="Hyperlink"/>
@@ -2135,7 +2135,7 @@
                 <w:noProof/>
                 <w:webHidden/>
               </w:rPr>
-              <w:instrText xml:space="preserve"> PAGEREF _Toc223637902 \h </w:instrText>
+              <w:instrText xml:space="preserve"> PAGEREF _Toc223789511 \h </w:instrText>
             </w:r>
             <w:r>
               <w:rPr>
@@ -2180,7 +2180,7 @@
               <w:lang w:eastAsia="en-GB"/>
             </w:rPr>
           </w:pPr>
-          <w:hyperlink w:anchor="_Toc223637903" w:history="1">
+          <w:hyperlink w:anchor="_Toc223789512" w:history="1">
             <w:r>
               <w:rPr>
                 <w:rStyle w:val="Hyperlink"/>
@@ -2207,7 +2207,7 @@
                 <w:noProof/>
                 <w:webHidden/>
               </w:rPr>
-              <w:instrText xml:space="preserve"> PAGEREF _Toc223637903 \h </w:instrText>
+              <w:instrText xml:space="preserve"> PAGEREF _Toc223789512 \h </w:instrText>
             </w:r>
             <w:r>
               <w:rPr>
@@ -2252,7 +2252,7 @@
               <w:lang w:eastAsia="en-GB"/>
             </w:rPr>
           </w:pPr>
-          <w:hyperlink w:anchor="_Toc223637904" w:history="1">
+          <w:hyperlink w:anchor="_Toc223789513" w:history="1">
             <w:r>
               <w:rPr>
                 <w:rStyle w:val="Hyperlink"/>
@@ -2279,7 +2279,7 @@
                 <w:noProof/>
                 <w:webHidden/>
               </w:rPr>
-              <w:instrText xml:space="preserve"> PAGEREF _Toc223637904 \h </w:instrText>
+              <w:instrText xml:space="preserve"> PAGEREF _Toc223789513 \h </w:instrText>
             </w:r>
             <w:r>
               <w:rPr>
@@ -2324,7 +2324,7 @@
               <w:lang w:eastAsia="en-GB"/>
             </w:rPr>
           </w:pPr>
-          <w:hyperlink w:anchor="_Toc223637905" w:history="1">
+          <w:hyperlink w:anchor="_Toc223789514" w:history="1">
             <w:r>
               <w:rPr>
                 <w:rStyle w:val="Hyperlink"/>
@@ -2351,7 +2351,7 @@
                 <w:noProof/>
                 <w:webHidden/>
               </w:rPr>
-              <w:instrText xml:space="preserve"> PAGEREF _Toc223637905 \h </w:instrText>
+              <w:instrText xml:space="preserve"> PAGEREF _Toc223789514 \h </w:instrText>
             </w:r>
             <w:r>
               <w:rPr>
@@ -2396,7 +2396,7 @@
               <w:lang w:eastAsia="en-GB"/>
             </w:rPr>
           </w:pPr>
-          <w:hyperlink w:anchor="_Toc223637906" w:history="1">
+          <w:hyperlink w:anchor="_Toc223789515" w:history="1">
             <w:r>
               <w:rPr>
                 <w:rStyle w:val="Hyperlink"/>
@@ -2423,7 +2423,7 @@
                 <w:noProof/>
                 <w:webHidden/>
               </w:rPr>
-              <w:instrText xml:space="preserve"> PAGEREF _Toc223637906 \h </w:instrText>
+              <w:instrText xml:space="preserve"> PAGEREF _Toc223789515 \h </w:instrText>
             </w:r>
             <w:r>
               <w:rPr>
@@ -2468,13 +2468,13 @@
               <w:lang w:eastAsia="en-GB"/>
             </w:rPr>
           </w:pPr>
-          <w:hyperlink w:anchor="_Toc223637907" w:history="1">
+          <w:hyperlink w:anchor="_Toc223789516" w:history="1">
             <w:r>
               <w:rPr>
                 <w:rStyle w:val="Hyperlink"/>
                 <w:noProof/>
               </w:rPr>
-              <w:t>Polish and Improvements</w:t>
+              <w:t>Final Version Implementation</w:t>
             </w:r>
             <w:r>
               <w:rPr>
@@ -2495,7 +2495,7 @@
                 <w:noProof/>
                 <w:webHidden/>
               </w:rPr>
-              <w:instrText xml:space="preserve"> PAGEREF _Toc223637907 \h </w:instrText>
+              <w:instrText xml:space="preserve"> PAGEREF _Toc223789516 \h </w:instrText>
             </w:r>
             <w:r>
               <w:rPr>
@@ -2515,7 +2515,7 @@
                 <w:noProof/>
                 <w:webHidden/>
               </w:rPr>
-              <w:t>19</w:t>
+              <w:t>20</w:t>
             </w:r>
             <w:r>
               <w:rPr>
@@ -2540,7 +2540,7 @@
               <w:lang w:eastAsia="en-GB"/>
             </w:rPr>
           </w:pPr>
-          <w:hyperlink w:anchor="_Toc223637908" w:history="1">
+          <w:hyperlink w:anchor="_Toc223789517" w:history="1">
             <w:r>
               <w:rPr>
                 <w:rStyle w:val="Hyperlink"/>
@@ -2567,7 +2567,7 @@
                 <w:noProof/>
                 <w:webHidden/>
               </w:rPr>
-              <w:instrText xml:space="preserve"> PAGEREF _Toc223637908 \h </w:instrText>
+              <w:instrText xml:space="preserve"> PAGEREF _Toc223789517 \h </w:instrText>
             </w:r>
             <w:r>
               <w:rPr>
@@ -2587,7 +2587,7 @@
                 <w:noProof/>
                 <w:webHidden/>
               </w:rPr>
-              <w:t>20</w:t>
+              <w:t>21</w:t>
             </w:r>
             <w:r>
               <w:rPr>
@@ -2612,13 +2612,13 @@
               <w:lang w:eastAsia="en-GB"/>
             </w:rPr>
           </w:pPr>
-          <w:hyperlink w:anchor="_Toc223637909" w:history="1">
+          <w:hyperlink w:anchor="_Toc223789518" w:history="1">
             <w:r>
               <w:rPr>
                 <w:rStyle w:val="Hyperlink"/>
                 <w:noProof/>
               </w:rPr>
-              <w:t>First Result Set</w:t>
+              <w:t>Prototype Tests</w:t>
             </w:r>
             <w:r>
               <w:rPr>
@@ -2639,7 +2639,7 @@
                 <w:noProof/>
                 <w:webHidden/>
               </w:rPr>
-              <w:instrText xml:space="preserve"> PAGEREF _Toc223637909 \h </w:instrText>
+              <w:instrText xml:space="preserve"> PAGEREF _Toc223789518 \h </w:instrText>
             </w:r>
             <w:r>
               <w:rPr>
@@ -2659,7 +2659,367 @@
                 <w:noProof/>
                 <w:webHidden/>
               </w:rPr>
-              <w:t>20</w:t>
+              <w:t>21</w:t>
+            </w:r>
+            <w:r>
+              <w:rPr>
+                <w:noProof/>
+                <w:webHidden/>
+              </w:rPr>
+              <w:fldChar w:fldCharType="end"/>
+            </w:r>
+          </w:hyperlink>
+        </w:p>
+        <w:p>
+          <w:pPr>
+            <w:pStyle w:val="TOC3"/>
+            <w:tabs>
+              <w:tab w:val="right" w:leader="dot" w:pos="9016"/>
+            </w:tabs>
+            <w:rPr>
+              <w:rFonts w:eastAsiaTheme="minorEastAsia"/>
+              <w:noProof/>
+              <w:sz w:val="24"/>
+              <w:szCs w:val="24"/>
+              <w:lang w:eastAsia="en-GB"/>
+            </w:rPr>
+          </w:pPr>
+          <w:hyperlink w:anchor="_Toc223789519" w:history="1">
+            <w:r>
+              <w:rPr>
+                <w:rStyle w:val="Hyperlink"/>
+                <w:noProof/>
+              </w:rPr>
+              <w:t>Interaction Objects and Objective Understanding</w:t>
+            </w:r>
+            <w:r>
+              <w:rPr>
+                <w:noProof/>
+                <w:webHidden/>
+              </w:rPr>
+              <w:tab/>
+            </w:r>
+            <w:r>
+              <w:rPr>
+                <w:noProof/>
+                <w:webHidden/>
+              </w:rPr>
+              <w:fldChar w:fldCharType="begin"/>
+            </w:r>
+            <w:r>
+              <w:rPr>
+                <w:noProof/>
+                <w:webHidden/>
+              </w:rPr>
+              <w:instrText xml:space="preserve"> PAGEREF _Toc223789519 \h </w:instrText>
+            </w:r>
+            <w:r>
+              <w:rPr>
+                <w:noProof/>
+                <w:webHidden/>
+              </w:rPr>
+            </w:r>
+            <w:r>
+              <w:rPr>
+                <w:noProof/>
+                <w:webHidden/>
+              </w:rPr>
+              <w:fldChar w:fldCharType="separate"/>
+            </w:r>
+            <w:r>
+              <w:rPr>
+                <w:noProof/>
+                <w:webHidden/>
+              </w:rPr>
+              <w:t>21</w:t>
+            </w:r>
+            <w:r>
+              <w:rPr>
+                <w:noProof/>
+                <w:webHidden/>
+              </w:rPr>
+              <w:fldChar w:fldCharType="end"/>
+            </w:r>
+          </w:hyperlink>
+        </w:p>
+        <w:p>
+          <w:pPr>
+            <w:pStyle w:val="TOC3"/>
+            <w:tabs>
+              <w:tab w:val="right" w:leader="dot" w:pos="9016"/>
+            </w:tabs>
+            <w:rPr>
+              <w:rFonts w:eastAsiaTheme="minorEastAsia"/>
+              <w:noProof/>
+              <w:sz w:val="24"/>
+              <w:szCs w:val="24"/>
+              <w:lang w:eastAsia="en-GB"/>
+            </w:rPr>
+          </w:pPr>
+          <w:hyperlink w:anchor="_Toc223789520" w:history="1">
+            <w:r>
+              <w:rPr>
+                <w:rStyle w:val="Hyperlink"/>
+                <w:noProof/>
+              </w:rPr>
+              <w:t>User Attention Detection</w:t>
+            </w:r>
+            <w:r>
+              <w:rPr>
+                <w:noProof/>
+                <w:webHidden/>
+              </w:rPr>
+              <w:tab/>
+            </w:r>
+            <w:r>
+              <w:rPr>
+                <w:noProof/>
+                <w:webHidden/>
+              </w:rPr>
+              <w:fldChar w:fldCharType="begin"/>
+            </w:r>
+            <w:r>
+              <w:rPr>
+                <w:noProof/>
+                <w:webHidden/>
+              </w:rPr>
+              <w:instrText xml:space="preserve"> PAGEREF _Toc223789520 \h </w:instrText>
+            </w:r>
+            <w:r>
+              <w:rPr>
+                <w:noProof/>
+                <w:webHidden/>
+              </w:rPr>
+            </w:r>
+            <w:r>
+              <w:rPr>
+                <w:noProof/>
+                <w:webHidden/>
+              </w:rPr>
+              <w:fldChar w:fldCharType="separate"/>
+            </w:r>
+            <w:r>
+              <w:rPr>
+                <w:noProof/>
+                <w:webHidden/>
+              </w:rPr>
+              <w:t>21</w:t>
+            </w:r>
+            <w:r>
+              <w:rPr>
+                <w:noProof/>
+                <w:webHidden/>
+              </w:rPr>
+              <w:fldChar w:fldCharType="end"/>
+            </w:r>
+          </w:hyperlink>
+        </w:p>
+        <w:p>
+          <w:pPr>
+            <w:pStyle w:val="TOC3"/>
+            <w:tabs>
+              <w:tab w:val="right" w:leader="dot" w:pos="9016"/>
+            </w:tabs>
+            <w:rPr>
+              <w:rFonts w:eastAsiaTheme="minorEastAsia"/>
+              <w:noProof/>
+              <w:sz w:val="24"/>
+              <w:szCs w:val="24"/>
+              <w:lang w:eastAsia="en-GB"/>
+            </w:rPr>
+          </w:pPr>
+          <w:hyperlink w:anchor="_Toc223789521" w:history="1">
+            <w:r>
+              <w:rPr>
+                <w:rStyle w:val="Hyperlink"/>
+                <w:noProof/>
+              </w:rPr>
+              <w:t>Symptom Simulations</w:t>
+            </w:r>
+            <w:r>
+              <w:rPr>
+                <w:noProof/>
+                <w:webHidden/>
+              </w:rPr>
+              <w:tab/>
+            </w:r>
+            <w:r>
+              <w:rPr>
+                <w:noProof/>
+                <w:webHidden/>
+              </w:rPr>
+              <w:fldChar w:fldCharType="begin"/>
+            </w:r>
+            <w:r>
+              <w:rPr>
+                <w:noProof/>
+                <w:webHidden/>
+              </w:rPr>
+              <w:instrText xml:space="preserve"> PAGEREF _Toc223789521 \h </w:instrText>
+            </w:r>
+            <w:r>
+              <w:rPr>
+                <w:noProof/>
+                <w:webHidden/>
+              </w:rPr>
+            </w:r>
+            <w:r>
+              <w:rPr>
+                <w:noProof/>
+                <w:webHidden/>
+              </w:rPr>
+              <w:fldChar w:fldCharType="separate"/>
+            </w:r>
+            <w:r>
+              <w:rPr>
+                <w:noProof/>
+                <w:webHidden/>
+              </w:rPr>
+              <w:t>21</w:t>
+            </w:r>
+            <w:r>
+              <w:rPr>
+                <w:noProof/>
+                <w:webHidden/>
+              </w:rPr>
+              <w:fldChar w:fldCharType="end"/>
+            </w:r>
+          </w:hyperlink>
+        </w:p>
+        <w:p>
+          <w:pPr>
+            <w:pStyle w:val="TOC3"/>
+            <w:tabs>
+              <w:tab w:val="right" w:leader="dot" w:pos="9016"/>
+            </w:tabs>
+            <w:rPr>
+              <w:rFonts w:eastAsiaTheme="minorEastAsia"/>
+              <w:noProof/>
+              <w:sz w:val="24"/>
+              <w:szCs w:val="24"/>
+              <w:lang w:eastAsia="en-GB"/>
+            </w:rPr>
+          </w:pPr>
+          <w:hyperlink w:anchor="_Toc223789522" w:history="1">
+            <w:r>
+              <w:rPr>
+                <w:rStyle w:val="Hyperlink"/>
+                <w:noProof/>
+              </w:rPr>
+              <w:t>Strengths and Weaknesses</w:t>
+            </w:r>
+            <w:r>
+              <w:rPr>
+                <w:noProof/>
+                <w:webHidden/>
+              </w:rPr>
+              <w:tab/>
+            </w:r>
+            <w:r>
+              <w:rPr>
+                <w:noProof/>
+                <w:webHidden/>
+              </w:rPr>
+              <w:fldChar w:fldCharType="begin"/>
+            </w:r>
+            <w:r>
+              <w:rPr>
+                <w:noProof/>
+                <w:webHidden/>
+              </w:rPr>
+              <w:instrText xml:space="preserve"> PAGEREF _Toc223789522 \h </w:instrText>
+            </w:r>
+            <w:r>
+              <w:rPr>
+                <w:noProof/>
+                <w:webHidden/>
+              </w:rPr>
+            </w:r>
+            <w:r>
+              <w:rPr>
+                <w:noProof/>
+                <w:webHidden/>
+              </w:rPr>
+              <w:fldChar w:fldCharType="separate"/>
+            </w:r>
+            <w:r>
+              <w:rPr>
+                <w:noProof/>
+                <w:webHidden/>
+              </w:rPr>
+              <w:t>21</w:t>
+            </w:r>
+            <w:r>
+              <w:rPr>
+                <w:noProof/>
+                <w:webHidden/>
+              </w:rPr>
+              <w:fldChar w:fldCharType="end"/>
+            </w:r>
+          </w:hyperlink>
+        </w:p>
+        <w:p>
+          <w:pPr>
+            <w:pStyle w:val="TOC3"/>
+            <w:tabs>
+              <w:tab w:val="right" w:leader="dot" w:pos="9016"/>
+            </w:tabs>
+            <w:rPr>
+              <w:rFonts w:eastAsiaTheme="minorEastAsia"/>
+              <w:noProof/>
+              <w:sz w:val="24"/>
+              <w:szCs w:val="24"/>
+              <w:lang w:eastAsia="en-GB"/>
+            </w:rPr>
+          </w:pPr>
+          <w:hyperlink w:anchor="_Toc223789523" w:history="1">
+            <w:r>
+              <w:rPr>
+                <w:rStyle w:val="Hyperlink"/>
+                <w:noProof/>
+              </w:rPr>
+              <w:t>Improvements to be Made</w:t>
+            </w:r>
+            <w:r>
+              <w:rPr>
+                <w:noProof/>
+                <w:webHidden/>
+              </w:rPr>
+              <w:tab/>
+            </w:r>
+            <w:r>
+              <w:rPr>
+                <w:noProof/>
+                <w:webHidden/>
+              </w:rPr>
+              <w:fldChar w:fldCharType="begin"/>
+            </w:r>
+            <w:r>
+              <w:rPr>
+                <w:noProof/>
+                <w:webHidden/>
+              </w:rPr>
+              <w:instrText xml:space="preserve"> PAGEREF _Toc223789523 \h </w:instrText>
+            </w:r>
+            <w:r>
+              <w:rPr>
+                <w:noProof/>
+                <w:webHidden/>
+              </w:rPr>
+            </w:r>
+            <w:r>
+              <w:rPr>
+                <w:noProof/>
+                <w:webHidden/>
+              </w:rPr>
+              <w:fldChar w:fldCharType="separate"/>
+            </w:r>
+            <w:r>
+              <w:rPr>
+                <w:noProof/>
+                <w:webHidden/>
+              </w:rPr>
+              <w:t>21</w:t>
             </w:r>
             <w:r>
               <w:rPr>
@@ -2684,13 +3044,13 @@
               <w:lang w:eastAsia="en-GB"/>
             </w:rPr>
           </w:pPr>
-          <w:hyperlink w:anchor="_Toc223637910" w:history="1">
+          <w:hyperlink w:anchor="_Toc223789524" w:history="1">
             <w:r>
               <w:rPr>
                 <w:rStyle w:val="Hyperlink"/>
                 <w:noProof/>
               </w:rPr>
-              <w:t>Second Result Set</w:t>
+              <w:t>Final Version Tests</w:t>
             </w:r>
             <w:r>
               <w:rPr>
@@ -2711,7 +3071,7 @@
                 <w:noProof/>
                 <w:webHidden/>
               </w:rPr>
-              <w:instrText xml:space="preserve"> PAGEREF _Toc223637910 \h </w:instrText>
+              <w:instrText xml:space="preserve"> PAGEREF _Toc223789524 \h </w:instrText>
             </w:r>
             <w:r>
               <w:rPr>
@@ -2731,7 +3091,7 @@
                 <w:noProof/>
                 <w:webHidden/>
               </w:rPr>
-              <w:t>20</w:t>
+              <w:t>22</w:t>
             </w:r>
             <w:r>
               <w:rPr>
@@ -2756,7 +3116,7 @@
               <w:lang w:eastAsia="en-GB"/>
             </w:rPr>
           </w:pPr>
-          <w:hyperlink w:anchor="_Toc223637911" w:history="1">
+          <w:hyperlink w:anchor="_Toc223789525" w:history="1">
             <w:r>
               <w:rPr>
                 <w:rStyle w:val="Hyperlink"/>
@@ -2783,7 +3143,7 @@
                 <w:noProof/>
                 <w:webHidden/>
               </w:rPr>
-              <w:instrText xml:space="preserve"> PAGEREF _Toc223637911 \h </w:instrText>
+              <w:instrText xml:space="preserve"> PAGEREF _Toc223789525 \h </w:instrText>
             </w:r>
             <w:r>
               <w:rPr>
@@ -2803,7 +3163,7 @@
                 <w:noProof/>
                 <w:webHidden/>
               </w:rPr>
-              <w:t>21</w:t>
+              <w:t>23</w:t>
             </w:r>
             <w:r>
               <w:rPr>
@@ -2828,7 +3188,7 @@
               <w:lang w:eastAsia="en-GB"/>
             </w:rPr>
           </w:pPr>
-          <w:hyperlink w:anchor="_Toc223637912" w:history="1">
+          <w:hyperlink w:anchor="_Toc223789526" w:history="1">
             <w:r>
               <w:rPr>
                 <w:rStyle w:val="Hyperlink"/>
@@ -2855,7 +3215,7 @@
                 <w:noProof/>
                 <w:webHidden/>
               </w:rPr>
-              <w:instrText xml:space="preserve"> PAGEREF _Toc223637912 \h </w:instrText>
+              <w:instrText xml:space="preserve"> PAGEREF _Toc223789526 \h </w:instrText>
             </w:r>
             <w:r>
               <w:rPr>
@@ -2875,7 +3235,7 @@
                 <w:noProof/>
                 <w:webHidden/>
               </w:rPr>
-              <w:t>22</w:t>
+              <w:t>24</w:t>
             </w:r>
             <w:r>
               <w:rPr>
@@ -2900,7 +3260,7 @@
               <w:lang w:eastAsia="en-GB"/>
             </w:rPr>
           </w:pPr>
-          <w:hyperlink w:anchor="_Toc223637913" w:history="1">
+          <w:hyperlink w:anchor="_Toc223789527" w:history="1">
             <w:r>
               <w:rPr>
                 <w:rStyle w:val="Hyperlink"/>
@@ -2927,7 +3287,7 @@
                 <w:noProof/>
                 <w:webHidden/>
               </w:rPr>
-              <w:instrText xml:space="preserve"> PAGEREF _Toc223637913 \h </w:instrText>
+              <w:instrText xml:space="preserve"> PAGEREF _Toc223789527 \h </w:instrText>
             </w:r>
             <w:r>
               <w:rPr>
@@ -2947,7 +3307,7 @@
                 <w:noProof/>
                 <w:webHidden/>
               </w:rPr>
-              <w:t>23</w:t>
+              <w:t>25</w:t>
             </w:r>
             <w:r>
               <w:rPr>
@@ -2972,7 +3332,7 @@
               <w:lang w:eastAsia="en-GB"/>
             </w:rPr>
           </w:pPr>
-          <w:hyperlink w:anchor="_Toc223637914" w:history="1">
+          <w:hyperlink w:anchor="_Toc223789528" w:history="1">
             <w:r>
               <w:rPr>
                 <w:rStyle w:val="Hyperlink"/>
@@ -2999,7 +3359,7 @@
                 <w:noProof/>
                 <w:webHidden/>
               </w:rPr>
-              <w:instrText xml:space="preserve"> PAGEREF _Toc223637914 \h </w:instrText>
+              <w:instrText xml:space="preserve"> PAGEREF _Toc223789528 \h </w:instrText>
             </w:r>
             <w:r>
               <w:rPr>
@@ -3019,7 +3379,7 @@
                 <w:noProof/>
                 <w:webHidden/>
               </w:rPr>
-              <w:t>24</w:t>
+              <w:t>26</w:t>
             </w:r>
             <w:r>
               <w:rPr>
@@ -3044,7 +3404,7 @@
               <w:lang w:eastAsia="en-GB"/>
             </w:rPr>
           </w:pPr>
-          <w:hyperlink w:anchor="_Toc223637915" w:history="1">
+          <w:hyperlink w:anchor="_Toc223789529" w:history="1">
             <w:r>
               <w:rPr>
                 <w:rStyle w:val="Hyperlink"/>
@@ -3071,7 +3431,7 @@
                 <w:noProof/>
                 <w:webHidden/>
               </w:rPr>
-              <w:instrText xml:space="preserve"> PAGEREF _Toc223637915 \h </w:instrText>
+              <w:instrText xml:space="preserve"> PAGEREF _Toc223789529 \h </w:instrText>
             </w:r>
             <w:r>
               <w:rPr>
@@ -3091,7 +3451,7 @@
                 <w:noProof/>
                 <w:webHidden/>
               </w:rPr>
-              <w:t>24</w:t>
+              <w:t>26</w:t>
             </w:r>
             <w:r>
               <w:rPr>
@@ -3116,7 +3476,7 @@
               <w:lang w:eastAsia="en-GB"/>
             </w:rPr>
           </w:pPr>
-          <w:hyperlink w:anchor="_Toc223637916" w:history="1">
+          <w:hyperlink w:anchor="_Toc223789530" w:history="1">
             <w:r>
               <w:rPr>
                 <w:rStyle w:val="Hyperlink"/>
@@ -3143,7 +3503,7 @@
                 <w:noProof/>
                 <w:webHidden/>
               </w:rPr>
-              <w:instrText xml:space="preserve"> PAGEREF _Toc223637916 \h </w:instrText>
+              <w:instrText xml:space="preserve"> PAGEREF _Toc223789530 \h </w:instrText>
             </w:r>
             <w:r>
               <w:rPr>
@@ -3163,7 +3523,7 @@
                 <w:noProof/>
                 <w:webHidden/>
               </w:rPr>
-              <w:t>24</w:t>
+              <w:t>26</w:t>
             </w:r>
             <w:r>
               <w:rPr>
@@ -3188,7 +3548,7 @@
               <w:lang w:eastAsia="en-GB"/>
             </w:rPr>
           </w:pPr>
-          <w:hyperlink w:anchor="_Toc223637917" w:history="1">
+          <w:hyperlink w:anchor="_Toc223789531" w:history="1">
             <w:r>
               <w:rPr>
                 <w:rStyle w:val="Hyperlink"/>
@@ -3215,7 +3575,7 @@
                 <w:noProof/>
                 <w:webHidden/>
               </w:rPr>
-              <w:instrText xml:space="preserve"> PAGEREF _Toc223637917 \h </w:instrText>
+              <w:instrText xml:space="preserve"> PAGEREF _Toc223789531 \h </w:instrText>
             </w:r>
             <w:r>
               <w:rPr>
@@ -3235,7 +3595,7 @@
                 <w:noProof/>
                 <w:webHidden/>
               </w:rPr>
-              <w:t>24</w:t>
+              <w:t>26</w:t>
             </w:r>
             <w:r>
               <w:rPr>
@@ -3260,7 +3620,7 @@
               <w:lang w:eastAsia="en-GB"/>
             </w:rPr>
           </w:pPr>
-          <w:hyperlink w:anchor="_Toc223637918" w:history="1">
+          <w:hyperlink w:anchor="_Toc223789532" w:history="1">
             <w:r>
               <w:rPr>
                 <w:rStyle w:val="Hyperlink"/>
@@ -3287,7 +3647,7 @@
                 <w:noProof/>
                 <w:webHidden/>
               </w:rPr>
-              <w:instrText xml:space="preserve"> PAGEREF _Toc223637918 \h </w:instrText>
+              <w:instrText xml:space="preserve"> PAGEREF _Toc223789532 \h </w:instrText>
             </w:r>
             <w:r>
               <w:rPr>
@@ -3307,7 +3667,7 @@
                 <w:noProof/>
                 <w:webHidden/>
               </w:rPr>
-              <w:t>24</w:t>
+              <w:t>26</w:t>
             </w:r>
             <w:r>
               <w:rPr>
@@ -3332,7 +3692,7 @@
               <w:lang w:eastAsia="en-GB"/>
             </w:rPr>
           </w:pPr>
-          <w:hyperlink w:anchor="_Toc223637919" w:history="1">
+          <w:hyperlink w:anchor="_Toc223789533" w:history="1">
             <w:r>
               <w:rPr>
                 <w:rStyle w:val="Hyperlink"/>
@@ -3359,7 +3719,7 @@
                 <w:noProof/>
                 <w:webHidden/>
               </w:rPr>
-              <w:instrText xml:space="preserve"> PAGEREF _Toc223637919 \h </w:instrText>
+              <w:instrText xml:space="preserve"> PAGEREF _Toc223789533 \h </w:instrText>
             </w:r>
             <w:r>
               <w:rPr>
@@ -3379,7 +3739,7 @@
                 <w:noProof/>
                 <w:webHidden/>
               </w:rPr>
-              <w:t>25</w:t>
+              <w:t>27</w:t>
             </w:r>
             <w:r>
               <w:rPr>
@@ -3404,7 +3764,7 @@
               <w:lang w:eastAsia="en-GB"/>
             </w:rPr>
           </w:pPr>
-          <w:hyperlink w:anchor="_Toc223637920" w:history="1">
+          <w:hyperlink w:anchor="_Toc223789534" w:history="1">
             <w:r>
               <w:rPr>
                 <w:rStyle w:val="Hyperlink"/>
@@ -3431,7 +3791,7 @@
                 <w:noProof/>
                 <w:webHidden/>
               </w:rPr>
-              <w:instrText xml:space="preserve"> PAGEREF _Toc223637920 \h </w:instrText>
+              <w:instrText xml:space="preserve"> PAGEREF _Toc223789534 \h </w:instrText>
             </w:r>
             <w:r>
               <w:rPr>
@@ -3451,7 +3811,7 @@
                 <w:noProof/>
                 <w:webHidden/>
               </w:rPr>
-              <w:t>25</w:t>
+              <w:t>27</w:t>
             </w:r>
             <w:r>
               <w:rPr>
@@ -3476,7 +3836,7 @@
               <w:lang w:eastAsia="en-GB"/>
             </w:rPr>
           </w:pPr>
-          <w:hyperlink w:anchor="_Toc223637921" w:history="1">
+          <w:hyperlink w:anchor="_Toc223789535" w:history="1">
             <w:r>
               <w:rPr>
                 <w:rStyle w:val="Hyperlink"/>
@@ -3503,7 +3863,7 @@
                 <w:noProof/>
                 <w:webHidden/>
               </w:rPr>
-              <w:instrText xml:space="preserve"> PAGEREF _Toc223637921 \h </w:instrText>
+              <w:instrText xml:space="preserve"> PAGEREF _Toc223789535 \h </w:instrText>
             </w:r>
             <w:r>
               <w:rPr>
@@ -3523,7 +3883,7 @@
                 <w:noProof/>
                 <w:webHidden/>
               </w:rPr>
-              <w:t>25</w:t>
+              <w:t>27</w:t>
             </w:r>
             <w:r>
               <w:rPr>
@@ -3548,7 +3908,7 @@
               <w:lang w:eastAsia="en-GB"/>
             </w:rPr>
           </w:pPr>
-          <w:hyperlink w:anchor="_Toc223637922" w:history="1">
+          <w:hyperlink w:anchor="_Toc223789536" w:history="1">
             <w:r>
               <w:rPr>
                 <w:rStyle w:val="Hyperlink"/>
@@ -3575,7 +3935,7 @@
                 <w:noProof/>
                 <w:webHidden/>
               </w:rPr>
-              <w:instrText xml:space="preserve"> PAGEREF _Toc223637922 \h </w:instrText>
+              <w:instrText xml:space="preserve"> PAGEREF _Toc223789536 \h </w:instrText>
             </w:r>
             <w:r>
               <w:rPr>
@@ -3595,7 +3955,7 @@
                 <w:noProof/>
                 <w:webHidden/>
               </w:rPr>
-              <w:t>26</w:t>
+              <w:t>28</w:t>
             </w:r>
             <w:r>
               <w:rPr>
@@ -3620,7 +3980,7 @@
               <w:lang w:eastAsia="en-GB"/>
             </w:rPr>
           </w:pPr>
-          <w:hyperlink w:anchor="_Toc223637923" w:history="1">
+          <w:hyperlink w:anchor="_Toc223789537" w:history="1">
             <w:r>
               <w:rPr>
                 <w:rStyle w:val="Hyperlink"/>
@@ -3647,7 +4007,7 @@
                 <w:noProof/>
                 <w:webHidden/>
               </w:rPr>
-              <w:instrText xml:space="preserve"> PAGEREF _Toc223637923 \h </w:instrText>
+              <w:instrText xml:space="preserve"> PAGEREF _Toc223789537 \h </w:instrText>
             </w:r>
             <w:r>
               <w:rPr>
@@ -3667,7 +4027,7 @@
                 <w:noProof/>
                 <w:webHidden/>
               </w:rPr>
-              <w:t>27</w:t>
+              <w:t>29</w:t>
             </w:r>
             <w:r>
               <w:rPr>
@@ -3692,7 +4052,7 @@
               <w:lang w:eastAsia="en-GB"/>
             </w:rPr>
           </w:pPr>
-          <w:hyperlink w:anchor="_Toc223637924" w:history="1">
+          <w:hyperlink w:anchor="_Toc223789538" w:history="1">
             <w:r>
               <w:rPr>
                 <w:rStyle w:val="Hyperlink"/>
@@ -3719,7 +4079,7 @@
                 <w:noProof/>
                 <w:webHidden/>
               </w:rPr>
-              <w:instrText xml:space="preserve"> PAGEREF _Toc223637924 \h </w:instrText>
+              <w:instrText xml:space="preserve"> PAGEREF _Toc223789538 \h </w:instrText>
             </w:r>
             <w:r>
               <w:rPr>
@@ -3739,7 +4099,7 @@
                 <w:noProof/>
                 <w:webHidden/>
               </w:rPr>
-              <w:t>28</w:t>
+              <w:t>30</w:t>
             </w:r>
             <w:r>
               <w:rPr>
@@ -3764,7 +4124,7 @@
               <w:lang w:eastAsia="en-GB"/>
             </w:rPr>
           </w:pPr>
-          <w:hyperlink w:anchor="_Toc223637925" w:history="1">
+          <w:hyperlink w:anchor="_Toc223789539" w:history="1">
             <w:r>
               <w:rPr>
                 <w:rStyle w:val="Hyperlink"/>
@@ -3791,7 +4151,7 @@
                 <w:noProof/>
                 <w:webHidden/>
               </w:rPr>
-              <w:instrText xml:space="preserve"> PAGEREF _Toc223637925 \h </w:instrText>
+              <w:instrText xml:space="preserve"> PAGEREF _Toc223789539 \h </w:instrText>
             </w:r>
             <w:r>
               <w:rPr>
@@ -3811,7 +4171,7 @@
                 <w:noProof/>
                 <w:webHidden/>
               </w:rPr>
-              <w:t>28</w:t>
+              <w:t>30</w:t>
             </w:r>
             <w:r>
               <w:rPr>
@@ -3836,7 +4196,7 @@
               <w:lang w:eastAsia="en-GB"/>
             </w:rPr>
           </w:pPr>
-          <w:hyperlink w:anchor="_Toc223637926" w:history="1">
+          <w:hyperlink w:anchor="_Toc223789540" w:history="1">
             <w:r>
               <w:rPr>
                 <w:rStyle w:val="Hyperlink"/>
@@ -3863,7 +4223,7 @@
                 <w:noProof/>
                 <w:webHidden/>
               </w:rPr>
-              <w:instrText xml:space="preserve"> PAGEREF _Toc223637926 \h </w:instrText>
+              <w:instrText xml:space="preserve"> PAGEREF _Toc223789540 \h </w:instrText>
             </w:r>
             <w:r>
               <w:rPr>
@@ -3883,7 +4243,7 @@
                 <w:noProof/>
                 <w:webHidden/>
               </w:rPr>
-              <w:t>29</w:t>
+              <w:t>31</w:t>
             </w:r>
             <w:r>
               <w:rPr>
@@ -3908,7 +4268,7 @@
               <w:lang w:eastAsia="en-GB"/>
             </w:rPr>
           </w:pPr>
-          <w:hyperlink w:anchor="_Toc223637927" w:history="1">
+          <w:hyperlink w:anchor="_Toc223789541" w:history="1">
             <w:r>
               <w:rPr>
                 <w:rStyle w:val="Hyperlink"/>
@@ -3935,7 +4295,7 @@
                 <w:noProof/>
                 <w:webHidden/>
               </w:rPr>
-              <w:instrText xml:space="preserve"> PAGEREF _Toc223637927 \h </w:instrText>
+              <w:instrText xml:space="preserve"> PAGEREF _Toc223789541 \h </w:instrText>
             </w:r>
             <w:r>
               <w:rPr>
@@ -3955,7 +4315,7 @@
                 <w:noProof/>
                 <w:webHidden/>
               </w:rPr>
-              <w:t>29</w:t>
+              <w:t>31</w:t>
             </w:r>
             <w:r>
               <w:rPr>
@@ -3996,7 +4356,7 @@
       <w:pPr>
         <w:pStyle w:val="Heading1"/>
       </w:pPr>
-      <w:bookmarkStart w:id="0" w:name="_Toc223637876"/>
+      <w:bookmarkStart w:id="0" w:name="_Toc223789485"/>
       <w:r>
         <w:lastRenderedPageBreak/>
         <w:t>List of Acro</w:t>
@@ -4251,7 +4611,7 @@
       <w:pPr>
         <w:pStyle w:val="Heading1"/>
       </w:pPr>
-      <w:bookmarkStart w:id="1" w:name="_Toc223637877"/>
+      <w:bookmarkStart w:id="1" w:name="_Toc223789486"/>
       <w:r>
         <w:lastRenderedPageBreak/>
         <w:t>Abstract</w:t>
@@ -4451,7 +4811,7 @@
       <w:pPr>
         <w:pStyle w:val="Heading1"/>
       </w:pPr>
-      <w:bookmarkStart w:id="2" w:name="_Toc223637878"/>
+      <w:bookmarkStart w:id="2" w:name="_Toc223789487"/>
       <w:r>
         <w:lastRenderedPageBreak/>
         <w:t>Introduction</w:t>
@@ -4498,8 +4858,13 @@
       <w:r>
         <w:t xml:space="preserve">. </w:t>
       </w:r>
-      <w:r>
-        <w:t xml:space="preserve">Porcar et al., </w:t>
+      <w:proofErr w:type="spellStart"/>
+      <w:r>
+        <w:t>Porcar</w:t>
+      </w:r>
+      <w:proofErr w:type="spellEnd"/>
+      <w:r>
+        <w:t xml:space="preserve"> et al., </w:t>
       </w:r>
       <w:r>
         <w:t>(</w:t>
@@ -4539,8 +4904,13 @@
       <w:r>
         <w:t xml:space="preserve">Research conducted by </w:t>
       </w:r>
-      <w:r>
-        <w:t xml:space="preserve">Cantó-Sancho et al., </w:t>
+      <w:proofErr w:type="spellStart"/>
+      <w:r>
+        <w:t>Cantó</w:t>
+      </w:r>
+      <w:proofErr w:type="spellEnd"/>
+      <w:r>
+        <w:t xml:space="preserve">-Sancho et al., </w:t>
       </w:r>
       <w:r>
         <w:t>(</w:t>
@@ -5024,7 +5394,7 @@
       <w:pPr>
         <w:pStyle w:val="Heading1"/>
       </w:pPr>
-      <w:bookmarkStart w:id="3" w:name="_Toc223637879"/>
+      <w:bookmarkStart w:id="3" w:name="_Toc223789488"/>
       <w:r>
         <w:lastRenderedPageBreak/>
         <w:t>Project Aim</w:t>
@@ -5074,7 +5444,7 @@
           <w:rFonts w:asciiTheme="minorHAnsi" w:hAnsiTheme="minorHAnsi"/>
         </w:rPr>
       </w:pPr>
-      <w:bookmarkStart w:id="4" w:name="_Toc223637880"/>
+      <w:bookmarkStart w:id="4" w:name="_Toc223789489"/>
       <w:r>
         <w:rPr>
           <w:rFonts w:asciiTheme="minorHAnsi" w:hAnsiTheme="minorHAnsi"/>
@@ -5361,7 +5731,7 @@
       <w:pPr>
         <w:pStyle w:val="Heading1"/>
       </w:pPr>
-      <w:bookmarkStart w:id="5" w:name="_Toc223637881"/>
+      <w:bookmarkStart w:id="5" w:name="_Toc223789490"/>
       <w:r>
         <w:lastRenderedPageBreak/>
         <w:t>Project Planning</w:t>
@@ -5742,7 +6112,7 @@
           <w:rFonts w:asciiTheme="minorHAnsi" w:hAnsiTheme="minorHAnsi"/>
         </w:rPr>
       </w:pPr>
-      <w:bookmarkStart w:id="6" w:name="_Toc223637882"/>
+      <w:bookmarkStart w:id="6" w:name="_Toc223789491"/>
       <w:r>
         <w:rPr>
           <w:rFonts w:asciiTheme="minorHAnsi" w:hAnsiTheme="minorHAnsi"/>
@@ -5944,7 +6314,7 @@
           <w:rFonts w:asciiTheme="minorHAnsi" w:hAnsiTheme="minorHAnsi"/>
         </w:rPr>
       </w:pPr>
-      <w:bookmarkStart w:id="7" w:name="_Toc223637883"/>
+      <w:bookmarkStart w:id="7" w:name="_Toc223789492"/>
       <w:r>
         <w:rPr>
           <w:rFonts w:asciiTheme="minorHAnsi" w:hAnsiTheme="minorHAnsi"/>
@@ -6183,7 +6553,21 @@
         <w:rPr>
           <w:rFonts w:cs="Arial"/>
         </w:rPr>
-        <w:t>Clear on screen prompts to guide and support users that aren’t familiar with VR equipment</w:t>
+        <w:t xml:space="preserve">Clear </w:t>
+      </w:r>
+      <w:proofErr w:type="gramStart"/>
+      <w:r>
+        <w:rPr>
+          <w:rFonts w:cs="Arial"/>
+        </w:rPr>
+        <w:t>on screen</w:t>
+      </w:r>
+      <w:proofErr w:type="gramEnd"/>
+      <w:r>
+        <w:rPr>
+          <w:rFonts w:cs="Arial"/>
+        </w:rPr>
+        <w:t xml:space="preserve"> prompts to guide and support users that aren’t familiar with VR equipment</w:t>
       </w:r>
     </w:p>
     <w:p>
@@ -6211,7 +6595,7 @@
           <w:rFonts w:asciiTheme="minorHAnsi" w:hAnsiTheme="minorHAnsi"/>
         </w:rPr>
       </w:pPr>
-      <w:bookmarkStart w:id="8" w:name="_Toc223637884"/>
+      <w:bookmarkStart w:id="8" w:name="_Toc223789493"/>
       <w:r>
         <w:rPr>
           <w:rFonts w:asciiTheme="minorHAnsi" w:hAnsiTheme="minorHAnsi"/>
@@ -6228,7 +6612,7 @@
           <w:rFonts w:asciiTheme="minorHAnsi" w:hAnsiTheme="minorHAnsi"/>
         </w:rPr>
       </w:pPr>
-      <w:bookmarkStart w:id="9" w:name="_Toc223637885"/>
+      <w:bookmarkStart w:id="9" w:name="_Toc223789494"/>
       <w:r>
         <w:rPr>
           <w:rFonts w:asciiTheme="minorHAnsi" w:hAnsiTheme="minorHAnsi"/>
@@ -6312,7 +6696,7 @@
           <w:rFonts w:asciiTheme="minorHAnsi" w:hAnsiTheme="minorHAnsi"/>
         </w:rPr>
       </w:pPr>
-      <w:bookmarkStart w:id="10" w:name="_Toc223637886"/>
+      <w:bookmarkStart w:id="10" w:name="_Toc223789495"/>
       <w:r>
         <w:rPr>
           <w:rFonts w:asciiTheme="minorHAnsi" w:hAnsiTheme="minorHAnsi"/>
@@ -6325,7 +6709,8 @@
       <w:pPr>
         <w:pStyle w:val="Heading3"/>
       </w:pPr>
-      <w:bookmarkStart w:id="11" w:name="_Toc223637887"/>
+      <w:bookmarkStart w:id="11" w:name="_Toc223789496"/>
+      <w:proofErr w:type="spellStart"/>
       <w:r>
         <w:t>Ey</w:t>
       </w:r>
@@ -6336,6 +6721,7 @@
         <w:t>si</w:t>
       </w:r>
       <w:bookmarkEnd w:id="11"/>
+      <w:proofErr w:type="spellEnd"/>
     </w:p>
     <w:p>
       <w:r>
@@ -6350,9 +6736,11 @@
       <w:r>
         <w:t xml:space="preserve"> discussed </w:t>
       </w:r>
+      <w:proofErr w:type="spellStart"/>
       <w:r>
         <w:t>Eyesi</w:t>
       </w:r>
+      <w:proofErr w:type="spellEnd"/>
       <w:r>
         <w:t>,</w:t>
       </w:r>
@@ -6465,7 +6853,15 @@
         <w:t xml:space="preserve">In addition to this, there is an </w:t>
       </w:r>
       <w:r>
-        <w:t xml:space="preserve">online training portal (vrmnet) </w:t>
+        <w:t>online training portal (</w:t>
+      </w:r>
+      <w:proofErr w:type="spellStart"/>
+      <w:r>
+        <w:t>vrmnet</w:t>
+      </w:r>
+      <w:proofErr w:type="spellEnd"/>
+      <w:r>
+        <w:t xml:space="preserve">) </w:t>
       </w:r>
       <w:r>
         <w:t>allowing comparison between trainees</w:t>
@@ -6600,7 +6996,15 @@
         <w:t xml:space="preserve"> </w:t>
       </w:r>
       <w:r>
-        <w:t xml:space="preserve">While Eyesi is effective for medical training for medical professionals, </w:t>
+        <w:t xml:space="preserve">While </w:t>
+      </w:r>
+      <w:proofErr w:type="spellStart"/>
+      <w:r>
+        <w:t>Eyesi</w:t>
+      </w:r>
+      <w:proofErr w:type="spellEnd"/>
+      <w:r>
+        <w:t xml:space="preserve"> is effective for medical training for medical professionals, </w:t>
       </w:r>
       <w:r>
         <w:t xml:space="preserve">similar </w:t>
@@ -6622,11 +7026,13 @@
       <w:pPr>
         <w:pStyle w:val="Heading3"/>
       </w:pPr>
-      <w:bookmarkStart w:id="12" w:name="_Toc223637888"/>
+      <w:bookmarkStart w:id="12" w:name="_Toc223789497"/>
+      <w:proofErr w:type="spellStart"/>
       <w:r>
         <w:t>OntoPhaco</w:t>
       </w:r>
       <w:bookmarkEnd w:id="12"/>
+      <w:proofErr w:type="spellEnd"/>
     </w:p>
     <w:p>
       <w:r>
@@ -6645,7 +7051,15 @@
         <w:t>d</w:t>
       </w:r>
       <w:r>
-        <w:t xml:space="preserve"> OntoPhaco, a</w:t>
+        <w:t xml:space="preserve"> </w:t>
+      </w:r>
+      <w:proofErr w:type="spellStart"/>
+      <w:r>
+        <w:t>OntoPhaco</w:t>
+      </w:r>
+      <w:proofErr w:type="spellEnd"/>
+      <w:r>
+        <w:t>, a</w:t>
       </w:r>
       <w:r>
         <w:t>n</w:t>
@@ -6778,173 +7192,191 @@
           <w:rFonts w:cs="TimesLTStd-Roman"/>
           <w:kern w:val="0"/>
         </w:rPr>
-        <w:t>Since OntoPhaco</w:t>
-      </w:r>
+        <w:t xml:space="preserve">Since </w:t>
+      </w:r>
+      <w:proofErr w:type="spellStart"/>
       <w:r>
         <w:rPr>
           <w:rFonts w:cs="TimesLTStd-Roman"/>
           <w:kern w:val="0"/>
         </w:rPr>
-        <w:t>’s</w:t>
+        <w:t>OntoPhaco</w:t>
       </w:r>
       <w:r>
         <w:rPr>
           <w:rFonts w:cs="TimesLTStd-Roman"/>
           <w:kern w:val="0"/>
         </w:rPr>
-        <w:t xml:space="preserve"> </w:t>
-      </w:r>
-      <w:r>
-        <w:t>s</w:t>
-      </w:r>
-      <w:r>
-        <w:t xml:space="preserve">ystematic verification and validation processes </w:t>
-      </w:r>
-      <w:r>
-        <w:t>include</w:t>
-      </w:r>
-      <w:r>
-        <w:t xml:space="preserve"> </w:t>
-      </w:r>
-      <w:r>
-        <w:t xml:space="preserve">theoretical </w:t>
-      </w:r>
-      <w:r>
-        <w:t>evaluat</w:t>
-      </w:r>
-      <w:r>
-        <w:t xml:space="preserve">ion </w:t>
-      </w:r>
-      <w:r>
-        <w:t>and expert feedback</w:t>
-      </w:r>
+        <w:t>’s</w:t>
+      </w:r>
+      <w:proofErr w:type="spellEnd"/>
       <w:r>
         <w:rPr>
           <w:rFonts w:cs="TimesLTStd-Roman"/>
           <w:kern w:val="0"/>
         </w:rPr>
-        <w:t xml:space="preserve">, each change, minor or major </w:t>
+        <w:t xml:space="preserve"> </w:t>
+      </w:r>
+      <w:r>
+        <w:t>s</w:t>
+      </w:r>
+      <w:r>
+        <w:t xml:space="preserve">ystematic verification and validation processes </w:t>
+      </w:r>
+      <w:r>
+        <w:t>include</w:t>
+      </w:r>
+      <w:r>
+        <w:t xml:space="preserve"> </w:t>
+      </w:r>
+      <w:r>
+        <w:t xml:space="preserve">theoretical </w:t>
+      </w:r>
+      <w:r>
+        <w:t>evaluat</w:t>
+      </w:r>
+      <w:r>
+        <w:t xml:space="preserve">ion </w:t>
+      </w:r>
+      <w:r>
+        <w:t>and expert feedback</w:t>
       </w:r>
       <w:r>
         <w:rPr>
           <w:rFonts w:cs="TimesLTStd-Roman"/>
           <w:kern w:val="0"/>
         </w:rPr>
-        <w:t>is</w:t>
+        <w:t xml:space="preserve">, each change, minor or major </w:t>
       </w:r>
       <w:r>
         <w:rPr>
           <w:rFonts w:cs="TimesLTStd-Roman"/>
           <w:kern w:val="0"/>
         </w:rPr>
-        <w:t xml:space="preserve"> verified and validate</w:t>
+        <w:t>is</w:t>
       </w:r>
       <w:r>
         <w:rPr>
           <w:rFonts w:cs="TimesLTStd-Roman"/>
           <w:kern w:val="0"/>
         </w:rPr>
-        <w:t>d</w:t>
-      </w:r>
-      <w:r>
-        <w:t>.</w:t>
+        <w:t xml:space="preserve"> verified and validate</w:t>
       </w:r>
       <w:r>
         <w:rPr>
           <w:rFonts w:cs="TimesLTStd-Roman"/>
           <w:kern w:val="0"/>
         </w:rPr>
-        <w:t xml:space="preserve"> </w:t>
+        <w:t>d</w:t>
+      </w:r>
+      <w:r>
+        <w:t>.</w:t>
       </w:r>
       <w:r>
         <w:rPr>
           <w:rFonts w:cs="TimesLTStd-Roman"/>
           <w:kern w:val="0"/>
         </w:rPr>
-        <w:t>OntoPhaco demonstrates VR</w:t>
-      </w:r>
+        <w:t xml:space="preserve"> </w:t>
+      </w:r>
+      <w:proofErr w:type="spellStart"/>
       <w:r>
         <w:rPr>
           <w:rFonts w:cs="TimesLTStd-Roman"/>
           <w:kern w:val="0"/>
         </w:rPr>
-        <w:t>’</w:t>
-      </w:r>
+        <w:t>OntoPhaco</w:t>
+      </w:r>
+      <w:proofErr w:type="spellEnd"/>
       <w:r>
         <w:rPr>
           <w:rFonts w:cs="TimesLTStd-Roman"/>
           <w:kern w:val="0"/>
         </w:rPr>
-        <w:t xml:space="preserve">s effectiveness </w:t>
+        <w:t xml:space="preserve"> demonstrates VR</w:t>
       </w:r>
       <w:r>
         <w:rPr>
           <w:rFonts w:cs="TimesLTStd-Roman"/>
           <w:kern w:val="0"/>
         </w:rPr>
-        <w:t xml:space="preserve">paired </w:t>
+        <w:t>’</w:t>
       </w:r>
       <w:r>
         <w:rPr>
           <w:rFonts w:cs="TimesLTStd-Roman"/>
           <w:kern w:val="0"/>
         </w:rPr>
-        <w:t>with ontology for medical training</w:t>
+        <w:t xml:space="preserve">s effectiveness </w:t>
       </w:r>
       <w:r>
         <w:rPr>
           <w:rFonts w:cs="TimesLTStd-Roman"/>
           <w:kern w:val="0"/>
         </w:rPr>
-        <w:t>. T</w:t>
+        <w:t xml:space="preserve">paired </w:t>
       </w:r>
       <w:r>
         <w:rPr>
           <w:rFonts w:cs="TimesLTStd-Roman"/>
           <w:kern w:val="0"/>
         </w:rPr>
-        <w:t>his project</w:t>
+        <w:t>with ontology for medical training</w:t>
       </w:r>
       <w:r>
         <w:rPr>
           <w:rFonts w:cs="TimesLTStd-Roman"/>
           <w:kern w:val="0"/>
         </w:rPr>
-        <w:t xml:space="preserve"> applies similar immersi</w:t>
+        <w:t>. T</w:t>
       </w:r>
       <w:r>
         <w:rPr>
           <w:rFonts w:cs="TimesLTStd-Roman"/>
           <w:kern w:val="0"/>
         </w:rPr>
-        <w:t>ve</w:t>
+        <w:t>his project</w:t>
       </w:r>
       <w:r>
         <w:rPr>
           <w:rFonts w:cs="TimesLTStd-Roman"/>
           <w:kern w:val="0"/>
         </w:rPr>
-        <w:t xml:space="preserve"> and educational knowledge </w:t>
+        <w:t xml:space="preserve"> applies similar immersi</w:t>
       </w:r>
       <w:r>
         <w:rPr>
           <w:rFonts w:cs="TimesLTStd-Roman"/>
           <w:kern w:val="0"/>
         </w:rPr>
-        <w:t xml:space="preserve">for DES to raise awareness, </w:t>
+        <w:t>ve</w:t>
       </w:r>
       <w:r>
         <w:rPr>
           <w:rFonts w:cs="TimesLTStd-Roman"/>
           <w:kern w:val="0"/>
         </w:rPr>
-        <w:t xml:space="preserve">spreading the </w:t>
+        <w:t xml:space="preserve"> and educational knowledge </w:t>
       </w:r>
       <w:r>
         <w:rPr>
           <w:rFonts w:cs="TimesLTStd-Roman"/>
           <w:kern w:val="0"/>
         </w:rPr>
+        <w:t xml:space="preserve">for DES to raise awareness, </w:t>
+      </w:r>
+      <w:r>
+        <w:rPr>
+          <w:rFonts w:cs="TimesLTStd-Roman"/>
+          <w:kern w:val="0"/>
+        </w:rPr>
+        <w:t xml:space="preserve">spreading the </w:t>
+      </w:r>
+      <w:r>
+        <w:rPr>
+          <w:rFonts w:cs="TimesLTStd-Roman"/>
+          <w:kern w:val="0"/>
+        </w:rPr>
         <w:t>benefits of VR use in education beyond professional training.</w:t>
       </w:r>
     </w:p>
@@ -6952,7 +7384,7 @@
       <w:pPr>
         <w:pStyle w:val="Heading3"/>
       </w:pPr>
-      <w:bookmarkStart w:id="13" w:name="_Toc223637889"/>
+      <w:bookmarkStart w:id="13" w:name="_Toc223789498"/>
       <w:r>
         <w:lastRenderedPageBreak/>
         <w:t>I</w:t>
@@ -7148,7 +7580,7 @@
       <w:pPr>
         <w:pStyle w:val="Heading3"/>
       </w:pPr>
-      <w:bookmarkStart w:id="14" w:name="_Toc223637890"/>
+      <w:bookmarkStart w:id="14" w:name="_Toc223789499"/>
       <w:r>
         <w:t>Opportunities for innovation</w:t>
       </w:r>
@@ -7158,17 +7590,27 @@
       <w:r>
         <w:t xml:space="preserve">While </w:t>
       </w:r>
-      <w:r>
-        <w:t>Eyesi focuses on hands on surgical practices</w:t>
+      <w:proofErr w:type="spellStart"/>
+      <w:r>
+        <w:t>Eyesi</w:t>
+      </w:r>
+      <w:proofErr w:type="spellEnd"/>
+      <w:r>
+        <w:t xml:space="preserve"> focuses on hands on surgical practices</w:t>
       </w:r>
       <w:r>
         <w:t xml:space="preserve">, </w:t>
       </w:r>
+      <w:proofErr w:type="spellStart"/>
       <w:r>
         <w:t>O</w:t>
       </w:r>
       <w:r>
-        <w:t>ntoPhaco focuses on the way knowledge is represented and conceptual understanding</w:t>
+        <w:t>ntoPhaco</w:t>
+      </w:r>
+      <w:proofErr w:type="spellEnd"/>
+      <w:r>
+        <w:t xml:space="preserve"> focuses on the way knowledge is represented and conceptual understanding</w:t>
       </w:r>
       <w:r>
         <w:t xml:space="preserve">. </w:t>
@@ -7266,7 +7708,7 @@
           <w:rFonts w:asciiTheme="minorHAnsi" w:hAnsiTheme="minorHAnsi"/>
         </w:rPr>
       </w:pPr>
-      <w:bookmarkStart w:id="15" w:name="_Toc223637891"/>
+      <w:bookmarkStart w:id="15" w:name="_Toc223789500"/>
       <w:r>
         <w:rPr>
           <w:rFonts w:asciiTheme="minorHAnsi" w:hAnsiTheme="minorHAnsi"/>
@@ -7279,7 +7721,7 @@
       <w:pPr>
         <w:pStyle w:val="Heading3"/>
       </w:pPr>
-      <w:bookmarkStart w:id="16" w:name="_Toc223637892"/>
+      <w:bookmarkStart w:id="16" w:name="_Toc223789501"/>
       <w:r>
         <w:t>VR in medical education</w:t>
       </w:r>
@@ -7426,9 +7868,19 @@
       <w:r>
         <w:t xml:space="preserve">Examples such as </w:t>
       </w:r>
-      <w:r>
-        <w:t>Mediverse by Goggleminds</w:t>
-      </w:r>
+      <w:proofErr w:type="spellStart"/>
+      <w:r>
+        <w:t>Mediverse</w:t>
+      </w:r>
+      <w:proofErr w:type="spellEnd"/>
+      <w:r>
+        <w:t xml:space="preserve"> by </w:t>
+      </w:r>
+      <w:proofErr w:type="spellStart"/>
+      <w:r>
+        <w:t>Goggleminds</w:t>
+      </w:r>
+      <w:proofErr w:type="spellEnd"/>
       <w:r>
         <w:t xml:space="preserve"> </w:t>
       </w:r>
@@ -7442,7 +7894,15 @@
         <w:t xml:space="preserve"> to healthcare providers and medical schools</w:t>
       </w:r>
       <w:r>
-        <w:t>. ClassVR by Systems improve</w:t>
+        <w:t xml:space="preserve">. </w:t>
+      </w:r>
+      <w:proofErr w:type="spellStart"/>
+      <w:r>
+        <w:t>ClassVR</w:t>
+      </w:r>
+      <w:proofErr w:type="spellEnd"/>
+      <w:r>
+        <w:t xml:space="preserve"> by Systems improve</w:t>
       </w:r>
       <w:r>
         <w:t>s</w:t>
@@ -7459,8 +7919,13 @@
       <w:r>
         <w:t xml:space="preserve"> </w:t>
       </w:r>
-      <w:r>
-        <w:t xml:space="preserve">PrismsVR </w:t>
+      <w:proofErr w:type="spellStart"/>
+      <w:r>
+        <w:t>PrismsVR</w:t>
+      </w:r>
+      <w:proofErr w:type="spellEnd"/>
+      <w:r>
+        <w:t xml:space="preserve"> </w:t>
       </w:r>
       <w:r>
         <w:t xml:space="preserve">helps students grasp core concepts in algebra and geometry, by </w:t>
@@ -7546,7 +8011,7 @@
       <w:pPr>
         <w:pStyle w:val="Heading3"/>
       </w:pPr>
-      <w:bookmarkStart w:id="17" w:name="_Toc223637893"/>
+      <w:bookmarkStart w:id="17" w:name="_Toc223789502"/>
       <w:r>
         <w:lastRenderedPageBreak/>
         <w:t>VR in Health Awareness</w:t>
@@ -7739,7 +8204,7 @@
           <w:rFonts w:asciiTheme="minorHAnsi" w:hAnsiTheme="minorHAnsi"/>
         </w:rPr>
       </w:pPr>
-      <w:bookmarkStart w:id="18" w:name="_Toc223637894"/>
+      <w:bookmarkStart w:id="18" w:name="_Toc223789503"/>
       <w:r>
         <w:rPr>
           <w:rFonts w:asciiTheme="minorHAnsi" w:hAnsiTheme="minorHAnsi"/>
@@ -7959,7 +8424,7 @@
       <w:pPr>
         <w:pStyle w:val="Heading1"/>
       </w:pPr>
-      <w:bookmarkStart w:id="19" w:name="_Toc223637895"/>
+      <w:bookmarkStart w:id="19" w:name="_Toc223789504"/>
       <w:r>
         <w:lastRenderedPageBreak/>
         <w:t>Appendices</w:t>
@@ -7970,7 +8435,7 @@
       <w:pPr>
         <w:pStyle w:val="Heading2"/>
       </w:pPr>
-      <w:bookmarkStart w:id="20" w:name="_Toc223637896"/>
+      <w:bookmarkStart w:id="20" w:name="_Toc223789505"/>
       <w:r>
         <w:t>Ethics Checklist</w:t>
       </w:r>
@@ -8112,7 +8577,7 @@
       <w:pPr>
         <w:pStyle w:val="Heading2"/>
       </w:pPr>
-      <w:bookmarkStart w:id="21" w:name="_Toc223637897"/>
+      <w:bookmarkStart w:id="21" w:name="_Toc223789506"/>
       <w:r>
         <w:lastRenderedPageBreak/>
         <w:t>Project Timeline Gant</w:t>
@@ -8308,7 +8773,7 @@
       <w:pPr>
         <w:pStyle w:val="Heading1"/>
       </w:pPr>
-      <w:bookmarkStart w:id="22" w:name="_Toc223637898"/>
+      <w:bookmarkStart w:id="22" w:name="_Toc223789507"/>
       <w:r>
         <w:lastRenderedPageBreak/>
         <w:t>Methodology</w:t>
@@ -8319,7 +8784,7 @@
       <w:pPr>
         <w:pStyle w:val="Heading2"/>
       </w:pPr>
-      <w:bookmarkStart w:id="23" w:name="_Toc223637899"/>
+      <w:bookmarkStart w:id="23" w:name="_Toc223789508"/>
       <w:r>
         <w:t>Prototype Implementation</w:t>
       </w:r>
@@ -8329,7 +8794,7 @@
       <w:pPr>
         <w:pStyle w:val="Heading3"/>
       </w:pPr>
-      <w:bookmarkStart w:id="24" w:name="_Toc223637900"/>
+      <w:bookmarkStart w:id="24" w:name="_Toc223789509"/>
       <w:r>
         <w:t>Usability and Flow</w:t>
       </w:r>
@@ -8412,7 +8877,7 @@
       <w:pPr>
         <w:pStyle w:val="Heading3"/>
       </w:pPr>
-      <w:bookmarkStart w:id="25" w:name="_Toc223637901"/>
+      <w:bookmarkStart w:id="25" w:name="_Toc223789510"/>
       <w:r>
         <w:t xml:space="preserve">Environment Design and </w:t>
       </w:r>
@@ -8541,7 +9006,7 @@
       <w:pPr>
         <w:pStyle w:val="Heading3"/>
       </w:pPr>
-      <w:bookmarkStart w:id="26" w:name="_Toc223637902"/>
+      <w:bookmarkStart w:id="26" w:name="_Toc223789511"/>
       <w:r>
         <w:t>Objective System Implementation</w:t>
       </w:r>
@@ -8582,7 +9047,15 @@
         <w:t>ere</w:t>
       </w:r>
       <w:r>
-        <w:t xml:space="preserve"> stored within the VRGameMode blueprint, with objectives being updated during runtime as conditions were satisfied </w:t>
+        <w:t xml:space="preserve"> stored within the </w:t>
+      </w:r>
+      <w:proofErr w:type="spellStart"/>
+      <w:r>
+        <w:t>VRGameMode</w:t>
+      </w:r>
+      <w:proofErr w:type="spellEnd"/>
+      <w:r>
+        <w:t xml:space="preserve"> blueprint, with objectives being updated during runtime as conditions were satisfied </w:t>
       </w:r>
       <w:r>
         <w:t>during</w:t>
@@ -8646,7 +9119,7 @@
       <w:pPr>
         <w:pStyle w:val="Heading3"/>
       </w:pPr>
-      <w:bookmarkStart w:id="27" w:name="_Toc223637903"/>
+      <w:bookmarkStart w:id="27" w:name="_Toc223789512"/>
       <w:r>
         <w:t>User</w:t>
       </w:r>
@@ -8743,7 +9216,7 @@
       <w:pPr>
         <w:pStyle w:val="Heading3"/>
       </w:pPr>
-      <w:bookmarkStart w:id="28" w:name="_Toc223637904"/>
+      <w:bookmarkStart w:id="28" w:name="_Toc223789513"/>
       <w:r>
         <w:t>Objective Based Interact</w:t>
       </w:r>
@@ -8811,7 +9284,7 @@
       <w:pPr>
         <w:pStyle w:val="Heading3"/>
       </w:pPr>
-      <w:bookmarkStart w:id="29" w:name="_Toc223637905"/>
+      <w:bookmarkStart w:id="29" w:name="_Toc223789514"/>
       <w:r>
         <w:t>Post Processing Effects</w:t>
       </w:r>
@@ -8828,7 +9301,15 @@
         <w:t>’s post processing component</w:t>
       </w:r>
       <w:r>
-        <w:t>. These effects were vignette to simulate eye fatigue, bloom for light sensitivity and blur for focus strain. Vignette and bloom post processing effects were triggered through adjusting their post processing variables within the camera post processing component. However, for blur a post processing material was required to create the radial blur. When objectives progressed triggering the simulation of symptoms, a timeline was used to progressively increase the value of an effect gradually over a duration. This decision was made to accommodate eyes adjusting to the changes of the camera as these effects were being triggered.</w:t>
+        <w:t xml:space="preserve">. These effects were </w:t>
+      </w:r>
+      <w:proofErr w:type="gramStart"/>
+      <w:r>
+        <w:t>vignette</w:t>
+      </w:r>
+      <w:proofErr w:type="gramEnd"/>
+      <w:r>
+        <w:t xml:space="preserve"> to simulate eye fatigue, bloom for light sensitivity and blur for focus strain. Vignette and bloom post processing effects were triggered through adjusting their post processing variables within the camera post processing component. However, for blur a post processing material was required to create the radial blur. When objectives progressed triggering the simulation of symptoms, a timeline was used to progressively increase the value of an effect gradually over a duration. This decision was made to accommodate eyes adjusting to the changes of the camera as these effects were being triggered.</w:t>
       </w:r>
       <w:r>
         <w:t xml:space="preserve"> The timeline was then used in reverse to revert the symptoms returning the camera view back to the original state it was in.</w:t>
@@ -8838,7 +9319,7 @@
       <w:pPr>
         <w:pStyle w:val="Heading3"/>
       </w:pPr>
-      <w:bookmarkStart w:id="30" w:name="_Toc223637906"/>
+      <w:bookmarkStart w:id="30" w:name="_Toc223789515"/>
       <w:r>
         <w:t>User</w:t>
       </w:r>
@@ -8861,16 +9342,15 @@
           <w:szCs w:val="32"/>
         </w:rPr>
       </w:pPr>
-      <w:bookmarkStart w:id="31" w:name="_Toc223637907"/>
       <w:r>
         <w:br w:type="page"/>
       </w:r>
     </w:p>
-    <w:bookmarkEnd w:id="31"/>
     <w:p>
       <w:pPr>
         <w:pStyle w:val="Heading2"/>
       </w:pPr>
+      <w:bookmarkStart w:id="31" w:name="_Toc223789516"/>
       <w:r>
         <w:lastRenderedPageBreak/>
         <w:t>Final Version</w:t>
@@ -8878,6 +9358,7 @@
       <w:r>
         <w:t xml:space="preserve"> Implementation</w:t>
       </w:r>
+      <w:bookmarkEnd w:id="31"/>
     </w:p>
     <w:p/>
     <w:p>
@@ -8889,7 +9370,6 @@
           <w:szCs w:val="40"/>
         </w:rPr>
       </w:pPr>
-      <w:bookmarkStart w:id="32" w:name="_Toc223637908"/>
       <w:r>
         <w:br w:type="page"/>
       </w:r>
@@ -8898,6 +9378,7 @@
       <w:pPr>
         <w:pStyle w:val="Heading1"/>
       </w:pPr>
+      <w:bookmarkStart w:id="32" w:name="_Toc223789517"/>
       <w:r>
         <w:lastRenderedPageBreak/>
         <w:t>Results</w:t>
@@ -8908,53 +9389,165 @@
       <w:pPr>
         <w:pStyle w:val="Heading2"/>
       </w:pPr>
-      <w:bookmarkStart w:id="33" w:name="_Toc223637909"/>
-      <w:r>
-        <w:t>First Result Set</w:t>
+      <w:bookmarkStart w:id="33" w:name="_Toc223789518"/>
+      <w:r>
+        <w:t>Prototype Tests</w:t>
       </w:r>
       <w:bookmarkEnd w:id="33"/>
     </w:p>
     <w:p>
       <w:pPr>
-        <w:rPr>
-          <w:rFonts w:asciiTheme="majorHAnsi" w:eastAsiaTheme="majorEastAsia" w:hAnsiTheme="majorHAnsi" w:cstheme="majorBidi"/>
-          <w:color w:val="0F4761" w:themeColor="accent1" w:themeShade="BF"/>
-          <w:sz w:val="32"/>
-          <w:szCs w:val="32"/>
-        </w:rPr>
-      </w:pPr>
-      <w:bookmarkStart w:id="34" w:name="_Toc223637910"/>
+        <w:pStyle w:val="Heading3"/>
+      </w:pPr>
+      <w:bookmarkStart w:id="34" w:name="_Toc223789519"/>
+      <w:r>
+        <w:t>Interaction</w:t>
+      </w:r>
+      <w:r>
+        <w:t xml:space="preserve"> Objects</w:t>
+      </w:r>
+      <w:r>
+        <w:t xml:space="preserve"> and Objective Understanding</w:t>
+      </w:r>
+      <w:bookmarkEnd w:id="34"/>
+    </w:p>
+    <w:p>
+      <w:pPr>
+        <w:pStyle w:val="ListParagraph"/>
+        <w:numPr>
+          <w:ilvl w:val="0"/>
+          <w:numId w:val="11"/>
+        </w:numPr>
+      </w:pPr>
+      <w:r>
+        <w:t>Switch between objectives 4 to 5 is quick so timeline does not have as much time to play and show the player the reversing of the symptom</w:t>
+      </w:r>
+    </w:p>
+    <w:p>
+      <w:pPr>
+        <w:pStyle w:val="ListParagraph"/>
+        <w:numPr>
+          <w:ilvl w:val="0"/>
+          <w:numId w:val="11"/>
+        </w:numPr>
+      </w:pPr>
+      <w:r>
+        <w:t>Hand collisions impairing experience than benefitting it</w:t>
+      </w:r>
+    </w:p>
+    <w:p>
+      <w:pPr>
+        <w:pStyle w:val="Heading3"/>
+      </w:pPr>
+      <w:bookmarkStart w:id="35" w:name="_Toc223789520"/>
+      <w:r>
+        <w:t>User Attention Detection</w:t>
+      </w:r>
+      <w:bookmarkEnd w:id="35"/>
+    </w:p>
+    <w:p>
+      <w:pPr>
+        <w:pStyle w:val="ListParagraph"/>
+        <w:numPr>
+          <w:ilvl w:val="0"/>
+          <w:numId w:val="11"/>
+        </w:numPr>
+      </w:pPr>
+      <w:r>
+        <w:t>Can be unforgiving as it</w:t>
+      </w:r>
+      <w:r>
+        <w:t xml:space="preserve"> uses</w:t>
+      </w:r>
+      <w:r>
+        <w:t xml:space="preserve"> a singular li</w:t>
+      </w:r>
+      <w:r>
+        <w:t>n</w:t>
+      </w:r>
+      <w:r>
+        <w:t>e and not a channel</w:t>
+      </w:r>
+    </w:p>
+    <w:p>
+      <w:pPr>
+        <w:pStyle w:val="Heading3"/>
+      </w:pPr>
+      <w:bookmarkStart w:id="36" w:name="_Toc223789521"/>
+      <w:r>
+        <w:t>Symptom Simulations</w:t>
+      </w:r>
+      <w:bookmarkEnd w:id="36"/>
+    </w:p>
+    <w:p>
+      <w:pPr>
+        <w:pStyle w:val="ListParagraph"/>
+        <w:numPr>
+          <w:ilvl w:val="0"/>
+          <w:numId w:val="11"/>
+        </w:numPr>
+      </w:pPr>
+      <w:r>
+        <w:t xml:space="preserve">Symptoms seem okay but are difficult to gauge with </w:t>
+      </w:r>
+      <w:r>
+        <w:t>most</w:t>
+      </w:r>
+      <w:r>
+        <w:t xml:space="preserve"> possible users as select few have tested the experience</w:t>
+      </w:r>
+    </w:p>
+    <w:p>
+      <w:pPr>
+        <w:pStyle w:val="Heading3"/>
+      </w:pPr>
+      <w:bookmarkStart w:id="37" w:name="_Toc223789522"/>
+      <w:r>
+        <w:t>Strengths and Weaknesses</w:t>
+      </w:r>
+      <w:bookmarkEnd w:id="37"/>
+    </w:p>
+    <w:p>
+      <w:pPr>
+        <w:pStyle w:val="Heading3"/>
+      </w:pPr>
+      <w:bookmarkStart w:id="38" w:name="_Toc223789523"/>
+      <w:r>
+        <w:t xml:space="preserve">Improvements to be </w:t>
+      </w:r>
+      <w:r>
+        <w:t>M</w:t>
+      </w:r>
+      <w:r>
+        <w:t>ade</w:t>
+      </w:r>
+      <w:bookmarkEnd w:id="38"/>
+    </w:p>
+    <w:p/>
+    <w:p>
+      <w:pPr>
+        <w:pStyle w:val="Heading2"/>
+      </w:pPr>
+      <w:bookmarkStart w:id="39" w:name="_Toc223789524"/>
+      <w:r>
+        <w:lastRenderedPageBreak/>
+        <w:t>Final Version Tests</w:t>
+      </w:r>
+      <w:bookmarkEnd w:id="39"/>
       <w:r>
         <w:br w:type="page"/>
       </w:r>
     </w:p>
     <w:p>
       <w:pPr>
-        <w:pStyle w:val="Heading2"/>
-        <w:rPr>
-          <w:sz w:val="40"/>
-          <w:szCs w:val="40"/>
-        </w:rPr>
-      </w:pPr>
-      <w:r>
-        <w:lastRenderedPageBreak/>
-        <w:t>Second Result Set</w:t>
-      </w:r>
-      <w:bookmarkEnd w:id="34"/>
-      <w:r>
-        <w:br w:type="page"/>
-      </w:r>
-    </w:p>
-    <w:p>
-      <w:pPr>
         <w:pStyle w:val="Heading1"/>
       </w:pPr>
-      <w:bookmarkStart w:id="35" w:name="_Toc223637911"/>
+      <w:bookmarkStart w:id="40" w:name="_Toc223789525"/>
       <w:r>
         <w:lastRenderedPageBreak/>
         <w:t>Critical Evaluation</w:t>
       </w:r>
-      <w:bookmarkEnd w:id="35"/>
+      <w:bookmarkEnd w:id="40"/>
     </w:p>
     <w:p>
       <w:pPr>
@@ -8976,12 +9569,48 @@
       <w:pPr>
         <w:pStyle w:val="Heading1"/>
       </w:pPr>
-      <w:bookmarkStart w:id="36" w:name="_Toc223637912"/>
+      <w:bookmarkStart w:id="41" w:name="_Toc223789526"/>
       <w:r>
         <w:lastRenderedPageBreak/>
         <w:t>Conclusions and Future Work</w:t>
       </w:r>
-      <w:bookmarkEnd w:id="36"/>
+      <w:bookmarkEnd w:id="41"/>
+    </w:p>
+    <w:p>
+      <w:pPr>
+        <w:pStyle w:val="ListParagraph"/>
+        <w:numPr>
+          <w:ilvl w:val="0"/>
+          <w:numId w:val="11"/>
+        </w:numPr>
+      </w:pPr>
+      <w:r>
+        <w:t>Adding a narrator into the background to guide users through the experience</w:t>
+      </w:r>
+    </w:p>
+    <w:p>
+      <w:pPr>
+        <w:pStyle w:val="ListParagraph"/>
+        <w:numPr>
+          <w:ilvl w:val="0"/>
+          <w:numId w:val="11"/>
+        </w:numPr>
+      </w:pPr>
+      <w:r>
+        <w:t>Introductory tutorial of one to two minutes to help non-technical users with understanding the controls</w:t>
+      </w:r>
+    </w:p>
+    <w:p>
+      <w:pPr>
+        <w:pStyle w:val="ListParagraph"/>
+        <w:numPr>
+          <w:ilvl w:val="0"/>
+          <w:numId w:val="11"/>
+        </w:numPr>
+      </w:pPr>
+      <w:r>
+        <w:t xml:space="preserve">Exploring accessibility settings for those with visual impairments or eye diseases that are still able to use the experience so that some of the symptoms displayed are not as harsh to them </w:t>
+      </w:r>
       <w:r>
         <w:br w:type="page"/>
       </w:r>
@@ -8990,17 +9619,31 @@
       <w:pPr>
         <w:pStyle w:val="Heading1"/>
       </w:pPr>
-      <w:bookmarkStart w:id="37" w:name="_Toc223637913"/>
+      <w:bookmarkStart w:id="42" w:name="_Toc223789527"/>
       <w:r>
         <w:lastRenderedPageBreak/>
         <w:t>References</w:t>
       </w:r>
-      <w:bookmarkEnd w:id="37"/>
-    </w:p>
-    <w:p>
-      <w:r>
-        <w:t xml:space="preserve">Cantó-Sancho, N., Porru, S., Casati, S., Ronda, E., Seguí-Crespo, M. and Carta, A. (2023) ‘Prevalence and risk factors of computer vision syndrome—assessed in office workers by a validated questionnaire’. </w:t>
-      </w:r>
+      <w:bookmarkEnd w:id="42"/>
+    </w:p>
+    <w:p>
+      <w:proofErr w:type="spellStart"/>
+      <w:r>
+        <w:t>Cantó</w:t>
+      </w:r>
+      <w:proofErr w:type="spellEnd"/>
+      <w:r>
+        <w:t xml:space="preserve">-Sancho, N., </w:t>
+      </w:r>
+      <w:proofErr w:type="spellStart"/>
+      <w:r>
+        <w:t>Porru</w:t>
+      </w:r>
+      <w:proofErr w:type="spellEnd"/>
+      <w:r>
+        <w:t xml:space="preserve">, S., Casati, S., Ronda, E., Seguí-Crespo, M. and Carta, A. (2023) ‘Prevalence and risk factors of computer vision syndrome—assessed in office workers by a validated questionnaire’. </w:t>
+      </w:r>
+      <w:proofErr w:type="spellStart"/>
       <w:r>
         <w:rPr>
           <w:i/>
@@ -9008,13 +9651,30 @@
         </w:rPr>
         <w:t>PeerJ</w:t>
       </w:r>
+      <w:proofErr w:type="spellEnd"/>
       <w:r>
         <w:t xml:space="preserve"> 11, p. e14937. Available at: https://www.researchgate.net/publication/369002899_Prevalence_and_risk_factors_of_computer_vision_syndrome-assessed_in_office_workers_by_a_validated_questionnaire (Accessed: 20 October 2025).</w:t>
       </w:r>
     </w:p>
     <w:p>
       <w:r>
-        <w:t xml:space="preserve">Chandrasekhara, R.S., Low, C., Lim, Y., Low, L., Mardina, F. and Nursaleha, M. (2013) ‘Computer vision syndrome: a study of knowledge and practices in university students’. </w:t>
+        <w:t xml:space="preserve">Chandrasekhara, R.S., Low, C., Lim, Y., Low, L., Mardina, F. and </w:t>
+      </w:r>
+      <w:proofErr w:type="spellStart"/>
+      <w:r>
+        <w:t>Nursaleha</w:t>
+      </w:r>
+      <w:proofErr w:type="spellEnd"/>
+      <w:r>
+        <w:t xml:space="preserve">, M. (2013) ‘Computer vision syndrome: a study of knowledge and practices in university </w:t>
+      </w:r>
+      <w:proofErr w:type="gramStart"/>
+      <w:r>
+        <w:t>students’</w:t>
+      </w:r>
+      <w:proofErr w:type="gramEnd"/>
+      <w:r>
+        <w:t xml:space="preserve">. </w:t>
       </w:r>
       <w:r>
         <w:rPr>
@@ -9040,7 +9700,15 @@
     </w:p>
     <w:p>
       <w:r>
-        <w:t xml:space="preserve">Muñoz, E.G., Fabregat, R., Bacca-Acosta, J., Duque-Méndez, N. and Avila-Garzon, C. (2022) ‘Augmented Reality, Virtual Reality, and Game Technologies in Ophthalmology Training’. </w:t>
+        <w:t xml:space="preserve">Muñoz, E.G., </w:t>
+      </w:r>
+      <w:proofErr w:type="spellStart"/>
+      <w:r>
+        <w:t>Fabregat</w:t>
+      </w:r>
+      <w:proofErr w:type="spellEnd"/>
+      <w:r>
+        <w:t xml:space="preserve">, R., Bacca-Acosta, J., Duque-Méndez, N. and Avila-Garzon, C. (2022) ‘Augmented Reality, Virtual Reality, and Game Technologies in Ophthalmology Training’. </w:t>
       </w:r>
       <w:r>
         <w:rPr>
@@ -9050,7 +9718,15 @@
         <w:t>Information</w:t>
       </w:r>
       <w:r>
-        <w:t xml:space="preserve"> 13(5), p. 222. doi: </w:t>
+        <w:t xml:space="preserve"> 13(5), p. 222. </w:t>
+      </w:r>
+      <w:proofErr w:type="spellStart"/>
+      <w:r>
+        <w:t>doi</w:t>
+      </w:r>
+      <w:proofErr w:type="spellEnd"/>
+      <w:r>
+        <w:t xml:space="preserve">: </w:t>
       </w:r>
       <w:hyperlink r:id="rId16" w:history="1">
         <w:r>
@@ -9066,12 +9742,33 @@
     </w:p>
     <w:p>
       <w:r>
-        <w:t>Orji, J., Hernandez, A., Selema, B. and Orji, R. (2022) ‘Virtual and augmented reality applications for promoting safety and security: A systematic review’., pp. 1–7. doi: https://doi.org/10.1109/SEGAH54908.2022.9978597.</w:t>
-      </w:r>
-    </w:p>
-    <w:p>
-      <w:r>
-        <w:t xml:space="preserve">Porcar, E., Pons, A. and Lorente, A. (2016) ‘Visual and ocular effects from the use of flat-panel displays’. </w:t>
+        <w:t xml:space="preserve">Orji, J., Hernandez, A., Selema, B. and Orji, R. (2022) ‘Virtual and augmented reality applications for promoting safety and security: A systematic review’., pp. 1–7. </w:t>
+      </w:r>
+      <w:proofErr w:type="spellStart"/>
+      <w:r>
+        <w:t>doi</w:t>
+      </w:r>
+      <w:proofErr w:type="spellEnd"/>
+      <w:r>
+        <w:t>: https://doi.org/10.1109/SEGAH54908.2022.9978597.</w:t>
+      </w:r>
+    </w:p>
+    <w:p>
+      <w:proofErr w:type="spellStart"/>
+      <w:r>
+        <w:t>Porcar</w:t>
+      </w:r>
+      <w:proofErr w:type="spellEnd"/>
+      <w:r>
+        <w:t xml:space="preserve">, E., Pons, A. and Lorente, A. (2016) ‘Visual and ocular effects from the use of flat-panel </w:t>
+      </w:r>
+      <w:proofErr w:type="gramStart"/>
+      <w:r>
+        <w:t>displays’</w:t>
+      </w:r>
+      <w:proofErr w:type="gramEnd"/>
+      <w:r>
+        <w:t xml:space="preserve">. </w:t>
       </w:r>
       <w:r>
         <w:rPr>
@@ -9086,7 +9783,23 @@
     </w:p>
     <w:p>
       <w:r>
-        <w:t xml:space="preserve">Santilli, T., Ceccacci, S., Mengoni, M. and Catia Giaconi (2025) ‘Virtual vs. traditional learning in higher education: A systematic review of comparative studies’. </w:t>
+        <w:t xml:space="preserve">Santilli, T., Ceccacci, S., Mengoni, M. and Catia </w:t>
+      </w:r>
+      <w:proofErr w:type="spellStart"/>
+      <w:r>
+        <w:t>Giaconi</w:t>
+      </w:r>
+      <w:proofErr w:type="spellEnd"/>
+      <w:r>
+        <w:t xml:space="preserve"> (2025) ‘Virtual vs. traditional learning in higher education: A systematic review of comparative </w:t>
+      </w:r>
+      <w:proofErr w:type="gramStart"/>
+      <w:r>
+        <w:t>studies’</w:t>
+      </w:r>
+      <w:proofErr w:type="gramEnd"/>
+      <w:r>
+        <w:t xml:space="preserve">. </w:t>
       </w:r>
       <w:r>
         <w:rPr>
@@ -9121,7 +9834,23 @@
     </w:p>
     <w:p>
       <w:r>
-        <w:t>Vieira, F., Oliveira, E. and Rodrigues, N. (2019) ‘iSVC – digital platform for detection and prevention of computer vision syndrome’., pp. 1–7. doi: https://doi.org/10.1109/SeGAH.2019.8882438.</w:t>
+        <w:t>Vieira, F., Oliveira, E. and Rodrigues, N. (2019) ‘</w:t>
+      </w:r>
+      <w:proofErr w:type="spellStart"/>
+      <w:r>
+        <w:t>iSVC</w:t>
+      </w:r>
+      <w:proofErr w:type="spellEnd"/>
+      <w:r>
+        <w:t xml:space="preserve"> – digital platform for detection and prevention of computer vision syndrome’., pp. 1–7. </w:t>
+      </w:r>
+      <w:proofErr w:type="spellStart"/>
+      <w:r>
+        <w:t>doi</w:t>
+      </w:r>
+      <w:proofErr w:type="spellEnd"/>
+      <w:r>
+        <w:t>: https://doi.org/10.1109/SeGAH.2019.8882438.</w:t>
       </w:r>
     </w:p>
     <w:p>
@@ -9136,12 +9865,28 @@
         <w:t>Annals of Emerging Technologies in Computing</w:t>
       </w:r>
       <w:r>
-        <w:t xml:space="preserve"> 9(3), pp. 50–68. doi: https://doi.org/10.33166/aetic.2025.03.004.</w:t>
-      </w:r>
-    </w:p>
-    <w:p>
-      <w:r>
-        <w:t xml:space="preserve">Youcef, B., Ahmad, M.N. and Mustapha, M. (2021) ‘OntoPhaco: An ontology for virtual reality training in ophthalmology Domain—A case study of cataract surgery’. </w:t>
+        <w:t xml:space="preserve"> 9(3), pp. 50–68. </w:t>
+      </w:r>
+      <w:proofErr w:type="spellStart"/>
+      <w:r>
+        <w:t>doi</w:t>
+      </w:r>
+      <w:proofErr w:type="spellEnd"/>
+      <w:r>
+        <w:t>: https://doi.org/10.33166/aetic.2025.03.004.</w:t>
+      </w:r>
+    </w:p>
+    <w:p>
+      <w:r>
+        <w:t>Youcef, B., Ahmad, M.N. and Mustapha, M. (2021) ‘</w:t>
+      </w:r>
+      <w:proofErr w:type="spellStart"/>
+      <w:r>
+        <w:t>OntoPhaco</w:t>
+      </w:r>
+      <w:proofErr w:type="spellEnd"/>
+      <w:r>
+        <w:t xml:space="preserve">: An ontology for virtual reality training in ophthalmology Domain—A case study of cataract surgery’. </w:t>
       </w:r>
       <w:r>
         <w:rPr>
@@ -9151,7 +9896,15 @@
         <w:t>IEEE Access</w:t>
       </w:r>
       <w:r>
-        <w:t xml:space="preserve"> 9, pp. 152347–152378. doi: https://doi.org/10.1109/ACCESS.2021.3126697.</w:t>
+        <w:t xml:space="preserve"> 9, pp. 152347–152378. </w:t>
+      </w:r>
+      <w:proofErr w:type="spellStart"/>
+      <w:r>
+        <w:t>doi</w:t>
+      </w:r>
+      <w:proofErr w:type="spellEnd"/>
+      <w:r>
+        <w:t>: https://doi.org/10.1109/ACCESS.2021.3126697.</w:t>
       </w:r>
     </w:p>
     <w:p/>
@@ -9159,32 +9912,32 @@
       <w:pPr>
         <w:pStyle w:val="Heading1"/>
       </w:pPr>
-      <w:bookmarkStart w:id="38" w:name="_Toc223637914"/>
+      <w:bookmarkStart w:id="43" w:name="_Toc223789528"/>
       <w:r>
         <w:lastRenderedPageBreak/>
         <w:t>Appendix</w:t>
       </w:r>
-      <w:bookmarkEnd w:id="38"/>
+      <w:bookmarkEnd w:id="43"/>
     </w:p>
     <w:p>
       <w:pPr>
         <w:pStyle w:val="Heading2"/>
       </w:pPr>
-      <w:bookmarkStart w:id="39" w:name="_Toc223637915"/>
+      <w:bookmarkStart w:id="44" w:name="_Toc223789529"/>
       <w:r>
         <w:t>Asset Licenses and Sources</w:t>
       </w:r>
-      <w:bookmarkEnd w:id="39"/>
+      <w:bookmarkEnd w:id="44"/>
     </w:p>
     <w:p>
       <w:pPr>
         <w:pStyle w:val="Heading3"/>
       </w:pPr>
-      <w:bookmarkStart w:id="40" w:name="_Toc223637916"/>
+      <w:bookmarkStart w:id="45" w:name="_Toc223789530"/>
       <w:r>
         <w:t>Modern Office Table</w:t>
       </w:r>
-      <w:bookmarkEnd w:id="40"/>
+      <w:bookmarkEnd w:id="45"/>
     </w:p>
     <w:p>
       <w:r>
@@ -9264,11 +10017,11 @@
       <w:pPr>
         <w:pStyle w:val="Heading3"/>
       </w:pPr>
-      <w:bookmarkStart w:id="41" w:name="_Toc223637917"/>
+      <w:bookmarkStart w:id="46" w:name="_Toc223789531"/>
       <w:r>
         <w:t>Free Studio Starter Pack</w:t>
       </w:r>
-      <w:bookmarkEnd w:id="41"/>
+      <w:bookmarkEnd w:id="46"/>
     </w:p>
     <w:p>
       <w:r>
@@ -9348,11 +10101,11 @@
       <w:pPr>
         <w:pStyle w:val="Heading3"/>
       </w:pPr>
-      <w:bookmarkStart w:id="42" w:name="_Toc223637918"/>
+      <w:bookmarkStart w:id="47" w:name="_Toc223789532"/>
       <w:r>
         <w:t>General Desktop Bundle</w:t>
       </w:r>
-      <w:bookmarkEnd w:id="42"/>
+      <w:bookmarkEnd w:id="47"/>
     </w:p>
     <w:p>
       <w:r>
@@ -9432,12 +10185,12 @@
       <w:pPr>
         <w:pStyle w:val="Heading3"/>
       </w:pPr>
-      <w:bookmarkStart w:id="43" w:name="_Toc223637919"/>
+      <w:bookmarkStart w:id="48" w:name="_Toc223789533"/>
       <w:r>
         <w:lastRenderedPageBreak/>
         <w:t>General Gaming Headset</w:t>
       </w:r>
-      <w:bookmarkEnd w:id="43"/>
+      <w:bookmarkEnd w:id="48"/>
     </w:p>
     <w:p>
       <w:r>
@@ -9517,11 +10270,11 @@
       <w:pPr>
         <w:pStyle w:val="Heading3"/>
       </w:pPr>
-      <w:bookmarkStart w:id="44" w:name="_Toc223637920"/>
+      <w:bookmarkStart w:id="49" w:name="_Toc223789534"/>
       <w:r>
         <w:t>General Gaming Chair</w:t>
       </w:r>
-      <w:bookmarkEnd w:id="44"/>
+      <w:bookmarkEnd w:id="49"/>
     </w:p>
     <w:p>
       <w:r>
@@ -9601,11 +10354,11 @@
       <w:pPr>
         <w:pStyle w:val="Heading3"/>
       </w:pPr>
-      <w:bookmarkStart w:id="45" w:name="_Toc223637921"/>
+      <w:bookmarkStart w:id="50" w:name="_Toc223789535"/>
       <w:r>
         <w:t>Light Switch</w:t>
       </w:r>
-      <w:bookmarkEnd w:id="45"/>
+      <w:bookmarkEnd w:id="50"/>
     </w:p>
     <w:p>
       <w:r>
@@ -9699,12 +10452,12 @@
       <w:pPr>
         <w:pStyle w:val="Heading3"/>
       </w:pPr>
-      <w:bookmarkStart w:id="46" w:name="_Toc223637922"/>
+      <w:bookmarkStart w:id="51" w:name="_Toc223789536"/>
       <w:r>
         <w:lastRenderedPageBreak/>
         <w:t>Materials for General PC setup</w:t>
       </w:r>
-      <w:bookmarkEnd w:id="46"/>
+      <w:bookmarkEnd w:id="51"/>
     </w:p>
     <w:p>
       <w:r>
@@ -9826,12 +10579,12 @@
       <w:pPr>
         <w:pStyle w:val="Heading3"/>
       </w:pPr>
-      <w:bookmarkStart w:id="47" w:name="_Toc223637923"/>
+      <w:bookmarkStart w:id="52" w:name="_Toc223789537"/>
       <w:r>
         <w:lastRenderedPageBreak/>
         <w:t>Monitor background image</w:t>
       </w:r>
-      <w:bookmarkEnd w:id="47"/>
+      <w:bookmarkEnd w:id="52"/>
     </w:p>
     <w:p>
       <w:r>
@@ -9922,12 +10675,25 @@
       <w:pPr>
         <w:pStyle w:val="Heading3"/>
       </w:pPr>
-      <w:bookmarkStart w:id="48" w:name="_Toc223637924"/>
+      <w:bookmarkStart w:id="53" w:name="_Toc223789538"/>
       <w:r>
         <w:lastRenderedPageBreak/>
-        <w:t>Button Hover Sfx by Fachii</w:t>
-      </w:r>
-      <w:bookmarkEnd w:id="48"/>
+        <w:t xml:space="preserve">Button Hover </w:t>
+      </w:r>
+      <w:proofErr w:type="spellStart"/>
+      <w:r>
+        <w:t>Sfx</w:t>
+      </w:r>
+      <w:proofErr w:type="spellEnd"/>
+      <w:r>
+        <w:t xml:space="preserve"> by </w:t>
+      </w:r>
+      <w:proofErr w:type="spellStart"/>
+      <w:r>
+        <w:t>Fachii</w:t>
+      </w:r>
+      <w:bookmarkEnd w:id="53"/>
+      <w:proofErr w:type="spellEnd"/>
     </w:p>
     <w:p>
       <w:r>
@@ -10022,14 +10788,36 @@
     </w:p>
     <w:p/>
     <w:p>
-      <w:bookmarkStart w:id="49" w:name="_Toc223637925"/>
+      <w:bookmarkStart w:id="54" w:name="_Toc223789539"/>
       <w:r>
         <w:rPr>
           <w:rStyle w:val="Heading3Char"/>
         </w:rPr>
-        <w:t>Button click Sfx by AndrewEathan</w:t>
-      </w:r>
-      <w:bookmarkEnd w:id="49"/>
+        <w:t xml:space="preserve">Button click </w:t>
+      </w:r>
+      <w:proofErr w:type="spellStart"/>
+      <w:r>
+        <w:rPr>
+          <w:rStyle w:val="Heading3Char"/>
+        </w:rPr>
+        <w:t>Sfx</w:t>
+      </w:r>
+      <w:proofErr w:type="spellEnd"/>
+      <w:r>
+        <w:rPr>
+          <w:rStyle w:val="Heading3Char"/>
+        </w:rPr>
+        <w:t xml:space="preserve"> by </w:t>
+      </w:r>
+      <w:proofErr w:type="spellStart"/>
+      <w:r>
+        <w:rPr>
+          <w:rStyle w:val="Heading3Char"/>
+        </w:rPr>
+        <w:t>AndrewEathan</w:t>
+      </w:r>
+      <w:bookmarkEnd w:id="54"/>
+      <w:proofErr w:type="spellEnd"/>
       <w:r>
         <w:t xml:space="preserve"> </w:t>
       </w:r>
@@ -10135,12 +10923,25 @@
       <w:pPr>
         <w:pStyle w:val="Heading3"/>
       </w:pPr>
-      <w:bookmarkStart w:id="50" w:name="_Toc223637926"/>
+      <w:bookmarkStart w:id="55" w:name="_Toc223789540"/>
       <w:r>
         <w:lastRenderedPageBreak/>
-        <w:t>Light Switch On Sfx</w:t>
-      </w:r>
-      <w:bookmarkEnd w:id="50"/>
+        <w:t xml:space="preserve">Light Switch </w:t>
+      </w:r>
+      <w:proofErr w:type="gramStart"/>
+      <w:r>
+        <w:t>On</w:t>
+      </w:r>
+      <w:proofErr w:type="gramEnd"/>
+      <w:r>
+        <w:t xml:space="preserve"> </w:t>
+      </w:r>
+      <w:proofErr w:type="spellStart"/>
+      <w:r>
+        <w:t>Sfx</w:t>
+      </w:r>
+      <w:bookmarkEnd w:id="55"/>
+      <w:proofErr w:type="spellEnd"/>
     </w:p>
     <w:p>
       <w:r>
@@ -10230,11 +11031,16 @@
       <w:pPr>
         <w:pStyle w:val="Heading3"/>
       </w:pPr>
-      <w:bookmarkStart w:id="51" w:name="_Toc223637927"/>
-      <w:r>
-        <w:t>Light Switch Off Sfx</w:t>
-      </w:r>
-      <w:bookmarkEnd w:id="51"/>
+      <w:bookmarkStart w:id="56" w:name="_Toc223789541"/>
+      <w:r>
+        <w:t xml:space="preserve">Light Switch Off </w:t>
+      </w:r>
+      <w:proofErr w:type="spellStart"/>
+      <w:r>
+        <w:t>Sfx</w:t>
+      </w:r>
+      <w:bookmarkEnd w:id="56"/>
+      <w:proofErr w:type="spellEnd"/>
     </w:p>
     <w:p>
       <w:r>
@@ -10447,10 +11253,10 @@
     </w:lvl>
   </w:abstractNum>
   <w:abstractNum w:abstractNumId="1" w15:restartNumberingAfterBreak="0">
-    <w:nsid w:val="24953192"/>
+    <w:nsid w:val="1A00258F"/>
     <w:multiLevelType w:val="hybridMultilevel"/>
-    <w:tmpl w:val="9102630C"/>
-    <w:lvl w:ilvl="0" w:tplc="EF261838">
+    <w:tmpl w:val="EADC80D8"/>
+    <w:lvl w:ilvl="0" w:tplc="1E5868E8">
       <w:numFmt w:val="bullet"/>
       <w:lvlText w:val="-"/>
       <w:lvlJc w:val="left"/>
@@ -10559,6 +11365,118 @@
     </w:lvl>
   </w:abstractNum>
   <w:abstractNum w:abstractNumId="2" w15:restartNumberingAfterBreak="0">
+    <w:nsid w:val="24953192"/>
+    <w:multiLevelType w:val="hybridMultilevel"/>
+    <w:tmpl w:val="9102630C"/>
+    <w:lvl w:ilvl="0" w:tplc="EF261838">
+      <w:numFmt w:val="bullet"/>
+      <w:lvlText w:val="-"/>
+      <w:lvlJc w:val="left"/>
+      <w:pPr>
+        <w:ind w:left="720" w:hanging="360"/>
+      </w:pPr>
+      <w:rPr>
+        <w:rFonts w:ascii="Aptos" w:eastAsiaTheme="minorHAnsi" w:hAnsi="Aptos" w:cstheme="minorBidi" w:hint="default"/>
+      </w:rPr>
+    </w:lvl>
+    <w:lvl w:ilvl="1" w:tplc="08090003" w:tentative="1">
+      <w:start w:val="1"/>
+      <w:numFmt w:val="bullet"/>
+      <w:lvlText w:val="o"/>
+      <w:lvlJc w:val="left"/>
+      <w:pPr>
+        <w:ind w:left="1440" w:hanging="360"/>
+      </w:pPr>
+      <w:rPr>
+        <w:rFonts w:ascii="Courier New" w:hAnsi="Courier New" w:cs="Courier New" w:hint="default"/>
+      </w:rPr>
+    </w:lvl>
+    <w:lvl w:ilvl="2" w:tplc="08090005" w:tentative="1">
+      <w:start w:val="1"/>
+      <w:numFmt w:val="bullet"/>
+      <w:lvlText w:val=""/>
+      <w:lvlJc w:val="left"/>
+      <w:pPr>
+        <w:ind w:left="2160" w:hanging="360"/>
+      </w:pPr>
+      <w:rPr>
+        <w:rFonts w:ascii="Wingdings" w:hAnsi="Wingdings" w:hint="default"/>
+      </w:rPr>
+    </w:lvl>
+    <w:lvl w:ilvl="3" w:tplc="08090001" w:tentative="1">
+      <w:start w:val="1"/>
+      <w:numFmt w:val="bullet"/>
+      <w:lvlText w:val=""/>
+      <w:lvlJc w:val="left"/>
+      <w:pPr>
+        <w:ind w:left="2880" w:hanging="360"/>
+      </w:pPr>
+      <w:rPr>
+        <w:rFonts w:ascii="Symbol" w:hAnsi="Symbol" w:hint="default"/>
+      </w:rPr>
+    </w:lvl>
+    <w:lvl w:ilvl="4" w:tplc="08090003" w:tentative="1">
+      <w:start w:val="1"/>
+      <w:numFmt w:val="bullet"/>
+      <w:lvlText w:val="o"/>
+      <w:lvlJc w:val="left"/>
+      <w:pPr>
+        <w:ind w:left="3600" w:hanging="360"/>
+      </w:pPr>
+      <w:rPr>
+        <w:rFonts w:ascii="Courier New" w:hAnsi="Courier New" w:cs="Courier New" w:hint="default"/>
+      </w:rPr>
+    </w:lvl>
+    <w:lvl w:ilvl="5" w:tplc="08090005" w:tentative="1">
+      <w:start w:val="1"/>
+      <w:numFmt w:val="bullet"/>
+      <w:lvlText w:val=""/>
+      <w:lvlJc w:val="left"/>
+      <w:pPr>
+        <w:ind w:left="4320" w:hanging="360"/>
+      </w:pPr>
+      <w:rPr>
+        <w:rFonts w:ascii="Wingdings" w:hAnsi="Wingdings" w:hint="default"/>
+      </w:rPr>
+    </w:lvl>
+    <w:lvl w:ilvl="6" w:tplc="08090001" w:tentative="1">
+      <w:start w:val="1"/>
+      <w:numFmt w:val="bullet"/>
+      <w:lvlText w:val=""/>
+      <w:lvlJc w:val="left"/>
+      <w:pPr>
+        <w:ind w:left="5040" w:hanging="360"/>
+      </w:pPr>
+      <w:rPr>
+        <w:rFonts w:ascii="Symbol" w:hAnsi="Symbol" w:hint="default"/>
+      </w:rPr>
+    </w:lvl>
+    <w:lvl w:ilvl="7" w:tplc="08090003" w:tentative="1">
+      <w:start w:val="1"/>
+      <w:numFmt w:val="bullet"/>
+      <w:lvlText w:val="o"/>
+      <w:lvlJc w:val="left"/>
+      <w:pPr>
+        <w:ind w:left="5760" w:hanging="360"/>
+      </w:pPr>
+      <w:rPr>
+        <w:rFonts w:ascii="Courier New" w:hAnsi="Courier New" w:cs="Courier New" w:hint="default"/>
+      </w:rPr>
+    </w:lvl>
+    <w:lvl w:ilvl="8" w:tplc="08090005" w:tentative="1">
+      <w:start w:val="1"/>
+      <w:numFmt w:val="bullet"/>
+      <w:lvlText w:val=""/>
+      <w:lvlJc w:val="left"/>
+      <w:pPr>
+        <w:ind w:left="6480" w:hanging="360"/>
+      </w:pPr>
+      <w:rPr>
+        <w:rFonts w:ascii="Wingdings" w:hAnsi="Wingdings" w:hint="default"/>
+      </w:rPr>
+    </w:lvl>
+  </w:abstractNum>
+  <w:abstractNum w:abstractNumId="3" w15:restartNumberingAfterBreak="0">
     <w:nsid w:val="2A8605A5"/>
     <w:multiLevelType w:val="hybridMultilevel"/>
     <w:tmpl w:val="A62456B4"/>
@@ -10671,7 +11589,7 @@
       </w:rPr>
     </w:lvl>
   </w:abstractNum>
-  <w:abstractNum w:abstractNumId="3" w15:restartNumberingAfterBreak="0">
+  <w:abstractNum w:abstractNumId="4" w15:restartNumberingAfterBreak="0">
     <w:nsid w:val="2BE415C4"/>
     <w:multiLevelType w:val="hybridMultilevel"/>
     <w:tmpl w:val="FFF86940"/>
@@ -10783,7 +11701,7 @@
       </w:rPr>
     </w:lvl>
   </w:abstractNum>
-  <w:abstractNum w:abstractNumId="4" w15:restartNumberingAfterBreak="0">
+  <w:abstractNum w:abstractNumId="5" w15:restartNumberingAfterBreak="0">
     <w:nsid w:val="378815F8"/>
     <w:multiLevelType w:val="hybridMultilevel"/>
     <w:tmpl w:val="B640525A"/>
@@ -10896,12 +11814,11 @@
       </w:rPr>
     </w:lvl>
   </w:abstractNum>
-  <w:abstractNum w:abstractNumId="5" w15:restartNumberingAfterBreak="0">
-    <w:nsid w:val="5BDF51FB"/>
+  <w:abstractNum w:abstractNumId="6" w15:restartNumberingAfterBreak="0">
+    <w:nsid w:val="396C2EBE"/>
     <w:multiLevelType w:val="hybridMultilevel"/>
-    <w:tmpl w:val="7B48E138"/>
-    <w:lvl w:ilvl="0" w:tplc="B1686156">
-      <w:start w:val="4206"/>
+    <w:tmpl w:val="9996B432"/>
+    <w:lvl w:ilvl="0" w:tplc="05B08298">
       <w:numFmt w:val="bullet"/>
       <w:lvlText w:val="-"/>
       <w:lvlJc w:val="left"/>
@@ -11009,7 +11926,120 @@
       </w:rPr>
     </w:lvl>
   </w:abstractNum>
-  <w:abstractNum w:abstractNumId="6" w15:restartNumberingAfterBreak="0">
+  <w:abstractNum w:abstractNumId="7" w15:restartNumberingAfterBreak="0">
+    <w:nsid w:val="5BDF51FB"/>
+    <w:multiLevelType w:val="hybridMultilevel"/>
+    <w:tmpl w:val="7B48E138"/>
+    <w:lvl w:ilvl="0" w:tplc="B1686156">
+      <w:start w:val="4206"/>
+      <w:numFmt w:val="bullet"/>
+      <w:lvlText w:val="-"/>
+      <w:lvlJc w:val="left"/>
+      <w:pPr>
+        <w:ind w:left="720" w:hanging="360"/>
+      </w:pPr>
+      <w:rPr>
+        <w:rFonts w:ascii="Aptos" w:eastAsiaTheme="minorHAnsi" w:hAnsi="Aptos" w:cstheme="minorBidi" w:hint="default"/>
+      </w:rPr>
+    </w:lvl>
+    <w:lvl w:ilvl="1" w:tplc="08090003" w:tentative="1">
+      <w:start w:val="1"/>
+      <w:numFmt w:val="bullet"/>
+      <w:lvlText w:val="o"/>
+      <w:lvlJc w:val="left"/>
+      <w:pPr>
+        <w:ind w:left="1440" w:hanging="360"/>
+      </w:pPr>
+      <w:rPr>
+        <w:rFonts w:ascii="Courier New" w:hAnsi="Courier New" w:cs="Courier New" w:hint="default"/>
+      </w:rPr>
+    </w:lvl>
+    <w:lvl w:ilvl="2" w:tplc="08090005" w:tentative="1">
+      <w:start w:val="1"/>
+      <w:numFmt w:val="bullet"/>
+      <w:lvlText w:val=""/>
+      <w:lvlJc w:val="left"/>
+      <w:pPr>
+        <w:ind w:left="2160" w:hanging="360"/>
+      </w:pPr>
+      <w:rPr>
+        <w:rFonts w:ascii="Wingdings" w:hAnsi="Wingdings" w:hint="default"/>
+      </w:rPr>
+    </w:lvl>
+    <w:lvl w:ilvl="3" w:tplc="08090001" w:tentative="1">
+      <w:start w:val="1"/>
+      <w:numFmt w:val="bullet"/>
+      <w:lvlText w:val=""/>
+      <w:lvlJc w:val="left"/>
+      <w:pPr>
+        <w:ind w:left="2880" w:hanging="360"/>
+      </w:pPr>
+      <w:rPr>
+        <w:rFonts w:ascii="Symbol" w:hAnsi="Symbol" w:hint="default"/>
+      </w:rPr>
+    </w:lvl>
+    <w:lvl w:ilvl="4" w:tplc="08090003" w:tentative="1">
+      <w:start w:val="1"/>
+      <w:numFmt w:val="bullet"/>
+      <w:lvlText w:val="o"/>
+      <w:lvlJc w:val="left"/>
+      <w:pPr>
+        <w:ind w:left="3600" w:hanging="360"/>
+      </w:pPr>
+      <w:rPr>
+        <w:rFonts w:ascii="Courier New" w:hAnsi="Courier New" w:cs="Courier New" w:hint="default"/>
+      </w:rPr>
+    </w:lvl>
+    <w:lvl w:ilvl="5" w:tplc="08090005" w:tentative="1">
+      <w:start w:val="1"/>
+      <w:numFmt w:val="bullet"/>
+      <w:lvlText w:val=""/>
+      <w:lvlJc w:val="left"/>
+      <w:pPr>
+        <w:ind w:left="4320" w:hanging="360"/>
+      </w:pPr>
+      <w:rPr>
+        <w:rFonts w:ascii="Wingdings" w:hAnsi="Wingdings" w:hint="default"/>
+      </w:rPr>
+    </w:lvl>
+    <w:lvl w:ilvl="6" w:tplc="08090001" w:tentative="1">
+      <w:start w:val="1"/>
+      <w:numFmt w:val="bullet"/>
+      <w:lvlText w:val=""/>
+      <w:lvlJc w:val="left"/>
+      <w:pPr>
+        <w:ind w:left="5040" w:hanging="360"/>
+      </w:pPr>
+      <w:rPr>
+        <w:rFonts w:ascii="Symbol" w:hAnsi="Symbol" w:hint="default"/>
+      </w:rPr>
+    </w:lvl>
+    <w:lvl w:ilvl="7" w:tplc="08090003" w:tentative="1">
+      <w:start w:val="1"/>
+      <w:numFmt w:val="bullet"/>
+      <w:lvlText w:val="o"/>
+      <w:lvlJc w:val="left"/>
+      <w:pPr>
+        <w:ind w:left="5760" w:hanging="360"/>
+      </w:pPr>
+      <w:rPr>
+        <w:rFonts w:ascii="Courier New" w:hAnsi="Courier New" w:cs="Courier New" w:hint="default"/>
+      </w:rPr>
+    </w:lvl>
+    <w:lvl w:ilvl="8" w:tplc="08090005" w:tentative="1">
+      <w:start w:val="1"/>
+      <w:numFmt w:val="bullet"/>
+      <w:lvlText w:val=""/>
+      <w:lvlJc w:val="left"/>
+      <w:pPr>
+        <w:ind w:left="6480" w:hanging="360"/>
+      </w:pPr>
+      <w:rPr>
+        <w:rFonts w:ascii="Wingdings" w:hAnsi="Wingdings" w:hint="default"/>
+      </w:rPr>
+    </w:lvl>
+  </w:abstractNum>
+  <w:abstractNum w:abstractNumId="8" w15:restartNumberingAfterBreak="0">
     <w:nsid w:val="60695550"/>
     <w:multiLevelType w:val="hybridMultilevel"/>
     <w:tmpl w:val="3F0E459E"/>
@@ -11122,7 +12152,7 @@
       </w:rPr>
     </w:lvl>
   </w:abstractNum>
-  <w:abstractNum w:abstractNumId="7" w15:restartNumberingAfterBreak="0">
+  <w:abstractNum w:abstractNumId="9" w15:restartNumberingAfterBreak="0">
     <w:nsid w:val="623F4563"/>
     <w:multiLevelType w:val="hybridMultilevel"/>
     <w:tmpl w:val="57CEFC9E"/>
@@ -11234,7 +12264,7 @@
       </w:rPr>
     </w:lvl>
   </w:abstractNum>
-  <w:abstractNum w:abstractNumId="8" w15:restartNumberingAfterBreak="0">
+  <w:abstractNum w:abstractNumId="10" w15:restartNumberingAfterBreak="0">
     <w:nsid w:val="7EB9593C"/>
     <w:multiLevelType w:val="hybridMultilevel"/>
     <w:tmpl w:val="2AC89758"/>
@@ -11327,28 +12357,34 @@
     <w:abstractNumId w:val="0"/>
   </w:num>
   <w:num w:numId="2" w16cid:durableId="1684430893">
+    <w:abstractNumId w:val="7"/>
+  </w:num>
+  <w:num w:numId="3" w16cid:durableId="1581481780">
+    <w:abstractNumId w:val="4"/>
+  </w:num>
+  <w:num w:numId="4" w16cid:durableId="1660115902">
+    <w:abstractNumId w:val="9"/>
+  </w:num>
+  <w:num w:numId="5" w16cid:durableId="252710067">
     <w:abstractNumId w:val="5"/>
   </w:num>
-  <w:num w:numId="3" w16cid:durableId="1581481780">
+  <w:num w:numId="6" w16cid:durableId="447509088">
+    <w:abstractNumId w:val="8"/>
+  </w:num>
+  <w:num w:numId="7" w16cid:durableId="721564270">
     <w:abstractNumId w:val="3"/>
   </w:num>
-  <w:num w:numId="4" w16cid:durableId="1660115902">
-    <w:abstractNumId w:val="7"/>
+  <w:num w:numId="8" w16cid:durableId="421604762">
+    <w:abstractNumId w:val="10"/>
   </w:num>
-  <w:num w:numId="5" w16cid:durableId="252710067">
-    <w:abstractNumId w:val="4"/>
-  </w:num>
-  <w:num w:numId="6" w16cid:durableId="447509088">
-    <w:abstractNumId w:val="6"/>
-  </w:num>
-  <w:num w:numId="7" w16cid:durableId="721564270">
+  <w:num w:numId="9" w16cid:durableId="1404716916">
     <w:abstractNumId w:val="2"/>
   </w:num>
-  <w:num w:numId="8" w16cid:durableId="421604762">
-    <w:abstractNumId w:val="8"/>
+  <w:num w:numId="10" w16cid:durableId="352071079">
+    <w:abstractNumId w:val="1"/>
   </w:num>
-  <w:num w:numId="9" w16cid:durableId="1404716916">
-    <w:abstractNumId w:val="1"/>
+  <w:num w:numId="11" w16cid:durableId="425536714">
+    <w:abstractNumId w:val="6"/>
   </w:num>
 </w:numbering>
 </file>

</xml_diff>

<commit_message>
Completed first paragraph explaining the tests conducted
</commit_message>
<xml_diff>
--- a/30077548Thesis.docx
+++ b/30077548Thesis.docx
@@ -236,7 +236,7 @@
           <w:r>
             <w:fldChar w:fldCharType="separate"/>
           </w:r>
-          <w:hyperlink w:anchor="_Toc223789485" w:history="1">
+          <w:hyperlink w:anchor="_Toc223792448" w:history="1">
             <w:r>
               <w:rPr>
                 <w:rStyle w:val="Hyperlink"/>
@@ -263,7 +263,7 @@
                 <w:noProof/>
                 <w:webHidden/>
               </w:rPr>
-              <w:instrText xml:space="preserve"> PAGEREF _Toc223789485 \h </w:instrText>
+              <w:instrText xml:space="preserve"> PAGEREF _Toc223792448 \h </w:instrText>
             </w:r>
             <w:r>
               <w:rPr>
@@ -308,7 +308,7 @@
               <w:lang w:eastAsia="en-GB"/>
             </w:rPr>
           </w:pPr>
-          <w:hyperlink w:anchor="_Toc223789486" w:history="1">
+          <w:hyperlink w:anchor="_Toc223792449" w:history="1">
             <w:r>
               <w:rPr>
                 <w:rStyle w:val="Hyperlink"/>
@@ -335,7 +335,7 @@
                 <w:noProof/>
                 <w:webHidden/>
               </w:rPr>
-              <w:instrText xml:space="preserve"> PAGEREF _Toc223789486 \h </w:instrText>
+              <w:instrText xml:space="preserve"> PAGEREF _Toc223792449 \h </w:instrText>
             </w:r>
             <w:r>
               <w:rPr>
@@ -380,7 +380,7 @@
               <w:lang w:eastAsia="en-GB"/>
             </w:rPr>
           </w:pPr>
-          <w:hyperlink w:anchor="_Toc223789487" w:history="1">
+          <w:hyperlink w:anchor="_Toc223792450" w:history="1">
             <w:r>
               <w:rPr>
                 <w:rStyle w:val="Hyperlink"/>
@@ -407,7 +407,7 @@
                 <w:noProof/>
                 <w:webHidden/>
               </w:rPr>
-              <w:instrText xml:space="preserve"> PAGEREF _Toc223789487 \h </w:instrText>
+              <w:instrText xml:space="preserve"> PAGEREF _Toc223792450 \h </w:instrText>
             </w:r>
             <w:r>
               <w:rPr>
@@ -452,7 +452,7 @@
               <w:lang w:eastAsia="en-GB"/>
             </w:rPr>
           </w:pPr>
-          <w:hyperlink w:anchor="_Toc223789488" w:history="1">
+          <w:hyperlink w:anchor="_Toc223792451" w:history="1">
             <w:r>
               <w:rPr>
                 <w:rStyle w:val="Hyperlink"/>
@@ -479,7 +479,7 @@
                 <w:noProof/>
                 <w:webHidden/>
               </w:rPr>
-              <w:instrText xml:space="preserve"> PAGEREF _Toc223789488 \h </w:instrText>
+              <w:instrText xml:space="preserve"> PAGEREF _Toc223792451 \h </w:instrText>
             </w:r>
             <w:r>
               <w:rPr>
@@ -524,7 +524,7 @@
               <w:lang w:eastAsia="en-GB"/>
             </w:rPr>
           </w:pPr>
-          <w:hyperlink w:anchor="_Toc223789489" w:history="1">
+          <w:hyperlink w:anchor="_Toc223792452" w:history="1">
             <w:r>
               <w:rPr>
                 <w:rStyle w:val="Hyperlink"/>
@@ -551,7 +551,7 @@
                 <w:noProof/>
                 <w:webHidden/>
               </w:rPr>
-              <w:instrText xml:space="preserve"> PAGEREF _Toc223789489 \h </w:instrText>
+              <w:instrText xml:space="preserve"> PAGEREF _Toc223792452 \h </w:instrText>
             </w:r>
             <w:r>
               <w:rPr>
@@ -596,7 +596,7 @@
               <w:lang w:eastAsia="en-GB"/>
             </w:rPr>
           </w:pPr>
-          <w:hyperlink w:anchor="_Toc223789490" w:history="1">
+          <w:hyperlink w:anchor="_Toc223792453" w:history="1">
             <w:r>
               <w:rPr>
                 <w:rStyle w:val="Hyperlink"/>
@@ -623,7 +623,7 @@
                 <w:noProof/>
                 <w:webHidden/>
               </w:rPr>
-              <w:instrText xml:space="preserve"> PAGEREF _Toc223789490 \h </w:instrText>
+              <w:instrText xml:space="preserve"> PAGEREF _Toc223792453 \h </w:instrText>
             </w:r>
             <w:r>
               <w:rPr>
@@ -668,7 +668,7 @@
               <w:lang w:eastAsia="en-GB"/>
             </w:rPr>
           </w:pPr>
-          <w:hyperlink w:anchor="_Toc223789491" w:history="1">
+          <w:hyperlink w:anchor="_Toc223792454" w:history="1">
             <w:r>
               <w:rPr>
                 <w:rStyle w:val="Hyperlink"/>
@@ -695,7 +695,7 @@
                 <w:noProof/>
                 <w:webHidden/>
               </w:rPr>
-              <w:instrText xml:space="preserve"> PAGEREF _Toc223789491 \h </w:instrText>
+              <w:instrText xml:space="preserve"> PAGEREF _Toc223792454 \h </w:instrText>
             </w:r>
             <w:r>
               <w:rPr>
@@ -740,7 +740,7 @@
               <w:lang w:eastAsia="en-GB"/>
             </w:rPr>
           </w:pPr>
-          <w:hyperlink w:anchor="_Toc223789492" w:history="1">
+          <w:hyperlink w:anchor="_Toc223792455" w:history="1">
             <w:r>
               <w:rPr>
                 <w:rStyle w:val="Hyperlink"/>
@@ -767,7 +767,7 @@
                 <w:noProof/>
                 <w:webHidden/>
               </w:rPr>
-              <w:instrText xml:space="preserve"> PAGEREF _Toc223789492 \h </w:instrText>
+              <w:instrText xml:space="preserve"> PAGEREF _Toc223792455 \h </w:instrText>
             </w:r>
             <w:r>
               <w:rPr>
@@ -812,7 +812,7 @@
               <w:lang w:eastAsia="en-GB"/>
             </w:rPr>
           </w:pPr>
-          <w:hyperlink w:anchor="_Toc223789493" w:history="1">
+          <w:hyperlink w:anchor="_Toc223792456" w:history="1">
             <w:r>
               <w:rPr>
                 <w:rStyle w:val="Hyperlink"/>
@@ -839,7 +839,7 @@
                 <w:noProof/>
                 <w:webHidden/>
               </w:rPr>
-              <w:instrText xml:space="preserve"> PAGEREF _Toc223789493 \h </w:instrText>
+              <w:instrText xml:space="preserve"> PAGEREF _Toc223792456 \h </w:instrText>
             </w:r>
             <w:r>
               <w:rPr>
@@ -884,7 +884,7 @@
               <w:lang w:eastAsia="en-GB"/>
             </w:rPr>
           </w:pPr>
-          <w:hyperlink w:anchor="_Toc223789494" w:history="1">
+          <w:hyperlink w:anchor="_Toc223792457" w:history="1">
             <w:r>
               <w:rPr>
                 <w:rStyle w:val="Hyperlink"/>
@@ -911,7 +911,7 @@
                 <w:noProof/>
                 <w:webHidden/>
               </w:rPr>
-              <w:instrText xml:space="preserve"> PAGEREF _Toc223789494 \h </w:instrText>
+              <w:instrText xml:space="preserve"> PAGEREF _Toc223792457 \h </w:instrText>
             </w:r>
             <w:r>
               <w:rPr>
@@ -956,7 +956,7 @@
               <w:lang w:eastAsia="en-GB"/>
             </w:rPr>
           </w:pPr>
-          <w:hyperlink w:anchor="_Toc223789495" w:history="1">
+          <w:hyperlink w:anchor="_Toc223792458" w:history="1">
             <w:r>
               <w:rPr>
                 <w:rStyle w:val="Hyperlink"/>
@@ -983,7 +983,7 @@
                 <w:noProof/>
                 <w:webHidden/>
               </w:rPr>
-              <w:instrText xml:space="preserve"> PAGEREF _Toc223789495 \h </w:instrText>
+              <w:instrText xml:space="preserve"> PAGEREF _Toc223792458 \h </w:instrText>
             </w:r>
             <w:r>
               <w:rPr>
@@ -1028,7 +1028,7 @@
               <w:lang w:eastAsia="en-GB"/>
             </w:rPr>
           </w:pPr>
-          <w:hyperlink w:anchor="_Toc223789496" w:history="1">
+          <w:hyperlink w:anchor="_Toc223792459" w:history="1">
             <w:r>
               <w:rPr>
                 <w:rStyle w:val="Hyperlink"/>
@@ -1055,7 +1055,7 @@
                 <w:noProof/>
                 <w:webHidden/>
               </w:rPr>
-              <w:instrText xml:space="preserve"> PAGEREF _Toc223789496 \h </w:instrText>
+              <w:instrText xml:space="preserve"> PAGEREF _Toc223792459 \h </w:instrText>
             </w:r>
             <w:r>
               <w:rPr>
@@ -1100,7 +1100,7 @@
               <w:lang w:eastAsia="en-GB"/>
             </w:rPr>
           </w:pPr>
-          <w:hyperlink w:anchor="_Toc223789497" w:history="1">
+          <w:hyperlink w:anchor="_Toc223792460" w:history="1">
             <w:r>
               <w:rPr>
                 <w:rStyle w:val="Hyperlink"/>
@@ -1127,7 +1127,7 @@
                 <w:noProof/>
                 <w:webHidden/>
               </w:rPr>
-              <w:instrText xml:space="preserve"> PAGEREF _Toc223789497 \h </w:instrText>
+              <w:instrText xml:space="preserve"> PAGEREF _Toc223792460 \h </w:instrText>
             </w:r>
             <w:r>
               <w:rPr>
@@ -1172,7 +1172,7 @@
               <w:lang w:eastAsia="en-GB"/>
             </w:rPr>
           </w:pPr>
-          <w:hyperlink w:anchor="_Toc223789498" w:history="1">
+          <w:hyperlink w:anchor="_Toc223792461" w:history="1">
             <w:r>
               <w:rPr>
                 <w:rStyle w:val="Hyperlink"/>
@@ -1199,7 +1199,7 @@
                 <w:noProof/>
                 <w:webHidden/>
               </w:rPr>
-              <w:instrText xml:space="preserve"> PAGEREF _Toc223789498 \h </w:instrText>
+              <w:instrText xml:space="preserve"> PAGEREF _Toc223792461 \h </w:instrText>
             </w:r>
             <w:r>
               <w:rPr>
@@ -1244,7 +1244,7 @@
               <w:lang w:eastAsia="en-GB"/>
             </w:rPr>
           </w:pPr>
-          <w:hyperlink w:anchor="_Toc223789499" w:history="1">
+          <w:hyperlink w:anchor="_Toc223792462" w:history="1">
             <w:r>
               <w:rPr>
                 <w:rStyle w:val="Hyperlink"/>
@@ -1271,7 +1271,7 @@
                 <w:noProof/>
                 <w:webHidden/>
               </w:rPr>
-              <w:instrText xml:space="preserve"> PAGEREF _Toc223789499 \h </w:instrText>
+              <w:instrText xml:space="preserve"> PAGEREF _Toc223792462 \h </w:instrText>
             </w:r>
             <w:r>
               <w:rPr>
@@ -1316,7 +1316,7 @@
               <w:lang w:eastAsia="en-GB"/>
             </w:rPr>
           </w:pPr>
-          <w:hyperlink w:anchor="_Toc223789500" w:history="1">
+          <w:hyperlink w:anchor="_Toc223792463" w:history="1">
             <w:r>
               <w:rPr>
                 <w:rStyle w:val="Hyperlink"/>
@@ -1343,7 +1343,7 @@
                 <w:noProof/>
                 <w:webHidden/>
               </w:rPr>
-              <w:instrText xml:space="preserve"> PAGEREF _Toc223789500 \h </w:instrText>
+              <w:instrText xml:space="preserve"> PAGEREF _Toc223792463 \h </w:instrText>
             </w:r>
             <w:r>
               <w:rPr>
@@ -1388,7 +1388,7 @@
               <w:lang w:eastAsia="en-GB"/>
             </w:rPr>
           </w:pPr>
-          <w:hyperlink w:anchor="_Toc223789501" w:history="1">
+          <w:hyperlink w:anchor="_Toc223792464" w:history="1">
             <w:r>
               <w:rPr>
                 <w:rStyle w:val="Hyperlink"/>
@@ -1415,7 +1415,7 @@
                 <w:noProof/>
                 <w:webHidden/>
               </w:rPr>
-              <w:instrText xml:space="preserve"> PAGEREF _Toc223789501 \h </w:instrText>
+              <w:instrText xml:space="preserve"> PAGEREF _Toc223792464 \h </w:instrText>
             </w:r>
             <w:r>
               <w:rPr>
@@ -1460,7 +1460,7 @@
               <w:lang w:eastAsia="en-GB"/>
             </w:rPr>
           </w:pPr>
-          <w:hyperlink w:anchor="_Toc223789502" w:history="1">
+          <w:hyperlink w:anchor="_Toc223792465" w:history="1">
             <w:r>
               <w:rPr>
                 <w:rStyle w:val="Hyperlink"/>
@@ -1487,7 +1487,7 @@
                 <w:noProof/>
                 <w:webHidden/>
               </w:rPr>
-              <w:instrText xml:space="preserve"> PAGEREF _Toc223789502 \h </w:instrText>
+              <w:instrText xml:space="preserve"> PAGEREF _Toc223792465 \h </w:instrText>
             </w:r>
             <w:r>
               <w:rPr>
@@ -1532,7 +1532,7 @@
               <w:lang w:eastAsia="en-GB"/>
             </w:rPr>
           </w:pPr>
-          <w:hyperlink w:anchor="_Toc223789503" w:history="1">
+          <w:hyperlink w:anchor="_Toc223792466" w:history="1">
             <w:r>
               <w:rPr>
                 <w:rStyle w:val="Hyperlink"/>
@@ -1559,7 +1559,7 @@
                 <w:noProof/>
                 <w:webHidden/>
               </w:rPr>
-              <w:instrText xml:space="preserve"> PAGEREF _Toc223789503 \h </w:instrText>
+              <w:instrText xml:space="preserve"> PAGEREF _Toc223792466 \h </w:instrText>
             </w:r>
             <w:r>
               <w:rPr>
@@ -1604,7 +1604,7 @@
               <w:lang w:eastAsia="en-GB"/>
             </w:rPr>
           </w:pPr>
-          <w:hyperlink w:anchor="_Toc223789504" w:history="1">
+          <w:hyperlink w:anchor="_Toc223792467" w:history="1">
             <w:r>
               <w:rPr>
                 <w:rStyle w:val="Hyperlink"/>
@@ -1631,7 +1631,7 @@
                 <w:noProof/>
                 <w:webHidden/>
               </w:rPr>
-              <w:instrText xml:space="preserve"> PAGEREF _Toc223789504 \h </w:instrText>
+              <w:instrText xml:space="preserve"> PAGEREF _Toc223792467 \h </w:instrText>
             </w:r>
             <w:r>
               <w:rPr>
@@ -1676,7 +1676,7 @@
               <w:lang w:eastAsia="en-GB"/>
             </w:rPr>
           </w:pPr>
-          <w:hyperlink w:anchor="_Toc223789505" w:history="1">
+          <w:hyperlink w:anchor="_Toc223792468" w:history="1">
             <w:r>
               <w:rPr>
                 <w:rStyle w:val="Hyperlink"/>
@@ -1703,7 +1703,7 @@
                 <w:noProof/>
                 <w:webHidden/>
               </w:rPr>
-              <w:instrText xml:space="preserve"> PAGEREF _Toc223789505 \h </w:instrText>
+              <w:instrText xml:space="preserve"> PAGEREF _Toc223792468 \h </w:instrText>
             </w:r>
             <w:r>
               <w:rPr>
@@ -1748,7 +1748,7 @@
               <w:lang w:eastAsia="en-GB"/>
             </w:rPr>
           </w:pPr>
-          <w:hyperlink w:anchor="_Toc223789506" w:history="1">
+          <w:hyperlink w:anchor="_Toc223792469" w:history="1">
             <w:r>
               <w:rPr>
                 <w:rStyle w:val="Hyperlink"/>
@@ -1775,7 +1775,7 @@
                 <w:noProof/>
                 <w:webHidden/>
               </w:rPr>
-              <w:instrText xml:space="preserve"> PAGEREF _Toc223789506 \h </w:instrText>
+              <w:instrText xml:space="preserve"> PAGEREF _Toc223792469 \h </w:instrText>
             </w:r>
             <w:r>
               <w:rPr>
@@ -1820,7 +1820,7 @@
               <w:lang w:eastAsia="en-GB"/>
             </w:rPr>
           </w:pPr>
-          <w:hyperlink w:anchor="_Toc223789507" w:history="1">
+          <w:hyperlink w:anchor="_Toc223792470" w:history="1">
             <w:r>
               <w:rPr>
                 <w:rStyle w:val="Hyperlink"/>
@@ -1847,7 +1847,7 @@
                 <w:noProof/>
                 <w:webHidden/>
               </w:rPr>
-              <w:instrText xml:space="preserve"> PAGEREF _Toc223789507 \h </w:instrText>
+              <w:instrText xml:space="preserve"> PAGEREF _Toc223792470 \h </w:instrText>
             </w:r>
             <w:r>
               <w:rPr>
@@ -1892,7 +1892,7 @@
               <w:lang w:eastAsia="en-GB"/>
             </w:rPr>
           </w:pPr>
-          <w:hyperlink w:anchor="_Toc223789508" w:history="1">
+          <w:hyperlink w:anchor="_Toc223792471" w:history="1">
             <w:r>
               <w:rPr>
                 <w:rStyle w:val="Hyperlink"/>
@@ -1919,7 +1919,7 @@
                 <w:noProof/>
                 <w:webHidden/>
               </w:rPr>
-              <w:instrText xml:space="preserve"> PAGEREF _Toc223789508 \h </w:instrText>
+              <w:instrText xml:space="preserve"> PAGEREF _Toc223792471 \h </w:instrText>
             </w:r>
             <w:r>
               <w:rPr>
@@ -1964,7 +1964,7 @@
               <w:lang w:eastAsia="en-GB"/>
             </w:rPr>
           </w:pPr>
-          <w:hyperlink w:anchor="_Toc223789509" w:history="1">
+          <w:hyperlink w:anchor="_Toc223792472" w:history="1">
             <w:r>
               <w:rPr>
                 <w:rStyle w:val="Hyperlink"/>
@@ -1991,7 +1991,7 @@
                 <w:noProof/>
                 <w:webHidden/>
               </w:rPr>
-              <w:instrText xml:space="preserve"> PAGEREF _Toc223789509 \h </w:instrText>
+              <w:instrText xml:space="preserve"> PAGEREF _Toc223792472 \h </w:instrText>
             </w:r>
             <w:r>
               <w:rPr>
@@ -2036,7 +2036,7 @@
               <w:lang w:eastAsia="en-GB"/>
             </w:rPr>
           </w:pPr>
-          <w:hyperlink w:anchor="_Toc223789510" w:history="1">
+          <w:hyperlink w:anchor="_Toc223792473" w:history="1">
             <w:r>
               <w:rPr>
                 <w:rStyle w:val="Hyperlink"/>
@@ -2063,7 +2063,7 @@
                 <w:noProof/>
                 <w:webHidden/>
               </w:rPr>
-              <w:instrText xml:space="preserve"> PAGEREF _Toc223789510 \h </w:instrText>
+              <w:instrText xml:space="preserve"> PAGEREF _Toc223792473 \h </w:instrText>
             </w:r>
             <w:r>
               <w:rPr>
@@ -2108,7 +2108,7 @@
               <w:lang w:eastAsia="en-GB"/>
             </w:rPr>
           </w:pPr>
-          <w:hyperlink w:anchor="_Toc223789511" w:history="1">
+          <w:hyperlink w:anchor="_Toc223792474" w:history="1">
             <w:r>
               <w:rPr>
                 <w:rStyle w:val="Hyperlink"/>
@@ -2135,7 +2135,7 @@
                 <w:noProof/>
                 <w:webHidden/>
               </w:rPr>
-              <w:instrText xml:space="preserve"> PAGEREF _Toc223789511 \h </w:instrText>
+              <w:instrText xml:space="preserve"> PAGEREF _Toc223792474 \h </w:instrText>
             </w:r>
             <w:r>
               <w:rPr>
@@ -2180,7 +2180,7 @@
               <w:lang w:eastAsia="en-GB"/>
             </w:rPr>
           </w:pPr>
-          <w:hyperlink w:anchor="_Toc223789512" w:history="1">
+          <w:hyperlink w:anchor="_Toc223792475" w:history="1">
             <w:r>
               <w:rPr>
                 <w:rStyle w:val="Hyperlink"/>
@@ -2207,7 +2207,7 @@
                 <w:noProof/>
                 <w:webHidden/>
               </w:rPr>
-              <w:instrText xml:space="preserve"> PAGEREF _Toc223789512 \h </w:instrText>
+              <w:instrText xml:space="preserve"> PAGEREF _Toc223792475 \h </w:instrText>
             </w:r>
             <w:r>
               <w:rPr>
@@ -2252,7 +2252,7 @@
               <w:lang w:eastAsia="en-GB"/>
             </w:rPr>
           </w:pPr>
-          <w:hyperlink w:anchor="_Toc223789513" w:history="1">
+          <w:hyperlink w:anchor="_Toc223792476" w:history="1">
             <w:r>
               <w:rPr>
                 <w:rStyle w:val="Hyperlink"/>
@@ -2279,7 +2279,7 @@
                 <w:noProof/>
                 <w:webHidden/>
               </w:rPr>
-              <w:instrText xml:space="preserve"> PAGEREF _Toc223789513 \h </w:instrText>
+              <w:instrText xml:space="preserve"> PAGEREF _Toc223792476 \h </w:instrText>
             </w:r>
             <w:r>
               <w:rPr>
@@ -2324,7 +2324,7 @@
               <w:lang w:eastAsia="en-GB"/>
             </w:rPr>
           </w:pPr>
-          <w:hyperlink w:anchor="_Toc223789514" w:history="1">
+          <w:hyperlink w:anchor="_Toc223792477" w:history="1">
             <w:r>
               <w:rPr>
                 <w:rStyle w:val="Hyperlink"/>
@@ -2351,7 +2351,7 @@
                 <w:noProof/>
                 <w:webHidden/>
               </w:rPr>
-              <w:instrText xml:space="preserve"> PAGEREF _Toc223789514 \h </w:instrText>
+              <w:instrText xml:space="preserve"> PAGEREF _Toc223792477 \h </w:instrText>
             </w:r>
             <w:r>
               <w:rPr>
@@ -2396,7 +2396,7 @@
               <w:lang w:eastAsia="en-GB"/>
             </w:rPr>
           </w:pPr>
-          <w:hyperlink w:anchor="_Toc223789515" w:history="1">
+          <w:hyperlink w:anchor="_Toc223792478" w:history="1">
             <w:r>
               <w:rPr>
                 <w:rStyle w:val="Hyperlink"/>
@@ -2423,7 +2423,7 @@
                 <w:noProof/>
                 <w:webHidden/>
               </w:rPr>
-              <w:instrText xml:space="preserve"> PAGEREF _Toc223789515 \h </w:instrText>
+              <w:instrText xml:space="preserve"> PAGEREF _Toc223792478 \h </w:instrText>
             </w:r>
             <w:r>
               <w:rPr>
@@ -2468,7 +2468,7 @@
               <w:lang w:eastAsia="en-GB"/>
             </w:rPr>
           </w:pPr>
-          <w:hyperlink w:anchor="_Toc223789516" w:history="1">
+          <w:hyperlink w:anchor="_Toc223792479" w:history="1">
             <w:r>
               <w:rPr>
                 <w:rStyle w:val="Hyperlink"/>
@@ -2495,7 +2495,7 @@
                 <w:noProof/>
                 <w:webHidden/>
               </w:rPr>
-              <w:instrText xml:space="preserve"> PAGEREF _Toc223789516 \h </w:instrText>
+              <w:instrText xml:space="preserve"> PAGEREF _Toc223792479 \h </w:instrText>
             </w:r>
             <w:r>
               <w:rPr>
@@ -2540,7 +2540,7 @@
               <w:lang w:eastAsia="en-GB"/>
             </w:rPr>
           </w:pPr>
-          <w:hyperlink w:anchor="_Toc223789517" w:history="1">
+          <w:hyperlink w:anchor="_Toc223792480" w:history="1">
             <w:r>
               <w:rPr>
                 <w:rStyle w:val="Hyperlink"/>
@@ -2567,7 +2567,7 @@
                 <w:noProof/>
                 <w:webHidden/>
               </w:rPr>
-              <w:instrText xml:space="preserve"> PAGEREF _Toc223789517 \h </w:instrText>
+              <w:instrText xml:space="preserve"> PAGEREF _Toc223792480 \h </w:instrText>
             </w:r>
             <w:r>
               <w:rPr>
@@ -2612,7 +2612,7 @@
               <w:lang w:eastAsia="en-GB"/>
             </w:rPr>
           </w:pPr>
-          <w:hyperlink w:anchor="_Toc223789518" w:history="1">
+          <w:hyperlink w:anchor="_Toc223792481" w:history="1">
             <w:r>
               <w:rPr>
                 <w:rStyle w:val="Hyperlink"/>
@@ -2639,7 +2639,7 @@
                 <w:noProof/>
                 <w:webHidden/>
               </w:rPr>
-              <w:instrText xml:space="preserve"> PAGEREF _Toc223789518 \h </w:instrText>
+              <w:instrText xml:space="preserve"> PAGEREF _Toc223792481 \h </w:instrText>
             </w:r>
             <w:r>
               <w:rPr>
@@ -2684,7 +2684,7 @@
               <w:lang w:eastAsia="en-GB"/>
             </w:rPr>
           </w:pPr>
-          <w:hyperlink w:anchor="_Toc223789519" w:history="1">
+          <w:hyperlink w:anchor="_Toc223792482" w:history="1">
             <w:r>
               <w:rPr>
                 <w:rStyle w:val="Hyperlink"/>
@@ -2711,7 +2711,7 @@
                 <w:noProof/>
                 <w:webHidden/>
               </w:rPr>
-              <w:instrText xml:space="preserve"> PAGEREF _Toc223789519 \h </w:instrText>
+              <w:instrText xml:space="preserve"> PAGEREF _Toc223792482 \h </w:instrText>
             </w:r>
             <w:r>
               <w:rPr>
@@ -2756,7 +2756,7 @@
               <w:lang w:eastAsia="en-GB"/>
             </w:rPr>
           </w:pPr>
-          <w:hyperlink w:anchor="_Toc223789520" w:history="1">
+          <w:hyperlink w:anchor="_Toc223792483" w:history="1">
             <w:r>
               <w:rPr>
                 <w:rStyle w:val="Hyperlink"/>
@@ -2783,7 +2783,7 @@
                 <w:noProof/>
                 <w:webHidden/>
               </w:rPr>
-              <w:instrText xml:space="preserve"> PAGEREF _Toc223789520 \h </w:instrText>
+              <w:instrText xml:space="preserve"> PAGEREF _Toc223792483 \h </w:instrText>
             </w:r>
             <w:r>
               <w:rPr>
@@ -2828,7 +2828,7 @@
               <w:lang w:eastAsia="en-GB"/>
             </w:rPr>
           </w:pPr>
-          <w:hyperlink w:anchor="_Toc223789521" w:history="1">
+          <w:hyperlink w:anchor="_Toc223792484" w:history="1">
             <w:r>
               <w:rPr>
                 <w:rStyle w:val="Hyperlink"/>
@@ -2855,7 +2855,7 @@
                 <w:noProof/>
                 <w:webHidden/>
               </w:rPr>
-              <w:instrText xml:space="preserve"> PAGEREF _Toc223789521 \h </w:instrText>
+              <w:instrText xml:space="preserve"> PAGEREF _Toc223792484 \h </w:instrText>
             </w:r>
             <w:r>
               <w:rPr>
@@ -2900,7 +2900,7 @@
               <w:lang w:eastAsia="en-GB"/>
             </w:rPr>
           </w:pPr>
-          <w:hyperlink w:anchor="_Toc223789522" w:history="1">
+          <w:hyperlink w:anchor="_Toc223792485" w:history="1">
             <w:r>
               <w:rPr>
                 <w:rStyle w:val="Hyperlink"/>
@@ -2927,7 +2927,7 @@
                 <w:noProof/>
                 <w:webHidden/>
               </w:rPr>
-              <w:instrText xml:space="preserve"> PAGEREF _Toc223789522 \h </w:instrText>
+              <w:instrText xml:space="preserve"> PAGEREF _Toc223792485 \h </w:instrText>
             </w:r>
             <w:r>
               <w:rPr>
@@ -2972,7 +2972,7 @@
               <w:lang w:eastAsia="en-GB"/>
             </w:rPr>
           </w:pPr>
-          <w:hyperlink w:anchor="_Toc223789523" w:history="1">
+          <w:hyperlink w:anchor="_Toc223792486" w:history="1">
             <w:r>
               <w:rPr>
                 <w:rStyle w:val="Hyperlink"/>
@@ -2999,7 +2999,7 @@
                 <w:noProof/>
                 <w:webHidden/>
               </w:rPr>
-              <w:instrText xml:space="preserve"> PAGEREF _Toc223789523 \h </w:instrText>
+              <w:instrText xml:space="preserve"> PAGEREF _Toc223792486 \h </w:instrText>
             </w:r>
             <w:r>
               <w:rPr>
@@ -3044,7 +3044,7 @@
               <w:lang w:eastAsia="en-GB"/>
             </w:rPr>
           </w:pPr>
-          <w:hyperlink w:anchor="_Toc223789524" w:history="1">
+          <w:hyperlink w:anchor="_Toc223792487" w:history="1">
             <w:r>
               <w:rPr>
                 <w:rStyle w:val="Hyperlink"/>
@@ -3071,7 +3071,7 @@
                 <w:noProof/>
                 <w:webHidden/>
               </w:rPr>
-              <w:instrText xml:space="preserve"> PAGEREF _Toc223789524 \h </w:instrText>
+              <w:instrText xml:space="preserve"> PAGEREF _Toc223792487 \h </w:instrText>
             </w:r>
             <w:r>
               <w:rPr>
@@ -3116,7 +3116,7 @@
               <w:lang w:eastAsia="en-GB"/>
             </w:rPr>
           </w:pPr>
-          <w:hyperlink w:anchor="_Toc223789525" w:history="1">
+          <w:hyperlink w:anchor="_Toc223792488" w:history="1">
             <w:r>
               <w:rPr>
                 <w:rStyle w:val="Hyperlink"/>
@@ -3143,7 +3143,7 @@
                 <w:noProof/>
                 <w:webHidden/>
               </w:rPr>
-              <w:instrText xml:space="preserve"> PAGEREF _Toc223789525 \h </w:instrText>
+              <w:instrText xml:space="preserve"> PAGEREF _Toc223792488 \h </w:instrText>
             </w:r>
             <w:r>
               <w:rPr>
@@ -3188,7 +3188,7 @@
               <w:lang w:eastAsia="en-GB"/>
             </w:rPr>
           </w:pPr>
-          <w:hyperlink w:anchor="_Toc223789526" w:history="1">
+          <w:hyperlink w:anchor="_Toc223792489" w:history="1">
             <w:r>
               <w:rPr>
                 <w:rStyle w:val="Hyperlink"/>
@@ -3215,7 +3215,7 @@
                 <w:noProof/>
                 <w:webHidden/>
               </w:rPr>
-              <w:instrText xml:space="preserve"> PAGEREF _Toc223789526 \h </w:instrText>
+              <w:instrText xml:space="preserve"> PAGEREF _Toc223792489 \h </w:instrText>
             </w:r>
             <w:r>
               <w:rPr>
@@ -3260,7 +3260,7 @@
               <w:lang w:eastAsia="en-GB"/>
             </w:rPr>
           </w:pPr>
-          <w:hyperlink w:anchor="_Toc223789527" w:history="1">
+          <w:hyperlink w:anchor="_Toc223792490" w:history="1">
             <w:r>
               <w:rPr>
                 <w:rStyle w:val="Hyperlink"/>
@@ -3287,7 +3287,7 @@
                 <w:noProof/>
                 <w:webHidden/>
               </w:rPr>
-              <w:instrText xml:space="preserve"> PAGEREF _Toc223789527 \h </w:instrText>
+              <w:instrText xml:space="preserve"> PAGEREF _Toc223792490 \h </w:instrText>
             </w:r>
             <w:r>
               <w:rPr>
@@ -3332,7 +3332,7 @@
               <w:lang w:eastAsia="en-GB"/>
             </w:rPr>
           </w:pPr>
-          <w:hyperlink w:anchor="_Toc223789528" w:history="1">
+          <w:hyperlink w:anchor="_Toc223792491" w:history="1">
             <w:r>
               <w:rPr>
                 <w:rStyle w:val="Hyperlink"/>
@@ -3359,7 +3359,7 @@
                 <w:noProof/>
                 <w:webHidden/>
               </w:rPr>
-              <w:instrText xml:space="preserve"> PAGEREF _Toc223789528 \h </w:instrText>
+              <w:instrText xml:space="preserve"> PAGEREF _Toc223792491 \h </w:instrText>
             </w:r>
             <w:r>
               <w:rPr>
@@ -3404,7 +3404,7 @@
               <w:lang w:eastAsia="en-GB"/>
             </w:rPr>
           </w:pPr>
-          <w:hyperlink w:anchor="_Toc223789529" w:history="1">
+          <w:hyperlink w:anchor="_Toc223792492" w:history="1">
             <w:r>
               <w:rPr>
                 <w:rStyle w:val="Hyperlink"/>
@@ -3431,7 +3431,7 @@
                 <w:noProof/>
                 <w:webHidden/>
               </w:rPr>
-              <w:instrText xml:space="preserve"> PAGEREF _Toc223789529 \h </w:instrText>
+              <w:instrText xml:space="preserve"> PAGEREF _Toc223792492 \h </w:instrText>
             </w:r>
             <w:r>
               <w:rPr>
@@ -3476,7 +3476,7 @@
               <w:lang w:eastAsia="en-GB"/>
             </w:rPr>
           </w:pPr>
-          <w:hyperlink w:anchor="_Toc223789530" w:history="1">
+          <w:hyperlink w:anchor="_Toc223792493" w:history="1">
             <w:r>
               <w:rPr>
                 <w:rStyle w:val="Hyperlink"/>
@@ -3503,7 +3503,7 @@
                 <w:noProof/>
                 <w:webHidden/>
               </w:rPr>
-              <w:instrText xml:space="preserve"> PAGEREF _Toc223789530 \h </w:instrText>
+              <w:instrText xml:space="preserve"> PAGEREF _Toc223792493 \h </w:instrText>
             </w:r>
             <w:r>
               <w:rPr>
@@ -3548,7 +3548,7 @@
               <w:lang w:eastAsia="en-GB"/>
             </w:rPr>
           </w:pPr>
-          <w:hyperlink w:anchor="_Toc223789531" w:history="1">
+          <w:hyperlink w:anchor="_Toc223792494" w:history="1">
             <w:r>
               <w:rPr>
                 <w:rStyle w:val="Hyperlink"/>
@@ -3575,7 +3575,7 @@
                 <w:noProof/>
                 <w:webHidden/>
               </w:rPr>
-              <w:instrText xml:space="preserve"> PAGEREF _Toc223789531 \h </w:instrText>
+              <w:instrText xml:space="preserve"> PAGEREF _Toc223792494 \h </w:instrText>
             </w:r>
             <w:r>
               <w:rPr>
@@ -3620,7 +3620,7 @@
               <w:lang w:eastAsia="en-GB"/>
             </w:rPr>
           </w:pPr>
-          <w:hyperlink w:anchor="_Toc223789532" w:history="1">
+          <w:hyperlink w:anchor="_Toc223792495" w:history="1">
             <w:r>
               <w:rPr>
                 <w:rStyle w:val="Hyperlink"/>
@@ -3647,7 +3647,7 @@
                 <w:noProof/>
                 <w:webHidden/>
               </w:rPr>
-              <w:instrText xml:space="preserve"> PAGEREF _Toc223789532 \h </w:instrText>
+              <w:instrText xml:space="preserve"> PAGEREF _Toc223792495 \h </w:instrText>
             </w:r>
             <w:r>
               <w:rPr>
@@ -3692,7 +3692,7 @@
               <w:lang w:eastAsia="en-GB"/>
             </w:rPr>
           </w:pPr>
-          <w:hyperlink w:anchor="_Toc223789533" w:history="1">
+          <w:hyperlink w:anchor="_Toc223792496" w:history="1">
             <w:r>
               <w:rPr>
                 <w:rStyle w:val="Hyperlink"/>
@@ -3719,7 +3719,7 @@
                 <w:noProof/>
                 <w:webHidden/>
               </w:rPr>
-              <w:instrText xml:space="preserve"> PAGEREF _Toc223789533 \h </w:instrText>
+              <w:instrText xml:space="preserve"> PAGEREF _Toc223792496 \h </w:instrText>
             </w:r>
             <w:r>
               <w:rPr>
@@ -3764,7 +3764,7 @@
               <w:lang w:eastAsia="en-GB"/>
             </w:rPr>
           </w:pPr>
-          <w:hyperlink w:anchor="_Toc223789534" w:history="1">
+          <w:hyperlink w:anchor="_Toc223792497" w:history="1">
             <w:r>
               <w:rPr>
                 <w:rStyle w:val="Hyperlink"/>
@@ -3791,7 +3791,7 @@
                 <w:noProof/>
                 <w:webHidden/>
               </w:rPr>
-              <w:instrText xml:space="preserve"> PAGEREF _Toc223789534 \h </w:instrText>
+              <w:instrText xml:space="preserve"> PAGEREF _Toc223792497 \h </w:instrText>
             </w:r>
             <w:r>
               <w:rPr>
@@ -3836,7 +3836,7 @@
               <w:lang w:eastAsia="en-GB"/>
             </w:rPr>
           </w:pPr>
-          <w:hyperlink w:anchor="_Toc223789535" w:history="1">
+          <w:hyperlink w:anchor="_Toc223792498" w:history="1">
             <w:r>
               <w:rPr>
                 <w:rStyle w:val="Hyperlink"/>
@@ -3863,7 +3863,7 @@
                 <w:noProof/>
                 <w:webHidden/>
               </w:rPr>
-              <w:instrText xml:space="preserve"> PAGEREF _Toc223789535 \h </w:instrText>
+              <w:instrText xml:space="preserve"> PAGEREF _Toc223792498 \h </w:instrText>
             </w:r>
             <w:r>
               <w:rPr>
@@ -3908,7 +3908,7 @@
               <w:lang w:eastAsia="en-GB"/>
             </w:rPr>
           </w:pPr>
-          <w:hyperlink w:anchor="_Toc223789536" w:history="1">
+          <w:hyperlink w:anchor="_Toc223792499" w:history="1">
             <w:r>
               <w:rPr>
                 <w:rStyle w:val="Hyperlink"/>
@@ -3935,7 +3935,7 @@
                 <w:noProof/>
                 <w:webHidden/>
               </w:rPr>
-              <w:instrText xml:space="preserve"> PAGEREF _Toc223789536 \h </w:instrText>
+              <w:instrText xml:space="preserve"> PAGEREF _Toc223792499 \h </w:instrText>
             </w:r>
             <w:r>
               <w:rPr>
@@ -3980,7 +3980,7 @@
               <w:lang w:eastAsia="en-GB"/>
             </w:rPr>
           </w:pPr>
-          <w:hyperlink w:anchor="_Toc223789537" w:history="1">
+          <w:hyperlink w:anchor="_Toc223792500" w:history="1">
             <w:r>
               <w:rPr>
                 <w:rStyle w:val="Hyperlink"/>
@@ -4007,7 +4007,7 @@
                 <w:noProof/>
                 <w:webHidden/>
               </w:rPr>
-              <w:instrText xml:space="preserve"> PAGEREF _Toc223789537 \h </w:instrText>
+              <w:instrText xml:space="preserve"> PAGEREF _Toc223792500 \h </w:instrText>
             </w:r>
             <w:r>
               <w:rPr>
@@ -4052,7 +4052,7 @@
               <w:lang w:eastAsia="en-GB"/>
             </w:rPr>
           </w:pPr>
-          <w:hyperlink w:anchor="_Toc223789538" w:history="1">
+          <w:hyperlink w:anchor="_Toc223792501" w:history="1">
             <w:r>
               <w:rPr>
                 <w:rStyle w:val="Hyperlink"/>
@@ -4079,7 +4079,7 @@
                 <w:noProof/>
                 <w:webHidden/>
               </w:rPr>
-              <w:instrText xml:space="preserve"> PAGEREF _Toc223789538 \h </w:instrText>
+              <w:instrText xml:space="preserve"> PAGEREF _Toc223792501 \h </w:instrText>
             </w:r>
             <w:r>
               <w:rPr>
@@ -4124,7 +4124,7 @@
               <w:lang w:eastAsia="en-GB"/>
             </w:rPr>
           </w:pPr>
-          <w:hyperlink w:anchor="_Toc223789539" w:history="1">
+          <w:hyperlink w:anchor="_Toc223792502" w:history="1">
             <w:r>
               <w:rPr>
                 <w:rStyle w:val="Hyperlink"/>
@@ -4151,7 +4151,7 @@
                 <w:noProof/>
                 <w:webHidden/>
               </w:rPr>
-              <w:instrText xml:space="preserve"> PAGEREF _Toc223789539 \h </w:instrText>
+              <w:instrText xml:space="preserve"> PAGEREF _Toc223792502 \h </w:instrText>
             </w:r>
             <w:r>
               <w:rPr>
@@ -4196,7 +4196,7 @@
               <w:lang w:eastAsia="en-GB"/>
             </w:rPr>
           </w:pPr>
-          <w:hyperlink w:anchor="_Toc223789540" w:history="1">
+          <w:hyperlink w:anchor="_Toc223792503" w:history="1">
             <w:r>
               <w:rPr>
                 <w:rStyle w:val="Hyperlink"/>
@@ -4223,7 +4223,7 @@
                 <w:noProof/>
                 <w:webHidden/>
               </w:rPr>
-              <w:instrText xml:space="preserve"> PAGEREF _Toc223789540 \h </w:instrText>
+              <w:instrText xml:space="preserve"> PAGEREF _Toc223792503 \h </w:instrText>
             </w:r>
             <w:r>
               <w:rPr>
@@ -4268,7 +4268,7 @@
               <w:lang w:eastAsia="en-GB"/>
             </w:rPr>
           </w:pPr>
-          <w:hyperlink w:anchor="_Toc223789541" w:history="1">
+          <w:hyperlink w:anchor="_Toc223792504" w:history="1">
             <w:r>
               <w:rPr>
                 <w:rStyle w:val="Hyperlink"/>
@@ -4295,7 +4295,7 @@
                 <w:noProof/>
                 <w:webHidden/>
               </w:rPr>
-              <w:instrText xml:space="preserve"> PAGEREF _Toc223789541 \h </w:instrText>
+              <w:instrText xml:space="preserve"> PAGEREF _Toc223792504 \h </w:instrText>
             </w:r>
             <w:r>
               <w:rPr>
@@ -4356,7 +4356,7 @@
       <w:pPr>
         <w:pStyle w:val="Heading1"/>
       </w:pPr>
-      <w:bookmarkStart w:id="0" w:name="_Toc223789485"/>
+      <w:bookmarkStart w:id="0" w:name="_Toc223792448"/>
       <w:r>
         <w:lastRenderedPageBreak/>
         <w:t>List of Acro</w:t>
@@ -4611,7 +4611,7 @@
       <w:pPr>
         <w:pStyle w:val="Heading1"/>
       </w:pPr>
-      <w:bookmarkStart w:id="1" w:name="_Toc223789486"/>
+      <w:bookmarkStart w:id="1" w:name="_Toc223792449"/>
       <w:r>
         <w:lastRenderedPageBreak/>
         <w:t>Abstract</w:t>
@@ -4811,7 +4811,7 @@
       <w:pPr>
         <w:pStyle w:val="Heading1"/>
       </w:pPr>
-      <w:bookmarkStart w:id="2" w:name="_Toc223789487"/>
+      <w:bookmarkStart w:id="2" w:name="_Toc223792450"/>
       <w:r>
         <w:lastRenderedPageBreak/>
         <w:t>Introduction</w:t>
@@ -4858,13 +4858,8 @@
       <w:r>
         <w:t xml:space="preserve">. </w:t>
       </w:r>
-      <w:proofErr w:type="spellStart"/>
-      <w:r>
-        <w:t>Porcar</w:t>
-      </w:r>
-      <w:proofErr w:type="spellEnd"/>
-      <w:r>
-        <w:t xml:space="preserve"> et al., </w:t>
+      <w:r>
+        <w:t xml:space="preserve">Porcar et al., </w:t>
       </w:r>
       <w:r>
         <w:t>(</w:t>
@@ -4904,13 +4899,8 @@
       <w:r>
         <w:t xml:space="preserve">Research conducted by </w:t>
       </w:r>
-      <w:proofErr w:type="spellStart"/>
-      <w:r>
-        <w:t>Cantó</w:t>
-      </w:r>
-      <w:proofErr w:type="spellEnd"/>
-      <w:r>
-        <w:t xml:space="preserve">-Sancho et al., </w:t>
+      <w:r>
+        <w:t xml:space="preserve">Cantó-Sancho et al., </w:t>
       </w:r>
       <w:r>
         <w:t>(</w:t>
@@ -5394,7 +5384,7 @@
       <w:pPr>
         <w:pStyle w:val="Heading1"/>
       </w:pPr>
-      <w:bookmarkStart w:id="3" w:name="_Toc223789488"/>
+      <w:bookmarkStart w:id="3" w:name="_Toc223792451"/>
       <w:r>
         <w:lastRenderedPageBreak/>
         <w:t>Project Aim</w:t>
@@ -5444,7 +5434,7 @@
           <w:rFonts w:asciiTheme="minorHAnsi" w:hAnsiTheme="minorHAnsi"/>
         </w:rPr>
       </w:pPr>
-      <w:bookmarkStart w:id="4" w:name="_Toc223789489"/>
+      <w:bookmarkStart w:id="4" w:name="_Toc223792452"/>
       <w:r>
         <w:rPr>
           <w:rFonts w:asciiTheme="minorHAnsi" w:hAnsiTheme="minorHAnsi"/>
@@ -5731,7 +5721,7 @@
       <w:pPr>
         <w:pStyle w:val="Heading1"/>
       </w:pPr>
-      <w:bookmarkStart w:id="5" w:name="_Toc223789490"/>
+      <w:bookmarkStart w:id="5" w:name="_Toc223792453"/>
       <w:r>
         <w:lastRenderedPageBreak/>
         <w:t>Project Planning</w:t>
@@ -6112,7 +6102,7 @@
           <w:rFonts w:asciiTheme="minorHAnsi" w:hAnsiTheme="minorHAnsi"/>
         </w:rPr>
       </w:pPr>
-      <w:bookmarkStart w:id="6" w:name="_Toc223789491"/>
+      <w:bookmarkStart w:id="6" w:name="_Toc223792454"/>
       <w:r>
         <w:rPr>
           <w:rFonts w:asciiTheme="minorHAnsi" w:hAnsiTheme="minorHAnsi"/>
@@ -6314,7 +6304,7 @@
           <w:rFonts w:asciiTheme="minorHAnsi" w:hAnsiTheme="minorHAnsi"/>
         </w:rPr>
       </w:pPr>
-      <w:bookmarkStart w:id="7" w:name="_Toc223789492"/>
+      <w:bookmarkStart w:id="7" w:name="_Toc223792455"/>
       <w:r>
         <w:rPr>
           <w:rFonts w:asciiTheme="minorHAnsi" w:hAnsiTheme="minorHAnsi"/>
@@ -6553,21 +6543,7 @@
         <w:rPr>
           <w:rFonts w:cs="Arial"/>
         </w:rPr>
-        <w:t xml:space="preserve">Clear </w:t>
-      </w:r>
-      <w:proofErr w:type="gramStart"/>
-      <w:r>
-        <w:rPr>
-          <w:rFonts w:cs="Arial"/>
-        </w:rPr>
-        <w:t>on screen</w:t>
-      </w:r>
-      <w:proofErr w:type="gramEnd"/>
-      <w:r>
-        <w:rPr>
-          <w:rFonts w:cs="Arial"/>
-        </w:rPr>
-        <w:t xml:space="preserve"> prompts to guide and support users that aren’t familiar with VR equipment</w:t>
+        <w:t>Clear on screen prompts to guide and support users that aren’t familiar with VR equipment</w:t>
       </w:r>
     </w:p>
     <w:p>
@@ -6595,7 +6571,7 @@
           <w:rFonts w:asciiTheme="minorHAnsi" w:hAnsiTheme="minorHAnsi"/>
         </w:rPr>
       </w:pPr>
-      <w:bookmarkStart w:id="8" w:name="_Toc223789493"/>
+      <w:bookmarkStart w:id="8" w:name="_Toc223792456"/>
       <w:r>
         <w:rPr>
           <w:rFonts w:asciiTheme="minorHAnsi" w:hAnsiTheme="minorHAnsi"/>
@@ -6612,7 +6588,7 @@
           <w:rFonts w:asciiTheme="minorHAnsi" w:hAnsiTheme="minorHAnsi"/>
         </w:rPr>
       </w:pPr>
-      <w:bookmarkStart w:id="9" w:name="_Toc223789494"/>
+      <w:bookmarkStart w:id="9" w:name="_Toc223792457"/>
       <w:r>
         <w:rPr>
           <w:rFonts w:asciiTheme="minorHAnsi" w:hAnsiTheme="minorHAnsi"/>
@@ -6696,7 +6672,7 @@
           <w:rFonts w:asciiTheme="minorHAnsi" w:hAnsiTheme="minorHAnsi"/>
         </w:rPr>
       </w:pPr>
-      <w:bookmarkStart w:id="10" w:name="_Toc223789495"/>
+      <w:bookmarkStart w:id="10" w:name="_Toc223792458"/>
       <w:r>
         <w:rPr>
           <w:rFonts w:asciiTheme="minorHAnsi" w:hAnsiTheme="minorHAnsi"/>
@@ -6709,8 +6685,7 @@
       <w:pPr>
         <w:pStyle w:val="Heading3"/>
       </w:pPr>
-      <w:bookmarkStart w:id="11" w:name="_Toc223789496"/>
-      <w:proofErr w:type="spellStart"/>
+      <w:bookmarkStart w:id="11" w:name="_Toc223792459"/>
       <w:r>
         <w:t>Ey</w:t>
       </w:r>
@@ -6721,7 +6696,6 @@
         <w:t>si</w:t>
       </w:r>
       <w:bookmarkEnd w:id="11"/>
-      <w:proofErr w:type="spellEnd"/>
     </w:p>
     <w:p>
       <w:r>
@@ -6736,11 +6710,9 @@
       <w:r>
         <w:t xml:space="preserve"> discussed </w:t>
       </w:r>
-      <w:proofErr w:type="spellStart"/>
       <w:r>
         <w:t>Eyesi</w:t>
       </w:r>
-      <w:proofErr w:type="spellEnd"/>
       <w:r>
         <w:t>,</w:t>
       </w:r>
@@ -6853,15 +6825,7 @@
         <w:t xml:space="preserve">In addition to this, there is an </w:t>
       </w:r>
       <w:r>
-        <w:t>online training portal (</w:t>
-      </w:r>
-      <w:proofErr w:type="spellStart"/>
-      <w:r>
-        <w:t>vrmnet</w:t>
-      </w:r>
-      <w:proofErr w:type="spellEnd"/>
-      <w:r>
-        <w:t xml:space="preserve">) </w:t>
+        <w:t xml:space="preserve">online training portal (vrmnet) </w:t>
       </w:r>
       <w:r>
         <w:t>allowing comparison between trainees</w:t>
@@ -6996,15 +6960,7 @@
         <w:t xml:space="preserve"> </w:t>
       </w:r>
       <w:r>
-        <w:t xml:space="preserve">While </w:t>
-      </w:r>
-      <w:proofErr w:type="spellStart"/>
-      <w:r>
-        <w:t>Eyesi</w:t>
-      </w:r>
-      <w:proofErr w:type="spellEnd"/>
-      <w:r>
-        <w:t xml:space="preserve"> is effective for medical training for medical professionals, </w:t>
+        <w:t xml:space="preserve">While Eyesi is effective for medical training for medical professionals, </w:t>
       </w:r>
       <w:r>
         <w:t xml:space="preserve">similar </w:t>
@@ -7026,13 +6982,11 @@
       <w:pPr>
         <w:pStyle w:val="Heading3"/>
       </w:pPr>
-      <w:bookmarkStart w:id="12" w:name="_Toc223789497"/>
-      <w:proofErr w:type="spellStart"/>
+      <w:bookmarkStart w:id="12" w:name="_Toc223792460"/>
       <w:r>
         <w:t>OntoPhaco</w:t>
       </w:r>
       <w:bookmarkEnd w:id="12"/>
-      <w:proofErr w:type="spellEnd"/>
     </w:p>
     <w:p>
       <w:r>
@@ -7051,15 +7005,7 @@
         <w:t>d</w:t>
       </w:r>
       <w:r>
-        <w:t xml:space="preserve"> </w:t>
-      </w:r>
-      <w:proofErr w:type="spellStart"/>
-      <w:r>
-        <w:t>OntoPhaco</w:t>
-      </w:r>
-      <w:proofErr w:type="spellEnd"/>
-      <w:r>
-        <w:t>, a</w:t>
+        <w:t xml:space="preserve"> OntoPhaco, a</w:t>
       </w:r>
       <w:r>
         <w:t>n</w:t>
@@ -7192,191 +7138,173 @@
           <w:rFonts w:cs="TimesLTStd-Roman"/>
           <w:kern w:val="0"/>
         </w:rPr>
-        <w:t xml:space="preserve">Since </w:t>
-      </w:r>
-      <w:proofErr w:type="spellStart"/>
+        <w:t>Since OntoPhaco</w:t>
+      </w:r>
       <w:r>
         <w:rPr>
           <w:rFonts w:cs="TimesLTStd-Roman"/>
           <w:kern w:val="0"/>
         </w:rPr>
-        <w:t>OntoPhaco</w:t>
+        <w:t>’s</w:t>
       </w:r>
       <w:r>
         <w:rPr>
           <w:rFonts w:cs="TimesLTStd-Roman"/>
           <w:kern w:val="0"/>
         </w:rPr>
-        <w:t>’s</w:t>
-      </w:r>
-      <w:proofErr w:type="spellEnd"/>
+        <w:t xml:space="preserve"> </w:t>
+      </w:r>
+      <w:r>
+        <w:t>s</w:t>
+      </w:r>
+      <w:r>
+        <w:t xml:space="preserve">ystematic verification and validation processes </w:t>
+      </w:r>
+      <w:r>
+        <w:t>include</w:t>
+      </w:r>
+      <w:r>
+        <w:t xml:space="preserve"> </w:t>
+      </w:r>
+      <w:r>
+        <w:t xml:space="preserve">theoretical </w:t>
+      </w:r>
+      <w:r>
+        <w:t>evaluat</w:t>
+      </w:r>
+      <w:r>
+        <w:t xml:space="preserve">ion </w:t>
+      </w:r>
+      <w:r>
+        <w:t>and expert feedback</w:t>
+      </w:r>
       <w:r>
         <w:rPr>
           <w:rFonts w:cs="TimesLTStd-Roman"/>
           <w:kern w:val="0"/>
         </w:rPr>
-        <w:t xml:space="preserve"> </w:t>
-      </w:r>
-      <w:r>
-        <w:t>s</w:t>
-      </w:r>
-      <w:r>
-        <w:t xml:space="preserve">ystematic verification and validation processes </w:t>
-      </w:r>
-      <w:r>
-        <w:t>include</w:t>
-      </w:r>
-      <w:r>
-        <w:t xml:space="preserve"> </w:t>
-      </w:r>
-      <w:r>
-        <w:t xml:space="preserve">theoretical </w:t>
-      </w:r>
-      <w:r>
-        <w:t>evaluat</w:t>
-      </w:r>
-      <w:r>
-        <w:t xml:space="preserve">ion </w:t>
-      </w:r>
-      <w:r>
-        <w:t>and expert feedback</w:t>
+        <w:t xml:space="preserve">, each change, minor or major </w:t>
       </w:r>
       <w:r>
         <w:rPr>
           <w:rFonts w:cs="TimesLTStd-Roman"/>
           <w:kern w:val="0"/>
         </w:rPr>
-        <w:t xml:space="preserve">, each change, minor or major </w:t>
+        <w:t>is</w:t>
       </w:r>
       <w:r>
         <w:rPr>
           <w:rFonts w:cs="TimesLTStd-Roman"/>
           <w:kern w:val="0"/>
         </w:rPr>
-        <w:t>is</w:t>
+        <w:t xml:space="preserve"> verified and validate</w:t>
       </w:r>
       <w:r>
         <w:rPr>
           <w:rFonts w:cs="TimesLTStd-Roman"/>
           <w:kern w:val="0"/>
         </w:rPr>
-        <w:t xml:space="preserve"> verified and validate</w:t>
+        <w:t>d</w:t>
+      </w:r>
+      <w:r>
+        <w:t>.</w:t>
       </w:r>
       <w:r>
         <w:rPr>
           <w:rFonts w:cs="TimesLTStd-Roman"/>
           <w:kern w:val="0"/>
         </w:rPr>
-        <w:t>d</w:t>
-      </w:r>
-      <w:r>
-        <w:t>.</w:t>
+        <w:t xml:space="preserve"> </w:t>
       </w:r>
       <w:r>
         <w:rPr>
           <w:rFonts w:cs="TimesLTStd-Roman"/>
           <w:kern w:val="0"/>
         </w:rPr>
-        <w:t xml:space="preserve"> </w:t>
-      </w:r>
-      <w:proofErr w:type="spellStart"/>
+        <w:t>OntoPhaco demonstrates VR</w:t>
+      </w:r>
       <w:r>
         <w:rPr>
           <w:rFonts w:cs="TimesLTStd-Roman"/>
           <w:kern w:val="0"/>
         </w:rPr>
-        <w:t>OntoPhaco</w:t>
-      </w:r>
-      <w:proofErr w:type="spellEnd"/>
+        <w:t>’</w:t>
+      </w:r>
       <w:r>
         <w:rPr>
           <w:rFonts w:cs="TimesLTStd-Roman"/>
           <w:kern w:val="0"/>
         </w:rPr>
-        <w:t xml:space="preserve"> demonstrates VR</w:t>
+        <w:t xml:space="preserve">s effectiveness </w:t>
       </w:r>
       <w:r>
         <w:rPr>
           <w:rFonts w:cs="TimesLTStd-Roman"/>
           <w:kern w:val="0"/>
         </w:rPr>
-        <w:t>’</w:t>
+        <w:t xml:space="preserve">paired </w:t>
       </w:r>
       <w:r>
         <w:rPr>
           <w:rFonts w:cs="TimesLTStd-Roman"/>
           <w:kern w:val="0"/>
         </w:rPr>
-        <w:t xml:space="preserve">s effectiveness </w:t>
+        <w:t>with ontology for medical training</w:t>
       </w:r>
       <w:r>
         <w:rPr>
           <w:rFonts w:cs="TimesLTStd-Roman"/>
           <w:kern w:val="0"/>
         </w:rPr>
-        <w:t xml:space="preserve">paired </w:t>
+        <w:t>. T</w:t>
       </w:r>
       <w:r>
         <w:rPr>
           <w:rFonts w:cs="TimesLTStd-Roman"/>
           <w:kern w:val="0"/>
         </w:rPr>
-        <w:t>with ontology for medical training</w:t>
+        <w:t>his project</w:t>
       </w:r>
       <w:r>
         <w:rPr>
           <w:rFonts w:cs="TimesLTStd-Roman"/>
           <w:kern w:val="0"/>
         </w:rPr>
-        <w:t>. T</w:t>
+        <w:t xml:space="preserve"> applies similar immersi</w:t>
       </w:r>
       <w:r>
         <w:rPr>
           <w:rFonts w:cs="TimesLTStd-Roman"/>
           <w:kern w:val="0"/>
         </w:rPr>
-        <w:t>his project</w:t>
+        <w:t>ve</w:t>
       </w:r>
       <w:r>
         <w:rPr>
           <w:rFonts w:cs="TimesLTStd-Roman"/>
           <w:kern w:val="0"/>
         </w:rPr>
-        <w:t xml:space="preserve"> applies similar immersi</w:t>
+        <w:t xml:space="preserve"> and educational knowledge </w:t>
       </w:r>
       <w:r>
         <w:rPr>
           <w:rFonts w:cs="TimesLTStd-Roman"/>
           <w:kern w:val="0"/>
         </w:rPr>
-        <w:t>ve</w:t>
+        <w:t xml:space="preserve">for DES to raise awareness, </w:t>
       </w:r>
       <w:r>
         <w:rPr>
           <w:rFonts w:cs="TimesLTStd-Roman"/>
           <w:kern w:val="0"/>
         </w:rPr>
-        <w:t xml:space="preserve"> and educational knowledge </w:t>
+        <w:t xml:space="preserve">spreading the </w:t>
       </w:r>
       <w:r>
         <w:rPr>
           <w:rFonts w:cs="TimesLTStd-Roman"/>
           <w:kern w:val="0"/>
         </w:rPr>
-        <w:t xml:space="preserve">for DES to raise awareness, </w:t>
-      </w:r>
-      <w:r>
-        <w:rPr>
-          <w:rFonts w:cs="TimesLTStd-Roman"/>
-          <w:kern w:val="0"/>
-        </w:rPr>
-        <w:t xml:space="preserve">spreading the </w:t>
-      </w:r>
-      <w:r>
-        <w:rPr>
-          <w:rFonts w:cs="TimesLTStd-Roman"/>
-          <w:kern w:val="0"/>
-        </w:rPr>
         <w:t>benefits of VR use in education beyond professional training.</w:t>
       </w:r>
     </w:p>
@@ -7384,7 +7312,7 @@
       <w:pPr>
         <w:pStyle w:val="Heading3"/>
       </w:pPr>
-      <w:bookmarkStart w:id="13" w:name="_Toc223789498"/>
+      <w:bookmarkStart w:id="13" w:name="_Toc223792461"/>
       <w:r>
         <w:lastRenderedPageBreak/>
         <w:t>I</w:t>
@@ -7580,7 +7508,7 @@
       <w:pPr>
         <w:pStyle w:val="Heading3"/>
       </w:pPr>
-      <w:bookmarkStart w:id="14" w:name="_Toc223789499"/>
+      <w:bookmarkStart w:id="14" w:name="_Toc223792462"/>
       <w:r>
         <w:t>Opportunities for innovation</w:t>
       </w:r>
@@ -7590,27 +7518,17 @@
       <w:r>
         <w:t xml:space="preserve">While </w:t>
       </w:r>
-      <w:proofErr w:type="spellStart"/>
-      <w:r>
-        <w:t>Eyesi</w:t>
-      </w:r>
-      <w:proofErr w:type="spellEnd"/>
-      <w:r>
-        <w:t xml:space="preserve"> focuses on hands on surgical practices</w:t>
+      <w:r>
+        <w:t>Eyesi focuses on hands on surgical practices</w:t>
       </w:r>
       <w:r>
         <w:t xml:space="preserve">, </w:t>
       </w:r>
-      <w:proofErr w:type="spellStart"/>
       <w:r>
         <w:t>O</w:t>
       </w:r>
       <w:r>
-        <w:t>ntoPhaco</w:t>
-      </w:r>
-      <w:proofErr w:type="spellEnd"/>
-      <w:r>
-        <w:t xml:space="preserve"> focuses on the way knowledge is represented and conceptual understanding</w:t>
+        <w:t>ntoPhaco focuses on the way knowledge is represented and conceptual understanding</w:t>
       </w:r>
       <w:r>
         <w:t xml:space="preserve">. </w:t>
@@ -7708,7 +7626,7 @@
           <w:rFonts w:asciiTheme="minorHAnsi" w:hAnsiTheme="minorHAnsi"/>
         </w:rPr>
       </w:pPr>
-      <w:bookmarkStart w:id="15" w:name="_Toc223789500"/>
+      <w:bookmarkStart w:id="15" w:name="_Toc223792463"/>
       <w:r>
         <w:rPr>
           <w:rFonts w:asciiTheme="minorHAnsi" w:hAnsiTheme="minorHAnsi"/>
@@ -7721,7 +7639,7 @@
       <w:pPr>
         <w:pStyle w:val="Heading3"/>
       </w:pPr>
-      <w:bookmarkStart w:id="16" w:name="_Toc223789501"/>
+      <w:bookmarkStart w:id="16" w:name="_Toc223792464"/>
       <w:r>
         <w:t>VR in medical education</w:t>
       </w:r>
@@ -7868,19 +7786,9 @@
       <w:r>
         <w:t xml:space="preserve">Examples such as </w:t>
       </w:r>
-      <w:proofErr w:type="spellStart"/>
-      <w:r>
-        <w:t>Mediverse</w:t>
-      </w:r>
-      <w:proofErr w:type="spellEnd"/>
-      <w:r>
-        <w:t xml:space="preserve"> by </w:t>
-      </w:r>
-      <w:proofErr w:type="spellStart"/>
-      <w:r>
-        <w:t>Goggleminds</w:t>
-      </w:r>
-      <w:proofErr w:type="spellEnd"/>
+      <w:r>
+        <w:t>Mediverse by Goggleminds</w:t>
+      </w:r>
       <w:r>
         <w:t xml:space="preserve"> </w:t>
       </w:r>
@@ -7894,85 +7802,72 @@
         <w:t xml:space="preserve"> to healthcare providers and medical schools</w:t>
       </w:r>
       <w:r>
+        <w:t>. ClassVR by Systems improve</w:t>
+      </w:r>
+      <w:r>
+        <w:t>s</w:t>
+      </w:r>
+      <w:r>
+        <w:t xml:space="preserve"> student engagement</w:t>
+      </w:r>
+      <w:r>
+        <w:t xml:space="preserve"> to help teachers with educating students on learning material</w:t>
+      </w:r>
+      <w:r>
         <w:t xml:space="preserve">. </w:t>
       </w:r>
-      <w:proofErr w:type="spellStart"/>
-      <w:r>
-        <w:t>ClassVR</w:t>
-      </w:r>
-      <w:proofErr w:type="spellEnd"/>
-      <w:r>
-        <w:t xml:space="preserve"> by Systems improve</w:t>
-      </w:r>
-      <w:r>
-        <w:t>s</w:t>
-      </w:r>
-      <w:r>
-        <w:t xml:space="preserve"> student engagement</w:t>
-      </w:r>
-      <w:r>
-        <w:t xml:space="preserve"> to help teachers with educating students on learning material</w:t>
-      </w:r>
-      <w:r>
-        <w:t xml:space="preserve">. </w:t>
-      </w:r>
       <w:r>
         <w:t xml:space="preserve"> </w:t>
       </w:r>
-      <w:proofErr w:type="spellStart"/>
-      <w:r>
-        <w:t>PrismsVR</w:t>
-      </w:r>
-      <w:proofErr w:type="spellEnd"/>
+      <w:r>
+        <w:t xml:space="preserve">PrismsVR </w:t>
+      </w:r>
+      <w:r>
+        <w:t xml:space="preserve">helps students grasp core concepts in algebra and geometry, by </w:t>
+      </w:r>
+      <w:r>
+        <w:t>us</w:t>
+      </w:r>
+      <w:r>
+        <w:t>ing</w:t>
+      </w:r>
       <w:r>
         <w:t xml:space="preserve"> </w:t>
       </w:r>
       <w:r>
-        <w:t xml:space="preserve">helps students grasp core concepts in algebra and geometry, by </w:t>
-      </w:r>
-      <w:r>
-        <w:t>us</w:t>
+        <w:t>recognised teaching methods</w:t>
+      </w:r>
+      <w:r>
+        <w:t xml:space="preserve"> and immersive, </w:t>
+      </w:r>
+      <w:r>
+        <w:t xml:space="preserve">interactive </w:t>
+      </w:r>
+      <w:r>
+        <w:t>virtual environments.</w:t>
+      </w:r>
+      <w:r>
+        <w:t xml:space="preserve"> </w:t>
+      </w:r>
+      <w:r>
+        <w:t>This shows how VR enhances interaction</w:t>
+      </w:r>
+      <w:r>
+        <w:t xml:space="preserve"> and engagement</w:t>
+      </w:r>
+      <w:r>
+        <w:t xml:space="preserve"> in learning across fields</w:t>
+      </w:r>
+      <w:r>
+        <w:t xml:space="preserve">, it </w:t>
+      </w:r>
+      <w:r>
+        <w:t>is applicable to rais</w:t>
       </w:r>
       <w:r>
         <w:t>ing</w:t>
       </w:r>
       <w:r>
-        <w:t xml:space="preserve"> </w:t>
-      </w:r>
-      <w:r>
-        <w:t>recognised teaching methods</w:t>
-      </w:r>
-      <w:r>
-        <w:t xml:space="preserve"> and immersive, </w:t>
-      </w:r>
-      <w:r>
-        <w:t xml:space="preserve">interactive </w:t>
-      </w:r>
-      <w:r>
-        <w:t>virtual environments.</w:t>
-      </w:r>
-      <w:r>
-        <w:t xml:space="preserve"> </w:t>
-      </w:r>
-      <w:r>
-        <w:t>This shows how VR enhances interaction</w:t>
-      </w:r>
-      <w:r>
-        <w:t xml:space="preserve"> and engagement</w:t>
-      </w:r>
-      <w:r>
-        <w:t xml:space="preserve"> in learning across fields</w:t>
-      </w:r>
-      <w:r>
-        <w:t xml:space="preserve">, it </w:t>
-      </w:r>
-      <w:r>
-        <w:t>is applicable to rais</w:t>
-      </w:r>
-      <w:r>
-        <w:t>ing</w:t>
-      </w:r>
-      <w:r>
         <w:t xml:space="preserve"> awareness of health issues </w:t>
       </w:r>
       <w:r>
@@ -8011,7 +7906,7 @@
       <w:pPr>
         <w:pStyle w:val="Heading3"/>
       </w:pPr>
-      <w:bookmarkStart w:id="17" w:name="_Toc223789502"/>
+      <w:bookmarkStart w:id="17" w:name="_Toc223792465"/>
       <w:r>
         <w:lastRenderedPageBreak/>
         <w:t>VR in Health Awareness</w:t>
@@ -8204,7 +8099,7 @@
           <w:rFonts w:asciiTheme="minorHAnsi" w:hAnsiTheme="minorHAnsi"/>
         </w:rPr>
       </w:pPr>
-      <w:bookmarkStart w:id="18" w:name="_Toc223789503"/>
+      <w:bookmarkStart w:id="18" w:name="_Toc223792466"/>
       <w:r>
         <w:rPr>
           <w:rFonts w:asciiTheme="minorHAnsi" w:hAnsiTheme="minorHAnsi"/>
@@ -8424,7 +8319,7 @@
       <w:pPr>
         <w:pStyle w:val="Heading1"/>
       </w:pPr>
-      <w:bookmarkStart w:id="19" w:name="_Toc223789504"/>
+      <w:bookmarkStart w:id="19" w:name="_Toc223792467"/>
       <w:r>
         <w:lastRenderedPageBreak/>
         <w:t>Appendices</w:t>
@@ -8435,7 +8330,7 @@
       <w:pPr>
         <w:pStyle w:val="Heading2"/>
       </w:pPr>
-      <w:bookmarkStart w:id="20" w:name="_Toc223789505"/>
+      <w:bookmarkStart w:id="20" w:name="_Toc223792468"/>
       <w:r>
         <w:t>Ethics Checklist</w:t>
       </w:r>
@@ -8577,7 +8472,7 @@
       <w:pPr>
         <w:pStyle w:val="Heading2"/>
       </w:pPr>
-      <w:bookmarkStart w:id="21" w:name="_Toc223789506"/>
+      <w:bookmarkStart w:id="21" w:name="_Toc223792469"/>
       <w:r>
         <w:lastRenderedPageBreak/>
         <w:t>Project Timeline Gant</w:t>
@@ -8773,7 +8668,7 @@
       <w:pPr>
         <w:pStyle w:val="Heading1"/>
       </w:pPr>
-      <w:bookmarkStart w:id="22" w:name="_Toc223789507"/>
+      <w:bookmarkStart w:id="22" w:name="_Toc223792470"/>
       <w:r>
         <w:lastRenderedPageBreak/>
         <w:t>Methodology</w:t>
@@ -8784,7 +8679,7 @@
       <w:pPr>
         <w:pStyle w:val="Heading2"/>
       </w:pPr>
-      <w:bookmarkStart w:id="23" w:name="_Toc223789508"/>
+      <w:bookmarkStart w:id="23" w:name="_Toc223792471"/>
       <w:r>
         <w:t>Prototype Implementation</w:t>
       </w:r>
@@ -8794,7 +8689,7 @@
       <w:pPr>
         <w:pStyle w:val="Heading3"/>
       </w:pPr>
-      <w:bookmarkStart w:id="24" w:name="_Toc223789509"/>
+      <w:bookmarkStart w:id="24" w:name="_Toc223792472"/>
       <w:r>
         <w:t>Usability and Flow</w:t>
       </w:r>
@@ -8877,7 +8772,7 @@
       <w:pPr>
         <w:pStyle w:val="Heading3"/>
       </w:pPr>
-      <w:bookmarkStart w:id="25" w:name="_Toc223789510"/>
+      <w:bookmarkStart w:id="25" w:name="_Toc223792473"/>
       <w:r>
         <w:t xml:space="preserve">Environment Design and </w:t>
       </w:r>
@@ -9006,7 +8901,7 @@
       <w:pPr>
         <w:pStyle w:val="Heading3"/>
       </w:pPr>
-      <w:bookmarkStart w:id="26" w:name="_Toc223789511"/>
+      <w:bookmarkStart w:id="26" w:name="_Toc223792474"/>
       <w:r>
         <w:t>Objective System Implementation</w:t>
       </w:r>
@@ -9047,15 +8942,7 @@
         <w:t>ere</w:t>
       </w:r>
       <w:r>
-        <w:t xml:space="preserve"> stored within the </w:t>
-      </w:r>
-      <w:proofErr w:type="spellStart"/>
-      <w:r>
-        <w:t>VRGameMode</w:t>
-      </w:r>
-      <w:proofErr w:type="spellEnd"/>
-      <w:r>
-        <w:t xml:space="preserve"> blueprint, with objectives being updated during runtime as conditions were satisfied </w:t>
+        <w:t xml:space="preserve"> stored within the VRGameMode blueprint, with objectives being updated during runtime as conditions were satisfied </w:t>
       </w:r>
       <w:r>
         <w:t>during</w:t>
@@ -9119,7 +9006,7 @@
       <w:pPr>
         <w:pStyle w:val="Heading3"/>
       </w:pPr>
-      <w:bookmarkStart w:id="27" w:name="_Toc223789512"/>
+      <w:bookmarkStart w:id="27" w:name="_Toc223792475"/>
       <w:r>
         <w:t>User</w:t>
       </w:r>
@@ -9216,7 +9103,7 @@
       <w:pPr>
         <w:pStyle w:val="Heading3"/>
       </w:pPr>
-      <w:bookmarkStart w:id="28" w:name="_Toc223789513"/>
+      <w:bookmarkStart w:id="28" w:name="_Toc223792476"/>
       <w:r>
         <w:t>Objective Based Interact</w:t>
       </w:r>
@@ -9284,7 +9171,7 @@
       <w:pPr>
         <w:pStyle w:val="Heading3"/>
       </w:pPr>
-      <w:bookmarkStart w:id="29" w:name="_Toc223789514"/>
+      <w:bookmarkStart w:id="29" w:name="_Toc223792477"/>
       <w:r>
         <w:t>Post Processing Effects</w:t>
       </w:r>
@@ -9301,15 +9188,7 @@
         <w:t>’s post processing component</w:t>
       </w:r>
       <w:r>
-        <w:t xml:space="preserve">. These effects were </w:t>
-      </w:r>
-      <w:proofErr w:type="gramStart"/>
-      <w:r>
-        <w:t>vignette</w:t>
-      </w:r>
-      <w:proofErr w:type="gramEnd"/>
-      <w:r>
-        <w:t xml:space="preserve"> to simulate eye fatigue, bloom for light sensitivity and blur for focus strain. Vignette and bloom post processing effects were triggered through adjusting their post processing variables within the camera post processing component. However, for blur a post processing material was required to create the radial blur. When objectives progressed triggering the simulation of symptoms, a timeline was used to progressively increase the value of an effect gradually over a duration. This decision was made to accommodate eyes adjusting to the changes of the camera as these effects were being triggered.</w:t>
+        <w:t>. These effects were vignette to simulate eye fatigue, bloom for light sensitivity and blur for focus strain. Vignette and bloom post processing effects were triggered through adjusting their post processing variables within the camera post processing component. However, for blur a post processing material was required to create the radial blur. When objectives progressed triggering the simulation of symptoms, a timeline was used to progressively increase the value of an effect gradually over a duration. This decision was made to accommodate eyes adjusting to the changes of the camera as these effects were being triggered.</w:t>
       </w:r>
       <w:r>
         <w:t xml:space="preserve"> The timeline was then used in reverse to revert the symptoms returning the camera view back to the original state it was in.</w:t>
@@ -9319,7 +9198,7 @@
       <w:pPr>
         <w:pStyle w:val="Heading3"/>
       </w:pPr>
-      <w:bookmarkStart w:id="30" w:name="_Toc223789515"/>
+      <w:bookmarkStart w:id="30" w:name="_Toc223792478"/>
       <w:r>
         <w:t>User</w:t>
       </w:r>
@@ -9350,7 +9229,7 @@
       <w:pPr>
         <w:pStyle w:val="Heading2"/>
       </w:pPr>
-      <w:bookmarkStart w:id="31" w:name="_Toc223789516"/>
+      <w:bookmarkStart w:id="31" w:name="_Toc223792479"/>
       <w:r>
         <w:lastRenderedPageBreak/>
         <w:t>Final Version</w:t>
@@ -9378,7 +9257,7 @@
       <w:pPr>
         <w:pStyle w:val="Heading1"/>
       </w:pPr>
-      <w:bookmarkStart w:id="32" w:name="_Toc223789517"/>
+      <w:bookmarkStart w:id="32" w:name="_Toc223792480"/>
       <w:r>
         <w:lastRenderedPageBreak/>
         <w:t>Results</w:t>
@@ -9389,17 +9268,97 @@
       <w:pPr>
         <w:pStyle w:val="Heading2"/>
       </w:pPr>
-      <w:bookmarkStart w:id="33" w:name="_Toc223789518"/>
+      <w:bookmarkStart w:id="33" w:name="_Toc223792481"/>
       <w:r>
         <w:t>Prototype Tests</w:t>
       </w:r>
       <w:bookmarkEnd w:id="33"/>
     </w:p>
     <w:p>
+      <w:r>
+        <w:t xml:space="preserve">Tests were conducted to determine the </w:t>
+      </w:r>
+      <w:r>
+        <w:t>experience’</w:t>
+      </w:r>
+      <w:r>
+        <w:t>s</w:t>
+      </w:r>
+      <w:r>
+        <w:t xml:space="preserve"> s</w:t>
+      </w:r>
+      <w:r>
+        <w:t>trengths and weaknesse</w:t>
+      </w:r>
+      <w:r>
+        <w:t>s</w:t>
+      </w:r>
+      <w:r>
+        <w:t>. The</w:t>
+      </w:r>
+      <w:r>
+        <w:t xml:space="preserve"> aim of the</w:t>
+      </w:r>
+      <w:r>
+        <w:t xml:space="preserve"> tests </w:t>
+      </w:r>
+      <w:r>
+        <w:t>was</w:t>
+      </w:r>
+      <w:r>
+        <w:t xml:space="preserve"> </w:t>
+      </w:r>
+      <w:r>
+        <w:t>to gather information on how immersive, usable and functiona</w:t>
+      </w:r>
+      <w:r>
+        <w:t>l</w:t>
+      </w:r>
+      <w:r>
+        <w:t xml:space="preserve"> it was </w:t>
+      </w:r>
+      <w:r>
+        <w:t>during</w:t>
+      </w:r>
+      <w:r>
+        <w:t xml:space="preserve"> different </w:t>
+      </w:r>
+      <w:r>
+        <w:t xml:space="preserve">test </w:t>
+      </w:r>
+      <w:r>
+        <w:t>runs. Information gathered would then be used to evaluate</w:t>
+      </w:r>
+      <w:r>
+        <w:t xml:space="preserve"> </w:t>
+      </w:r>
+      <w:r>
+        <w:t>weaknesse</w:t>
+      </w:r>
+      <w:r>
+        <w:t>s, identify areas to</w:t>
+      </w:r>
+      <w:r>
+        <w:t xml:space="preserve"> improve and </w:t>
+      </w:r>
+      <w:r>
+        <w:t xml:space="preserve">gauge </w:t>
+      </w:r>
+      <w:r>
+        <w:t>how effective the information being taught was being received by testers. The following sections break down the tests completed</w:t>
+      </w:r>
+      <w:r>
+        <w:t xml:space="preserve">, </w:t>
+      </w:r>
+      <w:r>
+        <w:t>what observations were made and the evaluations reached to progress forward and achieve the aims and objectives set out at the start of this project.</w:t>
+      </w:r>
+    </w:p>
+    <w:p>
       <w:pPr>
         <w:pStyle w:val="Heading3"/>
       </w:pPr>
-      <w:bookmarkStart w:id="34" w:name="_Toc223789519"/>
+      <w:bookmarkStart w:id="34" w:name="_Toc223792482"/>
       <w:r>
         <w:t>Interaction</w:t>
       </w:r>
@@ -9439,7 +9398,7 @@
       <w:pPr>
         <w:pStyle w:val="Heading3"/>
       </w:pPr>
-      <w:bookmarkStart w:id="35" w:name="_Toc223789520"/>
+      <w:bookmarkStart w:id="35" w:name="_Toc223792483"/>
       <w:r>
         <w:t>User Attention Detection</w:t>
       </w:r>
@@ -9473,7 +9432,7 @@
       <w:pPr>
         <w:pStyle w:val="Heading3"/>
       </w:pPr>
-      <w:bookmarkStart w:id="36" w:name="_Toc223789521"/>
+      <w:bookmarkStart w:id="36" w:name="_Toc223792484"/>
       <w:r>
         <w:t>Symptom Simulations</w:t>
       </w:r>
@@ -9501,7 +9460,7 @@
       <w:pPr>
         <w:pStyle w:val="Heading3"/>
       </w:pPr>
-      <w:bookmarkStart w:id="37" w:name="_Toc223789522"/>
+      <w:bookmarkStart w:id="37" w:name="_Toc223792485"/>
       <w:r>
         <w:t>Strengths and Weaknesses</w:t>
       </w:r>
@@ -9511,7 +9470,7 @@
       <w:pPr>
         <w:pStyle w:val="Heading3"/>
       </w:pPr>
-      <w:bookmarkStart w:id="38" w:name="_Toc223789523"/>
+      <w:bookmarkStart w:id="38" w:name="_Toc223792486"/>
       <w:r>
         <w:t xml:space="preserve">Improvements to be </w:t>
       </w:r>
@@ -9528,7 +9487,7 @@
       <w:pPr>
         <w:pStyle w:val="Heading2"/>
       </w:pPr>
-      <w:bookmarkStart w:id="39" w:name="_Toc223789524"/>
+      <w:bookmarkStart w:id="39" w:name="_Toc223792487"/>
       <w:r>
         <w:lastRenderedPageBreak/>
         <w:t>Final Version Tests</w:t>
@@ -9542,7 +9501,7 @@
       <w:pPr>
         <w:pStyle w:val="Heading1"/>
       </w:pPr>
-      <w:bookmarkStart w:id="40" w:name="_Toc223789525"/>
+      <w:bookmarkStart w:id="40" w:name="_Toc223792488"/>
       <w:r>
         <w:lastRenderedPageBreak/>
         <w:t>Critical Evaluation</w:t>
@@ -9569,7 +9528,7 @@
       <w:pPr>
         <w:pStyle w:val="Heading1"/>
       </w:pPr>
-      <w:bookmarkStart w:id="41" w:name="_Toc223789526"/>
+      <w:bookmarkStart w:id="41" w:name="_Toc223792489"/>
       <w:r>
         <w:lastRenderedPageBreak/>
         <w:t>Conclusions and Future Work</w:t>
@@ -9619,7 +9578,7 @@
       <w:pPr>
         <w:pStyle w:val="Heading1"/>
       </w:pPr>
-      <w:bookmarkStart w:id="42" w:name="_Toc223789527"/>
+      <w:bookmarkStart w:id="42" w:name="_Toc223792490"/>
       <w:r>
         <w:lastRenderedPageBreak/>
         <w:t>References</w:t>
@@ -9627,23 +9586,9 @@
       <w:bookmarkEnd w:id="42"/>
     </w:p>
     <w:p>
-      <w:proofErr w:type="spellStart"/>
-      <w:r>
-        <w:t>Cantó</w:t>
-      </w:r>
-      <w:proofErr w:type="spellEnd"/>
-      <w:r>
-        <w:t xml:space="preserve">-Sancho, N., </w:t>
-      </w:r>
-      <w:proofErr w:type="spellStart"/>
-      <w:r>
-        <w:t>Porru</w:t>
-      </w:r>
-      <w:proofErr w:type="spellEnd"/>
-      <w:r>
-        <w:t xml:space="preserve">, S., Casati, S., Ronda, E., Seguí-Crespo, M. and Carta, A. (2023) ‘Prevalence and risk factors of computer vision syndrome—assessed in office workers by a validated questionnaire’. </w:t>
-      </w:r>
-      <w:proofErr w:type="spellStart"/>
+      <w:r>
+        <w:t xml:space="preserve">Cantó-Sancho, N., Porru, S., Casati, S., Ronda, E., Seguí-Crespo, M. and Carta, A. (2023) ‘Prevalence and risk factors of computer vision syndrome—assessed in office workers by a validated questionnaire’. </w:t>
+      </w:r>
       <w:r>
         <w:rPr>
           <w:i/>
@@ -9651,30 +9596,13 @@
         </w:rPr>
         <w:t>PeerJ</w:t>
       </w:r>
-      <w:proofErr w:type="spellEnd"/>
       <w:r>
         <w:t xml:space="preserve"> 11, p. e14937. Available at: https://www.researchgate.net/publication/369002899_Prevalence_and_risk_factors_of_computer_vision_syndrome-assessed_in_office_workers_by_a_validated_questionnaire (Accessed: 20 October 2025).</w:t>
       </w:r>
     </w:p>
     <w:p>
       <w:r>
-        <w:t xml:space="preserve">Chandrasekhara, R.S., Low, C., Lim, Y., Low, L., Mardina, F. and </w:t>
-      </w:r>
-      <w:proofErr w:type="spellStart"/>
-      <w:r>
-        <w:t>Nursaleha</w:t>
-      </w:r>
-      <w:proofErr w:type="spellEnd"/>
-      <w:r>
-        <w:t xml:space="preserve">, M. (2013) ‘Computer vision syndrome: a study of knowledge and practices in university </w:t>
-      </w:r>
-      <w:proofErr w:type="gramStart"/>
-      <w:r>
-        <w:t>students’</w:t>
-      </w:r>
-      <w:proofErr w:type="gramEnd"/>
-      <w:r>
-        <w:t xml:space="preserve">. </w:t>
+        <w:t xml:space="preserve">Chandrasekhara, R.S., Low, C., Lim, Y., Low, L., Mardina, F. and Nursaleha, M. (2013) ‘Computer vision syndrome: a study of knowledge and practices in university students’. </w:t>
       </w:r>
       <w:r>
         <w:rPr>
@@ -9700,15 +9628,7 @@
     </w:p>
     <w:p>
       <w:r>
-        <w:t xml:space="preserve">Muñoz, E.G., </w:t>
-      </w:r>
-      <w:proofErr w:type="spellStart"/>
-      <w:r>
-        <w:t>Fabregat</w:t>
-      </w:r>
-      <w:proofErr w:type="spellEnd"/>
-      <w:r>
-        <w:t xml:space="preserve">, R., Bacca-Acosta, J., Duque-Méndez, N. and Avila-Garzon, C. (2022) ‘Augmented Reality, Virtual Reality, and Game Technologies in Ophthalmology Training’. </w:t>
+        <w:t xml:space="preserve">Muñoz, E.G., Fabregat, R., Bacca-Acosta, J., Duque-Méndez, N. and Avila-Garzon, C. (2022) ‘Augmented Reality, Virtual Reality, and Game Technologies in Ophthalmology Training’. </w:t>
       </w:r>
       <w:r>
         <w:rPr>
@@ -9718,15 +9638,7 @@
         <w:t>Information</w:t>
       </w:r>
       <w:r>
-        <w:t xml:space="preserve"> 13(5), p. 222. </w:t>
-      </w:r>
-      <w:proofErr w:type="spellStart"/>
-      <w:r>
-        <w:t>doi</w:t>
-      </w:r>
-      <w:proofErr w:type="spellEnd"/>
-      <w:r>
-        <w:t xml:space="preserve">: </w:t>
+        <w:t xml:space="preserve"> 13(5), p. 222. doi: </w:t>
       </w:r>
       <w:hyperlink r:id="rId16" w:history="1">
         <w:r>
@@ -9742,33 +9654,12 @@
     </w:p>
     <w:p>
       <w:r>
-        <w:t xml:space="preserve">Orji, J., Hernandez, A., Selema, B. and Orji, R. (2022) ‘Virtual and augmented reality applications for promoting safety and security: A systematic review’., pp. 1–7. </w:t>
-      </w:r>
-      <w:proofErr w:type="spellStart"/>
-      <w:r>
-        <w:t>doi</w:t>
-      </w:r>
-      <w:proofErr w:type="spellEnd"/>
-      <w:r>
-        <w:t>: https://doi.org/10.1109/SEGAH54908.2022.9978597.</w:t>
-      </w:r>
-    </w:p>
-    <w:p>
-      <w:proofErr w:type="spellStart"/>
-      <w:r>
-        <w:t>Porcar</w:t>
-      </w:r>
-      <w:proofErr w:type="spellEnd"/>
-      <w:r>
-        <w:t xml:space="preserve">, E., Pons, A. and Lorente, A. (2016) ‘Visual and ocular effects from the use of flat-panel </w:t>
-      </w:r>
-      <w:proofErr w:type="gramStart"/>
-      <w:r>
-        <w:t>displays’</w:t>
-      </w:r>
-      <w:proofErr w:type="gramEnd"/>
-      <w:r>
-        <w:t xml:space="preserve">. </w:t>
+        <w:t>Orji, J., Hernandez, A., Selema, B. and Orji, R. (2022) ‘Virtual and augmented reality applications for promoting safety and security: A systematic review’., pp. 1–7. doi: https://doi.org/10.1109/SEGAH54908.2022.9978597.</w:t>
+      </w:r>
+    </w:p>
+    <w:p>
+      <w:r>
+        <w:t xml:space="preserve">Porcar, E., Pons, A. and Lorente, A. (2016) ‘Visual and ocular effects from the use of flat-panel displays’. </w:t>
       </w:r>
       <w:r>
         <w:rPr>
@@ -9783,23 +9674,7 @@
     </w:p>
     <w:p>
       <w:r>
-        <w:t xml:space="preserve">Santilli, T., Ceccacci, S., Mengoni, M. and Catia </w:t>
-      </w:r>
-      <w:proofErr w:type="spellStart"/>
-      <w:r>
-        <w:t>Giaconi</w:t>
-      </w:r>
-      <w:proofErr w:type="spellEnd"/>
-      <w:r>
-        <w:t xml:space="preserve"> (2025) ‘Virtual vs. traditional learning in higher education: A systematic review of comparative </w:t>
-      </w:r>
-      <w:proofErr w:type="gramStart"/>
-      <w:r>
-        <w:t>studies’</w:t>
-      </w:r>
-      <w:proofErr w:type="gramEnd"/>
-      <w:r>
-        <w:t xml:space="preserve">. </w:t>
+        <w:t xml:space="preserve">Santilli, T., Ceccacci, S., Mengoni, M. and Catia Giaconi (2025) ‘Virtual vs. traditional learning in higher education: A systematic review of comparative studies’. </w:t>
       </w:r>
       <w:r>
         <w:rPr>
@@ -9834,23 +9709,7 @@
     </w:p>
     <w:p>
       <w:r>
-        <w:t>Vieira, F., Oliveira, E. and Rodrigues, N. (2019) ‘</w:t>
-      </w:r>
-      <w:proofErr w:type="spellStart"/>
-      <w:r>
-        <w:t>iSVC</w:t>
-      </w:r>
-      <w:proofErr w:type="spellEnd"/>
-      <w:r>
-        <w:t xml:space="preserve"> – digital platform for detection and prevention of computer vision syndrome’., pp. 1–7. </w:t>
-      </w:r>
-      <w:proofErr w:type="spellStart"/>
-      <w:r>
-        <w:t>doi</w:t>
-      </w:r>
-      <w:proofErr w:type="spellEnd"/>
-      <w:r>
-        <w:t>: https://doi.org/10.1109/SeGAH.2019.8882438.</w:t>
+        <w:t>Vieira, F., Oliveira, E. and Rodrigues, N. (2019) ‘iSVC – digital platform for detection and prevention of computer vision syndrome’., pp. 1–7. doi: https://doi.org/10.1109/SeGAH.2019.8882438.</w:t>
       </w:r>
     </w:p>
     <w:p>
@@ -9865,28 +9724,12 @@
         <w:t>Annals of Emerging Technologies in Computing</w:t>
       </w:r>
       <w:r>
-        <w:t xml:space="preserve"> 9(3), pp. 50–68. </w:t>
-      </w:r>
-      <w:proofErr w:type="spellStart"/>
-      <w:r>
-        <w:t>doi</w:t>
-      </w:r>
-      <w:proofErr w:type="spellEnd"/>
-      <w:r>
-        <w:t>: https://doi.org/10.33166/aetic.2025.03.004.</w:t>
-      </w:r>
-    </w:p>
-    <w:p>
-      <w:r>
-        <w:t>Youcef, B., Ahmad, M.N. and Mustapha, M. (2021) ‘</w:t>
-      </w:r>
-      <w:proofErr w:type="spellStart"/>
-      <w:r>
-        <w:t>OntoPhaco</w:t>
-      </w:r>
-      <w:proofErr w:type="spellEnd"/>
-      <w:r>
-        <w:t xml:space="preserve">: An ontology for virtual reality training in ophthalmology Domain—A case study of cataract surgery’. </w:t>
+        <w:t xml:space="preserve"> 9(3), pp. 50–68. doi: https://doi.org/10.33166/aetic.2025.03.004.</w:t>
+      </w:r>
+    </w:p>
+    <w:p>
+      <w:r>
+        <w:t xml:space="preserve">Youcef, B., Ahmad, M.N. and Mustapha, M. (2021) ‘OntoPhaco: An ontology for virtual reality training in ophthalmology Domain—A case study of cataract surgery’. </w:t>
       </w:r>
       <w:r>
         <w:rPr>
@@ -9896,15 +9739,7 @@
         <w:t>IEEE Access</w:t>
       </w:r>
       <w:r>
-        <w:t xml:space="preserve"> 9, pp. 152347–152378. </w:t>
-      </w:r>
-      <w:proofErr w:type="spellStart"/>
-      <w:r>
-        <w:t>doi</w:t>
-      </w:r>
-      <w:proofErr w:type="spellEnd"/>
-      <w:r>
-        <w:t>: https://doi.org/10.1109/ACCESS.2021.3126697.</w:t>
+        <w:t xml:space="preserve"> 9, pp. 152347–152378. doi: https://doi.org/10.1109/ACCESS.2021.3126697.</w:t>
       </w:r>
     </w:p>
     <w:p/>
@@ -9912,7 +9747,7 @@
       <w:pPr>
         <w:pStyle w:val="Heading1"/>
       </w:pPr>
-      <w:bookmarkStart w:id="43" w:name="_Toc223789528"/>
+      <w:bookmarkStart w:id="43" w:name="_Toc223792491"/>
       <w:r>
         <w:lastRenderedPageBreak/>
         <w:t>Appendix</w:t>
@@ -9923,7 +9758,7 @@
       <w:pPr>
         <w:pStyle w:val="Heading2"/>
       </w:pPr>
-      <w:bookmarkStart w:id="44" w:name="_Toc223789529"/>
+      <w:bookmarkStart w:id="44" w:name="_Toc223792492"/>
       <w:r>
         <w:t>Asset Licenses and Sources</w:t>
       </w:r>
@@ -9933,7 +9768,7 @@
       <w:pPr>
         <w:pStyle w:val="Heading3"/>
       </w:pPr>
-      <w:bookmarkStart w:id="45" w:name="_Toc223789530"/>
+      <w:bookmarkStart w:id="45" w:name="_Toc223792493"/>
       <w:r>
         <w:t>Modern Office Table</w:t>
       </w:r>
@@ -10017,7 +9852,7 @@
       <w:pPr>
         <w:pStyle w:val="Heading3"/>
       </w:pPr>
-      <w:bookmarkStart w:id="46" w:name="_Toc223789531"/>
+      <w:bookmarkStart w:id="46" w:name="_Toc223792494"/>
       <w:r>
         <w:t>Free Studio Starter Pack</w:t>
       </w:r>
@@ -10101,7 +9936,7 @@
       <w:pPr>
         <w:pStyle w:val="Heading3"/>
       </w:pPr>
-      <w:bookmarkStart w:id="47" w:name="_Toc223789532"/>
+      <w:bookmarkStart w:id="47" w:name="_Toc223792495"/>
       <w:r>
         <w:t>General Desktop Bundle</w:t>
       </w:r>
@@ -10185,7 +10020,7 @@
       <w:pPr>
         <w:pStyle w:val="Heading3"/>
       </w:pPr>
-      <w:bookmarkStart w:id="48" w:name="_Toc223789533"/>
+      <w:bookmarkStart w:id="48" w:name="_Toc223792496"/>
       <w:r>
         <w:lastRenderedPageBreak/>
         <w:t>General Gaming Headset</w:t>
@@ -10270,7 +10105,7 @@
       <w:pPr>
         <w:pStyle w:val="Heading3"/>
       </w:pPr>
-      <w:bookmarkStart w:id="49" w:name="_Toc223789534"/>
+      <w:bookmarkStart w:id="49" w:name="_Toc223792497"/>
       <w:r>
         <w:t>General Gaming Chair</w:t>
       </w:r>
@@ -10354,7 +10189,7 @@
       <w:pPr>
         <w:pStyle w:val="Heading3"/>
       </w:pPr>
-      <w:bookmarkStart w:id="50" w:name="_Toc223789535"/>
+      <w:bookmarkStart w:id="50" w:name="_Toc223792498"/>
       <w:r>
         <w:t>Light Switch</w:t>
       </w:r>
@@ -10452,7 +10287,7 @@
       <w:pPr>
         <w:pStyle w:val="Heading3"/>
       </w:pPr>
-      <w:bookmarkStart w:id="51" w:name="_Toc223789536"/>
+      <w:bookmarkStart w:id="51" w:name="_Toc223792499"/>
       <w:r>
         <w:lastRenderedPageBreak/>
         <w:t>Materials for General PC setup</w:t>
@@ -10579,7 +10414,7 @@
       <w:pPr>
         <w:pStyle w:val="Heading3"/>
       </w:pPr>
-      <w:bookmarkStart w:id="52" w:name="_Toc223789537"/>
+      <w:bookmarkStart w:id="52" w:name="_Toc223792500"/>
       <w:r>
         <w:lastRenderedPageBreak/>
         <w:t>Monitor background image</w:t>
@@ -10675,25 +10510,12 @@
       <w:pPr>
         <w:pStyle w:val="Heading3"/>
       </w:pPr>
-      <w:bookmarkStart w:id="53" w:name="_Toc223789538"/>
+      <w:bookmarkStart w:id="53" w:name="_Toc223792501"/>
       <w:r>
         <w:lastRenderedPageBreak/>
-        <w:t xml:space="preserve">Button Hover </w:t>
-      </w:r>
-      <w:proofErr w:type="spellStart"/>
-      <w:r>
-        <w:t>Sfx</w:t>
-      </w:r>
-      <w:proofErr w:type="spellEnd"/>
-      <w:r>
-        <w:t xml:space="preserve"> by </w:t>
-      </w:r>
-      <w:proofErr w:type="spellStart"/>
-      <w:r>
-        <w:t>Fachii</w:t>
+        <w:t>Button Hover Sfx by Fachii</w:t>
       </w:r>
       <w:bookmarkEnd w:id="53"/>
-      <w:proofErr w:type="spellEnd"/>
     </w:p>
     <w:p>
       <w:r>
@@ -10788,36 +10610,14 @@
     </w:p>
     <w:p/>
     <w:p>
-      <w:bookmarkStart w:id="54" w:name="_Toc223789539"/>
+      <w:bookmarkStart w:id="54" w:name="_Toc223792502"/>
       <w:r>
         <w:rPr>
           <w:rStyle w:val="Heading3Char"/>
         </w:rPr>
-        <w:t xml:space="preserve">Button click </w:t>
-      </w:r>
-      <w:proofErr w:type="spellStart"/>
-      <w:r>
-        <w:rPr>
-          <w:rStyle w:val="Heading3Char"/>
-        </w:rPr>
-        <w:t>Sfx</w:t>
-      </w:r>
-      <w:proofErr w:type="spellEnd"/>
-      <w:r>
-        <w:rPr>
-          <w:rStyle w:val="Heading3Char"/>
-        </w:rPr>
-        <w:t xml:space="preserve"> by </w:t>
-      </w:r>
-      <w:proofErr w:type="spellStart"/>
-      <w:r>
-        <w:rPr>
-          <w:rStyle w:val="Heading3Char"/>
-        </w:rPr>
-        <w:t>AndrewEathan</w:t>
+        <w:t>Button click Sfx by AndrewEathan</w:t>
       </w:r>
       <w:bookmarkEnd w:id="54"/>
-      <w:proofErr w:type="spellEnd"/>
       <w:r>
         <w:t xml:space="preserve"> </w:t>
       </w:r>
@@ -10923,25 +10723,12 @@
       <w:pPr>
         <w:pStyle w:val="Heading3"/>
       </w:pPr>
-      <w:bookmarkStart w:id="55" w:name="_Toc223789540"/>
+      <w:bookmarkStart w:id="55" w:name="_Toc223792503"/>
       <w:r>
         <w:lastRenderedPageBreak/>
-        <w:t xml:space="preserve">Light Switch </w:t>
-      </w:r>
-      <w:proofErr w:type="gramStart"/>
-      <w:r>
-        <w:t>On</w:t>
-      </w:r>
-      <w:proofErr w:type="gramEnd"/>
-      <w:r>
-        <w:t xml:space="preserve"> </w:t>
-      </w:r>
-      <w:proofErr w:type="spellStart"/>
-      <w:r>
-        <w:t>Sfx</w:t>
+        <w:t>Light Switch On Sfx</w:t>
       </w:r>
       <w:bookmarkEnd w:id="55"/>
-      <w:proofErr w:type="spellEnd"/>
     </w:p>
     <w:p>
       <w:r>
@@ -11031,16 +10818,11 @@
       <w:pPr>
         <w:pStyle w:val="Heading3"/>
       </w:pPr>
-      <w:bookmarkStart w:id="56" w:name="_Toc223789541"/>
-      <w:r>
-        <w:t xml:space="preserve">Light Switch Off </w:t>
-      </w:r>
-      <w:proofErr w:type="spellStart"/>
-      <w:r>
-        <w:t>Sfx</w:t>
+      <w:bookmarkStart w:id="56" w:name="_Toc223792504"/>
+      <w:r>
+        <w:t>Light Switch Off Sfx</w:t>
       </w:r>
       <w:bookmarkEnd w:id="56"/>
-      <w:proofErr w:type="spellEnd"/>
     </w:p>
     <w:p>
       <w:r>

</xml_diff>

<commit_message>
Mapped out final version tests area, completed both introductory paragraphs in the testing section
</commit_message>
<xml_diff>
--- a/30077548Thesis.docx
+++ b/30077548Thesis.docx
@@ -236,7 +236,7 @@
           <w:r>
             <w:fldChar w:fldCharType="separate"/>
           </w:r>
-          <w:hyperlink w:anchor="_Toc223792448" w:history="1">
+          <w:hyperlink w:anchor="_Toc223794362" w:history="1">
             <w:r>
               <w:rPr>
                 <w:rStyle w:val="Hyperlink"/>
@@ -263,7 +263,7 @@
                 <w:noProof/>
                 <w:webHidden/>
               </w:rPr>
-              <w:instrText xml:space="preserve"> PAGEREF _Toc223792448 \h </w:instrText>
+              <w:instrText xml:space="preserve"> PAGEREF _Toc223794362 \h </w:instrText>
             </w:r>
             <w:r>
               <w:rPr>
@@ -308,7 +308,7 @@
               <w:lang w:eastAsia="en-GB"/>
             </w:rPr>
           </w:pPr>
-          <w:hyperlink w:anchor="_Toc223792449" w:history="1">
+          <w:hyperlink w:anchor="_Toc223794363" w:history="1">
             <w:r>
               <w:rPr>
                 <w:rStyle w:val="Hyperlink"/>
@@ -335,7 +335,7 @@
                 <w:noProof/>
                 <w:webHidden/>
               </w:rPr>
-              <w:instrText xml:space="preserve"> PAGEREF _Toc223792449 \h </w:instrText>
+              <w:instrText xml:space="preserve"> PAGEREF _Toc223794363 \h </w:instrText>
             </w:r>
             <w:r>
               <w:rPr>
@@ -380,7 +380,7 @@
               <w:lang w:eastAsia="en-GB"/>
             </w:rPr>
           </w:pPr>
-          <w:hyperlink w:anchor="_Toc223792450" w:history="1">
+          <w:hyperlink w:anchor="_Toc223794364" w:history="1">
             <w:r>
               <w:rPr>
                 <w:rStyle w:val="Hyperlink"/>
@@ -407,7 +407,7 @@
                 <w:noProof/>
                 <w:webHidden/>
               </w:rPr>
-              <w:instrText xml:space="preserve"> PAGEREF _Toc223792450 \h </w:instrText>
+              <w:instrText xml:space="preserve"> PAGEREF _Toc223794364 \h </w:instrText>
             </w:r>
             <w:r>
               <w:rPr>
@@ -452,7 +452,7 @@
               <w:lang w:eastAsia="en-GB"/>
             </w:rPr>
           </w:pPr>
-          <w:hyperlink w:anchor="_Toc223792451" w:history="1">
+          <w:hyperlink w:anchor="_Toc223794365" w:history="1">
             <w:r>
               <w:rPr>
                 <w:rStyle w:val="Hyperlink"/>
@@ -479,7 +479,7 @@
                 <w:noProof/>
                 <w:webHidden/>
               </w:rPr>
-              <w:instrText xml:space="preserve"> PAGEREF _Toc223792451 \h </w:instrText>
+              <w:instrText xml:space="preserve"> PAGEREF _Toc223794365 \h </w:instrText>
             </w:r>
             <w:r>
               <w:rPr>
@@ -524,7 +524,7 @@
               <w:lang w:eastAsia="en-GB"/>
             </w:rPr>
           </w:pPr>
-          <w:hyperlink w:anchor="_Toc223792452" w:history="1">
+          <w:hyperlink w:anchor="_Toc223794366" w:history="1">
             <w:r>
               <w:rPr>
                 <w:rStyle w:val="Hyperlink"/>
@@ -551,7 +551,7 @@
                 <w:noProof/>
                 <w:webHidden/>
               </w:rPr>
-              <w:instrText xml:space="preserve"> PAGEREF _Toc223792452 \h </w:instrText>
+              <w:instrText xml:space="preserve"> PAGEREF _Toc223794366 \h </w:instrText>
             </w:r>
             <w:r>
               <w:rPr>
@@ -596,7 +596,7 @@
               <w:lang w:eastAsia="en-GB"/>
             </w:rPr>
           </w:pPr>
-          <w:hyperlink w:anchor="_Toc223792453" w:history="1">
+          <w:hyperlink w:anchor="_Toc223794367" w:history="1">
             <w:r>
               <w:rPr>
                 <w:rStyle w:val="Hyperlink"/>
@@ -623,7 +623,7 @@
                 <w:noProof/>
                 <w:webHidden/>
               </w:rPr>
-              <w:instrText xml:space="preserve"> PAGEREF _Toc223792453 \h </w:instrText>
+              <w:instrText xml:space="preserve"> PAGEREF _Toc223794367 \h </w:instrText>
             </w:r>
             <w:r>
               <w:rPr>
@@ -668,7 +668,7 @@
               <w:lang w:eastAsia="en-GB"/>
             </w:rPr>
           </w:pPr>
-          <w:hyperlink w:anchor="_Toc223792454" w:history="1">
+          <w:hyperlink w:anchor="_Toc223794368" w:history="1">
             <w:r>
               <w:rPr>
                 <w:rStyle w:val="Hyperlink"/>
@@ -695,7 +695,7 @@
                 <w:noProof/>
                 <w:webHidden/>
               </w:rPr>
-              <w:instrText xml:space="preserve"> PAGEREF _Toc223792454 \h </w:instrText>
+              <w:instrText xml:space="preserve"> PAGEREF _Toc223794368 \h </w:instrText>
             </w:r>
             <w:r>
               <w:rPr>
@@ -740,7 +740,7 @@
               <w:lang w:eastAsia="en-GB"/>
             </w:rPr>
           </w:pPr>
-          <w:hyperlink w:anchor="_Toc223792455" w:history="1">
+          <w:hyperlink w:anchor="_Toc223794369" w:history="1">
             <w:r>
               <w:rPr>
                 <w:rStyle w:val="Hyperlink"/>
@@ -767,7 +767,7 @@
                 <w:noProof/>
                 <w:webHidden/>
               </w:rPr>
-              <w:instrText xml:space="preserve"> PAGEREF _Toc223792455 \h </w:instrText>
+              <w:instrText xml:space="preserve"> PAGEREF _Toc223794369 \h </w:instrText>
             </w:r>
             <w:r>
               <w:rPr>
@@ -812,7 +812,7 @@
               <w:lang w:eastAsia="en-GB"/>
             </w:rPr>
           </w:pPr>
-          <w:hyperlink w:anchor="_Toc223792456" w:history="1">
+          <w:hyperlink w:anchor="_Toc223794370" w:history="1">
             <w:r>
               <w:rPr>
                 <w:rStyle w:val="Hyperlink"/>
@@ -839,7 +839,7 @@
                 <w:noProof/>
                 <w:webHidden/>
               </w:rPr>
-              <w:instrText xml:space="preserve"> PAGEREF _Toc223792456 \h </w:instrText>
+              <w:instrText xml:space="preserve"> PAGEREF _Toc223794370 \h </w:instrText>
             </w:r>
             <w:r>
               <w:rPr>
@@ -884,7 +884,7 @@
               <w:lang w:eastAsia="en-GB"/>
             </w:rPr>
           </w:pPr>
-          <w:hyperlink w:anchor="_Toc223792457" w:history="1">
+          <w:hyperlink w:anchor="_Toc223794371" w:history="1">
             <w:r>
               <w:rPr>
                 <w:rStyle w:val="Hyperlink"/>
@@ -911,7 +911,7 @@
                 <w:noProof/>
                 <w:webHidden/>
               </w:rPr>
-              <w:instrText xml:space="preserve"> PAGEREF _Toc223792457 \h </w:instrText>
+              <w:instrText xml:space="preserve"> PAGEREF _Toc223794371 \h </w:instrText>
             </w:r>
             <w:r>
               <w:rPr>
@@ -956,7 +956,7 @@
               <w:lang w:eastAsia="en-GB"/>
             </w:rPr>
           </w:pPr>
-          <w:hyperlink w:anchor="_Toc223792458" w:history="1">
+          <w:hyperlink w:anchor="_Toc223794372" w:history="1">
             <w:r>
               <w:rPr>
                 <w:rStyle w:val="Hyperlink"/>
@@ -983,7 +983,7 @@
                 <w:noProof/>
                 <w:webHidden/>
               </w:rPr>
-              <w:instrText xml:space="preserve"> PAGEREF _Toc223792458 \h </w:instrText>
+              <w:instrText xml:space="preserve"> PAGEREF _Toc223794372 \h </w:instrText>
             </w:r>
             <w:r>
               <w:rPr>
@@ -1028,7 +1028,7 @@
               <w:lang w:eastAsia="en-GB"/>
             </w:rPr>
           </w:pPr>
-          <w:hyperlink w:anchor="_Toc223792459" w:history="1">
+          <w:hyperlink w:anchor="_Toc223794373" w:history="1">
             <w:r>
               <w:rPr>
                 <w:rStyle w:val="Hyperlink"/>
@@ -1055,7 +1055,7 @@
                 <w:noProof/>
                 <w:webHidden/>
               </w:rPr>
-              <w:instrText xml:space="preserve"> PAGEREF _Toc223792459 \h </w:instrText>
+              <w:instrText xml:space="preserve"> PAGEREF _Toc223794373 \h </w:instrText>
             </w:r>
             <w:r>
               <w:rPr>
@@ -1100,7 +1100,7 @@
               <w:lang w:eastAsia="en-GB"/>
             </w:rPr>
           </w:pPr>
-          <w:hyperlink w:anchor="_Toc223792460" w:history="1">
+          <w:hyperlink w:anchor="_Toc223794374" w:history="1">
             <w:r>
               <w:rPr>
                 <w:rStyle w:val="Hyperlink"/>
@@ -1127,7 +1127,7 @@
                 <w:noProof/>
                 <w:webHidden/>
               </w:rPr>
-              <w:instrText xml:space="preserve"> PAGEREF _Toc223792460 \h </w:instrText>
+              <w:instrText xml:space="preserve"> PAGEREF _Toc223794374 \h </w:instrText>
             </w:r>
             <w:r>
               <w:rPr>
@@ -1172,7 +1172,7 @@
               <w:lang w:eastAsia="en-GB"/>
             </w:rPr>
           </w:pPr>
-          <w:hyperlink w:anchor="_Toc223792461" w:history="1">
+          <w:hyperlink w:anchor="_Toc223794375" w:history="1">
             <w:r>
               <w:rPr>
                 <w:rStyle w:val="Hyperlink"/>
@@ -1199,7 +1199,7 @@
                 <w:noProof/>
                 <w:webHidden/>
               </w:rPr>
-              <w:instrText xml:space="preserve"> PAGEREF _Toc223792461 \h </w:instrText>
+              <w:instrText xml:space="preserve"> PAGEREF _Toc223794375 \h </w:instrText>
             </w:r>
             <w:r>
               <w:rPr>
@@ -1244,7 +1244,7 @@
               <w:lang w:eastAsia="en-GB"/>
             </w:rPr>
           </w:pPr>
-          <w:hyperlink w:anchor="_Toc223792462" w:history="1">
+          <w:hyperlink w:anchor="_Toc223794376" w:history="1">
             <w:r>
               <w:rPr>
                 <w:rStyle w:val="Hyperlink"/>
@@ -1271,7 +1271,7 @@
                 <w:noProof/>
                 <w:webHidden/>
               </w:rPr>
-              <w:instrText xml:space="preserve"> PAGEREF _Toc223792462 \h </w:instrText>
+              <w:instrText xml:space="preserve"> PAGEREF _Toc223794376 \h </w:instrText>
             </w:r>
             <w:r>
               <w:rPr>
@@ -1316,7 +1316,7 @@
               <w:lang w:eastAsia="en-GB"/>
             </w:rPr>
           </w:pPr>
-          <w:hyperlink w:anchor="_Toc223792463" w:history="1">
+          <w:hyperlink w:anchor="_Toc223794377" w:history="1">
             <w:r>
               <w:rPr>
                 <w:rStyle w:val="Hyperlink"/>
@@ -1343,7 +1343,7 @@
                 <w:noProof/>
                 <w:webHidden/>
               </w:rPr>
-              <w:instrText xml:space="preserve"> PAGEREF _Toc223792463 \h </w:instrText>
+              <w:instrText xml:space="preserve"> PAGEREF _Toc223794377 \h </w:instrText>
             </w:r>
             <w:r>
               <w:rPr>
@@ -1388,7 +1388,7 @@
               <w:lang w:eastAsia="en-GB"/>
             </w:rPr>
           </w:pPr>
-          <w:hyperlink w:anchor="_Toc223792464" w:history="1">
+          <w:hyperlink w:anchor="_Toc223794378" w:history="1">
             <w:r>
               <w:rPr>
                 <w:rStyle w:val="Hyperlink"/>
@@ -1415,7 +1415,7 @@
                 <w:noProof/>
                 <w:webHidden/>
               </w:rPr>
-              <w:instrText xml:space="preserve"> PAGEREF _Toc223792464 \h </w:instrText>
+              <w:instrText xml:space="preserve"> PAGEREF _Toc223794378 \h </w:instrText>
             </w:r>
             <w:r>
               <w:rPr>
@@ -1460,7 +1460,7 @@
               <w:lang w:eastAsia="en-GB"/>
             </w:rPr>
           </w:pPr>
-          <w:hyperlink w:anchor="_Toc223792465" w:history="1">
+          <w:hyperlink w:anchor="_Toc223794379" w:history="1">
             <w:r>
               <w:rPr>
                 <w:rStyle w:val="Hyperlink"/>
@@ -1487,7 +1487,7 @@
                 <w:noProof/>
                 <w:webHidden/>
               </w:rPr>
-              <w:instrText xml:space="preserve"> PAGEREF _Toc223792465 \h </w:instrText>
+              <w:instrText xml:space="preserve"> PAGEREF _Toc223794379 \h </w:instrText>
             </w:r>
             <w:r>
               <w:rPr>
@@ -1532,7 +1532,7 @@
               <w:lang w:eastAsia="en-GB"/>
             </w:rPr>
           </w:pPr>
-          <w:hyperlink w:anchor="_Toc223792466" w:history="1">
+          <w:hyperlink w:anchor="_Toc223794380" w:history="1">
             <w:r>
               <w:rPr>
                 <w:rStyle w:val="Hyperlink"/>
@@ -1559,7 +1559,7 @@
                 <w:noProof/>
                 <w:webHidden/>
               </w:rPr>
-              <w:instrText xml:space="preserve"> PAGEREF _Toc223792466 \h </w:instrText>
+              <w:instrText xml:space="preserve"> PAGEREF _Toc223794380 \h </w:instrText>
             </w:r>
             <w:r>
               <w:rPr>
@@ -1604,7 +1604,7 @@
               <w:lang w:eastAsia="en-GB"/>
             </w:rPr>
           </w:pPr>
-          <w:hyperlink w:anchor="_Toc223792467" w:history="1">
+          <w:hyperlink w:anchor="_Toc223794381" w:history="1">
             <w:r>
               <w:rPr>
                 <w:rStyle w:val="Hyperlink"/>
@@ -1631,7 +1631,7 @@
                 <w:noProof/>
                 <w:webHidden/>
               </w:rPr>
-              <w:instrText xml:space="preserve"> PAGEREF _Toc223792467 \h </w:instrText>
+              <w:instrText xml:space="preserve"> PAGEREF _Toc223794381 \h </w:instrText>
             </w:r>
             <w:r>
               <w:rPr>
@@ -1676,7 +1676,7 @@
               <w:lang w:eastAsia="en-GB"/>
             </w:rPr>
           </w:pPr>
-          <w:hyperlink w:anchor="_Toc223792468" w:history="1">
+          <w:hyperlink w:anchor="_Toc223794382" w:history="1">
             <w:r>
               <w:rPr>
                 <w:rStyle w:val="Hyperlink"/>
@@ -1703,7 +1703,7 @@
                 <w:noProof/>
                 <w:webHidden/>
               </w:rPr>
-              <w:instrText xml:space="preserve"> PAGEREF _Toc223792468 \h </w:instrText>
+              <w:instrText xml:space="preserve"> PAGEREF _Toc223794382 \h </w:instrText>
             </w:r>
             <w:r>
               <w:rPr>
@@ -1748,7 +1748,7 @@
               <w:lang w:eastAsia="en-GB"/>
             </w:rPr>
           </w:pPr>
-          <w:hyperlink w:anchor="_Toc223792469" w:history="1">
+          <w:hyperlink w:anchor="_Toc223794383" w:history="1">
             <w:r>
               <w:rPr>
                 <w:rStyle w:val="Hyperlink"/>
@@ -1775,7 +1775,7 @@
                 <w:noProof/>
                 <w:webHidden/>
               </w:rPr>
-              <w:instrText xml:space="preserve"> PAGEREF _Toc223792469 \h </w:instrText>
+              <w:instrText xml:space="preserve"> PAGEREF _Toc223794383 \h </w:instrText>
             </w:r>
             <w:r>
               <w:rPr>
@@ -1820,7 +1820,7 @@
               <w:lang w:eastAsia="en-GB"/>
             </w:rPr>
           </w:pPr>
-          <w:hyperlink w:anchor="_Toc223792470" w:history="1">
+          <w:hyperlink w:anchor="_Toc223794384" w:history="1">
             <w:r>
               <w:rPr>
                 <w:rStyle w:val="Hyperlink"/>
@@ -1847,7 +1847,7 @@
                 <w:noProof/>
                 <w:webHidden/>
               </w:rPr>
-              <w:instrText xml:space="preserve"> PAGEREF _Toc223792470 \h </w:instrText>
+              <w:instrText xml:space="preserve"> PAGEREF _Toc223794384 \h </w:instrText>
             </w:r>
             <w:r>
               <w:rPr>
@@ -1892,7 +1892,7 @@
               <w:lang w:eastAsia="en-GB"/>
             </w:rPr>
           </w:pPr>
-          <w:hyperlink w:anchor="_Toc223792471" w:history="1">
+          <w:hyperlink w:anchor="_Toc223794385" w:history="1">
             <w:r>
               <w:rPr>
                 <w:rStyle w:val="Hyperlink"/>
@@ -1919,7 +1919,7 @@
                 <w:noProof/>
                 <w:webHidden/>
               </w:rPr>
-              <w:instrText xml:space="preserve"> PAGEREF _Toc223792471 \h </w:instrText>
+              <w:instrText xml:space="preserve"> PAGEREF _Toc223794385 \h </w:instrText>
             </w:r>
             <w:r>
               <w:rPr>
@@ -1964,7 +1964,7 @@
               <w:lang w:eastAsia="en-GB"/>
             </w:rPr>
           </w:pPr>
-          <w:hyperlink w:anchor="_Toc223792472" w:history="1">
+          <w:hyperlink w:anchor="_Toc223794386" w:history="1">
             <w:r>
               <w:rPr>
                 <w:rStyle w:val="Hyperlink"/>
@@ -1991,7 +1991,7 @@
                 <w:noProof/>
                 <w:webHidden/>
               </w:rPr>
-              <w:instrText xml:space="preserve"> PAGEREF _Toc223792472 \h </w:instrText>
+              <w:instrText xml:space="preserve"> PAGEREF _Toc223794386 \h </w:instrText>
             </w:r>
             <w:r>
               <w:rPr>
@@ -2036,7 +2036,7 @@
               <w:lang w:eastAsia="en-GB"/>
             </w:rPr>
           </w:pPr>
-          <w:hyperlink w:anchor="_Toc223792473" w:history="1">
+          <w:hyperlink w:anchor="_Toc223794387" w:history="1">
             <w:r>
               <w:rPr>
                 <w:rStyle w:val="Hyperlink"/>
@@ -2063,7 +2063,7 @@
                 <w:noProof/>
                 <w:webHidden/>
               </w:rPr>
-              <w:instrText xml:space="preserve"> PAGEREF _Toc223792473 \h </w:instrText>
+              <w:instrText xml:space="preserve"> PAGEREF _Toc223794387 \h </w:instrText>
             </w:r>
             <w:r>
               <w:rPr>
@@ -2108,7 +2108,7 @@
               <w:lang w:eastAsia="en-GB"/>
             </w:rPr>
           </w:pPr>
-          <w:hyperlink w:anchor="_Toc223792474" w:history="1">
+          <w:hyperlink w:anchor="_Toc223794388" w:history="1">
             <w:r>
               <w:rPr>
                 <w:rStyle w:val="Hyperlink"/>
@@ -2135,7 +2135,7 @@
                 <w:noProof/>
                 <w:webHidden/>
               </w:rPr>
-              <w:instrText xml:space="preserve"> PAGEREF _Toc223792474 \h </w:instrText>
+              <w:instrText xml:space="preserve"> PAGEREF _Toc223794388 \h </w:instrText>
             </w:r>
             <w:r>
               <w:rPr>
@@ -2180,7 +2180,7 @@
               <w:lang w:eastAsia="en-GB"/>
             </w:rPr>
           </w:pPr>
-          <w:hyperlink w:anchor="_Toc223792475" w:history="1">
+          <w:hyperlink w:anchor="_Toc223794389" w:history="1">
             <w:r>
               <w:rPr>
                 <w:rStyle w:val="Hyperlink"/>
@@ -2207,7 +2207,7 @@
                 <w:noProof/>
                 <w:webHidden/>
               </w:rPr>
-              <w:instrText xml:space="preserve"> PAGEREF _Toc223792475 \h </w:instrText>
+              <w:instrText xml:space="preserve"> PAGEREF _Toc223794389 \h </w:instrText>
             </w:r>
             <w:r>
               <w:rPr>
@@ -2252,7 +2252,7 @@
               <w:lang w:eastAsia="en-GB"/>
             </w:rPr>
           </w:pPr>
-          <w:hyperlink w:anchor="_Toc223792476" w:history="1">
+          <w:hyperlink w:anchor="_Toc223794390" w:history="1">
             <w:r>
               <w:rPr>
                 <w:rStyle w:val="Hyperlink"/>
@@ -2279,7 +2279,7 @@
                 <w:noProof/>
                 <w:webHidden/>
               </w:rPr>
-              <w:instrText xml:space="preserve"> PAGEREF _Toc223792476 \h </w:instrText>
+              <w:instrText xml:space="preserve"> PAGEREF _Toc223794390 \h </w:instrText>
             </w:r>
             <w:r>
               <w:rPr>
@@ -2324,7 +2324,7 @@
               <w:lang w:eastAsia="en-GB"/>
             </w:rPr>
           </w:pPr>
-          <w:hyperlink w:anchor="_Toc223792477" w:history="1">
+          <w:hyperlink w:anchor="_Toc223794391" w:history="1">
             <w:r>
               <w:rPr>
                 <w:rStyle w:val="Hyperlink"/>
@@ -2351,7 +2351,7 @@
                 <w:noProof/>
                 <w:webHidden/>
               </w:rPr>
-              <w:instrText xml:space="preserve"> PAGEREF _Toc223792477 \h </w:instrText>
+              <w:instrText xml:space="preserve"> PAGEREF _Toc223794391 \h </w:instrText>
             </w:r>
             <w:r>
               <w:rPr>
@@ -2396,7 +2396,7 @@
               <w:lang w:eastAsia="en-GB"/>
             </w:rPr>
           </w:pPr>
-          <w:hyperlink w:anchor="_Toc223792478" w:history="1">
+          <w:hyperlink w:anchor="_Toc223794392" w:history="1">
             <w:r>
               <w:rPr>
                 <w:rStyle w:val="Hyperlink"/>
@@ -2423,7 +2423,7 @@
                 <w:noProof/>
                 <w:webHidden/>
               </w:rPr>
-              <w:instrText xml:space="preserve"> PAGEREF _Toc223792478 \h </w:instrText>
+              <w:instrText xml:space="preserve"> PAGEREF _Toc223794392 \h </w:instrText>
             </w:r>
             <w:r>
               <w:rPr>
@@ -2468,7 +2468,7 @@
               <w:lang w:eastAsia="en-GB"/>
             </w:rPr>
           </w:pPr>
-          <w:hyperlink w:anchor="_Toc223792479" w:history="1">
+          <w:hyperlink w:anchor="_Toc223794393" w:history="1">
             <w:r>
               <w:rPr>
                 <w:rStyle w:val="Hyperlink"/>
@@ -2495,7 +2495,7 @@
                 <w:noProof/>
                 <w:webHidden/>
               </w:rPr>
-              <w:instrText xml:space="preserve"> PAGEREF _Toc223792479 \h </w:instrText>
+              <w:instrText xml:space="preserve"> PAGEREF _Toc223794393 \h </w:instrText>
             </w:r>
             <w:r>
               <w:rPr>
@@ -2540,7 +2540,7 @@
               <w:lang w:eastAsia="en-GB"/>
             </w:rPr>
           </w:pPr>
-          <w:hyperlink w:anchor="_Toc223792480" w:history="1">
+          <w:hyperlink w:anchor="_Toc223794394" w:history="1">
             <w:r>
               <w:rPr>
                 <w:rStyle w:val="Hyperlink"/>
@@ -2567,7 +2567,7 @@
                 <w:noProof/>
                 <w:webHidden/>
               </w:rPr>
-              <w:instrText xml:space="preserve"> PAGEREF _Toc223792480 \h </w:instrText>
+              <w:instrText xml:space="preserve"> PAGEREF _Toc223794394 \h </w:instrText>
             </w:r>
             <w:r>
               <w:rPr>
@@ -2612,7 +2612,7 @@
               <w:lang w:eastAsia="en-GB"/>
             </w:rPr>
           </w:pPr>
-          <w:hyperlink w:anchor="_Toc223792481" w:history="1">
+          <w:hyperlink w:anchor="_Toc223794395" w:history="1">
             <w:r>
               <w:rPr>
                 <w:rStyle w:val="Hyperlink"/>
@@ -2639,7 +2639,7 @@
                 <w:noProof/>
                 <w:webHidden/>
               </w:rPr>
-              <w:instrText xml:space="preserve"> PAGEREF _Toc223792481 \h </w:instrText>
+              <w:instrText xml:space="preserve"> PAGEREF _Toc223794395 \h </w:instrText>
             </w:r>
             <w:r>
               <w:rPr>
@@ -2684,7 +2684,7 @@
               <w:lang w:eastAsia="en-GB"/>
             </w:rPr>
           </w:pPr>
-          <w:hyperlink w:anchor="_Toc223792482" w:history="1">
+          <w:hyperlink w:anchor="_Toc223794396" w:history="1">
             <w:r>
               <w:rPr>
                 <w:rStyle w:val="Hyperlink"/>
@@ -2711,7 +2711,7 @@
                 <w:noProof/>
                 <w:webHidden/>
               </w:rPr>
-              <w:instrText xml:space="preserve"> PAGEREF _Toc223792482 \h </w:instrText>
+              <w:instrText xml:space="preserve"> PAGEREF _Toc223794396 \h </w:instrText>
             </w:r>
             <w:r>
               <w:rPr>
@@ -2756,7 +2756,7 @@
               <w:lang w:eastAsia="en-GB"/>
             </w:rPr>
           </w:pPr>
-          <w:hyperlink w:anchor="_Toc223792483" w:history="1">
+          <w:hyperlink w:anchor="_Toc223794397" w:history="1">
             <w:r>
               <w:rPr>
                 <w:rStyle w:val="Hyperlink"/>
@@ -2783,7 +2783,7 @@
                 <w:noProof/>
                 <w:webHidden/>
               </w:rPr>
-              <w:instrText xml:space="preserve"> PAGEREF _Toc223792483 \h </w:instrText>
+              <w:instrText xml:space="preserve"> PAGEREF _Toc223794397 \h </w:instrText>
             </w:r>
             <w:r>
               <w:rPr>
@@ -2828,7 +2828,7 @@
               <w:lang w:eastAsia="en-GB"/>
             </w:rPr>
           </w:pPr>
-          <w:hyperlink w:anchor="_Toc223792484" w:history="1">
+          <w:hyperlink w:anchor="_Toc223794398" w:history="1">
             <w:r>
               <w:rPr>
                 <w:rStyle w:val="Hyperlink"/>
@@ -2855,7 +2855,7 @@
                 <w:noProof/>
                 <w:webHidden/>
               </w:rPr>
-              <w:instrText xml:space="preserve"> PAGEREF _Toc223792484 \h </w:instrText>
+              <w:instrText xml:space="preserve"> PAGEREF _Toc223794398 \h </w:instrText>
             </w:r>
             <w:r>
               <w:rPr>
@@ -2900,7 +2900,7 @@
               <w:lang w:eastAsia="en-GB"/>
             </w:rPr>
           </w:pPr>
-          <w:hyperlink w:anchor="_Toc223792485" w:history="1">
+          <w:hyperlink w:anchor="_Toc223794399" w:history="1">
             <w:r>
               <w:rPr>
                 <w:rStyle w:val="Hyperlink"/>
@@ -2927,7 +2927,7 @@
                 <w:noProof/>
                 <w:webHidden/>
               </w:rPr>
-              <w:instrText xml:space="preserve"> PAGEREF _Toc223792485 \h </w:instrText>
+              <w:instrText xml:space="preserve"> PAGEREF _Toc223794399 \h </w:instrText>
             </w:r>
             <w:r>
               <w:rPr>
@@ -2972,7 +2972,7 @@
               <w:lang w:eastAsia="en-GB"/>
             </w:rPr>
           </w:pPr>
-          <w:hyperlink w:anchor="_Toc223792486" w:history="1">
+          <w:hyperlink w:anchor="_Toc223794400" w:history="1">
             <w:r>
               <w:rPr>
                 <w:rStyle w:val="Hyperlink"/>
@@ -2999,7 +2999,7 @@
                 <w:noProof/>
                 <w:webHidden/>
               </w:rPr>
-              <w:instrText xml:space="preserve"> PAGEREF _Toc223792486 \h </w:instrText>
+              <w:instrText xml:space="preserve"> PAGEREF _Toc223794400 \h </w:instrText>
             </w:r>
             <w:r>
               <w:rPr>
@@ -3044,7 +3044,7 @@
               <w:lang w:eastAsia="en-GB"/>
             </w:rPr>
           </w:pPr>
-          <w:hyperlink w:anchor="_Toc223792487" w:history="1">
+          <w:hyperlink w:anchor="_Toc223794401" w:history="1">
             <w:r>
               <w:rPr>
                 <w:rStyle w:val="Hyperlink"/>
@@ -3071,7 +3071,223 @@
                 <w:noProof/>
                 <w:webHidden/>
               </w:rPr>
-              <w:instrText xml:space="preserve"> PAGEREF _Toc223792487 \h </w:instrText>
+              <w:instrText xml:space="preserve"> PAGEREF _Toc223794401 \h </w:instrText>
+            </w:r>
+            <w:r>
+              <w:rPr>
+                <w:noProof/>
+                <w:webHidden/>
+              </w:rPr>
+            </w:r>
+            <w:r>
+              <w:rPr>
+                <w:noProof/>
+                <w:webHidden/>
+              </w:rPr>
+              <w:fldChar w:fldCharType="separate"/>
+            </w:r>
+            <w:r>
+              <w:rPr>
+                <w:noProof/>
+                <w:webHidden/>
+              </w:rPr>
+              <w:t>21</w:t>
+            </w:r>
+            <w:r>
+              <w:rPr>
+                <w:noProof/>
+                <w:webHidden/>
+              </w:rPr>
+              <w:fldChar w:fldCharType="end"/>
+            </w:r>
+          </w:hyperlink>
+        </w:p>
+        <w:p>
+          <w:pPr>
+            <w:pStyle w:val="TOC3"/>
+            <w:tabs>
+              <w:tab w:val="right" w:leader="dot" w:pos="9016"/>
+            </w:tabs>
+            <w:rPr>
+              <w:rFonts w:eastAsiaTheme="minorEastAsia"/>
+              <w:noProof/>
+              <w:sz w:val="24"/>
+              <w:szCs w:val="24"/>
+              <w:lang w:eastAsia="en-GB"/>
+            </w:rPr>
+          </w:pPr>
+          <w:hyperlink w:anchor="_Toc223794402" w:history="1">
+            <w:r>
+              <w:rPr>
+                <w:rStyle w:val="Hyperlink"/>
+                <w:noProof/>
+              </w:rPr>
+              <w:t>Interaction Objects and Objective Understanding</w:t>
+            </w:r>
+            <w:r>
+              <w:rPr>
+                <w:noProof/>
+                <w:webHidden/>
+              </w:rPr>
+              <w:tab/>
+            </w:r>
+            <w:r>
+              <w:rPr>
+                <w:noProof/>
+                <w:webHidden/>
+              </w:rPr>
+              <w:fldChar w:fldCharType="begin"/>
+            </w:r>
+            <w:r>
+              <w:rPr>
+                <w:noProof/>
+                <w:webHidden/>
+              </w:rPr>
+              <w:instrText xml:space="preserve"> PAGEREF _Toc223794402 \h </w:instrText>
+            </w:r>
+            <w:r>
+              <w:rPr>
+                <w:noProof/>
+                <w:webHidden/>
+              </w:rPr>
+            </w:r>
+            <w:r>
+              <w:rPr>
+                <w:noProof/>
+                <w:webHidden/>
+              </w:rPr>
+              <w:fldChar w:fldCharType="separate"/>
+            </w:r>
+            <w:r>
+              <w:rPr>
+                <w:noProof/>
+                <w:webHidden/>
+              </w:rPr>
+              <w:t>22</w:t>
+            </w:r>
+            <w:r>
+              <w:rPr>
+                <w:noProof/>
+                <w:webHidden/>
+              </w:rPr>
+              <w:fldChar w:fldCharType="end"/>
+            </w:r>
+          </w:hyperlink>
+        </w:p>
+        <w:p>
+          <w:pPr>
+            <w:pStyle w:val="TOC3"/>
+            <w:tabs>
+              <w:tab w:val="right" w:leader="dot" w:pos="9016"/>
+            </w:tabs>
+            <w:rPr>
+              <w:rFonts w:eastAsiaTheme="minorEastAsia"/>
+              <w:noProof/>
+              <w:sz w:val="24"/>
+              <w:szCs w:val="24"/>
+              <w:lang w:eastAsia="en-GB"/>
+            </w:rPr>
+          </w:pPr>
+          <w:hyperlink w:anchor="_Toc223794403" w:history="1">
+            <w:r>
+              <w:rPr>
+                <w:rStyle w:val="Hyperlink"/>
+                <w:noProof/>
+              </w:rPr>
+              <w:t>User Attention Detection</w:t>
+            </w:r>
+            <w:r>
+              <w:rPr>
+                <w:noProof/>
+                <w:webHidden/>
+              </w:rPr>
+              <w:tab/>
+            </w:r>
+            <w:r>
+              <w:rPr>
+                <w:noProof/>
+                <w:webHidden/>
+              </w:rPr>
+              <w:fldChar w:fldCharType="begin"/>
+            </w:r>
+            <w:r>
+              <w:rPr>
+                <w:noProof/>
+                <w:webHidden/>
+              </w:rPr>
+              <w:instrText xml:space="preserve"> PAGEREF _Toc223794403 \h </w:instrText>
+            </w:r>
+            <w:r>
+              <w:rPr>
+                <w:noProof/>
+                <w:webHidden/>
+              </w:rPr>
+            </w:r>
+            <w:r>
+              <w:rPr>
+                <w:noProof/>
+                <w:webHidden/>
+              </w:rPr>
+              <w:fldChar w:fldCharType="separate"/>
+            </w:r>
+            <w:r>
+              <w:rPr>
+                <w:noProof/>
+                <w:webHidden/>
+              </w:rPr>
+              <w:t>22</w:t>
+            </w:r>
+            <w:r>
+              <w:rPr>
+                <w:noProof/>
+                <w:webHidden/>
+              </w:rPr>
+              <w:fldChar w:fldCharType="end"/>
+            </w:r>
+          </w:hyperlink>
+        </w:p>
+        <w:p>
+          <w:pPr>
+            <w:pStyle w:val="TOC3"/>
+            <w:tabs>
+              <w:tab w:val="right" w:leader="dot" w:pos="9016"/>
+            </w:tabs>
+            <w:rPr>
+              <w:rFonts w:eastAsiaTheme="minorEastAsia"/>
+              <w:noProof/>
+              <w:sz w:val="24"/>
+              <w:szCs w:val="24"/>
+              <w:lang w:eastAsia="en-GB"/>
+            </w:rPr>
+          </w:pPr>
+          <w:hyperlink w:anchor="_Toc223794404" w:history="1">
+            <w:r>
+              <w:rPr>
+                <w:rStyle w:val="Hyperlink"/>
+                <w:noProof/>
+              </w:rPr>
+              <w:t>Symptom Simulations</w:t>
+            </w:r>
+            <w:r>
+              <w:rPr>
+                <w:noProof/>
+                <w:webHidden/>
+              </w:rPr>
+              <w:tab/>
+            </w:r>
+            <w:r>
+              <w:rPr>
+                <w:noProof/>
+                <w:webHidden/>
+              </w:rPr>
+              <w:fldChar w:fldCharType="begin"/>
+            </w:r>
+            <w:r>
+              <w:rPr>
+                <w:noProof/>
+                <w:webHidden/>
+              </w:rPr>
+              <w:instrText xml:space="preserve"> PAGEREF _Toc223794404 \h </w:instrText>
             </w:r>
             <w:r>
               <w:rPr>
@@ -3116,7 +3332,7 @@
               <w:lang w:eastAsia="en-GB"/>
             </w:rPr>
           </w:pPr>
-          <w:hyperlink w:anchor="_Toc223792488" w:history="1">
+          <w:hyperlink w:anchor="_Toc223794405" w:history="1">
             <w:r>
               <w:rPr>
                 <w:rStyle w:val="Hyperlink"/>
@@ -3143,7 +3359,7 @@
                 <w:noProof/>
                 <w:webHidden/>
               </w:rPr>
-              <w:instrText xml:space="preserve"> PAGEREF _Toc223792488 \h </w:instrText>
+              <w:instrText xml:space="preserve"> PAGEREF _Toc223794405 \h </w:instrText>
             </w:r>
             <w:r>
               <w:rPr>
@@ -3188,7 +3404,7 @@
               <w:lang w:eastAsia="en-GB"/>
             </w:rPr>
           </w:pPr>
-          <w:hyperlink w:anchor="_Toc223792489" w:history="1">
+          <w:hyperlink w:anchor="_Toc223794406" w:history="1">
             <w:r>
               <w:rPr>
                 <w:rStyle w:val="Hyperlink"/>
@@ -3215,7 +3431,7 @@
                 <w:noProof/>
                 <w:webHidden/>
               </w:rPr>
-              <w:instrText xml:space="preserve"> PAGEREF _Toc223792489 \h </w:instrText>
+              <w:instrText xml:space="preserve"> PAGEREF _Toc223794406 \h </w:instrText>
             </w:r>
             <w:r>
               <w:rPr>
@@ -3260,7 +3476,7 @@
               <w:lang w:eastAsia="en-GB"/>
             </w:rPr>
           </w:pPr>
-          <w:hyperlink w:anchor="_Toc223792490" w:history="1">
+          <w:hyperlink w:anchor="_Toc223794407" w:history="1">
             <w:r>
               <w:rPr>
                 <w:rStyle w:val="Hyperlink"/>
@@ -3287,7 +3503,7 @@
                 <w:noProof/>
                 <w:webHidden/>
               </w:rPr>
-              <w:instrText xml:space="preserve"> PAGEREF _Toc223792490 \h </w:instrText>
+              <w:instrText xml:space="preserve"> PAGEREF _Toc223794407 \h </w:instrText>
             </w:r>
             <w:r>
               <w:rPr>
@@ -3332,7 +3548,7 @@
               <w:lang w:eastAsia="en-GB"/>
             </w:rPr>
           </w:pPr>
-          <w:hyperlink w:anchor="_Toc223792491" w:history="1">
+          <w:hyperlink w:anchor="_Toc223794408" w:history="1">
             <w:r>
               <w:rPr>
                 <w:rStyle w:val="Hyperlink"/>
@@ -3359,7 +3575,7 @@
                 <w:noProof/>
                 <w:webHidden/>
               </w:rPr>
-              <w:instrText xml:space="preserve"> PAGEREF _Toc223792491 \h </w:instrText>
+              <w:instrText xml:space="preserve"> PAGEREF _Toc223794408 \h </w:instrText>
             </w:r>
             <w:r>
               <w:rPr>
@@ -3404,7 +3620,7 @@
               <w:lang w:eastAsia="en-GB"/>
             </w:rPr>
           </w:pPr>
-          <w:hyperlink w:anchor="_Toc223792492" w:history="1">
+          <w:hyperlink w:anchor="_Toc223794409" w:history="1">
             <w:r>
               <w:rPr>
                 <w:rStyle w:val="Hyperlink"/>
@@ -3431,7 +3647,7 @@
                 <w:noProof/>
                 <w:webHidden/>
               </w:rPr>
-              <w:instrText xml:space="preserve"> PAGEREF _Toc223792492 \h </w:instrText>
+              <w:instrText xml:space="preserve"> PAGEREF _Toc223794409 \h </w:instrText>
             </w:r>
             <w:r>
               <w:rPr>
@@ -3476,7 +3692,7 @@
               <w:lang w:eastAsia="en-GB"/>
             </w:rPr>
           </w:pPr>
-          <w:hyperlink w:anchor="_Toc223792493" w:history="1">
+          <w:hyperlink w:anchor="_Toc223794410" w:history="1">
             <w:r>
               <w:rPr>
                 <w:rStyle w:val="Hyperlink"/>
@@ -3503,7 +3719,7 @@
                 <w:noProof/>
                 <w:webHidden/>
               </w:rPr>
-              <w:instrText xml:space="preserve"> PAGEREF _Toc223792493 \h </w:instrText>
+              <w:instrText xml:space="preserve"> PAGEREF _Toc223794410 \h </w:instrText>
             </w:r>
             <w:r>
               <w:rPr>
@@ -3548,7 +3764,7 @@
               <w:lang w:eastAsia="en-GB"/>
             </w:rPr>
           </w:pPr>
-          <w:hyperlink w:anchor="_Toc223792494" w:history="1">
+          <w:hyperlink w:anchor="_Toc223794411" w:history="1">
             <w:r>
               <w:rPr>
                 <w:rStyle w:val="Hyperlink"/>
@@ -3575,7 +3791,7 @@
                 <w:noProof/>
                 <w:webHidden/>
               </w:rPr>
-              <w:instrText xml:space="preserve"> PAGEREF _Toc223792494 \h </w:instrText>
+              <w:instrText xml:space="preserve"> PAGEREF _Toc223794411 \h </w:instrText>
             </w:r>
             <w:r>
               <w:rPr>
@@ -3620,7 +3836,7 @@
               <w:lang w:eastAsia="en-GB"/>
             </w:rPr>
           </w:pPr>
-          <w:hyperlink w:anchor="_Toc223792495" w:history="1">
+          <w:hyperlink w:anchor="_Toc223794412" w:history="1">
             <w:r>
               <w:rPr>
                 <w:rStyle w:val="Hyperlink"/>
@@ -3647,7 +3863,7 @@
                 <w:noProof/>
                 <w:webHidden/>
               </w:rPr>
-              <w:instrText xml:space="preserve"> PAGEREF _Toc223792495 \h </w:instrText>
+              <w:instrText xml:space="preserve"> PAGEREF _Toc223794412 \h </w:instrText>
             </w:r>
             <w:r>
               <w:rPr>
@@ -3692,7 +3908,7 @@
               <w:lang w:eastAsia="en-GB"/>
             </w:rPr>
           </w:pPr>
-          <w:hyperlink w:anchor="_Toc223792496" w:history="1">
+          <w:hyperlink w:anchor="_Toc223794413" w:history="1">
             <w:r>
               <w:rPr>
                 <w:rStyle w:val="Hyperlink"/>
@@ -3719,7 +3935,7 @@
                 <w:noProof/>
                 <w:webHidden/>
               </w:rPr>
-              <w:instrText xml:space="preserve"> PAGEREF _Toc223792496 \h </w:instrText>
+              <w:instrText xml:space="preserve"> PAGEREF _Toc223794413 \h </w:instrText>
             </w:r>
             <w:r>
               <w:rPr>
@@ -3764,7 +3980,7 @@
               <w:lang w:eastAsia="en-GB"/>
             </w:rPr>
           </w:pPr>
-          <w:hyperlink w:anchor="_Toc223792497" w:history="1">
+          <w:hyperlink w:anchor="_Toc223794414" w:history="1">
             <w:r>
               <w:rPr>
                 <w:rStyle w:val="Hyperlink"/>
@@ -3791,7 +4007,7 @@
                 <w:noProof/>
                 <w:webHidden/>
               </w:rPr>
-              <w:instrText xml:space="preserve"> PAGEREF _Toc223792497 \h </w:instrText>
+              <w:instrText xml:space="preserve"> PAGEREF _Toc223794414 \h </w:instrText>
             </w:r>
             <w:r>
               <w:rPr>
@@ -3836,7 +4052,7 @@
               <w:lang w:eastAsia="en-GB"/>
             </w:rPr>
           </w:pPr>
-          <w:hyperlink w:anchor="_Toc223792498" w:history="1">
+          <w:hyperlink w:anchor="_Toc223794415" w:history="1">
             <w:r>
               <w:rPr>
                 <w:rStyle w:val="Hyperlink"/>
@@ -3863,7 +4079,7 @@
                 <w:noProof/>
                 <w:webHidden/>
               </w:rPr>
-              <w:instrText xml:space="preserve"> PAGEREF _Toc223792498 \h </w:instrText>
+              <w:instrText xml:space="preserve"> PAGEREF _Toc223794415 \h </w:instrText>
             </w:r>
             <w:r>
               <w:rPr>
@@ -3908,7 +4124,7 @@
               <w:lang w:eastAsia="en-GB"/>
             </w:rPr>
           </w:pPr>
-          <w:hyperlink w:anchor="_Toc223792499" w:history="1">
+          <w:hyperlink w:anchor="_Toc223794416" w:history="1">
             <w:r>
               <w:rPr>
                 <w:rStyle w:val="Hyperlink"/>
@@ -3935,7 +4151,7 @@
                 <w:noProof/>
                 <w:webHidden/>
               </w:rPr>
-              <w:instrText xml:space="preserve"> PAGEREF _Toc223792499 \h </w:instrText>
+              <w:instrText xml:space="preserve"> PAGEREF _Toc223794416 \h </w:instrText>
             </w:r>
             <w:r>
               <w:rPr>
@@ -3980,7 +4196,7 @@
               <w:lang w:eastAsia="en-GB"/>
             </w:rPr>
           </w:pPr>
-          <w:hyperlink w:anchor="_Toc223792500" w:history="1">
+          <w:hyperlink w:anchor="_Toc223794417" w:history="1">
             <w:r>
               <w:rPr>
                 <w:rStyle w:val="Hyperlink"/>
@@ -4007,7 +4223,7 @@
                 <w:noProof/>
                 <w:webHidden/>
               </w:rPr>
-              <w:instrText xml:space="preserve"> PAGEREF _Toc223792500 \h </w:instrText>
+              <w:instrText xml:space="preserve"> PAGEREF _Toc223794417 \h </w:instrText>
             </w:r>
             <w:r>
               <w:rPr>
@@ -4052,7 +4268,7 @@
               <w:lang w:eastAsia="en-GB"/>
             </w:rPr>
           </w:pPr>
-          <w:hyperlink w:anchor="_Toc223792501" w:history="1">
+          <w:hyperlink w:anchor="_Toc223794418" w:history="1">
             <w:r>
               <w:rPr>
                 <w:rStyle w:val="Hyperlink"/>
@@ -4079,7 +4295,7 @@
                 <w:noProof/>
                 <w:webHidden/>
               </w:rPr>
-              <w:instrText xml:space="preserve"> PAGEREF _Toc223792501 \h </w:instrText>
+              <w:instrText xml:space="preserve"> PAGEREF _Toc223794418 \h </w:instrText>
             </w:r>
             <w:r>
               <w:rPr>
@@ -4124,7 +4340,7 @@
               <w:lang w:eastAsia="en-GB"/>
             </w:rPr>
           </w:pPr>
-          <w:hyperlink w:anchor="_Toc223792502" w:history="1">
+          <w:hyperlink w:anchor="_Toc223794419" w:history="1">
             <w:r>
               <w:rPr>
                 <w:rStyle w:val="Hyperlink"/>
@@ -4151,7 +4367,7 @@
                 <w:noProof/>
                 <w:webHidden/>
               </w:rPr>
-              <w:instrText xml:space="preserve"> PAGEREF _Toc223792502 \h </w:instrText>
+              <w:instrText xml:space="preserve"> PAGEREF _Toc223794419 \h </w:instrText>
             </w:r>
             <w:r>
               <w:rPr>
@@ -4196,7 +4412,7 @@
               <w:lang w:eastAsia="en-GB"/>
             </w:rPr>
           </w:pPr>
-          <w:hyperlink w:anchor="_Toc223792503" w:history="1">
+          <w:hyperlink w:anchor="_Toc223794420" w:history="1">
             <w:r>
               <w:rPr>
                 <w:rStyle w:val="Hyperlink"/>
@@ -4223,7 +4439,7 @@
                 <w:noProof/>
                 <w:webHidden/>
               </w:rPr>
-              <w:instrText xml:space="preserve"> PAGEREF _Toc223792503 \h </w:instrText>
+              <w:instrText xml:space="preserve"> PAGEREF _Toc223794420 \h </w:instrText>
             </w:r>
             <w:r>
               <w:rPr>
@@ -4268,7 +4484,7 @@
               <w:lang w:eastAsia="en-GB"/>
             </w:rPr>
           </w:pPr>
-          <w:hyperlink w:anchor="_Toc223792504" w:history="1">
+          <w:hyperlink w:anchor="_Toc223794421" w:history="1">
             <w:r>
               <w:rPr>
                 <w:rStyle w:val="Hyperlink"/>
@@ -4295,7 +4511,7 @@
                 <w:noProof/>
                 <w:webHidden/>
               </w:rPr>
-              <w:instrText xml:space="preserve"> PAGEREF _Toc223792504 \h </w:instrText>
+              <w:instrText xml:space="preserve"> PAGEREF _Toc223794421 \h </w:instrText>
             </w:r>
             <w:r>
               <w:rPr>
@@ -4356,7 +4572,7 @@
       <w:pPr>
         <w:pStyle w:val="Heading1"/>
       </w:pPr>
-      <w:bookmarkStart w:id="0" w:name="_Toc223792448"/>
+      <w:bookmarkStart w:id="0" w:name="_Toc223794362"/>
       <w:r>
         <w:lastRenderedPageBreak/>
         <w:t>List of Acro</w:t>
@@ -4611,7 +4827,7 @@
       <w:pPr>
         <w:pStyle w:val="Heading1"/>
       </w:pPr>
-      <w:bookmarkStart w:id="1" w:name="_Toc223792449"/>
+      <w:bookmarkStart w:id="1" w:name="_Toc223794363"/>
       <w:r>
         <w:lastRenderedPageBreak/>
         <w:t>Abstract</w:t>
@@ -4811,7 +5027,7 @@
       <w:pPr>
         <w:pStyle w:val="Heading1"/>
       </w:pPr>
-      <w:bookmarkStart w:id="2" w:name="_Toc223792450"/>
+      <w:bookmarkStart w:id="2" w:name="_Toc223794364"/>
       <w:r>
         <w:lastRenderedPageBreak/>
         <w:t>Introduction</w:t>
@@ -4858,8 +5074,13 @@
       <w:r>
         <w:t xml:space="preserve">. </w:t>
       </w:r>
-      <w:r>
-        <w:t xml:space="preserve">Porcar et al., </w:t>
+      <w:proofErr w:type="spellStart"/>
+      <w:r>
+        <w:t>Porcar</w:t>
+      </w:r>
+      <w:proofErr w:type="spellEnd"/>
+      <w:r>
+        <w:t xml:space="preserve"> et al., </w:t>
       </w:r>
       <w:r>
         <w:t>(</w:t>
@@ -4899,8 +5120,13 @@
       <w:r>
         <w:t xml:space="preserve">Research conducted by </w:t>
       </w:r>
-      <w:r>
-        <w:t xml:space="preserve">Cantó-Sancho et al., </w:t>
+      <w:proofErr w:type="spellStart"/>
+      <w:r>
+        <w:t>Cantó</w:t>
+      </w:r>
+      <w:proofErr w:type="spellEnd"/>
+      <w:r>
+        <w:t xml:space="preserve">-Sancho et al., </w:t>
       </w:r>
       <w:r>
         <w:t>(</w:t>
@@ -5384,7 +5610,7 @@
       <w:pPr>
         <w:pStyle w:val="Heading1"/>
       </w:pPr>
-      <w:bookmarkStart w:id="3" w:name="_Toc223792451"/>
+      <w:bookmarkStart w:id="3" w:name="_Toc223794365"/>
       <w:r>
         <w:lastRenderedPageBreak/>
         <w:t>Project Aim</w:t>
@@ -5434,7 +5660,7 @@
           <w:rFonts w:asciiTheme="minorHAnsi" w:hAnsiTheme="minorHAnsi"/>
         </w:rPr>
       </w:pPr>
-      <w:bookmarkStart w:id="4" w:name="_Toc223792452"/>
+      <w:bookmarkStart w:id="4" w:name="_Toc223794366"/>
       <w:r>
         <w:rPr>
           <w:rFonts w:asciiTheme="minorHAnsi" w:hAnsiTheme="minorHAnsi"/>
@@ -5721,7 +5947,7 @@
       <w:pPr>
         <w:pStyle w:val="Heading1"/>
       </w:pPr>
-      <w:bookmarkStart w:id="5" w:name="_Toc223792453"/>
+      <w:bookmarkStart w:id="5" w:name="_Toc223794367"/>
       <w:r>
         <w:lastRenderedPageBreak/>
         <w:t>Project Planning</w:t>
@@ -6102,7 +6328,7 @@
           <w:rFonts w:asciiTheme="minorHAnsi" w:hAnsiTheme="minorHAnsi"/>
         </w:rPr>
       </w:pPr>
-      <w:bookmarkStart w:id="6" w:name="_Toc223792454"/>
+      <w:bookmarkStart w:id="6" w:name="_Toc223794368"/>
       <w:r>
         <w:rPr>
           <w:rFonts w:asciiTheme="minorHAnsi" w:hAnsiTheme="minorHAnsi"/>
@@ -6304,7 +6530,7 @@
           <w:rFonts w:asciiTheme="minorHAnsi" w:hAnsiTheme="minorHAnsi"/>
         </w:rPr>
       </w:pPr>
-      <w:bookmarkStart w:id="7" w:name="_Toc223792455"/>
+      <w:bookmarkStart w:id="7" w:name="_Toc223794369"/>
       <w:r>
         <w:rPr>
           <w:rFonts w:asciiTheme="minorHAnsi" w:hAnsiTheme="minorHAnsi"/>
@@ -6543,7 +6769,21 @@
         <w:rPr>
           <w:rFonts w:cs="Arial"/>
         </w:rPr>
-        <w:t>Clear on screen prompts to guide and support users that aren’t familiar with VR equipment</w:t>
+        <w:t xml:space="preserve">Clear </w:t>
+      </w:r>
+      <w:proofErr w:type="gramStart"/>
+      <w:r>
+        <w:rPr>
+          <w:rFonts w:cs="Arial"/>
+        </w:rPr>
+        <w:t>on screen</w:t>
+      </w:r>
+      <w:proofErr w:type="gramEnd"/>
+      <w:r>
+        <w:rPr>
+          <w:rFonts w:cs="Arial"/>
+        </w:rPr>
+        <w:t xml:space="preserve"> prompts to guide and support users that aren’t familiar with VR equipment</w:t>
       </w:r>
     </w:p>
     <w:p>
@@ -6571,7 +6811,7 @@
           <w:rFonts w:asciiTheme="minorHAnsi" w:hAnsiTheme="minorHAnsi"/>
         </w:rPr>
       </w:pPr>
-      <w:bookmarkStart w:id="8" w:name="_Toc223792456"/>
+      <w:bookmarkStart w:id="8" w:name="_Toc223794370"/>
       <w:r>
         <w:rPr>
           <w:rFonts w:asciiTheme="minorHAnsi" w:hAnsiTheme="minorHAnsi"/>
@@ -6588,7 +6828,7 @@
           <w:rFonts w:asciiTheme="minorHAnsi" w:hAnsiTheme="minorHAnsi"/>
         </w:rPr>
       </w:pPr>
-      <w:bookmarkStart w:id="9" w:name="_Toc223792457"/>
+      <w:bookmarkStart w:id="9" w:name="_Toc223794371"/>
       <w:r>
         <w:rPr>
           <w:rFonts w:asciiTheme="minorHAnsi" w:hAnsiTheme="minorHAnsi"/>
@@ -6672,7 +6912,7 @@
           <w:rFonts w:asciiTheme="minorHAnsi" w:hAnsiTheme="minorHAnsi"/>
         </w:rPr>
       </w:pPr>
-      <w:bookmarkStart w:id="10" w:name="_Toc223792458"/>
+      <w:bookmarkStart w:id="10" w:name="_Toc223794372"/>
       <w:r>
         <w:rPr>
           <w:rFonts w:asciiTheme="minorHAnsi" w:hAnsiTheme="minorHAnsi"/>
@@ -6685,7 +6925,8 @@
       <w:pPr>
         <w:pStyle w:val="Heading3"/>
       </w:pPr>
-      <w:bookmarkStart w:id="11" w:name="_Toc223792459"/>
+      <w:bookmarkStart w:id="11" w:name="_Toc223794373"/>
+      <w:proofErr w:type="spellStart"/>
       <w:r>
         <w:t>Ey</w:t>
       </w:r>
@@ -6696,6 +6937,7 @@
         <w:t>si</w:t>
       </w:r>
       <w:bookmarkEnd w:id="11"/>
+      <w:proofErr w:type="spellEnd"/>
     </w:p>
     <w:p>
       <w:r>
@@ -6710,9 +6952,11 @@
       <w:r>
         <w:t xml:space="preserve"> discussed </w:t>
       </w:r>
+      <w:proofErr w:type="spellStart"/>
       <w:r>
         <w:t>Eyesi</w:t>
       </w:r>
+      <w:proofErr w:type="spellEnd"/>
       <w:r>
         <w:t>,</w:t>
       </w:r>
@@ -6825,7 +7069,15 @@
         <w:t xml:space="preserve">In addition to this, there is an </w:t>
       </w:r>
       <w:r>
-        <w:t xml:space="preserve">online training portal (vrmnet) </w:t>
+        <w:t>online training portal (</w:t>
+      </w:r>
+      <w:proofErr w:type="spellStart"/>
+      <w:r>
+        <w:t>vrmnet</w:t>
+      </w:r>
+      <w:proofErr w:type="spellEnd"/>
+      <w:r>
+        <w:t xml:space="preserve">) </w:t>
       </w:r>
       <w:r>
         <w:t>allowing comparison between trainees</w:t>
@@ -6960,7 +7212,15 @@
         <w:t xml:space="preserve"> </w:t>
       </w:r>
       <w:r>
-        <w:t xml:space="preserve">While Eyesi is effective for medical training for medical professionals, </w:t>
+        <w:t xml:space="preserve">While </w:t>
+      </w:r>
+      <w:proofErr w:type="spellStart"/>
+      <w:r>
+        <w:t>Eyesi</w:t>
+      </w:r>
+      <w:proofErr w:type="spellEnd"/>
+      <w:r>
+        <w:t xml:space="preserve"> is effective for medical training for medical professionals, </w:t>
       </w:r>
       <w:r>
         <w:t xml:space="preserve">similar </w:t>
@@ -6982,11 +7242,13 @@
       <w:pPr>
         <w:pStyle w:val="Heading3"/>
       </w:pPr>
-      <w:bookmarkStart w:id="12" w:name="_Toc223792460"/>
+      <w:bookmarkStart w:id="12" w:name="_Toc223794374"/>
+      <w:proofErr w:type="spellStart"/>
       <w:r>
         <w:t>OntoPhaco</w:t>
       </w:r>
       <w:bookmarkEnd w:id="12"/>
+      <w:proofErr w:type="spellEnd"/>
     </w:p>
     <w:p>
       <w:r>
@@ -7005,7 +7267,15 @@
         <w:t>d</w:t>
       </w:r>
       <w:r>
-        <w:t xml:space="preserve"> OntoPhaco, a</w:t>
+        <w:t xml:space="preserve"> </w:t>
+      </w:r>
+      <w:proofErr w:type="spellStart"/>
+      <w:r>
+        <w:t>OntoPhaco</w:t>
+      </w:r>
+      <w:proofErr w:type="spellEnd"/>
+      <w:r>
+        <w:t>, a</w:t>
       </w:r>
       <w:r>
         <w:t>n</w:t>
@@ -7138,173 +7408,191 @@
           <w:rFonts w:cs="TimesLTStd-Roman"/>
           <w:kern w:val="0"/>
         </w:rPr>
-        <w:t>Since OntoPhaco</w:t>
-      </w:r>
+        <w:t xml:space="preserve">Since </w:t>
+      </w:r>
+      <w:proofErr w:type="spellStart"/>
       <w:r>
         <w:rPr>
           <w:rFonts w:cs="TimesLTStd-Roman"/>
           <w:kern w:val="0"/>
         </w:rPr>
-        <w:t>’s</w:t>
+        <w:t>OntoPhaco</w:t>
       </w:r>
       <w:r>
         <w:rPr>
           <w:rFonts w:cs="TimesLTStd-Roman"/>
           <w:kern w:val="0"/>
         </w:rPr>
-        <w:t xml:space="preserve"> </w:t>
-      </w:r>
-      <w:r>
-        <w:t>s</w:t>
-      </w:r>
-      <w:r>
-        <w:t xml:space="preserve">ystematic verification and validation processes </w:t>
-      </w:r>
-      <w:r>
-        <w:t>include</w:t>
-      </w:r>
-      <w:r>
-        <w:t xml:space="preserve"> </w:t>
-      </w:r>
-      <w:r>
-        <w:t xml:space="preserve">theoretical </w:t>
-      </w:r>
-      <w:r>
-        <w:t>evaluat</w:t>
-      </w:r>
-      <w:r>
-        <w:t xml:space="preserve">ion </w:t>
-      </w:r>
-      <w:r>
-        <w:t>and expert feedback</w:t>
-      </w:r>
+        <w:t>’s</w:t>
+      </w:r>
+      <w:proofErr w:type="spellEnd"/>
       <w:r>
         <w:rPr>
           <w:rFonts w:cs="TimesLTStd-Roman"/>
           <w:kern w:val="0"/>
         </w:rPr>
-        <w:t xml:space="preserve">, each change, minor or major </w:t>
+        <w:t xml:space="preserve"> </w:t>
+      </w:r>
+      <w:r>
+        <w:t>s</w:t>
+      </w:r>
+      <w:r>
+        <w:t xml:space="preserve">ystematic verification and validation processes </w:t>
+      </w:r>
+      <w:r>
+        <w:t>include</w:t>
+      </w:r>
+      <w:r>
+        <w:t xml:space="preserve"> </w:t>
+      </w:r>
+      <w:r>
+        <w:t xml:space="preserve">theoretical </w:t>
+      </w:r>
+      <w:r>
+        <w:t>evaluat</w:t>
+      </w:r>
+      <w:r>
+        <w:t xml:space="preserve">ion </w:t>
+      </w:r>
+      <w:r>
+        <w:t>and expert feedback</w:t>
       </w:r>
       <w:r>
         <w:rPr>
           <w:rFonts w:cs="TimesLTStd-Roman"/>
           <w:kern w:val="0"/>
         </w:rPr>
-        <w:t>is</w:t>
+        <w:t xml:space="preserve">, each change, minor or major </w:t>
       </w:r>
       <w:r>
         <w:rPr>
           <w:rFonts w:cs="TimesLTStd-Roman"/>
           <w:kern w:val="0"/>
         </w:rPr>
-        <w:t xml:space="preserve"> verified and validate</w:t>
+        <w:t>is</w:t>
       </w:r>
       <w:r>
         <w:rPr>
           <w:rFonts w:cs="TimesLTStd-Roman"/>
           <w:kern w:val="0"/>
         </w:rPr>
-        <w:t>d</w:t>
-      </w:r>
-      <w:r>
-        <w:t>.</w:t>
+        <w:t xml:space="preserve"> verified and validate</w:t>
       </w:r>
       <w:r>
         <w:rPr>
           <w:rFonts w:cs="TimesLTStd-Roman"/>
           <w:kern w:val="0"/>
         </w:rPr>
-        <w:t xml:space="preserve"> </w:t>
+        <w:t>d</w:t>
+      </w:r>
+      <w:r>
+        <w:t>.</w:t>
       </w:r>
       <w:r>
         <w:rPr>
           <w:rFonts w:cs="TimesLTStd-Roman"/>
           <w:kern w:val="0"/>
         </w:rPr>
-        <w:t>OntoPhaco demonstrates VR</w:t>
-      </w:r>
+        <w:t xml:space="preserve"> </w:t>
+      </w:r>
+      <w:proofErr w:type="spellStart"/>
       <w:r>
         <w:rPr>
           <w:rFonts w:cs="TimesLTStd-Roman"/>
           <w:kern w:val="0"/>
         </w:rPr>
-        <w:t>’</w:t>
-      </w:r>
+        <w:t>OntoPhaco</w:t>
+      </w:r>
+      <w:proofErr w:type="spellEnd"/>
       <w:r>
         <w:rPr>
           <w:rFonts w:cs="TimesLTStd-Roman"/>
           <w:kern w:val="0"/>
         </w:rPr>
-        <w:t xml:space="preserve">s effectiveness </w:t>
+        <w:t xml:space="preserve"> demonstrates VR</w:t>
       </w:r>
       <w:r>
         <w:rPr>
           <w:rFonts w:cs="TimesLTStd-Roman"/>
           <w:kern w:val="0"/>
         </w:rPr>
-        <w:t xml:space="preserve">paired </w:t>
+        <w:t>’</w:t>
       </w:r>
       <w:r>
         <w:rPr>
           <w:rFonts w:cs="TimesLTStd-Roman"/>
           <w:kern w:val="0"/>
         </w:rPr>
-        <w:t>with ontology for medical training</w:t>
+        <w:t xml:space="preserve">s effectiveness </w:t>
       </w:r>
       <w:r>
         <w:rPr>
           <w:rFonts w:cs="TimesLTStd-Roman"/>
           <w:kern w:val="0"/>
         </w:rPr>
-        <w:t>. T</w:t>
+        <w:t xml:space="preserve">paired </w:t>
       </w:r>
       <w:r>
         <w:rPr>
           <w:rFonts w:cs="TimesLTStd-Roman"/>
           <w:kern w:val="0"/>
         </w:rPr>
-        <w:t>his project</w:t>
+        <w:t>with ontology for medical training</w:t>
       </w:r>
       <w:r>
         <w:rPr>
           <w:rFonts w:cs="TimesLTStd-Roman"/>
           <w:kern w:val="0"/>
         </w:rPr>
-        <w:t xml:space="preserve"> applies similar immersi</w:t>
+        <w:t>. T</w:t>
       </w:r>
       <w:r>
         <w:rPr>
           <w:rFonts w:cs="TimesLTStd-Roman"/>
           <w:kern w:val="0"/>
         </w:rPr>
-        <w:t>ve</w:t>
+        <w:t>his project</w:t>
       </w:r>
       <w:r>
         <w:rPr>
           <w:rFonts w:cs="TimesLTStd-Roman"/>
           <w:kern w:val="0"/>
         </w:rPr>
-        <w:t xml:space="preserve"> and educational knowledge </w:t>
+        <w:t xml:space="preserve"> applies similar immersi</w:t>
       </w:r>
       <w:r>
         <w:rPr>
           <w:rFonts w:cs="TimesLTStd-Roman"/>
           <w:kern w:val="0"/>
         </w:rPr>
-        <w:t xml:space="preserve">for DES to raise awareness, </w:t>
+        <w:t>ve</w:t>
       </w:r>
       <w:r>
         <w:rPr>
           <w:rFonts w:cs="TimesLTStd-Roman"/>
           <w:kern w:val="0"/>
         </w:rPr>
-        <w:t xml:space="preserve">spreading the </w:t>
+        <w:t xml:space="preserve"> and educational knowledge </w:t>
       </w:r>
       <w:r>
         <w:rPr>
           <w:rFonts w:cs="TimesLTStd-Roman"/>
           <w:kern w:val="0"/>
         </w:rPr>
+        <w:t xml:space="preserve">for DES to raise awareness, </w:t>
+      </w:r>
+      <w:r>
+        <w:rPr>
+          <w:rFonts w:cs="TimesLTStd-Roman"/>
+          <w:kern w:val="0"/>
+        </w:rPr>
+        <w:t xml:space="preserve">spreading the </w:t>
+      </w:r>
+      <w:r>
+        <w:rPr>
+          <w:rFonts w:cs="TimesLTStd-Roman"/>
+          <w:kern w:val="0"/>
+        </w:rPr>
         <w:t>benefits of VR use in education beyond professional training.</w:t>
       </w:r>
     </w:p>
@@ -7312,7 +7600,7 @@
       <w:pPr>
         <w:pStyle w:val="Heading3"/>
       </w:pPr>
-      <w:bookmarkStart w:id="13" w:name="_Toc223792461"/>
+      <w:bookmarkStart w:id="13" w:name="_Toc223794375"/>
       <w:r>
         <w:lastRenderedPageBreak/>
         <w:t>I</w:t>
@@ -7508,7 +7796,7 @@
       <w:pPr>
         <w:pStyle w:val="Heading3"/>
       </w:pPr>
-      <w:bookmarkStart w:id="14" w:name="_Toc223792462"/>
+      <w:bookmarkStart w:id="14" w:name="_Toc223794376"/>
       <w:r>
         <w:t>Opportunities for innovation</w:t>
       </w:r>
@@ -7518,17 +7806,27 @@
       <w:r>
         <w:t xml:space="preserve">While </w:t>
       </w:r>
-      <w:r>
-        <w:t>Eyesi focuses on hands on surgical practices</w:t>
+      <w:proofErr w:type="spellStart"/>
+      <w:r>
+        <w:t>Eyesi</w:t>
+      </w:r>
+      <w:proofErr w:type="spellEnd"/>
+      <w:r>
+        <w:t xml:space="preserve"> focuses on hands on surgical practices</w:t>
       </w:r>
       <w:r>
         <w:t xml:space="preserve">, </w:t>
       </w:r>
+      <w:proofErr w:type="spellStart"/>
       <w:r>
         <w:t>O</w:t>
       </w:r>
       <w:r>
-        <w:t>ntoPhaco focuses on the way knowledge is represented and conceptual understanding</w:t>
+        <w:t>ntoPhaco</w:t>
+      </w:r>
+      <w:proofErr w:type="spellEnd"/>
+      <w:r>
+        <w:t xml:space="preserve"> focuses on the way knowledge is represented and conceptual understanding</w:t>
       </w:r>
       <w:r>
         <w:t xml:space="preserve">. </w:t>
@@ -7626,7 +7924,7 @@
           <w:rFonts w:asciiTheme="minorHAnsi" w:hAnsiTheme="minorHAnsi"/>
         </w:rPr>
       </w:pPr>
-      <w:bookmarkStart w:id="15" w:name="_Toc223792463"/>
+      <w:bookmarkStart w:id="15" w:name="_Toc223794377"/>
       <w:r>
         <w:rPr>
           <w:rFonts w:asciiTheme="minorHAnsi" w:hAnsiTheme="minorHAnsi"/>
@@ -7639,7 +7937,7 @@
       <w:pPr>
         <w:pStyle w:val="Heading3"/>
       </w:pPr>
-      <w:bookmarkStart w:id="16" w:name="_Toc223792464"/>
+      <w:bookmarkStart w:id="16" w:name="_Toc223794378"/>
       <w:r>
         <w:t>VR in medical education</w:t>
       </w:r>
@@ -7786,9 +8084,19 @@
       <w:r>
         <w:t xml:space="preserve">Examples such as </w:t>
       </w:r>
-      <w:r>
-        <w:t>Mediverse by Goggleminds</w:t>
-      </w:r>
+      <w:proofErr w:type="spellStart"/>
+      <w:r>
+        <w:t>Mediverse</w:t>
+      </w:r>
+      <w:proofErr w:type="spellEnd"/>
+      <w:r>
+        <w:t xml:space="preserve"> by </w:t>
+      </w:r>
+      <w:proofErr w:type="spellStart"/>
+      <w:r>
+        <w:t>Goggleminds</w:t>
+      </w:r>
+      <w:proofErr w:type="spellEnd"/>
       <w:r>
         <w:t xml:space="preserve"> </w:t>
       </w:r>
@@ -7802,7 +8110,15 @@
         <w:t xml:space="preserve"> to healthcare providers and medical schools</w:t>
       </w:r>
       <w:r>
-        <w:t>. ClassVR by Systems improve</w:t>
+        <w:t xml:space="preserve">. </w:t>
+      </w:r>
+      <w:proofErr w:type="spellStart"/>
+      <w:r>
+        <w:t>ClassVR</w:t>
+      </w:r>
+      <w:proofErr w:type="spellEnd"/>
+      <w:r>
+        <w:t xml:space="preserve"> by Systems improve</w:t>
       </w:r>
       <w:r>
         <w:t>s</w:t>
@@ -7819,8 +8135,13 @@
       <w:r>
         <w:t xml:space="preserve"> </w:t>
       </w:r>
-      <w:r>
-        <w:t xml:space="preserve">PrismsVR </w:t>
+      <w:proofErr w:type="spellStart"/>
+      <w:r>
+        <w:t>PrismsVR</w:t>
+      </w:r>
+      <w:proofErr w:type="spellEnd"/>
+      <w:r>
+        <w:t xml:space="preserve"> </w:t>
       </w:r>
       <w:r>
         <w:t xml:space="preserve">helps students grasp core concepts in algebra and geometry, by </w:t>
@@ -7906,7 +8227,7 @@
       <w:pPr>
         <w:pStyle w:val="Heading3"/>
       </w:pPr>
-      <w:bookmarkStart w:id="17" w:name="_Toc223792465"/>
+      <w:bookmarkStart w:id="17" w:name="_Toc223794379"/>
       <w:r>
         <w:lastRenderedPageBreak/>
         <w:t>VR in Health Awareness</w:t>
@@ -8099,7 +8420,7 @@
           <w:rFonts w:asciiTheme="minorHAnsi" w:hAnsiTheme="minorHAnsi"/>
         </w:rPr>
       </w:pPr>
-      <w:bookmarkStart w:id="18" w:name="_Toc223792466"/>
+      <w:bookmarkStart w:id="18" w:name="_Toc223794380"/>
       <w:r>
         <w:rPr>
           <w:rFonts w:asciiTheme="minorHAnsi" w:hAnsiTheme="minorHAnsi"/>
@@ -8319,7 +8640,7 @@
       <w:pPr>
         <w:pStyle w:val="Heading1"/>
       </w:pPr>
-      <w:bookmarkStart w:id="19" w:name="_Toc223792467"/>
+      <w:bookmarkStart w:id="19" w:name="_Toc223794381"/>
       <w:r>
         <w:lastRenderedPageBreak/>
         <w:t>Appendices</w:t>
@@ -8330,7 +8651,7 @@
       <w:pPr>
         <w:pStyle w:val="Heading2"/>
       </w:pPr>
-      <w:bookmarkStart w:id="20" w:name="_Toc223792468"/>
+      <w:bookmarkStart w:id="20" w:name="_Toc223794382"/>
       <w:r>
         <w:t>Ethics Checklist</w:t>
       </w:r>
@@ -8472,7 +8793,7 @@
       <w:pPr>
         <w:pStyle w:val="Heading2"/>
       </w:pPr>
-      <w:bookmarkStart w:id="21" w:name="_Toc223792469"/>
+      <w:bookmarkStart w:id="21" w:name="_Toc223794383"/>
       <w:r>
         <w:lastRenderedPageBreak/>
         <w:t>Project Timeline Gant</w:t>
@@ -8668,7 +8989,7 @@
       <w:pPr>
         <w:pStyle w:val="Heading1"/>
       </w:pPr>
-      <w:bookmarkStart w:id="22" w:name="_Toc223792470"/>
+      <w:bookmarkStart w:id="22" w:name="_Toc223794384"/>
       <w:r>
         <w:lastRenderedPageBreak/>
         <w:t>Methodology</w:t>
@@ -8679,7 +9000,7 @@
       <w:pPr>
         <w:pStyle w:val="Heading2"/>
       </w:pPr>
-      <w:bookmarkStart w:id="23" w:name="_Toc223792471"/>
+      <w:bookmarkStart w:id="23" w:name="_Toc223794385"/>
       <w:r>
         <w:t>Prototype Implementation</w:t>
       </w:r>
@@ -8689,7 +9010,7 @@
       <w:pPr>
         <w:pStyle w:val="Heading3"/>
       </w:pPr>
-      <w:bookmarkStart w:id="24" w:name="_Toc223792472"/>
+      <w:bookmarkStart w:id="24" w:name="_Toc223794386"/>
       <w:r>
         <w:t>Usability and Flow</w:t>
       </w:r>
@@ -8772,7 +9093,7 @@
       <w:pPr>
         <w:pStyle w:val="Heading3"/>
       </w:pPr>
-      <w:bookmarkStart w:id="25" w:name="_Toc223792473"/>
+      <w:bookmarkStart w:id="25" w:name="_Toc223794387"/>
       <w:r>
         <w:t xml:space="preserve">Environment Design and </w:t>
       </w:r>
@@ -8901,7 +9222,7 @@
       <w:pPr>
         <w:pStyle w:val="Heading3"/>
       </w:pPr>
-      <w:bookmarkStart w:id="26" w:name="_Toc223792474"/>
+      <w:bookmarkStart w:id="26" w:name="_Toc223794388"/>
       <w:r>
         <w:t>Objective System Implementation</w:t>
       </w:r>
@@ -8942,7 +9263,15 @@
         <w:t>ere</w:t>
       </w:r>
       <w:r>
-        <w:t xml:space="preserve"> stored within the VRGameMode blueprint, with objectives being updated during runtime as conditions were satisfied </w:t>
+        <w:t xml:space="preserve"> stored within the </w:t>
+      </w:r>
+      <w:proofErr w:type="spellStart"/>
+      <w:r>
+        <w:t>VRGameMode</w:t>
+      </w:r>
+      <w:proofErr w:type="spellEnd"/>
+      <w:r>
+        <w:t xml:space="preserve"> blueprint, with objectives being updated during runtime as conditions were satisfied </w:t>
       </w:r>
       <w:r>
         <w:t>during</w:t>
@@ -9006,7 +9335,7 @@
       <w:pPr>
         <w:pStyle w:val="Heading3"/>
       </w:pPr>
-      <w:bookmarkStart w:id="27" w:name="_Toc223792475"/>
+      <w:bookmarkStart w:id="27" w:name="_Toc223794389"/>
       <w:r>
         <w:t>User</w:t>
       </w:r>
@@ -9103,7 +9432,7 @@
       <w:pPr>
         <w:pStyle w:val="Heading3"/>
       </w:pPr>
-      <w:bookmarkStart w:id="28" w:name="_Toc223792476"/>
+      <w:bookmarkStart w:id="28" w:name="_Toc223794390"/>
       <w:r>
         <w:t>Objective Based Interact</w:t>
       </w:r>
@@ -9171,7 +9500,7 @@
       <w:pPr>
         <w:pStyle w:val="Heading3"/>
       </w:pPr>
-      <w:bookmarkStart w:id="29" w:name="_Toc223792477"/>
+      <w:bookmarkStart w:id="29" w:name="_Toc223794391"/>
       <w:r>
         <w:t>Post Processing Effects</w:t>
       </w:r>
@@ -9188,7 +9517,15 @@
         <w:t>’s post processing component</w:t>
       </w:r>
       <w:r>
-        <w:t>. These effects were vignette to simulate eye fatigue, bloom for light sensitivity and blur for focus strain. Vignette and bloom post processing effects were triggered through adjusting their post processing variables within the camera post processing component. However, for blur a post processing material was required to create the radial blur. When objectives progressed triggering the simulation of symptoms, a timeline was used to progressively increase the value of an effect gradually over a duration. This decision was made to accommodate eyes adjusting to the changes of the camera as these effects were being triggered.</w:t>
+        <w:t xml:space="preserve">. These effects were </w:t>
+      </w:r>
+      <w:proofErr w:type="gramStart"/>
+      <w:r>
+        <w:t>vignette</w:t>
+      </w:r>
+      <w:proofErr w:type="gramEnd"/>
+      <w:r>
+        <w:t xml:space="preserve"> to simulate eye fatigue, bloom for light sensitivity and blur for focus strain. Vignette and bloom post processing effects were triggered through adjusting their post processing variables within the camera post processing component. However, for blur a post processing material was required to create the radial blur. When objectives progressed triggering the simulation of symptoms, a timeline was used to progressively increase the value of an effect gradually over a duration. This decision was made to accommodate eyes adjusting to the changes of the camera as these effects were being triggered.</w:t>
       </w:r>
       <w:r>
         <w:t xml:space="preserve"> The timeline was then used in reverse to revert the symptoms returning the camera view back to the original state it was in.</w:t>
@@ -9198,7 +9535,7 @@
       <w:pPr>
         <w:pStyle w:val="Heading3"/>
       </w:pPr>
-      <w:bookmarkStart w:id="30" w:name="_Toc223792478"/>
+      <w:bookmarkStart w:id="30" w:name="_Toc223794392"/>
       <w:r>
         <w:t>User</w:t>
       </w:r>
@@ -9229,7 +9566,7 @@
       <w:pPr>
         <w:pStyle w:val="Heading2"/>
       </w:pPr>
-      <w:bookmarkStart w:id="31" w:name="_Toc223792479"/>
+      <w:bookmarkStart w:id="31" w:name="_Toc223794393"/>
       <w:r>
         <w:lastRenderedPageBreak/>
         <w:t>Final Version</w:t>
@@ -9257,7 +9594,7 @@
       <w:pPr>
         <w:pStyle w:val="Heading1"/>
       </w:pPr>
-      <w:bookmarkStart w:id="32" w:name="_Toc223792480"/>
+      <w:bookmarkStart w:id="32" w:name="_Toc223794394"/>
       <w:r>
         <w:lastRenderedPageBreak/>
         <w:t>Results</w:t>
@@ -9268,7 +9605,7 @@
       <w:pPr>
         <w:pStyle w:val="Heading2"/>
       </w:pPr>
-      <w:bookmarkStart w:id="33" w:name="_Toc223792481"/>
+      <w:bookmarkStart w:id="33" w:name="_Toc223794395"/>
       <w:r>
         <w:t>Prototype Tests</w:t>
       </w:r>
@@ -9358,7 +9695,7 @@
       <w:pPr>
         <w:pStyle w:val="Heading3"/>
       </w:pPr>
-      <w:bookmarkStart w:id="34" w:name="_Toc223792482"/>
+      <w:bookmarkStart w:id="34" w:name="_Toc223794396"/>
       <w:r>
         <w:t>Interaction</w:t>
       </w:r>
@@ -9398,7 +9735,7 @@
       <w:pPr>
         <w:pStyle w:val="Heading3"/>
       </w:pPr>
-      <w:bookmarkStart w:id="35" w:name="_Toc223792483"/>
+      <w:bookmarkStart w:id="35" w:name="_Toc223794397"/>
       <w:r>
         <w:t>User Attention Detection</w:t>
       </w:r>
@@ -9432,7 +9769,7 @@
       <w:pPr>
         <w:pStyle w:val="Heading3"/>
       </w:pPr>
-      <w:bookmarkStart w:id="36" w:name="_Toc223792484"/>
+      <w:bookmarkStart w:id="36" w:name="_Toc223794398"/>
       <w:r>
         <w:t>Symptom Simulations</w:t>
       </w:r>
@@ -9460,7 +9797,7 @@
       <w:pPr>
         <w:pStyle w:val="Heading3"/>
       </w:pPr>
-      <w:bookmarkStart w:id="37" w:name="_Toc223792485"/>
+      <w:bookmarkStart w:id="37" w:name="_Toc223794399"/>
       <w:r>
         <w:t>Strengths and Weaknesses</w:t>
       </w:r>
@@ -9470,7 +9807,7 @@
       <w:pPr>
         <w:pStyle w:val="Heading3"/>
       </w:pPr>
-      <w:bookmarkStart w:id="38" w:name="_Toc223792486"/>
+      <w:bookmarkStart w:id="38" w:name="_Toc223794400"/>
       <w:r>
         <w:t xml:space="preserve">Improvements to be </w:t>
       </w:r>
@@ -9487,12 +9824,74 @@
       <w:pPr>
         <w:pStyle w:val="Heading2"/>
       </w:pPr>
-      <w:bookmarkStart w:id="39" w:name="_Toc223792487"/>
+      <w:bookmarkStart w:id="39" w:name="_Toc223794401"/>
+      <w:r>
+        <w:t>Final Version Tests</w:t>
+      </w:r>
+      <w:bookmarkEnd w:id="39"/>
+    </w:p>
+    <w:p>
+      <w:r>
+        <w:t xml:space="preserve">After the improvements carried out from the results of the prototype tests, a new set of tests </w:t>
+      </w:r>
+      <w:r>
+        <w:t>was</w:t>
+      </w:r>
+      <w:r>
+        <w:t xml:space="preserve"> carried out to ensure the improvements had made a positive impact on the experience instead of hindering it. The conducted tests were relatively the same </w:t>
+      </w:r>
+      <w:r>
+        <w:t>as</w:t>
+      </w:r>
+      <w:r>
+        <w:t xml:space="preserve"> the first set carried out for the prototype version, although slight changes were made to probe for any weaknesses within the improvements made. This choice was made to ensure that the final version did not have bugs, show clear polish and refinements while </w:t>
+      </w:r>
+      <w:r>
+        <w:t>maintaining the</w:t>
+      </w:r>
+      <w:r>
+        <w:t xml:space="preserve"> integrity</w:t>
+      </w:r>
+      <w:r>
+        <w:t xml:space="preserve"> of the application</w:t>
+      </w:r>
+      <w:r>
+        <w:t xml:space="preserve"> so that users could have the best possible experience.</w:t>
+      </w:r>
+    </w:p>
+    <w:p>
+      <w:pPr>
+        <w:pStyle w:val="Heading3"/>
+      </w:pPr>
+      <w:bookmarkStart w:id="40" w:name="_Toc223794402"/>
       <w:r>
         <w:lastRenderedPageBreak/>
-        <w:t>Final Version Tests</w:t>
-      </w:r>
-      <w:bookmarkEnd w:id="39"/>
+        <w:t>Interaction Objects and Objective Understanding</w:t>
+      </w:r>
+      <w:bookmarkEnd w:id="40"/>
+    </w:p>
+    <w:p>
+      <w:pPr>
+        <w:pStyle w:val="Heading3"/>
+      </w:pPr>
+      <w:bookmarkStart w:id="41" w:name="_Toc223794403"/>
+      <w:r>
+        <w:t>User Attention Detection</w:t>
+      </w:r>
+      <w:bookmarkEnd w:id="41"/>
+    </w:p>
+    <w:p>
+      <w:pPr>
+        <w:pStyle w:val="Heading3"/>
+      </w:pPr>
+      <w:bookmarkStart w:id="42" w:name="_Toc223794404"/>
+      <w:r>
+        <w:t>Symptom Simulation</w:t>
+      </w:r>
+      <w:r>
+        <w:t>s</w:t>
+      </w:r>
+      <w:bookmarkEnd w:id="42"/>
       <w:r>
         <w:br w:type="page"/>
       </w:r>
@@ -9501,12 +9900,12 @@
       <w:pPr>
         <w:pStyle w:val="Heading1"/>
       </w:pPr>
-      <w:bookmarkStart w:id="40" w:name="_Toc223792488"/>
+      <w:bookmarkStart w:id="43" w:name="_Toc223794405"/>
       <w:r>
         <w:lastRenderedPageBreak/>
         <w:t>Critical Evaluation</w:t>
       </w:r>
-      <w:bookmarkEnd w:id="40"/>
+      <w:bookmarkEnd w:id="43"/>
     </w:p>
     <w:p>
       <w:pPr>
@@ -9528,12 +9927,12 @@
       <w:pPr>
         <w:pStyle w:val="Heading1"/>
       </w:pPr>
-      <w:bookmarkStart w:id="41" w:name="_Toc223792489"/>
+      <w:bookmarkStart w:id="44" w:name="_Toc223794406"/>
       <w:r>
         <w:lastRenderedPageBreak/>
         <w:t>Conclusions and Future Work</w:t>
       </w:r>
-      <w:bookmarkEnd w:id="41"/>
+      <w:bookmarkEnd w:id="44"/>
     </w:p>
     <w:p>
       <w:pPr>
@@ -9578,17 +9977,31 @@
       <w:pPr>
         <w:pStyle w:val="Heading1"/>
       </w:pPr>
-      <w:bookmarkStart w:id="42" w:name="_Toc223792490"/>
+      <w:bookmarkStart w:id="45" w:name="_Toc223794407"/>
       <w:r>
         <w:lastRenderedPageBreak/>
         <w:t>References</w:t>
       </w:r>
-      <w:bookmarkEnd w:id="42"/>
-    </w:p>
-    <w:p>
-      <w:r>
-        <w:t xml:space="preserve">Cantó-Sancho, N., Porru, S., Casati, S., Ronda, E., Seguí-Crespo, M. and Carta, A. (2023) ‘Prevalence and risk factors of computer vision syndrome—assessed in office workers by a validated questionnaire’. </w:t>
-      </w:r>
+      <w:bookmarkEnd w:id="45"/>
+    </w:p>
+    <w:p>
+      <w:proofErr w:type="spellStart"/>
+      <w:r>
+        <w:t>Cantó</w:t>
+      </w:r>
+      <w:proofErr w:type="spellEnd"/>
+      <w:r>
+        <w:t xml:space="preserve">-Sancho, N., </w:t>
+      </w:r>
+      <w:proofErr w:type="spellStart"/>
+      <w:r>
+        <w:t>Porru</w:t>
+      </w:r>
+      <w:proofErr w:type="spellEnd"/>
+      <w:r>
+        <w:t xml:space="preserve">, S., Casati, S., Ronda, E., Seguí-Crespo, M. and Carta, A. (2023) ‘Prevalence and risk factors of computer vision syndrome—assessed in office workers by a validated questionnaire’. </w:t>
+      </w:r>
+      <w:proofErr w:type="spellStart"/>
       <w:r>
         <w:rPr>
           <w:i/>
@@ -9596,13 +10009,30 @@
         </w:rPr>
         <w:t>PeerJ</w:t>
       </w:r>
+      <w:proofErr w:type="spellEnd"/>
       <w:r>
         <w:t xml:space="preserve"> 11, p. e14937. Available at: https://www.researchgate.net/publication/369002899_Prevalence_and_risk_factors_of_computer_vision_syndrome-assessed_in_office_workers_by_a_validated_questionnaire (Accessed: 20 October 2025).</w:t>
       </w:r>
     </w:p>
     <w:p>
       <w:r>
-        <w:t xml:space="preserve">Chandrasekhara, R.S., Low, C., Lim, Y., Low, L., Mardina, F. and Nursaleha, M. (2013) ‘Computer vision syndrome: a study of knowledge and practices in university students’. </w:t>
+        <w:t xml:space="preserve">Chandrasekhara, R.S., Low, C., Lim, Y., Low, L., Mardina, F. and </w:t>
+      </w:r>
+      <w:proofErr w:type="spellStart"/>
+      <w:r>
+        <w:t>Nursaleha</w:t>
+      </w:r>
+      <w:proofErr w:type="spellEnd"/>
+      <w:r>
+        <w:t xml:space="preserve">, M. (2013) ‘Computer vision syndrome: a study of knowledge and practices in university </w:t>
+      </w:r>
+      <w:proofErr w:type="gramStart"/>
+      <w:r>
+        <w:t>students’</w:t>
+      </w:r>
+      <w:proofErr w:type="gramEnd"/>
+      <w:r>
+        <w:t xml:space="preserve">. </w:t>
       </w:r>
       <w:r>
         <w:rPr>
@@ -9628,7 +10058,15 @@
     </w:p>
     <w:p>
       <w:r>
-        <w:t xml:space="preserve">Muñoz, E.G., Fabregat, R., Bacca-Acosta, J., Duque-Méndez, N. and Avila-Garzon, C. (2022) ‘Augmented Reality, Virtual Reality, and Game Technologies in Ophthalmology Training’. </w:t>
+        <w:t xml:space="preserve">Muñoz, E.G., </w:t>
+      </w:r>
+      <w:proofErr w:type="spellStart"/>
+      <w:r>
+        <w:t>Fabregat</w:t>
+      </w:r>
+      <w:proofErr w:type="spellEnd"/>
+      <w:r>
+        <w:t xml:space="preserve">, R., Bacca-Acosta, J., Duque-Méndez, N. and Avila-Garzon, C. (2022) ‘Augmented Reality, Virtual Reality, and Game Technologies in Ophthalmology Training’. </w:t>
       </w:r>
       <w:r>
         <w:rPr>
@@ -9638,7 +10076,15 @@
         <w:t>Information</w:t>
       </w:r>
       <w:r>
-        <w:t xml:space="preserve"> 13(5), p. 222. doi: </w:t>
+        <w:t xml:space="preserve"> 13(5), p. 222. </w:t>
+      </w:r>
+      <w:proofErr w:type="spellStart"/>
+      <w:r>
+        <w:t>doi</w:t>
+      </w:r>
+      <w:proofErr w:type="spellEnd"/>
+      <w:r>
+        <w:t xml:space="preserve">: </w:t>
       </w:r>
       <w:hyperlink r:id="rId16" w:history="1">
         <w:r>
@@ -9654,12 +10100,33 @@
     </w:p>
     <w:p>
       <w:r>
-        <w:t>Orji, J., Hernandez, A., Selema, B. and Orji, R. (2022) ‘Virtual and augmented reality applications for promoting safety and security: A systematic review’., pp. 1–7. doi: https://doi.org/10.1109/SEGAH54908.2022.9978597.</w:t>
-      </w:r>
-    </w:p>
-    <w:p>
-      <w:r>
-        <w:t xml:space="preserve">Porcar, E., Pons, A. and Lorente, A. (2016) ‘Visual and ocular effects from the use of flat-panel displays’. </w:t>
+        <w:t xml:space="preserve">Orji, J., Hernandez, A., Selema, B. and Orji, R. (2022) ‘Virtual and augmented reality applications for promoting safety and security: A systematic review’., pp. 1–7. </w:t>
+      </w:r>
+      <w:proofErr w:type="spellStart"/>
+      <w:r>
+        <w:t>doi</w:t>
+      </w:r>
+      <w:proofErr w:type="spellEnd"/>
+      <w:r>
+        <w:t>: https://doi.org/10.1109/SEGAH54908.2022.9978597.</w:t>
+      </w:r>
+    </w:p>
+    <w:p>
+      <w:proofErr w:type="spellStart"/>
+      <w:r>
+        <w:t>Porcar</w:t>
+      </w:r>
+      <w:proofErr w:type="spellEnd"/>
+      <w:r>
+        <w:t xml:space="preserve">, E., Pons, A. and Lorente, A. (2016) ‘Visual and ocular effects from the use of flat-panel </w:t>
+      </w:r>
+      <w:proofErr w:type="gramStart"/>
+      <w:r>
+        <w:t>displays’</w:t>
+      </w:r>
+      <w:proofErr w:type="gramEnd"/>
+      <w:r>
+        <w:t xml:space="preserve">. </w:t>
       </w:r>
       <w:r>
         <w:rPr>
@@ -9674,7 +10141,23 @@
     </w:p>
     <w:p>
       <w:r>
-        <w:t xml:space="preserve">Santilli, T., Ceccacci, S., Mengoni, M. and Catia Giaconi (2025) ‘Virtual vs. traditional learning in higher education: A systematic review of comparative studies’. </w:t>
+        <w:t xml:space="preserve">Santilli, T., Ceccacci, S., Mengoni, M. and Catia </w:t>
+      </w:r>
+      <w:proofErr w:type="spellStart"/>
+      <w:r>
+        <w:t>Giaconi</w:t>
+      </w:r>
+      <w:proofErr w:type="spellEnd"/>
+      <w:r>
+        <w:t xml:space="preserve"> (2025) ‘Virtual vs. traditional learning in higher education: A systematic review of comparative </w:t>
+      </w:r>
+      <w:proofErr w:type="gramStart"/>
+      <w:r>
+        <w:t>studies’</w:t>
+      </w:r>
+      <w:proofErr w:type="gramEnd"/>
+      <w:r>
+        <w:t xml:space="preserve">. </w:t>
       </w:r>
       <w:r>
         <w:rPr>
@@ -9709,7 +10192,23 @@
     </w:p>
     <w:p>
       <w:r>
-        <w:t>Vieira, F., Oliveira, E. and Rodrigues, N. (2019) ‘iSVC – digital platform for detection and prevention of computer vision syndrome’., pp. 1–7. doi: https://doi.org/10.1109/SeGAH.2019.8882438.</w:t>
+        <w:t>Vieira, F., Oliveira, E. and Rodrigues, N. (2019) ‘</w:t>
+      </w:r>
+      <w:proofErr w:type="spellStart"/>
+      <w:r>
+        <w:t>iSVC</w:t>
+      </w:r>
+      <w:proofErr w:type="spellEnd"/>
+      <w:r>
+        <w:t xml:space="preserve"> – digital platform for detection and prevention of computer vision syndrome’., pp. 1–7. </w:t>
+      </w:r>
+      <w:proofErr w:type="spellStart"/>
+      <w:r>
+        <w:t>doi</w:t>
+      </w:r>
+      <w:proofErr w:type="spellEnd"/>
+      <w:r>
+        <w:t>: https://doi.org/10.1109/SeGAH.2019.8882438.</w:t>
       </w:r>
     </w:p>
     <w:p>
@@ -9724,12 +10223,28 @@
         <w:t>Annals of Emerging Technologies in Computing</w:t>
       </w:r>
       <w:r>
-        <w:t xml:space="preserve"> 9(3), pp. 50–68. doi: https://doi.org/10.33166/aetic.2025.03.004.</w:t>
-      </w:r>
-    </w:p>
-    <w:p>
-      <w:r>
-        <w:t xml:space="preserve">Youcef, B., Ahmad, M.N. and Mustapha, M. (2021) ‘OntoPhaco: An ontology for virtual reality training in ophthalmology Domain—A case study of cataract surgery’. </w:t>
+        <w:t xml:space="preserve"> 9(3), pp. 50–68. </w:t>
+      </w:r>
+      <w:proofErr w:type="spellStart"/>
+      <w:r>
+        <w:t>doi</w:t>
+      </w:r>
+      <w:proofErr w:type="spellEnd"/>
+      <w:r>
+        <w:t>: https://doi.org/10.33166/aetic.2025.03.004.</w:t>
+      </w:r>
+    </w:p>
+    <w:p>
+      <w:r>
+        <w:t>Youcef, B., Ahmad, M.N. and Mustapha, M. (2021) ‘</w:t>
+      </w:r>
+      <w:proofErr w:type="spellStart"/>
+      <w:r>
+        <w:t>OntoPhaco</w:t>
+      </w:r>
+      <w:proofErr w:type="spellEnd"/>
+      <w:r>
+        <w:t xml:space="preserve">: An ontology for virtual reality training in ophthalmology Domain—A case study of cataract surgery’. </w:t>
       </w:r>
       <w:r>
         <w:rPr>
@@ -9739,7 +10254,15 @@
         <w:t>IEEE Access</w:t>
       </w:r>
       <w:r>
-        <w:t xml:space="preserve"> 9, pp. 152347–152378. doi: https://doi.org/10.1109/ACCESS.2021.3126697.</w:t>
+        <w:t xml:space="preserve"> 9, pp. 152347–152378. </w:t>
+      </w:r>
+      <w:proofErr w:type="spellStart"/>
+      <w:r>
+        <w:t>doi</w:t>
+      </w:r>
+      <w:proofErr w:type="spellEnd"/>
+      <w:r>
+        <w:t>: https://doi.org/10.1109/ACCESS.2021.3126697.</w:t>
       </w:r>
     </w:p>
     <w:p/>
@@ -9747,32 +10270,32 @@
       <w:pPr>
         <w:pStyle w:val="Heading1"/>
       </w:pPr>
-      <w:bookmarkStart w:id="43" w:name="_Toc223792491"/>
+      <w:bookmarkStart w:id="46" w:name="_Toc223794408"/>
       <w:r>
         <w:lastRenderedPageBreak/>
         <w:t>Appendix</w:t>
       </w:r>
-      <w:bookmarkEnd w:id="43"/>
+      <w:bookmarkEnd w:id="46"/>
     </w:p>
     <w:p>
       <w:pPr>
         <w:pStyle w:val="Heading2"/>
       </w:pPr>
-      <w:bookmarkStart w:id="44" w:name="_Toc223792492"/>
+      <w:bookmarkStart w:id="47" w:name="_Toc223794409"/>
       <w:r>
         <w:t>Asset Licenses and Sources</w:t>
       </w:r>
-      <w:bookmarkEnd w:id="44"/>
+      <w:bookmarkEnd w:id="47"/>
     </w:p>
     <w:p>
       <w:pPr>
         <w:pStyle w:val="Heading3"/>
       </w:pPr>
-      <w:bookmarkStart w:id="45" w:name="_Toc223792493"/>
+      <w:bookmarkStart w:id="48" w:name="_Toc223794410"/>
       <w:r>
         <w:t>Modern Office Table</w:t>
       </w:r>
-      <w:bookmarkEnd w:id="45"/>
+      <w:bookmarkEnd w:id="48"/>
     </w:p>
     <w:p>
       <w:r>
@@ -9852,11 +10375,11 @@
       <w:pPr>
         <w:pStyle w:val="Heading3"/>
       </w:pPr>
-      <w:bookmarkStart w:id="46" w:name="_Toc223792494"/>
+      <w:bookmarkStart w:id="49" w:name="_Toc223794411"/>
       <w:r>
         <w:t>Free Studio Starter Pack</w:t>
       </w:r>
-      <w:bookmarkEnd w:id="46"/>
+      <w:bookmarkEnd w:id="49"/>
     </w:p>
     <w:p>
       <w:r>
@@ -9936,11 +10459,11 @@
       <w:pPr>
         <w:pStyle w:val="Heading3"/>
       </w:pPr>
-      <w:bookmarkStart w:id="47" w:name="_Toc223792495"/>
+      <w:bookmarkStart w:id="50" w:name="_Toc223794412"/>
       <w:r>
         <w:t>General Desktop Bundle</w:t>
       </w:r>
-      <w:bookmarkEnd w:id="47"/>
+      <w:bookmarkEnd w:id="50"/>
     </w:p>
     <w:p>
       <w:r>
@@ -10020,12 +10543,12 @@
       <w:pPr>
         <w:pStyle w:val="Heading3"/>
       </w:pPr>
-      <w:bookmarkStart w:id="48" w:name="_Toc223792496"/>
+      <w:bookmarkStart w:id="51" w:name="_Toc223794413"/>
       <w:r>
         <w:lastRenderedPageBreak/>
         <w:t>General Gaming Headset</w:t>
       </w:r>
-      <w:bookmarkEnd w:id="48"/>
+      <w:bookmarkEnd w:id="51"/>
     </w:p>
     <w:p>
       <w:r>
@@ -10105,11 +10628,11 @@
       <w:pPr>
         <w:pStyle w:val="Heading3"/>
       </w:pPr>
-      <w:bookmarkStart w:id="49" w:name="_Toc223792497"/>
+      <w:bookmarkStart w:id="52" w:name="_Toc223794414"/>
       <w:r>
         <w:t>General Gaming Chair</w:t>
       </w:r>
-      <w:bookmarkEnd w:id="49"/>
+      <w:bookmarkEnd w:id="52"/>
     </w:p>
     <w:p>
       <w:r>
@@ -10189,11 +10712,11 @@
       <w:pPr>
         <w:pStyle w:val="Heading3"/>
       </w:pPr>
-      <w:bookmarkStart w:id="50" w:name="_Toc223792498"/>
+      <w:bookmarkStart w:id="53" w:name="_Toc223794415"/>
       <w:r>
         <w:t>Light Switch</w:t>
       </w:r>
-      <w:bookmarkEnd w:id="50"/>
+      <w:bookmarkEnd w:id="53"/>
     </w:p>
     <w:p>
       <w:r>
@@ -10287,12 +10810,12 @@
       <w:pPr>
         <w:pStyle w:val="Heading3"/>
       </w:pPr>
-      <w:bookmarkStart w:id="51" w:name="_Toc223792499"/>
+      <w:bookmarkStart w:id="54" w:name="_Toc223794416"/>
       <w:r>
         <w:lastRenderedPageBreak/>
         <w:t>Materials for General PC setup</w:t>
       </w:r>
-      <w:bookmarkEnd w:id="51"/>
+      <w:bookmarkEnd w:id="54"/>
     </w:p>
     <w:p>
       <w:r>
@@ -10414,12 +10937,12 @@
       <w:pPr>
         <w:pStyle w:val="Heading3"/>
       </w:pPr>
-      <w:bookmarkStart w:id="52" w:name="_Toc223792500"/>
+      <w:bookmarkStart w:id="55" w:name="_Toc223794417"/>
       <w:r>
         <w:lastRenderedPageBreak/>
         <w:t>Monitor background image</w:t>
       </w:r>
-      <w:bookmarkEnd w:id="52"/>
+      <w:bookmarkEnd w:id="55"/>
     </w:p>
     <w:p>
       <w:r>
@@ -10510,12 +11033,25 @@
       <w:pPr>
         <w:pStyle w:val="Heading3"/>
       </w:pPr>
-      <w:bookmarkStart w:id="53" w:name="_Toc223792501"/>
+      <w:bookmarkStart w:id="56" w:name="_Toc223794418"/>
       <w:r>
         <w:lastRenderedPageBreak/>
-        <w:t>Button Hover Sfx by Fachii</w:t>
-      </w:r>
-      <w:bookmarkEnd w:id="53"/>
+        <w:t xml:space="preserve">Button Hover </w:t>
+      </w:r>
+      <w:proofErr w:type="spellStart"/>
+      <w:r>
+        <w:t>Sfx</w:t>
+      </w:r>
+      <w:proofErr w:type="spellEnd"/>
+      <w:r>
+        <w:t xml:space="preserve"> by </w:t>
+      </w:r>
+      <w:proofErr w:type="spellStart"/>
+      <w:r>
+        <w:t>Fachii</w:t>
+      </w:r>
+      <w:bookmarkEnd w:id="56"/>
+      <w:proofErr w:type="spellEnd"/>
     </w:p>
     <w:p>
       <w:r>
@@ -10610,14 +11146,36 @@
     </w:p>
     <w:p/>
     <w:p>
-      <w:bookmarkStart w:id="54" w:name="_Toc223792502"/>
+      <w:bookmarkStart w:id="57" w:name="_Toc223794419"/>
       <w:r>
         <w:rPr>
           <w:rStyle w:val="Heading3Char"/>
         </w:rPr>
-        <w:t>Button click Sfx by AndrewEathan</w:t>
-      </w:r>
-      <w:bookmarkEnd w:id="54"/>
+        <w:t xml:space="preserve">Button click </w:t>
+      </w:r>
+      <w:proofErr w:type="spellStart"/>
+      <w:r>
+        <w:rPr>
+          <w:rStyle w:val="Heading3Char"/>
+        </w:rPr>
+        <w:t>Sfx</w:t>
+      </w:r>
+      <w:proofErr w:type="spellEnd"/>
+      <w:r>
+        <w:rPr>
+          <w:rStyle w:val="Heading3Char"/>
+        </w:rPr>
+        <w:t xml:space="preserve"> by </w:t>
+      </w:r>
+      <w:proofErr w:type="spellStart"/>
+      <w:r>
+        <w:rPr>
+          <w:rStyle w:val="Heading3Char"/>
+        </w:rPr>
+        <w:t>AndrewEathan</w:t>
+      </w:r>
+      <w:bookmarkEnd w:id="57"/>
+      <w:proofErr w:type="spellEnd"/>
       <w:r>
         <w:t xml:space="preserve"> </w:t>
       </w:r>
@@ -10723,12 +11281,25 @@
       <w:pPr>
         <w:pStyle w:val="Heading3"/>
       </w:pPr>
-      <w:bookmarkStart w:id="55" w:name="_Toc223792503"/>
+      <w:bookmarkStart w:id="58" w:name="_Toc223794420"/>
       <w:r>
         <w:lastRenderedPageBreak/>
-        <w:t>Light Switch On Sfx</w:t>
-      </w:r>
-      <w:bookmarkEnd w:id="55"/>
+        <w:t xml:space="preserve">Light Switch </w:t>
+      </w:r>
+      <w:proofErr w:type="gramStart"/>
+      <w:r>
+        <w:t>On</w:t>
+      </w:r>
+      <w:proofErr w:type="gramEnd"/>
+      <w:r>
+        <w:t xml:space="preserve"> </w:t>
+      </w:r>
+      <w:proofErr w:type="spellStart"/>
+      <w:r>
+        <w:t>Sfx</w:t>
+      </w:r>
+      <w:bookmarkEnd w:id="58"/>
+      <w:proofErr w:type="spellEnd"/>
     </w:p>
     <w:p>
       <w:r>
@@ -10818,11 +11389,16 @@
       <w:pPr>
         <w:pStyle w:val="Heading3"/>
       </w:pPr>
-      <w:bookmarkStart w:id="56" w:name="_Toc223792504"/>
-      <w:r>
-        <w:t>Light Switch Off Sfx</w:t>
-      </w:r>
-      <w:bookmarkEnd w:id="56"/>
+      <w:bookmarkStart w:id="59" w:name="_Toc223794421"/>
+      <w:r>
+        <w:t xml:space="preserve">Light Switch Off </w:t>
+      </w:r>
+      <w:proofErr w:type="spellStart"/>
+      <w:r>
+        <w:t>Sfx</w:t>
+      </w:r>
+      <w:bookmarkEnd w:id="59"/>
+      <w:proofErr w:type="spellEnd"/>
     </w:p>
     <w:p>
       <w:r>

</xml_diff>

<commit_message>
Completed object interaction and objective paragraph
</commit_message>
<xml_diff>
--- a/30077548Thesis.docx
+++ b/30077548Thesis.docx
@@ -5074,13 +5074,8 @@
       <w:r>
         <w:t xml:space="preserve">. </w:t>
       </w:r>
-      <w:proofErr w:type="spellStart"/>
-      <w:r>
-        <w:t>Porcar</w:t>
-      </w:r>
-      <w:proofErr w:type="spellEnd"/>
-      <w:r>
-        <w:t xml:space="preserve"> et al., </w:t>
+      <w:r>
+        <w:t xml:space="preserve">Porcar et al., </w:t>
       </w:r>
       <w:r>
         <w:t>(</w:t>
@@ -5120,13 +5115,8 @@
       <w:r>
         <w:t xml:space="preserve">Research conducted by </w:t>
       </w:r>
-      <w:proofErr w:type="spellStart"/>
-      <w:r>
-        <w:t>Cantó</w:t>
-      </w:r>
-      <w:proofErr w:type="spellEnd"/>
-      <w:r>
-        <w:t xml:space="preserve">-Sancho et al., </w:t>
+      <w:r>
+        <w:t xml:space="preserve">Cantó-Sancho et al., </w:t>
       </w:r>
       <w:r>
         <w:t>(</w:t>
@@ -6769,21 +6759,7 @@
         <w:rPr>
           <w:rFonts w:cs="Arial"/>
         </w:rPr>
-        <w:t xml:space="preserve">Clear </w:t>
-      </w:r>
-      <w:proofErr w:type="gramStart"/>
-      <w:r>
-        <w:rPr>
-          <w:rFonts w:cs="Arial"/>
-        </w:rPr>
-        <w:t>on screen</w:t>
-      </w:r>
-      <w:proofErr w:type="gramEnd"/>
-      <w:r>
-        <w:rPr>
-          <w:rFonts w:cs="Arial"/>
-        </w:rPr>
-        <w:t xml:space="preserve"> prompts to guide and support users that aren’t familiar with VR equipment</w:t>
+        <w:t>Clear on screen prompts to guide and support users that aren’t familiar with VR equipment</w:t>
       </w:r>
     </w:p>
     <w:p>
@@ -6926,7 +6902,6 @@
         <w:pStyle w:val="Heading3"/>
       </w:pPr>
       <w:bookmarkStart w:id="11" w:name="_Toc223794373"/>
-      <w:proofErr w:type="spellStart"/>
       <w:r>
         <w:t>Ey</w:t>
       </w:r>
@@ -6937,7 +6912,6 @@
         <w:t>si</w:t>
       </w:r>
       <w:bookmarkEnd w:id="11"/>
-      <w:proofErr w:type="spellEnd"/>
     </w:p>
     <w:p>
       <w:r>
@@ -6952,11 +6926,9 @@
       <w:r>
         <w:t xml:space="preserve"> discussed </w:t>
       </w:r>
-      <w:proofErr w:type="spellStart"/>
       <w:r>
         <w:t>Eyesi</w:t>
       </w:r>
-      <w:proofErr w:type="spellEnd"/>
       <w:r>
         <w:t>,</w:t>
       </w:r>
@@ -7069,15 +7041,7 @@
         <w:t xml:space="preserve">In addition to this, there is an </w:t>
       </w:r>
       <w:r>
-        <w:t>online training portal (</w:t>
-      </w:r>
-      <w:proofErr w:type="spellStart"/>
-      <w:r>
-        <w:t>vrmnet</w:t>
-      </w:r>
-      <w:proofErr w:type="spellEnd"/>
-      <w:r>
-        <w:t xml:space="preserve">) </w:t>
+        <w:t xml:space="preserve">online training portal (vrmnet) </w:t>
       </w:r>
       <w:r>
         <w:t>allowing comparison between trainees</w:t>
@@ -7212,15 +7176,7 @@
         <w:t xml:space="preserve"> </w:t>
       </w:r>
       <w:r>
-        <w:t xml:space="preserve">While </w:t>
-      </w:r>
-      <w:proofErr w:type="spellStart"/>
-      <w:r>
-        <w:t>Eyesi</w:t>
-      </w:r>
-      <w:proofErr w:type="spellEnd"/>
-      <w:r>
-        <w:t xml:space="preserve"> is effective for medical training for medical professionals, </w:t>
+        <w:t xml:space="preserve">While Eyesi is effective for medical training for medical professionals, </w:t>
       </w:r>
       <w:r>
         <w:t xml:space="preserve">similar </w:t>
@@ -7243,12 +7199,10 @@
         <w:pStyle w:val="Heading3"/>
       </w:pPr>
       <w:bookmarkStart w:id="12" w:name="_Toc223794374"/>
-      <w:proofErr w:type="spellStart"/>
       <w:r>
         <w:t>OntoPhaco</w:t>
       </w:r>
       <w:bookmarkEnd w:id="12"/>
-      <w:proofErr w:type="spellEnd"/>
     </w:p>
     <w:p>
       <w:r>
@@ -7267,15 +7221,7 @@
         <w:t>d</w:t>
       </w:r>
       <w:r>
-        <w:t xml:space="preserve"> </w:t>
-      </w:r>
-      <w:proofErr w:type="spellStart"/>
-      <w:r>
-        <w:t>OntoPhaco</w:t>
-      </w:r>
-      <w:proofErr w:type="spellEnd"/>
-      <w:r>
-        <w:t>, a</w:t>
+        <w:t xml:space="preserve"> OntoPhaco, a</w:t>
       </w:r>
       <w:r>
         <w:t>n</w:t>
@@ -7408,191 +7354,173 @@
           <w:rFonts w:cs="TimesLTStd-Roman"/>
           <w:kern w:val="0"/>
         </w:rPr>
-        <w:t xml:space="preserve">Since </w:t>
-      </w:r>
-      <w:proofErr w:type="spellStart"/>
+        <w:t>Since OntoPhaco</w:t>
+      </w:r>
       <w:r>
         <w:rPr>
           <w:rFonts w:cs="TimesLTStd-Roman"/>
           <w:kern w:val="0"/>
         </w:rPr>
-        <w:t>OntoPhaco</w:t>
+        <w:t>’s</w:t>
       </w:r>
       <w:r>
         <w:rPr>
           <w:rFonts w:cs="TimesLTStd-Roman"/>
           <w:kern w:val="0"/>
         </w:rPr>
-        <w:t>’s</w:t>
-      </w:r>
-      <w:proofErr w:type="spellEnd"/>
+        <w:t xml:space="preserve"> </w:t>
+      </w:r>
+      <w:r>
+        <w:t>s</w:t>
+      </w:r>
+      <w:r>
+        <w:t xml:space="preserve">ystematic verification and validation processes </w:t>
+      </w:r>
+      <w:r>
+        <w:t>include</w:t>
+      </w:r>
+      <w:r>
+        <w:t xml:space="preserve"> </w:t>
+      </w:r>
+      <w:r>
+        <w:t xml:space="preserve">theoretical </w:t>
+      </w:r>
+      <w:r>
+        <w:t>evaluat</w:t>
+      </w:r>
+      <w:r>
+        <w:t xml:space="preserve">ion </w:t>
+      </w:r>
+      <w:r>
+        <w:t>and expert feedback</w:t>
+      </w:r>
       <w:r>
         <w:rPr>
           <w:rFonts w:cs="TimesLTStd-Roman"/>
           <w:kern w:val="0"/>
         </w:rPr>
-        <w:t xml:space="preserve"> </w:t>
-      </w:r>
-      <w:r>
-        <w:t>s</w:t>
-      </w:r>
-      <w:r>
-        <w:t xml:space="preserve">ystematic verification and validation processes </w:t>
-      </w:r>
-      <w:r>
-        <w:t>include</w:t>
-      </w:r>
-      <w:r>
-        <w:t xml:space="preserve"> </w:t>
-      </w:r>
-      <w:r>
-        <w:t xml:space="preserve">theoretical </w:t>
-      </w:r>
-      <w:r>
-        <w:t>evaluat</w:t>
-      </w:r>
-      <w:r>
-        <w:t xml:space="preserve">ion </w:t>
-      </w:r>
-      <w:r>
-        <w:t>and expert feedback</w:t>
+        <w:t xml:space="preserve">, each change, minor or major </w:t>
       </w:r>
       <w:r>
         <w:rPr>
           <w:rFonts w:cs="TimesLTStd-Roman"/>
           <w:kern w:val="0"/>
         </w:rPr>
-        <w:t xml:space="preserve">, each change, minor or major </w:t>
+        <w:t>is</w:t>
       </w:r>
       <w:r>
         <w:rPr>
           <w:rFonts w:cs="TimesLTStd-Roman"/>
           <w:kern w:val="0"/>
         </w:rPr>
-        <w:t>is</w:t>
+        <w:t xml:space="preserve"> verified and validate</w:t>
       </w:r>
       <w:r>
         <w:rPr>
           <w:rFonts w:cs="TimesLTStd-Roman"/>
           <w:kern w:val="0"/>
         </w:rPr>
-        <w:t xml:space="preserve"> verified and validate</w:t>
+        <w:t>d</w:t>
+      </w:r>
+      <w:r>
+        <w:t>.</w:t>
       </w:r>
       <w:r>
         <w:rPr>
           <w:rFonts w:cs="TimesLTStd-Roman"/>
           <w:kern w:val="0"/>
         </w:rPr>
-        <w:t>d</w:t>
-      </w:r>
-      <w:r>
-        <w:t>.</w:t>
+        <w:t xml:space="preserve"> </w:t>
       </w:r>
       <w:r>
         <w:rPr>
           <w:rFonts w:cs="TimesLTStd-Roman"/>
           <w:kern w:val="0"/>
         </w:rPr>
-        <w:t xml:space="preserve"> </w:t>
-      </w:r>
-      <w:proofErr w:type="spellStart"/>
+        <w:t>OntoPhaco demonstrates VR</w:t>
+      </w:r>
       <w:r>
         <w:rPr>
           <w:rFonts w:cs="TimesLTStd-Roman"/>
           <w:kern w:val="0"/>
         </w:rPr>
-        <w:t>OntoPhaco</w:t>
-      </w:r>
-      <w:proofErr w:type="spellEnd"/>
+        <w:t>’</w:t>
+      </w:r>
       <w:r>
         <w:rPr>
           <w:rFonts w:cs="TimesLTStd-Roman"/>
           <w:kern w:val="0"/>
         </w:rPr>
-        <w:t xml:space="preserve"> demonstrates VR</w:t>
+        <w:t xml:space="preserve">s effectiveness </w:t>
       </w:r>
       <w:r>
         <w:rPr>
           <w:rFonts w:cs="TimesLTStd-Roman"/>
           <w:kern w:val="0"/>
         </w:rPr>
-        <w:t>’</w:t>
+        <w:t xml:space="preserve">paired </w:t>
       </w:r>
       <w:r>
         <w:rPr>
           <w:rFonts w:cs="TimesLTStd-Roman"/>
           <w:kern w:val="0"/>
         </w:rPr>
-        <w:t xml:space="preserve">s effectiveness </w:t>
+        <w:t>with ontology for medical training</w:t>
       </w:r>
       <w:r>
         <w:rPr>
           <w:rFonts w:cs="TimesLTStd-Roman"/>
           <w:kern w:val="0"/>
         </w:rPr>
-        <w:t xml:space="preserve">paired </w:t>
+        <w:t>. T</w:t>
       </w:r>
       <w:r>
         <w:rPr>
           <w:rFonts w:cs="TimesLTStd-Roman"/>
           <w:kern w:val="0"/>
         </w:rPr>
-        <w:t>with ontology for medical training</w:t>
+        <w:t>his project</w:t>
       </w:r>
       <w:r>
         <w:rPr>
           <w:rFonts w:cs="TimesLTStd-Roman"/>
           <w:kern w:val="0"/>
         </w:rPr>
-        <w:t>. T</w:t>
+        <w:t xml:space="preserve"> applies similar immersi</w:t>
       </w:r>
       <w:r>
         <w:rPr>
           <w:rFonts w:cs="TimesLTStd-Roman"/>
           <w:kern w:val="0"/>
         </w:rPr>
-        <w:t>his project</w:t>
+        <w:t>ve</w:t>
       </w:r>
       <w:r>
         <w:rPr>
           <w:rFonts w:cs="TimesLTStd-Roman"/>
           <w:kern w:val="0"/>
         </w:rPr>
-        <w:t xml:space="preserve"> applies similar immersi</w:t>
+        <w:t xml:space="preserve"> and educational knowledge </w:t>
       </w:r>
       <w:r>
         <w:rPr>
           <w:rFonts w:cs="TimesLTStd-Roman"/>
           <w:kern w:val="0"/>
         </w:rPr>
-        <w:t>ve</w:t>
+        <w:t xml:space="preserve">for DES to raise awareness, </w:t>
       </w:r>
       <w:r>
         <w:rPr>
           <w:rFonts w:cs="TimesLTStd-Roman"/>
           <w:kern w:val="0"/>
         </w:rPr>
-        <w:t xml:space="preserve"> and educational knowledge </w:t>
+        <w:t xml:space="preserve">spreading the </w:t>
       </w:r>
       <w:r>
         <w:rPr>
           <w:rFonts w:cs="TimesLTStd-Roman"/>
           <w:kern w:val="0"/>
         </w:rPr>
-        <w:t xml:space="preserve">for DES to raise awareness, </w:t>
-      </w:r>
-      <w:r>
-        <w:rPr>
-          <w:rFonts w:cs="TimesLTStd-Roman"/>
-          <w:kern w:val="0"/>
-        </w:rPr>
-        <w:t xml:space="preserve">spreading the </w:t>
-      </w:r>
-      <w:r>
-        <w:rPr>
-          <w:rFonts w:cs="TimesLTStd-Roman"/>
-          <w:kern w:val="0"/>
-        </w:rPr>
         <w:t>benefits of VR use in education beyond professional training.</w:t>
       </w:r>
     </w:p>
@@ -7806,27 +7734,17 @@
       <w:r>
         <w:t xml:space="preserve">While </w:t>
       </w:r>
-      <w:proofErr w:type="spellStart"/>
-      <w:r>
-        <w:t>Eyesi</w:t>
-      </w:r>
-      <w:proofErr w:type="spellEnd"/>
-      <w:r>
-        <w:t xml:space="preserve"> focuses on hands on surgical practices</w:t>
+      <w:r>
+        <w:t>Eyesi focuses on hands on surgical practices</w:t>
       </w:r>
       <w:r>
         <w:t xml:space="preserve">, </w:t>
       </w:r>
-      <w:proofErr w:type="spellStart"/>
       <w:r>
         <w:t>O</w:t>
       </w:r>
       <w:r>
-        <w:t>ntoPhaco</w:t>
-      </w:r>
-      <w:proofErr w:type="spellEnd"/>
-      <w:r>
-        <w:t xml:space="preserve"> focuses on the way knowledge is represented and conceptual understanding</w:t>
+        <w:t>ntoPhaco focuses on the way knowledge is represented and conceptual understanding</w:t>
       </w:r>
       <w:r>
         <w:t xml:space="preserve">. </w:t>
@@ -8084,19 +8002,9 @@
       <w:r>
         <w:t xml:space="preserve">Examples such as </w:t>
       </w:r>
-      <w:proofErr w:type="spellStart"/>
-      <w:r>
-        <w:t>Mediverse</w:t>
-      </w:r>
-      <w:proofErr w:type="spellEnd"/>
-      <w:r>
-        <w:t xml:space="preserve"> by </w:t>
-      </w:r>
-      <w:proofErr w:type="spellStart"/>
-      <w:r>
-        <w:t>Goggleminds</w:t>
-      </w:r>
-      <w:proofErr w:type="spellEnd"/>
+      <w:r>
+        <w:t>Mediverse by Goggleminds</w:t>
+      </w:r>
       <w:r>
         <w:t xml:space="preserve"> </w:t>
       </w:r>
@@ -8110,38 +8018,25 @@
         <w:t xml:space="preserve"> to healthcare providers and medical schools</w:t>
       </w:r>
       <w:r>
+        <w:t>. ClassVR by Systems improve</w:t>
+      </w:r>
+      <w:r>
+        <w:t>s</w:t>
+      </w:r>
+      <w:r>
+        <w:t xml:space="preserve"> student engagement</w:t>
+      </w:r>
+      <w:r>
+        <w:t xml:space="preserve"> to help teachers with educating students on learning material</w:t>
+      </w:r>
+      <w:r>
         <w:t xml:space="preserve">. </w:t>
       </w:r>
-      <w:proofErr w:type="spellStart"/>
-      <w:r>
-        <w:t>ClassVR</w:t>
-      </w:r>
-      <w:proofErr w:type="spellEnd"/>
-      <w:r>
-        <w:t xml:space="preserve"> by Systems improve</w:t>
-      </w:r>
-      <w:r>
-        <w:t>s</w:t>
-      </w:r>
-      <w:r>
-        <w:t xml:space="preserve"> student engagement</w:t>
-      </w:r>
-      <w:r>
-        <w:t xml:space="preserve"> to help teachers with educating students on learning material</w:t>
-      </w:r>
-      <w:r>
-        <w:t xml:space="preserve">. </w:t>
-      </w:r>
       <w:r>
         <w:t xml:space="preserve"> </w:t>
       </w:r>
-      <w:proofErr w:type="spellStart"/>
-      <w:r>
-        <w:t>PrismsVR</w:t>
-      </w:r>
-      <w:proofErr w:type="spellEnd"/>
-      <w:r>
-        <w:t xml:space="preserve"> </w:t>
+      <w:r>
+        <w:t xml:space="preserve">PrismsVR </w:t>
       </w:r>
       <w:r>
         <w:t xml:space="preserve">helps students grasp core concepts in algebra and geometry, by </w:t>
@@ -9263,15 +9158,7 @@
         <w:t>ere</w:t>
       </w:r>
       <w:r>
-        <w:t xml:space="preserve"> stored within the </w:t>
-      </w:r>
-      <w:proofErr w:type="spellStart"/>
-      <w:r>
-        <w:t>VRGameMode</w:t>
-      </w:r>
-      <w:proofErr w:type="spellEnd"/>
-      <w:r>
-        <w:t xml:space="preserve"> blueprint, with objectives being updated during runtime as conditions were satisfied </w:t>
+        <w:t xml:space="preserve"> stored within the VRGameMode blueprint, with objectives being updated during runtime as conditions were satisfied </w:t>
       </w:r>
       <w:r>
         <w:t>during</w:t>
@@ -9517,15 +9404,7 @@
         <w:t>’s post processing component</w:t>
       </w:r>
       <w:r>
-        <w:t xml:space="preserve">. These effects were </w:t>
-      </w:r>
-      <w:proofErr w:type="gramStart"/>
-      <w:r>
-        <w:t>vignette</w:t>
-      </w:r>
-      <w:proofErr w:type="gramEnd"/>
-      <w:r>
-        <w:t xml:space="preserve"> to simulate eye fatigue, bloom for light sensitivity and blur for focus strain. Vignette and bloom post processing effects were triggered through adjusting their post processing variables within the camera post processing component. However, for blur a post processing material was required to create the radial blur. When objectives progressed triggering the simulation of symptoms, a timeline was used to progressively increase the value of an effect gradually over a duration. This decision was made to accommodate eyes adjusting to the changes of the camera as these effects were being triggered.</w:t>
+        <w:t>. These effects were vignette to simulate eye fatigue, bloom for light sensitivity and blur for focus strain. Vignette and bloom post processing effects were triggered through adjusting their post processing variables within the camera post processing component. However, for blur a post processing material was required to create the radial blur. When objectives progressed triggering the simulation of symptoms, a timeline was used to progressively increase the value of an effect gradually over a duration. This decision was made to accommodate eyes adjusting to the changes of the camera as these effects were being triggered.</w:t>
       </w:r>
       <w:r>
         <w:t xml:space="preserve"> The timeline was then used in reverse to revert the symptoms returning the camera view back to the original state it was in.</w:t>
@@ -9706,6 +9585,161 @@
         <w:t xml:space="preserve"> and Objective Understanding</w:t>
       </w:r>
       <w:bookmarkEnd w:id="34"/>
+    </w:p>
+    <w:p>
+      <w:r>
+        <w:t xml:space="preserve">Interaction objects worked as intended with none of the objects failing to carry out the tasks they were intended for. However, the hand collisions placed within the hand components of the VR Pawn </w:t>
+      </w:r>
+      <w:r>
+        <w:t>impair</w:t>
+      </w:r>
+      <w:r>
+        <w:t xml:space="preserve"> how well the player can interact with the light switch</w:t>
+      </w:r>
+      <w:r>
+        <w:t>. This is because</w:t>
+      </w:r>
+      <w:r>
+        <w:t xml:space="preserve"> </w:t>
+      </w:r>
+      <w:r>
+        <w:t xml:space="preserve">the hand component </w:t>
+      </w:r>
+      <w:r>
+        <w:t>cannot</w:t>
+      </w:r>
+      <w:r>
+        <w:t xml:space="preserve"> </w:t>
+      </w:r>
+      <w:r>
+        <w:t>move</w:t>
+      </w:r>
+      <w:r>
+        <w:t xml:space="preserve"> </w:t>
+      </w:r>
+      <w:r>
+        <w:t>far</w:t>
+      </w:r>
+      <w:r>
+        <w:t xml:space="preserve"> enough</w:t>
+      </w:r>
+      <w:r>
+        <w:t xml:space="preserve"> into the switch</w:t>
+      </w:r>
+      <w:r>
+        <w:t xml:space="preserve"> to trigger collisions </w:t>
+      </w:r>
+      <w:r>
+        <w:t>reliably</w:t>
+      </w:r>
+      <w:r>
+        <w:t xml:space="preserve">. It became increasingly noticeable that the light switch felt like it had its own behaviour and only turned on whenever it wanted to due to this. </w:t>
+      </w:r>
+      <w:r>
+        <w:t>This became increasingly frustrating for some users that should have been able to turn the light on or off within the first try.</w:t>
+      </w:r>
+    </w:p>
+    <w:p>
+      <w:r>
+        <w:t xml:space="preserve">During testing, users found it difficult to tell when the symptom was being reverted for light sensitivity before the completion of objective </w:t>
+      </w:r>
+      <w:r>
+        <w:t>five</w:t>
+      </w:r>
+      <w:r>
+        <w:t xml:space="preserve"> occurred</w:t>
+      </w:r>
+      <w:r>
+        <w:t>,</w:t>
+      </w:r>
+      <w:r>
+        <w:t xml:space="preserve"> triggering the bloom post processing </w:t>
+      </w:r>
+      <w:r>
+        <w:t>effect</w:t>
+      </w:r>
+      <w:r>
+        <w:t xml:space="preserve">. This occurred due to two </w:t>
+      </w:r>
+      <w:r>
+        <w:t>reasons</w:t>
+      </w:r>
+      <w:r>
+        <w:t>.</w:t>
+      </w:r>
+      <w:r>
+        <w:t xml:space="preserve"> </w:t>
+      </w:r>
+      <w:r>
+        <w:t>T</w:t>
+      </w:r>
+      <w:r>
+        <w:t>he first</w:t>
+      </w:r>
+      <w:r>
+        <w:t xml:space="preserve"> being</w:t>
+      </w:r>
+      <w:r>
+        <w:t xml:space="preserve"> the timeline duration was too long to apply or revert the post processing effect</w:t>
+      </w:r>
+      <w:r>
+        <w:t>. The second reason was that the</w:t>
+      </w:r>
+      <w:r>
+        <w:t xml:space="preserve"> conditions to satisfy objective </w:t>
+      </w:r>
+      <w:r>
+        <w:t>five</w:t>
+      </w:r>
+      <w:r>
+        <w:t xml:space="preserve"> were easy to complete</w:t>
+      </w:r>
+      <w:r>
+        <w:t>,</w:t>
+      </w:r>
+      <w:r>
+        <w:t xml:space="preserve"> causing the illusion of the light sensitivity symptom reversal barely working</w:t>
+      </w:r>
+      <w:r>
+        <w:t>,</w:t>
+      </w:r>
+      <w:r>
+        <w:t xml:space="preserve"> before the blur post processing material was applied.</w:t>
+      </w:r>
+      <w:r>
+        <w:t xml:space="preserve"> This result</w:t>
+      </w:r>
+      <w:r>
+        <w:t xml:space="preserve">ed in confusion </w:t>
+      </w:r>
+      <w:r>
+        <w:t>among</w:t>
+      </w:r>
+      <w:r>
+        <w:t xml:space="preserve"> users as the prevention method taken to revert light sensitivity seemed to not work</w:t>
+      </w:r>
+      <w:r>
+        <w:t>,</w:t>
+      </w:r>
+      <w:r>
+        <w:t xml:space="preserve"> giving a false view</w:t>
+      </w:r>
+      <w:r>
+        <w:t xml:space="preserve"> of how effective the preventative measure was</w:t>
+      </w:r>
+      <w:r>
+        <w:t>.</w:t>
+      </w:r>
+    </w:p>
+    <w:p>
+      <w:pPr>
+        <w:pStyle w:val="Heading3"/>
+      </w:pPr>
+      <w:bookmarkStart w:id="35" w:name="_Toc223794397"/>
+      <w:r>
+        <w:t>User Attention Detection</w:t>
+      </w:r>
+      <w:bookmarkEnd w:id="35"/>
     </w:p>
     <w:p>
       <w:pPr>
@@ -9716,8 +9750,30 @@
         </w:numPr>
       </w:pPr>
       <w:r>
-        <w:t>Switch between objectives 4 to 5 is quick so timeline does not have as much time to play and show the player the reversing of the symptom</w:t>
-      </w:r>
+        <w:t>Can be unforgiving as it</w:t>
+      </w:r>
+      <w:r>
+        <w:t xml:space="preserve"> uses</w:t>
+      </w:r>
+      <w:r>
+        <w:t xml:space="preserve"> a singular li</w:t>
+      </w:r>
+      <w:r>
+        <w:t>n</w:t>
+      </w:r>
+      <w:r>
+        <w:t>e and not a channel</w:t>
+      </w:r>
+    </w:p>
+    <w:p>
+      <w:pPr>
+        <w:pStyle w:val="Heading3"/>
+      </w:pPr>
+      <w:bookmarkStart w:id="36" w:name="_Toc223794398"/>
+      <w:r>
+        <w:t>Symptom Simulations</w:t>
+      </w:r>
+      <w:bookmarkEnd w:id="36"/>
     </w:p>
     <w:p>
       <w:pPr>
@@ -9728,18 +9784,182 @@
         </w:numPr>
       </w:pPr>
       <w:r>
-        <w:t>Hand collisions impairing experience than benefitting it</w:t>
+        <w:t xml:space="preserve">Symptoms seem okay but are difficult to gauge with </w:t>
+      </w:r>
+      <w:r>
+        <w:t>most</w:t>
+      </w:r>
+      <w:r>
+        <w:t xml:space="preserve"> possible users as select few have tested the experience</w:t>
       </w:r>
     </w:p>
     <w:p>
       <w:pPr>
         <w:pStyle w:val="Heading3"/>
       </w:pPr>
-      <w:bookmarkStart w:id="35" w:name="_Toc223794397"/>
+      <w:bookmarkStart w:id="37" w:name="_Toc223794399"/>
+      <w:r>
+        <w:t>Strengths and Weaknesses</w:t>
+      </w:r>
+      <w:bookmarkEnd w:id="37"/>
+    </w:p>
+    <w:p>
+      <w:pPr>
+        <w:pStyle w:val="Heading3"/>
+      </w:pPr>
+      <w:bookmarkStart w:id="38" w:name="_Toc223794400"/>
+      <w:r>
+        <w:t xml:space="preserve">Improvements to be </w:t>
+      </w:r>
+      <w:r>
+        <w:t>M</w:t>
+      </w:r>
+      <w:r>
+        <w:t>ade</w:t>
+      </w:r>
+      <w:bookmarkEnd w:id="38"/>
+    </w:p>
+    <w:p>
+      <w:r>
+        <w:t>To refine the quality of the experience, improvements need to be made across the different aspects of the application. One such improvement includes removing the physics collisions for the hand components within the VR Pawn class. Doing this will allow interactions with the light switch to work as intended</w:t>
+      </w:r>
+      <w:r>
+        <w:t>,</w:t>
+      </w:r>
+      <w:r>
+        <w:t xml:space="preserve"> reducing the frustration of completing objectives three and four. </w:t>
+      </w:r>
+    </w:p>
+    <w:p>
+      <w:r>
+        <w:t xml:space="preserve">In addition to this, another improvement includes adding a delay to the change between objectives four and five to allow enough time for the reversal of the light sensitivity symptom. To </w:t>
+      </w:r>
+      <w:r>
+        <w:lastRenderedPageBreak/>
+        <w:t>strengthen this improvement</w:t>
+      </w:r>
+      <w:r>
+        <w:t>,</w:t>
+      </w:r>
+      <w:r>
+        <w:t xml:space="preserve"> the duration of the timeline reversal will be altered so that it does not take as long to execute the symptom reversal.</w:t>
+      </w:r>
+    </w:p>
+    <w:p>
+      <w:pPr>
+        <w:pStyle w:val="Heading2"/>
+      </w:pPr>
+      <w:bookmarkStart w:id="39" w:name="_Toc223794401"/>
+      <w:r>
+        <w:t>Final Version Tests</w:t>
+      </w:r>
+      <w:bookmarkEnd w:id="39"/>
+    </w:p>
+    <w:p>
+      <w:r>
+        <w:t xml:space="preserve">After the improvements carried out from the results of the prototype tests, a new set of tests </w:t>
+      </w:r>
+      <w:r>
+        <w:t>was</w:t>
+      </w:r>
+      <w:r>
+        <w:t xml:space="preserve"> carried out to ensure the improvements had made a positive impact on the experience instead of hindering it. The conducted tests were relatively the same </w:t>
+      </w:r>
+      <w:r>
+        <w:t>as</w:t>
+      </w:r>
+      <w:r>
+        <w:t xml:space="preserve"> the first set carried out for the prototype version, although slight changes were made to probe for any weaknesses within the improvements made. This choice was made to ensure that the final version did not have bugs, show clear polish and refinements while </w:t>
+      </w:r>
+      <w:r>
+        <w:t>maintaining the</w:t>
+      </w:r>
+      <w:r>
+        <w:t xml:space="preserve"> integrity</w:t>
+      </w:r>
+      <w:r>
+        <w:t xml:space="preserve"> of the application</w:t>
+      </w:r>
+      <w:r>
+        <w:t xml:space="preserve"> so that users could have the best possible experience.</w:t>
+      </w:r>
+      <w:bookmarkStart w:id="40" w:name="_Toc223794402"/>
+    </w:p>
+    <w:p>
+      <w:pPr>
+        <w:pStyle w:val="Heading3"/>
+      </w:pPr>
+      <w:r>
+        <w:t>Interaction Objects and Objective Understanding</w:t>
+      </w:r>
+      <w:bookmarkStart w:id="41" w:name="_Toc223794403"/>
+      <w:bookmarkEnd w:id="40"/>
+    </w:p>
+    <w:p>
+      <w:pPr>
+        <w:pStyle w:val="Heading3"/>
+      </w:pPr>
       <w:r>
         <w:t>User Attention Detection</w:t>
       </w:r>
-      <w:bookmarkEnd w:id="35"/>
+      <w:bookmarkStart w:id="42" w:name="_Toc223794404"/>
+      <w:bookmarkEnd w:id="41"/>
+    </w:p>
+    <w:p>
+      <w:pPr>
+        <w:pStyle w:val="Heading3"/>
+      </w:pPr>
+      <w:r>
+        <w:t>Symptom Simulation</w:t>
+      </w:r>
+      <w:r>
+        <w:t>s</w:t>
+      </w:r>
+      <w:bookmarkEnd w:id="42"/>
+    </w:p>
+    <w:p/>
+    <w:p>
+      <w:r>
+        <w:br w:type="page"/>
+      </w:r>
+    </w:p>
+    <w:p>
+      <w:pPr>
+        <w:pStyle w:val="Heading1"/>
+      </w:pPr>
+      <w:bookmarkStart w:id="43" w:name="_Toc223794405"/>
+      <w:r>
+        <w:lastRenderedPageBreak/>
+        <w:t>Critical Evaluation</w:t>
+      </w:r>
+      <w:bookmarkEnd w:id="43"/>
+    </w:p>
+    <w:p>
+      <w:pPr>
+        <w:rPr>
+          <w:rFonts w:asciiTheme="majorHAnsi" w:eastAsiaTheme="majorEastAsia" w:hAnsiTheme="majorHAnsi" w:cstheme="majorBidi"/>
+          <w:color w:val="0F4761" w:themeColor="accent1" w:themeShade="BF"/>
+          <w:sz w:val="40"/>
+          <w:szCs w:val="40"/>
+        </w:rPr>
+      </w:pPr>
+      <w:r>
+        <w:t>High word count for this, needs to be an in-depth evaluation, discuss in third person and cover all areas that help progress the project and other areas that dampened it such as outside life events etc.</w:t>
+      </w:r>
+      <w:r>
+        <w:br w:type="page"/>
+      </w:r>
+    </w:p>
+    <w:p>
+      <w:pPr>
+        <w:pStyle w:val="Heading1"/>
+      </w:pPr>
+      <w:bookmarkStart w:id="44" w:name="_Toc223794406"/>
+      <w:r>
+        <w:lastRenderedPageBreak/>
+        <w:t>Conclusions and Future Work</w:t>
+      </w:r>
+      <w:bookmarkEnd w:id="44"/>
     </w:p>
     <w:p>
       <w:pPr>
@@ -9750,30 +9970,8 @@
         </w:numPr>
       </w:pPr>
       <w:r>
-        <w:t>Can be unforgiving as it</w:t>
-      </w:r>
-      <w:r>
-        <w:t xml:space="preserve"> uses</w:t>
-      </w:r>
-      <w:r>
-        <w:t xml:space="preserve"> a singular li</w:t>
-      </w:r>
-      <w:r>
-        <w:t>n</w:t>
-      </w:r>
-      <w:r>
-        <w:t>e and not a channel</w:t>
-      </w:r>
-    </w:p>
-    <w:p>
-      <w:pPr>
-        <w:pStyle w:val="Heading3"/>
-      </w:pPr>
-      <w:bookmarkStart w:id="36" w:name="_Toc223794398"/>
-      <w:r>
-        <w:t>Symptom Simulations</w:t>
-      </w:r>
-      <w:bookmarkEnd w:id="36"/>
+        <w:t>Adding a narrator into the background to guide users through the experience</w:t>
+      </w:r>
     </w:p>
     <w:p>
       <w:pPr>
@@ -9784,155 +9982,8 @@
         </w:numPr>
       </w:pPr>
       <w:r>
-        <w:t xml:space="preserve">Symptoms seem okay but are difficult to gauge with </w:t>
-      </w:r>
-      <w:r>
-        <w:t>most</w:t>
-      </w:r>
-      <w:r>
-        <w:t xml:space="preserve"> possible users as select few have tested the experience</w:t>
-      </w:r>
-    </w:p>
-    <w:p>
-      <w:pPr>
-        <w:pStyle w:val="Heading3"/>
-      </w:pPr>
-      <w:bookmarkStart w:id="37" w:name="_Toc223794399"/>
-      <w:r>
-        <w:t>Strengths and Weaknesses</w:t>
-      </w:r>
-      <w:bookmarkEnd w:id="37"/>
-    </w:p>
-    <w:p>
-      <w:pPr>
-        <w:pStyle w:val="Heading3"/>
-      </w:pPr>
-      <w:bookmarkStart w:id="38" w:name="_Toc223794400"/>
-      <w:r>
-        <w:t xml:space="preserve">Improvements to be </w:t>
-      </w:r>
-      <w:r>
-        <w:t>M</w:t>
-      </w:r>
-      <w:r>
-        <w:t>ade</w:t>
-      </w:r>
-      <w:bookmarkEnd w:id="38"/>
-    </w:p>
-    <w:p/>
-    <w:p>
-      <w:pPr>
-        <w:pStyle w:val="Heading2"/>
-      </w:pPr>
-      <w:bookmarkStart w:id="39" w:name="_Toc223794401"/>
-      <w:r>
-        <w:t>Final Version Tests</w:t>
-      </w:r>
-      <w:bookmarkEnd w:id="39"/>
-    </w:p>
-    <w:p>
-      <w:r>
-        <w:t xml:space="preserve">After the improvements carried out from the results of the prototype tests, a new set of tests </w:t>
-      </w:r>
-      <w:r>
-        <w:t>was</w:t>
-      </w:r>
-      <w:r>
-        <w:t xml:space="preserve"> carried out to ensure the improvements had made a positive impact on the experience instead of hindering it. The conducted tests were relatively the same </w:t>
-      </w:r>
-      <w:r>
-        <w:t>as</w:t>
-      </w:r>
-      <w:r>
-        <w:t xml:space="preserve"> the first set carried out for the prototype version, although slight changes were made to probe for any weaknesses within the improvements made. This choice was made to ensure that the final version did not have bugs, show clear polish and refinements while </w:t>
-      </w:r>
-      <w:r>
-        <w:t>maintaining the</w:t>
-      </w:r>
-      <w:r>
-        <w:t xml:space="preserve"> integrity</w:t>
-      </w:r>
-      <w:r>
-        <w:t xml:space="preserve"> of the application</w:t>
-      </w:r>
-      <w:r>
-        <w:t xml:space="preserve"> so that users could have the best possible experience.</w:t>
-      </w:r>
-    </w:p>
-    <w:p>
-      <w:pPr>
-        <w:pStyle w:val="Heading3"/>
-      </w:pPr>
-      <w:bookmarkStart w:id="40" w:name="_Toc223794402"/>
-      <w:r>
-        <w:lastRenderedPageBreak/>
-        <w:t>Interaction Objects and Objective Understanding</w:t>
-      </w:r>
-      <w:bookmarkEnd w:id="40"/>
-    </w:p>
-    <w:p>
-      <w:pPr>
-        <w:pStyle w:val="Heading3"/>
-      </w:pPr>
-      <w:bookmarkStart w:id="41" w:name="_Toc223794403"/>
-      <w:r>
-        <w:t>User Attention Detection</w:t>
-      </w:r>
-      <w:bookmarkEnd w:id="41"/>
-    </w:p>
-    <w:p>
-      <w:pPr>
-        <w:pStyle w:val="Heading3"/>
-      </w:pPr>
-      <w:bookmarkStart w:id="42" w:name="_Toc223794404"/>
-      <w:r>
-        <w:t>Symptom Simulation</w:t>
-      </w:r>
-      <w:r>
-        <w:t>s</w:t>
-      </w:r>
-      <w:bookmarkEnd w:id="42"/>
-      <w:r>
-        <w:br w:type="page"/>
-      </w:r>
-    </w:p>
-    <w:p>
-      <w:pPr>
-        <w:pStyle w:val="Heading1"/>
-      </w:pPr>
-      <w:bookmarkStart w:id="43" w:name="_Toc223794405"/>
-      <w:r>
-        <w:lastRenderedPageBreak/>
-        <w:t>Critical Evaluation</w:t>
-      </w:r>
-      <w:bookmarkEnd w:id="43"/>
-    </w:p>
-    <w:p>
-      <w:pPr>
-        <w:rPr>
-          <w:rFonts w:asciiTheme="majorHAnsi" w:eastAsiaTheme="majorEastAsia" w:hAnsiTheme="majorHAnsi" w:cstheme="majorBidi"/>
-          <w:color w:val="0F4761" w:themeColor="accent1" w:themeShade="BF"/>
-          <w:sz w:val="40"/>
-          <w:szCs w:val="40"/>
-        </w:rPr>
-      </w:pPr>
-      <w:r>
-        <w:t>High word count for this, needs to be an in-depth evaluation, discuss in third person and cover all areas that help progress the project and other areas that dampened it such as outside life events etc.</w:t>
-      </w:r>
-      <w:r>
-        <w:br w:type="page"/>
-      </w:r>
-    </w:p>
-    <w:p>
-      <w:pPr>
-        <w:pStyle w:val="Heading1"/>
-      </w:pPr>
-      <w:bookmarkStart w:id="44" w:name="_Toc223794406"/>
-      <w:r>
-        <w:lastRenderedPageBreak/>
-        <w:t>Conclusions and Future Work</w:t>
-      </w:r>
-      <w:bookmarkEnd w:id="44"/>
+        <w:t>Introductory tutorial of one to two minutes to help non-technical users with understanding the controls</w:t>
+      </w:r>
     </w:p>
     <w:p>
       <w:pPr>
@@ -9943,30 +9994,6 @@
         </w:numPr>
       </w:pPr>
       <w:r>
-        <w:t>Adding a narrator into the background to guide users through the experience</w:t>
-      </w:r>
-    </w:p>
-    <w:p>
-      <w:pPr>
-        <w:pStyle w:val="ListParagraph"/>
-        <w:numPr>
-          <w:ilvl w:val="0"/>
-          <w:numId w:val="11"/>
-        </w:numPr>
-      </w:pPr>
-      <w:r>
-        <w:t>Introductory tutorial of one to two minutes to help non-technical users with understanding the controls</w:t>
-      </w:r>
-    </w:p>
-    <w:p>
-      <w:pPr>
-        <w:pStyle w:val="ListParagraph"/>
-        <w:numPr>
-          <w:ilvl w:val="0"/>
-          <w:numId w:val="11"/>
-        </w:numPr>
-      </w:pPr>
-      <w:r>
         <w:t xml:space="preserve">Exploring accessibility settings for those with visual impairments or eye diseases that are still able to use the experience so that some of the symptoms displayed are not as harsh to them </w:t>
       </w:r>
       <w:r>
@@ -9985,23 +10012,9 @@
       <w:bookmarkEnd w:id="45"/>
     </w:p>
     <w:p>
-      <w:proofErr w:type="spellStart"/>
-      <w:r>
-        <w:t>Cantó</w:t>
-      </w:r>
-      <w:proofErr w:type="spellEnd"/>
-      <w:r>
-        <w:t xml:space="preserve">-Sancho, N., </w:t>
-      </w:r>
-      <w:proofErr w:type="spellStart"/>
-      <w:r>
-        <w:t>Porru</w:t>
-      </w:r>
-      <w:proofErr w:type="spellEnd"/>
-      <w:r>
-        <w:t xml:space="preserve">, S., Casati, S., Ronda, E., Seguí-Crespo, M. and Carta, A. (2023) ‘Prevalence and risk factors of computer vision syndrome—assessed in office workers by a validated questionnaire’. </w:t>
-      </w:r>
-      <w:proofErr w:type="spellStart"/>
+      <w:r>
+        <w:t xml:space="preserve">Cantó-Sancho, N., Porru, S., Casati, S., Ronda, E., Seguí-Crespo, M. and Carta, A. (2023) ‘Prevalence and risk factors of computer vision syndrome—assessed in office workers by a validated questionnaire’. </w:t>
+      </w:r>
       <w:r>
         <w:rPr>
           <w:i/>
@@ -10009,30 +10022,13 @@
         </w:rPr>
         <w:t>PeerJ</w:t>
       </w:r>
-      <w:proofErr w:type="spellEnd"/>
       <w:r>
         <w:t xml:space="preserve"> 11, p. e14937. Available at: https://www.researchgate.net/publication/369002899_Prevalence_and_risk_factors_of_computer_vision_syndrome-assessed_in_office_workers_by_a_validated_questionnaire (Accessed: 20 October 2025).</w:t>
       </w:r>
     </w:p>
     <w:p>
       <w:r>
-        <w:t xml:space="preserve">Chandrasekhara, R.S., Low, C., Lim, Y., Low, L., Mardina, F. and </w:t>
-      </w:r>
-      <w:proofErr w:type="spellStart"/>
-      <w:r>
-        <w:t>Nursaleha</w:t>
-      </w:r>
-      <w:proofErr w:type="spellEnd"/>
-      <w:r>
-        <w:t xml:space="preserve">, M. (2013) ‘Computer vision syndrome: a study of knowledge and practices in university </w:t>
-      </w:r>
-      <w:proofErr w:type="gramStart"/>
-      <w:r>
-        <w:t>students’</w:t>
-      </w:r>
-      <w:proofErr w:type="gramEnd"/>
-      <w:r>
-        <w:t xml:space="preserve">. </w:t>
+        <w:t xml:space="preserve">Chandrasekhara, R.S., Low, C., Lim, Y., Low, L., Mardina, F. and Nursaleha, M. (2013) ‘Computer vision syndrome: a study of knowledge and practices in university students’. </w:t>
       </w:r>
       <w:r>
         <w:rPr>
@@ -10058,15 +10054,7 @@
     </w:p>
     <w:p>
       <w:r>
-        <w:t xml:space="preserve">Muñoz, E.G., </w:t>
-      </w:r>
-      <w:proofErr w:type="spellStart"/>
-      <w:r>
-        <w:t>Fabregat</w:t>
-      </w:r>
-      <w:proofErr w:type="spellEnd"/>
-      <w:r>
-        <w:t xml:space="preserve">, R., Bacca-Acosta, J., Duque-Méndez, N. and Avila-Garzon, C. (2022) ‘Augmented Reality, Virtual Reality, and Game Technologies in Ophthalmology Training’. </w:t>
+        <w:t xml:space="preserve">Muñoz, E.G., Fabregat, R., Bacca-Acosta, J., Duque-Méndez, N. and Avila-Garzon, C. (2022) ‘Augmented Reality, Virtual Reality, and Game Technologies in Ophthalmology Training’. </w:t>
       </w:r>
       <w:r>
         <w:rPr>
@@ -10076,15 +10064,7 @@
         <w:t>Information</w:t>
       </w:r>
       <w:r>
-        <w:t xml:space="preserve"> 13(5), p. 222. </w:t>
-      </w:r>
-      <w:proofErr w:type="spellStart"/>
-      <w:r>
-        <w:t>doi</w:t>
-      </w:r>
-      <w:proofErr w:type="spellEnd"/>
-      <w:r>
-        <w:t xml:space="preserve">: </w:t>
+        <w:t xml:space="preserve"> 13(5), p. 222. doi: </w:t>
       </w:r>
       <w:hyperlink r:id="rId16" w:history="1">
         <w:r>
@@ -10100,33 +10080,12 @@
     </w:p>
     <w:p>
       <w:r>
-        <w:t xml:space="preserve">Orji, J., Hernandez, A., Selema, B. and Orji, R. (2022) ‘Virtual and augmented reality applications for promoting safety and security: A systematic review’., pp. 1–7. </w:t>
-      </w:r>
-      <w:proofErr w:type="spellStart"/>
-      <w:r>
-        <w:t>doi</w:t>
-      </w:r>
-      <w:proofErr w:type="spellEnd"/>
-      <w:r>
-        <w:t>: https://doi.org/10.1109/SEGAH54908.2022.9978597.</w:t>
-      </w:r>
-    </w:p>
-    <w:p>
-      <w:proofErr w:type="spellStart"/>
-      <w:r>
-        <w:t>Porcar</w:t>
-      </w:r>
-      <w:proofErr w:type="spellEnd"/>
-      <w:r>
-        <w:t xml:space="preserve">, E., Pons, A. and Lorente, A. (2016) ‘Visual and ocular effects from the use of flat-panel </w:t>
-      </w:r>
-      <w:proofErr w:type="gramStart"/>
-      <w:r>
-        <w:t>displays’</w:t>
-      </w:r>
-      <w:proofErr w:type="gramEnd"/>
-      <w:r>
-        <w:t xml:space="preserve">. </w:t>
+        <w:t>Orji, J., Hernandez, A., Selema, B. and Orji, R. (2022) ‘Virtual and augmented reality applications for promoting safety and security: A systematic review’., pp. 1–7. doi: https://doi.org/10.1109/SEGAH54908.2022.9978597.</w:t>
+      </w:r>
+    </w:p>
+    <w:p>
+      <w:r>
+        <w:t xml:space="preserve">Porcar, E., Pons, A. and Lorente, A. (2016) ‘Visual and ocular effects from the use of flat-panel displays’. </w:t>
       </w:r>
       <w:r>
         <w:rPr>
@@ -10141,23 +10100,7 @@
     </w:p>
     <w:p>
       <w:r>
-        <w:t xml:space="preserve">Santilli, T., Ceccacci, S., Mengoni, M. and Catia </w:t>
-      </w:r>
-      <w:proofErr w:type="spellStart"/>
-      <w:r>
-        <w:t>Giaconi</w:t>
-      </w:r>
-      <w:proofErr w:type="spellEnd"/>
-      <w:r>
-        <w:t xml:space="preserve"> (2025) ‘Virtual vs. traditional learning in higher education: A systematic review of comparative </w:t>
-      </w:r>
-      <w:proofErr w:type="gramStart"/>
-      <w:r>
-        <w:t>studies’</w:t>
-      </w:r>
-      <w:proofErr w:type="gramEnd"/>
-      <w:r>
-        <w:t xml:space="preserve">. </w:t>
+        <w:t xml:space="preserve">Santilli, T., Ceccacci, S., Mengoni, M. and Catia Giaconi (2025) ‘Virtual vs. traditional learning in higher education: A systematic review of comparative studies’. </w:t>
       </w:r>
       <w:r>
         <w:rPr>
@@ -10192,23 +10135,7 @@
     </w:p>
     <w:p>
       <w:r>
-        <w:t>Vieira, F., Oliveira, E. and Rodrigues, N. (2019) ‘</w:t>
-      </w:r>
-      <w:proofErr w:type="spellStart"/>
-      <w:r>
-        <w:t>iSVC</w:t>
-      </w:r>
-      <w:proofErr w:type="spellEnd"/>
-      <w:r>
-        <w:t xml:space="preserve"> – digital platform for detection and prevention of computer vision syndrome’., pp. 1–7. </w:t>
-      </w:r>
-      <w:proofErr w:type="spellStart"/>
-      <w:r>
-        <w:t>doi</w:t>
-      </w:r>
-      <w:proofErr w:type="spellEnd"/>
-      <w:r>
-        <w:t>: https://doi.org/10.1109/SeGAH.2019.8882438.</w:t>
+        <w:t>Vieira, F., Oliveira, E. and Rodrigues, N. (2019) ‘iSVC – digital platform for detection and prevention of computer vision syndrome’., pp. 1–7. doi: https://doi.org/10.1109/SeGAH.2019.8882438.</w:t>
       </w:r>
     </w:p>
     <w:p>
@@ -10223,28 +10150,12 @@
         <w:t>Annals of Emerging Technologies in Computing</w:t>
       </w:r>
       <w:r>
-        <w:t xml:space="preserve"> 9(3), pp. 50–68. </w:t>
-      </w:r>
-      <w:proofErr w:type="spellStart"/>
-      <w:r>
-        <w:t>doi</w:t>
-      </w:r>
-      <w:proofErr w:type="spellEnd"/>
-      <w:r>
-        <w:t>: https://doi.org/10.33166/aetic.2025.03.004.</w:t>
-      </w:r>
-    </w:p>
-    <w:p>
-      <w:r>
-        <w:t>Youcef, B., Ahmad, M.N. and Mustapha, M. (2021) ‘</w:t>
-      </w:r>
-      <w:proofErr w:type="spellStart"/>
-      <w:r>
-        <w:t>OntoPhaco</w:t>
-      </w:r>
-      <w:proofErr w:type="spellEnd"/>
-      <w:r>
-        <w:t xml:space="preserve">: An ontology for virtual reality training in ophthalmology Domain—A case study of cataract surgery’. </w:t>
+        <w:t xml:space="preserve"> 9(3), pp. 50–68. doi: https://doi.org/10.33166/aetic.2025.03.004.</w:t>
+      </w:r>
+    </w:p>
+    <w:p>
+      <w:r>
+        <w:t xml:space="preserve">Youcef, B., Ahmad, M.N. and Mustapha, M. (2021) ‘OntoPhaco: An ontology for virtual reality training in ophthalmology Domain—A case study of cataract surgery’. </w:t>
       </w:r>
       <w:r>
         <w:rPr>
@@ -10254,15 +10165,7 @@
         <w:t>IEEE Access</w:t>
       </w:r>
       <w:r>
-        <w:t xml:space="preserve"> 9, pp. 152347–152378. </w:t>
-      </w:r>
-      <w:proofErr w:type="spellStart"/>
-      <w:r>
-        <w:t>doi</w:t>
-      </w:r>
-      <w:proofErr w:type="spellEnd"/>
-      <w:r>
-        <w:t>: https://doi.org/10.1109/ACCESS.2021.3126697.</w:t>
+        <w:t xml:space="preserve"> 9, pp. 152347–152378. doi: https://doi.org/10.1109/ACCESS.2021.3126697.</w:t>
       </w:r>
     </w:p>
     <w:p/>
@@ -11036,22 +10939,9 @@
       <w:bookmarkStart w:id="56" w:name="_Toc223794418"/>
       <w:r>
         <w:lastRenderedPageBreak/>
-        <w:t xml:space="preserve">Button Hover </w:t>
-      </w:r>
-      <w:proofErr w:type="spellStart"/>
-      <w:r>
-        <w:t>Sfx</w:t>
-      </w:r>
-      <w:proofErr w:type="spellEnd"/>
-      <w:r>
-        <w:t xml:space="preserve"> by </w:t>
-      </w:r>
-      <w:proofErr w:type="spellStart"/>
-      <w:r>
-        <w:t>Fachii</w:t>
+        <w:t>Button Hover Sfx by Fachii</w:t>
       </w:r>
       <w:bookmarkEnd w:id="56"/>
-      <w:proofErr w:type="spellEnd"/>
     </w:p>
     <w:p>
       <w:r>
@@ -11151,31 +11041,9 @@
         <w:rPr>
           <w:rStyle w:val="Heading3Char"/>
         </w:rPr>
-        <w:t xml:space="preserve">Button click </w:t>
-      </w:r>
-      <w:proofErr w:type="spellStart"/>
-      <w:r>
-        <w:rPr>
-          <w:rStyle w:val="Heading3Char"/>
-        </w:rPr>
-        <w:t>Sfx</w:t>
-      </w:r>
-      <w:proofErr w:type="spellEnd"/>
-      <w:r>
-        <w:rPr>
-          <w:rStyle w:val="Heading3Char"/>
-        </w:rPr>
-        <w:t xml:space="preserve"> by </w:t>
-      </w:r>
-      <w:proofErr w:type="spellStart"/>
-      <w:r>
-        <w:rPr>
-          <w:rStyle w:val="Heading3Char"/>
-        </w:rPr>
-        <w:t>AndrewEathan</w:t>
+        <w:t>Button click Sfx by AndrewEathan</w:t>
       </w:r>
       <w:bookmarkEnd w:id="57"/>
-      <w:proofErr w:type="spellEnd"/>
       <w:r>
         <w:t xml:space="preserve"> </w:t>
       </w:r>
@@ -11284,22 +11152,9 @@
       <w:bookmarkStart w:id="58" w:name="_Toc223794420"/>
       <w:r>
         <w:lastRenderedPageBreak/>
-        <w:t xml:space="preserve">Light Switch </w:t>
-      </w:r>
-      <w:proofErr w:type="gramStart"/>
-      <w:r>
-        <w:t>On</w:t>
-      </w:r>
-      <w:proofErr w:type="gramEnd"/>
-      <w:r>
-        <w:t xml:space="preserve"> </w:t>
-      </w:r>
-      <w:proofErr w:type="spellStart"/>
-      <w:r>
-        <w:t>Sfx</w:t>
+        <w:t>Light Switch On Sfx</w:t>
       </w:r>
       <w:bookmarkEnd w:id="58"/>
-      <w:proofErr w:type="spellEnd"/>
     </w:p>
     <w:p>
       <w:r>
@@ -11391,14 +11246,9 @@
       </w:pPr>
       <w:bookmarkStart w:id="59" w:name="_Toc223794421"/>
       <w:r>
-        <w:t xml:space="preserve">Light Switch Off </w:t>
-      </w:r>
-      <w:proofErr w:type="spellStart"/>
-      <w:r>
-        <w:t>Sfx</w:t>
+        <w:t>Light Switch Off Sfx</w:t>
       </w:r>
       <w:bookmarkEnd w:id="59"/>
-      <w:proofErr w:type="spellEnd"/>
     </w:p>
     <w:p>
       <w:r>

</xml_diff>

<commit_message>
Completed prototype testing section
</commit_message>
<xml_diff>
--- a/30077548Thesis.docx
+++ b/30077548Thesis.docx
@@ -236,7 +236,7 @@
           <w:r>
             <w:fldChar w:fldCharType="separate"/>
           </w:r>
-          <w:hyperlink w:anchor="_Toc223794362" w:history="1">
+          <w:hyperlink w:anchor="_Toc223815676" w:history="1">
             <w:r>
               <w:rPr>
                 <w:rStyle w:val="Hyperlink"/>
@@ -263,7 +263,7 @@
                 <w:noProof/>
                 <w:webHidden/>
               </w:rPr>
-              <w:instrText xml:space="preserve"> PAGEREF _Toc223794362 \h </w:instrText>
+              <w:instrText xml:space="preserve"> PAGEREF _Toc223815676 \h </w:instrText>
             </w:r>
             <w:r>
               <w:rPr>
@@ -308,7 +308,7 @@
               <w:lang w:eastAsia="en-GB"/>
             </w:rPr>
           </w:pPr>
-          <w:hyperlink w:anchor="_Toc223794363" w:history="1">
+          <w:hyperlink w:anchor="_Toc223815677" w:history="1">
             <w:r>
               <w:rPr>
                 <w:rStyle w:val="Hyperlink"/>
@@ -335,7 +335,7 @@
                 <w:noProof/>
                 <w:webHidden/>
               </w:rPr>
-              <w:instrText xml:space="preserve"> PAGEREF _Toc223794363 \h </w:instrText>
+              <w:instrText xml:space="preserve"> PAGEREF _Toc223815677 \h </w:instrText>
             </w:r>
             <w:r>
               <w:rPr>
@@ -380,7 +380,7 @@
               <w:lang w:eastAsia="en-GB"/>
             </w:rPr>
           </w:pPr>
-          <w:hyperlink w:anchor="_Toc223794364" w:history="1">
+          <w:hyperlink w:anchor="_Toc223815678" w:history="1">
             <w:r>
               <w:rPr>
                 <w:rStyle w:val="Hyperlink"/>
@@ -407,7 +407,7 @@
                 <w:noProof/>
                 <w:webHidden/>
               </w:rPr>
-              <w:instrText xml:space="preserve"> PAGEREF _Toc223794364 \h </w:instrText>
+              <w:instrText xml:space="preserve"> PAGEREF _Toc223815678 \h </w:instrText>
             </w:r>
             <w:r>
               <w:rPr>
@@ -452,7 +452,7 @@
               <w:lang w:eastAsia="en-GB"/>
             </w:rPr>
           </w:pPr>
-          <w:hyperlink w:anchor="_Toc223794365" w:history="1">
+          <w:hyperlink w:anchor="_Toc223815679" w:history="1">
             <w:r>
               <w:rPr>
                 <w:rStyle w:val="Hyperlink"/>
@@ -479,7 +479,7 @@
                 <w:noProof/>
                 <w:webHidden/>
               </w:rPr>
-              <w:instrText xml:space="preserve"> PAGEREF _Toc223794365 \h </w:instrText>
+              <w:instrText xml:space="preserve"> PAGEREF _Toc223815679 \h </w:instrText>
             </w:r>
             <w:r>
               <w:rPr>
@@ -524,7 +524,7 @@
               <w:lang w:eastAsia="en-GB"/>
             </w:rPr>
           </w:pPr>
-          <w:hyperlink w:anchor="_Toc223794366" w:history="1">
+          <w:hyperlink w:anchor="_Toc223815680" w:history="1">
             <w:r>
               <w:rPr>
                 <w:rStyle w:val="Hyperlink"/>
@@ -551,7 +551,7 @@
                 <w:noProof/>
                 <w:webHidden/>
               </w:rPr>
-              <w:instrText xml:space="preserve"> PAGEREF _Toc223794366 \h </w:instrText>
+              <w:instrText xml:space="preserve"> PAGEREF _Toc223815680 \h </w:instrText>
             </w:r>
             <w:r>
               <w:rPr>
@@ -596,7 +596,7 @@
               <w:lang w:eastAsia="en-GB"/>
             </w:rPr>
           </w:pPr>
-          <w:hyperlink w:anchor="_Toc223794367" w:history="1">
+          <w:hyperlink w:anchor="_Toc223815681" w:history="1">
             <w:r>
               <w:rPr>
                 <w:rStyle w:val="Hyperlink"/>
@@ -623,7 +623,7 @@
                 <w:noProof/>
                 <w:webHidden/>
               </w:rPr>
-              <w:instrText xml:space="preserve"> PAGEREF _Toc223794367 \h </w:instrText>
+              <w:instrText xml:space="preserve"> PAGEREF _Toc223815681 \h </w:instrText>
             </w:r>
             <w:r>
               <w:rPr>
@@ -668,7 +668,7 @@
               <w:lang w:eastAsia="en-GB"/>
             </w:rPr>
           </w:pPr>
-          <w:hyperlink w:anchor="_Toc223794368" w:history="1">
+          <w:hyperlink w:anchor="_Toc223815682" w:history="1">
             <w:r>
               <w:rPr>
                 <w:rStyle w:val="Hyperlink"/>
@@ -695,7 +695,7 @@
                 <w:noProof/>
                 <w:webHidden/>
               </w:rPr>
-              <w:instrText xml:space="preserve"> PAGEREF _Toc223794368 \h </w:instrText>
+              <w:instrText xml:space="preserve"> PAGEREF _Toc223815682 \h </w:instrText>
             </w:r>
             <w:r>
               <w:rPr>
@@ -740,7 +740,7 @@
               <w:lang w:eastAsia="en-GB"/>
             </w:rPr>
           </w:pPr>
-          <w:hyperlink w:anchor="_Toc223794369" w:history="1">
+          <w:hyperlink w:anchor="_Toc223815683" w:history="1">
             <w:r>
               <w:rPr>
                 <w:rStyle w:val="Hyperlink"/>
@@ -767,7 +767,7 @@
                 <w:noProof/>
                 <w:webHidden/>
               </w:rPr>
-              <w:instrText xml:space="preserve"> PAGEREF _Toc223794369 \h </w:instrText>
+              <w:instrText xml:space="preserve"> PAGEREF _Toc223815683 \h </w:instrText>
             </w:r>
             <w:r>
               <w:rPr>
@@ -812,7 +812,7 @@
               <w:lang w:eastAsia="en-GB"/>
             </w:rPr>
           </w:pPr>
-          <w:hyperlink w:anchor="_Toc223794370" w:history="1">
+          <w:hyperlink w:anchor="_Toc223815684" w:history="1">
             <w:r>
               <w:rPr>
                 <w:rStyle w:val="Hyperlink"/>
@@ -839,7 +839,7 @@
                 <w:noProof/>
                 <w:webHidden/>
               </w:rPr>
-              <w:instrText xml:space="preserve"> PAGEREF _Toc223794370 \h </w:instrText>
+              <w:instrText xml:space="preserve"> PAGEREF _Toc223815684 \h </w:instrText>
             </w:r>
             <w:r>
               <w:rPr>
@@ -884,7 +884,7 @@
               <w:lang w:eastAsia="en-GB"/>
             </w:rPr>
           </w:pPr>
-          <w:hyperlink w:anchor="_Toc223794371" w:history="1">
+          <w:hyperlink w:anchor="_Toc223815685" w:history="1">
             <w:r>
               <w:rPr>
                 <w:rStyle w:val="Hyperlink"/>
@@ -911,7 +911,7 @@
                 <w:noProof/>
                 <w:webHidden/>
               </w:rPr>
-              <w:instrText xml:space="preserve"> PAGEREF _Toc223794371 \h </w:instrText>
+              <w:instrText xml:space="preserve"> PAGEREF _Toc223815685 \h </w:instrText>
             </w:r>
             <w:r>
               <w:rPr>
@@ -956,7 +956,7 @@
               <w:lang w:eastAsia="en-GB"/>
             </w:rPr>
           </w:pPr>
-          <w:hyperlink w:anchor="_Toc223794372" w:history="1">
+          <w:hyperlink w:anchor="_Toc223815686" w:history="1">
             <w:r>
               <w:rPr>
                 <w:rStyle w:val="Hyperlink"/>
@@ -983,7 +983,7 @@
                 <w:noProof/>
                 <w:webHidden/>
               </w:rPr>
-              <w:instrText xml:space="preserve"> PAGEREF _Toc223794372 \h </w:instrText>
+              <w:instrText xml:space="preserve"> PAGEREF _Toc223815686 \h </w:instrText>
             </w:r>
             <w:r>
               <w:rPr>
@@ -1028,7 +1028,7 @@
               <w:lang w:eastAsia="en-GB"/>
             </w:rPr>
           </w:pPr>
-          <w:hyperlink w:anchor="_Toc223794373" w:history="1">
+          <w:hyperlink w:anchor="_Toc223815687" w:history="1">
             <w:r>
               <w:rPr>
                 <w:rStyle w:val="Hyperlink"/>
@@ -1055,7 +1055,7 @@
                 <w:noProof/>
                 <w:webHidden/>
               </w:rPr>
-              <w:instrText xml:space="preserve"> PAGEREF _Toc223794373 \h </w:instrText>
+              <w:instrText xml:space="preserve"> PAGEREF _Toc223815687 \h </w:instrText>
             </w:r>
             <w:r>
               <w:rPr>
@@ -1100,7 +1100,7 @@
               <w:lang w:eastAsia="en-GB"/>
             </w:rPr>
           </w:pPr>
-          <w:hyperlink w:anchor="_Toc223794374" w:history="1">
+          <w:hyperlink w:anchor="_Toc223815688" w:history="1">
             <w:r>
               <w:rPr>
                 <w:rStyle w:val="Hyperlink"/>
@@ -1127,7 +1127,7 @@
                 <w:noProof/>
                 <w:webHidden/>
               </w:rPr>
-              <w:instrText xml:space="preserve"> PAGEREF _Toc223794374 \h </w:instrText>
+              <w:instrText xml:space="preserve"> PAGEREF _Toc223815688 \h </w:instrText>
             </w:r>
             <w:r>
               <w:rPr>
@@ -1172,7 +1172,7 @@
               <w:lang w:eastAsia="en-GB"/>
             </w:rPr>
           </w:pPr>
-          <w:hyperlink w:anchor="_Toc223794375" w:history="1">
+          <w:hyperlink w:anchor="_Toc223815689" w:history="1">
             <w:r>
               <w:rPr>
                 <w:rStyle w:val="Hyperlink"/>
@@ -1199,7 +1199,7 @@
                 <w:noProof/>
                 <w:webHidden/>
               </w:rPr>
-              <w:instrText xml:space="preserve"> PAGEREF _Toc223794375 \h </w:instrText>
+              <w:instrText xml:space="preserve"> PAGEREF _Toc223815689 \h </w:instrText>
             </w:r>
             <w:r>
               <w:rPr>
@@ -1244,7 +1244,7 @@
               <w:lang w:eastAsia="en-GB"/>
             </w:rPr>
           </w:pPr>
-          <w:hyperlink w:anchor="_Toc223794376" w:history="1">
+          <w:hyperlink w:anchor="_Toc223815690" w:history="1">
             <w:r>
               <w:rPr>
                 <w:rStyle w:val="Hyperlink"/>
@@ -1271,7 +1271,7 @@
                 <w:noProof/>
                 <w:webHidden/>
               </w:rPr>
-              <w:instrText xml:space="preserve"> PAGEREF _Toc223794376 \h </w:instrText>
+              <w:instrText xml:space="preserve"> PAGEREF _Toc223815690 \h </w:instrText>
             </w:r>
             <w:r>
               <w:rPr>
@@ -1316,7 +1316,7 @@
               <w:lang w:eastAsia="en-GB"/>
             </w:rPr>
           </w:pPr>
-          <w:hyperlink w:anchor="_Toc223794377" w:history="1">
+          <w:hyperlink w:anchor="_Toc223815691" w:history="1">
             <w:r>
               <w:rPr>
                 <w:rStyle w:val="Hyperlink"/>
@@ -1343,7 +1343,7 @@
                 <w:noProof/>
                 <w:webHidden/>
               </w:rPr>
-              <w:instrText xml:space="preserve"> PAGEREF _Toc223794377 \h </w:instrText>
+              <w:instrText xml:space="preserve"> PAGEREF _Toc223815691 \h </w:instrText>
             </w:r>
             <w:r>
               <w:rPr>
@@ -1388,7 +1388,7 @@
               <w:lang w:eastAsia="en-GB"/>
             </w:rPr>
           </w:pPr>
-          <w:hyperlink w:anchor="_Toc223794378" w:history="1">
+          <w:hyperlink w:anchor="_Toc223815692" w:history="1">
             <w:r>
               <w:rPr>
                 <w:rStyle w:val="Hyperlink"/>
@@ -1415,7 +1415,7 @@
                 <w:noProof/>
                 <w:webHidden/>
               </w:rPr>
-              <w:instrText xml:space="preserve"> PAGEREF _Toc223794378 \h </w:instrText>
+              <w:instrText xml:space="preserve"> PAGEREF _Toc223815692 \h </w:instrText>
             </w:r>
             <w:r>
               <w:rPr>
@@ -1460,7 +1460,7 @@
               <w:lang w:eastAsia="en-GB"/>
             </w:rPr>
           </w:pPr>
-          <w:hyperlink w:anchor="_Toc223794379" w:history="1">
+          <w:hyperlink w:anchor="_Toc223815693" w:history="1">
             <w:r>
               <w:rPr>
                 <w:rStyle w:val="Hyperlink"/>
@@ -1487,7 +1487,7 @@
                 <w:noProof/>
                 <w:webHidden/>
               </w:rPr>
-              <w:instrText xml:space="preserve"> PAGEREF _Toc223794379 \h </w:instrText>
+              <w:instrText xml:space="preserve"> PAGEREF _Toc223815693 \h </w:instrText>
             </w:r>
             <w:r>
               <w:rPr>
@@ -1532,7 +1532,7 @@
               <w:lang w:eastAsia="en-GB"/>
             </w:rPr>
           </w:pPr>
-          <w:hyperlink w:anchor="_Toc223794380" w:history="1">
+          <w:hyperlink w:anchor="_Toc223815694" w:history="1">
             <w:r>
               <w:rPr>
                 <w:rStyle w:val="Hyperlink"/>
@@ -1559,7 +1559,7 @@
                 <w:noProof/>
                 <w:webHidden/>
               </w:rPr>
-              <w:instrText xml:space="preserve"> PAGEREF _Toc223794380 \h </w:instrText>
+              <w:instrText xml:space="preserve"> PAGEREF _Toc223815694 \h </w:instrText>
             </w:r>
             <w:r>
               <w:rPr>
@@ -1604,7 +1604,7 @@
               <w:lang w:eastAsia="en-GB"/>
             </w:rPr>
           </w:pPr>
-          <w:hyperlink w:anchor="_Toc223794381" w:history="1">
+          <w:hyperlink w:anchor="_Toc223815695" w:history="1">
             <w:r>
               <w:rPr>
                 <w:rStyle w:val="Hyperlink"/>
@@ -1631,7 +1631,7 @@
                 <w:noProof/>
                 <w:webHidden/>
               </w:rPr>
-              <w:instrText xml:space="preserve"> PAGEREF _Toc223794381 \h </w:instrText>
+              <w:instrText xml:space="preserve"> PAGEREF _Toc223815695 \h </w:instrText>
             </w:r>
             <w:r>
               <w:rPr>
@@ -1676,7 +1676,7 @@
               <w:lang w:eastAsia="en-GB"/>
             </w:rPr>
           </w:pPr>
-          <w:hyperlink w:anchor="_Toc223794382" w:history="1">
+          <w:hyperlink w:anchor="_Toc223815696" w:history="1">
             <w:r>
               <w:rPr>
                 <w:rStyle w:val="Hyperlink"/>
@@ -1703,7 +1703,7 @@
                 <w:noProof/>
                 <w:webHidden/>
               </w:rPr>
-              <w:instrText xml:space="preserve"> PAGEREF _Toc223794382 \h </w:instrText>
+              <w:instrText xml:space="preserve"> PAGEREF _Toc223815696 \h </w:instrText>
             </w:r>
             <w:r>
               <w:rPr>
@@ -1748,7 +1748,7 @@
               <w:lang w:eastAsia="en-GB"/>
             </w:rPr>
           </w:pPr>
-          <w:hyperlink w:anchor="_Toc223794383" w:history="1">
+          <w:hyperlink w:anchor="_Toc223815697" w:history="1">
             <w:r>
               <w:rPr>
                 <w:rStyle w:val="Hyperlink"/>
@@ -1775,7 +1775,7 @@
                 <w:noProof/>
                 <w:webHidden/>
               </w:rPr>
-              <w:instrText xml:space="preserve"> PAGEREF _Toc223794383 \h </w:instrText>
+              <w:instrText xml:space="preserve"> PAGEREF _Toc223815697 \h </w:instrText>
             </w:r>
             <w:r>
               <w:rPr>
@@ -1820,7 +1820,7 @@
               <w:lang w:eastAsia="en-GB"/>
             </w:rPr>
           </w:pPr>
-          <w:hyperlink w:anchor="_Toc223794384" w:history="1">
+          <w:hyperlink w:anchor="_Toc223815698" w:history="1">
             <w:r>
               <w:rPr>
                 <w:rStyle w:val="Hyperlink"/>
@@ -1847,7 +1847,7 @@
                 <w:noProof/>
                 <w:webHidden/>
               </w:rPr>
-              <w:instrText xml:space="preserve"> PAGEREF _Toc223794384 \h </w:instrText>
+              <w:instrText xml:space="preserve"> PAGEREF _Toc223815698 \h </w:instrText>
             </w:r>
             <w:r>
               <w:rPr>
@@ -1892,7 +1892,7 @@
               <w:lang w:eastAsia="en-GB"/>
             </w:rPr>
           </w:pPr>
-          <w:hyperlink w:anchor="_Toc223794385" w:history="1">
+          <w:hyperlink w:anchor="_Toc223815699" w:history="1">
             <w:r>
               <w:rPr>
                 <w:rStyle w:val="Hyperlink"/>
@@ -1919,7 +1919,7 @@
                 <w:noProof/>
                 <w:webHidden/>
               </w:rPr>
-              <w:instrText xml:space="preserve"> PAGEREF _Toc223794385 \h </w:instrText>
+              <w:instrText xml:space="preserve"> PAGEREF _Toc223815699 \h </w:instrText>
             </w:r>
             <w:r>
               <w:rPr>
@@ -1964,7 +1964,7 @@
               <w:lang w:eastAsia="en-GB"/>
             </w:rPr>
           </w:pPr>
-          <w:hyperlink w:anchor="_Toc223794386" w:history="1">
+          <w:hyperlink w:anchor="_Toc223815700" w:history="1">
             <w:r>
               <w:rPr>
                 <w:rStyle w:val="Hyperlink"/>
@@ -1991,7 +1991,7 @@
                 <w:noProof/>
                 <w:webHidden/>
               </w:rPr>
-              <w:instrText xml:space="preserve"> PAGEREF _Toc223794386 \h </w:instrText>
+              <w:instrText xml:space="preserve"> PAGEREF _Toc223815700 \h </w:instrText>
             </w:r>
             <w:r>
               <w:rPr>
@@ -2036,7 +2036,7 @@
               <w:lang w:eastAsia="en-GB"/>
             </w:rPr>
           </w:pPr>
-          <w:hyperlink w:anchor="_Toc223794387" w:history="1">
+          <w:hyperlink w:anchor="_Toc223815701" w:history="1">
             <w:r>
               <w:rPr>
                 <w:rStyle w:val="Hyperlink"/>
@@ -2063,7 +2063,7 @@
                 <w:noProof/>
                 <w:webHidden/>
               </w:rPr>
-              <w:instrText xml:space="preserve"> PAGEREF _Toc223794387 \h </w:instrText>
+              <w:instrText xml:space="preserve"> PAGEREF _Toc223815701 \h </w:instrText>
             </w:r>
             <w:r>
               <w:rPr>
@@ -2108,7 +2108,7 @@
               <w:lang w:eastAsia="en-GB"/>
             </w:rPr>
           </w:pPr>
-          <w:hyperlink w:anchor="_Toc223794388" w:history="1">
+          <w:hyperlink w:anchor="_Toc223815702" w:history="1">
             <w:r>
               <w:rPr>
                 <w:rStyle w:val="Hyperlink"/>
@@ -2135,7 +2135,7 @@
                 <w:noProof/>
                 <w:webHidden/>
               </w:rPr>
-              <w:instrText xml:space="preserve"> PAGEREF _Toc223794388 \h </w:instrText>
+              <w:instrText xml:space="preserve"> PAGEREF _Toc223815702 \h </w:instrText>
             </w:r>
             <w:r>
               <w:rPr>
@@ -2180,7 +2180,7 @@
               <w:lang w:eastAsia="en-GB"/>
             </w:rPr>
           </w:pPr>
-          <w:hyperlink w:anchor="_Toc223794389" w:history="1">
+          <w:hyperlink w:anchor="_Toc223815703" w:history="1">
             <w:r>
               <w:rPr>
                 <w:rStyle w:val="Hyperlink"/>
@@ -2207,7 +2207,7 @@
                 <w:noProof/>
                 <w:webHidden/>
               </w:rPr>
-              <w:instrText xml:space="preserve"> PAGEREF _Toc223794389 \h </w:instrText>
+              <w:instrText xml:space="preserve"> PAGEREF _Toc223815703 \h </w:instrText>
             </w:r>
             <w:r>
               <w:rPr>
@@ -2252,7 +2252,7 @@
               <w:lang w:eastAsia="en-GB"/>
             </w:rPr>
           </w:pPr>
-          <w:hyperlink w:anchor="_Toc223794390" w:history="1">
+          <w:hyperlink w:anchor="_Toc223815704" w:history="1">
             <w:r>
               <w:rPr>
                 <w:rStyle w:val="Hyperlink"/>
@@ -2279,7 +2279,7 @@
                 <w:noProof/>
                 <w:webHidden/>
               </w:rPr>
-              <w:instrText xml:space="preserve"> PAGEREF _Toc223794390 \h </w:instrText>
+              <w:instrText xml:space="preserve"> PAGEREF _Toc223815704 \h </w:instrText>
             </w:r>
             <w:r>
               <w:rPr>
@@ -2324,7 +2324,7 @@
               <w:lang w:eastAsia="en-GB"/>
             </w:rPr>
           </w:pPr>
-          <w:hyperlink w:anchor="_Toc223794391" w:history="1">
+          <w:hyperlink w:anchor="_Toc223815705" w:history="1">
             <w:r>
               <w:rPr>
                 <w:rStyle w:val="Hyperlink"/>
@@ -2351,7 +2351,7 @@
                 <w:noProof/>
                 <w:webHidden/>
               </w:rPr>
-              <w:instrText xml:space="preserve"> PAGEREF _Toc223794391 \h </w:instrText>
+              <w:instrText xml:space="preserve"> PAGEREF _Toc223815705 \h </w:instrText>
             </w:r>
             <w:r>
               <w:rPr>
@@ -2396,7 +2396,7 @@
               <w:lang w:eastAsia="en-GB"/>
             </w:rPr>
           </w:pPr>
-          <w:hyperlink w:anchor="_Toc223794392" w:history="1">
+          <w:hyperlink w:anchor="_Toc223815706" w:history="1">
             <w:r>
               <w:rPr>
                 <w:rStyle w:val="Hyperlink"/>
@@ -2423,7 +2423,7 @@
                 <w:noProof/>
                 <w:webHidden/>
               </w:rPr>
-              <w:instrText xml:space="preserve"> PAGEREF _Toc223794392 \h </w:instrText>
+              <w:instrText xml:space="preserve"> PAGEREF _Toc223815706 \h </w:instrText>
             </w:r>
             <w:r>
               <w:rPr>
@@ -2468,7 +2468,7 @@
               <w:lang w:eastAsia="en-GB"/>
             </w:rPr>
           </w:pPr>
-          <w:hyperlink w:anchor="_Toc223794393" w:history="1">
+          <w:hyperlink w:anchor="_Toc223815707" w:history="1">
             <w:r>
               <w:rPr>
                 <w:rStyle w:val="Hyperlink"/>
@@ -2495,7 +2495,7 @@
                 <w:noProof/>
                 <w:webHidden/>
               </w:rPr>
-              <w:instrText xml:space="preserve"> PAGEREF _Toc223794393 \h </w:instrText>
+              <w:instrText xml:space="preserve"> PAGEREF _Toc223815707 \h </w:instrText>
             </w:r>
             <w:r>
               <w:rPr>
@@ -2540,7 +2540,7 @@
               <w:lang w:eastAsia="en-GB"/>
             </w:rPr>
           </w:pPr>
-          <w:hyperlink w:anchor="_Toc223794394" w:history="1">
+          <w:hyperlink w:anchor="_Toc223815708" w:history="1">
             <w:r>
               <w:rPr>
                 <w:rStyle w:val="Hyperlink"/>
@@ -2567,7 +2567,7 @@
                 <w:noProof/>
                 <w:webHidden/>
               </w:rPr>
-              <w:instrText xml:space="preserve"> PAGEREF _Toc223794394 \h </w:instrText>
+              <w:instrText xml:space="preserve"> PAGEREF _Toc223815708 \h </w:instrText>
             </w:r>
             <w:r>
               <w:rPr>
@@ -2612,7 +2612,7 @@
               <w:lang w:eastAsia="en-GB"/>
             </w:rPr>
           </w:pPr>
-          <w:hyperlink w:anchor="_Toc223794395" w:history="1">
+          <w:hyperlink w:anchor="_Toc223815709" w:history="1">
             <w:r>
               <w:rPr>
                 <w:rStyle w:val="Hyperlink"/>
@@ -2639,7 +2639,7 @@
                 <w:noProof/>
                 <w:webHidden/>
               </w:rPr>
-              <w:instrText xml:space="preserve"> PAGEREF _Toc223794395 \h </w:instrText>
+              <w:instrText xml:space="preserve"> PAGEREF _Toc223815709 \h </w:instrText>
             </w:r>
             <w:r>
               <w:rPr>
@@ -2684,7 +2684,7 @@
               <w:lang w:eastAsia="en-GB"/>
             </w:rPr>
           </w:pPr>
-          <w:hyperlink w:anchor="_Toc223794396" w:history="1">
+          <w:hyperlink w:anchor="_Toc223815710" w:history="1">
             <w:r>
               <w:rPr>
                 <w:rStyle w:val="Hyperlink"/>
@@ -2711,7 +2711,7 @@
                 <w:noProof/>
                 <w:webHidden/>
               </w:rPr>
-              <w:instrText xml:space="preserve"> PAGEREF _Toc223794396 \h </w:instrText>
+              <w:instrText xml:space="preserve"> PAGEREF _Toc223815710 \h </w:instrText>
             </w:r>
             <w:r>
               <w:rPr>
@@ -2756,7 +2756,7 @@
               <w:lang w:eastAsia="en-GB"/>
             </w:rPr>
           </w:pPr>
-          <w:hyperlink w:anchor="_Toc223794397" w:history="1">
+          <w:hyperlink w:anchor="_Toc223815711" w:history="1">
             <w:r>
               <w:rPr>
                 <w:rStyle w:val="Hyperlink"/>
@@ -2783,7 +2783,7 @@
                 <w:noProof/>
                 <w:webHidden/>
               </w:rPr>
-              <w:instrText xml:space="preserve"> PAGEREF _Toc223794397 \h </w:instrText>
+              <w:instrText xml:space="preserve"> PAGEREF _Toc223815711 \h </w:instrText>
             </w:r>
             <w:r>
               <w:rPr>
@@ -2828,7 +2828,7 @@
               <w:lang w:eastAsia="en-GB"/>
             </w:rPr>
           </w:pPr>
-          <w:hyperlink w:anchor="_Toc223794398" w:history="1">
+          <w:hyperlink w:anchor="_Toc223815712" w:history="1">
             <w:r>
               <w:rPr>
                 <w:rStyle w:val="Hyperlink"/>
@@ -2855,7 +2855,7 @@
                 <w:noProof/>
                 <w:webHidden/>
               </w:rPr>
-              <w:instrText xml:space="preserve"> PAGEREF _Toc223794398 \h </w:instrText>
+              <w:instrText xml:space="preserve"> PAGEREF _Toc223815712 \h </w:instrText>
             </w:r>
             <w:r>
               <w:rPr>
@@ -2900,13 +2900,13 @@
               <w:lang w:eastAsia="en-GB"/>
             </w:rPr>
           </w:pPr>
-          <w:hyperlink w:anchor="_Toc223794399" w:history="1">
+          <w:hyperlink w:anchor="_Toc223815713" w:history="1">
             <w:r>
               <w:rPr>
                 <w:rStyle w:val="Hyperlink"/>
                 <w:noProof/>
               </w:rPr>
-              <w:t>Strengths and Weaknesses</w:t>
+              <w:t>Improvements to be Made</w:t>
             </w:r>
             <w:r>
               <w:rPr>
@@ -2927,7 +2927,7 @@
                 <w:noProof/>
                 <w:webHidden/>
               </w:rPr>
-              <w:instrText xml:space="preserve"> PAGEREF _Toc223794399 \h </w:instrText>
+              <w:instrText xml:space="preserve"> PAGEREF _Toc223815713 \h </w:instrText>
             </w:r>
             <w:r>
               <w:rPr>
@@ -2947,7 +2947,79 @@
                 <w:noProof/>
                 <w:webHidden/>
               </w:rPr>
-              <w:t>21</w:t>
+              <w:t>22</w:t>
+            </w:r>
+            <w:r>
+              <w:rPr>
+                <w:noProof/>
+                <w:webHidden/>
+              </w:rPr>
+              <w:fldChar w:fldCharType="end"/>
+            </w:r>
+          </w:hyperlink>
+        </w:p>
+        <w:p>
+          <w:pPr>
+            <w:pStyle w:val="TOC2"/>
+            <w:tabs>
+              <w:tab w:val="right" w:leader="dot" w:pos="9016"/>
+            </w:tabs>
+            <w:rPr>
+              <w:rFonts w:eastAsiaTheme="minorEastAsia"/>
+              <w:noProof/>
+              <w:sz w:val="24"/>
+              <w:szCs w:val="24"/>
+              <w:lang w:eastAsia="en-GB"/>
+            </w:rPr>
+          </w:pPr>
+          <w:hyperlink w:anchor="_Toc223815714" w:history="1">
+            <w:r>
+              <w:rPr>
+                <w:rStyle w:val="Hyperlink"/>
+                <w:noProof/>
+              </w:rPr>
+              <w:t>Final Version Tests</w:t>
+            </w:r>
+            <w:r>
+              <w:rPr>
+                <w:noProof/>
+                <w:webHidden/>
+              </w:rPr>
+              <w:tab/>
+            </w:r>
+            <w:r>
+              <w:rPr>
+                <w:noProof/>
+                <w:webHidden/>
+              </w:rPr>
+              <w:fldChar w:fldCharType="begin"/>
+            </w:r>
+            <w:r>
+              <w:rPr>
+                <w:noProof/>
+                <w:webHidden/>
+              </w:rPr>
+              <w:instrText xml:space="preserve"> PAGEREF _Toc223815714 \h </w:instrText>
+            </w:r>
+            <w:r>
+              <w:rPr>
+                <w:noProof/>
+                <w:webHidden/>
+              </w:rPr>
+            </w:r>
+            <w:r>
+              <w:rPr>
+                <w:noProof/>
+                <w:webHidden/>
+              </w:rPr>
+              <w:fldChar w:fldCharType="separate"/>
+            </w:r>
+            <w:r>
+              <w:rPr>
+                <w:noProof/>
+                <w:webHidden/>
+              </w:rPr>
+              <w:t>22</w:t>
             </w:r>
             <w:r>
               <w:rPr>
@@ -2972,13 +3044,13 @@
               <w:lang w:eastAsia="en-GB"/>
             </w:rPr>
           </w:pPr>
-          <w:hyperlink w:anchor="_Toc223794400" w:history="1">
+          <w:hyperlink w:anchor="_Toc223815715" w:history="1">
             <w:r>
               <w:rPr>
                 <w:rStyle w:val="Hyperlink"/>
                 <w:noProof/>
               </w:rPr>
-              <w:t>Improvements to be Made</w:t>
+              <w:t>Interaction Objects and Objective Understanding</w:t>
             </w:r>
             <w:r>
               <w:rPr>
@@ -2999,7 +3071,7 @@
                 <w:noProof/>
                 <w:webHidden/>
               </w:rPr>
-              <w:instrText xml:space="preserve"> PAGEREF _Toc223794400 \h </w:instrText>
+              <w:instrText xml:space="preserve"> PAGEREF _Toc223815715 \h </w:instrText>
             </w:r>
             <w:r>
               <w:rPr>
@@ -3019,7 +3091,439 @@
                 <w:noProof/>
                 <w:webHidden/>
               </w:rPr>
-              <w:t>21</w:t>
+              <w:t>22</w:t>
+            </w:r>
+            <w:r>
+              <w:rPr>
+                <w:noProof/>
+                <w:webHidden/>
+              </w:rPr>
+              <w:fldChar w:fldCharType="end"/>
+            </w:r>
+          </w:hyperlink>
+        </w:p>
+        <w:p>
+          <w:pPr>
+            <w:pStyle w:val="TOC3"/>
+            <w:tabs>
+              <w:tab w:val="right" w:leader="dot" w:pos="9016"/>
+            </w:tabs>
+            <w:rPr>
+              <w:rFonts w:eastAsiaTheme="minorEastAsia"/>
+              <w:noProof/>
+              <w:sz w:val="24"/>
+              <w:szCs w:val="24"/>
+              <w:lang w:eastAsia="en-GB"/>
+            </w:rPr>
+          </w:pPr>
+          <w:hyperlink w:anchor="_Toc223815716" w:history="1">
+            <w:r>
+              <w:rPr>
+                <w:rStyle w:val="Hyperlink"/>
+                <w:noProof/>
+              </w:rPr>
+              <w:t>User Attention Detection</w:t>
+            </w:r>
+            <w:r>
+              <w:rPr>
+                <w:noProof/>
+                <w:webHidden/>
+              </w:rPr>
+              <w:tab/>
+            </w:r>
+            <w:r>
+              <w:rPr>
+                <w:noProof/>
+                <w:webHidden/>
+              </w:rPr>
+              <w:fldChar w:fldCharType="begin"/>
+            </w:r>
+            <w:r>
+              <w:rPr>
+                <w:noProof/>
+                <w:webHidden/>
+              </w:rPr>
+              <w:instrText xml:space="preserve"> PAGEREF _Toc223815716 \h </w:instrText>
+            </w:r>
+            <w:r>
+              <w:rPr>
+                <w:noProof/>
+                <w:webHidden/>
+              </w:rPr>
+            </w:r>
+            <w:r>
+              <w:rPr>
+                <w:noProof/>
+                <w:webHidden/>
+              </w:rPr>
+              <w:fldChar w:fldCharType="separate"/>
+            </w:r>
+            <w:r>
+              <w:rPr>
+                <w:noProof/>
+                <w:webHidden/>
+              </w:rPr>
+              <w:t>22</w:t>
+            </w:r>
+            <w:r>
+              <w:rPr>
+                <w:noProof/>
+                <w:webHidden/>
+              </w:rPr>
+              <w:fldChar w:fldCharType="end"/>
+            </w:r>
+          </w:hyperlink>
+        </w:p>
+        <w:p>
+          <w:pPr>
+            <w:pStyle w:val="TOC3"/>
+            <w:tabs>
+              <w:tab w:val="right" w:leader="dot" w:pos="9016"/>
+            </w:tabs>
+            <w:rPr>
+              <w:rFonts w:eastAsiaTheme="minorEastAsia"/>
+              <w:noProof/>
+              <w:sz w:val="24"/>
+              <w:szCs w:val="24"/>
+              <w:lang w:eastAsia="en-GB"/>
+            </w:rPr>
+          </w:pPr>
+          <w:hyperlink w:anchor="_Toc223815717" w:history="1">
+            <w:r>
+              <w:rPr>
+                <w:rStyle w:val="Hyperlink"/>
+                <w:noProof/>
+              </w:rPr>
+              <w:t>Symptom Simulations</w:t>
+            </w:r>
+            <w:r>
+              <w:rPr>
+                <w:noProof/>
+                <w:webHidden/>
+              </w:rPr>
+              <w:tab/>
+            </w:r>
+            <w:r>
+              <w:rPr>
+                <w:noProof/>
+                <w:webHidden/>
+              </w:rPr>
+              <w:fldChar w:fldCharType="begin"/>
+            </w:r>
+            <w:r>
+              <w:rPr>
+                <w:noProof/>
+                <w:webHidden/>
+              </w:rPr>
+              <w:instrText xml:space="preserve"> PAGEREF _Toc223815717 \h </w:instrText>
+            </w:r>
+            <w:r>
+              <w:rPr>
+                <w:noProof/>
+                <w:webHidden/>
+              </w:rPr>
+            </w:r>
+            <w:r>
+              <w:rPr>
+                <w:noProof/>
+                <w:webHidden/>
+              </w:rPr>
+              <w:fldChar w:fldCharType="separate"/>
+            </w:r>
+            <w:r>
+              <w:rPr>
+                <w:noProof/>
+                <w:webHidden/>
+              </w:rPr>
+              <w:t>22</w:t>
+            </w:r>
+            <w:r>
+              <w:rPr>
+                <w:noProof/>
+                <w:webHidden/>
+              </w:rPr>
+              <w:fldChar w:fldCharType="end"/>
+            </w:r>
+          </w:hyperlink>
+        </w:p>
+        <w:p>
+          <w:pPr>
+            <w:pStyle w:val="TOC1"/>
+            <w:tabs>
+              <w:tab w:val="right" w:leader="dot" w:pos="9016"/>
+            </w:tabs>
+            <w:rPr>
+              <w:rFonts w:eastAsiaTheme="minorEastAsia"/>
+              <w:noProof/>
+              <w:sz w:val="24"/>
+              <w:szCs w:val="24"/>
+              <w:lang w:eastAsia="en-GB"/>
+            </w:rPr>
+          </w:pPr>
+          <w:hyperlink w:anchor="_Toc223815718" w:history="1">
+            <w:r>
+              <w:rPr>
+                <w:rStyle w:val="Hyperlink"/>
+                <w:noProof/>
+              </w:rPr>
+              <w:t>Critical Evaluation</w:t>
+            </w:r>
+            <w:r>
+              <w:rPr>
+                <w:noProof/>
+                <w:webHidden/>
+              </w:rPr>
+              <w:tab/>
+            </w:r>
+            <w:r>
+              <w:rPr>
+                <w:noProof/>
+                <w:webHidden/>
+              </w:rPr>
+              <w:fldChar w:fldCharType="begin"/>
+            </w:r>
+            <w:r>
+              <w:rPr>
+                <w:noProof/>
+                <w:webHidden/>
+              </w:rPr>
+              <w:instrText xml:space="preserve"> PAGEREF _Toc223815718 \h </w:instrText>
+            </w:r>
+            <w:r>
+              <w:rPr>
+                <w:noProof/>
+                <w:webHidden/>
+              </w:rPr>
+            </w:r>
+            <w:r>
+              <w:rPr>
+                <w:noProof/>
+                <w:webHidden/>
+              </w:rPr>
+              <w:fldChar w:fldCharType="separate"/>
+            </w:r>
+            <w:r>
+              <w:rPr>
+                <w:noProof/>
+                <w:webHidden/>
+              </w:rPr>
+              <w:t>23</w:t>
+            </w:r>
+            <w:r>
+              <w:rPr>
+                <w:noProof/>
+                <w:webHidden/>
+              </w:rPr>
+              <w:fldChar w:fldCharType="end"/>
+            </w:r>
+          </w:hyperlink>
+        </w:p>
+        <w:p>
+          <w:pPr>
+            <w:pStyle w:val="TOC1"/>
+            <w:tabs>
+              <w:tab w:val="right" w:leader="dot" w:pos="9016"/>
+            </w:tabs>
+            <w:rPr>
+              <w:rFonts w:eastAsiaTheme="minorEastAsia"/>
+              <w:noProof/>
+              <w:sz w:val="24"/>
+              <w:szCs w:val="24"/>
+              <w:lang w:eastAsia="en-GB"/>
+            </w:rPr>
+          </w:pPr>
+          <w:hyperlink w:anchor="_Toc223815719" w:history="1">
+            <w:r>
+              <w:rPr>
+                <w:rStyle w:val="Hyperlink"/>
+                <w:noProof/>
+              </w:rPr>
+              <w:t>Conclusions and Future Work</w:t>
+            </w:r>
+            <w:r>
+              <w:rPr>
+                <w:noProof/>
+                <w:webHidden/>
+              </w:rPr>
+              <w:tab/>
+            </w:r>
+            <w:r>
+              <w:rPr>
+                <w:noProof/>
+                <w:webHidden/>
+              </w:rPr>
+              <w:fldChar w:fldCharType="begin"/>
+            </w:r>
+            <w:r>
+              <w:rPr>
+                <w:noProof/>
+                <w:webHidden/>
+              </w:rPr>
+              <w:instrText xml:space="preserve"> PAGEREF _Toc223815719 \h </w:instrText>
+            </w:r>
+            <w:r>
+              <w:rPr>
+                <w:noProof/>
+                <w:webHidden/>
+              </w:rPr>
+            </w:r>
+            <w:r>
+              <w:rPr>
+                <w:noProof/>
+                <w:webHidden/>
+              </w:rPr>
+              <w:fldChar w:fldCharType="separate"/>
+            </w:r>
+            <w:r>
+              <w:rPr>
+                <w:noProof/>
+                <w:webHidden/>
+              </w:rPr>
+              <w:t>24</w:t>
+            </w:r>
+            <w:r>
+              <w:rPr>
+                <w:noProof/>
+                <w:webHidden/>
+              </w:rPr>
+              <w:fldChar w:fldCharType="end"/>
+            </w:r>
+          </w:hyperlink>
+        </w:p>
+        <w:p>
+          <w:pPr>
+            <w:pStyle w:val="TOC1"/>
+            <w:tabs>
+              <w:tab w:val="right" w:leader="dot" w:pos="9016"/>
+            </w:tabs>
+            <w:rPr>
+              <w:rFonts w:eastAsiaTheme="minorEastAsia"/>
+              <w:noProof/>
+              <w:sz w:val="24"/>
+              <w:szCs w:val="24"/>
+              <w:lang w:eastAsia="en-GB"/>
+            </w:rPr>
+          </w:pPr>
+          <w:hyperlink w:anchor="_Toc223815720" w:history="1">
+            <w:r>
+              <w:rPr>
+                <w:rStyle w:val="Hyperlink"/>
+                <w:noProof/>
+              </w:rPr>
+              <w:t>References</w:t>
+            </w:r>
+            <w:r>
+              <w:rPr>
+                <w:noProof/>
+                <w:webHidden/>
+              </w:rPr>
+              <w:tab/>
+            </w:r>
+            <w:r>
+              <w:rPr>
+                <w:noProof/>
+                <w:webHidden/>
+              </w:rPr>
+              <w:fldChar w:fldCharType="begin"/>
+            </w:r>
+            <w:r>
+              <w:rPr>
+                <w:noProof/>
+                <w:webHidden/>
+              </w:rPr>
+              <w:instrText xml:space="preserve"> PAGEREF _Toc223815720 \h </w:instrText>
+            </w:r>
+            <w:r>
+              <w:rPr>
+                <w:noProof/>
+                <w:webHidden/>
+              </w:rPr>
+            </w:r>
+            <w:r>
+              <w:rPr>
+                <w:noProof/>
+                <w:webHidden/>
+              </w:rPr>
+              <w:fldChar w:fldCharType="separate"/>
+            </w:r>
+            <w:r>
+              <w:rPr>
+                <w:noProof/>
+                <w:webHidden/>
+              </w:rPr>
+              <w:t>25</w:t>
+            </w:r>
+            <w:r>
+              <w:rPr>
+                <w:noProof/>
+                <w:webHidden/>
+              </w:rPr>
+              <w:fldChar w:fldCharType="end"/>
+            </w:r>
+          </w:hyperlink>
+        </w:p>
+        <w:p>
+          <w:pPr>
+            <w:pStyle w:val="TOC1"/>
+            <w:tabs>
+              <w:tab w:val="right" w:leader="dot" w:pos="9016"/>
+            </w:tabs>
+            <w:rPr>
+              <w:rFonts w:eastAsiaTheme="minorEastAsia"/>
+              <w:noProof/>
+              <w:sz w:val="24"/>
+              <w:szCs w:val="24"/>
+              <w:lang w:eastAsia="en-GB"/>
+            </w:rPr>
+          </w:pPr>
+          <w:hyperlink w:anchor="_Toc223815721" w:history="1">
+            <w:r>
+              <w:rPr>
+                <w:rStyle w:val="Hyperlink"/>
+                <w:noProof/>
+              </w:rPr>
+              <w:t>Appendix</w:t>
+            </w:r>
+            <w:r>
+              <w:rPr>
+                <w:noProof/>
+                <w:webHidden/>
+              </w:rPr>
+              <w:tab/>
+            </w:r>
+            <w:r>
+              <w:rPr>
+                <w:noProof/>
+                <w:webHidden/>
+              </w:rPr>
+              <w:fldChar w:fldCharType="begin"/>
+            </w:r>
+            <w:r>
+              <w:rPr>
+                <w:noProof/>
+                <w:webHidden/>
+              </w:rPr>
+              <w:instrText xml:space="preserve"> PAGEREF _Toc223815721 \h </w:instrText>
+            </w:r>
+            <w:r>
+              <w:rPr>
+                <w:noProof/>
+                <w:webHidden/>
+              </w:rPr>
+            </w:r>
+            <w:r>
+              <w:rPr>
+                <w:noProof/>
+                <w:webHidden/>
+              </w:rPr>
+              <w:fldChar w:fldCharType="separate"/>
+            </w:r>
+            <w:r>
+              <w:rPr>
+                <w:noProof/>
+                <w:webHidden/>
+              </w:rPr>
+              <w:t>26</w:t>
             </w:r>
             <w:r>
               <w:rPr>
@@ -3044,13 +3548,13 @@
               <w:lang w:eastAsia="en-GB"/>
             </w:rPr>
           </w:pPr>
-          <w:hyperlink w:anchor="_Toc223794401" w:history="1">
+          <w:hyperlink w:anchor="_Toc223815722" w:history="1">
             <w:r>
               <w:rPr>
                 <w:rStyle w:val="Hyperlink"/>
                 <w:noProof/>
               </w:rPr>
-              <w:t>Final Version Tests</w:t>
+              <w:t>Asset Licenses and Sources</w:t>
             </w:r>
             <w:r>
               <w:rPr>
@@ -3071,7 +3575,7 @@
                 <w:noProof/>
                 <w:webHidden/>
               </w:rPr>
-              <w:instrText xml:space="preserve"> PAGEREF _Toc223794401 \h </w:instrText>
+              <w:instrText xml:space="preserve"> PAGEREF _Toc223815722 \h </w:instrText>
             </w:r>
             <w:r>
               <w:rPr>
@@ -3091,7 +3595,7 @@
                 <w:noProof/>
                 <w:webHidden/>
               </w:rPr>
-              <w:t>21</w:t>
+              <w:t>26</w:t>
             </w:r>
             <w:r>
               <w:rPr>
@@ -3116,13 +3620,13 @@
               <w:lang w:eastAsia="en-GB"/>
             </w:rPr>
           </w:pPr>
-          <w:hyperlink w:anchor="_Toc223794402" w:history="1">
+          <w:hyperlink w:anchor="_Toc223815723" w:history="1">
             <w:r>
               <w:rPr>
                 <w:rStyle w:val="Hyperlink"/>
                 <w:noProof/>
               </w:rPr>
-              <w:t>Interaction Objects and Objective Understanding</w:t>
+              <w:t>Modern Office Table</w:t>
             </w:r>
             <w:r>
               <w:rPr>
@@ -3143,7 +3647,7 @@
                 <w:noProof/>
                 <w:webHidden/>
               </w:rPr>
-              <w:instrText xml:space="preserve"> PAGEREF _Toc223794402 \h </w:instrText>
+              <w:instrText xml:space="preserve"> PAGEREF _Toc223815723 \h </w:instrText>
             </w:r>
             <w:r>
               <w:rPr>
@@ -3163,7 +3667,7 @@
                 <w:noProof/>
                 <w:webHidden/>
               </w:rPr>
-              <w:t>22</w:t>
+              <w:t>26</w:t>
             </w:r>
             <w:r>
               <w:rPr>
@@ -3188,13 +3692,13 @@
               <w:lang w:eastAsia="en-GB"/>
             </w:rPr>
           </w:pPr>
-          <w:hyperlink w:anchor="_Toc223794403" w:history="1">
+          <w:hyperlink w:anchor="_Toc223815724" w:history="1">
             <w:r>
               <w:rPr>
                 <w:rStyle w:val="Hyperlink"/>
                 <w:noProof/>
               </w:rPr>
-              <w:t>User Attention Detection</w:t>
+              <w:t>Free Studio Starter Pack</w:t>
             </w:r>
             <w:r>
               <w:rPr>
@@ -3215,7 +3719,7 @@
                 <w:noProof/>
                 <w:webHidden/>
               </w:rPr>
-              <w:instrText xml:space="preserve"> PAGEREF _Toc223794403 \h </w:instrText>
+              <w:instrText xml:space="preserve"> PAGEREF _Toc223815724 \h </w:instrText>
             </w:r>
             <w:r>
               <w:rPr>
@@ -3235,7 +3739,7 @@
                 <w:noProof/>
                 <w:webHidden/>
               </w:rPr>
-              <w:t>22</w:t>
+              <w:t>26</w:t>
             </w:r>
             <w:r>
               <w:rPr>
@@ -3260,13 +3764,13 @@
               <w:lang w:eastAsia="en-GB"/>
             </w:rPr>
           </w:pPr>
-          <w:hyperlink w:anchor="_Toc223794404" w:history="1">
+          <w:hyperlink w:anchor="_Toc223815725" w:history="1">
             <w:r>
               <w:rPr>
                 <w:rStyle w:val="Hyperlink"/>
                 <w:noProof/>
               </w:rPr>
-              <w:t>Symptom Simulations</w:t>
+              <w:t>General Desktop Bundle</w:t>
             </w:r>
             <w:r>
               <w:rPr>
@@ -3287,367 +3791,7 @@
                 <w:noProof/>
                 <w:webHidden/>
               </w:rPr>
-              <w:instrText xml:space="preserve"> PAGEREF _Toc223794404 \h </w:instrText>
-            </w:r>
-            <w:r>
-              <w:rPr>
-                <w:noProof/>
-                <w:webHidden/>
-              </w:rPr>
-            </w:r>
-            <w:r>
-              <w:rPr>
-                <w:noProof/>
-                <w:webHidden/>
-              </w:rPr>
-              <w:fldChar w:fldCharType="separate"/>
-            </w:r>
-            <w:r>
-              <w:rPr>
-                <w:noProof/>
-                <w:webHidden/>
-              </w:rPr>
-              <w:t>22</w:t>
-            </w:r>
-            <w:r>
-              <w:rPr>
-                <w:noProof/>
-                <w:webHidden/>
-              </w:rPr>
-              <w:fldChar w:fldCharType="end"/>
-            </w:r>
-          </w:hyperlink>
-        </w:p>
-        <w:p>
-          <w:pPr>
-            <w:pStyle w:val="TOC1"/>
-            <w:tabs>
-              <w:tab w:val="right" w:leader="dot" w:pos="9016"/>
-            </w:tabs>
-            <w:rPr>
-              <w:rFonts w:eastAsiaTheme="minorEastAsia"/>
-              <w:noProof/>
-              <w:sz w:val="24"/>
-              <w:szCs w:val="24"/>
-              <w:lang w:eastAsia="en-GB"/>
-            </w:rPr>
-          </w:pPr>
-          <w:hyperlink w:anchor="_Toc223794405" w:history="1">
-            <w:r>
-              <w:rPr>
-                <w:rStyle w:val="Hyperlink"/>
-                <w:noProof/>
-              </w:rPr>
-              <w:t>Critical Evaluation</w:t>
-            </w:r>
-            <w:r>
-              <w:rPr>
-                <w:noProof/>
-                <w:webHidden/>
-              </w:rPr>
-              <w:tab/>
-            </w:r>
-            <w:r>
-              <w:rPr>
-                <w:noProof/>
-                <w:webHidden/>
-              </w:rPr>
-              <w:fldChar w:fldCharType="begin"/>
-            </w:r>
-            <w:r>
-              <w:rPr>
-                <w:noProof/>
-                <w:webHidden/>
-              </w:rPr>
-              <w:instrText xml:space="preserve"> PAGEREF _Toc223794405 \h </w:instrText>
-            </w:r>
-            <w:r>
-              <w:rPr>
-                <w:noProof/>
-                <w:webHidden/>
-              </w:rPr>
-            </w:r>
-            <w:r>
-              <w:rPr>
-                <w:noProof/>
-                <w:webHidden/>
-              </w:rPr>
-              <w:fldChar w:fldCharType="separate"/>
-            </w:r>
-            <w:r>
-              <w:rPr>
-                <w:noProof/>
-                <w:webHidden/>
-              </w:rPr>
-              <w:t>23</w:t>
-            </w:r>
-            <w:r>
-              <w:rPr>
-                <w:noProof/>
-                <w:webHidden/>
-              </w:rPr>
-              <w:fldChar w:fldCharType="end"/>
-            </w:r>
-          </w:hyperlink>
-        </w:p>
-        <w:p>
-          <w:pPr>
-            <w:pStyle w:val="TOC1"/>
-            <w:tabs>
-              <w:tab w:val="right" w:leader="dot" w:pos="9016"/>
-            </w:tabs>
-            <w:rPr>
-              <w:rFonts w:eastAsiaTheme="minorEastAsia"/>
-              <w:noProof/>
-              <w:sz w:val="24"/>
-              <w:szCs w:val="24"/>
-              <w:lang w:eastAsia="en-GB"/>
-            </w:rPr>
-          </w:pPr>
-          <w:hyperlink w:anchor="_Toc223794406" w:history="1">
-            <w:r>
-              <w:rPr>
-                <w:rStyle w:val="Hyperlink"/>
-                <w:noProof/>
-              </w:rPr>
-              <w:t>Conclusions and Future Work</w:t>
-            </w:r>
-            <w:r>
-              <w:rPr>
-                <w:noProof/>
-                <w:webHidden/>
-              </w:rPr>
-              <w:tab/>
-            </w:r>
-            <w:r>
-              <w:rPr>
-                <w:noProof/>
-                <w:webHidden/>
-              </w:rPr>
-              <w:fldChar w:fldCharType="begin"/>
-            </w:r>
-            <w:r>
-              <w:rPr>
-                <w:noProof/>
-                <w:webHidden/>
-              </w:rPr>
-              <w:instrText xml:space="preserve"> PAGEREF _Toc223794406 \h </w:instrText>
-            </w:r>
-            <w:r>
-              <w:rPr>
-                <w:noProof/>
-                <w:webHidden/>
-              </w:rPr>
-            </w:r>
-            <w:r>
-              <w:rPr>
-                <w:noProof/>
-                <w:webHidden/>
-              </w:rPr>
-              <w:fldChar w:fldCharType="separate"/>
-            </w:r>
-            <w:r>
-              <w:rPr>
-                <w:noProof/>
-                <w:webHidden/>
-              </w:rPr>
-              <w:t>24</w:t>
-            </w:r>
-            <w:r>
-              <w:rPr>
-                <w:noProof/>
-                <w:webHidden/>
-              </w:rPr>
-              <w:fldChar w:fldCharType="end"/>
-            </w:r>
-          </w:hyperlink>
-        </w:p>
-        <w:p>
-          <w:pPr>
-            <w:pStyle w:val="TOC1"/>
-            <w:tabs>
-              <w:tab w:val="right" w:leader="dot" w:pos="9016"/>
-            </w:tabs>
-            <w:rPr>
-              <w:rFonts w:eastAsiaTheme="minorEastAsia"/>
-              <w:noProof/>
-              <w:sz w:val="24"/>
-              <w:szCs w:val="24"/>
-              <w:lang w:eastAsia="en-GB"/>
-            </w:rPr>
-          </w:pPr>
-          <w:hyperlink w:anchor="_Toc223794407" w:history="1">
-            <w:r>
-              <w:rPr>
-                <w:rStyle w:val="Hyperlink"/>
-                <w:noProof/>
-              </w:rPr>
-              <w:t>References</w:t>
-            </w:r>
-            <w:r>
-              <w:rPr>
-                <w:noProof/>
-                <w:webHidden/>
-              </w:rPr>
-              <w:tab/>
-            </w:r>
-            <w:r>
-              <w:rPr>
-                <w:noProof/>
-                <w:webHidden/>
-              </w:rPr>
-              <w:fldChar w:fldCharType="begin"/>
-            </w:r>
-            <w:r>
-              <w:rPr>
-                <w:noProof/>
-                <w:webHidden/>
-              </w:rPr>
-              <w:instrText xml:space="preserve"> PAGEREF _Toc223794407 \h </w:instrText>
-            </w:r>
-            <w:r>
-              <w:rPr>
-                <w:noProof/>
-                <w:webHidden/>
-              </w:rPr>
-            </w:r>
-            <w:r>
-              <w:rPr>
-                <w:noProof/>
-                <w:webHidden/>
-              </w:rPr>
-              <w:fldChar w:fldCharType="separate"/>
-            </w:r>
-            <w:r>
-              <w:rPr>
-                <w:noProof/>
-                <w:webHidden/>
-              </w:rPr>
-              <w:t>25</w:t>
-            </w:r>
-            <w:r>
-              <w:rPr>
-                <w:noProof/>
-                <w:webHidden/>
-              </w:rPr>
-              <w:fldChar w:fldCharType="end"/>
-            </w:r>
-          </w:hyperlink>
-        </w:p>
-        <w:p>
-          <w:pPr>
-            <w:pStyle w:val="TOC1"/>
-            <w:tabs>
-              <w:tab w:val="right" w:leader="dot" w:pos="9016"/>
-            </w:tabs>
-            <w:rPr>
-              <w:rFonts w:eastAsiaTheme="minorEastAsia"/>
-              <w:noProof/>
-              <w:sz w:val="24"/>
-              <w:szCs w:val="24"/>
-              <w:lang w:eastAsia="en-GB"/>
-            </w:rPr>
-          </w:pPr>
-          <w:hyperlink w:anchor="_Toc223794408" w:history="1">
-            <w:r>
-              <w:rPr>
-                <w:rStyle w:val="Hyperlink"/>
-                <w:noProof/>
-              </w:rPr>
-              <w:t>Appendix</w:t>
-            </w:r>
-            <w:r>
-              <w:rPr>
-                <w:noProof/>
-                <w:webHidden/>
-              </w:rPr>
-              <w:tab/>
-            </w:r>
-            <w:r>
-              <w:rPr>
-                <w:noProof/>
-                <w:webHidden/>
-              </w:rPr>
-              <w:fldChar w:fldCharType="begin"/>
-            </w:r>
-            <w:r>
-              <w:rPr>
-                <w:noProof/>
-                <w:webHidden/>
-              </w:rPr>
-              <w:instrText xml:space="preserve"> PAGEREF _Toc223794408 \h </w:instrText>
-            </w:r>
-            <w:r>
-              <w:rPr>
-                <w:noProof/>
-                <w:webHidden/>
-              </w:rPr>
-            </w:r>
-            <w:r>
-              <w:rPr>
-                <w:noProof/>
-                <w:webHidden/>
-              </w:rPr>
-              <w:fldChar w:fldCharType="separate"/>
-            </w:r>
-            <w:r>
-              <w:rPr>
-                <w:noProof/>
-                <w:webHidden/>
-              </w:rPr>
-              <w:t>26</w:t>
-            </w:r>
-            <w:r>
-              <w:rPr>
-                <w:noProof/>
-                <w:webHidden/>
-              </w:rPr>
-              <w:fldChar w:fldCharType="end"/>
-            </w:r>
-          </w:hyperlink>
-        </w:p>
-        <w:p>
-          <w:pPr>
-            <w:pStyle w:val="TOC2"/>
-            <w:tabs>
-              <w:tab w:val="right" w:leader="dot" w:pos="9016"/>
-            </w:tabs>
-            <w:rPr>
-              <w:rFonts w:eastAsiaTheme="minorEastAsia"/>
-              <w:noProof/>
-              <w:sz w:val="24"/>
-              <w:szCs w:val="24"/>
-              <w:lang w:eastAsia="en-GB"/>
-            </w:rPr>
-          </w:pPr>
-          <w:hyperlink w:anchor="_Toc223794409" w:history="1">
-            <w:r>
-              <w:rPr>
-                <w:rStyle w:val="Hyperlink"/>
-                <w:noProof/>
-              </w:rPr>
-              <w:t>Asset Licenses and Sources</w:t>
-            </w:r>
-            <w:r>
-              <w:rPr>
-                <w:noProof/>
-                <w:webHidden/>
-              </w:rPr>
-              <w:tab/>
-            </w:r>
-            <w:r>
-              <w:rPr>
-                <w:noProof/>
-                <w:webHidden/>
-              </w:rPr>
-              <w:fldChar w:fldCharType="begin"/>
-            </w:r>
-            <w:r>
-              <w:rPr>
-                <w:noProof/>
-                <w:webHidden/>
-              </w:rPr>
-              <w:instrText xml:space="preserve"> PAGEREF _Toc223794409 \h </w:instrText>
+              <w:instrText xml:space="preserve"> PAGEREF _Toc223815725 \h </w:instrText>
             </w:r>
             <w:r>
               <w:rPr>
@@ -3692,13 +3836,13 @@
               <w:lang w:eastAsia="en-GB"/>
             </w:rPr>
           </w:pPr>
-          <w:hyperlink w:anchor="_Toc223794410" w:history="1">
+          <w:hyperlink w:anchor="_Toc223815726" w:history="1">
             <w:r>
               <w:rPr>
                 <w:rStyle w:val="Hyperlink"/>
                 <w:noProof/>
               </w:rPr>
-              <w:t>Modern Office Table</w:t>
+              <w:t>General Gaming Headset</w:t>
             </w:r>
             <w:r>
               <w:rPr>
@@ -3719,7 +3863,7 @@
                 <w:noProof/>
                 <w:webHidden/>
               </w:rPr>
-              <w:instrText xml:space="preserve"> PAGEREF _Toc223794410 \h </w:instrText>
+              <w:instrText xml:space="preserve"> PAGEREF _Toc223815726 \h </w:instrText>
             </w:r>
             <w:r>
               <w:rPr>
@@ -3739,7 +3883,7 @@
                 <w:noProof/>
                 <w:webHidden/>
               </w:rPr>
-              <w:t>26</w:t>
+              <w:t>27</w:t>
             </w:r>
             <w:r>
               <w:rPr>
@@ -3764,13 +3908,13 @@
               <w:lang w:eastAsia="en-GB"/>
             </w:rPr>
           </w:pPr>
-          <w:hyperlink w:anchor="_Toc223794411" w:history="1">
+          <w:hyperlink w:anchor="_Toc223815727" w:history="1">
             <w:r>
               <w:rPr>
                 <w:rStyle w:val="Hyperlink"/>
                 <w:noProof/>
               </w:rPr>
-              <w:t>Free Studio Starter Pack</w:t>
+              <w:t>General Gaming Chair</w:t>
             </w:r>
             <w:r>
               <w:rPr>
@@ -3791,7 +3935,7 @@
                 <w:noProof/>
                 <w:webHidden/>
               </w:rPr>
-              <w:instrText xml:space="preserve"> PAGEREF _Toc223794411 \h </w:instrText>
+              <w:instrText xml:space="preserve"> PAGEREF _Toc223815727 \h </w:instrText>
             </w:r>
             <w:r>
               <w:rPr>
@@ -3811,7 +3955,7 @@
                 <w:noProof/>
                 <w:webHidden/>
               </w:rPr>
-              <w:t>26</w:t>
+              <w:t>27</w:t>
             </w:r>
             <w:r>
               <w:rPr>
@@ -3836,13 +3980,13 @@
               <w:lang w:eastAsia="en-GB"/>
             </w:rPr>
           </w:pPr>
-          <w:hyperlink w:anchor="_Toc223794412" w:history="1">
+          <w:hyperlink w:anchor="_Toc223815728" w:history="1">
             <w:r>
               <w:rPr>
                 <w:rStyle w:val="Hyperlink"/>
                 <w:noProof/>
               </w:rPr>
-              <w:t>General Desktop Bundle</w:t>
+              <w:t>Light Switch</w:t>
             </w:r>
             <w:r>
               <w:rPr>
@@ -3863,7 +4007,7 @@
                 <w:noProof/>
                 <w:webHidden/>
               </w:rPr>
-              <w:instrText xml:space="preserve"> PAGEREF _Toc223794412 \h </w:instrText>
+              <w:instrText xml:space="preserve"> PAGEREF _Toc223815728 \h </w:instrText>
             </w:r>
             <w:r>
               <w:rPr>
@@ -3883,7 +4027,7 @@
                 <w:noProof/>
                 <w:webHidden/>
               </w:rPr>
-              <w:t>26</w:t>
+              <w:t>27</w:t>
             </w:r>
             <w:r>
               <w:rPr>
@@ -3908,13 +4052,13 @@
               <w:lang w:eastAsia="en-GB"/>
             </w:rPr>
           </w:pPr>
-          <w:hyperlink w:anchor="_Toc223794413" w:history="1">
+          <w:hyperlink w:anchor="_Toc223815729" w:history="1">
             <w:r>
               <w:rPr>
                 <w:rStyle w:val="Hyperlink"/>
                 <w:noProof/>
               </w:rPr>
-              <w:t>General Gaming Headset</w:t>
+              <w:t>Materials for General PC setup</w:t>
             </w:r>
             <w:r>
               <w:rPr>
@@ -3935,7 +4079,7 @@
                 <w:noProof/>
                 <w:webHidden/>
               </w:rPr>
-              <w:instrText xml:space="preserve"> PAGEREF _Toc223794413 \h </w:instrText>
+              <w:instrText xml:space="preserve"> PAGEREF _Toc223815729 \h </w:instrText>
             </w:r>
             <w:r>
               <w:rPr>
@@ -3955,7 +4099,7 @@
                 <w:noProof/>
                 <w:webHidden/>
               </w:rPr>
-              <w:t>27</w:t>
+              <w:t>28</w:t>
             </w:r>
             <w:r>
               <w:rPr>
@@ -3980,13 +4124,13 @@
               <w:lang w:eastAsia="en-GB"/>
             </w:rPr>
           </w:pPr>
-          <w:hyperlink w:anchor="_Toc223794414" w:history="1">
+          <w:hyperlink w:anchor="_Toc223815730" w:history="1">
             <w:r>
               <w:rPr>
                 <w:rStyle w:val="Hyperlink"/>
                 <w:noProof/>
               </w:rPr>
-              <w:t>General Gaming Chair</w:t>
+              <w:t>Monitor background image</w:t>
             </w:r>
             <w:r>
               <w:rPr>
@@ -4007,7 +4151,7 @@
                 <w:noProof/>
                 <w:webHidden/>
               </w:rPr>
-              <w:instrText xml:space="preserve"> PAGEREF _Toc223794414 \h </w:instrText>
+              <w:instrText xml:space="preserve"> PAGEREF _Toc223815730 \h </w:instrText>
             </w:r>
             <w:r>
               <w:rPr>
@@ -4027,7 +4171,7 @@
                 <w:noProof/>
                 <w:webHidden/>
               </w:rPr>
-              <w:t>27</w:t>
+              <w:t>29</w:t>
             </w:r>
             <w:r>
               <w:rPr>
@@ -4052,13 +4196,13 @@
               <w:lang w:eastAsia="en-GB"/>
             </w:rPr>
           </w:pPr>
-          <w:hyperlink w:anchor="_Toc223794415" w:history="1">
+          <w:hyperlink w:anchor="_Toc223815731" w:history="1">
             <w:r>
               <w:rPr>
                 <w:rStyle w:val="Hyperlink"/>
                 <w:noProof/>
               </w:rPr>
-              <w:t>Light Switch</w:t>
+              <w:t>Button Hover Sfx by Fachii</w:t>
             </w:r>
             <w:r>
               <w:rPr>
@@ -4079,7 +4223,7 @@
                 <w:noProof/>
                 <w:webHidden/>
               </w:rPr>
-              <w:instrText xml:space="preserve"> PAGEREF _Toc223794415 \h </w:instrText>
+              <w:instrText xml:space="preserve"> PAGEREF _Toc223815731 \h </w:instrText>
             </w:r>
             <w:r>
               <w:rPr>
@@ -4099,7 +4243,7 @@
                 <w:noProof/>
                 <w:webHidden/>
               </w:rPr>
-              <w:t>27</w:t>
+              <w:t>30</w:t>
             </w:r>
             <w:r>
               <w:rPr>
@@ -4124,13 +4268,13 @@
               <w:lang w:eastAsia="en-GB"/>
             </w:rPr>
           </w:pPr>
-          <w:hyperlink w:anchor="_Toc223794416" w:history="1">
+          <w:hyperlink w:anchor="_Toc223815732" w:history="1">
             <w:r>
               <w:rPr>
                 <w:rStyle w:val="Hyperlink"/>
                 <w:noProof/>
               </w:rPr>
-              <w:t>Materials for General PC setup</w:t>
+              <w:t>Button click Sfx by AndrewEathan</w:t>
             </w:r>
             <w:r>
               <w:rPr>
@@ -4151,7 +4295,7 @@
                 <w:noProof/>
                 <w:webHidden/>
               </w:rPr>
-              <w:instrText xml:space="preserve"> PAGEREF _Toc223794416 \h </w:instrText>
+              <w:instrText xml:space="preserve"> PAGEREF _Toc223815732 \h </w:instrText>
             </w:r>
             <w:r>
               <w:rPr>
@@ -4171,7 +4315,7 @@
                 <w:noProof/>
                 <w:webHidden/>
               </w:rPr>
-              <w:t>28</w:t>
+              <w:t>30</w:t>
             </w:r>
             <w:r>
               <w:rPr>
@@ -4196,13 +4340,13 @@
               <w:lang w:eastAsia="en-GB"/>
             </w:rPr>
           </w:pPr>
-          <w:hyperlink w:anchor="_Toc223794417" w:history="1">
+          <w:hyperlink w:anchor="_Toc223815733" w:history="1">
             <w:r>
               <w:rPr>
                 <w:rStyle w:val="Hyperlink"/>
                 <w:noProof/>
               </w:rPr>
-              <w:t>Monitor background image</w:t>
+              <w:t>Light Switch On Sfx</w:t>
             </w:r>
             <w:r>
               <w:rPr>
@@ -4223,7 +4367,7 @@
                 <w:noProof/>
                 <w:webHidden/>
               </w:rPr>
-              <w:instrText xml:space="preserve"> PAGEREF _Toc223794417 \h </w:instrText>
+              <w:instrText xml:space="preserve"> PAGEREF _Toc223815733 \h </w:instrText>
             </w:r>
             <w:r>
               <w:rPr>
@@ -4243,7 +4387,7 @@
                 <w:noProof/>
                 <w:webHidden/>
               </w:rPr>
-              <w:t>29</w:t>
+              <w:t>31</w:t>
             </w:r>
             <w:r>
               <w:rPr>
@@ -4268,13 +4412,13 @@
               <w:lang w:eastAsia="en-GB"/>
             </w:rPr>
           </w:pPr>
-          <w:hyperlink w:anchor="_Toc223794418" w:history="1">
+          <w:hyperlink w:anchor="_Toc223815734" w:history="1">
             <w:r>
               <w:rPr>
                 <w:rStyle w:val="Hyperlink"/>
                 <w:noProof/>
               </w:rPr>
-              <w:t>Button Hover Sfx by Fachii</w:t>
+              <w:t>Light Switch Off Sfx</w:t>
             </w:r>
             <w:r>
               <w:rPr>
@@ -4295,223 +4439,7 @@
                 <w:noProof/>
                 <w:webHidden/>
               </w:rPr>
-              <w:instrText xml:space="preserve"> PAGEREF _Toc223794418 \h </w:instrText>
-            </w:r>
-            <w:r>
-              <w:rPr>
-                <w:noProof/>
-                <w:webHidden/>
-              </w:rPr>
-            </w:r>
-            <w:r>
-              <w:rPr>
-                <w:noProof/>
-                <w:webHidden/>
-              </w:rPr>
-              <w:fldChar w:fldCharType="separate"/>
-            </w:r>
-            <w:r>
-              <w:rPr>
-                <w:noProof/>
-                <w:webHidden/>
-              </w:rPr>
-              <w:t>30</w:t>
-            </w:r>
-            <w:r>
-              <w:rPr>
-                <w:noProof/>
-                <w:webHidden/>
-              </w:rPr>
-              <w:fldChar w:fldCharType="end"/>
-            </w:r>
-          </w:hyperlink>
-        </w:p>
-        <w:p>
-          <w:pPr>
-            <w:pStyle w:val="TOC3"/>
-            <w:tabs>
-              <w:tab w:val="right" w:leader="dot" w:pos="9016"/>
-            </w:tabs>
-            <w:rPr>
-              <w:rFonts w:eastAsiaTheme="minorEastAsia"/>
-              <w:noProof/>
-              <w:sz w:val="24"/>
-              <w:szCs w:val="24"/>
-              <w:lang w:eastAsia="en-GB"/>
-            </w:rPr>
-          </w:pPr>
-          <w:hyperlink w:anchor="_Toc223794419" w:history="1">
-            <w:r>
-              <w:rPr>
-                <w:rStyle w:val="Hyperlink"/>
-                <w:noProof/>
-              </w:rPr>
-              <w:t>Button click Sfx by AndrewEathan</w:t>
-            </w:r>
-            <w:r>
-              <w:rPr>
-                <w:noProof/>
-                <w:webHidden/>
-              </w:rPr>
-              <w:tab/>
-            </w:r>
-            <w:r>
-              <w:rPr>
-                <w:noProof/>
-                <w:webHidden/>
-              </w:rPr>
-              <w:fldChar w:fldCharType="begin"/>
-            </w:r>
-            <w:r>
-              <w:rPr>
-                <w:noProof/>
-                <w:webHidden/>
-              </w:rPr>
-              <w:instrText xml:space="preserve"> PAGEREF _Toc223794419 \h </w:instrText>
-            </w:r>
-            <w:r>
-              <w:rPr>
-                <w:noProof/>
-                <w:webHidden/>
-              </w:rPr>
-            </w:r>
-            <w:r>
-              <w:rPr>
-                <w:noProof/>
-                <w:webHidden/>
-              </w:rPr>
-              <w:fldChar w:fldCharType="separate"/>
-            </w:r>
-            <w:r>
-              <w:rPr>
-                <w:noProof/>
-                <w:webHidden/>
-              </w:rPr>
-              <w:t>30</w:t>
-            </w:r>
-            <w:r>
-              <w:rPr>
-                <w:noProof/>
-                <w:webHidden/>
-              </w:rPr>
-              <w:fldChar w:fldCharType="end"/>
-            </w:r>
-          </w:hyperlink>
-        </w:p>
-        <w:p>
-          <w:pPr>
-            <w:pStyle w:val="TOC3"/>
-            <w:tabs>
-              <w:tab w:val="right" w:leader="dot" w:pos="9016"/>
-            </w:tabs>
-            <w:rPr>
-              <w:rFonts w:eastAsiaTheme="minorEastAsia"/>
-              <w:noProof/>
-              <w:sz w:val="24"/>
-              <w:szCs w:val="24"/>
-              <w:lang w:eastAsia="en-GB"/>
-            </w:rPr>
-          </w:pPr>
-          <w:hyperlink w:anchor="_Toc223794420" w:history="1">
-            <w:r>
-              <w:rPr>
-                <w:rStyle w:val="Hyperlink"/>
-                <w:noProof/>
-              </w:rPr>
-              <w:t>Light Switch On Sfx</w:t>
-            </w:r>
-            <w:r>
-              <w:rPr>
-                <w:noProof/>
-                <w:webHidden/>
-              </w:rPr>
-              <w:tab/>
-            </w:r>
-            <w:r>
-              <w:rPr>
-                <w:noProof/>
-                <w:webHidden/>
-              </w:rPr>
-              <w:fldChar w:fldCharType="begin"/>
-            </w:r>
-            <w:r>
-              <w:rPr>
-                <w:noProof/>
-                <w:webHidden/>
-              </w:rPr>
-              <w:instrText xml:space="preserve"> PAGEREF _Toc223794420 \h </w:instrText>
-            </w:r>
-            <w:r>
-              <w:rPr>
-                <w:noProof/>
-                <w:webHidden/>
-              </w:rPr>
-            </w:r>
-            <w:r>
-              <w:rPr>
-                <w:noProof/>
-                <w:webHidden/>
-              </w:rPr>
-              <w:fldChar w:fldCharType="separate"/>
-            </w:r>
-            <w:r>
-              <w:rPr>
-                <w:noProof/>
-                <w:webHidden/>
-              </w:rPr>
-              <w:t>31</w:t>
-            </w:r>
-            <w:r>
-              <w:rPr>
-                <w:noProof/>
-                <w:webHidden/>
-              </w:rPr>
-              <w:fldChar w:fldCharType="end"/>
-            </w:r>
-          </w:hyperlink>
-        </w:p>
-        <w:p>
-          <w:pPr>
-            <w:pStyle w:val="TOC3"/>
-            <w:tabs>
-              <w:tab w:val="right" w:leader="dot" w:pos="9016"/>
-            </w:tabs>
-            <w:rPr>
-              <w:rFonts w:eastAsiaTheme="minorEastAsia"/>
-              <w:noProof/>
-              <w:sz w:val="24"/>
-              <w:szCs w:val="24"/>
-              <w:lang w:eastAsia="en-GB"/>
-            </w:rPr>
-          </w:pPr>
-          <w:hyperlink w:anchor="_Toc223794421" w:history="1">
-            <w:r>
-              <w:rPr>
-                <w:rStyle w:val="Hyperlink"/>
-                <w:noProof/>
-              </w:rPr>
-              <w:t>Light Switch Off Sfx</w:t>
-            </w:r>
-            <w:r>
-              <w:rPr>
-                <w:noProof/>
-                <w:webHidden/>
-              </w:rPr>
-              <w:tab/>
-            </w:r>
-            <w:r>
-              <w:rPr>
-                <w:noProof/>
-                <w:webHidden/>
-              </w:rPr>
-              <w:fldChar w:fldCharType="begin"/>
-            </w:r>
-            <w:r>
-              <w:rPr>
-                <w:noProof/>
-                <w:webHidden/>
-              </w:rPr>
-              <w:instrText xml:space="preserve"> PAGEREF _Toc223794421 \h </w:instrText>
+              <w:instrText xml:space="preserve"> PAGEREF _Toc223815734 \h </w:instrText>
             </w:r>
             <w:r>
               <w:rPr>
@@ -4572,7 +4500,7 @@
       <w:pPr>
         <w:pStyle w:val="Heading1"/>
       </w:pPr>
-      <w:bookmarkStart w:id="0" w:name="_Toc223794362"/>
+      <w:bookmarkStart w:id="0" w:name="_Toc223815676"/>
       <w:r>
         <w:lastRenderedPageBreak/>
         <w:t>List of Acro</w:t>
@@ -4827,7 +4755,7 @@
       <w:pPr>
         <w:pStyle w:val="Heading1"/>
       </w:pPr>
-      <w:bookmarkStart w:id="1" w:name="_Toc223794363"/>
+      <w:bookmarkStart w:id="1" w:name="_Toc223815677"/>
       <w:r>
         <w:lastRenderedPageBreak/>
         <w:t>Abstract</w:t>
@@ -5027,7 +4955,7 @@
       <w:pPr>
         <w:pStyle w:val="Heading1"/>
       </w:pPr>
-      <w:bookmarkStart w:id="2" w:name="_Toc223794364"/>
+      <w:bookmarkStart w:id="2" w:name="_Toc223815678"/>
       <w:r>
         <w:lastRenderedPageBreak/>
         <w:t>Introduction</w:t>
@@ -5600,7 +5528,7 @@
       <w:pPr>
         <w:pStyle w:val="Heading1"/>
       </w:pPr>
-      <w:bookmarkStart w:id="3" w:name="_Toc223794365"/>
+      <w:bookmarkStart w:id="3" w:name="_Toc223815679"/>
       <w:r>
         <w:lastRenderedPageBreak/>
         <w:t>Project Aim</w:t>
@@ -5650,7 +5578,7 @@
           <w:rFonts w:asciiTheme="minorHAnsi" w:hAnsiTheme="minorHAnsi"/>
         </w:rPr>
       </w:pPr>
-      <w:bookmarkStart w:id="4" w:name="_Toc223794366"/>
+      <w:bookmarkStart w:id="4" w:name="_Toc223815680"/>
       <w:r>
         <w:rPr>
           <w:rFonts w:asciiTheme="minorHAnsi" w:hAnsiTheme="minorHAnsi"/>
@@ -5937,7 +5865,7 @@
       <w:pPr>
         <w:pStyle w:val="Heading1"/>
       </w:pPr>
-      <w:bookmarkStart w:id="5" w:name="_Toc223794367"/>
+      <w:bookmarkStart w:id="5" w:name="_Toc223815681"/>
       <w:r>
         <w:lastRenderedPageBreak/>
         <w:t>Project Planning</w:t>
@@ -6318,7 +6246,7 @@
           <w:rFonts w:asciiTheme="minorHAnsi" w:hAnsiTheme="minorHAnsi"/>
         </w:rPr>
       </w:pPr>
-      <w:bookmarkStart w:id="6" w:name="_Toc223794368"/>
+      <w:bookmarkStart w:id="6" w:name="_Toc223815682"/>
       <w:r>
         <w:rPr>
           <w:rFonts w:asciiTheme="minorHAnsi" w:hAnsiTheme="minorHAnsi"/>
@@ -6520,7 +6448,7 @@
           <w:rFonts w:asciiTheme="minorHAnsi" w:hAnsiTheme="minorHAnsi"/>
         </w:rPr>
       </w:pPr>
-      <w:bookmarkStart w:id="7" w:name="_Toc223794369"/>
+      <w:bookmarkStart w:id="7" w:name="_Toc223815683"/>
       <w:r>
         <w:rPr>
           <w:rFonts w:asciiTheme="minorHAnsi" w:hAnsiTheme="minorHAnsi"/>
@@ -6787,7 +6715,7 @@
           <w:rFonts w:asciiTheme="minorHAnsi" w:hAnsiTheme="minorHAnsi"/>
         </w:rPr>
       </w:pPr>
-      <w:bookmarkStart w:id="8" w:name="_Toc223794370"/>
+      <w:bookmarkStart w:id="8" w:name="_Toc223815684"/>
       <w:r>
         <w:rPr>
           <w:rFonts w:asciiTheme="minorHAnsi" w:hAnsiTheme="minorHAnsi"/>
@@ -6804,7 +6732,7 @@
           <w:rFonts w:asciiTheme="minorHAnsi" w:hAnsiTheme="minorHAnsi"/>
         </w:rPr>
       </w:pPr>
-      <w:bookmarkStart w:id="9" w:name="_Toc223794371"/>
+      <w:bookmarkStart w:id="9" w:name="_Toc223815685"/>
       <w:r>
         <w:rPr>
           <w:rFonts w:asciiTheme="minorHAnsi" w:hAnsiTheme="minorHAnsi"/>
@@ -6888,7 +6816,7 @@
           <w:rFonts w:asciiTheme="minorHAnsi" w:hAnsiTheme="minorHAnsi"/>
         </w:rPr>
       </w:pPr>
-      <w:bookmarkStart w:id="10" w:name="_Toc223794372"/>
+      <w:bookmarkStart w:id="10" w:name="_Toc223815686"/>
       <w:r>
         <w:rPr>
           <w:rFonts w:asciiTheme="minorHAnsi" w:hAnsiTheme="minorHAnsi"/>
@@ -6901,7 +6829,7 @@
       <w:pPr>
         <w:pStyle w:val="Heading3"/>
       </w:pPr>
-      <w:bookmarkStart w:id="11" w:name="_Toc223794373"/>
+      <w:bookmarkStart w:id="11" w:name="_Toc223815687"/>
       <w:r>
         <w:t>Ey</w:t>
       </w:r>
@@ -7198,7 +7126,7 @@
       <w:pPr>
         <w:pStyle w:val="Heading3"/>
       </w:pPr>
-      <w:bookmarkStart w:id="12" w:name="_Toc223794374"/>
+      <w:bookmarkStart w:id="12" w:name="_Toc223815688"/>
       <w:r>
         <w:t>OntoPhaco</w:t>
       </w:r>
@@ -7528,7 +7456,7 @@
       <w:pPr>
         <w:pStyle w:val="Heading3"/>
       </w:pPr>
-      <w:bookmarkStart w:id="13" w:name="_Toc223794375"/>
+      <w:bookmarkStart w:id="13" w:name="_Toc223815689"/>
       <w:r>
         <w:lastRenderedPageBreak/>
         <w:t>I</w:t>
@@ -7724,7 +7652,7 @@
       <w:pPr>
         <w:pStyle w:val="Heading3"/>
       </w:pPr>
-      <w:bookmarkStart w:id="14" w:name="_Toc223794376"/>
+      <w:bookmarkStart w:id="14" w:name="_Toc223815690"/>
       <w:r>
         <w:t>Opportunities for innovation</w:t>
       </w:r>
@@ -7842,7 +7770,7 @@
           <w:rFonts w:asciiTheme="minorHAnsi" w:hAnsiTheme="minorHAnsi"/>
         </w:rPr>
       </w:pPr>
-      <w:bookmarkStart w:id="15" w:name="_Toc223794377"/>
+      <w:bookmarkStart w:id="15" w:name="_Toc223815691"/>
       <w:r>
         <w:rPr>
           <w:rFonts w:asciiTheme="minorHAnsi" w:hAnsiTheme="minorHAnsi"/>
@@ -7855,7 +7783,7 @@
       <w:pPr>
         <w:pStyle w:val="Heading3"/>
       </w:pPr>
-      <w:bookmarkStart w:id="16" w:name="_Toc223794378"/>
+      <w:bookmarkStart w:id="16" w:name="_Toc223815692"/>
       <w:r>
         <w:t>VR in medical education</w:t>
       </w:r>
@@ -8122,7 +8050,7 @@
       <w:pPr>
         <w:pStyle w:val="Heading3"/>
       </w:pPr>
-      <w:bookmarkStart w:id="17" w:name="_Toc223794379"/>
+      <w:bookmarkStart w:id="17" w:name="_Toc223815693"/>
       <w:r>
         <w:lastRenderedPageBreak/>
         <w:t>VR in Health Awareness</w:t>
@@ -8315,7 +8243,7 @@
           <w:rFonts w:asciiTheme="minorHAnsi" w:hAnsiTheme="minorHAnsi"/>
         </w:rPr>
       </w:pPr>
-      <w:bookmarkStart w:id="18" w:name="_Toc223794380"/>
+      <w:bookmarkStart w:id="18" w:name="_Toc223815694"/>
       <w:r>
         <w:rPr>
           <w:rFonts w:asciiTheme="minorHAnsi" w:hAnsiTheme="minorHAnsi"/>
@@ -8535,7 +8463,7 @@
       <w:pPr>
         <w:pStyle w:val="Heading1"/>
       </w:pPr>
-      <w:bookmarkStart w:id="19" w:name="_Toc223794381"/>
+      <w:bookmarkStart w:id="19" w:name="_Toc223815695"/>
       <w:r>
         <w:lastRenderedPageBreak/>
         <w:t>Appendices</w:t>
@@ -8546,7 +8474,7 @@
       <w:pPr>
         <w:pStyle w:val="Heading2"/>
       </w:pPr>
-      <w:bookmarkStart w:id="20" w:name="_Toc223794382"/>
+      <w:bookmarkStart w:id="20" w:name="_Toc223815696"/>
       <w:r>
         <w:t>Ethics Checklist</w:t>
       </w:r>
@@ -8688,7 +8616,7 @@
       <w:pPr>
         <w:pStyle w:val="Heading2"/>
       </w:pPr>
-      <w:bookmarkStart w:id="21" w:name="_Toc223794383"/>
+      <w:bookmarkStart w:id="21" w:name="_Toc223815697"/>
       <w:r>
         <w:lastRenderedPageBreak/>
         <w:t>Project Timeline Gant</w:t>
@@ -8884,7 +8812,7 @@
       <w:pPr>
         <w:pStyle w:val="Heading1"/>
       </w:pPr>
-      <w:bookmarkStart w:id="22" w:name="_Toc223794384"/>
+      <w:bookmarkStart w:id="22" w:name="_Toc223815698"/>
       <w:r>
         <w:lastRenderedPageBreak/>
         <w:t>Methodology</w:t>
@@ -8895,7 +8823,7 @@
       <w:pPr>
         <w:pStyle w:val="Heading2"/>
       </w:pPr>
-      <w:bookmarkStart w:id="23" w:name="_Toc223794385"/>
+      <w:bookmarkStart w:id="23" w:name="_Toc223815699"/>
       <w:r>
         <w:t>Prototype Implementation</w:t>
       </w:r>
@@ -8905,7 +8833,7 @@
       <w:pPr>
         <w:pStyle w:val="Heading3"/>
       </w:pPr>
-      <w:bookmarkStart w:id="24" w:name="_Toc223794386"/>
+      <w:bookmarkStart w:id="24" w:name="_Toc223815700"/>
       <w:r>
         <w:t>Usability and Flow</w:t>
       </w:r>
@@ -8988,7 +8916,7 @@
       <w:pPr>
         <w:pStyle w:val="Heading3"/>
       </w:pPr>
-      <w:bookmarkStart w:id="25" w:name="_Toc223794387"/>
+      <w:bookmarkStart w:id="25" w:name="_Toc223815701"/>
       <w:r>
         <w:t xml:space="preserve">Environment Design and </w:t>
       </w:r>
@@ -9117,7 +9045,7 @@
       <w:pPr>
         <w:pStyle w:val="Heading3"/>
       </w:pPr>
-      <w:bookmarkStart w:id="26" w:name="_Toc223794388"/>
+      <w:bookmarkStart w:id="26" w:name="_Toc223815702"/>
       <w:r>
         <w:t>Objective System Implementation</w:t>
       </w:r>
@@ -9222,7 +9150,7 @@
       <w:pPr>
         <w:pStyle w:val="Heading3"/>
       </w:pPr>
-      <w:bookmarkStart w:id="27" w:name="_Toc223794389"/>
+      <w:bookmarkStart w:id="27" w:name="_Toc223815703"/>
       <w:r>
         <w:t>User</w:t>
       </w:r>
@@ -9319,7 +9247,7 @@
       <w:pPr>
         <w:pStyle w:val="Heading3"/>
       </w:pPr>
-      <w:bookmarkStart w:id="28" w:name="_Toc223794390"/>
+      <w:bookmarkStart w:id="28" w:name="_Toc223815704"/>
       <w:r>
         <w:t>Objective Based Interact</w:t>
       </w:r>
@@ -9387,7 +9315,7 @@
       <w:pPr>
         <w:pStyle w:val="Heading3"/>
       </w:pPr>
-      <w:bookmarkStart w:id="29" w:name="_Toc223794391"/>
+      <w:bookmarkStart w:id="29" w:name="_Toc223815705"/>
       <w:r>
         <w:t>Post Processing Effects</w:t>
       </w:r>
@@ -9414,7 +9342,7 @@
       <w:pPr>
         <w:pStyle w:val="Heading3"/>
       </w:pPr>
-      <w:bookmarkStart w:id="30" w:name="_Toc223794392"/>
+      <w:bookmarkStart w:id="30" w:name="_Toc223815706"/>
       <w:r>
         <w:t>User</w:t>
       </w:r>
@@ -9445,7 +9373,7 @@
       <w:pPr>
         <w:pStyle w:val="Heading2"/>
       </w:pPr>
-      <w:bookmarkStart w:id="31" w:name="_Toc223794393"/>
+      <w:bookmarkStart w:id="31" w:name="_Toc223815707"/>
       <w:r>
         <w:lastRenderedPageBreak/>
         <w:t>Final Version</w:t>
@@ -9473,7 +9401,7 @@
       <w:pPr>
         <w:pStyle w:val="Heading1"/>
       </w:pPr>
-      <w:bookmarkStart w:id="32" w:name="_Toc223794394"/>
+      <w:bookmarkStart w:id="32" w:name="_Toc223815708"/>
       <w:r>
         <w:lastRenderedPageBreak/>
         <w:t>Results</w:t>
@@ -9484,7 +9412,7 @@
       <w:pPr>
         <w:pStyle w:val="Heading2"/>
       </w:pPr>
-      <w:bookmarkStart w:id="33" w:name="_Toc223794395"/>
+      <w:bookmarkStart w:id="33" w:name="_Toc223815709"/>
       <w:r>
         <w:t>Prototype Tests</w:t>
       </w:r>
@@ -9561,7 +9489,13 @@
         <w:t xml:space="preserve">gauge </w:t>
       </w:r>
       <w:r>
-        <w:t>how effective the information being taught was being received by testers. The following sections break down the tests completed</w:t>
+        <w:t>how effectiv</w:t>
+      </w:r>
+      <w:r>
+        <w:t>ely</w:t>
+      </w:r>
+      <w:r>
+        <w:t xml:space="preserve"> the information being taught was received by testers. The following sections break down the tests completed</w:t>
       </w:r>
       <w:r>
         <w:t xml:space="preserve">, </w:t>
@@ -9574,7 +9508,7 @@
       <w:pPr>
         <w:pStyle w:val="Heading3"/>
       </w:pPr>
-      <w:bookmarkStart w:id="34" w:name="_Toc223794396"/>
+      <w:bookmarkStart w:id="34" w:name="_Toc223815710"/>
       <w:r>
         <w:t>Interaction</w:t>
       </w:r>
@@ -9735,11 +9669,359 @@
       <w:pPr>
         <w:pStyle w:val="Heading3"/>
       </w:pPr>
-      <w:bookmarkStart w:id="35" w:name="_Toc223794397"/>
+      <w:bookmarkStart w:id="35" w:name="_Toc223815711"/>
       <w:r>
         <w:t>User Attention Detection</w:t>
       </w:r>
       <w:bookmarkEnd w:id="35"/>
+    </w:p>
+    <w:p>
+      <w:r>
+        <w:t>Feedback received overall was mixed, users felt frustrated due to how unforgiving the gaze detection felt, especially given that there was no cursor for aiming like a typical video game</w:t>
+      </w:r>
+      <w:r>
+        <w:t>. Due to this</w:t>
+      </w:r>
+      <w:r>
+        <w:t>,</w:t>
+      </w:r>
+      <w:r>
+        <w:t xml:space="preserve"> </w:t>
+      </w:r>
+      <w:r>
+        <w:t>users felt they were just</w:t>
+      </w:r>
+      <w:r>
+        <w:t xml:space="preserve"> randomly triggering the progress bar and </w:t>
+      </w:r>
+      <w:r>
+        <w:t>remaining</w:t>
+      </w:r>
+      <w:r>
+        <w:t xml:space="preserve"> in the same position as it filled up with the worry of slight moving resetting the progress.</w:t>
+      </w:r>
+      <w:r>
+        <w:t xml:space="preserve"> The reason the gaze detection felt like this was due to it using a sing</w:t>
+      </w:r>
+      <w:r>
+        <w:t>le</w:t>
+      </w:r>
+      <w:r>
+        <w:t xml:space="preserve"> line trace which was very precise </w:t>
+      </w:r>
+      <w:r>
+        <w:t>when</w:t>
+      </w:r>
+      <w:r>
+        <w:t xml:space="preserve"> detecting hits, which instead </w:t>
+      </w:r>
+      <w:r>
+        <w:t>could use a</w:t>
+      </w:r>
+      <w:r>
+        <w:t xml:space="preserve"> channel trace to expand the area of detection to be more forgiving.</w:t>
+      </w:r>
+    </w:p>
+    <w:p>
+      <w:pPr>
+        <w:pStyle w:val="Heading3"/>
+      </w:pPr>
+      <w:bookmarkStart w:id="36" w:name="_Toc223815712"/>
+      <w:r>
+        <w:t>Symptom Simulations</w:t>
+      </w:r>
+      <w:bookmarkEnd w:id="36"/>
+    </w:p>
+    <w:p>
+      <w:r>
+        <w:t>Positive feedback was received by users regarding symptom simulations</w:t>
+      </w:r>
+      <w:r>
+        <w:t>.</w:t>
+      </w:r>
+      <w:r>
+        <w:t xml:space="preserve"> </w:t>
+      </w:r>
+      <w:r>
+        <w:t xml:space="preserve">Overall, </w:t>
+      </w:r>
+      <w:r>
+        <w:t xml:space="preserve">the feedback showed </w:t>
+      </w:r>
+      <w:r>
+        <w:t>the way the symptoms were portrayed help</w:t>
+      </w:r>
+      <w:r>
+        <w:t>ed</w:t>
+      </w:r>
+      <w:r>
+        <w:t xml:space="preserve"> to</w:t>
+      </w:r>
+      <w:r>
+        <w:t xml:space="preserve"> give an understanding of recognising them when they experience</w:t>
+      </w:r>
+      <w:r>
+        <w:t>d</w:t>
+      </w:r>
+      <w:r>
+        <w:t xml:space="preserve"> it themselves.</w:t>
+      </w:r>
+      <w:r>
+        <w:t xml:space="preserve"> Eye fatigue was displayed using a vignette post processing effect</w:t>
+      </w:r>
+      <w:r>
+        <w:t>,</w:t>
+      </w:r>
+      <w:r>
+        <w:t xml:space="preserve"> to show darkening around the peripherals of one’s view</w:t>
+      </w:r>
+      <w:r>
+        <w:t>.</w:t>
+      </w:r>
+      <w:r>
+        <w:t xml:space="preserve"> </w:t>
+      </w:r>
+      <w:r>
+        <w:t>L</w:t>
+      </w:r>
+      <w:r>
+        <w:t xml:space="preserve">ight sensitivity </w:t>
+      </w:r>
+      <w:r>
+        <w:t xml:space="preserve">was </w:t>
+      </w:r>
+      <w:r>
+        <w:t xml:space="preserve">incorporated </w:t>
+      </w:r>
+      <w:r>
+        <w:t xml:space="preserve">with </w:t>
+      </w:r>
+      <w:r>
+        <w:t>a bloom post processing effect</w:t>
+      </w:r>
+      <w:r>
+        <w:t>,</w:t>
+      </w:r>
+      <w:r>
+        <w:t xml:space="preserve"> to show lights becoming more intense to individuals as the level of sensitivity to them increased.</w:t>
+      </w:r>
+      <w:r>
+        <w:t xml:space="preserve"> Focus strain was simulated by a radial blur post processing material to show how </w:t>
+      </w:r>
+      <w:r>
+        <w:t xml:space="preserve">the </w:t>
+      </w:r>
+      <w:r>
+        <w:t xml:space="preserve">view becomes distorted and unclear as the eyes </w:t>
+      </w:r>
+      <w:r>
+        <w:lastRenderedPageBreak/>
+        <w:t>become more strained.</w:t>
+      </w:r>
+      <w:r>
+        <w:t xml:space="preserve"> However, due to the limited number </w:t>
+      </w:r>
+      <w:r>
+        <w:t>of testers and the range between them</w:t>
+      </w:r>
+      <w:r>
+        <w:t>,</w:t>
+      </w:r>
+      <w:r>
+        <w:t xml:space="preserve"> there was difficulty in gauging the appropriate level of portrayal</w:t>
+      </w:r>
+      <w:r>
+        <w:t>.</w:t>
+      </w:r>
+      <w:r>
+        <w:t xml:space="preserve"> </w:t>
+      </w:r>
+      <w:r>
+        <w:t>A</w:t>
+      </w:r>
+      <w:r>
+        <w:t>ccommodat</w:t>
+      </w:r>
+      <w:r>
+        <w:t>ing</w:t>
+      </w:r>
+      <w:r>
+        <w:t xml:space="preserve"> the </w:t>
+      </w:r>
+      <w:r>
+        <w:t xml:space="preserve">vast </w:t>
+      </w:r>
+      <w:r>
+        <w:t>range of target audiences</w:t>
+      </w:r>
+      <w:r>
+        <w:t xml:space="preserve"> would be difficult</w:t>
+      </w:r>
+      <w:r>
+        <w:t>,</w:t>
+      </w:r>
+      <w:r>
+        <w:t xml:space="preserve"> due to symptom intensity or experiences ranging between different individuals.</w:t>
+      </w:r>
+    </w:p>
+    <w:p>
+      <w:pPr>
+        <w:pStyle w:val="Heading3"/>
+      </w:pPr>
+      <w:bookmarkStart w:id="37" w:name="_Toc223815713"/>
+      <w:r>
+        <w:t xml:space="preserve">Improvements to be </w:t>
+      </w:r>
+      <w:r>
+        <w:t>M</w:t>
+      </w:r>
+      <w:r>
+        <w:t>ade</w:t>
+      </w:r>
+      <w:bookmarkEnd w:id="37"/>
+    </w:p>
+    <w:p>
+      <w:r>
+        <w:t>To refine the quality of the experience, improvements need to be made across the different aspects of the application. One such improvement includes removing the physics collisions for the hand components within the VR Pawn class. Doing this will allow interactions with the light switch to work as intended</w:t>
+      </w:r>
+      <w:r>
+        <w:t>,</w:t>
+      </w:r>
+      <w:r>
+        <w:t xml:space="preserve"> reducing the frustration of completing objectives three and four. </w:t>
+      </w:r>
+    </w:p>
+    <w:p>
+      <w:r>
+        <w:t>In addition to this, another improvement includes adding a delay to the change between objectives four and five to allow enough time for the reversal of the light sensitivity symptom. To strengthen this improvement</w:t>
+      </w:r>
+      <w:r>
+        <w:t>,</w:t>
+      </w:r>
+      <w:r>
+        <w:t xml:space="preserve"> the duration of the timeline reversal will be altered so that it does not take as long to execute the symptom reversal.</w:t>
+      </w:r>
+    </w:p>
+    <w:p>
+      <w:r>
+        <w:t>Furthermore, changing the single line trace used for user detection to a channel with a wider area of detection will help to ease frustration and difficulty of progression through the experience using the gaze interaction objects.</w:t>
+      </w:r>
+    </w:p>
+    <w:p>
+      <w:pPr>
+        <w:pStyle w:val="Heading2"/>
+      </w:pPr>
+      <w:bookmarkStart w:id="38" w:name="_Toc223815714"/>
+      <w:r>
+        <w:t>Final Version Tests</w:t>
+      </w:r>
+      <w:bookmarkEnd w:id="38"/>
+    </w:p>
+    <w:p>
+      <w:r>
+        <w:t xml:space="preserve">After the improvements carried out from the results of the prototype tests, a new set of tests </w:t>
+      </w:r>
+      <w:r>
+        <w:t>was</w:t>
+      </w:r>
+      <w:r>
+        <w:t xml:space="preserve"> carried out to ensure the improvements had made a positive impact on the experience instead of hindering it. The conducted tests were relatively the same </w:t>
+      </w:r>
+      <w:r>
+        <w:t>as</w:t>
+      </w:r>
+      <w:r>
+        <w:t xml:space="preserve"> the first set carried out for the prototype version, although slight changes were made to probe for any weaknesses within the improvements made. This choice was made to ensure that the final version did not have bugs, show clear polish and refinements while </w:t>
+      </w:r>
+      <w:r>
+        <w:t>maintaining the</w:t>
+      </w:r>
+      <w:r>
+        <w:t xml:space="preserve"> integrity</w:t>
+      </w:r>
+      <w:r>
+        <w:t xml:space="preserve"> of the application</w:t>
+      </w:r>
+      <w:r>
+        <w:t xml:space="preserve"> so that users could have the best possible experience.</w:t>
+      </w:r>
+    </w:p>
+    <w:p>
+      <w:pPr>
+        <w:pStyle w:val="Heading3"/>
+      </w:pPr>
+      <w:bookmarkStart w:id="39" w:name="_Toc223815715"/>
+      <w:r>
+        <w:t>Interaction Objects and Objective Understanding</w:t>
+      </w:r>
+      <w:bookmarkEnd w:id="39"/>
+    </w:p>
+    <w:p>
+      <w:pPr>
+        <w:pStyle w:val="Heading3"/>
+      </w:pPr>
+      <w:bookmarkStart w:id="40" w:name="_Toc223815716"/>
+      <w:r>
+        <w:t>User Attention Detection</w:t>
+      </w:r>
+      <w:bookmarkEnd w:id="40"/>
+    </w:p>
+    <w:p>
+      <w:pPr>
+        <w:pStyle w:val="Heading3"/>
+      </w:pPr>
+      <w:bookmarkStart w:id="41" w:name="_Toc223815717"/>
+      <w:r>
+        <w:t>Symptom Simulation</w:t>
+      </w:r>
+      <w:r>
+        <w:t>s</w:t>
+      </w:r>
+      <w:bookmarkEnd w:id="41"/>
+    </w:p>
+    <w:p/>
+    <w:p>
+      <w:r>
+        <w:br w:type="page"/>
+      </w:r>
+    </w:p>
+    <w:p>
+      <w:pPr>
+        <w:pStyle w:val="Heading1"/>
+      </w:pPr>
+      <w:bookmarkStart w:id="42" w:name="_Toc223815718"/>
+      <w:r>
+        <w:lastRenderedPageBreak/>
+        <w:t>Critical Evaluation</w:t>
+      </w:r>
+      <w:bookmarkEnd w:id="42"/>
+    </w:p>
+    <w:p>
+      <w:pPr>
+        <w:rPr>
+          <w:rFonts w:asciiTheme="majorHAnsi" w:eastAsiaTheme="majorEastAsia" w:hAnsiTheme="majorHAnsi" w:cstheme="majorBidi"/>
+          <w:color w:val="0F4761" w:themeColor="accent1" w:themeShade="BF"/>
+          <w:sz w:val="40"/>
+          <w:szCs w:val="40"/>
+        </w:rPr>
+      </w:pPr>
+      <w:r>
+        <w:t>High word count for this, needs to be an in-depth evaluation, discuss in third person and cover all areas that help progress the project and other areas that dampened it such as outside life events etc.</w:t>
+      </w:r>
+      <w:r>
+        <w:br w:type="page"/>
+      </w:r>
+    </w:p>
+    <w:p>
+      <w:pPr>
+        <w:pStyle w:val="Heading1"/>
+      </w:pPr>
+      <w:bookmarkStart w:id="43" w:name="_Toc223815719"/>
+      <w:r>
+        <w:lastRenderedPageBreak/>
+        <w:t>Conclusions and Future Work</w:t>
+      </w:r>
+      <w:bookmarkEnd w:id="43"/>
     </w:p>
     <w:p>
       <w:pPr>
@@ -9750,30 +10032,8 @@
         </w:numPr>
       </w:pPr>
       <w:r>
-        <w:t>Can be unforgiving as it</w:t>
-      </w:r>
-      <w:r>
-        <w:t xml:space="preserve"> uses</w:t>
-      </w:r>
-      <w:r>
-        <w:t xml:space="preserve"> a singular li</w:t>
-      </w:r>
-      <w:r>
-        <w:t>n</w:t>
-      </w:r>
-      <w:r>
-        <w:t>e and not a channel</w:t>
-      </w:r>
-    </w:p>
-    <w:p>
-      <w:pPr>
-        <w:pStyle w:val="Heading3"/>
-      </w:pPr>
-      <w:bookmarkStart w:id="36" w:name="_Toc223794398"/>
-      <w:r>
-        <w:t>Symptom Simulations</w:t>
-      </w:r>
-      <w:bookmarkEnd w:id="36"/>
+        <w:t>Adding a narrator into the background to guide users through the experience</w:t>
+      </w:r>
     </w:p>
     <w:p>
       <w:pPr>
@@ -9784,182 +10044,8 @@
         </w:numPr>
       </w:pPr>
       <w:r>
-        <w:t xml:space="preserve">Symptoms seem okay but are difficult to gauge with </w:t>
-      </w:r>
-      <w:r>
-        <w:t>most</w:t>
-      </w:r>
-      <w:r>
-        <w:t xml:space="preserve"> possible users as select few have tested the experience</w:t>
-      </w:r>
-    </w:p>
-    <w:p>
-      <w:pPr>
-        <w:pStyle w:val="Heading3"/>
-      </w:pPr>
-      <w:bookmarkStart w:id="37" w:name="_Toc223794399"/>
-      <w:r>
-        <w:t>Strengths and Weaknesses</w:t>
-      </w:r>
-      <w:bookmarkEnd w:id="37"/>
-    </w:p>
-    <w:p>
-      <w:pPr>
-        <w:pStyle w:val="Heading3"/>
-      </w:pPr>
-      <w:bookmarkStart w:id="38" w:name="_Toc223794400"/>
-      <w:r>
-        <w:t xml:space="preserve">Improvements to be </w:t>
-      </w:r>
-      <w:r>
-        <w:t>M</w:t>
-      </w:r>
-      <w:r>
-        <w:t>ade</w:t>
-      </w:r>
-      <w:bookmarkEnd w:id="38"/>
-    </w:p>
-    <w:p>
-      <w:r>
-        <w:t>To refine the quality of the experience, improvements need to be made across the different aspects of the application. One such improvement includes removing the physics collisions for the hand components within the VR Pawn class. Doing this will allow interactions with the light switch to work as intended</w:t>
-      </w:r>
-      <w:r>
-        <w:t>,</w:t>
-      </w:r>
-      <w:r>
-        <w:t xml:space="preserve"> reducing the frustration of completing objectives three and four. </w:t>
-      </w:r>
-    </w:p>
-    <w:p>
-      <w:r>
-        <w:t xml:space="preserve">In addition to this, another improvement includes adding a delay to the change between objectives four and five to allow enough time for the reversal of the light sensitivity symptom. To </w:t>
-      </w:r>
-      <w:r>
-        <w:lastRenderedPageBreak/>
-        <w:t>strengthen this improvement</w:t>
-      </w:r>
-      <w:r>
-        <w:t>,</w:t>
-      </w:r>
-      <w:r>
-        <w:t xml:space="preserve"> the duration of the timeline reversal will be altered so that it does not take as long to execute the symptom reversal.</w:t>
-      </w:r>
-    </w:p>
-    <w:p>
-      <w:pPr>
-        <w:pStyle w:val="Heading2"/>
-      </w:pPr>
-      <w:bookmarkStart w:id="39" w:name="_Toc223794401"/>
-      <w:r>
-        <w:t>Final Version Tests</w:t>
-      </w:r>
-      <w:bookmarkEnd w:id="39"/>
-    </w:p>
-    <w:p>
-      <w:r>
-        <w:t xml:space="preserve">After the improvements carried out from the results of the prototype tests, a new set of tests </w:t>
-      </w:r>
-      <w:r>
-        <w:t>was</w:t>
-      </w:r>
-      <w:r>
-        <w:t xml:space="preserve"> carried out to ensure the improvements had made a positive impact on the experience instead of hindering it. The conducted tests were relatively the same </w:t>
-      </w:r>
-      <w:r>
-        <w:t>as</w:t>
-      </w:r>
-      <w:r>
-        <w:t xml:space="preserve"> the first set carried out for the prototype version, although slight changes were made to probe for any weaknesses within the improvements made. This choice was made to ensure that the final version did not have bugs, show clear polish and refinements while </w:t>
-      </w:r>
-      <w:r>
-        <w:t>maintaining the</w:t>
-      </w:r>
-      <w:r>
-        <w:t xml:space="preserve"> integrity</w:t>
-      </w:r>
-      <w:r>
-        <w:t xml:space="preserve"> of the application</w:t>
-      </w:r>
-      <w:r>
-        <w:t xml:space="preserve"> so that users could have the best possible experience.</w:t>
-      </w:r>
-      <w:bookmarkStart w:id="40" w:name="_Toc223794402"/>
-    </w:p>
-    <w:p>
-      <w:pPr>
-        <w:pStyle w:val="Heading3"/>
-      </w:pPr>
-      <w:r>
-        <w:t>Interaction Objects and Objective Understanding</w:t>
-      </w:r>
-      <w:bookmarkStart w:id="41" w:name="_Toc223794403"/>
-      <w:bookmarkEnd w:id="40"/>
-    </w:p>
-    <w:p>
-      <w:pPr>
-        <w:pStyle w:val="Heading3"/>
-      </w:pPr>
-      <w:r>
-        <w:t>User Attention Detection</w:t>
-      </w:r>
-      <w:bookmarkStart w:id="42" w:name="_Toc223794404"/>
-      <w:bookmarkEnd w:id="41"/>
-    </w:p>
-    <w:p>
-      <w:pPr>
-        <w:pStyle w:val="Heading3"/>
-      </w:pPr>
-      <w:r>
-        <w:t>Symptom Simulation</w:t>
-      </w:r>
-      <w:r>
-        <w:t>s</w:t>
-      </w:r>
-      <w:bookmarkEnd w:id="42"/>
-    </w:p>
-    <w:p/>
-    <w:p>
-      <w:r>
-        <w:br w:type="page"/>
-      </w:r>
-    </w:p>
-    <w:p>
-      <w:pPr>
-        <w:pStyle w:val="Heading1"/>
-      </w:pPr>
-      <w:bookmarkStart w:id="43" w:name="_Toc223794405"/>
-      <w:r>
-        <w:lastRenderedPageBreak/>
-        <w:t>Critical Evaluation</w:t>
-      </w:r>
-      <w:bookmarkEnd w:id="43"/>
-    </w:p>
-    <w:p>
-      <w:pPr>
-        <w:rPr>
-          <w:rFonts w:asciiTheme="majorHAnsi" w:eastAsiaTheme="majorEastAsia" w:hAnsiTheme="majorHAnsi" w:cstheme="majorBidi"/>
-          <w:color w:val="0F4761" w:themeColor="accent1" w:themeShade="BF"/>
-          <w:sz w:val="40"/>
-          <w:szCs w:val="40"/>
-        </w:rPr>
-      </w:pPr>
-      <w:r>
-        <w:t>High word count for this, needs to be an in-depth evaluation, discuss in third person and cover all areas that help progress the project and other areas that dampened it such as outside life events etc.</w:t>
-      </w:r>
-      <w:r>
-        <w:br w:type="page"/>
-      </w:r>
-    </w:p>
-    <w:p>
-      <w:pPr>
-        <w:pStyle w:val="Heading1"/>
-      </w:pPr>
-      <w:bookmarkStart w:id="44" w:name="_Toc223794406"/>
-      <w:r>
-        <w:lastRenderedPageBreak/>
-        <w:t>Conclusions and Future Work</w:t>
-      </w:r>
-      <w:bookmarkEnd w:id="44"/>
+        <w:t>Introductory tutorial of one to two minutes to help non-technical users with understanding the controls</w:t>
+      </w:r>
     </w:p>
     <w:p>
       <w:pPr>
@@ -9970,30 +10056,6 @@
         </w:numPr>
       </w:pPr>
       <w:r>
-        <w:t>Adding a narrator into the background to guide users through the experience</w:t>
-      </w:r>
-    </w:p>
-    <w:p>
-      <w:pPr>
-        <w:pStyle w:val="ListParagraph"/>
-        <w:numPr>
-          <w:ilvl w:val="0"/>
-          <w:numId w:val="11"/>
-        </w:numPr>
-      </w:pPr>
-      <w:r>
-        <w:t>Introductory tutorial of one to two minutes to help non-technical users with understanding the controls</w:t>
-      </w:r>
-    </w:p>
-    <w:p>
-      <w:pPr>
-        <w:pStyle w:val="ListParagraph"/>
-        <w:numPr>
-          <w:ilvl w:val="0"/>
-          <w:numId w:val="11"/>
-        </w:numPr>
-      </w:pPr>
-      <w:r>
         <w:t xml:space="preserve">Exploring accessibility settings for those with visual impairments or eye diseases that are still able to use the experience so that some of the symptoms displayed are not as harsh to them </w:t>
       </w:r>
       <w:r>
@@ -10004,12 +10066,12 @@
       <w:pPr>
         <w:pStyle w:val="Heading1"/>
       </w:pPr>
-      <w:bookmarkStart w:id="45" w:name="_Toc223794407"/>
+      <w:bookmarkStart w:id="44" w:name="_Toc223815720"/>
       <w:r>
         <w:lastRenderedPageBreak/>
         <w:t>References</w:t>
       </w:r>
-      <w:bookmarkEnd w:id="45"/>
+      <w:bookmarkEnd w:id="44"/>
     </w:p>
     <w:p>
       <w:r>
@@ -10173,32 +10235,32 @@
       <w:pPr>
         <w:pStyle w:val="Heading1"/>
       </w:pPr>
-      <w:bookmarkStart w:id="46" w:name="_Toc223794408"/>
+      <w:bookmarkStart w:id="45" w:name="_Toc223815721"/>
       <w:r>
         <w:lastRenderedPageBreak/>
         <w:t>Appendix</w:t>
       </w:r>
+      <w:bookmarkEnd w:id="45"/>
+    </w:p>
+    <w:p>
+      <w:pPr>
+        <w:pStyle w:val="Heading2"/>
+      </w:pPr>
+      <w:bookmarkStart w:id="46" w:name="_Toc223815722"/>
+      <w:r>
+        <w:t>Asset Licenses and Sources</w:t>
+      </w:r>
       <w:bookmarkEnd w:id="46"/>
     </w:p>
     <w:p>
       <w:pPr>
-        <w:pStyle w:val="Heading2"/>
-      </w:pPr>
-      <w:bookmarkStart w:id="47" w:name="_Toc223794409"/>
-      <w:r>
-        <w:t>Asset Licenses and Sources</w:t>
+        <w:pStyle w:val="Heading3"/>
+      </w:pPr>
+      <w:bookmarkStart w:id="47" w:name="_Toc223815723"/>
+      <w:r>
+        <w:t>Modern Office Table</w:t>
       </w:r>
       <w:bookmarkEnd w:id="47"/>
-    </w:p>
-    <w:p>
-      <w:pPr>
-        <w:pStyle w:val="Heading3"/>
-      </w:pPr>
-      <w:bookmarkStart w:id="48" w:name="_Toc223794410"/>
-      <w:r>
-        <w:t>Modern Office Table</w:t>
-      </w:r>
-      <w:bookmarkEnd w:id="48"/>
     </w:p>
     <w:p>
       <w:r>
@@ -10278,11 +10340,11 @@
       <w:pPr>
         <w:pStyle w:val="Heading3"/>
       </w:pPr>
-      <w:bookmarkStart w:id="49" w:name="_Toc223794411"/>
+      <w:bookmarkStart w:id="48" w:name="_Toc223815724"/>
       <w:r>
         <w:t>Free Studio Starter Pack</w:t>
       </w:r>
-      <w:bookmarkEnd w:id="49"/>
+      <w:bookmarkEnd w:id="48"/>
     </w:p>
     <w:p>
       <w:r>
@@ -10362,11 +10424,11 @@
       <w:pPr>
         <w:pStyle w:val="Heading3"/>
       </w:pPr>
-      <w:bookmarkStart w:id="50" w:name="_Toc223794412"/>
+      <w:bookmarkStart w:id="49" w:name="_Toc223815725"/>
       <w:r>
         <w:t>General Desktop Bundle</w:t>
       </w:r>
-      <w:bookmarkEnd w:id="50"/>
+      <w:bookmarkEnd w:id="49"/>
     </w:p>
     <w:p>
       <w:r>
@@ -10446,12 +10508,12 @@
       <w:pPr>
         <w:pStyle w:val="Heading3"/>
       </w:pPr>
-      <w:bookmarkStart w:id="51" w:name="_Toc223794413"/>
+      <w:bookmarkStart w:id="50" w:name="_Toc223815726"/>
       <w:r>
         <w:lastRenderedPageBreak/>
         <w:t>General Gaming Headset</w:t>
       </w:r>
-      <w:bookmarkEnd w:id="51"/>
+      <w:bookmarkEnd w:id="50"/>
     </w:p>
     <w:p>
       <w:r>
@@ -10531,11 +10593,11 @@
       <w:pPr>
         <w:pStyle w:val="Heading3"/>
       </w:pPr>
-      <w:bookmarkStart w:id="52" w:name="_Toc223794414"/>
+      <w:bookmarkStart w:id="51" w:name="_Toc223815727"/>
       <w:r>
         <w:t>General Gaming Chair</w:t>
       </w:r>
-      <w:bookmarkEnd w:id="52"/>
+      <w:bookmarkEnd w:id="51"/>
     </w:p>
     <w:p>
       <w:r>
@@ -10615,11 +10677,11 @@
       <w:pPr>
         <w:pStyle w:val="Heading3"/>
       </w:pPr>
-      <w:bookmarkStart w:id="53" w:name="_Toc223794415"/>
+      <w:bookmarkStart w:id="52" w:name="_Toc223815728"/>
       <w:r>
         <w:t>Light Switch</w:t>
       </w:r>
-      <w:bookmarkEnd w:id="53"/>
+      <w:bookmarkEnd w:id="52"/>
     </w:p>
     <w:p>
       <w:r>
@@ -10713,12 +10775,12 @@
       <w:pPr>
         <w:pStyle w:val="Heading3"/>
       </w:pPr>
-      <w:bookmarkStart w:id="54" w:name="_Toc223794416"/>
+      <w:bookmarkStart w:id="53" w:name="_Toc223815729"/>
       <w:r>
         <w:lastRenderedPageBreak/>
         <w:t>Materials for General PC setup</w:t>
       </w:r>
-      <w:bookmarkEnd w:id="54"/>
+      <w:bookmarkEnd w:id="53"/>
     </w:p>
     <w:p>
       <w:r>
@@ -10840,12 +10902,12 @@
       <w:pPr>
         <w:pStyle w:val="Heading3"/>
       </w:pPr>
-      <w:bookmarkStart w:id="55" w:name="_Toc223794417"/>
+      <w:bookmarkStart w:id="54" w:name="_Toc223815730"/>
       <w:r>
         <w:lastRenderedPageBreak/>
         <w:t>Monitor background image</w:t>
       </w:r>
-      <w:bookmarkEnd w:id="55"/>
+      <w:bookmarkEnd w:id="54"/>
     </w:p>
     <w:p>
       <w:r>
@@ -10936,12 +10998,12 @@
       <w:pPr>
         <w:pStyle w:val="Heading3"/>
       </w:pPr>
-      <w:bookmarkStart w:id="56" w:name="_Toc223794418"/>
+      <w:bookmarkStart w:id="55" w:name="_Toc223815731"/>
       <w:r>
         <w:lastRenderedPageBreak/>
         <w:t>Button Hover Sfx by Fachii</w:t>
       </w:r>
-      <w:bookmarkEnd w:id="56"/>
+      <w:bookmarkEnd w:id="55"/>
     </w:p>
     <w:p>
       <w:r>
@@ -11036,14 +11098,14 @@
     </w:p>
     <w:p/>
     <w:p>
-      <w:bookmarkStart w:id="57" w:name="_Toc223794419"/>
+      <w:bookmarkStart w:id="56" w:name="_Toc223815732"/>
       <w:r>
         <w:rPr>
           <w:rStyle w:val="Heading3Char"/>
         </w:rPr>
         <w:t>Button click Sfx by AndrewEathan</w:t>
       </w:r>
-      <w:bookmarkEnd w:id="57"/>
+      <w:bookmarkEnd w:id="56"/>
       <w:r>
         <w:t xml:space="preserve"> </w:t>
       </w:r>
@@ -11149,12 +11211,12 @@
       <w:pPr>
         <w:pStyle w:val="Heading3"/>
       </w:pPr>
-      <w:bookmarkStart w:id="58" w:name="_Toc223794420"/>
+      <w:bookmarkStart w:id="57" w:name="_Toc223815733"/>
       <w:r>
         <w:lastRenderedPageBreak/>
         <w:t>Light Switch On Sfx</w:t>
       </w:r>
-      <w:bookmarkEnd w:id="58"/>
+      <w:bookmarkEnd w:id="57"/>
     </w:p>
     <w:p>
       <w:r>
@@ -11244,11 +11306,11 @@
       <w:pPr>
         <w:pStyle w:val="Heading3"/>
       </w:pPr>
-      <w:bookmarkStart w:id="59" w:name="_Toc223794421"/>
+      <w:bookmarkStart w:id="58" w:name="_Toc223815734"/>
       <w:r>
         <w:t>Light Switch Off Sfx</w:t>
       </w:r>
-      <w:bookmarkEnd w:id="59"/>
+      <w:bookmarkEnd w:id="58"/>
     </w:p>
     <w:p>
       <w:r>

</xml_diff>

<commit_message>
Changed title within asset sources and licenses section
</commit_message>
<xml_diff>
--- a/30077548Thesis.docx
+++ b/30077548Thesis.docx
@@ -236,7 +236,7 @@
           <w:r>
             <w:fldChar w:fldCharType="separate"/>
           </w:r>
-          <w:hyperlink w:anchor="_Toc223815676" w:history="1">
+          <w:hyperlink w:anchor="_Toc223885290" w:history="1">
             <w:r>
               <w:rPr>
                 <w:rStyle w:val="Hyperlink"/>
@@ -263,7 +263,7 @@
                 <w:noProof/>
                 <w:webHidden/>
               </w:rPr>
-              <w:instrText xml:space="preserve"> PAGEREF _Toc223815676 \h </w:instrText>
+              <w:instrText xml:space="preserve"> PAGEREF _Toc223885290 \h </w:instrText>
             </w:r>
             <w:r>
               <w:rPr>
@@ -308,7 +308,7 @@
               <w:lang w:eastAsia="en-GB"/>
             </w:rPr>
           </w:pPr>
-          <w:hyperlink w:anchor="_Toc223815677" w:history="1">
+          <w:hyperlink w:anchor="_Toc223885291" w:history="1">
             <w:r>
               <w:rPr>
                 <w:rStyle w:val="Hyperlink"/>
@@ -335,7 +335,7 @@
                 <w:noProof/>
                 <w:webHidden/>
               </w:rPr>
-              <w:instrText xml:space="preserve"> PAGEREF _Toc223815677 \h </w:instrText>
+              <w:instrText xml:space="preserve"> PAGEREF _Toc223885291 \h </w:instrText>
             </w:r>
             <w:r>
               <w:rPr>
@@ -380,7 +380,7 @@
               <w:lang w:eastAsia="en-GB"/>
             </w:rPr>
           </w:pPr>
-          <w:hyperlink w:anchor="_Toc223815678" w:history="1">
+          <w:hyperlink w:anchor="_Toc223885292" w:history="1">
             <w:r>
               <w:rPr>
                 <w:rStyle w:val="Hyperlink"/>
@@ -407,7 +407,7 @@
                 <w:noProof/>
                 <w:webHidden/>
               </w:rPr>
-              <w:instrText xml:space="preserve"> PAGEREF _Toc223815678 \h </w:instrText>
+              <w:instrText xml:space="preserve"> PAGEREF _Toc223885292 \h </w:instrText>
             </w:r>
             <w:r>
               <w:rPr>
@@ -452,7 +452,7 @@
               <w:lang w:eastAsia="en-GB"/>
             </w:rPr>
           </w:pPr>
-          <w:hyperlink w:anchor="_Toc223815679" w:history="1">
+          <w:hyperlink w:anchor="_Toc223885293" w:history="1">
             <w:r>
               <w:rPr>
                 <w:rStyle w:val="Hyperlink"/>
@@ -479,7 +479,7 @@
                 <w:noProof/>
                 <w:webHidden/>
               </w:rPr>
-              <w:instrText xml:space="preserve"> PAGEREF _Toc223815679 \h </w:instrText>
+              <w:instrText xml:space="preserve"> PAGEREF _Toc223885293 \h </w:instrText>
             </w:r>
             <w:r>
               <w:rPr>
@@ -524,7 +524,7 @@
               <w:lang w:eastAsia="en-GB"/>
             </w:rPr>
           </w:pPr>
-          <w:hyperlink w:anchor="_Toc223815680" w:history="1">
+          <w:hyperlink w:anchor="_Toc223885294" w:history="1">
             <w:r>
               <w:rPr>
                 <w:rStyle w:val="Hyperlink"/>
@@ -551,7 +551,7 @@
                 <w:noProof/>
                 <w:webHidden/>
               </w:rPr>
-              <w:instrText xml:space="preserve"> PAGEREF _Toc223815680 \h </w:instrText>
+              <w:instrText xml:space="preserve"> PAGEREF _Toc223885294 \h </w:instrText>
             </w:r>
             <w:r>
               <w:rPr>
@@ -596,7 +596,7 @@
               <w:lang w:eastAsia="en-GB"/>
             </w:rPr>
           </w:pPr>
-          <w:hyperlink w:anchor="_Toc223815681" w:history="1">
+          <w:hyperlink w:anchor="_Toc223885295" w:history="1">
             <w:r>
               <w:rPr>
                 <w:rStyle w:val="Hyperlink"/>
@@ -623,7 +623,7 @@
                 <w:noProof/>
                 <w:webHidden/>
               </w:rPr>
-              <w:instrText xml:space="preserve"> PAGEREF _Toc223815681 \h </w:instrText>
+              <w:instrText xml:space="preserve"> PAGEREF _Toc223885295 \h </w:instrText>
             </w:r>
             <w:r>
               <w:rPr>
@@ -668,7 +668,7 @@
               <w:lang w:eastAsia="en-GB"/>
             </w:rPr>
           </w:pPr>
-          <w:hyperlink w:anchor="_Toc223815682" w:history="1">
+          <w:hyperlink w:anchor="_Toc223885296" w:history="1">
             <w:r>
               <w:rPr>
                 <w:rStyle w:val="Hyperlink"/>
@@ -695,7 +695,7 @@
                 <w:noProof/>
                 <w:webHidden/>
               </w:rPr>
-              <w:instrText xml:space="preserve"> PAGEREF _Toc223815682 \h </w:instrText>
+              <w:instrText xml:space="preserve"> PAGEREF _Toc223885296 \h </w:instrText>
             </w:r>
             <w:r>
               <w:rPr>
@@ -740,7 +740,7 @@
               <w:lang w:eastAsia="en-GB"/>
             </w:rPr>
           </w:pPr>
-          <w:hyperlink w:anchor="_Toc223815683" w:history="1">
+          <w:hyperlink w:anchor="_Toc223885297" w:history="1">
             <w:r>
               <w:rPr>
                 <w:rStyle w:val="Hyperlink"/>
@@ -767,7 +767,7 @@
                 <w:noProof/>
                 <w:webHidden/>
               </w:rPr>
-              <w:instrText xml:space="preserve"> PAGEREF _Toc223815683 \h </w:instrText>
+              <w:instrText xml:space="preserve"> PAGEREF _Toc223885297 \h </w:instrText>
             </w:r>
             <w:r>
               <w:rPr>
@@ -812,7 +812,7 @@
               <w:lang w:eastAsia="en-GB"/>
             </w:rPr>
           </w:pPr>
-          <w:hyperlink w:anchor="_Toc223815684" w:history="1">
+          <w:hyperlink w:anchor="_Toc223885298" w:history="1">
             <w:r>
               <w:rPr>
                 <w:rStyle w:val="Hyperlink"/>
@@ -839,7 +839,7 @@
                 <w:noProof/>
                 <w:webHidden/>
               </w:rPr>
-              <w:instrText xml:space="preserve"> PAGEREF _Toc223815684 \h </w:instrText>
+              <w:instrText xml:space="preserve"> PAGEREF _Toc223885298 \h </w:instrText>
             </w:r>
             <w:r>
               <w:rPr>
@@ -884,7 +884,7 @@
               <w:lang w:eastAsia="en-GB"/>
             </w:rPr>
           </w:pPr>
-          <w:hyperlink w:anchor="_Toc223815685" w:history="1">
+          <w:hyperlink w:anchor="_Toc223885299" w:history="1">
             <w:r>
               <w:rPr>
                 <w:rStyle w:val="Hyperlink"/>
@@ -911,7 +911,7 @@
                 <w:noProof/>
                 <w:webHidden/>
               </w:rPr>
-              <w:instrText xml:space="preserve"> PAGEREF _Toc223815685 \h </w:instrText>
+              <w:instrText xml:space="preserve"> PAGEREF _Toc223885299 \h </w:instrText>
             </w:r>
             <w:r>
               <w:rPr>
@@ -956,7 +956,7 @@
               <w:lang w:eastAsia="en-GB"/>
             </w:rPr>
           </w:pPr>
-          <w:hyperlink w:anchor="_Toc223815686" w:history="1">
+          <w:hyperlink w:anchor="_Toc223885300" w:history="1">
             <w:r>
               <w:rPr>
                 <w:rStyle w:val="Hyperlink"/>
@@ -983,7 +983,7 @@
                 <w:noProof/>
                 <w:webHidden/>
               </w:rPr>
-              <w:instrText xml:space="preserve"> PAGEREF _Toc223815686 \h </w:instrText>
+              <w:instrText xml:space="preserve"> PAGEREF _Toc223885300 \h </w:instrText>
             </w:r>
             <w:r>
               <w:rPr>
@@ -1028,7 +1028,7 @@
               <w:lang w:eastAsia="en-GB"/>
             </w:rPr>
           </w:pPr>
-          <w:hyperlink w:anchor="_Toc223815687" w:history="1">
+          <w:hyperlink w:anchor="_Toc223885301" w:history="1">
             <w:r>
               <w:rPr>
                 <w:rStyle w:val="Hyperlink"/>
@@ -1055,7 +1055,7 @@
                 <w:noProof/>
                 <w:webHidden/>
               </w:rPr>
-              <w:instrText xml:space="preserve"> PAGEREF _Toc223815687 \h </w:instrText>
+              <w:instrText xml:space="preserve"> PAGEREF _Toc223885301 \h </w:instrText>
             </w:r>
             <w:r>
               <w:rPr>
@@ -1100,7 +1100,7 @@
               <w:lang w:eastAsia="en-GB"/>
             </w:rPr>
           </w:pPr>
-          <w:hyperlink w:anchor="_Toc223815688" w:history="1">
+          <w:hyperlink w:anchor="_Toc223885302" w:history="1">
             <w:r>
               <w:rPr>
                 <w:rStyle w:val="Hyperlink"/>
@@ -1127,7 +1127,7 @@
                 <w:noProof/>
                 <w:webHidden/>
               </w:rPr>
-              <w:instrText xml:space="preserve"> PAGEREF _Toc223815688 \h </w:instrText>
+              <w:instrText xml:space="preserve"> PAGEREF _Toc223885302 \h </w:instrText>
             </w:r>
             <w:r>
               <w:rPr>
@@ -1172,7 +1172,7 @@
               <w:lang w:eastAsia="en-GB"/>
             </w:rPr>
           </w:pPr>
-          <w:hyperlink w:anchor="_Toc223815689" w:history="1">
+          <w:hyperlink w:anchor="_Toc223885303" w:history="1">
             <w:r>
               <w:rPr>
                 <w:rStyle w:val="Hyperlink"/>
@@ -1199,7 +1199,7 @@
                 <w:noProof/>
                 <w:webHidden/>
               </w:rPr>
-              <w:instrText xml:space="preserve"> PAGEREF _Toc223815689 \h </w:instrText>
+              <w:instrText xml:space="preserve"> PAGEREF _Toc223885303 \h </w:instrText>
             </w:r>
             <w:r>
               <w:rPr>
@@ -1244,7 +1244,7 @@
               <w:lang w:eastAsia="en-GB"/>
             </w:rPr>
           </w:pPr>
-          <w:hyperlink w:anchor="_Toc223815690" w:history="1">
+          <w:hyperlink w:anchor="_Toc223885304" w:history="1">
             <w:r>
               <w:rPr>
                 <w:rStyle w:val="Hyperlink"/>
@@ -1271,7 +1271,7 @@
                 <w:noProof/>
                 <w:webHidden/>
               </w:rPr>
-              <w:instrText xml:space="preserve"> PAGEREF _Toc223815690 \h </w:instrText>
+              <w:instrText xml:space="preserve"> PAGEREF _Toc223885304 \h </w:instrText>
             </w:r>
             <w:r>
               <w:rPr>
@@ -1316,7 +1316,7 @@
               <w:lang w:eastAsia="en-GB"/>
             </w:rPr>
           </w:pPr>
-          <w:hyperlink w:anchor="_Toc223815691" w:history="1">
+          <w:hyperlink w:anchor="_Toc223885305" w:history="1">
             <w:r>
               <w:rPr>
                 <w:rStyle w:val="Hyperlink"/>
@@ -1343,7 +1343,7 @@
                 <w:noProof/>
                 <w:webHidden/>
               </w:rPr>
-              <w:instrText xml:space="preserve"> PAGEREF _Toc223815691 \h </w:instrText>
+              <w:instrText xml:space="preserve"> PAGEREF _Toc223885305 \h </w:instrText>
             </w:r>
             <w:r>
               <w:rPr>
@@ -1388,7 +1388,7 @@
               <w:lang w:eastAsia="en-GB"/>
             </w:rPr>
           </w:pPr>
-          <w:hyperlink w:anchor="_Toc223815692" w:history="1">
+          <w:hyperlink w:anchor="_Toc223885306" w:history="1">
             <w:r>
               <w:rPr>
                 <w:rStyle w:val="Hyperlink"/>
@@ -1415,7 +1415,7 @@
                 <w:noProof/>
                 <w:webHidden/>
               </w:rPr>
-              <w:instrText xml:space="preserve"> PAGEREF _Toc223815692 \h </w:instrText>
+              <w:instrText xml:space="preserve"> PAGEREF _Toc223885306 \h </w:instrText>
             </w:r>
             <w:r>
               <w:rPr>
@@ -1460,7 +1460,7 @@
               <w:lang w:eastAsia="en-GB"/>
             </w:rPr>
           </w:pPr>
-          <w:hyperlink w:anchor="_Toc223815693" w:history="1">
+          <w:hyperlink w:anchor="_Toc223885307" w:history="1">
             <w:r>
               <w:rPr>
                 <w:rStyle w:val="Hyperlink"/>
@@ -1487,7 +1487,7 @@
                 <w:noProof/>
                 <w:webHidden/>
               </w:rPr>
-              <w:instrText xml:space="preserve"> PAGEREF _Toc223815693 \h </w:instrText>
+              <w:instrText xml:space="preserve"> PAGEREF _Toc223885307 \h </w:instrText>
             </w:r>
             <w:r>
               <w:rPr>
@@ -1532,7 +1532,7 @@
               <w:lang w:eastAsia="en-GB"/>
             </w:rPr>
           </w:pPr>
-          <w:hyperlink w:anchor="_Toc223815694" w:history="1">
+          <w:hyperlink w:anchor="_Toc223885308" w:history="1">
             <w:r>
               <w:rPr>
                 <w:rStyle w:val="Hyperlink"/>
@@ -1559,7 +1559,7 @@
                 <w:noProof/>
                 <w:webHidden/>
               </w:rPr>
-              <w:instrText xml:space="preserve"> PAGEREF _Toc223815694 \h </w:instrText>
+              <w:instrText xml:space="preserve"> PAGEREF _Toc223885308 \h </w:instrText>
             </w:r>
             <w:r>
               <w:rPr>
@@ -1604,7 +1604,7 @@
               <w:lang w:eastAsia="en-GB"/>
             </w:rPr>
           </w:pPr>
-          <w:hyperlink w:anchor="_Toc223815695" w:history="1">
+          <w:hyperlink w:anchor="_Toc223885309" w:history="1">
             <w:r>
               <w:rPr>
                 <w:rStyle w:val="Hyperlink"/>
@@ -1631,7 +1631,7 @@
                 <w:noProof/>
                 <w:webHidden/>
               </w:rPr>
-              <w:instrText xml:space="preserve"> PAGEREF _Toc223815695 \h </w:instrText>
+              <w:instrText xml:space="preserve"> PAGEREF _Toc223885309 \h </w:instrText>
             </w:r>
             <w:r>
               <w:rPr>
@@ -1676,7 +1676,7 @@
               <w:lang w:eastAsia="en-GB"/>
             </w:rPr>
           </w:pPr>
-          <w:hyperlink w:anchor="_Toc223815696" w:history="1">
+          <w:hyperlink w:anchor="_Toc223885310" w:history="1">
             <w:r>
               <w:rPr>
                 <w:rStyle w:val="Hyperlink"/>
@@ -1703,7 +1703,7 @@
                 <w:noProof/>
                 <w:webHidden/>
               </w:rPr>
-              <w:instrText xml:space="preserve"> PAGEREF _Toc223815696 \h </w:instrText>
+              <w:instrText xml:space="preserve"> PAGEREF _Toc223885310 \h </w:instrText>
             </w:r>
             <w:r>
               <w:rPr>
@@ -1748,7 +1748,7 @@
               <w:lang w:eastAsia="en-GB"/>
             </w:rPr>
           </w:pPr>
-          <w:hyperlink w:anchor="_Toc223815697" w:history="1">
+          <w:hyperlink w:anchor="_Toc223885311" w:history="1">
             <w:r>
               <w:rPr>
                 <w:rStyle w:val="Hyperlink"/>
@@ -1775,7 +1775,7 @@
                 <w:noProof/>
                 <w:webHidden/>
               </w:rPr>
-              <w:instrText xml:space="preserve"> PAGEREF _Toc223815697 \h </w:instrText>
+              <w:instrText xml:space="preserve"> PAGEREF _Toc223885311 \h </w:instrText>
             </w:r>
             <w:r>
               <w:rPr>
@@ -1820,7 +1820,7 @@
               <w:lang w:eastAsia="en-GB"/>
             </w:rPr>
           </w:pPr>
-          <w:hyperlink w:anchor="_Toc223815698" w:history="1">
+          <w:hyperlink w:anchor="_Toc223885312" w:history="1">
             <w:r>
               <w:rPr>
                 <w:rStyle w:val="Hyperlink"/>
@@ -1847,7 +1847,7 @@
                 <w:noProof/>
                 <w:webHidden/>
               </w:rPr>
-              <w:instrText xml:space="preserve"> PAGEREF _Toc223815698 \h </w:instrText>
+              <w:instrText xml:space="preserve"> PAGEREF _Toc223885312 \h </w:instrText>
             </w:r>
             <w:r>
               <w:rPr>
@@ -1892,7 +1892,7 @@
               <w:lang w:eastAsia="en-GB"/>
             </w:rPr>
           </w:pPr>
-          <w:hyperlink w:anchor="_Toc223815699" w:history="1">
+          <w:hyperlink w:anchor="_Toc223885313" w:history="1">
             <w:r>
               <w:rPr>
                 <w:rStyle w:val="Hyperlink"/>
@@ -1919,7 +1919,7 @@
                 <w:noProof/>
                 <w:webHidden/>
               </w:rPr>
-              <w:instrText xml:space="preserve"> PAGEREF _Toc223815699 \h </w:instrText>
+              <w:instrText xml:space="preserve"> PAGEREF _Toc223885313 \h </w:instrText>
             </w:r>
             <w:r>
               <w:rPr>
@@ -1964,7 +1964,7 @@
               <w:lang w:eastAsia="en-GB"/>
             </w:rPr>
           </w:pPr>
-          <w:hyperlink w:anchor="_Toc223815700" w:history="1">
+          <w:hyperlink w:anchor="_Toc223885314" w:history="1">
             <w:r>
               <w:rPr>
                 <w:rStyle w:val="Hyperlink"/>
@@ -1991,7 +1991,7 @@
                 <w:noProof/>
                 <w:webHidden/>
               </w:rPr>
-              <w:instrText xml:space="preserve"> PAGEREF _Toc223815700 \h </w:instrText>
+              <w:instrText xml:space="preserve"> PAGEREF _Toc223885314 \h </w:instrText>
             </w:r>
             <w:r>
               <w:rPr>
@@ -2036,7 +2036,7 @@
               <w:lang w:eastAsia="en-GB"/>
             </w:rPr>
           </w:pPr>
-          <w:hyperlink w:anchor="_Toc223815701" w:history="1">
+          <w:hyperlink w:anchor="_Toc223885315" w:history="1">
             <w:r>
               <w:rPr>
                 <w:rStyle w:val="Hyperlink"/>
@@ -2063,7 +2063,7 @@
                 <w:noProof/>
                 <w:webHidden/>
               </w:rPr>
-              <w:instrText xml:space="preserve"> PAGEREF _Toc223815701 \h </w:instrText>
+              <w:instrText xml:space="preserve"> PAGEREF _Toc223885315 \h </w:instrText>
             </w:r>
             <w:r>
               <w:rPr>
@@ -2108,7 +2108,7 @@
               <w:lang w:eastAsia="en-GB"/>
             </w:rPr>
           </w:pPr>
-          <w:hyperlink w:anchor="_Toc223815702" w:history="1">
+          <w:hyperlink w:anchor="_Toc223885316" w:history="1">
             <w:r>
               <w:rPr>
                 <w:rStyle w:val="Hyperlink"/>
@@ -2135,7 +2135,7 @@
                 <w:noProof/>
                 <w:webHidden/>
               </w:rPr>
-              <w:instrText xml:space="preserve"> PAGEREF _Toc223815702 \h </w:instrText>
+              <w:instrText xml:space="preserve"> PAGEREF _Toc223885316 \h </w:instrText>
             </w:r>
             <w:r>
               <w:rPr>
@@ -2180,7 +2180,7 @@
               <w:lang w:eastAsia="en-GB"/>
             </w:rPr>
           </w:pPr>
-          <w:hyperlink w:anchor="_Toc223815703" w:history="1">
+          <w:hyperlink w:anchor="_Toc223885317" w:history="1">
             <w:r>
               <w:rPr>
                 <w:rStyle w:val="Hyperlink"/>
@@ -2207,7 +2207,7 @@
                 <w:noProof/>
                 <w:webHidden/>
               </w:rPr>
-              <w:instrText xml:space="preserve"> PAGEREF _Toc223815703 \h </w:instrText>
+              <w:instrText xml:space="preserve"> PAGEREF _Toc223885317 \h </w:instrText>
             </w:r>
             <w:r>
               <w:rPr>
@@ -2252,7 +2252,7 @@
               <w:lang w:eastAsia="en-GB"/>
             </w:rPr>
           </w:pPr>
-          <w:hyperlink w:anchor="_Toc223815704" w:history="1">
+          <w:hyperlink w:anchor="_Toc223885318" w:history="1">
             <w:r>
               <w:rPr>
                 <w:rStyle w:val="Hyperlink"/>
@@ -2279,7 +2279,7 @@
                 <w:noProof/>
                 <w:webHidden/>
               </w:rPr>
-              <w:instrText xml:space="preserve"> PAGEREF _Toc223815704 \h </w:instrText>
+              <w:instrText xml:space="preserve"> PAGEREF _Toc223885318 \h </w:instrText>
             </w:r>
             <w:r>
               <w:rPr>
@@ -2324,7 +2324,7 @@
               <w:lang w:eastAsia="en-GB"/>
             </w:rPr>
           </w:pPr>
-          <w:hyperlink w:anchor="_Toc223815705" w:history="1">
+          <w:hyperlink w:anchor="_Toc223885319" w:history="1">
             <w:r>
               <w:rPr>
                 <w:rStyle w:val="Hyperlink"/>
@@ -2351,7 +2351,7 @@
                 <w:noProof/>
                 <w:webHidden/>
               </w:rPr>
-              <w:instrText xml:space="preserve"> PAGEREF _Toc223815705 \h </w:instrText>
+              <w:instrText xml:space="preserve"> PAGEREF _Toc223885319 \h </w:instrText>
             </w:r>
             <w:r>
               <w:rPr>
@@ -2396,7 +2396,7 @@
               <w:lang w:eastAsia="en-GB"/>
             </w:rPr>
           </w:pPr>
-          <w:hyperlink w:anchor="_Toc223815706" w:history="1">
+          <w:hyperlink w:anchor="_Toc223885320" w:history="1">
             <w:r>
               <w:rPr>
                 <w:rStyle w:val="Hyperlink"/>
@@ -2423,7 +2423,7 @@
                 <w:noProof/>
                 <w:webHidden/>
               </w:rPr>
-              <w:instrText xml:space="preserve"> PAGEREF _Toc223815706 \h </w:instrText>
+              <w:instrText xml:space="preserve"> PAGEREF _Toc223885320 \h </w:instrText>
             </w:r>
             <w:r>
               <w:rPr>
@@ -2468,7 +2468,7 @@
               <w:lang w:eastAsia="en-GB"/>
             </w:rPr>
           </w:pPr>
-          <w:hyperlink w:anchor="_Toc223815707" w:history="1">
+          <w:hyperlink w:anchor="_Toc223885321" w:history="1">
             <w:r>
               <w:rPr>
                 <w:rStyle w:val="Hyperlink"/>
@@ -2495,7 +2495,7 @@
                 <w:noProof/>
                 <w:webHidden/>
               </w:rPr>
-              <w:instrText xml:space="preserve"> PAGEREF _Toc223815707 \h </w:instrText>
+              <w:instrText xml:space="preserve"> PAGEREF _Toc223885321 \h </w:instrText>
             </w:r>
             <w:r>
               <w:rPr>
@@ -2540,7 +2540,7 @@
               <w:lang w:eastAsia="en-GB"/>
             </w:rPr>
           </w:pPr>
-          <w:hyperlink w:anchor="_Toc223815708" w:history="1">
+          <w:hyperlink w:anchor="_Toc223885322" w:history="1">
             <w:r>
               <w:rPr>
                 <w:rStyle w:val="Hyperlink"/>
@@ -2567,7 +2567,7 @@
                 <w:noProof/>
                 <w:webHidden/>
               </w:rPr>
-              <w:instrText xml:space="preserve"> PAGEREF _Toc223815708 \h </w:instrText>
+              <w:instrText xml:space="preserve"> PAGEREF _Toc223885322 \h </w:instrText>
             </w:r>
             <w:r>
               <w:rPr>
@@ -2612,7 +2612,7 @@
               <w:lang w:eastAsia="en-GB"/>
             </w:rPr>
           </w:pPr>
-          <w:hyperlink w:anchor="_Toc223815709" w:history="1">
+          <w:hyperlink w:anchor="_Toc223885323" w:history="1">
             <w:r>
               <w:rPr>
                 <w:rStyle w:val="Hyperlink"/>
@@ -2639,7 +2639,7 @@
                 <w:noProof/>
                 <w:webHidden/>
               </w:rPr>
-              <w:instrText xml:space="preserve"> PAGEREF _Toc223815709 \h </w:instrText>
+              <w:instrText xml:space="preserve"> PAGEREF _Toc223885323 \h </w:instrText>
             </w:r>
             <w:r>
               <w:rPr>
@@ -2684,7 +2684,7 @@
               <w:lang w:eastAsia="en-GB"/>
             </w:rPr>
           </w:pPr>
-          <w:hyperlink w:anchor="_Toc223815710" w:history="1">
+          <w:hyperlink w:anchor="_Toc223885324" w:history="1">
             <w:r>
               <w:rPr>
                 <w:rStyle w:val="Hyperlink"/>
@@ -2711,7 +2711,7 @@
                 <w:noProof/>
                 <w:webHidden/>
               </w:rPr>
-              <w:instrText xml:space="preserve"> PAGEREF _Toc223815710 \h </w:instrText>
+              <w:instrText xml:space="preserve"> PAGEREF _Toc223885324 \h </w:instrText>
             </w:r>
             <w:r>
               <w:rPr>
@@ -2756,7 +2756,7 @@
               <w:lang w:eastAsia="en-GB"/>
             </w:rPr>
           </w:pPr>
-          <w:hyperlink w:anchor="_Toc223815711" w:history="1">
+          <w:hyperlink w:anchor="_Toc223885325" w:history="1">
             <w:r>
               <w:rPr>
                 <w:rStyle w:val="Hyperlink"/>
@@ -2783,7 +2783,7 @@
                 <w:noProof/>
                 <w:webHidden/>
               </w:rPr>
-              <w:instrText xml:space="preserve"> PAGEREF _Toc223815711 \h </w:instrText>
+              <w:instrText xml:space="preserve"> PAGEREF _Toc223885325 \h </w:instrText>
             </w:r>
             <w:r>
               <w:rPr>
@@ -2828,7 +2828,7 @@
               <w:lang w:eastAsia="en-GB"/>
             </w:rPr>
           </w:pPr>
-          <w:hyperlink w:anchor="_Toc223815712" w:history="1">
+          <w:hyperlink w:anchor="_Toc223885326" w:history="1">
             <w:r>
               <w:rPr>
                 <w:rStyle w:val="Hyperlink"/>
@@ -2855,7 +2855,7 @@
                 <w:noProof/>
                 <w:webHidden/>
               </w:rPr>
-              <w:instrText xml:space="preserve"> PAGEREF _Toc223815712 \h </w:instrText>
+              <w:instrText xml:space="preserve"> PAGEREF _Toc223885326 \h </w:instrText>
             </w:r>
             <w:r>
               <w:rPr>
@@ -2900,7 +2900,7 @@
               <w:lang w:eastAsia="en-GB"/>
             </w:rPr>
           </w:pPr>
-          <w:hyperlink w:anchor="_Toc223815713" w:history="1">
+          <w:hyperlink w:anchor="_Toc223885327" w:history="1">
             <w:r>
               <w:rPr>
                 <w:rStyle w:val="Hyperlink"/>
@@ -2927,7 +2927,7 @@
                 <w:noProof/>
                 <w:webHidden/>
               </w:rPr>
-              <w:instrText xml:space="preserve"> PAGEREF _Toc223815713 \h </w:instrText>
+              <w:instrText xml:space="preserve"> PAGEREF _Toc223885327 \h </w:instrText>
             </w:r>
             <w:r>
               <w:rPr>
@@ -2972,7 +2972,7 @@
               <w:lang w:eastAsia="en-GB"/>
             </w:rPr>
           </w:pPr>
-          <w:hyperlink w:anchor="_Toc223815714" w:history="1">
+          <w:hyperlink w:anchor="_Toc223885328" w:history="1">
             <w:r>
               <w:rPr>
                 <w:rStyle w:val="Hyperlink"/>
@@ -2999,7 +2999,7 @@
                 <w:noProof/>
                 <w:webHidden/>
               </w:rPr>
-              <w:instrText xml:space="preserve"> PAGEREF _Toc223815714 \h </w:instrText>
+              <w:instrText xml:space="preserve"> PAGEREF _Toc223885328 \h </w:instrText>
             </w:r>
             <w:r>
               <w:rPr>
@@ -3044,7 +3044,7 @@
               <w:lang w:eastAsia="en-GB"/>
             </w:rPr>
           </w:pPr>
-          <w:hyperlink w:anchor="_Toc223815715" w:history="1">
+          <w:hyperlink w:anchor="_Toc223885329" w:history="1">
             <w:r>
               <w:rPr>
                 <w:rStyle w:val="Hyperlink"/>
@@ -3071,7 +3071,7 @@
                 <w:noProof/>
                 <w:webHidden/>
               </w:rPr>
-              <w:instrText xml:space="preserve"> PAGEREF _Toc223815715 \h </w:instrText>
+              <w:instrText xml:space="preserve"> PAGEREF _Toc223885329 \h </w:instrText>
             </w:r>
             <w:r>
               <w:rPr>
@@ -3116,7 +3116,7 @@
               <w:lang w:eastAsia="en-GB"/>
             </w:rPr>
           </w:pPr>
-          <w:hyperlink w:anchor="_Toc223815716" w:history="1">
+          <w:hyperlink w:anchor="_Toc223885330" w:history="1">
             <w:r>
               <w:rPr>
                 <w:rStyle w:val="Hyperlink"/>
@@ -3143,7 +3143,7 @@
                 <w:noProof/>
                 <w:webHidden/>
               </w:rPr>
-              <w:instrText xml:space="preserve"> PAGEREF _Toc223815716 \h </w:instrText>
+              <w:instrText xml:space="preserve"> PAGEREF _Toc223885330 \h </w:instrText>
             </w:r>
             <w:r>
               <w:rPr>
@@ -3188,7 +3188,7 @@
               <w:lang w:eastAsia="en-GB"/>
             </w:rPr>
           </w:pPr>
-          <w:hyperlink w:anchor="_Toc223815717" w:history="1">
+          <w:hyperlink w:anchor="_Toc223885331" w:history="1">
             <w:r>
               <w:rPr>
                 <w:rStyle w:val="Hyperlink"/>
@@ -3215,7 +3215,7 @@
                 <w:noProof/>
                 <w:webHidden/>
               </w:rPr>
-              <w:instrText xml:space="preserve"> PAGEREF _Toc223815717 \h </w:instrText>
+              <w:instrText xml:space="preserve"> PAGEREF _Toc223885331 \h </w:instrText>
             </w:r>
             <w:r>
               <w:rPr>
@@ -3260,7 +3260,7 @@
               <w:lang w:eastAsia="en-GB"/>
             </w:rPr>
           </w:pPr>
-          <w:hyperlink w:anchor="_Toc223815718" w:history="1">
+          <w:hyperlink w:anchor="_Toc223885332" w:history="1">
             <w:r>
               <w:rPr>
                 <w:rStyle w:val="Hyperlink"/>
@@ -3287,7 +3287,7 @@
                 <w:noProof/>
                 <w:webHidden/>
               </w:rPr>
-              <w:instrText xml:space="preserve"> PAGEREF _Toc223815718 \h </w:instrText>
+              <w:instrText xml:space="preserve"> PAGEREF _Toc223885332 \h </w:instrText>
             </w:r>
             <w:r>
               <w:rPr>
@@ -3332,7 +3332,7 @@
               <w:lang w:eastAsia="en-GB"/>
             </w:rPr>
           </w:pPr>
-          <w:hyperlink w:anchor="_Toc223815719" w:history="1">
+          <w:hyperlink w:anchor="_Toc223885333" w:history="1">
             <w:r>
               <w:rPr>
                 <w:rStyle w:val="Hyperlink"/>
@@ -3359,7 +3359,7 @@
                 <w:noProof/>
                 <w:webHidden/>
               </w:rPr>
-              <w:instrText xml:space="preserve"> PAGEREF _Toc223815719 \h </w:instrText>
+              <w:instrText xml:space="preserve"> PAGEREF _Toc223885333 \h </w:instrText>
             </w:r>
             <w:r>
               <w:rPr>
@@ -3404,7 +3404,7 @@
               <w:lang w:eastAsia="en-GB"/>
             </w:rPr>
           </w:pPr>
-          <w:hyperlink w:anchor="_Toc223815720" w:history="1">
+          <w:hyperlink w:anchor="_Toc223885334" w:history="1">
             <w:r>
               <w:rPr>
                 <w:rStyle w:val="Hyperlink"/>
@@ -3431,7 +3431,7 @@
                 <w:noProof/>
                 <w:webHidden/>
               </w:rPr>
-              <w:instrText xml:space="preserve"> PAGEREF _Toc223815720 \h </w:instrText>
+              <w:instrText xml:space="preserve"> PAGEREF _Toc223885334 \h </w:instrText>
             </w:r>
             <w:r>
               <w:rPr>
@@ -3476,7 +3476,7 @@
               <w:lang w:eastAsia="en-GB"/>
             </w:rPr>
           </w:pPr>
-          <w:hyperlink w:anchor="_Toc223815721" w:history="1">
+          <w:hyperlink w:anchor="_Toc223885335" w:history="1">
             <w:r>
               <w:rPr>
                 <w:rStyle w:val="Hyperlink"/>
@@ -3503,7 +3503,7 @@
                 <w:noProof/>
                 <w:webHidden/>
               </w:rPr>
-              <w:instrText xml:space="preserve"> PAGEREF _Toc223815721 \h </w:instrText>
+              <w:instrText xml:space="preserve"> PAGEREF _Toc223885335 \h </w:instrText>
             </w:r>
             <w:r>
               <w:rPr>
@@ -3548,7 +3548,7 @@
               <w:lang w:eastAsia="en-GB"/>
             </w:rPr>
           </w:pPr>
-          <w:hyperlink w:anchor="_Toc223815722" w:history="1">
+          <w:hyperlink w:anchor="_Toc223885336" w:history="1">
             <w:r>
               <w:rPr>
                 <w:rStyle w:val="Hyperlink"/>
@@ -3575,7 +3575,7 @@
                 <w:noProof/>
                 <w:webHidden/>
               </w:rPr>
-              <w:instrText xml:space="preserve"> PAGEREF _Toc223815722 \h </w:instrText>
+              <w:instrText xml:space="preserve"> PAGEREF _Toc223885336 \h </w:instrText>
             </w:r>
             <w:r>
               <w:rPr>
@@ -3620,7 +3620,7 @@
               <w:lang w:eastAsia="en-GB"/>
             </w:rPr>
           </w:pPr>
-          <w:hyperlink w:anchor="_Toc223815723" w:history="1">
+          <w:hyperlink w:anchor="_Toc223885337" w:history="1">
             <w:r>
               <w:rPr>
                 <w:rStyle w:val="Hyperlink"/>
@@ -3647,7 +3647,7 @@
                 <w:noProof/>
                 <w:webHidden/>
               </w:rPr>
-              <w:instrText xml:space="preserve"> PAGEREF _Toc223815723 \h </w:instrText>
+              <w:instrText xml:space="preserve"> PAGEREF _Toc223885337 \h </w:instrText>
             </w:r>
             <w:r>
               <w:rPr>
@@ -3692,7 +3692,7 @@
               <w:lang w:eastAsia="en-GB"/>
             </w:rPr>
           </w:pPr>
-          <w:hyperlink w:anchor="_Toc223815724" w:history="1">
+          <w:hyperlink w:anchor="_Toc223885338" w:history="1">
             <w:r>
               <w:rPr>
                 <w:rStyle w:val="Hyperlink"/>
@@ -3719,7 +3719,7 @@
                 <w:noProof/>
                 <w:webHidden/>
               </w:rPr>
-              <w:instrText xml:space="preserve"> PAGEREF _Toc223815724 \h </w:instrText>
+              <w:instrText xml:space="preserve"> PAGEREF _Toc223885338 \h </w:instrText>
             </w:r>
             <w:r>
               <w:rPr>
@@ -3764,7 +3764,7 @@
               <w:lang w:eastAsia="en-GB"/>
             </w:rPr>
           </w:pPr>
-          <w:hyperlink w:anchor="_Toc223815725" w:history="1">
+          <w:hyperlink w:anchor="_Toc223885339" w:history="1">
             <w:r>
               <w:rPr>
                 <w:rStyle w:val="Hyperlink"/>
@@ -3791,7 +3791,7 @@
                 <w:noProof/>
                 <w:webHidden/>
               </w:rPr>
-              <w:instrText xml:space="preserve"> PAGEREF _Toc223815725 \h </w:instrText>
+              <w:instrText xml:space="preserve"> PAGEREF _Toc223885339 \h </w:instrText>
             </w:r>
             <w:r>
               <w:rPr>
@@ -3836,7 +3836,7 @@
               <w:lang w:eastAsia="en-GB"/>
             </w:rPr>
           </w:pPr>
-          <w:hyperlink w:anchor="_Toc223815726" w:history="1">
+          <w:hyperlink w:anchor="_Toc223885340" w:history="1">
             <w:r>
               <w:rPr>
                 <w:rStyle w:val="Hyperlink"/>
@@ -3863,7 +3863,7 @@
                 <w:noProof/>
                 <w:webHidden/>
               </w:rPr>
-              <w:instrText xml:space="preserve"> PAGEREF _Toc223815726 \h </w:instrText>
+              <w:instrText xml:space="preserve"> PAGEREF _Toc223885340 \h </w:instrText>
             </w:r>
             <w:r>
               <w:rPr>
@@ -3908,7 +3908,7 @@
               <w:lang w:eastAsia="en-GB"/>
             </w:rPr>
           </w:pPr>
-          <w:hyperlink w:anchor="_Toc223815727" w:history="1">
+          <w:hyperlink w:anchor="_Toc223885341" w:history="1">
             <w:r>
               <w:rPr>
                 <w:rStyle w:val="Hyperlink"/>
@@ -3935,7 +3935,7 @@
                 <w:noProof/>
                 <w:webHidden/>
               </w:rPr>
-              <w:instrText xml:space="preserve"> PAGEREF _Toc223815727 \h </w:instrText>
+              <w:instrText xml:space="preserve"> PAGEREF _Toc223885341 \h </w:instrText>
             </w:r>
             <w:r>
               <w:rPr>
@@ -3980,7 +3980,7 @@
               <w:lang w:eastAsia="en-GB"/>
             </w:rPr>
           </w:pPr>
-          <w:hyperlink w:anchor="_Toc223815728" w:history="1">
+          <w:hyperlink w:anchor="_Toc223885342" w:history="1">
             <w:r>
               <w:rPr>
                 <w:rStyle w:val="Hyperlink"/>
@@ -4007,7 +4007,7 @@
                 <w:noProof/>
                 <w:webHidden/>
               </w:rPr>
-              <w:instrText xml:space="preserve"> PAGEREF _Toc223815728 \h </w:instrText>
+              <w:instrText xml:space="preserve"> PAGEREF _Toc223885342 \h </w:instrText>
             </w:r>
             <w:r>
               <w:rPr>
@@ -4052,13 +4052,13 @@
               <w:lang w:eastAsia="en-GB"/>
             </w:rPr>
           </w:pPr>
-          <w:hyperlink w:anchor="_Toc223815729" w:history="1">
+          <w:hyperlink w:anchor="_Toc223885343" w:history="1">
             <w:r>
               <w:rPr>
                 <w:rStyle w:val="Hyperlink"/>
                 <w:noProof/>
               </w:rPr>
-              <w:t>Materials for General PC setup</w:t>
+              <w:t>Materials for General PC setup and Scenes</w:t>
             </w:r>
             <w:r>
               <w:rPr>
@@ -4079,7 +4079,7 @@
                 <w:noProof/>
                 <w:webHidden/>
               </w:rPr>
-              <w:instrText xml:space="preserve"> PAGEREF _Toc223815729 \h </w:instrText>
+              <w:instrText xml:space="preserve"> PAGEREF _Toc223885343 \h </w:instrText>
             </w:r>
             <w:r>
               <w:rPr>
@@ -4124,7 +4124,7 @@
               <w:lang w:eastAsia="en-GB"/>
             </w:rPr>
           </w:pPr>
-          <w:hyperlink w:anchor="_Toc223815730" w:history="1">
+          <w:hyperlink w:anchor="_Toc223885344" w:history="1">
             <w:r>
               <w:rPr>
                 <w:rStyle w:val="Hyperlink"/>
@@ -4151,7 +4151,7 @@
                 <w:noProof/>
                 <w:webHidden/>
               </w:rPr>
-              <w:instrText xml:space="preserve"> PAGEREF _Toc223815730 \h </w:instrText>
+              <w:instrText xml:space="preserve"> PAGEREF _Toc223885344 \h </w:instrText>
             </w:r>
             <w:r>
               <w:rPr>
@@ -4196,7 +4196,7 @@
               <w:lang w:eastAsia="en-GB"/>
             </w:rPr>
           </w:pPr>
-          <w:hyperlink w:anchor="_Toc223815731" w:history="1">
+          <w:hyperlink w:anchor="_Toc223885345" w:history="1">
             <w:r>
               <w:rPr>
                 <w:rStyle w:val="Hyperlink"/>
@@ -4223,7 +4223,7 @@
                 <w:noProof/>
                 <w:webHidden/>
               </w:rPr>
-              <w:instrText xml:space="preserve"> PAGEREF _Toc223815731 \h </w:instrText>
+              <w:instrText xml:space="preserve"> PAGEREF _Toc223885345 \h </w:instrText>
             </w:r>
             <w:r>
               <w:rPr>
@@ -4268,7 +4268,7 @@
               <w:lang w:eastAsia="en-GB"/>
             </w:rPr>
           </w:pPr>
-          <w:hyperlink w:anchor="_Toc223815732" w:history="1">
+          <w:hyperlink w:anchor="_Toc223885346" w:history="1">
             <w:r>
               <w:rPr>
                 <w:rStyle w:val="Hyperlink"/>
@@ -4295,7 +4295,7 @@
                 <w:noProof/>
                 <w:webHidden/>
               </w:rPr>
-              <w:instrText xml:space="preserve"> PAGEREF _Toc223815732 \h </w:instrText>
+              <w:instrText xml:space="preserve"> PAGEREF _Toc223885346 \h </w:instrText>
             </w:r>
             <w:r>
               <w:rPr>
@@ -4340,7 +4340,7 @@
               <w:lang w:eastAsia="en-GB"/>
             </w:rPr>
           </w:pPr>
-          <w:hyperlink w:anchor="_Toc223815733" w:history="1">
+          <w:hyperlink w:anchor="_Toc223885347" w:history="1">
             <w:r>
               <w:rPr>
                 <w:rStyle w:val="Hyperlink"/>
@@ -4367,7 +4367,7 @@
                 <w:noProof/>
                 <w:webHidden/>
               </w:rPr>
-              <w:instrText xml:space="preserve"> PAGEREF _Toc223815733 \h </w:instrText>
+              <w:instrText xml:space="preserve"> PAGEREF _Toc223885347 \h </w:instrText>
             </w:r>
             <w:r>
               <w:rPr>
@@ -4412,7 +4412,7 @@
               <w:lang w:eastAsia="en-GB"/>
             </w:rPr>
           </w:pPr>
-          <w:hyperlink w:anchor="_Toc223815734" w:history="1">
+          <w:hyperlink w:anchor="_Toc223885348" w:history="1">
             <w:r>
               <w:rPr>
                 <w:rStyle w:val="Hyperlink"/>
@@ -4439,7 +4439,7 @@
                 <w:noProof/>
                 <w:webHidden/>
               </w:rPr>
-              <w:instrText xml:space="preserve"> PAGEREF _Toc223815734 \h </w:instrText>
+              <w:instrText xml:space="preserve"> PAGEREF _Toc223885348 \h </w:instrText>
             </w:r>
             <w:r>
               <w:rPr>
@@ -4500,7 +4500,7 @@
       <w:pPr>
         <w:pStyle w:val="Heading1"/>
       </w:pPr>
-      <w:bookmarkStart w:id="0" w:name="_Toc223815676"/>
+      <w:bookmarkStart w:id="0" w:name="_Toc223885290"/>
       <w:r>
         <w:lastRenderedPageBreak/>
         <w:t>List of Acro</w:t>
@@ -4755,7 +4755,7 @@
       <w:pPr>
         <w:pStyle w:val="Heading1"/>
       </w:pPr>
-      <w:bookmarkStart w:id="1" w:name="_Toc223815677"/>
+      <w:bookmarkStart w:id="1" w:name="_Toc223885291"/>
       <w:r>
         <w:lastRenderedPageBreak/>
         <w:t>Abstract</w:t>
@@ -4955,7 +4955,7 @@
       <w:pPr>
         <w:pStyle w:val="Heading1"/>
       </w:pPr>
-      <w:bookmarkStart w:id="2" w:name="_Toc223815678"/>
+      <w:bookmarkStart w:id="2" w:name="_Toc223885292"/>
       <w:r>
         <w:lastRenderedPageBreak/>
         <w:t>Introduction</w:t>
@@ -5002,8 +5002,13 @@
       <w:r>
         <w:t xml:space="preserve">. </w:t>
       </w:r>
-      <w:r>
-        <w:t xml:space="preserve">Porcar et al., </w:t>
+      <w:proofErr w:type="spellStart"/>
+      <w:r>
+        <w:t>Porcar</w:t>
+      </w:r>
+      <w:proofErr w:type="spellEnd"/>
+      <w:r>
+        <w:t xml:space="preserve"> et al., </w:t>
       </w:r>
       <w:r>
         <w:t>(</w:t>
@@ -5043,8 +5048,13 @@
       <w:r>
         <w:t xml:space="preserve">Research conducted by </w:t>
       </w:r>
-      <w:r>
-        <w:t xml:space="preserve">Cantó-Sancho et al., </w:t>
+      <w:proofErr w:type="spellStart"/>
+      <w:r>
+        <w:t>Cantó</w:t>
+      </w:r>
+      <w:proofErr w:type="spellEnd"/>
+      <w:r>
+        <w:t xml:space="preserve">-Sancho et al., </w:t>
       </w:r>
       <w:r>
         <w:t>(</w:t>
@@ -5528,7 +5538,7 @@
       <w:pPr>
         <w:pStyle w:val="Heading1"/>
       </w:pPr>
-      <w:bookmarkStart w:id="3" w:name="_Toc223815679"/>
+      <w:bookmarkStart w:id="3" w:name="_Toc223885293"/>
       <w:r>
         <w:lastRenderedPageBreak/>
         <w:t>Project Aim</w:t>
@@ -5578,7 +5588,7 @@
           <w:rFonts w:asciiTheme="minorHAnsi" w:hAnsiTheme="minorHAnsi"/>
         </w:rPr>
       </w:pPr>
-      <w:bookmarkStart w:id="4" w:name="_Toc223815680"/>
+      <w:bookmarkStart w:id="4" w:name="_Toc223885294"/>
       <w:r>
         <w:rPr>
           <w:rFonts w:asciiTheme="minorHAnsi" w:hAnsiTheme="minorHAnsi"/>
@@ -5865,7 +5875,7 @@
       <w:pPr>
         <w:pStyle w:val="Heading1"/>
       </w:pPr>
-      <w:bookmarkStart w:id="5" w:name="_Toc223815681"/>
+      <w:bookmarkStart w:id="5" w:name="_Toc223885295"/>
       <w:r>
         <w:lastRenderedPageBreak/>
         <w:t>Project Planning</w:t>
@@ -6246,7 +6256,7 @@
           <w:rFonts w:asciiTheme="minorHAnsi" w:hAnsiTheme="minorHAnsi"/>
         </w:rPr>
       </w:pPr>
-      <w:bookmarkStart w:id="6" w:name="_Toc223815682"/>
+      <w:bookmarkStart w:id="6" w:name="_Toc223885296"/>
       <w:r>
         <w:rPr>
           <w:rFonts w:asciiTheme="minorHAnsi" w:hAnsiTheme="minorHAnsi"/>
@@ -6448,7 +6458,7 @@
           <w:rFonts w:asciiTheme="minorHAnsi" w:hAnsiTheme="minorHAnsi"/>
         </w:rPr>
       </w:pPr>
-      <w:bookmarkStart w:id="7" w:name="_Toc223815683"/>
+      <w:bookmarkStart w:id="7" w:name="_Toc223885297"/>
       <w:r>
         <w:rPr>
           <w:rFonts w:asciiTheme="minorHAnsi" w:hAnsiTheme="minorHAnsi"/>
@@ -6687,7 +6697,21 @@
         <w:rPr>
           <w:rFonts w:cs="Arial"/>
         </w:rPr>
-        <w:t>Clear on screen prompts to guide and support users that aren’t familiar with VR equipment</w:t>
+        <w:t xml:space="preserve">Clear </w:t>
+      </w:r>
+      <w:proofErr w:type="gramStart"/>
+      <w:r>
+        <w:rPr>
+          <w:rFonts w:cs="Arial"/>
+        </w:rPr>
+        <w:t>on screen</w:t>
+      </w:r>
+      <w:proofErr w:type="gramEnd"/>
+      <w:r>
+        <w:rPr>
+          <w:rFonts w:cs="Arial"/>
+        </w:rPr>
+        <w:t xml:space="preserve"> prompts to guide and support users that aren’t familiar with VR equipment</w:t>
       </w:r>
     </w:p>
     <w:p>
@@ -6715,7 +6739,7 @@
           <w:rFonts w:asciiTheme="minorHAnsi" w:hAnsiTheme="minorHAnsi"/>
         </w:rPr>
       </w:pPr>
-      <w:bookmarkStart w:id="8" w:name="_Toc223815684"/>
+      <w:bookmarkStart w:id="8" w:name="_Toc223885298"/>
       <w:r>
         <w:rPr>
           <w:rFonts w:asciiTheme="minorHAnsi" w:hAnsiTheme="minorHAnsi"/>
@@ -6732,7 +6756,7 @@
           <w:rFonts w:asciiTheme="minorHAnsi" w:hAnsiTheme="minorHAnsi"/>
         </w:rPr>
       </w:pPr>
-      <w:bookmarkStart w:id="9" w:name="_Toc223815685"/>
+      <w:bookmarkStart w:id="9" w:name="_Toc223885299"/>
       <w:r>
         <w:rPr>
           <w:rFonts w:asciiTheme="minorHAnsi" w:hAnsiTheme="minorHAnsi"/>
@@ -6816,7 +6840,7 @@
           <w:rFonts w:asciiTheme="minorHAnsi" w:hAnsiTheme="minorHAnsi"/>
         </w:rPr>
       </w:pPr>
-      <w:bookmarkStart w:id="10" w:name="_Toc223815686"/>
+      <w:bookmarkStart w:id="10" w:name="_Toc223885300"/>
       <w:r>
         <w:rPr>
           <w:rFonts w:asciiTheme="minorHAnsi" w:hAnsiTheme="minorHAnsi"/>
@@ -6829,7 +6853,8 @@
       <w:pPr>
         <w:pStyle w:val="Heading3"/>
       </w:pPr>
-      <w:bookmarkStart w:id="11" w:name="_Toc223815687"/>
+      <w:bookmarkStart w:id="11" w:name="_Toc223885301"/>
+      <w:proofErr w:type="spellStart"/>
       <w:r>
         <w:t>Ey</w:t>
       </w:r>
@@ -6840,6 +6865,7 @@
         <w:t>si</w:t>
       </w:r>
       <w:bookmarkEnd w:id="11"/>
+      <w:proofErr w:type="spellEnd"/>
     </w:p>
     <w:p>
       <w:r>
@@ -6854,9 +6880,11 @@
       <w:r>
         <w:t xml:space="preserve"> discussed </w:t>
       </w:r>
+      <w:proofErr w:type="spellStart"/>
       <w:r>
         <w:t>Eyesi</w:t>
       </w:r>
+      <w:proofErr w:type="spellEnd"/>
       <w:r>
         <w:t>,</w:t>
       </w:r>
@@ -6969,7 +6997,15 @@
         <w:t xml:space="preserve">In addition to this, there is an </w:t>
       </w:r>
       <w:r>
-        <w:t xml:space="preserve">online training portal (vrmnet) </w:t>
+        <w:t>online training portal (</w:t>
+      </w:r>
+      <w:proofErr w:type="spellStart"/>
+      <w:r>
+        <w:t>vrmnet</w:t>
+      </w:r>
+      <w:proofErr w:type="spellEnd"/>
+      <w:r>
+        <w:t xml:space="preserve">) </w:t>
       </w:r>
       <w:r>
         <w:t>allowing comparison between trainees</w:t>
@@ -7104,7 +7140,15 @@
         <w:t xml:space="preserve"> </w:t>
       </w:r>
       <w:r>
-        <w:t xml:space="preserve">While Eyesi is effective for medical training for medical professionals, </w:t>
+        <w:t xml:space="preserve">While </w:t>
+      </w:r>
+      <w:proofErr w:type="spellStart"/>
+      <w:r>
+        <w:t>Eyesi</w:t>
+      </w:r>
+      <w:proofErr w:type="spellEnd"/>
+      <w:r>
+        <w:t xml:space="preserve"> is effective for medical training for medical professionals, </w:t>
       </w:r>
       <w:r>
         <w:t xml:space="preserve">similar </w:t>
@@ -7126,11 +7170,13 @@
       <w:pPr>
         <w:pStyle w:val="Heading3"/>
       </w:pPr>
-      <w:bookmarkStart w:id="12" w:name="_Toc223815688"/>
+      <w:bookmarkStart w:id="12" w:name="_Toc223885302"/>
+      <w:proofErr w:type="spellStart"/>
       <w:r>
         <w:t>OntoPhaco</w:t>
       </w:r>
       <w:bookmarkEnd w:id="12"/>
+      <w:proofErr w:type="spellEnd"/>
     </w:p>
     <w:p>
       <w:r>
@@ -7149,7 +7195,15 @@
         <w:t>d</w:t>
       </w:r>
       <w:r>
-        <w:t xml:space="preserve"> OntoPhaco, a</w:t>
+        <w:t xml:space="preserve"> </w:t>
+      </w:r>
+      <w:proofErr w:type="spellStart"/>
+      <w:r>
+        <w:t>OntoPhaco</w:t>
+      </w:r>
+      <w:proofErr w:type="spellEnd"/>
+      <w:r>
+        <w:t>, a</w:t>
       </w:r>
       <w:r>
         <w:t>n</w:t>
@@ -7282,173 +7336,191 @@
           <w:rFonts w:cs="TimesLTStd-Roman"/>
           <w:kern w:val="0"/>
         </w:rPr>
-        <w:t>Since OntoPhaco</w:t>
-      </w:r>
+        <w:t xml:space="preserve">Since </w:t>
+      </w:r>
+      <w:proofErr w:type="spellStart"/>
       <w:r>
         <w:rPr>
           <w:rFonts w:cs="TimesLTStd-Roman"/>
           <w:kern w:val="0"/>
         </w:rPr>
-        <w:t>’s</w:t>
+        <w:t>OntoPhaco</w:t>
       </w:r>
       <w:r>
         <w:rPr>
           <w:rFonts w:cs="TimesLTStd-Roman"/>
           <w:kern w:val="0"/>
         </w:rPr>
-        <w:t xml:space="preserve"> </w:t>
-      </w:r>
-      <w:r>
-        <w:t>s</w:t>
-      </w:r>
-      <w:r>
-        <w:t xml:space="preserve">ystematic verification and validation processes </w:t>
-      </w:r>
-      <w:r>
-        <w:t>include</w:t>
-      </w:r>
-      <w:r>
-        <w:t xml:space="preserve"> </w:t>
-      </w:r>
-      <w:r>
-        <w:t xml:space="preserve">theoretical </w:t>
-      </w:r>
-      <w:r>
-        <w:t>evaluat</w:t>
-      </w:r>
-      <w:r>
-        <w:t xml:space="preserve">ion </w:t>
-      </w:r>
-      <w:r>
-        <w:t>and expert feedback</w:t>
-      </w:r>
+        <w:t>’s</w:t>
+      </w:r>
+      <w:proofErr w:type="spellEnd"/>
       <w:r>
         <w:rPr>
           <w:rFonts w:cs="TimesLTStd-Roman"/>
           <w:kern w:val="0"/>
         </w:rPr>
-        <w:t xml:space="preserve">, each change, minor or major </w:t>
+        <w:t xml:space="preserve"> </w:t>
+      </w:r>
+      <w:r>
+        <w:t>s</w:t>
+      </w:r>
+      <w:r>
+        <w:t xml:space="preserve">ystematic verification and validation processes </w:t>
+      </w:r>
+      <w:r>
+        <w:t>include</w:t>
+      </w:r>
+      <w:r>
+        <w:t xml:space="preserve"> </w:t>
+      </w:r>
+      <w:r>
+        <w:t xml:space="preserve">theoretical </w:t>
+      </w:r>
+      <w:r>
+        <w:t>evaluat</w:t>
+      </w:r>
+      <w:r>
+        <w:t xml:space="preserve">ion </w:t>
+      </w:r>
+      <w:r>
+        <w:t>and expert feedback</w:t>
       </w:r>
       <w:r>
         <w:rPr>
           <w:rFonts w:cs="TimesLTStd-Roman"/>
           <w:kern w:val="0"/>
         </w:rPr>
-        <w:t>is</w:t>
+        <w:t xml:space="preserve">, each change, minor or major </w:t>
       </w:r>
       <w:r>
         <w:rPr>
           <w:rFonts w:cs="TimesLTStd-Roman"/>
           <w:kern w:val="0"/>
         </w:rPr>
-        <w:t xml:space="preserve"> verified and validate</w:t>
+        <w:t>is</w:t>
       </w:r>
       <w:r>
         <w:rPr>
           <w:rFonts w:cs="TimesLTStd-Roman"/>
           <w:kern w:val="0"/>
         </w:rPr>
-        <w:t>d</w:t>
-      </w:r>
-      <w:r>
-        <w:t>.</w:t>
+        <w:t xml:space="preserve"> verified and validate</w:t>
       </w:r>
       <w:r>
         <w:rPr>
           <w:rFonts w:cs="TimesLTStd-Roman"/>
           <w:kern w:val="0"/>
         </w:rPr>
-        <w:t xml:space="preserve"> </w:t>
+        <w:t>d</w:t>
+      </w:r>
+      <w:r>
+        <w:t>.</w:t>
       </w:r>
       <w:r>
         <w:rPr>
           <w:rFonts w:cs="TimesLTStd-Roman"/>
           <w:kern w:val="0"/>
         </w:rPr>
-        <w:t>OntoPhaco demonstrates VR</w:t>
-      </w:r>
+        <w:t xml:space="preserve"> </w:t>
+      </w:r>
+      <w:proofErr w:type="spellStart"/>
       <w:r>
         <w:rPr>
           <w:rFonts w:cs="TimesLTStd-Roman"/>
           <w:kern w:val="0"/>
         </w:rPr>
-        <w:t>’</w:t>
-      </w:r>
+        <w:t>OntoPhaco</w:t>
+      </w:r>
+      <w:proofErr w:type="spellEnd"/>
       <w:r>
         <w:rPr>
           <w:rFonts w:cs="TimesLTStd-Roman"/>
           <w:kern w:val="0"/>
         </w:rPr>
-        <w:t xml:space="preserve">s effectiveness </w:t>
+        <w:t xml:space="preserve"> demonstrates VR</w:t>
       </w:r>
       <w:r>
         <w:rPr>
           <w:rFonts w:cs="TimesLTStd-Roman"/>
           <w:kern w:val="0"/>
         </w:rPr>
-        <w:t xml:space="preserve">paired </w:t>
+        <w:t>’</w:t>
       </w:r>
       <w:r>
         <w:rPr>
           <w:rFonts w:cs="TimesLTStd-Roman"/>
           <w:kern w:val="0"/>
         </w:rPr>
-        <w:t>with ontology for medical training</w:t>
+        <w:t xml:space="preserve">s effectiveness </w:t>
       </w:r>
       <w:r>
         <w:rPr>
           <w:rFonts w:cs="TimesLTStd-Roman"/>
           <w:kern w:val="0"/>
         </w:rPr>
-        <w:t>. T</w:t>
+        <w:t xml:space="preserve">paired </w:t>
       </w:r>
       <w:r>
         <w:rPr>
           <w:rFonts w:cs="TimesLTStd-Roman"/>
           <w:kern w:val="0"/>
         </w:rPr>
-        <w:t>his project</w:t>
+        <w:t>with ontology for medical training</w:t>
       </w:r>
       <w:r>
         <w:rPr>
           <w:rFonts w:cs="TimesLTStd-Roman"/>
           <w:kern w:val="0"/>
         </w:rPr>
-        <w:t xml:space="preserve"> applies similar immersi</w:t>
+        <w:t>. T</w:t>
       </w:r>
       <w:r>
         <w:rPr>
           <w:rFonts w:cs="TimesLTStd-Roman"/>
           <w:kern w:val="0"/>
         </w:rPr>
-        <w:t>ve</w:t>
+        <w:t>his project</w:t>
       </w:r>
       <w:r>
         <w:rPr>
           <w:rFonts w:cs="TimesLTStd-Roman"/>
           <w:kern w:val="0"/>
         </w:rPr>
-        <w:t xml:space="preserve"> and educational knowledge </w:t>
+        <w:t xml:space="preserve"> applies similar immersi</w:t>
       </w:r>
       <w:r>
         <w:rPr>
           <w:rFonts w:cs="TimesLTStd-Roman"/>
           <w:kern w:val="0"/>
         </w:rPr>
-        <w:t xml:space="preserve">for DES to raise awareness, </w:t>
+        <w:t>ve</w:t>
       </w:r>
       <w:r>
         <w:rPr>
           <w:rFonts w:cs="TimesLTStd-Roman"/>
           <w:kern w:val="0"/>
         </w:rPr>
-        <w:t xml:space="preserve">spreading the </w:t>
+        <w:t xml:space="preserve"> and educational knowledge </w:t>
       </w:r>
       <w:r>
         <w:rPr>
           <w:rFonts w:cs="TimesLTStd-Roman"/>
           <w:kern w:val="0"/>
         </w:rPr>
+        <w:t xml:space="preserve">for DES to raise awareness, </w:t>
+      </w:r>
+      <w:r>
+        <w:rPr>
+          <w:rFonts w:cs="TimesLTStd-Roman"/>
+          <w:kern w:val="0"/>
+        </w:rPr>
+        <w:t xml:space="preserve">spreading the </w:t>
+      </w:r>
+      <w:r>
+        <w:rPr>
+          <w:rFonts w:cs="TimesLTStd-Roman"/>
+          <w:kern w:val="0"/>
+        </w:rPr>
         <w:t>benefits of VR use in education beyond professional training.</w:t>
       </w:r>
     </w:p>
@@ -7456,7 +7528,7 @@
       <w:pPr>
         <w:pStyle w:val="Heading3"/>
       </w:pPr>
-      <w:bookmarkStart w:id="13" w:name="_Toc223815689"/>
+      <w:bookmarkStart w:id="13" w:name="_Toc223885303"/>
       <w:r>
         <w:lastRenderedPageBreak/>
         <w:t>I</w:t>
@@ -7652,7 +7724,7 @@
       <w:pPr>
         <w:pStyle w:val="Heading3"/>
       </w:pPr>
-      <w:bookmarkStart w:id="14" w:name="_Toc223815690"/>
+      <w:bookmarkStart w:id="14" w:name="_Toc223885304"/>
       <w:r>
         <w:t>Opportunities for innovation</w:t>
       </w:r>
@@ -7662,17 +7734,27 @@
       <w:r>
         <w:t xml:space="preserve">While </w:t>
       </w:r>
-      <w:r>
-        <w:t>Eyesi focuses on hands on surgical practices</w:t>
+      <w:proofErr w:type="spellStart"/>
+      <w:r>
+        <w:t>Eyesi</w:t>
+      </w:r>
+      <w:proofErr w:type="spellEnd"/>
+      <w:r>
+        <w:t xml:space="preserve"> focuses on hands on surgical practices</w:t>
       </w:r>
       <w:r>
         <w:t xml:space="preserve">, </w:t>
       </w:r>
+      <w:proofErr w:type="spellStart"/>
       <w:r>
         <w:t>O</w:t>
       </w:r>
       <w:r>
-        <w:t>ntoPhaco focuses on the way knowledge is represented and conceptual understanding</w:t>
+        <w:t>ntoPhaco</w:t>
+      </w:r>
+      <w:proofErr w:type="spellEnd"/>
+      <w:r>
+        <w:t xml:space="preserve"> focuses on the way knowledge is represented and conceptual understanding</w:t>
       </w:r>
       <w:r>
         <w:t xml:space="preserve">. </w:t>
@@ -7770,7 +7852,7 @@
           <w:rFonts w:asciiTheme="minorHAnsi" w:hAnsiTheme="minorHAnsi"/>
         </w:rPr>
       </w:pPr>
-      <w:bookmarkStart w:id="15" w:name="_Toc223815691"/>
+      <w:bookmarkStart w:id="15" w:name="_Toc223885305"/>
       <w:r>
         <w:rPr>
           <w:rFonts w:asciiTheme="minorHAnsi" w:hAnsiTheme="minorHAnsi"/>
@@ -7783,7 +7865,7 @@
       <w:pPr>
         <w:pStyle w:val="Heading3"/>
       </w:pPr>
-      <w:bookmarkStart w:id="16" w:name="_Toc223815692"/>
+      <w:bookmarkStart w:id="16" w:name="_Toc223885306"/>
       <w:r>
         <w:t>VR in medical education</w:t>
       </w:r>
@@ -7930,9 +8012,19 @@
       <w:r>
         <w:t xml:space="preserve">Examples such as </w:t>
       </w:r>
-      <w:r>
-        <w:t>Mediverse by Goggleminds</w:t>
-      </w:r>
+      <w:proofErr w:type="spellStart"/>
+      <w:r>
+        <w:t>Mediverse</w:t>
+      </w:r>
+      <w:proofErr w:type="spellEnd"/>
+      <w:r>
+        <w:t xml:space="preserve"> by </w:t>
+      </w:r>
+      <w:proofErr w:type="spellStart"/>
+      <w:r>
+        <w:t>Goggleminds</w:t>
+      </w:r>
+      <w:proofErr w:type="spellEnd"/>
       <w:r>
         <w:t xml:space="preserve"> </w:t>
       </w:r>
@@ -7946,7 +8038,15 @@
         <w:t xml:space="preserve"> to healthcare providers and medical schools</w:t>
       </w:r>
       <w:r>
-        <w:t>. ClassVR by Systems improve</w:t>
+        <w:t xml:space="preserve">. </w:t>
+      </w:r>
+      <w:proofErr w:type="spellStart"/>
+      <w:r>
+        <w:t>ClassVR</w:t>
+      </w:r>
+      <w:proofErr w:type="spellEnd"/>
+      <w:r>
+        <w:t xml:space="preserve"> by Systems improve</w:t>
       </w:r>
       <w:r>
         <w:t>s</w:t>
@@ -7963,8 +8063,13 @@
       <w:r>
         <w:t xml:space="preserve"> </w:t>
       </w:r>
-      <w:r>
-        <w:t xml:space="preserve">PrismsVR </w:t>
+      <w:proofErr w:type="spellStart"/>
+      <w:r>
+        <w:t>PrismsVR</w:t>
+      </w:r>
+      <w:proofErr w:type="spellEnd"/>
+      <w:r>
+        <w:t xml:space="preserve"> </w:t>
       </w:r>
       <w:r>
         <w:t xml:space="preserve">helps students grasp core concepts in algebra and geometry, by </w:t>
@@ -8050,7 +8155,7 @@
       <w:pPr>
         <w:pStyle w:val="Heading3"/>
       </w:pPr>
-      <w:bookmarkStart w:id="17" w:name="_Toc223815693"/>
+      <w:bookmarkStart w:id="17" w:name="_Toc223885307"/>
       <w:r>
         <w:lastRenderedPageBreak/>
         <w:t>VR in Health Awareness</w:t>
@@ -8243,7 +8348,7 @@
           <w:rFonts w:asciiTheme="minorHAnsi" w:hAnsiTheme="minorHAnsi"/>
         </w:rPr>
       </w:pPr>
-      <w:bookmarkStart w:id="18" w:name="_Toc223815694"/>
+      <w:bookmarkStart w:id="18" w:name="_Toc223885308"/>
       <w:r>
         <w:rPr>
           <w:rFonts w:asciiTheme="minorHAnsi" w:hAnsiTheme="minorHAnsi"/>
@@ -8463,7 +8568,7 @@
       <w:pPr>
         <w:pStyle w:val="Heading1"/>
       </w:pPr>
-      <w:bookmarkStart w:id="19" w:name="_Toc223815695"/>
+      <w:bookmarkStart w:id="19" w:name="_Toc223885309"/>
       <w:r>
         <w:lastRenderedPageBreak/>
         <w:t>Appendices</w:t>
@@ -8474,7 +8579,7 @@
       <w:pPr>
         <w:pStyle w:val="Heading2"/>
       </w:pPr>
-      <w:bookmarkStart w:id="20" w:name="_Toc223815696"/>
+      <w:bookmarkStart w:id="20" w:name="_Toc223885310"/>
       <w:r>
         <w:t>Ethics Checklist</w:t>
       </w:r>
@@ -8616,7 +8721,7 @@
       <w:pPr>
         <w:pStyle w:val="Heading2"/>
       </w:pPr>
-      <w:bookmarkStart w:id="21" w:name="_Toc223815697"/>
+      <w:bookmarkStart w:id="21" w:name="_Toc223885311"/>
       <w:r>
         <w:lastRenderedPageBreak/>
         <w:t>Project Timeline Gant</w:t>
@@ -8812,7 +8917,7 @@
       <w:pPr>
         <w:pStyle w:val="Heading1"/>
       </w:pPr>
-      <w:bookmarkStart w:id="22" w:name="_Toc223815698"/>
+      <w:bookmarkStart w:id="22" w:name="_Toc223885312"/>
       <w:r>
         <w:lastRenderedPageBreak/>
         <w:t>Methodology</w:t>
@@ -8823,7 +8928,7 @@
       <w:pPr>
         <w:pStyle w:val="Heading2"/>
       </w:pPr>
-      <w:bookmarkStart w:id="23" w:name="_Toc223815699"/>
+      <w:bookmarkStart w:id="23" w:name="_Toc223885313"/>
       <w:r>
         <w:t>Prototype Implementation</w:t>
       </w:r>
@@ -8833,7 +8938,7 @@
       <w:pPr>
         <w:pStyle w:val="Heading3"/>
       </w:pPr>
-      <w:bookmarkStart w:id="24" w:name="_Toc223815700"/>
+      <w:bookmarkStart w:id="24" w:name="_Toc223885314"/>
       <w:r>
         <w:t>Usability and Flow</w:t>
       </w:r>
@@ -8916,7 +9021,7 @@
       <w:pPr>
         <w:pStyle w:val="Heading3"/>
       </w:pPr>
-      <w:bookmarkStart w:id="25" w:name="_Toc223815701"/>
+      <w:bookmarkStart w:id="25" w:name="_Toc223885315"/>
       <w:r>
         <w:t xml:space="preserve">Environment Design and </w:t>
       </w:r>
@@ -9045,7 +9150,7 @@
       <w:pPr>
         <w:pStyle w:val="Heading3"/>
       </w:pPr>
-      <w:bookmarkStart w:id="26" w:name="_Toc223815702"/>
+      <w:bookmarkStart w:id="26" w:name="_Toc223885316"/>
       <w:r>
         <w:t>Objective System Implementation</w:t>
       </w:r>
@@ -9086,7 +9191,15 @@
         <w:t>ere</w:t>
       </w:r>
       <w:r>
-        <w:t xml:space="preserve"> stored within the VRGameMode blueprint, with objectives being updated during runtime as conditions were satisfied </w:t>
+        <w:t xml:space="preserve"> stored within the </w:t>
+      </w:r>
+      <w:proofErr w:type="spellStart"/>
+      <w:r>
+        <w:t>VRGameMode</w:t>
+      </w:r>
+      <w:proofErr w:type="spellEnd"/>
+      <w:r>
+        <w:t xml:space="preserve"> blueprint, with objectives being updated during runtime as conditions were satisfied </w:t>
       </w:r>
       <w:r>
         <w:t>during</w:t>
@@ -9150,7 +9263,7 @@
       <w:pPr>
         <w:pStyle w:val="Heading3"/>
       </w:pPr>
-      <w:bookmarkStart w:id="27" w:name="_Toc223815703"/>
+      <w:bookmarkStart w:id="27" w:name="_Toc223885317"/>
       <w:r>
         <w:t>User</w:t>
       </w:r>
@@ -9247,7 +9360,7 @@
       <w:pPr>
         <w:pStyle w:val="Heading3"/>
       </w:pPr>
-      <w:bookmarkStart w:id="28" w:name="_Toc223815704"/>
+      <w:bookmarkStart w:id="28" w:name="_Toc223885318"/>
       <w:r>
         <w:t>Objective Based Interact</w:t>
       </w:r>
@@ -9315,7 +9428,7 @@
       <w:pPr>
         <w:pStyle w:val="Heading3"/>
       </w:pPr>
-      <w:bookmarkStart w:id="29" w:name="_Toc223815705"/>
+      <w:bookmarkStart w:id="29" w:name="_Toc223885319"/>
       <w:r>
         <w:t>Post Processing Effects</w:t>
       </w:r>
@@ -9332,7 +9445,15 @@
         <w:t>’s post processing component</w:t>
       </w:r>
       <w:r>
-        <w:t>. These effects were vignette to simulate eye fatigue, bloom for light sensitivity and blur for focus strain. Vignette and bloom post processing effects were triggered through adjusting their post processing variables within the camera post processing component. However, for blur a post processing material was required to create the radial blur. When objectives progressed triggering the simulation of symptoms, a timeline was used to progressively increase the value of an effect gradually over a duration. This decision was made to accommodate eyes adjusting to the changes of the camera as these effects were being triggered.</w:t>
+        <w:t xml:space="preserve">. These effects were </w:t>
+      </w:r>
+      <w:proofErr w:type="gramStart"/>
+      <w:r>
+        <w:t>vignette</w:t>
+      </w:r>
+      <w:proofErr w:type="gramEnd"/>
+      <w:r>
+        <w:t xml:space="preserve"> to simulate eye fatigue, bloom for light sensitivity and blur for focus strain. Vignette and bloom post processing effects were triggered through adjusting their post processing variables within the camera post processing component. However, for blur a post processing material was required to create the radial blur. When objectives progressed triggering the simulation of symptoms, a timeline was used to progressively increase the value of an effect gradually over a duration. This decision was made to accommodate eyes adjusting to the changes of the camera as these effects were being triggered.</w:t>
       </w:r>
       <w:r>
         <w:t xml:space="preserve"> The timeline was then used in reverse to revert the symptoms returning the camera view back to the original state it was in.</w:t>
@@ -9342,7 +9463,7 @@
       <w:pPr>
         <w:pStyle w:val="Heading3"/>
       </w:pPr>
-      <w:bookmarkStart w:id="30" w:name="_Toc223815706"/>
+      <w:bookmarkStart w:id="30" w:name="_Toc223885320"/>
       <w:r>
         <w:t>User</w:t>
       </w:r>
@@ -9373,7 +9494,7 @@
       <w:pPr>
         <w:pStyle w:val="Heading2"/>
       </w:pPr>
-      <w:bookmarkStart w:id="31" w:name="_Toc223815707"/>
+      <w:bookmarkStart w:id="31" w:name="_Toc223885321"/>
       <w:r>
         <w:lastRenderedPageBreak/>
         <w:t>Final Version</w:t>
@@ -9401,7 +9522,7 @@
       <w:pPr>
         <w:pStyle w:val="Heading1"/>
       </w:pPr>
-      <w:bookmarkStart w:id="32" w:name="_Toc223815708"/>
+      <w:bookmarkStart w:id="32" w:name="_Toc223885322"/>
       <w:r>
         <w:lastRenderedPageBreak/>
         <w:t>Results</w:t>
@@ -9412,7 +9533,7 @@
       <w:pPr>
         <w:pStyle w:val="Heading2"/>
       </w:pPr>
-      <w:bookmarkStart w:id="33" w:name="_Toc223815709"/>
+      <w:bookmarkStart w:id="33" w:name="_Toc223885323"/>
       <w:r>
         <w:t>Prototype Tests</w:t>
       </w:r>
@@ -9508,7 +9629,7 @@
       <w:pPr>
         <w:pStyle w:val="Heading3"/>
       </w:pPr>
-      <w:bookmarkStart w:id="34" w:name="_Toc223815710"/>
+      <w:bookmarkStart w:id="34" w:name="_Toc223885324"/>
       <w:r>
         <w:t>Interaction</w:t>
       </w:r>
@@ -9669,7 +9790,7 @@
       <w:pPr>
         <w:pStyle w:val="Heading3"/>
       </w:pPr>
-      <w:bookmarkStart w:id="35" w:name="_Toc223815711"/>
+      <w:bookmarkStart w:id="35" w:name="_Toc223885325"/>
       <w:r>
         <w:t>User Attention Detection</w:t>
       </w:r>
@@ -9726,7 +9847,7 @@
       <w:pPr>
         <w:pStyle w:val="Heading3"/>
       </w:pPr>
-      <w:bookmarkStart w:id="36" w:name="_Toc223815712"/>
+      <w:bookmarkStart w:id="36" w:name="_Toc223885326"/>
       <w:r>
         <w:t>Symptom Simulations</w:t>
       </w:r>
@@ -9868,7 +9989,7 @@
       <w:pPr>
         <w:pStyle w:val="Heading3"/>
       </w:pPr>
-      <w:bookmarkStart w:id="37" w:name="_Toc223815713"/>
+      <w:bookmarkStart w:id="37" w:name="_Toc223885327"/>
       <w:r>
         <w:t xml:space="preserve">Improvements to be </w:t>
       </w:r>
@@ -9911,7 +10032,7 @@
       <w:pPr>
         <w:pStyle w:val="Heading2"/>
       </w:pPr>
-      <w:bookmarkStart w:id="38" w:name="_Toc223815714"/>
+      <w:bookmarkStart w:id="38" w:name="_Toc223885328"/>
       <w:r>
         <w:t>Final Version Tests</w:t>
       </w:r>
@@ -9950,7 +10071,7 @@
       <w:pPr>
         <w:pStyle w:val="Heading3"/>
       </w:pPr>
-      <w:bookmarkStart w:id="39" w:name="_Toc223815715"/>
+      <w:bookmarkStart w:id="39" w:name="_Toc223885329"/>
       <w:r>
         <w:t>Interaction Objects and Objective Understanding</w:t>
       </w:r>
@@ -9960,7 +10081,7 @@
       <w:pPr>
         <w:pStyle w:val="Heading3"/>
       </w:pPr>
-      <w:bookmarkStart w:id="40" w:name="_Toc223815716"/>
+      <w:bookmarkStart w:id="40" w:name="_Toc223885330"/>
       <w:r>
         <w:t>User Attention Detection</w:t>
       </w:r>
@@ -9970,7 +10091,7 @@
       <w:pPr>
         <w:pStyle w:val="Heading3"/>
       </w:pPr>
-      <w:bookmarkStart w:id="41" w:name="_Toc223815717"/>
+      <w:bookmarkStart w:id="41" w:name="_Toc223885331"/>
       <w:r>
         <w:t>Symptom Simulation</w:t>
       </w:r>
@@ -9989,7 +10110,7 @@
       <w:pPr>
         <w:pStyle w:val="Heading1"/>
       </w:pPr>
-      <w:bookmarkStart w:id="42" w:name="_Toc223815718"/>
+      <w:bookmarkStart w:id="42" w:name="_Toc223885332"/>
       <w:r>
         <w:lastRenderedPageBreak/>
         <w:t>Critical Evaluation</w:t>
@@ -10016,7 +10137,7 @@
       <w:pPr>
         <w:pStyle w:val="Heading1"/>
       </w:pPr>
-      <w:bookmarkStart w:id="43" w:name="_Toc223815719"/>
+      <w:bookmarkStart w:id="43" w:name="_Toc223885333"/>
       <w:r>
         <w:lastRenderedPageBreak/>
         <w:t>Conclusions and Future Work</w:t>
@@ -10066,7 +10187,7 @@
       <w:pPr>
         <w:pStyle w:val="Heading1"/>
       </w:pPr>
-      <w:bookmarkStart w:id="44" w:name="_Toc223815720"/>
+      <w:bookmarkStart w:id="44" w:name="_Toc223885334"/>
       <w:r>
         <w:lastRenderedPageBreak/>
         <w:t>References</w:t>
@@ -10074,9 +10195,23 @@
       <w:bookmarkEnd w:id="44"/>
     </w:p>
     <w:p>
-      <w:r>
-        <w:t xml:space="preserve">Cantó-Sancho, N., Porru, S., Casati, S., Ronda, E., Seguí-Crespo, M. and Carta, A. (2023) ‘Prevalence and risk factors of computer vision syndrome—assessed in office workers by a validated questionnaire’. </w:t>
-      </w:r>
+      <w:proofErr w:type="spellStart"/>
+      <w:r>
+        <w:t>Cantó</w:t>
+      </w:r>
+      <w:proofErr w:type="spellEnd"/>
+      <w:r>
+        <w:t xml:space="preserve">-Sancho, N., </w:t>
+      </w:r>
+      <w:proofErr w:type="spellStart"/>
+      <w:r>
+        <w:t>Porru</w:t>
+      </w:r>
+      <w:proofErr w:type="spellEnd"/>
+      <w:r>
+        <w:t xml:space="preserve">, S., Casati, S., Ronda, E., Seguí-Crespo, M. and Carta, A. (2023) ‘Prevalence and risk factors of computer vision syndrome—assessed in office workers by a validated questionnaire’. </w:t>
+      </w:r>
+      <w:proofErr w:type="spellStart"/>
       <w:r>
         <w:rPr>
           <w:i/>
@@ -10084,13 +10219,30 @@
         </w:rPr>
         <w:t>PeerJ</w:t>
       </w:r>
+      <w:proofErr w:type="spellEnd"/>
       <w:r>
         <w:t xml:space="preserve"> 11, p. e14937. Available at: https://www.researchgate.net/publication/369002899_Prevalence_and_risk_factors_of_computer_vision_syndrome-assessed_in_office_workers_by_a_validated_questionnaire (Accessed: 20 October 2025).</w:t>
       </w:r>
     </w:p>
     <w:p>
       <w:r>
-        <w:t xml:space="preserve">Chandrasekhara, R.S., Low, C., Lim, Y., Low, L., Mardina, F. and Nursaleha, M. (2013) ‘Computer vision syndrome: a study of knowledge and practices in university students’. </w:t>
+        <w:t xml:space="preserve">Chandrasekhara, R.S., Low, C., Lim, Y., Low, L., Mardina, F. and </w:t>
+      </w:r>
+      <w:proofErr w:type="spellStart"/>
+      <w:r>
+        <w:t>Nursaleha</w:t>
+      </w:r>
+      <w:proofErr w:type="spellEnd"/>
+      <w:r>
+        <w:t xml:space="preserve">, M. (2013) ‘Computer vision syndrome: a study of knowledge and practices in university </w:t>
+      </w:r>
+      <w:proofErr w:type="gramStart"/>
+      <w:r>
+        <w:t>students’</w:t>
+      </w:r>
+      <w:proofErr w:type="gramEnd"/>
+      <w:r>
+        <w:t xml:space="preserve">. </w:t>
       </w:r>
       <w:r>
         <w:rPr>
@@ -10116,7 +10268,15 @@
     </w:p>
     <w:p>
       <w:r>
-        <w:t xml:space="preserve">Muñoz, E.G., Fabregat, R., Bacca-Acosta, J., Duque-Méndez, N. and Avila-Garzon, C. (2022) ‘Augmented Reality, Virtual Reality, and Game Technologies in Ophthalmology Training’. </w:t>
+        <w:t xml:space="preserve">Muñoz, E.G., </w:t>
+      </w:r>
+      <w:proofErr w:type="spellStart"/>
+      <w:r>
+        <w:t>Fabregat</w:t>
+      </w:r>
+      <w:proofErr w:type="spellEnd"/>
+      <w:r>
+        <w:t xml:space="preserve">, R., Bacca-Acosta, J., Duque-Méndez, N. and Avila-Garzon, C. (2022) ‘Augmented Reality, Virtual Reality, and Game Technologies in Ophthalmology Training’. </w:t>
       </w:r>
       <w:r>
         <w:rPr>
@@ -10126,7 +10286,15 @@
         <w:t>Information</w:t>
       </w:r>
       <w:r>
-        <w:t xml:space="preserve"> 13(5), p. 222. doi: </w:t>
+        <w:t xml:space="preserve"> 13(5), p. 222. </w:t>
+      </w:r>
+      <w:proofErr w:type="spellStart"/>
+      <w:r>
+        <w:t>doi</w:t>
+      </w:r>
+      <w:proofErr w:type="spellEnd"/>
+      <w:r>
+        <w:t xml:space="preserve">: </w:t>
       </w:r>
       <w:hyperlink r:id="rId16" w:history="1">
         <w:r>
@@ -10142,12 +10310,33 @@
     </w:p>
     <w:p>
       <w:r>
-        <w:t>Orji, J., Hernandez, A., Selema, B. and Orji, R. (2022) ‘Virtual and augmented reality applications for promoting safety and security: A systematic review’., pp. 1–7. doi: https://doi.org/10.1109/SEGAH54908.2022.9978597.</w:t>
-      </w:r>
-    </w:p>
-    <w:p>
-      <w:r>
-        <w:t xml:space="preserve">Porcar, E., Pons, A. and Lorente, A. (2016) ‘Visual and ocular effects from the use of flat-panel displays’. </w:t>
+        <w:t xml:space="preserve">Orji, J., Hernandez, A., Selema, B. and Orji, R. (2022) ‘Virtual and augmented reality applications for promoting safety and security: A systematic review’., pp. 1–7. </w:t>
+      </w:r>
+      <w:proofErr w:type="spellStart"/>
+      <w:r>
+        <w:t>doi</w:t>
+      </w:r>
+      <w:proofErr w:type="spellEnd"/>
+      <w:r>
+        <w:t>: https://doi.org/10.1109/SEGAH54908.2022.9978597.</w:t>
+      </w:r>
+    </w:p>
+    <w:p>
+      <w:proofErr w:type="spellStart"/>
+      <w:r>
+        <w:t>Porcar</w:t>
+      </w:r>
+      <w:proofErr w:type="spellEnd"/>
+      <w:r>
+        <w:t xml:space="preserve">, E., Pons, A. and Lorente, A. (2016) ‘Visual and ocular effects from the use of flat-panel </w:t>
+      </w:r>
+      <w:proofErr w:type="gramStart"/>
+      <w:r>
+        <w:t>displays’</w:t>
+      </w:r>
+      <w:proofErr w:type="gramEnd"/>
+      <w:r>
+        <w:t xml:space="preserve">. </w:t>
       </w:r>
       <w:r>
         <w:rPr>
@@ -10162,7 +10351,23 @@
     </w:p>
     <w:p>
       <w:r>
-        <w:t xml:space="preserve">Santilli, T., Ceccacci, S., Mengoni, M. and Catia Giaconi (2025) ‘Virtual vs. traditional learning in higher education: A systematic review of comparative studies’. </w:t>
+        <w:t xml:space="preserve">Santilli, T., Ceccacci, S., Mengoni, M. and Catia </w:t>
+      </w:r>
+      <w:proofErr w:type="spellStart"/>
+      <w:r>
+        <w:t>Giaconi</w:t>
+      </w:r>
+      <w:proofErr w:type="spellEnd"/>
+      <w:r>
+        <w:t xml:space="preserve"> (2025) ‘Virtual vs. traditional learning in higher education: A systematic review of comparative </w:t>
+      </w:r>
+      <w:proofErr w:type="gramStart"/>
+      <w:r>
+        <w:t>studies’</w:t>
+      </w:r>
+      <w:proofErr w:type="gramEnd"/>
+      <w:r>
+        <w:t xml:space="preserve">. </w:t>
       </w:r>
       <w:r>
         <w:rPr>
@@ -10197,7 +10402,23 @@
     </w:p>
     <w:p>
       <w:r>
-        <w:t>Vieira, F., Oliveira, E. and Rodrigues, N. (2019) ‘iSVC – digital platform for detection and prevention of computer vision syndrome’., pp. 1–7. doi: https://doi.org/10.1109/SeGAH.2019.8882438.</w:t>
+        <w:t>Vieira, F., Oliveira, E. and Rodrigues, N. (2019) ‘</w:t>
+      </w:r>
+      <w:proofErr w:type="spellStart"/>
+      <w:r>
+        <w:t>iSVC</w:t>
+      </w:r>
+      <w:proofErr w:type="spellEnd"/>
+      <w:r>
+        <w:t xml:space="preserve"> – digital platform for detection and prevention of computer vision syndrome’., pp. 1–7. </w:t>
+      </w:r>
+      <w:proofErr w:type="spellStart"/>
+      <w:r>
+        <w:t>doi</w:t>
+      </w:r>
+      <w:proofErr w:type="spellEnd"/>
+      <w:r>
+        <w:t>: https://doi.org/10.1109/SeGAH.2019.8882438.</w:t>
       </w:r>
     </w:p>
     <w:p>
@@ -10212,12 +10433,28 @@
         <w:t>Annals of Emerging Technologies in Computing</w:t>
       </w:r>
       <w:r>
-        <w:t xml:space="preserve"> 9(3), pp. 50–68. doi: https://doi.org/10.33166/aetic.2025.03.004.</w:t>
-      </w:r>
-    </w:p>
-    <w:p>
-      <w:r>
-        <w:t xml:space="preserve">Youcef, B., Ahmad, M.N. and Mustapha, M. (2021) ‘OntoPhaco: An ontology for virtual reality training in ophthalmology Domain—A case study of cataract surgery’. </w:t>
+        <w:t xml:space="preserve"> 9(3), pp. 50–68. </w:t>
+      </w:r>
+      <w:proofErr w:type="spellStart"/>
+      <w:r>
+        <w:t>doi</w:t>
+      </w:r>
+      <w:proofErr w:type="spellEnd"/>
+      <w:r>
+        <w:t>: https://doi.org/10.33166/aetic.2025.03.004.</w:t>
+      </w:r>
+    </w:p>
+    <w:p>
+      <w:r>
+        <w:t>Youcef, B., Ahmad, M.N. and Mustapha, M. (2021) ‘</w:t>
+      </w:r>
+      <w:proofErr w:type="spellStart"/>
+      <w:r>
+        <w:t>OntoPhaco</w:t>
+      </w:r>
+      <w:proofErr w:type="spellEnd"/>
+      <w:r>
+        <w:t xml:space="preserve">: An ontology for virtual reality training in ophthalmology Domain—A case study of cataract surgery’. </w:t>
       </w:r>
       <w:r>
         <w:rPr>
@@ -10227,7 +10464,15 @@
         <w:t>IEEE Access</w:t>
       </w:r>
       <w:r>
-        <w:t xml:space="preserve"> 9, pp. 152347–152378. doi: https://doi.org/10.1109/ACCESS.2021.3126697.</w:t>
+        <w:t xml:space="preserve"> 9, pp. 152347–152378. </w:t>
+      </w:r>
+      <w:proofErr w:type="spellStart"/>
+      <w:r>
+        <w:t>doi</w:t>
+      </w:r>
+      <w:proofErr w:type="spellEnd"/>
+      <w:r>
+        <w:t>: https://doi.org/10.1109/ACCESS.2021.3126697.</w:t>
       </w:r>
     </w:p>
     <w:p/>
@@ -10235,7 +10480,7 @@
       <w:pPr>
         <w:pStyle w:val="Heading1"/>
       </w:pPr>
-      <w:bookmarkStart w:id="45" w:name="_Toc223815721"/>
+      <w:bookmarkStart w:id="45" w:name="_Toc223885335"/>
       <w:r>
         <w:lastRenderedPageBreak/>
         <w:t>Appendix</w:t>
@@ -10246,7 +10491,7 @@
       <w:pPr>
         <w:pStyle w:val="Heading2"/>
       </w:pPr>
-      <w:bookmarkStart w:id="46" w:name="_Toc223815722"/>
+      <w:bookmarkStart w:id="46" w:name="_Toc223885336"/>
       <w:r>
         <w:t>Asset Licenses and Sources</w:t>
       </w:r>
@@ -10256,7 +10501,7 @@
       <w:pPr>
         <w:pStyle w:val="Heading3"/>
       </w:pPr>
-      <w:bookmarkStart w:id="47" w:name="_Toc223815723"/>
+      <w:bookmarkStart w:id="47" w:name="_Toc223885337"/>
       <w:r>
         <w:t>Modern Office Table</w:t>
       </w:r>
@@ -10340,7 +10585,7 @@
       <w:pPr>
         <w:pStyle w:val="Heading3"/>
       </w:pPr>
-      <w:bookmarkStart w:id="48" w:name="_Toc223815724"/>
+      <w:bookmarkStart w:id="48" w:name="_Toc223885338"/>
       <w:r>
         <w:t>Free Studio Starter Pack</w:t>
       </w:r>
@@ -10424,7 +10669,7 @@
       <w:pPr>
         <w:pStyle w:val="Heading3"/>
       </w:pPr>
-      <w:bookmarkStart w:id="49" w:name="_Toc223815725"/>
+      <w:bookmarkStart w:id="49" w:name="_Toc223885339"/>
       <w:r>
         <w:t>General Desktop Bundle</w:t>
       </w:r>
@@ -10508,7 +10753,7 @@
       <w:pPr>
         <w:pStyle w:val="Heading3"/>
       </w:pPr>
-      <w:bookmarkStart w:id="50" w:name="_Toc223815726"/>
+      <w:bookmarkStart w:id="50" w:name="_Toc223885340"/>
       <w:r>
         <w:lastRenderedPageBreak/>
         <w:t>General Gaming Headset</w:t>
@@ -10593,7 +10838,7 @@
       <w:pPr>
         <w:pStyle w:val="Heading3"/>
       </w:pPr>
-      <w:bookmarkStart w:id="51" w:name="_Toc223815727"/>
+      <w:bookmarkStart w:id="51" w:name="_Toc223885341"/>
       <w:r>
         <w:t>General Gaming Chair</w:t>
       </w:r>
@@ -10677,7 +10922,7 @@
       <w:pPr>
         <w:pStyle w:val="Heading3"/>
       </w:pPr>
-      <w:bookmarkStart w:id="52" w:name="_Toc223815728"/>
+      <w:bookmarkStart w:id="52" w:name="_Toc223885342"/>
       <w:r>
         <w:t>Light Switch</w:t>
       </w:r>
@@ -10775,10 +11020,13 @@
       <w:pPr>
         <w:pStyle w:val="Heading3"/>
       </w:pPr>
-      <w:bookmarkStart w:id="53" w:name="_Toc223815729"/>
+      <w:bookmarkStart w:id="53" w:name="_Toc223885343"/>
       <w:r>
         <w:lastRenderedPageBreak/>
         <w:t>Materials for General PC setup</w:t>
+      </w:r>
+      <w:r>
+        <w:t xml:space="preserve"> and Scenes</w:t>
       </w:r>
       <w:bookmarkEnd w:id="53"/>
     </w:p>
@@ -10902,7 +11150,7 @@
       <w:pPr>
         <w:pStyle w:val="Heading3"/>
       </w:pPr>
-      <w:bookmarkStart w:id="54" w:name="_Toc223815730"/>
+      <w:bookmarkStart w:id="54" w:name="_Toc223885344"/>
       <w:r>
         <w:lastRenderedPageBreak/>
         <w:t>Monitor background image</w:t>
@@ -10998,12 +11246,25 @@
       <w:pPr>
         <w:pStyle w:val="Heading3"/>
       </w:pPr>
-      <w:bookmarkStart w:id="55" w:name="_Toc223815731"/>
+      <w:bookmarkStart w:id="55" w:name="_Toc223885345"/>
       <w:r>
         <w:lastRenderedPageBreak/>
-        <w:t>Button Hover Sfx by Fachii</w:t>
+        <w:t xml:space="preserve">Button Hover </w:t>
+      </w:r>
+      <w:proofErr w:type="spellStart"/>
+      <w:r>
+        <w:t>Sfx</w:t>
+      </w:r>
+      <w:proofErr w:type="spellEnd"/>
+      <w:r>
+        <w:t xml:space="preserve"> by </w:t>
+      </w:r>
+      <w:proofErr w:type="spellStart"/>
+      <w:r>
+        <w:t>Fachii</w:t>
       </w:r>
       <w:bookmarkEnd w:id="55"/>
+      <w:proofErr w:type="spellEnd"/>
     </w:p>
     <w:p>
       <w:r>
@@ -11098,14 +11359,36 @@
     </w:p>
     <w:p/>
     <w:p>
-      <w:bookmarkStart w:id="56" w:name="_Toc223815732"/>
+      <w:bookmarkStart w:id="56" w:name="_Toc223885346"/>
       <w:r>
         <w:rPr>
           <w:rStyle w:val="Heading3Char"/>
         </w:rPr>
-        <w:t>Button click Sfx by AndrewEathan</w:t>
+        <w:t xml:space="preserve">Button click </w:t>
+      </w:r>
+      <w:proofErr w:type="spellStart"/>
+      <w:r>
+        <w:rPr>
+          <w:rStyle w:val="Heading3Char"/>
+        </w:rPr>
+        <w:t>Sfx</w:t>
+      </w:r>
+      <w:proofErr w:type="spellEnd"/>
+      <w:r>
+        <w:rPr>
+          <w:rStyle w:val="Heading3Char"/>
+        </w:rPr>
+        <w:t xml:space="preserve"> by </w:t>
+      </w:r>
+      <w:proofErr w:type="spellStart"/>
+      <w:r>
+        <w:rPr>
+          <w:rStyle w:val="Heading3Char"/>
+        </w:rPr>
+        <w:t>AndrewEathan</w:t>
       </w:r>
       <w:bookmarkEnd w:id="56"/>
+      <w:proofErr w:type="spellEnd"/>
       <w:r>
         <w:t xml:space="preserve"> </w:t>
       </w:r>
@@ -11211,12 +11494,25 @@
       <w:pPr>
         <w:pStyle w:val="Heading3"/>
       </w:pPr>
-      <w:bookmarkStart w:id="57" w:name="_Toc223815733"/>
+      <w:bookmarkStart w:id="57" w:name="_Toc223885347"/>
       <w:r>
         <w:lastRenderedPageBreak/>
-        <w:t>Light Switch On Sfx</w:t>
+        <w:t xml:space="preserve">Light Switch </w:t>
+      </w:r>
+      <w:proofErr w:type="gramStart"/>
+      <w:r>
+        <w:t>On</w:t>
+      </w:r>
+      <w:proofErr w:type="gramEnd"/>
+      <w:r>
+        <w:t xml:space="preserve"> </w:t>
+      </w:r>
+      <w:proofErr w:type="spellStart"/>
+      <w:r>
+        <w:t>Sfx</w:t>
       </w:r>
       <w:bookmarkEnd w:id="57"/>
+      <w:proofErr w:type="spellEnd"/>
     </w:p>
     <w:p>
       <w:r>
@@ -11306,11 +11602,16 @@
       <w:pPr>
         <w:pStyle w:val="Heading3"/>
       </w:pPr>
-      <w:bookmarkStart w:id="58" w:name="_Toc223815734"/>
-      <w:r>
-        <w:t>Light Switch Off Sfx</w:t>
+      <w:bookmarkStart w:id="58" w:name="_Toc223885348"/>
+      <w:r>
+        <w:t xml:space="preserve">Light Switch Off </w:t>
+      </w:r>
+      <w:proofErr w:type="spellStart"/>
+      <w:r>
+        <w:t>Sfx</w:t>
       </w:r>
       <w:bookmarkEnd w:id="58"/>
+      <w:proofErr w:type="spellEnd"/>
     </w:p>
     <w:p>
       <w:r>

</xml_diff>

<commit_message>
Mapped out final implementation methodology and testing section
</commit_message>
<xml_diff>
--- a/30077548Thesis.docx
+++ b/30077548Thesis.docx
@@ -236,7 +236,7 @@
           <w:r>
             <w:fldChar w:fldCharType="separate"/>
           </w:r>
-          <w:hyperlink w:anchor="_Toc223885290" w:history="1">
+          <w:hyperlink w:anchor="_Toc223886348" w:history="1">
             <w:r>
               <w:rPr>
                 <w:rStyle w:val="Hyperlink"/>
@@ -263,7 +263,7 @@
                 <w:noProof/>
                 <w:webHidden/>
               </w:rPr>
-              <w:instrText xml:space="preserve"> PAGEREF _Toc223885290 \h </w:instrText>
+              <w:instrText xml:space="preserve"> PAGEREF _Toc223886348 \h </w:instrText>
             </w:r>
             <w:r>
               <w:rPr>
@@ -308,7 +308,7 @@
               <w:lang w:eastAsia="en-GB"/>
             </w:rPr>
           </w:pPr>
-          <w:hyperlink w:anchor="_Toc223885291" w:history="1">
+          <w:hyperlink w:anchor="_Toc223886349" w:history="1">
             <w:r>
               <w:rPr>
                 <w:rStyle w:val="Hyperlink"/>
@@ -335,7 +335,7 @@
                 <w:noProof/>
                 <w:webHidden/>
               </w:rPr>
-              <w:instrText xml:space="preserve"> PAGEREF _Toc223885291 \h </w:instrText>
+              <w:instrText xml:space="preserve"> PAGEREF _Toc223886349 \h </w:instrText>
             </w:r>
             <w:r>
               <w:rPr>
@@ -380,7 +380,7 @@
               <w:lang w:eastAsia="en-GB"/>
             </w:rPr>
           </w:pPr>
-          <w:hyperlink w:anchor="_Toc223885292" w:history="1">
+          <w:hyperlink w:anchor="_Toc223886350" w:history="1">
             <w:r>
               <w:rPr>
                 <w:rStyle w:val="Hyperlink"/>
@@ -407,7 +407,7 @@
                 <w:noProof/>
                 <w:webHidden/>
               </w:rPr>
-              <w:instrText xml:space="preserve"> PAGEREF _Toc223885292 \h </w:instrText>
+              <w:instrText xml:space="preserve"> PAGEREF _Toc223886350 \h </w:instrText>
             </w:r>
             <w:r>
               <w:rPr>
@@ -452,7 +452,7 @@
               <w:lang w:eastAsia="en-GB"/>
             </w:rPr>
           </w:pPr>
-          <w:hyperlink w:anchor="_Toc223885293" w:history="1">
+          <w:hyperlink w:anchor="_Toc223886351" w:history="1">
             <w:r>
               <w:rPr>
                 <w:rStyle w:val="Hyperlink"/>
@@ -479,7 +479,7 @@
                 <w:noProof/>
                 <w:webHidden/>
               </w:rPr>
-              <w:instrText xml:space="preserve"> PAGEREF _Toc223885293 \h </w:instrText>
+              <w:instrText xml:space="preserve"> PAGEREF _Toc223886351 \h </w:instrText>
             </w:r>
             <w:r>
               <w:rPr>
@@ -524,7 +524,7 @@
               <w:lang w:eastAsia="en-GB"/>
             </w:rPr>
           </w:pPr>
-          <w:hyperlink w:anchor="_Toc223885294" w:history="1">
+          <w:hyperlink w:anchor="_Toc223886352" w:history="1">
             <w:r>
               <w:rPr>
                 <w:rStyle w:val="Hyperlink"/>
@@ -551,7 +551,7 @@
                 <w:noProof/>
                 <w:webHidden/>
               </w:rPr>
-              <w:instrText xml:space="preserve"> PAGEREF _Toc223885294 \h </w:instrText>
+              <w:instrText xml:space="preserve"> PAGEREF _Toc223886352 \h </w:instrText>
             </w:r>
             <w:r>
               <w:rPr>
@@ -596,7 +596,7 @@
               <w:lang w:eastAsia="en-GB"/>
             </w:rPr>
           </w:pPr>
-          <w:hyperlink w:anchor="_Toc223885295" w:history="1">
+          <w:hyperlink w:anchor="_Toc223886353" w:history="1">
             <w:r>
               <w:rPr>
                 <w:rStyle w:val="Hyperlink"/>
@@ -623,7 +623,7 @@
                 <w:noProof/>
                 <w:webHidden/>
               </w:rPr>
-              <w:instrText xml:space="preserve"> PAGEREF _Toc223885295 \h </w:instrText>
+              <w:instrText xml:space="preserve"> PAGEREF _Toc223886353 \h </w:instrText>
             </w:r>
             <w:r>
               <w:rPr>
@@ -668,7 +668,7 @@
               <w:lang w:eastAsia="en-GB"/>
             </w:rPr>
           </w:pPr>
-          <w:hyperlink w:anchor="_Toc223885296" w:history="1">
+          <w:hyperlink w:anchor="_Toc223886354" w:history="1">
             <w:r>
               <w:rPr>
                 <w:rStyle w:val="Hyperlink"/>
@@ -695,7 +695,7 @@
                 <w:noProof/>
                 <w:webHidden/>
               </w:rPr>
-              <w:instrText xml:space="preserve"> PAGEREF _Toc223885296 \h </w:instrText>
+              <w:instrText xml:space="preserve"> PAGEREF _Toc223886354 \h </w:instrText>
             </w:r>
             <w:r>
               <w:rPr>
@@ -740,7 +740,7 @@
               <w:lang w:eastAsia="en-GB"/>
             </w:rPr>
           </w:pPr>
-          <w:hyperlink w:anchor="_Toc223885297" w:history="1">
+          <w:hyperlink w:anchor="_Toc223886355" w:history="1">
             <w:r>
               <w:rPr>
                 <w:rStyle w:val="Hyperlink"/>
@@ -767,7 +767,7 @@
                 <w:noProof/>
                 <w:webHidden/>
               </w:rPr>
-              <w:instrText xml:space="preserve"> PAGEREF _Toc223885297 \h </w:instrText>
+              <w:instrText xml:space="preserve"> PAGEREF _Toc223886355 \h </w:instrText>
             </w:r>
             <w:r>
               <w:rPr>
@@ -812,7 +812,7 @@
               <w:lang w:eastAsia="en-GB"/>
             </w:rPr>
           </w:pPr>
-          <w:hyperlink w:anchor="_Toc223885298" w:history="1">
+          <w:hyperlink w:anchor="_Toc223886356" w:history="1">
             <w:r>
               <w:rPr>
                 <w:rStyle w:val="Hyperlink"/>
@@ -839,7 +839,7 @@
                 <w:noProof/>
                 <w:webHidden/>
               </w:rPr>
-              <w:instrText xml:space="preserve"> PAGEREF _Toc223885298 \h </w:instrText>
+              <w:instrText xml:space="preserve"> PAGEREF _Toc223886356 \h </w:instrText>
             </w:r>
             <w:r>
               <w:rPr>
@@ -884,7 +884,7 @@
               <w:lang w:eastAsia="en-GB"/>
             </w:rPr>
           </w:pPr>
-          <w:hyperlink w:anchor="_Toc223885299" w:history="1">
+          <w:hyperlink w:anchor="_Toc223886357" w:history="1">
             <w:r>
               <w:rPr>
                 <w:rStyle w:val="Hyperlink"/>
@@ -911,7 +911,7 @@
                 <w:noProof/>
                 <w:webHidden/>
               </w:rPr>
-              <w:instrText xml:space="preserve"> PAGEREF _Toc223885299 \h </w:instrText>
+              <w:instrText xml:space="preserve"> PAGEREF _Toc223886357 \h </w:instrText>
             </w:r>
             <w:r>
               <w:rPr>
@@ -956,7 +956,7 @@
               <w:lang w:eastAsia="en-GB"/>
             </w:rPr>
           </w:pPr>
-          <w:hyperlink w:anchor="_Toc223885300" w:history="1">
+          <w:hyperlink w:anchor="_Toc223886358" w:history="1">
             <w:r>
               <w:rPr>
                 <w:rStyle w:val="Hyperlink"/>
@@ -983,7 +983,7 @@
                 <w:noProof/>
                 <w:webHidden/>
               </w:rPr>
-              <w:instrText xml:space="preserve"> PAGEREF _Toc223885300 \h </w:instrText>
+              <w:instrText xml:space="preserve"> PAGEREF _Toc223886358 \h </w:instrText>
             </w:r>
             <w:r>
               <w:rPr>
@@ -1028,7 +1028,7 @@
               <w:lang w:eastAsia="en-GB"/>
             </w:rPr>
           </w:pPr>
-          <w:hyperlink w:anchor="_Toc223885301" w:history="1">
+          <w:hyperlink w:anchor="_Toc223886359" w:history="1">
             <w:r>
               <w:rPr>
                 <w:rStyle w:val="Hyperlink"/>
@@ -1055,7 +1055,7 @@
                 <w:noProof/>
                 <w:webHidden/>
               </w:rPr>
-              <w:instrText xml:space="preserve"> PAGEREF _Toc223885301 \h </w:instrText>
+              <w:instrText xml:space="preserve"> PAGEREF _Toc223886359 \h </w:instrText>
             </w:r>
             <w:r>
               <w:rPr>
@@ -1100,7 +1100,7 @@
               <w:lang w:eastAsia="en-GB"/>
             </w:rPr>
           </w:pPr>
-          <w:hyperlink w:anchor="_Toc223885302" w:history="1">
+          <w:hyperlink w:anchor="_Toc223886360" w:history="1">
             <w:r>
               <w:rPr>
                 <w:rStyle w:val="Hyperlink"/>
@@ -1127,7 +1127,7 @@
                 <w:noProof/>
                 <w:webHidden/>
               </w:rPr>
-              <w:instrText xml:space="preserve"> PAGEREF _Toc223885302 \h </w:instrText>
+              <w:instrText xml:space="preserve"> PAGEREF _Toc223886360 \h </w:instrText>
             </w:r>
             <w:r>
               <w:rPr>
@@ -1172,7 +1172,7 @@
               <w:lang w:eastAsia="en-GB"/>
             </w:rPr>
           </w:pPr>
-          <w:hyperlink w:anchor="_Toc223885303" w:history="1">
+          <w:hyperlink w:anchor="_Toc223886361" w:history="1">
             <w:r>
               <w:rPr>
                 <w:rStyle w:val="Hyperlink"/>
@@ -1199,7 +1199,7 @@
                 <w:noProof/>
                 <w:webHidden/>
               </w:rPr>
-              <w:instrText xml:space="preserve"> PAGEREF _Toc223885303 \h </w:instrText>
+              <w:instrText xml:space="preserve"> PAGEREF _Toc223886361 \h </w:instrText>
             </w:r>
             <w:r>
               <w:rPr>
@@ -1244,7 +1244,7 @@
               <w:lang w:eastAsia="en-GB"/>
             </w:rPr>
           </w:pPr>
-          <w:hyperlink w:anchor="_Toc223885304" w:history="1">
+          <w:hyperlink w:anchor="_Toc223886362" w:history="1">
             <w:r>
               <w:rPr>
                 <w:rStyle w:val="Hyperlink"/>
@@ -1271,7 +1271,7 @@
                 <w:noProof/>
                 <w:webHidden/>
               </w:rPr>
-              <w:instrText xml:space="preserve"> PAGEREF _Toc223885304 \h </w:instrText>
+              <w:instrText xml:space="preserve"> PAGEREF _Toc223886362 \h </w:instrText>
             </w:r>
             <w:r>
               <w:rPr>
@@ -1316,7 +1316,7 @@
               <w:lang w:eastAsia="en-GB"/>
             </w:rPr>
           </w:pPr>
-          <w:hyperlink w:anchor="_Toc223885305" w:history="1">
+          <w:hyperlink w:anchor="_Toc223886363" w:history="1">
             <w:r>
               <w:rPr>
                 <w:rStyle w:val="Hyperlink"/>
@@ -1343,7 +1343,7 @@
                 <w:noProof/>
                 <w:webHidden/>
               </w:rPr>
-              <w:instrText xml:space="preserve"> PAGEREF _Toc223885305 \h </w:instrText>
+              <w:instrText xml:space="preserve"> PAGEREF _Toc223886363 \h </w:instrText>
             </w:r>
             <w:r>
               <w:rPr>
@@ -1388,7 +1388,7 @@
               <w:lang w:eastAsia="en-GB"/>
             </w:rPr>
           </w:pPr>
-          <w:hyperlink w:anchor="_Toc223885306" w:history="1">
+          <w:hyperlink w:anchor="_Toc223886364" w:history="1">
             <w:r>
               <w:rPr>
                 <w:rStyle w:val="Hyperlink"/>
@@ -1415,7 +1415,7 @@
                 <w:noProof/>
                 <w:webHidden/>
               </w:rPr>
-              <w:instrText xml:space="preserve"> PAGEREF _Toc223885306 \h </w:instrText>
+              <w:instrText xml:space="preserve"> PAGEREF _Toc223886364 \h </w:instrText>
             </w:r>
             <w:r>
               <w:rPr>
@@ -1460,7 +1460,7 @@
               <w:lang w:eastAsia="en-GB"/>
             </w:rPr>
           </w:pPr>
-          <w:hyperlink w:anchor="_Toc223885307" w:history="1">
+          <w:hyperlink w:anchor="_Toc223886365" w:history="1">
             <w:r>
               <w:rPr>
                 <w:rStyle w:val="Hyperlink"/>
@@ -1487,7 +1487,7 @@
                 <w:noProof/>
                 <w:webHidden/>
               </w:rPr>
-              <w:instrText xml:space="preserve"> PAGEREF _Toc223885307 \h </w:instrText>
+              <w:instrText xml:space="preserve"> PAGEREF _Toc223886365 \h </w:instrText>
             </w:r>
             <w:r>
               <w:rPr>
@@ -1532,7 +1532,7 @@
               <w:lang w:eastAsia="en-GB"/>
             </w:rPr>
           </w:pPr>
-          <w:hyperlink w:anchor="_Toc223885308" w:history="1">
+          <w:hyperlink w:anchor="_Toc223886366" w:history="1">
             <w:r>
               <w:rPr>
                 <w:rStyle w:val="Hyperlink"/>
@@ -1559,7 +1559,7 @@
                 <w:noProof/>
                 <w:webHidden/>
               </w:rPr>
-              <w:instrText xml:space="preserve"> PAGEREF _Toc223885308 \h </w:instrText>
+              <w:instrText xml:space="preserve"> PAGEREF _Toc223886366 \h </w:instrText>
             </w:r>
             <w:r>
               <w:rPr>
@@ -1604,7 +1604,7 @@
               <w:lang w:eastAsia="en-GB"/>
             </w:rPr>
           </w:pPr>
-          <w:hyperlink w:anchor="_Toc223885309" w:history="1">
+          <w:hyperlink w:anchor="_Toc223886367" w:history="1">
             <w:r>
               <w:rPr>
                 <w:rStyle w:val="Hyperlink"/>
@@ -1631,7 +1631,7 @@
                 <w:noProof/>
                 <w:webHidden/>
               </w:rPr>
-              <w:instrText xml:space="preserve"> PAGEREF _Toc223885309 \h </w:instrText>
+              <w:instrText xml:space="preserve"> PAGEREF _Toc223886367 \h </w:instrText>
             </w:r>
             <w:r>
               <w:rPr>
@@ -1676,7 +1676,7 @@
               <w:lang w:eastAsia="en-GB"/>
             </w:rPr>
           </w:pPr>
-          <w:hyperlink w:anchor="_Toc223885310" w:history="1">
+          <w:hyperlink w:anchor="_Toc223886368" w:history="1">
             <w:r>
               <w:rPr>
                 <w:rStyle w:val="Hyperlink"/>
@@ -1703,7 +1703,7 @@
                 <w:noProof/>
                 <w:webHidden/>
               </w:rPr>
-              <w:instrText xml:space="preserve"> PAGEREF _Toc223885310 \h </w:instrText>
+              <w:instrText xml:space="preserve"> PAGEREF _Toc223886368 \h </w:instrText>
             </w:r>
             <w:r>
               <w:rPr>
@@ -1748,7 +1748,7 @@
               <w:lang w:eastAsia="en-GB"/>
             </w:rPr>
           </w:pPr>
-          <w:hyperlink w:anchor="_Toc223885311" w:history="1">
+          <w:hyperlink w:anchor="_Toc223886369" w:history="1">
             <w:r>
               <w:rPr>
                 <w:rStyle w:val="Hyperlink"/>
@@ -1775,7 +1775,7 @@
                 <w:noProof/>
                 <w:webHidden/>
               </w:rPr>
-              <w:instrText xml:space="preserve"> PAGEREF _Toc223885311 \h </w:instrText>
+              <w:instrText xml:space="preserve"> PAGEREF _Toc223886369 \h </w:instrText>
             </w:r>
             <w:r>
               <w:rPr>
@@ -1820,7 +1820,7 @@
               <w:lang w:eastAsia="en-GB"/>
             </w:rPr>
           </w:pPr>
-          <w:hyperlink w:anchor="_Toc223885312" w:history="1">
+          <w:hyperlink w:anchor="_Toc223886370" w:history="1">
             <w:r>
               <w:rPr>
                 <w:rStyle w:val="Hyperlink"/>
@@ -1847,7 +1847,7 @@
                 <w:noProof/>
                 <w:webHidden/>
               </w:rPr>
-              <w:instrText xml:space="preserve"> PAGEREF _Toc223885312 \h </w:instrText>
+              <w:instrText xml:space="preserve"> PAGEREF _Toc223886370 \h </w:instrText>
             </w:r>
             <w:r>
               <w:rPr>
@@ -1892,7 +1892,7 @@
               <w:lang w:eastAsia="en-GB"/>
             </w:rPr>
           </w:pPr>
-          <w:hyperlink w:anchor="_Toc223885313" w:history="1">
+          <w:hyperlink w:anchor="_Toc223886371" w:history="1">
             <w:r>
               <w:rPr>
                 <w:rStyle w:val="Hyperlink"/>
@@ -1919,7 +1919,7 @@
                 <w:noProof/>
                 <w:webHidden/>
               </w:rPr>
-              <w:instrText xml:space="preserve"> PAGEREF _Toc223885313 \h </w:instrText>
+              <w:instrText xml:space="preserve"> PAGEREF _Toc223886371 \h </w:instrText>
             </w:r>
             <w:r>
               <w:rPr>
@@ -1964,7 +1964,7 @@
               <w:lang w:eastAsia="en-GB"/>
             </w:rPr>
           </w:pPr>
-          <w:hyperlink w:anchor="_Toc223885314" w:history="1">
+          <w:hyperlink w:anchor="_Toc223886372" w:history="1">
             <w:r>
               <w:rPr>
                 <w:rStyle w:val="Hyperlink"/>
@@ -1991,7 +1991,7 @@
                 <w:noProof/>
                 <w:webHidden/>
               </w:rPr>
-              <w:instrText xml:space="preserve"> PAGEREF _Toc223885314 \h </w:instrText>
+              <w:instrText xml:space="preserve"> PAGEREF _Toc223886372 \h </w:instrText>
             </w:r>
             <w:r>
               <w:rPr>
@@ -2036,7 +2036,7 @@
               <w:lang w:eastAsia="en-GB"/>
             </w:rPr>
           </w:pPr>
-          <w:hyperlink w:anchor="_Toc223885315" w:history="1">
+          <w:hyperlink w:anchor="_Toc223886373" w:history="1">
             <w:r>
               <w:rPr>
                 <w:rStyle w:val="Hyperlink"/>
@@ -2063,7 +2063,7 @@
                 <w:noProof/>
                 <w:webHidden/>
               </w:rPr>
-              <w:instrText xml:space="preserve"> PAGEREF _Toc223885315 \h </w:instrText>
+              <w:instrText xml:space="preserve"> PAGEREF _Toc223886373 \h </w:instrText>
             </w:r>
             <w:r>
               <w:rPr>
@@ -2108,7 +2108,7 @@
               <w:lang w:eastAsia="en-GB"/>
             </w:rPr>
           </w:pPr>
-          <w:hyperlink w:anchor="_Toc223885316" w:history="1">
+          <w:hyperlink w:anchor="_Toc223886374" w:history="1">
             <w:r>
               <w:rPr>
                 <w:rStyle w:val="Hyperlink"/>
@@ -2135,7 +2135,7 @@
                 <w:noProof/>
                 <w:webHidden/>
               </w:rPr>
-              <w:instrText xml:space="preserve"> PAGEREF _Toc223885316 \h </w:instrText>
+              <w:instrText xml:space="preserve"> PAGEREF _Toc223886374 \h </w:instrText>
             </w:r>
             <w:r>
               <w:rPr>
@@ -2180,7 +2180,7 @@
               <w:lang w:eastAsia="en-GB"/>
             </w:rPr>
           </w:pPr>
-          <w:hyperlink w:anchor="_Toc223885317" w:history="1">
+          <w:hyperlink w:anchor="_Toc223886375" w:history="1">
             <w:r>
               <w:rPr>
                 <w:rStyle w:val="Hyperlink"/>
@@ -2207,7 +2207,7 @@
                 <w:noProof/>
                 <w:webHidden/>
               </w:rPr>
-              <w:instrText xml:space="preserve"> PAGEREF _Toc223885317 \h </w:instrText>
+              <w:instrText xml:space="preserve"> PAGEREF _Toc223886375 \h </w:instrText>
             </w:r>
             <w:r>
               <w:rPr>
@@ -2252,7 +2252,7 @@
               <w:lang w:eastAsia="en-GB"/>
             </w:rPr>
           </w:pPr>
-          <w:hyperlink w:anchor="_Toc223885318" w:history="1">
+          <w:hyperlink w:anchor="_Toc223886376" w:history="1">
             <w:r>
               <w:rPr>
                 <w:rStyle w:val="Hyperlink"/>
@@ -2279,7 +2279,7 @@
                 <w:noProof/>
                 <w:webHidden/>
               </w:rPr>
-              <w:instrText xml:space="preserve"> PAGEREF _Toc223885318 \h </w:instrText>
+              <w:instrText xml:space="preserve"> PAGEREF _Toc223886376 \h </w:instrText>
             </w:r>
             <w:r>
               <w:rPr>
@@ -2324,7 +2324,7 @@
               <w:lang w:eastAsia="en-GB"/>
             </w:rPr>
           </w:pPr>
-          <w:hyperlink w:anchor="_Toc223885319" w:history="1">
+          <w:hyperlink w:anchor="_Toc223886377" w:history="1">
             <w:r>
               <w:rPr>
                 <w:rStyle w:val="Hyperlink"/>
@@ -2351,7 +2351,7 @@
                 <w:noProof/>
                 <w:webHidden/>
               </w:rPr>
-              <w:instrText xml:space="preserve"> PAGEREF _Toc223885319 \h </w:instrText>
+              <w:instrText xml:space="preserve"> PAGEREF _Toc223886377 \h </w:instrText>
             </w:r>
             <w:r>
               <w:rPr>
@@ -2396,7 +2396,7 @@
               <w:lang w:eastAsia="en-GB"/>
             </w:rPr>
           </w:pPr>
-          <w:hyperlink w:anchor="_Toc223885320" w:history="1">
+          <w:hyperlink w:anchor="_Toc223886378" w:history="1">
             <w:r>
               <w:rPr>
                 <w:rStyle w:val="Hyperlink"/>
@@ -2423,7 +2423,7 @@
                 <w:noProof/>
                 <w:webHidden/>
               </w:rPr>
-              <w:instrText xml:space="preserve"> PAGEREF _Toc223885320 \h </w:instrText>
+              <w:instrText xml:space="preserve"> PAGEREF _Toc223886378 \h </w:instrText>
             </w:r>
             <w:r>
               <w:rPr>
@@ -2468,7 +2468,7 @@
               <w:lang w:eastAsia="en-GB"/>
             </w:rPr>
           </w:pPr>
-          <w:hyperlink w:anchor="_Toc223885321" w:history="1">
+          <w:hyperlink w:anchor="_Toc223886379" w:history="1">
             <w:r>
               <w:rPr>
                 <w:rStyle w:val="Hyperlink"/>
@@ -2495,7 +2495,223 @@
                 <w:noProof/>
                 <w:webHidden/>
               </w:rPr>
-              <w:instrText xml:space="preserve"> PAGEREF _Toc223885321 \h </w:instrText>
+              <w:instrText xml:space="preserve"> PAGEREF _Toc223886379 \h </w:instrText>
+            </w:r>
+            <w:r>
+              <w:rPr>
+                <w:noProof/>
+                <w:webHidden/>
+              </w:rPr>
+            </w:r>
+            <w:r>
+              <w:rPr>
+                <w:noProof/>
+                <w:webHidden/>
+              </w:rPr>
+              <w:fldChar w:fldCharType="separate"/>
+            </w:r>
+            <w:r>
+              <w:rPr>
+                <w:noProof/>
+                <w:webHidden/>
+              </w:rPr>
+              <w:t>20</w:t>
+            </w:r>
+            <w:r>
+              <w:rPr>
+                <w:noProof/>
+                <w:webHidden/>
+              </w:rPr>
+              <w:fldChar w:fldCharType="end"/>
+            </w:r>
+          </w:hyperlink>
+        </w:p>
+        <w:p>
+          <w:pPr>
+            <w:pStyle w:val="TOC3"/>
+            <w:tabs>
+              <w:tab w:val="right" w:leader="dot" w:pos="9016"/>
+            </w:tabs>
+            <w:rPr>
+              <w:rFonts w:eastAsiaTheme="minorEastAsia"/>
+              <w:noProof/>
+              <w:sz w:val="24"/>
+              <w:szCs w:val="24"/>
+              <w:lang w:eastAsia="en-GB"/>
+            </w:rPr>
+          </w:pPr>
+          <w:hyperlink w:anchor="_Toc223886380" w:history="1">
+            <w:r>
+              <w:rPr>
+                <w:rStyle w:val="Hyperlink"/>
+                <w:noProof/>
+              </w:rPr>
+              <w:t>Interaction Improvements</w:t>
+            </w:r>
+            <w:r>
+              <w:rPr>
+                <w:noProof/>
+                <w:webHidden/>
+              </w:rPr>
+              <w:tab/>
+            </w:r>
+            <w:r>
+              <w:rPr>
+                <w:noProof/>
+                <w:webHidden/>
+              </w:rPr>
+              <w:fldChar w:fldCharType="begin"/>
+            </w:r>
+            <w:r>
+              <w:rPr>
+                <w:noProof/>
+                <w:webHidden/>
+              </w:rPr>
+              <w:instrText xml:space="preserve"> PAGEREF _Toc223886380 \h </w:instrText>
+            </w:r>
+            <w:r>
+              <w:rPr>
+                <w:noProof/>
+                <w:webHidden/>
+              </w:rPr>
+            </w:r>
+            <w:r>
+              <w:rPr>
+                <w:noProof/>
+                <w:webHidden/>
+              </w:rPr>
+              <w:fldChar w:fldCharType="separate"/>
+            </w:r>
+            <w:r>
+              <w:rPr>
+                <w:noProof/>
+                <w:webHidden/>
+              </w:rPr>
+              <w:t>20</w:t>
+            </w:r>
+            <w:r>
+              <w:rPr>
+                <w:noProof/>
+                <w:webHidden/>
+              </w:rPr>
+              <w:fldChar w:fldCharType="end"/>
+            </w:r>
+          </w:hyperlink>
+        </w:p>
+        <w:p>
+          <w:pPr>
+            <w:pStyle w:val="TOC3"/>
+            <w:tabs>
+              <w:tab w:val="right" w:leader="dot" w:pos="9016"/>
+            </w:tabs>
+            <w:rPr>
+              <w:rFonts w:eastAsiaTheme="minorEastAsia"/>
+              <w:noProof/>
+              <w:sz w:val="24"/>
+              <w:szCs w:val="24"/>
+              <w:lang w:eastAsia="en-GB"/>
+            </w:rPr>
+          </w:pPr>
+          <w:hyperlink w:anchor="_Toc223886381" w:history="1">
+            <w:r>
+              <w:rPr>
+                <w:rStyle w:val="Hyperlink"/>
+                <w:noProof/>
+              </w:rPr>
+              <w:t>Objective Flow Tweaks</w:t>
+            </w:r>
+            <w:r>
+              <w:rPr>
+                <w:noProof/>
+                <w:webHidden/>
+              </w:rPr>
+              <w:tab/>
+            </w:r>
+            <w:r>
+              <w:rPr>
+                <w:noProof/>
+                <w:webHidden/>
+              </w:rPr>
+              <w:fldChar w:fldCharType="begin"/>
+            </w:r>
+            <w:r>
+              <w:rPr>
+                <w:noProof/>
+                <w:webHidden/>
+              </w:rPr>
+              <w:instrText xml:space="preserve"> PAGEREF _Toc223886381 \h </w:instrText>
+            </w:r>
+            <w:r>
+              <w:rPr>
+                <w:noProof/>
+                <w:webHidden/>
+              </w:rPr>
+            </w:r>
+            <w:r>
+              <w:rPr>
+                <w:noProof/>
+                <w:webHidden/>
+              </w:rPr>
+              <w:fldChar w:fldCharType="separate"/>
+            </w:r>
+            <w:r>
+              <w:rPr>
+                <w:noProof/>
+                <w:webHidden/>
+              </w:rPr>
+              <w:t>20</w:t>
+            </w:r>
+            <w:r>
+              <w:rPr>
+                <w:noProof/>
+                <w:webHidden/>
+              </w:rPr>
+              <w:fldChar w:fldCharType="end"/>
+            </w:r>
+          </w:hyperlink>
+        </w:p>
+        <w:p>
+          <w:pPr>
+            <w:pStyle w:val="TOC3"/>
+            <w:tabs>
+              <w:tab w:val="right" w:leader="dot" w:pos="9016"/>
+            </w:tabs>
+            <w:rPr>
+              <w:rFonts w:eastAsiaTheme="minorEastAsia"/>
+              <w:noProof/>
+              <w:sz w:val="24"/>
+              <w:szCs w:val="24"/>
+              <w:lang w:eastAsia="en-GB"/>
+            </w:rPr>
+          </w:pPr>
+          <w:hyperlink w:anchor="_Toc223886382" w:history="1">
+            <w:r>
+              <w:rPr>
+                <w:rStyle w:val="Hyperlink"/>
+                <w:noProof/>
+              </w:rPr>
+              <w:t>Gaze Detection Refinements</w:t>
+            </w:r>
+            <w:r>
+              <w:rPr>
+                <w:noProof/>
+                <w:webHidden/>
+              </w:rPr>
+              <w:tab/>
+            </w:r>
+            <w:r>
+              <w:rPr>
+                <w:noProof/>
+                <w:webHidden/>
+              </w:rPr>
+              <w:fldChar w:fldCharType="begin"/>
+            </w:r>
+            <w:r>
+              <w:rPr>
+                <w:noProof/>
+                <w:webHidden/>
+              </w:rPr>
+              <w:instrText xml:space="preserve"> PAGEREF _Toc223886382 \h </w:instrText>
             </w:r>
             <w:r>
               <w:rPr>
@@ -2540,7 +2756,7 @@
               <w:lang w:eastAsia="en-GB"/>
             </w:rPr>
           </w:pPr>
-          <w:hyperlink w:anchor="_Toc223885322" w:history="1">
+          <w:hyperlink w:anchor="_Toc223886383" w:history="1">
             <w:r>
               <w:rPr>
                 <w:rStyle w:val="Hyperlink"/>
@@ -2567,7 +2783,7 @@
                 <w:noProof/>
                 <w:webHidden/>
               </w:rPr>
-              <w:instrText xml:space="preserve"> PAGEREF _Toc223885322 \h </w:instrText>
+              <w:instrText xml:space="preserve"> PAGEREF _Toc223886383 \h </w:instrText>
             </w:r>
             <w:r>
               <w:rPr>
@@ -2612,7 +2828,7 @@
               <w:lang w:eastAsia="en-GB"/>
             </w:rPr>
           </w:pPr>
-          <w:hyperlink w:anchor="_Toc223885323" w:history="1">
+          <w:hyperlink w:anchor="_Toc223886384" w:history="1">
             <w:r>
               <w:rPr>
                 <w:rStyle w:val="Hyperlink"/>
@@ -2639,7 +2855,7 @@
                 <w:noProof/>
                 <w:webHidden/>
               </w:rPr>
-              <w:instrText xml:space="preserve"> PAGEREF _Toc223885323 \h </w:instrText>
+              <w:instrText xml:space="preserve"> PAGEREF _Toc223886384 \h </w:instrText>
             </w:r>
             <w:r>
               <w:rPr>
@@ -2684,7 +2900,7 @@
               <w:lang w:eastAsia="en-GB"/>
             </w:rPr>
           </w:pPr>
-          <w:hyperlink w:anchor="_Toc223885324" w:history="1">
+          <w:hyperlink w:anchor="_Toc223886385" w:history="1">
             <w:r>
               <w:rPr>
                 <w:rStyle w:val="Hyperlink"/>
@@ -2711,7 +2927,7 @@
                 <w:noProof/>
                 <w:webHidden/>
               </w:rPr>
-              <w:instrText xml:space="preserve"> PAGEREF _Toc223885324 \h </w:instrText>
+              <w:instrText xml:space="preserve"> PAGEREF _Toc223886385 \h </w:instrText>
             </w:r>
             <w:r>
               <w:rPr>
@@ -2756,7 +2972,7 @@
               <w:lang w:eastAsia="en-GB"/>
             </w:rPr>
           </w:pPr>
-          <w:hyperlink w:anchor="_Toc223885325" w:history="1">
+          <w:hyperlink w:anchor="_Toc223886386" w:history="1">
             <w:r>
               <w:rPr>
                 <w:rStyle w:val="Hyperlink"/>
@@ -2783,7 +2999,7 @@
                 <w:noProof/>
                 <w:webHidden/>
               </w:rPr>
-              <w:instrText xml:space="preserve"> PAGEREF _Toc223885325 \h </w:instrText>
+              <w:instrText xml:space="preserve"> PAGEREF _Toc223886386 \h </w:instrText>
             </w:r>
             <w:r>
               <w:rPr>
@@ -2828,7 +3044,7 @@
               <w:lang w:eastAsia="en-GB"/>
             </w:rPr>
           </w:pPr>
-          <w:hyperlink w:anchor="_Toc223885326" w:history="1">
+          <w:hyperlink w:anchor="_Toc223886387" w:history="1">
             <w:r>
               <w:rPr>
                 <w:rStyle w:val="Hyperlink"/>
@@ -2855,7 +3071,7 @@
                 <w:noProof/>
                 <w:webHidden/>
               </w:rPr>
-              <w:instrText xml:space="preserve"> PAGEREF _Toc223885326 \h </w:instrText>
+              <w:instrText xml:space="preserve"> PAGEREF _Toc223886387 \h </w:instrText>
             </w:r>
             <w:r>
               <w:rPr>
@@ -2900,7 +3116,7 @@
               <w:lang w:eastAsia="en-GB"/>
             </w:rPr>
           </w:pPr>
-          <w:hyperlink w:anchor="_Toc223885327" w:history="1">
+          <w:hyperlink w:anchor="_Toc223886388" w:history="1">
             <w:r>
               <w:rPr>
                 <w:rStyle w:val="Hyperlink"/>
@@ -2927,7 +3143,7 @@
                 <w:noProof/>
                 <w:webHidden/>
               </w:rPr>
-              <w:instrText xml:space="preserve"> PAGEREF _Toc223885327 \h </w:instrText>
+              <w:instrText xml:space="preserve"> PAGEREF _Toc223886388 \h </w:instrText>
             </w:r>
             <w:r>
               <w:rPr>
@@ -2948,6 +3164,582 @@
                 <w:webHidden/>
               </w:rPr>
               <w:t>22</w:t>
+            </w:r>
+            <w:r>
+              <w:rPr>
+                <w:noProof/>
+                <w:webHidden/>
+              </w:rPr>
+              <w:fldChar w:fldCharType="end"/>
+            </w:r>
+          </w:hyperlink>
+        </w:p>
+        <w:p>
+          <w:pPr>
+            <w:pStyle w:val="TOC3"/>
+            <w:tabs>
+              <w:tab w:val="right" w:leader="dot" w:pos="9016"/>
+            </w:tabs>
+            <w:rPr>
+              <w:rFonts w:eastAsiaTheme="minorEastAsia"/>
+              <w:noProof/>
+              <w:sz w:val="24"/>
+              <w:szCs w:val="24"/>
+              <w:lang w:eastAsia="en-GB"/>
+            </w:rPr>
+          </w:pPr>
+          <w:hyperlink w:anchor="_Toc223886389" w:history="1">
+            <w:r>
+              <w:rPr>
+                <w:rStyle w:val="Hyperlink"/>
+                <w:noProof/>
+              </w:rPr>
+              <w:t>Final Version Tests</w:t>
+            </w:r>
+            <w:r>
+              <w:rPr>
+                <w:noProof/>
+                <w:webHidden/>
+              </w:rPr>
+              <w:tab/>
+            </w:r>
+            <w:r>
+              <w:rPr>
+                <w:noProof/>
+                <w:webHidden/>
+              </w:rPr>
+              <w:fldChar w:fldCharType="begin"/>
+            </w:r>
+            <w:r>
+              <w:rPr>
+                <w:noProof/>
+                <w:webHidden/>
+              </w:rPr>
+              <w:instrText xml:space="preserve"> PAGEREF _Toc223886389 \h </w:instrText>
+            </w:r>
+            <w:r>
+              <w:rPr>
+                <w:noProof/>
+                <w:webHidden/>
+              </w:rPr>
+            </w:r>
+            <w:r>
+              <w:rPr>
+                <w:noProof/>
+                <w:webHidden/>
+              </w:rPr>
+              <w:fldChar w:fldCharType="separate"/>
+            </w:r>
+            <w:r>
+              <w:rPr>
+                <w:noProof/>
+                <w:webHidden/>
+              </w:rPr>
+              <w:t>23</w:t>
+            </w:r>
+            <w:r>
+              <w:rPr>
+                <w:noProof/>
+                <w:webHidden/>
+              </w:rPr>
+              <w:fldChar w:fldCharType="end"/>
+            </w:r>
+          </w:hyperlink>
+        </w:p>
+        <w:p>
+          <w:pPr>
+            <w:pStyle w:val="TOC3"/>
+            <w:tabs>
+              <w:tab w:val="right" w:leader="dot" w:pos="9016"/>
+            </w:tabs>
+            <w:rPr>
+              <w:rFonts w:eastAsiaTheme="minorEastAsia"/>
+              <w:noProof/>
+              <w:sz w:val="24"/>
+              <w:szCs w:val="24"/>
+              <w:lang w:eastAsia="en-GB"/>
+            </w:rPr>
+          </w:pPr>
+          <w:hyperlink w:anchor="_Toc223886390" w:history="1">
+            <w:r>
+              <w:rPr>
+                <w:rStyle w:val="Hyperlink"/>
+                <w:noProof/>
+              </w:rPr>
+              <w:t>Interaction Objects and Objective Understanding</w:t>
+            </w:r>
+            <w:r>
+              <w:rPr>
+                <w:noProof/>
+                <w:webHidden/>
+              </w:rPr>
+              <w:tab/>
+            </w:r>
+            <w:r>
+              <w:rPr>
+                <w:noProof/>
+                <w:webHidden/>
+              </w:rPr>
+              <w:fldChar w:fldCharType="begin"/>
+            </w:r>
+            <w:r>
+              <w:rPr>
+                <w:noProof/>
+                <w:webHidden/>
+              </w:rPr>
+              <w:instrText xml:space="preserve"> PAGEREF _Toc223886390 \h </w:instrText>
+            </w:r>
+            <w:r>
+              <w:rPr>
+                <w:noProof/>
+                <w:webHidden/>
+              </w:rPr>
+            </w:r>
+            <w:r>
+              <w:rPr>
+                <w:noProof/>
+                <w:webHidden/>
+              </w:rPr>
+              <w:fldChar w:fldCharType="separate"/>
+            </w:r>
+            <w:r>
+              <w:rPr>
+                <w:noProof/>
+                <w:webHidden/>
+              </w:rPr>
+              <w:t>23</w:t>
+            </w:r>
+            <w:r>
+              <w:rPr>
+                <w:noProof/>
+                <w:webHidden/>
+              </w:rPr>
+              <w:fldChar w:fldCharType="end"/>
+            </w:r>
+          </w:hyperlink>
+        </w:p>
+        <w:p>
+          <w:pPr>
+            <w:pStyle w:val="TOC3"/>
+            <w:tabs>
+              <w:tab w:val="right" w:leader="dot" w:pos="9016"/>
+            </w:tabs>
+            <w:rPr>
+              <w:rFonts w:eastAsiaTheme="minorEastAsia"/>
+              <w:noProof/>
+              <w:sz w:val="24"/>
+              <w:szCs w:val="24"/>
+              <w:lang w:eastAsia="en-GB"/>
+            </w:rPr>
+          </w:pPr>
+          <w:hyperlink w:anchor="_Toc223886391" w:history="1">
+            <w:r>
+              <w:rPr>
+                <w:rStyle w:val="Hyperlink"/>
+                <w:noProof/>
+              </w:rPr>
+              <w:t>User Attention Detection</w:t>
+            </w:r>
+            <w:r>
+              <w:rPr>
+                <w:noProof/>
+                <w:webHidden/>
+              </w:rPr>
+              <w:tab/>
+            </w:r>
+            <w:r>
+              <w:rPr>
+                <w:noProof/>
+                <w:webHidden/>
+              </w:rPr>
+              <w:fldChar w:fldCharType="begin"/>
+            </w:r>
+            <w:r>
+              <w:rPr>
+                <w:noProof/>
+                <w:webHidden/>
+              </w:rPr>
+              <w:instrText xml:space="preserve"> PAGEREF _Toc223886391 \h </w:instrText>
+            </w:r>
+            <w:r>
+              <w:rPr>
+                <w:noProof/>
+                <w:webHidden/>
+              </w:rPr>
+            </w:r>
+            <w:r>
+              <w:rPr>
+                <w:noProof/>
+                <w:webHidden/>
+              </w:rPr>
+              <w:fldChar w:fldCharType="separate"/>
+            </w:r>
+            <w:r>
+              <w:rPr>
+                <w:noProof/>
+                <w:webHidden/>
+              </w:rPr>
+              <w:t>23</w:t>
+            </w:r>
+            <w:r>
+              <w:rPr>
+                <w:noProof/>
+                <w:webHidden/>
+              </w:rPr>
+              <w:fldChar w:fldCharType="end"/>
+            </w:r>
+          </w:hyperlink>
+        </w:p>
+        <w:p>
+          <w:pPr>
+            <w:pStyle w:val="TOC3"/>
+            <w:tabs>
+              <w:tab w:val="right" w:leader="dot" w:pos="9016"/>
+            </w:tabs>
+            <w:rPr>
+              <w:rFonts w:eastAsiaTheme="minorEastAsia"/>
+              <w:noProof/>
+              <w:sz w:val="24"/>
+              <w:szCs w:val="24"/>
+              <w:lang w:eastAsia="en-GB"/>
+            </w:rPr>
+          </w:pPr>
+          <w:hyperlink w:anchor="_Toc223886392" w:history="1">
+            <w:r>
+              <w:rPr>
+                <w:rStyle w:val="Hyperlink"/>
+                <w:noProof/>
+              </w:rPr>
+              <w:t>Symptom Simulations</w:t>
+            </w:r>
+            <w:r>
+              <w:rPr>
+                <w:noProof/>
+                <w:webHidden/>
+              </w:rPr>
+              <w:tab/>
+            </w:r>
+            <w:r>
+              <w:rPr>
+                <w:noProof/>
+                <w:webHidden/>
+              </w:rPr>
+              <w:fldChar w:fldCharType="begin"/>
+            </w:r>
+            <w:r>
+              <w:rPr>
+                <w:noProof/>
+                <w:webHidden/>
+              </w:rPr>
+              <w:instrText xml:space="preserve"> PAGEREF _Toc223886392 \h </w:instrText>
+            </w:r>
+            <w:r>
+              <w:rPr>
+                <w:noProof/>
+                <w:webHidden/>
+              </w:rPr>
+            </w:r>
+            <w:r>
+              <w:rPr>
+                <w:noProof/>
+                <w:webHidden/>
+              </w:rPr>
+              <w:fldChar w:fldCharType="separate"/>
+            </w:r>
+            <w:r>
+              <w:rPr>
+                <w:noProof/>
+                <w:webHidden/>
+              </w:rPr>
+              <w:t>23</w:t>
+            </w:r>
+            <w:r>
+              <w:rPr>
+                <w:noProof/>
+                <w:webHidden/>
+              </w:rPr>
+              <w:fldChar w:fldCharType="end"/>
+            </w:r>
+          </w:hyperlink>
+        </w:p>
+        <w:p>
+          <w:pPr>
+            <w:pStyle w:val="TOC1"/>
+            <w:tabs>
+              <w:tab w:val="right" w:leader="dot" w:pos="9016"/>
+            </w:tabs>
+            <w:rPr>
+              <w:rFonts w:eastAsiaTheme="minorEastAsia"/>
+              <w:noProof/>
+              <w:sz w:val="24"/>
+              <w:szCs w:val="24"/>
+              <w:lang w:eastAsia="en-GB"/>
+            </w:rPr>
+          </w:pPr>
+          <w:hyperlink w:anchor="_Toc223886393" w:history="1">
+            <w:r>
+              <w:rPr>
+                <w:rStyle w:val="Hyperlink"/>
+                <w:noProof/>
+              </w:rPr>
+              <w:t>Critical Evaluation</w:t>
+            </w:r>
+            <w:r>
+              <w:rPr>
+                <w:noProof/>
+                <w:webHidden/>
+              </w:rPr>
+              <w:tab/>
+            </w:r>
+            <w:r>
+              <w:rPr>
+                <w:noProof/>
+                <w:webHidden/>
+              </w:rPr>
+              <w:fldChar w:fldCharType="begin"/>
+            </w:r>
+            <w:r>
+              <w:rPr>
+                <w:noProof/>
+                <w:webHidden/>
+              </w:rPr>
+              <w:instrText xml:space="preserve"> PAGEREF _Toc223886393 \h </w:instrText>
+            </w:r>
+            <w:r>
+              <w:rPr>
+                <w:noProof/>
+                <w:webHidden/>
+              </w:rPr>
+            </w:r>
+            <w:r>
+              <w:rPr>
+                <w:noProof/>
+                <w:webHidden/>
+              </w:rPr>
+              <w:fldChar w:fldCharType="separate"/>
+            </w:r>
+            <w:r>
+              <w:rPr>
+                <w:noProof/>
+                <w:webHidden/>
+              </w:rPr>
+              <w:t>24</w:t>
+            </w:r>
+            <w:r>
+              <w:rPr>
+                <w:noProof/>
+                <w:webHidden/>
+              </w:rPr>
+              <w:fldChar w:fldCharType="end"/>
+            </w:r>
+          </w:hyperlink>
+        </w:p>
+        <w:p>
+          <w:pPr>
+            <w:pStyle w:val="TOC1"/>
+            <w:tabs>
+              <w:tab w:val="right" w:leader="dot" w:pos="9016"/>
+            </w:tabs>
+            <w:rPr>
+              <w:rFonts w:eastAsiaTheme="minorEastAsia"/>
+              <w:noProof/>
+              <w:sz w:val="24"/>
+              <w:szCs w:val="24"/>
+              <w:lang w:eastAsia="en-GB"/>
+            </w:rPr>
+          </w:pPr>
+          <w:hyperlink w:anchor="_Toc223886394" w:history="1">
+            <w:r>
+              <w:rPr>
+                <w:rStyle w:val="Hyperlink"/>
+                <w:noProof/>
+              </w:rPr>
+              <w:t>Conclusions and Future Work</w:t>
+            </w:r>
+            <w:r>
+              <w:rPr>
+                <w:noProof/>
+                <w:webHidden/>
+              </w:rPr>
+              <w:tab/>
+            </w:r>
+            <w:r>
+              <w:rPr>
+                <w:noProof/>
+                <w:webHidden/>
+              </w:rPr>
+              <w:fldChar w:fldCharType="begin"/>
+            </w:r>
+            <w:r>
+              <w:rPr>
+                <w:noProof/>
+                <w:webHidden/>
+              </w:rPr>
+              <w:instrText xml:space="preserve"> PAGEREF _Toc223886394 \h </w:instrText>
+            </w:r>
+            <w:r>
+              <w:rPr>
+                <w:noProof/>
+                <w:webHidden/>
+              </w:rPr>
+            </w:r>
+            <w:r>
+              <w:rPr>
+                <w:noProof/>
+                <w:webHidden/>
+              </w:rPr>
+              <w:fldChar w:fldCharType="separate"/>
+            </w:r>
+            <w:r>
+              <w:rPr>
+                <w:noProof/>
+                <w:webHidden/>
+              </w:rPr>
+              <w:t>25</w:t>
+            </w:r>
+            <w:r>
+              <w:rPr>
+                <w:noProof/>
+                <w:webHidden/>
+              </w:rPr>
+              <w:fldChar w:fldCharType="end"/>
+            </w:r>
+          </w:hyperlink>
+        </w:p>
+        <w:p>
+          <w:pPr>
+            <w:pStyle w:val="TOC1"/>
+            <w:tabs>
+              <w:tab w:val="right" w:leader="dot" w:pos="9016"/>
+            </w:tabs>
+            <w:rPr>
+              <w:rFonts w:eastAsiaTheme="minorEastAsia"/>
+              <w:noProof/>
+              <w:sz w:val="24"/>
+              <w:szCs w:val="24"/>
+              <w:lang w:eastAsia="en-GB"/>
+            </w:rPr>
+          </w:pPr>
+          <w:hyperlink w:anchor="_Toc223886395" w:history="1">
+            <w:r>
+              <w:rPr>
+                <w:rStyle w:val="Hyperlink"/>
+                <w:noProof/>
+              </w:rPr>
+              <w:t>References</w:t>
+            </w:r>
+            <w:r>
+              <w:rPr>
+                <w:noProof/>
+                <w:webHidden/>
+              </w:rPr>
+              <w:tab/>
+            </w:r>
+            <w:r>
+              <w:rPr>
+                <w:noProof/>
+                <w:webHidden/>
+              </w:rPr>
+              <w:fldChar w:fldCharType="begin"/>
+            </w:r>
+            <w:r>
+              <w:rPr>
+                <w:noProof/>
+                <w:webHidden/>
+              </w:rPr>
+              <w:instrText xml:space="preserve"> PAGEREF _Toc223886395 \h </w:instrText>
+            </w:r>
+            <w:r>
+              <w:rPr>
+                <w:noProof/>
+                <w:webHidden/>
+              </w:rPr>
+            </w:r>
+            <w:r>
+              <w:rPr>
+                <w:noProof/>
+                <w:webHidden/>
+              </w:rPr>
+              <w:fldChar w:fldCharType="separate"/>
+            </w:r>
+            <w:r>
+              <w:rPr>
+                <w:noProof/>
+                <w:webHidden/>
+              </w:rPr>
+              <w:t>26</w:t>
+            </w:r>
+            <w:r>
+              <w:rPr>
+                <w:noProof/>
+                <w:webHidden/>
+              </w:rPr>
+              <w:fldChar w:fldCharType="end"/>
+            </w:r>
+          </w:hyperlink>
+        </w:p>
+        <w:p>
+          <w:pPr>
+            <w:pStyle w:val="TOC1"/>
+            <w:tabs>
+              <w:tab w:val="right" w:leader="dot" w:pos="9016"/>
+            </w:tabs>
+            <w:rPr>
+              <w:rFonts w:eastAsiaTheme="minorEastAsia"/>
+              <w:noProof/>
+              <w:sz w:val="24"/>
+              <w:szCs w:val="24"/>
+              <w:lang w:eastAsia="en-GB"/>
+            </w:rPr>
+          </w:pPr>
+          <w:hyperlink w:anchor="_Toc223886396" w:history="1">
+            <w:r>
+              <w:rPr>
+                <w:rStyle w:val="Hyperlink"/>
+                <w:noProof/>
+              </w:rPr>
+              <w:t>Appendix</w:t>
+            </w:r>
+            <w:r>
+              <w:rPr>
+                <w:noProof/>
+                <w:webHidden/>
+              </w:rPr>
+              <w:tab/>
+            </w:r>
+            <w:r>
+              <w:rPr>
+                <w:noProof/>
+                <w:webHidden/>
+              </w:rPr>
+              <w:fldChar w:fldCharType="begin"/>
+            </w:r>
+            <w:r>
+              <w:rPr>
+                <w:noProof/>
+                <w:webHidden/>
+              </w:rPr>
+              <w:instrText xml:space="preserve"> PAGEREF _Toc223886396 \h </w:instrText>
+            </w:r>
+            <w:r>
+              <w:rPr>
+                <w:noProof/>
+                <w:webHidden/>
+              </w:rPr>
+            </w:r>
+            <w:r>
+              <w:rPr>
+                <w:noProof/>
+                <w:webHidden/>
+              </w:rPr>
+              <w:fldChar w:fldCharType="separate"/>
+            </w:r>
+            <w:r>
+              <w:rPr>
+                <w:noProof/>
+                <w:webHidden/>
+              </w:rPr>
+              <w:t>27</w:t>
             </w:r>
             <w:r>
               <w:rPr>
@@ -2972,13 +3764,13 @@
               <w:lang w:eastAsia="en-GB"/>
             </w:rPr>
           </w:pPr>
-          <w:hyperlink w:anchor="_Toc223885328" w:history="1">
+          <w:hyperlink w:anchor="_Toc223886397" w:history="1">
             <w:r>
               <w:rPr>
                 <w:rStyle w:val="Hyperlink"/>
                 <w:noProof/>
               </w:rPr>
-              <w:t>Final Version Tests</w:t>
+              <w:t>Asset Licenses and Sources</w:t>
             </w:r>
             <w:r>
               <w:rPr>
@@ -2999,7 +3791,7 @@
                 <w:noProof/>
                 <w:webHidden/>
               </w:rPr>
-              <w:instrText xml:space="preserve"> PAGEREF _Toc223885328 \h </w:instrText>
+              <w:instrText xml:space="preserve"> PAGEREF _Toc223886397 \h </w:instrText>
             </w:r>
             <w:r>
               <w:rPr>
@@ -3019,7 +3811,7 @@
                 <w:noProof/>
                 <w:webHidden/>
               </w:rPr>
-              <w:t>22</w:t>
+              <w:t>27</w:t>
             </w:r>
             <w:r>
               <w:rPr>
@@ -3044,13 +3836,13 @@
               <w:lang w:eastAsia="en-GB"/>
             </w:rPr>
           </w:pPr>
-          <w:hyperlink w:anchor="_Toc223885329" w:history="1">
+          <w:hyperlink w:anchor="_Toc223886398" w:history="1">
             <w:r>
               <w:rPr>
                 <w:rStyle w:val="Hyperlink"/>
                 <w:noProof/>
               </w:rPr>
-              <w:t>Interaction Objects and Objective Understanding</w:t>
+              <w:t>Modern Office Table</w:t>
             </w:r>
             <w:r>
               <w:rPr>
@@ -3071,7 +3863,7 @@
                 <w:noProof/>
                 <w:webHidden/>
               </w:rPr>
-              <w:instrText xml:space="preserve"> PAGEREF _Toc223885329 \h </w:instrText>
+              <w:instrText xml:space="preserve"> PAGEREF _Toc223886398 \h </w:instrText>
             </w:r>
             <w:r>
               <w:rPr>
@@ -3091,7 +3883,7 @@
                 <w:noProof/>
                 <w:webHidden/>
               </w:rPr>
-              <w:t>22</w:t>
+              <w:t>27</w:t>
             </w:r>
             <w:r>
               <w:rPr>
@@ -3116,13 +3908,13 @@
               <w:lang w:eastAsia="en-GB"/>
             </w:rPr>
           </w:pPr>
-          <w:hyperlink w:anchor="_Toc223885330" w:history="1">
+          <w:hyperlink w:anchor="_Toc223886399" w:history="1">
             <w:r>
               <w:rPr>
                 <w:rStyle w:val="Hyperlink"/>
                 <w:noProof/>
               </w:rPr>
-              <w:t>User Attention Detection</w:t>
+              <w:t>Free Studio Starter Pack</w:t>
             </w:r>
             <w:r>
               <w:rPr>
@@ -3143,7 +3935,7 @@
                 <w:noProof/>
                 <w:webHidden/>
               </w:rPr>
-              <w:instrText xml:space="preserve"> PAGEREF _Toc223885330 \h </w:instrText>
+              <w:instrText xml:space="preserve"> PAGEREF _Toc223886399 \h </w:instrText>
             </w:r>
             <w:r>
               <w:rPr>
@@ -3163,7 +3955,7 @@
                 <w:noProof/>
                 <w:webHidden/>
               </w:rPr>
-              <w:t>22</w:t>
+              <w:t>27</w:t>
             </w:r>
             <w:r>
               <w:rPr>
@@ -3188,13 +3980,13 @@
               <w:lang w:eastAsia="en-GB"/>
             </w:rPr>
           </w:pPr>
-          <w:hyperlink w:anchor="_Toc223885331" w:history="1">
+          <w:hyperlink w:anchor="_Toc223886400" w:history="1">
             <w:r>
               <w:rPr>
                 <w:rStyle w:val="Hyperlink"/>
                 <w:noProof/>
               </w:rPr>
-              <w:t>Symptom Simulations</w:t>
+              <w:t>General Desktop Bundle</w:t>
             </w:r>
             <w:r>
               <w:rPr>
@@ -3215,7 +4007,7 @@
                 <w:noProof/>
                 <w:webHidden/>
               </w:rPr>
-              <w:instrText xml:space="preserve"> PAGEREF _Toc223885331 \h </w:instrText>
+              <w:instrText xml:space="preserve"> PAGEREF _Toc223886400 \h </w:instrText>
             </w:r>
             <w:r>
               <w:rPr>
@@ -3235,367 +4027,7 @@
                 <w:noProof/>
                 <w:webHidden/>
               </w:rPr>
-              <w:t>22</w:t>
-            </w:r>
-            <w:r>
-              <w:rPr>
-                <w:noProof/>
-                <w:webHidden/>
-              </w:rPr>
-              <w:fldChar w:fldCharType="end"/>
-            </w:r>
-          </w:hyperlink>
-        </w:p>
-        <w:p>
-          <w:pPr>
-            <w:pStyle w:val="TOC1"/>
-            <w:tabs>
-              <w:tab w:val="right" w:leader="dot" w:pos="9016"/>
-            </w:tabs>
-            <w:rPr>
-              <w:rFonts w:eastAsiaTheme="minorEastAsia"/>
-              <w:noProof/>
-              <w:sz w:val="24"/>
-              <w:szCs w:val="24"/>
-              <w:lang w:eastAsia="en-GB"/>
-            </w:rPr>
-          </w:pPr>
-          <w:hyperlink w:anchor="_Toc223885332" w:history="1">
-            <w:r>
-              <w:rPr>
-                <w:rStyle w:val="Hyperlink"/>
-                <w:noProof/>
-              </w:rPr>
-              <w:t>Critical Evaluation</w:t>
-            </w:r>
-            <w:r>
-              <w:rPr>
-                <w:noProof/>
-                <w:webHidden/>
-              </w:rPr>
-              <w:tab/>
-            </w:r>
-            <w:r>
-              <w:rPr>
-                <w:noProof/>
-                <w:webHidden/>
-              </w:rPr>
-              <w:fldChar w:fldCharType="begin"/>
-            </w:r>
-            <w:r>
-              <w:rPr>
-                <w:noProof/>
-                <w:webHidden/>
-              </w:rPr>
-              <w:instrText xml:space="preserve"> PAGEREF _Toc223885332 \h </w:instrText>
-            </w:r>
-            <w:r>
-              <w:rPr>
-                <w:noProof/>
-                <w:webHidden/>
-              </w:rPr>
-            </w:r>
-            <w:r>
-              <w:rPr>
-                <w:noProof/>
-                <w:webHidden/>
-              </w:rPr>
-              <w:fldChar w:fldCharType="separate"/>
-            </w:r>
-            <w:r>
-              <w:rPr>
-                <w:noProof/>
-                <w:webHidden/>
-              </w:rPr>
-              <w:t>23</w:t>
-            </w:r>
-            <w:r>
-              <w:rPr>
-                <w:noProof/>
-                <w:webHidden/>
-              </w:rPr>
-              <w:fldChar w:fldCharType="end"/>
-            </w:r>
-          </w:hyperlink>
-        </w:p>
-        <w:p>
-          <w:pPr>
-            <w:pStyle w:val="TOC1"/>
-            <w:tabs>
-              <w:tab w:val="right" w:leader="dot" w:pos="9016"/>
-            </w:tabs>
-            <w:rPr>
-              <w:rFonts w:eastAsiaTheme="minorEastAsia"/>
-              <w:noProof/>
-              <w:sz w:val="24"/>
-              <w:szCs w:val="24"/>
-              <w:lang w:eastAsia="en-GB"/>
-            </w:rPr>
-          </w:pPr>
-          <w:hyperlink w:anchor="_Toc223885333" w:history="1">
-            <w:r>
-              <w:rPr>
-                <w:rStyle w:val="Hyperlink"/>
-                <w:noProof/>
-              </w:rPr>
-              <w:t>Conclusions and Future Work</w:t>
-            </w:r>
-            <w:r>
-              <w:rPr>
-                <w:noProof/>
-                <w:webHidden/>
-              </w:rPr>
-              <w:tab/>
-            </w:r>
-            <w:r>
-              <w:rPr>
-                <w:noProof/>
-                <w:webHidden/>
-              </w:rPr>
-              <w:fldChar w:fldCharType="begin"/>
-            </w:r>
-            <w:r>
-              <w:rPr>
-                <w:noProof/>
-                <w:webHidden/>
-              </w:rPr>
-              <w:instrText xml:space="preserve"> PAGEREF _Toc223885333 \h </w:instrText>
-            </w:r>
-            <w:r>
-              <w:rPr>
-                <w:noProof/>
-                <w:webHidden/>
-              </w:rPr>
-            </w:r>
-            <w:r>
-              <w:rPr>
-                <w:noProof/>
-                <w:webHidden/>
-              </w:rPr>
-              <w:fldChar w:fldCharType="separate"/>
-            </w:r>
-            <w:r>
-              <w:rPr>
-                <w:noProof/>
-                <w:webHidden/>
-              </w:rPr>
-              <w:t>24</w:t>
-            </w:r>
-            <w:r>
-              <w:rPr>
-                <w:noProof/>
-                <w:webHidden/>
-              </w:rPr>
-              <w:fldChar w:fldCharType="end"/>
-            </w:r>
-          </w:hyperlink>
-        </w:p>
-        <w:p>
-          <w:pPr>
-            <w:pStyle w:val="TOC1"/>
-            <w:tabs>
-              <w:tab w:val="right" w:leader="dot" w:pos="9016"/>
-            </w:tabs>
-            <w:rPr>
-              <w:rFonts w:eastAsiaTheme="minorEastAsia"/>
-              <w:noProof/>
-              <w:sz w:val="24"/>
-              <w:szCs w:val="24"/>
-              <w:lang w:eastAsia="en-GB"/>
-            </w:rPr>
-          </w:pPr>
-          <w:hyperlink w:anchor="_Toc223885334" w:history="1">
-            <w:r>
-              <w:rPr>
-                <w:rStyle w:val="Hyperlink"/>
-                <w:noProof/>
-              </w:rPr>
-              <w:t>References</w:t>
-            </w:r>
-            <w:r>
-              <w:rPr>
-                <w:noProof/>
-                <w:webHidden/>
-              </w:rPr>
-              <w:tab/>
-            </w:r>
-            <w:r>
-              <w:rPr>
-                <w:noProof/>
-                <w:webHidden/>
-              </w:rPr>
-              <w:fldChar w:fldCharType="begin"/>
-            </w:r>
-            <w:r>
-              <w:rPr>
-                <w:noProof/>
-                <w:webHidden/>
-              </w:rPr>
-              <w:instrText xml:space="preserve"> PAGEREF _Toc223885334 \h </w:instrText>
-            </w:r>
-            <w:r>
-              <w:rPr>
-                <w:noProof/>
-                <w:webHidden/>
-              </w:rPr>
-            </w:r>
-            <w:r>
-              <w:rPr>
-                <w:noProof/>
-                <w:webHidden/>
-              </w:rPr>
-              <w:fldChar w:fldCharType="separate"/>
-            </w:r>
-            <w:r>
-              <w:rPr>
-                <w:noProof/>
-                <w:webHidden/>
-              </w:rPr>
-              <w:t>25</w:t>
-            </w:r>
-            <w:r>
-              <w:rPr>
-                <w:noProof/>
-                <w:webHidden/>
-              </w:rPr>
-              <w:fldChar w:fldCharType="end"/>
-            </w:r>
-          </w:hyperlink>
-        </w:p>
-        <w:p>
-          <w:pPr>
-            <w:pStyle w:val="TOC1"/>
-            <w:tabs>
-              <w:tab w:val="right" w:leader="dot" w:pos="9016"/>
-            </w:tabs>
-            <w:rPr>
-              <w:rFonts w:eastAsiaTheme="minorEastAsia"/>
-              <w:noProof/>
-              <w:sz w:val="24"/>
-              <w:szCs w:val="24"/>
-              <w:lang w:eastAsia="en-GB"/>
-            </w:rPr>
-          </w:pPr>
-          <w:hyperlink w:anchor="_Toc223885335" w:history="1">
-            <w:r>
-              <w:rPr>
-                <w:rStyle w:val="Hyperlink"/>
-                <w:noProof/>
-              </w:rPr>
-              <w:t>Appendix</w:t>
-            </w:r>
-            <w:r>
-              <w:rPr>
-                <w:noProof/>
-                <w:webHidden/>
-              </w:rPr>
-              <w:tab/>
-            </w:r>
-            <w:r>
-              <w:rPr>
-                <w:noProof/>
-                <w:webHidden/>
-              </w:rPr>
-              <w:fldChar w:fldCharType="begin"/>
-            </w:r>
-            <w:r>
-              <w:rPr>
-                <w:noProof/>
-                <w:webHidden/>
-              </w:rPr>
-              <w:instrText xml:space="preserve"> PAGEREF _Toc223885335 \h </w:instrText>
-            </w:r>
-            <w:r>
-              <w:rPr>
-                <w:noProof/>
-                <w:webHidden/>
-              </w:rPr>
-            </w:r>
-            <w:r>
-              <w:rPr>
-                <w:noProof/>
-                <w:webHidden/>
-              </w:rPr>
-              <w:fldChar w:fldCharType="separate"/>
-            </w:r>
-            <w:r>
-              <w:rPr>
-                <w:noProof/>
-                <w:webHidden/>
-              </w:rPr>
-              <w:t>26</w:t>
-            </w:r>
-            <w:r>
-              <w:rPr>
-                <w:noProof/>
-                <w:webHidden/>
-              </w:rPr>
-              <w:fldChar w:fldCharType="end"/>
-            </w:r>
-          </w:hyperlink>
-        </w:p>
-        <w:p>
-          <w:pPr>
-            <w:pStyle w:val="TOC2"/>
-            <w:tabs>
-              <w:tab w:val="right" w:leader="dot" w:pos="9016"/>
-            </w:tabs>
-            <w:rPr>
-              <w:rFonts w:eastAsiaTheme="minorEastAsia"/>
-              <w:noProof/>
-              <w:sz w:val="24"/>
-              <w:szCs w:val="24"/>
-              <w:lang w:eastAsia="en-GB"/>
-            </w:rPr>
-          </w:pPr>
-          <w:hyperlink w:anchor="_Toc223885336" w:history="1">
-            <w:r>
-              <w:rPr>
-                <w:rStyle w:val="Hyperlink"/>
-                <w:noProof/>
-              </w:rPr>
-              <w:t>Asset Licenses and Sources</w:t>
-            </w:r>
-            <w:r>
-              <w:rPr>
-                <w:noProof/>
-                <w:webHidden/>
-              </w:rPr>
-              <w:tab/>
-            </w:r>
-            <w:r>
-              <w:rPr>
-                <w:noProof/>
-                <w:webHidden/>
-              </w:rPr>
-              <w:fldChar w:fldCharType="begin"/>
-            </w:r>
-            <w:r>
-              <w:rPr>
-                <w:noProof/>
-                <w:webHidden/>
-              </w:rPr>
-              <w:instrText xml:space="preserve"> PAGEREF _Toc223885336 \h </w:instrText>
-            </w:r>
-            <w:r>
-              <w:rPr>
-                <w:noProof/>
-                <w:webHidden/>
-              </w:rPr>
-            </w:r>
-            <w:r>
-              <w:rPr>
-                <w:noProof/>
-                <w:webHidden/>
-              </w:rPr>
-              <w:fldChar w:fldCharType="separate"/>
-            </w:r>
-            <w:r>
-              <w:rPr>
-                <w:noProof/>
-                <w:webHidden/>
-              </w:rPr>
-              <w:t>26</w:t>
+              <w:t>27</w:t>
             </w:r>
             <w:r>
               <w:rPr>
@@ -3620,13 +4052,13 @@
               <w:lang w:eastAsia="en-GB"/>
             </w:rPr>
           </w:pPr>
-          <w:hyperlink w:anchor="_Toc223885337" w:history="1">
+          <w:hyperlink w:anchor="_Toc223886401" w:history="1">
             <w:r>
               <w:rPr>
                 <w:rStyle w:val="Hyperlink"/>
                 <w:noProof/>
               </w:rPr>
-              <w:t>Modern Office Table</w:t>
+              <w:t>General Gaming Headset</w:t>
             </w:r>
             <w:r>
               <w:rPr>
@@ -3647,7 +4079,7 @@
                 <w:noProof/>
                 <w:webHidden/>
               </w:rPr>
-              <w:instrText xml:space="preserve"> PAGEREF _Toc223885337 \h </w:instrText>
+              <w:instrText xml:space="preserve"> PAGEREF _Toc223886401 \h </w:instrText>
             </w:r>
             <w:r>
               <w:rPr>
@@ -3667,7 +4099,7 @@
                 <w:noProof/>
                 <w:webHidden/>
               </w:rPr>
-              <w:t>26</w:t>
+              <w:t>28</w:t>
             </w:r>
             <w:r>
               <w:rPr>
@@ -3692,13 +4124,13 @@
               <w:lang w:eastAsia="en-GB"/>
             </w:rPr>
           </w:pPr>
-          <w:hyperlink w:anchor="_Toc223885338" w:history="1">
+          <w:hyperlink w:anchor="_Toc223886402" w:history="1">
             <w:r>
               <w:rPr>
                 <w:rStyle w:val="Hyperlink"/>
                 <w:noProof/>
               </w:rPr>
-              <w:t>Free Studio Starter Pack</w:t>
+              <w:t>General Gaming Chair</w:t>
             </w:r>
             <w:r>
               <w:rPr>
@@ -3719,7 +4151,7 @@
                 <w:noProof/>
                 <w:webHidden/>
               </w:rPr>
-              <w:instrText xml:space="preserve"> PAGEREF _Toc223885338 \h </w:instrText>
+              <w:instrText xml:space="preserve"> PAGEREF _Toc223886402 \h </w:instrText>
             </w:r>
             <w:r>
               <w:rPr>
@@ -3739,7 +4171,7 @@
                 <w:noProof/>
                 <w:webHidden/>
               </w:rPr>
-              <w:t>26</w:t>
+              <w:t>28</w:t>
             </w:r>
             <w:r>
               <w:rPr>
@@ -3764,13 +4196,13 @@
               <w:lang w:eastAsia="en-GB"/>
             </w:rPr>
           </w:pPr>
-          <w:hyperlink w:anchor="_Toc223885339" w:history="1">
+          <w:hyperlink w:anchor="_Toc223886403" w:history="1">
             <w:r>
               <w:rPr>
                 <w:rStyle w:val="Hyperlink"/>
                 <w:noProof/>
               </w:rPr>
-              <w:t>General Desktop Bundle</w:t>
+              <w:t>Light Switch</w:t>
             </w:r>
             <w:r>
               <w:rPr>
@@ -3791,7 +4223,7 @@
                 <w:noProof/>
                 <w:webHidden/>
               </w:rPr>
-              <w:instrText xml:space="preserve"> PAGEREF _Toc223885339 \h </w:instrText>
+              <w:instrText xml:space="preserve"> PAGEREF _Toc223886403 \h </w:instrText>
             </w:r>
             <w:r>
               <w:rPr>
@@ -3811,7 +4243,7 @@
                 <w:noProof/>
                 <w:webHidden/>
               </w:rPr>
-              <w:t>26</w:t>
+              <w:t>28</w:t>
             </w:r>
             <w:r>
               <w:rPr>
@@ -3836,13 +4268,13 @@
               <w:lang w:eastAsia="en-GB"/>
             </w:rPr>
           </w:pPr>
-          <w:hyperlink w:anchor="_Toc223885340" w:history="1">
+          <w:hyperlink w:anchor="_Toc223886404" w:history="1">
             <w:r>
               <w:rPr>
                 <w:rStyle w:val="Hyperlink"/>
                 <w:noProof/>
               </w:rPr>
-              <w:t>General Gaming Headset</w:t>
+              <w:t>Materials for General PC setup and Scenes</w:t>
             </w:r>
             <w:r>
               <w:rPr>
@@ -3863,7 +4295,7 @@
                 <w:noProof/>
                 <w:webHidden/>
               </w:rPr>
-              <w:instrText xml:space="preserve"> PAGEREF _Toc223885340 \h </w:instrText>
+              <w:instrText xml:space="preserve"> PAGEREF _Toc223886404 \h </w:instrText>
             </w:r>
             <w:r>
               <w:rPr>
@@ -3883,7 +4315,7 @@
                 <w:noProof/>
                 <w:webHidden/>
               </w:rPr>
-              <w:t>27</w:t>
+              <w:t>29</w:t>
             </w:r>
             <w:r>
               <w:rPr>
@@ -3908,13 +4340,13 @@
               <w:lang w:eastAsia="en-GB"/>
             </w:rPr>
           </w:pPr>
-          <w:hyperlink w:anchor="_Toc223885341" w:history="1">
+          <w:hyperlink w:anchor="_Toc223886405" w:history="1">
             <w:r>
               <w:rPr>
                 <w:rStyle w:val="Hyperlink"/>
                 <w:noProof/>
               </w:rPr>
-              <w:t>General Gaming Chair</w:t>
+              <w:t>Monitor background image</w:t>
             </w:r>
             <w:r>
               <w:rPr>
@@ -3935,7 +4367,7 @@
                 <w:noProof/>
                 <w:webHidden/>
               </w:rPr>
-              <w:instrText xml:space="preserve"> PAGEREF _Toc223885341 \h </w:instrText>
+              <w:instrText xml:space="preserve"> PAGEREF _Toc223886405 \h </w:instrText>
             </w:r>
             <w:r>
               <w:rPr>
@@ -3955,7 +4387,7 @@
                 <w:noProof/>
                 <w:webHidden/>
               </w:rPr>
-              <w:t>27</w:t>
+              <w:t>30</w:t>
             </w:r>
             <w:r>
               <w:rPr>
@@ -3980,13 +4412,13 @@
               <w:lang w:eastAsia="en-GB"/>
             </w:rPr>
           </w:pPr>
-          <w:hyperlink w:anchor="_Toc223885342" w:history="1">
+          <w:hyperlink w:anchor="_Toc223886406" w:history="1">
             <w:r>
               <w:rPr>
                 <w:rStyle w:val="Hyperlink"/>
                 <w:noProof/>
               </w:rPr>
-              <w:t>Light Switch</w:t>
+              <w:t>Button Hover Sfx by Fachii</w:t>
             </w:r>
             <w:r>
               <w:rPr>
@@ -4007,7 +4439,7 @@
                 <w:noProof/>
                 <w:webHidden/>
               </w:rPr>
-              <w:instrText xml:space="preserve"> PAGEREF _Toc223885342 \h </w:instrText>
+              <w:instrText xml:space="preserve"> PAGEREF _Toc223886406 \h </w:instrText>
             </w:r>
             <w:r>
               <w:rPr>
@@ -4027,7 +4459,7 @@
                 <w:noProof/>
                 <w:webHidden/>
               </w:rPr>
-              <w:t>27</w:t>
+              <w:t>31</w:t>
             </w:r>
             <w:r>
               <w:rPr>
@@ -4052,13 +4484,13 @@
               <w:lang w:eastAsia="en-GB"/>
             </w:rPr>
           </w:pPr>
-          <w:hyperlink w:anchor="_Toc223885343" w:history="1">
+          <w:hyperlink w:anchor="_Toc223886407" w:history="1">
             <w:r>
               <w:rPr>
                 <w:rStyle w:val="Hyperlink"/>
                 <w:noProof/>
               </w:rPr>
-              <w:t>Materials for General PC setup and Scenes</w:t>
+              <w:t>Button click Sfx by AndrewEathan</w:t>
             </w:r>
             <w:r>
               <w:rPr>
@@ -4079,7 +4511,7 @@
                 <w:noProof/>
                 <w:webHidden/>
               </w:rPr>
-              <w:instrText xml:space="preserve"> PAGEREF _Toc223885343 \h </w:instrText>
+              <w:instrText xml:space="preserve"> PAGEREF _Toc223886407 \h </w:instrText>
             </w:r>
             <w:r>
               <w:rPr>
@@ -4099,7 +4531,7 @@
                 <w:noProof/>
                 <w:webHidden/>
               </w:rPr>
-              <w:t>28</w:t>
+              <w:t>31</w:t>
             </w:r>
             <w:r>
               <w:rPr>
@@ -4124,13 +4556,13 @@
               <w:lang w:eastAsia="en-GB"/>
             </w:rPr>
           </w:pPr>
-          <w:hyperlink w:anchor="_Toc223885344" w:history="1">
+          <w:hyperlink w:anchor="_Toc223886408" w:history="1">
             <w:r>
               <w:rPr>
                 <w:rStyle w:val="Hyperlink"/>
                 <w:noProof/>
               </w:rPr>
-              <w:t>Monitor background image</w:t>
+              <w:t>Light Switch On Sfx</w:t>
             </w:r>
             <w:r>
               <w:rPr>
@@ -4151,7 +4583,7 @@
                 <w:noProof/>
                 <w:webHidden/>
               </w:rPr>
-              <w:instrText xml:space="preserve"> PAGEREF _Toc223885344 \h </w:instrText>
+              <w:instrText xml:space="preserve"> PAGEREF _Toc223886408 \h </w:instrText>
             </w:r>
             <w:r>
               <w:rPr>
@@ -4171,7 +4603,7 @@
                 <w:noProof/>
                 <w:webHidden/>
               </w:rPr>
-              <w:t>29</w:t>
+              <w:t>32</w:t>
             </w:r>
             <w:r>
               <w:rPr>
@@ -4196,13 +4628,13 @@
               <w:lang w:eastAsia="en-GB"/>
             </w:rPr>
           </w:pPr>
-          <w:hyperlink w:anchor="_Toc223885345" w:history="1">
+          <w:hyperlink w:anchor="_Toc223886409" w:history="1">
             <w:r>
               <w:rPr>
                 <w:rStyle w:val="Hyperlink"/>
                 <w:noProof/>
               </w:rPr>
-              <w:t>Button Hover Sfx by Fachii</w:t>
+              <w:t>Light Switch Off Sfx</w:t>
             </w:r>
             <w:r>
               <w:rPr>
@@ -4223,7 +4655,7 @@
                 <w:noProof/>
                 <w:webHidden/>
               </w:rPr>
-              <w:instrText xml:space="preserve"> PAGEREF _Toc223885345 \h </w:instrText>
+              <w:instrText xml:space="preserve"> PAGEREF _Toc223886409 \h </w:instrText>
             </w:r>
             <w:r>
               <w:rPr>
@@ -4243,223 +4675,7 @@
                 <w:noProof/>
                 <w:webHidden/>
               </w:rPr>
-              <w:t>30</w:t>
-            </w:r>
-            <w:r>
-              <w:rPr>
-                <w:noProof/>
-                <w:webHidden/>
-              </w:rPr>
-              <w:fldChar w:fldCharType="end"/>
-            </w:r>
-          </w:hyperlink>
-        </w:p>
-        <w:p>
-          <w:pPr>
-            <w:pStyle w:val="TOC3"/>
-            <w:tabs>
-              <w:tab w:val="right" w:leader="dot" w:pos="9016"/>
-            </w:tabs>
-            <w:rPr>
-              <w:rFonts w:eastAsiaTheme="minorEastAsia"/>
-              <w:noProof/>
-              <w:sz w:val="24"/>
-              <w:szCs w:val="24"/>
-              <w:lang w:eastAsia="en-GB"/>
-            </w:rPr>
-          </w:pPr>
-          <w:hyperlink w:anchor="_Toc223885346" w:history="1">
-            <w:r>
-              <w:rPr>
-                <w:rStyle w:val="Hyperlink"/>
-                <w:noProof/>
-              </w:rPr>
-              <w:t>Button click Sfx by AndrewEathan</w:t>
-            </w:r>
-            <w:r>
-              <w:rPr>
-                <w:noProof/>
-                <w:webHidden/>
-              </w:rPr>
-              <w:tab/>
-            </w:r>
-            <w:r>
-              <w:rPr>
-                <w:noProof/>
-                <w:webHidden/>
-              </w:rPr>
-              <w:fldChar w:fldCharType="begin"/>
-            </w:r>
-            <w:r>
-              <w:rPr>
-                <w:noProof/>
-                <w:webHidden/>
-              </w:rPr>
-              <w:instrText xml:space="preserve"> PAGEREF _Toc223885346 \h </w:instrText>
-            </w:r>
-            <w:r>
-              <w:rPr>
-                <w:noProof/>
-                <w:webHidden/>
-              </w:rPr>
-            </w:r>
-            <w:r>
-              <w:rPr>
-                <w:noProof/>
-                <w:webHidden/>
-              </w:rPr>
-              <w:fldChar w:fldCharType="separate"/>
-            </w:r>
-            <w:r>
-              <w:rPr>
-                <w:noProof/>
-                <w:webHidden/>
-              </w:rPr>
-              <w:t>30</w:t>
-            </w:r>
-            <w:r>
-              <w:rPr>
-                <w:noProof/>
-                <w:webHidden/>
-              </w:rPr>
-              <w:fldChar w:fldCharType="end"/>
-            </w:r>
-          </w:hyperlink>
-        </w:p>
-        <w:p>
-          <w:pPr>
-            <w:pStyle w:val="TOC3"/>
-            <w:tabs>
-              <w:tab w:val="right" w:leader="dot" w:pos="9016"/>
-            </w:tabs>
-            <w:rPr>
-              <w:rFonts w:eastAsiaTheme="minorEastAsia"/>
-              <w:noProof/>
-              <w:sz w:val="24"/>
-              <w:szCs w:val="24"/>
-              <w:lang w:eastAsia="en-GB"/>
-            </w:rPr>
-          </w:pPr>
-          <w:hyperlink w:anchor="_Toc223885347" w:history="1">
-            <w:r>
-              <w:rPr>
-                <w:rStyle w:val="Hyperlink"/>
-                <w:noProof/>
-              </w:rPr>
-              <w:t>Light Switch On Sfx</w:t>
-            </w:r>
-            <w:r>
-              <w:rPr>
-                <w:noProof/>
-                <w:webHidden/>
-              </w:rPr>
-              <w:tab/>
-            </w:r>
-            <w:r>
-              <w:rPr>
-                <w:noProof/>
-                <w:webHidden/>
-              </w:rPr>
-              <w:fldChar w:fldCharType="begin"/>
-            </w:r>
-            <w:r>
-              <w:rPr>
-                <w:noProof/>
-                <w:webHidden/>
-              </w:rPr>
-              <w:instrText xml:space="preserve"> PAGEREF _Toc223885347 \h </w:instrText>
-            </w:r>
-            <w:r>
-              <w:rPr>
-                <w:noProof/>
-                <w:webHidden/>
-              </w:rPr>
-            </w:r>
-            <w:r>
-              <w:rPr>
-                <w:noProof/>
-                <w:webHidden/>
-              </w:rPr>
-              <w:fldChar w:fldCharType="separate"/>
-            </w:r>
-            <w:r>
-              <w:rPr>
-                <w:noProof/>
-                <w:webHidden/>
-              </w:rPr>
-              <w:t>31</w:t>
-            </w:r>
-            <w:r>
-              <w:rPr>
-                <w:noProof/>
-                <w:webHidden/>
-              </w:rPr>
-              <w:fldChar w:fldCharType="end"/>
-            </w:r>
-          </w:hyperlink>
-        </w:p>
-        <w:p>
-          <w:pPr>
-            <w:pStyle w:val="TOC3"/>
-            <w:tabs>
-              <w:tab w:val="right" w:leader="dot" w:pos="9016"/>
-            </w:tabs>
-            <w:rPr>
-              <w:rFonts w:eastAsiaTheme="minorEastAsia"/>
-              <w:noProof/>
-              <w:sz w:val="24"/>
-              <w:szCs w:val="24"/>
-              <w:lang w:eastAsia="en-GB"/>
-            </w:rPr>
-          </w:pPr>
-          <w:hyperlink w:anchor="_Toc223885348" w:history="1">
-            <w:r>
-              <w:rPr>
-                <w:rStyle w:val="Hyperlink"/>
-                <w:noProof/>
-              </w:rPr>
-              <w:t>Light Switch Off Sfx</w:t>
-            </w:r>
-            <w:r>
-              <w:rPr>
-                <w:noProof/>
-                <w:webHidden/>
-              </w:rPr>
-              <w:tab/>
-            </w:r>
-            <w:r>
-              <w:rPr>
-                <w:noProof/>
-                <w:webHidden/>
-              </w:rPr>
-              <w:fldChar w:fldCharType="begin"/>
-            </w:r>
-            <w:r>
-              <w:rPr>
-                <w:noProof/>
-                <w:webHidden/>
-              </w:rPr>
-              <w:instrText xml:space="preserve"> PAGEREF _Toc223885348 \h </w:instrText>
-            </w:r>
-            <w:r>
-              <w:rPr>
-                <w:noProof/>
-                <w:webHidden/>
-              </w:rPr>
-            </w:r>
-            <w:r>
-              <w:rPr>
-                <w:noProof/>
-                <w:webHidden/>
-              </w:rPr>
-              <w:fldChar w:fldCharType="separate"/>
-            </w:r>
-            <w:r>
-              <w:rPr>
-                <w:noProof/>
-                <w:webHidden/>
-              </w:rPr>
-              <w:t>31</w:t>
+              <w:t>32</w:t>
             </w:r>
             <w:r>
               <w:rPr>
@@ -4500,7 +4716,7 @@
       <w:pPr>
         <w:pStyle w:val="Heading1"/>
       </w:pPr>
-      <w:bookmarkStart w:id="0" w:name="_Toc223885290"/>
+      <w:bookmarkStart w:id="0" w:name="_Toc223886348"/>
       <w:r>
         <w:lastRenderedPageBreak/>
         <w:t>List of Acro</w:t>
@@ -4755,7 +4971,7 @@
       <w:pPr>
         <w:pStyle w:val="Heading1"/>
       </w:pPr>
-      <w:bookmarkStart w:id="1" w:name="_Toc223885291"/>
+      <w:bookmarkStart w:id="1" w:name="_Toc223886349"/>
       <w:r>
         <w:lastRenderedPageBreak/>
         <w:t>Abstract</w:t>
@@ -4955,7 +5171,7 @@
       <w:pPr>
         <w:pStyle w:val="Heading1"/>
       </w:pPr>
-      <w:bookmarkStart w:id="2" w:name="_Toc223885292"/>
+      <w:bookmarkStart w:id="2" w:name="_Toc223886350"/>
       <w:r>
         <w:lastRenderedPageBreak/>
         <w:t>Introduction</w:t>
@@ -5538,7 +5754,7 @@
       <w:pPr>
         <w:pStyle w:val="Heading1"/>
       </w:pPr>
-      <w:bookmarkStart w:id="3" w:name="_Toc223885293"/>
+      <w:bookmarkStart w:id="3" w:name="_Toc223886351"/>
       <w:r>
         <w:lastRenderedPageBreak/>
         <w:t>Project Aim</w:t>
@@ -5588,7 +5804,7 @@
           <w:rFonts w:asciiTheme="minorHAnsi" w:hAnsiTheme="minorHAnsi"/>
         </w:rPr>
       </w:pPr>
-      <w:bookmarkStart w:id="4" w:name="_Toc223885294"/>
+      <w:bookmarkStart w:id="4" w:name="_Toc223886352"/>
       <w:r>
         <w:rPr>
           <w:rFonts w:asciiTheme="minorHAnsi" w:hAnsiTheme="minorHAnsi"/>
@@ -5875,7 +6091,7 @@
       <w:pPr>
         <w:pStyle w:val="Heading1"/>
       </w:pPr>
-      <w:bookmarkStart w:id="5" w:name="_Toc223885295"/>
+      <w:bookmarkStart w:id="5" w:name="_Toc223886353"/>
       <w:r>
         <w:lastRenderedPageBreak/>
         <w:t>Project Planning</w:t>
@@ -6256,7 +6472,7 @@
           <w:rFonts w:asciiTheme="minorHAnsi" w:hAnsiTheme="minorHAnsi"/>
         </w:rPr>
       </w:pPr>
-      <w:bookmarkStart w:id="6" w:name="_Toc223885296"/>
+      <w:bookmarkStart w:id="6" w:name="_Toc223886354"/>
       <w:r>
         <w:rPr>
           <w:rFonts w:asciiTheme="minorHAnsi" w:hAnsiTheme="minorHAnsi"/>
@@ -6458,7 +6674,7 @@
           <w:rFonts w:asciiTheme="minorHAnsi" w:hAnsiTheme="minorHAnsi"/>
         </w:rPr>
       </w:pPr>
-      <w:bookmarkStart w:id="7" w:name="_Toc223885297"/>
+      <w:bookmarkStart w:id="7" w:name="_Toc223886355"/>
       <w:r>
         <w:rPr>
           <w:rFonts w:asciiTheme="minorHAnsi" w:hAnsiTheme="minorHAnsi"/>
@@ -6739,7 +6955,7 @@
           <w:rFonts w:asciiTheme="minorHAnsi" w:hAnsiTheme="minorHAnsi"/>
         </w:rPr>
       </w:pPr>
-      <w:bookmarkStart w:id="8" w:name="_Toc223885298"/>
+      <w:bookmarkStart w:id="8" w:name="_Toc223886356"/>
       <w:r>
         <w:rPr>
           <w:rFonts w:asciiTheme="minorHAnsi" w:hAnsiTheme="minorHAnsi"/>
@@ -6756,7 +6972,7 @@
           <w:rFonts w:asciiTheme="minorHAnsi" w:hAnsiTheme="minorHAnsi"/>
         </w:rPr>
       </w:pPr>
-      <w:bookmarkStart w:id="9" w:name="_Toc223885299"/>
+      <w:bookmarkStart w:id="9" w:name="_Toc223886357"/>
       <w:r>
         <w:rPr>
           <w:rFonts w:asciiTheme="minorHAnsi" w:hAnsiTheme="minorHAnsi"/>
@@ -6840,7 +7056,7 @@
           <w:rFonts w:asciiTheme="minorHAnsi" w:hAnsiTheme="minorHAnsi"/>
         </w:rPr>
       </w:pPr>
-      <w:bookmarkStart w:id="10" w:name="_Toc223885300"/>
+      <w:bookmarkStart w:id="10" w:name="_Toc223886358"/>
       <w:r>
         <w:rPr>
           <w:rFonts w:asciiTheme="minorHAnsi" w:hAnsiTheme="minorHAnsi"/>
@@ -6853,7 +7069,7 @@
       <w:pPr>
         <w:pStyle w:val="Heading3"/>
       </w:pPr>
-      <w:bookmarkStart w:id="11" w:name="_Toc223885301"/>
+      <w:bookmarkStart w:id="11" w:name="_Toc223886359"/>
       <w:proofErr w:type="spellStart"/>
       <w:r>
         <w:t>Ey</w:t>
@@ -7170,7 +7386,7 @@
       <w:pPr>
         <w:pStyle w:val="Heading3"/>
       </w:pPr>
-      <w:bookmarkStart w:id="12" w:name="_Toc223885302"/>
+      <w:bookmarkStart w:id="12" w:name="_Toc223886360"/>
       <w:proofErr w:type="spellStart"/>
       <w:r>
         <w:t>OntoPhaco</w:t>
@@ -7528,7 +7744,7 @@
       <w:pPr>
         <w:pStyle w:val="Heading3"/>
       </w:pPr>
-      <w:bookmarkStart w:id="13" w:name="_Toc223885303"/>
+      <w:bookmarkStart w:id="13" w:name="_Toc223886361"/>
       <w:r>
         <w:lastRenderedPageBreak/>
         <w:t>I</w:t>
@@ -7724,7 +7940,7 @@
       <w:pPr>
         <w:pStyle w:val="Heading3"/>
       </w:pPr>
-      <w:bookmarkStart w:id="14" w:name="_Toc223885304"/>
+      <w:bookmarkStart w:id="14" w:name="_Toc223886362"/>
       <w:r>
         <w:t>Opportunities for innovation</w:t>
       </w:r>
@@ -7852,7 +8068,7 @@
           <w:rFonts w:asciiTheme="minorHAnsi" w:hAnsiTheme="minorHAnsi"/>
         </w:rPr>
       </w:pPr>
-      <w:bookmarkStart w:id="15" w:name="_Toc223885305"/>
+      <w:bookmarkStart w:id="15" w:name="_Toc223886363"/>
       <w:r>
         <w:rPr>
           <w:rFonts w:asciiTheme="minorHAnsi" w:hAnsiTheme="minorHAnsi"/>
@@ -7865,7 +8081,7 @@
       <w:pPr>
         <w:pStyle w:val="Heading3"/>
       </w:pPr>
-      <w:bookmarkStart w:id="16" w:name="_Toc223885306"/>
+      <w:bookmarkStart w:id="16" w:name="_Toc223886364"/>
       <w:r>
         <w:t>VR in medical education</w:t>
       </w:r>
@@ -8155,7 +8371,7 @@
       <w:pPr>
         <w:pStyle w:val="Heading3"/>
       </w:pPr>
-      <w:bookmarkStart w:id="17" w:name="_Toc223885307"/>
+      <w:bookmarkStart w:id="17" w:name="_Toc223886365"/>
       <w:r>
         <w:lastRenderedPageBreak/>
         <w:t>VR in Health Awareness</w:t>
@@ -8348,7 +8564,7 @@
           <w:rFonts w:asciiTheme="minorHAnsi" w:hAnsiTheme="minorHAnsi"/>
         </w:rPr>
       </w:pPr>
-      <w:bookmarkStart w:id="18" w:name="_Toc223885308"/>
+      <w:bookmarkStart w:id="18" w:name="_Toc223886366"/>
       <w:r>
         <w:rPr>
           <w:rFonts w:asciiTheme="minorHAnsi" w:hAnsiTheme="minorHAnsi"/>
@@ -8568,7 +8784,7 @@
       <w:pPr>
         <w:pStyle w:val="Heading1"/>
       </w:pPr>
-      <w:bookmarkStart w:id="19" w:name="_Toc223885309"/>
+      <w:bookmarkStart w:id="19" w:name="_Toc223886367"/>
       <w:r>
         <w:lastRenderedPageBreak/>
         <w:t>Appendices</w:t>
@@ -8579,7 +8795,7 @@
       <w:pPr>
         <w:pStyle w:val="Heading2"/>
       </w:pPr>
-      <w:bookmarkStart w:id="20" w:name="_Toc223885310"/>
+      <w:bookmarkStart w:id="20" w:name="_Toc223886368"/>
       <w:r>
         <w:t>Ethics Checklist</w:t>
       </w:r>
@@ -8721,7 +8937,7 @@
       <w:pPr>
         <w:pStyle w:val="Heading2"/>
       </w:pPr>
-      <w:bookmarkStart w:id="21" w:name="_Toc223885311"/>
+      <w:bookmarkStart w:id="21" w:name="_Toc223886369"/>
       <w:r>
         <w:lastRenderedPageBreak/>
         <w:t>Project Timeline Gant</w:t>
@@ -8917,7 +9133,7 @@
       <w:pPr>
         <w:pStyle w:val="Heading1"/>
       </w:pPr>
-      <w:bookmarkStart w:id="22" w:name="_Toc223885312"/>
+      <w:bookmarkStart w:id="22" w:name="_Toc223886370"/>
       <w:r>
         <w:lastRenderedPageBreak/>
         <w:t>Methodology</w:t>
@@ -8928,7 +9144,7 @@
       <w:pPr>
         <w:pStyle w:val="Heading2"/>
       </w:pPr>
-      <w:bookmarkStart w:id="23" w:name="_Toc223885313"/>
+      <w:bookmarkStart w:id="23" w:name="_Toc223886371"/>
       <w:r>
         <w:t>Prototype Implementation</w:t>
       </w:r>
@@ -8938,7 +9154,7 @@
       <w:pPr>
         <w:pStyle w:val="Heading3"/>
       </w:pPr>
-      <w:bookmarkStart w:id="24" w:name="_Toc223885314"/>
+      <w:bookmarkStart w:id="24" w:name="_Toc223886372"/>
       <w:r>
         <w:t>Usability and Flow</w:t>
       </w:r>
@@ -9021,7 +9237,7 @@
       <w:pPr>
         <w:pStyle w:val="Heading3"/>
       </w:pPr>
-      <w:bookmarkStart w:id="25" w:name="_Toc223885315"/>
+      <w:bookmarkStart w:id="25" w:name="_Toc223886373"/>
       <w:r>
         <w:t xml:space="preserve">Environment Design and </w:t>
       </w:r>
@@ -9150,7 +9366,7 @@
       <w:pPr>
         <w:pStyle w:val="Heading3"/>
       </w:pPr>
-      <w:bookmarkStart w:id="26" w:name="_Toc223885316"/>
+      <w:bookmarkStart w:id="26" w:name="_Toc223886374"/>
       <w:r>
         <w:t>Objective System Implementation</w:t>
       </w:r>
@@ -9263,7 +9479,7 @@
       <w:pPr>
         <w:pStyle w:val="Heading3"/>
       </w:pPr>
-      <w:bookmarkStart w:id="27" w:name="_Toc223885317"/>
+      <w:bookmarkStart w:id="27" w:name="_Toc223886375"/>
       <w:r>
         <w:t>User</w:t>
       </w:r>
@@ -9360,7 +9576,7 @@
       <w:pPr>
         <w:pStyle w:val="Heading3"/>
       </w:pPr>
-      <w:bookmarkStart w:id="28" w:name="_Toc223885318"/>
+      <w:bookmarkStart w:id="28" w:name="_Toc223886376"/>
       <w:r>
         <w:t>Objective Based Interact</w:t>
       </w:r>
@@ -9428,7 +9644,7 @@
       <w:pPr>
         <w:pStyle w:val="Heading3"/>
       </w:pPr>
-      <w:bookmarkStart w:id="29" w:name="_Toc223885319"/>
+      <w:bookmarkStart w:id="29" w:name="_Toc223886377"/>
       <w:r>
         <w:t>Post Processing Effects</w:t>
       </w:r>
@@ -9463,7 +9679,7 @@
       <w:pPr>
         <w:pStyle w:val="Heading3"/>
       </w:pPr>
-      <w:bookmarkStart w:id="30" w:name="_Toc223885320"/>
+      <w:bookmarkStart w:id="30" w:name="_Toc223886378"/>
       <w:r>
         <w:t>User</w:t>
       </w:r>
@@ -9494,7 +9710,7 @@
       <w:pPr>
         <w:pStyle w:val="Heading2"/>
       </w:pPr>
-      <w:bookmarkStart w:id="31" w:name="_Toc223885321"/>
+      <w:bookmarkStart w:id="31" w:name="_Toc223886379"/>
       <w:r>
         <w:lastRenderedPageBreak/>
         <w:t>Final Version</w:t>
@@ -9504,7 +9720,87 @@
       </w:r>
       <w:bookmarkEnd w:id="31"/>
     </w:p>
-    <w:p/>
+    <w:p>
+      <w:pPr>
+        <w:pStyle w:val="Heading3"/>
+      </w:pPr>
+      <w:bookmarkStart w:id="32" w:name="_Toc223886380"/>
+      <w:r>
+        <w:t>Interaction Improvements</w:t>
+      </w:r>
+      <w:bookmarkEnd w:id="32"/>
+    </w:p>
+    <w:p>
+      <w:pPr>
+        <w:pStyle w:val="ListParagraph"/>
+        <w:numPr>
+          <w:ilvl w:val="0"/>
+          <w:numId w:val="12"/>
+        </w:numPr>
+      </w:pPr>
+      <w:r>
+        <w:t>H</w:t>
+      </w:r>
+      <w:r>
+        <w:t>and physics collisions were removed</w:t>
+      </w:r>
+    </w:p>
+    <w:p>
+      <w:pPr>
+        <w:pStyle w:val="ListParagraph"/>
+        <w:numPr>
+          <w:ilvl w:val="0"/>
+          <w:numId w:val="12"/>
+        </w:numPr>
+      </w:pPr>
+      <w:r>
+        <w:t>Became more reliable as felt like the light switch now worked as intended</w:t>
+      </w:r>
+    </w:p>
+    <w:p>
+      <w:pPr>
+        <w:pStyle w:val="Heading3"/>
+      </w:pPr>
+      <w:bookmarkStart w:id="33" w:name="_Toc223886381"/>
+      <w:r>
+        <w:t>Objective Flow Tweaks</w:t>
+      </w:r>
+      <w:bookmarkEnd w:id="33"/>
+    </w:p>
+    <w:p>
+      <w:pPr>
+        <w:pStyle w:val="ListParagraph"/>
+        <w:numPr>
+          <w:ilvl w:val="0"/>
+          <w:numId w:val="12"/>
+        </w:numPr>
+      </w:pPr>
+      <w:r>
+        <w:t>Reduced the timeline duration between objectives 4 and 5 for triggering and reverting the light sensitivity symptom. Saw an improvement as the symptom effects were still able to be portrayed to users while still showing prevention methods worked.</w:t>
+      </w:r>
+    </w:p>
+    <w:p>
+      <w:pPr>
+        <w:pStyle w:val="Heading3"/>
+      </w:pPr>
+      <w:bookmarkStart w:id="34" w:name="_Toc223886382"/>
+      <w:r>
+        <w:t>Gaze Detection Refinements</w:t>
+      </w:r>
+      <w:bookmarkEnd w:id="34"/>
+    </w:p>
+    <w:p>
+      <w:pPr>
+        <w:pStyle w:val="ListParagraph"/>
+        <w:numPr>
+          <w:ilvl w:val="0"/>
+          <w:numId w:val="12"/>
+        </w:numPr>
+      </w:pPr>
+      <w:r>
+        <w:t>Switched out single line trace to a capsule trace, larger radius for the capsule meant gaze detection was a lot more forgiving for users and it would not be precise in tracking.</w:t>
+      </w:r>
+    </w:p>
     <w:p>
       <w:pPr>
         <w:rPr>
@@ -9522,22 +9818,22 @@
       <w:pPr>
         <w:pStyle w:val="Heading1"/>
       </w:pPr>
-      <w:bookmarkStart w:id="32" w:name="_Toc223885322"/>
+      <w:bookmarkStart w:id="35" w:name="_Toc223886383"/>
       <w:r>
         <w:lastRenderedPageBreak/>
         <w:t>Results</w:t>
       </w:r>
-      <w:bookmarkEnd w:id="32"/>
+      <w:bookmarkEnd w:id="35"/>
     </w:p>
     <w:p>
       <w:pPr>
         <w:pStyle w:val="Heading2"/>
       </w:pPr>
-      <w:bookmarkStart w:id="33" w:name="_Toc223885323"/>
+      <w:bookmarkStart w:id="36" w:name="_Toc223886384"/>
       <w:r>
         <w:t>Prototype Tests</w:t>
       </w:r>
-      <w:bookmarkEnd w:id="33"/>
+      <w:bookmarkEnd w:id="36"/>
     </w:p>
     <w:p>
       <w:r>
@@ -9629,7 +9925,7 @@
       <w:pPr>
         <w:pStyle w:val="Heading3"/>
       </w:pPr>
-      <w:bookmarkStart w:id="34" w:name="_Toc223885324"/>
+      <w:bookmarkStart w:id="37" w:name="_Toc223886385"/>
       <w:r>
         <w:t>Interaction</w:t>
       </w:r>
@@ -9639,7 +9935,7 @@
       <w:r>
         <w:t xml:space="preserve"> and Objective Understanding</w:t>
       </w:r>
-      <w:bookmarkEnd w:id="34"/>
+      <w:bookmarkEnd w:id="37"/>
     </w:p>
     <w:p>
       <w:r>
@@ -9790,11 +10086,11 @@
       <w:pPr>
         <w:pStyle w:val="Heading3"/>
       </w:pPr>
-      <w:bookmarkStart w:id="35" w:name="_Toc223885325"/>
+      <w:bookmarkStart w:id="38" w:name="_Toc223886386"/>
       <w:r>
         <w:t>User Attention Detection</w:t>
       </w:r>
-      <w:bookmarkEnd w:id="35"/>
+      <w:bookmarkEnd w:id="38"/>
     </w:p>
     <w:p>
       <w:r>
@@ -9847,11 +10143,11 @@
       <w:pPr>
         <w:pStyle w:val="Heading3"/>
       </w:pPr>
-      <w:bookmarkStart w:id="36" w:name="_Toc223885326"/>
+      <w:bookmarkStart w:id="39" w:name="_Toc223886387"/>
       <w:r>
         <w:t>Symptom Simulations</w:t>
       </w:r>
-      <w:bookmarkEnd w:id="36"/>
+      <w:bookmarkEnd w:id="39"/>
     </w:p>
     <w:p>
       <w:r>
@@ -9989,7 +10285,7 @@
       <w:pPr>
         <w:pStyle w:val="Heading3"/>
       </w:pPr>
-      <w:bookmarkStart w:id="37" w:name="_Toc223885327"/>
+      <w:bookmarkStart w:id="40" w:name="_Toc223886388"/>
       <w:r>
         <w:t xml:space="preserve">Improvements to be </w:t>
       </w:r>
@@ -9999,7 +10295,7 @@
       <w:r>
         <w:t>ade</w:t>
       </w:r>
-      <w:bookmarkEnd w:id="37"/>
+      <w:bookmarkEnd w:id="40"/>
     </w:p>
     <w:p>
       <w:r>
@@ -10011,8 +10307,9 @@
       <w:r>
         <w:t xml:space="preserve"> reducing the frustration of completing objectives three and four. </w:t>
       </w:r>
-    </w:p>
-    <w:p>
+      <w:r>
+        <w:t xml:space="preserve"> </w:t>
+      </w:r>
       <w:r>
         <w:t>In addition to this, another improvement includes adding a delay to the change between objectives four and five to allow enough time for the reversal of the light sensitivity symptom. To strengthen this improvement</w:t>
       </w:r>
@@ -10022,21 +10319,33 @@
       <w:r>
         <w:t xml:space="preserve"> the duration of the timeline reversal will be altered so that it does not take as long to execute the symptom reversal.</w:t>
       </w:r>
-    </w:p>
-    <w:p>
+      <w:r>
+        <w:t xml:space="preserve"> </w:t>
+      </w:r>
       <w:r>
         <w:t>Furthermore, changing the single line trace used for user detection to a channel with a wider area of detection will help to ease frustration and difficulty of progression through the experience using the gaze interaction objects.</w:t>
       </w:r>
     </w:p>
     <w:p>
-      <w:pPr>
-        <w:pStyle w:val="Heading2"/>
-      </w:pPr>
-      <w:bookmarkStart w:id="38" w:name="_Toc223885328"/>
-      <w:r>
+      <w:r>
+        <w:br w:type="page"/>
+      </w:r>
+    </w:p>
+    <w:p>
+      <w:pPr>
+        <w:pStyle w:val="Heading3"/>
+        <w:rPr>
+          <w:rFonts w:asciiTheme="majorHAnsi" w:hAnsiTheme="majorHAnsi"/>
+          <w:sz w:val="32"/>
+          <w:szCs w:val="32"/>
+        </w:rPr>
+      </w:pPr>
+      <w:bookmarkStart w:id="41" w:name="_Toc223886389"/>
+      <w:r>
+        <w:lastRenderedPageBreak/>
         <w:t>Final Version Tests</w:t>
       </w:r>
-      <w:bookmarkEnd w:id="38"/>
+      <w:bookmarkEnd w:id="41"/>
     </w:p>
     <w:p>
       <w:r>
@@ -10071,36 +10380,74 @@
       <w:pPr>
         <w:pStyle w:val="Heading3"/>
       </w:pPr>
-      <w:bookmarkStart w:id="39" w:name="_Toc223885329"/>
+      <w:bookmarkStart w:id="42" w:name="_Toc223886390"/>
       <w:r>
         <w:t>Interaction Objects and Objective Understanding</w:t>
       </w:r>
-      <w:bookmarkEnd w:id="39"/>
+      <w:bookmarkEnd w:id="42"/>
+    </w:p>
+    <w:p>
+      <w:pPr>
+        <w:pStyle w:val="ListParagraph"/>
+        <w:numPr>
+          <w:ilvl w:val="0"/>
+          <w:numId w:val="12"/>
+        </w:numPr>
+      </w:pPr>
+      <w:r>
+        <w:t xml:space="preserve">Interactions with the light switch improved, </w:t>
+      </w:r>
+      <w:r>
+        <w:t>created a cleaner feel within the experience as the clunky feeling with the light switch was resolved. Objective transitions became clearer after the timeline adjustment was made, there was a clearer improvement to showing the preventative measure working with reverting the bloom post processing effect triggered from simulating the light sensitivity symptom.</w:t>
+      </w:r>
     </w:p>
     <w:p>
       <w:pPr>
         <w:pStyle w:val="Heading3"/>
       </w:pPr>
-      <w:bookmarkStart w:id="40" w:name="_Toc223885330"/>
+      <w:bookmarkStart w:id="43" w:name="_Toc223886391"/>
       <w:r>
         <w:t>User Attention Detection</w:t>
       </w:r>
-      <w:bookmarkEnd w:id="40"/>
+      <w:bookmarkEnd w:id="43"/>
+    </w:p>
+    <w:p>
+      <w:pPr>
+        <w:pStyle w:val="ListParagraph"/>
+        <w:numPr>
+          <w:ilvl w:val="0"/>
+          <w:numId w:val="12"/>
+        </w:numPr>
+      </w:pPr>
+      <w:r>
+        <w:t>Having a wider area of detection now the line trace was changed to a capsule trace made gaze interactions better for users, removing the feeling of frustration from having to be so precise with where they were looking. Progress bar felt more consistent as it didn’t look glitchy from the line trace going out of the area of interaction object and back in constantly.</w:t>
+      </w:r>
     </w:p>
     <w:p>
       <w:pPr>
         <w:pStyle w:val="Heading3"/>
       </w:pPr>
-      <w:bookmarkStart w:id="41" w:name="_Toc223885331"/>
+      <w:bookmarkStart w:id="44" w:name="_Toc223886392"/>
       <w:r>
         <w:t>Symptom Simulation</w:t>
       </w:r>
       <w:r>
         <w:t>s</w:t>
       </w:r>
-      <w:bookmarkEnd w:id="41"/>
-    </w:p>
-    <w:p/>
+      <w:bookmarkEnd w:id="44"/>
+    </w:p>
+    <w:p>
+      <w:pPr>
+        <w:pStyle w:val="ListParagraph"/>
+        <w:numPr>
+          <w:ilvl w:val="0"/>
+          <w:numId w:val="12"/>
+        </w:numPr>
+      </w:pPr>
+      <w:r>
+        <w:t>Effects were able to remain as intended even with the new improvements made, the information being taught was still effective for users and there wasn’t a negative impact from the changes made to improve the experience.</w:t>
+      </w:r>
+    </w:p>
     <w:p>
       <w:r>
         <w:br w:type="page"/>
@@ -10110,12 +10457,12 @@
       <w:pPr>
         <w:pStyle w:val="Heading1"/>
       </w:pPr>
-      <w:bookmarkStart w:id="42" w:name="_Toc223885332"/>
+      <w:bookmarkStart w:id="45" w:name="_Toc223886393"/>
       <w:r>
         <w:lastRenderedPageBreak/>
         <w:t>Critical Evaluation</w:t>
       </w:r>
-      <w:bookmarkEnd w:id="42"/>
+      <w:bookmarkEnd w:id="45"/>
     </w:p>
     <w:p>
       <w:pPr>
@@ -10137,12 +10484,12 @@
       <w:pPr>
         <w:pStyle w:val="Heading1"/>
       </w:pPr>
-      <w:bookmarkStart w:id="43" w:name="_Toc223885333"/>
+      <w:bookmarkStart w:id="46" w:name="_Toc223886394"/>
       <w:r>
         <w:lastRenderedPageBreak/>
         <w:t>Conclusions and Future Work</w:t>
       </w:r>
-      <w:bookmarkEnd w:id="43"/>
+      <w:bookmarkEnd w:id="46"/>
     </w:p>
     <w:p>
       <w:pPr>
@@ -10187,12 +10534,12 @@
       <w:pPr>
         <w:pStyle w:val="Heading1"/>
       </w:pPr>
-      <w:bookmarkStart w:id="44" w:name="_Toc223885334"/>
+      <w:bookmarkStart w:id="47" w:name="_Toc223886395"/>
       <w:r>
         <w:lastRenderedPageBreak/>
         <w:t>References</w:t>
       </w:r>
-      <w:bookmarkEnd w:id="44"/>
+      <w:bookmarkEnd w:id="47"/>
     </w:p>
     <w:p>
       <w:proofErr w:type="spellStart"/>
@@ -10480,32 +10827,32 @@
       <w:pPr>
         <w:pStyle w:val="Heading1"/>
       </w:pPr>
-      <w:bookmarkStart w:id="45" w:name="_Toc223885335"/>
+      <w:bookmarkStart w:id="48" w:name="_Toc223886396"/>
       <w:r>
         <w:lastRenderedPageBreak/>
         <w:t>Appendix</w:t>
       </w:r>
-      <w:bookmarkEnd w:id="45"/>
+      <w:bookmarkEnd w:id="48"/>
     </w:p>
     <w:p>
       <w:pPr>
         <w:pStyle w:val="Heading2"/>
       </w:pPr>
-      <w:bookmarkStart w:id="46" w:name="_Toc223885336"/>
+      <w:bookmarkStart w:id="49" w:name="_Toc223886397"/>
       <w:r>
         <w:t>Asset Licenses and Sources</w:t>
       </w:r>
-      <w:bookmarkEnd w:id="46"/>
+      <w:bookmarkEnd w:id="49"/>
     </w:p>
     <w:p>
       <w:pPr>
         <w:pStyle w:val="Heading3"/>
       </w:pPr>
-      <w:bookmarkStart w:id="47" w:name="_Toc223885337"/>
+      <w:bookmarkStart w:id="50" w:name="_Toc223886398"/>
       <w:r>
         <w:t>Modern Office Table</w:t>
       </w:r>
-      <w:bookmarkEnd w:id="47"/>
+      <w:bookmarkEnd w:id="50"/>
     </w:p>
     <w:p>
       <w:r>
@@ -10585,11 +10932,11 @@
       <w:pPr>
         <w:pStyle w:val="Heading3"/>
       </w:pPr>
-      <w:bookmarkStart w:id="48" w:name="_Toc223885338"/>
+      <w:bookmarkStart w:id="51" w:name="_Toc223886399"/>
       <w:r>
         <w:t>Free Studio Starter Pack</w:t>
       </w:r>
-      <w:bookmarkEnd w:id="48"/>
+      <w:bookmarkEnd w:id="51"/>
     </w:p>
     <w:p>
       <w:r>
@@ -10669,11 +11016,11 @@
       <w:pPr>
         <w:pStyle w:val="Heading3"/>
       </w:pPr>
-      <w:bookmarkStart w:id="49" w:name="_Toc223885339"/>
+      <w:bookmarkStart w:id="52" w:name="_Toc223886400"/>
       <w:r>
         <w:t>General Desktop Bundle</w:t>
       </w:r>
-      <w:bookmarkEnd w:id="49"/>
+      <w:bookmarkEnd w:id="52"/>
     </w:p>
     <w:p>
       <w:r>
@@ -10753,12 +11100,12 @@
       <w:pPr>
         <w:pStyle w:val="Heading3"/>
       </w:pPr>
-      <w:bookmarkStart w:id="50" w:name="_Toc223885340"/>
+      <w:bookmarkStart w:id="53" w:name="_Toc223886401"/>
       <w:r>
         <w:lastRenderedPageBreak/>
         <w:t>General Gaming Headset</w:t>
       </w:r>
-      <w:bookmarkEnd w:id="50"/>
+      <w:bookmarkEnd w:id="53"/>
     </w:p>
     <w:p>
       <w:r>
@@ -10838,11 +11185,11 @@
       <w:pPr>
         <w:pStyle w:val="Heading3"/>
       </w:pPr>
-      <w:bookmarkStart w:id="51" w:name="_Toc223885341"/>
+      <w:bookmarkStart w:id="54" w:name="_Toc223886402"/>
       <w:r>
         <w:t>General Gaming Chair</w:t>
       </w:r>
-      <w:bookmarkEnd w:id="51"/>
+      <w:bookmarkEnd w:id="54"/>
     </w:p>
     <w:p>
       <w:r>
@@ -10922,11 +11269,11 @@
       <w:pPr>
         <w:pStyle w:val="Heading3"/>
       </w:pPr>
-      <w:bookmarkStart w:id="52" w:name="_Toc223885342"/>
+      <w:bookmarkStart w:id="55" w:name="_Toc223886403"/>
       <w:r>
         <w:t>Light Switch</w:t>
       </w:r>
-      <w:bookmarkEnd w:id="52"/>
+      <w:bookmarkEnd w:id="55"/>
     </w:p>
     <w:p>
       <w:r>
@@ -11020,7 +11367,7 @@
       <w:pPr>
         <w:pStyle w:val="Heading3"/>
       </w:pPr>
-      <w:bookmarkStart w:id="53" w:name="_Toc223885343"/>
+      <w:bookmarkStart w:id="56" w:name="_Toc223886404"/>
       <w:r>
         <w:lastRenderedPageBreak/>
         <w:t>Materials for General PC setup</w:t>
@@ -11028,7 +11375,7 @@
       <w:r>
         <w:t xml:space="preserve"> and Scenes</w:t>
       </w:r>
-      <w:bookmarkEnd w:id="53"/>
+      <w:bookmarkEnd w:id="56"/>
     </w:p>
     <w:p>
       <w:r>
@@ -11150,12 +11497,12 @@
       <w:pPr>
         <w:pStyle w:val="Heading3"/>
       </w:pPr>
-      <w:bookmarkStart w:id="54" w:name="_Toc223885344"/>
+      <w:bookmarkStart w:id="57" w:name="_Toc223886405"/>
       <w:r>
         <w:lastRenderedPageBreak/>
         <w:t>Monitor background image</w:t>
       </w:r>
-      <w:bookmarkEnd w:id="54"/>
+      <w:bookmarkEnd w:id="57"/>
     </w:p>
     <w:p>
       <w:r>
@@ -11246,7 +11593,7 @@
       <w:pPr>
         <w:pStyle w:val="Heading3"/>
       </w:pPr>
-      <w:bookmarkStart w:id="55" w:name="_Toc223885345"/>
+      <w:bookmarkStart w:id="58" w:name="_Toc223886406"/>
       <w:r>
         <w:lastRenderedPageBreak/>
         <w:t xml:space="preserve">Button Hover </w:t>
@@ -11263,7 +11610,7 @@
       <w:r>
         <w:t>Fachii</w:t>
       </w:r>
-      <w:bookmarkEnd w:id="55"/>
+      <w:bookmarkEnd w:id="58"/>
       <w:proofErr w:type="spellEnd"/>
     </w:p>
     <w:p>
@@ -11359,7 +11706,7 @@
     </w:p>
     <w:p/>
     <w:p>
-      <w:bookmarkStart w:id="56" w:name="_Toc223885346"/>
+      <w:bookmarkStart w:id="59" w:name="_Toc223886407"/>
       <w:r>
         <w:rPr>
           <w:rStyle w:val="Heading3Char"/>
@@ -11387,7 +11734,7 @@
         </w:rPr>
         <w:t>AndrewEathan</w:t>
       </w:r>
-      <w:bookmarkEnd w:id="56"/>
+      <w:bookmarkEnd w:id="59"/>
       <w:proofErr w:type="spellEnd"/>
       <w:r>
         <w:t xml:space="preserve"> </w:t>
@@ -11494,7 +11841,7 @@
       <w:pPr>
         <w:pStyle w:val="Heading3"/>
       </w:pPr>
-      <w:bookmarkStart w:id="57" w:name="_Toc223885347"/>
+      <w:bookmarkStart w:id="60" w:name="_Toc223886408"/>
       <w:r>
         <w:lastRenderedPageBreak/>
         <w:t xml:space="preserve">Light Switch </w:t>
@@ -11511,7 +11858,7 @@
       <w:r>
         <w:t>Sfx</w:t>
       </w:r>
-      <w:bookmarkEnd w:id="57"/>
+      <w:bookmarkEnd w:id="60"/>
       <w:proofErr w:type="spellEnd"/>
     </w:p>
     <w:p>
@@ -11602,7 +11949,7 @@
       <w:pPr>
         <w:pStyle w:val="Heading3"/>
       </w:pPr>
-      <w:bookmarkStart w:id="58" w:name="_Toc223885348"/>
+      <w:bookmarkStart w:id="61" w:name="_Toc223886409"/>
       <w:r>
         <w:t xml:space="preserve">Light Switch Off </w:t>
       </w:r>
@@ -11610,7 +11957,7 @@
       <w:r>
         <w:t>Sfx</w:t>
       </w:r>
-      <w:bookmarkEnd w:id="58"/>
+      <w:bookmarkEnd w:id="61"/>
       <w:proofErr w:type="spellEnd"/>
     </w:p>
     <w:p>
@@ -12498,11 +12845,10 @@
     </w:lvl>
   </w:abstractNum>
   <w:abstractNum w:abstractNumId="7" w15:restartNumberingAfterBreak="0">
-    <w:nsid w:val="5BDF51FB"/>
+    <w:nsid w:val="3DF816AC"/>
     <w:multiLevelType w:val="hybridMultilevel"/>
-    <w:tmpl w:val="7B48E138"/>
-    <w:lvl w:ilvl="0" w:tplc="B1686156">
-      <w:start w:val="4206"/>
+    <w:tmpl w:val="AEA6B9DE"/>
+    <w:lvl w:ilvl="0" w:tplc="7B620192">
       <w:numFmt w:val="bullet"/>
       <w:lvlText w:val="-"/>
       <w:lvlJc w:val="left"/>
@@ -12611,6 +12957,119 @@
     </w:lvl>
   </w:abstractNum>
   <w:abstractNum w:abstractNumId="8" w15:restartNumberingAfterBreak="0">
+    <w:nsid w:val="5BDF51FB"/>
+    <w:multiLevelType w:val="hybridMultilevel"/>
+    <w:tmpl w:val="7B48E138"/>
+    <w:lvl w:ilvl="0" w:tplc="B1686156">
+      <w:start w:val="4206"/>
+      <w:numFmt w:val="bullet"/>
+      <w:lvlText w:val="-"/>
+      <w:lvlJc w:val="left"/>
+      <w:pPr>
+        <w:ind w:left="720" w:hanging="360"/>
+      </w:pPr>
+      <w:rPr>
+        <w:rFonts w:ascii="Aptos" w:eastAsiaTheme="minorHAnsi" w:hAnsi="Aptos" w:cstheme="minorBidi" w:hint="default"/>
+      </w:rPr>
+    </w:lvl>
+    <w:lvl w:ilvl="1" w:tplc="08090003" w:tentative="1">
+      <w:start w:val="1"/>
+      <w:numFmt w:val="bullet"/>
+      <w:lvlText w:val="o"/>
+      <w:lvlJc w:val="left"/>
+      <w:pPr>
+        <w:ind w:left="1440" w:hanging="360"/>
+      </w:pPr>
+      <w:rPr>
+        <w:rFonts w:ascii="Courier New" w:hAnsi="Courier New" w:cs="Courier New" w:hint="default"/>
+      </w:rPr>
+    </w:lvl>
+    <w:lvl w:ilvl="2" w:tplc="08090005" w:tentative="1">
+      <w:start w:val="1"/>
+      <w:numFmt w:val="bullet"/>
+      <w:lvlText w:val=""/>
+      <w:lvlJc w:val="left"/>
+      <w:pPr>
+        <w:ind w:left="2160" w:hanging="360"/>
+      </w:pPr>
+      <w:rPr>
+        <w:rFonts w:ascii="Wingdings" w:hAnsi="Wingdings" w:hint="default"/>
+      </w:rPr>
+    </w:lvl>
+    <w:lvl w:ilvl="3" w:tplc="08090001" w:tentative="1">
+      <w:start w:val="1"/>
+      <w:numFmt w:val="bullet"/>
+      <w:lvlText w:val=""/>
+      <w:lvlJc w:val="left"/>
+      <w:pPr>
+        <w:ind w:left="2880" w:hanging="360"/>
+      </w:pPr>
+      <w:rPr>
+        <w:rFonts w:ascii="Symbol" w:hAnsi="Symbol" w:hint="default"/>
+      </w:rPr>
+    </w:lvl>
+    <w:lvl w:ilvl="4" w:tplc="08090003" w:tentative="1">
+      <w:start w:val="1"/>
+      <w:numFmt w:val="bullet"/>
+      <w:lvlText w:val="o"/>
+      <w:lvlJc w:val="left"/>
+      <w:pPr>
+        <w:ind w:left="3600" w:hanging="360"/>
+      </w:pPr>
+      <w:rPr>
+        <w:rFonts w:ascii="Courier New" w:hAnsi="Courier New" w:cs="Courier New" w:hint="default"/>
+      </w:rPr>
+    </w:lvl>
+    <w:lvl w:ilvl="5" w:tplc="08090005" w:tentative="1">
+      <w:start w:val="1"/>
+      <w:numFmt w:val="bullet"/>
+      <w:lvlText w:val=""/>
+      <w:lvlJc w:val="left"/>
+      <w:pPr>
+        <w:ind w:left="4320" w:hanging="360"/>
+      </w:pPr>
+      <w:rPr>
+        <w:rFonts w:ascii="Wingdings" w:hAnsi="Wingdings" w:hint="default"/>
+      </w:rPr>
+    </w:lvl>
+    <w:lvl w:ilvl="6" w:tplc="08090001" w:tentative="1">
+      <w:start w:val="1"/>
+      <w:numFmt w:val="bullet"/>
+      <w:lvlText w:val=""/>
+      <w:lvlJc w:val="left"/>
+      <w:pPr>
+        <w:ind w:left="5040" w:hanging="360"/>
+      </w:pPr>
+      <w:rPr>
+        <w:rFonts w:ascii="Symbol" w:hAnsi="Symbol" w:hint="default"/>
+      </w:rPr>
+    </w:lvl>
+    <w:lvl w:ilvl="7" w:tplc="08090003" w:tentative="1">
+      <w:start w:val="1"/>
+      <w:numFmt w:val="bullet"/>
+      <w:lvlText w:val="o"/>
+      <w:lvlJc w:val="left"/>
+      <w:pPr>
+        <w:ind w:left="5760" w:hanging="360"/>
+      </w:pPr>
+      <w:rPr>
+        <w:rFonts w:ascii="Courier New" w:hAnsi="Courier New" w:cs="Courier New" w:hint="default"/>
+      </w:rPr>
+    </w:lvl>
+    <w:lvl w:ilvl="8" w:tplc="08090005" w:tentative="1">
+      <w:start w:val="1"/>
+      <w:numFmt w:val="bullet"/>
+      <w:lvlText w:val=""/>
+      <w:lvlJc w:val="left"/>
+      <w:pPr>
+        <w:ind w:left="6480" w:hanging="360"/>
+      </w:pPr>
+      <w:rPr>
+        <w:rFonts w:ascii="Wingdings" w:hAnsi="Wingdings" w:hint="default"/>
+      </w:rPr>
+    </w:lvl>
+  </w:abstractNum>
+  <w:abstractNum w:abstractNumId="9" w15:restartNumberingAfterBreak="0">
     <w:nsid w:val="60695550"/>
     <w:multiLevelType w:val="hybridMultilevel"/>
     <w:tmpl w:val="3F0E459E"/>
@@ -12723,7 +13182,7 @@
       </w:rPr>
     </w:lvl>
   </w:abstractNum>
-  <w:abstractNum w:abstractNumId="9" w15:restartNumberingAfterBreak="0">
+  <w:abstractNum w:abstractNumId="10" w15:restartNumberingAfterBreak="0">
     <w:nsid w:val="623F4563"/>
     <w:multiLevelType w:val="hybridMultilevel"/>
     <w:tmpl w:val="57CEFC9E"/>
@@ -12835,7 +13294,7 @@
       </w:rPr>
     </w:lvl>
   </w:abstractNum>
-  <w:abstractNum w:abstractNumId="10" w15:restartNumberingAfterBreak="0">
+  <w:abstractNum w:abstractNumId="11" w15:restartNumberingAfterBreak="0">
     <w:nsid w:val="7EB9593C"/>
     <w:multiLevelType w:val="hybridMultilevel"/>
     <w:tmpl w:val="2AC89758"/>
@@ -12928,25 +13387,25 @@
     <w:abstractNumId w:val="0"/>
   </w:num>
   <w:num w:numId="2" w16cid:durableId="1684430893">
-    <w:abstractNumId w:val="7"/>
+    <w:abstractNumId w:val="8"/>
   </w:num>
   <w:num w:numId="3" w16cid:durableId="1581481780">
     <w:abstractNumId w:val="4"/>
   </w:num>
   <w:num w:numId="4" w16cid:durableId="1660115902">
-    <w:abstractNumId w:val="9"/>
+    <w:abstractNumId w:val="10"/>
   </w:num>
   <w:num w:numId="5" w16cid:durableId="252710067">
     <w:abstractNumId w:val="5"/>
   </w:num>
   <w:num w:numId="6" w16cid:durableId="447509088">
-    <w:abstractNumId w:val="8"/>
+    <w:abstractNumId w:val="9"/>
   </w:num>
   <w:num w:numId="7" w16cid:durableId="721564270">
     <w:abstractNumId w:val="3"/>
   </w:num>
   <w:num w:numId="8" w16cid:durableId="421604762">
-    <w:abstractNumId w:val="10"/>
+    <w:abstractNumId w:val="11"/>
   </w:num>
   <w:num w:numId="9" w16cid:durableId="1404716916">
     <w:abstractNumId w:val="2"/>
@@ -12956,6 +13415,9 @@
   </w:num>
   <w:num w:numId="11" w16cid:durableId="425536714">
     <w:abstractNumId w:val="6"/>
+  </w:num>
+  <w:num w:numId="12" w16cid:durableId="144246511">
+    <w:abstractNumId w:val="7"/>
   </w:num>
 </w:numbering>
 </file>

</xml_diff>

<commit_message>
Interaction objects paragraph for final version testing completed
</commit_message>
<xml_diff>
--- a/30077548Thesis.docx
+++ b/30077548Thesis.docx
@@ -5218,13 +5218,8 @@
       <w:r>
         <w:t xml:space="preserve">. </w:t>
       </w:r>
-      <w:proofErr w:type="spellStart"/>
-      <w:r>
-        <w:t>Porcar</w:t>
-      </w:r>
-      <w:proofErr w:type="spellEnd"/>
-      <w:r>
-        <w:t xml:space="preserve"> et al., </w:t>
+      <w:r>
+        <w:t xml:space="preserve">Porcar et al., </w:t>
       </w:r>
       <w:r>
         <w:t>(</w:t>
@@ -5264,13 +5259,8 @@
       <w:r>
         <w:t xml:space="preserve">Research conducted by </w:t>
       </w:r>
-      <w:proofErr w:type="spellStart"/>
-      <w:r>
-        <w:t>Cantó</w:t>
-      </w:r>
-      <w:proofErr w:type="spellEnd"/>
-      <w:r>
-        <w:t xml:space="preserve">-Sancho et al., </w:t>
+      <w:r>
+        <w:t xml:space="preserve">Cantó-Sancho et al., </w:t>
       </w:r>
       <w:r>
         <w:t>(</w:t>
@@ -6913,21 +6903,7 @@
         <w:rPr>
           <w:rFonts w:cs="Arial"/>
         </w:rPr>
-        <w:t xml:space="preserve">Clear </w:t>
-      </w:r>
-      <w:proofErr w:type="gramStart"/>
-      <w:r>
-        <w:rPr>
-          <w:rFonts w:cs="Arial"/>
-        </w:rPr>
-        <w:t>on screen</w:t>
-      </w:r>
-      <w:proofErr w:type="gramEnd"/>
-      <w:r>
-        <w:rPr>
-          <w:rFonts w:cs="Arial"/>
-        </w:rPr>
-        <w:t xml:space="preserve"> prompts to guide and support users that aren’t familiar with VR equipment</w:t>
+        <w:t>Clear on screen prompts to guide and support users that aren’t familiar with VR equipment</w:t>
       </w:r>
     </w:p>
     <w:p>
@@ -7070,7 +7046,6 @@
         <w:pStyle w:val="Heading3"/>
       </w:pPr>
       <w:bookmarkStart w:id="11" w:name="_Toc223886359"/>
-      <w:proofErr w:type="spellStart"/>
       <w:r>
         <w:t>Ey</w:t>
       </w:r>
@@ -7081,7 +7056,6 @@
         <w:t>si</w:t>
       </w:r>
       <w:bookmarkEnd w:id="11"/>
-      <w:proofErr w:type="spellEnd"/>
     </w:p>
     <w:p>
       <w:r>
@@ -7096,11 +7070,9 @@
       <w:r>
         <w:t xml:space="preserve"> discussed </w:t>
       </w:r>
-      <w:proofErr w:type="spellStart"/>
       <w:r>
         <w:t>Eyesi</w:t>
       </w:r>
-      <w:proofErr w:type="spellEnd"/>
       <w:r>
         <w:t>,</w:t>
       </w:r>
@@ -7213,15 +7185,7 @@
         <w:t xml:space="preserve">In addition to this, there is an </w:t>
       </w:r>
       <w:r>
-        <w:t>online training portal (</w:t>
-      </w:r>
-      <w:proofErr w:type="spellStart"/>
-      <w:r>
-        <w:t>vrmnet</w:t>
-      </w:r>
-      <w:proofErr w:type="spellEnd"/>
-      <w:r>
-        <w:t xml:space="preserve">) </w:t>
+        <w:t xml:space="preserve">online training portal (vrmnet) </w:t>
       </w:r>
       <w:r>
         <w:t>allowing comparison between trainees</w:t>
@@ -7356,15 +7320,7 @@
         <w:t xml:space="preserve"> </w:t>
       </w:r>
       <w:r>
-        <w:t xml:space="preserve">While </w:t>
-      </w:r>
-      <w:proofErr w:type="spellStart"/>
-      <w:r>
-        <w:t>Eyesi</w:t>
-      </w:r>
-      <w:proofErr w:type="spellEnd"/>
-      <w:r>
-        <w:t xml:space="preserve"> is effective for medical training for medical professionals, </w:t>
+        <w:t xml:space="preserve">While Eyesi is effective for medical training for medical professionals, </w:t>
       </w:r>
       <w:r>
         <w:t xml:space="preserve">similar </w:t>
@@ -7387,12 +7343,10 @@
         <w:pStyle w:val="Heading3"/>
       </w:pPr>
       <w:bookmarkStart w:id="12" w:name="_Toc223886360"/>
-      <w:proofErr w:type="spellStart"/>
       <w:r>
         <w:t>OntoPhaco</w:t>
       </w:r>
       <w:bookmarkEnd w:id="12"/>
-      <w:proofErr w:type="spellEnd"/>
     </w:p>
     <w:p>
       <w:r>
@@ -7411,15 +7365,7 @@
         <w:t>d</w:t>
       </w:r>
       <w:r>
-        <w:t xml:space="preserve"> </w:t>
-      </w:r>
-      <w:proofErr w:type="spellStart"/>
-      <w:r>
-        <w:t>OntoPhaco</w:t>
-      </w:r>
-      <w:proofErr w:type="spellEnd"/>
-      <w:r>
-        <w:t>, a</w:t>
+        <w:t xml:space="preserve"> OntoPhaco, a</w:t>
       </w:r>
       <w:r>
         <w:t>n</w:t>
@@ -7552,191 +7498,173 @@
           <w:rFonts w:cs="TimesLTStd-Roman"/>
           <w:kern w:val="0"/>
         </w:rPr>
-        <w:t xml:space="preserve">Since </w:t>
-      </w:r>
-      <w:proofErr w:type="spellStart"/>
+        <w:t>Since OntoPhaco</w:t>
+      </w:r>
       <w:r>
         <w:rPr>
           <w:rFonts w:cs="TimesLTStd-Roman"/>
           <w:kern w:val="0"/>
         </w:rPr>
-        <w:t>OntoPhaco</w:t>
+        <w:t>’s</w:t>
       </w:r>
       <w:r>
         <w:rPr>
           <w:rFonts w:cs="TimesLTStd-Roman"/>
           <w:kern w:val="0"/>
         </w:rPr>
-        <w:t>’s</w:t>
-      </w:r>
-      <w:proofErr w:type="spellEnd"/>
+        <w:t xml:space="preserve"> </w:t>
+      </w:r>
+      <w:r>
+        <w:t>s</w:t>
+      </w:r>
+      <w:r>
+        <w:t xml:space="preserve">ystematic verification and validation processes </w:t>
+      </w:r>
+      <w:r>
+        <w:t>include</w:t>
+      </w:r>
+      <w:r>
+        <w:t xml:space="preserve"> </w:t>
+      </w:r>
+      <w:r>
+        <w:t xml:space="preserve">theoretical </w:t>
+      </w:r>
+      <w:r>
+        <w:t>evaluat</w:t>
+      </w:r>
+      <w:r>
+        <w:t xml:space="preserve">ion </w:t>
+      </w:r>
+      <w:r>
+        <w:t>and expert feedback</w:t>
+      </w:r>
       <w:r>
         <w:rPr>
           <w:rFonts w:cs="TimesLTStd-Roman"/>
           <w:kern w:val="0"/>
         </w:rPr>
-        <w:t xml:space="preserve"> </w:t>
-      </w:r>
-      <w:r>
-        <w:t>s</w:t>
-      </w:r>
-      <w:r>
-        <w:t xml:space="preserve">ystematic verification and validation processes </w:t>
-      </w:r>
-      <w:r>
-        <w:t>include</w:t>
-      </w:r>
-      <w:r>
-        <w:t xml:space="preserve"> </w:t>
-      </w:r>
-      <w:r>
-        <w:t xml:space="preserve">theoretical </w:t>
-      </w:r>
-      <w:r>
-        <w:t>evaluat</w:t>
-      </w:r>
-      <w:r>
-        <w:t xml:space="preserve">ion </w:t>
-      </w:r>
-      <w:r>
-        <w:t>and expert feedback</w:t>
+        <w:t xml:space="preserve">, each change, minor or major </w:t>
       </w:r>
       <w:r>
         <w:rPr>
           <w:rFonts w:cs="TimesLTStd-Roman"/>
           <w:kern w:val="0"/>
         </w:rPr>
-        <w:t xml:space="preserve">, each change, minor or major </w:t>
+        <w:t>is</w:t>
       </w:r>
       <w:r>
         <w:rPr>
           <w:rFonts w:cs="TimesLTStd-Roman"/>
           <w:kern w:val="0"/>
         </w:rPr>
-        <w:t>is</w:t>
+        <w:t xml:space="preserve"> verified and validate</w:t>
       </w:r>
       <w:r>
         <w:rPr>
           <w:rFonts w:cs="TimesLTStd-Roman"/>
           <w:kern w:val="0"/>
         </w:rPr>
-        <w:t xml:space="preserve"> verified and validate</w:t>
+        <w:t>d</w:t>
+      </w:r>
+      <w:r>
+        <w:t>.</w:t>
       </w:r>
       <w:r>
         <w:rPr>
           <w:rFonts w:cs="TimesLTStd-Roman"/>
           <w:kern w:val="0"/>
         </w:rPr>
-        <w:t>d</w:t>
-      </w:r>
-      <w:r>
-        <w:t>.</w:t>
+        <w:t xml:space="preserve"> </w:t>
       </w:r>
       <w:r>
         <w:rPr>
           <w:rFonts w:cs="TimesLTStd-Roman"/>
           <w:kern w:val="0"/>
         </w:rPr>
-        <w:t xml:space="preserve"> </w:t>
-      </w:r>
-      <w:proofErr w:type="spellStart"/>
+        <w:t>OntoPhaco demonstrates VR</w:t>
+      </w:r>
       <w:r>
         <w:rPr>
           <w:rFonts w:cs="TimesLTStd-Roman"/>
           <w:kern w:val="0"/>
         </w:rPr>
-        <w:t>OntoPhaco</w:t>
-      </w:r>
-      <w:proofErr w:type="spellEnd"/>
+        <w:t>’</w:t>
+      </w:r>
       <w:r>
         <w:rPr>
           <w:rFonts w:cs="TimesLTStd-Roman"/>
           <w:kern w:val="0"/>
         </w:rPr>
-        <w:t xml:space="preserve"> demonstrates VR</w:t>
+        <w:t xml:space="preserve">s effectiveness </w:t>
       </w:r>
       <w:r>
         <w:rPr>
           <w:rFonts w:cs="TimesLTStd-Roman"/>
           <w:kern w:val="0"/>
         </w:rPr>
-        <w:t>’</w:t>
+        <w:t xml:space="preserve">paired </w:t>
       </w:r>
       <w:r>
         <w:rPr>
           <w:rFonts w:cs="TimesLTStd-Roman"/>
           <w:kern w:val="0"/>
         </w:rPr>
-        <w:t xml:space="preserve">s effectiveness </w:t>
+        <w:t>with ontology for medical training</w:t>
       </w:r>
       <w:r>
         <w:rPr>
           <w:rFonts w:cs="TimesLTStd-Roman"/>
           <w:kern w:val="0"/>
         </w:rPr>
-        <w:t xml:space="preserve">paired </w:t>
+        <w:t>. T</w:t>
       </w:r>
       <w:r>
         <w:rPr>
           <w:rFonts w:cs="TimesLTStd-Roman"/>
           <w:kern w:val="0"/>
         </w:rPr>
-        <w:t>with ontology for medical training</w:t>
+        <w:t>his project</w:t>
       </w:r>
       <w:r>
         <w:rPr>
           <w:rFonts w:cs="TimesLTStd-Roman"/>
           <w:kern w:val="0"/>
         </w:rPr>
-        <w:t>. T</w:t>
+        <w:t xml:space="preserve"> applies similar immersi</w:t>
       </w:r>
       <w:r>
         <w:rPr>
           <w:rFonts w:cs="TimesLTStd-Roman"/>
           <w:kern w:val="0"/>
         </w:rPr>
-        <w:t>his project</w:t>
+        <w:t>ve</w:t>
       </w:r>
       <w:r>
         <w:rPr>
           <w:rFonts w:cs="TimesLTStd-Roman"/>
           <w:kern w:val="0"/>
         </w:rPr>
-        <w:t xml:space="preserve"> applies similar immersi</w:t>
+        <w:t xml:space="preserve"> and educational knowledge </w:t>
       </w:r>
       <w:r>
         <w:rPr>
           <w:rFonts w:cs="TimesLTStd-Roman"/>
           <w:kern w:val="0"/>
         </w:rPr>
-        <w:t>ve</w:t>
+        <w:t xml:space="preserve">for DES to raise awareness, </w:t>
       </w:r>
       <w:r>
         <w:rPr>
           <w:rFonts w:cs="TimesLTStd-Roman"/>
           <w:kern w:val="0"/>
         </w:rPr>
-        <w:t xml:space="preserve"> and educational knowledge </w:t>
+        <w:t xml:space="preserve">spreading the </w:t>
       </w:r>
       <w:r>
         <w:rPr>
           <w:rFonts w:cs="TimesLTStd-Roman"/>
           <w:kern w:val="0"/>
         </w:rPr>
-        <w:t xml:space="preserve">for DES to raise awareness, </w:t>
-      </w:r>
-      <w:r>
-        <w:rPr>
-          <w:rFonts w:cs="TimesLTStd-Roman"/>
-          <w:kern w:val="0"/>
-        </w:rPr>
-        <w:t xml:space="preserve">spreading the </w:t>
-      </w:r>
-      <w:r>
-        <w:rPr>
-          <w:rFonts w:cs="TimesLTStd-Roman"/>
-          <w:kern w:val="0"/>
-        </w:rPr>
         <w:t>benefits of VR use in education beyond professional training.</w:t>
       </w:r>
     </w:p>
@@ -7950,27 +7878,17 @@
       <w:r>
         <w:t xml:space="preserve">While </w:t>
       </w:r>
-      <w:proofErr w:type="spellStart"/>
-      <w:r>
-        <w:t>Eyesi</w:t>
-      </w:r>
-      <w:proofErr w:type="spellEnd"/>
-      <w:r>
-        <w:t xml:space="preserve"> focuses on hands on surgical practices</w:t>
+      <w:r>
+        <w:t>Eyesi focuses on hands on surgical practices</w:t>
       </w:r>
       <w:r>
         <w:t xml:space="preserve">, </w:t>
       </w:r>
-      <w:proofErr w:type="spellStart"/>
       <w:r>
         <w:t>O</w:t>
       </w:r>
       <w:r>
-        <w:t>ntoPhaco</w:t>
-      </w:r>
-      <w:proofErr w:type="spellEnd"/>
-      <w:r>
-        <w:t xml:space="preserve"> focuses on the way knowledge is represented and conceptual understanding</w:t>
+        <w:t>ntoPhaco focuses on the way knowledge is represented and conceptual understanding</w:t>
       </w:r>
       <w:r>
         <w:t xml:space="preserve">. </w:t>
@@ -8228,19 +8146,9 @@
       <w:r>
         <w:t xml:space="preserve">Examples such as </w:t>
       </w:r>
-      <w:proofErr w:type="spellStart"/>
-      <w:r>
-        <w:t>Mediverse</w:t>
-      </w:r>
-      <w:proofErr w:type="spellEnd"/>
-      <w:r>
-        <w:t xml:space="preserve"> by </w:t>
-      </w:r>
-      <w:proofErr w:type="spellStart"/>
-      <w:r>
-        <w:t>Goggleminds</w:t>
-      </w:r>
-      <w:proofErr w:type="spellEnd"/>
+      <w:r>
+        <w:t>Mediverse by Goggleminds</w:t>
+      </w:r>
       <w:r>
         <w:t xml:space="preserve"> </w:t>
       </w:r>
@@ -8254,38 +8162,25 @@
         <w:t xml:space="preserve"> to healthcare providers and medical schools</w:t>
       </w:r>
       <w:r>
+        <w:t>. ClassVR by Systems improve</w:t>
+      </w:r>
+      <w:r>
+        <w:t>s</w:t>
+      </w:r>
+      <w:r>
+        <w:t xml:space="preserve"> student engagement</w:t>
+      </w:r>
+      <w:r>
+        <w:t xml:space="preserve"> to help teachers with educating students on learning material</w:t>
+      </w:r>
+      <w:r>
         <w:t xml:space="preserve">. </w:t>
       </w:r>
-      <w:proofErr w:type="spellStart"/>
-      <w:r>
-        <w:t>ClassVR</w:t>
-      </w:r>
-      <w:proofErr w:type="spellEnd"/>
-      <w:r>
-        <w:t xml:space="preserve"> by Systems improve</w:t>
-      </w:r>
-      <w:r>
-        <w:t>s</w:t>
-      </w:r>
-      <w:r>
-        <w:t xml:space="preserve"> student engagement</w:t>
-      </w:r>
-      <w:r>
-        <w:t xml:space="preserve"> to help teachers with educating students on learning material</w:t>
-      </w:r>
-      <w:r>
-        <w:t xml:space="preserve">. </w:t>
-      </w:r>
-      <w:r>
-        <w:t xml:space="preserve"> </w:t>
-      </w:r>
-      <w:proofErr w:type="spellStart"/>
-      <w:r>
-        <w:t>PrismsVR</w:t>
-      </w:r>
-      <w:proofErr w:type="spellEnd"/>
-      <w:r>
-        <w:t xml:space="preserve"> </w:t>
+      <w:r>
+        <w:t xml:space="preserve"> </w:t>
+      </w:r>
+      <w:r>
+        <w:t xml:space="preserve">PrismsVR </w:t>
       </w:r>
       <w:r>
         <w:t xml:space="preserve">helps students grasp core concepts in algebra and geometry, by </w:t>
@@ -9407,15 +9302,7 @@
         <w:t>ere</w:t>
       </w:r>
       <w:r>
-        <w:t xml:space="preserve"> stored within the </w:t>
-      </w:r>
-      <w:proofErr w:type="spellStart"/>
-      <w:r>
-        <w:t>VRGameMode</w:t>
-      </w:r>
-      <w:proofErr w:type="spellEnd"/>
-      <w:r>
-        <w:t xml:space="preserve"> blueprint, with objectives being updated during runtime as conditions were satisfied </w:t>
+        <w:t xml:space="preserve"> stored within the VRGameMode blueprint, with objectives being updated during runtime as conditions were satisfied </w:t>
       </w:r>
       <w:r>
         <w:t>during</w:t>
@@ -9661,15 +9548,7 @@
         <w:t>’s post processing component</w:t>
       </w:r>
       <w:r>
-        <w:t xml:space="preserve">. These effects were </w:t>
-      </w:r>
-      <w:proofErr w:type="gramStart"/>
-      <w:r>
-        <w:t>vignette</w:t>
-      </w:r>
-      <w:proofErr w:type="gramEnd"/>
-      <w:r>
-        <w:t xml:space="preserve"> to simulate eye fatigue, bloom for light sensitivity and blur for focus strain. Vignette and bloom post processing effects were triggered through adjusting their post processing variables within the camera post processing component. However, for blur a post processing material was required to create the radial blur. When objectives progressed triggering the simulation of symptoms, a timeline was used to progressively increase the value of an effect gradually over a duration. This decision was made to accommodate eyes adjusting to the changes of the camera as these effects were being triggered.</w:t>
+        <w:t>. These effects were vignette to simulate eye fatigue, bloom for light sensitivity and blur for focus strain. Vignette and bloom post processing effects were triggered through adjusting their post processing variables within the camera post processing component. However, for blur a post processing material was required to create the radial blur. When objectives progressed triggering the simulation of symptoms, a timeline was used to progressively increase the value of an effect gradually over a duration. This decision was made to accommodate eyes adjusting to the changes of the camera as these effects were being triggered.</w:t>
       </w:r>
       <w:r>
         <w:t xml:space="preserve"> The timeline was then used in reverse to revert the symptoms returning the camera view back to the original state it was in.</w:t>
@@ -9729,6 +9608,665 @@
         <w:t>Interaction Improvements</w:t>
       </w:r>
       <w:bookmarkEnd w:id="32"/>
+    </w:p>
+    <w:p>
+      <w:pPr>
+        <w:pStyle w:val="Heading3"/>
+      </w:pPr>
+      <w:bookmarkStart w:id="33" w:name="_Toc223886382"/>
+      <w:r>
+        <w:t>Flow Tweaks</w:t>
+      </w:r>
+    </w:p>
+    <w:p>
+      <w:r>
+        <w:t>By reducing the timeline duration between objectives 4 and 5 for triggering and reverting the light sensitivity symptom. The experience saw an improvement as the symptom effects were still able to be portrayed to users while still showing prevention methods worked.</w:t>
+      </w:r>
+    </w:p>
+    <w:p>
+      <w:pPr>
+        <w:pStyle w:val="Heading3"/>
+      </w:pPr>
+      <w:r>
+        <w:t>Gaze Detection Refinements</w:t>
+      </w:r>
+      <w:bookmarkEnd w:id="33"/>
+    </w:p>
+    <w:p>
+      <w:pPr>
+        <w:rPr>
+          <w:rFonts w:asciiTheme="majorHAnsi" w:eastAsiaTheme="majorEastAsia" w:hAnsiTheme="majorHAnsi" w:cstheme="majorBidi"/>
+          <w:color w:val="0F4761" w:themeColor="accent1" w:themeShade="BF"/>
+          <w:sz w:val="40"/>
+          <w:szCs w:val="40"/>
+        </w:rPr>
+      </w:pPr>
+      <w:r>
+        <w:br w:type="page"/>
+      </w:r>
+    </w:p>
+    <w:p>
+      <w:pPr>
+        <w:pStyle w:val="Heading1"/>
+      </w:pPr>
+      <w:bookmarkStart w:id="34" w:name="_Toc223886383"/>
+      <w:r>
+        <w:lastRenderedPageBreak/>
+        <w:t>Results</w:t>
+      </w:r>
+      <w:bookmarkEnd w:id="34"/>
+    </w:p>
+    <w:p>
+      <w:pPr>
+        <w:pStyle w:val="Heading2"/>
+      </w:pPr>
+      <w:bookmarkStart w:id="35" w:name="_Toc223886384"/>
+      <w:r>
+        <w:t>Prototype Tests</w:t>
+      </w:r>
+      <w:bookmarkEnd w:id="35"/>
+    </w:p>
+    <w:p>
+      <w:r>
+        <w:t xml:space="preserve">Tests were conducted to determine the </w:t>
+      </w:r>
+      <w:r>
+        <w:t>experience’</w:t>
+      </w:r>
+      <w:r>
+        <w:t>s</w:t>
+      </w:r>
+      <w:r>
+        <w:t xml:space="preserve"> s</w:t>
+      </w:r>
+      <w:r>
+        <w:t>trengths and weaknesse</w:t>
+      </w:r>
+      <w:r>
+        <w:t>s</w:t>
+      </w:r>
+      <w:r>
+        <w:t>. The</w:t>
+      </w:r>
+      <w:r>
+        <w:t xml:space="preserve"> aim of the</w:t>
+      </w:r>
+      <w:r>
+        <w:t xml:space="preserve"> tests </w:t>
+      </w:r>
+      <w:r>
+        <w:t>was</w:t>
+      </w:r>
+      <w:r>
+        <w:t xml:space="preserve"> </w:t>
+      </w:r>
+      <w:r>
+        <w:t>to gather information on how immersive, usable and functiona</w:t>
+      </w:r>
+      <w:r>
+        <w:t>l</w:t>
+      </w:r>
+      <w:r>
+        <w:t xml:space="preserve"> it was </w:t>
+      </w:r>
+      <w:r>
+        <w:t>during</w:t>
+      </w:r>
+      <w:r>
+        <w:t xml:space="preserve"> different </w:t>
+      </w:r>
+      <w:r>
+        <w:t xml:space="preserve">test </w:t>
+      </w:r>
+      <w:r>
+        <w:t>runs. Information gathered would then be used to evaluate</w:t>
+      </w:r>
+      <w:r>
+        <w:t xml:space="preserve"> </w:t>
+      </w:r>
+      <w:r>
+        <w:t>weaknesse</w:t>
+      </w:r>
+      <w:r>
+        <w:t>s, identify areas to</w:t>
+      </w:r>
+      <w:r>
+        <w:t xml:space="preserve"> improve and </w:t>
+      </w:r>
+      <w:r>
+        <w:t xml:space="preserve">gauge </w:t>
+      </w:r>
+      <w:r>
+        <w:t>how effectiv</w:t>
+      </w:r>
+      <w:r>
+        <w:t>ely</w:t>
+      </w:r>
+      <w:r>
+        <w:t xml:space="preserve"> the information being taught was received by testers. The following sections break down the tests completed</w:t>
+      </w:r>
+      <w:r>
+        <w:t xml:space="preserve">, </w:t>
+      </w:r>
+      <w:r>
+        <w:t>what observations were made and the evaluations reached to progress forward and achieve the aims and objectives set out at the start of this project.</w:t>
+      </w:r>
+    </w:p>
+    <w:p>
+      <w:pPr>
+        <w:pStyle w:val="Heading3"/>
+      </w:pPr>
+      <w:bookmarkStart w:id="36" w:name="_Toc223886385"/>
+      <w:r>
+        <w:t>Interaction</w:t>
+      </w:r>
+      <w:r>
+        <w:t xml:space="preserve"> Objects</w:t>
+      </w:r>
+      <w:r>
+        <w:t xml:space="preserve"> and Objective Understanding</w:t>
+      </w:r>
+      <w:bookmarkEnd w:id="36"/>
+    </w:p>
+    <w:p>
+      <w:r>
+        <w:t xml:space="preserve">Interaction objects worked as intended with none of the objects failing to carry out the tasks they were intended for. However, the hand collisions placed within the hand components of the VR Pawn </w:t>
+      </w:r>
+      <w:r>
+        <w:t>impair</w:t>
+      </w:r>
+      <w:r>
+        <w:t xml:space="preserve"> how well the player can interact with the light switch</w:t>
+      </w:r>
+      <w:r>
+        <w:t>. This is because</w:t>
+      </w:r>
+      <w:r>
+        <w:t xml:space="preserve"> </w:t>
+      </w:r>
+      <w:r>
+        <w:t xml:space="preserve">the hand component </w:t>
+      </w:r>
+      <w:r>
+        <w:t>cannot</w:t>
+      </w:r>
+      <w:r>
+        <w:t xml:space="preserve"> </w:t>
+      </w:r>
+      <w:r>
+        <w:t>move</w:t>
+      </w:r>
+      <w:r>
+        <w:t xml:space="preserve"> </w:t>
+      </w:r>
+      <w:r>
+        <w:t>far</w:t>
+      </w:r>
+      <w:r>
+        <w:t xml:space="preserve"> enough</w:t>
+      </w:r>
+      <w:r>
+        <w:t xml:space="preserve"> into the switch</w:t>
+      </w:r>
+      <w:r>
+        <w:t xml:space="preserve"> to trigger collisions </w:t>
+      </w:r>
+      <w:r>
+        <w:t>reliably</w:t>
+      </w:r>
+      <w:r>
+        <w:t xml:space="preserve">. It became increasingly noticeable that the light switch felt like it had its own behaviour and only turned on whenever it wanted to due to this. </w:t>
+      </w:r>
+      <w:r>
+        <w:t>This became increasingly frustrating for some users that should have been able to turn the light on or off within the first try.</w:t>
+      </w:r>
+    </w:p>
+    <w:p>
+      <w:r>
+        <w:t xml:space="preserve">During testing, users found it difficult to tell when the symptom was being reverted for light sensitivity before the completion of objective </w:t>
+      </w:r>
+      <w:r>
+        <w:t>five</w:t>
+      </w:r>
+      <w:r>
+        <w:t xml:space="preserve"> occurred</w:t>
+      </w:r>
+      <w:r>
+        <w:t>,</w:t>
+      </w:r>
+      <w:r>
+        <w:t xml:space="preserve"> triggering the bloom post processing </w:t>
+      </w:r>
+      <w:r>
+        <w:t>effect</w:t>
+      </w:r>
+      <w:r>
+        <w:t xml:space="preserve">. This occurred due to two </w:t>
+      </w:r>
+      <w:r>
+        <w:t>reasons</w:t>
+      </w:r>
+      <w:r>
+        <w:t>.</w:t>
+      </w:r>
+      <w:r>
+        <w:t xml:space="preserve"> </w:t>
+      </w:r>
+      <w:r>
+        <w:t>T</w:t>
+      </w:r>
+      <w:r>
+        <w:t>he first</w:t>
+      </w:r>
+      <w:r>
+        <w:t xml:space="preserve"> being</w:t>
+      </w:r>
+      <w:r>
+        <w:t xml:space="preserve"> the timeline duration was too long to apply or revert the post processing effect</w:t>
+      </w:r>
+      <w:r>
+        <w:t>. The second reason was that the</w:t>
+      </w:r>
+      <w:r>
+        <w:t xml:space="preserve"> conditions to satisfy objective </w:t>
+      </w:r>
+      <w:r>
+        <w:t>five</w:t>
+      </w:r>
+      <w:r>
+        <w:t xml:space="preserve"> were easy to complete</w:t>
+      </w:r>
+      <w:r>
+        <w:t>,</w:t>
+      </w:r>
+      <w:r>
+        <w:t xml:space="preserve"> causing the illusion of the light sensitivity symptom reversal barely working</w:t>
+      </w:r>
+      <w:r>
+        <w:t>,</w:t>
+      </w:r>
+      <w:r>
+        <w:t xml:space="preserve"> before the blur post processing material was applied.</w:t>
+      </w:r>
+      <w:r>
+        <w:t xml:space="preserve"> This result</w:t>
+      </w:r>
+      <w:r>
+        <w:t xml:space="preserve">ed in confusion </w:t>
+      </w:r>
+      <w:r>
+        <w:t>among</w:t>
+      </w:r>
+      <w:r>
+        <w:t xml:space="preserve"> users as the prevention method taken to revert light sensitivity seemed to not work</w:t>
+      </w:r>
+      <w:r>
+        <w:t>,</w:t>
+      </w:r>
+      <w:r>
+        <w:t xml:space="preserve"> giving a false view</w:t>
+      </w:r>
+      <w:r>
+        <w:t xml:space="preserve"> of how effective the preventative measure was</w:t>
+      </w:r>
+      <w:r>
+        <w:t>.</w:t>
+      </w:r>
+    </w:p>
+    <w:p>
+      <w:pPr>
+        <w:pStyle w:val="Heading3"/>
+      </w:pPr>
+      <w:bookmarkStart w:id="37" w:name="_Toc223886386"/>
+      <w:r>
+        <w:t>User Attention Detection</w:t>
+      </w:r>
+      <w:bookmarkEnd w:id="37"/>
+    </w:p>
+    <w:p>
+      <w:r>
+        <w:t>Feedback received overall was mixed, users felt frustrated due to how unforgiving the gaze detection felt, especially given that there was no cursor for aiming like a typical video game</w:t>
+      </w:r>
+      <w:r>
+        <w:t>. Due to this</w:t>
+      </w:r>
+      <w:r>
+        <w:t>,</w:t>
+      </w:r>
+      <w:r>
+        <w:t xml:space="preserve"> </w:t>
+      </w:r>
+      <w:r>
+        <w:t>users felt they were just</w:t>
+      </w:r>
+      <w:r>
+        <w:t xml:space="preserve"> randomly triggering the progress bar and </w:t>
+      </w:r>
+      <w:r>
+        <w:t>remaining</w:t>
+      </w:r>
+      <w:r>
+        <w:t xml:space="preserve"> in the same position as it filled up with the worry of slight moving resetting the progress.</w:t>
+      </w:r>
+      <w:r>
+        <w:t xml:space="preserve"> The reason the gaze detection felt like this was due to it using a sing</w:t>
+      </w:r>
+      <w:r>
+        <w:t>le</w:t>
+      </w:r>
+      <w:r>
+        <w:t xml:space="preserve"> line trace which was very precise </w:t>
+      </w:r>
+      <w:r>
+        <w:t>when</w:t>
+      </w:r>
+      <w:r>
+        <w:t xml:space="preserve"> detecting hits, which instead </w:t>
+      </w:r>
+      <w:r>
+        <w:t>could use a</w:t>
+      </w:r>
+      <w:r>
+        <w:t xml:space="preserve"> channel trace to expand the area of detection to be more forgiving.</w:t>
+      </w:r>
+    </w:p>
+    <w:p>
+      <w:pPr>
+        <w:pStyle w:val="Heading3"/>
+      </w:pPr>
+      <w:bookmarkStart w:id="38" w:name="_Toc223886387"/>
+      <w:r>
+        <w:t>Symptom Simulations</w:t>
+      </w:r>
+      <w:bookmarkEnd w:id="38"/>
+    </w:p>
+    <w:p>
+      <w:r>
+        <w:t>Positive feedback was received by users regarding symptom simulations</w:t>
+      </w:r>
+      <w:r>
+        <w:t>.</w:t>
+      </w:r>
+      <w:r>
+        <w:t xml:space="preserve"> </w:t>
+      </w:r>
+      <w:r>
+        <w:t xml:space="preserve">Overall, </w:t>
+      </w:r>
+      <w:r>
+        <w:t xml:space="preserve">the feedback showed </w:t>
+      </w:r>
+      <w:r>
+        <w:t>the way the symptoms were portrayed help</w:t>
+      </w:r>
+      <w:r>
+        <w:t>ed</w:t>
+      </w:r>
+      <w:r>
+        <w:t xml:space="preserve"> to</w:t>
+      </w:r>
+      <w:r>
+        <w:t xml:space="preserve"> give an understanding of recognising them when they experience</w:t>
+      </w:r>
+      <w:r>
+        <w:t>d</w:t>
+      </w:r>
+      <w:r>
+        <w:t xml:space="preserve"> it themselves.</w:t>
+      </w:r>
+      <w:r>
+        <w:t xml:space="preserve"> Eye fatigue was displayed using a vignette post processing effect</w:t>
+      </w:r>
+      <w:r>
+        <w:t>,</w:t>
+      </w:r>
+      <w:r>
+        <w:t xml:space="preserve"> to show darkening around the peripherals of one’s view</w:t>
+      </w:r>
+      <w:r>
+        <w:t>.</w:t>
+      </w:r>
+      <w:r>
+        <w:t xml:space="preserve"> </w:t>
+      </w:r>
+      <w:r>
+        <w:t>L</w:t>
+      </w:r>
+      <w:r>
+        <w:t xml:space="preserve">ight sensitivity </w:t>
+      </w:r>
+      <w:r>
+        <w:t xml:space="preserve">was </w:t>
+      </w:r>
+      <w:r>
+        <w:t xml:space="preserve">incorporated </w:t>
+      </w:r>
+      <w:r>
+        <w:t xml:space="preserve">with </w:t>
+      </w:r>
+      <w:r>
+        <w:t>a bloom post processing effect</w:t>
+      </w:r>
+      <w:r>
+        <w:t>,</w:t>
+      </w:r>
+      <w:r>
+        <w:t xml:space="preserve"> to show lights becoming more intense to individuals as the level of sensitivity to them increased.</w:t>
+      </w:r>
+      <w:r>
+        <w:t xml:space="preserve"> Focus strain was simulated by a radial blur post processing material to show how </w:t>
+      </w:r>
+      <w:r>
+        <w:t xml:space="preserve">the </w:t>
+      </w:r>
+      <w:r>
+        <w:t xml:space="preserve">view becomes distorted and unclear as the eyes </w:t>
+      </w:r>
+      <w:r>
+        <w:lastRenderedPageBreak/>
+        <w:t>become more strained.</w:t>
+      </w:r>
+      <w:r>
+        <w:t xml:space="preserve"> However, due to the limited number </w:t>
+      </w:r>
+      <w:r>
+        <w:t>of testers and the range between them</w:t>
+      </w:r>
+      <w:r>
+        <w:t>,</w:t>
+      </w:r>
+      <w:r>
+        <w:t xml:space="preserve"> there was difficulty in gauging the appropriate level of portrayal</w:t>
+      </w:r>
+      <w:r>
+        <w:t>.</w:t>
+      </w:r>
+      <w:r>
+        <w:t xml:space="preserve"> </w:t>
+      </w:r>
+      <w:r>
+        <w:t>A</w:t>
+      </w:r>
+      <w:r>
+        <w:t>ccommodat</w:t>
+      </w:r>
+      <w:r>
+        <w:t>ing</w:t>
+      </w:r>
+      <w:r>
+        <w:t xml:space="preserve"> the </w:t>
+      </w:r>
+      <w:r>
+        <w:t xml:space="preserve">vast </w:t>
+      </w:r>
+      <w:r>
+        <w:t>range of target audiences</w:t>
+      </w:r>
+      <w:r>
+        <w:t xml:space="preserve"> would be difficult</w:t>
+      </w:r>
+      <w:r>
+        <w:t>,</w:t>
+      </w:r>
+      <w:r>
+        <w:t xml:space="preserve"> due to symptom intensity or experiences ranging between different individuals.</w:t>
+      </w:r>
+    </w:p>
+    <w:p>
+      <w:pPr>
+        <w:pStyle w:val="Heading3"/>
+      </w:pPr>
+      <w:bookmarkStart w:id="39" w:name="_Toc223886388"/>
+      <w:r>
+        <w:t xml:space="preserve">Improvements to be </w:t>
+      </w:r>
+      <w:r>
+        <w:t>M</w:t>
+      </w:r>
+      <w:r>
+        <w:t>ade</w:t>
+      </w:r>
+      <w:bookmarkEnd w:id="39"/>
+    </w:p>
+    <w:p>
+      <w:r>
+        <w:t>To refine the quality of the experience, improvements need to be made across the different aspects of the application. One such improvement includes removing the physics collisions for the hand components within the VR Pawn class. Doing this will allow interactions with the light switch to work as intended</w:t>
+      </w:r>
+      <w:r>
+        <w:t>,</w:t>
+      </w:r>
+      <w:r>
+        <w:t xml:space="preserve"> reducing the frustration of completing objectives three and four. </w:t>
+      </w:r>
+      <w:r>
+        <w:t xml:space="preserve"> </w:t>
+      </w:r>
+      <w:r>
+        <w:t>In addition to this, another improvement includes adding a delay to the change between objectives four and five to allow enough time for the reversal of the light sensitivity symptom. To strengthen this improvement</w:t>
+      </w:r>
+      <w:r>
+        <w:t>,</w:t>
+      </w:r>
+      <w:r>
+        <w:t xml:space="preserve"> the duration of the timeline reversal will be altered so that it does not take as long to execute the symptom reversal.</w:t>
+      </w:r>
+      <w:r>
+        <w:t xml:space="preserve"> </w:t>
+      </w:r>
+      <w:r>
+        <w:t>Furthermore, changing the single line trace used for user detection to a channel with a wider area of detection will help to ease frustration and difficulty of progression through the experience using the gaze interaction objects.</w:t>
+      </w:r>
+    </w:p>
+    <w:p>
+      <w:r>
+        <w:br w:type="page"/>
+      </w:r>
+    </w:p>
+    <w:p>
+      <w:pPr>
+        <w:pStyle w:val="Heading3"/>
+        <w:rPr>
+          <w:rFonts w:asciiTheme="majorHAnsi" w:hAnsiTheme="majorHAnsi"/>
+          <w:sz w:val="32"/>
+          <w:szCs w:val="32"/>
+        </w:rPr>
+      </w:pPr>
+      <w:bookmarkStart w:id="40" w:name="_Toc223886389"/>
+      <w:r>
+        <w:lastRenderedPageBreak/>
+        <w:t>Final Version Tests</w:t>
+      </w:r>
+      <w:bookmarkEnd w:id="40"/>
+    </w:p>
+    <w:p>
+      <w:r>
+        <w:t xml:space="preserve">After the improvements carried out from the results of the prototype tests, a new set of tests </w:t>
+      </w:r>
+      <w:r>
+        <w:t>was</w:t>
+      </w:r>
+      <w:r>
+        <w:t xml:space="preserve"> carried out to ensure the improvements had made a positive impact on the experience instead of hindering it. The conducted tests were relatively the same </w:t>
+      </w:r>
+      <w:r>
+        <w:t>as</w:t>
+      </w:r>
+      <w:r>
+        <w:t xml:space="preserve"> the first set carried out for the prototype version, although slight changes were made to probe for any weaknesses within the improvements made. This choice was made to ensure that the final version did not have bugs, show clear polish and refinements while </w:t>
+      </w:r>
+      <w:r>
+        <w:t>maintaining the</w:t>
+      </w:r>
+      <w:r>
+        <w:t xml:space="preserve"> integrity</w:t>
+      </w:r>
+      <w:r>
+        <w:t xml:space="preserve"> of the application</w:t>
+      </w:r>
+      <w:r>
+        <w:t xml:space="preserve"> so that users could have the best possible experience.</w:t>
+      </w:r>
+    </w:p>
+    <w:p>
+      <w:pPr>
+        <w:pStyle w:val="Heading3"/>
+      </w:pPr>
+      <w:bookmarkStart w:id="41" w:name="_Toc223886390"/>
+      <w:r>
+        <w:t>Interaction Objects and Objective Understanding</w:t>
+      </w:r>
+      <w:bookmarkEnd w:id="41"/>
+    </w:p>
+    <w:p>
+      <w:r>
+        <w:t xml:space="preserve">After feedback was received regarding how clunky the light switch interactions were, the hand physics collisions were removed. Doing this allowed the hand controller components of the VR Pawn to interact with the light switch freely, triggering the switch without needing to be </w:t>
+      </w:r>
+      <w:r>
+        <w:t>at</w:t>
+      </w:r>
+      <w:r>
+        <w:t xml:space="preserve"> a specific angle. </w:t>
+      </w:r>
+      <w:r>
+        <w:t>This resulted in user i</w:t>
+      </w:r>
+      <w:r>
+        <w:t xml:space="preserve">nteractions with the light switch </w:t>
+      </w:r>
+      <w:r>
+        <w:t>improving</w:t>
+      </w:r>
+      <w:r>
+        <w:t xml:space="preserve">, </w:t>
+      </w:r>
+      <w:r>
+        <w:t xml:space="preserve">which </w:t>
+      </w:r>
+      <w:r>
+        <w:t>created a cleaner feel within the experience as the clunky feeling with the light switch was resolved. Objective transitions became clearer after the timeline adjustment was made</w:t>
+      </w:r>
+      <w:r>
+        <w:t>.</w:t>
+      </w:r>
+      <w:r>
+        <w:t xml:space="preserve"> </w:t>
+      </w:r>
+      <w:r>
+        <w:t>T</w:t>
+      </w:r>
+      <w:r>
+        <w:t>here was a clearer improvement to showing the preventative measure working with reverting the bloom post processing effect triggered from simulating the light sensitivity symptom.</w:t>
+      </w:r>
+    </w:p>
+    <w:p>
+      <w:pPr>
+        <w:pStyle w:val="Heading3"/>
+      </w:pPr>
+      <w:bookmarkStart w:id="42" w:name="_Toc223886391"/>
+      <w:r>
+        <w:t>User Attention Detection</w:t>
+      </w:r>
+      <w:bookmarkEnd w:id="42"/>
     </w:p>
     <w:p>
       <w:pPr>
@@ -9739,11 +10277,21 @@
         </w:numPr>
       </w:pPr>
       <w:r>
-        <w:t>H</w:t>
-      </w:r>
-      <w:r>
-        <w:t>and physics collisions were removed</w:t>
-      </w:r>
+        <w:t>Having a wider area of detection now the line trace was changed to a capsule trace made gaze interactions better for users, removing the feeling of frustration from having to be so precise with where they were looking. Progress bar felt more consistent as it didn’t look glitchy from the line trace going out of the area of interaction object and back in constantly.</w:t>
+      </w:r>
+    </w:p>
+    <w:p>
+      <w:pPr>
+        <w:pStyle w:val="Heading3"/>
+      </w:pPr>
+      <w:bookmarkStart w:id="43" w:name="_Toc223886392"/>
+      <w:r>
+        <w:t>Symptom Simulation</w:t>
+      </w:r>
+      <w:r>
+        <w:t>s</w:t>
+      </w:r>
+      <w:bookmarkEnd w:id="43"/>
     </w:p>
     <w:p>
       <w:pPr>
@@ -9754,51 +10302,7 @@
         </w:numPr>
       </w:pPr>
       <w:r>
-        <w:t>Became more reliable as felt like the light switch now worked as intended</w:t>
-      </w:r>
-    </w:p>
-    <w:p>
-      <w:pPr>
-        <w:pStyle w:val="Heading3"/>
-      </w:pPr>
-      <w:bookmarkStart w:id="33" w:name="_Toc223886381"/>
-      <w:r>
-        <w:t>Objective Flow Tweaks</w:t>
-      </w:r>
-      <w:bookmarkEnd w:id="33"/>
-    </w:p>
-    <w:p>
-      <w:pPr>
-        <w:pStyle w:val="ListParagraph"/>
-        <w:numPr>
-          <w:ilvl w:val="0"/>
-          <w:numId w:val="12"/>
-        </w:numPr>
-      </w:pPr>
-      <w:r>
-        <w:t>Reduced the timeline duration between objectives 4 and 5 for triggering and reverting the light sensitivity symptom. Saw an improvement as the symptom effects were still able to be portrayed to users while still showing prevention methods worked.</w:t>
-      </w:r>
-    </w:p>
-    <w:p>
-      <w:pPr>
-        <w:pStyle w:val="Heading3"/>
-      </w:pPr>
-      <w:bookmarkStart w:id="34" w:name="_Toc223886382"/>
-      <w:r>
-        <w:t>Gaze Detection Refinements</w:t>
-      </w:r>
-      <w:bookmarkEnd w:id="34"/>
-    </w:p>
-    <w:p>
-      <w:pPr>
-        <w:pStyle w:val="ListParagraph"/>
-        <w:numPr>
-          <w:ilvl w:val="0"/>
-          <w:numId w:val="12"/>
-        </w:numPr>
-      </w:pPr>
-      <w:r>
-        <w:t>Switched out single line trace to a capsule trace, larger radius for the capsule meant gaze detection was a lot more forgiving for users and it would not be precise in tracking.</w:t>
+        <w:t>Effects were able to remain as intended even with the new improvements made, the information being taught was still effective for users and there wasn’t a negative impact from the changes made to improve the experience.</w:t>
       </w:r>
     </w:p>
     <w:p>
@@ -9810,6 +10314,7 @@
           <w:szCs w:val="40"/>
         </w:rPr>
       </w:pPr>
+      <w:bookmarkStart w:id="44" w:name="_Toc223886393"/>
       <w:r>
         <w:br w:type="page"/>
       </w:r>
@@ -9818,651 +10323,11 @@
       <w:pPr>
         <w:pStyle w:val="Heading1"/>
       </w:pPr>
-      <w:bookmarkStart w:id="35" w:name="_Toc223886383"/>
-      <w:r>
-        <w:lastRenderedPageBreak/>
-        <w:t>Results</w:t>
-      </w:r>
-      <w:bookmarkEnd w:id="35"/>
-    </w:p>
-    <w:p>
-      <w:pPr>
-        <w:pStyle w:val="Heading2"/>
-      </w:pPr>
-      <w:bookmarkStart w:id="36" w:name="_Toc223886384"/>
-      <w:r>
-        <w:t>Prototype Tests</w:t>
-      </w:r>
-      <w:bookmarkEnd w:id="36"/>
-    </w:p>
-    <w:p>
-      <w:r>
-        <w:t xml:space="preserve">Tests were conducted to determine the </w:t>
-      </w:r>
-      <w:r>
-        <w:t>experience’</w:t>
-      </w:r>
-      <w:r>
-        <w:t>s</w:t>
-      </w:r>
-      <w:r>
-        <w:t xml:space="preserve"> s</w:t>
-      </w:r>
-      <w:r>
-        <w:t>trengths and weaknesse</w:t>
-      </w:r>
-      <w:r>
-        <w:t>s</w:t>
-      </w:r>
-      <w:r>
-        <w:t>. The</w:t>
-      </w:r>
-      <w:r>
-        <w:t xml:space="preserve"> aim of the</w:t>
-      </w:r>
-      <w:r>
-        <w:t xml:space="preserve"> tests </w:t>
-      </w:r>
-      <w:r>
-        <w:t>was</w:t>
-      </w:r>
-      <w:r>
-        <w:t xml:space="preserve"> </w:t>
-      </w:r>
-      <w:r>
-        <w:t>to gather information on how immersive, usable and functiona</w:t>
-      </w:r>
-      <w:r>
-        <w:t>l</w:t>
-      </w:r>
-      <w:r>
-        <w:t xml:space="preserve"> it was </w:t>
-      </w:r>
-      <w:r>
-        <w:t>during</w:t>
-      </w:r>
-      <w:r>
-        <w:t xml:space="preserve"> different </w:t>
-      </w:r>
-      <w:r>
-        <w:t xml:space="preserve">test </w:t>
-      </w:r>
-      <w:r>
-        <w:t>runs. Information gathered would then be used to evaluate</w:t>
-      </w:r>
-      <w:r>
-        <w:t xml:space="preserve"> </w:t>
-      </w:r>
-      <w:r>
-        <w:t>weaknesse</w:t>
-      </w:r>
-      <w:r>
-        <w:t>s, identify areas to</w:t>
-      </w:r>
-      <w:r>
-        <w:t xml:space="preserve"> improve and </w:t>
-      </w:r>
-      <w:r>
-        <w:t xml:space="preserve">gauge </w:t>
-      </w:r>
-      <w:r>
-        <w:t>how effectiv</w:t>
-      </w:r>
-      <w:r>
-        <w:t>ely</w:t>
-      </w:r>
-      <w:r>
-        <w:t xml:space="preserve"> the information being taught was received by testers. The following sections break down the tests completed</w:t>
-      </w:r>
-      <w:r>
-        <w:t xml:space="preserve">, </w:t>
-      </w:r>
-      <w:r>
-        <w:t>what observations were made and the evaluations reached to progress forward and achieve the aims and objectives set out at the start of this project.</w:t>
-      </w:r>
-    </w:p>
-    <w:p>
-      <w:pPr>
-        <w:pStyle w:val="Heading3"/>
-      </w:pPr>
-      <w:bookmarkStart w:id="37" w:name="_Toc223886385"/>
-      <w:r>
-        <w:t>Interaction</w:t>
-      </w:r>
-      <w:r>
-        <w:t xml:space="preserve"> Objects</w:t>
-      </w:r>
-      <w:r>
-        <w:t xml:space="preserve"> and Objective Understanding</w:t>
-      </w:r>
-      <w:bookmarkEnd w:id="37"/>
-    </w:p>
-    <w:p>
-      <w:r>
-        <w:t xml:space="preserve">Interaction objects worked as intended with none of the objects failing to carry out the tasks they were intended for. However, the hand collisions placed within the hand components of the VR Pawn </w:t>
-      </w:r>
-      <w:r>
-        <w:t>impair</w:t>
-      </w:r>
-      <w:r>
-        <w:t xml:space="preserve"> how well the player can interact with the light switch</w:t>
-      </w:r>
-      <w:r>
-        <w:t>. This is because</w:t>
-      </w:r>
-      <w:r>
-        <w:t xml:space="preserve"> </w:t>
-      </w:r>
-      <w:r>
-        <w:t xml:space="preserve">the hand component </w:t>
-      </w:r>
-      <w:r>
-        <w:t>cannot</w:t>
-      </w:r>
-      <w:r>
-        <w:t xml:space="preserve"> </w:t>
-      </w:r>
-      <w:r>
-        <w:t>move</w:t>
-      </w:r>
-      <w:r>
-        <w:t xml:space="preserve"> </w:t>
-      </w:r>
-      <w:r>
-        <w:t>far</w:t>
-      </w:r>
-      <w:r>
-        <w:t xml:space="preserve"> enough</w:t>
-      </w:r>
-      <w:r>
-        <w:t xml:space="preserve"> into the switch</w:t>
-      </w:r>
-      <w:r>
-        <w:t xml:space="preserve"> to trigger collisions </w:t>
-      </w:r>
-      <w:r>
-        <w:t>reliably</w:t>
-      </w:r>
-      <w:r>
-        <w:t xml:space="preserve">. It became increasingly noticeable that the light switch felt like it had its own behaviour and only turned on whenever it wanted to due to this. </w:t>
-      </w:r>
-      <w:r>
-        <w:t>This became increasingly frustrating for some users that should have been able to turn the light on or off within the first try.</w:t>
-      </w:r>
-    </w:p>
-    <w:p>
-      <w:r>
-        <w:t xml:space="preserve">During testing, users found it difficult to tell when the symptom was being reverted for light sensitivity before the completion of objective </w:t>
-      </w:r>
-      <w:r>
-        <w:t>five</w:t>
-      </w:r>
-      <w:r>
-        <w:t xml:space="preserve"> occurred</w:t>
-      </w:r>
-      <w:r>
-        <w:t>,</w:t>
-      </w:r>
-      <w:r>
-        <w:t xml:space="preserve"> triggering the bloom post processing </w:t>
-      </w:r>
-      <w:r>
-        <w:t>effect</w:t>
-      </w:r>
-      <w:r>
-        <w:t xml:space="preserve">. This occurred due to two </w:t>
-      </w:r>
-      <w:r>
-        <w:t>reasons</w:t>
-      </w:r>
-      <w:r>
-        <w:t>.</w:t>
-      </w:r>
-      <w:r>
-        <w:t xml:space="preserve"> </w:t>
-      </w:r>
-      <w:r>
-        <w:t>T</w:t>
-      </w:r>
-      <w:r>
-        <w:t>he first</w:t>
-      </w:r>
-      <w:r>
-        <w:t xml:space="preserve"> being</w:t>
-      </w:r>
-      <w:r>
-        <w:t xml:space="preserve"> the timeline duration was too long to apply or revert the post processing effect</w:t>
-      </w:r>
-      <w:r>
-        <w:t>. The second reason was that the</w:t>
-      </w:r>
-      <w:r>
-        <w:t xml:space="preserve"> conditions to satisfy objective </w:t>
-      </w:r>
-      <w:r>
-        <w:t>five</w:t>
-      </w:r>
-      <w:r>
-        <w:t xml:space="preserve"> were easy to complete</w:t>
-      </w:r>
-      <w:r>
-        <w:t>,</w:t>
-      </w:r>
-      <w:r>
-        <w:t xml:space="preserve"> causing the illusion of the light sensitivity symptom reversal barely working</w:t>
-      </w:r>
-      <w:r>
-        <w:t>,</w:t>
-      </w:r>
-      <w:r>
-        <w:t xml:space="preserve"> before the blur post processing material was applied.</w:t>
-      </w:r>
-      <w:r>
-        <w:t xml:space="preserve"> This result</w:t>
-      </w:r>
-      <w:r>
-        <w:t xml:space="preserve">ed in confusion </w:t>
-      </w:r>
-      <w:r>
-        <w:t>among</w:t>
-      </w:r>
-      <w:r>
-        <w:t xml:space="preserve"> users as the prevention method taken to revert light sensitivity seemed to not work</w:t>
-      </w:r>
-      <w:r>
-        <w:t>,</w:t>
-      </w:r>
-      <w:r>
-        <w:t xml:space="preserve"> giving a false view</w:t>
-      </w:r>
-      <w:r>
-        <w:t xml:space="preserve"> of how effective the preventative measure was</w:t>
-      </w:r>
-      <w:r>
-        <w:t>.</w:t>
-      </w:r>
-    </w:p>
-    <w:p>
-      <w:pPr>
-        <w:pStyle w:val="Heading3"/>
-      </w:pPr>
-      <w:bookmarkStart w:id="38" w:name="_Toc223886386"/>
-      <w:r>
-        <w:t>User Attention Detection</w:t>
-      </w:r>
-      <w:bookmarkEnd w:id="38"/>
-    </w:p>
-    <w:p>
-      <w:r>
-        <w:t>Feedback received overall was mixed, users felt frustrated due to how unforgiving the gaze detection felt, especially given that there was no cursor for aiming like a typical video game</w:t>
-      </w:r>
-      <w:r>
-        <w:t>. Due to this</w:t>
-      </w:r>
-      <w:r>
-        <w:t>,</w:t>
-      </w:r>
-      <w:r>
-        <w:t xml:space="preserve"> </w:t>
-      </w:r>
-      <w:r>
-        <w:t>users felt they were just</w:t>
-      </w:r>
-      <w:r>
-        <w:t xml:space="preserve"> randomly triggering the progress bar and </w:t>
-      </w:r>
-      <w:r>
-        <w:t>remaining</w:t>
-      </w:r>
-      <w:r>
-        <w:t xml:space="preserve"> in the same position as it filled up with the worry of slight moving resetting the progress.</w:t>
-      </w:r>
-      <w:r>
-        <w:t xml:space="preserve"> The reason the gaze detection felt like this was due to it using a sing</w:t>
-      </w:r>
-      <w:r>
-        <w:t>le</w:t>
-      </w:r>
-      <w:r>
-        <w:t xml:space="preserve"> line trace which was very precise </w:t>
-      </w:r>
-      <w:r>
-        <w:t>when</w:t>
-      </w:r>
-      <w:r>
-        <w:t xml:space="preserve"> detecting hits, which instead </w:t>
-      </w:r>
-      <w:r>
-        <w:t>could use a</w:t>
-      </w:r>
-      <w:r>
-        <w:t xml:space="preserve"> channel trace to expand the area of detection to be more forgiving.</w:t>
-      </w:r>
-    </w:p>
-    <w:p>
-      <w:pPr>
-        <w:pStyle w:val="Heading3"/>
-      </w:pPr>
-      <w:bookmarkStart w:id="39" w:name="_Toc223886387"/>
-      <w:r>
-        <w:t>Symptom Simulations</w:t>
-      </w:r>
-      <w:bookmarkEnd w:id="39"/>
-    </w:p>
-    <w:p>
-      <w:r>
-        <w:t>Positive feedback was received by users regarding symptom simulations</w:t>
-      </w:r>
-      <w:r>
-        <w:t>.</w:t>
-      </w:r>
-      <w:r>
-        <w:t xml:space="preserve"> </w:t>
-      </w:r>
-      <w:r>
-        <w:t xml:space="preserve">Overall, </w:t>
-      </w:r>
-      <w:r>
-        <w:t xml:space="preserve">the feedback showed </w:t>
-      </w:r>
-      <w:r>
-        <w:t>the way the symptoms were portrayed help</w:t>
-      </w:r>
-      <w:r>
-        <w:t>ed</w:t>
-      </w:r>
-      <w:r>
-        <w:t xml:space="preserve"> to</w:t>
-      </w:r>
-      <w:r>
-        <w:t xml:space="preserve"> give an understanding of recognising them when they experience</w:t>
-      </w:r>
-      <w:r>
-        <w:t>d</w:t>
-      </w:r>
-      <w:r>
-        <w:t xml:space="preserve"> it themselves.</w:t>
-      </w:r>
-      <w:r>
-        <w:t xml:space="preserve"> Eye fatigue was displayed using a vignette post processing effect</w:t>
-      </w:r>
-      <w:r>
-        <w:t>,</w:t>
-      </w:r>
-      <w:r>
-        <w:t xml:space="preserve"> to show darkening around the peripherals of one’s view</w:t>
-      </w:r>
-      <w:r>
-        <w:t>.</w:t>
-      </w:r>
-      <w:r>
-        <w:t xml:space="preserve"> </w:t>
-      </w:r>
-      <w:r>
-        <w:t>L</w:t>
-      </w:r>
-      <w:r>
-        <w:t xml:space="preserve">ight sensitivity </w:t>
-      </w:r>
-      <w:r>
-        <w:t xml:space="preserve">was </w:t>
-      </w:r>
-      <w:r>
-        <w:t xml:space="preserve">incorporated </w:t>
-      </w:r>
-      <w:r>
-        <w:t xml:space="preserve">with </w:t>
-      </w:r>
-      <w:r>
-        <w:t>a bloom post processing effect</w:t>
-      </w:r>
-      <w:r>
-        <w:t>,</w:t>
-      </w:r>
-      <w:r>
-        <w:t xml:space="preserve"> to show lights becoming more intense to individuals as the level of sensitivity to them increased.</w:t>
-      </w:r>
-      <w:r>
-        <w:t xml:space="preserve"> Focus strain was simulated by a radial blur post processing material to show how </w:t>
-      </w:r>
-      <w:r>
-        <w:t xml:space="preserve">the </w:t>
-      </w:r>
-      <w:r>
-        <w:t xml:space="preserve">view becomes distorted and unclear as the eyes </w:t>
-      </w:r>
-      <w:r>
-        <w:lastRenderedPageBreak/>
-        <w:t>become more strained.</w:t>
-      </w:r>
-      <w:r>
-        <w:t xml:space="preserve"> However, due to the limited number </w:t>
-      </w:r>
-      <w:r>
-        <w:t>of testers and the range between them</w:t>
-      </w:r>
-      <w:r>
-        <w:t>,</w:t>
-      </w:r>
-      <w:r>
-        <w:t xml:space="preserve"> there was difficulty in gauging the appropriate level of portrayal</w:t>
-      </w:r>
-      <w:r>
-        <w:t>.</w:t>
-      </w:r>
-      <w:r>
-        <w:t xml:space="preserve"> </w:t>
-      </w:r>
-      <w:r>
-        <w:t>A</w:t>
-      </w:r>
-      <w:r>
-        <w:t>ccommodat</w:t>
-      </w:r>
-      <w:r>
-        <w:t>ing</w:t>
-      </w:r>
-      <w:r>
-        <w:t xml:space="preserve"> the </w:t>
-      </w:r>
-      <w:r>
-        <w:t xml:space="preserve">vast </w:t>
-      </w:r>
-      <w:r>
-        <w:t>range of target audiences</w:t>
-      </w:r>
-      <w:r>
-        <w:t xml:space="preserve"> would be difficult</w:t>
-      </w:r>
-      <w:r>
-        <w:t>,</w:t>
-      </w:r>
-      <w:r>
-        <w:t xml:space="preserve"> due to symptom intensity or experiences ranging between different individuals.</w:t>
-      </w:r>
-    </w:p>
-    <w:p>
-      <w:pPr>
-        <w:pStyle w:val="Heading3"/>
-      </w:pPr>
-      <w:bookmarkStart w:id="40" w:name="_Toc223886388"/>
-      <w:r>
-        <w:t xml:space="preserve">Improvements to be </w:t>
-      </w:r>
-      <w:r>
-        <w:t>M</w:t>
-      </w:r>
-      <w:r>
-        <w:t>ade</w:t>
-      </w:r>
-      <w:bookmarkEnd w:id="40"/>
-    </w:p>
-    <w:p>
-      <w:r>
-        <w:t>To refine the quality of the experience, improvements need to be made across the different aspects of the application. One such improvement includes removing the physics collisions for the hand components within the VR Pawn class. Doing this will allow interactions with the light switch to work as intended</w:t>
-      </w:r>
-      <w:r>
-        <w:t>,</w:t>
-      </w:r>
-      <w:r>
-        <w:t xml:space="preserve"> reducing the frustration of completing objectives three and four. </w:t>
-      </w:r>
-      <w:r>
-        <w:t xml:space="preserve"> </w:t>
-      </w:r>
-      <w:r>
-        <w:t>In addition to this, another improvement includes adding a delay to the change between objectives four and five to allow enough time for the reversal of the light sensitivity symptom. To strengthen this improvement</w:t>
-      </w:r>
-      <w:r>
-        <w:t>,</w:t>
-      </w:r>
-      <w:r>
-        <w:t xml:space="preserve"> the duration of the timeline reversal will be altered so that it does not take as long to execute the symptom reversal.</w:t>
-      </w:r>
-      <w:r>
-        <w:t xml:space="preserve"> </w:t>
-      </w:r>
-      <w:r>
-        <w:t>Furthermore, changing the single line trace used for user detection to a channel with a wider area of detection will help to ease frustration and difficulty of progression through the experience using the gaze interaction objects.</w:t>
-      </w:r>
-    </w:p>
-    <w:p>
-      <w:r>
-        <w:br w:type="page"/>
-      </w:r>
-    </w:p>
-    <w:p>
-      <w:pPr>
-        <w:pStyle w:val="Heading3"/>
-        <w:rPr>
-          <w:rFonts w:asciiTheme="majorHAnsi" w:hAnsiTheme="majorHAnsi"/>
-          <w:sz w:val="32"/>
-          <w:szCs w:val="32"/>
-        </w:rPr>
-      </w:pPr>
-      <w:bookmarkStart w:id="41" w:name="_Toc223886389"/>
-      <w:r>
-        <w:lastRenderedPageBreak/>
-        <w:t>Final Version Tests</w:t>
-      </w:r>
-      <w:bookmarkEnd w:id="41"/>
-    </w:p>
-    <w:p>
-      <w:r>
-        <w:t xml:space="preserve">After the improvements carried out from the results of the prototype tests, a new set of tests </w:t>
-      </w:r>
-      <w:r>
-        <w:t>was</w:t>
-      </w:r>
-      <w:r>
-        <w:t xml:space="preserve"> carried out to ensure the improvements had made a positive impact on the experience instead of hindering it. The conducted tests were relatively the same </w:t>
-      </w:r>
-      <w:r>
-        <w:t>as</w:t>
-      </w:r>
-      <w:r>
-        <w:t xml:space="preserve"> the first set carried out for the prototype version, although slight changes were made to probe for any weaknesses within the improvements made. This choice was made to ensure that the final version did not have bugs, show clear polish and refinements while </w:t>
-      </w:r>
-      <w:r>
-        <w:t>maintaining the</w:t>
-      </w:r>
-      <w:r>
-        <w:t xml:space="preserve"> integrity</w:t>
-      </w:r>
-      <w:r>
-        <w:t xml:space="preserve"> of the application</w:t>
-      </w:r>
-      <w:r>
-        <w:t xml:space="preserve"> so that users could have the best possible experience.</w:t>
-      </w:r>
-    </w:p>
-    <w:p>
-      <w:pPr>
-        <w:pStyle w:val="Heading3"/>
-      </w:pPr>
-      <w:bookmarkStart w:id="42" w:name="_Toc223886390"/>
-      <w:r>
-        <w:t>Interaction Objects and Objective Understanding</w:t>
-      </w:r>
-      <w:bookmarkEnd w:id="42"/>
-    </w:p>
-    <w:p>
-      <w:pPr>
-        <w:pStyle w:val="ListParagraph"/>
-        <w:numPr>
-          <w:ilvl w:val="0"/>
-          <w:numId w:val="12"/>
-        </w:numPr>
-      </w:pPr>
-      <w:r>
-        <w:t xml:space="preserve">Interactions with the light switch improved, </w:t>
-      </w:r>
-      <w:r>
-        <w:t>created a cleaner feel within the experience as the clunky feeling with the light switch was resolved. Objective transitions became clearer after the timeline adjustment was made, there was a clearer improvement to showing the preventative measure working with reverting the bloom post processing effect triggered from simulating the light sensitivity symptom.</w:t>
-      </w:r>
-    </w:p>
-    <w:p>
-      <w:pPr>
-        <w:pStyle w:val="Heading3"/>
-      </w:pPr>
-      <w:bookmarkStart w:id="43" w:name="_Toc223886391"/>
-      <w:r>
-        <w:t>User Attention Detection</w:t>
-      </w:r>
-      <w:bookmarkEnd w:id="43"/>
-    </w:p>
-    <w:p>
-      <w:pPr>
-        <w:pStyle w:val="ListParagraph"/>
-        <w:numPr>
-          <w:ilvl w:val="0"/>
-          <w:numId w:val="12"/>
-        </w:numPr>
-      </w:pPr>
-      <w:r>
-        <w:t>Having a wider area of detection now the line trace was changed to a capsule trace made gaze interactions better for users, removing the feeling of frustration from having to be so precise with where they were looking. Progress bar felt more consistent as it didn’t look glitchy from the line trace going out of the area of interaction object and back in constantly.</w:t>
-      </w:r>
-    </w:p>
-    <w:p>
-      <w:pPr>
-        <w:pStyle w:val="Heading3"/>
-      </w:pPr>
-      <w:bookmarkStart w:id="44" w:name="_Toc223886392"/>
-      <w:r>
-        <w:t>Symptom Simulation</w:t>
-      </w:r>
-      <w:r>
-        <w:t>s</w:t>
-      </w:r>
-      <w:bookmarkEnd w:id="44"/>
-    </w:p>
-    <w:p>
-      <w:pPr>
-        <w:pStyle w:val="ListParagraph"/>
-        <w:numPr>
-          <w:ilvl w:val="0"/>
-          <w:numId w:val="12"/>
-        </w:numPr>
-      </w:pPr>
-      <w:r>
-        <w:t>Effects were able to remain as intended even with the new improvements made, the information being taught was still effective for users and there wasn’t a negative impact from the changes made to improve the experience.</w:t>
-      </w:r>
-    </w:p>
-    <w:p>
-      <w:r>
-        <w:br w:type="page"/>
-      </w:r>
-    </w:p>
-    <w:p>
-      <w:pPr>
-        <w:pStyle w:val="Heading1"/>
-      </w:pPr>
-      <w:bookmarkStart w:id="45" w:name="_Toc223886393"/>
       <w:r>
         <w:lastRenderedPageBreak/>
         <w:t>Critical Evaluation</w:t>
       </w:r>
-      <w:bookmarkEnd w:id="45"/>
+      <w:bookmarkEnd w:id="44"/>
     </w:p>
     <w:p>
       <w:pPr>
@@ -10484,12 +10349,12 @@
       <w:pPr>
         <w:pStyle w:val="Heading1"/>
       </w:pPr>
-      <w:bookmarkStart w:id="46" w:name="_Toc223886394"/>
+      <w:bookmarkStart w:id="45" w:name="_Toc223886394"/>
       <w:r>
         <w:lastRenderedPageBreak/>
         <w:t>Conclusions and Future Work</w:t>
       </w:r>
-      <w:bookmarkEnd w:id="46"/>
+      <w:bookmarkEnd w:id="45"/>
     </w:p>
     <w:p>
       <w:pPr>
@@ -10534,31 +10399,17 @@
       <w:pPr>
         <w:pStyle w:val="Heading1"/>
       </w:pPr>
-      <w:bookmarkStart w:id="47" w:name="_Toc223886395"/>
+      <w:bookmarkStart w:id="46" w:name="_Toc223886395"/>
       <w:r>
         <w:lastRenderedPageBreak/>
         <w:t>References</w:t>
       </w:r>
-      <w:bookmarkEnd w:id="47"/>
-    </w:p>
-    <w:p>
-      <w:proofErr w:type="spellStart"/>
-      <w:r>
-        <w:t>Cantó</w:t>
-      </w:r>
-      <w:proofErr w:type="spellEnd"/>
-      <w:r>
-        <w:t xml:space="preserve">-Sancho, N., </w:t>
-      </w:r>
-      <w:proofErr w:type="spellStart"/>
-      <w:r>
-        <w:t>Porru</w:t>
-      </w:r>
-      <w:proofErr w:type="spellEnd"/>
-      <w:r>
-        <w:t xml:space="preserve">, S., Casati, S., Ronda, E., Seguí-Crespo, M. and Carta, A. (2023) ‘Prevalence and risk factors of computer vision syndrome—assessed in office workers by a validated questionnaire’. </w:t>
-      </w:r>
-      <w:proofErr w:type="spellStart"/>
+      <w:bookmarkEnd w:id="46"/>
+    </w:p>
+    <w:p>
+      <w:r>
+        <w:t xml:space="preserve">Cantó-Sancho, N., Porru, S., Casati, S., Ronda, E., Seguí-Crespo, M. and Carta, A. (2023) ‘Prevalence and risk factors of computer vision syndrome—assessed in office workers by a validated questionnaire’. </w:t>
+      </w:r>
       <w:r>
         <w:rPr>
           <w:i/>
@@ -10566,30 +10417,13 @@
         </w:rPr>
         <w:t>PeerJ</w:t>
       </w:r>
-      <w:proofErr w:type="spellEnd"/>
       <w:r>
         <w:t xml:space="preserve"> 11, p. e14937. Available at: https://www.researchgate.net/publication/369002899_Prevalence_and_risk_factors_of_computer_vision_syndrome-assessed_in_office_workers_by_a_validated_questionnaire (Accessed: 20 October 2025).</w:t>
       </w:r>
     </w:p>
     <w:p>
       <w:r>
-        <w:t xml:space="preserve">Chandrasekhara, R.S., Low, C., Lim, Y., Low, L., Mardina, F. and </w:t>
-      </w:r>
-      <w:proofErr w:type="spellStart"/>
-      <w:r>
-        <w:t>Nursaleha</w:t>
-      </w:r>
-      <w:proofErr w:type="spellEnd"/>
-      <w:r>
-        <w:t xml:space="preserve">, M. (2013) ‘Computer vision syndrome: a study of knowledge and practices in university </w:t>
-      </w:r>
-      <w:proofErr w:type="gramStart"/>
-      <w:r>
-        <w:t>students’</w:t>
-      </w:r>
-      <w:proofErr w:type="gramEnd"/>
-      <w:r>
-        <w:t xml:space="preserve">. </w:t>
+        <w:t xml:space="preserve">Chandrasekhara, R.S., Low, C., Lim, Y., Low, L., Mardina, F. and Nursaleha, M. (2013) ‘Computer vision syndrome: a study of knowledge and practices in university students’. </w:t>
       </w:r>
       <w:r>
         <w:rPr>
@@ -10615,15 +10449,7 @@
     </w:p>
     <w:p>
       <w:r>
-        <w:t xml:space="preserve">Muñoz, E.G., </w:t>
-      </w:r>
-      <w:proofErr w:type="spellStart"/>
-      <w:r>
-        <w:t>Fabregat</w:t>
-      </w:r>
-      <w:proofErr w:type="spellEnd"/>
-      <w:r>
-        <w:t xml:space="preserve">, R., Bacca-Acosta, J., Duque-Méndez, N. and Avila-Garzon, C. (2022) ‘Augmented Reality, Virtual Reality, and Game Technologies in Ophthalmology Training’. </w:t>
+        <w:t xml:space="preserve">Muñoz, E.G., Fabregat, R., Bacca-Acosta, J., Duque-Méndez, N. and Avila-Garzon, C. (2022) ‘Augmented Reality, Virtual Reality, and Game Technologies in Ophthalmology Training’. </w:t>
       </w:r>
       <w:r>
         <w:rPr>
@@ -10633,15 +10459,7 @@
         <w:t>Information</w:t>
       </w:r>
       <w:r>
-        <w:t xml:space="preserve"> 13(5), p. 222. </w:t>
-      </w:r>
-      <w:proofErr w:type="spellStart"/>
-      <w:r>
-        <w:t>doi</w:t>
-      </w:r>
-      <w:proofErr w:type="spellEnd"/>
-      <w:r>
-        <w:t xml:space="preserve">: </w:t>
+        <w:t xml:space="preserve"> 13(5), p. 222. doi: </w:t>
       </w:r>
       <w:hyperlink r:id="rId16" w:history="1">
         <w:r>
@@ -10657,33 +10475,12 @@
     </w:p>
     <w:p>
       <w:r>
-        <w:t xml:space="preserve">Orji, J., Hernandez, A., Selema, B. and Orji, R. (2022) ‘Virtual and augmented reality applications for promoting safety and security: A systematic review’., pp. 1–7. </w:t>
-      </w:r>
-      <w:proofErr w:type="spellStart"/>
-      <w:r>
-        <w:t>doi</w:t>
-      </w:r>
-      <w:proofErr w:type="spellEnd"/>
-      <w:r>
-        <w:t>: https://doi.org/10.1109/SEGAH54908.2022.9978597.</w:t>
-      </w:r>
-    </w:p>
-    <w:p>
-      <w:proofErr w:type="spellStart"/>
-      <w:r>
-        <w:t>Porcar</w:t>
-      </w:r>
-      <w:proofErr w:type="spellEnd"/>
-      <w:r>
-        <w:t xml:space="preserve">, E., Pons, A. and Lorente, A. (2016) ‘Visual and ocular effects from the use of flat-panel </w:t>
-      </w:r>
-      <w:proofErr w:type="gramStart"/>
-      <w:r>
-        <w:t>displays’</w:t>
-      </w:r>
-      <w:proofErr w:type="gramEnd"/>
-      <w:r>
-        <w:t xml:space="preserve">. </w:t>
+        <w:t>Orji, J., Hernandez, A., Selema, B. and Orji, R. (2022) ‘Virtual and augmented reality applications for promoting safety and security: A systematic review’., pp. 1–7. doi: https://doi.org/10.1109/SEGAH54908.2022.9978597.</w:t>
+      </w:r>
+    </w:p>
+    <w:p>
+      <w:r>
+        <w:t xml:space="preserve">Porcar, E., Pons, A. and Lorente, A. (2016) ‘Visual and ocular effects from the use of flat-panel displays’. </w:t>
       </w:r>
       <w:r>
         <w:rPr>
@@ -10698,23 +10495,7 @@
     </w:p>
     <w:p>
       <w:r>
-        <w:t xml:space="preserve">Santilli, T., Ceccacci, S., Mengoni, M. and Catia </w:t>
-      </w:r>
-      <w:proofErr w:type="spellStart"/>
-      <w:r>
-        <w:t>Giaconi</w:t>
-      </w:r>
-      <w:proofErr w:type="spellEnd"/>
-      <w:r>
-        <w:t xml:space="preserve"> (2025) ‘Virtual vs. traditional learning in higher education: A systematic review of comparative </w:t>
-      </w:r>
-      <w:proofErr w:type="gramStart"/>
-      <w:r>
-        <w:t>studies’</w:t>
-      </w:r>
-      <w:proofErr w:type="gramEnd"/>
-      <w:r>
-        <w:t xml:space="preserve">. </w:t>
+        <w:t xml:space="preserve">Santilli, T., Ceccacci, S., Mengoni, M. and Catia Giaconi (2025) ‘Virtual vs. traditional learning in higher education: A systematic review of comparative studies’. </w:t>
       </w:r>
       <w:r>
         <w:rPr>
@@ -10749,23 +10530,7 @@
     </w:p>
     <w:p>
       <w:r>
-        <w:t>Vieira, F., Oliveira, E. and Rodrigues, N. (2019) ‘</w:t>
-      </w:r>
-      <w:proofErr w:type="spellStart"/>
-      <w:r>
-        <w:t>iSVC</w:t>
-      </w:r>
-      <w:proofErr w:type="spellEnd"/>
-      <w:r>
-        <w:t xml:space="preserve"> – digital platform for detection and prevention of computer vision syndrome’., pp. 1–7. </w:t>
-      </w:r>
-      <w:proofErr w:type="spellStart"/>
-      <w:r>
-        <w:t>doi</w:t>
-      </w:r>
-      <w:proofErr w:type="spellEnd"/>
-      <w:r>
-        <w:t>: https://doi.org/10.1109/SeGAH.2019.8882438.</w:t>
+        <w:t>Vieira, F., Oliveira, E. and Rodrigues, N. (2019) ‘iSVC – digital platform for detection and prevention of computer vision syndrome’., pp. 1–7. doi: https://doi.org/10.1109/SeGAH.2019.8882438.</w:t>
       </w:r>
     </w:p>
     <w:p>
@@ -10780,28 +10545,12 @@
         <w:t>Annals of Emerging Technologies in Computing</w:t>
       </w:r>
       <w:r>
-        <w:t xml:space="preserve"> 9(3), pp. 50–68. </w:t>
-      </w:r>
-      <w:proofErr w:type="spellStart"/>
-      <w:r>
-        <w:t>doi</w:t>
-      </w:r>
-      <w:proofErr w:type="spellEnd"/>
-      <w:r>
-        <w:t>: https://doi.org/10.33166/aetic.2025.03.004.</w:t>
-      </w:r>
-    </w:p>
-    <w:p>
-      <w:r>
-        <w:t>Youcef, B., Ahmad, M.N. and Mustapha, M. (2021) ‘</w:t>
-      </w:r>
-      <w:proofErr w:type="spellStart"/>
-      <w:r>
-        <w:t>OntoPhaco</w:t>
-      </w:r>
-      <w:proofErr w:type="spellEnd"/>
-      <w:r>
-        <w:t xml:space="preserve">: An ontology for virtual reality training in ophthalmology Domain—A case study of cataract surgery’. </w:t>
+        <w:t xml:space="preserve"> 9(3), pp. 50–68. doi: https://doi.org/10.33166/aetic.2025.03.004.</w:t>
+      </w:r>
+    </w:p>
+    <w:p>
+      <w:r>
+        <w:t xml:space="preserve">Youcef, B., Ahmad, M.N. and Mustapha, M. (2021) ‘OntoPhaco: An ontology for virtual reality training in ophthalmology Domain—A case study of cataract surgery’. </w:t>
       </w:r>
       <w:r>
         <w:rPr>
@@ -10811,15 +10560,7 @@
         <w:t>IEEE Access</w:t>
       </w:r>
       <w:r>
-        <w:t xml:space="preserve"> 9, pp. 152347–152378. </w:t>
-      </w:r>
-      <w:proofErr w:type="spellStart"/>
-      <w:r>
-        <w:t>doi</w:t>
-      </w:r>
-      <w:proofErr w:type="spellEnd"/>
-      <w:r>
-        <w:t>: https://doi.org/10.1109/ACCESS.2021.3126697.</w:t>
+        <w:t xml:space="preserve"> 9, pp. 152347–152378. doi: https://doi.org/10.1109/ACCESS.2021.3126697.</w:t>
       </w:r>
     </w:p>
     <w:p/>
@@ -10827,32 +10568,32 @@
       <w:pPr>
         <w:pStyle w:val="Heading1"/>
       </w:pPr>
-      <w:bookmarkStart w:id="48" w:name="_Toc223886396"/>
+      <w:bookmarkStart w:id="47" w:name="_Toc223886396"/>
       <w:r>
         <w:lastRenderedPageBreak/>
         <w:t>Appendix</w:t>
       </w:r>
+      <w:bookmarkEnd w:id="47"/>
+    </w:p>
+    <w:p>
+      <w:pPr>
+        <w:pStyle w:val="Heading2"/>
+      </w:pPr>
+      <w:bookmarkStart w:id="48" w:name="_Toc223886397"/>
+      <w:r>
+        <w:t>Asset Licenses and Sources</w:t>
+      </w:r>
       <w:bookmarkEnd w:id="48"/>
     </w:p>
     <w:p>
       <w:pPr>
-        <w:pStyle w:val="Heading2"/>
-      </w:pPr>
-      <w:bookmarkStart w:id="49" w:name="_Toc223886397"/>
-      <w:r>
-        <w:t>Asset Licenses and Sources</w:t>
+        <w:pStyle w:val="Heading3"/>
+      </w:pPr>
+      <w:bookmarkStart w:id="49" w:name="_Toc223886398"/>
+      <w:r>
+        <w:t>Modern Office Table</w:t>
       </w:r>
       <w:bookmarkEnd w:id="49"/>
-    </w:p>
-    <w:p>
-      <w:pPr>
-        <w:pStyle w:val="Heading3"/>
-      </w:pPr>
-      <w:bookmarkStart w:id="50" w:name="_Toc223886398"/>
-      <w:r>
-        <w:t>Modern Office Table</w:t>
-      </w:r>
-      <w:bookmarkEnd w:id="50"/>
     </w:p>
     <w:p>
       <w:r>
@@ -10932,11 +10673,11 @@
       <w:pPr>
         <w:pStyle w:val="Heading3"/>
       </w:pPr>
-      <w:bookmarkStart w:id="51" w:name="_Toc223886399"/>
+      <w:bookmarkStart w:id="50" w:name="_Toc223886399"/>
       <w:r>
         <w:t>Free Studio Starter Pack</w:t>
       </w:r>
-      <w:bookmarkEnd w:id="51"/>
+      <w:bookmarkEnd w:id="50"/>
     </w:p>
     <w:p>
       <w:r>
@@ -11016,11 +10757,11 @@
       <w:pPr>
         <w:pStyle w:val="Heading3"/>
       </w:pPr>
-      <w:bookmarkStart w:id="52" w:name="_Toc223886400"/>
+      <w:bookmarkStart w:id="51" w:name="_Toc223886400"/>
       <w:r>
         <w:t>General Desktop Bundle</w:t>
       </w:r>
-      <w:bookmarkEnd w:id="52"/>
+      <w:bookmarkEnd w:id="51"/>
     </w:p>
     <w:p>
       <w:r>
@@ -11100,12 +10841,12 @@
       <w:pPr>
         <w:pStyle w:val="Heading3"/>
       </w:pPr>
-      <w:bookmarkStart w:id="53" w:name="_Toc223886401"/>
+      <w:bookmarkStart w:id="52" w:name="_Toc223886401"/>
       <w:r>
         <w:lastRenderedPageBreak/>
         <w:t>General Gaming Headset</w:t>
       </w:r>
-      <w:bookmarkEnd w:id="53"/>
+      <w:bookmarkEnd w:id="52"/>
     </w:p>
     <w:p>
       <w:r>
@@ -11185,11 +10926,11 @@
       <w:pPr>
         <w:pStyle w:val="Heading3"/>
       </w:pPr>
-      <w:bookmarkStart w:id="54" w:name="_Toc223886402"/>
+      <w:bookmarkStart w:id="53" w:name="_Toc223886402"/>
       <w:r>
         <w:t>General Gaming Chair</w:t>
       </w:r>
-      <w:bookmarkEnd w:id="54"/>
+      <w:bookmarkEnd w:id="53"/>
     </w:p>
     <w:p>
       <w:r>
@@ -11269,11 +11010,11 @@
       <w:pPr>
         <w:pStyle w:val="Heading3"/>
       </w:pPr>
-      <w:bookmarkStart w:id="55" w:name="_Toc223886403"/>
+      <w:bookmarkStart w:id="54" w:name="_Toc223886403"/>
       <w:r>
         <w:t>Light Switch</w:t>
       </w:r>
-      <w:bookmarkEnd w:id="55"/>
+      <w:bookmarkEnd w:id="54"/>
     </w:p>
     <w:p>
       <w:r>
@@ -11367,7 +11108,7 @@
       <w:pPr>
         <w:pStyle w:val="Heading3"/>
       </w:pPr>
-      <w:bookmarkStart w:id="56" w:name="_Toc223886404"/>
+      <w:bookmarkStart w:id="55" w:name="_Toc223886404"/>
       <w:r>
         <w:lastRenderedPageBreak/>
         <w:t>Materials for General PC setup</w:t>
@@ -11375,7 +11116,7 @@
       <w:r>
         <w:t xml:space="preserve"> and Scenes</w:t>
       </w:r>
-      <w:bookmarkEnd w:id="56"/>
+      <w:bookmarkEnd w:id="55"/>
     </w:p>
     <w:p>
       <w:r>
@@ -11497,12 +11238,12 @@
       <w:pPr>
         <w:pStyle w:val="Heading3"/>
       </w:pPr>
-      <w:bookmarkStart w:id="57" w:name="_Toc223886405"/>
+      <w:bookmarkStart w:id="56" w:name="_Toc223886405"/>
       <w:r>
         <w:lastRenderedPageBreak/>
         <w:t>Monitor background image</w:t>
       </w:r>
-      <w:bookmarkEnd w:id="57"/>
+      <w:bookmarkEnd w:id="56"/>
     </w:p>
     <w:p>
       <w:r>
@@ -11593,25 +11334,12 @@
       <w:pPr>
         <w:pStyle w:val="Heading3"/>
       </w:pPr>
-      <w:bookmarkStart w:id="58" w:name="_Toc223886406"/>
+      <w:bookmarkStart w:id="57" w:name="_Toc223886406"/>
       <w:r>
         <w:lastRenderedPageBreak/>
-        <w:t xml:space="preserve">Button Hover </w:t>
-      </w:r>
-      <w:proofErr w:type="spellStart"/>
-      <w:r>
-        <w:t>Sfx</w:t>
-      </w:r>
-      <w:proofErr w:type="spellEnd"/>
-      <w:r>
-        <w:t xml:space="preserve"> by </w:t>
-      </w:r>
-      <w:proofErr w:type="spellStart"/>
-      <w:r>
-        <w:t>Fachii</w:t>
-      </w:r>
-      <w:bookmarkEnd w:id="58"/>
-      <w:proofErr w:type="spellEnd"/>
+        <w:t>Button Hover Sfx by Fachii</w:t>
+      </w:r>
+      <w:bookmarkEnd w:id="57"/>
     </w:p>
     <w:p>
       <w:r>
@@ -11706,36 +11434,14 @@
     </w:p>
     <w:p/>
     <w:p>
-      <w:bookmarkStart w:id="59" w:name="_Toc223886407"/>
+      <w:bookmarkStart w:id="58" w:name="_Toc223886407"/>
       <w:r>
         <w:rPr>
           <w:rStyle w:val="Heading3Char"/>
         </w:rPr>
-        <w:t xml:space="preserve">Button click </w:t>
-      </w:r>
-      <w:proofErr w:type="spellStart"/>
-      <w:r>
-        <w:rPr>
-          <w:rStyle w:val="Heading3Char"/>
-        </w:rPr>
-        <w:t>Sfx</w:t>
-      </w:r>
-      <w:proofErr w:type="spellEnd"/>
-      <w:r>
-        <w:rPr>
-          <w:rStyle w:val="Heading3Char"/>
-        </w:rPr>
-        <w:t xml:space="preserve"> by </w:t>
-      </w:r>
-      <w:proofErr w:type="spellStart"/>
-      <w:r>
-        <w:rPr>
-          <w:rStyle w:val="Heading3Char"/>
-        </w:rPr>
-        <w:t>AndrewEathan</w:t>
-      </w:r>
-      <w:bookmarkEnd w:id="59"/>
-      <w:proofErr w:type="spellEnd"/>
+        <w:t>Button click Sfx by AndrewEathan</w:t>
+      </w:r>
+      <w:bookmarkEnd w:id="58"/>
       <w:r>
         <w:t xml:space="preserve"> </w:t>
       </w:r>
@@ -11841,25 +11547,12 @@
       <w:pPr>
         <w:pStyle w:val="Heading3"/>
       </w:pPr>
-      <w:bookmarkStart w:id="60" w:name="_Toc223886408"/>
+      <w:bookmarkStart w:id="59" w:name="_Toc223886408"/>
       <w:r>
         <w:lastRenderedPageBreak/>
-        <w:t xml:space="preserve">Light Switch </w:t>
-      </w:r>
-      <w:proofErr w:type="gramStart"/>
-      <w:r>
-        <w:t>On</w:t>
-      </w:r>
-      <w:proofErr w:type="gramEnd"/>
-      <w:r>
-        <w:t xml:space="preserve"> </w:t>
-      </w:r>
-      <w:proofErr w:type="spellStart"/>
-      <w:r>
-        <w:t>Sfx</w:t>
-      </w:r>
-      <w:bookmarkEnd w:id="60"/>
-      <w:proofErr w:type="spellEnd"/>
+        <w:t>Light Switch On Sfx</w:t>
+      </w:r>
+      <w:bookmarkEnd w:id="59"/>
     </w:p>
     <w:p>
       <w:r>
@@ -11949,16 +11642,11 @@
       <w:pPr>
         <w:pStyle w:val="Heading3"/>
       </w:pPr>
-      <w:bookmarkStart w:id="61" w:name="_Toc223886409"/>
-      <w:r>
-        <w:t xml:space="preserve">Light Switch Off </w:t>
-      </w:r>
-      <w:proofErr w:type="spellStart"/>
-      <w:r>
-        <w:t>Sfx</w:t>
-      </w:r>
-      <w:bookmarkEnd w:id="61"/>
-      <w:proofErr w:type="spellEnd"/>
+      <w:bookmarkStart w:id="60" w:name="_Toc223886409"/>
+      <w:r>
+        <w:t>Light Switch Off Sfx</w:t>
+      </w:r>
+      <w:bookmarkEnd w:id="60"/>
     </w:p>
     <w:p>
       <w:r>

</xml_diff>

<commit_message>
Finished final version testing section
</commit_message>
<xml_diff>
--- a/30077548Thesis.docx
+++ b/30077548Thesis.docx
@@ -236,7 +236,7 @@
           <w:r>
             <w:fldChar w:fldCharType="separate"/>
           </w:r>
-          <w:hyperlink w:anchor="_Toc223886348" w:history="1">
+          <w:hyperlink w:anchor="_Toc223965848" w:history="1">
             <w:r>
               <w:rPr>
                 <w:rStyle w:val="Hyperlink"/>
@@ -263,7 +263,7 @@
                 <w:noProof/>
                 <w:webHidden/>
               </w:rPr>
-              <w:instrText xml:space="preserve"> PAGEREF _Toc223886348 \h </w:instrText>
+              <w:instrText xml:space="preserve"> PAGEREF _Toc223965848 \h </w:instrText>
             </w:r>
             <w:r>
               <w:rPr>
@@ -308,7 +308,7 @@
               <w:lang w:eastAsia="en-GB"/>
             </w:rPr>
           </w:pPr>
-          <w:hyperlink w:anchor="_Toc223886349" w:history="1">
+          <w:hyperlink w:anchor="_Toc223965849" w:history="1">
             <w:r>
               <w:rPr>
                 <w:rStyle w:val="Hyperlink"/>
@@ -335,7 +335,7 @@
                 <w:noProof/>
                 <w:webHidden/>
               </w:rPr>
-              <w:instrText xml:space="preserve"> PAGEREF _Toc223886349 \h </w:instrText>
+              <w:instrText xml:space="preserve"> PAGEREF _Toc223965849 \h </w:instrText>
             </w:r>
             <w:r>
               <w:rPr>
@@ -380,7 +380,7 @@
               <w:lang w:eastAsia="en-GB"/>
             </w:rPr>
           </w:pPr>
-          <w:hyperlink w:anchor="_Toc223886350" w:history="1">
+          <w:hyperlink w:anchor="_Toc223965850" w:history="1">
             <w:r>
               <w:rPr>
                 <w:rStyle w:val="Hyperlink"/>
@@ -407,7 +407,7 @@
                 <w:noProof/>
                 <w:webHidden/>
               </w:rPr>
-              <w:instrText xml:space="preserve"> PAGEREF _Toc223886350 \h </w:instrText>
+              <w:instrText xml:space="preserve"> PAGEREF _Toc223965850 \h </w:instrText>
             </w:r>
             <w:r>
               <w:rPr>
@@ -452,7 +452,7 @@
               <w:lang w:eastAsia="en-GB"/>
             </w:rPr>
           </w:pPr>
-          <w:hyperlink w:anchor="_Toc223886351" w:history="1">
+          <w:hyperlink w:anchor="_Toc223965851" w:history="1">
             <w:r>
               <w:rPr>
                 <w:rStyle w:val="Hyperlink"/>
@@ -479,7 +479,7 @@
                 <w:noProof/>
                 <w:webHidden/>
               </w:rPr>
-              <w:instrText xml:space="preserve"> PAGEREF _Toc223886351 \h </w:instrText>
+              <w:instrText xml:space="preserve"> PAGEREF _Toc223965851 \h </w:instrText>
             </w:r>
             <w:r>
               <w:rPr>
@@ -524,7 +524,7 @@
               <w:lang w:eastAsia="en-GB"/>
             </w:rPr>
           </w:pPr>
-          <w:hyperlink w:anchor="_Toc223886352" w:history="1">
+          <w:hyperlink w:anchor="_Toc223965852" w:history="1">
             <w:r>
               <w:rPr>
                 <w:rStyle w:val="Hyperlink"/>
@@ -551,7 +551,7 @@
                 <w:noProof/>
                 <w:webHidden/>
               </w:rPr>
-              <w:instrText xml:space="preserve"> PAGEREF _Toc223886352 \h </w:instrText>
+              <w:instrText xml:space="preserve"> PAGEREF _Toc223965852 \h </w:instrText>
             </w:r>
             <w:r>
               <w:rPr>
@@ -596,7 +596,7 @@
               <w:lang w:eastAsia="en-GB"/>
             </w:rPr>
           </w:pPr>
-          <w:hyperlink w:anchor="_Toc223886353" w:history="1">
+          <w:hyperlink w:anchor="_Toc223965853" w:history="1">
             <w:r>
               <w:rPr>
                 <w:rStyle w:val="Hyperlink"/>
@@ -623,7 +623,7 @@
                 <w:noProof/>
                 <w:webHidden/>
               </w:rPr>
-              <w:instrText xml:space="preserve"> PAGEREF _Toc223886353 \h </w:instrText>
+              <w:instrText xml:space="preserve"> PAGEREF _Toc223965853 \h </w:instrText>
             </w:r>
             <w:r>
               <w:rPr>
@@ -668,7 +668,7 @@
               <w:lang w:eastAsia="en-GB"/>
             </w:rPr>
           </w:pPr>
-          <w:hyperlink w:anchor="_Toc223886354" w:history="1">
+          <w:hyperlink w:anchor="_Toc223965854" w:history="1">
             <w:r>
               <w:rPr>
                 <w:rStyle w:val="Hyperlink"/>
@@ -695,7 +695,7 @@
                 <w:noProof/>
                 <w:webHidden/>
               </w:rPr>
-              <w:instrText xml:space="preserve"> PAGEREF _Toc223886354 \h </w:instrText>
+              <w:instrText xml:space="preserve"> PAGEREF _Toc223965854 \h </w:instrText>
             </w:r>
             <w:r>
               <w:rPr>
@@ -740,7 +740,7 @@
               <w:lang w:eastAsia="en-GB"/>
             </w:rPr>
           </w:pPr>
-          <w:hyperlink w:anchor="_Toc223886355" w:history="1">
+          <w:hyperlink w:anchor="_Toc223965855" w:history="1">
             <w:r>
               <w:rPr>
                 <w:rStyle w:val="Hyperlink"/>
@@ -767,7 +767,7 @@
                 <w:noProof/>
                 <w:webHidden/>
               </w:rPr>
-              <w:instrText xml:space="preserve"> PAGEREF _Toc223886355 \h </w:instrText>
+              <w:instrText xml:space="preserve"> PAGEREF _Toc223965855 \h </w:instrText>
             </w:r>
             <w:r>
               <w:rPr>
@@ -812,7 +812,7 @@
               <w:lang w:eastAsia="en-GB"/>
             </w:rPr>
           </w:pPr>
-          <w:hyperlink w:anchor="_Toc223886356" w:history="1">
+          <w:hyperlink w:anchor="_Toc223965856" w:history="1">
             <w:r>
               <w:rPr>
                 <w:rStyle w:val="Hyperlink"/>
@@ -839,7 +839,7 @@
                 <w:noProof/>
                 <w:webHidden/>
               </w:rPr>
-              <w:instrText xml:space="preserve"> PAGEREF _Toc223886356 \h </w:instrText>
+              <w:instrText xml:space="preserve"> PAGEREF _Toc223965856 \h </w:instrText>
             </w:r>
             <w:r>
               <w:rPr>
@@ -884,7 +884,7 @@
               <w:lang w:eastAsia="en-GB"/>
             </w:rPr>
           </w:pPr>
-          <w:hyperlink w:anchor="_Toc223886357" w:history="1">
+          <w:hyperlink w:anchor="_Toc223965857" w:history="1">
             <w:r>
               <w:rPr>
                 <w:rStyle w:val="Hyperlink"/>
@@ -911,7 +911,7 @@
                 <w:noProof/>
                 <w:webHidden/>
               </w:rPr>
-              <w:instrText xml:space="preserve"> PAGEREF _Toc223886357 \h </w:instrText>
+              <w:instrText xml:space="preserve"> PAGEREF _Toc223965857 \h </w:instrText>
             </w:r>
             <w:r>
               <w:rPr>
@@ -956,7 +956,7 @@
               <w:lang w:eastAsia="en-GB"/>
             </w:rPr>
           </w:pPr>
-          <w:hyperlink w:anchor="_Toc223886358" w:history="1">
+          <w:hyperlink w:anchor="_Toc223965858" w:history="1">
             <w:r>
               <w:rPr>
                 <w:rStyle w:val="Hyperlink"/>
@@ -983,7 +983,7 @@
                 <w:noProof/>
                 <w:webHidden/>
               </w:rPr>
-              <w:instrText xml:space="preserve"> PAGEREF _Toc223886358 \h </w:instrText>
+              <w:instrText xml:space="preserve"> PAGEREF _Toc223965858 \h </w:instrText>
             </w:r>
             <w:r>
               <w:rPr>
@@ -1028,7 +1028,7 @@
               <w:lang w:eastAsia="en-GB"/>
             </w:rPr>
           </w:pPr>
-          <w:hyperlink w:anchor="_Toc223886359" w:history="1">
+          <w:hyperlink w:anchor="_Toc223965859" w:history="1">
             <w:r>
               <w:rPr>
                 <w:rStyle w:val="Hyperlink"/>
@@ -1055,7 +1055,7 @@
                 <w:noProof/>
                 <w:webHidden/>
               </w:rPr>
-              <w:instrText xml:space="preserve"> PAGEREF _Toc223886359 \h </w:instrText>
+              <w:instrText xml:space="preserve"> PAGEREF _Toc223965859 \h </w:instrText>
             </w:r>
             <w:r>
               <w:rPr>
@@ -1100,7 +1100,7 @@
               <w:lang w:eastAsia="en-GB"/>
             </w:rPr>
           </w:pPr>
-          <w:hyperlink w:anchor="_Toc223886360" w:history="1">
+          <w:hyperlink w:anchor="_Toc223965860" w:history="1">
             <w:r>
               <w:rPr>
                 <w:rStyle w:val="Hyperlink"/>
@@ -1127,7 +1127,7 @@
                 <w:noProof/>
                 <w:webHidden/>
               </w:rPr>
-              <w:instrText xml:space="preserve"> PAGEREF _Toc223886360 \h </w:instrText>
+              <w:instrText xml:space="preserve"> PAGEREF _Toc223965860 \h </w:instrText>
             </w:r>
             <w:r>
               <w:rPr>
@@ -1172,7 +1172,7 @@
               <w:lang w:eastAsia="en-GB"/>
             </w:rPr>
           </w:pPr>
-          <w:hyperlink w:anchor="_Toc223886361" w:history="1">
+          <w:hyperlink w:anchor="_Toc223965861" w:history="1">
             <w:r>
               <w:rPr>
                 <w:rStyle w:val="Hyperlink"/>
@@ -1199,7 +1199,7 @@
                 <w:noProof/>
                 <w:webHidden/>
               </w:rPr>
-              <w:instrText xml:space="preserve"> PAGEREF _Toc223886361 \h </w:instrText>
+              <w:instrText xml:space="preserve"> PAGEREF _Toc223965861 \h </w:instrText>
             </w:r>
             <w:r>
               <w:rPr>
@@ -1244,7 +1244,7 @@
               <w:lang w:eastAsia="en-GB"/>
             </w:rPr>
           </w:pPr>
-          <w:hyperlink w:anchor="_Toc223886362" w:history="1">
+          <w:hyperlink w:anchor="_Toc223965862" w:history="1">
             <w:r>
               <w:rPr>
                 <w:rStyle w:val="Hyperlink"/>
@@ -1271,7 +1271,7 @@
                 <w:noProof/>
                 <w:webHidden/>
               </w:rPr>
-              <w:instrText xml:space="preserve"> PAGEREF _Toc223886362 \h </w:instrText>
+              <w:instrText xml:space="preserve"> PAGEREF _Toc223965862 \h </w:instrText>
             </w:r>
             <w:r>
               <w:rPr>
@@ -1316,7 +1316,7 @@
               <w:lang w:eastAsia="en-GB"/>
             </w:rPr>
           </w:pPr>
-          <w:hyperlink w:anchor="_Toc223886363" w:history="1">
+          <w:hyperlink w:anchor="_Toc223965863" w:history="1">
             <w:r>
               <w:rPr>
                 <w:rStyle w:val="Hyperlink"/>
@@ -1343,7 +1343,7 @@
                 <w:noProof/>
                 <w:webHidden/>
               </w:rPr>
-              <w:instrText xml:space="preserve"> PAGEREF _Toc223886363 \h </w:instrText>
+              <w:instrText xml:space="preserve"> PAGEREF _Toc223965863 \h </w:instrText>
             </w:r>
             <w:r>
               <w:rPr>
@@ -1388,7 +1388,7 @@
               <w:lang w:eastAsia="en-GB"/>
             </w:rPr>
           </w:pPr>
-          <w:hyperlink w:anchor="_Toc223886364" w:history="1">
+          <w:hyperlink w:anchor="_Toc223965864" w:history="1">
             <w:r>
               <w:rPr>
                 <w:rStyle w:val="Hyperlink"/>
@@ -1415,7 +1415,7 @@
                 <w:noProof/>
                 <w:webHidden/>
               </w:rPr>
-              <w:instrText xml:space="preserve"> PAGEREF _Toc223886364 \h </w:instrText>
+              <w:instrText xml:space="preserve"> PAGEREF _Toc223965864 \h </w:instrText>
             </w:r>
             <w:r>
               <w:rPr>
@@ -1460,7 +1460,7 @@
               <w:lang w:eastAsia="en-GB"/>
             </w:rPr>
           </w:pPr>
-          <w:hyperlink w:anchor="_Toc223886365" w:history="1">
+          <w:hyperlink w:anchor="_Toc223965865" w:history="1">
             <w:r>
               <w:rPr>
                 <w:rStyle w:val="Hyperlink"/>
@@ -1487,7 +1487,7 @@
                 <w:noProof/>
                 <w:webHidden/>
               </w:rPr>
-              <w:instrText xml:space="preserve"> PAGEREF _Toc223886365 \h </w:instrText>
+              <w:instrText xml:space="preserve"> PAGEREF _Toc223965865 \h </w:instrText>
             </w:r>
             <w:r>
               <w:rPr>
@@ -1532,7 +1532,7 @@
               <w:lang w:eastAsia="en-GB"/>
             </w:rPr>
           </w:pPr>
-          <w:hyperlink w:anchor="_Toc223886366" w:history="1">
+          <w:hyperlink w:anchor="_Toc223965866" w:history="1">
             <w:r>
               <w:rPr>
                 <w:rStyle w:val="Hyperlink"/>
@@ -1559,7 +1559,7 @@
                 <w:noProof/>
                 <w:webHidden/>
               </w:rPr>
-              <w:instrText xml:space="preserve"> PAGEREF _Toc223886366 \h </w:instrText>
+              <w:instrText xml:space="preserve"> PAGEREF _Toc223965866 \h </w:instrText>
             </w:r>
             <w:r>
               <w:rPr>
@@ -1604,7 +1604,7 @@
               <w:lang w:eastAsia="en-GB"/>
             </w:rPr>
           </w:pPr>
-          <w:hyperlink w:anchor="_Toc223886367" w:history="1">
+          <w:hyperlink w:anchor="_Toc223965867" w:history="1">
             <w:r>
               <w:rPr>
                 <w:rStyle w:val="Hyperlink"/>
@@ -1631,7 +1631,7 @@
                 <w:noProof/>
                 <w:webHidden/>
               </w:rPr>
-              <w:instrText xml:space="preserve"> PAGEREF _Toc223886367 \h </w:instrText>
+              <w:instrText xml:space="preserve"> PAGEREF _Toc223965867 \h </w:instrText>
             </w:r>
             <w:r>
               <w:rPr>
@@ -1676,7 +1676,7 @@
               <w:lang w:eastAsia="en-GB"/>
             </w:rPr>
           </w:pPr>
-          <w:hyperlink w:anchor="_Toc223886368" w:history="1">
+          <w:hyperlink w:anchor="_Toc223965868" w:history="1">
             <w:r>
               <w:rPr>
                 <w:rStyle w:val="Hyperlink"/>
@@ -1703,7 +1703,7 @@
                 <w:noProof/>
                 <w:webHidden/>
               </w:rPr>
-              <w:instrText xml:space="preserve"> PAGEREF _Toc223886368 \h </w:instrText>
+              <w:instrText xml:space="preserve"> PAGEREF _Toc223965868 \h </w:instrText>
             </w:r>
             <w:r>
               <w:rPr>
@@ -1748,7 +1748,7 @@
               <w:lang w:eastAsia="en-GB"/>
             </w:rPr>
           </w:pPr>
-          <w:hyperlink w:anchor="_Toc223886369" w:history="1">
+          <w:hyperlink w:anchor="_Toc223965869" w:history="1">
             <w:r>
               <w:rPr>
                 <w:rStyle w:val="Hyperlink"/>
@@ -1775,7 +1775,7 @@
                 <w:noProof/>
                 <w:webHidden/>
               </w:rPr>
-              <w:instrText xml:space="preserve"> PAGEREF _Toc223886369 \h </w:instrText>
+              <w:instrText xml:space="preserve"> PAGEREF _Toc223965869 \h </w:instrText>
             </w:r>
             <w:r>
               <w:rPr>
@@ -1820,7 +1820,7 @@
               <w:lang w:eastAsia="en-GB"/>
             </w:rPr>
           </w:pPr>
-          <w:hyperlink w:anchor="_Toc223886370" w:history="1">
+          <w:hyperlink w:anchor="_Toc223965870" w:history="1">
             <w:r>
               <w:rPr>
                 <w:rStyle w:val="Hyperlink"/>
@@ -1847,7 +1847,7 @@
                 <w:noProof/>
                 <w:webHidden/>
               </w:rPr>
-              <w:instrText xml:space="preserve"> PAGEREF _Toc223886370 \h </w:instrText>
+              <w:instrText xml:space="preserve"> PAGEREF _Toc223965870 \h </w:instrText>
             </w:r>
             <w:r>
               <w:rPr>
@@ -1892,12 +1892,84 @@
               <w:lang w:eastAsia="en-GB"/>
             </w:rPr>
           </w:pPr>
-          <w:hyperlink w:anchor="_Toc223886371" w:history="1">
+          <w:hyperlink w:anchor="_Toc223965871" w:history="1">
             <w:r>
               <w:rPr>
                 <w:rStyle w:val="Hyperlink"/>
                 <w:noProof/>
               </w:rPr>
+              <w:t>Source Control</w:t>
+            </w:r>
+            <w:r>
+              <w:rPr>
+                <w:noProof/>
+                <w:webHidden/>
+              </w:rPr>
+              <w:tab/>
+            </w:r>
+            <w:r>
+              <w:rPr>
+                <w:noProof/>
+                <w:webHidden/>
+              </w:rPr>
+              <w:fldChar w:fldCharType="begin"/>
+            </w:r>
+            <w:r>
+              <w:rPr>
+                <w:noProof/>
+                <w:webHidden/>
+              </w:rPr>
+              <w:instrText xml:space="preserve"> PAGEREF _Toc223965871 \h </w:instrText>
+            </w:r>
+            <w:r>
+              <w:rPr>
+                <w:noProof/>
+                <w:webHidden/>
+              </w:rPr>
+            </w:r>
+            <w:r>
+              <w:rPr>
+                <w:noProof/>
+                <w:webHidden/>
+              </w:rPr>
+              <w:fldChar w:fldCharType="separate"/>
+            </w:r>
+            <w:r>
+              <w:rPr>
+                <w:noProof/>
+                <w:webHidden/>
+              </w:rPr>
+              <w:t>18</w:t>
+            </w:r>
+            <w:r>
+              <w:rPr>
+                <w:noProof/>
+                <w:webHidden/>
+              </w:rPr>
+              <w:fldChar w:fldCharType="end"/>
+            </w:r>
+          </w:hyperlink>
+        </w:p>
+        <w:p>
+          <w:pPr>
+            <w:pStyle w:val="TOC2"/>
+            <w:tabs>
+              <w:tab w:val="right" w:leader="dot" w:pos="9016"/>
+            </w:tabs>
+            <w:rPr>
+              <w:rFonts w:eastAsiaTheme="minorEastAsia"/>
+              <w:noProof/>
+              <w:sz w:val="24"/>
+              <w:szCs w:val="24"/>
+              <w:lang w:eastAsia="en-GB"/>
+            </w:rPr>
+          </w:pPr>
+          <w:hyperlink w:anchor="_Toc223965872" w:history="1">
+            <w:r>
+              <w:rPr>
+                <w:rStyle w:val="Hyperlink"/>
+                <w:noProof/>
+              </w:rPr>
               <w:t>Prototype Implementation</w:t>
             </w:r>
             <w:r>
@@ -1919,7 +1991,7 @@
                 <w:noProof/>
                 <w:webHidden/>
               </w:rPr>
-              <w:instrText xml:space="preserve"> PAGEREF _Toc223886371 \h </w:instrText>
+              <w:instrText xml:space="preserve"> PAGEREF _Toc223965872 \h </w:instrText>
             </w:r>
             <w:r>
               <w:rPr>
@@ -1964,7 +2036,7 @@
               <w:lang w:eastAsia="en-GB"/>
             </w:rPr>
           </w:pPr>
-          <w:hyperlink w:anchor="_Toc223886372" w:history="1">
+          <w:hyperlink w:anchor="_Toc223965873" w:history="1">
             <w:r>
               <w:rPr>
                 <w:rStyle w:val="Hyperlink"/>
@@ -1991,7 +2063,7 @@
                 <w:noProof/>
                 <w:webHidden/>
               </w:rPr>
-              <w:instrText xml:space="preserve"> PAGEREF _Toc223886372 \h </w:instrText>
+              <w:instrText xml:space="preserve"> PAGEREF _Toc223965873 \h </w:instrText>
             </w:r>
             <w:r>
               <w:rPr>
@@ -2036,7 +2108,7 @@
               <w:lang w:eastAsia="en-GB"/>
             </w:rPr>
           </w:pPr>
-          <w:hyperlink w:anchor="_Toc223886373" w:history="1">
+          <w:hyperlink w:anchor="_Toc223965874" w:history="1">
             <w:r>
               <w:rPr>
                 <w:rStyle w:val="Hyperlink"/>
@@ -2063,7 +2135,7 @@
                 <w:noProof/>
                 <w:webHidden/>
               </w:rPr>
-              <w:instrText xml:space="preserve"> PAGEREF _Toc223886373 \h </w:instrText>
+              <w:instrText xml:space="preserve"> PAGEREF _Toc223965874 \h </w:instrText>
             </w:r>
             <w:r>
               <w:rPr>
@@ -2108,7 +2180,7 @@
               <w:lang w:eastAsia="en-GB"/>
             </w:rPr>
           </w:pPr>
-          <w:hyperlink w:anchor="_Toc223886374" w:history="1">
+          <w:hyperlink w:anchor="_Toc223965875" w:history="1">
             <w:r>
               <w:rPr>
                 <w:rStyle w:val="Hyperlink"/>
@@ -2135,7 +2207,7 @@
                 <w:noProof/>
                 <w:webHidden/>
               </w:rPr>
-              <w:instrText xml:space="preserve"> PAGEREF _Toc223886374 \h </w:instrText>
+              <w:instrText xml:space="preserve"> PAGEREF _Toc223965875 \h </w:instrText>
             </w:r>
             <w:r>
               <w:rPr>
@@ -2180,7 +2252,7 @@
               <w:lang w:eastAsia="en-GB"/>
             </w:rPr>
           </w:pPr>
-          <w:hyperlink w:anchor="_Toc223886375" w:history="1">
+          <w:hyperlink w:anchor="_Toc223965876" w:history="1">
             <w:r>
               <w:rPr>
                 <w:rStyle w:val="Hyperlink"/>
@@ -2207,7 +2279,7 @@
                 <w:noProof/>
                 <w:webHidden/>
               </w:rPr>
-              <w:instrText xml:space="preserve"> PAGEREF _Toc223886375 \h </w:instrText>
+              <w:instrText xml:space="preserve"> PAGEREF _Toc223965876 \h </w:instrText>
             </w:r>
             <w:r>
               <w:rPr>
@@ -2252,7 +2324,7 @@
               <w:lang w:eastAsia="en-GB"/>
             </w:rPr>
           </w:pPr>
-          <w:hyperlink w:anchor="_Toc223886376" w:history="1">
+          <w:hyperlink w:anchor="_Toc223965877" w:history="1">
             <w:r>
               <w:rPr>
                 <w:rStyle w:val="Hyperlink"/>
@@ -2279,7 +2351,7 @@
                 <w:noProof/>
                 <w:webHidden/>
               </w:rPr>
-              <w:instrText xml:space="preserve"> PAGEREF _Toc223886376 \h </w:instrText>
+              <w:instrText xml:space="preserve"> PAGEREF _Toc223965877 \h </w:instrText>
             </w:r>
             <w:r>
               <w:rPr>
@@ -2324,7 +2396,7 @@
               <w:lang w:eastAsia="en-GB"/>
             </w:rPr>
           </w:pPr>
-          <w:hyperlink w:anchor="_Toc223886377" w:history="1">
+          <w:hyperlink w:anchor="_Toc223965878" w:history="1">
             <w:r>
               <w:rPr>
                 <w:rStyle w:val="Hyperlink"/>
@@ -2351,7 +2423,7 @@
                 <w:noProof/>
                 <w:webHidden/>
               </w:rPr>
-              <w:instrText xml:space="preserve"> PAGEREF _Toc223886377 \h </w:instrText>
+              <w:instrText xml:space="preserve"> PAGEREF _Toc223965878 \h </w:instrText>
             </w:r>
             <w:r>
               <w:rPr>
@@ -2396,7 +2468,7 @@
               <w:lang w:eastAsia="en-GB"/>
             </w:rPr>
           </w:pPr>
-          <w:hyperlink w:anchor="_Toc223886378" w:history="1">
+          <w:hyperlink w:anchor="_Toc223965879" w:history="1">
             <w:r>
               <w:rPr>
                 <w:rStyle w:val="Hyperlink"/>
@@ -2423,7 +2495,7 @@
                 <w:noProof/>
                 <w:webHidden/>
               </w:rPr>
-              <w:instrText xml:space="preserve"> PAGEREF _Toc223886378 \h </w:instrText>
+              <w:instrText xml:space="preserve"> PAGEREF _Toc223965879 \h </w:instrText>
             </w:r>
             <w:r>
               <w:rPr>
@@ -2468,7 +2540,7 @@
               <w:lang w:eastAsia="en-GB"/>
             </w:rPr>
           </w:pPr>
-          <w:hyperlink w:anchor="_Toc223886379" w:history="1">
+          <w:hyperlink w:anchor="_Toc223965880" w:history="1">
             <w:r>
               <w:rPr>
                 <w:rStyle w:val="Hyperlink"/>
@@ -2495,7 +2567,7 @@
                 <w:noProof/>
                 <w:webHidden/>
               </w:rPr>
-              <w:instrText xml:space="preserve"> PAGEREF _Toc223886379 \h </w:instrText>
+              <w:instrText xml:space="preserve"> PAGEREF _Toc223965880 \h </w:instrText>
             </w:r>
             <w:r>
               <w:rPr>
@@ -2540,7 +2612,7 @@
               <w:lang w:eastAsia="en-GB"/>
             </w:rPr>
           </w:pPr>
-          <w:hyperlink w:anchor="_Toc223886380" w:history="1">
+          <w:hyperlink w:anchor="_Toc223965881" w:history="1">
             <w:r>
               <w:rPr>
                 <w:rStyle w:val="Hyperlink"/>
@@ -2567,7 +2639,7 @@
                 <w:noProof/>
                 <w:webHidden/>
               </w:rPr>
-              <w:instrText xml:space="preserve"> PAGEREF _Toc223886380 \h </w:instrText>
+              <w:instrText xml:space="preserve"> PAGEREF _Toc223965881 \h </w:instrText>
             </w:r>
             <w:r>
               <w:rPr>
@@ -2612,13 +2684,13 @@
               <w:lang w:eastAsia="en-GB"/>
             </w:rPr>
           </w:pPr>
-          <w:hyperlink w:anchor="_Toc223886381" w:history="1">
+          <w:hyperlink w:anchor="_Toc223965882" w:history="1">
             <w:r>
               <w:rPr>
                 <w:rStyle w:val="Hyperlink"/>
                 <w:noProof/>
               </w:rPr>
-              <w:t>Objective Flow Tweaks</w:t>
+              <w:t>Flow Tweaks</w:t>
             </w:r>
             <w:r>
               <w:rPr>
@@ -2639,7 +2711,7 @@
                 <w:noProof/>
                 <w:webHidden/>
               </w:rPr>
-              <w:instrText xml:space="preserve"> PAGEREF _Toc223886381 \h </w:instrText>
+              <w:instrText xml:space="preserve"> PAGEREF _Toc223965882 \h </w:instrText>
             </w:r>
             <w:r>
               <w:rPr>
@@ -2684,7 +2756,7 @@
               <w:lang w:eastAsia="en-GB"/>
             </w:rPr>
           </w:pPr>
-          <w:hyperlink w:anchor="_Toc223886382" w:history="1">
+          <w:hyperlink w:anchor="_Toc223965883" w:history="1">
             <w:r>
               <w:rPr>
                 <w:rStyle w:val="Hyperlink"/>
@@ -2711,7 +2783,7 @@
                 <w:noProof/>
                 <w:webHidden/>
               </w:rPr>
-              <w:instrText xml:space="preserve"> PAGEREF _Toc223886382 \h </w:instrText>
+              <w:instrText xml:space="preserve"> PAGEREF _Toc223965883 \h </w:instrText>
             </w:r>
             <w:r>
               <w:rPr>
@@ -2756,7 +2828,7 @@
               <w:lang w:eastAsia="en-GB"/>
             </w:rPr>
           </w:pPr>
-          <w:hyperlink w:anchor="_Toc223886383" w:history="1">
+          <w:hyperlink w:anchor="_Toc223965884" w:history="1">
             <w:r>
               <w:rPr>
                 <w:rStyle w:val="Hyperlink"/>
@@ -2783,7 +2855,7 @@
                 <w:noProof/>
                 <w:webHidden/>
               </w:rPr>
-              <w:instrText xml:space="preserve"> PAGEREF _Toc223886383 \h </w:instrText>
+              <w:instrText xml:space="preserve"> PAGEREF _Toc223965884 \h </w:instrText>
             </w:r>
             <w:r>
               <w:rPr>
@@ -2828,7 +2900,7 @@
               <w:lang w:eastAsia="en-GB"/>
             </w:rPr>
           </w:pPr>
-          <w:hyperlink w:anchor="_Toc223886384" w:history="1">
+          <w:hyperlink w:anchor="_Toc223965885" w:history="1">
             <w:r>
               <w:rPr>
                 <w:rStyle w:val="Hyperlink"/>
@@ -2855,7 +2927,7 @@
                 <w:noProof/>
                 <w:webHidden/>
               </w:rPr>
-              <w:instrText xml:space="preserve"> PAGEREF _Toc223886384 \h </w:instrText>
+              <w:instrText xml:space="preserve"> PAGEREF _Toc223965885 \h </w:instrText>
             </w:r>
             <w:r>
               <w:rPr>
@@ -2900,7 +2972,7 @@
               <w:lang w:eastAsia="en-GB"/>
             </w:rPr>
           </w:pPr>
-          <w:hyperlink w:anchor="_Toc223886385" w:history="1">
+          <w:hyperlink w:anchor="_Toc223965886" w:history="1">
             <w:r>
               <w:rPr>
                 <w:rStyle w:val="Hyperlink"/>
@@ -2927,7 +2999,7 @@
                 <w:noProof/>
                 <w:webHidden/>
               </w:rPr>
-              <w:instrText xml:space="preserve"> PAGEREF _Toc223886385 \h </w:instrText>
+              <w:instrText xml:space="preserve"> PAGEREF _Toc223965886 \h </w:instrText>
             </w:r>
             <w:r>
               <w:rPr>
@@ -2972,7 +3044,7 @@
               <w:lang w:eastAsia="en-GB"/>
             </w:rPr>
           </w:pPr>
-          <w:hyperlink w:anchor="_Toc223886386" w:history="1">
+          <w:hyperlink w:anchor="_Toc223965887" w:history="1">
             <w:r>
               <w:rPr>
                 <w:rStyle w:val="Hyperlink"/>
@@ -2999,7 +3071,7 @@
                 <w:noProof/>
                 <w:webHidden/>
               </w:rPr>
-              <w:instrText xml:space="preserve"> PAGEREF _Toc223886386 \h </w:instrText>
+              <w:instrText xml:space="preserve"> PAGEREF _Toc223965887 \h </w:instrText>
             </w:r>
             <w:r>
               <w:rPr>
@@ -3044,7 +3116,7 @@
               <w:lang w:eastAsia="en-GB"/>
             </w:rPr>
           </w:pPr>
-          <w:hyperlink w:anchor="_Toc223886387" w:history="1">
+          <w:hyperlink w:anchor="_Toc223965888" w:history="1">
             <w:r>
               <w:rPr>
                 <w:rStyle w:val="Hyperlink"/>
@@ -3071,7 +3143,7 @@
                 <w:noProof/>
                 <w:webHidden/>
               </w:rPr>
-              <w:instrText xml:space="preserve"> PAGEREF _Toc223886387 \h </w:instrText>
+              <w:instrText xml:space="preserve"> PAGEREF _Toc223965888 \h </w:instrText>
             </w:r>
             <w:r>
               <w:rPr>
@@ -3116,7 +3188,7 @@
               <w:lang w:eastAsia="en-GB"/>
             </w:rPr>
           </w:pPr>
-          <w:hyperlink w:anchor="_Toc223886388" w:history="1">
+          <w:hyperlink w:anchor="_Toc223965889" w:history="1">
             <w:r>
               <w:rPr>
                 <w:rStyle w:val="Hyperlink"/>
@@ -3143,7 +3215,7 @@
                 <w:noProof/>
                 <w:webHidden/>
               </w:rPr>
-              <w:instrText xml:space="preserve"> PAGEREF _Toc223886388 \h </w:instrText>
+              <w:instrText xml:space="preserve"> PAGEREF _Toc223965889 \h </w:instrText>
             </w:r>
             <w:r>
               <w:rPr>
@@ -3188,7 +3260,7 @@
               <w:lang w:eastAsia="en-GB"/>
             </w:rPr>
           </w:pPr>
-          <w:hyperlink w:anchor="_Toc223886389" w:history="1">
+          <w:hyperlink w:anchor="_Toc223965890" w:history="1">
             <w:r>
               <w:rPr>
                 <w:rStyle w:val="Hyperlink"/>
@@ -3215,7 +3287,7 @@
                 <w:noProof/>
                 <w:webHidden/>
               </w:rPr>
-              <w:instrText xml:space="preserve"> PAGEREF _Toc223886389 \h </w:instrText>
+              <w:instrText xml:space="preserve"> PAGEREF _Toc223965890 \h </w:instrText>
             </w:r>
             <w:r>
               <w:rPr>
@@ -3260,7 +3332,7 @@
               <w:lang w:eastAsia="en-GB"/>
             </w:rPr>
           </w:pPr>
-          <w:hyperlink w:anchor="_Toc223886390" w:history="1">
+          <w:hyperlink w:anchor="_Toc223965891" w:history="1">
             <w:r>
               <w:rPr>
                 <w:rStyle w:val="Hyperlink"/>
@@ -3287,7 +3359,7 @@
                 <w:noProof/>
                 <w:webHidden/>
               </w:rPr>
-              <w:instrText xml:space="preserve"> PAGEREF _Toc223886390 \h </w:instrText>
+              <w:instrText xml:space="preserve"> PAGEREF _Toc223965891 \h </w:instrText>
             </w:r>
             <w:r>
               <w:rPr>
@@ -3332,7 +3404,7 @@
               <w:lang w:eastAsia="en-GB"/>
             </w:rPr>
           </w:pPr>
-          <w:hyperlink w:anchor="_Toc223886391" w:history="1">
+          <w:hyperlink w:anchor="_Toc223965892" w:history="1">
             <w:r>
               <w:rPr>
                 <w:rStyle w:val="Hyperlink"/>
@@ -3359,7 +3431,7 @@
                 <w:noProof/>
                 <w:webHidden/>
               </w:rPr>
-              <w:instrText xml:space="preserve"> PAGEREF _Toc223886391 \h </w:instrText>
+              <w:instrText xml:space="preserve"> PAGEREF _Toc223965892 \h </w:instrText>
             </w:r>
             <w:r>
               <w:rPr>
@@ -3404,7 +3476,7 @@
               <w:lang w:eastAsia="en-GB"/>
             </w:rPr>
           </w:pPr>
-          <w:hyperlink w:anchor="_Toc223886392" w:history="1">
+          <w:hyperlink w:anchor="_Toc223965893" w:history="1">
             <w:r>
               <w:rPr>
                 <w:rStyle w:val="Hyperlink"/>
@@ -3431,7 +3503,7 @@
                 <w:noProof/>
                 <w:webHidden/>
               </w:rPr>
-              <w:instrText xml:space="preserve"> PAGEREF _Toc223886392 \h </w:instrText>
+              <w:instrText xml:space="preserve"> PAGEREF _Toc223965893 \h </w:instrText>
             </w:r>
             <w:r>
               <w:rPr>
@@ -3476,7 +3548,7 @@
               <w:lang w:eastAsia="en-GB"/>
             </w:rPr>
           </w:pPr>
-          <w:hyperlink w:anchor="_Toc223886393" w:history="1">
+          <w:hyperlink w:anchor="_Toc223965894" w:history="1">
             <w:r>
               <w:rPr>
                 <w:rStyle w:val="Hyperlink"/>
@@ -3503,7 +3575,7 @@
                 <w:noProof/>
                 <w:webHidden/>
               </w:rPr>
-              <w:instrText xml:space="preserve"> PAGEREF _Toc223886393 \h </w:instrText>
+              <w:instrText xml:space="preserve"> PAGEREF _Toc223965894 \h </w:instrText>
             </w:r>
             <w:r>
               <w:rPr>
@@ -3548,7 +3620,7 @@
               <w:lang w:eastAsia="en-GB"/>
             </w:rPr>
           </w:pPr>
-          <w:hyperlink w:anchor="_Toc223886394" w:history="1">
+          <w:hyperlink w:anchor="_Toc223965895" w:history="1">
             <w:r>
               <w:rPr>
                 <w:rStyle w:val="Hyperlink"/>
@@ -3575,7 +3647,7 @@
                 <w:noProof/>
                 <w:webHidden/>
               </w:rPr>
-              <w:instrText xml:space="preserve"> PAGEREF _Toc223886394 \h </w:instrText>
+              <w:instrText xml:space="preserve"> PAGEREF _Toc223965895 \h </w:instrText>
             </w:r>
             <w:r>
               <w:rPr>
@@ -3620,7 +3692,7 @@
               <w:lang w:eastAsia="en-GB"/>
             </w:rPr>
           </w:pPr>
-          <w:hyperlink w:anchor="_Toc223886395" w:history="1">
+          <w:hyperlink w:anchor="_Toc223965896" w:history="1">
             <w:r>
               <w:rPr>
                 <w:rStyle w:val="Hyperlink"/>
@@ -3647,7 +3719,7 @@
                 <w:noProof/>
                 <w:webHidden/>
               </w:rPr>
-              <w:instrText xml:space="preserve"> PAGEREF _Toc223886395 \h </w:instrText>
+              <w:instrText xml:space="preserve"> PAGEREF _Toc223965896 \h </w:instrText>
             </w:r>
             <w:r>
               <w:rPr>
@@ -3692,7 +3764,7 @@
               <w:lang w:eastAsia="en-GB"/>
             </w:rPr>
           </w:pPr>
-          <w:hyperlink w:anchor="_Toc223886396" w:history="1">
+          <w:hyperlink w:anchor="_Toc223965897" w:history="1">
             <w:r>
               <w:rPr>
                 <w:rStyle w:val="Hyperlink"/>
@@ -3719,7 +3791,7 @@
                 <w:noProof/>
                 <w:webHidden/>
               </w:rPr>
-              <w:instrText xml:space="preserve"> PAGEREF _Toc223886396 \h </w:instrText>
+              <w:instrText xml:space="preserve"> PAGEREF _Toc223965897 \h </w:instrText>
             </w:r>
             <w:r>
               <w:rPr>
@@ -3764,7 +3836,7 @@
               <w:lang w:eastAsia="en-GB"/>
             </w:rPr>
           </w:pPr>
-          <w:hyperlink w:anchor="_Toc223886397" w:history="1">
+          <w:hyperlink w:anchor="_Toc223965898" w:history="1">
             <w:r>
               <w:rPr>
                 <w:rStyle w:val="Hyperlink"/>
@@ -3791,7 +3863,7 @@
                 <w:noProof/>
                 <w:webHidden/>
               </w:rPr>
-              <w:instrText xml:space="preserve"> PAGEREF _Toc223886397 \h </w:instrText>
+              <w:instrText xml:space="preserve"> PAGEREF _Toc223965898 \h </w:instrText>
             </w:r>
             <w:r>
               <w:rPr>
@@ -3836,7 +3908,7 @@
               <w:lang w:eastAsia="en-GB"/>
             </w:rPr>
           </w:pPr>
-          <w:hyperlink w:anchor="_Toc223886398" w:history="1">
+          <w:hyperlink w:anchor="_Toc223965899" w:history="1">
             <w:r>
               <w:rPr>
                 <w:rStyle w:val="Hyperlink"/>
@@ -3863,7 +3935,7 @@
                 <w:noProof/>
                 <w:webHidden/>
               </w:rPr>
-              <w:instrText xml:space="preserve"> PAGEREF _Toc223886398 \h </w:instrText>
+              <w:instrText xml:space="preserve"> PAGEREF _Toc223965899 \h </w:instrText>
             </w:r>
             <w:r>
               <w:rPr>
@@ -3908,7 +3980,7 @@
               <w:lang w:eastAsia="en-GB"/>
             </w:rPr>
           </w:pPr>
-          <w:hyperlink w:anchor="_Toc223886399" w:history="1">
+          <w:hyperlink w:anchor="_Toc223965900" w:history="1">
             <w:r>
               <w:rPr>
                 <w:rStyle w:val="Hyperlink"/>
@@ -3935,7 +4007,7 @@
                 <w:noProof/>
                 <w:webHidden/>
               </w:rPr>
-              <w:instrText xml:space="preserve"> PAGEREF _Toc223886399 \h </w:instrText>
+              <w:instrText xml:space="preserve"> PAGEREF _Toc223965900 \h </w:instrText>
             </w:r>
             <w:r>
               <w:rPr>
@@ -3980,7 +4052,7 @@
               <w:lang w:eastAsia="en-GB"/>
             </w:rPr>
           </w:pPr>
-          <w:hyperlink w:anchor="_Toc223886400" w:history="1">
+          <w:hyperlink w:anchor="_Toc223965901" w:history="1">
             <w:r>
               <w:rPr>
                 <w:rStyle w:val="Hyperlink"/>
@@ -4007,7 +4079,7 @@
                 <w:noProof/>
                 <w:webHidden/>
               </w:rPr>
-              <w:instrText xml:space="preserve"> PAGEREF _Toc223886400 \h </w:instrText>
+              <w:instrText xml:space="preserve"> PAGEREF _Toc223965901 \h </w:instrText>
             </w:r>
             <w:r>
               <w:rPr>
@@ -4052,7 +4124,7 @@
               <w:lang w:eastAsia="en-GB"/>
             </w:rPr>
           </w:pPr>
-          <w:hyperlink w:anchor="_Toc223886401" w:history="1">
+          <w:hyperlink w:anchor="_Toc223965902" w:history="1">
             <w:r>
               <w:rPr>
                 <w:rStyle w:val="Hyperlink"/>
@@ -4079,7 +4151,7 @@
                 <w:noProof/>
                 <w:webHidden/>
               </w:rPr>
-              <w:instrText xml:space="preserve"> PAGEREF _Toc223886401 \h </w:instrText>
+              <w:instrText xml:space="preserve"> PAGEREF _Toc223965902 \h </w:instrText>
             </w:r>
             <w:r>
               <w:rPr>
@@ -4124,7 +4196,7 @@
               <w:lang w:eastAsia="en-GB"/>
             </w:rPr>
           </w:pPr>
-          <w:hyperlink w:anchor="_Toc223886402" w:history="1">
+          <w:hyperlink w:anchor="_Toc223965903" w:history="1">
             <w:r>
               <w:rPr>
                 <w:rStyle w:val="Hyperlink"/>
@@ -4151,7 +4223,7 @@
                 <w:noProof/>
                 <w:webHidden/>
               </w:rPr>
-              <w:instrText xml:space="preserve"> PAGEREF _Toc223886402 \h </w:instrText>
+              <w:instrText xml:space="preserve"> PAGEREF _Toc223965903 \h </w:instrText>
             </w:r>
             <w:r>
               <w:rPr>
@@ -4196,7 +4268,7 @@
               <w:lang w:eastAsia="en-GB"/>
             </w:rPr>
           </w:pPr>
-          <w:hyperlink w:anchor="_Toc223886403" w:history="1">
+          <w:hyperlink w:anchor="_Toc223965904" w:history="1">
             <w:r>
               <w:rPr>
                 <w:rStyle w:val="Hyperlink"/>
@@ -4223,7 +4295,7 @@
                 <w:noProof/>
                 <w:webHidden/>
               </w:rPr>
-              <w:instrText xml:space="preserve"> PAGEREF _Toc223886403 \h </w:instrText>
+              <w:instrText xml:space="preserve"> PAGEREF _Toc223965904 \h </w:instrText>
             </w:r>
             <w:r>
               <w:rPr>
@@ -4268,7 +4340,7 @@
               <w:lang w:eastAsia="en-GB"/>
             </w:rPr>
           </w:pPr>
-          <w:hyperlink w:anchor="_Toc223886404" w:history="1">
+          <w:hyperlink w:anchor="_Toc223965905" w:history="1">
             <w:r>
               <w:rPr>
                 <w:rStyle w:val="Hyperlink"/>
@@ -4295,7 +4367,7 @@
                 <w:noProof/>
                 <w:webHidden/>
               </w:rPr>
-              <w:instrText xml:space="preserve"> PAGEREF _Toc223886404 \h </w:instrText>
+              <w:instrText xml:space="preserve"> PAGEREF _Toc223965905 \h </w:instrText>
             </w:r>
             <w:r>
               <w:rPr>
@@ -4340,7 +4412,7 @@
               <w:lang w:eastAsia="en-GB"/>
             </w:rPr>
           </w:pPr>
-          <w:hyperlink w:anchor="_Toc223886405" w:history="1">
+          <w:hyperlink w:anchor="_Toc223965906" w:history="1">
             <w:r>
               <w:rPr>
                 <w:rStyle w:val="Hyperlink"/>
@@ -4367,7 +4439,7 @@
                 <w:noProof/>
                 <w:webHidden/>
               </w:rPr>
-              <w:instrText xml:space="preserve"> PAGEREF _Toc223886405 \h </w:instrText>
+              <w:instrText xml:space="preserve"> PAGEREF _Toc223965906 \h </w:instrText>
             </w:r>
             <w:r>
               <w:rPr>
@@ -4412,7 +4484,7 @@
               <w:lang w:eastAsia="en-GB"/>
             </w:rPr>
           </w:pPr>
-          <w:hyperlink w:anchor="_Toc223886406" w:history="1">
+          <w:hyperlink w:anchor="_Toc223965907" w:history="1">
             <w:r>
               <w:rPr>
                 <w:rStyle w:val="Hyperlink"/>
@@ -4439,7 +4511,7 @@
                 <w:noProof/>
                 <w:webHidden/>
               </w:rPr>
-              <w:instrText xml:space="preserve"> PAGEREF _Toc223886406 \h </w:instrText>
+              <w:instrText xml:space="preserve"> PAGEREF _Toc223965907 \h </w:instrText>
             </w:r>
             <w:r>
               <w:rPr>
@@ -4484,7 +4556,7 @@
               <w:lang w:eastAsia="en-GB"/>
             </w:rPr>
           </w:pPr>
-          <w:hyperlink w:anchor="_Toc223886407" w:history="1">
+          <w:hyperlink w:anchor="_Toc223965908" w:history="1">
             <w:r>
               <w:rPr>
                 <w:rStyle w:val="Hyperlink"/>
@@ -4511,7 +4583,7 @@
                 <w:noProof/>
                 <w:webHidden/>
               </w:rPr>
-              <w:instrText xml:space="preserve"> PAGEREF _Toc223886407 \h </w:instrText>
+              <w:instrText xml:space="preserve"> PAGEREF _Toc223965908 \h </w:instrText>
             </w:r>
             <w:r>
               <w:rPr>
@@ -4556,7 +4628,7 @@
               <w:lang w:eastAsia="en-GB"/>
             </w:rPr>
           </w:pPr>
-          <w:hyperlink w:anchor="_Toc223886408" w:history="1">
+          <w:hyperlink w:anchor="_Toc223965909" w:history="1">
             <w:r>
               <w:rPr>
                 <w:rStyle w:val="Hyperlink"/>
@@ -4583,7 +4655,7 @@
                 <w:noProof/>
                 <w:webHidden/>
               </w:rPr>
-              <w:instrText xml:space="preserve"> PAGEREF _Toc223886408 \h </w:instrText>
+              <w:instrText xml:space="preserve"> PAGEREF _Toc223965909 \h </w:instrText>
             </w:r>
             <w:r>
               <w:rPr>
@@ -4628,7 +4700,7 @@
               <w:lang w:eastAsia="en-GB"/>
             </w:rPr>
           </w:pPr>
-          <w:hyperlink w:anchor="_Toc223886409" w:history="1">
+          <w:hyperlink w:anchor="_Toc223965910" w:history="1">
             <w:r>
               <w:rPr>
                 <w:rStyle w:val="Hyperlink"/>
@@ -4655,7 +4727,7 @@
                 <w:noProof/>
                 <w:webHidden/>
               </w:rPr>
-              <w:instrText xml:space="preserve"> PAGEREF _Toc223886409 \h </w:instrText>
+              <w:instrText xml:space="preserve"> PAGEREF _Toc223965910 \h </w:instrText>
             </w:r>
             <w:r>
               <w:rPr>
@@ -4716,7 +4788,7 @@
       <w:pPr>
         <w:pStyle w:val="Heading1"/>
       </w:pPr>
-      <w:bookmarkStart w:id="0" w:name="_Toc223886348"/>
+      <w:bookmarkStart w:id="0" w:name="_Toc223965848"/>
       <w:r>
         <w:lastRenderedPageBreak/>
         <w:t>List of Acro</w:t>
@@ -4971,7 +5043,7 @@
       <w:pPr>
         <w:pStyle w:val="Heading1"/>
       </w:pPr>
-      <w:bookmarkStart w:id="1" w:name="_Toc223886349"/>
+      <w:bookmarkStart w:id="1" w:name="_Toc223965849"/>
       <w:r>
         <w:lastRenderedPageBreak/>
         <w:t>Abstract</w:t>
@@ -5171,7 +5243,7 @@
       <w:pPr>
         <w:pStyle w:val="Heading1"/>
       </w:pPr>
-      <w:bookmarkStart w:id="2" w:name="_Toc223886350"/>
+      <w:bookmarkStart w:id="2" w:name="_Toc223965850"/>
       <w:r>
         <w:lastRenderedPageBreak/>
         <w:t>Introduction</w:t>
@@ -5218,8 +5290,13 @@
       <w:r>
         <w:t xml:space="preserve">. </w:t>
       </w:r>
-      <w:r>
-        <w:t xml:space="preserve">Porcar et al., </w:t>
+      <w:proofErr w:type="spellStart"/>
+      <w:r>
+        <w:t>Porcar</w:t>
+      </w:r>
+      <w:proofErr w:type="spellEnd"/>
+      <w:r>
+        <w:t xml:space="preserve"> et al., </w:t>
       </w:r>
       <w:r>
         <w:t>(</w:t>
@@ -5259,8 +5336,13 @@
       <w:r>
         <w:t xml:space="preserve">Research conducted by </w:t>
       </w:r>
-      <w:r>
-        <w:t xml:space="preserve">Cantó-Sancho et al., </w:t>
+      <w:proofErr w:type="spellStart"/>
+      <w:r>
+        <w:t>Cantó</w:t>
+      </w:r>
+      <w:proofErr w:type="spellEnd"/>
+      <w:r>
+        <w:t xml:space="preserve">-Sancho et al., </w:t>
       </w:r>
       <w:r>
         <w:t>(</w:t>
@@ -5744,7 +5826,7 @@
       <w:pPr>
         <w:pStyle w:val="Heading1"/>
       </w:pPr>
-      <w:bookmarkStart w:id="3" w:name="_Toc223886351"/>
+      <w:bookmarkStart w:id="3" w:name="_Toc223965851"/>
       <w:r>
         <w:lastRenderedPageBreak/>
         <w:t>Project Aim</w:t>
@@ -5794,7 +5876,7 @@
           <w:rFonts w:asciiTheme="minorHAnsi" w:hAnsiTheme="minorHAnsi"/>
         </w:rPr>
       </w:pPr>
-      <w:bookmarkStart w:id="4" w:name="_Toc223886352"/>
+      <w:bookmarkStart w:id="4" w:name="_Toc223965852"/>
       <w:r>
         <w:rPr>
           <w:rFonts w:asciiTheme="minorHAnsi" w:hAnsiTheme="minorHAnsi"/>
@@ -6081,7 +6163,7 @@
       <w:pPr>
         <w:pStyle w:val="Heading1"/>
       </w:pPr>
-      <w:bookmarkStart w:id="5" w:name="_Toc223886353"/>
+      <w:bookmarkStart w:id="5" w:name="_Toc223965853"/>
       <w:r>
         <w:lastRenderedPageBreak/>
         <w:t>Project Planning</w:t>
@@ -6462,7 +6544,7 @@
           <w:rFonts w:asciiTheme="minorHAnsi" w:hAnsiTheme="minorHAnsi"/>
         </w:rPr>
       </w:pPr>
-      <w:bookmarkStart w:id="6" w:name="_Toc223886354"/>
+      <w:bookmarkStart w:id="6" w:name="_Toc223965854"/>
       <w:r>
         <w:rPr>
           <w:rFonts w:asciiTheme="minorHAnsi" w:hAnsiTheme="minorHAnsi"/>
@@ -6664,7 +6746,7 @@
           <w:rFonts w:asciiTheme="minorHAnsi" w:hAnsiTheme="minorHAnsi"/>
         </w:rPr>
       </w:pPr>
-      <w:bookmarkStart w:id="7" w:name="_Toc223886355"/>
+      <w:bookmarkStart w:id="7" w:name="_Toc223965855"/>
       <w:r>
         <w:rPr>
           <w:rFonts w:asciiTheme="minorHAnsi" w:hAnsiTheme="minorHAnsi"/>
@@ -6931,7 +7013,7 @@
           <w:rFonts w:asciiTheme="minorHAnsi" w:hAnsiTheme="minorHAnsi"/>
         </w:rPr>
       </w:pPr>
-      <w:bookmarkStart w:id="8" w:name="_Toc223886356"/>
+      <w:bookmarkStart w:id="8" w:name="_Toc223965856"/>
       <w:r>
         <w:rPr>
           <w:rFonts w:asciiTheme="minorHAnsi" w:hAnsiTheme="minorHAnsi"/>
@@ -6948,7 +7030,7 @@
           <w:rFonts w:asciiTheme="minorHAnsi" w:hAnsiTheme="minorHAnsi"/>
         </w:rPr>
       </w:pPr>
-      <w:bookmarkStart w:id="9" w:name="_Toc223886357"/>
+      <w:bookmarkStart w:id="9" w:name="_Toc223965857"/>
       <w:r>
         <w:rPr>
           <w:rFonts w:asciiTheme="minorHAnsi" w:hAnsiTheme="minorHAnsi"/>
@@ -7032,7 +7114,7 @@
           <w:rFonts w:asciiTheme="minorHAnsi" w:hAnsiTheme="minorHAnsi"/>
         </w:rPr>
       </w:pPr>
-      <w:bookmarkStart w:id="10" w:name="_Toc223886358"/>
+      <w:bookmarkStart w:id="10" w:name="_Toc223965858"/>
       <w:r>
         <w:rPr>
           <w:rFonts w:asciiTheme="minorHAnsi" w:hAnsiTheme="minorHAnsi"/>
@@ -7045,7 +7127,8 @@
       <w:pPr>
         <w:pStyle w:val="Heading3"/>
       </w:pPr>
-      <w:bookmarkStart w:id="11" w:name="_Toc223886359"/>
+      <w:bookmarkStart w:id="11" w:name="_Toc223965859"/>
+      <w:proofErr w:type="spellStart"/>
       <w:r>
         <w:t>Ey</w:t>
       </w:r>
@@ -7056,6 +7139,7 @@
         <w:t>si</w:t>
       </w:r>
       <w:bookmarkEnd w:id="11"/>
+      <w:proofErr w:type="spellEnd"/>
     </w:p>
     <w:p>
       <w:r>
@@ -7070,9 +7154,11 @@
       <w:r>
         <w:t xml:space="preserve"> discussed </w:t>
       </w:r>
+      <w:proofErr w:type="spellStart"/>
       <w:r>
         <w:t>Eyesi</w:t>
       </w:r>
+      <w:proofErr w:type="spellEnd"/>
       <w:r>
         <w:t>,</w:t>
       </w:r>
@@ -7185,7 +7271,15 @@
         <w:t xml:space="preserve">In addition to this, there is an </w:t>
       </w:r>
       <w:r>
-        <w:t xml:space="preserve">online training portal (vrmnet) </w:t>
+        <w:t>online training portal (</w:t>
+      </w:r>
+      <w:proofErr w:type="spellStart"/>
+      <w:r>
+        <w:t>vrmnet</w:t>
+      </w:r>
+      <w:proofErr w:type="spellEnd"/>
+      <w:r>
+        <w:t xml:space="preserve">) </w:t>
       </w:r>
       <w:r>
         <w:t>allowing comparison between trainees</w:t>
@@ -7320,7 +7414,15 @@
         <w:t xml:space="preserve"> </w:t>
       </w:r>
       <w:r>
-        <w:t xml:space="preserve">While Eyesi is effective for medical training for medical professionals, </w:t>
+        <w:t xml:space="preserve">While </w:t>
+      </w:r>
+      <w:proofErr w:type="spellStart"/>
+      <w:r>
+        <w:t>Eyesi</w:t>
+      </w:r>
+      <w:proofErr w:type="spellEnd"/>
+      <w:r>
+        <w:t xml:space="preserve"> is effective for medical training for medical professionals, </w:t>
       </w:r>
       <w:r>
         <w:t xml:space="preserve">similar </w:t>
@@ -7342,11 +7444,13 @@
       <w:pPr>
         <w:pStyle w:val="Heading3"/>
       </w:pPr>
-      <w:bookmarkStart w:id="12" w:name="_Toc223886360"/>
+      <w:bookmarkStart w:id="12" w:name="_Toc223965860"/>
+      <w:proofErr w:type="spellStart"/>
       <w:r>
         <w:t>OntoPhaco</w:t>
       </w:r>
       <w:bookmarkEnd w:id="12"/>
+      <w:proofErr w:type="spellEnd"/>
     </w:p>
     <w:p>
       <w:r>
@@ -7365,7 +7469,15 @@
         <w:t>d</w:t>
       </w:r>
       <w:r>
-        <w:t xml:space="preserve"> OntoPhaco, a</w:t>
+        <w:t xml:space="preserve"> </w:t>
+      </w:r>
+      <w:proofErr w:type="spellStart"/>
+      <w:r>
+        <w:t>OntoPhaco</w:t>
+      </w:r>
+      <w:proofErr w:type="spellEnd"/>
+      <w:r>
+        <w:t>, a</w:t>
       </w:r>
       <w:r>
         <w:t>n</w:t>
@@ -7498,173 +7610,191 @@
           <w:rFonts w:cs="TimesLTStd-Roman"/>
           <w:kern w:val="0"/>
         </w:rPr>
-        <w:t>Since OntoPhaco</w:t>
-      </w:r>
+        <w:t xml:space="preserve">Since </w:t>
+      </w:r>
+      <w:proofErr w:type="spellStart"/>
       <w:r>
         <w:rPr>
           <w:rFonts w:cs="TimesLTStd-Roman"/>
           <w:kern w:val="0"/>
         </w:rPr>
-        <w:t>’s</w:t>
+        <w:t>OntoPhaco</w:t>
       </w:r>
       <w:r>
         <w:rPr>
           <w:rFonts w:cs="TimesLTStd-Roman"/>
           <w:kern w:val="0"/>
         </w:rPr>
-        <w:t xml:space="preserve"> </w:t>
-      </w:r>
-      <w:r>
-        <w:t>s</w:t>
-      </w:r>
-      <w:r>
-        <w:t xml:space="preserve">ystematic verification and validation processes </w:t>
-      </w:r>
-      <w:r>
-        <w:t>include</w:t>
-      </w:r>
-      <w:r>
-        <w:t xml:space="preserve"> </w:t>
-      </w:r>
-      <w:r>
-        <w:t xml:space="preserve">theoretical </w:t>
-      </w:r>
-      <w:r>
-        <w:t>evaluat</w:t>
-      </w:r>
-      <w:r>
-        <w:t xml:space="preserve">ion </w:t>
-      </w:r>
-      <w:r>
-        <w:t>and expert feedback</w:t>
-      </w:r>
+        <w:t>’s</w:t>
+      </w:r>
+      <w:proofErr w:type="spellEnd"/>
       <w:r>
         <w:rPr>
           <w:rFonts w:cs="TimesLTStd-Roman"/>
           <w:kern w:val="0"/>
         </w:rPr>
-        <w:t xml:space="preserve">, each change, minor or major </w:t>
+        <w:t xml:space="preserve"> </w:t>
+      </w:r>
+      <w:r>
+        <w:t>s</w:t>
+      </w:r>
+      <w:r>
+        <w:t xml:space="preserve">ystematic verification and validation processes </w:t>
+      </w:r>
+      <w:r>
+        <w:t>include</w:t>
+      </w:r>
+      <w:r>
+        <w:t xml:space="preserve"> </w:t>
+      </w:r>
+      <w:r>
+        <w:t xml:space="preserve">theoretical </w:t>
+      </w:r>
+      <w:r>
+        <w:t>evaluat</w:t>
+      </w:r>
+      <w:r>
+        <w:t xml:space="preserve">ion </w:t>
+      </w:r>
+      <w:r>
+        <w:t>and expert feedback</w:t>
       </w:r>
       <w:r>
         <w:rPr>
           <w:rFonts w:cs="TimesLTStd-Roman"/>
           <w:kern w:val="0"/>
         </w:rPr>
-        <w:t>is</w:t>
+        <w:t xml:space="preserve">, each change, minor or major </w:t>
       </w:r>
       <w:r>
         <w:rPr>
           <w:rFonts w:cs="TimesLTStd-Roman"/>
           <w:kern w:val="0"/>
         </w:rPr>
-        <w:t xml:space="preserve"> verified and validate</w:t>
+        <w:t>is</w:t>
       </w:r>
       <w:r>
         <w:rPr>
           <w:rFonts w:cs="TimesLTStd-Roman"/>
           <w:kern w:val="0"/>
         </w:rPr>
-        <w:t>d</w:t>
-      </w:r>
-      <w:r>
-        <w:t>.</w:t>
+        <w:t xml:space="preserve"> verified and validate</w:t>
       </w:r>
       <w:r>
         <w:rPr>
           <w:rFonts w:cs="TimesLTStd-Roman"/>
           <w:kern w:val="0"/>
         </w:rPr>
-        <w:t xml:space="preserve"> </w:t>
+        <w:t>d</w:t>
+      </w:r>
+      <w:r>
+        <w:t>.</w:t>
       </w:r>
       <w:r>
         <w:rPr>
           <w:rFonts w:cs="TimesLTStd-Roman"/>
           <w:kern w:val="0"/>
         </w:rPr>
-        <w:t>OntoPhaco demonstrates VR</w:t>
-      </w:r>
+        <w:t xml:space="preserve"> </w:t>
+      </w:r>
+      <w:proofErr w:type="spellStart"/>
       <w:r>
         <w:rPr>
           <w:rFonts w:cs="TimesLTStd-Roman"/>
           <w:kern w:val="0"/>
         </w:rPr>
-        <w:t>’</w:t>
-      </w:r>
+        <w:t>OntoPhaco</w:t>
+      </w:r>
+      <w:proofErr w:type="spellEnd"/>
       <w:r>
         <w:rPr>
           <w:rFonts w:cs="TimesLTStd-Roman"/>
           <w:kern w:val="0"/>
         </w:rPr>
-        <w:t xml:space="preserve">s effectiveness </w:t>
+        <w:t xml:space="preserve"> demonstrates VR</w:t>
       </w:r>
       <w:r>
         <w:rPr>
           <w:rFonts w:cs="TimesLTStd-Roman"/>
           <w:kern w:val="0"/>
         </w:rPr>
-        <w:t xml:space="preserve">paired </w:t>
+        <w:t>’</w:t>
       </w:r>
       <w:r>
         <w:rPr>
           <w:rFonts w:cs="TimesLTStd-Roman"/>
           <w:kern w:val="0"/>
         </w:rPr>
-        <w:t>with ontology for medical training</w:t>
+        <w:t xml:space="preserve">s effectiveness </w:t>
       </w:r>
       <w:r>
         <w:rPr>
           <w:rFonts w:cs="TimesLTStd-Roman"/>
           <w:kern w:val="0"/>
         </w:rPr>
-        <w:t>. T</w:t>
+        <w:t xml:space="preserve">paired </w:t>
       </w:r>
       <w:r>
         <w:rPr>
           <w:rFonts w:cs="TimesLTStd-Roman"/>
           <w:kern w:val="0"/>
         </w:rPr>
-        <w:t>his project</w:t>
+        <w:t>with ontology for medical training</w:t>
       </w:r>
       <w:r>
         <w:rPr>
           <w:rFonts w:cs="TimesLTStd-Roman"/>
           <w:kern w:val="0"/>
         </w:rPr>
-        <w:t xml:space="preserve"> applies similar immersi</w:t>
+        <w:t>. T</w:t>
       </w:r>
       <w:r>
         <w:rPr>
           <w:rFonts w:cs="TimesLTStd-Roman"/>
           <w:kern w:val="0"/>
         </w:rPr>
-        <w:t>ve</w:t>
+        <w:t>his project</w:t>
       </w:r>
       <w:r>
         <w:rPr>
           <w:rFonts w:cs="TimesLTStd-Roman"/>
           <w:kern w:val="0"/>
         </w:rPr>
-        <w:t xml:space="preserve"> and educational knowledge </w:t>
+        <w:t xml:space="preserve"> applies similar immersi</w:t>
       </w:r>
       <w:r>
         <w:rPr>
           <w:rFonts w:cs="TimesLTStd-Roman"/>
           <w:kern w:val="0"/>
         </w:rPr>
-        <w:t xml:space="preserve">for DES to raise awareness, </w:t>
+        <w:t>ve</w:t>
       </w:r>
       <w:r>
         <w:rPr>
           <w:rFonts w:cs="TimesLTStd-Roman"/>
           <w:kern w:val="0"/>
         </w:rPr>
-        <w:t xml:space="preserve">spreading the </w:t>
+        <w:t xml:space="preserve"> and educational knowledge </w:t>
       </w:r>
       <w:r>
         <w:rPr>
           <w:rFonts w:cs="TimesLTStd-Roman"/>
           <w:kern w:val="0"/>
         </w:rPr>
+        <w:t xml:space="preserve">for DES to raise awareness, </w:t>
+      </w:r>
+      <w:r>
+        <w:rPr>
+          <w:rFonts w:cs="TimesLTStd-Roman"/>
+          <w:kern w:val="0"/>
+        </w:rPr>
+        <w:t xml:space="preserve">spreading the </w:t>
+      </w:r>
+      <w:r>
+        <w:rPr>
+          <w:rFonts w:cs="TimesLTStd-Roman"/>
+          <w:kern w:val="0"/>
+        </w:rPr>
         <w:t>benefits of VR use in education beyond professional training.</w:t>
       </w:r>
     </w:p>
@@ -7672,7 +7802,7 @@
       <w:pPr>
         <w:pStyle w:val="Heading3"/>
       </w:pPr>
-      <w:bookmarkStart w:id="13" w:name="_Toc223886361"/>
+      <w:bookmarkStart w:id="13" w:name="_Toc223965861"/>
       <w:r>
         <w:lastRenderedPageBreak/>
         <w:t>I</w:t>
@@ -7868,7 +7998,7 @@
       <w:pPr>
         <w:pStyle w:val="Heading3"/>
       </w:pPr>
-      <w:bookmarkStart w:id="14" w:name="_Toc223886362"/>
+      <w:bookmarkStart w:id="14" w:name="_Toc223965862"/>
       <w:r>
         <w:t>Opportunities for innovation</w:t>
       </w:r>
@@ -7878,17 +8008,27 @@
       <w:r>
         <w:t xml:space="preserve">While </w:t>
       </w:r>
-      <w:r>
-        <w:t>Eyesi focuses on hands on surgical practices</w:t>
+      <w:proofErr w:type="spellStart"/>
+      <w:r>
+        <w:t>Eyesi</w:t>
+      </w:r>
+      <w:proofErr w:type="spellEnd"/>
+      <w:r>
+        <w:t xml:space="preserve"> focuses on hands on surgical practices</w:t>
       </w:r>
       <w:r>
         <w:t xml:space="preserve">, </w:t>
       </w:r>
+      <w:proofErr w:type="spellStart"/>
       <w:r>
         <w:t>O</w:t>
       </w:r>
       <w:r>
-        <w:t>ntoPhaco focuses on the way knowledge is represented and conceptual understanding</w:t>
+        <w:t>ntoPhaco</w:t>
+      </w:r>
+      <w:proofErr w:type="spellEnd"/>
+      <w:r>
+        <w:t xml:space="preserve"> focuses on the way knowledge is represented and conceptual understanding</w:t>
       </w:r>
       <w:r>
         <w:t xml:space="preserve">. </w:t>
@@ -7986,7 +8126,7 @@
           <w:rFonts w:asciiTheme="minorHAnsi" w:hAnsiTheme="minorHAnsi"/>
         </w:rPr>
       </w:pPr>
-      <w:bookmarkStart w:id="15" w:name="_Toc223886363"/>
+      <w:bookmarkStart w:id="15" w:name="_Toc223965863"/>
       <w:r>
         <w:rPr>
           <w:rFonts w:asciiTheme="minorHAnsi" w:hAnsiTheme="minorHAnsi"/>
@@ -7999,7 +8139,7 @@
       <w:pPr>
         <w:pStyle w:val="Heading3"/>
       </w:pPr>
-      <w:bookmarkStart w:id="16" w:name="_Toc223886364"/>
+      <w:bookmarkStart w:id="16" w:name="_Toc223965864"/>
       <w:r>
         <w:t>VR in medical education</w:t>
       </w:r>
@@ -8146,9 +8286,19 @@
       <w:r>
         <w:t xml:space="preserve">Examples such as </w:t>
       </w:r>
-      <w:r>
-        <w:t>Mediverse by Goggleminds</w:t>
-      </w:r>
+      <w:proofErr w:type="spellStart"/>
+      <w:r>
+        <w:t>Mediverse</w:t>
+      </w:r>
+      <w:proofErr w:type="spellEnd"/>
+      <w:r>
+        <w:t xml:space="preserve"> by </w:t>
+      </w:r>
+      <w:proofErr w:type="spellStart"/>
+      <w:r>
+        <w:t>Goggleminds</w:t>
+      </w:r>
+      <w:proofErr w:type="spellEnd"/>
       <w:r>
         <w:t xml:space="preserve"> </w:t>
       </w:r>
@@ -8162,7 +8312,15 @@
         <w:t xml:space="preserve"> to healthcare providers and medical schools</w:t>
       </w:r>
       <w:r>
-        <w:t>. ClassVR by Systems improve</w:t>
+        <w:t xml:space="preserve">. </w:t>
+      </w:r>
+      <w:proofErr w:type="spellStart"/>
+      <w:r>
+        <w:t>ClassVR</w:t>
+      </w:r>
+      <w:proofErr w:type="spellEnd"/>
+      <w:r>
+        <w:t xml:space="preserve"> by Systems improve</w:t>
       </w:r>
       <w:r>
         <w:t>s</w:t>
@@ -8179,8 +8337,13 @@
       <w:r>
         <w:t xml:space="preserve"> </w:t>
       </w:r>
-      <w:r>
-        <w:t xml:space="preserve">PrismsVR </w:t>
+      <w:proofErr w:type="spellStart"/>
+      <w:r>
+        <w:t>PrismsVR</w:t>
+      </w:r>
+      <w:proofErr w:type="spellEnd"/>
+      <w:r>
+        <w:t xml:space="preserve"> </w:t>
       </w:r>
       <w:r>
         <w:t xml:space="preserve">helps students grasp core concepts in algebra and geometry, by </w:t>
@@ -8266,7 +8429,7 @@
       <w:pPr>
         <w:pStyle w:val="Heading3"/>
       </w:pPr>
-      <w:bookmarkStart w:id="17" w:name="_Toc223886365"/>
+      <w:bookmarkStart w:id="17" w:name="_Toc223965865"/>
       <w:r>
         <w:lastRenderedPageBreak/>
         <w:t>VR in Health Awareness</w:t>
@@ -8459,7 +8622,7 @@
           <w:rFonts w:asciiTheme="minorHAnsi" w:hAnsiTheme="minorHAnsi"/>
         </w:rPr>
       </w:pPr>
-      <w:bookmarkStart w:id="18" w:name="_Toc223886366"/>
+      <w:bookmarkStart w:id="18" w:name="_Toc223965866"/>
       <w:r>
         <w:rPr>
           <w:rFonts w:asciiTheme="minorHAnsi" w:hAnsiTheme="minorHAnsi"/>
@@ -8679,7 +8842,7 @@
       <w:pPr>
         <w:pStyle w:val="Heading1"/>
       </w:pPr>
-      <w:bookmarkStart w:id="19" w:name="_Toc223886367"/>
+      <w:bookmarkStart w:id="19" w:name="_Toc223965867"/>
       <w:r>
         <w:lastRenderedPageBreak/>
         <w:t>Appendices</w:t>
@@ -8690,7 +8853,7 @@
       <w:pPr>
         <w:pStyle w:val="Heading2"/>
       </w:pPr>
-      <w:bookmarkStart w:id="20" w:name="_Toc223886368"/>
+      <w:bookmarkStart w:id="20" w:name="_Toc223965868"/>
       <w:r>
         <w:t>Ethics Checklist</w:t>
       </w:r>
@@ -8832,7 +8995,7 @@
       <w:pPr>
         <w:pStyle w:val="Heading2"/>
       </w:pPr>
-      <w:bookmarkStart w:id="21" w:name="_Toc223886369"/>
+      <w:bookmarkStart w:id="21" w:name="_Toc223965869"/>
       <w:r>
         <w:lastRenderedPageBreak/>
         <w:t>Project Timeline Gant</w:t>
@@ -9028,7 +9191,7 @@
       <w:pPr>
         <w:pStyle w:val="Heading1"/>
       </w:pPr>
-      <w:bookmarkStart w:id="22" w:name="_Toc223886370"/>
+      <w:bookmarkStart w:id="22" w:name="_Toc223965870"/>
       <w:r>
         <w:lastRenderedPageBreak/>
         <w:t>Methodology</w:t>
@@ -9039,21 +9202,32 @@
       <w:pPr>
         <w:pStyle w:val="Heading2"/>
       </w:pPr>
-      <w:bookmarkStart w:id="23" w:name="_Toc223886371"/>
+      <w:bookmarkStart w:id="23" w:name="_Toc223965871"/>
+      <w:r>
+        <w:t>Source Control</w:t>
+      </w:r>
+      <w:bookmarkEnd w:id="23"/>
+    </w:p>
+    <w:p/>
+    <w:p>
+      <w:pPr>
+        <w:pStyle w:val="Heading2"/>
+      </w:pPr>
+      <w:bookmarkStart w:id="24" w:name="_Toc223965872"/>
       <w:r>
         <w:t>Prototype Implementation</w:t>
       </w:r>
-      <w:bookmarkEnd w:id="23"/>
+      <w:bookmarkEnd w:id="24"/>
     </w:p>
     <w:p>
       <w:pPr>
         <w:pStyle w:val="Heading3"/>
       </w:pPr>
-      <w:bookmarkStart w:id="24" w:name="_Toc223886372"/>
+      <w:bookmarkStart w:id="25" w:name="_Toc223965873"/>
       <w:r>
         <w:t>Usability and Flow</w:t>
       </w:r>
-      <w:bookmarkEnd w:id="24"/>
+      <w:bookmarkEnd w:id="25"/>
     </w:p>
     <w:p>
       <w:r>
@@ -9132,14 +9306,14 @@
       <w:pPr>
         <w:pStyle w:val="Heading3"/>
       </w:pPr>
-      <w:bookmarkStart w:id="25" w:name="_Toc223886373"/>
+      <w:bookmarkStart w:id="26" w:name="_Toc223965874"/>
       <w:r>
         <w:t xml:space="preserve">Environment Design and </w:t>
       </w:r>
       <w:r>
         <w:t>Scene Setup</w:t>
       </w:r>
-      <w:bookmarkEnd w:id="25"/>
+      <w:bookmarkEnd w:id="26"/>
     </w:p>
     <w:p>
       <w:r>
@@ -9261,11 +9435,11 @@
       <w:pPr>
         <w:pStyle w:val="Heading3"/>
       </w:pPr>
-      <w:bookmarkStart w:id="26" w:name="_Toc223886374"/>
+      <w:bookmarkStart w:id="27" w:name="_Toc223965875"/>
       <w:r>
         <w:t>Objective System Implementation</w:t>
       </w:r>
-      <w:bookmarkEnd w:id="26"/>
+      <w:bookmarkEnd w:id="27"/>
     </w:p>
     <w:p>
       <w:r>
@@ -9302,7 +9476,15 @@
         <w:t>ere</w:t>
       </w:r>
       <w:r>
-        <w:t xml:space="preserve"> stored within the VRGameMode blueprint, with objectives being updated during runtime as conditions were satisfied </w:t>
+        <w:t xml:space="preserve"> stored within the </w:t>
+      </w:r>
+      <w:proofErr w:type="spellStart"/>
+      <w:r>
+        <w:t>VRGameMode</w:t>
+      </w:r>
+      <w:proofErr w:type="spellEnd"/>
+      <w:r>
+        <w:t xml:space="preserve"> blueprint, with objectives being updated during runtime as conditions were satisfied </w:t>
       </w:r>
       <w:r>
         <w:t>during</w:t>
@@ -9366,7 +9548,7 @@
       <w:pPr>
         <w:pStyle w:val="Heading3"/>
       </w:pPr>
-      <w:bookmarkStart w:id="27" w:name="_Toc223886375"/>
+      <w:bookmarkStart w:id="28" w:name="_Toc223965876"/>
       <w:r>
         <w:t>User</w:t>
       </w:r>
@@ -9376,7 +9558,7 @@
       <w:r>
         <w:t>Feedback</w:t>
       </w:r>
-      <w:bookmarkEnd w:id="27"/>
+      <w:bookmarkEnd w:id="28"/>
     </w:p>
     <w:p>
       <w:r>
@@ -9410,11 +9592,11 @@
         <w:t>s</w:t>
       </w:r>
       <w:r>
-        <w:t xml:space="preserve">) seen within video games so that the experience would be more immersive with users needing to interact and search the environment around them. The UI is implemented as a world space widget attached to the screen mesh of a monitor that uses a widget blueprint to control the information displayed. The widget consists of the current objective description to prompt users along with a progress bar that fills up green as the necessary requirements are being met to complete the </w:t>
+        <w:t xml:space="preserve">) seen within video games so that the experience would be more immersive with users needing to interact and search the environment around them. The UI is implemented as a world space widget </w:t>
       </w:r>
       <w:r>
         <w:lastRenderedPageBreak/>
-        <w:t xml:space="preserve">objective. </w:t>
+        <w:t xml:space="preserve">attached to the screen mesh of a monitor that uses a widget blueprint to control the information displayed. The widget consists of the current objective description to prompt users along with a progress bar that fills up green as the necessary requirements are being met to complete the objective. </w:t>
       </w:r>
       <w:r>
         <w:t>Event</w:t>
@@ -9463,7 +9645,7 @@
       <w:pPr>
         <w:pStyle w:val="Heading3"/>
       </w:pPr>
-      <w:bookmarkStart w:id="28" w:name="_Toc223886376"/>
+      <w:bookmarkStart w:id="29" w:name="_Toc223965877"/>
       <w:r>
         <w:t>Objective Based Interact</w:t>
       </w:r>
@@ -9476,7 +9658,7 @@
       <w:r>
         <w:t>s</w:t>
       </w:r>
-      <w:bookmarkEnd w:id="28"/>
+      <w:bookmarkEnd w:id="29"/>
     </w:p>
     <w:p>
       <w:r>
@@ -9531,14 +9713,14 @@
       <w:pPr>
         <w:pStyle w:val="Heading3"/>
       </w:pPr>
-      <w:bookmarkStart w:id="29" w:name="_Toc223886377"/>
+      <w:bookmarkStart w:id="30" w:name="_Toc223965878"/>
       <w:r>
         <w:t>Post Processing Effects</w:t>
       </w:r>
       <w:r>
         <w:t xml:space="preserve"> for Simulating Symptoms</w:t>
       </w:r>
-      <w:bookmarkEnd w:id="29"/>
+      <w:bookmarkEnd w:id="30"/>
     </w:p>
     <w:p>
       <w:r>
@@ -9558,14 +9740,14 @@
       <w:pPr>
         <w:pStyle w:val="Heading3"/>
       </w:pPr>
-      <w:bookmarkStart w:id="30" w:name="_Toc223886378"/>
+      <w:bookmarkStart w:id="31" w:name="_Toc223965879"/>
       <w:r>
         <w:t>User</w:t>
       </w:r>
       <w:r>
         <w:t xml:space="preserve"> Look Direction and Attention Detection</w:t>
       </w:r>
-      <w:bookmarkEnd w:id="30"/>
+      <w:bookmarkEnd w:id="31"/>
     </w:p>
     <w:p>
       <w:r>
@@ -9573,14 +9755,6 @@
       </w:r>
     </w:p>
     <w:p>
-      <w:pPr>
-        <w:rPr>
-          <w:rFonts w:asciiTheme="majorHAnsi" w:eastAsiaTheme="majorEastAsia" w:hAnsiTheme="majorHAnsi" w:cstheme="majorBidi"/>
-          <w:color w:val="0F4761" w:themeColor="accent1" w:themeShade="BF"/>
-          <w:sz w:val="32"/>
-          <w:szCs w:val="32"/>
-        </w:rPr>
-      </w:pPr>
       <w:r>
         <w:br w:type="page"/>
       </w:r>
@@ -9589,7 +9763,7 @@
       <w:pPr>
         <w:pStyle w:val="Heading2"/>
       </w:pPr>
-      <w:bookmarkStart w:id="31" w:name="_Toc223886379"/>
+      <w:bookmarkStart w:id="32" w:name="_Toc223965880"/>
       <w:r>
         <w:lastRenderedPageBreak/>
         <w:t>Final Version</w:t>
@@ -9597,26 +9771,27 @@
       <w:r>
         <w:t xml:space="preserve"> Implementation</w:t>
       </w:r>
-      <w:bookmarkEnd w:id="31"/>
+      <w:bookmarkEnd w:id="32"/>
     </w:p>
     <w:p>
       <w:pPr>
         <w:pStyle w:val="Heading3"/>
       </w:pPr>
-      <w:bookmarkStart w:id="32" w:name="_Toc223886380"/>
+      <w:bookmarkStart w:id="33" w:name="_Toc223965881"/>
       <w:r>
         <w:t>Interaction Improvements</w:t>
       </w:r>
-      <w:bookmarkEnd w:id="32"/>
+      <w:bookmarkEnd w:id="33"/>
     </w:p>
     <w:p>
       <w:pPr>
         <w:pStyle w:val="Heading3"/>
       </w:pPr>
-      <w:bookmarkStart w:id="33" w:name="_Toc223886382"/>
+      <w:bookmarkStart w:id="34" w:name="_Toc223965882"/>
       <w:r>
         <w:t>Flow Tweaks</w:t>
       </w:r>
+      <w:bookmarkEnd w:id="34"/>
     </w:p>
     <w:p>
       <w:r>
@@ -9627,10 +9802,11 @@
       <w:pPr>
         <w:pStyle w:val="Heading3"/>
       </w:pPr>
+      <w:bookmarkStart w:id="35" w:name="_Toc223965883"/>
       <w:r>
         <w:t>Gaze Detection Refinements</w:t>
       </w:r>
-      <w:bookmarkEnd w:id="33"/>
+      <w:bookmarkEnd w:id="35"/>
     </w:p>
     <w:p>
       <w:pPr>
@@ -9649,22 +9825,22 @@
       <w:pPr>
         <w:pStyle w:val="Heading1"/>
       </w:pPr>
-      <w:bookmarkStart w:id="34" w:name="_Toc223886383"/>
+      <w:bookmarkStart w:id="36" w:name="_Toc223965884"/>
       <w:r>
         <w:lastRenderedPageBreak/>
         <w:t>Results</w:t>
       </w:r>
-      <w:bookmarkEnd w:id="34"/>
+      <w:bookmarkEnd w:id="36"/>
     </w:p>
     <w:p>
       <w:pPr>
         <w:pStyle w:val="Heading2"/>
       </w:pPr>
-      <w:bookmarkStart w:id="35" w:name="_Toc223886384"/>
+      <w:bookmarkStart w:id="37" w:name="_Toc223965885"/>
       <w:r>
         <w:t>Prototype Tests</w:t>
       </w:r>
-      <w:bookmarkEnd w:id="35"/>
+      <w:bookmarkEnd w:id="37"/>
     </w:p>
     <w:p>
       <w:r>
@@ -9756,7 +9932,7 @@
       <w:pPr>
         <w:pStyle w:val="Heading3"/>
       </w:pPr>
-      <w:bookmarkStart w:id="36" w:name="_Toc223886385"/>
+      <w:bookmarkStart w:id="38" w:name="_Toc223965886"/>
       <w:r>
         <w:t>Interaction</w:t>
       </w:r>
@@ -9766,7 +9942,7 @@
       <w:r>
         <w:t xml:space="preserve"> and Objective Understanding</w:t>
       </w:r>
-      <w:bookmarkEnd w:id="36"/>
+      <w:bookmarkEnd w:id="38"/>
     </w:p>
     <w:p>
       <w:r>
@@ -9917,11 +10093,11 @@
       <w:pPr>
         <w:pStyle w:val="Heading3"/>
       </w:pPr>
-      <w:bookmarkStart w:id="37" w:name="_Toc223886386"/>
+      <w:bookmarkStart w:id="39" w:name="_Toc223965887"/>
       <w:r>
         <w:t>User Attention Detection</w:t>
       </w:r>
-      <w:bookmarkEnd w:id="37"/>
+      <w:bookmarkEnd w:id="39"/>
     </w:p>
     <w:p>
       <w:r>
@@ -9974,11 +10150,11 @@
       <w:pPr>
         <w:pStyle w:val="Heading3"/>
       </w:pPr>
-      <w:bookmarkStart w:id="38" w:name="_Toc223886387"/>
+      <w:bookmarkStart w:id="40" w:name="_Toc223965888"/>
       <w:r>
         <w:t>Symptom Simulations</w:t>
       </w:r>
-      <w:bookmarkEnd w:id="38"/>
+      <w:bookmarkEnd w:id="40"/>
     </w:p>
     <w:p>
       <w:r>
@@ -10116,7 +10292,7 @@
       <w:pPr>
         <w:pStyle w:val="Heading3"/>
       </w:pPr>
-      <w:bookmarkStart w:id="39" w:name="_Toc223886388"/>
+      <w:bookmarkStart w:id="41" w:name="_Toc223965889"/>
       <w:r>
         <w:t xml:space="preserve">Improvements to be </w:t>
       </w:r>
@@ -10126,7 +10302,7 @@
       <w:r>
         <w:t>ade</w:t>
       </w:r>
-      <w:bookmarkEnd w:id="39"/>
+      <w:bookmarkEnd w:id="41"/>
     </w:p>
     <w:p>
       <w:r>
@@ -10164,19 +10340,14 @@
     </w:p>
     <w:p>
       <w:pPr>
-        <w:pStyle w:val="Heading3"/>
-        <w:rPr>
-          <w:rFonts w:asciiTheme="majorHAnsi" w:hAnsiTheme="majorHAnsi"/>
-          <w:sz w:val="32"/>
-          <w:szCs w:val="32"/>
-        </w:rPr>
-      </w:pPr>
-      <w:bookmarkStart w:id="40" w:name="_Toc223886389"/>
+        <w:pStyle w:val="Heading2"/>
+      </w:pPr>
+      <w:bookmarkStart w:id="42" w:name="_Toc223965890"/>
       <w:r>
         <w:lastRenderedPageBreak/>
         <w:t>Final Version Tests</w:t>
       </w:r>
-      <w:bookmarkEnd w:id="40"/>
+      <w:bookmarkEnd w:id="42"/>
     </w:p>
     <w:p>
       <w:r>
@@ -10211,11 +10382,11 @@
       <w:pPr>
         <w:pStyle w:val="Heading3"/>
       </w:pPr>
-      <w:bookmarkStart w:id="41" w:name="_Toc223886390"/>
+      <w:bookmarkStart w:id="43" w:name="_Toc223965891"/>
       <w:r>
         <w:t>Interaction Objects and Objective Understanding</w:t>
       </w:r>
-      <w:bookmarkEnd w:id="41"/>
+      <w:bookmarkEnd w:id="43"/>
     </w:p>
     <w:p>
       <w:r>
@@ -10225,10 +10396,7 @@
         <w:t>at</w:t>
       </w:r>
       <w:r>
-        <w:t xml:space="preserve"> a specific angle. </w:t>
-      </w:r>
-      <w:r>
-        <w:t>This resulted in user i</w:t>
+        <w:t xml:space="preserve"> a specific angle. This resulted in user i</w:t>
       </w:r>
       <w:r>
         <w:t xml:space="preserve">nteractions with the light switch </w:t>
@@ -10262,47 +10430,93 @@
       <w:pPr>
         <w:pStyle w:val="Heading3"/>
       </w:pPr>
-      <w:bookmarkStart w:id="42" w:name="_Toc223886391"/>
+      <w:bookmarkStart w:id="44" w:name="_Toc223965892"/>
       <w:r>
         <w:t>User Attention Detection</w:t>
       </w:r>
-      <w:bookmarkEnd w:id="42"/>
-    </w:p>
-    <w:p>
-      <w:pPr>
-        <w:pStyle w:val="ListParagraph"/>
-        <w:numPr>
-          <w:ilvl w:val="0"/>
-          <w:numId w:val="12"/>
-        </w:numPr>
-      </w:pPr>
-      <w:r>
-        <w:t>Having a wider area of detection now the line trace was changed to a capsule trace made gaze interactions better for users, removing the feeling of frustration from having to be so precise with where they were looking. Progress bar felt more consistent as it didn’t look glitchy from the line trace going out of the area of interaction object and back in constantly.</w:t>
+      <w:bookmarkEnd w:id="44"/>
+    </w:p>
+    <w:p>
+      <w:r>
+        <w:t xml:space="preserve">Having a wider area of detection </w:t>
+      </w:r>
+      <w:r>
+        <w:t>after</w:t>
+      </w:r>
+      <w:r>
+        <w:t xml:space="preserve"> the line trace was changed to a capsule made gaze interactions better for users</w:t>
+      </w:r>
+      <w:r>
+        <w:t>. It</w:t>
+      </w:r>
+      <w:r>
+        <w:t xml:space="preserve"> remov</w:t>
+      </w:r>
+      <w:r>
+        <w:t>ed</w:t>
+      </w:r>
+      <w:r>
+        <w:t xml:space="preserve"> the feeling of frustration from having to be so precise with where they were looking. </w:t>
+      </w:r>
+      <w:r>
+        <w:t>The</w:t>
+      </w:r>
+      <w:r>
+        <w:t xml:space="preserve"> p</w:t>
+      </w:r>
+      <w:r>
+        <w:t>rogress bar</w:t>
+      </w:r>
+      <w:r>
+        <w:t xml:space="preserve"> </w:t>
+      </w:r>
+      <w:r>
+        <w:t>fel</w:t>
+      </w:r>
+      <w:r>
+        <w:t>t</w:t>
+      </w:r>
+      <w:r>
+        <w:t xml:space="preserve"> more consistent</w:t>
+      </w:r>
+      <w:r>
+        <w:t>,</w:t>
+      </w:r>
+      <w:r>
+        <w:t xml:space="preserve"> as it didn’t look glitchy from the line trace going out of the area of interaction object and back in constantly.</w:t>
+      </w:r>
+      <w:r>
+        <w:t xml:space="preserve"> Overall, this resulted in a smoother progression through objectives with a higher level of clarity to users.</w:t>
       </w:r>
     </w:p>
     <w:p>
       <w:pPr>
         <w:pStyle w:val="Heading3"/>
       </w:pPr>
-      <w:bookmarkStart w:id="43" w:name="_Toc223886392"/>
+      <w:bookmarkStart w:id="45" w:name="_Toc223965893"/>
       <w:r>
         <w:t>Symptom Simulation</w:t>
       </w:r>
       <w:r>
         <w:t>s</w:t>
       </w:r>
-      <w:bookmarkEnd w:id="43"/>
-    </w:p>
-    <w:p>
-      <w:pPr>
-        <w:pStyle w:val="ListParagraph"/>
-        <w:numPr>
-          <w:ilvl w:val="0"/>
-          <w:numId w:val="12"/>
-        </w:numPr>
-      </w:pPr>
-      <w:r>
-        <w:t>Effects were able to remain as intended even with the new improvements made, the information being taught was still effective for users and there wasn’t a negative impact from the changes made to improve the experience.</w:t>
+      <w:bookmarkEnd w:id="45"/>
+    </w:p>
+    <w:p>
+      <w:r>
+        <w:t>Effects were able to remain as intended even with the new improvements made</w:t>
+      </w:r>
+      <w:r>
+        <w:t>. T</w:t>
+      </w:r>
+      <w:r>
+        <w:t>he information being taught was still effective for users and there wasn’t a negative impact from the changes made to improve the experience.</w:t>
+      </w:r>
+      <w:r>
+        <w:t xml:space="preserve"> The symptoms simulated for eye fatigue, light sensitivity and focus strain still executed as intended</w:t>
+      </w:r>
+      <w:r>
+        <w:t xml:space="preserve"> during the experience.</w:t>
       </w:r>
     </w:p>
     <w:p>
@@ -10314,7 +10528,6 @@
           <w:szCs w:val="40"/>
         </w:rPr>
       </w:pPr>
-      <w:bookmarkStart w:id="44" w:name="_Toc223886393"/>
       <w:r>
         <w:br w:type="page"/>
       </w:r>
@@ -10323,11 +10536,12 @@
       <w:pPr>
         <w:pStyle w:val="Heading1"/>
       </w:pPr>
+      <w:bookmarkStart w:id="46" w:name="_Toc223965894"/>
       <w:r>
         <w:lastRenderedPageBreak/>
         <w:t>Critical Evaluation</w:t>
       </w:r>
-      <w:bookmarkEnd w:id="44"/>
+      <w:bookmarkEnd w:id="46"/>
     </w:p>
     <w:p>
       <w:pPr>
@@ -10349,12 +10563,12 @@
       <w:pPr>
         <w:pStyle w:val="Heading1"/>
       </w:pPr>
-      <w:bookmarkStart w:id="45" w:name="_Toc223886394"/>
+      <w:bookmarkStart w:id="47" w:name="_Toc223965895"/>
       <w:r>
         <w:lastRenderedPageBreak/>
         <w:t>Conclusions and Future Work</w:t>
       </w:r>
-      <w:bookmarkEnd w:id="45"/>
+      <w:bookmarkEnd w:id="47"/>
     </w:p>
     <w:p>
       <w:pPr>
@@ -10399,17 +10613,31 @@
       <w:pPr>
         <w:pStyle w:val="Heading1"/>
       </w:pPr>
-      <w:bookmarkStart w:id="46" w:name="_Toc223886395"/>
+      <w:bookmarkStart w:id="48" w:name="_Toc223965896"/>
       <w:r>
         <w:lastRenderedPageBreak/>
         <w:t>References</w:t>
       </w:r>
-      <w:bookmarkEnd w:id="46"/>
-    </w:p>
-    <w:p>
-      <w:r>
-        <w:t xml:space="preserve">Cantó-Sancho, N., Porru, S., Casati, S., Ronda, E., Seguí-Crespo, M. and Carta, A. (2023) ‘Prevalence and risk factors of computer vision syndrome—assessed in office workers by a validated questionnaire’. </w:t>
-      </w:r>
+      <w:bookmarkEnd w:id="48"/>
+    </w:p>
+    <w:p>
+      <w:proofErr w:type="spellStart"/>
+      <w:r>
+        <w:t>Cantó</w:t>
+      </w:r>
+      <w:proofErr w:type="spellEnd"/>
+      <w:r>
+        <w:t xml:space="preserve">-Sancho, N., </w:t>
+      </w:r>
+      <w:proofErr w:type="spellStart"/>
+      <w:r>
+        <w:t>Porru</w:t>
+      </w:r>
+      <w:proofErr w:type="spellEnd"/>
+      <w:r>
+        <w:t xml:space="preserve">, S., Casati, S., Ronda, E., Seguí-Crespo, M. and Carta, A. (2023) ‘Prevalence and risk factors of computer vision syndrome—assessed in office workers by a validated questionnaire’. </w:t>
+      </w:r>
+      <w:proofErr w:type="spellStart"/>
       <w:r>
         <w:rPr>
           <w:i/>
@@ -10417,13 +10645,22 @@
         </w:rPr>
         <w:t>PeerJ</w:t>
       </w:r>
+      <w:proofErr w:type="spellEnd"/>
       <w:r>
         <w:t xml:space="preserve"> 11, p. e14937. Available at: https://www.researchgate.net/publication/369002899_Prevalence_and_risk_factors_of_computer_vision_syndrome-assessed_in_office_workers_by_a_validated_questionnaire (Accessed: 20 October 2025).</w:t>
       </w:r>
     </w:p>
     <w:p>
       <w:r>
-        <w:t xml:space="preserve">Chandrasekhara, R.S., Low, C., Lim, Y., Low, L., Mardina, F. and Nursaleha, M. (2013) ‘Computer vision syndrome: a study of knowledge and practices in university students’. </w:t>
+        <w:t xml:space="preserve">Chandrasekhara, R.S., Low, C., Lim, Y., Low, L., Mardina, F. and </w:t>
+      </w:r>
+      <w:proofErr w:type="spellStart"/>
+      <w:r>
+        <w:t>Nursaleha</w:t>
+      </w:r>
+      <w:proofErr w:type="spellEnd"/>
+      <w:r>
+        <w:t xml:space="preserve">, M. (2013) ‘Computer vision syndrome: a study of knowledge and practices in university students’. </w:t>
       </w:r>
       <w:r>
         <w:rPr>
@@ -10449,7 +10686,15 @@
     </w:p>
     <w:p>
       <w:r>
-        <w:t xml:space="preserve">Muñoz, E.G., Fabregat, R., Bacca-Acosta, J., Duque-Méndez, N. and Avila-Garzon, C. (2022) ‘Augmented Reality, Virtual Reality, and Game Technologies in Ophthalmology Training’. </w:t>
+        <w:t xml:space="preserve">Muñoz, E.G., </w:t>
+      </w:r>
+      <w:proofErr w:type="spellStart"/>
+      <w:r>
+        <w:t>Fabregat</w:t>
+      </w:r>
+      <w:proofErr w:type="spellEnd"/>
+      <w:r>
+        <w:t xml:space="preserve">, R., Bacca-Acosta, J., Duque-Méndez, N. and Avila-Garzon, C. (2022) ‘Augmented Reality, Virtual Reality, and Game Technologies in Ophthalmology Training’. </w:t>
       </w:r>
       <w:r>
         <w:rPr>
@@ -10459,7 +10704,15 @@
         <w:t>Information</w:t>
       </w:r>
       <w:r>
-        <w:t xml:space="preserve"> 13(5), p. 222. doi: </w:t>
+        <w:t xml:space="preserve"> 13(5), p. 222. </w:t>
+      </w:r>
+      <w:proofErr w:type="spellStart"/>
+      <w:r>
+        <w:t>doi</w:t>
+      </w:r>
+      <w:proofErr w:type="spellEnd"/>
+      <w:r>
+        <w:t xml:space="preserve">: </w:t>
       </w:r>
       <w:hyperlink r:id="rId16" w:history="1">
         <w:r>
@@ -10475,12 +10728,25 @@
     </w:p>
     <w:p>
       <w:r>
-        <w:t>Orji, J., Hernandez, A., Selema, B. and Orji, R. (2022) ‘Virtual and augmented reality applications for promoting safety and security: A systematic review’., pp. 1–7. doi: https://doi.org/10.1109/SEGAH54908.2022.9978597.</w:t>
-      </w:r>
-    </w:p>
-    <w:p>
-      <w:r>
-        <w:t xml:space="preserve">Porcar, E., Pons, A. and Lorente, A. (2016) ‘Visual and ocular effects from the use of flat-panel displays’. </w:t>
+        <w:t xml:space="preserve">Orji, J., Hernandez, A., Selema, B. and Orji, R. (2022) ‘Virtual and augmented reality applications for promoting safety and security: A systematic review’., pp. 1–7. </w:t>
+      </w:r>
+      <w:proofErr w:type="spellStart"/>
+      <w:r>
+        <w:t>doi</w:t>
+      </w:r>
+      <w:proofErr w:type="spellEnd"/>
+      <w:r>
+        <w:t>: https://doi.org/10.1109/SEGAH54908.2022.9978597.</w:t>
+      </w:r>
+    </w:p>
+    <w:p>
+      <w:proofErr w:type="spellStart"/>
+      <w:r>
+        <w:t>Porcar</w:t>
+      </w:r>
+      <w:proofErr w:type="spellEnd"/>
+      <w:r>
+        <w:t xml:space="preserve">, E., Pons, A. and Lorente, A. (2016) ‘Visual and ocular effects from the use of flat-panel displays’. </w:t>
       </w:r>
       <w:r>
         <w:rPr>
@@ -10495,7 +10761,15 @@
     </w:p>
     <w:p>
       <w:r>
-        <w:t xml:space="preserve">Santilli, T., Ceccacci, S., Mengoni, M. and Catia Giaconi (2025) ‘Virtual vs. traditional learning in higher education: A systematic review of comparative studies’. </w:t>
+        <w:t xml:space="preserve">Santilli, T., Ceccacci, S., Mengoni, M. and Catia </w:t>
+      </w:r>
+      <w:proofErr w:type="spellStart"/>
+      <w:r>
+        <w:t>Giaconi</w:t>
+      </w:r>
+      <w:proofErr w:type="spellEnd"/>
+      <w:r>
+        <w:t xml:space="preserve"> (2025) ‘Virtual vs. traditional learning in higher education: A systematic review of comparative studies’. </w:t>
       </w:r>
       <w:r>
         <w:rPr>
@@ -10530,7 +10804,23 @@
     </w:p>
     <w:p>
       <w:r>
-        <w:t>Vieira, F., Oliveira, E. and Rodrigues, N. (2019) ‘iSVC – digital platform for detection and prevention of computer vision syndrome’., pp. 1–7. doi: https://doi.org/10.1109/SeGAH.2019.8882438.</w:t>
+        <w:t>Vieira, F., Oliveira, E. and Rodrigues, N. (2019) ‘</w:t>
+      </w:r>
+      <w:proofErr w:type="spellStart"/>
+      <w:r>
+        <w:t>iSVC</w:t>
+      </w:r>
+      <w:proofErr w:type="spellEnd"/>
+      <w:r>
+        <w:t xml:space="preserve"> – digital platform for detection and prevention of computer vision syndrome’., pp. 1–7. </w:t>
+      </w:r>
+      <w:proofErr w:type="spellStart"/>
+      <w:r>
+        <w:t>doi</w:t>
+      </w:r>
+      <w:proofErr w:type="spellEnd"/>
+      <w:r>
+        <w:t>: https://doi.org/10.1109/SeGAH.2019.8882438.</w:t>
       </w:r>
     </w:p>
     <w:p>
@@ -10545,12 +10835,28 @@
         <w:t>Annals of Emerging Technologies in Computing</w:t>
       </w:r>
       <w:r>
-        <w:t xml:space="preserve"> 9(3), pp. 50–68. doi: https://doi.org/10.33166/aetic.2025.03.004.</w:t>
-      </w:r>
-    </w:p>
-    <w:p>
-      <w:r>
-        <w:t xml:space="preserve">Youcef, B., Ahmad, M.N. and Mustapha, M. (2021) ‘OntoPhaco: An ontology for virtual reality training in ophthalmology Domain—A case study of cataract surgery’. </w:t>
+        <w:t xml:space="preserve"> 9(3), pp. 50–68. </w:t>
+      </w:r>
+      <w:proofErr w:type="spellStart"/>
+      <w:r>
+        <w:t>doi</w:t>
+      </w:r>
+      <w:proofErr w:type="spellEnd"/>
+      <w:r>
+        <w:t>: https://doi.org/10.33166/aetic.2025.03.004.</w:t>
+      </w:r>
+    </w:p>
+    <w:p>
+      <w:r>
+        <w:t>Youcef, B., Ahmad, M.N. and Mustapha, M. (2021) ‘</w:t>
+      </w:r>
+      <w:proofErr w:type="spellStart"/>
+      <w:r>
+        <w:t>OntoPhaco</w:t>
+      </w:r>
+      <w:proofErr w:type="spellEnd"/>
+      <w:r>
+        <w:t xml:space="preserve">: An ontology for virtual reality training in ophthalmology Domain—A case study of cataract surgery’. </w:t>
       </w:r>
       <w:r>
         <w:rPr>
@@ -10560,7 +10866,15 @@
         <w:t>IEEE Access</w:t>
       </w:r>
       <w:r>
-        <w:t xml:space="preserve"> 9, pp. 152347–152378. doi: https://doi.org/10.1109/ACCESS.2021.3126697.</w:t>
+        <w:t xml:space="preserve"> 9, pp. 152347–152378. </w:t>
+      </w:r>
+      <w:proofErr w:type="spellStart"/>
+      <w:r>
+        <w:t>doi</w:t>
+      </w:r>
+      <w:proofErr w:type="spellEnd"/>
+      <w:r>
+        <w:t>: https://doi.org/10.1109/ACCESS.2021.3126697.</w:t>
       </w:r>
     </w:p>
     <w:p/>
@@ -10568,32 +10882,32 @@
       <w:pPr>
         <w:pStyle w:val="Heading1"/>
       </w:pPr>
-      <w:bookmarkStart w:id="47" w:name="_Toc223886396"/>
+      <w:bookmarkStart w:id="49" w:name="_Toc223965897"/>
       <w:r>
         <w:lastRenderedPageBreak/>
         <w:t>Appendix</w:t>
       </w:r>
-      <w:bookmarkEnd w:id="47"/>
+      <w:bookmarkEnd w:id="49"/>
     </w:p>
     <w:p>
       <w:pPr>
         <w:pStyle w:val="Heading2"/>
       </w:pPr>
-      <w:bookmarkStart w:id="48" w:name="_Toc223886397"/>
+      <w:bookmarkStart w:id="50" w:name="_Toc223965898"/>
       <w:r>
         <w:t>Asset Licenses and Sources</w:t>
       </w:r>
-      <w:bookmarkEnd w:id="48"/>
+      <w:bookmarkEnd w:id="50"/>
     </w:p>
     <w:p>
       <w:pPr>
         <w:pStyle w:val="Heading3"/>
       </w:pPr>
-      <w:bookmarkStart w:id="49" w:name="_Toc223886398"/>
+      <w:bookmarkStart w:id="51" w:name="_Toc223965899"/>
       <w:r>
         <w:t>Modern Office Table</w:t>
       </w:r>
-      <w:bookmarkEnd w:id="49"/>
+      <w:bookmarkEnd w:id="51"/>
     </w:p>
     <w:p>
       <w:r>
@@ -10673,11 +10987,11 @@
       <w:pPr>
         <w:pStyle w:val="Heading3"/>
       </w:pPr>
-      <w:bookmarkStart w:id="50" w:name="_Toc223886399"/>
+      <w:bookmarkStart w:id="52" w:name="_Toc223965900"/>
       <w:r>
         <w:t>Free Studio Starter Pack</w:t>
       </w:r>
-      <w:bookmarkEnd w:id="50"/>
+      <w:bookmarkEnd w:id="52"/>
     </w:p>
     <w:p>
       <w:r>
@@ -10757,11 +11071,11 @@
       <w:pPr>
         <w:pStyle w:val="Heading3"/>
       </w:pPr>
-      <w:bookmarkStart w:id="51" w:name="_Toc223886400"/>
+      <w:bookmarkStart w:id="53" w:name="_Toc223965901"/>
       <w:r>
         <w:t>General Desktop Bundle</w:t>
       </w:r>
-      <w:bookmarkEnd w:id="51"/>
+      <w:bookmarkEnd w:id="53"/>
     </w:p>
     <w:p>
       <w:r>
@@ -10841,12 +11155,12 @@
       <w:pPr>
         <w:pStyle w:val="Heading3"/>
       </w:pPr>
-      <w:bookmarkStart w:id="52" w:name="_Toc223886401"/>
+      <w:bookmarkStart w:id="54" w:name="_Toc223965902"/>
       <w:r>
         <w:lastRenderedPageBreak/>
         <w:t>General Gaming Headset</w:t>
       </w:r>
-      <w:bookmarkEnd w:id="52"/>
+      <w:bookmarkEnd w:id="54"/>
     </w:p>
     <w:p>
       <w:r>
@@ -10926,11 +11240,11 @@
       <w:pPr>
         <w:pStyle w:val="Heading3"/>
       </w:pPr>
-      <w:bookmarkStart w:id="53" w:name="_Toc223886402"/>
+      <w:bookmarkStart w:id="55" w:name="_Toc223965903"/>
       <w:r>
         <w:t>General Gaming Chair</w:t>
       </w:r>
-      <w:bookmarkEnd w:id="53"/>
+      <w:bookmarkEnd w:id="55"/>
     </w:p>
     <w:p>
       <w:r>
@@ -11010,11 +11324,11 @@
       <w:pPr>
         <w:pStyle w:val="Heading3"/>
       </w:pPr>
-      <w:bookmarkStart w:id="54" w:name="_Toc223886403"/>
+      <w:bookmarkStart w:id="56" w:name="_Toc223965904"/>
       <w:r>
         <w:t>Light Switch</w:t>
       </w:r>
-      <w:bookmarkEnd w:id="54"/>
+      <w:bookmarkEnd w:id="56"/>
     </w:p>
     <w:p>
       <w:r>
@@ -11108,7 +11422,7 @@
       <w:pPr>
         <w:pStyle w:val="Heading3"/>
       </w:pPr>
-      <w:bookmarkStart w:id="55" w:name="_Toc223886404"/>
+      <w:bookmarkStart w:id="57" w:name="_Toc223965905"/>
       <w:r>
         <w:lastRenderedPageBreak/>
         <w:t>Materials for General PC setup</w:t>
@@ -11116,7 +11430,7 @@
       <w:r>
         <w:t xml:space="preserve"> and Scenes</w:t>
       </w:r>
-      <w:bookmarkEnd w:id="55"/>
+      <w:bookmarkEnd w:id="57"/>
     </w:p>
     <w:p>
       <w:r>
@@ -11238,12 +11552,12 @@
       <w:pPr>
         <w:pStyle w:val="Heading3"/>
       </w:pPr>
-      <w:bookmarkStart w:id="56" w:name="_Toc223886405"/>
+      <w:bookmarkStart w:id="58" w:name="_Toc223965906"/>
       <w:r>
         <w:lastRenderedPageBreak/>
         <w:t>Monitor background image</w:t>
       </w:r>
-      <w:bookmarkEnd w:id="56"/>
+      <w:bookmarkEnd w:id="58"/>
     </w:p>
     <w:p>
       <w:r>
@@ -11334,12 +11648,25 @@
       <w:pPr>
         <w:pStyle w:val="Heading3"/>
       </w:pPr>
-      <w:bookmarkStart w:id="57" w:name="_Toc223886406"/>
+      <w:bookmarkStart w:id="59" w:name="_Toc223965907"/>
       <w:r>
         <w:lastRenderedPageBreak/>
-        <w:t>Button Hover Sfx by Fachii</w:t>
-      </w:r>
-      <w:bookmarkEnd w:id="57"/>
+        <w:t xml:space="preserve">Button Hover </w:t>
+      </w:r>
+      <w:proofErr w:type="spellStart"/>
+      <w:r>
+        <w:t>Sfx</w:t>
+      </w:r>
+      <w:proofErr w:type="spellEnd"/>
+      <w:r>
+        <w:t xml:space="preserve"> by </w:t>
+      </w:r>
+      <w:proofErr w:type="spellStart"/>
+      <w:r>
+        <w:t>Fachii</w:t>
+      </w:r>
+      <w:bookmarkEnd w:id="59"/>
+      <w:proofErr w:type="spellEnd"/>
     </w:p>
     <w:p>
       <w:r>
@@ -11434,14 +11761,36 @@
     </w:p>
     <w:p/>
     <w:p>
-      <w:bookmarkStart w:id="58" w:name="_Toc223886407"/>
+      <w:bookmarkStart w:id="60" w:name="_Toc223965908"/>
       <w:r>
         <w:rPr>
           <w:rStyle w:val="Heading3Char"/>
         </w:rPr>
-        <w:t>Button click Sfx by AndrewEathan</w:t>
-      </w:r>
-      <w:bookmarkEnd w:id="58"/>
+        <w:t xml:space="preserve">Button click </w:t>
+      </w:r>
+      <w:proofErr w:type="spellStart"/>
+      <w:r>
+        <w:rPr>
+          <w:rStyle w:val="Heading3Char"/>
+        </w:rPr>
+        <w:t>Sfx</w:t>
+      </w:r>
+      <w:proofErr w:type="spellEnd"/>
+      <w:r>
+        <w:rPr>
+          <w:rStyle w:val="Heading3Char"/>
+        </w:rPr>
+        <w:t xml:space="preserve"> by </w:t>
+      </w:r>
+      <w:proofErr w:type="spellStart"/>
+      <w:r>
+        <w:rPr>
+          <w:rStyle w:val="Heading3Char"/>
+        </w:rPr>
+        <w:t>AndrewEathan</w:t>
+      </w:r>
+      <w:bookmarkEnd w:id="60"/>
+      <w:proofErr w:type="spellEnd"/>
       <w:r>
         <w:t xml:space="preserve"> </w:t>
       </w:r>
@@ -11547,12 +11896,17 @@
       <w:pPr>
         <w:pStyle w:val="Heading3"/>
       </w:pPr>
-      <w:bookmarkStart w:id="59" w:name="_Toc223886408"/>
+      <w:bookmarkStart w:id="61" w:name="_Toc223965909"/>
       <w:r>
         <w:lastRenderedPageBreak/>
-        <w:t>Light Switch On Sfx</w:t>
-      </w:r>
-      <w:bookmarkEnd w:id="59"/>
+        <w:t xml:space="preserve">Light Switch On </w:t>
+      </w:r>
+      <w:proofErr w:type="spellStart"/>
+      <w:r>
+        <w:t>Sfx</w:t>
+      </w:r>
+      <w:bookmarkEnd w:id="61"/>
+      <w:proofErr w:type="spellEnd"/>
     </w:p>
     <w:p>
       <w:r>
@@ -11642,11 +11996,16 @@
       <w:pPr>
         <w:pStyle w:val="Heading3"/>
       </w:pPr>
-      <w:bookmarkStart w:id="60" w:name="_Toc223886409"/>
-      <w:r>
-        <w:t>Light Switch Off Sfx</w:t>
-      </w:r>
-      <w:bookmarkEnd w:id="60"/>
+      <w:bookmarkStart w:id="62" w:name="_Toc223965910"/>
+      <w:r>
+        <w:t xml:space="preserve">Light Switch Off </w:t>
+      </w:r>
+      <w:proofErr w:type="spellStart"/>
+      <w:r>
+        <w:t>Sfx</w:t>
+      </w:r>
+      <w:bookmarkEnd w:id="62"/>
+      <w:proofErr w:type="spellEnd"/>
     </w:p>
     <w:p>
       <w:r>

</xml_diff>

<commit_message>
Finished methodology section for final implementation
</commit_message>
<xml_diff>
--- a/30077548Thesis.docx
+++ b/30077548Thesis.docx
@@ -5014,6 +5014,28 @@
           </w:p>
         </w:tc>
       </w:tr>
+      <w:tr>
+        <w:tc>
+          <w:tcPr>
+            <w:tcW w:w="4508" w:type="dxa"/>
+          </w:tcPr>
+          <w:p>
+            <w:r>
+              <w:t>FPS</w:t>
+            </w:r>
+          </w:p>
+        </w:tc>
+        <w:tc>
+          <w:tcPr>
+            <w:tcW w:w="4508" w:type="dxa"/>
+          </w:tcPr>
+          <w:p>
+            <w:r>
+              <w:t>First Person Shooter</w:t>
+            </w:r>
+          </w:p>
+        </w:tc>
+      </w:tr>
     </w:tbl>
     <w:p/>
     <w:p/>
@@ -5290,13 +5312,8 @@
       <w:r>
         <w:t xml:space="preserve">. </w:t>
       </w:r>
-      <w:proofErr w:type="spellStart"/>
-      <w:r>
-        <w:t>Porcar</w:t>
-      </w:r>
-      <w:proofErr w:type="spellEnd"/>
-      <w:r>
-        <w:t xml:space="preserve"> et al., </w:t>
+      <w:r>
+        <w:t xml:space="preserve">Porcar et al., </w:t>
       </w:r>
       <w:r>
         <w:t>(</w:t>
@@ -5336,13 +5353,8 @@
       <w:r>
         <w:t xml:space="preserve">Research conducted by </w:t>
       </w:r>
-      <w:proofErr w:type="spellStart"/>
-      <w:r>
-        <w:t>Cantó</w:t>
-      </w:r>
-      <w:proofErr w:type="spellEnd"/>
-      <w:r>
-        <w:t xml:space="preserve">-Sancho et al., </w:t>
+      <w:r>
+        <w:t xml:space="preserve">Cantó-Sancho et al., </w:t>
       </w:r>
       <w:r>
         <w:t>(</w:t>
@@ -7128,7 +7140,6 @@
         <w:pStyle w:val="Heading3"/>
       </w:pPr>
       <w:bookmarkStart w:id="11" w:name="_Toc223965859"/>
-      <w:proofErr w:type="spellStart"/>
       <w:r>
         <w:t>Ey</w:t>
       </w:r>
@@ -7139,7 +7150,6 @@
         <w:t>si</w:t>
       </w:r>
       <w:bookmarkEnd w:id="11"/>
-      <w:proofErr w:type="spellEnd"/>
     </w:p>
     <w:p>
       <w:r>
@@ -7154,11 +7164,9 @@
       <w:r>
         <w:t xml:space="preserve"> discussed </w:t>
       </w:r>
-      <w:proofErr w:type="spellStart"/>
       <w:r>
         <w:t>Eyesi</w:t>
       </w:r>
-      <w:proofErr w:type="spellEnd"/>
       <w:r>
         <w:t>,</w:t>
       </w:r>
@@ -7271,15 +7279,7 @@
         <w:t xml:space="preserve">In addition to this, there is an </w:t>
       </w:r>
       <w:r>
-        <w:t>online training portal (</w:t>
-      </w:r>
-      <w:proofErr w:type="spellStart"/>
-      <w:r>
-        <w:t>vrmnet</w:t>
-      </w:r>
-      <w:proofErr w:type="spellEnd"/>
-      <w:r>
-        <w:t xml:space="preserve">) </w:t>
+        <w:t xml:space="preserve">online training portal (vrmnet) </w:t>
       </w:r>
       <w:r>
         <w:t>allowing comparison between trainees</w:t>
@@ -7414,15 +7414,7 @@
         <w:t xml:space="preserve"> </w:t>
       </w:r>
       <w:r>
-        <w:t xml:space="preserve">While </w:t>
-      </w:r>
-      <w:proofErr w:type="spellStart"/>
-      <w:r>
-        <w:t>Eyesi</w:t>
-      </w:r>
-      <w:proofErr w:type="spellEnd"/>
-      <w:r>
-        <w:t xml:space="preserve"> is effective for medical training for medical professionals, </w:t>
+        <w:t xml:space="preserve">While Eyesi is effective for medical training for medical professionals, </w:t>
       </w:r>
       <w:r>
         <w:t xml:space="preserve">similar </w:t>
@@ -7445,12 +7437,10 @@
         <w:pStyle w:val="Heading3"/>
       </w:pPr>
       <w:bookmarkStart w:id="12" w:name="_Toc223965860"/>
-      <w:proofErr w:type="spellStart"/>
       <w:r>
         <w:t>OntoPhaco</w:t>
       </w:r>
       <w:bookmarkEnd w:id="12"/>
-      <w:proofErr w:type="spellEnd"/>
     </w:p>
     <w:p>
       <w:r>
@@ -7469,15 +7459,7 @@
         <w:t>d</w:t>
       </w:r>
       <w:r>
-        <w:t xml:space="preserve"> </w:t>
-      </w:r>
-      <w:proofErr w:type="spellStart"/>
-      <w:r>
-        <w:t>OntoPhaco</w:t>
-      </w:r>
-      <w:proofErr w:type="spellEnd"/>
-      <w:r>
-        <w:t>, a</w:t>
+        <w:t xml:space="preserve"> OntoPhaco, a</w:t>
       </w:r>
       <w:r>
         <w:t>n</w:t>
@@ -7610,191 +7592,173 @@
           <w:rFonts w:cs="TimesLTStd-Roman"/>
           <w:kern w:val="0"/>
         </w:rPr>
-        <w:t xml:space="preserve">Since </w:t>
-      </w:r>
-      <w:proofErr w:type="spellStart"/>
+        <w:t>Since OntoPhaco</w:t>
+      </w:r>
       <w:r>
         <w:rPr>
           <w:rFonts w:cs="TimesLTStd-Roman"/>
           <w:kern w:val="0"/>
         </w:rPr>
-        <w:t>OntoPhaco</w:t>
+        <w:t>’s</w:t>
       </w:r>
       <w:r>
         <w:rPr>
           <w:rFonts w:cs="TimesLTStd-Roman"/>
           <w:kern w:val="0"/>
         </w:rPr>
-        <w:t>’s</w:t>
-      </w:r>
-      <w:proofErr w:type="spellEnd"/>
+        <w:t xml:space="preserve"> </w:t>
+      </w:r>
+      <w:r>
+        <w:t>s</w:t>
+      </w:r>
+      <w:r>
+        <w:t xml:space="preserve">ystematic verification and validation processes </w:t>
+      </w:r>
+      <w:r>
+        <w:t>include</w:t>
+      </w:r>
+      <w:r>
+        <w:t xml:space="preserve"> </w:t>
+      </w:r>
+      <w:r>
+        <w:t xml:space="preserve">theoretical </w:t>
+      </w:r>
+      <w:r>
+        <w:t>evaluat</w:t>
+      </w:r>
+      <w:r>
+        <w:t xml:space="preserve">ion </w:t>
+      </w:r>
+      <w:r>
+        <w:t>and expert feedback</w:t>
+      </w:r>
       <w:r>
         <w:rPr>
           <w:rFonts w:cs="TimesLTStd-Roman"/>
           <w:kern w:val="0"/>
         </w:rPr>
-        <w:t xml:space="preserve"> </w:t>
-      </w:r>
-      <w:r>
-        <w:t>s</w:t>
-      </w:r>
-      <w:r>
-        <w:t xml:space="preserve">ystematic verification and validation processes </w:t>
-      </w:r>
-      <w:r>
-        <w:t>include</w:t>
-      </w:r>
-      <w:r>
-        <w:t xml:space="preserve"> </w:t>
-      </w:r>
-      <w:r>
-        <w:t xml:space="preserve">theoretical </w:t>
-      </w:r>
-      <w:r>
-        <w:t>evaluat</w:t>
-      </w:r>
-      <w:r>
-        <w:t xml:space="preserve">ion </w:t>
-      </w:r>
-      <w:r>
-        <w:t>and expert feedback</w:t>
+        <w:t xml:space="preserve">, each change, minor or major </w:t>
       </w:r>
       <w:r>
         <w:rPr>
           <w:rFonts w:cs="TimesLTStd-Roman"/>
           <w:kern w:val="0"/>
         </w:rPr>
-        <w:t xml:space="preserve">, each change, minor or major </w:t>
+        <w:t>is</w:t>
       </w:r>
       <w:r>
         <w:rPr>
           <w:rFonts w:cs="TimesLTStd-Roman"/>
           <w:kern w:val="0"/>
         </w:rPr>
-        <w:t>is</w:t>
+        <w:t xml:space="preserve"> verified and validate</w:t>
       </w:r>
       <w:r>
         <w:rPr>
           <w:rFonts w:cs="TimesLTStd-Roman"/>
           <w:kern w:val="0"/>
         </w:rPr>
-        <w:t xml:space="preserve"> verified and validate</w:t>
+        <w:t>d</w:t>
+      </w:r>
+      <w:r>
+        <w:t>.</w:t>
       </w:r>
       <w:r>
         <w:rPr>
           <w:rFonts w:cs="TimesLTStd-Roman"/>
           <w:kern w:val="0"/>
         </w:rPr>
-        <w:t>d</w:t>
-      </w:r>
-      <w:r>
-        <w:t>.</w:t>
+        <w:t xml:space="preserve"> </w:t>
       </w:r>
       <w:r>
         <w:rPr>
           <w:rFonts w:cs="TimesLTStd-Roman"/>
           <w:kern w:val="0"/>
         </w:rPr>
-        <w:t xml:space="preserve"> </w:t>
-      </w:r>
-      <w:proofErr w:type="spellStart"/>
+        <w:t>OntoPhaco demonstrates VR</w:t>
+      </w:r>
       <w:r>
         <w:rPr>
           <w:rFonts w:cs="TimesLTStd-Roman"/>
           <w:kern w:val="0"/>
         </w:rPr>
-        <w:t>OntoPhaco</w:t>
-      </w:r>
-      <w:proofErr w:type="spellEnd"/>
+        <w:t>’</w:t>
+      </w:r>
       <w:r>
         <w:rPr>
           <w:rFonts w:cs="TimesLTStd-Roman"/>
           <w:kern w:val="0"/>
         </w:rPr>
-        <w:t xml:space="preserve"> demonstrates VR</w:t>
+        <w:t xml:space="preserve">s effectiveness </w:t>
       </w:r>
       <w:r>
         <w:rPr>
           <w:rFonts w:cs="TimesLTStd-Roman"/>
           <w:kern w:val="0"/>
         </w:rPr>
-        <w:t>’</w:t>
+        <w:t xml:space="preserve">paired </w:t>
       </w:r>
       <w:r>
         <w:rPr>
           <w:rFonts w:cs="TimesLTStd-Roman"/>
           <w:kern w:val="0"/>
         </w:rPr>
-        <w:t xml:space="preserve">s effectiveness </w:t>
+        <w:t>with ontology for medical training</w:t>
       </w:r>
       <w:r>
         <w:rPr>
           <w:rFonts w:cs="TimesLTStd-Roman"/>
           <w:kern w:val="0"/>
         </w:rPr>
-        <w:t xml:space="preserve">paired </w:t>
+        <w:t>. T</w:t>
       </w:r>
       <w:r>
         <w:rPr>
           <w:rFonts w:cs="TimesLTStd-Roman"/>
           <w:kern w:val="0"/>
         </w:rPr>
-        <w:t>with ontology for medical training</w:t>
+        <w:t>his project</w:t>
       </w:r>
       <w:r>
         <w:rPr>
           <w:rFonts w:cs="TimesLTStd-Roman"/>
           <w:kern w:val="0"/>
         </w:rPr>
-        <w:t>. T</w:t>
+        <w:t xml:space="preserve"> applies similar immersi</w:t>
       </w:r>
       <w:r>
         <w:rPr>
           <w:rFonts w:cs="TimesLTStd-Roman"/>
           <w:kern w:val="0"/>
         </w:rPr>
-        <w:t>his project</w:t>
+        <w:t>ve</w:t>
       </w:r>
       <w:r>
         <w:rPr>
           <w:rFonts w:cs="TimesLTStd-Roman"/>
           <w:kern w:val="0"/>
         </w:rPr>
-        <w:t xml:space="preserve"> applies similar immersi</w:t>
+        <w:t xml:space="preserve"> and educational knowledge </w:t>
       </w:r>
       <w:r>
         <w:rPr>
           <w:rFonts w:cs="TimesLTStd-Roman"/>
           <w:kern w:val="0"/>
         </w:rPr>
-        <w:t>ve</w:t>
+        <w:t xml:space="preserve">for DES to raise awareness, </w:t>
       </w:r>
       <w:r>
         <w:rPr>
           <w:rFonts w:cs="TimesLTStd-Roman"/>
           <w:kern w:val="0"/>
         </w:rPr>
-        <w:t xml:space="preserve"> and educational knowledge </w:t>
+        <w:t xml:space="preserve">spreading the </w:t>
       </w:r>
       <w:r>
         <w:rPr>
           <w:rFonts w:cs="TimesLTStd-Roman"/>
           <w:kern w:val="0"/>
         </w:rPr>
-        <w:t xml:space="preserve">for DES to raise awareness, </w:t>
-      </w:r>
-      <w:r>
-        <w:rPr>
-          <w:rFonts w:cs="TimesLTStd-Roman"/>
-          <w:kern w:val="0"/>
-        </w:rPr>
-        <w:t xml:space="preserve">spreading the </w:t>
-      </w:r>
-      <w:r>
-        <w:rPr>
-          <w:rFonts w:cs="TimesLTStd-Roman"/>
-          <w:kern w:val="0"/>
-        </w:rPr>
         <w:t>benefits of VR use in education beyond professional training.</w:t>
       </w:r>
     </w:p>
@@ -8008,27 +7972,17 @@
       <w:r>
         <w:t xml:space="preserve">While </w:t>
       </w:r>
-      <w:proofErr w:type="spellStart"/>
-      <w:r>
-        <w:t>Eyesi</w:t>
-      </w:r>
-      <w:proofErr w:type="spellEnd"/>
-      <w:r>
-        <w:t xml:space="preserve"> focuses on hands on surgical practices</w:t>
+      <w:r>
+        <w:t>Eyesi focuses on hands on surgical practices</w:t>
       </w:r>
       <w:r>
         <w:t xml:space="preserve">, </w:t>
       </w:r>
-      <w:proofErr w:type="spellStart"/>
       <w:r>
         <w:t>O</w:t>
       </w:r>
       <w:r>
-        <w:t>ntoPhaco</w:t>
-      </w:r>
-      <w:proofErr w:type="spellEnd"/>
-      <w:r>
-        <w:t xml:space="preserve"> focuses on the way knowledge is represented and conceptual understanding</w:t>
+        <w:t>ntoPhaco focuses on the way knowledge is represented and conceptual understanding</w:t>
       </w:r>
       <w:r>
         <w:t xml:space="preserve">. </w:t>
@@ -8286,19 +8240,9 @@
       <w:r>
         <w:t xml:space="preserve">Examples such as </w:t>
       </w:r>
-      <w:proofErr w:type="spellStart"/>
-      <w:r>
-        <w:t>Mediverse</w:t>
-      </w:r>
-      <w:proofErr w:type="spellEnd"/>
-      <w:r>
-        <w:t xml:space="preserve"> by </w:t>
-      </w:r>
-      <w:proofErr w:type="spellStart"/>
-      <w:r>
-        <w:t>Goggleminds</w:t>
-      </w:r>
-      <w:proofErr w:type="spellEnd"/>
+      <w:r>
+        <w:t>Mediverse by Goggleminds</w:t>
+      </w:r>
       <w:r>
         <w:t xml:space="preserve"> </w:t>
       </w:r>
@@ -8312,38 +8256,25 @@
         <w:t xml:space="preserve"> to healthcare providers and medical schools</w:t>
       </w:r>
       <w:r>
+        <w:t>. ClassVR by Systems improve</w:t>
+      </w:r>
+      <w:r>
+        <w:t>s</w:t>
+      </w:r>
+      <w:r>
+        <w:t xml:space="preserve"> student engagement</w:t>
+      </w:r>
+      <w:r>
+        <w:t xml:space="preserve"> to help teachers with educating students on learning material</w:t>
+      </w:r>
+      <w:r>
         <w:t xml:space="preserve">. </w:t>
       </w:r>
-      <w:proofErr w:type="spellStart"/>
-      <w:r>
-        <w:t>ClassVR</w:t>
-      </w:r>
-      <w:proofErr w:type="spellEnd"/>
-      <w:r>
-        <w:t xml:space="preserve"> by Systems improve</w:t>
-      </w:r>
-      <w:r>
-        <w:t>s</w:t>
-      </w:r>
-      <w:r>
-        <w:t xml:space="preserve"> student engagement</w:t>
-      </w:r>
-      <w:r>
-        <w:t xml:space="preserve"> to help teachers with educating students on learning material</w:t>
-      </w:r>
-      <w:r>
-        <w:t xml:space="preserve">. </w:t>
-      </w:r>
-      <w:r>
-        <w:t xml:space="preserve"> </w:t>
-      </w:r>
-      <w:proofErr w:type="spellStart"/>
-      <w:r>
-        <w:t>PrismsVR</w:t>
-      </w:r>
-      <w:proofErr w:type="spellEnd"/>
-      <w:r>
-        <w:t xml:space="preserve"> </w:t>
+      <w:r>
+        <w:t xml:space="preserve"> </w:t>
+      </w:r>
+      <w:r>
+        <w:t xml:space="preserve">PrismsVR </w:t>
       </w:r>
       <w:r>
         <w:t xml:space="preserve">helps students grasp core concepts in algebra and geometry, by </w:t>
@@ -9476,15 +9407,7 @@
         <w:t>ere</w:t>
       </w:r>
       <w:r>
-        <w:t xml:space="preserve"> stored within the </w:t>
-      </w:r>
-      <w:proofErr w:type="spellStart"/>
-      <w:r>
-        <w:t>VRGameMode</w:t>
-      </w:r>
-      <w:proofErr w:type="spellEnd"/>
-      <w:r>
-        <w:t xml:space="preserve"> blueprint, with objectives being updated during runtime as conditions were satisfied </w:t>
+        <w:t xml:space="preserve"> stored within the VRGameMode blueprint, with objectives being updated during runtime as conditions were satisfied </w:t>
       </w:r>
       <w:r>
         <w:t>during</w:t>
@@ -9777,6 +9700,31 @@
       <w:pPr>
         <w:pStyle w:val="Heading3"/>
       </w:pPr>
+      <w:r>
+        <w:t>Environment Changes and Visual Modifications</w:t>
+      </w:r>
+    </w:p>
+    <w:p>
+      <w:r>
+        <w:t>To add some colour to the scenes</w:t>
+      </w:r>
+      <w:r>
+        <w:t>,</w:t>
+      </w:r>
+      <w:r>
+        <w:t xml:space="preserve"> the default grid materials were swapped out for flooring, ceiling, wall and other materials to change the scene from a grey looking prototype to a </w:t>
+      </w:r>
+      <w:r>
+        <w:t xml:space="preserve">more </w:t>
+      </w:r>
+      <w:r>
+        <w:t>polished scene setup.</w:t>
+      </w:r>
+    </w:p>
+    <w:p>
+      <w:pPr>
+        <w:pStyle w:val="Heading3"/>
+      </w:pPr>
       <w:bookmarkStart w:id="33" w:name="_Toc223965881"/>
       <w:r>
         <w:t>Interaction Improvements</w:t>
@@ -9784,6 +9732,56 @@
       <w:bookmarkEnd w:id="33"/>
     </w:p>
     <w:p>
+      <w:r>
+        <w:t xml:space="preserve">Hand physics collisions were removed </w:t>
+      </w:r>
+      <w:r>
+        <w:t xml:space="preserve">which allowed the user interactions with the </w:t>
+      </w:r>
+      <w:r>
+        <w:t xml:space="preserve">light switch </w:t>
+      </w:r>
+      <w:r>
+        <w:t xml:space="preserve">to </w:t>
+      </w:r>
+      <w:r>
+        <w:t>work as intended</w:t>
+      </w:r>
+      <w:r>
+        <w:t xml:space="preserve">. As the physics collisions were no longer blocking the player hand components from </w:t>
+      </w:r>
+      <w:r>
+        <w:t>moving</w:t>
+      </w:r>
+      <w:r>
+        <w:t xml:space="preserve"> into the light switch</w:t>
+      </w:r>
+      <w:r>
+        <w:t>,</w:t>
+      </w:r>
+      <w:r>
+        <w:t xml:space="preserve"> </w:t>
+      </w:r>
+      <w:r>
+        <w:t xml:space="preserve">the interaction could </w:t>
+      </w:r>
+      <w:r>
+        <w:t xml:space="preserve">reliably </w:t>
+      </w:r>
+      <w:r>
+        <w:t>receive</w:t>
+      </w:r>
+      <w:r>
+        <w:t xml:space="preserve"> </w:t>
+      </w:r>
+      <w:r>
+        <w:t>trigger inputs from the user</w:t>
+      </w:r>
+      <w:r>
+        <w:t>.</w:t>
+      </w:r>
+    </w:p>
+    <w:p>
       <w:pPr>
         <w:pStyle w:val="Heading3"/>
       </w:pPr>
@@ -9795,7 +9793,82 @@
     </w:p>
     <w:p>
       <w:r>
-        <w:t>By reducing the timeline duration between objectives 4 and 5 for triggering and reverting the light sensitivity symptom. The experience saw an improvement as the symptom effects were still able to be portrayed to users while still showing prevention methods worked.</w:t>
+        <w:t xml:space="preserve">The </w:t>
+      </w:r>
+      <w:r>
+        <w:t>timeline duration between objectives 4 and 5 for triggering and reverting the light sensitivity symptom</w:t>
+      </w:r>
+      <w:r>
+        <w:t xml:space="preserve"> w</w:t>
+      </w:r>
+      <w:r>
+        <w:t>as</w:t>
+      </w:r>
+      <w:r>
+        <w:t xml:space="preserve"> reduced</w:t>
+      </w:r>
+      <w:r>
+        <w:t xml:space="preserve">. </w:t>
+      </w:r>
+      <w:r>
+        <w:t>S</w:t>
+      </w:r>
+      <w:r>
+        <w:t>ymptom effects were still able to be portrayed to users while showing prevention methods worked.</w:t>
+      </w:r>
+      <w:r>
+        <w:t xml:space="preserve"> </w:t>
+      </w:r>
+      <w:r>
+        <w:t>O</w:t>
+      </w:r>
+      <w:r>
+        <w:t xml:space="preserve">bjectives should not overlap each other </w:t>
+      </w:r>
+      <w:r>
+        <w:t>or</w:t>
+      </w:r>
+      <w:r>
+        <w:t xml:space="preserve"> show </w:t>
+      </w:r>
+      <w:r>
+        <w:t xml:space="preserve">unexpected </w:t>
+      </w:r>
+      <w:r>
+        <w:t>behaviour</w:t>
+      </w:r>
+      <w:r>
+        <w:t xml:space="preserve"> </w:t>
+      </w:r>
+      <w:r>
+        <w:t>to the player</w:t>
+      </w:r>
+      <w:r>
+        <w:t>. T</w:t>
+      </w:r>
+      <w:r>
+        <w:t xml:space="preserve">his </w:t>
+      </w:r>
+      <w:r>
+        <w:t>keep</w:t>
+      </w:r>
+      <w:r>
+        <w:t>s</w:t>
+      </w:r>
+      <w:r>
+        <w:t xml:space="preserve"> the understanding </w:t>
+      </w:r>
+      <w:r>
+        <w:t xml:space="preserve">of the experience </w:t>
+      </w:r>
+      <w:r>
+        <w:t xml:space="preserve">clear and </w:t>
+      </w:r>
+      <w:r>
+        <w:t>prioritises</w:t>
+      </w:r>
+      <w:r>
+        <w:t xml:space="preserve"> information retention.</w:t>
       </w:r>
     </w:p>
     <w:p>
@@ -9817,6 +9890,45 @@
           <w:szCs w:val="40"/>
         </w:rPr>
       </w:pPr>
+      <w:r>
+        <w:t xml:space="preserve">The line trace used for gaze detection was replaced with a capsule trace. The capsule was also given a larger radius to increase how forgiving the detection was for players when trying to progress through the experience. </w:t>
+      </w:r>
+      <w:r>
+        <w:t>W</w:t>
+      </w:r>
+      <w:r>
+        <w:t>ith no crosshair</w:t>
+      </w:r>
+      <w:r>
+        <w:t>,</w:t>
+      </w:r>
+      <w:r>
+        <w:t xml:space="preserve"> </w:t>
+      </w:r>
+      <w:r>
+        <w:t xml:space="preserve">it was difficult for users </w:t>
+      </w:r>
+      <w:r>
+        <w:t xml:space="preserve">to guide </w:t>
+      </w:r>
+      <w:r>
+        <w:t xml:space="preserve">their </w:t>
+      </w:r>
+      <w:r>
+        <w:t>aim as immersion was prioritised over the experience looking like a</w:t>
+      </w:r>
+      <w:r>
+        <w:t>n</w:t>
+      </w:r>
+      <w:r>
+        <w:t xml:space="preserve"> FPS</w:t>
+      </w:r>
+      <w:r>
+        <w:t xml:space="preserve"> (First Person Shooter)</w:t>
+      </w:r>
+      <w:r>
+        <w:t xml:space="preserve"> style game.</w:t>
+      </w:r>
       <w:r>
         <w:br w:type="page"/>
       </w:r>
@@ -10621,23 +10733,9 @@
       <w:bookmarkEnd w:id="48"/>
     </w:p>
     <w:p>
-      <w:proofErr w:type="spellStart"/>
-      <w:r>
-        <w:t>Cantó</w:t>
-      </w:r>
-      <w:proofErr w:type="spellEnd"/>
-      <w:r>
-        <w:t xml:space="preserve">-Sancho, N., </w:t>
-      </w:r>
-      <w:proofErr w:type="spellStart"/>
-      <w:r>
-        <w:t>Porru</w:t>
-      </w:r>
-      <w:proofErr w:type="spellEnd"/>
-      <w:r>
-        <w:t xml:space="preserve">, S., Casati, S., Ronda, E., Seguí-Crespo, M. and Carta, A. (2023) ‘Prevalence and risk factors of computer vision syndrome—assessed in office workers by a validated questionnaire’. </w:t>
-      </w:r>
-      <w:proofErr w:type="spellStart"/>
+      <w:r>
+        <w:t xml:space="preserve">Cantó-Sancho, N., Porru, S., Casati, S., Ronda, E., Seguí-Crespo, M. and Carta, A. (2023) ‘Prevalence and risk factors of computer vision syndrome—assessed in office workers by a validated questionnaire’. </w:t>
+      </w:r>
       <w:r>
         <w:rPr>
           <w:i/>
@@ -10645,22 +10743,13 @@
         </w:rPr>
         <w:t>PeerJ</w:t>
       </w:r>
-      <w:proofErr w:type="spellEnd"/>
       <w:r>
         <w:t xml:space="preserve"> 11, p. e14937. Available at: https://www.researchgate.net/publication/369002899_Prevalence_and_risk_factors_of_computer_vision_syndrome-assessed_in_office_workers_by_a_validated_questionnaire (Accessed: 20 October 2025).</w:t>
       </w:r>
     </w:p>
     <w:p>
       <w:r>
-        <w:t xml:space="preserve">Chandrasekhara, R.S., Low, C., Lim, Y., Low, L., Mardina, F. and </w:t>
-      </w:r>
-      <w:proofErr w:type="spellStart"/>
-      <w:r>
-        <w:t>Nursaleha</w:t>
-      </w:r>
-      <w:proofErr w:type="spellEnd"/>
-      <w:r>
-        <w:t xml:space="preserve">, M. (2013) ‘Computer vision syndrome: a study of knowledge and practices in university students’. </w:t>
+        <w:t xml:space="preserve">Chandrasekhara, R.S., Low, C., Lim, Y., Low, L., Mardina, F. and Nursaleha, M. (2013) ‘Computer vision syndrome: a study of knowledge and practices in university students’. </w:t>
       </w:r>
       <w:r>
         <w:rPr>
@@ -10686,15 +10775,7 @@
     </w:p>
     <w:p>
       <w:r>
-        <w:t xml:space="preserve">Muñoz, E.G., </w:t>
-      </w:r>
-      <w:proofErr w:type="spellStart"/>
-      <w:r>
-        <w:t>Fabregat</w:t>
-      </w:r>
-      <w:proofErr w:type="spellEnd"/>
-      <w:r>
-        <w:t xml:space="preserve">, R., Bacca-Acosta, J., Duque-Méndez, N. and Avila-Garzon, C. (2022) ‘Augmented Reality, Virtual Reality, and Game Technologies in Ophthalmology Training’. </w:t>
+        <w:t xml:space="preserve">Muñoz, E.G., Fabregat, R., Bacca-Acosta, J., Duque-Méndez, N. and Avila-Garzon, C. (2022) ‘Augmented Reality, Virtual Reality, and Game Technologies in Ophthalmology Training’. </w:t>
       </w:r>
       <w:r>
         <w:rPr>
@@ -10704,15 +10785,7 @@
         <w:t>Information</w:t>
       </w:r>
       <w:r>
-        <w:t xml:space="preserve"> 13(5), p. 222. </w:t>
-      </w:r>
-      <w:proofErr w:type="spellStart"/>
-      <w:r>
-        <w:t>doi</w:t>
-      </w:r>
-      <w:proofErr w:type="spellEnd"/>
-      <w:r>
-        <w:t xml:space="preserve">: </w:t>
+        <w:t xml:space="preserve"> 13(5), p. 222. doi: </w:t>
       </w:r>
       <w:hyperlink r:id="rId16" w:history="1">
         <w:r>
@@ -10728,25 +10801,12 @@
     </w:p>
     <w:p>
       <w:r>
-        <w:t xml:space="preserve">Orji, J., Hernandez, A., Selema, B. and Orji, R. (2022) ‘Virtual and augmented reality applications for promoting safety and security: A systematic review’., pp. 1–7. </w:t>
-      </w:r>
-      <w:proofErr w:type="spellStart"/>
-      <w:r>
-        <w:t>doi</w:t>
-      </w:r>
-      <w:proofErr w:type="spellEnd"/>
-      <w:r>
-        <w:t>: https://doi.org/10.1109/SEGAH54908.2022.9978597.</w:t>
-      </w:r>
-    </w:p>
-    <w:p>
-      <w:proofErr w:type="spellStart"/>
-      <w:r>
-        <w:t>Porcar</w:t>
-      </w:r>
-      <w:proofErr w:type="spellEnd"/>
-      <w:r>
-        <w:t xml:space="preserve">, E., Pons, A. and Lorente, A. (2016) ‘Visual and ocular effects from the use of flat-panel displays’. </w:t>
+        <w:t>Orji, J., Hernandez, A., Selema, B. and Orji, R. (2022) ‘Virtual and augmented reality applications for promoting safety and security: A systematic review’., pp. 1–7. doi: https://doi.org/10.1109/SEGAH54908.2022.9978597.</w:t>
+      </w:r>
+    </w:p>
+    <w:p>
+      <w:r>
+        <w:t xml:space="preserve">Porcar, E., Pons, A. and Lorente, A. (2016) ‘Visual and ocular effects from the use of flat-panel displays’. </w:t>
       </w:r>
       <w:r>
         <w:rPr>
@@ -10761,15 +10821,7 @@
     </w:p>
     <w:p>
       <w:r>
-        <w:t xml:space="preserve">Santilli, T., Ceccacci, S., Mengoni, M. and Catia </w:t>
-      </w:r>
-      <w:proofErr w:type="spellStart"/>
-      <w:r>
-        <w:t>Giaconi</w:t>
-      </w:r>
-      <w:proofErr w:type="spellEnd"/>
-      <w:r>
-        <w:t xml:space="preserve"> (2025) ‘Virtual vs. traditional learning in higher education: A systematic review of comparative studies’. </w:t>
+        <w:t xml:space="preserve">Santilli, T., Ceccacci, S., Mengoni, M. and Catia Giaconi (2025) ‘Virtual vs. traditional learning in higher education: A systematic review of comparative studies’. </w:t>
       </w:r>
       <w:r>
         <w:rPr>
@@ -10804,23 +10856,7 @@
     </w:p>
     <w:p>
       <w:r>
-        <w:t>Vieira, F., Oliveira, E. and Rodrigues, N. (2019) ‘</w:t>
-      </w:r>
-      <w:proofErr w:type="spellStart"/>
-      <w:r>
-        <w:t>iSVC</w:t>
-      </w:r>
-      <w:proofErr w:type="spellEnd"/>
-      <w:r>
-        <w:t xml:space="preserve"> – digital platform for detection and prevention of computer vision syndrome’., pp. 1–7. </w:t>
-      </w:r>
-      <w:proofErr w:type="spellStart"/>
-      <w:r>
-        <w:t>doi</w:t>
-      </w:r>
-      <w:proofErr w:type="spellEnd"/>
-      <w:r>
-        <w:t>: https://doi.org/10.1109/SeGAH.2019.8882438.</w:t>
+        <w:t>Vieira, F., Oliveira, E. and Rodrigues, N. (2019) ‘iSVC – digital platform for detection and prevention of computer vision syndrome’., pp. 1–7. doi: https://doi.org/10.1109/SeGAH.2019.8882438.</w:t>
       </w:r>
     </w:p>
     <w:p>
@@ -10835,28 +10871,12 @@
         <w:t>Annals of Emerging Technologies in Computing</w:t>
       </w:r>
       <w:r>
-        <w:t xml:space="preserve"> 9(3), pp. 50–68. </w:t>
-      </w:r>
-      <w:proofErr w:type="spellStart"/>
-      <w:r>
-        <w:t>doi</w:t>
-      </w:r>
-      <w:proofErr w:type="spellEnd"/>
-      <w:r>
-        <w:t>: https://doi.org/10.33166/aetic.2025.03.004.</w:t>
-      </w:r>
-    </w:p>
-    <w:p>
-      <w:r>
-        <w:t>Youcef, B., Ahmad, M.N. and Mustapha, M. (2021) ‘</w:t>
-      </w:r>
-      <w:proofErr w:type="spellStart"/>
-      <w:r>
-        <w:t>OntoPhaco</w:t>
-      </w:r>
-      <w:proofErr w:type="spellEnd"/>
-      <w:r>
-        <w:t xml:space="preserve">: An ontology for virtual reality training in ophthalmology Domain—A case study of cataract surgery’. </w:t>
+        <w:t xml:space="preserve"> 9(3), pp. 50–68. doi: https://doi.org/10.33166/aetic.2025.03.004.</w:t>
+      </w:r>
+    </w:p>
+    <w:p>
+      <w:r>
+        <w:t xml:space="preserve">Youcef, B., Ahmad, M.N. and Mustapha, M. (2021) ‘OntoPhaco: An ontology for virtual reality training in ophthalmology Domain—A case study of cataract surgery’. </w:t>
       </w:r>
       <w:r>
         <w:rPr>
@@ -10866,15 +10886,7 @@
         <w:t>IEEE Access</w:t>
       </w:r>
       <w:r>
-        <w:t xml:space="preserve"> 9, pp. 152347–152378. </w:t>
-      </w:r>
-      <w:proofErr w:type="spellStart"/>
-      <w:r>
-        <w:t>doi</w:t>
-      </w:r>
-      <w:proofErr w:type="spellEnd"/>
-      <w:r>
-        <w:t>: https://doi.org/10.1109/ACCESS.2021.3126697.</w:t>
+        <w:t xml:space="preserve"> 9, pp. 152347–152378. doi: https://doi.org/10.1109/ACCESS.2021.3126697.</w:t>
       </w:r>
     </w:p>
     <w:p/>
@@ -11651,22 +11663,9 @@
       <w:bookmarkStart w:id="59" w:name="_Toc223965907"/>
       <w:r>
         <w:lastRenderedPageBreak/>
-        <w:t xml:space="preserve">Button Hover </w:t>
-      </w:r>
-      <w:proofErr w:type="spellStart"/>
-      <w:r>
-        <w:t>Sfx</w:t>
-      </w:r>
-      <w:proofErr w:type="spellEnd"/>
-      <w:r>
-        <w:t xml:space="preserve"> by </w:t>
-      </w:r>
-      <w:proofErr w:type="spellStart"/>
-      <w:r>
-        <w:t>Fachii</w:t>
+        <w:t>Button Hover Sfx by Fachii</w:t>
       </w:r>
       <w:bookmarkEnd w:id="59"/>
-      <w:proofErr w:type="spellEnd"/>
     </w:p>
     <w:p>
       <w:r>
@@ -11766,31 +11765,9 @@
         <w:rPr>
           <w:rStyle w:val="Heading3Char"/>
         </w:rPr>
-        <w:t xml:space="preserve">Button click </w:t>
-      </w:r>
-      <w:proofErr w:type="spellStart"/>
-      <w:r>
-        <w:rPr>
-          <w:rStyle w:val="Heading3Char"/>
-        </w:rPr>
-        <w:t>Sfx</w:t>
-      </w:r>
-      <w:proofErr w:type="spellEnd"/>
-      <w:r>
-        <w:rPr>
-          <w:rStyle w:val="Heading3Char"/>
-        </w:rPr>
-        <w:t xml:space="preserve"> by </w:t>
-      </w:r>
-      <w:proofErr w:type="spellStart"/>
-      <w:r>
-        <w:rPr>
-          <w:rStyle w:val="Heading3Char"/>
-        </w:rPr>
-        <w:t>AndrewEathan</w:t>
+        <w:t>Button click Sfx by AndrewEathan</w:t>
       </w:r>
       <w:bookmarkEnd w:id="60"/>
-      <w:proofErr w:type="spellEnd"/>
       <w:r>
         <w:t xml:space="preserve"> </w:t>
       </w:r>
@@ -11899,14 +11876,9 @@
       <w:bookmarkStart w:id="61" w:name="_Toc223965909"/>
       <w:r>
         <w:lastRenderedPageBreak/>
-        <w:t xml:space="preserve">Light Switch On </w:t>
-      </w:r>
-      <w:proofErr w:type="spellStart"/>
-      <w:r>
-        <w:t>Sfx</w:t>
+        <w:t>Light Switch On Sfx</w:t>
       </w:r>
       <w:bookmarkEnd w:id="61"/>
-      <w:proofErr w:type="spellEnd"/>
     </w:p>
     <w:p>
       <w:r>
@@ -11998,14 +11970,9 @@
       </w:pPr>
       <w:bookmarkStart w:id="62" w:name="_Toc223965910"/>
       <w:r>
-        <w:t xml:space="preserve">Light Switch Off </w:t>
-      </w:r>
-      <w:proofErr w:type="spellStart"/>
-      <w:r>
-        <w:t>Sfx</w:t>
+        <w:t>Light Switch Off Sfx</w:t>
       </w:r>
       <w:bookmarkEnd w:id="62"/>
-      <w:proofErr w:type="spellEnd"/>
     </w:p>
     <w:p>
       <w:r>

</xml_diff>

<commit_message>
Mapped out other areas of the thesis with notes, ready to move onto source control paragraph
</commit_message>
<xml_diff>
--- a/30077548Thesis.docx
+++ b/30077548Thesis.docx
@@ -6997,7 +6997,21 @@
         <w:rPr>
           <w:rFonts w:cs="Arial"/>
         </w:rPr>
-        <w:t>Clear on screen prompts to guide and support users that aren’t familiar with VR equipment</w:t>
+        <w:t xml:space="preserve">Clear </w:t>
+      </w:r>
+      <w:proofErr w:type="gramStart"/>
+      <w:r>
+        <w:rPr>
+          <w:rFonts w:cs="Arial"/>
+        </w:rPr>
+        <w:t>on screen</w:t>
+      </w:r>
+      <w:proofErr w:type="gramEnd"/>
+      <w:r>
+        <w:rPr>
+          <w:rFonts w:cs="Arial"/>
+        </w:rPr>
+        <w:t xml:space="preserve"> prompts to guide and support users that aren’t familiar with VR equipment</w:t>
       </w:r>
     </w:p>
     <w:p>
@@ -9653,7 +9667,15 @@
         <w:t>’s post processing component</w:t>
       </w:r>
       <w:r>
-        <w:t>. These effects were vignette to simulate eye fatigue, bloom for light sensitivity and blur for focus strain. Vignette and bloom post processing effects were triggered through adjusting their post processing variables within the camera post processing component. However, for blur a post processing material was required to create the radial blur. When objectives progressed triggering the simulation of symptoms, a timeline was used to progressively increase the value of an effect gradually over a duration. This decision was made to accommodate eyes adjusting to the changes of the camera as these effects were being triggered.</w:t>
+        <w:t xml:space="preserve">. These effects were </w:t>
+      </w:r>
+      <w:proofErr w:type="gramStart"/>
+      <w:r>
+        <w:t>vignette</w:t>
+      </w:r>
+      <w:proofErr w:type="gramEnd"/>
+      <w:r>
+        <w:t xml:space="preserve"> to simulate eye fatigue, bloom for light sensitivity and blur for focus strain. Vignette and bloom post processing effects were triggered through adjusting their post processing variables within the camera post processing component. However, for blur a post processing material was required to create the radial blur. When objectives progressed triggering the simulation of symptoms, a timeline was used to progressively increase the value of an effect gradually over a duration. This decision was made to accommodate eyes adjusting to the changes of the camera as these effects were being triggered.</w:t>
       </w:r>
       <w:r>
         <w:t xml:space="preserve"> The timeline was then used in reverse to revert the symptoms returning the camera view back to the original state it was in.</w:t>
@@ -10656,16 +10678,43 @@
       <w:bookmarkEnd w:id="46"/>
     </w:p>
     <w:p>
-      <w:pPr>
-        <w:rPr>
-          <w:rFonts w:asciiTheme="majorHAnsi" w:eastAsiaTheme="majorEastAsia" w:hAnsiTheme="majorHAnsi" w:cstheme="majorBidi"/>
-          <w:color w:val="0F4761" w:themeColor="accent1" w:themeShade="BF"/>
-          <w:sz w:val="40"/>
-          <w:szCs w:val="40"/>
-        </w:rPr>
-      </w:pPr>
       <w:r>
         <w:t>High word count for this, needs to be an in-depth evaluation, discuss in third person and cover all areas that help progress the project and other areas that dampened it such as outside life events etc.</w:t>
+      </w:r>
+      <w:r>
+        <w:br/>
+      </w:r>
+    </w:p>
+    <w:p>
+      <w:r>
+        <w:t>Project Evaluation</w:t>
+      </w:r>
+    </w:p>
+    <w:p/>
+    <w:p>
+      <w:r>
+        <w:t>Strengths</w:t>
+      </w:r>
+    </w:p>
+    <w:p/>
+    <w:p>
+      <w:r>
+        <w:t>Weaknesses</w:t>
+      </w:r>
+    </w:p>
+    <w:p/>
+    <w:p>
+      <w:r>
+        <w:t>Technical Challenges</w:t>
+      </w:r>
+    </w:p>
+    <w:p/>
+    <w:p>
+      <w:r>
+        <w:t>Limiting and External fact</w:t>
+      </w:r>
+      <w:r>
+        <w:t>ors</w:t>
       </w:r>
       <w:r>
         <w:br w:type="page"/>
@@ -10681,6 +10730,23 @@
         <w:t>Conclusions and Future Work</w:t>
       </w:r>
       <w:bookmarkEnd w:id="47"/>
+    </w:p>
+    <w:p>
+      <w:pPr>
+        <w:pStyle w:val="Heading2"/>
+      </w:pPr>
+      <w:r>
+        <w:t>Conclusion</w:t>
+      </w:r>
+    </w:p>
+    <w:p/>
+    <w:p>
+      <w:pPr>
+        <w:pStyle w:val="Heading2"/>
+      </w:pPr>
+      <w:r>
+        <w:t>Future Work</w:t>
+      </w:r>
     </w:p>
     <w:p>
       <w:pPr>
@@ -10717,6 +10783,42 @@
       <w:r>
         <w:t xml:space="preserve">Exploring accessibility settings for those with visual impairments or eye diseases that are still able to use the experience so that some of the symptoms displayed are not as harsh to them </w:t>
       </w:r>
+    </w:p>
+    <w:p>
+      <w:pPr>
+        <w:pStyle w:val="ListParagraph"/>
+        <w:numPr>
+          <w:ilvl w:val="0"/>
+          <w:numId w:val="11"/>
+        </w:numPr>
+      </w:pPr>
+      <w:r>
+        <w:t>Additional preventative measures</w:t>
+      </w:r>
+    </w:p>
+    <w:p>
+      <w:pPr>
+        <w:pStyle w:val="ListParagraph"/>
+        <w:numPr>
+          <w:ilvl w:val="0"/>
+          <w:numId w:val="11"/>
+        </w:numPr>
+      </w:pPr>
+      <w:r>
+        <w:t>Larger testing group</w:t>
+      </w:r>
+    </w:p>
+    <w:p>
+      <w:pPr>
+        <w:pStyle w:val="ListParagraph"/>
+        <w:numPr>
+          <w:ilvl w:val="0"/>
+          <w:numId w:val="11"/>
+        </w:numPr>
+      </w:pPr>
+      <w:r>
+        <w:t>Possibly adding eye tracking</w:t>
+      </w:r>
       <w:r>
         <w:br w:type="page"/>
       </w:r>
@@ -10749,7 +10851,15 @@
     </w:p>
     <w:p>
       <w:r>
-        <w:t xml:space="preserve">Chandrasekhara, R.S., Low, C., Lim, Y., Low, L., Mardina, F. and Nursaleha, M. (2013) ‘Computer vision syndrome: a study of knowledge and practices in university students’. </w:t>
+        <w:t xml:space="preserve">Chandrasekhara, R.S., Low, C., Lim, Y., Low, L., Mardina, F. and Nursaleha, M. (2013) ‘Computer vision syndrome: a study of knowledge and practices in university </w:t>
+      </w:r>
+      <w:proofErr w:type="gramStart"/>
+      <w:r>
+        <w:t>students’</w:t>
+      </w:r>
+      <w:proofErr w:type="gramEnd"/>
+      <w:r>
+        <w:t xml:space="preserve">. </w:t>
       </w:r>
       <w:r>
         <w:rPr>
@@ -10806,7 +10916,15 @@
     </w:p>
     <w:p>
       <w:r>
-        <w:t xml:space="preserve">Porcar, E., Pons, A. and Lorente, A. (2016) ‘Visual and ocular effects from the use of flat-panel displays’. </w:t>
+        <w:t xml:space="preserve">Porcar, E., Pons, A. and Lorente, A. (2016) ‘Visual and ocular effects from the use of flat-panel </w:t>
+      </w:r>
+      <w:proofErr w:type="gramStart"/>
+      <w:r>
+        <w:t>displays’</w:t>
+      </w:r>
+      <w:proofErr w:type="gramEnd"/>
+      <w:r>
+        <w:t xml:space="preserve">. </w:t>
       </w:r>
       <w:r>
         <w:rPr>
@@ -10821,7 +10939,15 @@
     </w:p>
     <w:p>
       <w:r>
-        <w:t xml:space="preserve">Santilli, T., Ceccacci, S., Mengoni, M. and Catia Giaconi (2025) ‘Virtual vs. traditional learning in higher education: A systematic review of comparative studies’. </w:t>
+        <w:t xml:space="preserve">Santilli, T., Ceccacci, S., Mengoni, M. and Catia Giaconi (2025) ‘Virtual vs. traditional learning in higher education: A systematic review of comparative </w:t>
+      </w:r>
+      <w:proofErr w:type="gramStart"/>
+      <w:r>
+        <w:t>studies’</w:t>
+      </w:r>
+      <w:proofErr w:type="gramEnd"/>
+      <w:r>
+        <w:t xml:space="preserve">. </w:t>
       </w:r>
       <w:r>
         <w:rPr>
@@ -11876,7 +12002,15 @@
       <w:bookmarkStart w:id="61" w:name="_Toc223965909"/>
       <w:r>
         <w:lastRenderedPageBreak/>
-        <w:t>Light Switch On Sfx</w:t>
+        <w:t xml:space="preserve">Light Switch </w:t>
+      </w:r>
+      <w:proofErr w:type="gramStart"/>
+      <w:r>
+        <w:t>On</w:t>
+      </w:r>
+      <w:proofErr w:type="gramEnd"/>
+      <w:r>
+        <w:t xml:space="preserve"> Sfx</w:t>
       </w:r>
       <w:bookmarkEnd w:id="61"/>
     </w:p>

</xml_diff>

<commit_message>
Update interactions parts in the testing and methodology areas
</commit_message>
<xml_diff>
--- a/30077548Thesis.docx
+++ b/30077548Thesis.docx
@@ -236,7 +236,7 @@
           <w:r>
             <w:fldChar w:fldCharType="separate"/>
           </w:r>
-          <w:hyperlink w:anchor="_Toc223965848" w:history="1">
+          <w:hyperlink w:anchor="_Toc223984310" w:history="1">
             <w:r>
               <w:rPr>
                 <w:rStyle w:val="Hyperlink"/>
@@ -263,7 +263,7 @@
                 <w:noProof/>
                 <w:webHidden/>
               </w:rPr>
-              <w:instrText xml:space="preserve"> PAGEREF _Toc223965848 \h </w:instrText>
+              <w:instrText xml:space="preserve"> PAGEREF _Toc223984310 \h </w:instrText>
             </w:r>
             <w:r>
               <w:rPr>
@@ -308,7 +308,7 @@
               <w:lang w:eastAsia="en-GB"/>
             </w:rPr>
           </w:pPr>
-          <w:hyperlink w:anchor="_Toc223965849" w:history="1">
+          <w:hyperlink w:anchor="_Toc223984311" w:history="1">
             <w:r>
               <w:rPr>
                 <w:rStyle w:val="Hyperlink"/>
@@ -335,7 +335,7 @@
                 <w:noProof/>
                 <w:webHidden/>
               </w:rPr>
-              <w:instrText xml:space="preserve"> PAGEREF _Toc223965849 \h </w:instrText>
+              <w:instrText xml:space="preserve"> PAGEREF _Toc223984311 \h </w:instrText>
             </w:r>
             <w:r>
               <w:rPr>
@@ -380,7 +380,7 @@
               <w:lang w:eastAsia="en-GB"/>
             </w:rPr>
           </w:pPr>
-          <w:hyperlink w:anchor="_Toc223965850" w:history="1">
+          <w:hyperlink w:anchor="_Toc223984312" w:history="1">
             <w:r>
               <w:rPr>
                 <w:rStyle w:val="Hyperlink"/>
@@ -407,7 +407,7 @@
                 <w:noProof/>
                 <w:webHidden/>
               </w:rPr>
-              <w:instrText xml:space="preserve"> PAGEREF _Toc223965850 \h </w:instrText>
+              <w:instrText xml:space="preserve"> PAGEREF _Toc223984312 \h </w:instrText>
             </w:r>
             <w:r>
               <w:rPr>
@@ -452,7 +452,7 @@
               <w:lang w:eastAsia="en-GB"/>
             </w:rPr>
           </w:pPr>
-          <w:hyperlink w:anchor="_Toc223965851" w:history="1">
+          <w:hyperlink w:anchor="_Toc223984313" w:history="1">
             <w:r>
               <w:rPr>
                 <w:rStyle w:val="Hyperlink"/>
@@ -479,7 +479,7 @@
                 <w:noProof/>
                 <w:webHidden/>
               </w:rPr>
-              <w:instrText xml:space="preserve"> PAGEREF _Toc223965851 \h </w:instrText>
+              <w:instrText xml:space="preserve"> PAGEREF _Toc223984313 \h </w:instrText>
             </w:r>
             <w:r>
               <w:rPr>
@@ -524,7 +524,7 @@
               <w:lang w:eastAsia="en-GB"/>
             </w:rPr>
           </w:pPr>
-          <w:hyperlink w:anchor="_Toc223965852" w:history="1">
+          <w:hyperlink w:anchor="_Toc223984314" w:history="1">
             <w:r>
               <w:rPr>
                 <w:rStyle w:val="Hyperlink"/>
@@ -551,7 +551,7 @@
                 <w:noProof/>
                 <w:webHidden/>
               </w:rPr>
-              <w:instrText xml:space="preserve"> PAGEREF _Toc223965852 \h </w:instrText>
+              <w:instrText xml:space="preserve"> PAGEREF _Toc223984314 \h </w:instrText>
             </w:r>
             <w:r>
               <w:rPr>
@@ -596,7 +596,7 @@
               <w:lang w:eastAsia="en-GB"/>
             </w:rPr>
           </w:pPr>
-          <w:hyperlink w:anchor="_Toc223965853" w:history="1">
+          <w:hyperlink w:anchor="_Toc223984315" w:history="1">
             <w:r>
               <w:rPr>
                 <w:rStyle w:val="Hyperlink"/>
@@ -623,7 +623,7 @@
                 <w:noProof/>
                 <w:webHidden/>
               </w:rPr>
-              <w:instrText xml:space="preserve"> PAGEREF _Toc223965853 \h </w:instrText>
+              <w:instrText xml:space="preserve"> PAGEREF _Toc223984315 \h </w:instrText>
             </w:r>
             <w:r>
               <w:rPr>
@@ -668,7 +668,7 @@
               <w:lang w:eastAsia="en-GB"/>
             </w:rPr>
           </w:pPr>
-          <w:hyperlink w:anchor="_Toc223965854" w:history="1">
+          <w:hyperlink w:anchor="_Toc223984316" w:history="1">
             <w:r>
               <w:rPr>
                 <w:rStyle w:val="Hyperlink"/>
@@ -695,7 +695,7 @@
                 <w:noProof/>
                 <w:webHidden/>
               </w:rPr>
-              <w:instrText xml:space="preserve"> PAGEREF _Toc223965854 \h </w:instrText>
+              <w:instrText xml:space="preserve"> PAGEREF _Toc223984316 \h </w:instrText>
             </w:r>
             <w:r>
               <w:rPr>
@@ -740,7 +740,7 @@
               <w:lang w:eastAsia="en-GB"/>
             </w:rPr>
           </w:pPr>
-          <w:hyperlink w:anchor="_Toc223965855" w:history="1">
+          <w:hyperlink w:anchor="_Toc223984317" w:history="1">
             <w:r>
               <w:rPr>
                 <w:rStyle w:val="Hyperlink"/>
@@ -767,7 +767,7 @@
                 <w:noProof/>
                 <w:webHidden/>
               </w:rPr>
-              <w:instrText xml:space="preserve"> PAGEREF _Toc223965855 \h </w:instrText>
+              <w:instrText xml:space="preserve"> PAGEREF _Toc223984317 \h </w:instrText>
             </w:r>
             <w:r>
               <w:rPr>
@@ -812,7 +812,7 @@
               <w:lang w:eastAsia="en-GB"/>
             </w:rPr>
           </w:pPr>
-          <w:hyperlink w:anchor="_Toc223965856" w:history="1">
+          <w:hyperlink w:anchor="_Toc223984318" w:history="1">
             <w:r>
               <w:rPr>
                 <w:rStyle w:val="Hyperlink"/>
@@ -839,7 +839,7 @@
                 <w:noProof/>
                 <w:webHidden/>
               </w:rPr>
-              <w:instrText xml:space="preserve"> PAGEREF _Toc223965856 \h </w:instrText>
+              <w:instrText xml:space="preserve"> PAGEREF _Toc223984318 \h </w:instrText>
             </w:r>
             <w:r>
               <w:rPr>
@@ -884,7 +884,7 @@
               <w:lang w:eastAsia="en-GB"/>
             </w:rPr>
           </w:pPr>
-          <w:hyperlink w:anchor="_Toc223965857" w:history="1">
+          <w:hyperlink w:anchor="_Toc223984319" w:history="1">
             <w:r>
               <w:rPr>
                 <w:rStyle w:val="Hyperlink"/>
@@ -911,7 +911,7 @@
                 <w:noProof/>
                 <w:webHidden/>
               </w:rPr>
-              <w:instrText xml:space="preserve"> PAGEREF _Toc223965857 \h </w:instrText>
+              <w:instrText xml:space="preserve"> PAGEREF _Toc223984319 \h </w:instrText>
             </w:r>
             <w:r>
               <w:rPr>
@@ -956,7 +956,7 @@
               <w:lang w:eastAsia="en-GB"/>
             </w:rPr>
           </w:pPr>
-          <w:hyperlink w:anchor="_Toc223965858" w:history="1">
+          <w:hyperlink w:anchor="_Toc223984320" w:history="1">
             <w:r>
               <w:rPr>
                 <w:rStyle w:val="Hyperlink"/>
@@ -983,7 +983,7 @@
                 <w:noProof/>
                 <w:webHidden/>
               </w:rPr>
-              <w:instrText xml:space="preserve"> PAGEREF _Toc223965858 \h </w:instrText>
+              <w:instrText xml:space="preserve"> PAGEREF _Toc223984320 \h </w:instrText>
             </w:r>
             <w:r>
               <w:rPr>
@@ -1028,7 +1028,7 @@
               <w:lang w:eastAsia="en-GB"/>
             </w:rPr>
           </w:pPr>
-          <w:hyperlink w:anchor="_Toc223965859" w:history="1">
+          <w:hyperlink w:anchor="_Toc223984321" w:history="1">
             <w:r>
               <w:rPr>
                 <w:rStyle w:val="Hyperlink"/>
@@ -1055,7 +1055,7 @@
                 <w:noProof/>
                 <w:webHidden/>
               </w:rPr>
-              <w:instrText xml:space="preserve"> PAGEREF _Toc223965859 \h </w:instrText>
+              <w:instrText xml:space="preserve"> PAGEREF _Toc223984321 \h </w:instrText>
             </w:r>
             <w:r>
               <w:rPr>
@@ -1100,7 +1100,7 @@
               <w:lang w:eastAsia="en-GB"/>
             </w:rPr>
           </w:pPr>
-          <w:hyperlink w:anchor="_Toc223965860" w:history="1">
+          <w:hyperlink w:anchor="_Toc223984322" w:history="1">
             <w:r>
               <w:rPr>
                 <w:rStyle w:val="Hyperlink"/>
@@ -1127,7 +1127,7 @@
                 <w:noProof/>
                 <w:webHidden/>
               </w:rPr>
-              <w:instrText xml:space="preserve"> PAGEREF _Toc223965860 \h </w:instrText>
+              <w:instrText xml:space="preserve"> PAGEREF _Toc223984322 \h </w:instrText>
             </w:r>
             <w:r>
               <w:rPr>
@@ -1172,7 +1172,7 @@
               <w:lang w:eastAsia="en-GB"/>
             </w:rPr>
           </w:pPr>
-          <w:hyperlink w:anchor="_Toc223965861" w:history="1">
+          <w:hyperlink w:anchor="_Toc223984323" w:history="1">
             <w:r>
               <w:rPr>
                 <w:rStyle w:val="Hyperlink"/>
@@ -1199,7 +1199,7 @@
                 <w:noProof/>
                 <w:webHidden/>
               </w:rPr>
-              <w:instrText xml:space="preserve"> PAGEREF _Toc223965861 \h </w:instrText>
+              <w:instrText xml:space="preserve"> PAGEREF _Toc223984323 \h </w:instrText>
             </w:r>
             <w:r>
               <w:rPr>
@@ -1244,7 +1244,7 @@
               <w:lang w:eastAsia="en-GB"/>
             </w:rPr>
           </w:pPr>
-          <w:hyperlink w:anchor="_Toc223965862" w:history="1">
+          <w:hyperlink w:anchor="_Toc223984324" w:history="1">
             <w:r>
               <w:rPr>
                 <w:rStyle w:val="Hyperlink"/>
@@ -1271,7 +1271,7 @@
                 <w:noProof/>
                 <w:webHidden/>
               </w:rPr>
-              <w:instrText xml:space="preserve"> PAGEREF _Toc223965862 \h </w:instrText>
+              <w:instrText xml:space="preserve"> PAGEREF _Toc223984324 \h </w:instrText>
             </w:r>
             <w:r>
               <w:rPr>
@@ -1316,7 +1316,7 @@
               <w:lang w:eastAsia="en-GB"/>
             </w:rPr>
           </w:pPr>
-          <w:hyperlink w:anchor="_Toc223965863" w:history="1">
+          <w:hyperlink w:anchor="_Toc223984325" w:history="1">
             <w:r>
               <w:rPr>
                 <w:rStyle w:val="Hyperlink"/>
@@ -1343,7 +1343,7 @@
                 <w:noProof/>
                 <w:webHidden/>
               </w:rPr>
-              <w:instrText xml:space="preserve"> PAGEREF _Toc223965863 \h </w:instrText>
+              <w:instrText xml:space="preserve"> PAGEREF _Toc223984325 \h </w:instrText>
             </w:r>
             <w:r>
               <w:rPr>
@@ -1388,7 +1388,7 @@
               <w:lang w:eastAsia="en-GB"/>
             </w:rPr>
           </w:pPr>
-          <w:hyperlink w:anchor="_Toc223965864" w:history="1">
+          <w:hyperlink w:anchor="_Toc223984326" w:history="1">
             <w:r>
               <w:rPr>
                 <w:rStyle w:val="Hyperlink"/>
@@ -1415,7 +1415,7 @@
                 <w:noProof/>
                 <w:webHidden/>
               </w:rPr>
-              <w:instrText xml:space="preserve"> PAGEREF _Toc223965864 \h </w:instrText>
+              <w:instrText xml:space="preserve"> PAGEREF _Toc223984326 \h </w:instrText>
             </w:r>
             <w:r>
               <w:rPr>
@@ -1460,7 +1460,7 @@
               <w:lang w:eastAsia="en-GB"/>
             </w:rPr>
           </w:pPr>
-          <w:hyperlink w:anchor="_Toc223965865" w:history="1">
+          <w:hyperlink w:anchor="_Toc223984327" w:history="1">
             <w:r>
               <w:rPr>
                 <w:rStyle w:val="Hyperlink"/>
@@ -1487,7 +1487,7 @@
                 <w:noProof/>
                 <w:webHidden/>
               </w:rPr>
-              <w:instrText xml:space="preserve"> PAGEREF _Toc223965865 \h </w:instrText>
+              <w:instrText xml:space="preserve"> PAGEREF _Toc223984327 \h </w:instrText>
             </w:r>
             <w:r>
               <w:rPr>
@@ -1532,7 +1532,7 @@
               <w:lang w:eastAsia="en-GB"/>
             </w:rPr>
           </w:pPr>
-          <w:hyperlink w:anchor="_Toc223965866" w:history="1">
+          <w:hyperlink w:anchor="_Toc223984328" w:history="1">
             <w:r>
               <w:rPr>
                 <w:rStyle w:val="Hyperlink"/>
@@ -1559,7 +1559,7 @@
                 <w:noProof/>
                 <w:webHidden/>
               </w:rPr>
-              <w:instrText xml:space="preserve"> PAGEREF _Toc223965866 \h </w:instrText>
+              <w:instrText xml:space="preserve"> PAGEREF _Toc223984328 \h </w:instrText>
             </w:r>
             <w:r>
               <w:rPr>
@@ -1604,7 +1604,7 @@
               <w:lang w:eastAsia="en-GB"/>
             </w:rPr>
           </w:pPr>
-          <w:hyperlink w:anchor="_Toc223965867" w:history="1">
+          <w:hyperlink w:anchor="_Toc223984329" w:history="1">
             <w:r>
               <w:rPr>
                 <w:rStyle w:val="Hyperlink"/>
@@ -1631,7 +1631,7 @@
                 <w:noProof/>
                 <w:webHidden/>
               </w:rPr>
-              <w:instrText xml:space="preserve"> PAGEREF _Toc223965867 \h </w:instrText>
+              <w:instrText xml:space="preserve"> PAGEREF _Toc223984329 \h </w:instrText>
             </w:r>
             <w:r>
               <w:rPr>
@@ -1676,7 +1676,7 @@
               <w:lang w:eastAsia="en-GB"/>
             </w:rPr>
           </w:pPr>
-          <w:hyperlink w:anchor="_Toc223965868" w:history="1">
+          <w:hyperlink w:anchor="_Toc223984330" w:history="1">
             <w:r>
               <w:rPr>
                 <w:rStyle w:val="Hyperlink"/>
@@ -1703,7 +1703,7 @@
                 <w:noProof/>
                 <w:webHidden/>
               </w:rPr>
-              <w:instrText xml:space="preserve"> PAGEREF _Toc223965868 \h </w:instrText>
+              <w:instrText xml:space="preserve"> PAGEREF _Toc223984330 \h </w:instrText>
             </w:r>
             <w:r>
               <w:rPr>
@@ -1748,7 +1748,7 @@
               <w:lang w:eastAsia="en-GB"/>
             </w:rPr>
           </w:pPr>
-          <w:hyperlink w:anchor="_Toc223965869" w:history="1">
+          <w:hyperlink w:anchor="_Toc223984331" w:history="1">
             <w:r>
               <w:rPr>
                 <w:rStyle w:val="Hyperlink"/>
@@ -1775,7 +1775,7 @@
                 <w:noProof/>
                 <w:webHidden/>
               </w:rPr>
-              <w:instrText xml:space="preserve"> PAGEREF _Toc223965869 \h </w:instrText>
+              <w:instrText xml:space="preserve"> PAGEREF _Toc223984331 \h </w:instrText>
             </w:r>
             <w:r>
               <w:rPr>
@@ -1820,7 +1820,7 @@
               <w:lang w:eastAsia="en-GB"/>
             </w:rPr>
           </w:pPr>
-          <w:hyperlink w:anchor="_Toc223965870" w:history="1">
+          <w:hyperlink w:anchor="_Toc223984332" w:history="1">
             <w:r>
               <w:rPr>
                 <w:rStyle w:val="Hyperlink"/>
@@ -1847,7 +1847,7 @@
                 <w:noProof/>
                 <w:webHidden/>
               </w:rPr>
-              <w:instrText xml:space="preserve"> PAGEREF _Toc223965870 \h </w:instrText>
+              <w:instrText xml:space="preserve"> PAGEREF _Toc223984332 \h </w:instrText>
             </w:r>
             <w:r>
               <w:rPr>
@@ -1892,7 +1892,7 @@
               <w:lang w:eastAsia="en-GB"/>
             </w:rPr>
           </w:pPr>
-          <w:hyperlink w:anchor="_Toc223965871" w:history="1">
+          <w:hyperlink w:anchor="_Toc223984333" w:history="1">
             <w:r>
               <w:rPr>
                 <w:rStyle w:val="Hyperlink"/>
@@ -1919,7 +1919,7 @@
                 <w:noProof/>
                 <w:webHidden/>
               </w:rPr>
-              <w:instrText xml:space="preserve"> PAGEREF _Toc223965871 \h </w:instrText>
+              <w:instrText xml:space="preserve"> PAGEREF _Toc223984333 \h </w:instrText>
             </w:r>
             <w:r>
               <w:rPr>
@@ -1964,7 +1964,7 @@
               <w:lang w:eastAsia="en-GB"/>
             </w:rPr>
           </w:pPr>
-          <w:hyperlink w:anchor="_Toc223965872" w:history="1">
+          <w:hyperlink w:anchor="_Toc223984334" w:history="1">
             <w:r>
               <w:rPr>
                 <w:rStyle w:val="Hyperlink"/>
@@ -1991,7 +1991,7 @@
                 <w:noProof/>
                 <w:webHidden/>
               </w:rPr>
-              <w:instrText xml:space="preserve"> PAGEREF _Toc223965872 \h </w:instrText>
+              <w:instrText xml:space="preserve"> PAGEREF _Toc223984334 \h </w:instrText>
             </w:r>
             <w:r>
               <w:rPr>
@@ -2036,7 +2036,7 @@
               <w:lang w:eastAsia="en-GB"/>
             </w:rPr>
           </w:pPr>
-          <w:hyperlink w:anchor="_Toc223965873" w:history="1">
+          <w:hyperlink w:anchor="_Toc223984335" w:history="1">
             <w:r>
               <w:rPr>
                 <w:rStyle w:val="Hyperlink"/>
@@ -2063,7 +2063,7 @@
                 <w:noProof/>
                 <w:webHidden/>
               </w:rPr>
-              <w:instrText xml:space="preserve"> PAGEREF _Toc223965873 \h </w:instrText>
+              <w:instrText xml:space="preserve"> PAGEREF _Toc223984335 \h </w:instrText>
             </w:r>
             <w:r>
               <w:rPr>
@@ -2108,7 +2108,7 @@
               <w:lang w:eastAsia="en-GB"/>
             </w:rPr>
           </w:pPr>
-          <w:hyperlink w:anchor="_Toc223965874" w:history="1">
+          <w:hyperlink w:anchor="_Toc223984336" w:history="1">
             <w:r>
               <w:rPr>
                 <w:rStyle w:val="Hyperlink"/>
@@ -2135,7 +2135,7 @@
                 <w:noProof/>
                 <w:webHidden/>
               </w:rPr>
-              <w:instrText xml:space="preserve"> PAGEREF _Toc223965874 \h </w:instrText>
+              <w:instrText xml:space="preserve"> PAGEREF _Toc223984336 \h </w:instrText>
             </w:r>
             <w:r>
               <w:rPr>
@@ -2180,7 +2180,7 @@
               <w:lang w:eastAsia="en-GB"/>
             </w:rPr>
           </w:pPr>
-          <w:hyperlink w:anchor="_Toc223965875" w:history="1">
+          <w:hyperlink w:anchor="_Toc223984337" w:history="1">
             <w:r>
               <w:rPr>
                 <w:rStyle w:val="Hyperlink"/>
@@ -2207,7 +2207,7 @@
                 <w:noProof/>
                 <w:webHidden/>
               </w:rPr>
-              <w:instrText xml:space="preserve"> PAGEREF _Toc223965875 \h </w:instrText>
+              <w:instrText xml:space="preserve"> PAGEREF _Toc223984337 \h </w:instrText>
             </w:r>
             <w:r>
               <w:rPr>
@@ -2252,7 +2252,7 @@
               <w:lang w:eastAsia="en-GB"/>
             </w:rPr>
           </w:pPr>
-          <w:hyperlink w:anchor="_Toc223965876" w:history="1">
+          <w:hyperlink w:anchor="_Toc223984338" w:history="1">
             <w:r>
               <w:rPr>
                 <w:rStyle w:val="Hyperlink"/>
@@ -2279,7 +2279,7 @@
                 <w:noProof/>
                 <w:webHidden/>
               </w:rPr>
-              <w:instrText xml:space="preserve"> PAGEREF _Toc223965876 \h </w:instrText>
+              <w:instrText xml:space="preserve"> PAGEREF _Toc223984338 \h </w:instrText>
             </w:r>
             <w:r>
               <w:rPr>
@@ -2324,7 +2324,7 @@
               <w:lang w:eastAsia="en-GB"/>
             </w:rPr>
           </w:pPr>
-          <w:hyperlink w:anchor="_Toc223965877" w:history="1">
+          <w:hyperlink w:anchor="_Toc223984339" w:history="1">
             <w:r>
               <w:rPr>
                 <w:rStyle w:val="Hyperlink"/>
@@ -2351,7 +2351,7 @@
                 <w:noProof/>
                 <w:webHidden/>
               </w:rPr>
-              <w:instrText xml:space="preserve"> PAGEREF _Toc223965877 \h </w:instrText>
+              <w:instrText xml:space="preserve"> PAGEREF _Toc223984339 \h </w:instrText>
             </w:r>
             <w:r>
               <w:rPr>
@@ -2396,7 +2396,7 @@
               <w:lang w:eastAsia="en-GB"/>
             </w:rPr>
           </w:pPr>
-          <w:hyperlink w:anchor="_Toc223965878" w:history="1">
+          <w:hyperlink w:anchor="_Toc223984340" w:history="1">
             <w:r>
               <w:rPr>
                 <w:rStyle w:val="Hyperlink"/>
@@ -2423,7 +2423,7 @@
                 <w:noProof/>
                 <w:webHidden/>
               </w:rPr>
-              <w:instrText xml:space="preserve"> PAGEREF _Toc223965878 \h </w:instrText>
+              <w:instrText xml:space="preserve"> PAGEREF _Toc223984340 \h </w:instrText>
             </w:r>
             <w:r>
               <w:rPr>
@@ -2468,7 +2468,7 @@
               <w:lang w:eastAsia="en-GB"/>
             </w:rPr>
           </w:pPr>
-          <w:hyperlink w:anchor="_Toc223965879" w:history="1">
+          <w:hyperlink w:anchor="_Toc223984341" w:history="1">
             <w:r>
               <w:rPr>
                 <w:rStyle w:val="Hyperlink"/>
@@ -2495,7 +2495,7 @@
                 <w:noProof/>
                 <w:webHidden/>
               </w:rPr>
-              <w:instrText xml:space="preserve"> PAGEREF _Toc223965879 \h </w:instrText>
+              <w:instrText xml:space="preserve"> PAGEREF _Toc223984341 \h </w:instrText>
             </w:r>
             <w:r>
               <w:rPr>
@@ -2540,7 +2540,7 @@
               <w:lang w:eastAsia="en-GB"/>
             </w:rPr>
           </w:pPr>
-          <w:hyperlink w:anchor="_Toc223965880" w:history="1">
+          <w:hyperlink w:anchor="_Toc223984342" w:history="1">
             <w:r>
               <w:rPr>
                 <w:rStyle w:val="Hyperlink"/>
@@ -2567,7 +2567,7 @@
                 <w:noProof/>
                 <w:webHidden/>
               </w:rPr>
-              <w:instrText xml:space="preserve"> PAGEREF _Toc223965880 \h </w:instrText>
+              <w:instrText xml:space="preserve"> PAGEREF _Toc223984342 \h </w:instrText>
             </w:r>
             <w:r>
               <w:rPr>
@@ -2612,13 +2612,13 @@
               <w:lang w:eastAsia="en-GB"/>
             </w:rPr>
           </w:pPr>
-          <w:hyperlink w:anchor="_Toc223965881" w:history="1">
+          <w:hyperlink w:anchor="_Toc223984343" w:history="1">
             <w:r>
               <w:rPr>
                 <w:rStyle w:val="Hyperlink"/>
                 <w:noProof/>
               </w:rPr>
-              <w:t>Interaction Improvements</w:t>
+              <w:t>Environment Changes and Visual Modifications</w:t>
             </w:r>
             <w:r>
               <w:rPr>
@@ -2639,7 +2639,7 @@
                 <w:noProof/>
                 <w:webHidden/>
               </w:rPr>
-              <w:instrText xml:space="preserve"> PAGEREF _Toc223965881 \h </w:instrText>
+              <w:instrText xml:space="preserve"> PAGEREF _Toc223984343 \h </w:instrText>
             </w:r>
             <w:r>
               <w:rPr>
@@ -2684,13 +2684,13 @@
               <w:lang w:eastAsia="en-GB"/>
             </w:rPr>
           </w:pPr>
-          <w:hyperlink w:anchor="_Toc223965882" w:history="1">
+          <w:hyperlink w:anchor="_Toc223984344" w:history="1">
             <w:r>
               <w:rPr>
                 <w:rStyle w:val="Hyperlink"/>
                 <w:noProof/>
               </w:rPr>
-              <w:t>Flow Tweaks</w:t>
+              <w:t>Interaction Improvements</w:t>
             </w:r>
             <w:r>
               <w:rPr>
@@ -2711,7 +2711,7 @@
                 <w:noProof/>
                 <w:webHidden/>
               </w:rPr>
-              <w:instrText xml:space="preserve"> PAGEREF _Toc223965882 \h </w:instrText>
+              <w:instrText xml:space="preserve"> PAGEREF _Toc223984344 \h </w:instrText>
             </w:r>
             <w:r>
               <w:rPr>
@@ -2756,12 +2756,84 @@
               <w:lang w:eastAsia="en-GB"/>
             </w:rPr>
           </w:pPr>
-          <w:hyperlink w:anchor="_Toc223965883" w:history="1">
+          <w:hyperlink w:anchor="_Toc223984345" w:history="1">
             <w:r>
               <w:rPr>
                 <w:rStyle w:val="Hyperlink"/>
                 <w:noProof/>
               </w:rPr>
+              <w:t>Flow Tweaks</w:t>
+            </w:r>
+            <w:r>
+              <w:rPr>
+                <w:noProof/>
+                <w:webHidden/>
+              </w:rPr>
+              <w:tab/>
+            </w:r>
+            <w:r>
+              <w:rPr>
+                <w:noProof/>
+                <w:webHidden/>
+              </w:rPr>
+              <w:fldChar w:fldCharType="begin"/>
+            </w:r>
+            <w:r>
+              <w:rPr>
+                <w:noProof/>
+                <w:webHidden/>
+              </w:rPr>
+              <w:instrText xml:space="preserve"> PAGEREF _Toc223984345 \h </w:instrText>
+            </w:r>
+            <w:r>
+              <w:rPr>
+                <w:noProof/>
+                <w:webHidden/>
+              </w:rPr>
+            </w:r>
+            <w:r>
+              <w:rPr>
+                <w:noProof/>
+                <w:webHidden/>
+              </w:rPr>
+              <w:fldChar w:fldCharType="separate"/>
+            </w:r>
+            <w:r>
+              <w:rPr>
+                <w:noProof/>
+                <w:webHidden/>
+              </w:rPr>
+              <w:t>20</w:t>
+            </w:r>
+            <w:r>
+              <w:rPr>
+                <w:noProof/>
+                <w:webHidden/>
+              </w:rPr>
+              <w:fldChar w:fldCharType="end"/>
+            </w:r>
+          </w:hyperlink>
+        </w:p>
+        <w:p>
+          <w:pPr>
+            <w:pStyle w:val="TOC3"/>
+            <w:tabs>
+              <w:tab w:val="right" w:leader="dot" w:pos="9016"/>
+            </w:tabs>
+            <w:rPr>
+              <w:rFonts w:eastAsiaTheme="minorEastAsia"/>
+              <w:noProof/>
+              <w:sz w:val="24"/>
+              <w:szCs w:val="24"/>
+              <w:lang w:eastAsia="en-GB"/>
+            </w:rPr>
+          </w:pPr>
+          <w:hyperlink w:anchor="_Toc223984346" w:history="1">
+            <w:r>
+              <w:rPr>
+                <w:rStyle w:val="Hyperlink"/>
+                <w:noProof/>
+              </w:rPr>
               <w:t>Gaze Detection Refinements</w:t>
             </w:r>
             <w:r>
@@ -2783,7 +2855,7 @@
                 <w:noProof/>
                 <w:webHidden/>
               </w:rPr>
-              <w:instrText xml:space="preserve"> PAGEREF _Toc223965883 \h </w:instrText>
+              <w:instrText xml:space="preserve"> PAGEREF _Toc223984346 \h </w:instrText>
             </w:r>
             <w:r>
               <w:rPr>
@@ -2828,7 +2900,7 @@
               <w:lang w:eastAsia="en-GB"/>
             </w:rPr>
           </w:pPr>
-          <w:hyperlink w:anchor="_Toc223965884" w:history="1">
+          <w:hyperlink w:anchor="_Toc223984347" w:history="1">
             <w:r>
               <w:rPr>
                 <w:rStyle w:val="Hyperlink"/>
@@ -2855,7 +2927,7 @@
                 <w:noProof/>
                 <w:webHidden/>
               </w:rPr>
-              <w:instrText xml:space="preserve"> PAGEREF _Toc223965884 \h </w:instrText>
+              <w:instrText xml:space="preserve"> PAGEREF _Toc223984347 \h </w:instrText>
             </w:r>
             <w:r>
               <w:rPr>
@@ -2900,7 +2972,7 @@
               <w:lang w:eastAsia="en-GB"/>
             </w:rPr>
           </w:pPr>
-          <w:hyperlink w:anchor="_Toc223965885" w:history="1">
+          <w:hyperlink w:anchor="_Toc223984348" w:history="1">
             <w:r>
               <w:rPr>
                 <w:rStyle w:val="Hyperlink"/>
@@ -2927,7 +2999,7 @@
                 <w:noProof/>
                 <w:webHidden/>
               </w:rPr>
-              <w:instrText xml:space="preserve"> PAGEREF _Toc223965885 \h </w:instrText>
+              <w:instrText xml:space="preserve"> PAGEREF _Toc223984348 \h </w:instrText>
             </w:r>
             <w:r>
               <w:rPr>
@@ -2972,7 +3044,7 @@
               <w:lang w:eastAsia="en-GB"/>
             </w:rPr>
           </w:pPr>
-          <w:hyperlink w:anchor="_Toc223965886" w:history="1">
+          <w:hyperlink w:anchor="_Toc223984349" w:history="1">
             <w:r>
               <w:rPr>
                 <w:rStyle w:val="Hyperlink"/>
@@ -2999,7 +3071,7 @@
                 <w:noProof/>
                 <w:webHidden/>
               </w:rPr>
-              <w:instrText xml:space="preserve"> PAGEREF _Toc223965886 \h </w:instrText>
+              <w:instrText xml:space="preserve"> PAGEREF _Toc223984349 \h </w:instrText>
             </w:r>
             <w:r>
               <w:rPr>
@@ -3044,7 +3116,7 @@
               <w:lang w:eastAsia="en-GB"/>
             </w:rPr>
           </w:pPr>
-          <w:hyperlink w:anchor="_Toc223965887" w:history="1">
+          <w:hyperlink w:anchor="_Toc223984350" w:history="1">
             <w:r>
               <w:rPr>
                 <w:rStyle w:val="Hyperlink"/>
@@ -3071,7 +3143,7 @@
                 <w:noProof/>
                 <w:webHidden/>
               </w:rPr>
-              <w:instrText xml:space="preserve"> PAGEREF _Toc223965887 \h </w:instrText>
+              <w:instrText xml:space="preserve"> PAGEREF _Toc223984350 \h </w:instrText>
             </w:r>
             <w:r>
               <w:rPr>
@@ -3116,7 +3188,7 @@
               <w:lang w:eastAsia="en-GB"/>
             </w:rPr>
           </w:pPr>
-          <w:hyperlink w:anchor="_Toc223965888" w:history="1">
+          <w:hyperlink w:anchor="_Toc223984351" w:history="1">
             <w:r>
               <w:rPr>
                 <w:rStyle w:val="Hyperlink"/>
@@ -3143,7 +3215,7 @@
                 <w:noProof/>
                 <w:webHidden/>
               </w:rPr>
-              <w:instrText xml:space="preserve"> PAGEREF _Toc223965888 \h </w:instrText>
+              <w:instrText xml:space="preserve"> PAGEREF _Toc223984351 \h </w:instrText>
             </w:r>
             <w:r>
               <w:rPr>
@@ -3188,7 +3260,7 @@
               <w:lang w:eastAsia="en-GB"/>
             </w:rPr>
           </w:pPr>
-          <w:hyperlink w:anchor="_Toc223965889" w:history="1">
+          <w:hyperlink w:anchor="_Toc223984352" w:history="1">
             <w:r>
               <w:rPr>
                 <w:rStyle w:val="Hyperlink"/>
@@ -3215,7 +3287,7 @@
                 <w:noProof/>
                 <w:webHidden/>
               </w:rPr>
-              <w:instrText xml:space="preserve"> PAGEREF _Toc223965889 \h </w:instrText>
+              <w:instrText xml:space="preserve"> PAGEREF _Toc223984352 \h </w:instrText>
             </w:r>
             <w:r>
               <w:rPr>
@@ -3236,6 +3308,78 @@
                 <w:webHidden/>
               </w:rPr>
               <w:t>22</w:t>
+            </w:r>
+            <w:r>
+              <w:rPr>
+                <w:noProof/>
+                <w:webHidden/>
+              </w:rPr>
+              <w:fldChar w:fldCharType="end"/>
+            </w:r>
+          </w:hyperlink>
+        </w:p>
+        <w:p>
+          <w:pPr>
+            <w:pStyle w:val="TOC2"/>
+            <w:tabs>
+              <w:tab w:val="right" w:leader="dot" w:pos="9016"/>
+            </w:tabs>
+            <w:rPr>
+              <w:rFonts w:eastAsiaTheme="minorEastAsia"/>
+              <w:noProof/>
+              <w:sz w:val="24"/>
+              <w:szCs w:val="24"/>
+              <w:lang w:eastAsia="en-GB"/>
+            </w:rPr>
+          </w:pPr>
+          <w:hyperlink w:anchor="_Toc223984353" w:history="1">
+            <w:r>
+              <w:rPr>
+                <w:rStyle w:val="Hyperlink"/>
+                <w:noProof/>
+              </w:rPr>
+              <w:t>Final Version Tests</w:t>
+            </w:r>
+            <w:r>
+              <w:rPr>
+                <w:noProof/>
+                <w:webHidden/>
+              </w:rPr>
+              <w:tab/>
+            </w:r>
+            <w:r>
+              <w:rPr>
+                <w:noProof/>
+                <w:webHidden/>
+              </w:rPr>
+              <w:fldChar w:fldCharType="begin"/>
+            </w:r>
+            <w:r>
+              <w:rPr>
+                <w:noProof/>
+                <w:webHidden/>
+              </w:rPr>
+              <w:instrText xml:space="preserve"> PAGEREF _Toc223984353 \h </w:instrText>
+            </w:r>
+            <w:r>
+              <w:rPr>
+                <w:noProof/>
+                <w:webHidden/>
+              </w:rPr>
+            </w:r>
+            <w:r>
+              <w:rPr>
+                <w:noProof/>
+                <w:webHidden/>
+              </w:rPr>
+              <w:fldChar w:fldCharType="separate"/>
+            </w:r>
+            <w:r>
+              <w:rPr>
+                <w:noProof/>
+                <w:webHidden/>
+              </w:rPr>
+              <w:t>23</w:t>
             </w:r>
             <w:r>
               <w:rPr>
@@ -3260,13 +3404,13 @@
               <w:lang w:eastAsia="en-GB"/>
             </w:rPr>
           </w:pPr>
-          <w:hyperlink w:anchor="_Toc223965890" w:history="1">
+          <w:hyperlink w:anchor="_Toc223984354" w:history="1">
             <w:r>
               <w:rPr>
                 <w:rStyle w:val="Hyperlink"/>
                 <w:noProof/>
               </w:rPr>
-              <w:t>Final Version Tests</w:t>
+              <w:t>Interaction Objects and Objective Understanding</w:t>
             </w:r>
             <w:r>
               <w:rPr>
@@ -3287,7 +3431,7 @@
                 <w:noProof/>
                 <w:webHidden/>
               </w:rPr>
-              <w:instrText xml:space="preserve"> PAGEREF _Toc223965890 \h </w:instrText>
+              <w:instrText xml:space="preserve"> PAGEREF _Toc223984354 \h </w:instrText>
             </w:r>
             <w:r>
               <w:rPr>
@@ -3332,13 +3476,13 @@
               <w:lang w:eastAsia="en-GB"/>
             </w:rPr>
           </w:pPr>
-          <w:hyperlink w:anchor="_Toc223965891" w:history="1">
+          <w:hyperlink w:anchor="_Toc223984355" w:history="1">
             <w:r>
               <w:rPr>
                 <w:rStyle w:val="Hyperlink"/>
                 <w:noProof/>
               </w:rPr>
-              <w:t>Interaction Objects and Objective Understanding</w:t>
+              <w:t>User Attention Detection</w:t>
             </w:r>
             <w:r>
               <w:rPr>
@@ -3359,7 +3503,7 @@
                 <w:noProof/>
                 <w:webHidden/>
               </w:rPr>
-              <w:instrText xml:space="preserve"> PAGEREF _Toc223965891 \h </w:instrText>
+              <w:instrText xml:space="preserve"> PAGEREF _Toc223984355 \h </w:instrText>
             </w:r>
             <w:r>
               <w:rPr>
@@ -3404,13 +3548,13 @@
               <w:lang w:eastAsia="en-GB"/>
             </w:rPr>
           </w:pPr>
-          <w:hyperlink w:anchor="_Toc223965892" w:history="1">
+          <w:hyperlink w:anchor="_Toc223984356" w:history="1">
             <w:r>
               <w:rPr>
                 <w:rStyle w:val="Hyperlink"/>
                 <w:noProof/>
               </w:rPr>
-              <w:t>User Attention Detection</w:t>
+              <w:t>Symptom Simulations</w:t>
             </w:r>
             <w:r>
               <w:rPr>
@@ -3431,7 +3575,7 @@
                 <w:noProof/>
                 <w:webHidden/>
               </w:rPr>
-              <w:instrText xml:space="preserve"> PAGEREF _Toc223965892 \h </w:instrText>
+              <w:instrText xml:space="preserve"> PAGEREF _Toc223984356 \h </w:instrText>
             </w:r>
             <w:r>
               <w:rPr>
@@ -3452,6 +3596,510 @@
                 <w:webHidden/>
               </w:rPr>
               <w:t>23</w:t>
+            </w:r>
+            <w:r>
+              <w:rPr>
+                <w:noProof/>
+                <w:webHidden/>
+              </w:rPr>
+              <w:fldChar w:fldCharType="end"/>
+            </w:r>
+          </w:hyperlink>
+        </w:p>
+        <w:p>
+          <w:pPr>
+            <w:pStyle w:val="TOC1"/>
+            <w:tabs>
+              <w:tab w:val="right" w:leader="dot" w:pos="9016"/>
+            </w:tabs>
+            <w:rPr>
+              <w:rFonts w:eastAsiaTheme="minorEastAsia"/>
+              <w:noProof/>
+              <w:sz w:val="24"/>
+              <w:szCs w:val="24"/>
+              <w:lang w:eastAsia="en-GB"/>
+            </w:rPr>
+          </w:pPr>
+          <w:hyperlink w:anchor="_Toc223984357" w:history="1">
+            <w:r>
+              <w:rPr>
+                <w:rStyle w:val="Hyperlink"/>
+                <w:noProof/>
+              </w:rPr>
+              <w:t>Critical Evaluation</w:t>
+            </w:r>
+            <w:r>
+              <w:rPr>
+                <w:noProof/>
+                <w:webHidden/>
+              </w:rPr>
+              <w:tab/>
+            </w:r>
+            <w:r>
+              <w:rPr>
+                <w:noProof/>
+                <w:webHidden/>
+              </w:rPr>
+              <w:fldChar w:fldCharType="begin"/>
+            </w:r>
+            <w:r>
+              <w:rPr>
+                <w:noProof/>
+                <w:webHidden/>
+              </w:rPr>
+              <w:instrText xml:space="preserve"> PAGEREF _Toc223984357 \h </w:instrText>
+            </w:r>
+            <w:r>
+              <w:rPr>
+                <w:noProof/>
+                <w:webHidden/>
+              </w:rPr>
+            </w:r>
+            <w:r>
+              <w:rPr>
+                <w:noProof/>
+                <w:webHidden/>
+              </w:rPr>
+              <w:fldChar w:fldCharType="separate"/>
+            </w:r>
+            <w:r>
+              <w:rPr>
+                <w:noProof/>
+                <w:webHidden/>
+              </w:rPr>
+              <w:t>24</w:t>
+            </w:r>
+            <w:r>
+              <w:rPr>
+                <w:noProof/>
+                <w:webHidden/>
+              </w:rPr>
+              <w:fldChar w:fldCharType="end"/>
+            </w:r>
+          </w:hyperlink>
+        </w:p>
+        <w:p>
+          <w:pPr>
+            <w:pStyle w:val="TOC1"/>
+            <w:tabs>
+              <w:tab w:val="right" w:leader="dot" w:pos="9016"/>
+            </w:tabs>
+            <w:rPr>
+              <w:rFonts w:eastAsiaTheme="minorEastAsia"/>
+              <w:noProof/>
+              <w:sz w:val="24"/>
+              <w:szCs w:val="24"/>
+              <w:lang w:eastAsia="en-GB"/>
+            </w:rPr>
+          </w:pPr>
+          <w:hyperlink w:anchor="_Toc223984358" w:history="1">
+            <w:r>
+              <w:rPr>
+                <w:rStyle w:val="Hyperlink"/>
+                <w:noProof/>
+              </w:rPr>
+              <w:t>Conclusions and Future Work</w:t>
+            </w:r>
+            <w:r>
+              <w:rPr>
+                <w:noProof/>
+                <w:webHidden/>
+              </w:rPr>
+              <w:tab/>
+            </w:r>
+            <w:r>
+              <w:rPr>
+                <w:noProof/>
+                <w:webHidden/>
+              </w:rPr>
+              <w:fldChar w:fldCharType="begin"/>
+            </w:r>
+            <w:r>
+              <w:rPr>
+                <w:noProof/>
+                <w:webHidden/>
+              </w:rPr>
+              <w:instrText xml:space="preserve"> PAGEREF _Toc223984358 \h </w:instrText>
+            </w:r>
+            <w:r>
+              <w:rPr>
+                <w:noProof/>
+                <w:webHidden/>
+              </w:rPr>
+            </w:r>
+            <w:r>
+              <w:rPr>
+                <w:noProof/>
+                <w:webHidden/>
+              </w:rPr>
+              <w:fldChar w:fldCharType="separate"/>
+            </w:r>
+            <w:r>
+              <w:rPr>
+                <w:noProof/>
+                <w:webHidden/>
+              </w:rPr>
+              <w:t>25</w:t>
+            </w:r>
+            <w:r>
+              <w:rPr>
+                <w:noProof/>
+                <w:webHidden/>
+              </w:rPr>
+              <w:fldChar w:fldCharType="end"/>
+            </w:r>
+          </w:hyperlink>
+        </w:p>
+        <w:p>
+          <w:pPr>
+            <w:pStyle w:val="TOC2"/>
+            <w:tabs>
+              <w:tab w:val="right" w:leader="dot" w:pos="9016"/>
+            </w:tabs>
+            <w:rPr>
+              <w:rFonts w:eastAsiaTheme="minorEastAsia"/>
+              <w:noProof/>
+              <w:sz w:val="24"/>
+              <w:szCs w:val="24"/>
+              <w:lang w:eastAsia="en-GB"/>
+            </w:rPr>
+          </w:pPr>
+          <w:hyperlink w:anchor="_Toc223984359" w:history="1">
+            <w:r>
+              <w:rPr>
+                <w:rStyle w:val="Hyperlink"/>
+                <w:noProof/>
+              </w:rPr>
+              <w:t>Conclusion</w:t>
+            </w:r>
+            <w:r>
+              <w:rPr>
+                <w:noProof/>
+                <w:webHidden/>
+              </w:rPr>
+              <w:tab/>
+            </w:r>
+            <w:r>
+              <w:rPr>
+                <w:noProof/>
+                <w:webHidden/>
+              </w:rPr>
+              <w:fldChar w:fldCharType="begin"/>
+            </w:r>
+            <w:r>
+              <w:rPr>
+                <w:noProof/>
+                <w:webHidden/>
+              </w:rPr>
+              <w:instrText xml:space="preserve"> PAGEREF _Toc223984359 \h </w:instrText>
+            </w:r>
+            <w:r>
+              <w:rPr>
+                <w:noProof/>
+                <w:webHidden/>
+              </w:rPr>
+            </w:r>
+            <w:r>
+              <w:rPr>
+                <w:noProof/>
+                <w:webHidden/>
+              </w:rPr>
+              <w:fldChar w:fldCharType="separate"/>
+            </w:r>
+            <w:r>
+              <w:rPr>
+                <w:noProof/>
+                <w:webHidden/>
+              </w:rPr>
+              <w:t>25</w:t>
+            </w:r>
+            <w:r>
+              <w:rPr>
+                <w:noProof/>
+                <w:webHidden/>
+              </w:rPr>
+              <w:fldChar w:fldCharType="end"/>
+            </w:r>
+          </w:hyperlink>
+        </w:p>
+        <w:p>
+          <w:pPr>
+            <w:pStyle w:val="TOC2"/>
+            <w:tabs>
+              <w:tab w:val="right" w:leader="dot" w:pos="9016"/>
+            </w:tabs>
+            <w:rPr>
+              <w:rFonts w:eastAsiaTheme="minorEastAsia"/>
+              <w:noProof/>
+              <w:sz w:val="24"/>
+              <w:szCs w:val="24"/>
+              <w:lang w:eastAsia="en-GB"/>
+            </w:rPr>
+          </w:pPr>
+          <w:hyperlink w:anchor="_Toc223984360" w:history="1">
+            <w:r>
+              <w:rPr>
+                <w:rStyle w:val="Hyperlink"/>
+                <w:noProof/>
+              </w:rPr>
+              <w:t>Future Work</w:t>
+            </w:r>
+            <w:r>
+              <w:rPr>
+                <w:noProof/>
+                <w:webHidden/>
+              </w:rPr>
+              <w:tab/>
+            </w:r>
+            <w:r>
+              <w:rPr>
+                <w:noProof/>
+                <w:webHidden/>
+              </w:rPr>
+              <w:fldChar w:fldCharType="begin"/>
+            </w:r>
+            <w:r>
+              <w:rPr>
+                <w:noProof/>
+                <w:webHidden/>
+              </w:rPr>
+              <w:instrText xml:space="preserve"> PAGEREF _Toc223984360 \h </w:instrText>
+            </w:r>
+            <w:r>
+              <w:rPr>
+                <w:noProof/>
+                <w:webHidden/>
+              </w:rPr>
+            </w:r>
+            <w:r>
+              <w:rPr>
+                <w:noProof/>
+                <w:webHidden/>
+              </w:rPr>
+              <w:fldChar w:fldCharType="separate"/>
+            </w:r>
+            <w:r>
+              <w:rPr>
+                <w:noProof/>
+                <w:webHidden/>
+              </w:rPr>
+              <w:t>25</w:t>
+            </w:r>
+            <w:r>
+              <w:rPr>
+                <w:noProof/>
+                <w:webHidden/>
+              </w:rPr>
+              <w:fldChar w:fldCharType="end"/>
+            </w:r>
+          </w:hyperlink>
+        </w:p>
+        <w:p>
+          <w:pPr>
+            <w:pStyle w:val="TOC1"/>
+            <w:tabs>
+              <w:tab w:val="right" w:leader="dot" w:pos="9016"/>
+            </w:tabs>
+            <w:rPr>
+              <w:rFonts w:eastAsiaTheme="minorEastAsia"/>
+              <w:noProof/>
+              <w:sz w:val="24"/>
+              <w:szCs w:val="24"/>
+              <w:lang w:eastAsia="en-GB"/>
+            </w:rPr>
+          </w:pPr>
+          <w:hyperlink w:anchor="_Toc223984361" w:history="1">
+            <w:r>
+              <w:rPr>
+                <w:rStyle w:val="Hyperlink"/>
+                <w:noProof/>
+              </w:rPr>
+              <w:t>References</w:t>
+            </w:r>
+            <w:r>
+              <w:rPr>
+                <w:noProof/>
+                <w:webHidden/>
+              </w:rPr>
+              <w:tab/>
+            </w:r>
+            <w:r>
+              <w:rPr>
+                <w:noProof/>
+                <w:webHidden/>
+              </w:rPr>
+              <w:fldChar w:fldCharType="begin"/>
+            </w:r>
+            <w:r>
+              <w:rPr>
+                <w:noProof/>
+                <w:webHidden/>
+              </w:rPr>
+              <w:instrText xml:space="preserve"> PAGEREF _Toc223984361 \h </w:instrText>
+            </w:r>
+            <w:r>
+              <w:rPr>
+                <w:noProof/>
+                <w:webHidden/>
+              </w:rPr>
+            </w:r>
+            <w:r>
+              <w:rPr>
+                <w:noProof/>
+                <w:webHidden/>
+              </w:rPr>
+              <w:fldChar w:fldCharType="separate"/>
+            </w:r>
+            <w:r>
+              <w:rPr>
+                <w:noProof/>
+                <w:webHidden/>
+              </w:rPr>
+              <w:t>26</w:t>
+            </w:r>
+            <w:r>
+              <w:rPr>
+                <w:noProof/>
+                <w:webHidden/>
+              </w:rPr>
+              <w:fldChar w:fldCharType="end"/>
+            </w:r>
+          </w:hyperlink>
+        </w:p>
+        <w:p>
+          <w:pPr>
+            <w:pStyle w:val="TOC1"/>
+            <w:tabs>
+              <w:tab w:val="right" w:leader="dot" w:pos="9016"/>
+            </w:tabs>
+            <w:rPr>
+              <w:rFonts w:eastAsiaTheme="minorEastAsia"/>
+              <w:noProof/>
+              <w:sz w:val="24"/>
+              <w:szCs w:val="24"/>
+              <w:lang w:eastAsia="en-GB"/>
+            </w:rPr>
+          </w:pPr>
+          <w:hyperlink w:anchor="_Toc223984362" w:history="1">
+            <w:r>
+              <w:rPr>
+                <w:rStyle w:val="Hyperlink"/>
+                <w:noProof/>
+              </w:rPr>
+              <w:t>Appendix</w:t>
+            </w:r>
+            <w:r>
+              <w:rPr>
+                <w:noProof/>
+                <w:webHidden/>
+              </w:rPr>
+              <w:tab/>
+            </w:r>
+            <w:r>
+              <w:rPr>
+                <w:noProof/>
+                <w:webHidden/>
+              </w:rPr>
+              <w:fldChar w:fldCharType="begin"/>
+            </w:r>
+            <w:r>
+              <w:rPr>
+                <w:noProof/>
+                <w:webHidden/>
+              </w:rPr>
+              <w:instrText xml:space="preserve"> PAGEREF _Toc223984362 \h </w:instrText>
+            </w:r>
+            <w:r>
+              <w:rPr>
+                <w:noProof/>
+                <w:webHidden/>
+              </w:rPr>
+            </w:r>
+            <w:r>
+              <w:rPr>
+                <w:noProof/>
+                <w:webHidden/>
+              </w:rPr>
+              <w:fldChar w:fldCharType="separate"/>
+            </w:r>
+            <w:r>
+              <w:rPr>
+                <w:noProof/>
+                <w:webHidden/>
+              </w:rPr>
+              <w:t>27</w:t>
+            </w:r>
+            <w:r>
+              <w:rPr>
+                <w:noProof/>
+                <w:webHidden/>
+              </w:rPr>
+              <w:fldChar w:fldCharType="end"/>
+            </w:r>
+          </w:hyperlink>
+        </w:p>
+        <w:p>
+          <w:pPr>
+            <w:pStyle w:val="TOC2"/>
+            <w:tabs>
+              <w:tab w:val="right" w:leader="dot" w:pos="9016"/>
+            </w:tabs>
+            <w:rPr>
+              <w:rFonts w:eastAsiaTheme="minorEastAsia"/>
+              <w:noProof/>
+              <w:sz w:val="24"/>
+              <w:szCs w:val="24"/>
+              <w:lang w:eastAsia="en-GB"/>
+            </w:rPr>
+          </w:pPr>
+          <w:hyperlink w:anchor="_Toc223984363" w:history="1">
+            <w:r>
+              <w:rPr>
+                <w:rStyle w:val="Hyperlink"/>
+                <w:noProof/>
+              </w:rPr>
+              <w:t>Asset Licenses and Sources</w:t>
+            </w:r>
+            <w:r>
+              <w:rPr>
+                <w:noProof/>
+                <w:webHidden/>
+              </w:rPr>
+              <w:tab/>
+            </w:r>
+            <w:r>
+              <w:rPr>
+                <w:noProof/>
+                <w:webHidden/>
+              </w:rPr>
+              <w:fldChar w:fldCharType="begin"/>
+            </w:r>
+            <w:r>
+              <w:rPr>
+                <w:noProof/>
+                <w:webHidden/>
+              </w:rPr>
+              <w:instrText xml:space="preserve"> PAGEREF _Toc223984363 \h </w:instrText>
+            </w:r>
+            <w:r>
+              <w:rPr>
+                <w:noProof/>
+                <w:webHidden/>
+              </w:rPr>
+            </w:r>
+            <w:r>
+              <w:rPr>
+                <w:noProof/>
+                <w:webHidden/>
+              </w:rPr>
+              <w:fldChar w:fldCharType="separate"/>
+            </w:r>
+            <w:r>
+              <w:rPr>
+                <w:noProof/>
+                <w:webHidden/>
+              </w:rPr>
+              <w:t>27</w:t>
             </w:r>
             <w:r>
               <w:rPr>
@@ -3476,13 +4124,13 @@
               <w:lang w:eastAsia="en-GB"/>
             </w:rPr>
           </w:pPr>
-          <w:hyperlink w:anchor="_Toc223965893" w:history="1">
+          <w:hyperlink w:anchor="_Toc223984364" w:history="1">
             <w:r>
               <w:rPr>
                 <w:rStyle w:val="Hyperlink"/>
                 <w:noProof/>
               </w:rPr>
-              <w:t>Symptom Simulations</w:t>
+              <w:t>Modern Office Table</w:t>
             </w:r>
             <w:r>
               <w:rPr>
@@ -3503,367 +4151,7 @@
                 <w:noProof/>
                 <w:webHidden/>
               </w:rPr>
-              <w:instrText xml:space="preserve"> PAGEREF _Toc223965893 \h </w:instrText>
-            </w:r>
-            <w:r>
-              <w:rPr>
-                <w:noProof/>
-                <w:webHidden/>
-              </w:rPr>
-            </w:r>
-            <w:r>
-              <w:rPr>
-                <w:noProof/>
-                <w:webHidden/>
-              </w:rPr>
-              <w:fldChar w:fldCharType="separate"/>
-            </w:r>
-            <w:r>
-              <w:rPr>
-                <w:noProof/>
-                <w:webHidden/>
-              </w:rPr>
-              <w:t>23</w:t>
-            </w:r>
-            <w:r>
-              <w:rPr>
-                <w:noProof/>
-                <w:webHidden/>
-              </w:rPr>
-              <w:fldChar w:fldCharType="end"/>
-            </w:r>
-          </w:hyperlink>
-        </w:p>
-        <w:p>
-          <w:pPr>
-            <w:pStyle w:val="TOC1"/>
-            <w:tabs>
-              <w:tab w:val="right" w:leader="dot" w:pos="9016"/>
-            </w:tabs>
-            <w:rPr>
-              <w:rFonts w:eastAsiaTheme="minorEastAsia"/>
-              <w:noProof/>
-              <w:sz w:val="24"/>
-              <w:szCs w:val="24"/>
-              <w:lang w:eastAsia="en-GB"/>
-            </w:rPr>
-          </w:pPr>
-          <w:hyperlink w:anchor="_Toc223965894" w:history="1">
-            <w:r>
-              <w:rPr>
-                <w:rStyle w:val="Hyperlink"/>
-                <w:noProof/>
-              </w:rPr>
-              <w:t>Critical Evaluation</w:t>
-            </w:r>
-            <w:r>
-              <w:rPr>
-                <w:noProof/>
-                <w:webHidden/>
-              </w:rPr>
-              <w:tab/>
-            </w:r>
-            <w:r>
-              <w:rPr>
-                <w:noProof/>
-                <w:webHidden/>
-              </w:rPr>
-              <w:fldChar w:fldCharType="begin"/>
-            </w:r>
-            <w:r>
-              <w:rPr>
-                <w:noProof/>
-                <w:webHidden/>
-              </w:rPr>
-              <w:instrText xml:space="preserve"> PAGEREF _Toc223965894 \h </w:instrText>
-            </w:r>
-            <w:r>
-              <w:rPr>
-                <w:noProof/>
-                <w:webHidden/>
-              </w:rPr>
-            </w:r>
-            <w:r>
-              <w:rPr>
-                <w:noProof/>
-                <w:webHidden/>
-              </w:rPr>
-              <w:fldChar w:fldCharType="separate"/>
-            </w:r>
-            <w:r>
-              <w:rPr>
-                <w:noProof/>
-                <w:webHidden/>
-              </w:rPr>
-              <w:t>24</w:t>
-            </w:r>
-            <w:r>
-              <w:rPr>
-                <w:noProof/>
-                <w:webHidden/>
-              </w:rPr>
-              <w:fldChar w:fldCharType="end"/>
-            </w:r>
-          </w:hyperlink>
-        </w:p>
-        <w:p>
-          <w:pPr>
-            <w:pStyle w:val="TOC1"/>
-            <w:tabs>
-              <w:tab w:val="right" w:leader="dot" w:pos="9016"/>
-            </w:tabs>
-            <w:rPr>
-              <w:rFonts w:eastAsiaTheme="minorEastAsia"/>
-              <w:noProof/>
-              <w:sz w:val="24"/>
-              <w:szCs w:val="24"/>
-              <w:lang w:eastAsia="en-GB"/>
-            </w:rPr>
-          </w:pPr>
-          <w:hyperlink w:anchor="_Toc223965895" w:history="1">
-            <w:r>
-              <w:rPr>
-                <w:rStyle w:val="Hyperlink"/>
-                <w:noProof/>
-              </w:rPr>
-              <w:t>Conclusions and Future Work</w:t>
-            </w:r>
-            <w:r>
-              <w:rPr>
-                <w:noProof/>
-                <w:webHidden/>
-              </w:rPr>
-              <w:tab/>
-            </w:r>
-            <w:r>
-              <w:rPr>
-                <w:noProof/>
-                <w:webHidden/>
-              </w:rPr>
-              <w:fldChar w:fldCharType="begin"/>
-            </w:r>
-            <w:r>
-              <w:rPr>
-                <w:noProof/>
-                <w:webHidden/>
-              </w:rPr>
-              <w:instrText xml:space="preserve"> PAGEREF _Toc223965895 \h </w:instrText>
-            </w:r>
-            <w:r>
-              <w:rPr>
-                <w:noProof/>
-                <w:webHidden/>
-              </w:rPr>
-            </w:r>
-            <w:r>
-              <w:rPr>
-                <w:noProof/>
-                <w:webHidden/>
-              </w:rPr>
-              <w:fldChar w:fldCharType="separate"/>
-            </w:r>
-            <w:r>
-              <w:rPr>
-                <w:noProof/>
-                <w:webHidden/>
-              </w:rPr>
-              <w:t>25</w:t>
-            </w:r>
-            <w:r>
-              <w:rPr>
-                <w:noProof/>
-                <w:webHidden/>
-              </w:rPr>
-              <w:fldChar w:fldCharType="end"/>
-            </w:r>
-          </w:hyperlink>
-        </w:p>
-        <w:p>
-          <w:pPr>
-            <w:pStyle w:val="TOC1"/>
-            <w:tabs>
-              <w:tab w:val="right" w:leader="dot" w:pos="9016"/>
-            </w:tabs>
-            <w:rPr>
-              <w:rFonts w:eastAsiaTheme="minorEastAsia"/>
-              <w:noProof/>
-              <w:sz w:val="24"/>
-              <w:szCs w:val="24"/>
-              <w:lang w:eastAsia="en-GB"/>
-            </w:rPr>
-          </w:pPr>
-          <w:hyperlink w:anchor="_Toc223965896" w:history="1">
-            <w:r>
-              <w:rPr>
-                <w:rStyle w:val="Hyperlink"/>
-                <w:noProof/>
-              </w:rPr>
-              <w:t>References</w:t>
-            </w:r>
-            <w:r>
-              <w:rPr>
-                <w:noProof/>
-                <w:webHidden/>
-              </w:rPr>
-              <w:tab/>
-            </w:r>
-            <w:r>
-              <w:rPr>
-                <w:noProof/>
-                <w:webHidden/>
-              </w:rPr>
-              <w:fldChar w:fldCharType="begin"/>
-            </w:r>
-            <w:r>
-              <w:rPr>
-                <w:noProof/>
-                <w:webHidden/>
-              </w:rPr>
-              <w:instrText xml:space="preserve"> PAGEREF _Toc223965896 \h </w:instrText>
-            </w:r>
-            <w:r>
-              <w:rPr>
-                <w:noProof/>
-                <w:webHidden/>
-              </w:rPr>
-            </w:r>
-            <w:r>
-              <w:rPr>
-                <w:noProof/>
-                <w:webHidden/>
-              </w:rPr>
-              <w:fldChar w:fldCharType="separate"/>
-            </w:r>
-            <w:r>
-              <w:rPr>
-                <w:noProof/>
-                <w:webHidden/>
-              </w:rPr>
-              <w:t>26</w:t>
-            </w:r>
-            <w:r>
-              <w:rPr>
-                <w:noProof/>
-                <w:webHidden/>
-              </w:rPr>
-              <w:fldChar w:fldCharType="end"/>
-            </w:r>
-          </w:hyperlink>
-        </w:p>
-        <w:p>
-          <w:pPr>
-            <w:pStyle w:val="TOC1"/>
-            <w:tabs>
-              <w:tab w:val="right" w:leader="dot" w:pos="9016"/>
-            </w:tabs>
-            <w:rPr>
-              <w:rFonts w:eastAsiaTheme="minorEastAsia"/>
-              <w:noProof/>
-              <w:sz w:val="24"/>
-              <w:szCs w:val="24"/>
-              <w:lang w:eastAsia="en-GB"/>
-            </w:rPr>
-          </w:pPr>
-          <w:hyperlink w:anchor="_Toc223965897" w:history="1">
-            <w:r>
-              <w:rPr>
-                <w:rStyle w:val="Hyperlink"/>
-                <w:noProof/>
-              </w:rPr>
-              <w:t>Appendix</w:t>
-            </w:r>
-            <w:r>
-              <w:rPr>
-                <w:noProof/>
-                <w:webHidden/>
-              </w:rPr>
-              <w:tab/>
-            </w:r>
-            <w:r>
-              <w:rPr>
-                <w:noProof/>
-                <w:webHidden/>
-              </w:rPr>
-              <w:fldChar w:fldCharType="begin"/>
-            </w:r>
-            <w:r>
-              <w:rPr>
-                <w:noProof/>
-                <w:webHidden/>
-              </w:rPr>
-              <w:instrText xml:space="preserve"> PAGEREF _Toc223965897 \h </w:instrText>
-            </w:r>
-            <w:r>
-              <w:rPr>
-                <w:noProof/>
-                <w:webHidden/>
-              </w:rPr>
-            </w:r>
-            <w:r>
-              <w:rPr>
-                <w:noProof/>
-                <w:webHidden/>
-              </w:rPr>
-              <w:fldChar w:fldCharType="separate"/>
-            </w:r>
-            <w:r>
-              <w:rPr>
-                <w:noProof/>
-                <w:webHidden/>
-              </w:rPr>
-              <w:t>27</w:t>
-            </w:r>
-            <w:r>
-              <w:rPr>
-                <w:noProof/>
-                <w:webHidden/>
-              </w:rPr>
-              <w:fldChar w:fldCharType="end"/>
-            </w:r>
-          </w:hyperlink>
-        </w:p>
-        <w:p>
-          <w:pPr>
-            <w:pStyle w:val="TOC2"/>
-            <w:tabs>
-              <w:tab w:val="right" w:leader="dot" w:pos="9016"/>
-            </w:tabs>
-            <w:rPr>
-              <w:rFonts w:eastAsiaTheme="minorEastAsia"/>
-              <w:noProof/>
-              <w:sz w:val="24"/>
-              <w:szCs w:val="24"/>
-              <w:lang w:eastAsia="en-GB"/>
-            </w:rPr>
-          </w:pPr>
-          <w:hyperlink w:anchor="_Toc223965898" w:history="1">
-            <w:r>
-              <w:rPr>
-                <w:rStyle w:val="Hyperlink"/>
-                <w:noProof/>
-              </w:rPr>
-              <w:t>Asset Licenses and Sources</w:t>
-            </w:r>
-            <w:r>
-              <w:rPr>
-                <w:noProof/>
-                <w:webHidden/>
-              </w:rPr>
-              <w:tab/>
-            </w:r>
-            <w:r>
-              <w:rPr>
-                <w:noProof/>
-                <w:webHidden/>
-              </w:rPr>
-              <w:fldChar w:fldCharType="begin"/>
-            </w:r>
-            <w:r>
-              <w:rPr>
-                <w:noProof/>
-                <w:webHidden/>
-              </w:rPr>
-              <w:instrText xml:space="preserve"> PAGEREF _Toc223965898 \h </w:instrText>
+              <w:instrText xml:space="preserve"> PAGEREF _Toc223984364 \h </w:instrText>
             </w:r>
             <w:r>
               <w:rPr>
@@ -3908,13 +4196,13 @@
               <w:lang w:eastAsia="en-GB"/>
             </w:rPr>
           </w:pPr>
-          <w:hyperlink w:anchor="_Toc223965899" w:history="1">
+          <w:hyperlink w:anchor="_Toc223984365" w:history="1">
             <w:r>
               <w:rPr>
                 <w:rStyle w:val="Hyperlink"/>
                 <w:noProof/>
               </w:rPr>
-              <w:t>Modern Office Table</w:t>
+              <w:t>Free Studio Starter Pack</w:t>
             </w:r>
             <w:r>
               <w:rPr>
@@ -3935,7 +4223,7 @@
                 <w:noProof/>
                 <w:webHidden/>
               </w:rPr>
-              <w:instrText xml:space="preserve"> PAGEREF _Toc223965899 \h </w:instrText>
+              <w:instrText xml:space="preserve"> PAGEREF _Toc223984365 \h </w:instrText>
             </w:r>
             <w:r>
               <w:rPr>
@@ -3980,13 +4268,13 @@
               <w:lang w:eastAsia="en-GB"/>
             </w:rPr>
           </w:pPr>
-          <w:hyperlink w:anchor="_Toc223965900" w:history="1">
+          <w:hyperlink w:anchor="_Toc223984366" w:history="1">
             <w:r>
               <w:rPr>
                 <w:rStyle w:val="Hyperlink"/>
                 <w:noProof/>
               </w:rPr>
-              <w:t>Free Studio Starter Pack</w:t>
+              <w:t>General Desktop Bundle</w:t>
             </w:r>
             <w:r>
               <w:rPr>
@@ -4007,7 +4295,7 @@
                 <w:noProof/>
                 <w:webHidden/>
               </w:rPr>
-              <w:instrText xml:space="preserve"> PAGEREF _Toc223965900 \h </w:instrText>
+              <w:instrText xml:space="preserve"> PAGEREF _Toc223984366 \h </w:instrText>
             </w:r>
             <w:r>
               <w:rPr>
@@ -4052,13 +4340,13 @@
               <w:lang w:eastAsia="en-GB"/>
             </w:rPr>
           </w:pPr>
-          <w:hyperlink w:anchor="_Toc223965901" w:history="1">
+          <w:hyperlink w:anchor="_Toc223984367" w:history="1">
             <w:r>
               <w:rPr>
                 <w:rStyle w:val="Hyperlink"/>
                 <w:noProof/>
               </w:rPr>
-              <w:t>General Desktop Bundle</w:t>
+              <w:t>General Gaming Headset</w:t>
             </w:r>
             <w:r>
               <w:rPr>
@@ -4079,7 +4367,7 @@
                 <w:noProof/>
                 <w:webHidden/>
               </w:rPr>
-              <w:instrText xml:space="preserve"> PAGEREF _Toc223965901 \h </w:instrText>
+              <w:instrText xml:space="preserve"> PAGEREF _Toc223984367 \h </w:instrText>
             </w:r>
             <w:r>
               <w:rPr>
@@ -4099,7 +4387,7 @@
                 <w:noProof/>
                 <w:webHidden/>
               </w:rPr>
-              <w:t>27</w:t>
+              <w:t>28</w:t>
             </w:r>
             <w:r>
               <w:rPr>
@@ -4124,13 +4412,13 @@
               <w:lang w:eastAsia="en-GB"/>
             </w:rPr>
           </w:pPr>
-          <w:hyperlink w:anchor="_Toc223965902" w:history="1">
+          <w:hyperlink w:anchor="_Toc223984368" w:history="1">
             <w:r>
               <w:rPr>
                 <w:rStyle w:val="Hyperlink"/>
                 <w:noProof/>
               </w:rPr>
-              <w:t>General Gaming Headset</w:t>
+              <w:t>General Gaming Chair</w:t>
             </w:r>
             <w:r>
               <w:rPr>
@@ -4151,7 +4439,7 @@
                 <w:noProof/>
                 <w:webHidden/>
               </w:rPr>
-              <w:instrText xml:space="preserve"> PAGEREF _Toc223965902 \h </w:instrText>
+              <w:instrText xml:space="preserve"> PAGEREF _Toc223984368 \h </w:instrText>
             </w:r>
             <w:r>
               <w:rPr>
@@ -4196,13 +4484,13 @@
               <w:lang w:eastAsia="en-GB"/>
             </w:rPr>
           </w:pPr>
-          <w:hyperlink w:anchor="_Toc223965903" w:history="1">
+          <w:hyperlink w:anchor="_Toc223984369" w:history="1">
             <w:r>
               <w:rPr>
                 <w:rStyle w:val="Hyperlink"/>
                 <w:noProof/>
               </w:rPr>
-              <w:t>General Gaming Chair</w:t>
+              <w:t>Light Switch</w:t>
             </w:r>
             <w:r>
               <w:rPr>
@@ -4223,7 +4511,7 @@
                 <w:noProof/>
                 <w:webHidden/>
               </w:rPr>
-              <w:instrText xml:space="preserve"> PAGEREF _Toc223965903 \h </w:instrText>
+              <w:instrText xml:space="preserve"> PAGEREF _Toc223984369 \h </w:instrText>
             </w:r>
             <w:r>
               <w:rPr>
@@ -4268,13 +4556,13 @@
               <w:lang w:eastAsia="en-GB"/>
             </w:rPr>
           </w:pPr>
-          <w:hyperlink w:anchor="_Toc223965904" w:history="1">
+          <w:hyperlink w:anchor="_Toc223984370" w:history="1">
             <w:r>
               <w:rPr>
                 <w:rStyle w:val="Hyperlink"/>
                 <w:noProof/>
               </w:rPr>
-              <w:t>Light Switch</w:t>
+              <w:t>Materials for General PC setup and Scenes</w:t>
             </w:r>
             <w:r>
               <w:rPr>
@@ -4295,7 +4583,7 @@
                 <w:noProof/>
                 <w:webHidden/>
               </w:rPr>
-              <w:instrText xml:space="preserve"> PAGEREF _Toc223965904 \h </w:instrText>
+              <w:instrText xml:space="preserve"> PAGEREF _Toc223984370 \h </w:instrText>
             </w:r>
             <w:r>
               <w:rPr>
@@ -4315,7 +4603,7 @@
                 <w:noProof/>
                 <w:webHidden/>
               </w:rPr>
-              <w:t>28</w:t>
+              <w:t>29</w:t>
             </w:r>
             <w:r>
               <w:rPr>
@@ -4340,13 +4628,13 @@
               <w:lang w:eastAsia="en-GB"/>
             </w:rPr>
           </w:pPr>
-          <w:hyperlink w:anchor="_Toc223965905" w:history="1">
+          <w:hyperlink w:anchor="_Toc223984371" w:history="1">
             <w:r>
               <w:rPr>
                 <w:rStyle w:val="Hyperlink"/>
                 <w:noProof/>
               </w:rPr>
-              <w:t>Materials for General PC setup and Scenes</w:t>
+              <w:t>Monitor background image</w:t>
             </w:r>
             <w:r>
               <w:rPr>
@@ -4367,7 +4655,7 @@
                 <w:noProof/>
                 <w:webHidden/>
               </w:rPr>
-              <w:instrText xml:space="preserve"> PAGEREF _Toc223965905 \h </w:instrText>
+              <w:instrText xml:space="preserve"> PAGEREF _Toc223984371 \h </w:instrText>
             </w:r>
             <w:r>
               <w:rPr>
@@ -4387,7 +4675,7 @@
                 <w:noProof/>
                 <w:webHidden/>
               </w:rPr>
-              <w:t>29</w:t>
+              <w:t>30</w:t>
             </w:r>
             <w:r>
               <w:rPr>
@@ -4412,13 +4700,13 @@
               <w:lang w:eastAsia="en-GB"/>
             </w:rPr>
           </w:pPr>
-          <w:hyperlink w:anchor="_Toc223965906" w:history="1">
+          <w:hyperlink w:anchor="_Toc223984372" w:history="1">
             <w:r>
               <w:rPr>
                 <w:rStyle w:val="Hyperlink"/>
                 <w:noProof/>
               </w:rPr>
-              <w:t>Monitor background image</w:t>
+              <w:t>Button Hover Sfx by Fachii</w:t>
             </w:r>
             <w:r>
               <w:rPr>
@@ -4439,7 +4727,7 @@
                 <w:noProof/>
                 <w:webHidden/>
               </w:rPr>
-              <w:instrText xml:space="preserve"> PAGEREF _Toc223965906 \h </w:instrText>
+              <w:instrText xml:space="preserve"> PAGEREF _Toc223984372 \h </w:instrText>
             </w:r>
             <w:r>
               <w:rPr>
@@ -4459,7 +4747,7 @@
                 <w:noProof/>
                 <w:webHidden/>
               </w:rPr>
-              <w:t>30</w:t>
+              <w:t>31</w:t>
             </w:r>
             <w:r>
               <w:rPr>
@@ -4484,13 +4772,13 @@
               <w:lang w:eastAsia="en-GB"/>
             </w:rPr>
           </w:pPr>
-          <w:hyperlink w:anchor="_Toc223965907" w:history="1">
+          <w:hyperlink w:anchor="_Toc223984373" w:history="1">
             <w:r>
               <w:rPr>
                 <w:rStyle w:val="Hyperlink"/>
                 <w:noProof/>
               </w:rPr>
-              <w:t>Button Hover Sfx by Fachii</w:t>
+              <w:t>Button click Sfx by AndrewEathan</w:t>
             </w:r>
             <w:r>
               <w:rPr>
@@ -4511,7 +4799,7 @@
                 <w:noProof/>
                 <w:webHidden/>
               </w:rPr>
-              <w:instrText xml:space="preserve"> PAGEREF _Toc223965907 \h </w:instrText>
+              <w:instrText xml:space="preserve"> PAGEREF _Toc223984373 \h </w:instrText>
             </w:r>
             <w:r>
               <w:rPr>
@@ -4556,13 +4844,13 @@
               <w:lang w:eastAsia="en-GB"/>
             </w:rPr>
           </w:pPr>
-          <w:hyperlink w:anchor="_Toc223965908" w:history="1">
+          <w:hyperlink w:anchor="_Toc223984374" w:history="1">
             <w:r>
               <w:rPr>
                 <w:rStyle w:val="Hyperlink"/>
                 <w:noProof/>
               </w:rPr>
-              <w:t>Button click Sfx by AndrewEathan</w:t>
+              <w:t>Light Switch On Sfx</w:t>
             </w:r>
             <w:r>
               <w:rPr>
@@ -4583,7 +4871,7 @@
                 <w:noProof/>
                 <w:webHidden/>
               </w:rPr>
-              <w:instrText xml:space="preserve"> PAGEREF _Toc223965908 \h </w:instrText>
+              <w:instrText xml:space="preserve"> PAGEREF _Toc223984374 \h </w:instrText>
             </w:r>
             <w:r>
               <w:rPr>
@@ -4603,7 +4891,7 @@
                 <w:noProof/>
                 <w:webHidden/>
               </w:rPr>
-              <w:t>31</w:t>
+              <w:t>32</w:t>
             </w:r>
             <w:r>
               <w:rPr>
@@ -4628,13 +4916,13 @@
               <w:lang w:eastAsia="en-GB"/>
             </w:rPr>
           </w:pPr>
-          <w:hyperlink w:anchor="_Toc223965909" w:history="1">
+          <w:hyperlink w:anchor="_Toc223984375" w:history="1">
             <w:r>
               <w:rPr>
                 <w:rStyle w:val="Hyperlink"/>
                 <w:noProof/>
               </w:rPr>
-              <w:t>Light Switch On Sfx</w:t>
+              <w:t>Light Switch Off Sfx</w:t>
             </w:r>
             <w:r>
               <w:rPr>
@@ -4655,79 +4943,7 @@
                 <w:noProof/>
                 <w:webHidden/>
               </w:rPr>
-              <w:instrText xml:space="preserve"> PAGEREF _Toc223965909 \h </w:instrText>
-            </w:r>
-            <w:r>
-              <w:rPr>
-                <w:noProof/>
-                <w:webHidden/>
-              </w:rPr>
-            </w:r>
-            <w:r>
-              <w:rPr>
-                <w:noProof/>
-                <w:webHidden/>
-              </w:rPr>
-              <w:fldChar w:fldCharType="separate"/>
-            </w:r>
-            <w:r>
-              <w:rPr>
-                <w:noProof/>
-                <w:webHidden/>
-              </w:rPr>
-              <w:t>32</w:t>
-            </w:r>
-            <w:r>
-              <w:rPr>
-                <w:noProof/>
-                <w:webHidden/>
-              </w:rPr>
-              <w:fldChar w:fldCharType="end"/>
-            </w:r>
-          </w:hyperlink>
-        </w:p>
-        <w:p>
-          <w:pPr>
-            <w:pStyle w:val="TOC3"/>
-            <w:tabs>
-              <w:tab w:val="right" w:leader="dot" w:pos="9016"/>
-            </w:tabs>
-            <w:rPr>
-              <w:rFonts w:eastAsiaTheme="minorEastAsia"/>
-              <w:noProof/>
-              <w:sz w:val="24"/>
-              <w:szCs w:val="24"/>
-              <w:lang w:eastAsia="en-GB"/>
-            </w:rPr>
-          </w:pPr>
-          <w:hyperlink w:anchor="_Toc223965910" w:history="1">
-            <w:r>
-              <w:rPr>
-                <w:rStyle w:val="Hyperlink"/>
-                <w:noProof/>
-              </w:rPr>
-              <w:t>Light Switch Off Sfx</w:t>
-            </w:r>
-            <w:r>
-              <w:rPr>
-                <w:noProof/>
-                <w:webHidden/>
-              </w:rPr>
-              <w:tab/>
-            </w:r>
-            <w:r>
-              <w:rPr>
-                <w:noProof/>
-                <w:webHidden/>
-              </w:rPr>
-              <w:fldChar w:fldCharType="begin"/>
-            </w:r>
-            <w:r>
-              <w:rPr>
-                <w:noProof/>
-                <w:webHidden/>
-              </w:rPr>
-              <w:instrText xml:space="preserve"> PAGEREF _Toc223965910 \h </w:instrText>
+              <w:instrText xml:space="preserve"> PAGEREF _Toc223984375 \h </w:instrText>
             </w:r>
             <w:r>
               <w:rPr>
@@ -4788,7 +5004,7 @@
       <w:pPr>
         <w:pStyle w:val="Heading1"/>
       </w:pPr>
-      <w:bookmarkStart w:id="0" w:name="_Toc223965848"/>
+      <w:bookmarkStart w:id="0" w:name="_Toc223984310"/>
       <w:r>
         <w:lastRenderedPageBreak/>
         <w:t>List of Acro</w:t>
@@ -5065,7 +5281,7 @@
       <w:pPr>
         <w:pStyle w:val="Heading1"/>
       </w:pPr>
-      <w:bookmarkStart w:id="1" w:name="_Toc223965849"/>
+      <w:bookmarkStart w:id="1" w:name="_Toc223984311"/>
       <w:r>
         <w:lastRenderedPageBreak/>
         <w:t>Abstract</w:t>
@@ -5265,7 +5481,7 @@
       <w:pPr>
         <w:pStyle w:val="Heading1"/>
       </w:pPr>
-      <w:bookmarkStart w:id="2" w:name="_Toc223965850"/>
+      <w:bookmarkStart w:id="2" w:name="_Toc223984312"/>
       <w:r>
         <w:lastRenderedPageBreak/>
         <w:t>Introduction</w:t>
@@ -5838,7 +6054,7 @@
       <w:pPr>
         <w:pStyle w:val="Heading1"/>
       </w:pPr>
-      <w:bookmarkStart w:id="3" w:name="_Toc223965851"/>
+      <w:bookmarkStart w:id="3" w:name="_Toc223984313"/>
       <w:r>
         <w:lastRenderedPageBreak/>
         <w:t>Project Aim</w:t>
@@ -5888,7 +6104,7 @@
           <w:rFonts w:asciiTheme="minorHAnsi" w:hAnsiTheme="minorHAnsi"/>
         </w:rPr>
       </w:pPr>
-      <w:bookmarkStart w:id="4" w:name="_Toc223965852"/>
+      <w:bookmarkStart w:id="4" w:name="_Toc223984314"/>
       <w:r>
         <w:rPr>
           <w:rFonts w:asciiTheme="minorHAnsi" w:hAnsiTheme="minorHAnsi"/>
@@ -6175,7 +6391,7 @@
       <w:pPr>
         <w:pStyle w:val="Heading1"/>
       </w:pPr>
-      <w:bookmarkStart w:id="5" w:name="_Toc223965853"/>
+      <w:bookmarkStart w:id="5" w:name="_Toc223984315"/>
       <w:r>
         <w:lastRenderedPageBreak/>
         <w:t>Project Planning</w:t>
@@ -6556,7 +6772,7 @@
           <w:rFonts w:asciiTheme="minorHAnsi" w:hAnsiTheme="minorHAnsi"/>
         </w:rPr>
       </w:pPr>
-      <w:bookmarkStart w:id="6" w:name="_Toc223965854"/>
+      <w:bookmarkStart w:id="6" w:name="_Toc223984316"/>
       <w:r>
         <w:rPr>
           <w:rFonts w:asciiTheme="minorHAnsi" w:hAnsiTheme="minorHAnsi"/>
@@ -6758,7 +6974,7 @@
           <w:rFonts w:asciiTheme="minorHAnsi" w:hAnsiTheme="minorHAnsi"/>
         </w:rPr>
       </w:pPr>
-      <w:bookmarkStart w:id="7" w:name="_Toc223965855"/>
+      <w:bookmarkStart w:id="7" w:name="_Toc223984317"/>
       <w:r>
         <w:rPr>
           <w:rFonts w:asciiTheme="minorHAnsi" w:hAnsiTheme="minorHAnsi"/>
@@ -6997,21 +7213,7 @@
         <w:rPr>
           <w:rFonts w:cs="Arial"/>
         </w:rPr>
-        <w:t xml:space="preserve">Clear </w:t>
-      </w:r>
-      <w:proofErr w:type="gramStart"/>
-      <w:r>
-        <w:rPr>
-          <w:rFonts w:cs="Arial"/>
-        </w:rPr>
-        <w:t>on screen</w:t>
-      </w:r>
-      <w:proofErr w:type="gramEnd"/>
-      <w:r>
-        <w:rPr>
-          <w:rFonts w:cs="Arial"/>
-        </w:rPr>
-        <w:t xml:space="preserve"> prompts to guide and support users that aren’t familiar with VR equipment</w:t>
+        <w:t>Clear on screen prompts to guide and support users that aren’t familiar with VR equipment</w:t>
       </w:r>
     </w:p>
     <w:p>
@@ -7039,7 +7241,7 @@
           <w:rFonts w:asciiTheme="minorHAnsi" w:hAnsiTheme="minorHAnsi"/>
         </w:rPr>
       </w:pPr>
-      <w:bookmarkStart w:id="8" w:name="_Toc223965856"/>
+      <w:bookmarkStart w:id="8" w:name="_Toc223984318"/>
       <w:r>
         <w:rPr>
           <w:rFonts w:asciiTheme="minorHAnsi" w:hAnsiTheme="minorHAnsi"/>
@@ -7056,7 +7258,7 @@
           <w:rFonts w:asciiTheme="minorHAnsi" w:hAnsiTheme="minorHAnsi"/>
         </w:rPr>
       </w:pPr>
-      <w:bookmarkStart w:id="9" w:name="_Toc223965857"/>
+      <w:bookmarkStart w:id="9" w:name="_Toc223984319"/>
       <w:r>
         <w:rPr>
           <w:rFonts w:asciiTheme="minorHAnsi" w:hAnsiTheme="minorHAnsi"/>
@@ -7140,7 +7342,7 @@
           <w:rFonts w:asciiTheme="minorHAnsi" w:hAnsiTheme="minorHAnsi"/>
         </w:rPr>
       </w:pPr>
-      <w:bookmarkStart w:id="10" w:name="_Toc223965858"/>
+      <w:bookmarkStart w:id="10" w:name="_Toc223984320"/>
       <w:r>
         <w:rPr>
           <w:rFonts w:asciiTheme="minorHAnsi" w:hAnsiTheme="minorHAnsi"/>
@@ -7153,7 +7355,7 @@
       <w:pPr>
         <w:pStyle w:val="Heading3"/>
       </w:pPr>
-      <w:bookmarkStart w:id="11" w:name="_Toc223965859"/>
+      <w:bookmarkStart w:id="11" w:name="_Toc223984321"/>
       <w:r>
         <w:t>Ey</w:t>
       </w:r>
@@ -7450,7 +7652,7 @@
       <w:pPr>
         <w:pStyle w:val="Heading3"/>
       </w:pPr>
-      <w:bookmarkStart w:id="12" w:name="_Toc223965860"/>
+      <w:bookmarkStart w:id="12" w:name="_Toc223984322"/>
       <w:r>
         <w:t>OntoPhaco</w:t>
       </w:r>
@@ -7780,7 +7982,7 @@
       <w:pPr>
         <w:pStyle w:val="Heading3"/>
       </w:pPr>
-      <w:bookmarkStart w:id="13" w:name="_Toc223965861"/>
+      <w:bookmarkStart w:id="13" w:name="_Toc223984323"/>
       <w:r>
         <w:lastRenderedPageBreak/>
         <w:t>I</w:t>
@@ -7976,7 +8178,7 @@
       <w:pPr>
         <w:pStyle w:val="Heading3"/>
       </w:pPr>
-      <w:bookmarkStart w:id="14" w:name="_Toc223965862"/>
+      <w:bookmarkStart w:id="14" w:name="_Toc223984324"/>
       <w:r>
         <w:t>Opportunities for innovation</w:t>
       </w:r>
@@ -8094,7 +8296,7 @@
           <w:rFonts w:asciiTheme="minorHAnsi" w:hAnsiTheme="minorHAnsi"/>
         </w:rPr>
       </w:pPr>
-      <w:bookmarkStart w:id="15" w:name="_Toc223965863"/>
+      <w:bookmarkStart w:id="15" w:name="_Toc223984325"/>
       <w:r>
         <w:rPr>
           <w:rFonts w:asciiTheme="minorHAnsi" w:hAnsiTheme="minorHAnsi"/>
@@ -8107,7 +8309,7 @@
       <w:pPr>
         <w:pStyle w:val="Heading3"/>
       </w:pPr>
-      <w:bookmarkStart w:id="16" w:name="_Toc223965864"/>
+      <w:bookmarkStart w:id="16" w:name="_Toc223984326"/>
       <w:r>
         <w:t>VR in medical education</w:t>
       </w:r>
@@ -8374,7 +8576,7 @@
       <w:pPr>
         <w:pStyle w:val="Heading3"/>
       </w:pPr>
-      <w:bookmarkStart w:id="17" w:name="_Toc223965865"/>
+      <w:bookmarkStart w:id="17" w:name="_Toc223984327"/>
       <w:r>
         <w:lastRenderedPageBreak/>
         <w:t>VR in Health Awareness</w:t>
@@ -8567,7 +8769,7 @@
           <w:rFonts w:asciiTheme="minorHAnsi" w:hAnsiTheme="minorHAnsi"/>
         </w:rPr>
       </w:pPr>
-      <w:bookmarkStart w:id="18" w:name="_Toc223965866"/>
+      <w:bookmarkStart w:id="18" w:name="_Toc223984328"/>
       <w:r>
         <w:rPr>
           <w:rFonts w:asciiTheme="minorHAnsi" w:hAnsiTheme="minorHAnsi"/>
@@ -8787,7 +8989,7 @@
       <w:pPr>
         <w:pStyle w:val="Heading1"/>
       </w:pPr>
-      <w:bookmarkStart w:id="19" w:name="_Toc223965867"/>
+      <w:bookmarkStart w:id="19" w:name="_Toc223984329"/>
       <w:r>
         <w:lastRenderedPageBreak/>
         <w:t>Appendices</w:t>
@@ -8798,7 +9000,7 @@
       <w:pPr>
         <w:pStyle w:val="Heading2"/>
       </w:pPr>
-      <w:bookmarkStart w:id="20" w:name="_Toc223965868"/>
+      <w:bookmarkStart w:id="20" w:name="_Toc223984330"/>
       <w:r>
         <w:t>Ethics Checklist</w:t>
       </w:r>
@@ -8940,7 +9142,7 @@
       <w:pPr>
         <w:pStyle w:val="Heading2"/>
       </w:pPr>
-      <w:bookmarkStart w:id="21" w:name="_Toc223965869"/>
+      <w:bookmarkStart w:id="21" w:name="_Toc223984331"/>
       <w:r>
         <w:lastRenderedPageBreak/>
         <w:t>Project Timeline Gant</w:t>
@@ -9136,7 +9338,7 @@
       <w:pPr>
         <w:pStyle w:val="Heading1"/>
       </w:pPr>
-      <w:bookmarkStart w:id="22" w:name="_Toc223965870"/>
+      <w:bookmarkStart w:id="22" w:name="_Toc223984332"/>
       <w:r>
         <w:lastRenderedPageBreak/>
         <w:t>Methodology</w:t>
@@ -9147,18 +9349,22 @@
       <w:pPr>
         <w:pStyle w:val="Heading2"/>
       </w:pPr>
-      <w:bookmarkStart w:id="23" w:name="_Toc223965871"/>
+      <w:bookmarkStart w:id="23" w:name="_Toc223984333"/>
       <w:r>
         <w:t>Source Control</w:t>
       </w:r>
       <w:bookmarkEnd w:id="23"/>
     </w:p>
-    <w:p/>
+    <w:p>
+      <w:r>
+        <w:t xml:space="preserve">During development, GitHub was used as source control for the project. Source control is needed to </w:t>
+      </w:r>
+    </w:p>
     <w:p>
       <w:pPr>
         <w:pStyle w:val="Heading2"/>
       </w:pPr>
-      <w:bookmarkStart w:id="24" w:name="_Toc223965872"/>
+      <w:bookmarkStart w:id="24" w:name="_Toc223984334"/>
       <w:r>
         <w:t>Prototype Implementation</w:t>
       </w:r>
@@ -9168,7 +9374,7 @@
       <w:pPr>
         <w:pStyle w:val="Heading3"/>
       </w:pPr>
-      <w:bookmarkStart w:id="25" w:name="_Toc223965873"/>
+      <w:bookmarkStart w:id="25" w:name="_Toc223984335"/>
       <w:r>
         <w:t>Usability and Flow</w:t>
       </w:r>
@@ -9251,7 +9457,7 @@
       <w:pPr>
         <w:pStyle w:val="Heading3"/>
       </w:pPr>
-      <w:bookmarkStart w:id="26" w:name="_Toc223965874"/>
+      <w:bookmarkStart w:id="26" w:name="_Toc223984336"/>
       <w:r>
         <w:t xml:space="preserve">Environment Design and </w:t>
       </w:r>
@@ -9380,7 +9586,7 @@
       <w:pPr>
         <w:pStyle w:val="Heading3"/>
       </w:pPr>
-      <w:bookmarkStart w:id="27" w:name="_Toc223965875"/>
+      <w:bookmarkStart w:id="27" w:name="_Toc223984337"/>
       <w:r>
         <w:t>Objective System Implementation</w:t>
       </w:r>
@@ -9485,7 +9691,7 @@
       <w:pPr>
         <w:pStyle w:val="Heading3"/>
       </w:pPr>
-      <w:bookmarkStart w:id="28" w:name="_Toc223965876"/>
+      <w:bookmarkStart w:id="28" w:name="_Toc223984338"/>
       <w:r>
         <w:t>User</w:t>
       </w:r>
@@ -9529,11 +9735,11 @@
         <w:t>s</w:t>
       </w:r>
       <w:r>
-        <w:t xml:space="preserve">) seen within video games so that the experience would be more immersive with users needing to interact and search the environment around them. The UI is implemented as a world space widget </w:t>
+        <w:t xml:space="preserve">) seen within video games so that the experience would be more immersive with users needing to interact </w:t>
       </w:r>
       <w:r>
         <w:lastRenderedPageBreak/>
-        <w:t xml:space="preserve">attached to the screen mesh of a monitor that uses a widget blueprint to control the information displayed. The widget consists of the current objective description to prompt users along with a progress bar that fills up green as the necessary requirements are being met to complete the objective. </w:t>
+        <w:t xml:space="preserve">and search the environment around them. The UI is implemented as a world space widget attached to the screen mesh of a monitor that uses a widget blueprint to control the information displayed. The widget consists of the current objective description to prompt users along with a progress bar that fills up green as the necessary requirements are being met to complete the objective. </w:t>
       </w:r>
       <w:r>
         <w:t>Event</w:t>
@@ -9582,7 +9788,7 @@
       <w:pPr>
         <w:pStyle w:val="Heading3"/>
       </w:pPr>
-      <w:bookmarkStart w:id="29" w:name="_Toc223965877"/>
+      <w:bookmarkStart w:id="29" w:name="_Toc223984339"/>
       <w:r>
         <w:t>Objective Based Interact</w:t>
       </w:r>
@@ -9650,7 +9856,7 @@
       <w:pPr>
         <w:pStyle w:val="Heading3"/>
       </w:pPr>
-      <w:bookmarkStart w:id="30" w:name="_Toc223965878"/>
+      <w:bookmarkStart w:id="30" w:name="_Toc223984340"/>
       <w:r>
         <w:t>Post Processing Effects</w:t>
       </w:r>
@@ -9667,15 +9873,7 @@
         <w:t>’s post processing component</w:t>
       </w:r>
       <w:r>
-        <w:t xml:space="preserve">. These effects were </w:t>
-      </w:r>
-      <w:proofErr w:type="gramStart"/>
-      <w:r>
-        <w:t>vignette</w:t>
-      </w:r>
-      <w:proofErr w:type="gramEnd"/>
-      <w:r>
-        <w:t xml:space="preserve"> to simulate eye fatigue, bloom for light sensitivity and blur for focus strain. Vignette and bloom post processing effects were triggered through adjusting their post processing variables within the camera post processing component. However, for blur a post processing material was required to create the radial blur. When objectives progressed triggering the simulation of symptoms, a timeline was used to progressively increase the value of an effect gradually over a duration. This decision was made to accommodate eyes adjusting to the changes of the camera as these effects were being triggered.</w:t>
+        <w:t>. These effects were vignette to simulate eye fatigue, bloom for light sensitivity and blur for focus strain. Vignette and bloom post processing effects were triggered through adjusting their post processing variables within the camera post processing component. However, for blur a post processing material was required to create the radial blur. When objectives progressed triggering the simulation of symptoms, a timeline was used to progressively increase the value of an effect gradually over a duration. This decision was made to accommodate eyes adjusting to the changes of the camera as these effects were being triggered.</w:t>
       </w:r>
       <w:r>
         <w:t xml:space="preserve"> The timeline was then used in reverse to revert the symptoms returning the camera view back to the original state it was in.</w:t>
@@ -9685,7 +9883,7 @@
       <w:pPr>
         <w:pStyle w:val="Heading3"/>
       </w:pPr>
-      <w:bookmarkStart w:id="31" w:name="_Toc223965879"/>
+      <w:bookmarkStart w:id="31" w:name="_Toc223984341"/>
       <w:r>
         <w:t>User</w:t>
       </w:r>
@@ -9708,7 +9906,7 @@
       <w:pPr>
         <w:pStyle w:val="Heading2"/>
       </w:pPr>
-      <w:bookmarkStart w:id="32" w:name="_Toc223965880"/>
+      <w:bookmarkStart w:id="32" w:name="_Toc223984342"/>
       <w:r>
         <w:lastRenderedPageBreak/>
         <w:t>Final Version</w:t>
@@ -9722,9 +9920,11 @@
       <w:pPr>
         <w:pStyle w:val="Heading3"/>
       </w:pPr>
+      <w:bookmarkStart w:id="33" w:name="_Toc223984343"/>
       <w:r>
         <w:t>Environment Changes and Visual Modifications</w:t>
       </w:r>
+      <w:bookmarkEnd w:id="33"/>
     </w:p>
     <w:p>
       <w:r>
@@ -9747,11 +9947,11 @@
       <w:pPr>
         <w:pStyle w:val="Heading3"/>
       </w:pPr>
-      <w:bookmarkStart w:id="33" w:name="_Toc223965881"/>
+      <w:bookmarkStart w:id="34" w:name="_Toc223984344"/>
       <w:r>
         <w:t>Interaction Improvements</w:t>
       </w:r>
-      <w:bookmarkEnd w:id="33"/>
+      <w:bookmarkEnd w:id="34"/>
     </w:p>
     <w:p>
       <w:r>
@@ -9770,7 +9970,42 @@
         <w:t>work as intended</w:t>
       </w:r>
       <w:r>
-        <w:t xml:space="preserve">. As the physics collisions were no longer blocking the player hand components from </w:t>
+        <w:t>.</w:t>
+      </w:r>
+      <w:r>
+        <w:t xml:space="preserve"> In addition to this, the blueprint for the light switch was heavily simplified. The original blueprint used logic that worked for a lever like interaction component that was quite large and would adjust its rotation based on where the player hand was while interacting with the object. However, the light switch was a small object where there was a minimal difference in position of the hand component. The logic needed to be simplified to detection of the user interacting with the grab component</w:t>
+      </w:r>
+      <w:r>
+        <w:t xml:space="preserve"> of the switch</w:t>
+      </w:r>
+      <w:r>
+        <w:t>.</w:t>
+      </w:r>
+      <w:r>
+        <w:t xml:space="preserve"> </w:t>
+      </w:r>
+      <w:r>
+        <w:t>T</w:t>
+      </w:r>
+      <w:r>
+        <w:t>hen the light</w:t>
+      </w:r>
+      <w:r>
+        <w:t xml:space="preserve"> would be </w:t>
+      </w:r>
+      <w:r>
+        <w:t>turned</w:t>
+      </w:r>
+      <w:r>
+        <w:t xml:space="preserve"> on or off depending on the value of a Boolean variable, which stored the information on whether the lights were currently switched on or off. </w:t>
+      </w:r>
+    </w:p>
+    <w:p>
+      <w:r>
+        <w:t xml:space="preserve">From this change, most of the other supporting code within the event graph was no longer necessary so was removed to strip the blueprint back to basics. </w:t>
+      </w:r>
+      <w:r>
+        <w:t xml:space="preserve">As the physics collisions were no longer blocking the player hand components from </w:t>
       </w:r>
       <w:r>
         <w:t>moving</w:t>
@@ -9779,6 +10014,9 @@
         <w:t xml:space="preserve"> into the light switch</w:t>
       </w:r>
       <w:r>
+        <w:t xml:space="preserve"> and the logic of the light switch had become simplified</w:t>
+      </w:r>
+      <w:r>
         <w:t>,</w:t>
       </w:r>
       <w:r>
@@ -9807,11 +10045,11 @@
       <w:pPr>
         <w:pStyle w:val="Heading3"/>
       </w:pPr>
-      <w:bookmarkStart w:id="34" w:name="_Toc223965882"/>
+      <w:bookmarkStart w:id="35" w:name="_Toc223984345"/>
       <w:r>
         <w:t>Flow Tweaks</w:t>
       </w:r>
-      <w:bookmarkEnd w:id="34"/>
+      <w:bookmarkEnd w:id="35"/>
     </w:p>
     <w:p>
       <w:r>
@@ -9897,11 +10135,11 @@
       <w:pPr>
         <w:pStyle w:val="Heading3"/>
       </w:pPr>
-      <w:bookmarkStart w:id="35" w:name="_Toc223965883"/>
+      <w:bookmarkStart w:id="36" w:name="_Toc223984346"/>
       <w:r>
         <w:t>Gaze Detection Refinements</w:t>
       </w:r>
-      <w:bookmarkEnd w:id="35"/>
+      <w:bookmarkEnd w:id="36"/>
     </w:p>
     <w:p>
       <w:pPr>
@@ -9959,22 +10197,22 @@
       <w:pPr>
         <w:pStyle w:val="Heading1"/>
       </w:pPr>
-      <w:bookmarkStart w:id="36" w:name="_Toc223965884"/>
+      <w:bookmarkStart w:id="37" w:name="_Toc223984347"/>
       <w:r>
         <w:lastRenderedPageBreak/>
         <w:t>Results</w:t>
       </w:r>
-      <w:bookmarkEnd w:id="36"/>
+      <w:bookmarkEnd w:id="37"/>
     </w:p>
     <w:p>
       <w:pPr>
         <w:pStyle w:val="Heading2"/>
       </w:pPr>
-      <w:bookmarkStart w:id="37" w:name="_Toc223965885"/>
+      <w:bookmarkStart w:id="38" w:name="_Toc223984348"/>
       <w:r>
         <w:t>Prototype Tests</w:t>
       </w:r>
-      <w:bookmarkEnd w:id="37"/>
+      <w:bookmarkEnd w:id="38"/>
     </w:p>
     <w:p>
       <w:r>
@@ -10066,7 +10304,7 @@
       <w:pPr>
         <w:pStyle w:val="Heading3"/>
       </w:pPr>
-      <w:bookmarkStart w:id="38" w:name="_Toc223965886"/>
+      <w:bookmarkStart w:id="39" w:name="_Toc223984349"/>
       <w:r>
         <w:t>Interaction</w:t>
       </w:r>
@@ -10076,7 +10314,7 @@
       <w:r>
         <w:t xml:space="preserve"> and Objective Understanding</w:t>
       </w:r>
-      <w:bookmarkEnd w:id="38"/>
+      <w:bookmarkEnd w:id="39"/>
     </w:p>
     <w:p>
       <w:r>
@@ -10227,11 +10465,11 @@
       <w:pPr>
         <w:pStyle w:val="Heading3"/>
       </w:pPr>
-      <w:bookmarkStart w:id="39" w:name="_Toc223965887"/>
+      <w:bookmarkStart w:id="40" w:name="_Toc223984350"/>
       <w:r>
         <w:t>User Attention Detection</w:t>
       </w:r>
-      <w:bookmarkEnd w:id="39"/>
+      <w:bookmarkEnd w:id="40"/>
     </w:p>
     <w:p>
       <w:r>
@@ -10284,11 +10522,11 @@
       <w:pPr>
         <w:pStyle w:val="Heading3"/>
       </w:pPr>
-      <w:bookmarkStart w:id="40" w:name="_Toc223965888"/>
+      <w:bookmarkStart w:id="41" w:name="_Toc223984351"/>
       <w:r>
         <w:t>Symptom Simulations</w:t>
       </w:r>
-      <w:bookmarkEnd w:id="40"/>
+      <w:bookmarkEnd w:id="41"/>
     </w:p>
     <w:p>
       <w:r>
@@ -10426,7 +10664,7 @@
       <w:pPr>
         <w:pStyle w:val="Heading3"/>
       </w:pPr>
-      <w:bookmarkStart w:id="41" w:name="_Toc223965889"/>
+      <w:bookmarkStart w:id="42" w:name="_Toc223984352"/>
       <w:r>
         <w:t xml:space="preserve">Improvements to be </w:t>
       </w:r>
@@ -10436,7 +10674,7 @@
       <w:r>
         <w:t>ade</w:t>
       </w:r>
-      <w:bookmarkEnd w:id="41"/>
+      <w:bookmarkEnd w:id="42"/>
     </w:p>
     <w:p>
       <w:r>
@@ -10476,12 +10714,12 @@
       <w:pPr>
         <w:pStyle w:val="Heading2"/>
       </w:pPr>
-      <w:bookmarkStart w:id="42" w:name="_Toc223965890"/>
+      <w:bookmarkStart w:id="43" w:name="_Toc223984353"/>
       <w:r>
         <w:lastRenderedPageBreak/>
         <w:t>Final Version Tests</w:t>
       </w:r>
-      <w:bookmarkEnd w:id="42"/>
+      <w:bookmarkEnd w:id="43"/>
     </w:p>
     <w:p>
       <w:r>
@@ -10516,15 +10754,21 @@
       <w:pPr>
         <w:pStyle w:val="Heading3"/>
       </w:pPr>
-      <w:bookmarkStart w:id="43" w:name="_Toc223965891"/>
+      <w:bookmarkStart w:id="44" w:name="_Toc223984354"/>
       <w:r>
         <w:t>Interaction Objects and Objective Understanding</w:t>
       </w:r>
-      <w:bookmarkEnd w:id="43"/>
-    </w:p>
-    <w:p>
-      <w:r>
-        <w:t xml:space="preserve">After feedback was received regarding how clunky the light switch interactions were, the hand physics collisions were removed. Doing this allowed the hand controller components of the VR Pawn to interact with the light switch freely, triggering the switch without needing to be </w:t>
+      <w:bookmarkEnd w:id="44"/>
+    </w:p>
+    <w:p>
+      <w:r>
+        <w:t>After feedback was received regarding how clunky the light switch interactions were, the hand physics collisions were removed</w:t>
+      </w:r>
+      <w:r>
+        <w:t xml:space="preserve"> and the logic was simplified</w:t>
+      </w:r>
+      <w:r>
+        <w:t xml:space="preserve">. Doing this allowed the hand controller components of the VR Pawn to interact with the light switch freely, triggering the switch without needing to be </w:t>
       </w:r>
       <w:r>
         <w:t>at</w:t>
@@ -10564,11 +10808,11 @@
       <w:pPr>
         <w:pStyle w:val="Heading3"/>
       </w:pPr>
-      <w:bookmarkStart w:id="44" w:name="_Toc223965892"/>
+      <w:bookmarkStart w:id="45" w:name="_Toc223984355"/>
       <w:r>
         <w:t>User Attention Detection</w:t>
       </w:r>
-      <w:bookmarkEnd w:id="44"/>
+      <w:bookmarkEnd w:id="45"/>
     </w:p>
     <w:p>
       <w:r>
@@ -10627,14 +10871,14 @@
       <w:pPr>
         <w:pStyle w:val="Heading3"/>
       </w:pPr>
-      <w:bookmarkStart w:id="45" w:name="_Toc223965893"/>
+      <w:bookmarkStart w:id="46" w:name="_Toc223984356"/>
       <w:r>
         <w:t>Symptom Simulation</w:t>
       </w:r>
       <w:r>
         <w:t>s</w:t>
       </w:r>
-      <w:bookmarkEnd w:id="45"/>
+      <w:bookmarkEnd w:id="46"/>
     </w:p>
     <w:p>
       <w:r>
@@ -10670,12 +10914,12 @@
       <w:pPr>
         <w:pStyle w:val="Heading1"/>
       </w:pPr>
-      <w:bookmarkStart w:id="46" w:name="_Toc223965894"/>
+      <w:bookmarkStart w:id="47" w:name="_Toc223984357"/>
       <w:r>
         <w:lastRenderedPageBreak/>
         <w:t>Critical Evaluation</w:t>
       </w:r>
-      <w:bookmarkEnd w:id="46"/>
+      <w:bookmarkEnd w:id="47"/>
     </w:p>
     <w:p>
       <w:r>
@@ -10724,29 +10968,33 @@
       <w:pPr>
         <w:pStyle w:val="Heading1"/>
       </w:pPr>
-      <w:bookmarkStart w:id="47" w:name="_Toc223965895"/>
+      <w:bookmarkStart w:id="48" w:name="_Toc223984358"/>
       <w:r>
         <w:lastRenderedPageBreak/>
         <w:t>Conclusions and Future Work</w:t>
       </w:r>
-      <w:bookmarkEnd w:id="47"/>
+      <w:bookmarkEnd w:id="48"/>
     </w:p>
     <w:p>
       <w:pPr>
         <w:pStyle w:val="Heading2"/>
       </w:pPr>
+      <w:bookmarkStart w:id="49" w:name="_Toc223984359"/>
       <w:r>
         <w:t>Conclusion</w:t>
       </w:r>
+      <w:bookmarkEnd w:id="49"/>
     </w:p>
     <w:p/>
     <w:p>
       <w:pPr>
         <w:pStyle w:val="Heading2"/>
       </w:pPr>
+      <w:bookmarkStart w:id="50" w:name="_Toc223984360"/>
       <w:r>
         <w:t>Future Work</w:t>
       </w:r>
+      <w:bookmarkEnd w:id="50"/>
     </w:p>
     <w:p>
       <w:pPr>
@@ -10827,12 +11075,12 @@
       <w:pPr>
         <w:pStyle w:val="Heading1"/>
       </w:pPr>
-      <w:bookmarkStart w:id="48" w:name="_Toc223965896"/>
+      <w:bookmarkStart w:id="51" w:name="_Toc223984361"/>
       <w:r>
         <w:lastRenderedPageBreak/>
         <w:t>References</w:t>
       </w:r>
-      <w:bookmarkEnd w:id="48"/>
+      <w:bookmarkEnd w:id="51"/>
     </w:p>
     <w:p>
       <w:r>
@@ -10851,15 +11099,7 @@
     </w:p>
     <w:p>
       <w:r>
-        <w:t xml:space="preserve">Chandrasekhara, R.S., Low, C., Lim, Y., Low, L., Mardina, F. and Nursaleha, M. (2013) ‘Computer vision syndrome: a study of knowledge and practices in university </w:t>
-      </w:r>
-      <w:proofErr w:type="gramStart"/>
-      <w:r>
-        <w:t>students’</w:t>
-      </w:r>
-      <w:proofErr w:type="gramEnd"/>
-      <w:r>
-        <w:t xml:space="preserve">. </w:t>
+        <w:t xml:space="preserve">Chandrasekhara, R.S., Low, C., Lim, Y., Low, L., Mardina, F. and Nursaleha, M. (2013) ‘Computer vision syndrome: a study of knowledge and practices in university students’. </w:t>
       </w:r>
       <w:r>
         <w:rPr>
@@ -10916,15 +11156,7 @@
     </w:p>
     <w:p>
       <w:r>
-        <w:t xml:space="preserve">Porcar, E., Pons, A. and Lorente, A. (2016) ‘Visual and ocular effects from the use of flat-panel </w:t>
-      </w:r>
-      <w:proofErr w:type="gramStart"/>
-      <w:r>
-        <w:t>displays’</w:t>
-      </w:r>
-      <w:proofErr w:type="gramEnd"/>
-      <w:r>
-        <w:t xml:space="preserve">. </w:t>
+        <w:t xml:space="preserve">Porcar, E., Pons, A. and Lorente, A. (2016) ‘Visual and ocular effects from the use of flat-panel displays’. </w:t>
       </w:r>
       <w:r>
         <w:rPr>
@@ -10939,15 +11171,7 @@
     </w:p>
     <w:p>
       <w:r>
-        <w:t xml:space="preserve">Santilli, T., Ceccacci, S., Mengoni, M. and Catia Giaconi (2025) ‘Virtual vs. traditional learning in higher education: A systematic review of comparative </w:t>
-      </w:r>
-      <w:proofErr w:type="gramStart"/>
-      <w:r>
-        <w:t>studies’</w:t>
-      </w:r>
-      <w:proofErr w:type="gramEnd"/>
-      <w:r>
-        <w:t xml:space="preserve">. </w:t>
+        <w:t xml:space="preserve">Santilli, T., Ceccacci, S., Mengoni, M. and Catia Giaconi (2025) ‘Virtual vs. traditional learning in higher education: A systematic review of comparative studies’. </w:t>
       </w:r>
       <w:r>
         <w:rPr>
@@ -11020,32 +11244,32 @@
       <w:pPr>
         <w:pStyle w:val="Heading1"/>
       </w:pPr>
-      <w:bookmarkStart w:id="49" w:name="_Toc223965897"/>
+      <w:bookmarkStart w:id="52" w:name="_Toc223984362"/>
       <w:r>
         <w:lastRenderedPageBreak/>
         <w:t>Appendix</w:t>
       </w:r>
-      <w:bookmarkEnd w:id="49"/>
+      <w:bookmarkEnd w:id="52"/>
     </w:p>
     <w:p>
       <w:pPr>
         <w:pStyle w:val="Heading2"/>
       </w:pPr>
-      <w:bookmarkStart w:id="50" w:name="_Toc223965898"/>
+      <w:bookmarkStart w:id="53" w:name="_Toc223984363"/>
       <w:r>
         <w:t>Asset Licenses and Sources</w:t>
       </w:r>
-      <w:bookmarkEnd w:id="50"/>
+      <w:bookmarkEnd w:id="53"/>
     </w:p>
     <w:p>
       <w:pPr>
         <w:pStyle w:val="Heading3"/>
       </w:pPr>
-      <w:bookmarkStart w:id="51" w:name="_Toc223965899"/>
+      <w:bookmarkStart w:id="54" w:name="_Toc223984364"/>
       <w:r>
         <w:t>Modern Office Table</w:t>
       </w:r>
-      <w:bookmarkEnd w:id="51"/>
+      <w:bookmarkEnd w:id="54"/>
     </w:p>
     <w:p>
       <w:r>
@@ -11125,11 +11349,11 @@
       <w:pPr>
         <w:pStyle w:val="Heading3"/>
       </w:pPr>
-      <w:bookmarkStart w:id="52" w:name="_Toc223965900"/>
+      <w:bookmarkStart w:id="55" w:name="_Toc223984365"/>
       <w:r>
         <w:t>Free Studio Starter Pack</w:t>
       </w:r>
-      <w:bookmarkEnd w:id="52"/>
+      <w:bookmarkEnd w:id="55"/>
     </w:p>
     <w:p>
       <w:r>
@@ -11209,11 +11433,11 @@
       <w:pPr>
         <w:pStyle w:val="Heading3"/>
       </w:pPr>
-      <w:bookmarkStart w:id="53" w:name="_Toc223965901"/>
+      <w:bookmarkStart w:id="56" w:name="_Toc223984366"/>
       <w:r>
         <w:t>General Desktop Bundle</w:t>
       </w:r>
-      <w:bookmarkEnd w:id="53"/>
+      <w:bookmarkEnd w:id="56"/>
     </w:p>
     <w:p>
       <w:r>
@@ -11293,12 +11517,12 @@
       <w:pPr>
         <w:pStyle w:val="Heading3"/>
       </w:pPr>
-      <w:bookmarkStart w:id="54" w:name="_Toc223965902"/>
+      <w:bookmarkStart w:id="57" w:name="_Toc223984367"/>
       <w:r>
         <w:lastRenderedPageBreak/>
         <w:t>General Gaming Headset</w:t>
       </w:r>
-      <w:bookmarkEnd w:id="54"/>
+      <w:bookmarkEnd w:id="57"/>
     </w:p>
     <w:p>
       <w:r>
@@ -11378,11 +11602,11 @@
       <w:pPr>
         <w:pStyle w:val="Heading3"/>
       </w:pPr>
-      <w:bookmarkStart w:id="55" w:name="_Toc223965903"/>
+      <w:bookmarkStart w:id="58" w:name="_Toc223984368"/>
       <w:r>
         <w:t>General Gaming Chair</w:t>
       </w:r>
-      <w:bookmarkEnd w:id="55"/>
+      <w:bookmarkEnd w:id="58"/>
     </w:p>
     <w:p>
       <w:r>
@@ -11462,11 +11686,11 @@
       <w:pPr>
         <w:pStyle w:val="Heading3"/>
       </w:pPr>
-      <w:bookmarkStart w:id="56" w:name="_Toc223965904"/>
+      <w:bookmarkStart w:id="59" w:name="_Toc223984369"/>
       <w:r>
         <w:t>Light Switch</w:t>
       </w:r>
-      <w:bookmarkEnd w:id="56"/>
+      <w:bookmarkEnd w:id="59"/>
     </w:p>
     <w:p>
       <w:r>
@@ -11560,7 +11784,7 @@
       <w:pPr>
         <w:pStyle w:val="Heading3"/>
       </w:pPr>
-      <w:bookmarkStart w:id="57" w:name="_Toc223965905"/>
+      <w:bookmarkStart w:id="60" w:name="_Toc223984370"/>
       <w:r>
         <w:lastRenderedPageBreak/>
         <w:t>Materials for General PC setup</w:t>
@@ -11568,7 +11792,7 @@
       <w:r>
         <w:t xml:space="preserve"> and Scenes</w:t>
       </w:r>
-      <w:bookmarkEnd w:id="57"/>
+      <w:bookmarkEnd w:id="60"/>
     </w:p>
     <w:p>
       <w:r>
@@ -11690,12 +11914,12 @@
       <w:pPr>
         <w:pStyle w:val="Heading3"/>
       </w:pPr>
-      <w:bookmarkStart w:id="58" w:name="_Toc223965906"/>
+      <w:bookmarkStart w:id="61" w:name="_Toc223984371"/>
       <w:r>
         <w:lastRenderedPageBreak/>
         <w:t>Monitor background image</w:t>
       </w:r>
-      <w:bookmarkEnd w:id="58"/>
+      <w:bookmarkEnd w:id="61"/>
     </w:p>
     <w:p>
       <w:r>
@@ -11786,12 +12010,12 @@
       <w:pPr>
         <w:pStyle w:val="Heading3"/>
       </w:pPr>
-      <w:bookmarkStart w:id="59" w:name="_Toc223965907"/>
+      <w:bookmarkStart w:id="62" w:name="_Toc223984372"/>
       <w:r>
         <w:lastRenderedPageBreak/>
         <w:t>Button Hover Sfx by Fachii</w:t>
       </w:r>
-      <w:bookmarkEnd w:id="59"/>
+      <w:bookmarkEnd w:id="62"/>
     </w:p>
     <w:p>
       <w:r>
@@ -11886,14 +12110,14 @@
     </w:p>
     <w:p/>
     <w:p>
-      <w:bookmarkStart w:id="60" w:name="_Toc223965908"/>
+      <w:bookmarkStart w:id="63" w:name="_Toc223984373"/>
       <w:r>
         <w:rPr>
           <w:rStyle w:val="Heading3Char"/>
         </w:rPr>
         <w:t>Button click Sfx by AndrewEathan</w:t>
       </w:r>
-      <w:bookmarkEnd w:id="60"/>
+      <w:bookmarkEnd w:id="63"/>
       <w:r>
         <w:t xml:space="preserve"> </w:t>
       </w:r>
@@ -11999,20 +12223,12 @@
       <w:pPr>
         <w:pStyle w:val="Heading3"/>
       </w:pPr>
-      <w:bookmarkStart w:id="61" w:name="_Toc223965909"/>
+      <w:bookmarkStart w:id="64" w:name="_Toc223984374"/>
       <w:r>
         <w:lastRenderedPageBreak/>
-        <w:t xml:space="preserve">Light Switch </w:t>
-      </w:r>
-      <w:proofErr w:type="gramStart"/>
-      <w:r>
-        <w:t>On</w:t>
-      </w:r>
-      <w:proofErr w:type="gramEnd"/>
-      <w:r>
-        <w:t xml:space="preserve"> Sfx</w:t>
-      </w:r>
-      <w:bookmarkEnd w:id="61"/>
+        <w:t>Light Switch On Sfx</w:t>
+      </w:r>
+      <w:bookmarkEnd w:id="64"/>
     </w:p>
     <w:p>
       <w:r>
@@ -12102,11 +12318,11 @@
       <w:pPr>
         <w:pStyle w:val="Heading3"/>
       </w:pPr>
-      <w:bookmarkStart w:id="62" w:name="_Toc223965910"/>
+      <w:bookmarkStart w:id="65" w:name="_Toc223984375"/>
       <w:r>
         <w:t>Light Switch Off Sfx</w:t>
       </w:r>
-      <w:bookmarkEnd w:id="62"/>
+      <w:bookmarkEnd w:id="65"/>
     </w:p>
     <w:p>
       <w:r>

</xml_diff>

<commit_message>
Completed source control paragraph
</commit_message>
<xml_diff>
--- a/30077548Thesis.docx
+++ b/30077548Thesis.docx
@@ -236,7 +236,7 @@
           <w:r>
             <w:fldChar w:fldCharType="separate"/>
           </w:r>
-          <w:hyperlink w:anchor="_Toc223984310" w:history="1">
+          <w:hyperlink w:anchor="_Toc223987269" w:history="1">
             <w:r>
               <w:rPr>
                 <w:rStyle w:val="Hyperlink"/>
@@ -263,7 +263,7 @@
                 <w:noProof/>
                 <w:webHidden/>
               </w:rPr>
-              <w:instrText xml:space="preserve"> PAGEREF _Toc223984310 \h </w:instrText>
+              <w:instrText xml:space="preserve"> PAGEREF _Toc223987269 \h </w:instrText>
             </w:r>
             <w:r>
               <w:rPr>
@@ -308,7 +308,7 @@
               <w:lang w:eastAsia="en-GB"/>
             </w:rPr>
           </w:pPr>
-          <w:hyperlink w:anchor="_Toc223984311" w:history="1">
+          <w:hyperlink w:anchor="_Toc223987270" w:history="1">
             <w:r>
               <w:rPr>
                 <w:rStyle w:val="Hyperlink"/>
@@ -335,7 +335,7 @@
                 <w:noProof/>
                 <w:webHidden/>
               </w:rPr>
-              <w:instrText xml:space="preserve"> PAGEREF _Toc223984311 \h </w:instrText>
+              <w:instrText xml:space="preserve"> PAGEREF _Toc223987270 \h </w:instrText>
             </w:r>
             <w:r>
               <w:rPr>
@@ -380,7 +380,7 @@
               <w:lang w:eastAsia="en-GB"/>
             </w:rPr>
           </w:pPr>
-          <w:hyperlink w:anchor="_Toc223984312" w:history="1">
+          <w:hyperlink w:anchor="_Toc223987271" w:history="1">
             <w:r>
               <w:rPr>
                 <w:rStyle w:val="Hyperlink"/>
@@ -407,7 +407,7 @@
                 <w:noProof/>
                 <w:webHidden/>
               </w:rPr>
-              <w:instrText xml:space="preserve"> PAGEREF _Toc223984312 \h </w:instrText>
+              <w:instrText xml:space="preserve"> PAGEREF _Toc223987271 \h </w:instrText>
             </w:r>
             <w:r>
               <w:rPr>
@@ -452,7 +452,7 @@
               <w:lang w:eastAsia="en-GB"/>
             </w:rPr>
           </w:pPr>
-          <w:hyperlink w:anchor="_Toc223984313" w:history="1">
+          <w:hyperlink w:anchor="_Toc223987272" w:history="1">
             <w:r>
               <w:rPr>
                 <w:rStyle w:val="Hyperlink"/>
@@ -479,7 +479,7 @@
                 <w:noProof/>
                 <w:webHidden/>
               </w:rPr>
-              <w:instrText xml:space="preserve"> PAGEREF _Toc223984313 \h </w:instrText>
+              <w:instrText xml:space="preserve"> PAGEREF _Toc223987272 \h </w:instrText>
             </w:r>
             <w:r>
               <w:rPr>
@@ -524,7 +524,7 @@
               <w:lang w:eastAsia="en-GB"/>
             </w:rPr>
           </w:pPr>
-          <w:hyperlink w:anchor="_Toc223984314" w:history="1">
+          <w:hyperlink w:anchor="_Toc223987273" w:history="1">
             <w:r>
               <w:rPr>
                 <w:rStyle w:val="Hyperlink"/>
@@ -551,7 +551,7 @@
                 <w:noProof/>
                 <w:webHidden/>
               </w:rPr>
-              <w:instrText xml:space="preserve"> PAGEREF _Toc223984314 \h </w:instrText>
+              <w:instrText xml:space="preserve"> PAGEREF _Toc223987273 \h </w:instrText>
             </w:r>
             <w:r>
               <w:rPr>
@@ -596,7 +596,7 @@
               <w:lang w:eastAsia="en-GB"/>
             </w:rPr>
           </w:pPr>
-          <w:hyperlink w:anchor="_Toc223984315" w:history="1">
+          <w:hyperlink w:anchor="_Toc223987274" w:history="1">
             <w:r>
               <w:rPr>
                 <w:rStyle w:val="Hyperlink"/>
@@ -623,7 +623,7 @@
                 <w:noProof/>
                 <w:webHidden/>
               </w:rPr>
-              <w:instrText xml:space="preserve"> PAGEREF _Toc223984315 \h </w:instrText>
+              <w:instrText xml:space="preserve"> PAGEREF _Toc223987274 \h </w:instrText>
             </w:r>
             <w:r>
               <w:rPr>
@@ -668,7 +668,7 @@
               <w:lang w:eastAsia="en-GB"/>
             </w:rPr>
           </w:pPr>
-          <w:hyperlink w:anchor="_Toc223984316" w:history="1">
+          <w:hyperlink w:anchor="_Toc223987275" w:history="1">
             <w:r>
               <w:rPr>
                 <w:rStyle w:val="Hyperlink"/>
@@ -695,7 +695,7 @@
                 <w:noProof/>
                 <w:webHidden/>
               </w:rPr>
-              <w:instrText xml:space="preserve"> PAGEREF _Toc223984316 \h </w:instrText>
+              <w:instrText xml:space="preserve"> PAGEREF _Toc223987275 \h </w:instrText>
             </w:r>
             <w:r>
               <w:rPr>
@@ -740,7 +740,7 @@
               <w:lang w:eastAsia="en-GB"/>
             </w:rPr>
           </w:pPr>
-          <w:hyperlink w:anchor="_Toc223984317" w:history="1">
+          <w:hyperlink w:anchor="_Toc223987276" w:history="1">
             <w:r>
               <w:rPr>
                 <w:rStyle w:val="Hyperlink"/>
@@ -767,7 +767,7 @@
                 <w:noProof/>
                 <w:webHidden/>
               </w:rPr>
-              <w:instrText xml:space="preserve"> PAGEREF _Toc223984317 \h </w:instrText>
+              <w:instrText xml:space="preserve"> PAGEREF _Toc223987276 \h </w:instrText>
             </w:r>
             <w:r>
               <w:rPr>
@@ -812,7 +812,7 @@
               <w:lang w:eastAsia="en-GB"/>
             </w:rPr>
           </w:pPr>
-          <w:hyperlink w:anchor="_Toc223984318" w:history="1">
+          <w:hyperlink w:anchor="_Toc223987277" w:history="1">
             <w:r>
               <w:rPr>
                 <w:rStyle w:val="Hyperlink"/>
@@ -839,7 +839,7 @@
                 <w:noProof/>
                 <w:webHidden/>
               </w:rPr>
-              <w:instrText xml:space="preserve"> PAGEREF _Toc223984318 \h </w:instrText>
+              <w:instrText xml:space="preserve"> PAGEREF _Toc223987277 \h </w:instrText>
             </w:r>
             <w:r>
               <w:rPr>
@@ -884,7 +884,7 @@
               <w:lang w:eastAsia="en-GB"/>
             </w:rPr>
           </w:pPr>
-          <w:hyperlink w:anchor="_Toc223984319" w:history="1">
+          <w:hyperlink w:anchor="_Toc223987278" w:history="1">
             <w:r>
               <w:rPr>
                 <w:rStyle w:val="Hyperlink"/>
@@ -911,7 +911,7 @@
                 <w:noProof/>
                 <w:webHidden/>
               </w:rPr>
-              <w:instrText xml:space="preserve"> PAGEREF _Toc223984319 \h </w:instrText>
+              <w:instrText xml:space="preserve"> PAGEREF _Toc223987278 \h </w:instrText>
             </w:r>
             <w:r>
               <w:rPr>
@@ -956,7 +956,7 @@
               <w:lang w:eastAsia="en-GB"/>
             </w:rPr>
           </w:pPr>
-          <w:hyperlink w:anchor="_Toc223984320" w:history="1">
+          <w:hyperlink w:anchor="_Toc223987279" w:history="1">
             <w:r>
               <w:rPr>
                 <w:rStyle w:val="Hyperlink"/>
@@ -983,7 +983,7 @@
                 <w:noProof/>
                 <w:webHidden/>
               </w:rPr>
-              <w:instrText xml:space="preserve"> PAGEREF _Toc223984320 \h </w:instrText>
+              <w:instrText xml:space="preserve"> PAGEREF _Toc223987279 \h </w:instrText>
             </w:r>
             <w:r>
               <w:rPr>
@@ -1028,7 +1028,7 @@
               <w:lang w:eastAsia="en-GB"/>
             </w:rPr>
           </w:pPr>
-          <w:hyperlink w:anchor="_Toc223984321" w:history="1">
+          <w:hyperlink w:anchor="_Toc223987280" w:history="1">
             <w:r>
               <w:rPr>
                 <w:rStyle w:val="Hyperlink"/>
@@ -1055,7 +1055,7 @@
                 <w:noProof/>
                 <w:webHidden/>
               </w:rPr>
-              <w:instrText xml:space="preserve"> PAGEREF _Toc223984321 \h </w:instrText>
+              <w:instrText xml:space="preserve"> PAGEREF _Toc223987280 \h </w:instrText>
             </w:r>
             <w:r>
               <w:rPr>
@@ -1100,7 +1100,7 @@
               <w:lang w:eastAsia="en-GB"/>
             </w:rPr>
           </w:pPr>
-          <w:hyperlink w:anchor="_Toc223984322" w:history="1">
+          <w:hyperlink w:anchor="_Toc223987281" w:history="1">
             <w:r>
               <w:rPr>
                 <w:rStyle w:val="Hyperlink"/>
@@ -1127,7 +1127,7 @@
                 <w:noProof/>
                 <w:webHidden/>
               </w:rPr>
-              <w:instrText xml:space="preserve"> PAGEREF _Toc223984322 \h </w:instrText>
+              <w:instrText xml:space="preserve"> PAGEREF _Toc223987281 \h </w:instrText>
             </w:r>
             <w:r>
               <w:rPr>
@@ -1172,7 +1172,7 @@
               <w:lang w:eastAsia="en-GB"/>
             </w:rPr>
           </w:pPr>
-          <w:hyperlink w:anchor="_Toc223984323" w:history="1">
+          <w:hyperlink w:anchor="_Toc223987282" w:history="1">
             <w:r>
               <w:rPr>
                 <w:rStyle w:val="Hyperlink"/>
@@ -1199,7 +1199,7 @@
                 <w:noProof/>
                 <w:webHidden/>
               </w:rPr>
-              <w:instrText xml:space="preserve"> PAGEREF _Toc223984323 \h </w:instrText>
+              <w:instrText xml:space="preserve"> PAGEREF _Toc223987282 \h </w:instrText>
             </w:r>
             <w:r>
               <w:rPr>
@@ -1244,7 +1244,7 @@
               <w:lang w:eastAsia="en-GB"/>
             </w:rPr>
           </w:pPr>
-          <w:hyperlink w:anchor="_Toc223984324" w:history="1">
+          <w:hyperlink w:anchor="_Toc223987283" w:history="1">
             <w:r>
               <w:rPr>
                 <w:rStyle w:val="Hyperlink"/>
@@ -1271,7 +1271,7 @@
                 <w:noProof/>
                 <w:webHidden/>
               </w:rPr>
-              <w:instrText xml:space="preserve"> PAGEREF _Toc223984324 \h </w:instrText>
+              <w:instrText xml:space="preserve"> PAGEREF _Toc223987283 \h </w:instrText>
             </w:r>
             <w:r>
               <w:rPr>
@@ -1316,7 +1316,7 @@
               <w:lang w:eastAsia="en-GB"/>
             </w:rPr>
           </w:pPr>
-          <w:hyperlink w:anchor="_Toc223984325" w:history="1">
+          <w:hyperlink w:anchor="_Toc223987284" w:history="1">
             <w:r>
               <w:rPr>
                 <w:rStyle w:val="Hyperlink"/>
@@ -1343,7 +1343,7 @@
                 <w:noProof/>
                 <w:webHidden/>
               </w:rPr>
-              <w:instrText xml:space="preserve"> PAGEREF _Toc223984325 \h </w:instrText>
+              <w:instrText xml:space="preserve"> PAGEREF _Toc223987284 \h </w:instrText>
             </w:r>
             <w:r>
               <w:rPr>
@@ -1388,7 +1388,7 @@
               <w:lang w:eastAsia="en-GB"/>
             </w:rPr>
           </w:pPr>
-          <w:hyperlink w:anchor="_Toc223984326" w:history="1">
+          <w:hyperlink w:anchor="_Toc223987285" w:history="1">
             <w:r>
               <w:rPr>
                 <w:rStyle w:val="Hyperlink"/>
@@ -1415,7 +1415,7 @@
                 <w:noProof/>
                 <w:webHidden/>
               </w:rPr>
-              <w:instrText xml:space="preserve"> PAGEREF _Toc223984326 \h </w:instrText>
+              <w:instrText xml:space="preserve"> PAGEREF _Toc223987285 \h </w:instrText>
             </w:r>
             <w:r>
               <w:rPr>
@@ -1460,7 +1460,7 @@
               <w:lang w:eastAsia="en-GB"/>
             </w:rPr>
           </w:pPr>
-          <w:hyperlink w:anchor="_Toc223984327" w:history="1">
+          <w:hyperlink w:anchor="_Toc223987286" w:history="1">
             <w:r>
               <w:rPr>
                 <w:rStyle w:val="Hyperlink"/>
@@ -1487,7 +1487,7 @@
                 <w:noProof/>
                 <w:webHidden/>
               </w:rPr>
-              <w:instrText xml:space="preserve"> PAGEREF _Toc223984327 \h </w:instrText>
+              <w:instrText xml:space="preserve"> PAGEREF _Toc223987286 \h </w:instrText>
             </w:r>
             <w:r>
               <w:rPr>
@@ -1532,7 +1532,7 @@
               <w:lang w:eastAsia="en-GB"/>
             </w:rPr>
           </w:pPr>
-          <w:hyperlink w:anchor="_Toc223984328" w:history="1">
+          <w:hyperlink w:anchor="_Toc223987287" w:history="1">
             <w:r>
               <w:rPr>
                 <w:rStyle w:val="Hyperlink"/>
@@ -1559,7 +1559,7 @@
                 <w:noProof/>
                 <w:webHidden/>
               </w:rPr>
-              <w:instrText xml:space="preserve"> PAGEREF _Toc223984328 \h </w:instrText>
+              <w:instrText xml:space="preserve"> PAGEREF _Toc223987287 \h </w:instrText>
             </w:r>
             <w:r>
               <w:rPr>
@@ -1604,7 +1604,7 @@
               <w:lang w:eastAsia="en-GB"/>
             </w:rPr>
           </w:pPr>
-          <w:hyperlink w:anchor="_Toc223984329" w:history="1">
+          <w:hyperlink w:anchor="_Toc223987288" w:history="1">
             <w:r>
               <w:rPr>
                 <w:rStyle w:val="Hyperlink"/>
@@ -1631,7 +1631,7 @@
                 <w:noProof/>
                 <w:webHidden/>
               </w:rPr>
-              <w:instrText xml:space="preserve"> PAGEREF _Toc223984329 \h </w:instrText>
+              <w:instrText xml:space="preserve"> PAGEREF _Toc223987288 \h </w:instrText>
             </w:r>
             <w:r>
               <w:rPr>
@@ -1676,7 +1676,7 @@
               <w:lang w:eastAsia="en-GB"/>
             </w:rPr>
           </w:pPr>
-          <w:hyperlink w:anchor="_Toc223984330" w:history="1">
+          <w:hyperlink w:anchor="_Toc223987289" w:history="1">
             <w:r>
               <w:rPr>
                 <w:rStyle w:val="Hyperlink"/>
@@ -1703,7 +1703,7 @@
                 <w:noProof/>
                 <w:webHidden/>
               </w:rPr>
-              <w:instrText xml:space="preserve"> PAGEREF _Toc223984330 \h </w:instrText>
+              <w:instrText xml:space="preserve"> PAGEREF _Toc223987289 \h </w:instrText>
             </w:r>
             <w:r>
               <w:rPr>
@@ -1748,7 +1748,7 @@
               <w:lang w:eastAsia="en-GB"/>
             </w:rPr>
           </w:pPr>
-          <w:hyperlink w:anchor="_Toc223984331" w:history="1">
+          <w:hyperlink w:anchor="_Toc223987290" w:history="1">
             <w:r>
               <w:rPr>
                 <w:rStyle w:val="Hyperlink"/>
@@ -1775,7 +1775,7 @@
                 <w:noProof/>
                 <w:webHidden/>
               </w:rPr>
-              <w:instrText xml:space="preserve"> PAGEREF _Toc223984331 \h </w:instrText>
+              <w:instrText xml:space="preserve"> PAGEREF _Toc223987290 \h </w:instrText>
             </w:r>
             <w:r>
               <w:rPr>
@@ -1820,7 +1820,7 @@
               <w:lang w:eastAsia="en-GB"/>
             </w:rPr>
           </w:pPr>
-          <w:hyperlink w:anchor="_Toc223984332" w:history="1">
+          <w:hyperlink w:anchor="_Toc223987291" w:history="1">
             <w:r>
               <w:rPr>
                 <w:rStyle w:val="Hyperlink"/>
@@ -1847,7 +1847,7 @@
                 <w:noProof/>
                 <w:webHidden/>
               </w:rPr>
-              <w:instrText xml:space="preserve"> PAGEREF _Toc223984332 \h </w:instrText>
+              <w:instrText xml:space="preserve"> PAGEREF _Toc223987291 \h </w:instrText>
             </w:r>
             <w:r>
               <w:rPr>
@@ -1892,7 +1892,7 @@
               <w:lang w:eastAsia="en-GB"/>
             </w:rPr>
           </w:pPr>
-          <w:hyperlink w:anchor="_Toc223984333" w:history="1">
+          <w:hyperlink w:anchor="_Toc223987292" w:history="1">
             <w:r>
               <w:rPr>
                 <w:rStyle w:val="Hyperlink"/>
@@ -1919,7 +1919,7 @@
                 <w:noProof/>
                 <w:webHidden/>
               </w:rPr>
-              <w:instrText xml:space="preserve"> PAGEREF _Toc223984333 \h </w:instrText>
+              <w:instrText xml:space="preserve"> PAGEREF _Toc223987292 \h </w:instrText>
             </w:r>
             <w:r>
               <w:rPr>
@@ -1964,7 +1964,7 @@
               <w:lang w:eastAsia="en-GB"/>
             </w:rPr>
           </w:pPr>
-          <w:hyperlink w:anchor="_Toc223984334" w:history="1">
+          <w:hyperlink w:anchor="_Toc223987293" w:history="1">
             <w:r>
               <w:rPr>
                 <w:rStyle w:val="Hyperlink"/>
@@ -1991,7 +1991,7 @@
                 <w:noProof/>
                 <w:webHidden/>
               </w:rPr>
-              <w:instrText xml:space="preserve"> PAGEREF _Toc223984334 \h </w:instrText>
+              <w:instrText xml:space="preserve"> PAGEREF _Toc223987293 \h </w:instrText>
             </w:r>
             <w:r>
               <w:rPr>
@@ -2036,7 +2036,7 @@
               <w:lang w:eastAsia="en-GB"/>
             </w:rPr>
           </w:pPr>
-          <w:hyperlink w:anchor="_Toc223984335" w:history="1">
+          <w:hyperlink w:anchor="_Toc223987294" w:history="1">
             <w:r>
               <w:rPr>
                 <w:rStyle w:val="Hyperlink"/>
@@ -2063,7 +2063,7 @@
                 <w:noProof/>
                 <w:webHidden/>
               </w:rPr>
-              <w:instrText xml:space="preserve"> PAGEREF _Toc223984335 \h </w:instrText>
+              <w:instrText xml:space="preserve"> PAGEREF _Toc223987294 \h </w:instrText>
             </w:r>
             <w:r>
               <w:rPr>
@@ -2108,7 +2108,7 @@
               <w:lang w:eastAsia="en-GB"/>
             </w:rPr>
           </w:pPr>
-          <w:hyperlink w:anchor="_Toc223984336" w:history="1">
+          <w:hyperlink w:anchor="_Toc223987295" w:history="1">
             <w:r>
               <w:rPr>
                 <w:rStyle w:val="Hyperlink"/>
@@ -2135,7 +2135,7 @@
                 <w:noProof/>
                 <w:webHidden/>
               </w:rPr>
-              <w:instrText xml:space="preserve"> PAGEREF _Toc223984336 \h </w:instrText>
+              <w:instrText xml:space="preserve"> PAGEREF _Toc223987295 \h </w:instrText>
             </w:r>
             <w:r>
               <w:rPr>
@@ -2180,7 +2180,7 @@
               <w:lang w:eastAsia="en-GB"/>
             </w:rPr>
           </w:pPr>
-          <w:hyperlink w:anchor="_Toc223984337" w:history="1">
+          <w:hyperlink w:anchor="_Toc223987296" w:history="1">
             <w:r>
               <w:rPr>
                 <w:rStyle w:val="Hyperlink"/>
@@ -2207,7 +2207,7 @@
                 <w:noProof/>
                 <w:webHidden/>
               </w:rPr>
-              <w:instrText xml:space="preserve"> PAGEREF _Toc223984337 \h </w:instrText>
+              <w:instrText xml:space="preserve"> PAGEREF _Toc223987296 \h </w:instrText>
             </w:r>
             <w:r>
               <w:rPr>
@@ -2252,7 +2252,7 @@
               <w:lang w:eastAsia="en-GB"/>
             </w:rPr>
           </w:pPr>
-          <w:hyperlink w:anchor="_Toc223984338" w:history="1">
+          <w:hyperlink w:anchor="_Toc223987297" w:history="1">
             <w:r>
               <w:rPr>
                 <w:rStyle w:val="Hyperlink"/>
@@ -2279,7 +2279,7 @@
                 <w:noProof/>
                 <w:webHidden/>
               </w:rPr>
-              <w:instrText xml:space="preserve"> PAGEREF _Toc223984338 \h </w:instrText>
+              <w:instrText xml:space="preserve"> PAGEREF _Toc223987297 \h </w:instrText>
             </w:r>
             <w:r>
               <w:rPr>
@@ -2299,7 +2299,7 @@
                 <w:noProof/>
                 <w:webHidden/>
               </w:rPr>
-              <w:t>18</w:t>
+              <w:t>19</w:t>
             </w:r>
             <w:r>
               <w:rPr>
@@ -2324,7 +2324,7 @@
               <w:lang w:eastAsia="en-GB"/>
             </w:rPr>
           </w:pPr>
-          <w:hyperlink w:anchor="_Toc223984339" w:history="1">
+          <w:hyperlink w:anchor="_Toc223987298" w:history="1">
             <w:r>
               <w:rPr>
                 <w:rStyle w:val="Hyperlink"/>
@@ -2351,7 +2351,7 @@
                 <w:noProof/>
                 <w:webHidden/>
               </w:rPr>
-              <w:instrText xml:space="preserve"> PAGEREF _Toc223984339 \h </w:instrText>
+              <w:instrText xml:space="preserve"> PAGEREF _Toc223987298 \h </w:instrText>
             </w:r>
             <w:r>
               <w:rPr>
@@ -2396,7 +2396,7 @@
               <w:lang w:eastAsia="en-GB"/>
             </w:rPr>
           </w:pPr>
-          <w:hyperlink w:anchor="_Toc223984340" w:history="1">
+          <w:hyperlink w:anchor="_Toc223987299" w:history="1">
             <w:r>
               <w:rPr>
                 <w:rStyle w:val="Hyperlink"/>
@@ -2423,7 +2423,7 @@
                 <w:noProof/>
                 <w:webHidden/>
               </w:rPr>
-              <w:instrText xml:space="preserve"> PAGEREF _Toc223984340 \h </w:instrText>
+              <w:instrText xml:space="preserve"> PAGEREF _Toc223987299 \h </w:instrText>
             </w:r>
             <w:r>
               <w:rPr>
@@ -2468,7 +2468,7 @@
               <w:lang w:eastAsia="en-GB"/>
             </w:rPr>
           </w:pPr>
-          <w:hyperlink w:anchor="_Toc223984341" w:history="1">
+          <w:hyperlink w:anchor="_Toc223987300" w:history="1">
             <w:r>
               <w:rPr>
                 <w:rStyle w:val="Hyperlink"/>
@@ -2495,7 +2495,7 @@
                 <w:noProof/>
                 <w:webHidden/>
               </w:rPr>
-              <w:instrText xml:space="preserve"> PAGEREF _Toc223984341 \h </w:instrText>
+              <w:instrText xml:space="preserve"> PAGEREF _Toc223987300 \h </w:instrText>
             </w:r>
             <w:r>
               <w:rPr>
@@ -2540,7 +2540,7 @@
               <w:lang w:eastAsia="en-GB"/>
             </w:rPr>
           </w:pPr>
-          <w:hyperlink w:anchor="_Toc223984342" w:history="1">
+          <w:hyperlink w:anchor="_Toc223987301" w:history="1">
             <w:r>
               <w:rPr>
                 <w:rStyle w:val="Hyperlink"/>
@@ -2567,7 +2567,7 @@
                 <w:noProof/>
                 <w:webHidden/>
               </w:rPr>
-              <w:instrText xml:space="preserve"> PAGEREF _Toc223984342 \h </w:instrText>
+              <w:instrText xml:space="preserve"> PAGEREF _Toc223987301 \h </w:instrText>
             </w:r>
             <w:r>
               <w:rPr>
@@ -2612,7 +2612,7 @@
               <w:lang w:eastAsia="en-GB"/>
             </w:rPr>
           </w:pPr>
-          <w:hyperlink w:anchor="_Toc223984343" w:history="1">
+          <w:hyperlink w:anchor="_Toc223987302" w:history="1">
             <w:r>
               <w:rPr>
                 <w:rStyle w:val="Hyperlink"/>
@@ -2639,7 +2639,7 @@
                 <w:noProof/>
                 <w:webHidden/>
               </w:rPr>
-              <w:instrText xml:space="preserve"> PAGEREF _Toc223984343 \h </w:instrText>
+              <w:instrText xml:space="preserve"> PAGEREF _Toc223987302 \h </w:instrText>
             </w:r>
             <w:r>
               <w:rPr>
@@ -2684,7 +2684,7 @@
               <w:lang w:eastAsia="en-GB"/>
             </w:rPr>
           </w:pPr>
-          <w:hyperlink w:anchor="_Toc223984344" w:history="1">
+          <w:hyperlink w:anchor="_Toc223987303" w:history="1">
             <w:r>
               <w:rPr>
                 <w:rStyle w:val="Hyperlink"/>
@@ -2711,7 +2711,7 @@
                 <w:noProof/>
                 <w:webHidden/>
               </w:rPr>
-              <w:instrText xml:space="preserve"> PAGEREF _Toc223984344 \h </w:instrText>
+              <w:instrText xml:space="preserve"> PAGEREF _Toc223987303 \h </w:instrText>
             </w:r>
             <w:r>
               <w:rPr>
@@ -2756,7 +2756,7 @@
               <w:lang w:eastAsia="en-GB"/>
             </w:rPr>
           </w:pPr>
-          <w:hyperlink w:anchor="_Toc223984345" w:history="1">
+          <w:hyperlink w:anchor="_Toc223987304" w:history="1">
             <w:r>
               <w:rPr>
                 <w:rStyle w:val="Hyperlink"/>
@@ -2783,7 +2783,7 @@
                 <w:noProof/>
                 <w:webHidden/>
               </w:rPr>
-              <w:instrText xml:space="preserve"> PAGEREF _Toc223984345 \h </w:instrText>
+              <w:instrText xml:space="preserve"> PAGEREF _Toc223987304 \h </w:instrText>
             </w:r>
             <w:r>
               <w:rPr>
@@ -2828,7 +2828,7 @@
               <w:lang w:eastAsia="en-GB"/>
             </w:rPr>
           </w:pPr>
-          <w:hyperlink w:anchor="_Toc223984346" w:history="1">
+          <w:hyperlink w:anchor="_Toc223987305" w:history="1">
             <w:r>
               <w:rPr>
                 <w:rStyle w:val="Hyperlink"/>
@@ -2855,7 +2855,7 @@
                 <w:noProof/>
                 <w:webHidden/>
               </w:rPr>
-              <w:instrText xml:space="preserve"> PAGEREF _Toc223984346 \h </w:instrText>
+              <w:instrText xml:space="preserve"> PAGEREF _Toc223987305 \h </w:instrText>
             </w:r>
             <w:r>
               <w:rPr>
@@ -2900,7 +2900,7 @@
               <w:lang w:eastAsia="en-GB"/>
             </w:rPr>
           </w:pPr>
-          <w:hyperlink w:anchor="_Toc223984347" w:history="1">
+          <w:hyperlink w:anchor="_Toc223987306" w:history="1">
             <w:r>
               <w:rPr>
                 <w:rStyle w:val="Hyperlink"/>
@@ -2927,7 +2927,7 @@
                 <w:noProof/>
                 <w:webHidden/>
               </w:rPr>
-              <w:instrText xml:space="preserve"> PAGEREF _Toc223984347 \h </w:instrText>
+              <w:instrText xml:space="preserve"> PAGEREF _Toc223987306 \h </w:instrText>
             </w:r>
             <w:r>
               <w:rPr>
@@ -2972,7 +2972,7 @@
               <w:lang w:eastAsia="en-GB"/>
             </w:rPr>
           </w:pPr>
-          <w:hyperlink w:anchor="_Toc223984348" w:history="1">
+          <w:hyperlink w:anchor="_Toc223987307" w:history="1">
             <w:r>
               <w:rPr>
                 <w:rStyle w:val="Hyperlink"/>
@@ -2999,7 +2999,7 @@
                 <w:noProof/>
                 <w:webHidden/>
               </w:rPr>
-              <w:instrText xml:space="preserve"> PAGEREF _Toc223984348 \h </w:instrText>
+              <w:instrText xml:space="preserve"> PAGEREF _Toc223987307 \h </w:instrText>
             </w:r>
             <w:r>
               <w:rPr>
@@ -3044,7 +3044,7 @@
               <w:lang w:eastAsia="en-GB"/>
             </w:rPr>
           </w:pPr>
-          <w:hyperlink w:anchor="_Toc223984349" w:history="1">
+          <w:hyperlink w:anchor="_Toc223987308" w:history="1">
             <w:r>
               <w:rPr>
                 <w:rStyle w:val="Hyperlink"/>
@@ -3071,7 +3071,7 @@
                 <w:noProof/>
                 <w:webHidden/>
               </w:rPr>
-              <w:instrText xml:space="preserve"> PAGEREF _Toc223984349 \h </w:instrText>
+              <w:instrText xml:space="preserve"> PAGEREF _Toc223987308 \h </w:instrText>
             </w:r>
             <w:r>
               <w:rPr>
@@ -3116,7 +3116,7 @@
               <w:lang w:eastAsia="en-GB"/>
             </w:rPr>
           </w:pPr>
-          <w:hyperlink w:anchor="_Toc223984350" w:history="1">
+          <w:hyperlink w:anchor="_Toc223987309" w:history="1">
             <w:r>
               <w:rPr>
                 <w:rStyle w:val="Hyperlink"/>
@@ -3143,7 +3143,7 @@
                 <w:noProof/>
                 <w:webHidden/>
               </w:rPr>
-              <w:instrText xml:space="preserve"> PAGEREF _Toc223984350 \h </w:instrText>
+              <w:instrText xml:space="preserve"> PAGEREF _Toc223987309 \h </w:instrText>
             </w:r>
             <w:r>
               <w:rPr>
@@ -3188,7 +3188,7 @@
               <w:lang w:eastAsia="en-GB"/>
             </w:rPr>
           </w:pPr>
-          <w:hyperlink w:anchor="_Toc223984351" w:history="1">
+          <w:hyperlink w:anchor="_Toc223987310" w:history="1">
             <w:r>
               <w:rPr>
                 <w:rStyle w:val="Hyperlink"/>
@@ -3215,7 +3215,7 @@
                 <w:noProof/>
                 <w:webHidden/>
               </w:rPr>
-              <w:instrText xml:space="preserve"> PAGEREF _Toc223984351 \h </w:instrText>
+              <w:instrText xml:space="preserve"> PAGEREF _Toc223987310 \h </w:instrText>
             </w:r>
             <w:r>
               <w:rPr>
@@ -3260,7 +3260,7 @@
               <w:lang w:eastAsia="en-GB"/>
             </w:rPr>
           </w:pPr>
-          <w:hyperlink w:anchor="_Toc223984352" w:history="1">
+          <w:hyperlink w:anchor="_Toc223987311" w:history="1">
             <w:r>
               <w:rPr>
                 <w:rStyle w:val="Hyperlink"/>
@@ -3287,7 +3287,7 @@
                 <w:noProof/>
                 <w:webHidden/>
               </w:rPr>
-              <w:instrText xml:space="preserve"> PAGEREF _Toc223984352 \h </w:instrText>
+              <w:instrText xml:space="preserve"> PAGEREF _Toc223987311 \h </w:instrText>
             </w:r>
             <w:r>
               <w:rPr>
@@ -3332,7 +3332,7 @@
               <w:lang w:eastAsia="en-GB"/>
             </w:rPr>
           </w:pPr>
-          <w:hyperlink w:anchor="_Toc223984353" w:history="1">
+          <w:hyperlink w:anchor="_Toc223987312" w:history="1">
             <w:r>
               <w:rPr>
                 <w:rStyle w:val="Hyperlink"/>
@@ -3359,7 +3359,7 @@
                 <w:noProof/>
                 <w:webHidden/>
               </w:rPr>
-              <w:instrText xml:space="preserve"> PAGEREF _Toc223984353 \h </w:instrText>
+              <w:instrText xml:space="preserve"> PAGEREF _Toc223987312 \h </w:instrText>
             </w:r>
             <w:r>
               <w:rPr>
@@ -3404,7 +3404,7 @@
               <w:lang w:eastAsia="en-GB"/>
             </w:rPr>
           </w:pPr>
-          <w:hyperlink w:anchor="_Toc223984354" w:history="1">
+          <w:hyperlink w:anchor="_Toc223987313" w:history="1">
             <w:r>
               <w:rPr>
                 <w:rStyle w:val="Hyperlink"/>
@@ -3431,7 +3431,7 @@
                 <w:noProof/>
                 <w:webHidden/>
               </w:rPr>
-              <w:instrText xml:space="preserve"> PAGEREF _Toc223984354 \h </w:instrText>
+              <w:instrText xml:space="preserve"> PAGEREF _Toc223987313 \h </w:instrText>
             </w:r>
             <w:r>
               <w:rPr>
@@ -3476,7 +3476,7 @@
               <w:lang w:eastAsia="en-GB"/>
             </w:rPr>
           </w:pPr>
-          <w:hyperlink w:anchor="_Toc223984355" w:history="1">
+          <w:hyperlink w:anchor="_Toc223987314" w:history="1">
             <w:r>
               <w:rPr>
                 <w:rStyle w:val="Hyperlink"/>
@@ -3503,7 +3503,7 @@
                 <w:noProof/>
                 <w:webHidden/>
               </w:rPr>
-              <w:instrText xml:space="preserve"> PAGEREF _Toc223984355 \h </w:instrText>
+              <w:instrText xml:space="preserve"> PAGEREF _Toc223987314 \h </w:instrText>
             </w:r>
             <w:r>
               <w:rPr>
@@ -3548,7 +3548,7 @@
               <w:lang w:eastAsia="en-GB"/>
             </w:rPr>
           </w:pPr>
-          <w:hyperlink w:anchor="_Toc223984356" w:history="1">
+          <w:hyperlink w:anchor="_Toc223987315" w:history="1">
             <w:r>
               <w:rPr>
                 <w:rStyle w:val="Hyperlink"/>
@@ -3575,7 +3575,7 @@
                 <w:noProof/>
                 <w:webHidden/>
               </w:rPr>
-              <w:instrText xml:space="preserve"> PAGEREF _Toc223984356 \h </w:instrText>
+              <w:instrText xml:space="preserve"> PAGEREF _Toc223987315 \h </w:instrText>
             </w:r>
             <w:r>
               <w:rPr>
@@ -3620,7 +3620,7 @@
               <w:lang w:eastAsia="en-GB"/>
             </w:rPr>
           </w:pPr>
-          <w:hyperlink w:anchor="_Toc223984357" w:history="1">
+          <w:hyperlink w:anchor="_Toc223987316" w:history="1">
             <w:r>
               <w:rPr>
                 <w:rStyle w:val="Hyperlink"/>
@@ -3647,7 +3647,7 @@
                 <w:noProof/>
                 <w:webHidden/>
               </w:rPr>
-              <w:instrText xml:space="preserve"> PAGEREF _Toc223984357 \h </w:instrText>
+              <w:instrText xml:space="preserve"> PAGEREF _Toc223987316 \h </w:instrText>
             </w:r>
             <w:r>
               <w:rPr>
@@ -3692,7 +3692,7 @@
               <w:lang w:eastAsia="en-GB"/>
             </w:rPr>
           </w:pPr>
-          <w:hyperlink w:anchor="_Toc223984358" w:history="1">
+          <w:hyperlink w:anchor="_Toc223987317" w:history="1">
             <w:r>
               <w:rPr>
                 <w:rStyle w:val="Hyperlink"/>
@@ -3719,7 +3719,7 @@
                 <w:noProof/>
                 <w:webHidden/>
               </w:rPr>
-              <w:instrText xml:space="preserve"> PAGEREF _Toc223984358 \h </w:instrText>
+              <w:instrText xml:space="preserve"> PAGEREF _Toc223987317 \h </w:instrText>
             </w:r>
             <w:r>
               <w:rPr>
@@ -3764,7 +3764,7 @@
               <w:lang w:eastAsia="en-GB"/>
             </w:rPr>
           </w:pPr>
-          <w:hyperlink w:anchor="_Toc223984359" w:history="1">
+          <w:hyperlink w:anchor="_Toc223987318" w:history="1">
             <w:r>
               <w:rPr>
                 <w:rStyle w:val="Hyperlink"/>
@@ -3791,7 +3791,7 @@
                 <w:noProof/>
                 <w:webHidden/>
               </w:rPr>
-              <w:instrText xml:space="preserve"> PAGEREF _Toc223984359 \h </w:instrText>
+              <w:instrText xml:space="preserve"> PAGEREF _Toc223987318 \h </w:instrText>
             </w:r>
             <w:r>
               <w:rPr>
@@ -3836,7 +3836,7 @@
               <w:lang w:eastAsia="en-GB"/>
             </w:rPr>
           </w:pPr>
-          <w:hyperlink w:anchor="_Toc223984360" w:history="1">
+          <w:hyperlink w:anchor="_Toc223987319" w:history="1">
             <w:r>
               <w:rPr>
                 <w:rStyle w:val="Hyperlink"/>
@@ -3863,7 +3863,7 @@
                 <w:noProof/>
                 <w:webHidden/>
               </w:rPr>
-              <w:instrText xml:space="preserve"> PAGEREF _Toc223984360 \h </w:instrText>
+              <w:instrText xml:space="preserve"> PAGEREF _Toc223987319 \h </w:instrText>
             </w:r>
             <w:r>
               <w:rPr>
@@ -3908,7 +3908,7 @@
               <w:lang w:eastAsia="en-GB"/>
             </w:rPr>
           </w:pPr>
-          <w:hyperlink w:anchor="_Toc223984361" w:history="1">
+          <w:hyperlink w:anchor="_Toc223987320" w:history="1">
             <w:r>
               <w:rPr>
                 <w:rStyle w:val="Hyperlink"/>
@@ -3935,7 +3935,7 @@
                 <w:noProof/>
                 <w:webHidden/>
               </w:rPr>
-              <w:instrText xml:space="preserve"> PAGEREF _Toc223984361 \h </w:instrText>
+              <w:instrText xml:space="preserve"> PAGEREF _Toc223987320 \h </w:instrText>
             </w:r>
             <w:r>
               <w:rPr>
@@ -3980,7 +3980,7 @@
               <w:lang w:eastAsia="en-GB"/>
             </w:rPr>
           </w:pPr>
-          <w:hyperlink w:anchor="_Toc223984362" w:history="1">
+          <w:hyperlink w:anchor="_Toc223987321" w:history="1">
             <w:r>
               <w:rPr>
                 <w:rStyle w:val="Hyperlink"/>
@@ -4007,7 +4007,7 @@
                 <w:noProof/>
                 <w:webHidden/>
               </w:rPr>
-              <w:instrText xml:space="preserve"> PAGEREF _Toc223984362 \h </w:instrText>
+              <w:instrText xml:space="preserve"> PAGEREF _Toc223987321 \h </w:instrText>
             </w:r>
             <w:r>
               <w:rPr>
@@ -4052,7 +4052,7 @@
               <w:lang w:eastAsia="en-GB"/>
             </w:rPr>
           </w:pPr>
-          <w:hyperlink w:anchor="_Toc223984363" w:history="1">
+          <w:hyperlink w:anchor="_Toc223987322" w:history="1">
             <w:r>
               <w:rPr>
                 <w:rStyle w:val="Hyperlink"/>
@@ -4079,7 +4079,7 @@
                 <w:noProof/>
                 <w:webHidden/>
               </w:rPr>
-              <w:instrText xml:space="preserve"> PAGEREF _Toc223984363 \h </w:instrText>
+              <w:instrText xml:space="preserve"> PAGEREF _Toc223987322 \h </w:instrText>
             </w:r>
             <w:r>
               <w:rPr>
@@ -4124,7 +4124,7 @@
               <w:lang w:eastAsia="en-GB"/>
             </w:rPr>
           </w:pPr>
-          <w:hyperlink w:anchor="_Toc223984364" w:history="1">
+          <w:hyperlink w:anchor="_Toc223987323" w:history="1">
             <w:r>
               <w:rPr>
                 <w:rStyle w:val="Hyperlink"/>
@@ -4151,7 +4151,7 @@
                 <w:noProof/>
                 <w:webHidden/>
               </w:rPr>
-              <w:instrText xml:space="preserve"> PAGEREF _Toc223984364 \h </w:instrText>
+              <w:instrText xml:space="preserve"> PAGEREF _Toc223987323 \h </w:instrText>
             </w:r>
             <w:r>
               <w:rPr>
@@ -4196,7 +4196,7 @@
               <w:lang w:eastAsia="en-GB"/>
             </w:rPr>
           </w:pPr>
-          <w:hyperlink w:anchor="_Toc223984365" w:history="1">
+          <w:hyperlink w:anchor="_Toc223987324" w:history="1">
             <w:r>
               <w:rPr>
                 <w:rStyle w:val="Hyperlink"/>
@@ -4223,7 +4223,7 @@
                 <w:noProof/>
                 <w:webHidden/>
               </w:rPr>
-              <w:instrText xml:space="preserve"> PAGEREF _Toc223984365 \h </w:instrText>
+              <w:instrText xml:space="preserve"> PAGEREF _Toc223987324 \h </w:instrText>
             </w:r>
             <w:r>
               <w:rPr>
@@ -4268,7 +4268,7 @@
               <w:lang w:eastAsia="en-GB"/>
             </w:rPr>
           </w:pPr>
-          <w:hyperlink w:anchor="_Toc223984366" w:history="1">
+          <w:hyperlink w:anchor="_Toc223987325" w:history="1">
             <w:r>
               <w:rPr>
                 <w:rStyle w:val="Hyperlink"/>
@@ -4295,7 +4295,7 @@
                 <w:noProof/>
                 <w:webHidden/>
               </w:rPr>
-              <w:instrText xml:space="preserve"> PAGEREF _Toc223984366 \h </w:instrText>
+              <w:instrText xml:space="preserve"> PAGEREF _Toc223987325 \h </w:instrText>
             </w:r>
             <w:r>
               <w:rPr>
@@ -4340,7 +4340,7 @@
               <w:lang w:eastAsia="en-GB"/>
             </w:rPr>
           </w:pPr>
-          <w:hyperlink w:anchor="_Toc223984367" w:history="1">
+          <w:hyperlink w:anchor="_Toc223987326" w:history="1">
             <w:r>
               <w:rPr>
                 <w:rStyle w:val="Hyperlink"/>
@@ -4367,7 +4367,7 @@
                 <w:noProof/>
                 <w:webHidden/>
               </w:rPr>
-              <w:instrText xml:space="preserve"> PAGEREF _Toc223984367 \h </w:instrText>
+              <w:instrText xml:space="preserve"> PAGEREF _Toc223987326 \h </w:instrText>
             </w:r>
             <w:r>
               <w:rPr>
@@ -4412,7 +4412,7 @@
               <w:lang w:eastAsia="en-GB"/>
             </w:rPr>
           </w:pPr>
-          <w:hyperlink w:anchor="_Toc223984368" w:history="1">
+          <w:hyperlink w:anchor="_Toc223987327" w:history="1">
             <w:r>
               <w:rPr>
                 <w:rStyle w:val="Hyperlink"/>
@@ -4439,7 +4439,7 @@
                 <w:noProof/>
                 <w:webHidden/>
               </w:rPr>
-              <w:instrText xml:space="preserve"> PAGEREF _Toc223984368 \h </w:instrText>
+              <w:instrText xml:space="preserve"> PAGEREF _Toc223987327 \h </w:instrText>
             </w:r>
             <w:r>
               <w:rPr>
@@ -4484,7 +4484,7 @@
               <w:lang w:eastAsia="en-GB"/>
             </w:rPr>
           </w:pPr>
-          <w:hyperlink w:anchor="_Toc223984369" w:history="1">
+          <w:hyperlink w:anchor="_Toc223987328" w:history="1">
             <w:r>
               <w:rPr>
                 <w:rStyle w:val="Hyperlink"/>
@@ -4511,7 +4511,7 @@
                 <w:noProof/>
                 <w:webHidden/>
               </w:rPr>
-              <w:instrText xml:space="preserve"> PAGEREF _Toc223984369 \h </w:instrText>
+              <w:instrText xml:space="preserve"> PAGEREF _Toc223987328 \h </w:instrText>
             </w:r>
             <w:r>
               <w:rPr>
@@ -4556,7 +4556,7 @@
               <w:lang w:eastAsia="en-GB"/>
             </w:rPr>
           </w:pPr>
-          <w:hyperlink w:anchor="_Toc223984370" w:history="1">
+          <w:hyperlink w:anchor="_Toc223987329" w:history="1">
             <w:r>
               <w:rPr>
                 <w:rStyle w:val="Hyperlink"/>
@@ -4583,7 +4583,7 @@
                 <w:noProof/>
                 <w:webHidden/>
               </w:rPr>
-              <w:instrText xml:space="preserve"> PAGEREF _Toc223984370 \h </w:instrText>
+              <w:instrText xml:space="preserve"> PAGEREF _Toc223987329 \h </w:instrText>
             </w:r>
             <w:r>
               <w:rPr>
@@ -4628,7 +4628,7 @@
               <w:lang w:eastAsia="en-GB"/>
             </w:rPr>
           </w:pPr>
-          <w:hyperlink w:anchor="_Toc223984371" w:history="1">
+          <w:hyperlink w:anchor="_Toc223987330" w:history="1">
             <w:r>
               <w:rPr>
                 <w:rStyle w:val="Hyperlink"/>
@@ -4655,7 +4655,7 @@
                 <w:noProof/>
                 <w:webHidden/>
               </w:rPr>
-              <w:instrText xml:space="preserve"> PAGEREF _Toc223984371 \h </w:instrText>
+              <w:instrText xml:space="preserve"> PAGEREF _Toc223987330 \h </w:instrText>
             </w:r>
             <w:r>
               <w:rPr>
@@ -4700,7 +4700,7 @@
               <w:lang w:eastAsia="en-GB"/>
             </w:rPr>
           </w:pPr>
-          <w:hyperlink w:anchor="_Toc223984372" w:history="1">
+          <w:hyperlink w:anchor="_Toc223987331" w:history="1">
             <w:r>
               <w:rPr>
                 <w:rStyle w:val="Hyperlink"/>
@@ -4727,7 +4727,7 @@
                 <w:noProof/>
                 <w:webHidden/>
               </w:rPr>
-              <w:instrText xml:space="preserve"> PAGEREF _Toc223984372 \h </w:instrText>
+              <w:instrText xml:space="preserve"> PAGEREF _Toc223987331 \h </w:instrText>
             </w:r>
             <w:r>
               <w:rPr>
@@ -4772,7 +4772,7 @@
               <w:lang w:eastAsia="en-GB"/>
             </w:rPr>
           </w:pPr>
-          <w:hyperlink w:anchor="_Toc223984373" w:history="1">
+          <w:hyperlink w:anchor="_Toc223987332" w:history="1">
             <w:r>
               <w:rPr>
                 <w:rStyle w:val="Hyperlink"/>
@@ -4799,7 +4799,7 @@
                 <w:noProof/>
                 <w:webHidden/>
               </w:rPr>
-              <w:instrText xml:space="preserve"> PAGEREF _Toc223984373 \h </w:instrText>
+              <w:instrText xml:space="preserve"> PAGEREF _Toc223987332 \h </w:instrText>
             </w:r>
             <w:r>
               <w:rPr>
@@ -4844,7 +4844,7 @@
               <w:lang w:eastAsia="en-GB"/>
             </w:rPr>
           </w:pPr>
-          <w:hyperlink w:anchor="_Toc223984374" w:history="1">
+          <w:hyperlink w:anchor="_Toc223987333" w:history="1">
             <w:r>
               <w:rPr>
                 <w:rStyle w:val="Hyperlink"/>
@@ -4871,7 +4871,7 @@
                 <w:noProof/>
                 <w:webHidden/>
               </w:rPr>
-              <w:instrText xml:space="preserve"> PAGEREF _Toc223984374 \h </w:instrText>
+              <w:instrText xml:space="preserve"> PAGEREF _Toc223987333 \h </w:instrText>
             </w:r>
             <w:r>
               <w:rPr>
@@ -4916,7 +4916,7 @@
               <w:lang w:eastAsia="en-GB"/>
             </w:rPr>
           </w:pPr>
-          <w:hyperlink w:anchor="_Toc223984375" w:history="1">
+          <w:hyperlink w:anchor="_Toc223987334" w:history="1">
             <w:r>
               <w:rPr>
                 <w:rStyle w:val="Hyperlink"/>
@@ -4943,7 +4943,7 @@
                 <w:noProof/>
                 <w:webHidden/>
               </w:rPr>
-              <w:instrText xml:space="preserve"> PAGEREF _Toc223984375 \h </w:instrText>
+              <w:instrText xml:space="preserve"> PAGEREF _Toc223987334 \h </w:instrText>
             </w:r>
             <w:r>
               <w:rPr>
@@ -5004,7 +5004,7 @@
       <w:pPr>
         <w:pStyle w:val="Heading1"/>
       </w:pPr>
-      <w:bookmarkStart w:id="0" w:name="_Toc223984310"/>
+      <w:bookmarkStart w:id="0" w:name="_Toc223987269"/>
       <w:r>
         <w:lastRenderedPageBreak/>
         <w:t>List of Acro</w:t>
@@ -5281,7 +5281,7 @@
       <w:pPr>
         <w:pStyle w:val="Heading1"/>
       </w:pPr>
-      <w:bookmarkStart w:id="1" w:name="_Toc223984311"/>
+      <w:bookmarkStart w:id="1" w:name="_Toc223987270"/>
       <w:r>
         <w:lastRenderedPageBreak/>
         <w:t>Abstract</w:t>
@@ -5481,7 +5481,7 @@
       <w:pPr>
         <w:pStyle w:val="Heading1"/>
       </w:pPr>
-      <w:bookmarkStart w:id="2" w:name="_Toc223984312"/>
+      <w:bookmarkStart w:id="2" w:name="_Toc223987271"/>
       <w:r>
         <w:lastRenderedPageBreak/>
         <w:t>Introduction</w:t>
@@ -5528,8 +5528,13 @@
       <w:r>
         <w:t xml:space="preserve">. </w:t>
       </w:r>
-      <w:r>
-        <w:t xml:space="preserve">Porcar et al., </w:t>
+      <w:proofErr w:type="spellStart"/>
+      <w:r>
+        <w:t>Porcar</w:t>
+      </w:r>
+      <w:proofErr w:type="spellEnd"/>
+      <w:r>
+        <w:t xml:space="preserve"> et al., </w:t>
       </w:r>
       <w:r>
         <w:t>(</w:t>
@@ -5569,8 +5574,13 @@
       <w:r>
         <w:t xml:space="preserve">Research conducted by </w:t>
       </w:r>
-      <w:r>
-        <w:t xml:space="preserve">Cantó-Sancho et al., </w:t>
+      <w:proofErr w:type="spellStart"/>
+      <w:r>
+        <w:t>Cantó</w:t>
+      </w:r>
+      <w:proofErr w:type="spellEnd"/>
+      <w:r>
+        <w:t xml:space="preserve">-Sancho et al., </w:t>
       </w:r>
       <w:r>
         <w:t>(</w:t>
@@ -6054,7 +6064,7 @@
       <w:pPr>
         <w:pStyle w:val="Heading1"/>
       </w:pPr>
-      <w:bookmarkStart w:id="3" w:name="_Toc223984313"/>
+      <w:bookmarkStart w:id="3" w:name="_Toc223987272"/>
       <w:r>
         <w:lastRenderedPageBreak/>
         <w:t>Project Aim</w:t>
@@ -6104,7 +6114,7 @@
           <w:rFonts w:asciiTheme="minorHAnsi" w:hAnsiTheme="minorHAnsi"/>
         </w:rPr>
       </w:pPr>
-      <w:bookmarkStart w:id="4" w:name="_Toc223984314"/>
+      <w:bookmarkStart w:id="4" w:name="_Toc223987273"/>
       <w:r>
         <w:rPr>
           <w:rFonts w:asciiTheme="minorHAnsi" w:hAnsiTheme="minorHAnsi"/>
@@ -6391,7 +6401,7 @@
       <w:pPr>
         <w:pStyle w:val="Heading1"/>
       </w:pPr>
-      <w:bookmarkStart w:id="5" w:name="_Toc223984315"/>
+      <w:bookmarkStart w:id="5" w:name="_Toc223987274"/>
       <w:r>
         <w:lastRenderedPageBreak/>
         <w:t>Project Planning</w:t>
@@ -6772,7 +6782,7 @@
           <w:rFonts w:asciiTheme="minorHAnsi" w:hAnsiTheme="minorHAnsi"/>
         </w:rPr>
       </w:pPr>
-      <w:bookmarkStart w:id="6" w:name="_Toc223984316"/>
+      <w:bookmarkStart w:id="6" w:name="_Toc223987275"/>
       <w:r>
         <w:rPr>
           <w:rFonts w:asciiTheme="minorHAnsi" w:hAnsiTheme="minorHAnsi"/>
@@ -6974,7 +6984,7 @@
           <w:rFonts w:asciiTheme="minorHAnsi" w:hAnsiTheme="minorHAnsi"/>
         </w:rPr>
       </w:pPr>
-      <w:bookmarkStart w:id="7" w:name="_Toc223984317"/>
+      <w:bookmarkStart w:id="7" w:name="_Toc223987276"/>
       <w:r>
         <w:rPr>
           <w:rFonts w:asciiTheme="minorHAnsi" w:hAnsiTheme="minorHAnsi"/>
@@ -7213,7 +7223,21 @@
         <w:rPr>
           <w:rFonts w:cs="Arial"/>
         </w:rPr>
-        <w:t>Clear on screen prompts to guide and support users that aren’t familiar with VR equipment</w:t>
+        <w:t xml:space="preserve">Clear </w:t>
+      </w:r>
+      <w:proofErr w:type="gramStart"/>
+      <w:r>
+        <w:rPr>
+          <w:rFonts w:cs="Arial"/>
+        </w:rPr>
+        <w:t>on screen</w:t>
+      </w:r>
+      <w:proofErr w:type="gramEnd"/>
+      <w:r>
+        <w:rPr>
+          <w:rFonts w:cs="Arial"/>
+        </w:rPr>
+        <w:t xml:space="preserve"> prompts to guide and support users that aren’t familiar with VR equipment</w:t>
       </w:r>
     </w:p>
     <w:p>
@@ -7241,7 +7265,7 @@
           <w:rFonts w:asciiTheme="minorHAnsi" w:hAnsiTheme="minorHAnsi"/>
         </w:rPr>
       </w:pPr>
-      <w:bookmarkStart w:id="8" w:name="_Toc223984318"/>
+      <w:bookmarkStart w:id="8" w:name="_Toc223987277"/>
       <w:r>
         <w:rPr>
           <w:rFonts w:asciiTheme="minorHAnsi" w:hAnsiTheme="minorHAnsi"/>
@@ -7258,7 +7282,7 @@
           <w:rFonts w:asciiTheme="minorHAnsi" w:hAnsiTheme="minorHAnsi"/>
         </w:rPr>
       </w:pPr>
-      <w:bookmarkStart w:id="9" w:name="_Toc223984319"/>
+      <w:bookmarkStart w:id="9" w:name="_Toc223987278"/>
       <w:r>
         <w:rPr>
           <w:rFonts w:asciiTheme="minorHAnsi" w:hAnsiTheme="minorHAnsi"/>
@@ -7342,7 +7366,7 @@
           <w:rFonts w:asciiTheme="minorHAnsi" w:hAnsiTheme="minorHAnsi"/>
         </w:rPr>
       </w:pPr>
-      <w:bookmarkStart w:id="10" w:name="_Toc223984320"/>
+      <w:bookmarkStart w:id="10" w:name="_Toc223987279"/>
       <w:r>
         <w:rPr>
           <w:rFonts w:asciiTheme="minorHAnsi" w:hAnsiTheme="minorHAnsi"/>
@@ -7355,7 +7379,8 @@
       <w:pPr>
         <w:pStyle w:val="Heading3"/>
       </w:pPr>
-      <w:bookmarkStart w:id="11" w:name="_Toc223984321"/>
+      <w:bookmarkStart w:id="11" w:name="_Toc223987280"/>
+      <w:proofErr w:type="spellStart"/>
       <w:r>
         <w:t>Ey</w:t>
       </w:r>
@@ -7366,6 +7391,7 @@
         <w:t>si</w:t>
       </w:r>
       <w:bookmarkEnd w:id="11"/>
+      <w:proofErr w:type="spellEnd"/>
     </w:p>
     <w:p>
       <w:r>
@@ -7380,9 +7406,11 @@
       <w:r>
         <w:t xml:space="preserve"> discussed </w:t>
       </w:r>
+      <w:proofErr w:type="spellStart"/>
       <w:r>
         <w:t>Eyesi</w:t>
       </w:r>
+      <w:proofErr w:type="spellEnd"/>
       <w:r>
         <w:t>,</w:t>
       </w:r>
@@ -7495,7 +7523,15 @@
         <w:t xml:space="preserve">In addition to this, there is an </w:t>
       </w:r>
       <w:r>
-        <w:t xml:space="preserve">online training portal (vrmnet) </w:t>
+        <w:t>online training portal (</w:t>
+      </w:r>
+      <w:proofErr w:type="spellStart"/>
+      <w:r>
+        <w:t>vrmnet</w:t>
+      </w:r>
+      <w:proofErr w:type="spellEnd"/>
+      <w:r>
+        <w:t xml:space="preserve">) </w:t>
       </w:r>
       <w:r>
         <w:t>allowing comparison between trainees</w:t>
@@ -7630,7 +7666,15 @@
         <w:t xml:space="preserve"> </w:t>
       </w:r>
       <w:r>
-        <w:t xml:space="preserve">While Eyesi is effective for medical training for medical professionals, </w:t>
+        <w:t xml:space="preserve">While </w:t>
+      </w:r>
+      <w:proofErr w:type="spellStart"/>
+      <w:r>
+        <w:t>Eyesi</w:t>
+      </w:r>
+      <w:proofErr w:type="spellEnd"/>
+      <w:r>
+        <w:t xml:space="preserve"> is effective for medical training for medical professionals, </w:t>
       </w:r>
       <w:r>
         <w:t xml:space="preserve">similar </w:t>
@@ -7652,11 +7696,13 @@
       <w:pPr>
         <w:pStyle w:val="Heading3"/>
       </w:pPr>
-      <w:bookmarkStart w:id="12" w:name="_Toc223984322"/>
+      <w:bookmarkStart w:id="12" w:name="_Toc223987281"/>
+      <w:proofErr w:type="spellStart"/>
       <w:r>
         <w:t>OntoPhaco</w:t>
       </w:r>
       <w:bookmarkEnd w:id="12"/>
+      <w:proofErr w:type="spellEnd"/>
     </w:p>
     <w:p>
       <w:r>
@@ -7675,7 +7721,15 @@
         <w:t>d</w:t>
       </w:r>
       <w:r>
-        <w:t xml:space="preserve"> OntoPhaco, a</w:t>
+        <w:t xml:space="preserve"> </w:t>
+      </w:r>
+      <w:proofErr w:type="spellStart"/>
+      <w:r>
+        <w:t>OntoPhaco</w:t>
+      </w:r>
+      <w:proofErr w:type="spellEnd"/>
+      <w:r>
+        <w:t>, a</w:t>
       </w:r>
       <w:r>
         <w:t>n</w:t>
@@ -7808,173 +7862,191 @@
           <w:rFonts w:cs="TimesLTStd-Roman"/>
           <w:kern w:val="0"/>
         </w:rPr>
-        <w:t>Since OntoPhaco</w:t>
-      </w:r>
+        <w:t xml:space="preserve">Since </w:t>
+      </w:r>
+      <w:proofErr w:type="spellStart"/>
       <w:r>
         <w:rPr>
           <w:rFonts w:cs="TimesLTStd-Roman"/>
           <w:kern w:val="0"/>
         </w:rPr>
-        <w:t>’s</w:t>
+        <w:t>OntoPhaco</w:t>
       </w:r>
       <w:r>
         <w:rPr>
           <w:rFonts w:cs="TimesLTStd-Roman"/>
           <w:kern w:val="0"/>
         </w:rPr>
-        <w:t xml:space="preserve"> </w:t>
-      </w:r>
-      <w:r>
-        <w:t>s</w:t>
-      </w:r>
-      <w:r>
-        <w:t xml:space="preserve">ystematic verification and validation processes </w:t>
-      </w:r>
-      <w:r>
-        <w:t>include</w:t>
-      </w:r>
-      <w:r>
-        <w:t xml:space="preserve"> </w:t>
-      </w:r>
-      <w:r>
-        <w:t xml:space="preserve">theoretical </w:t>
-      </w:r>
-      <w:r>
-        <w:t>evaluat</w:t>
-      </w:r>
-      <w:r>
-        <w:t xml:space="preserve">ion </w:t>
-      </w:r>
-      <w:r>
-        <w:t>and expert feedback</w:t>
-      </w:r>
+        <w:t>’s</w:t>
+      </w:r>
+      <w:proofErr w:type="spellEnd"/>
       <w:r>
         <w:rPr>
           <w:rFonts w:cs="TimesLTStd-Roman"/>
           <w:kern w:val="0"/>
         </w:rPr>
-        <w:t xml:space="preserve">, each change, minor or major </w:t>
+        <w:t xml:space="preserve"> </w:t>
+      </w:r>
+      <w:r>
+        <w:t>s</w:t>
+      </w:r>
+      <w:r>
+        <w:t xml:space="preserve">ystematic verification and validation processes </w:t>
+      </w:r>
+      <w:r>
+        <w:t>include</w:t>
+      </w:r>
+      <w:r>
+        <w:t xml:space="preserve"> </w:t>
+      </w:r>
+      <w:r>
+        <w:t xml:space="preserve">theoretical </w:t>
+      </w:r>
+      <w:r>
+        <w:t>evaluat</w:t>
+      </w:r>
+      <w:r>
+        <w:t xml:space="preserve">ion </w:t>
+      </w:r>
+      <w:r>
+        <w:t>and expert feedback</w:t>
       </w:r>
       <w:r>
         <w:rPr>
           <w:rFonts w:cs="TimesLTStd-Roman"/>
           <w:kern w:val="0"/>
         </w:rPr>
-        <w:t>is</w:t>
+        <w:t xml:space="preserve">, each change, minor or major </w:t>
       </w:r>
       <w:r>
         <w:rPr>
           <w:rFonts w:cs="TimesLTStd-Roman"/>
           <w:kern w:val="0"/>
         </w:rPr>
-        <w:t xml:space="preserve"> verified and validate</w:t>
+        <w:t>is</w:t>
       </w:r>
       <w:r>
         <w:rPr>
           <w:rFonts w:cs="TimesLTStd-Roman"/>
           <w:kern w:val="0"/>
         </w:rPr>
-        <w:t>d</w:t>
-      </w:r>
-      <w:r>
-        <w:t>.</w:t>
+        <w:t xml:space="preserve"> verified and validate</w:t>
       </w:r>
       <w:r>
         <w:rPr>
           <w:rFonts w:cs="TimesLTStd-Roman"/>
           <w:kern w:val="0"/>
         </w:rPr>
-        <w:t xml:space="preserve"> </w:t>
+        <w:t>d</w:t>
+      </w:r>
+      <w:r>
+        <w:t>.</w:t>
       </w:r>
       <w:r>
         <w:rPr>
           <w:rFonts w:cs="TimesLTStd-Roman"/>
           <w:kern w:val="0"/>
         </w:rPr>
-        <w:t>OntoPhaco demonstrates VR</w:t>
-      </w:r>
+        <w:t xml:space="preserve"> </w:t>
+      </w:r>
+      <w:proofErr w:type="spellStart"/>
       <w:r>
         <w:rPr>
           <w:rFonts w:cs="TimesLTStd-Roman"/>
           <w:kern w:val="0"/>
         </w:rPr>
-        <w:t>’</w:t>
-      </w:r>
+        <w:t>OntoPhaco</w:t>
+      </w:r>
+      <w:proofErr w:type="spellEnd"/>
       <w:r>
         <w:rPr>
           <w:rFonts w:cs="TimesLTStd-Roman"/>
           <w:kern w:val="0"/>
         </w:rPr>
-        <w:t xml:space="preserve">s effectiveness </w:t>
+        <w:t xml:space="preserve"> demonstrates VR</w:t>
       </w:r>
       <w:r>
         <w:rPr>
           <w:rFonts w:cs="TimesLTStd-Roman"/>
           <w:kern w:val="0"/>
         </w:rPr>
-        <w:t xml:space="preserve">paired </w:t>
+        <w:t>’</w:t>
       </w:r>
       <w:r>
         <w:rPr>
           <w:rFonts w:cs="TimesLTStd-Roman"/>
           <w:kern w:val="0"/>
         </w:rPr>
-        <w:t>with ontology for medical training</w:t>
+        <w:t xml:space="preserve">s effectiveness </w:t>
       </w:r>
       <w:r>
         <w:rPr>
           <w:rFonts w:cs="TimesLTStd-Roman"/>
           <w:kern w:val="0"/>
         </w:rPr>
-        <w:t>. T</w:t>
+        <w:t xml:space="preserve">paired </w:t>
       </w:r>
       <w:r>
         <w:rPr>
           <w:rFonts w:cs="TimesLTStd-Roman"/>
           <w:kern w:val="0"/>
         </w:rPr>
-        <w:t>his project</w:t>
+        <w:t>with ontology for medical training</w:t>
       </w:r>
       <w:r>
         <w:rPr>
           <w:rFonts w:cs="TimesLTStd-Roman"/>
           <w:kern w:val="0"/>
         </w:rPr>
-        <w:t xml:space="preserve"> applies similar immersi</w:t>
+        <w:t>. T</w:t>
       </w:r>
       <w:r>
         <w:rPr>
           <w:rFonts w:cs="TimesLTStd-Roman"/>
           <w:kern w:val="0"/>
         </w:rPr>
-        <w:t>ve</w:t>
+        <w:t>his project</w:t>
       </w:r>
       <w:r>
         <w:rPr>
           <w:rFonts w:cs="TimesLTStd-Roman"/>
           <w:kern w:val="0"/>
         </w:rPr>
-        <w:t xml:space="preserve"> and educational knowledge </w:t>
+        <w:t xml:space="preserve"> applies similar immersi</w:t>
       </w:r>
       <w:r>
         <w:rPr>
           <w:rFonts w:cs="TimesLTStd-Roman"/>
           <w:kern w:val="0"/>
         </w:rPr>
-        <w:t xml:space="preserve">for DES to raise awareness, </w:t>
+        <w:t>ve</w:t>
       </w:r>
       <w:r>
         <w:rPr>
           <w:rFonts w:cs="TimesLTStd-Roman"/>
           <w:kern w:val="0"/>
         </w:rPr>
-        <w:t xml:space="preserve">spreading the </w:t>
+        <w:t xml:space="preserve"> and educational knowledge </w:t>
       </w:r>
       <w:r>
         <w:rPr>
           <w:rFonts w:cs="TimesLTStd-Roman"/>
           <w:kern w:val="0"/>
         </w:rPr>
+        <w:t xml:space="preserve">for DES to raise awareness, </w:t>
+      </w:r>
+      <w:r>
+        <w:rPr>
+          <w:rFonts w:cs="TimesLTStd-Roman"/>
+          <w:kern w:val="0"/>
+        </w:rPr>
+        <w:t xml:space="preserve">spreading the </w:t>
+      </w:r>
+      <w:r>
+        <w:rPr>
+          <w:rFonts w:cs="TimesLTStd-Roman"/>
+          <w:kern w:val="0"/>
+        </w:rPr>
         <w:t>benefits of VR use in education beyond professional training.</w:t>
       </w:r>
     </w:p>
@@ -7982,7 +8054,7 @@
       <w:pPr>
         <w:pStyle w:val="Heading3"/>
       </w:pPr>
-      <w:bookmarkStart w:id="13" w:name="_Toc223984323"/>
+      <w:bookmarkStart w:id="13" w:name="_Toc223987282"/>
       <w:r>
         <w:lastRenderedPageBreak/>
         <w:t>I</w:t>
@@ -8178,7 +8250,7 @@
       <w:pPr>
         <w:pStyle w:val="Heading3"/>
       </w:pPr>
-      <w:bookmarkStart w:id="14" w:name="_Toc223984324"/>
+      <w:bookmarkStart w:id="14" w:name="_Toc223987283"/>
       <w:r>
         <w:t>Opportunities for innovation</w:t>
       </w:r>
@@ -8188,17 +8260,27 @@
       <w:r>
         <w:t xml:space="preserve">While </w:t>
       </w:r>
-      <w:r>
-        <w:t>Eyesi focuses on hands on surgical practices</w:t>
+      <w:proofErr w:type="spellStart"/>
+      <w:r>
+        <w:t>Eyesi</w:t>
+      </w:r>
+      <w:proofErr w:type="spellEnd"/>
+      <w:r>
+        <w:t xml:space="preserve"> focuses on hands on surgical practices</w:t>
       </w:r>
       <w:r>
         <w:t xml:space="preserve">, </w:t>
       </w:r>
+      <w:proofErr w:type="spellStart"/>
       <w:r>
         <w:t>O</w:t>
       </w:r>
       <w:r>
-        <w:t>ntoPhaco focuses on the way knowledge is represented and conceptual understanding</w:t>
+        <w:t>ntoPhaco</w:t>
+      </w:r>
+      <w:proofErr w:type="spellEnd"/>
+      <w:r>
+        <w:t xml:space="preserve"> focuses on the way knowledge is represented and conceptual understanding</w:t>
       </w:r>
       <w:r>
         <w:t xml:space="preserve">. </w:t>
@@ -8296,7 +8378,7 @@
           <w:rFonts w:asciiTheme="minorHAnsi" w:hAnsiTheme="minorHAnsi"/>
         </w:rPr>
       </w:pPr>
-      <w:bookmarkStart w:id="15" w:name="_Toc223984325"/>
+      <w:bookmarkStart w:id="15" w:name="_Toc223987284"/>
       <w:r>
         <w:rPr>
           <w:rFonts w:asciiTheme="minorHAnsi" w:hAnsiTheme="minorHAnsi"/>
@@ -8309,7 +8391,7 @@
       <w:pPr>
         <w:pStyle w:val="Heading3"/>
       </w:pPr>
-      <w:bookmarkStart w:id="16" w:name="_Toc223984326"/>
+      <w:bookmarkStart w:id="16" w:name="_Toc223987285"/>
       <w:r>
         <w:t>VR in medical education</w:t>
       </w:r>
@@ -8456,9 +8538,19 @@
       <w:r>
         <w:t xml:space="preserve">Examples such as </w:t>
       </w:r>
-      <w:r>
-        <w:t>Mediverse by Goggleminds</w:t>
-      </w:r>
+      <w:proofErr w:type="spellStart"/>
+      <w:r>
+        <w:t>Mediverse</w:t>
+      </w:r>
+      <w:proofErr w:type="spellEnd"/>
+      <w:r>
+        <w:t xml:space="preserve"> by </w:t>
+      </w:r>
+      <w:proofErr w:type="spellStart"/>
+      <w:r>
+        <w:t>Goggleminds</w:t>
+      </w:r>
+      <w:proofErr w:type="spellEnd"/>
       <w:r>
         <w:t xml:space="preserve"> </w:t>
       </w:r>
@@ -8472,7 +8564,15 @@
         <w:t xml:space="preserve"> to healthcare providers and medical schools</w:t>
       </w:r>
       <w:r>
-        <w:t>. ClassVR by Systems improve</w:t>
+        <w:t xml:space="preserve">. </w:t>
+      </w:r>
+      <w:proofErr w:type="spellStart"/>
+      <w:r>
+        <w:t>ClassVR</w:t>
+      </w:r>
+      <w:proofErr w:type="spellEnd"/>
+      <w:r>
+        <w:t xml:space="preserve"> by Systems improve</w:t>
       </w:r>
       <w:r>
         <w:t>s</w:t>
@@ -8489,8 +8589,13 @@
       <w:r>
         <w:t xml:space="preserve"> </w:t>
       </w:r>
-      <w:r>
-        <w:t xml:space="preserve">PrismsVR </w:t>
+      <w:proofErr w:type="spellStart"/>
+      <w:r>
+        <w:t>PrismsVR</w:t>
+      </w:r>
+      <w:proofErr w:type="spellEnd"/>
+      <w:r>
+        <w:t xml:space="preserve"> </w:t>
       </w:r>
       <w:r>
         <w:t xml:space="preserve">helps students grasp core concepts in algebra and geometry, by </w:t>
@@ -8576,7 +8681,7 @@
       <w:pPr>
         <w:pStyle w:val="Heading3"/>
       </w:pPr>
-      <w:bookmarkStart w:id="17" w:name="_Toc223984327"/>
+      <w:bookmarkStart w:id="17" w:name="_Toc223987286"/>
       <w:r>
         <w:lastRenderedPageBreak/>
         <w:t>VR in Health Awareness</w:t>
@@ -8769,7 +8874,7 @@
           <w:rFonts w:asciiTheme="minorHAnsi" w:hAnsiTheme="minorHAnsi"/>
         </w:rPr>
       </w:pPr>
-      <w:bookmarkStart w:id="18" w:name="_Toc223984328"/>
+      <w:bookmarkStart w:id="18" w:name="_Toc223987287"/>
       <w:r>
         <w:rPr>
           <w:rFonts w:asciiTheme="minorHAnsi" w:hAnsiTheme="minorHAnsi"/>
@@ -8989,7 +9094,7 @@
       <w:pPr>
         <w:pStyle w:val="Heading1"/>
       </w:pPr>
-      <w:bookmarkStart w:id="19" w:name="_Toc223984329"/>
+      <w:bookmarkStart w:id="19" w:name="_Toc223987288"/>
       <w:r>
         <w:lastRenderedPageBreak/>
         <w:t>Appendices</w:t>
@@ -9000,7 +9105,7 @@
       <w:pPr>
         <w:pStyle w:val="Heading2"/>
       </w:pPr>
-      <w:bookmarkStart w:id="20" w:name="_Toc223984330"/>
+      <w:bookmarkStart w:id="20" w:name="_Toc223987289"/>
       <w:r>
         <w:t>Ethics Checklist</w:t>
       </w:r>
@@ -9142,7 +9247,7 @@
       <w:pPr>
         <w:pStyle w:val="Heading2"/>
       </w:pPr>
-      <w:bookmarkStart w:id="21" w:name="_Toc223984331"/>
+      <w:bookmarkStart w:id="21" w:name="_Toc223987290"/>
       <w:r>
         <w:lastRenderedPageBreak/>
         <w:t>Project Timeline Gant</w:t>
@@ -9338,7 +9443,7 @@
       <w:pPr>
         <w:pStyle w:val="Heading1"/>
       </w:pPr>
-      <w:bookmarkStart w:id="22" w:name="_Toc223984332"/>
+      <w:bookmarkStart w:id="22" w:name="_Toc223987291"/>
       <w:r>
         <w:lastRenderedPageBreak/>
         <w:t>Methodology</w:t>
@@ -9349,7 +9454,7 @@
       <w:pPr>
         <w:pStyle w:val="Heading2"/>
       </w:pPr>
-      <w:bookmarkStart w:id="23" w:name="_Toc223984333"/>
+      <w:bookmarkStart w:id="23" w:name="_Toc223987292"/>
       <w:r>
         <w:t>Source Control</w:t>
       </w:r>
@@ -9357,14 +9462,59 @@
     </w:p>
     <w:p>
       <w:r>
-        <w:t xml:space="preserve">During development, GitHub was used as source control for the project. Source control is needed to </w:t>
+        <w:t xml:space="preserve">GitHub was used </w:t>
+      </w:r>
+      <w:r>
+        <w:t>for</w:t>
+      </w:r>
+      <w:r>
+        <w:t xml:space="preserve"> source control </w:t>
+      </w:r>
+      <w:r>
+        <w:t>within</w:t>
+      </w:r>
+      <w:r>
+        <w:t xml:space="preserve"> the project. Source control is needed to </w:t>
+      </w:r>
+      <w:r>
+        <w:t>keep track of changes made during the development process</w:t>
+      </w:r>
+      <w:r>
+        <w:t xml:space="preserve">. It also helps to </w:t>
+      </w:r>
+      <w:r>
+        <w:t xml:space="preserve">revert earlier commits if anything goes wrong, record when changes </w:t>
+      </w:r>
+      <w:r>
+        <w:t xml:space="preserve">were </w:t>
+      </w:r>
+      <w:r>
+        <w:t>mad</w:t>
+      </w:r>
+      <w:r>
+        <w:t>e, where they were made</w:t>
+      </w:r>
+      <w:r>
+        <w:t xml:space="preserve"> and makes it easier </w:t>
+      </w:r>
+      <w:r>
+        <w:t>to complete work in a separate branch without affecting the main branch</w:t>
+      </w:r>
+      <w:r>
+        <w:t>. Without source control, it would become very easy for errors to go unchecked, untraced and build up causing major issues down the line</w:t>
+      </w:r>
+      <w:r>
+        <w:t xml:space="preserve"> that could compromise the project</w:t>
+      </w:r>
+      <w:r>
+        <w:t>.</w:t>
       </w:r>
     </w:p>
     <w:p>
       <w:pPr>
         <w:pStyle w:val="Heading2"/>
       </w:pPr>
-      <w:bookmarkStart w:id="24" w:name="_Toc223984334"/>
+      <w:bookmarkStart w:id="24" w:name="_Toc223987293"/>
       <w:r>
         <w:t>Prototype Implementation</w:t>
       </w:r>
@@ -9374,7 +9524,7 @@
       <w:pPr>
         <w:pStyle w:val="Heading3"/>
       </w:pPr>
-      <w:bookmarkStart w:id="25" w:name="_Toc223984335"/>
+      <w:bookmarkStart w:id="25" w:name="_Toc223987294"/>
       <w:r>
         <w:t>Usability and Flow</w:t>
       </w:r>
@@ -9457,7 +9607,7 @@
       <w:pPr>
         <w:pStyle w:val="Heading3"/>
       </w:pPr>
-      <w:bookmarkStart w:id="26" w:name="_Toc223984336"/>
+      <w:bookmarkStart w:id="26" w:name="_Toc223987295"/>
       <w:r>
         <w:t xml:space="preserve">Environment Design and </w:t>
       </w:r>
@@ -9586,7 +9736,7 @@
       <w:pPr>
         <w:pStyle w:val="Heading3"/>
       </w:pPr>
-      <w:bookmarkStart w:id="27" w:name="_Toc223984337"/>
+      <w:bookmarkStart w:id="27" w:name="_Toc223987296"/>
       <w:r>
         <w:t>Objective System Implementation</w:t>
       </w:r>
@@ -9627,7 +9777,15 @@
         <w:t>ere</w:t>
       </w:r>
       <w:r>
-        <w:t xml:space="preserve"> stored within the VRGameMode blueprint, with objectives being updated during runtime as conditions were satisfied </w:t>
+        <w:t xml:space="preserve"> stored within the </w:t>
+      </w:r>
+      <w:proofErr w:type="spellStart"/>
+      <w:r>
+        <w:t>VRGameMode</w:t>
+      </w:r>
+      <w:proofErr w:type="spellEnd"/>
+      <w:r>
+        <w:t xml:space="preserve"> blueprint, with objectives being updated during runtime as conditions were satisfied </w:t>
       </w:r>
       <w:r>
         <w:t>during</w:t>
@@ -9691,8 +9849,9 @@
       <w:pPr>
         <w:pStyle w:val="Heading3"/>
       </w:pPr>
-      <w:bookmarkStart w:id="28" w:name="_Toc223984338"/>
-      <w:r>
+      <w:bookmarkStart w:id="28" w:name="_Toc223987297"/>
+      <w:r>
+        <w:lastRenderedPageBreak/>
         <w:t>User</w:t>
       </w:r>
       <w:r>
@@ -9735,407 +9894,414 @@
         <w:t>s</w:t>
       </w:r>
       <w:r>
-        <w:t xml:space="preserve">) seen within video games so that the experience would be more immersive with users needing to interact </w:t>
+        <w:t xml:space="preserve">) seen within video games so that the experience would be more immersive with users needing to interact and search the environment around them. The UI is implemented as a world space widget attached to the screen mesh of a monitor that uses a widget blueprint to control the information displayed. </w:t>
+      </w:r>
+    </w:p>
+    <w:p>
+      <w:r>
+        <w:t xml:space="preserve">The widget consists of the current objective description to prompt users along with a progress bar that fills up green as the necessary requirements are being met to complete the objective. </w:t>
+      </w:r>
+      <w:r>
+        <w:t>Event</w:t>
+      </w:r>
+      <w:r>
+        <w:t xml:space="preserve"> dispatchers control updates to the widget updat</w:t>
+      </w:r>
+      <w:r>
+        <w:t>ing it</w:t>
+      </w:r>
+      <w:r>
+        <w:t xml:space="preserve"> in real time</w:t>
+      </w:r>
+      <w:r>
+        <w:t>. W</w:t>
+      </w:r>
+      <w:r>
+        <w:t>hen an objective is complete</w:t>
+      </w:r>
+      <w:r>
+        <w:t>,</w:t>
+      </w:r>
+      <w:r>
+        <w:t xml:space="preserve"> the progress bar resets with the objective description changing to the next. </w:t>
+      </w:r>
+      <w:r>
+        <w:t>Furthermore, when</w:t>
+      </w:r>
+      <w:r>
+        <w:t xml:space="preserve"> the experience is </w:t>
+      </w:r>
+      <w:r>
+        <w:t>completed,</w:t>
+      </w:r>
+      <w:r>
+        <w:t xml:space="preserve"> users are informed using a message that they have completed all the objectives before exiting back to the </w:t>
+      </w:r>
+      <w:r>
+        <w:t xml:space="preserve">start screen </w:t>
+      </w:r>
+      <w:r>
+        <w:t>menu.</w:t>
+      </w:r>
+    </w:p>
+    <w:p>
+      <w:pPr>
+        <w:pStyle w:val="Heading3"/>
+      </w:pPr>
+      <w:bookmarkStart w:id="29" w:name="_Toc223987298"/>
+      <w:r>
+        <w:t>Objective Based Interact</w:t>
+      </w:r>
+      <w:r>
+        <w:t>ive</w:t>
+      </w:r>
+      <w:r>
+        <w:t xml:space="preserve"> Object</w:t>
+      </w:r>
+      <w:r>
+        <w:t>s</w:t>
+      </w:r>
+      <w:bookmarkEnd w:id="29"/>
+    </w:p>
+    <w:p>
+      <w:r>
+        <w:t xml:space="preserve">To enhance the </w:t>
+      </w:r>
+      <w:r>
+        <w:t>experience</w:t>
+      </w:r>
+      <w:r>
+        <w:t xml:space="preserve"> of the application, getting the user to interact with objects within the scene was important</w:t>
+      </w:r>
+      <w:r>
+        <w:t xml:space="preserve"> to increase immersion</w:t>
+      </w:r>
+      <w:r>
+        <w:t xml:space="preserve">. These interactions included staring at the screen for a certain duration, looking at an object far away or on the desk and turning a light switch on and off. By doing this, the user would replicate actual actions that cause symptoms of DES and preventative measures reinforcing the learning being undertaken. </w:t>
+      </w:r>
+    </w:p>
+    <w:p>
+      <w:r>
+        <w:t>A</w:t>
+      </w:r>
+      <w:r>
+        <w:t xml:space="preserve"> line trace channel </w:t>
+      </w:r>
+      <w:r>
+        <w:t xml:space="preserve">was used </w:t>
+      </w:r>
+      <w:r>
+        <w:t xml:space="preserve">to </w:t>
+      </w:r>
+      <w:r>
+        <w:t>detect collision events with interactable objects.</w:t>
+      </w:r>
+      <w:r>
+        <w:t xml:space="preserve"> Whenever a hit was received, depending on which objective was the</w:t>
+      </w:r>
+      <w:r>
+        <w:t xml:space="preserve"> </w:t>
+      </w:r>
+      <w:r>
+        <w:t>current one it would update according to if the object being looked at was the right one to progress that specific objective. Users were notified by the UI on the monitor to which object needed to be looked at or interacted with. For the light switch, interaction using the grab trigger was needed to simulate the light switching on and off. Once the specific condition was met</w:t>
+      </w:r>
+      <w:r>
+        <w:t>,</w:t>
+      </w:r>
+      <w:r>
+        <w:t xml:space="preserve"> event dispatchers were fired from those objects to notify of objective updates.</w:t>
+      </w:r>
+    </w:p>
+    <w:p>
+      <w:pPr>
+        <w:pStyle w:val="Heading3"/>
+      </w:pPr>
+      <w:bookmarkStart w:id="30" w:name="_Toc223987299"/>
+      <w:r>
+        <w:t>Post Processing Effects</w:t>
+      </w:r>
+      <w:r>
+        <w:t xml:space="preserve"> for Simulating Symptoms</w:t>
+      </w:r>
+      <w:bookmarkEnd w:id="30"/>
+    </w:p>
+    <w:p>
+      <w:r>
+        <w:t>Simulating the symptoms of DES required enabling specific post processing effects within the camera</w:t>
+      </w:r>
+      <w:r>
+        <w:t>’s post processing component</w:t>
+      </w:r>
+      <w:r>
+        <w:t xml:space="preserve">. These effects were </w:t>
+      </w:r>
+      <w:proofErr w:type="gramStart"/>
+      <w:r>
+        <w:t>vignette</w:t>
+      </w:r>
+      <w:proofErr w:type="gramEnd"/>
+      <w:r>
+        <w:t xml:space="preserve"> to simulate eye fatigue, bloom for light sensitivity and blur for focus strain. Vignette and bloom post processing effects were triggered through adjusting their post processing variables within the camera post processing component. However, for blur a post processing material was required to create the radial blur. When objectives progressed triggering the simulation of symptoms, a timeline was used to progressively increase the value of an effect gradually over a duration. This decision was made to accommodate eyes adjusting to the changes of the camera as these effects were being triggered.</w:t>
+      </w:r>
+      <w:r>
+        <w:t xml:space="preserve"> The timeline was then used in reverse to revert the symptoms returning the camera view back to the original state it was in.</w:t>
+      </w:r>
+    </w:p>
+    <w:p>
+      <w:pPr>
+        <w:pStyle w:val="Heading3"/>
+      </w:pPr>
+      <w:bookmarkStart w:id="31" w:name="_Toc223987300"/>
+      <w:r>
+        <w:t>User</w:t>
+      </w:r>
+      <w:r>
+        <w:t xml:space="preserve"> Look Direction and Attention Detection</w:t>
+      </w:r>
+      <w:bookmarkEnd w:id="31"/>
+    </w:p>
+    <w:p>
+      <w:r>
+        <w:t xml:space="preserve">Look direction was detected using a line trace that took the camera position as the starting location and a distance value multiplied by the forward vector of the camera. From there, returned hits would be checked for the object needed to progress the objective. When a successful hit was recorded, the time spent staring at the object was recorded and used to update the progress bar on the monitor. Whenever user gaze averted from the required </w:t>
       </w:r>
       <w:r>
         <w:lastRenderedPageBreak/>
-        <w:t xml:space="preserve">and search the environment around them. The UI is implemented as a world space widget attached to the screen mesh of a monitor that uses a widget blueprint to control the information displayed. The widget consists of the current objective description to prompt users along with a progress bar that fills up green as the necessary requirements are being met to complete the objective. </w:t>
-      </w:r>
-      <w:r>
-        <w:t>Event</w:t>
-      </w:r>
-      <w:r>
-        <w:t xml:space="preserve"> dispatchers control updates to the widget updat</w:t>
-      </w:r>
-      <w:r>
-        <w:t>ing it</w:t>
-      </w:r>
-      <w:r>
-        <w:t xml:space="preserve"> in real time</w:t>
-      </w:r>
-      <w:r>
-        <w:t>. W</w:t>
-      </w:r>
-      <w:r>
-        <w:t>hen an objective is complete</w:t>
+        <w:t>progression object, the progress bar would reset back to zero so that progress wasn’t accumulated over multiple looks but from one continuous stare replicating the causes for symptoms.</w:t>
+      </w:r>
+    </w:p>
+    <w:p>
+      <w:pPr>
+        <w:pStyle w:val="Heading2"/>
+      </w:pPr>
+      <w:bookmarkStart w:id="32" w:name="_Toc223987301"/>
+      <w:r>
+        <w:t>Final Version</w:t>
+      </w:r>
+      <w:r>
+        <w:t xml:space="preserve"> Implementation</w:t>
+      </w:r>
+      <w:bookmarkEnd w:id="32"/>
+    </w:p>
+    <w:p>
+      <w:pPr>
+        <w:pStyle w:val="Heading3"/>
+      </w:pPr>
+      <w:bookmarkStart w:id="33" w:name="_Toc223987302"/>
+      <w:r>
+        <w:t>Environment Changes and Visual Modifications</w:t>
+      </w:r>
+      <w:bookmarkEnd w:id="33"/>
+    </w:p>
+    <w:p>
+      <w:r>
+        <w:t>To add some colour to the scenes</w:t>
       </w:r>
       <w:r>
         <w:t>,</w:t>
       </w:r>
       <w:r>
-        <w:t xml:space="preserve"> the progress bar resets with the objective description changing to the next. </w:t>
-      </w:r>
-      <w:r>
-        <w:t>Furthermore, when</w:t>
-      </w:r>
-      <w:r>
-        <w:t xml:space="preserve"> the experience is </w:t>
-      </w:r>
-      <w:r>
-        <w:t>completed,</w:t>
-      </w:r>
-      <w:r>
-        <w:t xml:space="preserve"> users are informed using a message that they have completed all the objectives before exiting back to the </w:t>
-      </w:r>
-      <w:r>
-        <w:t xml:space="preserve">start screen </w:t>
-      </w:r>
-      <w:r>
-        <w:t>menu.</w:t>
+        <w:t xml:space="preserve"> the default grid materials were swapped out for flooring, ceiling, wall and other materials to change the scene from a grey looking prototype to a </w:t>
+      </w:r>
+      <w:r>
+        <w:t xml:space="preserve">more </w:t>
+      </w:r>
+      <w:r>
+        <w:t>polished scene setup.</w:t>
       </w:r>
     </w:p>
     <w:p>
       <w:pPr>
         <w:pStyle w:val="Heading3"/>
       </w:pPr>
-      <w:bookmarkStart w:id="29" w:name="_Toc223984339"/>
-      <w:r>
-        <w:t>Objective Based Interact</w:t>
-      </w:r>
-      <w:r>
-        <w:t>ive</w:t>
-      </w:r>
-      <w:r>
-        <w:t xml:space="preserve"> Object</w:t>
+      <w:bookmarkStart w:id="34" w:name="_Toc223987303"/>
+      <w:r>
+        <w:t>Interaction Improvements</w:t>
+      </w:r>
+      <w:bookmarkEnd w:id="34"/>
+    </w:p>
+    <w:p>
+      <w:r>
+        <w:t xml:space="preserve">Hand physics collisions were removed </w:t>
+      </w:r>
+      <w:r>
+        <w:t xml:space="preserve">which allowed the user interactions with the </w:t>
+      </w:r>
+      <w:r>
+        <w:t xml:space="preserve">light switch </w:t>
+      </w:r>
+      <w:r>
+        <w:t xml:space="preserve">to </w:t>
+      </w:r>
+      <w:r>
+        <w:t>work as intended</w:t>
+      </w:r>
+      <w:r>
+        <w:t>.</w:t>
+      </w:r>
+      <w:r>
+        <w:t xml:space="preserve"> In addition to this, the blueprint for the light switch was heavily simplified. The original blueprint used logic that worked for a lever like interaction component that was quite large and would adjust its rotation based on where the player hand was while interacting with the object. However, the light switch was a small object where there was a minimal difference in position of the hand component. The logic needed to be simplified to detection of the user interacting with the grab component</w:t>
+      </w:r>
+      <w:r>
+        <w:t xml:space="preserve"> of the switch</w:t>
+      </w:r>
+      <w:r>
+        <w:t>.</w:t>
+      </w:r>
+      <w:r>
+        <w:t xml:space="preserve"> </w:t>
+      </w:r>
+      <w:r>
+        <w:t>T</w:t>
+      </w:r>
+      <w:r>
+        <w:t>hen the light</w:t>
+      </w:r>
+      <w:r>
+        <w:t xml:space="preserve"> would be </w:t>
+      </w:r>
+      <w:r>
+        <w:t>turned</w:t>
+      </w:r>
+      <w:r>
+        <w:t xml:space="preserve"> on or off depending on the value of a Boolean variable, which stored the information on whether the lights were currently switched on or off. </w:t>
+      </w:r>
+    </w:p>
+    <w:p>
+      <w:r>
+        <w:t xml:space="preserve">From this change, most of the other supporting code within the event graph was no longer necessary so was removed to strip the blueprint back to basics. </w:t>
+      </w:r>
+      <w:r>
+        <w:t xml:space="preserve">As the physics collisions were no longer blocking the player hand components from </w:t>
+      </w:r>
+      <w:r>
+        <w:t>moving</w:t>
+      </w:r>
+      <w:r>
+        <w:t xml:space="preserve"> into the light switch</w:t>
+      </w:r>
+      <w:r>
+        <w:t xml:space="preserve"> and the logic of the light switch had become simplified</w:t>
+      </w:r>
+      <w:r>
+        <w:t>,</w:t>
+      </w:r>
+      <w:r>
+        <w:t xml:space="preserve"> </w:t>
+      </w:r>
+      <w:r>
+        <w:t xml:space="preserve">the interaction could </w:t>
+      </w:r>
+      <w:r>
+        <w:t xml:space="preserve">reliably </w:t>
+      </w:r>
+      <w:r>
+        <w:t>receive</w:t>
+      </w:r>
+      <w:r>
+        <w:t xml:space="preserve"> </w:t>
+      </w:r>
+      <w:r>
+        <w:t>trigger inputs from the user</w:t>
+      </w:r>
+      <w:r>
+        <w:t>.</w:t>
+      </w:r>
+    </w:p>
+    <w:p>
+      <w:pPr>
+        <w:pStyle w:val="Heading3"/>
+      </w:pPr>
+      <w:bookmarkStart w:id="35" w:name="_Toc223987304"/>
+      <w:r>
+        <w:t>Flow Tweaks</w:t>
+      </w:r>
+      <w:bookmarkEnd w:id="35"/>
+    </w:p>
+    <w:p>
+      <w:r>
+        <w:t xml:space="preserve">The </w:t>
+      </w:r>
+      <w:r>
+        <w:t>timeline duration between objectives 4 and 5 for triggering and reverting the light sensitivity symptom</w:t>
+      </w:r>
+      <w:r>
+        <w:t xml:space="preserve"> w</w:t>
+      </w:r>
+      <w:r>
+        <w:t>as</w:t>
+      </w:r>
+      <w:r>
+        <w:t xml:space="preserve"> reduced</w:t>
+      </w:r>
+      <w:r>
+        <w:t xml:space="preserve">. </w:t>
+      </w:r>
+      <w:r>
+        <w:t>S</w:t>
+      </w:r>
+      <w:r>
+        <w:t>ymptom effects were still able to be portrayed to users while showing prevention methods worked.</w:t>
+      </w:r>
+      <w:r>
+        <w:t xml:space="preserve"> </w:t>
+      </w:r>
+      <w:r>
+        <w:t>O</w:t>
+      </w:r>
+      <w:r>
+        <w:t xml:space="preserve">bjectives should not overlap each other </w:t>
+      </w:r>
+      <w:r>
+        <w:t>or</w:t>
+      </w:r>
+      <w:r>
+        <w:t xml:space="preserve"> show </w:t>
+      </w:r>
+      <w:r>
+        <w:t xml:space="preserve">unexpected </w:t>
+      </w:r>
+      <w:r>
+        <w:t>behaviour</w:t>
+      </w:r>
+      <w:r>
+        <w:t xml:space="preserve"> </w:t>
+      </w:r>
+      <w:r>
+        <w:t>to the player</w:t>
+      </w:r>
+      <w:r>
+        <w:t>. T</w:t>
+      </w:r>
+      <w:r>
+        <w:t xml:space="preserve">his </w:t>
+      </w:r>
+      <w:r>
+        <w:t>keep</w:t>
       </w:r>
       <w:r>
         <w:t>s</w:t>
       </w:r>
-      <w:bookmarkEnd w:id="29"/>
-    </w:p>
-    <w:p>
-      <w:r>
-        <w:t xml:space="preserve">To enhance the </w:t>
-      </w:r>
-      <w:r>
-        <w:t>experience</w:t>
-      </w:r>
-      <w:r>
-        <w:t xml:space="preserve"> of the application, getting the user to interact with objects within the scene was important</w:t>
-      </w:r>
-      <w:r>
-        <w:t xml:space="preserve"> to increase immersion</w:t>
-      </w:r>
-      <w:r>
-        <w:t xml:space="preserve">. These interactions included staring at the screen for a certain duration, looking at an object far away or on the desk and turning a light switch on and off. By doing this, the user would replicate actual actions that cause symptoms of DES and preventative measures reinforcing the learning being undertaken. </w:t>
-      </w:r>
-    </w:p>
-    <w:p>
-      <w:r>
-        <w:t>A</w:t>
-      </w:r>
-      <w:r>
-        <w:t xml:space="preserve"> line trace channel </w:t>
-      </w:r>
-      <w:r>
-        <w:t xml:space="preserve">was used </w:t>
-      </w:r>
-      <w:r>
-        <w:t xml:space="preserve">to </w:t>
-      </w:r>
-      <w:r>
-        <w:t>detect collision events with interactable objects.</w:t>
-      </w:r>
-      <w:r>
-        <w:t xml:space="preserve"> Whenever a hit was received, depending on which objective was the</w:t>
-      </w:r>
-      <w:r>
-        <w:t xml:space="preserve"> </w:t>
-      </w:r>
-      <w:r>
-        <w:t>current one it would update according to if the object being looked at was the right one to progress that specific objective. Users were notified by the UI on the monitor to which object needed to be looked at or interacted with. For the light switch, interaction using the grab trigger was needed to simulate the light switching on and off. Once the specific condition was met</w:t>
-      </w:r>
-      <w:r>
-        <w:t>,</w:t>
-      </w:r>
-      <w:r>
-        <w:t xml:space="preserve"> event dispatchers were fired from those objects to notify of objective updates.</w:t>
+      <w:r>
+        <w:t xml:space="preserve"> the understanding </w:t>
+      </w:r>
+      <w:r>
+        <w:t xml:space="preserve">of the experience </w:t>
+      </w:r>
+      <w:r>
+        <w:t xml:space="preserve">clear and </w:t>
+      </w:r>
+      <w:r>
+        <w:t>prioritises</w:t>
+      </w:r>
+      <w:r>
+        <w:t xml:space="preserve"> information retention.</w:t>
       </w:r>
     </w:p>
     <w:p>
       <w:pPr>
         <w:pStyle w:val="Heading3"/>
       </w:pPr>
-      <w:bookmarkStart w:id="30" w:name="_Toc223984340"/>
-      <w:r>
-        <w:t>Post Processing Effects</w:t>
-      </w:r>
-      <w:r>
-        <w:t xml:space="preserve"> for Simulating Symptoms</w:t>
-      </w:r>
-      <w:bookmarkEnd w:id="30"/>
-    </w:p>
-    <w:p>
-      <w:r>
-        <w:t>Simulating the symptoms of DES required enabling specific post processing effects within the camera</w:t>
-      </w:r>
-      <w:r>
-        <w:t>’s post processing component</w:t>
-      </w:r>
-      <w:r>
-        <w:t>. These effects were vignette to simulate eye fatigue, bloom for light sensitivity and blur for focus strain. Vignette and bloom post processing effects were triggered through adjusting their post processing variables within the camera post processing component. However, for blur a post processing material was required to create the radial blur. When objectives progressed triggering the simulation of symptoms, a timeline was used to progressively increase the value of an effect gradually over a duration. This decision was made to accommodate eyes adjusting to the changes of the camera as these effects were being triggered.</w:t>
-      </w:r>
-      <w:r>
-        <w:t xml:space="preserve"> The timeline was then used in reverse to revert the symptoms returning the camera view back to the original state it was in.</w:t>
-      </w:r>
-    </w:p>
-    <w:p>
-      <w:pPr>
-        <w:pStyle w:val="Heading3"/>
-      </w:pPr>
-      <w:bookmarkStart w:id="31" w:name="_Toc223984341"/>
-      <w:r>
-        <w:t>User</w:t>
-      </w:r>
-      <w:r>
-        <w:t xml:space="preserve"> Look Direction and Attention Detection</w:t>
-      </w:r>
-      <w:bookmarkEnd w:id="31"/>
-    </w:p>
-    <w:p>
-      <w:r>
-        <w:t>Look direction was detected using a line trace that took the camera position as the starting location and a distance value multiplied by the forward vector of the camera. From there, returned hits would be checked for the object needed to progress the objective. When a successful hit was recorded, the time spent staring at the object was recorded and used to update the progress bar on the monitor. Whenever user gaze averted from the required progression object, the progress bar would reset back to zero so that progress wasn’t accumulated over multiple looks but from one continuous stare replicating the causes for symptoms.</w:t>
-      </w:r>
-    </w:p>
-    <w:p>
-      <w:r>
-        <w:br w:type="page"/>
-      </w:r>
-    </w:p>
-    <w:p>
-      <w:pPr>
-        <w:pStyle w:val="Heading2"/>
-      </w:pPr>
-      <w:bookmarkStart w:id="32" w:name="_Toc223984342"/>
-      <w:r>
-        <w:lastRenderedPageBreak/>
-        <w:t>Final Version</w:t>
-      </w:r>
-      <w:r>
-        <w:t xml:space="preserve"> Implementation</w:t>
-      </w:r>
-      <w:bookmarkEnd w:id="32"/>
-    </w:p>
-    <w:p>
-      <w:pPr>
-        <w:pStyle w:val="Heading3"/>
-      </w:pPr>
-      <w:bookmarkStart w:id="33" w:name="_Toc223984343"/>
-      <w:r>
-        <w:t>Environment Changes and Visual Modifications</w:t>
-      </w:r>
-      <w:bookmarkEnd w:id="33"/>
-    </w:p>
-    <w:p>
-      <w:r>
-        <w:t>To add some colour to the scenes</w:t>
-      </w:r>
-      <w:r>
-        <w:t>,</w:t>
-      </w:r>
-      <w:r>
-        <w:t xml:space="preserve"> the default grid materials were swapped out for flooring, ceiling, wall and other materials to change the scene from a grey looking prototype to a </w:t>
-      </w:r>
-      <w:r>
-        <w:t xml:space="preserve">more </w:t>
-      </w:r>
-      <w:r>
-        <w:t>polished scene setup.</w:t>
-      </w:r>
-    </w:p>
-    <w:p>
-      <w:pPr>
-        <w:pStyle w:val="Heading3"/>
-      </w:pPr>
-      <w:bookmarkStart w:id="34" w:name="_Toc223984344"/>
-      <w:r>
-        <w:t>Interaction Improvements</w:t>
-      </w:r>
-      <w:bookmarkEnd w:id="34"/>
-    </w:p>
-    <w:p>
-      <w:r>
-        <w:t xml:space="preserve">Hand physics collisions were removed </w:t>
-      </w:r>
-      <w:r>
-        <w:t xml:space="preserve">which allowed the user interactions with the </w:t>
-      </w:r>
-      <w:r>
-        <w:t xml:space="preserve">light switch </w:t>
-      </w:r>
-      <w:r>
-        <w:t xml:space="preserve">to </w:t>
-      </w:r>
-      <w:r>
-        <w:t>work as intended</w:t>
-      </w:r>
-      <w:r>
-        <w:t>.</w:t>
-      </w:r>
-      <w:r>
-        <w:t xml:space="preserve"> In addition to this, the blueprint for the light switch was heavily simplified. The original blueprint used logic that worked for a lever like interaction component that was quite large and would adjust its rotation based on where the player hand was while interacting with the object. However, the light switch was a small object where there was a minimal difference in position of the hand component. The logic needed to be simplified to detection of the user interacting with the grab component</w:t>
-      </w:r>
-      <w:r>
-        <w:t xml:space="preserve"> of the switch</w:t>
-      </w:r>
-      <w:r>
-        <w:t>.</w:t>
-      </w:r>
-      <w:r>
-        <w:t xml:space="preserve"> </w:t>
-      </w:r>
-      <w:r>
-        <w:t>T</w:t>
-      </w:r>
-      <w:r>
-        <w:t>hen the light</w:t>
-      </w:r>
-      <w:r>
-        <w:t xml:space="preserve"> would be </w:t>
-      </w:r>
-      <w:r>
-        <w:t>turned</w:t>
-      </w:r>
-      <w:r>
-        <w:t xml:space="preserve"> on or off depending on the value of a Boolean variable, which stored the information on whether the lights were currently switched on or off. </w:t>
-      </w:r>
-    </w:p>
-    <w:p>
-      <w:r>
-        <w:t xml:space="preserve">From this change, most of the other supporting code within the event graph was no longer necessary so was removed to strip the blueprint back to basics. </w:t>
-      </w:r>
-      <w:r>
-        <w:t xml:space="preserve">As the physics collisions were no longer blocking the player hand components from </w:t>
-      </w:r>
-      <w:r>
-        <w:t>moving</w:t>
-      </w:r>
-      <w:r>
-        <w:t xml:space="preserve"> into the light switch</w:t>
-      </w:r>
-      <w:r>
-        <w:t xml:space="preserve"> and the logic of the light switch had become simplified</w:t>
-      </w:r>
-      <w:r>
-        <w:t>,</w:t>
-      </w:r>
-      <w:r>
-        <w:t xml:space="preserve"> </w:t>
-      </w:r>
-      <w:r>
-        <w:t xml:space="preserve">the interaction could </w:t>
-      </w:r>
-      <w:r>
-        <w:t xml:space="preserve">reliably </w:t>
-      </w:r>
-      <w:r>
-        <w:t>receive</w:t>
-      </w:r>
-      <w:r>
-        <w:t xml:space="preserve"> </w:t>
-      </w:r>
-      <w:r>
-        <w:t>trigger inputs from the user</w:t>
-      </w:r>
-      <w:r>
-        <w:t>.</w:t>
-      </w:r>
-    </w:p>
-    <w:p>
-      <w:pPr>
-        <w:pStyle w:val="Heading3"/>
-      </w:pPr>
-      <w:bookmarkStart w:id="35" w:name="_Toc223984345"/>
-      <w:r>
-        <w:t>Flow Tweaks</w:t>
-      </w:r>
-      <w:bookmarkEnd w:id="35"/>
-    </w:p>
-    <w:p>
-      <w:r>
-        <w:t xml:space="preserve">The </w:t>
-      </w:r>
-      <w:r>
-        <w:t>timeline duration between objectives 4 and 5 for triggering and reverting the light sensitivity symptom</w:t>
-      </w:r>
-      <w:r>
-        <w:t xml:space="preserve"> w</w:t>
-      </w:r>
-      <w:r>
-        <w:t>as</w:t>
-      </w:r>
-      <w:r>
-        <w:t xml:space="preserve"> reduced</w:t>
-      </w:r>
-      <w:r>
-        <w:t xml:space="preserve">. </w:t>
-      </w:r>
-      <w:r>
-        <w:t>S</w:t>
-      </w:r>
-      <w:r>
-        <w:t>ymptom effects were still able to be portrayed to users while showing prevention methods worked.</w:t>
-      </w:r>
-      <w:r>
-        <w:t xml:space="preserve"> </w:t>
-      </w:r>
-      <w:r>
-        <w:t>O</w:t>
-      </w:r>
-      <w:r>
-        <w:t xml:space="preserve">bjectives should not overlap each other </w:t>
-      </w:r>
-      <w:r>
-        <w:t>or</w:t>
-      </w:r>
-      <w:r>
-        <w:t xml:space="preserve"> show </w:t>
-      </w:r>
-      <w:r>
-        <w:t xml:space="preserve">unexpected </w:t>
-      </w:r>
-      <w:r>
-        <w:t>behaviour</w:t>
-      </w:r>
-      <w:r>
-        <w:t xml:space="preserve"> </w:t>
-      </w:r>
-      <w:r>
-        <w:t>to the player</w:t>
-      </w:r>
-      <w:r>
-        <w:t>. T</w:t>
-      </w:r>
-      <w:r>
-        <w:t xml:space="preserve">his </w:t>
-      </w:r>
-      <w:r>
-        <w:t>keep</w:t>
-      </w:r>
-      <w:r>
-        <w:t>s</w:t>
-      </w:r>
-      <w:r>
-        <w:t xml:space="preserve"> the understanding </w:t>
-      </w:r>
-      <w:r>
-        <w:t xml:space="preserve">of the experience </w:t>
-      </w:r>
-      <w:r>
-        <w:t xml:space="preserve">clear and </w:t>
-      </w:r>
-      <w:r>
-        <w:t>prioritises</w:t>
-      </w:r>
-      <w:r>
-        <w:t xml:space="preserve"> information retention.</w:t>
-      </w:r>
-    </w:p>
-    <w:p>
-      <w:pPr>
-        <w:pStyle w:val="Heading3"/>
-      </w:pPr>
-      <w:bookmarkStart w:id="36" w:name="_Toc223984346"/>
+      <w:bookmarkStart w:id="36" w:name="_Toc223987305"/>
       <w:r>
         <w:t>Gaze Detection Refinements</w:t>
       </w:r>
@@ -10197,7 +10363,7 @@
       <w:pPr>
         <w:pStyle w:val="Heading1"/>
       </w:pPr>
-      <w:bookmarkStart w:id="37" w:name="_Toc223984347"/>
+      <w:bookmarkStart w:id="37" w:name="_Toc223987306"/>
       <w:r>
         <w:lastRenderedPageBreak/>
         <w:t>Results</w:t>
@@ -10208,7 +10374,7 @@
       <w:pPr>
         <w:pStyle w:val="Heading2"/>
       </w:pPr>
-      <w:bookmarkStart w:id="38" w:name="_Toc223984348"/>
+      <w:bookmarkStart w:id="38" w:name="_Toc223987307"/>
       <w:r>
         <w:t>Prototype Tests</w:t>
       </w:r>
@@ -10304,7 +10470,7 @@
       <w:pPr>
         <w:pStyle w:val="Heading3"/>
       </w:pPr>
-      <w:bookmarkStart w:id="39" w:name="_Toc223984349"/>
+      <w:bookmarkStart w:id="39" w:name="_Toc223987308"/>
       <w:r>
         <w:t>Interaction</w:t>
       </w:r>
@@ -10465,7 +10631,7 @@
       <w:pPr>
         <w:pStyle w:val="Heading3"/>
       </w:pPr>
-      <w:bookmarkStart w:id="40" w:name="_Toc223984350"/>
+      <w:bookmarkStart w:id="40" w:name="_Toc223987309"/>
       <w:r>
         <w:t>User Attention Detection</w:t>
       </w:r>
@@ -10522,7 +10688,7 @@
       <w:pPr>
         <w:pStyle w:val="Heading3"/>
       </w:pPr>
-      <w:bookmarkStart w:id="41" w:name="_Toc223984351"/>
+      <w:bookmarkStart w:id="41" w:name="_Toc223987310"/>
       <w:r>
         <w:t>Symptom Simulations</w:t>
       </w:r>
@@ -10664,7 +10830,7 @@
       <w:pPr>
         <w:pStyle w:val="Heading3"/>
       </w:pPr>
-      <w:bookmarkStart w:id="42" w:name="_Toc223984352"/>
+      <w:bookmarkStart w:id="42" w:name="_Toc223987311"/>
       <w:r>
         <w:t xml:space="preserve">Improvements to be </w:t>
       </w:r>
@@ -10714,7 +10880,7 @@
       <w:pPr>
         <w:pStyle w:val="Heading2"/>
       </w:pPr>
-      <w:bookmarkStart w:id="43" w:name="_Toc223984353"/>
+      <w:bookmarkStart w:id="43" w:name="_Toc223987312"/>
       <w:r>
         <w:lastRenderedPageBreak/>
         <w:t>Final Version Tests</w:t>
@@ -10754,7 +10920,7 @@
       <w:pPr>
         <w:pStyle w:val="Heading3"/>
       </w:pPr>
-      <w:bookmarkStart w:id="44" w:name="_Toc223984354"/>
+      <w:bookmarkStart w:id="44" w:name="_Toc223987313"/>
       <w:r>
         <w:t>Interaction Objects and Objective Understanding</w:t>
       </w:r>
@@ -10808,7 +10974,7 @@
       <w:pPr>
         <w:pStyle w:val="Heading3"/>
       </w:pPr>
-      <w:bookmarkStart w:id="45" w:name="_Toc223984355"/>
+      <w:bookmarkStart w:id="45" w:name="_Toc223987314"/>
       <w:r>
         <w:t>User Attention Detection</w:t>
       </w:r>
@@ -10871,7 +11037,7 @@
       <w:pPr>
         <w:pStyle w:val="Heading3"/>
       </w:pPr>
-      <w:bookmarkStart w:id="46" w:name="_Toc223984356"/>
+      <w:bookmarkStart w:id="46" w:name="_Toc223987315"/>
       <w:r>
         <w:t>Symptom Simulation</w:t>
       </w:r>
@@ -10914,7 +11080,7 @@
       <w:pPr>
         <w:pStyle w:val="Heading1"/>
       </w:pPr>
-      <w:bookmarkStart w:id="47" w:name="_Toc223984357"/>
+      <w:bookmarkStart w:id="47" w:name="_Toc223987316"/>
       <w:r>
         <w:lastRenderedPageBreak/>
         <w:t>Critical Evaluation</w:t>
@@ -10968,7 +11134,7 @@
       <w:pPr>
         <w:pStyle w:val="Heading1"/>
       </w:pPr>
-      <w:bookmarkStart w:id="48" w:name="_Toc223984358"/>
+      <w:bookmarkStart w:id="48" w:name="_Toc223987317"/>
       <w:r>
         <w:lastRenderedPageBreak/>
         <w:t>Conclusions and Future Work</w:t>
@@ -10979,7 +11145,7 @@
       <w:pPr>
         <w:pStyle w:val="Heading2"/>
       </w:pPr>
-      <w:bookmarkStart w:id="49" w:name="_Toc223984359"/>
+      <w:bookmarkStart w:id="49" w:name="_Toc223987318"/>
       <w:r>
         <w:t>Conclusion</w:t>
       </w:r>
@@ -10990,7 +11156,7 @@
       <w:pPr>
         <w:pStyle w:val="Heading2"/>
       </w:pPr>
-      <w:bookmarkStart w:id="50" w:name="_Toc223984360"/>
+      <w:bookmarkStart w:id="50" w:name="_Toc223987319"/>
       <w:r>
         <w:t>Future Work</w:t>
       </w:r>
@@ -11075,7 +11241,7 @@
       <w:pPr>
         <w:pStyle w:val="Heading1"/>
       </w:pPr>
-      <w:bookmarkStart w:id="51" w:name="_Toc223984361"/>
+      <w:bookmarkStart w:id="51" w:name="_Toc223987320"/>
       <w:r>
         <w:lastRenderedPageBreak/>
         <w:t>References</w:t>
@@ -11083,9 +11249,23 @@
       <w:bookmarkEnd w:id="51"/>
     </w:p>
     <w:p>
-      <w:r>
-        <w:t xml:space="preserve">Cantó-Sancho, N., Porru, S., Casati, S., Ronda, E., Seguí-Crespo, M. and Carta, A. (2023) ‘Prevalence and risk factors of computer vision syndrome—assessed in office workers by a validated questionnaire’. </w:t>
-      </w:r>
+      <w:proofErr w:type="spellStart"/>
+      <w:r>
+        <w:t>Cantó</w:t>
+      </w:r>
+      <w:proofErr w:type="spellEnd"/>
+      <w:r>
+        <w:t xml:space="preserve">-Sancho, N., </w:t>
+      </w:r>
+      <w:proofErr w:type="spellStart"/>
+      <w:r>
+        <w:t>Porru</w:t>
+      </w:r>
+      <w:proofErr w:type="spellEnd"/>
+      <w:r>
+        <w:t xml:space="preserve">, S., Casati, S., Ronda, E., Seguí-Crespo, M. and Carta, A. (2023) ‘Prevalence and risk factors of computer vision syndrome—assessed in office workers by a validated questionnaire’. </w:t>
+      </w:r>
+      <w:proofErr w:type="spellStart"/>
       <w:r>
         <w:rPr>
           <w:i/>
@@ -11093,13 +11273,30 @@
         </w:rPr>
         <w:t>PeerJ</w:t>
       </w:r>
+      <w:proofErr w:type="spellEnd"/>
       <w:r>
         <w:t xml:space="preserve"> 11, p. e14937. Available at: https://www.researchgate.net/publication/369002899_Prevalence_and_risk_factors_of_computer_vision_syndrome-assessed_in_office_workers_by_a_validated_questionnaire (Accessed: 20 October 2025).</w:t>
       </w:r>
     </w:p>
     <w:p>
       <w:r>
-        <w:t xml:space="preserve">Chandrasekhara, R.S., Low, C., Lim, Y., Low, L., Mardina, F. and Nursaleha, M. (2013) ‘Computer vision syndrome: a study of knowledge and practices in university students’. </w:t>
+        <w:t xml:space="preserve">Chandrasekhara, R.S., Low, C., Lim, Y., Low, L., Mardina, F. and </w:t>
+      </w:r>
+      <w:proofErr w:type="spellStart"/>
+      <w:r>
+        <w:t>Nursaleha</w:t>
+      </w:r>
+      <w:proofErr w:type="spellEnd"/>
+      <w:r>
+        <w:t xml:space="preserve">, M. (2013) ‘Computer vision syndrome: a study of knowledge and practices in university </w:t>
+      </w:r>
+      <w:proofErr w:type="gramStart"/>
+      <w:r>
+        <w:t>students’</w:t>
+      </w:r>
+      <w:proofErr w:type="gramEnd"/>
+      <w:r>
+        <w:t xml:space="preserve">. </w:t>
       </w:r>
       <w:r>
         <w:rPr>
@@ -11125,7 +11322,15 @@
     </w:p>
     <w:p>
       <w:r>
-        <w:t xml:space="preserve">Muñoz, E.G., Fabregat, R., Bacca-Acosta, J., Duque-Méndez, N. and Avila-Garzon, C. (2022) ‘Augmented Reality, Virtual Reality, and Game Technologies in Ophthalmology Training’. </w:t>
+        <w:t xml:space="preserve">Muñoz, E.G., </w:t>
+      </w:r>
+      <w:proofErr w:type="spellStart"/>
+      <w:r>
+        <w:t>Fabregat</w:t>
+      </w:r>
+      <w:proofErr w:type="spellEnd"/>
+      <w:r>
+        <w:t xml:space="preserve">, R., Bacca-Acosta, J., Duque-Méndez, N. and Avila-Garzon, C. (2022) ‘Augmented Reality, Virtual Reality, and Game Technologies in Ophthalmology Training’. </w:t>
       </w:r>
       <w:r>
         <w:rPr>
@@ -11135,7 +11340,15 @@
         <w:t>Information</w:t>
       </w:r>
       <w:r>
-        <w:t xml:space="preserve"> 13(5), p. 222. doi: </w:t>
+        <w:t xml:space="preserve"> 13(5), p. 222. </w:t>
+      </w:r>
+      <w:proofErr w:type="spellStart"/>
+      <w:r>
+        <w:t>doi</w:t>
+      </w:r>
+      <w:proofErr w:type="spellEnd"/>
+      <w:r>
+        <w:t xml:space="preserve">: </w:t>
       </w:r>
       <w:hyperlink r:id="rId16" w:history="1">
         <w:r>
@@ -11151,12 +11364,33 @@
     </w:p>
     <w:p>
       <w:r>
-        <w:t>Orji, J., Hernandez, A., Selema, B. and Orji, R. (2022) ‘Virtual and augmented reality applications for promoting safety and security: A systematic review’., pp. 1–7. doi: https://doi.org/10.1109/SEGAH54908.2022.9978597.</w:t>
-      </w:r>
-    </w:p>
-    <w:p>
-      <w:r>
-        <w:t xml:space="preserve">Porcar, E., Pons, A. and Lorente, A. (2016) ‘Visual and ocular effects from the use of flat-panel displays’. </w:t>
+        <w:t xml:space="preserve">Orji, J., Hernandez, A., Selema, B. and Orji, R. (2022) ‘Virtual and augmented reality applications for promoting safety and security: A systematic review’., pp. 1–7. </w:t>
+      </w:r>
+      <w:proofErr w:type="spellStart"/>
+      <w:r>
+        <w:t>doi</w:t>
+      </w:r>
+      <w:proofErr w:type="spellEnd"/>
+      <w:r>
+        <w:t>: https://doi.org/10.1109/SEGAH54908.2022.9978597.</w:t>
+      </w:r>
+    </w:p>
+    <w:p>
+      <w:proofErr w:type="spellStart"/>
+      <w:r>
+        <w:t>Porcar</w:t>
+      </w:r>
+      <w:proofErr w:type="spellEnd"/>
+      <w:r>
+        <w:t xml:space="preserve">, E., Pons, A. and Lorente, A. (2016) ‘Visual and ocular effects from the use of flat-panel </w:t>
+      </w:r>
+      <w:proofErr w:type="gramStart"/>
+      <w:r>
+        <w:t>displays’</w:t>
+      </w:r>
+      <w:proofErr w:type="gramEnd"/>
+      <w:r>
+        <w:t xml:space="preserve">. </w:t>
       </w:r>
       <w:r>
         <w:rPr>
@@ -11171,7 +11405,23 @@
     </w:p>
     <w:p>
       <w:r>
-        <w:t xml:space="preserve">Santilli, T., Ceccacci, S., Mengoni, M. and Catia Giaconi (2025) ‘Virtual vs. traditional learning in higher education: A systematic review of comparative studies’. </w:t>
+        <w:t xml:space="preserve">Santilli, T., Ceccacci, S., Mengoni, M. and Catia </w:t>
+      </w:r>
+      <w:proofErr w:type="spellStart"/>
+      <w:r>
+        <w:t>Giaconi</w:t>
+      </w:r>
+      <w:proofErr w:type="spellEnd"/>
+      <w:r>
+        <w:t xml:space="preserve"> (2025) ‘Virtual vs. traditional learning in higher education: A systematic review of comparative </w:t>
+      </w:r>
+      <w:proofErr w:type="gramStart"/>
+      <w:r>
+        <w:t>studies’</w:t>
+      </w:r>
+      <w:proofErr w:type="gramEnd"/>
+      <w:r>
+        <w:t xml:space="preserve">. </w:t>
       </w:r>
       <w:r>
         <w:rPr>
@@ -11206,7 +11456,23 @@
     </w:p>
     <w:p>
       <w:r>
-        <w:t>Vieira, F., Oliveira, E. and Rodrigues, N. (2019) ‘iSVC – digital platform for detection and prevention of computer vision syndrome’., pp. 1–7. doi: https://doi.org/10.1109/SeGAH.2019.8882438.</w:t>
+        <w:t>Vieira, F., Oliveira, E. and Rodrigues, N. (2019) ‘</w:t>
+      </w:r>
+      <w:proofErr w:type="spellStart"/>
+      <w:r>
+        <w:t>iSVC</w:t>
+      </w:r>
+      <w:proofErr w:type="spellEnd"/>
+      <w:r>
+        <w:t xml:space="preserve"> – digital platform for detection and prevention of computer vision syndrome’., pp. 1–7. </w:t>
+      </w:r>
+      <w:proofErr w:type="spellStart"/>
+      <w:r>
+        <w:t>doi</w:t>
+      </w:r>
+      <w:proofErr w:type="spellEnd"/>
+      <w:r>
+        <w:t>: https://doi.org/10.1109/SeGAH.2019.8882438.</w:t>
       </w:r>
     </w:p>
     <w:p>
@@ -11221,12 +11487,28 @@
         <w:t>Annals of Emerging Technologies in Computing</w:t>
       </w:r>
       <w:r>
-        <w:t xml:space="preserve"> 9(3), pp. 50–68. doi: https://doi.org/10.33166/aetic.2025.03.004.</w:t>
-      </w:r>
-    </w:p>
-    <w:p>
-      <w:r>
-        <w:t xml:space="preserve">Youcef, B., Ahmad, M.N. and Mustapha, M. (2021) ‘OntoPhaco: An ontology for virtual reality training in ophthalmology Domain—A case study of cataract surgery’. </w:t>
+        <w:t xml:space="preserve"> 9(3), pp. 50–68. </w:t>
+      </w:r>
+      <w:proofErr w:type="spellStart"/>
+      <w:r>
+        <w:t>doi</w:t>
+      </w:r>
+      <w:proofErr w:type="spellEnd"/>
+      <w:r>
+        <w:t>: https://doi.org/10.33166/aetic.2025.03.004.</w:t>
+      </w:r>
+    </w:p>
+    <w:p>
+      <w:r>
+        <w:t>Youcef, B., Ahmad, M.N. and Mustapha, M. (2021) ‘</w:t>
+      </w:r>
+      <w:proofErr w:type="spellStart"/>
+      <w:r>
+        <w:t>OntoPhaco</w:t>
+      </w:r>
+      <w:proofErr w:type="spellEnd"/>
+      <w:r>
+        <w:t xml:space="preserve">: An ontology for virtual reality training in ophthalmology Domain—A case study of cataract surgery’. </w:t>
       </w:r>
       <w:r>
         <w:rPr>
@@ -11236,7 +11518,15 @@
         <w:t>IEEE Access</w:t>
       </w:r>
       <w:r>
-        <w:t xml:space="preserve"> 9, pp. 152347–152378. doi: https://doi.org/10.1109/ACCESS.2021.3126697.</w:t>
+        <w:t xml:space="preserve"> 9, pp. 152347–152378. </w:t>
+      </w:r>
+      <w:proofErr w:type="spellStart"/>
+      <w:r>
+        <w:t>doi</w:t>
+      </w:r>
+      <w:proofErr w:type="spellEnd"/>
+      <w:r>
+        <w:t>: https://doi.org/10.1109/ACCESS.2021.3126697.</w:t>
       </w:r>
     </w:p>
     <w:p/>
@@ -11244,7 +11534,7 @@
       <w:pPr>
         <w:pStyle w:val="Heading1"/>
       </w:pPr>
-      <w:bookmarkStart w:id="52" w:name="_Toc223984362"/>
+      <w:bookmarkStart w:id="52" w:name="_Toc223987321"/>
       <w:r>
         <w:lastRenderedPageBreak/>
         <w:t>Appendix</w:t>
@@ -11255,7 +11545,7 @@
       <w:pPr>
         <w:pStyle w:val="Heading2"/>
       </w:pPr>
-      <w:bookmarkStart w:id="53" w:name="_Toc223984363"/>
+      <w:bookmarkStart w:id="53" w:name="_Toc223987322"/>
       <w:r>
         <w:t>Asset Licenses and Sources</w:t>
       </w:r>
@@ -11265,7 +11555,7 @@
       <w:pPr>
         <w:pStyle w:val="Heading3"/>
       </w:pPr>
-      <w:bookmarkStart w:id="54" w:name="_Toc223984364"/>
+      <w:bookmarkStart w:id="54" w:name="_Toc223987323"/>
       <w:r>
         <w:t>Modern Office Table</w:t>
       </w:r>
@@ -11349,7 +11639,7 @@
       <w:pPr>
         <w:pStyle w:val="Heading3"/>
       </w:pPr>
-      <w:bookmarkStart w:id="55" w:name="_Toc223984365"/>
+      <w:bookmarkStart w:id="55" w:name="_Toc223987324"/>
       <w:r>
         <w:t>Free Studio Starter Pack</w:t>
       </w:r>
@@ -11433,7 +11723,7 @@
       <w:pPr>
         <w:pStyle w:val="Heading3"/>
       </w:pPr>
-      <w:bookmarkStart w:id="56" w:name="_Toc223984366"/>
+      <w:bookmarkStart w:id="56" w:name="_Toc223987325"/>
       <w:r>
         <w:t>General Desktop Bundle</w:t>
       </w:r>
@@ -11517,7 +11807,7 @@
       <w:pPr>
         <w:pStyle w:val="Heading3"/>
       </w:pPr>
-      <w:bookmarkStart w:id="57" w:name="_Toc223984367"/>
+      <w:bookmarkStart w:id="57" w:name="_Toc223987326"/>
       <w:r>
         <w:lastRenderedPageBreak/>
         <w:t>General Gaming Headset</w:t>
@@ -11602,7 +11892,7 @@
       <w:pPr>
         <w:pStyle w:val="Heading3"/>
       </w:pPr>
-      <w:bookmarkStart w:id="58" w:name="_Toc223984368"/>
+      <w:bookmarkStart w:id="58" w:name="_Toc223987327"/>
       <w:r>
         <w:t>General Gaming Chair</w:t>
       </w:r>
@@ -11686,7 +11976,7 @@
       <w:pPr>
         <w:pStyle w:val="Heading3"/>
       </w:pPr>
-      <w:bookmarkStart w:id="59" w:name="_Toc223984369"/>
+      <w:bookmarkStart w:id="59" w:name="_Toc223987328"/>
       <w:r>
         <w:t>Light Switch</w:t>
       </w:r>
@@ -11784,7 +12074,7 @@
       <w:pPr>
         <w:pStyle w:val="Heading3"/>
       </w:pPr>
-      <w:bookmarkStart w:id="60" w:name="_Toc223984370"/>
+      <w:bookmarkStart w:id="60" w:name="_Toc223987329"/>
       <w:r>
         <w:lastRenderedPageBreak/>
         <w:t>Materials for General PC setup</w:t>
@@ -11914,7 +12204,7 @@
       <w:pPr>
         <w:pStyle w:val="Heading3"/>
       </w:pPr>
-      <w:bookmarkStart w:id="61" w:name="_Toc223984371"/>
+      <w:bookmarkStart w:id="61" w:name="_Toc223987330"/>
       <w:r>
         <w:lastRenderedPageBreak/>
         <w:t>Monitor background image</w:t>
@@ -12010,12 +12300,25 @@
       <w:pPr>
         <w:pStyle w:val="Heading3"/>
       </w:pPr>
-      <w:bookmarkStart w:id="62" w:name="_Toc223984372"/>
+      <w:bookmarkStart w:id="62" w:name="_Toc223987331"/>
       <w:r>
         <w:lastRenderedPageBreak/>
-        <w:t>Button Hover Sfx by Fachii</w:t>
+        <w:t xml:space="preserve">Button Hover </w:t>
+      </w:r>
+      <w:proofErr w:type="spellStart"/>
+      <w:r>
+        <w:t>Sfx</w:t>
+      </w:r>
+      <w:proofErr w:type="spellEnd"/>
+      <w:r>
+        <w:t xml:space="preserve"> by </w:t>
+      </w:r>
+      <w:proofErr w:type="spellStart"/>
+      <w:r>
+        <w:t>Fachii</w:t>
       </w:r>
       <w:bookmarkEnd w:id="62"/>
+      <w:proofErr w:type="spellEnd"/>
     </w:p>
     <w:p>
       <w:r>
@@ -12110,14 +12413,36 @@
     </w:p>
     <w:p/>
     <w:p>
-      <w:bookmarkStart w:id="63" w:name="_Toc223984373"/>
+      <w:bookmarkStart w:id="63" w:name="_Toc223987332"/>
       <w:r>
         <w:rPr>
           <w:rStyle w:val="Heading3Char"/>
         </w:rPr>
-        <w:t>Button click Sfx by AndrewEathan</w:t>
+        <w:t xml:space="preserve">Button click </w:t>
+      </w:r>
+      <w:proofErr w:type="spellStart"/>
+      <w:r>
+        <w:rPr>
+          <w:rStyle w:val="Heading3Char"/>
+        </w:rPr>
+        <w:t>Sfx</w:t>
+      </w:r>
+      <w:proofErr w:type="spellEnd"/>
+      <w:r>
+        <w:rPr>
+          <w:rStyle w:val="Heading3Char"/>
+        </w:rPr>
+        <w:t xml:space="preserve"> by </w:t>
+      </w:r>
+      <w:proofErr w:type="spellStart"/>
+      <w:r>
+        <w:rPr>
+          <w:rStyle w:val="Heading3Char"/>
+        </w:rPr>
+        <w:t>AndrewEathan</w:t>
       </w:r>
       <w:bookmarkEnd w:id="63"/>
+      <w:proofErr w:type="spellEnd"/>
       <w:r>
         <w:t xml:space="preserve"> </w:t>
       </w:r>
@@ -12223,12 +12548,25 @@
       <w:pPr>
         <w:pStyle w:val="Heading3"/>
       </w:pPr>
-      <w:bookmarkStart w:id="64" w:name="_Toc223984374"/>
+      <w:bookmarkStart w:id="64" w:name="_Toc223987333"/>
       <w:r>
         <w:lastRenderedPageBreak/>
-        <w:t>Light Switch On Sfx</w:t>
+        <w:t xml:space="preserve">Light Switch </w:t>
+      </w:r>
+      <w:proofErr w:type="gramStart"/>
+      <w:r>
+        <w:t>On</w:t>
+      </w:r>
+      <w:proofErr w:type="gramEnd"/>
+      <w:r>
+        <w:t xml:space="preserve"> </w:t>
+      </w:r>
+      <w:proofErr w:type="spellStart"/>
+      <w:r>
+        <w:t>Sfx</w:t>
       </w:r>
       <w:bookmarkEnd w:id="64"/>
+      <w:proofErr w:type="spellEnd"/>
     </w:p>
     <w:p>
       <w:r>
@@ -12318,11 +12656,16 @@
       <w:pPr>
         <w:pStyle w:val="Heading3"/>
       </w:pPr>
-      <w:bookmarkStart w:id="65" w:name="_Toc223984375"/>
-      <w:r>
-        <w:t>Light Switch Off Sfx</w:t>
+      <w:bookmarkStart w:id="65" w:name="_Toc223987334"/>
+      <w:r>
+        <w:t xml:space="preserve">Light Switch Off </w:t>
+      </w:r>
+      <w:proofErr w:type="spellStart"/>
+      <w:r>
+        <w:t>Sfx</w:t>
       </w:r>
       <w:bookmarkEnd w:id="65"/>
+      <w:proofErr w:type="spellEnd"/>
     </w:p>
     <w:p>
       <w:r>

</xml_diff>

<commit_message>
Added two citations to the source control paragraph
</commit_message>
<xml_diff>
--- a/30077548Thesis.docx
+++ b/30077548Thesis.docx
@@ -7223,21 +7223,7 @@
         <w:rPr>
           <w:rFonts w:cs="Arial"/>
         </w:rPr>
-        <w:t xml:space="preserve">Clear </w:t>
-      </w:r>
-      <w:proofErr w:type="gramStart"/>
-      <w:r>
-        <w:rPr>
-          <w:rFonts w:cs="Arial"/>
-        </w:rPr>
-        <w:t>on screen</w:t>
-      </w:r>
-      <w:proofErr w:type="gramEnd"/>
-      <w:r>
-        <w:rPr>
-          <w:rFonts w:cs="Arial"/>
-        </w:rPr>
-        <w:t xml:space="preserve"> prompts to guide and support users that aren’t familiar with VR equipment</w:t>
+        <w:t>Clear on screen prompts to guide and support users that aren’t familiar with VR equipment</w:t>
       </w:r>
     </w:p>
     <w:p>
@@ -9462,25 +9448,67 @@
     </w:p>
     <w:p>
       <w:r>
-        <w:t xml:space="preserve">GitHub was used </w:t>
-      </w:r>
-      <w:r>
-        <w:t>for</w:t>
-      </w:r>
-      <w:r>
-        <w:t xml:space="preserve"> source control </w:t>
+        <w:t>GitHub</w:t>
+      </w:r>
+      <w:r>
+        <w:t xml:space="preserve">, </w:t>
+      </w:r>
+      <w:r>
+        <w:t>(2024)</w:t>
+      </w:r>
+      <w:r>
+        <w:t xml:space="preserve"> is</w:t>
+      </w:r>
+      <w:r>
+        <w:t xml:space="preserve"> a widely </w:t>
+      </w:r>
+      <w:r>
+        <w:t>used</w:t>
+      </w:r>
+      <w:r>
+        <w:t xml:space="preserve"> version control tool</w:t>
+      </w:r>
+      <w:r>
+        <w:t xml:space="preserve"> which</w:t>
+      </w:r>
+      <w:r>
+        <w:t xml:space="preserve"> was used </w:t>
       </w:r>
       <w:r>
         <w:t>within</w:t>
       </w:r>
       <w:r>
-        <w:t xml:space="preserve"> the project. Source control is needed to </w:t>
+        <w:t xml:space="preserve"> the project. </w:t>
+      </w:r>
+      <w:r>
+        <w:t>S</w:t>
+      </w:r>
+      <w:r>
+        <w:t xml:space="preserve">ource control is needed to </w:t>
       </w:r>
       <w:r>
         <w:t>keep track of changes made during the development process</w:t>
       </w:r>
       <w:r>
-        <w:t xml:space="preserve">. It also helps to </w:t>
+        <w:t xml:space="preserve">. </w:t>
+      </w:r>
+      <w:r>
+        <w:t xml:space="preserve">Chacon and Straub, </w:t>
+      </w:r>
+      <w:r>
+        <w:t>(</w:t>
+      </w:r>
+      <w:r>
+        <w:t>2014)</w:t>
+      </w:r>
+      <w:r>
+        <w:t xml:space="preserve"> examined how </w:t>
+      </w:r>
+      <w:r>
+        <w:t xml:space="preserve">it </w:t>
+      </w:r>
+      <w:r>
+        <w:t xml:space="preserve">also helps to </w:t>
       </w:r>
       <w:r>
         <w:t xml:space="preserve">revert earlier commits if anything goes wrong, record when changes </w:t>
@@ -10033,15 +10061,7 @@
         <w:t>’s post processing component</w:t>
       </w:r>
       <w:r>
-        <w:t xml:space="preserve">. These effects were </w:t>
-      </w:r>
-      <w:proofErr w:type="gramStart"/>
-      <w:r>
-        <w:t>vignette</w:t>
-      </w:r>
-      <w:proofErr w:type="gramEnd"/>
-      <w:r>
-        <w:t xml:space="preserve"> to simulate eye fatigue, bloom for light sensitivity and blur for focus strain. Vignette and bloom post processing effects were triggered through adjusting their post processing variables within the camera post processing component. However, for blur a post processing material was required to create the radial blur. When objectives progressed triggering the simulation of symptoms, a timeline was used to progressively increase the value of an effect gradually over a duration. This decision was made to accommodate eyes adjusting to the changes of the camera as these effects were being triggered.</w:t>
+        <w:t>. These effects were vignette to simulate eye fatigue, bloom for light sensitivity and blur for focus strain. Vignette and bloom post processing effects were triggered through adjusting their post processing variables within the camera post processing component. However, for blur a post processing material was required to create the radial blur. When objectives progressed triggering the simulation of symptoms, a timeline was used to progressively increase the value of an effect gradually over a duration. This decision was made to accommodate eyes adjusting to the changes of the camera as these effects were being triggered.</w:t>
       </w:r>
       <w:r>
         <w:t xml:space="preserve"> The timeline was then used in reverse to revert the symptoms returning the camera view back to the original state it was in.</w:t>
@@ -11280,6 +11300,21 @@
     </w:p>
     <w:p>
       <w:r>
+        <w:t xml:space="preserve">Chacon, S. and Straub, B. (2014) </w:t>
+      </w:r>
+      <w:r>
+        <w:rPr>
+          <w:i/>
+          <w:iCs/>
+        </w:rPr>
+        <w:t>Git - Book</w:t>
+      </w:r>
+      <w:r>
+        <w:t>. Available at: https://git-scm.com/book/en/v2.</w:t>
+      </w:r>
+    </w:p>
+    <w:p>
+      <w:r>
         <w:t xml:space="preserve">Chandrasekhara, R.S., Low, C., Lim, Y., Low, L., Mardina, F. and </w:t>
       </w:r>
       <w:proofErr w:type="spellStart"/>
@@ -11288,15 +11323,7 @@
       </w:r>
       <w:proofErr w:type="spellEnd"/>
       <w:r>
-        <w:t xml:space="preserve">, M. (2013) ‘Computer vision syndrome: a study of knowledge and practices in university </w:t>
-      </w:r>
-      <w:proofErr w:type="gramStart"/>
-      <w:r>
-        <w:t>students’</w:t>
-      </w:r>
-      <w:proofErr w:type="gramEnd"/>
-      <w:r>
-        <w:t xml:space="preserve">. </w:t>
+        <w:t xml:space="preserve">, M. (2013) ‘Computer vision syndrome: a study of knowledge and practices in university students’. </w:t>
       </w:r>
       <w:r>
         <w:rPr>
@@ -11322,6 +11349,21 @@
     </w:p>
     <w:p>
       <w:r>
+        <w:t xml:space="preserve">GitHub (2024) </w:t>
+      </w:r>
+      <w:r>
+        <w:rPr>
+          <w:i/>
+          <w:iCs/>
+        </w:rPr>
+        <w:t>About GitHub and Git</w:t>
+      </w:r>
+      <w:r>
+        <w:t>. Available at: https://docs.github.com/en/get-started/start-your-journey/about-github-and-git.</w:t>
+      </w:r>
+    </w:p>
+    <w:p>
+      <w:r>
         <w:t xml:space="preserve">Muñoz, E.G., </w:t>
       </w:r>
       <w:proofErr w:type="spellStart"/>
@@ -11382,15 +11424,7 @@
       </w:r>
       <w:proofErr w:type="spellEnd"/>
       <w:r>
-        <w:t xml:space="preserve">, E., Pons, A. and Lorente, A. (2016) ‘Visual and ocular effects from the use of flat-panel </w:t>
-      </w:r>
-      <w:proofErr w:type="gramStart"/>
-      <w:r>
-        <w:t>displays’</w:t>
-      </w:r>
-      <w:proofErr w:type="gramEnd"/>
-      <w:r>
-        <w:t xml:space="preserve">. </w:t>
+        <w:t xml:space="preserve">, E., Pons, A. and Lorente, A. (2016) ‘Visual and ocular effects from the use of flat-panel displays’. </w:t>
       </w:r>
       <w:r>
         <w:rPr>
@@ -11413,15 +11447,7 @@
       </w:r>
       <w:proofErr w:type="spellEnd"/>
       <w:r>
-        <w:t xml:space="preserve"> (2025) ‘Virtual vs. traditional learning in higher education: A systematic review of comparative </w:t>
-      </w:r>
-      <w:proofErr w:type="gramStart"/>
-      <w:r>
-        <w:t>studies’</w:t>
-      </w:r>
-      <w:proofErr w:type="gramEnd"/>
-      <w:r>
-        <w:t xml:space="preserve">. </w:t>
+        <w:t xml:space="preserve"> (2025) ‘Virtual vs. traditional learning in higher education: A systematic review of comparative studies’. </w:t>
       </w:r>
       <w:r>
         <w:rPr>
@@ -11500,6 +11526,7 @@
     </w:p>
     <w:p>
       <w:r>
+        <w:lastRenderedPageBreak/>
         <w:t>Youcef, B., Ahmad, M.N. and Mustapha, M. (2021) ‘</w:t>
       </w:r>
       <w:proofErr w:type="spellStart"/>
@@ -11536,7 +11563,6 @@
       </w:pPr>
       <w:bookmarkStart w:id="52" w:name="_Toc223987321"/>
       <w:r>
-        <w:lastRenderedPageBreak/>
         <w:t>Appendix</w:t>
       </w:r>
       <w:bookmarkEnd w:id="52"/>
@@ -11725,6 +11751,7 @@
       </w:pPr>
       <w:bookmarkStart w:id="56" w:name="_Toc223987325"/>
       <w:r>
+        <w:lastRenderedPageBreak/>
         <w:t>General Desktop Bundle</w:t>
       </w:r>
       <w:bookmarkEnd w:id="56"/>
@@ -11809,7 +11836,6 @@
       </w:pPr>
       <w:bookmarkStart w:id="57" w:name="_Toc223987326"/>
       <w:r>
-        <w:lastRenderedPageBreak/>
         <w:t>General Gaming Headset</w:t>
       </w:r>
       <w:bookmarkEnd w:id="57"/>
@@ -11978,6 +12004,7 @@
       </w:pPr>
       <w:bookmarkStart w:id="59" w:name="_Toc223987328"/>
       <w:r>
+        <w:lastRenderedPageBreak/>
         <w:t>Light Switch</w:t>
       </w:r>
       <w:bookmarkEnd w:id="59"/>
@@ -12076,7 +12103,6 @@
       </w:pPr>
       <w:bookmarkStart w:id="60" w:name="_Toc223987329"/>
       <w:r>
-        <w:lastRenderedPageBreak/>
         <w:t>Materials for General PC setup</w:t>
       </w:r>
       <w:r>
@@ -12163,6 +12189,7 @@
         <w:rPr>
           <w:noProof/>
         </w:rPr>
+        <w:lastRenderedPageBreak/>
         <w:drawing>
           <wp:inline distT="0" distB="0" distL="0" distR="0" wp14:anchorId="3BB7987B" wp14:editId="0D618C24">
             <wp:extent cx="4152900" cy="5861733"/>
@@ -12206,21 +12233,21 @@
       </w:pPr>
       <w:bookmarkStart w:id="61" w:name="_Toc223987330"/>
       <w:r>
+        <w:t>Monitor background image</w:t>
+      </w:r>
+      <w:bookmarkEnd w:id="61"/>
+    </w:p>
+    <w:p>
+      <w:r>
+        <w:t>Created by Paul Earle</w:t>
+      </w:r>
+    </w:p>
+    <w:p>
+      <w:r>
+        <w:rPr>
+          <w:noProof/>
+        </w:rPr>
         <w:lastRenderedPageBreak/>
-        <w:t>Monitor background image</w:t>
-      </w:r>
-      <w:bookmarkEnd w:id="61"/>
-    </w:p>
-    <w:p>
-      <w:r>
-        <w:t>Created by Paul Earle</w:t>
-      </w:r>
-    </w:p>
-    <w:p>
-      <w:r>
-        <w:rPr>
-          <w:noProof/>
-        </w:rPr>
         <w:drawing>
           <wp:inline distT="0" distB="0" distL="0" distR="0" wp14:anchorId="7249F24E" wp14:editId="19E18124">
             <wp:extent cx="5400675" cy="4993799"/>
@@ -12302,7 +12329,6 @@
       </w:pPr>
       <w:bookmarkStart w:id="62" w:name="_Toc223987331"/>
       <w:r>
-        <w:lastRenderedPageBreak/>
         <w:t xml:space="preserve">Button Hover </w:t>
       </w:r>
       <w:proofErr w:type="spellStart"/>
@@ -12381,6 +12407,7 @@
     </w:p>
     <w:p>
       <w:r>
+        <w:lastRenderedPageBreak/>
         <w:t>Source:</w:t>
       </w:r>
       <w:r>
@@ -12551,15 +12578,7 @@
       <w:bookmarkStart w:id="64" w:name="_Toc223987333"/>
       <w:r>
         <w:lastRenderedPageBreak/>
-        <w:t xml:space="preserve">Light Switch </w:t>
-      </w:r>
-      <w:proofErr w:type="gramStart"/>
-      <w:r>
-        <w:t>On</w:t>
-      </w:r>
-      <w:proofErr w:type="gramEnd"/>
-      <w:r>
-        <w:t xml:space="preserve"> </w:t>
+        <w:t xml:space="preserve">Light Switch On </w:t>
       </w:r>
       <w:proofErr w:type="spellStart"/>
       <w:r>
@@ -14731,7 +14750,6 @@
   <w:style w:type="character" w:default="1" w:styleId="DefaultParagraphFont">
     <w:name w:val="Default Paragraph Font"/>
     <w:uiPriority w:val="1"/>
-    <w:semiHidden/>
     <w:unhideWhenUsed/>
   </w:style>
   <w:style w:type="table" w:default="1" w:styleId="TableNormal">

</xml_diff>

<commit_message>
Added 3 references in
</commit_message>
<xml_diff>
--- a/30077548Thesis.docx
+++ b/30077548Thesis.docx
@@ -9502,10 +9502,7 @@
         <w:t>2014)</w:t>
       </w:r>
       <w:r>
-        <w:t xml:space="preserve"> examined how </w:t>
-      </w:r>
-      <w:r>
-        <w:t xml:space="preserve">it </w:t>
+        <w:t xml:space="preserve"> examined how it </w:t>
       </w:r>
       <w:r>
         <w:t xml:space="preserve">also helps to </w:t>
@@ -9578,13 +9575,42 @@
         <w:t>.</w:t>
       </w:r>
       <w:r>
-        <w:t xml:space="preserve"> As the project aims to raise awareness of DES within a VR interactive environment, ensuring the experience was </w:t>
+        <w:t xml:space="preserve"> </w:t>
+      </w:r>
+      <w:r>
+        <w:t xml:space="preserve">Göransson, </w:t>
+      </w:r>
+      <w:r>
+        <w:t>(</w:t>
+      </w:r>
+      <w:r>
+        <w:t>2022)</w:t>
+      </w:r>
+      <w:r>
+        <w:t xml:space="preserve"> established that</w:t>
+      </w:r>
+      <w:r>
+        <w:t xml:space="preserve"> when</w:t>
+      </w:r>
+      <w:r>
+        <w:t xml:space="preserve"> designing a usable interactive experience, the system needs a focus on the goals, needs and context of users</w:t>
+      </w:r>
+      <w:r>
+        <w:t xml:space="preserve">. </w:t>
+      </w:r>
+      <w:r>
+        <w:t xml:space="preserve">As the project aims to raise awareness of DES within a VR interactive environment, ensuring the experience was </w:t>
       </w:r>
       <w:r>
         <w:t>accommodating</w:t>
       </w:r>
       <w:r>
-        <w:t xml:space="preserve"> was crucial so users could quickly understand how to progress through the experience. In addition to this, the experience was structured using objective based progression </w:t>
+        <w:t xml:space="preserve"> was crucial so users could quickly understand how to progress through the experience. </w:t>
+      </w:r>
+    </w:p>
+    <w:p>
+      <w:r>
+        <w:t xml:space="preserve">In addition to this, the experience was structured using objective based progression </w:t>
       </w:r>
       <w:r>
         <w:t>where</w:t>
@@ -9598,8 +9624,38 @@
       <w:r>
         <w:t xml:space="preserve"> </w:t>
       </w:r>
-    </w:p>
-    <w:p>
+      <w:proofErr w:type="spellStart"/>
+      <w:r>
+        <w:t>Looyestyn</w:t>
+      </w:r>
+      <w:proofErr w:type="spellEnd"/>
+      <w:r>
+        <w:t xml:space="preserve"> et al., </w:t>
+      </w:r>
+      <w:r>
+        <w:t>(</w:t>
+      </w:r>
+      <w:r>
+        <w:t>2017)</w:t>
+      </w:r>
+      <w:r>
+        <w:t xml:space="preserve"> analysed how using gamification to set clear goals, progression indicators and feedback </w:t>
+      </w:r>
+      <w:r>
+        <w:t>can</w:t>
+      </w:r>
+      <w:r>
+        <w:t xml:space="preserve"> increase</w:t>
+      </w:r>
+      <w:r>
+        <w:t xml:space="preserve"> </w:t>
+      </w:r>
+      <w:r>
+        <w:t>user engagement within interactive systems.</w:t>
+      </w:r>
+      <w:r>
+        <w:t xml:space="preserve"> </w:t>
+      </w:r>
       <w:r>
         <w:t>The objectives were divided into</w:t>
       </w:r>
@@ -9661,432 +9717,504 @@
         <w:t xml:space="preserve"> </w:t>
       </w:r>
       <w:r>
-        <w:t xml:space="preserve">was created to replicate an office or home desk style environment. The scene consisted of a desk PC </w:t>
+        <w:t>was created to replicate an office or home desk style environment.</w:t>
+      </w:r>
+      <w:r>
+        <w:t xml:space="preserve"> </w:t>
+      </w:r>
+      <w:r>
+        <w:t xml:space="preserve">The scene </w:t>
+      </w:r>
+      <w:r>
+        <w:t>was</w:t>
+      </w:r>
+      <w:r>
+        <w:t xml:space="preserve"> </w:t>
+      </w:r>
+      <w:r>
+        <w:t xml:space="preserve">set within a confined </w:t>
+      </w:r>
+      <w:r>
+        <w:t>room, with a desk</w:t>
+      </w:r>
+      <w:r>
+        <w:t xml:space="preserve"> made up</w:t>
+      </w:r>
+      <w:r>
+        <w:t xml:space="preserve"> of a PC </w:t>
       </w:r>
       <w:r>
         <w:t xml:space="preserve">(personal computer) </w:t>
       </w:r>
       <w:r>
+        <w:t xml:space="preserve">desk </w:t>
+      </w:r>
+      <w:r>
         <w:t>setup</w:t>
       </w:r>
       <w:r>
+        <w:t>.</w:t>
+      </w:r>
+      <w:r>
+        <w:t xml:space="preserve"> </w:t>
+      </w:r>
+      <w:r>
+        <w:t xml:space="preserve">Research conducted by </w:t>
+      </w:r>
+      <w:r>
+        <w:t xml:space="preserve">Newman et al., </w:t>
+      </w:r>
+      <w:r>
+        <w:t>(</w:t>
+      </w:r>
+      <w:r>
+        <w:t>2022)</w:t>
+      </w:r>
+      <w:r>
+        <w:t xml:space="preserve"> showed </w:t>
+      </w:r>
+      <w:r>
+        <w:t xml:space="preserve">that </w:t>
+      </w:r>
+      <w:r>
+        <w:t>higher</w:t>
+      </w:r>
+      <w:r>
+        <w:t xml:space="preserve"> realism in a virtual environment </w:t>
+      </w:r>
+      <w:r>
+        <w:t>contribut</w:t>
+      </w:r>
+      <w:r>
+        <w:t>es</w:t>
+      </w:r>
+      <w:r>
+        <w:t xml:space="preserve"> to </w:t>
+      </w:r>
+      <w:r>
+        <w:t xml:space="preserve">user </w:t>
+      </w:r>
+      <w:r>
+        <w:t>engagement and immersion within VR experiences.</w:t>
+      </w:r>
+      <w:r>
+        <w:t xml:space="preserve"> </w:t>
+      </w:r>
+      <w:r>
+        <w:t>T</w:t>
+      </w:r>
+      <w:r>
+        <w:t xml:space="preserve">he camera position </w:t>
+      </w:r>
+      <w:r>
+        <w:t>was</w:t>
+      </w:r>
+      <w:r>
+        <w:t xml:space="preserve"> inside of the desk chair</w:t>
+      </w:r>
+      <w:r>
         <w:t>,</w:t>
       </w:r>
       <w:r>
-        <w:t xml:space="preserve"> with the camera position being inside of the desk chair. </w:t>
-      </w:r>
-      <w:r>
-        <w:t xml:space="preserve">Furthermore, the </w:t>
-      </w:r>
-      <w:r>
-        <w:t>workspace was set within a</w:t>
-      </w:r>
-      <w:r>
-        <w:t xml:space="preserve"> confined room</w:t>
+        <w:t xml:space="preserve"> with</w:t>
+      </w:r>
+      <w:r>
+        <w:t xml:space="preserve"> </w:t>
+      </w:r>
+      <w:r>
+        <w:t xml:space="preserve">the monitor being </w:t>
+      </w:r>
+      <w:r>
+        <w:t xml:space="preserve">at </w:t>
+      </w:r>
+      <w:r>
+        <w:t>an appropriate distance from the camera view</w:t>
+      </w:r>
+      <w:r>
+        <w:t xml:space="preserve"> </w:t>
+      </w:r>
+      <w:r>
+        <w:t>and</w:t>
+      </w:r>
+      <w:r>
+        <w:t xml:space="preserve"> the rest of the room being relatively empty</w:t>
+      </w:r>
+      <w:r>
+        <w:t xml:space="preserve">. </w:t>
+      </w:r>
+      <w:r>
+        <w:t>By keeping t</w:t>
+      </w:r>
+      <w:r>
+        <w:t xml:space="preserve">he environment simple </w:t>
+      </w:r>
+      <w:r>
+        <w:t>it</w:t>
+      </w:r>
+      <w:r>
+        <w:t xml:space="preserve"> </w:t>
+      </w:r>
+      <w:r>
+        <w:t>reinforce</w:t>
+      </w:r>
+      <w:r>
+        <w:t>d</w:t>
+      </w:r>
+      <w:r>
+        <w:t xml:space="preserve"> the user</w:t>
+      </w:r>
+      <w:r>
+        <w:t>’</w:t>
+      </w:r>
+      <w:r>
+        <w:t xml:space="preserve">s focus on the symptoms of DES within the objectives </w:t>
+      </w:r>
+      <w:r>
+        <w:t>without</w:t>
+      </w:r>
+      <w:r>
+        <w:t xml:space="preserve"> be</w:t>
+      </w:r>
+      <w:r>
+        <w:t>ing</w:t>
+      </w:r>
+      <w:r>
+        <w:t xml:space="preserve"> distracted by other objects</w:t>
+      </w:r>
+      <w:r>
+        <w:t xml:space="preserve"> in the room</w:t>
+      </w:r>
+      <w:r>
+        <w:t xml:space="preserve"> when trying to relieve each symptom.</w:t>
+      </w:r>
+    </w:p>
+    <w:p>
+      <w:pPr>
+        <w:pStyle w:val="Heading3"/>
+      </w:pPr>
+      <w:bookmarkStart w:id="27" w:name="_Toc223987296"/>
+      <w:r>
+        <w:t>Objective System Implementation</w:t>
+      </w:r>
+      <w:bookmarkEnd w:id="27"/>
+    </w:p>
+    <w:p>
+      <w:r>
+        <w:t>The</w:t>
+      </w:r>
+      <w:r>
+        <w:t xml:space="preserve"> objective system </w:t>
+      </w:r>
+      <w:r>
+        <w:t xml:space="preserve">was implemented </w:t>
+      </w:r>
+      <w:r>
+        <w:t xml:space="preserve">so that users could be </w:t>
+      </w:r>
+      <w:r>
+        <w:t xml:space="preserve">guided </w:t>
+      </w:r>
+      <w:r>
+        <w:t xml:space="preserve">while </w:t>
+      </w:r>
+      <w:r>
+        <w:t xml:space="preserve">receiving </w:t>
+      </w:r>
+      <w:r>
+        <w:t xml:space="preserve">the information being taught. The objective data </w:t>
+      </w:r>
+      <w:r>
+        <w:t xml:space="preserve">containing titles, IDs and descriptions </w:t>
+      </w:r>
+      <w:r>
+        <w:t>w</w:t>
+      </w:r>
+      <w:r>
+        <w:t>ere</w:t>
+      </w:r>
+      <w:r>
+        <w:t xml:space="preserve"> stored within the </w:t>
+      </w:r>
+      <w:proofErr w:type="spellStart"/>
+      <w:r>
+        <w:t>VRGameMode</w:t>
+      </w:r>
+      <w:proofErr w:type="spellEnd"/>
+      <w:r>
+        <w:t xml:space="preserve"> blueprint, with objectives being updated during runtime as conditions </w:t>
+      </w:r>
+      <w:r>
+        <w:lastRenderedPageBreak/>
+        <w:t xml:space="preserve">were satisfied </w:t>
+      </w:r>
+      <w:r>
+        <w:t>during</w:t>
+      </w:r>
+      <w:r>
+        <w:t xml:space="preserve"> progression. </w:t>
+      </w:r>
+      <w:r>
+        <w:t>P</w:t>
+      </w:r>
+      <w:r>
+        <w:t xml:space="preserve">rogression was </w:t>
+      </w:r>
+      <w:r>
+        <w:t>recorded</w:t>
+      </w:r>
+      <w:r>
+        <w:t xml:space="preserve"> through user gaze tracking and interactions with </w:t>
+      </w:r>
+      <w:r>
+        <w:t>interactive</w:t>
+      </w:r>
+      <w:r>
+        <w:t xml:space="preserve"> objects within the scene, the object to gaze at or interact with varied depending on what the current objective was. When a condition was satisfied, event dispatchers were implemented to signal</w:t>
+      </w:r>
+      <w:r>
+        <w:t xml:space="preserve"> system</w:t>
+      </w:r>
+      <w:r>
+        <w:t xml:space="preserve"> changes. These changes consisted of</w:t>
+      </w:r>
+      <w:r>
+        <w:t xml:space="preserve"> objective change</w:t>
+      </w:r>
+      <w:r>
+        <w:t>s</w:t>
+      </w:r>
+      <w:r>
+        <w:t xml:space="preserve">, </w:t>
+      </w:r>
+      <w:r>
+        <w:t>symptoms being triggered</w:t>
+      </w:r>
+      <w:r>
+        <w:t xml:space="preserve"> or relieved, completion of the experience and updat</w:t>
+      </w:r>
+      <w:r>
+        <w:t>ing</w:t>
+      </w:r>
+      <w:r>
+        <w:t xml:space="preserve"> the current objective displayed on the monitor object</w:t>
+      </w:r>
+      <w:r>
+        <w:t xml:space="preserve"> along with the progress bar</w:t>
+      </w:r>
+      <w:r>
+        <w:t>.</w:t>
+      </w:r>
+    </w:p>
+    <w:p>
+      <w:pPr>
+        <w:pStyle w:val="Heading3"/>
+      </w:pPr>
+      <w:bookmarkStart w:id="28" w:name="_Toc223987297"/>
+      <w:r>
+        <w:t>User</w:t>
+      </w:r>
+      <w:r>
+        <w:t xml:space="preserve"> Objective </w:t>
+      </w:r>
+      <w:r>
+        <w:t>Feedback</w:t>
+      </w:r>
+      <w:bookmarkEnd w:id="28"/>
+    </w:p>
+    <w:p>
+      <w:r>
+        <w:t>Users</w:t>
+      </w:r>
+      <w:r>
+        <w:t xml:space="preserve"> received objective feedback through the monitor object within the level. UI</w:t>
+      </w:r>
+      <w:r>
+        <w:t xml:space="preserve"> </w:t>
+      </w:r>
+      <w:r>
+        <w:t xml:space="preserve">(User Interface) </w:t>
+      </w:r>
+      <w:r>
+        <w:t xml:space="preserve">within the level </w:t>
+      </w:r>
+      <w:r>
+        <w:t xml:space="preserve">was </w:t>
+      </w:r>
+      <w:r>
+        <w:t>chosen over traditional HUD</w:t>
+      </w:r>
+      <w:r>
+        <w:t>s</w:t>
+      </w:r>
+      <w:r>
+        <w:t xml:space="preserve"> (Heads Up Display</w:t>
+      </w:r>
+      <w:r>
+        <w:t>s</w:t>
+      </w:r>
+      <w:r>
+        <w:t xml:space="preserve">) seen within video games so that the experience would be more immersive with users needing to interact and search the environment around them. The UI is implemented as a world space widget attached to the screen mesh of a monitor that uses a widget blueprint to control the information displayed. </w:t>
+      </w:r>
+    </w:p>
+    <w:p>
+      <w:r>
+        <w:t xml:space="preserve">The widget consists of the current objective description to prompt users along with a progress bar that fills up green as the necessary requirements are being met to complete the objective. </w:t>
+      </w:r>
+      <w:r>
+        <w:t>Event</w:t>
+      </w:r>
+      <w:r>
+        <w:t xml:space="preserve"> dispatchers control updates to the widget updat</w:t>
+      </w:r>
+      <w:r>
+        <w:t>ing it</w:t>
+      </w:r>
+      <w:r>
+        <w:t xml:space="preserve"> in real time</w:t>
+      </w:r>
+      <w:r>
+        <w:t>. W</w:t>
+      </w:r>
+      <w:r>
+        <w:t>hen an objective is complete</w:t>
       </w:r>
       <w:r>
         <w:t>,</w:t>
       </w:r>
       <w:r>
-        <w:t xml:space="preserve"> with</w:t>
-      </w:r>
-      <w:r>
-        <w:t xml:space="preserve"> </w:t>
-      </w:r>
-      <w:r>
-        <w:t xml:space="preserve">the monitor being </w:t>
-      </w:r>
-      <w:r>
-        <w:t xml:space="preserve">at </w:t>
-      </w:r>
-      <w:r>
-        <w:t>an appropriate distance from the camera view</w:t>
-      </w:r>
-      <w:r>
-        <w:t xml:space="preserve"> </w:t>
-      </w:r>
-      <w:r>
-        <w:t>and</w:t>
-      </w:r>
-      <w:r>
-        <w:t xml:space="preserve"> the rest of the room being relatively empty</w:t>
-      </w:r>
-      <w:r>
-        <w:t xml:space="preserve">. </w:t>
-      </w:r>
-      <w:r>
-        <w:t>By keeping t</w:t>
-      </w:r>
-      <w:r>
-        <w:t xml:space="preserve">he environment simple </w:t>
-      </w:r>
-      <w:r>
-        <w:t>it</w:t>
-      </w:r>
-      <w:r>
-        <w:t xml:space="preserve"> </w:t>
-      </w:r>
-      <w:r>
-        <w:t>reinforce</w:t>
-      </w:r>
-      <w:r>
-        <w:t>d</w:t>
-      </w:r>
-      <w:r>
-        <w:t xml:space="preserve"> the user</w:t>
-      </w:r>
-      <w:r>
-        <w:t>’</w:t>
-      </w:r>
-      <w:r>
-        <w:t xml:space="preserve">s focus on the symptoms of DES within the objectives </w:t>
-      </w:r>
-      <w:r>
-        <w:t>without</w:t>
-      </w:r>
-      <w:r>
-        <w:t xml:space="preserve"> be</w:t>
-      </w:r>
-      <w:r>
-        <w:t>ing</w:t>
-      </w:r>
-      <w:r>
-        <w:t xml:space="preserve"> distracted by other objects</w:t>
-      </w:r>
-      <w:r>
-        <w:t xml:space="preserve"> in the room</w:t>
-      </w:r>
-      <w:r>
-        <w:t xml:space="preserve"> when trying to relieve each symptom.</w:t>
+        <w:t xml:space="preserve"> the progress bar resets with the objective description changing to the next. </w:t>
+      </w:r>
+      <w:r>
+        <w:t>Furthermore, when</w:t>
+      </w:r>
+      <w:r>
+        <w:t xml:space="preserve"> the experience is </w:t>
+      </w:r>
+      <w:r>
+        <w:t>completed,</w:t>
+      </w:r>
+      <w:r>
+        <w:t xml:space="preserve"> users are informed using a message that they have completed all the objectives before exiting back to the </w:t>
+      </w:r>
+      <w:r>
+        <w:t xml:space="preserve">start screen </w:t>
+      </w:r>
+      <w:r>
+        <w:t>menu.</w:t>
       </w:r>
     </w:p>
     <w:p>
       <w:pPr>
         <w:pStyle w:val="Heading3"/>
       </w:pPr>
-      <w:bookmarkStart w:id="27" w:name="_Toc223987296"/>
-      <w:r>
-        <w:t>Objective System Implementation</w:t>
-      </w:r>
-      <w:bookmarkEnd w:id="27"/>
-    </w:p>
-    <w:p>
-      <w:r>
-        <w:t>The</w:t>
-      </w:r>
-      <w:r>
-        <w:t xml:space="preserve"> objective system </w:t>
-      </w:r>
-      <w:r>
-        <w:t xml:space="preserve">was implemented </w:t>
-      </w:r>
-      <w:r>
-        <w:t xml:space="preserve">so that users could be </w:t>
-      </w:r>
-      <w:r>
-        <w:t xml:space="preserve">guided </w:t>
-      </w:r>
-      <w:r>
-        <w:t xml:space="preserve">while </w:t>
-      </w:r>
-      <w:r>
-        <w:t xml:space="preserve">receiving </w:t>
-      </w:r>
-      <w:r>
-        <w:t xml:space="preserve">the information being taught. The objective data </w:t>
-      </w:r>
-      <w:r>
-        <w:t xml:space="preserve">containing titles, IDs and descriptions </w:t>
-      </w:r>
-      <w:r>
-        <w:t>w</w:t>
-      </w:r>
-      <w:r>
-        <w:t>ere</w:t>
-      </w:r>
-      <w:r>
-        <w:t xml:space="preserve"> stored within the </w:t>
-      </w:r>
-      <w:proofErr w:type="spellStart"/>
-      <w:r>
-        <w:t>VRGameMode</w:t>
-      </w:r>
-      <w:proofErr w:type="spellEnd"/>
-      <w:r>
-        <w:t xml:space="preserve"> blueprint, with objectives being updated during runtime as conditions were satisfied </w:t>
-      </w:r>
-      <w:r>
-        <w:t>during</w:t>
-      </w:r>
-      <w:r>
-        <w:t xml:space="preserve"> progression. </w:t>
-      </w:r>
-      <w:r>
-        <w:t>P</w:t>
-      </w:r>
-      <w:r>
-        <w:t xml:space="preserve">rogression was </w:t>
-      </w:r>
-      <w:r>
-        <w:t>recorded</w:t>
-      </w:r>
-      <w:r>
-        <w:t xml:space="preserve"> through user gaze tracking and interactions with </w:t>
-      </w:r>
-      <w:r>
-        <w:t>interactive</w:t>
-      </w:r>
-      <w:r>
-        <w:t xml:space="preserve"> objects within the scene, the object to gaze at or interact with varied depending on what the current objective was. When a condition was satisfied, event dispatchers were implemented to signal</w:t>
-      </w:r>
-      <w:r>
-        <w:t xml:space="preserve"> system</w:t>
-      </w:r>
-      <w:r>
-        <w:t xml:space="preserve"> changes. These changes consisted of</w:t>
-      </w:r>
-      <w:r>
-        <w:t xml:space="preserve"> objective change</w:t>
+      <w:bookmarkStart w:id="29" w:name="_Toc223987298"/>
+      <w:r>
+        <w:t>Objective Based Interact</w:t>
+      </w:r>
+      <w:r>
+        <w:t>ive</w:t>
+      </w:r>
+      <w:r>
+        <w:t xml:space="preserve"> Object</w:t>
       </w:r>
       <w:r>
         <w:t>s</w:t>
       </w:r>
-      <w:r>
-        <w:t xml:space="preserve">, </w:t>
-      </w:r>
-      <w:r>
-        <w:t>symptoms being triggered</w:t>
-      </w:r>
-      <w:r>
-        <w:t xml:space="preserve"> or relieved, completion of the experience and updat</w:t>
-      </w:r>
-      <w:r>
-        <w:t>ing</w:t>
-      </w:r>
-      <w:r>
-        <w:t xml:space="preserve"> the current objective displayed on the monitor object</w:t>
-      </w:r>
-      <w:r>
-        <w:t xml:space="preserve"> along with the progress bar</w:t>
-      </w:r>
-      <w:r>
-        <w:t>.</w:t>
+      <w:bookmarkEnd w:id="29"/>
+    </w:p>
+    <w:p>
+      <w:r>
+        <w:t xml:space="preserve">To enhance the </w:t>
+      </w:r>
+      <w:r>
+        <w:t>experience</w:t>
+      </w:r>
+      <w:r>
+        <w:t xml:space="preserve"> of the application, getting the user to interact with objects within the scene was important</w:t>
+      </w:r>
+      <w:r>
+        <w:t xml:space="preserve"> to increase immersion</w:t>
+      </w:r>
+      <w:r>
+        <w:t xml:space="preserve">. These interactions included staring at the screen for a certain duration, looking at an object far away or on the desk and turning a light switch on and off. By doing this, the user would replicate actual actions that cause symptoms of DES and preventative measures reinforcing the learning being undertaken. </w:t>
+      </w:r>
+    </w:p>
+    <w:p>
+      <w:r>
+        <w:t>A</w:t>
+      </w:r>
+      <w:r>
+        <w:t xml:space="preserve"> line trace channel </w:t>
+      </w:r>
+      <w:r>
+        <w:t xml:space="preserve">was used </w:t>
+      </w:r>
+      <w:r>
+        <w:t xml:space="preserve">to </w:t>
+      </w:r>
+      <w:r>
+        <w:t>detect collision events with interactable objects.</w:t>
+      </w:r>
+      <w:r>
+        <w:t xml:space="preserve"> Whenever a hit was received, depending on which objective was the</w:t>
+      </w:r>
+      <w:r>
+        <w:t xml:space="preserve"> </w:t>
+      </w:r>
+      <w:r>
+        <w:t>current one it would update according to if the object being looked at was the right one to progress that specific objective. Users were notified by the UI on the monitor to which object needed to be looked at or interacted with. For the light switch, interaction using the grab trigger was needed to simulate the light switching on and off. Once the specific condition was met</w:t>
+      </w:r>
+      <w:r>
+        <w:t>,</w:t>
+      </w:r>
+      <w:r>
+        <w:t xml:space="preserve"> event dispatchers were fired from those objects to notify of objective updates.</w:t>
       </w:r>
     </w:p>
     <w:p>
       <w:pPr>
         <w:pStyle w:val="Heading3"/>
       </w:pPr>
-      <w:bookmarkStart w:id="28" w:name="_Toc223987297"/>
+      <w:bookmarkStart w:id="30" w:name="_Toc223987299"/>
+      <w:r>
+        <w:t>Post Processing Effects</w:t>
+      </w:r>
+      <w:r>
+        <w:t xml:space="preserve"> for Simulating Symptoms</w:t>
+      </w:r>
+      <w:bookmarkEnd w:id="30"/>
+    </w:p>
+    <w:p>
+      <w:r>
+        <w:t>Simulating the symptoms of DES required enabling specific post processing effects within the camera</w:t>
+      </w:r>
+      <w:r>
+        <w:t>’s post processing component</w:t>
+      </w:r>
+      <w:r>
+        <w:t>. These effects were vignette to simulate eye fatigue, bloom for light sensitivity and blur for focus strain. Vignette and bloom post processing effects were triggered through adjusting their post processing variables within the camera post processing component. However, for blur a post processing material was required to create the radial blur. When objectives progressed triggering the simulation of symptoms, a timeline was used to progressively increase the value of an effect gradually over a duration. This decision was made to accommodate eyes adjusting to the changes of the camera as these effects were being triggered.</w:t>
+      </w:r>
+      <w:r>
+        <w:t xml:space="preserve"> The timeline was then used in reverse to revert the symptoms returning the camera view back to the original state it was in.</w:t>
+      </w:r>
+    </w:p>
+    <w:p>
+      <w:pPr>
+        <w:pStyle w:val="Heading3"/>
+      </w:pPr>
+      <w:bookmarkStart w:id="31" w:name="_Toc223987300"/>
       <w:r>
         <w:lastRenderedPageBreak/>
         <w:t>User</w:t>
       </w:r>
       <w:r>
-        <w:t xml:space="preserve"> Objective </w:t>
-      </w:r>
-      <w:r>
-        <w:t>Feedback</w:t>
-      </w:r>
-      <w:bookmarkEnd w:id="28"/>
-    </w:p>
-    <w:p>
-      <w:r>
-        <w:t>Users</w:t>
-      </w:r>
-      <w:r>
-        <w:t xml:space="preserve"> received objective feedback through the monitor object within the level. UI</w:t>
-      </w:r>
-      <w:r>
-        <w:t xml:space="preserve"> </w:t>
-      </w:r>
-      <w:r>
-        <w:t xml:space="preserve">(User Interface) </w:t>
-      </w:r>
-      <w:r>
-        <w:t xml:space="preserve">within the level </w:t>
-      </w:r>
-      <w:r>
-        <w:t xml:space="preserve">was </w:t>
-      </w:r>
-      <w:r>
-        <w:t>chosen over traditional HUD</w:t>
-      </w:r>
-      <w:r>
-        <w:t>s</w:t>
-      </w:r>
-      <w:r>
-        <w:t xml:space="preserve"> (Heads Up Display</w:t>
-      </w:r>
-      <w:r>
-        <w:t>s</w:t>
-      </w:r>
-      <w:r>
-        <w:t xml:space="preserve">) seen within video games so that the experience would be more immersive with users needing to interact and search the environment around them. The UI is implemented as a world space widget attached to the screen mesh of a monitor that uses a widget blueprint to control the information displayed. </w:t>
-      </w:r>
-    </w:p>
-    <w:p>
-      <w:r>
-        <w:t xml:space="preserve">The widget consists of the current objective description to prompt users along with a progress bar that fills up green as the necessary requirements are being met to complete the objective. </w:t>
-      </w:r>
-      <w:r>
-        <w:t>Event</w:t>
-      </w:r>
-      <w:r>
-        <w:t xml:space="preserve"> dispatchers control updates to the widget updat</w:t>
-      </w:r>
-      <w:r>
-        <w:t>ing it</w:t>
-      </w:r>
-      <w:r>
-        <w:t xml:space="preserve"> in real time</w:t>
-      </w:r>
-      <w:r>
-        <w:t>. W</w:t>
-      </w:r>
-      <w:r>
-        <w:t>hen an objective is complete</w:t>
-      </w:r>
-      <w:r>
-        <w:t>,</w:t>
-      </w:r>
-      <w:r>
-        <w:t xml:space="preserve"> the progress bar resets with the objective description changing to the next. </w:t>
-      </w:r>
-      <w:r>
-        <w:t>Furthermore, when</w:t>
-      </w:r>
-      <w:r>
-        <w:t xml:space="preserve"> the experience is </w:t>
-      </w:r>
-      <w:r>
-        <w:t>completed,</w:t>
-      </w:r>
-      <w:r>
-        <w:t xml:space="preserve"> users are informed using a message that they have completed all the objectives before exiting back to the </w:t>
-      </w:r>
-      <w:r>
-        <w:t xml:space="preserve">start screen </w:t>
-      </w:r>
-      <w:r>
-        <w:t>menu.</w:t>
-      </w:r>
-    </w:p>
-    <w:p>
-      <w:pPr>
-        <w:pStyle w:val="Heading3"/>
-      </w:pPr>
-      <w:bookmarkStart w:id="29" w:name="_Toc223987298"/>
-      <w:r>
-        <w:t>Objective Based Interact</w:t>
-      </w:r>
-      <w:r>
-        <w:t>ive</w:t>
-      </w:r>
-      <w:r>
-        <w:t xml:space="preserve"> Object</w:t>
-      </w:r>
-      <w:r>
-        <w:t>s</w:t>
-      </w:r>
-      <w:bookmarkEnd w:id="29"/>
-    </w:p>
-    <w:p>
-      <w:r>
-        <w:t xml:space="preserve">To enhance the </w:t>
-      </w:r>
-      <w:r>
-        <w:t>experience</w:t>
-      </w:r>
-      <w:r>
-        <w:t xml:space="preserve"> of the application, getting the user to interact with objects within the scene was important</w:t>
-      </w:r>
-      <w:r>
-        <w:t xml:space="preserve"> to increase immersion</w:t>
-      </w:r>
-      <w:r>
-        <w:t xml:space="preserve">. These interactions included staring at the screen for a certain duration, looking at an object far away or on the desk and turning a light switch on and off. By doing this, the user would replicate actual actions that cause symptoms of DES and preventative measures reinforcing the learning being undertaken. </w:t>
-      </w:r>
-    </w:p>
-    <w:p>
-      <w:r>
-        <w:t>A</w:t>
-      </w:r>
-      <w:r>
-        <w:t xml:space="preserve"> line trace channel </w:t>
-      </w:r>
-      <w:r>
-        <w:t xml:space="preserve">was used </w:t>
-      </w:r>
-      <w:r>
-        <w:t xml:space="preserve">to </w:t>
-      </w:r>
-      <w:r>
-        <w:t>detect collision events with interactable objects.</w:t>
-      </w:r>
-      <w:r>
-        <w:t xml:space="preserve"> Whenever a hit was received, depending on which objective was the</w:t>
-      </w:r>
-      <w:r>
-        <w:t xml:space="preserve"> </w:t>
-      </w:r>
-      <w:r>
-        <w:t>current one it would update according to if the object being looked at was the right one to progress that specific objective. Users were notified by the UI on the monitor to which object needed to be looked at or interacted with. For the light switch, interaction using the grab trigger was needed to simulate the light switching on and off. Once the specific condition was met</w:t>
-      </w:r>
-      <w:r>
-        <w:t>,</w:t>
-      </w:r>
-      <w:r>
-        <w:t xml:space="preserve"> event dispatchers were fired from those objects to notify of objective updates.</w:t>
-      </w:r>
-    </w:p>
-    <w:p>
-      <w:pPr>
-        <w:pStyle w:val="Heading3"/>
-      </w:pPr>
-      <w:bookmarkStart w:id="30" w:name="_Toc223987299"/>
-      <w:r>
-        <w:t>Post Processing Effects</w:t>
-      </w:r>
-      <w:r>
-        <w:t xml:space="preserve"> for Simulating Symptoms</w:t>
-      </w:r>
-      <w:bookmarkEnd w:id="30"/>
-    </w:p>
-    <w:p>
-      <w:r>
-        <w:t>Simulating the symptoms of DES required enabling specific post processing effects within the camera</w:t>
-      </w:r>
-      <w:r>
-        <w:t>’s post processing component</w:t>
-      </w:r>
-      <w:r>
-        <w:t>. These effects were vignette to simulate eye fatigue, bloom for light sensitivity and blur for focus strain. Vignette and bloom post processing effects were triggered through adjusting their post processing variables within the camera post processing component. However, for blur a post processing material was required to create the radial blur. When objectives progressed triggering the simulation of symptoms, a timeline was used to progressively increase the value of an effect gradually over a duration. This decision was made to accommodate eyes adjusting to the changes of the camera as these effects were being triggered.</w:t>
-      </w:r>
-      <w:r>
-        <w:t xml:space="preserve"> The timeline was then used in reverse to revert the symptoms returning the camera view back to the original state it was in.</w:t>
-      </w:r>
-    </w:p>
-    <w:p>
-      <w:pPr>
-        <w:pStyle w:val="Heading3"/>
-      </w:pPr>
-      <w:bookmarkStart w:id="31" w:name="_Toc223987300"/>
-      <w:r>
-        <w:t>User</w:t>
-      </w:r>
-      <w:r>
         <w:t xml:space="preserve"> Look Direction and Attention Detection</w:t>
       </w:r>
       <w:bookmarkEnd w:id="31"/>
     </w:p>
     <w:p>
       <w:r>
-        <w:t xml:space="preserve">Look direction was detected using a line trace that took the camera position as the starting location and a distance value multiplied by the forward vector of the camera. From there, returned hits would be checked for the object needed to progress the objective. When a successful hit was recorded, the time spent staring at the object was recorded and used to update the progress bar on the monitor. Whenever user gaze averted from the required </w:t>
-      </w:r>
-      <w:r>
-        <w:lastRenderedPageBreak/>
-        <w:t>progression object, the progress bar would reset back to zero so that progress wasn’t accumulated over multiple looks but from one continuous stare replicating the causes for symptoms.</w:t>
+        <w:t>Look direction was detected using a line trace that took the camera position as the starting location and a distance value multiplied by the forward vector of the camera. From there, returned hits would be checked for the object needed to progress the objective. When a successful hit was recorded, the time spent staring at the object was recorded and used to update the progress bar on the monitor. Whenever user gaze averted from the required progression object, the progress bar would reset back to zero so that progress wasn’t accumulated over multiple looks but from one continuous stare replicating the causes for symptoms.</w:t>
       </w:r>
     </w:p>
     <w:p>
@@ -11359,26 +11487,122 @@
         <w:t>About GitHub and Git</w:t>
       </w:r>
       <w:r>
-        <w:t>. Available at: https://docs.github.com/en/get-started/start-your-journey/about-github-and-git.</w:t>
-      </w:r>
-    </w:p>
-    <w:p>
-      <w:r>
-        <w:t xml:space="preserve">Muñoz, E.G., </w:t>
-      </w:r>
-      <w:proofErr w:type="spellStart"/>
-      <w:r>
-        <w:t>Fabregat</w:t>
-      </w:r>
-      <w:proofErr w:type="spellEnd"/>
-      <w:r>
-        <w:t xml:space="preserve">, R., Bacca-Acosta, J., Duque-Méndez, N. and Avila-Garzon, C. (2022) ‘Augmented Reality, Virtual Reality, and Game Technologies in Ophthalmology Training’. </w:t>
+        <w:t xml:space="preserve">. Available at: </w:t>
+      </w:r>
+      <w:hyperlink r:id="rId16" w:history="1">
+        <w:r>
+          <w:rPr>
+            <w:rStyle w:val="Hyperlink"/>
+          </w:rPr>
+          <w:t>https://docs.github.com/en/get-started/start-your-journey/about-github-and-git</w:t>
+        </w:r>
+      </w:hyperlink>
+      <w:r>
+        <w:t>.</w:t>
+      </w:r>
+    </w:p>
+    <w:p>
+      <w:r>
+        <w:t xml:space="preserve">Göransson, B. (2022) </w:t>
       </w:r>
       <w:r>
         <w:rPr>
           <w:i/>
           <w:iCs/>
         </w:rPr>
+        <w:t>User-Centred Systems Design</w:t>
+      </w:r>
+      <w:r>
+        <w:rPr>
+          <w:i/>
+          <w:iCs/>
+        </w:rPr>
+        <w:t xml:space="preserve"> </w:t>
+      </w:r>
+      <w:r>
+        <w:rPr>
+          <w:i/>
+          <w:iCs/>
+        </w:rPr>
+        <w:t>: Designing Usable Interactive Systems in Practice</w:t>
+      </w:r>
+      <w:r>
+        <w:t xml:space="preserve">. Available at: </w:t>
+      </w:r>
+      <w:hyperlink r:id="rId17" w:history="1">
+        <w:r>
+          <w:rPr>
+            <w:rStyle w:val="Hyperlink"/>
+          </w:rPr>
+          <w:t>https://www.diva-portal.org/smash/record.jsf?pid=diva2%3A164639&amp;dswid=-3185</w:t>
+        </w:r>
+      </w:hyperlink>
+      <w:r>
+        <w:t xml:space="preserve"> </w:t>
+      </w:r>
+      <w:r>
+        <w:t>(Accessed: 10 March 2026).</w:t>
+      </w:r>
+    </w:p>
+    <w:p>
+      <w:proofErr w:type="spellStart"/>
+      <w:r>
+        <w:t>Looyestyn</w:t>
+      </w:r>
+      <w:proofErr w:type="spellEnd"/>
+      <w:r>
+        <w:t xml:space="preserve">, J., Kernot, J., Boshoff, K., Ryan, J., Edney, S. and Maher, C. (2017) ‘Does gamification increase engagement with online programs? A systematic review’. </w:t>
+      </w:r>
+      <w:proofErr w:type="spellStart"/>
+      <w:r>
+        <w:t>Amblard</w:t>
+      </w:r>
+      <w:proofErr w:type="spellEnd"/>
+      <w:r>
+        <w:t xml:space="preserve">, F. (ed.). </w:t>
+      </w:r>
+      <w:r>
+        <w:rPr>
+          <w:i/>
+          <w:iCs/>
+        </w:rPr>
+        <w:t>PLOS ONE</w:t>
+      </w:r>
+      <w:r>
+        <w:t xml:space="preserve"> 12(3), p. e0173403. Available at: </w:t>
+      </w:r>
+      <w:hyperlink r:id="rId18" w:history="1">
+        <w:r>
+          <w:rPr>
+            <w:rStyle w:val="Hyperlink"/>
+          </w:rPr>
+          <w:t>https://journals.plos.org/plosone/article?id=10.1371/journal.pone.0173403</w:t>
+        </w:r>
+      </w:hyperlink>
+      <w:r>
+        <w:t>.</w:t>
+      </w:r>
+      <w:r>
+        <w:t xml:space="preserve"> </w:t>
+      </w:r>
+    </w:p>
+    <w:p>
+      <w:r>
+        <w:t xml:space="preserve">Muñoz, E.G., </w:t>
+      </w:r>
+      <w:proofErr w:type="spellStart"/>
+      <w:r>
+        <w:t>Fabregat</w:t>
+      </w:r>
+      <w:proofErr w:type="spellEnd"/>
+      <w:r>
+        <w:t xml:space="preserve">, R., Bacca-Acosta, J., Duque-Méndez, N. and Avila-Garzon, C. (2022) ‘Augmented Reality, Virtual Reality, and Game Technologies in Ophthalmology Training’. </w:t>
+      </w:r>
+      <w:r>
+        <w:rPr>
+          <w:i/>
+          <w:iCs/>
+        </w:rPr>
         <w:t>Information</w:t>
       </w:r>
       <w:r>
@@ -11392,7 +11616,7 @@
       <w:r>
         <w:t xml:space="preserve">: </w:t>
       </w:r>
-      <w:hyperlink r:id="rId16" w:history="1">
+      <w:hyperlink r:id="rId19" w:history="1">
         <w:r>
           <w:rPr>
             <w:rStyle w:val="Hyperlink"/>
@@ -11406,110 +11630,151 @@
     </w:p>
     <w:p>
       <w:r>
-        <w:t xml:space="preserve">Orji, J., Hernandez, A., Selema, B. and Orji, R. (2022) ‘Virtual and augmented reality applications for promoting safety and security: A systematic review’., pp. 1–7. </w:t>
+        <w:t xml:space="preserve">Newman, M., </w:t>
       </w:r>
       <w:proofErr w:type="spellStart"/>
       <w:r>
-        <w:t>doi</w:t>
+        <w:t>Gatersleben</w:t>
       </w:r>
       <w:proofErr w:type="spellEnd"/>
       <w:r>
-        <w:t>: https://doi.org/10.1109/SEGAH54908.2022.9978597.</w:t>
-      </w:r>
-    </w:p>
-    <w:p>
-      <w:proofErr w:type="spellStart"/>
-      <w:r>
-        <w:t>Porcar</w:t>
-      </w:r>
-      <w:proofErr w:type="spellEnd"/>
-      <w:r>
-        <w:t xml:space="preserve">, E., Pons, A. and Lorente, A. (2016) ‘Visual and ocular effects from the use of flat-panel displays’. </w:t>
+        <w:t xml:space="preserve">, B., Wyles, K.J. and Ratcliffe, E. (2022) ‘The use of virtual reality in environment experiences and the importance of realism’. </w:t>
       </w:r>
       <w:r>
         <w:rPr>
           <w:i/>
           <w:iCs/>
         </w:rPr>
-        <w:t>International journal of ophthalmology</w:t>
-      </w:r>
-      <w:r>
-        <w:t xml:space="preserve"> 9(6), pp. 881–5. Available at: https://pmc.ncbi.nlm.nih.gov/articles/PMC4916147/ (Accessed: 20 October 2025).</w:t>
-      </w:r>
-    </w:p>
-    <w:p>
-      <w:r>
-        <w:t xml:space="preserve">Santilli, T., Ceccacci, S., Mengoni, M. and Catia </w:t>
+        <w:t>Journal of Environmental Psychology</w:t>
+      </w:r>
+      <w:r>
+        <w:t xml:space="preserve"> 79, p. 101733. Available at: </w:t>
+      </w:r>
+      <w:hyperlink r:id="rId20" w:history="1">
+        <w:r>
+          <w:rPr>
+            <w:rStyle w:val="Hyperlink"/>
+          </w:rPr>
+          <w:t>https://www.sciencedirect.com/science/article/pii/S0272494421001869?via%3Dihub</w:t>
+        </w:r>
+      </w:hyperlink>
+      <w:r>
+        <w:t>.</w:t>
+      </w:r>
+      <w:r>
+        <w:t xml:space="preserve"> </w:t>
+      </w:r>
+    </w:p>
+    <w:p>
+      <w:r>
+        <w:t xml:space="preserve">Orji, J., Hernandez, A., Selema, B. and Orji, R. (2022) ‘Virtual and augmented reality applications for promoting safety and security: A systematic review’., pp. 1–7. </w:t>
       </w:r>
       <w:proofErr w:type="spellStart"/>
       <w:r>
-        <w:t>Giaconi</w:t>
+        <w:t>doi</w:t>
       </w:r>
       <w:proofErr w:type="spellEnd"/>
       <w:r>
-        <w:t xml:space="preserve"> (2025) ‘Virtual vs. traditional learning in higher education: A systematic review of comparative studies’. </w:t>
+        <w:t>: https://doi.org/10.1109/SEGAH54908.2022.9978597.</w:t>
+      </w:r>
+    </w:p>
+    <w:p>
+      <w:proofErr w:type="spellStart"/>
+      <w:r>
+        <w:t>Porcar</w:t>
+      </w:r>
+      <w:proofErr w:type="spellEnd"/>
+      <w:r>
+        <w:t xml:space="preserve">, E., Pons, A. and Lorente, A. (2016) ‘Visual and ocular effects from the use of flat-panel displays’. </w:t>
       </w:r>
       <w:r>
         <w:rPr>
           <w:i/>
           <w:iCs/>
         </w:rPr>
-        <w:t>Computers &amp; Education</w:t>
-      </w:r>
-      <w:r>
-        <w:t xml:space="preserve"> 227(0360-1315), p. 105214. Available at: https://www.sciencedirect.com/science/article/pii/S0360131524002288.</w:t>
-      </w:r>
-    </w:p>
-    <w:p>
-      <w:r>
-        <w:t>Sharma, M., Kumar, P. and Singh, D.K. (2024) ‘The Role of Virtual Reality in Education: A Comprehensive Review of Research and Application’. Available at: https://ieeexplore.ieee.org/document/10406461/authors#authors (Accessed: 21 October 2025).</w:t>
-      </w:r>
-    </w:p>
-    <w:p>
-      <w:r>
-        <w:t xml:space="preserve">Sheppard, A.L. and Wolffsohn, J.S. (2018) ‘Digital eye strain: prevalence, measurement and amelioration’. </w:t>
+        <w:t>International journal of ophthalmology</w:t>
+      </w:r>
+      <w:r>
+        <w:t xml:space="preserve"> 9(6), pp. 881–5. Available at: https://pmc.ncbi.nlm.nih.gov/articles/PMC4916147/ (Accessed: 20 October 2025).</w:t>
+      </w:r>
+    </w:p>
+    <w:p>
+      <w:r>
+        <w:t xml:space="preserve">Santilli, T., Ceccacci, S., Mengoni, M. and Catia </w:t>
+      </w:r>
+      <w:proofErr w:type="spellStart"/>
+      <w:r>
+        <w:t>Giaconi</w:t>
+      </w:r>
+      <w:proofErr w:type="spellEnd"/>
+      <w:r>
+        <w:t xml:space="preserve"> (2025) ‘Virtual vs. traditional learning in higher education: A systematic review of comparative studies’. </w:t>
       </w:r>
       <w:r>
         <w:rPr>
           <w:i/>
           <w:iCs/>
         </w:rPr>
-        <w:t>BMJ Open Ophthalmology</w:t>
-      </w:r>
-      <w:r>
-        <w:t xml:space="preserve"> 3(1), p. e000146. Available at: https://bmjophth.bmj.com/content/3/1/e000146.</w:t>
-      </w:r>
-    </w:p>
-    <w:p>
-      <w:r>
-        <w:t>Vieira, F., Oliveira, E. and Rodrigues, N. (2019) ‘</w:t>
-      </w:r>
-      <w:proofErr w:type="spellStart"/>
-      <w:r>
-        <w:t>iSVC</w:t>
-      </w:r>
-      <w:proofErr w:type="spellEnd"/>
-      <w:r>
-        <w:t xml:space="preserve"> – digital platform for detection and prevention of computer vision syndrome’., pp. 1–7. </w:t>
-      </w:r>
-      <w:proofErr w:type="spellStart"/>
-      <w:r>
-        <w:t>doi</w:t>
-      </w:r>
-      <w:proofErr w:type="spellEnd"/>
-      <w:r>
-        <w:t>: https://doi.org/10.1109/SeGAH.2019.8882438.</w:t>
-      </w:r>
-    </w:p>
-    <w:p>
-      <w:r>
-        <w:t xml:space="preserve">Wasswa, W. and Ware, J.A. (2025) ‘A Systematic Literature Review on Virtual Reality Applications in Medical Education’. </w:t>
+        <w:t>Computers &amp; Education</w:t>
+      </w:r>
+      <w:r>
+        <w:t xml:space="preserve"> 227(0360-1315), p. 105214. Available at: https://www.sciencedirect.com/science/article/pii/S0360131524002288.</w:t>
+      </w:r>
+    </w:p>
+    <w:p>
+      <w:r>
+        <w:t xml:space="preserve">Sharma, M., Kumar, P. and Singh, D.K. (2024) ‘The Role of Virtual Reality in Education: A Comprehensive Review of Research and Application’. Available at: </w:t>
+      </w:r>
+      <w:r>
+        <w:lastRenderedPageBreak/>
+        <w:t>https://ieeexplore.ieee.org/document/10406461/authors#authors (Accessed: 21 October 2025).</w:t>
+      </w:r>
+    </w:p>
+    <w:p>
+      <w:r>
+        <w:t xml:space="preserve">Sheppard, A.L. and Wolffsohn, J.S. (2018) ‘Digital eye strain: prevalence, measurement and amelioration’. </w:t>
       </w:r>
       <w:r>
         <w:rPr>
           <w:i/>
           <w:iCs/>
         </w:rPr>
+        <w:t>BMJ Open Ophthalmology</w:t>
+      </w:r>
+      <w:r>
+        <w:t xml:space="preserve"> 3(1), p. e000146. Available at: https://bmjophth.bmj.com/content/3/1/e000146.</w:t>
+      </w:r>
+    </w:p>
+    <w:p>
+      <w:r>
+        <w:t>Vieira, F., Oliveira, E. and Rodrigues, N. (2019) ‘</w:t>
+      </w:r>
+      <w:proofErr w:type="spellStart"/>
+      <w:r>
+        <w:t>iSVC</w:t>
+      </w:r>
+      <w:proofErr w:type="spellEnd"/>
+      <w:r>
+        <w:t xml:space="preserve"> – digital platform for detection and prevention of computer vision syndrome’., pp. 1–7. </w:t>
+      </w:r>
+      <w:proofErr w:type="spellStart"/>
+      <w:r>
+        <w:t>doi</w:t>
+      </w:r>
+      <w:proofErr w:type="spellEnd"/>
+      <w:r>
+        <w:t>: https://doi.org/10.1109/SeGAH.2019.8882438.</w:t>
+      </w:r>
+    </w:p>
+    <w:p>
+      <w:r>
+        <w:t xml:space="preserve">Wasswa, W. and Ware, J.A. (2025) ‘A Systematic Literature Review on Virtual Reality Applications in Medical Education’. </w:t>
+      </w:r>
+      <w:r>
+        <w:rPr>
+          <w:i/>
+          <w:iCs/>
+        </w:rPr>
         <w:t>Annals of Emerging Technologies in Computing</w:t>
       </w:r>
       <w:r>
@@ -11526,7 +11791,6 @@
     </w:p>
     <w:p>
       <w:r>
-        <w:lastRenderedPageBreak/>
         <w:t>Youcef, B., Ahmad, M.N. and Mustapha, M. (2021) ‘</w:t>
       </w:r>
       <w:proofErr w:type="spellStart"/>
@@ -11608,7 +11872,7 @@
                     <pic:cNvPicPr/>
                   </pic:nvPicPr>
                   <pic:blipFill>
-                    <a:blip r:embed="rId17"/>
+                    <a:blip r:embed="rId21"/>
                     <a:stretch>
                       <a:fillRect/>
                     </a:stretch>
@@ -11633,7 +11897,7 @@
       <w:r>
         <w:t xml:space="preserve">Source: </w:t>
       </w:r>
-      <w:hyperlink r:id="rId18" w:history="1">
+      <w:hyperlink r:id="rId22" w:history="1">
         <w:r>
           <w:rPr>
             <w:rStyle w:val="Hyperlink"/>
@@ -11649,7 +11913,7 @@
       <w:r>
         <w:t xml:space="preserve">License: </w:t>
       </w:r>
-      <w:hyperlink r:id="rId19" w:history="1">
+      <w:hyperlink r:id="rId23" w:history="1">
         <w:r>
           <w:rPr>
             <w:rStyle w:val="Hyperlink"/>
@@ -11692,7 +11956,7 @@
                     <pic:cNvPicPr/>
                   </pic:nvPicPr>
                   <pic:blipFill>
-                    <a:blip r:embed="rId20"/>
+                    <a:blip r:embed="rId24"/>
                     <a:stretch>
                       <a:fillRect/>
                     </a:stretch>
@@ -11715,9 +11979,10 @@
     </w:p>
     <w:p>
       <w:r>
+        <w:lastRenderedPageBreak/>
         <w:t xml:space="preserve">Source: </w:t>
       </w:r>
-      <w:hyperlink r:id="rId21" w:history="1">
+      <w:hyperlink r:id="rId25" w:history="1">
         <w:r>
           <w:rPr>
             <w:rStyle w:val="Hyperlink"/>
@@ -11733,7 +11998,7 @@
       <w:r>
         <w:t xml:space="preserve">License: </w:t>
       </w:r>
-      <w:hyperlink r:id="rId22" w:history="1">
+      <w:hyperlink r:id="rId26" w:history="1">
         <w:r>
           <w:rPr>
             <w:rStyle w:val="Hyperlink"/>
@@ -11751,7 +12016,6 @@
       </w:pPr>
       <w:bookmarkStart w:id="56" w:name="_Toc223987325"/>
       <w:r>
-        <w:lastRenderedPageBreak/>
         <w:t>General Desktop Bundle</w:t>
       </w:r>
       <w:bookmarkEnd w:id="56"/>
@@ -11777,7 +12041,7 @@
                     <pic:cNvPicPr/>
                   </pic:nvPicPr>
                   <pic:blipFill>
-                    <a:blip r:embed="rId23"/>
+                    <a:blip r:embed="rId27"/>
                     <a:stretch>
                       <a:fillRect/>
                     </a:stretch>
@@ -11802,7 +12066,7 @@
       <w:r>
         <w:t xml:space="preserve">Source: </w:t>
       </w:r>
-      <w:hyperlink r:id="rId24" w:history="1">
+      <w:hyperlink r:id="rId28" w:history="1">
         <w:r>
           <w:rPr>
             <w:rStyle w:val="Hyperlink"/>
@@ -11818,7 +12082,7 @@
       <w:r>
         <w:t xml:space="preserve">License: </w:t>
       </w:r>
-      <w:hyperlink r:id="rId25" w:history="1">
+      <w:hyperlink r:id="rId29" w:history="1">
         <w:r>
           <w:rPr>
             <w:rStyle w:val="Hyperlink"/>
@@ -11861,7 +12125,7 @@
                     <pic:cNvPicPr/>
                   </pic:nvPicPr>
                   <pic:blipFill>
-                    <a:blip r:embed="rId26"/>
+                    <a:blip r:embed="rId30"/>
                     <a:stretch>
                       <a:fillRect/>
                     </a:stretch>
@@ -11886,7 +12150,7 @@
       <w:r>
         <w:t xml:space="preserve">Source: </w:t>
       </w:r>
-      <w:hyperlink r:id="rId27" w:history="1">
+      <w:hyperlink r:id="rId31" w:history="1">
         <w:r>
           <w:rPr>
             <w:rStyle w:val="Hyperlink"/>
@@ -11902,7 +12166,7 @@
       <w:r>
         <w:t xml:space="preserve">License: </w:t>
       </w:r>
-      <w:hyperlink r:id="rId28" w:history="1">
+      <w:hyperlink r:id="rId32" w:history="1">
         <w:r>
           <w:rPr>
             <w:rStyle w:val="Hyperlink"/>
@@ -11945,7 +12209,7 @@
                     <pic:cNvPicPr/>
                   </pic:nvPicPr>
                   <pic:blipFill>
-                    <a:blip r:embed="rId29"/>
+                    <a:blip r:embed="rId33"/>
                     <a:stretch>
                       <a:fillRect/>
                     </a:stretch>
@@ -11968,9 +12232,10 @@
     </w:p>
     <w:p>
       <w:r>
+        <w:lastRenderedPageBreak/>
         <w:t xml:space="preserve">Source: </w:t>
       </w:r>
-      <w:hyperlink r:id="rId30" w:history="1">
+      <w:hyperlink r:id="rId34" w:history="1">
         <w:r>
           <w:rPr>
             <w:rStyle w:val="Hyperlink"/>
@@ -11986,7 +12251,7 @@
       <w:r>
         <w:t xml:space="preserve">License: </w:t>
       </w:r>
-      <w:hyperlink r:id="rId31" w:history="1">
+      <w:hyperlink r:id="rId35" w:history="1">
         <w:r>
           <w:rPr>
             <w:rStyle w:val="Hyperlink"/>
@@ -12004,7 +12269,6 @@
       </w:pPr>
       <w:bookmarkStart w:id="59" w:name="_Toc223987328"/>
       <w:r>
-        <w:lastRenderedPageBreak/>
         <w:t>Light Switch</w:t>
       </w:r>
       <w:bookmarkEnd w:id="59"/>
@@ -12030,7 +12294,7 @@
                     <pic:cNvPicPr/>
                   </pic:nvPicPr>
                   <pic:blipFill rotWithShape="1">
-                    <a:blip r:embed="rId32"/>
+                    <a:blip r:embed="rId36"/>
                     <a:srcRect t="23971" b="7788"/>
                     <a:stretch>
                       <a:fillRect/>
@@ -12067,7 +12331,7 @@
       <w:r>
         <w:t xml:space="preserve"> </w:t>
       </w:r>
-      <w:hyperlink r:id="rId33" w:history="1">
+      <w:hyperlink r:id="rId37" w:history="1">
         <w:r>
           <w:rPr>
             <w:rStyle w:val="Hyperlink"/>
@@ -12083,7 +12347,7 @@
       <w:r>
         <w:t xml:space="preserve">License: </w:t>
       </w:r>
-      <w:hyperlink r:id="rId34" w:history="1">
+      <w:hyperlink r:id="rId38" w:history="1">
         <w:r>
           <w:rPr>
             <w:rStyle w:val="Hyperlink"/>
@@ -12114,7 +12378,7 @@
       <w:r>
         <w:t xml:space="preserve">Source: </w:t>
       </w:r>
-      <w:hyperlink r:id="rId35" w:history="1">
+      <w:hyperlink r:id="rId39" w:history="1">
         <w:r>
           <w:rPr>
             <w:rStyle w:val="Hyperlink"/>
@@ -12130,7 +12394,7 @@
       <w:r>
         <w:t xml:space="preserve">License: </w:t>
       </w:r>
-      <w:hyperlink r:id="rId36" w:history="1">
+      <w:hyperlink r:id="rId40" w:history="1">
         <w:r>
           <w:rPr>
             <w:rStyle w:val="Hyperlink"/>
@@ -12163,7 +12427,7 @@
                     <pic:cNvPicPr/>
                   </pic:nvPicPr>
                   <pic:blipFill>
-                    <a:blip r:embed="rId37"/>
+                    <a:blip r:embed="rId41"/>
                     <a:stretch>
                       <a:fillRect/>
                     </a:stretch>
@@ -12206,7 +12470,7 @@
                     <pic:cNvPicPr/>
                   </pic:nvPicPr>
                   <pic:blipFill>
-                    <a:blip r:embed="rId38"/>
+                    <a:blip r:embed="rId42"/>
                     <a:stretch>
                       <a:fillRect/>
                     </a:stretch>
@@ -12264,7 +12528,7 @@
                     <pic:cNvPicPr/>
                   </pic:nvPicPr>
                   <pic:blipFill>
-                    <a:blip r:embed="rId39"/>
+                    <a:blip r:embed="rId43"/>
                     <a:stretch>
                       <a:fillRect/>
                     </a:stretch>
@@ -12289,7 +12553,7 @@
       <w:r>
         <w:t xml:space="preserve">Source: </w:t>
       </w:r>
-      <w:hyperlink r:id="rId40" w:history="1">
+      <w:hyperlink r:id="rId44" w:history="1">
         <w:r>
           <w:rPr>
             <w:rStyle w:val="Hyperlink"/>
@@ -12305,7 +12569,7 @@
       <w:r>
         <w:t xml:space="preserve">License: </w:t>
       </w:r>
-      <w:hyperlink r:id="rId41" w:history="1">
+      <w:hyperlink r:id="rId45" w:history="1">
         <w:r>
           <w:rPr>
             <w:rStyle w:val="Hyperlink"/>
@@ -12356,7 +12620,7 @@
             <wp:extent cx="5731510" cy="2659380"/>
             <wp:effectExtent l="0" t="0" r="2540" b="7620"/>
             <wp:docPr id="1819945004" name="Picture 2" descr="Image">
-              <a:hlinkClick xmlns:a="http://schemas.openxmlformats.org/drawingml/2006/main" r:id="rId42" tgtFrame="&quot;_blank&quot;"/>
+              <a:hlinkClick xmlns:a="http://schemas.openxmlformats.org/drawingml/2006/main" r:id="rId46" tgtFrame="&quot;_blank&quot;"/>
             </wp:docPr>
             <wp:cNvGraphicFramePr>
               <a:graphicFrameLocks xmlns:a="http://schemas.openxmlformats.org/drawingml/2006/main" noChangeAspect="1"/>
@@ -12366,14 +12630,14 @@
                 <pic:pic xmlns:pic="http://schemas.openxmlformats.org/drawingml/2006/picture">
                   <pic:nvPicPr>
                     <pic:cNvPr id="0" name="Picture 6" descr="Image">
-                      <a:hlinkClick r:id="rId42" tgtFrame="&quot;_blank&quot;"/>
+                      <a:hlinkClick r:id="rId46" tgtFrame="&quot;_blank&quot;"/>
                     </pic:cNvPr>
                     <pic:cNvPicPr>
                       <a:picLocks noChangeAspect="1" noChangeArrowheads="1"/>
                     </pic:cNvPicPr>
                   </pic:nvPicPr>
                   <pic:blipFill>
-                    <a:blip r:embed="rId43">
+                    <a:blip r:embed="rId47">
                       <a:extLst>
                         <a:ext uri="{28A0092B-C50C-407E-A947-70E740481C1C}">
                           <a14:useLocalDpi xmlns:a14="http://schemas.microsoft.com/office/drawing/2010/main" val="0"/>
@@ -12413,7 +12677,7 @@
       <w:r>
         <w:t> </w:t>
       </w:r>
-      <w:hyperlink r:id="rId44" w:history="1">
+      <w:hyperlink r:id="rId48" w:history="1">
         <w:r>
           <w:rPr>
             <w:rStyle w:val="Hyperlink"/>
@@ -12429,7 +12693,7 @@
       <w:r>
         <w:t xml:space="preserve"> </w:t>
       </w:r>
-      <w:hyperlink r:id="rId45" w:history="1">
+      <w:hyperlink r:id="rId49" w:history="1">
         <w:r>
           <w:rPr>
             <w:rStyle w:val="Hyperlink"/>
@@ -12482,7 +12746,7 @@
             <wp:extent cx="5731510" cy="2298065"/>
             <wp:effectExtent l="0" t="0" r="2540" b="6985"/>
             <wp:docPr id="1391107064" name="Picture 4" descr="Image">
-              <a:hlinkClick xmlns:a="http://schemas.openxmlformats.org/drawingml/2006/main" r:id="rId46" tgtFrame="&quot;_blank&quot;"/>
+              <a:hlinkClick xmlns:a="http://schemas.openxmlformats.org/drawingml/2006/main" r:id="rId50" tgtFrame="&quot;_blank&quot;"/>
             </wp:docPr>
             <wp:cNvGraphicFramePr>
               <a:graphicFrameLocks xmlns:a="http://schemas.openxmlformats.org/drawingml/2006/main" noChangeAspect="1"/>
@@ -12492,14 +12756,14 @@
                 <pic:pic xmlns:pic="http://schemas.openxmlformats.org/drawingml/2006/picture">
                   <pic:nvPicPr>
                     <pic:cNvPr id="0" name="Picture 13" descr="Image">
-                      <a:hlinkClick r:id="rId46" tgtFrame="&quot;_blank&quot;"/>
+                      <a:hlinkClick r:id="rId50" tgtFrame="&quot;_blank&quot;"/>
                     </pic:cNvPr>
                     <pic:cNvPicPr>
                       <a:picLocks noChangeAspect="1" noChangeArrowheads="1"/>
                     </pic:cNvPicPr>
                   </pic:nvPicPr>
                   <pic:blipFill>
-                    <a:blip r:embed="rId47">
+                    <a:blip r:embed="rId51">
                       <a:extLst>
                         <a:ext uri="{28A0092B-C50C-407E-A947-70E740481C1C}">
                           <a14:useLocalDpi xmlns:a14="http://schemas.microsoft.com/office/drawing/2010/main" val="0"/>
@@ -12536,7 +12800,7 @@
       <w:r>
         <w:t> </w:t>
       </w:r>
-      <w:hyperlink r:id="rId48" w:history="1">
+      <w:hyperlink r:id="rId52" w:history="1">
         <w:r>
           <w:rPr>
             <w:rStyle w:val="Hyperlink"/>
@@ -12549,7 +12813,7 @@
       <w:r>
         <w:t>License: </w:t>
       </w:r>
-      <w:hyperlink r:id="rId49" w:history="1">
+      <w:hyperlink r:id="rId53" w:history="1">
         <w:r>
           <w:rPr>
             <w:rStyle w:val="Hyperlink"/>
@@ -12591,7 +12855,7 @@
       <w:r>
         <w:t>Source: </w:t>
       </w:r>
-      <w:hyperlink r:id="rId50" w:history="1">
+      <w:hyperlink r:id="rId54" w:history="1">
         <w:r>
           <w:rPr>
             <w:rStyle w:val="Hyperlink"/>
@@ -12603,7 +12867,7 @@
         <w:br/>
         <w:t>License: </w:t>
       </w:r>
-      <w:hyperlink r:id="rId51" w:history="1">
+      <w:hyperlink r:id="rId55" w:history="1">
         <w:r>
           <w:rPr>
             <w:rStyle w:val="Hyperlink"/>
@@ -12622,7 +12886,7 @@
             <wp:extent cx="5731510" cy="2829560"/>
             <wp:effectExtent l="0" t="0" r="2540" b="8890"/>
             <wp:docPr id="300778054" name="Picture 2" descr="Image">
-              <a:hlinkClick xmlns:a="http://schemas.openxmlformats.org/drawingml/2006/main" r:id="rId52" tgtFrame="&quot;_blank&quot;"/>
+              <a:hlinkClick xmlns:a="http://schemas.openxmlformats.org/drawingml/2006/main" r:id="rId56" tgtFrame="&quot;_blank&quot;"/>
             </wp:docPr>
             <wp:cNvGraphicFramePr>
               <a:graphicFrameLocks xmlns:a="http://schemas.openxmlformats.org/drawingml/2006/main" noChangeAspect="1"/>
@@ -12632,14 +12896,14 @@
                 <pic:pic xmlns:pic="http://schemas.openxmlformats.org/drawingml/2006/picture">
                   <pic:nvPicPr>
                     <pic:cNvPr id="0" name="Picture 6" descr="Image">
-                      <a:hlinkClick r:id="rId52" tgtFrame="&quot;_blank&quot;"/>
+                      <a:hlinkClick r:id="rId56" tgtFrame="&quot;_blank&quot;"/>
                     </pic:cNvPr>
                     <pic:cNvPicPr>
                       <a:picLocks noChangeAspect="1" noChangeArrowheads="1"/>
                     </pic:cNvPicPr>
                   </pic:nvPicPr>
                   <pic:blipFill>
-                    <a:blip r:embed="rId53">
+                    <a:blip r:embed="rId57">
                       <a:extLst>
                         <a:ext uri="{28A0092B-C50C-407E-A947-70E740481C1C}">
                           <a14:useLocalDpi xmlns:a14="http://schemas.microsoft.com/office/drawing/2010/main" val="0"/>
@@ -12690,7 +12954,7 @@
       <w:r>
         <w:t>Source: </w:t>
       </w:r>
-      <w:hyperlink r:id="rId54" w:history="1">
+      <w:hyperlink r:id="rId58" w:history="1">
         <w:r>
           <w:rPr>
             <w:rStyle w:val="Hyperlink"/>
@@ -12702,7 +12966,7 @@
         <w:br/>
         <w:t>License: </w:t>
       </w:r>
-      <w:hyperlink r:id="rId55" w:history="1">
+      <w:hyperlink r:id="rId59" w:history="1">
         <w:r>
           <w:rPr>
             <w:rStyle w:val="Hyperlink"/>
@@ -12721,7 +12985,7 @@
             <wp:extent cx="5731510" cy="2783840"/>
             <wp:effectExtent l="0" t="0" r="2540" b="0"/>
             <wp:docPr id="1261778138" name="Picture 4" descr="Image">
-              <a:hlinkClick xmlns:a="http://schemas.openxmlformats.org/drawingml/2006/main" r:id="rId56" tgtFrame="&quot;_blank&quot;"/>
+              <a:hlinkClick xmlns:a="http://schemas.openxmlformats.org/drawingml/2006/main" r:id="rId60" tgtFrame="&quot;_blank&quot;"/>
             </wp:docPr>
             <wp:cNvGraphicFramePr>
               <a:graphicFrameLocks xmlns:a="http://schemas.openxmlformats.org/drawingml/2006/main" noChangeAspect="1"/>
@@ -12731,14 +12995,14 @@
                 <pic:pic xmlns:pic="http://schemas.openxmlformats.org/drawingml/2006/picture">
                   <pic:nvPicPr>
                     <pic:cNvPr id="0" name="Picture 13" descr="Image">
-                      <a:hlinkClick r:id="rId56" tgtFrame="&quot;_blank&quot;"/>
+                      <a:hlinkClick r:id="rId60" tgtFrame="&quot;_blank&quot;"/>
                     </pic:cNvPr>
                     <pic:cNvPicPr>
                       <a:picLocks noChangeAspect="1" noChangeArrowheads="1"/>
                     </pic:cNvPicPr>
                   </pic:nvPicPr>
                   <pic:blipFill>
-                    <a:blip r:embed="rId57">
+                    <a:blip r:embed="rId61">
                       <a:extLst>
                         <a:ext uri="{28A0092B-C50C-407E-A947-70E740481C1C}">
                           <a14:useLocalDpi xmlns:a14="http://schemas.microsoft.com/office/drawing/2010/main" val="0"/>

</xml_diff>

<commit_message>
Added another two references
</commit_message>
<xml_diff>
--- a/30077548Thesis.docx
+++ b/30077548Thesis.docx
@@ -236,7 +236,7 @@
           <w:r>
             <w:fldChar w:fldCharType="separate"/>
           </w:r>
-          <w:hyperlink w:anchor="_Toc223987269" w:history="1">
+          <w:hyperlink w:anchor="_Toc224050573" w:history="1">
             <w:r>
               <w:rPr>
                 <w:rStyle w:val="Hyperlink"/>
@@ -263,7 +263,7 @@
                 <w:noProof/>
                 <w:webHidden/>
               </w:rPr>
-              <w:instrText xml:space="preserve"> PAGEREF _Toc223987269 \h </w:instrText>
+              <w:instrText xml:space="preserve"> PAGEREF _Toc224050573 \h </w:instrText>
             </w:r>
             <w:r>
               <w:rPr>
@@ -308,7 +308,7 @@
               <w:lang w:eastAsia="en-GB"/>
             </w:rPr>
           </w:pPr>
-          <w:hyperlink w:anchor="_Toc223987270" w:history="1">
+          <w:hyperlink w:anchor="_Toc224050574" w:history="1">
             <w:r>
               <w:rPr>
                 <w:rStyle w:val="Hyperlink"/>
@@ -335,7 +335,7 @@
                 <w:noProof/>
                 <w:webHidden/>
               </w:rPr>
-              <w:instrText xml:space="preserve"> PAGEREF _Toc223987270 \h </w:instrText>
+              <w:instrText xml:space="preserve"> PAGEREF _Toc224050574 \h </w:instrText>
             </w:r>
             <w:r>
               <w:rPr>
@@ -380,7 +380,7 @@
               <w:lang w:eastAsia="en-GB"/>
             </w:rPr>
           </w:pPr>
-          <w:hyperlink w:anchor="_Toc223987271" w:history="1">
+          <w:hyperlink w:anchor="_Toc224050575" w:history="1">
             <w:r>
               <w:rPr>
                 <w:rStyle w:val="Hyperlink"/>
@@ -407,7 +407,7 @@
                 <w:noProof/>
                 <w:webHidden/>
               </w:rPr>
-              <w:instrText xml:space="preserve"> PAGEREF _Toc223987271 \h </w:instrText>
+              <w:instrText xml:space="preserve"> PAGEREF _Toc224050575 \h </w:instrText>
             </w:r>
             <w:r>
               <w:rPr>
@@ -452,7 +452,7 @@
               <w:lang w:eastAsia="en-GB"/>
             </w:rPr>
           </w:pPr>
-          <w:hyperlink w:anchor="_Toc223987272" w:history="1">
+          <w:hyperlink w:anchor="_Toc224050576" w:history="1">
             <w:r>
               <w:rPr>
                 <w:rStyle w:val="Hyperlink"/>
@@ -479,7 +479,7 @@
                 <w:noProof/>
                 <w:webHidden/>
               </w:rPr>
-              <w:instrText xml:space="preserve"> PAGEREF _Toc223987272 \h </w:instrText>
+              <w:instrText xml:space="preserve"> PAGEREF _Toc224050576 \h </w:instrText>
             </w:r>
             <w:r>
               <w:rPr>
@@ -524,7 +524,7 @@
               <w:lang w:eastAsia="en-GB"/>
             </w:rPr>
           </w:pPr>
-          <w:hyperlink w:anchor="_Toc223987273" w:history="1">
+          <w:hyperlink w:anchor="_Toc224050577" w:history="1">
             <w:r>
               <w:rPr>
                 <w:rStyle w:val="Hyperlink"/>
@@ -551,7 +551,7 @@
                 <w:noProof/>
                 <w:webHidden/>
               </w:rPr>
-              <w:instrText xml:space="preserve"> PAGEREF _Toc223987273 \h </w:instrText>
+              <w:instrText xml:space="preserve"> PAGEREF _Toc224050577 \h </w:instrText>
             </w:r>
             <w:r>
               <w:rPr>
@@ -596,7 +596,7 @@
               <w:lang w:eastAsia="en-GB"/>
             </w:rPr>
           </w:pPr>
-          <w:hyperlink w:anchor="_Toc223987274" w:history="1">
+          <w:hyperlink w:anchor="_Toc224050578" w:history="1">
             <w:r>
               <w:rPr>
                 <w:rStyle w:val="Hyperlink"/>
@@ -623,7 +623,7 @@
                 <w:noProof/>
                 <w:webHidden/>
               </w:rPr>
-              <w:instrText xml:space="preserve"> PAGEREF _Toc223987274 \h </w:instrText>
+              <w:instrText xml:space="preserve"> PAGEREF _Toc224050578 \h </w:instrText>
             </w:r>
             <w:r>
               <w:rPr>
@@ -668,7 +668,7 @@
               <w:lang w:eastAsia="en-GB"/>
             </w:rPr>
           </w:pPr>
-          <w:hyperlink w:anchor="_Toc223987275" w:history="1">
+          <w:hyperlink w:anchor="_Toc224050579" w:history="1">
             <w:r>
               <w:rPr>
                 <w:rStyle w:val="Hyperlink"/>
@@ -695,7 +695,7 @@
                 <w:noProof/>
                 <w:webHidden/>
               </w:rPr>
-              <w:instrText xml:space="preserve"> PAGEREF _Toc223987275 \h </w:instrText>
+              <w:instrText xml:space="preserve"> PAGEREF _Toc224050579 \h </w:instrText>
             </w:r>
             <w:r>
               <w:rPr>
@@ -740,7 +740,7 @@
               <w:lang w:eastAsia="en-GB"/>
             </w:rPr>
           </w:pPr>
-          <w:hyperlink w:anchor="_Toc223987276" w:history="1">
+          <w:hyperlink w:anchor="_Toc224050580" w:history="1">
             <w:r>
               <w:rPr>
                 <w:rStyle w:val="Hyperlink"/>
@@ -767,7 +767,7 @@
                 <w:noProof/>
                 <w:webHidden/>
               </w:rPr>
-              <w:instrText xml:space="preserve"> PAGEREF _Toc223987276 \h </w:instrText>
+              <w:instrText xml:space="preserve"> PAGEREF _Toc224050580 \h </w:instrText>
             </w:r>
             <w:r>
               <w:rPr>
@@ -812,7 +812,7 @@
               <w:lang w:eastAsia="en-GB"/>
             </w:rPr>
           </w:pPr>
-          <w:hyperlink w:anchor="_Toc223987277" w:history="1">
+          <w:hyperlink w:anchor="_Toc224050581" w:history="1">
             <w:r>
               <w:rPr>
                 <w:rStyle w:val="Hyperlink"/>
@@ -839,7 +839,7 @@
                 <w:noProof/>
                 <w:webHidden/>
               </w:rPr>
-              <w:instrText xml:space="preserve"> PAGEREF _Toc223987277 \h </w:instrText>
+              <w:instrText xml:space="preserve"> PAGEREF _Toc224050581 \h </w:instrText>
             </w:r>
             <w:r>
               <w:rPr>
@@ -884,7 +884,7 @@
               <w:lang w:eastAsia="en-GB"/>
             </w:rPr>
           </w:pPr>
-          <w:hyperlink w:anchor="_Toc223987278" w:history="1">
+          <w:hyperlink w:anchor="_Toc224050582" w:history="1">
             <w:r>
               <w:rPr>
                 <w:rStyle w:val="Hyperlink"/>
@@ -911,7 +911,7 @@
                 <w:noProof/>
                 <w:webHidden/>
               </w:rPr>
-              <w:instrText xml:space="preserve"> PAGEREF _Toc223987278 \h </w:instrText>
+              <w:instrText xml:space="preserve"> PAGEREF _Toc224050582 \h </w:instrText>
             </w:r>
             <w:r>
               <w:rPr>
@@ -956,7 +956,7 @@
               <w:lang w:eastAsia="en-GB"/>
             </w:rPr>
           </w:pPr>
-          <w:hyperlink w:anchor="_Toc223987279" w:history="1">
+          <w:hyperlink w:anchor="_Toc224050583" w:history="1">
             <w:r>
               <w:rPr>
                 <w:rStyle w:val="Hyperlink"/>
@@ -983,7 +983,7 @@
                 <w:noProof/>
                 <w:webHidden/>
               </w:rPr>
-              <w:instrText xml:space="preserve"> PAGEREF _Toc223987279 \h </w:instrText>
+              <w:instrText xml:space="preserve"> PAGEREF _Toc224050583 \h </w:instrText>
             </w:r>
             <w:r>
               <w:rPr>
@@ -1028,7 +1028,7 @@
               <w:lang w:eastAsia="en-GB"/>
             </w:rPr>
           </w:pPr>
-          <w:hyperlink w:anchor="_Toc223987280" w:history="1">
+          <w:hyperlink w:anchor="_Toc224050584" w:history="1">
             <w:r>
               <w:rPr>
                 <w:rStyle w:val="Hyperlink"/>
@@ -1055,7 +1055,7 @@
                 <w:noProof/>
                 <w:webHidden/>
               </w:rPr>
-              <w:instrText xml:space="preserve"> PAGEREF _Toc223987280 \h </w:instrText>
+              <w:instrText xml:space="preserve"> PAGEREF _Toc224050584 \h </w:instrText>
             </w:r>
             <w:r>
               <w:rPr>
@@ -1100,7 +1100,7 @@
               <w:lang w:eastAsia="en-GB"/>
             </w:rPr>
           </w:pPr>
-          <w:hyperlink w:anchor="_Toc223987281" w:history="1">
+          <w:hyperlink w:anchor="_Toc224050585" w:history="1">
             <w:r>
               <w:rPr>
                 <w:rStyle w:val="Hyperlink"/>
@@ -1127,7 +1127,7 @@
                 <w:noProof/>
                 <w:webHidden/>
               </w:rPr>
-              <w:instrText xml:space="preserve"> PAGEREF _Toc223987281 \h </w:instrText>
+              <w:instrText xml:space="preserve"> PAGEREF _Toc224050585 \h </w:instrText>
             </w:r>
             <w:r>
               <w:rPr>
@@ -1172,7 +1172,7 @@
               <w:lang w:eastAsia="en-GB"/>
             </w:rPr>
           </w:pPr>
-          <w:hyperlink w:anchor="_Toc223987282" w:history="1">
+          <w:hyperlink w:anchor="_Toc224050586" w:history="1">
             <w:r>
               <w:rPr>
                 <w:rStyle w:val="Hyperlink"/>
@@ -1199,7 +1199,7 @@
                 <w:noProof/>
                 <w:webHidden/>
               </w:rPr>
-              <w:instrText xml:space="preserve"> PAGEREF _Toc223987282 \h </w:instrText>
+              <w:instrText xml:space="preserve"> PAGEREF _Toc224050586 \h </w:instrText>
             </w:r>
             <w:r>
               <w:rPr>
@@ -1244,7 +1244,7 @@
               <w:lang w:eastAsia="en-GB"/>
             </w:rPr>
           </w:pPr>
-          <w:hyperlink w:anchor="_Toc223987283" w:history="1">
+          <w:hyperlink w:anchor="_Toc224050587" w:history="1">
             <w:r>
               <w:rPr>
                 <w:rStyle w:val="Hyperlink"/>
@@ -1271,7 +1271,7 @@
                 <w:noProof/>
                 <w:webHidden/>
               </w:rPr>
-              <w:instrText xml:space="preserve"> PAGEREF _Toc223987283 \h </w:instrText>
+              <w:instrText xml:space="preserve"> PAGEREF _Toc224050587 \h </w:instrText>
             </w:r>
             <w:r>
               <w:rPr>
@@ -1316,7 +1316,7 @@
               <w:lang w:eastAsia="en-GB"/>
             </w:rPr>
           </w:pPr>
-          <w:hyperlink w:anchor="_Toc223987284" w:history="1">
+          <w:hyperlink w:anchor="_Toc224050588" w:history="1">
             <w:r>
               <w:rPr>
                 <w:rStyle w:val="Hyperlink"/>
@@ -1343,7 +1343,7 @@
                 <w:noProof/>
                 <w:webHidden/>
               </w:rPr>
-              <w:instrText xml:space="preserve"> PAGEREF _Toc223987284 \h </w:instrText>
+              <w:instrText xml:space="preserve"> PAGEREF _Toc224050588 \h </w:instrText>
             </w:r>
             <w:r>
               <w:rPr>
@@ -1388,7 +1388,7 @@
               <w:lang w:eastAsia="en-GB"/>
             </w:rPr>
           </w:pPr>
-          <w:hyperlink w:anchor="_Toc223987285" w:history="1">
+          <w:hyperlink w:anchor="_Toc224050589" w:history="1">
             <w:r>
               <w:rPr>
                 <w:rStyle w:val="Hyperlink"/>
@@ -1415,7 +1415,7 @@
                 <w:noProof/>
                 <w:webHidden/>
               </w:rPr>
-              <w:instrText xml:space="preserve"> PAGEREF _Toc223987285 \h </w:instrText>
+              <w:instrText xml:space="preserve"> PAGEREF _Toc224050589 \h </w:instrText>
             </w:r>
             <w:r>
               <w:rPr>
@@ -1460,7 +1460,7 @@
               <w:lang w:eastAsia="en-GB"/>
             </w:rPr>
           </w:pPr>
-          <w:hyperlink w:anchor="_Toc223987286" w:history="1">
+          <w:hyperlink w:anchor="_Toc224050590" w:history="1">
             <w:r>
               <w:rPr>
                 <w:rStyle w:val="Hyperlink"/>
@@ -1487,7 +1487,7 @@
                 <w:noProof/>
                 <w:webHidden/>
               </w:rPr>
-              <w:instrText xml:space="preserve"> PAGEREF _Toc223987286 \h </w:instrText>
+              <w:instrText xml:space="preserve"> PAGEREF _Toc224050590 \h </w:instrText>
             </w:r>
             <w:r>
               <w:rPr>
@@ -1532,7 +1532,7 @@
               <w:lang w:eastAsia="en-GB"/>
             </w:rPr>
           </w:pPr>
-          <w:hyperlink w:anchor="_Toc223987287" w:history="1">
+          <w:hyperlink w:anchor="_Toc224050591" w:history="1">
             <w:r>
               <w:rPr>
                 <w:rStyle w:val="Hyperlink"/>
@@ -1559,7 +1559,7 @@
                 <w:noProof/>
                 <w:webHidden/>
               </w:rPr>
-              <w:instrText xml:space="preserve"> PAGEREF _Toc223987287 \h </w:instrText>
+              <w:instrText xml:space="preserve"> PAGEREF _Toc224050591 \h </w:instrText>
             </w:r>
             <w:r>
               <w:rPr>
@@ -1604,7 +1604,7 @@
               <w:lang w:eastAsia="en-GB"/>
             </w:rPr>
           </w:pPr>
-          <w:hyperlink w:anchor="_Toc223987288" w:history="1">
+          <w:hyperlink w:anchor="_Toc224050592" w:history="1">
             <w:r>
               <w:rPr>
                 <w:rStyle w:val="Hyperlink"/>
@@ -1631,7 +1631,7 @@
                 <w:noProof/>
                 <w:webHidden/>
               </w:rPr>
-              <w:instrText xml:space="preserve"> PAGEREF _Toc223987288 \h </w:instrText>
+              <w:instrText xml:space="preserve"> PAGEREF _Toc224050592 \h </w:instrText>
             </w:r>
             <w:r>
               <w:rPr>
@@ -1676,7 +1676,7 @@
               <w:lang w:eastAsia="en-GB"/>
             </w:rPr>
           </w:pPr>
-          <w:hyperlink w:anchor="_Toc223987289" w:history="1">
+          <w:hyperlink w:anchor="_Toc224050593" w:history="1">
             <w:r>
               <w:rPr>
                 <w:rStyle w:val="Hyperlink"/>
@@ -1703,7 +1703,7 @@
                 <w:noProof/>
                 <w:webHidden/>
               </w:rPr>
-              <w:instrText xml:space="preserve"> PAGEREF _Toc223987289 \h </w:instrText>
+              <w:instrText xml:space="preserve"> PAGEREF _Toc224050593 \h </w:instrText>
             </w:r>
             <w:r>
               <w:rPr>
@@ -1748,7 +1748,7 @@
               <w:lang w:eastAsia="en-GB"/>
             </w:rPr>
           </w:pPr>
-          <w:hyperlink w:anchor="_Toc223987290" w:history="1">
+          <w:hyperlink w:anchor="_Toc224050594" w:history="1">
             <w:r>
               <w:rPr>
                 <w:rStyle w:val="Hyperlink"/>
@@ -1775,7 +1775,7 @@
                 <w:noProof/>
                 <w:webHidden/>
               </w:rPr>
-              <w:instrText xml:space="preserve"> PAGEREF _Toc223987290 \h </w:instrText>
+              <w:instrText xml:space="preserve"> PAGEREF _Toc224050594 \h </w:instrText>
             </w:r>
             <w:r>
               <w:rPr>
@@ -1820,7 +1820,7 @@
               <w:lang w:eastAsia="en-GB"/>
             </w:rPr>
           </w:pPr>
-          <w:hyperlink w:anchor="_Toc223987291" w:history="1">
+          <w:hyperlink w:anchor="_Toc224050595" w:history="1">
             <w:r>
               <w:rPr>
                 <w:rStyle w:val="Hyperlink"/>
@@ -1847,7 +1847,7 @@
                 <w:noProof/>
                 <w:webHidden/>
               </w:rPr>
-              <w:instrText xml:space="preserve"> PAGEREF _Toc223987291 \h </w:instrText>
+              <w:instrText xml:space="preserve"> PAGEREF _Toc224050595 \h </w:instrText>
             </w:r>
             <w:r>
               <w:rPr>
@@ -1892,7 +1892,7 @@
               <w:lang w:eastAsia="en-GB"/>
             </w:rPr>
           </w:pPr>
-          <w:hyperlink w:anchor="_Toc223987292" w:history="1">
+          <w:hyperlink w:anchor="_Toc224050596" w:history="1">
             <w:r>
               <w:rPr>
                 <w:rStyle w:val="Hyperlink"/>
@@ -1919,7 +1919,7 @@
                 <w:noProof/>
                 <w:webHidden/>
               </w:rPr>
-              <w:instrText xml:space="preserve"> PAGEREF _Toc223987292 \h </w:instrText>
+              <w:instrText xml:space="preserve"> PAGEREF _Toc224050596 \h </w:instrText>
             </w:r>
             <w:r>
               <w:rPr>
@@ -1964,7 +1964,7 @@
               <w:lang w:eastAsia="en-GB"/>
             </w:rPr>
           </w:pPr>
-          <w:hyperlink w:anchor="_Toc223987293" w:history="1">
+          <w:hyperlink w:anchor="_Toc224050597" w:history="1">
             <w:r>
               <w:rPr>
                 <w:rStyle w:val="Hyperlink"/>
@@ -1991,7 +1991,7 @@
                 <w:noProof/>
                 <w:webHidden/>
               </w:rPr>
-              <w:instrText xml:space="preserve"> PAGEREF _Toc223987293 \h </w:instrText>
+              <w:instrText xml:space="preserve"> PAGEREF _Toc224050597 \h </w:instrText>
             </w:r>
             <w:r>
               <w:rPr>
@@ -2036,7 +2036,7 @@
               <w:lang w:eastAsia="en-GB"/>
             </w:rPr>
           </w:pPr>
-          <w:hyperlink w:anchor="_Toc223987294" w:history="1">
+          <w:hyperlink w:anchor="_Toc224050598" w:history="1">
             <w:r>
               <w:rPr>
                 <w:rStyle w:val="Hyperlink"/>
@@ -2063,7 +2063,7 @@
                 <w:noProof/>
                 <w:webHidden/>
               </w:rPr>
-              <w:instrText xml:space="preserve"> PAGEREF _Toc223987294 \h </w:instrText>
+              <w:instrText xml:space="preserve"> PAGEREF _Toc224050598 \h </w:instrText>
             </w:r>
             <w:r>
               <w:rPr>
@@ -2108,7 +2108,7 @@
               <w:lang w:eastAsia="en-GB"/>
             </w:rPr>
           </w:pPr>
-          <w:hyperlink w:anchor="_Toc223987295" w:history="1">
+          <w:hyperlink w:anchor="_Toc224050599" w:history="1">
             <w:r>
               <w:rPr>
                 <w:rStyle w:val="Hyperlink"/>
@@ -2135,7 +2135,7 @@
                 <w:noProof/>
                 <w:webHidden/>
               </w:rPr>
-              <w:instrText xml:space="preserve"> PAGEREF _Toc223987295 \h </w:instrText>
+              <w:instrText xml:space="preserve"> PAGEREF _Toc224050599 \h </w:instrText>
             </w:r>
             <w:r>
               <w:rPr>
@@ -2180,7 +2180,7 @@
               <w:lang w:eastAsia="en-GB"/>
             </w:rPr>
           </w:pPr>
-          <w:hyperlink w:anchor="_Toc223987296" w:history="1">
+          <w:hyperlink w:anchor="_Toc224050600" w:history="1">
             <w:r>
               <w:rPr>
                 <w:rStyle w:val="Hyperlink"/>
@@ -2207,7 +2207,7 @@
                 <w:noProof/>
                 <w:webHidden/>
               </w:rPr>
-              <w:instrText xml:space="preserve"> PAGEREF _Toc223987296 \h </w:instrText>
+              <w:instrText xml:space="preserve"> PAGEREF _Toc224050600 \h </w:instrText>
             </w:r>
             <w:r>
               <w:rPr>
@@ -2252,7 +2252,7 @@
               <w:lang w:eastAsia="en-GB"/>
             </w:rPr>
           </w:pPr>
-          <w:hyperlink w:anchor="_Toc223987297" w:history="1">
+          <w:hyperlink w:anchor="_Toc224050601" w:history="1">
             <w:r>
               <w:rPr>
                 <w:rStyle w:val="Hyperlink"/>
@@ -2279,7 +2279,7 @@
                 <w:noProof/>
                 <w:webHidden/>
               </w:rPr>
-              <w:instrText xml:space="preserve"> PAGEREF _Toc223987297 \h </w:instrText>
+              <w:instrText xml:space="preserve"> PAGEREF _Toc224050601 \h </w:instrText>
             </w:r>
             <w:r>
               <w:rPr>
@@ -2324,7 +2324,7 @@
               <w:lang w:eastAsia="en-GB"/>
             </w:rPr>
           </w:pPr>
-          <w:hyperlink w:anchor="_Toc223987298" w:history="1">
+          <w:hyperlink w:anchor="_Toc224050602" w:history="1">
             <w:r>
               <w:rPr>
                 <w:rStyle w:val="Hyperlink"/>
@@ -2351,7 +2351,7 @@
                 <w:noProof/>
                 <w:webHidden/>
               </w:rPr>
-              <w:instrText xml:space="preserve"> PAGEREF _Toc223987298 \h </w:instrText>
+              <w:instrText xml:space="preserve"> PAGEREF _Toc224050602 \h </w:instrText>
             </w:r>
             <w:r>
               <w:rPr>
@@ -2396,7 +2396,7 @@
               <w:lang w:eastAsia="en-GB"/>
             </w:rPr>
           </w:pPr>
-          <w:hyperlink w:anchor="_Toc223987299" w:history="1">
+          <w:hyperlink w:anchor="_Toc224050603" w:history="1">
             <w:r>
               <w:rPr>
                 <w:rStyle w:val="Hyperlink"/>
@@ -2423,7 +2423,7 @@
                 <w:noProof/>
                 <w:webHidden/>
               </w:rPr>
-              <w:instrText xml:space="preserve"> PAGEREF _Toc223987299 \h </w:instrText>
+              <w:instrText xml:space="preserve"> PAGEREF _Toc224050603 \h </w:instrText>
             </w:r>
             <w:r>
               <w:rPr>
@@ -2468,7 +2468,7 @@
               <w:lang w:eastAsia="en-GB"/>
             </w:rPr>
           </w:pPr>
-          <w:hyperlink w:anchor="_Toc223987300" w:history="1">
+          <w:hyperlink w:anchor="_Toc224050604" w:history="1">
             <w:r>
               <w:rPr>
                 <w:rStyle w:val="Hyperlink"/>
@@ -2495,7 +2495,7 @@
                 <w:noProof/>
                 <w:webHidden/>
               </w:rPr>
-              <w:instrText xml:space="preserve"> PAGEREF _Toc223987300 \h </w:instrText>
+              <w:instrText xml:space="preserve"> PAGEREF _Toc224050604 \h </w:instrText>
             </w:r>
             <w:r>
               <w:rPr>
@@ -2515,7 +2515,7 @@
                 <w:noProof/>
                 <w:webHidden/>
               </w:rPr>
-              <w:t>19</w:t>
+              <w:t>20</w:t>
             </w:r>
             <w:r>
               <w:rPr>
@@ -2540,7 +2540,7 @@
               <w:lang w:eastAsia="en-GB"/>
             </w:rPr>
           </w:pPr>
-          <w:hyperlink w:anchor="_Toc223987301" w:history="1">
+          <w:hyperlink w:anchor="_Toc224050605" w:history="1">
             <w:r>
               <w:rPr>
                 <w:rStyle w:val="Hyperlink"/>
@@ -2567,7 +2567,7 @@
                 <w:noProof/>
                 <w:webHidden/>
               </w:rPr>
-              <w:instrText xml:space="preserve"> PAGEREF _Toc223987301 \h </w:instrText>
+              <w:instrText xml:space="preserve"> PAGEREF _Toc224050605 \h </w:instrText>
             </w:r>
             <w:r>
               <w:rPr>
@@ -2612,7 +2612,7 @@
               <w:lang w:eastAsia="en-GB"/>
             </w:rPr>
           </w:pPr>
-          <w:hyperlink w:anchor="_Toc223987302" w:history="1">
+          <w:hyperlink w:anchor="_Toc224050606" w:history="1">
             <w:r>
               <w:rPr>
                 <w:rStyle w:val="Hyperlink"/>
@@ -2639,7 +2639,7 @@
                 <w:noProof/>
                 <w:webHidden/>
               </w:rPr>
-              <w:instrText xml:space="preserve"> PAGEREF _Toc223987302 \h </w:instrText>
+              <w:instrText xml:space="preserve"> PAGEREF _Toc224050606 \h </w:instrText>
             </w:r>
             <w:r>
               <w:rPr>
@@ -2684,7 +2684,7 @@
               <w:lang w:eastAsia="en-GB"/>
             </w:rPr>
           </w:pPr>
-          <w:hyperlink w:anchor="_Toc223987303" w:history="1">
+          <w:hyperlink w:anchor="_Toc224050607" w:history="1">
             <w:r>
               <w:rPr>
                 <w:rStyle w:val="Hyperlink"/>
@@ -2711,7 +2711,7 @@
                 <w:noProof/>
                 <w:webHidden/>
               </w:rPr>
-              <w:instrText xml:space="preserve"> PAGEREF _Toc223987303 \h </w:instrText>
+              <w:instrText xml:space="preserve"> PAGEREF _Toc224050607 \h </w:instrText>
             </w:r>
             <w:r>
               <w:rPr>
@@ -2756,7 +2756,7 @@
               <w:lang w:eastAsia="en-GB"/>
             </w:rPr>
           </w:pPr>
-          <w:hyperlink w:anchor="_Toc223987304" w:history="1">
+          <w:hyperlink w:anchor="_Toc224050608" w:history="1">
             <w:r>
               <w:rPr>
                 <w:rStyle w:val="Hyperlink"/>
@@ -2783,7 +2783,7 @@
                 <w:noProof/>
                 <w:webHidden/>
               </w:rPr>
-              <w:instrText xml:space="preserve"> PAGEREF _Toc223987304 \h </w:instrText>
+              <w:instrText xml:space="preserve"> PAGEREF _Toc224050608 \h </w:instrText>
             </w:r>
             <w:r>
               <w:rPr>
@@ -2828,7 +2828,7 @@
               <w:lang w:eastAsia="en-GB"/>
             </w:rPr>
           </w:pPr>
-          <w:hyperlink w:anchor="_Toc223987305" w:history="1">
+          <w:hyperlink w:anchor="_Toc224050609" w:history="1">
             <w:r>
               <w:rPr>
                 <w:rStyle w:val="Hyperlink"/>
@@ -2855,7 +2855,7 @@
                 <w:noProof/>
                 <w:webHidden/>
               </w:rPr>
-              <w:instrText xml:space="preserve"> PAGEREF _Toc223987305 \h </w:instrText>
+              <w:instrText xml:space="preserve"> PAGEREF _Toc224050609 \h </w:instrText>
             </w:r>
             <w:r>
               <w:rPr>
@@ -2900,7 +2900,7 @@
               <w:lang w:eastAsia="en-GB"/>
             </w:rPr>
           </w:pPr>
-          <w:hyperlink w:anchor="_Toc223987306" w:history="1">
+          <w:hyperlink w:anchor="_Toc224050610" w:history="1">
             <w:r>
               <w:rPr>
                 <w:rStyle w:val="Hyperlink"/>
@@ -2927,7 +2927,7 @@
                 <w:noProof/>
                 <w:webHidden/>
               </w:rPr>
-              <w:instrText xml:space="preserve"> PAGEREF _Toc223987306 \h </w:instrText>
+              <w:instrText xml:space="preserve"> PAGEREF _Toc224050610 \h </w:instrText>
             </w:r>
             <w:r>
               <w:rPr>
@@ -2972,7 +2972,7 @@
               <w:lang w:eastAsia="en-GB"/>
             </w:rPr>
           </w:pPr>
-          <w:hyperlink w:anchor="_Toc223987307" w:history="1">
+          <w:hyperlink w:anchor="_Toc224050611" w:history="1">
             <w:r>
               <w:rPr>
                 <w:rStyle w:val="Hyperlink"/>
@@ -2999,7 +2999,7 @@
                 <w:noProof/>
                 <w:webHidden/>
               </w:rPr>
-              <w:instrText xml:space="preserve"> PAGEREF _Toc223987307 \h </w:instrText>
+              <w:instrText xml:space="preserve"> PAGEREF _Toc224050611 \h </w:instrText>
             </w:r>
             <w:r>
               <w:rPr>
@@ -3044,7 +3044,7 @@
               <w:lang w:eastAsia="en-GB"/>
             </w:rPr>
           </w:pPr>
-          <w:hyperlink w:anchor="_Toc223987308" w:history="1">
+          <w:hyperlink w:anchor="_Toc224050612" w:history="1">
             <w:r>
               <w:rPr>
                 <w:rStyle w:val="Hyperlink"/>
@@ -3071,7 +3071,7 @@
                 <w:noProof/>
                 <w:webHidden/>
               </w:rPr>
-              <w:instrText xml:space="preserve"> PAGEREF _Toc223987308 \h </w:instrText>
+              <w:instrText xml:space="preserve"> PAGEREF _Toc224050612 \h </w:instrText>
             </w:r>
             <w:r>
               <w:rPr>
@@ -3116,7 +3116,7 @@
               <w:lang w:eastAsia="en-GB"/>
             </w:rPr>
           </w:pPr>
-          <w:hyperlink w:anchor="_Toc223987309" w:history="1">
+          <w:hyperlink w:anchor="_Toc224050613" w:history="1">
             <w:r>
               <w:rPr>
                 <w:rStyle w:val="Hyperlink"/>
@@ -3143,7 +3143,7 @@
                 <w:noProof/>
                 <w:webHidden/>
               </w:rPr>
-              <w:instrText xml:space="preserve"> PAGEREF _Toc223987309 \h </w:instrText>
+              <w:instrText xml:space="preserve"> PAGEREF _Toc224050613 \h </w:instrText>
             </w:r>
             <w:r>
               <w:rPr>
@@ -3188,7 +3188,7 @@
               <w:lang w:eastAsia="en-GB"/>
             </w:rPr>
           </w:pPr>
-          <w:hyperlink w:anchor="_Toc223987310" w:history="1">
+          <w:hyperlink w:anchor="_Toc224050614" w:history="1">
             <w:r>
               <w:rPr>
                 <w:rStyle w:val="Hyperlink"/>
@@ -3215,7 +3215,7 @@
                 <w:noProof/>
                 <w:webHidden/>
               </w:rPr>
-              <w:instrText xml:space="preserve"> PAGEREF _Toc223987310 \h </w:instrText>
+              <w:instrText xml:space="preserve"> PAGEREF _Toc224050614 \h </w:instrText>
             </w:r>
             <w:r>
               <w:rPr>
@@ -3260,7 +3260,7 @@
               <w:lang w:eastAsia="en-GB"/>
             </w:rPr>
           </w:pPr>
-          <w:hyperlink w:anchor="_Toc223987311" w:history="1">
+          <w:hyperlink w:anchor="_Toc224050615" w:history="1">
             <w:r>
               <w:rPr>
                 <w:rStyle w:val="Hyperlink"/>
@@ -3287,7 +3287,7 @@
                 <w:noProof/>
                 <w:webHidden/>
               </w:rPr>
-              <w:instrText xml:space="preserve"> PAGEREF _Toc223987311 \h </w:instrText>
+              <w:instrText xml:space="preserve"> PAGEREF _Toc224050615 \h </w:instrText>
             </w:r>
             <w:r>
               <w:rPr>
@@ -3332,7 +3332,7 @@
               <w:lang w:eastAsia="en-GB"/>
             </w:rPr>
           </w:pPr>
-          <w:hyperlink w:anchor="_Toc223987312" w:history="1">
+          <w:hyperlink w:anchor="_Toc224050616" w:history="1">
             <w:r>
               <w:rPr>
                 <w:rStyle w:val="Hyperlink"/>
@@ -3359,7 +3359,7 @@
                 <w:noProof/>
                 <w:webHidden/>
               </w:rPr>
-              <w:instrText xml:space="preserve"> PAGEREF _Toc223987312 \h </w:instrText>
+              <w:instrText xml:space="preserve"> PAGEREF _Toc224050616 \h </w:instrText>
             </w:r>
             <w:r>
               <w:rPr>
@@ -3404,7 +3404,7 @@
               <w:lang w:eastAsia="en-GB"/>
             </w:rPr>
           </w:pPr>
-          <w:hyperlink w:anchor="_Toc223987313" w:history="1">
+          <w:hyperlink w:anchor="_Toc224050617" w:history="1">
             <w:r>
               <w:rPr>
                 <w:rStyle w:val="Hyperlink"/>
@@ -3431,7 +3431,7 @@
                 <w:noProof/>
                 <w:webHidden/>
               </w:rPr>
-              <w:instrText xml:space="preserve"> PAGEREF _Toc223987313 \h </w:instrText>
+              <w:instrText xml:space="preserve"> PAGEREF _Toc224050617 \h </w:instrText>
             </w:r>
             <w:r>
               <w:rPr>
@@ -3476,7 +3476,7 @@
               <w:lang w:eastAsia="en-GB"/>
             </w:rPr>
           </w:pPr>
-          <w:hyperlink w:anchor="_Toc223987314" w:history="1">
+          <w:hyperlink w:anchor="_Toc224050618" w:history="1">
             <w:r>
               <w:rPr>
                 <w:rStyle w:val="Hyperlink"/>
@@ -3503,7 +3503,7 @@
                 <w:noProof/>
                 <w:webHidden/>
               </w:rPr>
-              <w:instrText xml:space="preserve"> PAGEREF _Toc223987314 \h </w:instrText>
+              <w:instrText xml:space="preserve"> PAGEREF _Toc224050618 \h </w:instrText>
             </w:r>
             <w:r>
               <w:rPr>
@@ -3548,7 +3548,7 @@
               <w:lang w:eastAsia="en-GB"/>
             </w:rPr>
           </w:pPr>
-          <w:hyperlink w:anchor="_Toc223987315" w:history="1">
+          <w:hyperlink w:anchor="_Toc224050619" w:history="1">
             <w:r>
               <w:rPr>
                 <w:rStyle w:val="Hyperlink"/>
@@ -3575,7 +3575,7 @@
                 <w:noProof/>
                 <w:webHidden/>
               </w:rPr>
-              <w:instrText xml:space="preserve"> PAGEREF _Toc223987315 \h </w:instrText>
+              <w:instrText xml:space="preserve"> PAGEREF _Toc224050619 \h </w:instrText>
             </w:r>
             <w:r>
               <w:rPr>
@@ -3620,7 +3620,7 @@
               <w:lang w:eastAsia="en-GB"/>
             </w:rPr>
           </w:pPr>
-          <w:hyperlink w:anchor="_Toc223987316" w:history="1">
+          <w:hyperlink w:anchor="_Toc224050620" w:history="1">
             <w:r>
               <w:rPr>
                 <w:rStyle w:val="Hyperlink"/>
@@ -3647,7 +3647,7 @@
                 <w:noProof/>
                 <w:webHidden/>
               </w:rPr>
-              <w:instrText xml:space="preserve"> PAGEREF _Toc223987316 \h </w:instrText>
+              <w:instrText xml:space="preserve"> PAGEREF _Toc224050620 \h </w:instrText>
             </w:r>
             <w:r>
               <w:rPr>
@@ -3692,7 +3692,7 @@
               <w:lang w:eastAsia="en-GB"/>
             </w:rPr>
           </w:pPr>
-          <w:hyperlink w:anchor="_Toc223987317" w:history="1">
+          <w:hyperlink w:anchor="_Toc224050621" w:history="1">
             <w:r>
               <w:rPr>
                 <w:rStyle w:val="Hyperlink"/>
@@ -3719,7 +3719,7 @@
                 <w:noProof/>
                 <w:webHidden/>
               </w:rPr>
-              <w:instrText xml:space="preserve"> PAGEREF _Toc223987317 \h </w:instrText>
+              <w:instrText xml:space="preserve"> PAGEREF _Toc224050621 \h </w:instrText>
             </w:r>
             <w:r>
               <w:rPr>
@@ -3764,7 +3764,7 @@
               <w:lang w:eastAsia="en-GB"/>
             </w:rPr>
           </w:pPr>
-          <w:hyperlink w:anchor="_Toc223987318" w:history="1">
+          <w:hyperlink w:anchor="_Toc224050622" w:history="1">
             <w:r>
               <w:rPr>
                 <w:rStyle w:val="Hyperlink"/>
@@ -3791,7 +3791,7 @@
                 <w:noProof/>
                 <w:webHidden/>
               </w:rPr>
-              <w:instrText xml:space="preserve"> PAGEREF _Toc223987318 \h </w:instrText>
+              <w:instrText xml:space="preserve"> PAGEREF _Toc224050622 \h </w:instrText>
             </w:r>
             <w:r>
               <w:rPr>
@@ -3836,7 +3836,7 @@
               <w:lang w:eastAsia="en-GB"/>
             </w:rPr>
           </w:pPr>
-          <w:hyperlink w:anchor="_Toc223987319" w:history="1">
+          <w:hyperlink w:anchor="_Toc224050623" w:history="1">
             <w:r>
               <w:rPr>
                 <w:rStyle w:val="Hyperlink"/>
@@ -3863,7 +3863,7 @@
                 <w:noProof/>
                 <w:webHidden/>
               </w:rPr>
-              <w:instrText xml:space="preserve"> PAGEREF _Toc223987319 \h </w:instrText>
+              <w:instrText xml:space="preserve"> PAGEREF _Toc224050623 \h </w:instrText>
             </w:r>
             <w:r>
               <w:rPr>
@@ -3908,7 +3908,7 @@
               <w:lang w:eastAsia="en-GB"/>
             </w:rPr>
           </w:pPr>
-          <w:hyperlink w:anchor="_Toc223987320" w:history="1">
+          <w:hyperlink w:anchor="_Toc224050624" w:history="1">
             <w:r>
               <w:rPr>
                 <w:rStyle w:val="Hyperlink"/>
@@ -3935,7 +3935,7 @@
                 <w:noProof/>
                 <w:webHidden/>
               </w:rPr>
-              <w:instrText xml:space="preserve"> PAGEREF _Toc223987320 \h </w:instrText>
+              <w:instrText xml:space="preserve"> PAGEREF _Toc224050624 \h </w:instrText>
             </w:r>
             <w:r>
               <w:rPr>
@@ -3980,7 +3980,7 @@
               <w:lang w:eastAsia="en-GB"/>
             </w:rPr>
           </w:pPr>
-          <w:hyperlink w:anchor="_Toc223987321" w:history="1">
+          <w:hyperlink w:anchor="_Toc224050625" w:history="1">
             <w:r>
               <w:rPr>
                 <w:rStyle w:val="Hyperlink"/>
@@ -4007,7 +4007,7 @@
                 <w:noProof/>
                 <w:webHidden/>
               </w:rPr>
-              <w:instrText xml:space="preserve"> PAGEREF _Toc223987321 \h </w:instrText>
+              <w:instrText xml:space="preserve"> PAGEREF _Toc224050625 \h </w:instrText>
             </w:r>
             <w:r>
               <w:rPr>
@@ -4052,7 +4052,7 @@
               <w:lang w:eastAsia="en-GB"/>
             </w:rPr>
           </w:pPr>
-          <w:hyperlink w:anchor="_Toc223987322" w:history="1">
+          <w:hyperlink w:anchor="_Toc224050626" w:history="1">
             <w:r>
               <w:rPr>
                 <w:rStyle w:val="Hyperlink"/>
@@ -4079,7 +4079,7 @@
                 <w:noProof/>
                 <w:webHidden/>
               </w:rPr>
-              <w:instrText xml:space="preserve"> PAGEREF _Toc223987322 \h </w:instrText>
+              <w:instrText xml:space="preserve"> PAGEREF _Toc224050626 \h </w:instrText>
             </w:r>
             <w:r>
               <w:rPr>
@@ -4124,7 +4124,7 @@
               <w:lang w:eastAsia="en-GB"/>
             </w:rPr>
           </w:pPr>
-          <w:hyperlink w:anchor="_Toc223987323" w:history="1">
+          <w:hyperlink w:anchor="_Toc224050627" w:history="1">
             <w:r>
               <w:rPr>
                 <w:rStyle w:val="Hyperlink"/>
@@ -4151,7 +4151,7 @@
                 <w:noProof/>
                 <w:webHidden/>
               </w:rPr>
-              <w:instrText xml:space="preserve"> PAGEREF _Toc223987323 \h </w:instrText>
+              <w:instrText xml:space="preserve"> PAGEREF _Toc224050627 \h </w:instrText>
             </w:r>
             <w:r>
               <w:rPr>
@@ -4196,7 +4196,7 @@
               <w:lang w:eastAsia="en-GB"/>
             </w:rPr>
           </w:pPr>
-          <w:hyperlink w:anchor="_Toc223987324" w:history="1">
+          <w:hyperlink w:anchor="_Toc224050628" w:history="1">
             <w:r>
               <w:rPr>
                 <w:rStyle w:val="Hyperlink"/>
@@ -4223,7 +4223,7 @@
                 <w:noProof/>
                 <w:webHidden/>
               </w:rPr>
-              <w:instrText xml:space="preserve"> PAGEREF _Toc223987324 \h </w:instrText>
+              <w:instrText xml:space="preserve"> PAGEREF _Toc224050628 \h </w:instrText>
             </w:r>
             <w:r>
               <w:rPr>
@@ -4268,7 +4268,7 @@
               <w:lang w:eastAsia="en-GB"/>
             </w:rPr>
           </w:pPr>
-          <w:hyperlink w:anchor="_Toc223987325" w:history="1">
+          <w:hyperlink w:anchor="_Toc224050629" w:history="1">
             <w:r>
               <w:rPr>
                 <w:rStyle w:val="Hyperlink"/>
@@ -4295,7 +4295,7 @@
                 <w:noProof/>
                 <w:webHidden/>
               </w:rPr>
-              <w:instrText xml:space="preserve"> PAGEREF _Toc223987325 \h </w:instrText>
+              <w:instrText xml:space="preserve"> PAGEREF _Toc224050629 \h </w:instrText>
             </w:r>
             <w:r>
               <w:rPr>
@@ -4315,7 +4315,7 @@
                 <w:noProof/>
                 <w:webHidden/>
               </w:rPr>
-              <w:t>27</w:t>
+              <w:t>28</w:t>
             </w:r>
             <w:r>
               <w:rPr>
@@ -4340,7 +4340,7 @@
               <w:lang w:eastAsia="en-GB"/>
             </w:rPr>
           </w:pPr>
-          <w:hyperlink w:anchor="_Toc223987326" w:history="1">
+          <w:hyperlink w:anchor="_Toc224050630" w:history="1">
             <w:r>
               <w:rPr>
                 <w:rStyle w:val="Hyperlink"/>
@@ -4367,7 +4367,7 @@
                 <w:noProof/>
                 <w:webHidden/>
               </w:rPr>
-              <w:instrText xml:space="preserve"> PAGEREF _Toc223987326 \h </w:instrText>
+              <w:instrText xml:space="preserve"> PAGEREF _Toc224050630 \h </w:instrText>
             </w:r>
             <w:r>
               <w:rPr>
@@ -4412,7 +4412,7 @@
               <w:lang w:eastAsia="en-GB"/>
             </w:rPr>
           </w:pPr>
-          <w:hyperlink w:anchor="_Toc223987327" w:history="1">
+          <w:hyperlink w:anchor="_Toc224050631" w:history="1">
             <w:r>
               <w:rPr>
                 <w:rStyle w:val="Hyperlink"/>
@@ -4439,7 +4439,7 @@
                 <w:noProof/>
                 <w:webHidden/>
               </w:rPr>
-              <w:instrText xml:space="preserve"> PAGEREF _Toc223987327 \h </w:instrText>
+              <w:instrText xml:space="preserve"> PAGEREF _Toc224050631 \h </w:instrText>
             </w:r>
             <w:r>
               <w:rPr>
@@ -4484,7 +4484,7 @@
               <w:lang w:eastAsia="en-GB"/>
             </w:rPr>
           </w:pPr>
-          <w:hyperlink w:anchor="_Toc223987328" w:history="1">
+          <w:hyperlink w:anchor="_Toc224050632" w:history="1">
             <w:r>
               <w:rPr>
                 <w:rStyle w:val="Hyperlink"/>
@@ -4511,7 +4511,7 @@
                 <w:noProof/>
                 <w:webHidden/>
               </w:rPr>
-              <w:instrText xml:space="preserve"> PAGEREF _Toc223987328 \h </w:instrText>
+              <w:instrText xml:space="preserve"> PAGEREF _Toc224050632 \h </w:instrText>
             </w:r>
             <w:r>
               <w:rPr>
@@ -4531,7 +4531,7 @@
                 <w:noProof/>
                 <w:webHidden/>
               </w:rPr>
-              <w:t>28</w:t>
+              <w:t>29</w:t>
             </w:r>
             <w:r>
               <w:rPr>
@@ -4556,7 +4556,7 @@
               <w:lang w:eastAsia="en-GB"/>
             </w:rPr>
           </w:pPr>
-          <w:hyperlink w:anchor="_Toc223987329" w:history="1">
+          <w:hyperlink w:anchor="_Toc224050633" w:history="1">
             <w:r>
               <w:rPr>
                 <w:rStyle w:val="Hyperlink"/>
@@ -4583,7 +4583,7 @@
                 <w:noProof/>
                 <w:webHidden/>
               </w:rPr>
-              <w:instrText xml:space="preserve"> PAGEREF _Toc223987329 \h </w:instrText>
+              <w:instrText xml:space="preserve"> PAGEREF _Toc224050633 \h </w:instrText>
             </w:r>
             <w:r>
               <w:rPr>
@@ -4628,7 +4628,7 @@
               <w:lang w:eastAsia="en-GB"/>
             </w:rPr>
           </w:pPr>
-          <w:hyperlink w:anchor="_Toc223987330" w:history="1">
+          <w:hyperlink w:anchor="_Toc224050634" w:history="1">
             <w:r>
               <w:rPr>
                 <w:rStyle w:val="Hyperlink"/>
@@ -4655,7 +4655,7 @@
                 <w:noProof/>
                 <w:webHidden/>
               </w:rPr>
-              <w:instrText xml:space="preserve"> PAGEREF _Toc223987330 \h </w:instrText>
+              <w:instrText xml:space="preserve"> PAGEREF _Toc224050634 \h </w:instrText>
             </w:r>
             <w:r>
               <w:rPr>
@@ -4700,7 +4700,7 @@
               <w:lang w:eastAsia="en-GB"/>
             </w:rPr>
           </w:pPr>
-          <w:hyperlink w:anchor="_Toc223987331" w:history="1">
+          <w:hyperlink w:anchor="_Toc224050635" w:history="1">
             <w:r>
               <w:rPr>
                 <w:rStyle w:val="Hyperlink"/>
@@ -4727,7 +4727,7 @@
                 <w:noProof/>
                 <w:webHidden/>
               </w:rPr>
-              <w:instrText xml:space="preserve"> PAGEREF _Toc223987331 \h </w:instrText>
+              <w:instrText xml:space="preserve"> PAGEREF _Toc224050635 \h </w:instrText>
             </w:r>
             <w:r>
               <w:rPr>
@@ -4772,7 +4772,7 @@
               <w:lang w:eastAsia="en-GB"/>
             </w:rPr>
           </w:pPr>
-          <w:hyperlink w:anchor="_Toc223987332" w:history="1">
+          <w:hyperlink w:anchor="_Toc224050636" w:history="1">
             <w:r>
               <w:rPr>
                 <w:rStyle w:val="Hyperlink"/>
@@ -4799,7 +4799,7 @@
                 <w:noProof/>
                 <w:webHidden/>
               </w:rPr>
-              <w:instrText xml:space="preserve"> PAGEREF _Toc223987332 \h </w:instrText>
+              <w:instrText xml:space="preserve"> PAGEREF _Toc224050636 \h </w:instrText>
             </w:r>
             <w:r>
               <w:rPr>
@@ -4819,7 +4819,7 @@
                 <w:noProof/>
                 <w:webHidden/>
               </w:rPr>
-              <w:t>31</w:t>
+              <w:t>32</w:t>
             </w:r>
             <w:r>
               <w:rPr>
@@ -4844,7 +4844,7 @@
               <w:lang w:eastAsia="en-GB"/>
             </w:rPr>
           </w:pPr>
-          <w:hyperlink w:anchor="_Toc223987333" w:history="1">
+          <w:hyperlink w:anchor="_Toc224050637" w:history="1">
             <w:r>
               <w:rPr>
                 <w:rStyle w:val="Hyperlink"/>
@@ -4871,7 +4871,7 @@
                 <w:noProof/>
                 <w:webHidden/>
               </w:rPr>
-              <w:instrText xml:space="preserve"> PAGEREF _Toc223987333 \h </w:instrText>
+              <w:instrText xml:space="preserve"> PAGEREF _Toc224050637 \h </w:instrText>
             </w:r>
             <w:r>
               <w:rPr>
@@ -4891,7 +4891,7 @@
                 <w:noProof/>
                 <w:webHidden/>
               </w:rPr>
-              <w:t>32</w:t>
+              <w:t>33</w:t>
             </w:r>
             <w:r>
               <w:rPr>
@@ -4916,7 +4916,7 @@
               <w:lang w:eastAsia="en-GB"/>
             </w:rPr>
           </w:pPr>
-          <w:hyperlink w:anchor="_Toc223987334" w:history="1">
+          <w:hyperlink w:anchor="_Toc224050638" w:history="1">
             <w:r>
               <w:rPr>
                 <w:rStyle w:val="Hyperlink"/>
@@ -4943,7 +4943,7 @@
                 <w:noProof/>
                 <w:webHidden/>
               </w:rPr>
-              <w:instrText xml:space="preserve"> PAGEREF _Toc223987334 \h </w:instrText>
+              <w:instrText xml:space="preserve"> PAGEREF _Toc224050638 \h </w:instrText>
             </w:r>
             <w:r>
               <w:rPr>
@@ -4963,7 +4963,7 @@
                 <w:noProof/>
                 <w:webHidden/>
               </w:rPr>
-              <w:t>32</w:t>
+              <w:t>33</w:t>
             </w:r>
             <w:r>
               <w:rPr>
@@ -5004,7 +5004,7 @@
       <w:pPr>
         <w:pStyle w:val="Heading1"/>
       </w:pPr>
-      <w:bookmarkStart w:id="0" w:name="_Toc223987269"/>
+      <w:bookmarkStart w:id="0" w:name="_Toc224050573"/>
       <w:r>
         <w:lastRenderedPageBreak/>
         <w:t>List of Acro</w:t>
@@ -5281,7 +5281,7 @@
       <w:pPr>
         <w:pStyle w:val="Heading1"/>
       </w:pPr>
-      <w:bookmarkStart w:id="1" w:name="_Toc223987270"/>
+      <w:bookmarkStart w:id="1" w:name="_Toc224050574"/>
       <w:r>
         <w:lastRenderedPageBreak/>
         <w:t>Abstract</w:t>
@@ -5481,7 +5481,7 @@
       <w:pPr>
         <w:pStyle w:val="Heading1"/>
       </w:pPr>
-      <w:bookmarkStart w:id="2" w:name="_Toc223987271"/>
+      <w:bookmarkStart w:id="2" w:name="_Toc224050575"/>
       <w:r>
         <w:lastRenderedPageBreak/>
         <w:t>Introduction</w:t>
@@ -6064,7 +6064,7 @@
       <w:pPr>
         <w:pStyle w:val="Heading1"/>
       </w:pPr>
-      <w:bookmarkStart w:id="3" w:name="_Toc223987272"/>
+      <w:bookmarkStart w:id="3" w:name="_Toc224050576"/>
       <w:r>
         <w:lastRenderedPageBreak/>
         <w:t>Project Aim</w:t>
@@ -6114,7 +6114,7 @@
           <w:rFonts w:asciiTheme="minorHAnsi" w:hAnsiTheme="minorHAnsi"/>
         </w:rPr>
       </w:pPr>
-      <w:bookmarkStart w:id="4" w:name="_Toc223987273"/>
+      <w:bookmarkStart w:id="4" w:name="_Toc224050577"/>
       <w:r>
         <w:rPr>
           <w:rFonts w:asciiTheme="minorHAnsi" w:hAnsiTheme="minorHAnsi"/>
@@ -6401,7 +6401,7 @@
       <w:pPr>
         <w:pStyle w:val="Heading1"/>
       </w:pPr>
-      <w:bookmarkStart w:id="5" w:name="_Toc223987274"/>
+      <w:bookmarkStart w:id="5" w:name="_Toc224050578"/>
       <w:r>
         <w:lastRenderedPageBreak/>
         <w:t>Project Planning</w:t>
@@ -6782,7 +6782,7 @@
           <w:rFonts w:asciiTheme="minorHAnsi" w:hAnsiTheme="minorHAnsi"/>
         </w:rPr>
       </w:pPr>
-      <w:bookmarkStart w:id="6" w:name="_Toc223987275"/>
+      <w:bookmarkStart w:id="6" w:name="_Toc224050579"/>
       <w:r>
         <w:rPr>
           <w:rFonts w:asciiTheme="minorHAnsi" w:hAnsiTheme="minorHAnsi"/>
@@ -6984,7 +6984,7 @@
           <w:rFonts w:asciiTheme="minorHAnsi" w:hAnsiTheme="minorHAnsi"/>
         </w:rPr>
       </w:pPr>
-      <w:bookmarkStart w:id="7" w:name="_Toc223987276"/>
+      <w:bookmarkStart w:id="7" w:name="_Toc224050580"/>
       <w:r>
         <w:rPr>
           <w:rFonts w:asciiTheme="minorHAnsi" w:hAnsiTheme="minorHAnsi"/>
@@ -7223,7 +7223,21 @@
         <w:rPr>
           <w:rFonts w:cs="Arial"/>
         </w:rPr>
-        <w:t>Clear on screen prompts to guide and support users that aren’t familiar with VR equipment</w:t>
+        <w:t xml:space="preserve">Clear </w:t>
+      </w:r>
+      <w:proofErr w:type="gramStart"/>
+      <w:r>
+        <w:rPr>
+          <w:rFonts w:cs="Arial"/>
+        </w:rPr>
+        <w:t>on screen</w:t>
+      </w:r>
+      <w:proofErr w:type="gramEnd"/>
+      <w:r>
+        <w:rPr>
+          <w:rFonts w:cs="Arial"/>
+        </w:rPr>
+        <w:t xml:space="preserve"> prompts to guide and support users that aren’t familiar with VR equipment</w:t>
       </w:r>
     </w:p>
     <w:p>
@@ -7251,7 +7265,7 @@
           <w:rFonts w:asciiTheme="minorHAnsi" w:hAnsiTheme="minorHAnsi"/>
         </w:rPr>
       </w:pPr>
-      <w:bookmarkStart w:id="8" w:name="_Toc223987277"/>
+      <w:bookmarkStart w:id="8" w:name="_Toc224050581"/>
       <w:r>
         <w:rPr>
           <w:rFonts w:asciiTheme="minorHAnsi" w:hAnsiTheme="minorHAnsi"/>
@@ -7268,7 +7282,7 @@
           <w:rFonts w:asciiTheme="minorHAnsi" w:hAnsiTheme="minorHAnsi"/>
         </w:rPr>
       </w:pPr>
-      <w:bookmarkStart w:id="9" w:name="_Toc223987278"/>
+      <w:bookmarkStart w:id="9" w:name="_Toc224050582"/>
       <w:r>
         <w:rPr>
           <w:rFonts w:asciiTheme="minorHAnsi" w:hAnsiTheme="minorHAnsi"/>
@@ -7352,7 +7366,7 @@
           <w:rFonts w:asciiTheme="minorHAnsi" w:hAnsiTheme="minorHAnsi"/>
         </w:rPr>
       </w:pPr>
-      <w:bookmarkStart w:id="10" w:name="_Toc223987279"/>
+      <w:bookmarkStart w:id="10" w:name="_Toc224050583"/>
       <w:r>
         <w:rPr>
           <w:rFonts w:asciiTheme="minorHAnsi" w:hAnsiTheme="minorHAnsi"/>
@@ -7365,7 +7379,7 @@
       <w:pPr>
         <w:pStyle w:val="Heading3"/>
       </w:pPr>
-      <w:bookmarkStart w:id="11" w:name="_Toc223987280"/>
+      <w:bookmarkStart w:id="11" w:name="_Toc224050584"/>
       <w:proofErr w:type="spellStart"/>
       <w:r>
         <w:t>Ey</w:t>
@@ -7682,7 +7696,7 @@
       <w:pPr>
         <w:pStyle w:val="Heading3"/>
       </w:pPr>
-      <w:bookmarkStart w:id="12" w:name="_Toc223987281"/>
+      <w:bookmarkStart w:id="12" w:name="_Toc224050585"/>
       <w:proofErr w:type="spellStart"/>
       <w:r>
         <w:t>OntoPhaco</w:t>
@@ -8040,7 +8054,7 @@
       <w:pPr>
         <w:pStyle w:val="Heading3"/>
       </w:pPr>
-      <w:bookmarkStart w:id="13" w:name="_Toc223987282"/>
+      <w:bookmarkStart w:id="13" w:name="_Toc224050586"/>
       <w:r>
         <w:lastRenderedPageBreak/>
         <w:t>I</w:t>
@@ -8236,7 +8250,7 @@
       <w:pPr>
         <w:pStyle w:val="Heading3"/>
       </w:pPr>
-      <w:bookmarkStart w:id="14" w:name="_Toc223987283"/>
+      <w:bookmarkStart w:id="14" w:name="_Toc224050587"/>
       <w:r>
         <w:t>Opportunities for innovation</w:t>
       </w:r>
@@ -8364,7 +8378,7 @@
           <w:rFonts w:asciiTheme="minorHAnsi" w:hAnsiTheme="minorHAnsi"/>
         </w:rPr>
       </w:pPr>
-      <w:bookmarkStart w:id="15" w:name="_Toc223987284"/>
+      <w:bookmarkStart w:id="15" w:name="_Toc224050588"/>
       <w:r>
         <w:rPr>
           <w:rFonts w:asciiTheme="minorHAnsi" w:hAnsiTheme="minorHAnsi"/>
@@ -8377,7 +8391,7 @@
       <w:pPr>
         <w:pStyle w:val="Heading3"/>
       </w:pPr>
-      <w:bookmarkStart w:id="16" w:name="_Toc223987285"/>
+      <w:bookmarkStart w:id="16" w:name="_Toc224050589"/>
       <w:r>
         <w:t>VR in medical education</w:t>
       </w:r>
@@ -8667,7 +8681,7 @@
       <w:pPr>
         <w:pStyle w:val="Heading3"/>
       </w:pPr>
-      <w:bookmarkStart w:id="17" w:name="_Toc223987286"/>
+      <w:bookmarkStart w:id="17" w:name="_Toc224050590"/>
       <w:r>
         <w:lastRenderedPageBreak/>
         <w:t>VR in Health Awareness</w:t>
@@ -8860,7 +8874,7 @@
           <w:rFonts w:asciiTheme="minorHAnsi" w:hAnsiTheme="minorHAnsi"/>
         </w:rPr>
       </w:pPr>
-      <w:bookmarkStart w:id="18" w:name="_Toc223987287"/>
+      <w:bookmarkStart w:id="18" w:name="_Toc224050591"/>
       <w:r>
         <w:rPr>
           <w:rFonts w:asciiTheme="minorHAnsi" w:hAnsiTheme="minorHAnsi"/>
@@ -9080,7 +9094,7 @@
       <w:pPr>
         <w:pStyle w:val="Heading1"/>
       </w:pPr>
-      <w:bookmarkStart w:id="19" w:name="_Toc223987288"/>
+      <w:bookmarkStart w:id="19" w:name="_Toc224050592"/>
       <w:r>
         <w:lastRenderedPageBreak/>
         <w:t>Appendices</w:t>
@@ -9091,7 +9105,7 @@
       <w:pPr>
         <w:pStyle w:val="Heading2"/>
       </w:pPr>
-      <w:bookmarkStart w:id="20" w:name="_Toc223987289"/>
+      <w:bookmarkStart w:id="20" w:name="_Toc224050593"/>
       <w:r>
         <w:t>Ethics Checklist</w:t>
       </w:r>
@@ -9233,7 +9247,7 @@
       <w:pPr>
         <w:pStyle w:val="Heading2"/>
       </w:pPr>
-      <w:bookmarkStart w:id="21" w:name="_Toc223987290"/>
+      <w:bookmarkStart w:id="21" w:name="_Toc224050594"/>
       <w:r>
         <w:lastRenderedPageBreak/>
         <w:t>Project Timeline Gant</w:t>
@@ -9429,7 +9443,7 @@
       <w:pPr>
         <w:pStyle w:val="Heading1"/>
       </w:pPr>
-      <w:bookmarkStart w:id="22" w:name="_Toc223987291"/>
+      <w:bookmarkStart w:id="22" w:name="_Toc224050595"/>
       <w:r>
         <w:lastRenderedPageBreak/>
         <w:t>Methodology</w:t>
@@ -9440,7 +9454,7 @@
       <w:pPr>
         <w:pStyle w:val="Heading2"/>
       </w:pPr>
-      <w:bookmarkStart w:id="23" w:name="_Toc223987292"/>
+      <w:bookmarkStart w:id="23" w:name="_Toc224050596"/>
       <w:r>
         <w:t>Source Control</w:t>
       </w:r>
@@ -9539,7 +9553,7 @@
       <w:pPr>
         <w:pStyle w:val="Heading2"/>
       </w:pPr>
-      <w:bookmarkStart w:id="24" w:name="_Toc223987293"/>
+      <w:bookmarkStart w:id="24" w:name="_Toc224050597"/>
       <w:r>
         <w:t>Prototype Implementation</w:t>
       </w:r>
@@ -9549,7 +9563,7 @@
       <w:pPr>
         <w:pStyle w:val="Heading3"/>
       </w:pPr>
-      <w:bookmarkStart w:id="25" w:name="_Toc223987294"/>
+      <w:bookmarkStart w:id="25" w:name="_Toc224050598"/>
       <w:r>
         <w:t>Usability and Flow</w:t>
       </w:r>
@@ -9691,7 +9705,7 @@
       <w:pPr>
         <w:pStyle w:val="Heading3"/>
       </w:pPr>
-      <w:bookmarkStart w:id="26" w:name="_Toc223987295"/>
+      <w:bookmarkStart w:id="26" w:name="_Toc224050599"/>
       <w:r>
         <w:t xml:space="preserve">Environment Design and </w:t>
       </w:r>
@@ -9732,10 +9746,7 @@
         <w:t xml:space="preserve"> </w:t>
       </w:r>
       <w:r>
-        <w:t xml:space="preserve">set within a confined </w:t>
-      </w:r>
-      <w:r>
-        <w:t>room, with a desk</w:t>
+        <w:t>set within a confined room, with a desk</w:t>
       </w:r>
       <w:r>
         <w:t xml:space="preserve"> made up</w:t>
@@ -9756,10 +9767,7 @@
         <w:t>.</w:t>
       </w:r>
       <w:r>
-        <w:t xml:space="preserve"> </w:t>
-      </w:r>
-      <w:r>
-        <w:t xml:space="preserve">Research conducted by </w:t>
+        <w:t xml:space="preserve"> Research conducted by </w:t>
       </w:r>
       <w:r>
         <w:t xml:space="preserve">Newman et al., </w:t>
@@ -9887,13 +9895,15 @@
       <w:r>
         <w:t xml:space="preserve"> when trying to relieve each symptom.</w:t>
       </w:r>
-    </w:p>
+      <w:bookmarkStart w:id="27" w:name="_Toc224050600"/>
+    </w:p>
+    <w:p/>
     <w:p>
       <w:pPr>
         <w:pStyle w:val="Heading3"/>
       </w:pPr>
-      <w:bookmarkStart w:id="27" w:name="_Toc223987296"/>
-      <w:r>
+      <w:r>
+        <w:lastRenderedPageBreak/>
         <w:t>Objective System Implementation</w:t>
       </w:r>
       <w:bookmarkEnd w:id="27"/>
@@ -9941,515 +9951,684 @@
       </w:r>
       <w:proofErr w:type="spellEnd"/>
       <w:r>
-        <w:t xml:space="preserve"> blueprint, with objectives being updated during runtime as conditions </w:t>
-      </w:r>
+        <w:t xml:space="preserve"> blueprint, with objectives being updated during runtime as conditions were satisfied </w:t>
+      </w:r>
+      <w:r>
+        <w:t>during</w:t>
+      </w:r>
+      <w:r>
+        <w:t xml:space="preserve"> progression. </w:t>
+      </w:r>
+      <w:r>
+        <w:t>P</w:t>
+      </w:r>
+      <w:r>
+        <w:t xml:space="preserve">rogression was </w:t>
+      </w:r>
+      <w:r>
+        <w:t>recorded</w:t>
+      </w:r>
+      <w:r>
+        <w:t xml:space="preserve"> through user gaze tracking and interactions with </w:t>
+      </w:r>
+      <w:r>
+        <w:t>interactive</w:t>
+      </w:r>
+      <w:r>
+        <w:t xml:space="preserve"> objects within the scene, the object to gaze at or interact with varied depending on what the current objective was. When a condition was satisfied, event dispatchers were implemented to signal</w:t>
+      </w:r>
+      <w:r>
+        <w:t xml:space="preserve"> system</w:t>
+      </w:r>
+      <w:r>
+        <w:t xml:space="preserve"> changes. These changes consisted of</w:t>
+      </w:r>
+      <w:r>
+        <w:t xml:space="preserve"> objective change</w:t>
+      </w:r>
+      <w:r>
+        <w:t>s</w:t>
+      </w:r>
+      <w:r>
+        <w:t xml:space="preserve">, </w:t>
+      </w:r>
+      <w:r>
+        <w:t>symptoms being triggered</w:t>
+      </w:r>
+      <w:r>
+        <w:t xml:space="preserve"> or relieved, completion of the experience and updat</w:t>
+      </w:r>
+      <w:r>
+        <w:t>ing</w:t>
+      </w:r>
+      <w:r>
+        <w:t xml:space="preserve"> the current objective displayed on the monitor object</w:t>
+      </w:r>
+      <w:r>
+        <w:t xml:space="preserve"> along with the progress bar</w:t>
+      </w:r>
+      <w:r>
+        <w:t>.</w:t>
+      </w:r>
+    </w:p>
+    <w:p>
+      <w:pPr>
+        <w:pStyle w:val="Heading3"/>
+      </w:pPr>
+      <w:bookmarkStart w:id="28" w:name="_Toc224050601"/>
+      <w:r>
+        <w:t>User</w:t>
+      </w:r>
+      <w:r>
+        <w:t xml:space="preserve"> Objective </w:t>
+      </w:r>
+      <w:r>
+        <w:t>Feedback</w:t>
+      </w:r>
+      <w:bookmarkEnd w:id="28"/>
+    </w:p>
+    <w:p>
+      <w:r>
+        <w:t>Users</w:t>
+      </w:r>
+      <w:r>
+        <w:t xml:space="preserve"> received objective feedback through the monitor object within the level. UI</w:t>
+      </w:r>
+      <w:r>
+        <w:t xml:space="preserve"> </w:t>
+      </w:r>
+      <w:r>
+        <w:t xml:space="preserve">(User Interface) </w:t>
+      </w:r>
+      <w:r>
+        <w:t xml:space="preserve">within the level </w:t>
+      </w:r>
+      <w:r>
+        <w:t xml:space="preserve">was </w:t>
+      </w:r>
+      <w:r>
+        <w:t>chosen over traditional HUD</w:t>
+      </w:r>
+      <w:r>
+        <w:t>s</w:t>
+      </w:r>
+      <w:r>
+        <w:t xml:space="preserve"> (Heads Up Display</w:t>
+      </w:r>
+      <w:r>
+        <w:t>s</w:t>
+      </w:r>
+      <w:r>
+        <w:t xml:space="preserve">) seen within video games so that the experience would be more immersive with users needing to interact and search the environment around them. </w:t>
+      </w:r>
+      <w:r>
+        <w:t xml:space="preserve">Seo and Bae, </w:t>
+      </w:r>
+      <w:r>
+        <w:t>(</w:t>
+      </w:r>
+      <w:r>
+        <w:t>2018)</w:t>
+      </w:r>
+      <w:r>
+        <w:t xml:space="preserve"> explain how diegetic UI implemented in a virtual environment enhances immersion compared to traditional HUDs.</w:t>
+      </w:r>
+    </w:p>
+    <w:p>
+      <w:r>
+        <w:t xml:space="preserve">The UI is implemented as a world space widget attached to the screen mesh of a monitor that uses a widget blueprint to control the information displayed. The widget consists of the current objective description to prompt users along with a progress bar that fills up green as the necessary requirements are being met to complete the objective. </w:t>
+      </w:r>
+      <w:r>
+        <w:t>Event</w:t>
+      </w:r>
+      <w:r>
+        <w:t xml:space="preserve"> dispatchers control updates to the widget updat</w:t>
+      </w:r>
+      <w:r>
+        <w:t>ing it</w:t>
+      </w:r>
+      <w:r>
+        <w:t xml:space="preserve"> in real time</w:t>
+      </w:r>
+      <w:r>
+        <w:t>. W</w:t>
+      </w:r>
+      <w:r>
+        <w:t>hen an objective is complete</w:t>
+      </w:r>
+      <w:r>
+        <w:t>,</w:t>
+      </w:r>
+      <w:r>
+        <w:t xml:space="preserve"> the progress bar resets with the objective description changing to the next. </w:t>
+      </w:r>
+      <w:r>
+        <w:t>Furthermore, when</w:t>
+      </w:r>
+      <w:r>
+        <w:t xml:space="preserve"> the experience is </w:t>
+      </w:r>
+      <w:r>
+        <w:t>completed,</w:t>
+      </w:r>
+      <w:r>
+        <w:t xml:space="preserve"> users are informed using a message that they have completed all the objectives before exiting back to the </w:t>
+      </w:r>
+      <w:r>
+        <w:t xml:space="preserve">start screen </w:t>
+      </w:r>
+      <w:r>
+        <w:t>menu.</w:t>
+      </w:r>
+    </w:p>
+    <w:p>
+      <w:pPr>
+        <w:pStyle w:val="Heading3"/>
+      </w:pPr>
+      <w:bookmarkStart w:id="29" w:name="_Toc224050602"/>
+      <w:r>
+        <w:t>Objective Based Interact</w:t>
+      </w:r>
+      <w:r>
+        <w:t>ive</w:t>
+      </w:r>
+      <w:r>
+        <w:t xml:space="preserve"> Object</w:t>
+      </w:r>
+      <w:r>
+        <w:t>s</w:t>
+      </w:r>
+      <w:bookmarkEnd w:id="29"/>
+    </w:p>
+    <w:p>
+      <w:r>
+        <w:t xml:space="preserve">To enhance the </w:t>
+      </w:r>
+      <w:r>
+        <w:t>experience</w:t>
+      </w:r>
+      <w:r>
+        <w:t xml:space="preserve"> of the application, getting the user to interact with objects within the scene was important</w:t>
+      </w:r>
+      <w:r>
+        <w:t xml:space="preserve"> to increase immersion</w:t>
+      </w:r>
+      <w:r>
+        <w:t xml:space="preserve">. These interactions included staring at the screen for a certain duration, looking at an object far away or on the desk and turning a light switch on and off. By doing this, the user would replicate actual actions that cause symptoms of DES and preventative measures reinforcing the learning being undertaken. </w:t>
+      </w:r>
+    </w:p>
+    <w:p>
+      <w:r>
+        <w:t>A</w:t>
+      </w:r>
+      <w:r>
+        <w:t xml:space="preserve"> line trace channel </w:t>
+      </w:r>
+      <w:r>
+        <w:t xml:space="preserve">was used </w:t>
+      </w:r>
+      <w:r>
+        <w:t xml:space="preserve">to </w:t>
+      </w:r>
+      <w:r>
+        <w:t>detect collision events with interactable objects.</w:t>
+      </w:r>
+      <w:r>
+        <w:t xml:space="preserve"> Whenever a hit was received, depending on which objective was the</w:t>
+      </w:r>
+      <w:r>
+        <w:t xml:space="preserve"> </w:t>
+      </w:r>
+      <w:r>
+        <w:t>current one it would update according to if the object being looked at was the right one to progress that specific objective. Users were notified by the UI on the monitor to which object needed to be looked at or interacted with. For the light switch, interaction using the grab trigger was needed to simulate the light switching on and off. Once the specific condition was met</w:t>
+      </w:r>
+      <w:r>
+        <w:t>,</w:t>
+      </w:r>
+      <w:r>
+        <w:t xml:space="preserve"> event dispatchers were fired from those objects to notify of objective updates.</w:t>
+      </w:r>
+      <w:bookmarkStart w:id="30" w:name="_Toc224050603"/>
+    </w:p>
+    <w:p/>
+    <w:p/>
+    <w:p/>
+    <w:p>
+      <w:pPr>
+        <w:pStyle w:val="Heading3"/>
+      </w:pPr>
       <w:r>
         <w:lastRenderedPageBreak/>
-        <w:t xml:space="preserve">were satisfied </w:t>
-      </w:r>
-      <w:r>
-        <w:t>during</w:t>
-      </w:r>
-      <w:r>
-        <w:t xml:space="preserve"> progression. </w:t>
-      </w:r>
-      <w:r>
-        <w:t>P</w:t>
-      </w:r>
-      <w:r>
-        <w:t xml:space="preserve">rogression was </w:t>
-      </w:r>
-      <w:r>
-        <w:t>recorded</w:t>
-      </w:r>
-      <w:r>
-        <w:t xml:space="preserve"> through user gaze tracking and interactions with </w:t>
-      </w:r>
-      <w:r>
-        <w:t>interactive</w:t>
-      </w:r>
-      <w:r>
-        <w:t xml:space="preserve"> objects within the scene, the object to gaze at or interact with varied depending on what the current objective was. When a condition was satisfied, event dispatchers were implemented to signal</w:t>
-      </w:r>
-      <w:r>
-        <w:t xml:space="preserve"> system</w:t>
-      </w:r>
-      <w:r>
-        <w:t xml:space="preserve"> changes. These changes consisted of</w:t>
-      </w:r>
-      <w:r>
-        <w:t xml:space="preserve"> objective change</w:t>
+        <w:t>Post Processing Effects</w:t>
+      </w:r>
+      <w:r>
+        <w:t xml:space="preserve"> for Simulating Symptoms</w:t>
+      </w:r>
+      <w:bookmarkEnd w:id="30"/>
+    </w:p>
+    <w:p>
+      <w:r>
+        <w:t>Simulating the symptoms of DES required enabling specific post processing effects within the camera</w:t>
+      </w:r>
+      <w:r>
+        <w:t>’s post processing component</w:t>
+      </w:r>
+      <w:r>
+        <w:t xml:space="preserve">. </w:t>
+      </w:r>
+      <w:r>
+        <w:t>The development process involved evaluating</w:t>
+      </w:r>
+      <w:r>
+        <w:t xml:space="preserve"> how </w:t>
+      </w:r>
+      <w:r>
+        <w:t>these</w:t>
+      </w:r>
+      <w:r>
+        <w:t xml:space="preserve"> symptoms </w:t>
+      </w:r>
+      <w:r>
+        <w:t>were</w:t>
+      </w:r>
+      <w:r>
+        <w:t xml:space="preserve"> </w:t>
+      </w:r>
+      <w:r>
+        <w:t xml:space="preserve">simulated </w:t>
+      </w:r>
+      <w:r>
+        <w:t xml:space="preserve">so the experience </w:t>
+      </w:r>
+      <w:r>
+        <w:t>didn</w:t>
+      </w:r>
+      <w:r>
+        <w:t>’t</w:t>
+      </w:r>
+      <w:r>
+        <w:t xml:space="preserve"> </w:t>
+      </w:r>
+      <w:r>
+        <w:t>unintentionally</w:t>
+      </w:r>
+      <w:r>
+        <w:t xml:space="preserve"> trigger</w:t>
+      </w:r>
+      <w:r>
+        <w:t xml:space="preserve"> </w:t>
+      </w:r>
+      <w:r>
+        <w:t xml:space="preserve">discomfort, motion sickness or </w:t>
+      </w:r>
+      <w:r>
+        <w:t xml:space="preserve">other </w:t>
+      </w:r>
+      <w:r>
+        <w:t xml:space="preserve">symptoms. </w:t>
+      </w:r>
+      <w:r>
+        <w:t xml:space="preserve">As discussed by </w:t>
+      </w:r>
+      <w:r>
+        <w:t xml:space="preserve">Conner et al., </w:t>
+      </w:r>
+      <w:r>
+        <w:t>(</w:t>
+      </w:r>
+      <w:r>
+        <w:t>2022)</w:t>
+      </w:r>
+      <w:r>
+        <w:t>, symptoms such as</w:t>
+      </w:r>
+      <w:r>
+        <w:t xml:space="preserve"> fatigue,</w:t>
+      </w:r>
+      <w:r>
+        <w:t xml:space="preserve"> </w:t>
+      </w:r>
+      <w:r>
+        <w:t>nausea</w:t>
+      </w:r>
+      <w:r>
+        <w:t>,</w:t>
+      </w:r>
+      <w:r>
+        <w:t xml:space="preserve"> disorientation and headaches</w:t>
+      </w:r>
+      <w:r>
+        <w:t xml:space="preserve"> are often caused when using VR</w:t>
+      </w:r>
+      <w:r>
+        <w:t>,</w:t>
+      </w:r>
+      <w:r>
+        <w:t xml:space="preserve"> </w:t>
+      </w:r>
+      <w:r>
+        <w:t>limit</w:t>
+      </w:r>
+      <w:r>
+        <w:t>ing</w:t>
+      </w:r>
+      <w:r>
+        <w:t xml:space="preserve"> </w:t>
+      </w:r>
+      <w:r>
+        <w:t>its</w:t>
+      </w:r>
+      <w:r>
+        <w:t xml:space="preserve"> </w:t>
+      </w:r>
+      <w:r>
+        <w:t>widespread adoption</w:t>
+      </w:r>
+      <w:r>
+        <w:t>.</w:t>
+      </w:r>
+      <w:r>
+        <w:t xml:space="preserve"> This </w:t>
+      </w:r>
+      <w:r>
+        <w:t>reinforces</w:t>
+      </w:r>
+      <w:r>
+        <w:t xml:space="preserve"> the need for care during development to avoid these consequences incurred by users</w:t>
+      </w:r>
+      <w:r>
+        <w:t>.</w:t>
+      </w:r>
+    </w:p>
+    <w:p>
+      <w:r>
+        <w:t>The</w:t>
+      </w:r>
+      <w:r>
+        <w:t xml:space="preserve"> effect</w:t>
       </w:r>
       <w:r>
         <w:t>s</w:t>
       </w:r>
       <w:r>
-        <w:t xml:space="preserve">, </w:t>
-      </w:r>
-      <w:r>
-        <w:t>symptoms being triggered</w:t>
-      </w:r>
-      <w:r>
-        <w:t xml:space="preserve"> or relieved, completion of the experience and updat</w:t>
-      </w:r>
-      <w:r>
-        <w:t>ing</w:t>
-      </w:r>
-      <w:r>
-        <w:t xml:space="preserve"> the current objective displayed on the monitor object</w:t>
-      </w:r>
-      <w:r>
-        <w:t xml:space="preserve"> along with the progress bar</w:t>
+        <w:t xml:space="preserve"> simulated </w:t>
+      </w:r>
+      <w:r>
+        <w:t xml:space="preserve">were </w:t>
+      </w:r>
+      <w:proofErr w:type="gramStart"/>
+      <w:r>
+        <w:t>vignette</w:t>
+      </w:r>
+      <w:proofErr w:type="gramEnd"/>
+      <w:r>
+        <w:t xml:space="preserve"> to simulate eye fatigue, bloom for light sensitivity and blur for focus strain. Vignette and bloom post processing effects were triggered </w:t>
+      </w:r>
+      <w:r>
+        <w:t>by</w:t>
+      </w:r>
+      <w:r>
+        <w:t xml:space="preserve"> adjusting their post processing variables within the camera post processing component. However, for blur a post processing material was required to create the radial blur. When objectives progressed triggering the simulation of symptoms, a timeline was used to progressively increase the value of an effect gradually over a duration. This decision was made to accommodate eyes adjusting to the changes of the camera as these effects were being triggered.</w:t>
+      </w:r>
+      <w:r>
+        <w:t xml:space="preserve"> The timeline was then used in reverse to revert the symptoms returning the camera view back to the original state it was in.</w:t>
+      </w:r>
+    </w:p>
+    <w:p>
+      <w:pPr>
+        <w:pStyle w:val="Heading3"/>
+      </w:pPr>
+      <w:bookmarkStart w:id="31" w:name="_Toc224050604"/>
+      <w:r>
+        <w:t>User</w:t>
+      </w:r>
+      <w:r>
+        <w:t xml:space="preserve"> Look Direction and Attention Detection</w:t>
+      </w:r>
+      <w:bookmarkEnd w:id="31"/>
+    </w:p>
+    <w:p>
+      <w:r>
+        <w:t>Look direction was detected using a line trace that took the camera position as the starting location and a distance value multiplied by the forward vector of the camera. From there, returned hits would be checked for the object needed to progress the objective. When a successful hit was recorded, the time spent staring at the object was recorded and used to update the progress bar on the monitor. Whenever user gaze averted from the required progression object, the progress bar would reset back to zero so that progress wasn’t accumulated over multiple looks but from one continuous stare replicating the causes for symptoms.</w:t>
+      </w:r>
+    </w:p>
+    <w:p>
+      <w:pPr>
+        <w:pStyle w:val="Heading2"/>
+      </w:pPr>
+      <w:bookmarkStart w:id="32" w:name="_Toc224050605"/>
+      <w:r>
+        <w:t>Final Version</w:t>
+      </w:r>
+      <w:r>
+        <w:t xml:space="preserve"> Implementation</w:t>
+      </w:r>
+      <w:bookmarkEnd w:id="32"/>
+    </w:p>
+    <w:p>
+      <w:pPr>
+        <w:pStyle w:val="Heading3"/>
+      </w:pPr>
+      <w:bookmarkStart w:id="33" w:name="_Toc224050606"/>
+      <w:r>
+        <w:t>Environment Changes and Visual Modifications</w:t>
+      </w:r>
+      <w:bookmarkEnd w:id="33"/>
+    </w:p>
+    <w:p>
+      <w:r>
+        <w:t>To add some colour to the scenes</w:t>
+      </w:r>
+      <w:r>
+        <w:t>,</w:t>
+      </w:r>
+      <w:r>
+        <w:t xml:space="preserve"> the default grid materials were swapped out for flooring, ceiling, wall and other materials to change the scene from a grey looking prototype to a </w:t>
+      </w:r>
+      <w:r>
+        <w:t xml:space="preserve">more </w:t>
+      </w:r>
+      <w:r>
+        <w:t>polished scene setup.</w:t>
+      </w:r>
+    </w:p>
+    <w:p>
+      <w:pPr>
+        <w:pStyle w:val="Heading3"/>
+      </w:pPr>
+      <w:bookmarkStart w:id="34" w:name="_Toc224050607"/>
+      <w:r>
+        <w:t>Interaction Improvements</w:t>
+      </w:r>
+      <w:bookmarkEnd w:id="34"/>
+    </w:p>
+    <w:p>
+      <w:r>
+        <w:t xml:space="preserve">Hand physics collisions were removed </w:t>
+      </w:r>
+      <w:r>
+        <w:t xml:space="preserve">which allowed the user interactions with the </w:t>
+      </w:r>
+      <w:r>
+        <w:t xml:space="preserve">light switch </w:t>
+      </w:r>
+      <w:r>
+        <w:t xml:space="preserve">to </w:t>
+      </w:r>
+      <w:r>
+        <w:t>work as intended</w:t>
       </w:r>
       <w:r>
         <w:t>.</w:t>
       </w:r>
+      <w:r>
+        <w:t xml:space="preserve"> In addition to this, the blueprint for the light switch was heavily simplified. The original blueprint used logic that worked for a lever like interaction component that was quite large and would adjust its rotation based on where the player hand was while interacting with the object. However, the light switch was a small object where there was a minimal difference in position of the hand component. The logic needed to be simplified to detection of the user interacting with the grab component</w:t>
+      </w:r>
+      <w:r>
+        <w:t xml:space="preserve"> of the switch</w:t>
+      </w:r>
+      <w:r>
+        <w:t>.</w:t>
+      </w:r>
+      <w:r>
+        <w:t xml:space="preserve"> </w:t>
+      </w:r>
+      <w:r>
+        <w:t>T</w:t>
+      </w:r>
+      <w:r>
+        <w:t>hen the light</w:t>
+      </w:r>
+      <w:r>
+        <w:t xml:space="preserve"> would be </w:t>
+      </w:r>
+      <w:r>
+        <w:t>turned</w:t>
+      </w:r>
+      <w:r>
+        <w:t xml:space="preserve"> on or off depending on the value of a Boolean variable, which stored the information on whether the lights were currently switched on or off. </w:t>
+      </w:r>
+    </w:p>
+    <w:p>
+      <w:r>
+        <w:t xml:space="preserve">From this change, most of the other supporting code within the event graph was no longer necessary so was removed to strip the blueprint back to basics. </w:t>
+      </w:r>
+      <w:r>
+        <w:t xml:space="preserve">As the physics collisions were </w:t>
+      </w:r>
+      <w:r>
+        <w:lastRenderedPageBreak/>
+        <w:t xml:space="preserve">no longer blocking the player hand components from </w:t>
+      </w:r>
+      <w:r>
+        <w:t>moving</w:t>
+      </w:r>
+      <w:r>
+        <w:t xml:space="preserve"> into the light switch</w:t>
+      </w:r>
+      <w:r>
+        <w:t xml:space="preserve"> and the logic of the light switch had become simplified</w:t>
+      </w:r>
+      <w:r>
+        <w:t>,</w:t>
+      </w:r>
+      <w:r>
+        <w:t xml:space="preserve"> </w:t>
+      </w:r>
+      <w:r>
+        <w:t xml:space="preserve">the interaction could </w:t>
+      </w:r>
+      <w:r>
+        <w:t xml:space="preserve">reliably </w:t>
+      </w:r>
+      <w:r>
+        <w:t>receive</w:t>
+      </w:r>
+      <w:r>
+        <w:t xml:space="preserve"> </w:t>
+      </w:r>
+      <w:r>
+        <w:t>trigger inputs from the user</w:t>
+      </w:r>
+      <w:r>
+        <w:t>.</w:t>
+      </w:r>
     </w:p>
     <w:p>
       <w:pPr>
         <w:pStyle w:val="Heading3"/>
       </w:pPr>
-      <w:bookmarkStart w:id="28" w:name="_Toc223987297"/>
-      <w:r>
-        <w:t>User</w:t>
-      </w:r>
-      <w:r>
-        <w:t xml:space="preserve"> Objective </w:t>
-      </w:r>
-      <w:r>
-        <w:t>Feedback</w:t>
-      </w:r>
-      <w:bookmarkEnd w:id="28"/>
-    </w:p>
-    <w:p>
-      <w:r>
-        <w:t>Users</w:t>
-      </w:r>
-      <w:r>
-        <w:t xml:space="preserve"> received objective feedback through the monitor object within the level. UI</w:t>
-      </w:r>
-      <w:r>
-        <w:t xml:space="preserve"> </w:t>
-      </w:r>
-      <w:r>
-        <w:t xml:space="preserve">(User Interface) </w:t>
-      </w:r>
-      <w:r>
-        <w:t xml:space="preserve">within the level </w:t>
-      </w:r>
-      <w:r>
-        <w:t xml:space="preserve">was </w:t>
-      </w:r>
-      <w:r>
-        <w:t>chosen over traditional HUD</w:t>
+      <w:bookmarkStart w:id="35" w:name="_Toc224050608"/>
+      <w:r>
+        <w:t>Flow Tweaks</w:t>
+      </w:r>
+      <w:bookmarkEnd w:id="35"/>
+    </w:p>
+    <w:p>
+      <w:r>
+        <w:t xml:space="preserve">The </w:t>
+      </w:r>
+      <w:r>
+        <w:t>timeline duration between objectives 4 and 5 for triggering and reverting the light sensitivity symptom</w:t>
+      </w:r>
+      <w:r>
+        <w:t xml:space="preserve"> w</w:t>
+      </w:r>
+      <w:r>
+        <w:t>as</w:t>
+      </w:r>
+      <w:r>
+        <w:t xml:space="preserve"> reduced</w:t>
+      </w:r>
+      <w:r>
+        <w:t xml:space="preserve">. </w:t>
+      </w:r>
+      <w:r>
+        <w:t>S</w:t>
+      </w:r>
+      <w:r>
+        <w:t>ymptom effects were still able to be portrayed to users while showing prevention methods worked.</w:t>
+      </w:r>
+      <w:r>
+        <w:t xml:space="preserve"> </w:t>
+      </w:r>
+      <w:r>
+        <w:t>O</w:t>
+      </w:r>
+      <w:r>
+        <w:t xml:space="preserve">bjectives should not overlap each other </w:t>
+      </w:r>
+      <w:r>
+        <w:t>or</w:t>
+      </w:r>
+      <w:r>
+        <w:t xml:space="preserve"> show </w:t>
+      </w:r>
+      <w:r>
+        <w:t xml:space="preserve">unexpected </w:t>
+      </w:r>
+      <w:r>
+        <w:t>behaviour</w:t>
+      </w:r>
+      <w:r>
+        <w:t xml:space="preserve"> </w:t>
+      </w:r>
+      <w:r>
+        <w:t>to the player</w:t>
+      </w:r>
+      <w:r>
+        <w:t>. T</w:t>
+      </w:r>
+      <w:r>
+        <w:t xml:space="preserve">his </w:t>
+      </w:r>
+      <w:r>
+        <w:t>keep</w:t>
       </w:r>
       <w:r>
         <w:t>s</w:t>
       </w:r>
       <w:r>
-        <w:t xml:space="preserve"> (Heads Up Display</w:t>
-      </w:r>
-      <w:r>
-        <w:t>s</w:t>
-      </w:r>
-      <w:r>
-        <w:t xml:space="preserve">) seen within video games so that the experience would be more immersive with users needing to interact and search the environment around them. The UI is implemented as a world space widget attached to the screen mesh of a monitor that uses a widget blueprint to control the information displayed. </w:t>
-      </w:r>
-    </w:p>
-    <w:p>
-      <w:r>
-        <w:t xml:space="preserve">The widget consists of the current objective description to prompt users along with a progress bar that fills up green as the necessary requirements are being met to complete the objective. </w:t>
-      </w:r>
-      <w:r>
-        <w:t>Event</w:t>
-      </w:r>
-      <w:r>
-        <w:t xml:space="preserve"> dispatchers control updates to the widget updat</w:t>
-      </w:r>
-      <w:r>
-        <w:t>ing it</w:t>
-      </w:r>
-      <w:r>
-        <w:t xml:space="preserve"> in real time</w:t>
-      </w:r>
-      <w:r>
-        <w:t>. W</w:t>
-      </w:r>
-      <w:r>
-        <w:t>hen an objective is complete</w:t>
-      </w:r>
-      <w:r>
-        <w:t>,</w:t>
-      </w:r>
-      <w:r>
-        <w:t xml:space="preserve"> the progress bar resets with the objective description changing to the next. </w:t>
-      </w:r>
-      <w:r>
-        <w:t>Furthermore, when</w:t>
-      </w:r>
-      <w:r>
-        <w:t xml:space="preserve"> the experience is </w:t>
-      </w:r>
-      <w:r>
-        <w:t>completed,</w:t>
-      </w:r>
-      <w:r>
-        <w:t xml:space="preserve"> users are informed using a message that they have completed all the objectives before exiting back to the </w:t>
-      </w:r>
-      <w:r>
-        <w:t xml:space="preserve">start screen </w:t>
-      </w:r>
-      <w:r>
-        <w:t>menu.</w:t>
+        <w:t xml:space="preserve"> the understanding </w:t>
+      </w:r>
+      <w:r>
+        <w:t xml:space="preserve">of the experience </w:t>
+      </w:r>
+      <w:r>
+        <w:t xml:space="preserve">clear and </w:t>
+      </w:r>
+      <w:r>
+        <w:t>prioritises</w:t>
+      </w:r>
+      <w:r>
+        <w:t xml:space="preserve"> information retention.</w:t>
       </w:r>
     </w:p>
     <w:p>
       <w:pPr>
         <w:pStyle w:val="Heading3"/>
       </w:pPr>
-      <w:bookmarkStart w:id="29" w:name="_Toc223987298"/>
-      <w:r>
-        <w:t>Objective Based Interact</w:t>
-      </w:r>
-      <w:r>
-        <w:t>ive</w:t>
-      </w:r>
-      <w:r>
-        <w:t xml:space="preserve"> Object</w:t>
-      </w:r>
-      <w:r>
-        <w:t>s</w:t>
-      </w:r>
-      <w:bookmarkEnd w:id="29"/>
-    </w:p>
-    <w:p>
-      <w:r>
-        <w:t xml:space="preserve">To enhance the </w:t>
-      </w:r>
-      <w:r>
-        <w:t>experience</w:t>
-      </w:r>
-      <w:r>
-        <w:t xml:space="preserve"> of the application, getting the user to interact with objects within the scene was important</w:t>
-      </w:r>
-      <w:r>
-        <w:t xml:space="preserve"> to increase immersion</w:t>
-      </w:r>
-      <w:r>
-        <w:t xml:space="preserve">. These interactions included staring at the screen for a certain duration, looking at an object far away or on the desk and turning a light switch on and off. By doing this, the user would replicate actual actions that cause symptoms of DES and preventative measures reinforcing the learning being undertaken. </w:t>
-      </w:r>
-    </w:p>
-    <w:p>
-      <w:r>
-        <w:t>A</w:t>
-      </w:r>
-      <w:r>
-        <w:t xml:space="preserve"> line trace channel </w:t>
-      </w:r>
-      <w:r>
-        <w:t xml:space="preserve">was used </w:t>
-      </w:r>
-      <w:r>
-        <w:t xml:space="preserve">to </w:t>
-      </w:r>
-      <w:r>
-        <w:t>detect collision events with interactable objects.</w:t>
-      </w:r>
-      <w:r>
-        <w:t xml:space="preserve"> Whenever a hit was received, depending on which objective was the</w:t>
-      </w:r>
-      <w:r>
-        <w:t xml:space="preserve"> </w:t>
-      </w:r>
-      <w:r>
-        <w:t>current one it would update according to if the object being looked at was the right one to progress that specific objective. Users were notified by the UI on the monitor to which object needed to be looked at or interacted with. For the light switch, interaction using the grab trigger was needed to simulate the light switching on and off. Once the specific condition was met</w:t>
-      </w:r>
-      <w:r>
-        <w:t>,</w:t>
-      </w:r>
-      <w:r>
-        <w:t xml:space="preserve"> event dispatchers were fired from those objects to notify of objective updates.</w:t>
-      </w:r>
-    </w:p>
-    <w:p>
-      <w:pPr>
-        <w:pStyle w:val="Heading3"/>
-      </w:pPr>
-      <w:bookmarkStart w:id="30" w:name="_Toc223987299"/>
-      <w:r>
-        <w:t>Post Processing Effects</w:t>
-      </w:r>
-      <w:r>
-        <w:t xml:space="preserve"> for Simulating Symptoms</w:t>
-      </w:r>
-      <w:bookmarkEnd w:id="30"/>
-    </w:p>
-    <w:p>
-      <w:r>
-        <w:t>Simulating the symptoms of DES required enabling specific post processing effects within the camera</w:t>
-      </w:r>
-      <w:r>
-        <w:t>’s post processing component</w:t>
-      </w:r>
-      <w:r>
-        <w:t>. These effects were vignette to simulate eye fatigue, bloom for light sensitivity and blur for focus strain. Vignette and bloom post processing effects were triggered through adjusting their post processing variables within the camera post processing component. However, for blur a post processing material was required to create the radial blur. When objectives progressed triggering the simulation of symptoms, a timeline was used to progressively increase the value of an effect gradually over a duration. This decision was made to accommodate eyes adjusting to the changes of the camera as these effects were being triggered.</w:t>
-      </w:r>
-      <w:r>
-        <w:t xml:space="preserve"> The timeline was then used in reverse to revert the symptoms returning the camera view back to the original state it was in.</w:t>
-      </w:r>
-    </w:p>
-    <w:p>
-      <w:pPr>
-        <w:pStyle w:val="Heading3"/>
-      </w:pPr>
-      <w:bookmarkStart w:id="31" w:name="_Toc223987300"/>
-      <w:r>
-        <w:lastRenderedPageBreak/>
-        <w:t>User</w:t>
-      </w:r>
-      <w:r>
-        <w:t xml:space="preserve"> Look Direction and Attention Detection</w:t>
-      </w:r>
-      <w:bookmarkEnd w:id="31"/>
-    </w:p>
-    <w:p>
-      <w:r>
-        <w:t>Look direction was detected using a line trace that took the camera position as the starting location and a distance value multiplied by the forward vector of the camera. From there, returned hits would be checked for the object needed to progress the objective. When a successful hit was recorded, the time spent staring at the object was recorded and used to update the progress bar on the monitor. Whenever user gaze averted from the required progression object, the progress bar would reset back to zero so that progress wasn’t accumulated over multiple looks but from one continuous stare replicating the causes for symptoms.</w:t>
-      </w:r>
-    </w:p>
-    <w:p>
-      <w:pPr>
-        <w:pStyle w:val="Heading2"/>
-      </w:pPr>
-      <w:bookmarkStart w:id="32" w:name="_Toc223987301"/>
-      <w:r>
-        <w:t>Final Version</w:t>
-      </w:r>
-      <w:r>
-        <w:t xml:space="preserve"> Implementation</w:t>
-      </w:r>
-      <w:bookmarkEnd w:id="32"/>
-    </w:p>
-    <w:p>
-      <w:pPr>
-        <w:pStyle w:val="Heading3"/>
-      </w:pPr>
-      <w:bookmarkStart w:id="33" w:name="_Toc223987302"/>
-      <w:r>
-        <w:t>Environment Changes and Visual Modifications</w:t>
-      </w:r>
-      <w:bookmarkEnd w:id="33"/>
-    </w:p>
-    <w:p>
-      <w:r>
-        <w:t>To add some colour to the scenes</w:t>
-      </w:r>
-      <w:r>
-        <w:t>,</w:t>
-      </w:r>
-      <w:r>
-        <w:t xml:space="preserve"> the default grid materials were swapped out for flooring, ceiling, wall and other materials to change the scene from a grey looking prototype to a </w:t>
-      </w:r>
-      <w:r>
-        <w:t xml:space="preserve">more </w:t>
-      </w:r>
-      <w:r>
-        <w:t>polished scene setup.</w:t>
-      </w:r>
-    </w:p>
-    <w:p>
-      <w:pPr>
-        <w:pStyle w:val="Heading3"/>
-      </w:pPr>
-      <w:bookmarkStart w:id="34" w:name="_Toc223987303"/>
-      <w:r>
-        <w:t>Interaction Improvements</w:t>
-      </w:r>
-      <w:bookmarkEnd w:id="34"/>
-    </w:p>
-    <w:p>
-      <w:r>
-        <w:t xml:space="preserve">Hand physics collisions were removed </w:t>
-      </w:r>
-      <w:r>
-        <w:t xml:space="preserve">which allowed the user interactions with the </w:t>
-      </w:r>
-      <w:r>
-        <w:t xml:space="preserve">light switch </w:t>
-      </w:r>
-      <w:r>
-        <w:t xml:space="preserve">to </w:t>
-      </w:r>
-      <w:r>
-        <w:t>work as intended</w:t>
-      </w:r>
-      <w:r>
-        <w:t>.</w:t>
-      </w:r>
-      <w:r>
-        <w:t xml:space="preserve"> In addition to this, the blueprint for the light switch was heavily simplified. The original blueprint used logic that worked for a lever like interaction component that was quite large and would adjust its rotation based on where the player hand was while interacting with the object. However, the light switch was a small object where there was a minimal difference in position of the hand component. The logic needed to be simplified to detection of the user interacting with the grab component</w:t>
-      </w:r>
-      <w:r>
-        <w:t xml:space="preserve"> of the switch</w:t>
-      </w:r>
-      <w:r>
-        <w:t>.</w:t>
-      </w:r>
-      <w:r>
-        <w:t xml:space="preserve"> </w:t>
-      </w:r>
-      <w:r>
-        <w:t>T</w:t>
-      </w:r>
-      <w:r>
-        <w:t>hen the light</w:t>
-      </w:r>
-      <w:r>
-        <w:t xml:space="preserve"> would be </w:t>
-      </w:r>
-      <w:r>
-        <w:t>turned</w:t>
-      </w:r>
-      <w:r>
-        <w:t xml:space="preserve"> on or off depending on the value of a Boolean variable, which stored the information on whether the lights were currently switched on or off. </w:t>
-      </w:r>
-    </w:p>
-    <w:p>
-      <w:r>
-        <w:t xml:space="preserve">From this change, most of the other supporting code within the event graph was no longer necessary so was removed to strip the blueprint back to basics. </w:t>
-      </w:r>
-      <w:r>
-        <w:t xml:space="preserve">As the physics collisions were no longer blocking the player hand components from </w:t>
-      </w:r>
-      <w:r>
-        <w:t>moving</w:t>
-      </w:r>
-      <w:r>
-        <w:t xml:space="preserve"> into the light switch</w:t>
-      </w:r>
-      <w:r>
-        <w:t xml:space="preserve"> and the logic of the light switch had become simplified</w:t>
-      </w:r>
-      <w:r>
-        <w:t>,</w:t>
-      </w:r>
-      <w:r>
-        <w:t xml:space="preserve"> </w:t>
-      </w:r>
-      <w:r>
-        <w:t xml:space="preserve">the interaction could </w:t>
-      </w:r>
-      <w:r>
-        <w:t xml:space="preserve">reliably </w:t>
-      </w:r>
-      <w:r>
-        <w:t>receive</w:t>
-      </w:r>
-      <w:r>
-        <w:t xml:space="preserve"> </w:t>
-      </w:r>
-      <w:r>
-        <w:t>trigger inputs from the user</w:t>
-      </w:r>
-      <w:r>
-        <w:t>.</w:t>
-      </w:r>
-    </w:p>
-    <w:p>
-      <w:pPr>
-        <w:pStyle w:val="Heading3"/>
-      </w:pPr>
-      <w:bookmarkStart w:id="35" w:name="_Toc223987304"/>
-      <w:r>
-        <w:t>Flow Tweaks</w:t>
-      </w:r>
-      <w:bookmarkEnd w:id="35"/>
-    </w:p>
-    <w:p>
-      <w:r>
-        <w:t xml:space="preserve">The </w:t>
-      </w:r>
-      <w:r>
-        <w:t>timeline duration between objectives 4 and 5 for triggering and reverting the light sensitivity symptom</w:t>
-      </w:r>
-      <w:r>
-        <w:t xml:space="preserve"> w</w:t>
-      </w:r>
-      <w:r>
-        <w:t>as</w:t>
-      </w:r>
-      <w:r>
-        <w:t xml:space="preserve"> reduced</w:t>
-      </w:r>
-      <w:r>
-        <w:t xml:space="preserve">. </w:t>
-      </w:r>
-      <w:r>
-        <w:t>S</w:t>
-      </w:r>
-      <w:r>
-        <w:t>ymptom effects were still able to be portrayed to users while showing prevention methods worked.</w:t>
-      </w:r>
-      <w:r>
-        <w:t xml:space="preserve"> </w:t>
-      </w:r>
-      <w:r>
-        <w:t>O</w:t>
-      </w:r>
-      <w:r>
-        <w:t xml:space="preserve">bjectives should not overlap each other </w:t>
-      </w:r>
-      <w:r>
-        <w:t>or</w:t>
-      </w:r>
-      <w:r>
-        <w:t xml:space="preserve"> show </w:t>
-      </w:r>
-      <w:r>
-        <w:t xml:space="preserve">unexpected </w:t>
-      </w:r>
-      <w:r>
-        <w:t>behaviour</w:t>
-      </w:r>
-      <w:r>
-        <w:t xml:space="preserve"> </w:t>
-      </w:r>
-      <w:r>
-        <w:t>to the player</w:t>
-      </w:r>
-      <w:r>
-        <w:t>. T</w:t>
-      </w:r>
-      <w:r>
-        <w:t xml:space="preserve">his </w:t>
-      </w:r>
-      <w:r>
-        <w:t>keep</w:t>
-      </w:r>
-      <w:r>
-        <w:t>s</w:t>
-      </w:r>
-      <w:r>
-        <w:t xml:space="preserve"> the understanding </w:t>
-      </w:r>
-      <w:r>
-        <w:t xml:space="preserve">of the experience </w:t>
-      </w:r>
-      <w:r>
-        <w:t xml:space="preserve">clear and </w:t>
-      </w:r>
-      <w:r>
-        <w:t>prioritises</w:t>
-      </w:r>
-      <w:r>
-        <w:t xml:space="preserve"> information retention.</w:t>
-      </w:r>
-    </w:p>
-    <w:p>
-      <w:pPr>
-        <w:pStyle w:val="Heading3"/>
-      </w:pPr>
-      <w:bookmarkStart w:id="36" w:name="_Toc223987305"/>
+      <w:bookmarkStart w:id="36" w:name="_Toc224050609"/>
       <w:r>
         <w:t>Gaze Detection Refinements</w:t>
       </w:r>
@@ -10511,7 +10690,7 @@
       <w:pPr>
         <w:pStyle w:val="Heading1"/>
       </w:pPr>
-      <w:bookmarkStart w:id="37" w:name="_Toc223987306"/>
+      <w:bookmarkStart w:id="37" w:name="_Toc224050610"/>
       <w:r>
         <w:lastRenderedPageBreak/>
         <w:t>Results</w:t>
@@ -10522,7 +10701,7 @@
       <w:pPr>
         <w:pStyle w:val="Heading2"/>
       </w:pPr>
-      <w:bookmarkStart w:id="38" w:name="_Toc223987307"/>
+      <w:bookmarkStart w:id="38" w:name="_Toc224050611"/>
       <w:r>
         <w:t>Prototype Tests</w:t>
       </w:r>
@@ -10618,7 +10797,7 @@
       <w:pPr>
         <w:pStyle w:val="Heading3"/>
       </w:pPr>
-      <w:bookmarkStart w:id="39" w:name="_Toc223987308"/>
+      <w:bookmarkStart w:id="39" w:name="_Toc224050612"/>
       <w:r>
         <w:t>Interaction</w:t>
       </w:r>
@@ -10779,7 +10958,7 @@
       <w:pPr>
         <w:pStyle w:val="Heading3"/>
       </w:pPr>
-      <w:bookmarkStart w:id="40" w:name="_Toc223987309"/>
+      <w:bookmarkStart w:id="40" w:name="_Toc224050613"/>
       <w:r>
         <w:t>User Attention Detection</w:t>
       </w:r>
@@ -10836,7 +11015,7 @@
       <w:pPr>
         <w:pStyle w:val="Heading3"/>
       </w:pPr>
-      <w:bookmarkStart w:id="41" w:name="_Toc223987310"/>
+      <w:bookmarkStart w:id="41" w:name="_Toc224050614"/>
       <w:r>
         <w:t>Symptom Simulations</w:t>
       </w:r>
@@ -10978,7 +11157,7 @@
       <w:pPr>
         <w:pStyle w:val="Heading3"/>
       </w:pPr>
-      <w:bookmarkStart w:id="42" w:name="_Toc223987311"/>
+      <w:bookmarkStart w:id="42" w:name="_Toc224050615"/>
       <w:r>
         <w:t xml:space="preserve">Improvements to be </w:t>
       </w:r>
@@ -11028,7 +11207,7 @@
       <w:pPr>
         <w:pStyle w:val="Heading2"/>
       </w:pPr>
-      <w:bookmarkStart w:id="43" w:name="_Toc223987312"/>
+      <w:bookmarkStart w:id="43" w:name="_Toc224050616"/>
       <w:r>
         <w:lastRenderedPageBreak/>
         <w:t>Final Version Tests</w:t>
@@ -11068,7 +11247,7 @@
       <w:pPr>
         <w:pStyle w:val="Heading3"/>
       </w:pPr>
-      <w:bookmarkStart w:id="44" w:name="_Toc223987313"/>
+      <w:bookmarkStart w:id="44" w:name="_Toc224050617"/>
       <w:r>
         <w:t>Interaction Objects and Objective Understanding</w:t>
       </w:r>
@@ -11122,7 +11301,7 @@
       <w:pPr>
         <w:pStyle w:val="Heading3"/>
       </w:pPr>
-      <w:bookmarkStart w:id="45" w:name="_Toc223987314"/>
+      <w:bookmarkStart w:id="45" w:name="_Toc224050618"/>
       <w:r>
         <w:t>User Attention Detection</w:t>
       </w:r>
@@ -11185,7 +11364,7 @@
       <w:pPr>
         <w:pStyle w:val="Heading3"/>
       </w:pPr>
-      <w:bookmarkStart w:id="46" w:name="_Toc223987315"/>
+      <w:bookmarkStart w:id="46" w:name="_Toc224050619"/>
       <w:r>
         <w:t>Symptom Simulation</w:t>
       </w:r>
@@ -11228,7 +11407,7 @@
       <w:pPr>
         <w:pStyle w:val="Heading1"/>
       </w:pPr>
-      <w:bookmarkStart w:id="47" w:name="_Toc223987316"/>
+      <w:bookmarkStart w:id="47" w:name="_Toc224050620"/>
       <w:r>
         <w:lastRenderedPageBreak/>
         <w:t>Critical Evaluation</w:t>
@@ -11282,7 +11461,7 @@
       <w:pPr>
         <w:pStyle w:val="Heading1"/>
       </w:pPr>
-      <w:bookmarkStart w:id="48" w:name="_Toc223987317"/>
+      <w:bookmarkStart w:id="48" w:name="_Toc224050621"/>
       <w:r>
         <w:lastRenderedPageBreak/>
         <w:t>Conclusions and Future Work</w:t>
@@ -11293,7 +11472,7 @@
       <w:pPr>
         <w:pStyle w:val="Heading2"/>
       </w:pPr>
-      <w:bookmarkStart w:id="49" w:name="_Toc223987318"/>
+      <w:bookmarkStart w:id="49" w:name="_Toc224050622"/>
       <w:r>
         <w:t>Conclusion</w:t>
       </w:r>
@@ -11304,7 +11483,7 @@
       <w:pPr>
         <w:pStyle w:val="Heading2"/>
       </w:pPr>
-      <w:bookmarkStart w:id="50" w:name="_Toc223987319"/>
+      <w:bookmarkStart w:id="50" w:name="_Toc224050623"/>
       <w:r>
         <w:t>Future Work</w:t>
       </w:r>
@@ -11389,7 +11568,7 @@
       <w:pPr>
         <w:pStyle w:val="Heading1"/>
       </w:pPr>
-      <w:bookmarkStart w:id="51" w:name="_Toc223987320"/>
+      <w:bookmarkStart w:id="51" w:name="_Toc224050624"/>
       <w:r>
         <w:lastRenderedPageBreak/>
         <w:t>References</w:t>
@@ -11423,7 +11602,21 @@
       </w:r>
       <w:proofErr w:type="spellEnd"/>
       <w:r>
-        <w:t xml:space="preserve"> 11, p. e14937. Available at: https://www.researchgate.net/publication/369002899_Prevalence_and_risk_factors_of_computer_vision_syndrome-assessed_in_office_workers_by_a_validated_questionnaire (Accessed: 20 October 2025).</w:t>
+        <w:t xml:space="preserve"> 11, p. e14937. Available at: </w:t>
+      </w:r>
+      <w:hyperlink r:id="rId15" w:history="1">
+        <w:r>
+          <w:rPr>
+            <w:rStyle w:val="Hyperlink"/>
+          </w:rPr>
+          <w:t>https://www.researchgate.net/publication/369002899_Prevalence_and_risk_factors_of_computer_vision_syndrome-assessed_in_office_workers_by_a_validated_questionnaire</w:t>
+        </w:r>
+      </w:hyperlink>
+      <w:r>
+        <w:t xml:space="preserve"> </w:t>
+      </w:r>
+      <w:r>
+        <w:t>(Accessed: 20 October 2025).</w:t>
       </w:r>
     </w:p>
     <w:p>
@@ -11438,7 +11631,18 @@
         <w:t>Git - Book</w:t>
       </w:r>
       <w:r>
-        <w:t>. Available at: https://git-scm.com/book/en/v2.</w:t>
+        <w:t xml:space="preserve">. Available at: </w:t>
+      </w:r>
+      <w:hyperlink r:id="rId16" w:history="1">
+        <w:r>
+          <w:rPr>
+            <w:rStyle w:val="Hyperlink"/>
+          </w:rPr>
+          <w:t>https://git-scm.com/book/en/v2</w:t>
+        </w:r>
+      </w:hyperlink>
+      <w:r>
+        <w:t>.</w:t>
       </w:r>
     </w:p>
     <w:p>
@@ -11451,7 +11655,15 @@
       </w:r>
       <w:proofErr w:type="spellEnd"/>
       <w:r>
-        <w:t xml:space="preserve">, M. (2013) ‘Computer vision syndrome: a study of knowledge and practices in university students’. </w:t>
+        <w:t xml:space="preserve">, M. (2013) ‘Computer vision syndrome: a study of knowledge and practices in university </w:t>
+      </w:r>
+      <w:proofErr w:type="gramStart"/>
+      <w:r>
+        <w:t>students’</w:t>
+      </w:r>
+      <w:proofErr w:type="gramEnd"/>
+      <w:r>
+        <w:t xml:space="preserve">. </w:t>
       </w:r>
       <w:r>
         <w:rPr>
@@ -11463,7 +11675,7 @@
       <w:r>
         <w:t xml:space="preserve"> 5, pp. 161–168. Available at: </w:t>
       </w:r>
-      <w:hyperlink r:id="rId15" w:history="1">
+      <w:hyperlink r:id="rId17" w:history="1">
         <w:r>
           <w:rPr>
             <w:rStyle w:val="Hyperlink"/>
@@ -11477,19 +11689,45 @@
     </w:p>
     <w:p>
       <w:r>
-        <w:t xml:space="preserve">GitHub (2024) </w:t>
+        <w:t xml:space="preserve">Conner, N.O., Freeman, H.R., Jones, J.A., Luczak, T., Carruth, D., Knight, A.C. and Chander, H. (2022) ‘Virtual Reality Induced Symptoms and Effects: Concerns, Causes, Assessment &amp; Mitigation’. </w:t>
       </w:r>
       <w:r>
         <w:rPr>
           <w:i/>
           <w:iCs/>
         </w:rPr>
+        <w:t>Virtual Worlds</w:t>
+      </w:r>
+      <w:r>
+        <w:t xml:space="preserve"> 1(2), pp. 130–146. Available at: </w:t>
+      </w:r>
+      <w:hyperlink r:id="rId18" w:history="1">
+        <w:r>
+          <w:rPr>
+            <w:rStyle w:val="Hyperlink"/>
+          </w:rPr>
+          <w:t>https://www.mdpi.com/2813-2084/1/2/8</w:t>
+        </w:r>
+      </w:hyperlink>
+      <w:r>
+        <w:t>.</w:t>
+      </w:r>
+    </w:p>
+    <w:p>
+      <w:r>
+        <w:t xml:space="preserve">GitHub (2024) </w:t>
+      </w:r>
+      <w:r>
+        <w:rPr>
+          <w:i/>
+          <w:iCs/>
+        </w:rPr>
         <w:t>About GitHub and Git</w:t>
       </w:r>
       <w:r>
         <w:t xml:space="preserve">. Available at: </w:t>
       </w:r>
-      <w:hyperlink r:id="rId16" w:history="1">
+      <w:hyperlink r:id="rId19" w:history="1">
         <w:r>
           <w:rPr>
             <w:rStyle w:val="Hyperlink"/>
@@ -11510,26 +11748,42 @@
           <w:i/>
           <w:iCs/>
         </w:rPr>
-        <w:t>User-Centred Systems Design</w:t>
-      </w:r>
+        <w:t xml:space="preserve">User-Centred Systems </w:t>
+      </w:r>
+      <w:proofErr w:type="gramStart"/>
       <w:r>
         <w:rPr>
           <w:i/>
           <w:iCs/>
         </w:rPr>
-        <w:t xml:space="preserve"> </w:t>
+        <w:t>Design</w:t>
       </w:r>
       <w:r>
         <w:rPr>
           <w:i/>
           <w:iCs/>
         </w:rPr>
-        <w:t>: Designing Usable Interactive Systems in Practice</w:t>
+        <w:t xml:space="preserve"> </w:t>
+      </w:r>
+      <w:r>
+        <w:rPr>
+          <w:i/>
+          <w:iCs/>
+        </w:rPr>
+        <w:t>:</w:t>
+      </w:r>
+      <w:proofErr w:type="gramEnd"/>
+      <w:r>
+        <w:rPr>
+          <w:i/>
+          <w:iCs/>
+        </w:rPr>
+        <w:t xml:space="preserve"> Designing Usable Interactive Systems in Practice</w:t>
       </w:r>
       <w:r>
         <w:t xml:space="preserve">. Available at: </w:t>
       </w:r>
-      <w:hyperlink r:id="rId17" w:history="1">
+      <w:hyperlink r:id="rId20" w:history="1">
         <w:r>
           <w:rPr>
             <w:rStyle w:val="Hyperlink"/>
@@ -11571,7 +11825,7 @@
       <w:r>
         <w:t xml:space="preserve"> 12(3), p. e0173403. Available at: </w:t>
       </w:r>
-      <w:hyperlink r:id="rId18" w:history="1">
+      <w:hyperlink r:id="rId21" w:history="1">
         <w:r>
           <w:rPr>
             <w:rStyle w:val="Hyperlink"/>
@@ -11616,7 +11870,7 @@
       <w:r>
         <w:t xml:space="preserve">: </w:t>
       </w:r>
-      <w:hyperlink r:id="rId19" w:history="1">
+      <w:hyperlink r:id="rId22" w:history="1">
         <w:r>
           <w:rPr>
             <w:rStyle w:val="Hyperlink"/>
@@ -11650,7 +11904,7 @@
       <w:r>
         <w:t xml:space="preserve"> 79, p. 101733. Available at: </w:t>
       </w:r>
-      <w:hyperlink r:id="rId20" w:history="1">
+      <w:hyperlink r:id="rId23" w:history="1">
         <w:r>
           <w:rPr>
             <w:rStyle w:val="Hyperlink"/>
@@ -11675,7 +11929,18 @@
       </w:r>
       <w:proofErr w:type="spellEnd"/>
       <w:r>
-        <w:t>: https://doi.org/10.1109/SEGAH54908.2022.9978597.</w:t>
+        <w:t xml:space="preserve">: </w:t>
+      </w:r>
+      <w:hyperlink r:id="rId24" w:history="1">
+        <w:r>
+          <w:rPr>
+            <w:rStyle w:val="Hyperlink"/>
+          </w:rPr>
+          <w:t>https://doi.org/10.1109/SEGAH54908.2022.9978597</w:t>
+        </w:r>
+      </w:hyperlink>
+      <w:r>
+        <w:t>.</w:t>
       </w:r>
     </w:p>
     <w:p>
@@ -11685,7 +11950,15 @@
       </w:r>
       <w:proofErr w:type="spellEnd"/>
       <w:r>
-        <w:t xml:space="preserve">, E., Pons, A. and Lorente, A. (2016) ‘Visual and ocular effects from the use of flat-panel displays’. </w:t>
+        <w:t xml:space="preserve">, E., Pons, A. and Lorente, A. (2016) ‘Visual and ocular effects from the use of flat-panel </w:t>
+      </w:r>
+      <w:proofErr w:type="gramStart"/>
+      <w:r>
+        <w:t>displays’</w:t>
+      </w:r>
+      <w:proofErr w:type="gramEnd"/>
+      <w:r>
+        <w:t xml:space="preserve">. </w:t>
       </w:r>
       <w:r>
         <w:rPr>
@@ -11695,7 +11968,21 @@
         <w:t>International journal of ophthalmology</w:t>
       </w:r>
       <w:r>
-        <w:t xml:space="preserve"> 9(6), pp. 881–5. Available at: https://pmc.ncbi.nlm.nih.gov/articles/PMC4916147/ (Accessed: 20 October 2025).</w:t>
+        <w:t xml:space="preserve"> 9(6), pp. 881–5. Available at: </w:t>
+      </w:r>
+      <w:hyperlink r:id="rId25" w:history="1">
+        <w:r>
+          <w:rPr>
+            <w:rStyle w:val="Hyperlink"/>
+          </w:rPr>
+          <w:t>https://pmc.ncbi.nlm.nih.gov/articles/PMC4916147/</w:t>
+        </w:r>
+      </w:hyperlink>
+      <w:r>
+        <w:t xml:space="preserve"> </w:t>
+      </w:r>
+      <w:r>
+        <w:t>(Accessed: 20 October 2025).</w:t>
       </w:r>
     </w:p>
     <w:p>
@@ -11708,7 +11995,15 @@
       </w:r>
       <w:proofErr w:type="spellEnd"/>
       <w:r>
-        <w:t xml:space="preserve"> (2025) ‘Virtual vs. traditional learning in higher education: A systematic review of comparative studies’. </w:t>
+        <w:t xml:space="preserve"> (2025) ‘Virtual vs. traditional learning in higher education: A systematic review of comparative </w:t>
+      </w:r>
+      <w:proofErr w:type="gramStart"/>
+      <w:r>
+        <w:t>studies’</w:t>
+      </w:r>
+      <w:proofErr w:type="gramEnd"/>
+      <w:r>
+        <w:t xml:space="preserve">. </w:t>
       </w:r>
       <w:r>
         <w:rPr>
@@ -11718,67 +12013,49 @@
         <w:t>Computers &amp; Education</w:t>
       </w:r>
       <w:r>
-        <w:t xml:space="preserve"> 227(0360-1315), p. 105214. Available at: https://www.sciencedirect.com/science/article/pii/S0360131524002288.</w:t>
-      </w:r>
-    </w:p>
-    <w:p>
-      <w:r>
-        <w:t xml:space="preserve">Sharma, M., Kumar, P. and Singh, D.K. (2024) ‘The Role of Virtual Reality in Education: A Comprehensive Review of Research and Application’. Available at: </w:t>
+        <w:t xml:space="preserve"> </w:t>
       </w:r>
       <w:r>
         <w:lastRenderedPageBreak/>
-        <w:t>https://ieeexplore.ieee.org/document/10406461/authors#authors (Accessed: 21 October 2025).</w:t>
-      </w:r>
-    </w:p>
-    <w:p>
-      <w:r>
-        <w:t xml:space="preserve">Sheppard, A.L. and Wolffsohn, J.S. (2018) ‘Digital eye strain: prevalence, measurement and amelioration’. </w:t>
+        <w:t xml:space="preserve">227(0360-1315), p. 105214. Available at: </w:t>
+      </w:r>
+      <w:hyperlink r:id="rId26" w:history="1">
+        <w:r>
+          <w:rPr>
+            <w:rStyle w:val="Hyperlink"/>
+          </w:rPr>
+          <w:t>https://www.sciencedirect.com/science/article/pii/S0360131524002288</w:t>
+        </w:r>
+      </w:hyperlink>
+      <w:r>
+        <w:t>.</w:t>
+      </w:r>
+    </w:p>
+    <w:p>
+      <w:r>
+        <w:t xml:space="preserve">Seo, G. and Bae, B.-C. (2018) ‘Towards the Utilization of Diegetic UI in Virtual Reality Educational Content’. </w:t>
       </w:r>
       <w:r>
         <w:rPr>
           <w:i/>
           <w:iCs/>
         </w:rPr>
-        <w:t>BMJ Open Ophthalmology</w:t>
-      </w:r>
-      <w:r>
-        <w:t xml:space="preserve"> 3(1), p. e000146. Available at: https://bmjophth.bmj.com/content/3/1/e000146.</w:t>
-      </w:r>
-    </w:p>
-    <w:p>
-      <w:r>
-        <w:t>Vieira, F., Oliveira, E. and Rodrigues, N. (2019) ‘</w:t>
-      </w:r>
-      <w:proofErr w:type="spellStart"/>
-      <w:r>
-        <w:t>iSVC</w:t>
-      </w:r>
-      <w:proofErr w:type="spellEnd"/>
-      <w:r>
-        <w:t xml:space="preserve"> – digital platform for detection and prevention of computer vision syndrome’., pp. 1–7. </w:t>
-      </w:r>
-      <w:proofErr w:type="spellStart"/>
-      <w:r>
-        <w:t>doi</w:t>
-      </w:r>
-      <w:proofErr w:type="spellEnd"/>
-      <w:r>
-        <w:t>: https://doi.org/10.1109/SeGAH.2019.8882438.</w:t>
-      </w:r>
-    </w:p>
-    <w:p>
-      <w:r>
-        <w:t xml:space="preserve">Wasswa, W. and Ware, J.A. (2025) ‘A Systematic Literature Review on Virtual Reality Applications in Medical Education’. </w:t>
-      </w:r>
+        <w:t xml:space="preserve">Communications in computer and information </w:t>
+      </w:r>
+      <w:proofErr w:type="gramStart"/>
       <w:r>
         <w:rPr>
           <w:i/>
           <w:iCs/>
         </w:rPr>
-        <w:t>Annals of Emerging Technologies in Computing</w:t>
-      </w:r>
-      <w:r>
-        <w:t xml:space="preserve"> 9(3), pp. 50–68. </w:t>
+        <w:t>science</w:t>
+      </w:r>
+      <w:r>
+        <w:t xml:space="preserve"> ,</w:t>
+      </w:r>
+      <w:proofErr w:type="gramEnd"/>
+      <w:r>
+        <w:t xml:space="preserve"> pp. 111–115. </w:t>
       </w:r>
       <w:proofErr w:type="spellStart"/>
       <w:r>
@@ -11786,26 +12063,148 @@
       </w:r>
       <w:proofErr w:type="spellEnd"/>
       <w:r>
-        <w:t>: https://doi.org/10.33166/aetic.2025.03.004.</w:t>
-      </w:r>
-    </w:p>
-    <w:p>
-      <w:r>
-        <w:t>Youcef, B., Ahmad, M.N. and Mustapha, M. (2021) ‘</w:t>
-      </w:r>
-      <w:proofErr w:type="spellStart"/>
-      <w:r>
-        <w:t>OntoPhaco</w:t>
-      </w:r>
-      <w:proofErr w:type="spellEnd"/>
-      <w:r>
-        <w:t xml:space="preserve">: An ontology for virtual reality training in ophthalmology Domain—A case study of cataract surgery’. </w:t>
+        <w:t xml:space="preserve">: </w:t>
+      </w:r>
+      <w:hyperlink r:id="rId27" w:history="1">
+        <w:r>
+          <w:rPr>
+            <w:rStyle w:val="Hyperlink"/>
+          </w:rPr>
+          <w:t>https://doi.org/10.1007/978-3-319-92285-0_16</w:t>
+        </w:r>
+      </w:hyperlink>
+      <w:r>
+        <w:t>.</w:t>
+      </w:r>
+    </w:p>
+    <w:p>
+      <w:r>
+        <w:t xml:space="preserve">Sharma, M., Kumar, P. and Singh, D.K. (2024) ‘The Role of Virtual Reality in Education: A Comprehensive Review of Research and Application’. Available at: </w:t>
+      </w:r>
+      <w:hyperlink r:id="rId28" w:history="1">
+        <w:r>
+          <w:rPr>
+            <w:rStyle w:val="Hyperlink"/>
+          </w:rPr>
+          <w:t>https://ieeexplore.ieee.org/document/10406461/authors#authors</w:t>
+        </w:r>
+      </w:hyperlink>
+      <w:r>
+        <w:t xml:space="preserve"> </w:t>
+      </w:r>
+      <w:r>
+        <w:t>(Accessed: 21 October 2025).</w:t>
+      </w:r>
+    </w:p>
+    <w:p>
+      <w:r>
+        <w:t xml:space="preserve">Sheppard, A.L. and Wolffsohn, J.S. (2018) ‘Digital eye strain: prevalence, measurement and amelioration’. </w:t>
       </w:r>
       <w:r>
         <w:rPr>
           <w:i/>
           <w:iCs/>
         </w:rPr>
+        <w:t>BMJ Open Ophthalmology</w:t>
+      </w:r>
+      <w:r>
+        <w:t xml:space="preserve"> 3(1), p. e000146. Available at: </w:t>
+      </w:r>
+      <w:hyperlink r:id="rId29" w:history="1">
+        <w:r>
+          <w:rPr>
+            <w:rStyle w:val="Hyperlink"/>
+          </w:rPr>
+          <w:t>https://bmjophth.bmj.com/content/3/1/e000146</w:t>
+        </w:r>
+      </w:hyperlink>
+      <w:r>
+        <w:t>.</w:t>
+      </w:r>
+    </w:p>
+    <w:p>
+      <w:r>
+        <w:t>Vieira, F., Oliveira, E. and Rodrigues, N. (2019) ‘</w:t>
+      </w:r>
+      <w:proofErr w:type="spellStart"/>
+      <w:r>
+        <w:t>iSVC</w:t>
+      </w:r>
+      <w:proofErr w:type="spellEnd"/>
+      <w:r>
+        <w:t xml:space="preserve"> – digital platform for detection and prevention of computer vision syndrome’., pp. 1–7. </w:t>
+      </w:r>
+      <w:proofErr w:type="spellStart"/>
+      <w:r>
+        <w:t>doi</w:t>
+      </w:r>
+      <w:proofErr w:type="spellEnd"/>
+      <w:r>
+        <w:t xml:space="preserve">: </w:t>
+      </w:r>
+      <w:hyperlink r:id="rId30" w:history="1">
+        <w:r>
+          <w:rPr>
+            <w:rStyle w:val="Hyperlink"/>
+          </w:rPr>
+          <w:t>https://doi.org/10.1109/SeGAH.2019.8882438</w:t>
+        </w:r>
+      </w:hyperlink>
+      <w:r>
+        <w:t>.</w:t>
+      </w:r>
+    </w:p>
+    <w:p>
+      <w:r>
+        <w:t xml:space="preserve">Wasswa, W. and Ware, J.A. (2025) ‘A Systematic Literature Review on Virtual Reality Applications in Medical Education’. </w:t>
+      </w:r>
+      <w:r>
+        <w:rPr>
+          <w:i/>
+          <w:iCs/>
+        </w:rPr>
+        <w:t>Annals of Emerging Technologies in Computing</w:t>
+      </w:r>
+      <w:r>
+        <w:t xml:space="preserve"> 9(3), pp. 50–68. </w:t>
+      </w:r>
+      <w:proofErr w:type="spellStart"/>
+      <w:r>
+        <w:t>doi</w:t>
+      </w:r>
+      <w:proofErr w:type="spellEnd"/>
+      <w:r>
+        <w:t xml:space="preserve">: </w:t>
+      </w:r>
+      <w:hyperlink r:id="rId31" w:history="1">
+        <w:r>
+          <w:rPr>
+            <w:rStyle w:val="Hyperlink"/>
+          </w:rPr>
+          <w:t>https://doi.org/10.33166/aetic.2025.03.004</w:t>
+        </w:r>
+      </w:hyperlink>
+      <w:r>
+        <w:t>.</w:t>
+      </w:r>
+    </w:p>
+    <w:p>
+      <w:r>
+        <w:t>Youcef, B., Ahmad, M.N. and Mustapha, M. (2021) ‘</w:t>
+      </w:r>
+      <w:proofErr w:type="spellStart"/>
+      <w:r>
+        <w:t>OntoPhaco</w:t>
+      </w:r>
+      <w:proofErr w:type="spellEnd"/>
+      <w:r>
+        <w:t xml:space="preserve">: An ontology for virtual reality training in ophthalmology Domain—A case study of cataract surgery’. </w:t>
+      </w:r>
+      <w:r>
+        <w:rPr>
+          <w:i/>
+          <w:iCs/>
+        </w:rPr>
         <w:t>IEEE Access</w:t>
       </w:r>
       <w:r>
@@ -11817,7 +12216,18 @@
       </w:r>
       <w:proofErr w:type="spellEnd"/>
       <w:r>
-        <w:t>: https://doi.org/10.1109/ACCESS.2021.3126697.</w:t>
+        <w:t xml:space="preserve">: </w:t>
+      </w:r>
+      <w:hyperlink r:id="rId32" w:history="1">
+        <w:r>
+          <w:rPr>
+            <w:rStyle w:val="Hyperlink"/>
+          </w:rPr>
+          <w:t>https://doi.org/10.1109/ACCESS.2021.3126697</w:t>
+        </w:r>
+      </w:hyperlink>
+      <w:r>
+        <w:t>.</w:t>
       </w:r>
     </w:p>
     <w:p/>
@@ -11825,7 +12235,7 @@
       <w:pPr>
         <w:pStyle w:val="Heading1"/>
       </w:pPr>
-      <w:bookmarkStart w:id="52" w:name="_Toc223987321"/>
+      <w:bookmarkStart w:id="52" w:name="_Toc224050625"/>
       <w:r>
         <w:t>Appendix</w:t>
       </w:r>
@@ -11835,7 +12245,7 @@
       <w:pPr>
         <w:pStyle w:val="Heading2"/>
       </w:pPr>
-      <w:bookmarkStart w:id="53" w:name="_Toc223987322"/>
+      <w:bookmarkStart w:id="53" w:name="_Toc224050626"/>
       <w:r>
         <w:t>Asset Licenses and Sources</w:t>
       </w:r>
@@ -11845,7 +12255,7 @@
       <w:pPr>
         <w:pStyle w:val="Heading3"/>
       </w:pPr>
-      <w:bookmarkStart w:id="54" w:name="_Toc223987323"/>
+      <w:bookmarkStart w:id="54" w:name="_Toc224050627"/>
       <w:r>
         <w:t>Modern Office Table</w:t>
       </w:r>
@@ -11872,7 +12282,7 @@
                     <pic:cNvPicPr/>
                   </pic:nvPicPr>
                   <pic:blipFill>
-                    <a:blip r:embed="rId21"/>
+                    <a:blip r:embed="rId33"/>
                     <a:stretch>
                       <a:fillRect/>
                     </a:stretch>
@@ -11897,7 +12307,7 @@
       <w:r>
         <w:t xml:space="preserve">Source: </w:t>
       </w:r>
-      <w:hyperlink r:id="rId22" w:history="1">
+      <w:hyperlink r:id="rId34" w:history="1">
         <w:r>
           <w:rPr>
             <w:rStyle w:val="Hyperlink"/>
@@ -11913,7 +12323,7 @@
       <w:r>
         <w:t xml:space="preserve">License: </w:t>
       </w:r>
-      <w:hyperlink r:id="rId23" w:history="1">
+      <w:hyperlink r:id="rId35" w:history="1">
         <w:r>
           <w:rPr>
             <w:rStyle w:val="Hyperlink"/>
@@ -11929,8 +12339,9 @@
       <w:pPr>
         <w:pStyle w:val="Heading3"/>
       </w:pPr>
-      <w:bookmarkStart w:id="55" w:name="_Toc223987324"/>
-      <w:r>
+      <w:bookmarkStart w:id="55" w:name="_Toc224050628"/>
+      <w:r>
+        <w:lastRenderedPageBreak/>
         <w:t>Free Studio Starter Pack</w:t>
       </w:r>
       <w:bookmarkEnd w:id="55"/>
@@ -11956,7 +12367,7 @@
                     <pic:cNvPicPr/>
                   </pic:nvPicPr>
                   <pic:blipFill>
-                    <a:blip r:embed="rId24"/>
+                    <a:blip r:embed="rId36"/>
                     <a:stretch>
                       <a:fillRect/>
                     </a:stretch>
@@ -11979,10 +12390,9 @@
     </w:p>
     <w:p>
       <w:r>
-        <w:lastRenderedPageBreak/>
         <w:t xml:space="preserve">Source: </w:t>
       </w:r>
-      <w:hyperlink r:id="rId25" w:history="1">
+      <w:hyperlink r:id="rId37" w:history="1">
         <w:r>
           <w:rPr>
             <w:rStyle w:val="Hyperlink"/>
@@ -11998,7 +12408,7 @@
       <w:r>
         <w:t xml:space="preserve">License: </w:t>
       </w:r>
-      <w:hyperlink r:id="rId26" w:history="1">
+      <w:hyperlink r:id="rId38" w:history="1">
         <w:r>
           <w:rPr>
             <w:rStyle w:val="Hyperlink"/>
@@ -12014,7 +12424,7 @@
       <w:pPr>
         <w:pStyle w:val="Heading3"/>
       </w:pPr>
-      <w:bookmarkStart w:id="56" w:name="_Toc223987325"/>
+      <w:bookmarkStart w:id="56" w:name="_Toc224050629"/>
       <w:r>
         <w:t>General Desktop Bundle</w:t>
       </w:r>
@@ -12041,7 +12451,7 @@
                     <pic:cNvPicPr/>
                   </pic:nvPicPr>
                   <pic:blipFill>
-                    <a:blip r:embed="rId27"/>
+                    <a:blip r:embed="rId39"/>
                     <a:stretch>
                       <a:fillRect/>
                     </a:stretch>
@@ -12066,7 +12476,7 @@
       <w:r>
         <w:t xml:space="preserve">Source: </w:t>
       </w:r>
-      <w:hyperlink r:id="rId28" w:history="1">
+      <w:hyperlink r:id="rId40" w:history="1">
         <w:r>
           <w:rPr>
             <w:rStyle w:val="Hyperlink"/>
@@ -12082,7 +12492,7 @@
       <w:r>
         <w:t xml:space="preserve">License: </w:t>
       </w:r>
-      <w:hyperlink r:id="rId29" w:history="1">
+      <w:hyperlink r:id="rId41" w:history="1">
         <w:r>
           <w:rPr>
             <w:rStyle w:val="Hyperlink"/>
@@ -12098,7 +12508,7 @@
       <w:pPr>
         <w:pStyle w:val="Heading3"/>
       </w:pPr>
-      <w:bookmarkStart w:id="57" w:name="_Toc223987326"/>
+      <w:bookmarkStart w:id="57" w:name="_Toc224050630"/>
       <w:r>
         <w:t>General Gaming Headset</w:t>
       </w:r>
@@ -12125,7 +12535,7 @@
                     <pic:cNvPicPr/>
                   </pic:nvPicPr>
                   <pic:blipFill>
-                    <a:blip r:embed="rId30"/>
+                    <a:blip r:embed="rId42"/>
                     <a:stretch>
                       <a:fillRect/>
                     </a:stretch>
@@ -12150,7 +12560,7 @@
       <w:r>
         <w:t xml:space="preserve">Source: </w:t>
       </w:r>
-      <w:hyperlink r:id="rId31" w:history="1">
+      <w:hyperlink r:id="rId43" w:history="1">
         <w:r>
           <w:rPr>
             <w:rStyle w:val="Hyperlink"/>
@@ -12166,7 +12576,7 @@
       <w:r>
         <w:t xml:space="preserve">License: </w:t>
       </w:r>
-      <w:hyperlink r:id="rId32" w:history="1">
+      <w:hyperlink r:id="rId44" w:history="1">
         <w:r>
           <w:rPr>
             <w:rStyle w:val="Hyperlink"/>
@@ -12182,8 +12592,9 @@
       <w:pPr>
         <w:pStyle w:val="Heading3"/>
       </w:pPr>
-      <w:bookmarkStart w:id="58" w:name="_Toc223987327"/>
-      <w:r>
+      <w:bookmarkStart w:id="58" w:name="_Toc224050631"/>
+      <w:r>
+        <w:lastRenderedPageBreak/>
         <w:t>General Gaming Chair</w:t>
       </w:r>
       <w:bookmarkEnd w:id="58"/>
@@ -12209,7 +12620,7 @@
                     <pic:cNvPicPr/>
                   </pic:nvPicPr>
                   <pic:blipFill>
-                    <a:blip r:embed="rId33"/>
+                    <a:blip r:embed="rId45"/>
                     <a:stretch>
                       <a:fillRect/>
                     </a:stretch>
@@ -12232,10 +12643,9 @@
     </w:p>
     <w:p>
       <w:r>
-        <w:lastRenderedPageBreak/>
         <w:t xml:space="preserve">Source: </w:t>
       </w:r>
-      <w:hyperlink r:id="rId34" w:history="1">
+      <w:hyperlink r:id="rId46" w:history="1">
         <w:r>
           <w:rPr>
             <w:rStyle w:val="Hyperlink"/>
@@ -12251,7 +12661,7 @@
       <w:r>
         <w:t xml:space="preserve">License: </w:t>
       </w:r>
-      <w:hyperlink r:id="rId35" w:history="1">
+      <w:hyperlink r:id="rId47" w:history="1">
         <w:r>
           <w:rPr>
             <w:rStyle w:val="Hyperlink"/>
@@ -12267,7 +12677,7 @@
       <w:pPr>
         <w:pStyle w:val="Heading3"/>
       </w:pPr>
-      <w:bookmarkStart w:id="59" w:name="_Toc223987328"/>
+      <w:bookmarkStart w:id="59" w:name="_Toc224050632"/>
       <w:r>
         <w:t>Light Switch</w:t>
       </w:r>
@@ -12294,7 +12704,7 @@
                     <pic:cNvPicPr/>
                   </pic:nvPicPr>
                   <pic:blipFill rotWithShape="1">
-                    <a:blip r:embed="rId36"/>
+                    <a:blip r:embed="rId48"/>
                     <a:srcRect t="23971" b="7788"/>
                     <a:stretch>
                       <a:fillRect/>
@@ -12331,7 +12741,7 @@
       <w:r>
         <w:t xml:space="preserve"> </w:t>
       </w:r>
-      <w:hyperlink r:id="rId37" w:history="1">
+      <w:hyperlink r:id="rId49" w:history="1">
         <w:r>
           <w:rPr>
             <w:rStyle w:val="Hyperlink"/>
@@ -12347,7 +12757,7 @@
       <w:r>
         <w:t xml:space="preserve">License: </w:t>
       </w:r>
-      <w:hyperlink r:id="rId38" w:history="1">
+      <w:hyperlink r:id="rId50" w:history="1">
         <w:r>
           <w:rPr>
             <w:rStyle w:val="Hyperlink"/>
@@ -12365,7 +12775,7 @@
       <w:pPr>
         <w:pStyle w:val="Heading3"/>
       </w:pPr>
-      <w:bookmarkStart w:id="60" w:name="_Toc223987329"/>
+      <w:bookmarkStart w:id="60" w:name="_Toc224050633"/>
       <w:r>
         <w:t>Materials for General PC setup</w:t>
       </w:r>
@@ -12378,7 +12788,7 @@
       <w:r>
         <w:t xml:space="preserve">Source: </w:t>
       </w:r>
-      <w:hyperlink r:id="rId39" w:history="1">
+      <w:hyperlink r:id="rId51" w:history="1">
         <w:r>
           <w:rPr>
             <w:rStyle w:val="Hyperlink"/>
@@ -12394,7 +12804,7 @@
       <w:r>
         <w:t xml:space="preserve">License: </w:t>
       </w:r>
-      <w:hyperlink r:id="rId40" w:history="1">
+      <w:hyperlink r:id="rId52" w:history="1">
         <w:r>
           <w:rPr>
             <w:rStyle w:val="Hyperlink"/>
@@ -12427,7 +12837,7 @@
                     <pic:cNvPicPr/>
                   </pic:nvPicPr>
                   <pic:blipFill>
-                    <a:blip r:embed="rId41"/>
+                    <a:blip r:embed="rId53"/>
                     <a:stretch>
                       <a:fillRect/>
                     </a:stretch>
@@ -12470,7 +12880,7 @@
                     <pic:cNvPicPr/>
                   </pic:nvPicPr>
                   <pic:blipFill>
-                    <a:blip r:embed="rId42"/>
+                    <a:blip r:embed="rId54"/>
                     <a:stretch>
                       <a:fillRect/>
                     </a:stretch>
@@ -12495,7 +12905,7 @@
       <w:pPr>
         <w:pStyle w:val="Heading3"/>
       </w:pPr>
-      <w:bookmarkStart w:id="61" w:name="_Toc223987330"/>
+      <w:bookmarkStart w:id="61" w:name="_Toc224050634"/>
       <w:r>
         <w:t>Monitor background image</w:t>
       </w:r>
@@ -12528,7 +12938,7 @@
                     <pic:cNvPicPr/>
                   </pic:nvPicPr>
                   <pic:blipFill>
-                    <a:blip r:embed="rId43"/>
+                    <a:blip r:embed="rId55"/>
                     <a:stretch>
                       <a:fillRect/>
                     </a:stretch>
@@ -12553,7 +12963,7 @@
       <w:r>
         <w:t xml:space="preserve">Source: </w:t>
       </w:r>
-      <w:hyperlink r:id="rId44" w:history="1">
+      <w:hyperlink r:id="rId56" w:history="1">
         <w:r>
           <w:rPr>
             <w:rStyle w:val="Hyperlink"/>
@@ -12569,7 +12979,7 @@
       <w:r>
         <w:t xml:space="preserve">License: </w:t>
       </w:r>
-      <w:hyperlink r:id="rId45" w:history="1">
+      <w:hyperlink r:id="rId57" w:history="1">
         <w:r>
           <w:rPr>
             <w:rStyle w:val="Hyperlink"/>
@@ -12591,7 +13001,7 @@
       <w:pPr>
         <w:pStyle w:val="Heading3"/>
       </w:pPr>
-      <w:bookmarkStart w:id="62" w:name="_Toc223987331"/>
+      <w:bookmarkStart w:id="62" w:name="_Toc224050635"/>
       <w:r>
         <w:t xml:space="preserve">Button Hover </w:t>
       </w:r>
@@ -12620,7 +13030,7 @@
             <wp:extent cx="5731510" cy="2659380"/>
             <wp:effectExtent l="0" t="0" r="2540" b="7620"/>
             <wp:docPr id="1819945004" name="Picture 2" descr="Image">
-              <a:hlinkClick xmlns:a="http://schemas.openxmlformats.org/drawingml/2006/main" r:id="rId46" tgtFrame="&quot;_blank&quot;"/>
+              <a:hlinkClick xmlns:a="http://schemas.openxmlformats.org/drawingml/2006/main" r:id="rId58" tgtFrame="&quot;_blank&quot;"/>
             </wp:docPr>
             <wp:cNvGraphicFramePr>
               <a:graphicFrameLocks xmlns:a="http://schemas.openxmlformats.org/drawingml/2006/main" noChangeAspect="1"/>
@@ -12630,14 +13040,14 @@
                 <pic:pic xmlns:pic="http://schemas.openxmlformats.org/drawingml/2006/picture">
                   <pic:nvPicPr>
                     <pic:cNvPr id="0" name="Picture 6" descr="Image">
-                      <a:hlinkClick r:id="rId46" tgtFrame="&quot;_blank&quot;"/>
+                      <a:hlinkClick r:id="rId58" tgtFrame="&quot;_blank&quot;"/>
                     </pic:cNvPr>
                     <pic:cNvPicPr>
                       <a:picLocks noChangeAspect="1" noChangeArrowheads="1"/>
                     </pic:cNvPicPr>
                   </pic:nvPicPr>
                   <pic:blipFill>
-                    <a:blip r:embed="rId47">
+                    <a:blip r:embed="rId59">
                       <a:extLst>
                         <a:ext uri="{28A0092B-C50C-407E-A947-70E740481C1C}">
                           <a14:useLocalDpi xmlns:a14="http://schemas.microsoft.com/office/drawing/2010/main" val="0"/>
@@ -12677,7 +13087,7 @@
       <w:r>
         <w:t> </w:t>
       </w:r>
-      <w:hyperlink r:id="rId48" w:history="1">
+      <w:hyperlink r:id="rId60" w:history="1">
         <w:r>
           <w:rPr>
             <w:rStyle w:val="Hyperlink"/>
@@ -12693,7 +13103,7 @@
       <w:r>
         <w:t xml:space="preserve"> </w:t>
       </w:r>
-      <w:hyperlink r:id="rId49" w:history="1">
+      <w:hyperlink r:id="rId61" w:history="1">
         <w:r>
           <w:rPr>
             <w:rStyle w:val="Hyperlink"/>
@@ -12704,7 +13114,7 @@
     </w:p>
     <w:p/>
     <w:p>
-      <w:bookmarkStart w:id="63" w:name="_Toc223987332"/>
+      <w:bookmarkStart w:id="63" w:name="_Toc224050636"/>
       <w:r>
         <w:rPr>
           <w:rStyle w:val="Heading3Char"/>
@@ -12746,7 +13156,7 @@
             <wp:extent cx="5731510" cy="2298065"/>
             <wp:effectExtent l="0" t="0" r="2540" b="6985"/>
             <wp:docPr id="1391107064" name="Picture 4" descr="Image">
-              <a:hlinkClick xmlns:a="http://schemas.openxmlformats.org/drawingml/2006/main" r:id="rId50" tgtFrame="&quot;_blank&quot;"/>
+              <a:hlinkClick xmlns:a="http://schemas.openxmlformats.org/drawingml/2006/main" r:id="rId62" tgtFrame="&quot;_blank&quot;"/>
             </wp:docPr>
             <wp:cNvGraphicFramePr>
               <a:graphicFrameLocks xmlns:a="http://schemas.openxmlformats.org/drawingml/2006/main" noChangeAspect="1"/>
@@ -12756,14 +13166,14 @@
                 <pic:pic xmlns:pic="http://schemas.openxmlformats.org/drawingml/2006/picture">
                   <pic:nvPicPr>
                     <pic:cNvPr id="0" name="Picture 13" descr="Image">
-                      <a:hlinkClick r:id="rId50" tgtFrame="&quot;_blank&quot;"/>
+                      <a:hlinkClick r:id="rId62" tgtFrame="&quot;_blank&quot;"/>
                     </pic:cNvPr>
                     <pic:cNvPicPr>
                       <a:picLocks noChangeAspect="1" noChangeArrowheads="1"/>
                     </pic:cNvPicPr>
                   </pic:nvPicPr>
                   <pic:blipFill>
-                    <a:blip r:embed="rId51">
+                    <a:blip r:embed="rId63">
                       <a:extLst>
                         <a:ext uri="{28A0092B-C50C-407E-A947-70E740481C1C}">
                           <a14:useLocalDpi xmlns:a14="http://schemas.microsoft.com/office/drawing/2010/main" val="0"/>
@@ -12800,7 +13210,7 @@
       <w:r>
         <w:t> </w:t>
       </w:r>
-      <w:hyperlink r:id="rId52" w:history="1">
+      <w:hyperlink r:id="rId64" w:history="1">
         <w:r>
           <w:rPr>
             <w:rStyle w:val="Hyperlink"/>
@@ -12813,7 +13223,7 @@
       <w:r>
         <w:t>License: </w:t>
       </w:r>
-      <w:hyperlink r:id="rId53" w:history="1">
+      <w:hyperlink r:id="rId65" w:history="1">
         <w:r>
           <w:rPr>
             <w:rStyle w:val="Hyperlink"/>
@@ -12839,10 +13249,18 @@
       <w:pPr>
         <w:pStyle w:val="Heading3"/>
       </w:pPr>
-      <w:bookmarkStart w:id="64" w:name="_Toc223987333"/>
+      <w:bookmarkStart w:id="64" w:name="_Toc224050637"/>
       <w:r>
         <w:lastRenderedPageBreak/>
-        <w:t xml:space="preserve">Light Switch On </w:t>
+        <w:t xml:space="preserve">Light Switch </w:t>
+      </w:r>
+      <w:proofErr w:type="gramStart"/>
+      <w:r>
+        <w:t>On</w:t>
+      </w:r>
+      <w:proofErr w:type="gramEnd"/>
+      <w:r>
+        <w:t xml:space="preserve"> </w:t>
       </w:r>
       <w:proofErr w:type="spellStart"/>
       <w:r>
@@ -12855,7 +13273,7 @@
       <w:r>
         <w:t>Source: </w:t>
       </w:r>
-      <w:hyperlink r:id="rId54" w:history="1">
+      <w:hyperlink r:id="rId66" w:history="1">
         <w:r>
           <w:rPr>
             <w:rStyle w:val="Hyperlink"/>
@@ -12867,7 +13285,7 @@
         <w:br/>
         <w:t>License: </w:t>
       </w:r>
-      <w:hyperlink r:id="rId55" w:history="1">
+      <w:hyperlink r:id="rId67" w:history="1">
         <w:r>
           <w:rPr>
             <w:rStyle w:val="Hyperlink"/>
@@ -12886,7 +13304,7 @@
             <wp:extent cx="5731510" cy="2829560"/>
             <wp:effectExtent l="0" t="0" r="2540" b="8890"/>
             <wp:docPr id="300778054" name="Picture 2" descr="Image">
-              <a:hlinkClick xmlns:a="http://schemas.openxmlformats.org/drawingml/2006/main" r:id="rId56" tgtFrame="&quot;_blank&quot;"/>
+              <a:hlinkClick xmlns:a="http://schemas.openxmlformats.org/drawingml/2006/main" r:id="rId68" tgtFrame="&quot;_blank&quot;"/>
             </wp:docPr>
             <wp:cNvGraphicFramePr>
               <a:graphicFrameLocks xmlns:a="http://schemas.openxmlformats.org/drawingml/2006/main" noChangeAspect="1"/>
@@ -12896,14 +13314,14 @@
                 <pic:pic xmlns:pic="http://schemas.openxmlformats.org/drawingml/2006/picture">
                   <pic:nvPicPr>
                     <pic:cNvPr id="0" name="Picture 6" descr="Image">
-                      <a:hlinkClick r:id="rId56" tgtFrame="&quot;_blank&quot;"/>
+                      <a:hlinkClick r:id="rId68" tgtFrame="&quot;_blank&quot;"/>
                     </pic:cNvPr>
                     <pic:cNvPicPr>
                       <a:picLocks noChangeAspect="1" noChangeArrowheads="1"/>
                     </pic:cNvPicPr>
                   </pic:nvPicPr>
                   <pic:blipFill>
-                    <a:blip r:embed="rId57">
+                    <a:blip r:embed="rId69">
                       <a:extLst>
                         <a:ext uri="{28A0092B-C50C-407E-A947-70E740481C1C}">
                           <a14:useLocalDpi xmlns:a14="http://schemas.microsoft.com/office/drawing/2010/main" val="0"/>
@@ -12939,7 +13357,7 @@
       <w:pPr>
         <w:pStyle w:val="Heading3"/>
       </w:pPr>
-      <w:bookmarkStart w:id="65" w:name="_Toc223987334"/>
+      <w:bookmarkStart w:id="65" w:name="_Toc224050638"/>
       <w:r>
         <w:t xml:space="preserve">Light Switch Off </w:t>
       </w:r>
@@ -12954,7 +13372,7 @@
       <w:r>
         <w:t>Source: </w:t>
       </w:r>
-      <w:hyperlink r:id="rId58" w:history="1">
+      <w:hyperlink r:id="rId70" w:history="1">
         <w:r>
           <w:rPr>
             <w:rStyle w:val="Hyperlink"/>
@@ -12966,7 +13384,7 @@
         <w:br/>
         <w:t>License: </w:t>
       </w:r>
-      <w:hyperlink r:id="rId59" w:history="1">
+      <w:hyperlink r:id="rId71" w:history="1">
         <w:r>
           <w:rPr>
             <w:rStyle w:val="Hyperlink"/>
@@ -12985,7 +13403,7 @@
             <wp:extent cx="5731510" cy="2783840"/>
             <wp:effectExtent l="0" t="0" r="2540" b="0"/>
             <wp:docPr id="1261778138" name="Picture 4" descr="Image">
-              <a:hlinkClick xmlns:a="http://schemas.openxmlformats.org/drawingml/2006/main" r:id="rId60" tgtFrame="&quot;_blank&quot;"/>
+              <a:hlinkClick xmlns:a="http://schemas.openxmlformats.org/drawingml/2006/main" r:id="rId72" tgtFrame="&quot;_blank&quot;"/>
             </wp:docPr>
             <wp:cNvGraphicFramePr>
               <a:graphicFrameLocks xmlns:a="http://schemas.openxmlformats.org/drawingml/2006/main" noChangeAspect="1"/>
@@ -12995,14 +13413,14 @@
                 <pic:pic xmlns:pic="http://schemas.openxmlformats.org/drawingml/2006/picture">
                   <pic:nvPicPr>
                     <pic:cNvPr id="0" name="Picture 13" descr="Image">
-                      <a:hlinkClick r:id="rId60" tgtFrame="&quot;_blank&quot;"/>
+                      <a:hlinkClick r:id="rId72" tgtFrame="&quot;_blank&quot;"/>
                     </pic:cNvPr>
                     <pic:cNvPicPr>
                       <a:picLocks noChangeAspect="1" noChangeArrowheads="1"/>
                     </pic:cNvPicPr>
                   </pic:nvPicPr>
                   <pic:blipFill>
-                    <a:blip r:embed="rId61">
+                    <a:blip r:embed="rId73">
                       <a:extLst>
                         <a:ext uri="{28A0092B-C50C-407E-A947-70E740481C1C}">
                           <a14:useLocalDpi xmlns:a14="http://schemas.microsoft.com/office/drawing/2010/main" val="0"/>

</xml_diff>

<commit_message>
Completed references for testing section
</commit_message>
<xml_diff>
--- a/30077548Thesis.docx
+++ b/30077548Thesis.docx
@@ -236,7 +236,7 @@
           <w:r>
             <w:fldChar w:fldCharType="separate"/>
           </w:r>
-          <w:hyperlink w:anchor="_Toc224063278" w:history="1">
+          <w:hyperlink w:anchor="_Toc224071315" w:history="1">
             <w:r>
               <w:rPr>
                 <w:rStyle w:val="Hyperlink"/>
@@ -263,7 +263,7 @@
                 <w:noProof/>
                 <w:webHidden/>
               </w:rPr>
-              <w:instrText xml:space="preserve"> PAGEREF _Toc224063278 \h </w:instrText>
+              <w:instrText xml:space="preserve"> PAGEREF _Toc224071315 \h </w:instrText>
             </w:r>
             <w:r>
               <w:rPr>
@@ -308,7 +308,7 @@
               <w:lang w:eastAsia="en-GB"/>
             </w:rPr>
           </w:pPr>
-          <w:hyperlink w:anchor="_Toc224063279" w:history="1">
+          <w:hyperlink w:anchor="_Toc224071316" w:history="1">
             <w:r>
               <w:rPr>
                 <w:rStyle w:val="Hyperlink"/>
@@ -335,7 +335,7 @@
                 <w:noProof/>
                 <w:webHidden/>
               </w:rPr>
-              <w:instrText xml:space="preserve"> PAGEREF _Toc224063279 \h </w:instrText>
+              <w:instrText xml:space="preserve"> PAGEREF _Toc224071316 \h </w:instrText>
             </w:r>
             <w:r>
               <w:rPr>
@@ -380,7 +380,7 @@
               <w:lang w:eastAsia="en-GB"/>
             </w:rPr>
           </w:pPr>
-          <w:hyperlink w:anchor="_Toc224063280" w:history="1">
+          <w:hyperlink w:anchor="_Toc224071317" w:history="1">
             <w:r>
               <w:rPr>
                 <w:rStyle w:val="Hyperlink"/>
@@ -407,7 +407,7 @@
                 <w:noProof/>
                 <w:webHidden/>
               </w:rPr>
-              <w:instrText xml:space="preserve"> PAGEREF _Toc224063280 \h </w:instrText>
+              <w:instrText xml:space="preserve"> PAGEREF _Toc224071317 \h </w:instrText>
             </w:r>
             <w:r>
               <w:rPr>
@@ -452,7 +452,7 @@
               <w:lang w:eastAsia="en-GB"/>
             </w:rPr>
           </w:pPr>
-          <w:hyperlink w:anchor="_Toc224063281" w:history="1">
+          <w:hyperlink w:anchor="_Toc224071318" w:history="1">
             <w:r>
               <w:rPr>
                 <w:rStyle w:val="Hyperlink"/>
@@ -479,7 +479,7 @@
                 <w:noProof/>
                 <w:webHidden/>
               </w:rPr>
-              <w:instrText xml:space="preserve"> PAGEREF _Toc224063281 \h </w:instrText>
+              <w:instrText xml:space="preserve"> PAGEREF _Toc224071318 \h </w:instrText>
             </w:r>
             <w:r>
               <w:rPr>
@@ -524,7 +524,7 @@
               <w:lang w:eastAsia="en-GB"/>
             </w:rPr>
           </w:pPr>
-          <w:hyperlink w:anchor="_Toc224063282" w:history="1">
+          <w:hyperlink w:anchor="_Toc224071319" w:history="1">
             <w:r>
               <w:rPr>
                 <w:rStyle w:val="Hyperlink"/>
@@ -551,7 +551,7 @@
                 <w:noProof/>
                 <w:webHidden/>
               </w:rPr>
-              <w:instrText xml:space="preserve"> PAGEREF _Toc224063282 \h </w:instrText>
+              <w:instrText xml:space="preserve"> PAGEREF _Toc224071319 \h </w:instrText>
             </w:r>
             <w:r>
               <w:rPr>
@@ -596,7 +596,7 @@
               <w:lang w:eastAsia="en-GB"/>
             </w:rPr>
           </w:pPr>
-          <w:hyperlink w:anchor="_Toc224063283" w:history="1">
+          <w:hyperlink w:anchor="_Toc224071320" w:history="1">
             <w:r>
               <w:rPr>
                 <w:rStyle w:val="Hyperlink"/>
@@ -623,7 +623,7 @@
                 <w:noProof/>
                 <w:webHidden/>
               </w:rPr>
-              <w:instrText xml:space="preserve"> PAGEREF _Toc224063283 \h </w:instrText>
+              <w:instrText xml:space="preserve"> PAGEREF _Toc224071320 \h </w:instrText>
             </w:r>
             <w:r>
               <w:rPr>
@@ -668,7 +668,7 @@
               <w:lang w:eastAsia="en-GB"/>
             </w:rPr>
           </w:pPr>
-          <w:hyperlink w:anchor="_Toc224063284" w:history="1">
+          <w:hyperlink w:anchor="_Toc224071321" w:history="1">
             <w:r>
               <w:rPr>
                 <w:rStyle w:val="Hyperlink"/>
@@ -695,7 +695,7 @@
                 <w:noProof/>
                 <w:webHidden/>
               </w:rPr>
-              <w:instrText xml:space="preserve"> PAGEREF _Toc224063284 \h </w:instrText>
+              <w:instrText xml:space="preserve"> PAGEREF _Toc224071321 \h </w:instrText>
             </w:r>
             <w:r>
               <w:rPr>
@@ -740,7 +740,7 @@
               <w:lang w:eastAsia="en-GB"/>
             </w:rPr>
           </w:pPr>
-          <w:hyperlink w:anchor="_Toc224063285" w:history="1">
+          <w:hyperlink w:anchor="_Toc224071322" w:history="1">
             <w:r>
               <w:rPr>
                 <w:rStyle w:val="Hyperlink"/>
@@ -767,7 +767,7 @@
                 <w:noProof/>
                 <w:webHidden/>
               </w:rPr>
-              <w:instrText xml:space="preserve"> PAGEREF _Toc224063285 \h </w:instrText>
+              <w:instrText xml:space="preserve"> PAGEREF _Toc224071322 \h </w:instrText>
             </w:r>
             <w:r>
               <w:rPr>
@@ -812,7 +812,7 @@
               <w:lang w:eastAsia="en-GB"/>
             </w:rPr>
           </w:pPr>
-          <w:hyperlink w:anchor="_Toc224063286" w:history="1">
+          <w:hyperlink w:anchor="_Toc224071323" w:history="1">
             <w:r>
               <w:rPr>
                 <w:rStyle w:val="Hyperlink"/>
@@ -839,7 +839,7 @@
                 <w:noProof/>
                 <w:webHidden/>
               </w:rPr>
-              <w:instrText xml:space="preserve"> PAGEREF _Toc224063286 \h </w:instrText>
+              <w:instrText xml:space="preserve"> PAGEREF _Toc224071323 \h </w:instrText>
             </w:r>
             <w:r>
               <w:rPr>
@@ -884,7 +884,7 @@
               <w:lang w:eastAsia="en-GB"/>
             </w:rPr>
           </w:pPr>
-          <w:hyperlink w:anchor="_Toc224063287" w:history="1">
+          <w:hyperlink w:anchor="_Toc224071324" w:history="1">
             <w:r>
               <w:rPr>
                 <w:rStyle w:val="Hyperlink"/>
@@ -911,7 +911,7 @@
                 <w:noProof/>
                 <w:webHidden/>
               </w:rPr>
-              <w:instrText xml:space="preserve"> PAGEREF _Toc224063287 \h </w:instrText>
+              <w:instrText xml:space="preserve"> PAGEREF _Toc224071324 \h </w:instrText>
             </w:r>
             <w:r>
               <w:rPr>
@@ -956,7 +956,7 @@
               <w:lang w:eastAsia="en-GB"/>
             </w:rPr>
           </w:pPr>
-          <w:hyperlink w:anchor="_Toc224063288" w:history="1">
+          <w:hyperlink w:anchor="_Toc224071325" w:history="1">
             <w:r>
               <w:rPr>
                 <w:rStyle w:val="Hyperlink"/>
@@ -983,7 +983,7 @@
                 <w:noProof/>
                 <w:webHidden/>
               </w:rPr>
-              <w:instrText xml:space="preserve"> PAGEREF _Toc224063288 \h </w:instrText>
+              <w:instrText xml:space="preserve"> PAGEREF _Toc224071325 \h </w:instrText>
             </w:r>
             <w:r>
               <w:rPr>
@@ -1028,7 +1028,7 @@
               <w:lang w:eastAsia="en-GB"/>
             </w:rPr>
           </w:pPr>
-          <w:hyperlink w:anchor="_Toc224063289" w:history="1">
+          <w:hyperlink w:anchor="_Toc224071326" w:history="1">
             <w:r>
               <w:rPr>
                 <w:rStyle w:val="Hyperlink"/>
@@ -1055,7 +1055,7 @@
                 <w:noProof/>
                 <w:webHidden/>
               </w:rPr>
-              <w:instrText xml:space="preserve"> PAGEREF _Toc224063289 \h </w:instrText>
+              <w:instrText xml:space="preserve"> PAGEREF _Toc224071326 \h </w:instrText>
             </w:r>
             <w:r>
               <w:rPr>
@@ -1100,7 +1100,7 @@
               <w:lang w:eastAsia="en-GB"/>
             </w:rPr>
           </w:pPr>
-          <w:hyperlink w:anchor="_Toc224063290" w:history="1">
+          <w:hyperlink w:anchor="_Toc224071327" w:history="1">
             <w:r>
               <w:rPr>
                 <w:rStyle w:val="Hyperlink"/>
@@ -1127,7 +1127,7 @@
                 <w:noProof/>
                 <w:webHidden/>
               </w:rPr>
-              <w:instrText xml:space="preserve"> PAGEREF _Toc224063290 \h </w:instrText>
+              <w:instrText xml:space="preserve"> PAGEREF _Toc224071327 \h </w:instrText>
             </w:r>
             <w:r>
               <w:rPr>
@@ -1172,7 +1172,7 @@
               <w:lang w:eastAsia="en-GB"/>
             </w:rPr>
           </w:pPr>
-          <w:hyperlink w:anchor="_Toc224063291" w:history="1">
+          <w:hyperlink w:anchor="_Toc224071328" w:history="1">
             <w:r>
               <w:rPr>
                 <w:rStyle w:val="Hyperlink"/>
@@ -1199,7 +1199,7 @@
                 <w:noProof/>
                 <w:webHidden/>
               </w:rPr>
-              <w:instrText xml:space="preserve"> PAGEREF _Toc224063291 \h </w:instrText>
+              <w:instrText xml:space="preserve"> PAGEREF _Toc224071328 \h </w:instrText>
             </w:r>
             <w:r>
               <w:rPr>
@@ -1244,7 +1244,7 @@
               <w:lang w:eastAsia="en-GB"/>
             </w:rPr>
           </w:pPr>
-          <w:hyperlink w:anchor="_Toc224063292" w:history="1">
+          <w:hyperlink w:anchor="_Toc224071329" w:history="1">
             <w:r>
               <w:rPr>
                 <w:rStyle w:val="Hyperlink"/>
@@ -1271,7 +1271,7 @@
                 <w:noProof/>
                 <w:webHidden/>
               </w:rPr>
-              <w:instrText xml:space="preserve"> PAGEREF _Toc224063292 \h </w:instrText>
+              <w:instrText xml:space="preserve"> PAGEREF _Toc224071329 \h </w:instrText>
             </w:r>
             <w:r>
               <w:rPr>
@@ -1316,7 +1316,7 @@
               <w:lang w:eastAsia="en-GB"/>
             </w:rPr>
           </w:pPr>
-          <w:hyperlink w:anchor="_Toc224063293" w:history="1">
+          <w:hyperlink w:anchor="_Toc224071330" w:history="1">
             <w:r>
               <w:rPr>
                 <w:rStyle w:val="Hyperlink"/>
@@ -1343,7 +1343,7 @@
                 <w:noProof/>
                 <w:webHidden/>
               </w:rPr>
-              <w:instrText xml:space="preserve"> PAGEREF _Toc224063293 \h </w:instrText>
+              <w:instrText xml:space="preserve"> PAGEREF _Toc224071330 \h </w:instrText>
             </w:r>
             <w:r>
               <w:rPr>
@@ -1388,7 +1388,7 @@
               <w:lang w:eastAsia="en-GB"/>
             </w:rPr>
           </w:pPr>
-          <w:hyperlink w:anchor="_Toc224063294" w:history="1">
+          <w:hyperlink w:anchor="_Toc224071331" w:history="1">
             <w:r>
               <w:rPr>
                 <w:rStyle w:val="Hyperlink"/>
@@ -1415,7 +1415,7 @@
                 <w:noProof/>
                 <w:webHidden/>
               </w:rPr>
-              <w:instrText xml:space="preserve"> PAGEREF _Toc224063294 \h </w:instrText>
+              <w:instrText xml:space="preserve"> PAGEREF _Toc224071331 \h </w:instrText>
             </w:r>
             <w:r>
               <w:rPr>
@@ -1460,7 +1460,7 @@
               <w:lang w:eastAsia="en-GB"/>
             </w:rPr>
           </w:pPr>
-          <w:hyperlink w:anchor="_Toc224063295" w:history="1">
+          <w:hyperlink w:anchor="_Toc224071332" w:history="1">
             <w:r>
               <w:rPr>
                 <w:rStyle w:val="Hyperlink"/>
@@ -1487,7 +1487,7 @@
                 <w:noProof/>
                 <w:webHidden/>
               </w:rPr>
-              <w:instrText xml:space="preserve"> PAGEREF _Toc224063295 \h </w:instrText>
+              <w:instrText xml:space="preserve"> PAGEREF _Toc224071332 \h </w:instrText>
             </w:r>
             <w:r>
               <w:rPr>
@@ -1532,7 +1532,7 @@
               <w:lang w:eastAsia="en-GB"/>
             </w:rPr>
           </w:pPr>
-          <w:hyperlink w:anchor="_Toc224063296" w:history="1">
+          <w:hyperlink w:anchor="_Toc224071333" w:history="1">
             <w:r>
               <w:rPr>
                 <w:rStyle w:val="Hyperlink"/>
@@ -1559,7 +1559,7 @@
                 <w:noProof/>
                 <w:webHidden/>
               </w:rPr>
-              <w:instrText xml:space="preserve"> PAGEREF _Toc224063296 \h </w:instrText>
+              <w:instrText xml:space="preserve"> PAGEREF _Toc224071333 \h </w:instrText>
             </w:r>
             <w:r>
               <w:rPr>
@@ -1604,7 +1604,7 @@
               <w:lang w:eastAsia="en-GB"/>
             </w:rPr>
           </w:pPr>
-          <w:hyperlink w:anchor="_Toc224063297" w:history="1">
+          <w:hyperlink w:anchor="_Toc224071334" w:history="1">
             <w:r>
               <w:rPr>
                 <w:rStyle w:val="Hyperlink"/>
@@ -1631,7 +1631,7 @@
                 <w:noProof/>
                 <w:webHidden/>
               </w:rPr>
-              <w:instrText xml:space="preserve"> PAGEREF _Toc224063297 \h </w:instrText>
+              <w:instrText xml:space="preserve"> PAGEREF _Toc224071334 \h </w:instrText>
             </w:r>
             <w:r>
               <w:rPr>
@@ -1676,7 +1676,7 @@
               <w:lang w:eastAsia="en-GB"/>
             </w:rPr>
           </w:pPr>
-          <w:hyperlink w:anchor="_Toc224063298" w:history="1">
+          <w:hyperlink w:anchor="_Toc224071335" w:history="1">
             <w:r>
               <w:rPr>
                 <w:rStyle w:val="Hyperlink"/>
@@ -1703,7 +1703,7 @@
                 <w:noProof/>
                 <w:webHidden/>
               </w:rPr>
-              <w:instrText xml:space="preserve"> PAGEREF _Toc224063298 \h </w:instrText>
+              <w:instrText xml:space="preserve"> PAGEREF _Toc224071335 \h </w:instrText>
             </w:r>
             <w:r>
               <w:rPr>
@@ -1748,7 +1748,7 @@
               <w:lang w:eastAsia="en-GB"/>
             </w:rPr>
           </w:pPr>
-          <w:hyperlink w:anchor="_Toc224063299" w:history="1">
+          <w:hyperlink w:anchor="_Toc224071336" w:history="1">
             <w:r>
               <w:rPr>
                 <w:rStyle w:val="Hyperlink"/>
@@ -1775,7 +1775,7 @@
                 <w:noProof/>
                 <w:webHidden/>
               </w:rPr>
-              <w:instrText xml:space="preserve"> PAGEREF _Toc224063299 \h </w:instrText>
+              <w:instrText xml:space="preserve"> PAGEREF _Toc224071336 \h </w:instrText>
             </w:r>
             <w:r>
               <w:rPr>
@@ -1820,7 +1820,7 @@
               <w:lang w:eastAsia="en-GB"/>
             </w:rPr>
           </w:pPr>
-          <w:hyperlink w:anchor="_Toc224063300" w:history="1">
+          <w:hyperlink w:anchor="_Toc224071337" w:history="1">
             <w:r>
               <w:rPr>
                 <w:rStyle w:val="Hyperlink"/>
@@ -1847,7 +1847,7 @@
                 <w:noProof/>
                 <w:webHidden/>
               </w:rPr>
-              <w:instrText xml:space="preserve"> PAGEREF _Toc224063300 \h </w:instrText>
+              <w:instrText xml:space="preserve"> PAGEREF _Toc224071337 \h </w:instrText>
             </w:r>
             <w:r>
               <w:rPr>
@@ -1892,7 +1892,7 @@
               <w:lang w:eastAsia="en-GB"/>
             </w:rPr>
           </w:pPr>
-          <w:hyperlink w:anchor="_Toc224063301" w:history="1">
+          <w:hyperlink w:anchor="_Toc224071338" w:history="1">
             <w:r>
               <w:rPr>
                 <w:rStyle w:val="Hyperlink"/>
@@ -1919,7 +1919,7 @@
                 <w:noProof/>
                 <w:webHidden/>
               </w:rPr>
-              <w:instrText xml:space="preserve"> PAGEREF _Toc224063301 \h </w:instrText>
+              <w:instrText xml:space="preserve"> PAGEREF _Toc224071338 \h </w:instrText>
             </w:r>
             <w:r>
               <w:rPr>
@@ -1964,7 +1964,7 @@
               <w:lang w:eastAsia="en-GB"/>
             </w:rPr>
           </w:pPr>
-          <w:hyperlink w:anchor="_Toc224063302" w:history="1">
+          <w:hyperlink w:anchor="_Toc224071339" w:history="1">
             <w:r>
               <w:rPr>
                 <w:rStyle w:val="Hyperlink"/>
@@ -1991,7 +1991,7 @@
                 <w:noProof/>
                 <w:webHidden/>
               </w:rPr>
-              <w:instrText xml:space="preserve"> PAGEREF _Toc224063302 \h </w:instrText>
+              <w:instrText xml:space="preserve"> PAGEREF _Toc224071339 \h </w:instrText>
             </w:r>
             <w:r>
               <w:rPr>
@@ -2036,7 +2036,7 @@
               <w:lang w:eastAsia="en-GB"/>
             </w:rPr>
           </w:pPr>
-          <w:hyperlink w:anchor="_Toc224063303" w:history="1">
+          <w:hyperlink w:anchor="_Toc224071340" w:history="1">
             <w:r>
               <w:rPr>
                 <w:rStyle w:val="Hyperlink"/>
@@ -2063,7 +2063,7 @@
                 <w:noProof/>
                 <w:webHidden/>
               </w:rPr>
-              <w:instrText xml:space="preserve"> PAGEREF _Toc224063303 \h </w:instrText>
+              <w:instrText xml:space="preserve"> PAGEREF _Toc224071340 \h </w:instrText>
             </w:r>
             <w:r>
               <w:rPr>
@@ -2108,7 +2108,7 @@
               <w:lang w:eastAsia="en-GB"/>
             </w:rPr>
           </w:pPr>
-          <w:hyperlink w:anchor="_Toc224063304" w:history="1">
+          <w:hyperlink w:anchor="_Toc224071341" w:history="1">
             <w:r>
               <w:rPr>
                 <w:rStyle w:val="Hyperlink"/>
@@ -2135,7 +2135,7 @@
                 <w:noProof/>
                 <w:webHidden/>
               </w:rPr>
-              <w:instrText xml:space="preserve"> PAGEREF _Toc224063304 \h </w:instrText>
+              <w:instrText xml:space="preserve"> PAGEREF _Toc224071341 \h </w:instrText>
             </w:r>
             <w:r>
               <w:rPr>
@@ -2180,7 +2180,7 @@
               <w:lang w:eastAsia="en-GB"/>
             </w:rPr>
           </w:pPr>
-          <w:hyperlink w:anchor="_Toc224063305" w:history="1">
+          <w:hyperlink w:anchor="_Toc224071342" w:history="1">
             <w:r>
               <w:rPr>
                 <w:rStyle w:val="Hyperlink"/>
@@ -2207,7 +2207,7 @@
                 <w:noProof/>
                 <w:webHidden/>
               </w:rPr>
-              <w:instrText xml:space="preserve"> PAGEREF _Toc224063305 \h </w:instrText>
+              <w:instrText xml:space="preserve"> PAGEREF _Toc224071342 \h </w:instrText>
             </w:r>
             <w:r>
               <w:rPr>
@@ -2252,7 +2252,7 @@
               <w:lang w:eastAsia="en-GB"/>
             </w:rPr>
           </w:pPr>
-          <w:hyperlink w:anchor="_Toc224063306" w:history="1">
+          <w:hyperlink w:anchor="_Toc224071343" w:history="1">
             <w:r>
               <w:rPr>
                 <w:rStyle w:val="Hyperlink"/>
@@ -2279,7 +2279,7 @@
                 <w:noProof/>
                 <w:webHidden/>
               </w:rPr>
-              <w:instrText xml:space="preserve"> PAGEREF _Toc224063306 \h </w:instrText>
+              <w:instrText xml:space="preserve"> PAGEREF _Toc224071343 \h </w:instrText>
             </w:r>
             <w:r>
               <w:rPr>
@@ -2324,7 +2324,7 @@
               <w:lang w:eastAsia="en-GB"/>
             </w:rPr>
           </w:pPr>
-          <w:hyperlink w:anchor="_Toc224063307" w:history="1">
+          <w:hyperlink w:anchor="_Toc224071344" w:history="1">
             <w:r>
               <w:rPr>
                 <w:rStyle w:val="Hyperlink"/>
@@ -2351,7 +2351,7 @@
                 <w:noProof/>
                 <w:webHidden/>
               </w:rPr>
-              <w:instrText xml:space="preserve"> PAGEREF _Toc224063307 \h </w:instrText>
+              <w:instrText xml:space="preserve"> PAGEREF _Toc224071344 \h </w:instrText>
             </w:r>
             <w:r>
               <w:rPr>
@@ -2396,7 +2396,7 @@
               <w:lang w:eastAsia="en-GB"/>
             </w:rPr>
           </w:pPr>
-          <w:hyperlink w:anchor="_Toc224063308" w:history="1">
+          <w:hyperlink w:anchor="_Toc224071345" w:history="1">
             <w:r>
               <w:rPr>
                 <w:rStyle w:val="Hyperlink"/>
@@ -2423,7 +2423,7 @@
                 <w:noProof/>
                 <w:webHidden/>
               </w:rPr>
-              <w:instrText xml:space="preserve"> PAGEREF _Toc224063308 \h </w:instrText>
+              <w:instrText xml:space="preserve"> PAGEREF _Toc224071345 \h </w:instrText>
             </w:r>
             <w:r>
               <w:rPr>
@@ -2468,7 +2468,7 @@
               <w:lang w:eastAsia="en-GB"/>
             </w:rPr>
           </w:pPr>
-          <w:hyperlink w:anchor="_Toc224063309" w:history="1">
+          <w:hyperlink w:anchor="_Toc224071346" w:history="1">
             <w:r>
               <w:rPr>
                 <w:rStyle w:val="Hyperlink"/>
@@ -2495,7 +2495,7 @@
                 <w:noProof/>
                 <w:webHidden/>
               </w:rPr>
-              <w:instrText xml:space="preserve"> PAGEREF _Toc224063309 \h </w:instrText>
+              <w:instrText xml:space="preserve"> PAGEREF _Toc224071346 \h </w:instrText>
             </w:r>
             <w:r>
               <w:rPr>
@@ -2540,7 +2540,7 @@
               <w:lang w:eastAsia="en-GB"/>
             </w:rPr>
           </w:pPr>
-          <w:hyperlink w:anchor="_Toc224063310" w:history="1">
+          <w:hyperlink w:anchor="_Toc224071347" w:history="1">
             <w:r>
               <w:rPr>
                 <w:rStyle w:val="Hyperlink"/>
@@ -2567,7 +2567,7 @@
                 <w:noProof/>
                 <w:webHidden/>
               </w:rPr>
-              <w:instrText xml:space="preserve"> PAGEREF _Toc224063310 \h </w:instrText>
+              <w:instrText xml:space="preserve"> PAGEREF _Toc224071347 \h </w:instrText>
             </w:r>
             <w:r>
               <w:rPr>
@@ -2612,7 +2612,7 @@
               <w:lang w:eastAsia="en-GB"/>
             </w:rPr>
           </w:pPr>
-          <w:hyperlink w:anchor="_Toc224063311" w:history="1">
+          <w:hyperlink w:anchor="_Toc224071348" w:history="1">
             <w:r>
               <w:rPr>
                 <w:rStyle w:val="Hyperlink"/>
@@ -2639,7 +2639,7 @@
                 <w:noProof/>
                 <w:webHidden/>
               </w:rPr>
-              <w:instrText xml:space="preserve"> PAGEREF _Toc224063311 \h </w:instrText>
+              <w:instrText xml:space="preserve"> PAGEREF _Toc224071348 \h </w:instrText>
             </w:r>
             <w:r>
               <w:rPr>
@@ -2684,7 +2684,7 @@
               <w:lang w:eastAsia="en-GB"/>
             </w:rPr>
           </w:pPr>
-          <w:hyperlink w:anchor="_Toc224063312" w:history="1">
+          <w:hyperlink w:anchor="_Toc224071349" w:history="1">
             <w:r>
               <w:rPr>
                 <w:rStyle w:val="Hyperlink"/>
@@ -2711,7 +2711,7 @@
                 <w:noProof/>
                 <w:webHidden/>
               </w:rPr>
-              <w:instrText xml:space="preserve"> PAGEREF _Toc224063312 \h </w:instrText>
+              <w:instrText xml:space="preserve"> PAGEREF _Toc224071349 \h </w:instrText>
             </w:r>
             <w:r>
               <w:rPr>
@@ -2756,7 +2756,7 @@
               <w:lang w:eastAsia="en-GB"/>
             </w:rPr>
           </w:pPr>
-          <w:hyperlink w:anchor="_Toc224063313" w:history="1">
+          <w:hyperlink w:anchor="_Toc224071350" w:history="1">
             <w:r>
               <w:rPr>
                 <w:rStyle w:val="Hyperlink"/>
@@ -2783,7 +2783,7 @@
                 <w:noProof/>
                 <w:webHidden/>
               </w:rPr>
-              <w:instrText xml:space="preserve"> PAGEREF _Toc224063313 \h </w:instrText>
+              <w:instrText xml:space="preserve"> PAGEREF _Toc224071350 \h </w:instrText>
             </w:r>
             <w:r>
               <w:rPr>
@@ -2828,7 +2828,7 @@
               <w:lang w:eastAsia="en-GB"/>
             </w:rPr>
           </w:pPr>
-          <w:hyperlink w:anchor="_Toc224063314" w:history="1">
+          <w:hyperlink w:anchor="_Toc224071351" w:history="1">
             <w:r>
               <w:rPr>
                 <w:rStyle w:val="Hyperlink"/>
@@ -2855,7 +2855,7 @@
                 <w:noProof/>
                 <w:webHidden/>
               </w:rPr>
-              <w:instrText xml:space="preserve"> PAGEREF _Toc224063314 \h </w:instrText>
+              <w:instrText xml:space="preserve"> PAGEREF _Toc224071351 \h </w:instrText>
             </w:r>
             <w:r>
               <w:rPr>
@@ -2900,7 +2900,7 @@
               <w:lang w:eastAsia="en-GB"/>
             </w:rPr>
           </w:pPr>
-          <w:hyperlink w:anchor="_Toc224063315" w:history="1">
+          <w:hyperlink w:anchor="_Toc224071352" w:history="1">
             <w:r>
               <w:rPr>
                 <w:rStyle w:val="Hyperlink"/>
@@ -2927,7 +2927,7 @@
                 <w:noProof/>
                 <w:webHidden/>
               </w:rPr>
-              <w:instrText xml:space="preserve"> PAGEREF _Toc224063315 \h </w:instrText>
+              <w:instrText xml:space="preserve"> PAGEREF _Toc224071352 \h </w:instrText>
             </w:r>
             <w:r>
               <w:rPr>
@@ -2972,7 +2972,7 @@
               <w:lang w:eastAsia="en-GB"/>
             </w:rPr>
           </w:pPr>
-          <w:hyperlink w:anchor="_Toc224063316" w:history="1">
+          <w:hyperlink w:anchor="_Toc224071353" w:history="1">
             <w:r>
               <w:rPr>
                 <w:rStyle w:val="Hyperlink"/>
@@ -2999,7 +2999,7 @@
                 <w:noProof/>
                 <w:webHidden/>
               </w:rPr>
-              <w:instrText xml:space="preserve"> PAGEREF _Toc224063316 \h </w:instrText>
+              <w:instrText xml:space="preserve"> PAGEREF _Toc224071353 \h </w:instrText>
             </w:r>
             <w:r>
               <w:rPr>
@@ -3044,7 +3044,7 @@
               <w:lang w:eastAsia="en-GB"/>
             </w:rPr>
           </w:pPr>
-          <w:hyperlink w:anchor="_Toc224063317" w:history="1">
+          <w:hyperlink w:anchor="_Toc224071354" w:history="1">
             <w:r>
               <w:rPr>
                 <w:rStyle w:val="Hyperlink"/>
@@ -3071,7 +3071,7 @@
                 <w:noProof/>
                 <w:webHidden/>
               </w:rPr>
-              <w:instrText xml:space="preserve"> PAGEREF _Toc224063317 \h </w:instrText>
+              <w:instrText xml:space="preserve"> PAGEREF _Toc224071354 \h </w:instrText>
             </w:r>
             <w:r>
               <w:rPr>
@@ -3116,7 +3116,7 @@
               <w:lang w:eastAsia="en-GB"/>
             </w:rPr>
           </w:pPr>
-          <w:hyperlink w:anchor="_Toc224063318" w:history="1">
+          <w:hyperlink w:anchor="_Toc224071355" w:history="1">
             <w:r>
               <w:rPr>
                 <w:rStyle w:val="Hyperlink"/>
@@ -3143,7 +3143,7 @@
                 <w:noProof/>
                 <w:webHidden/>
               </w:rPr>
-              <w:instrText xml:space="preserve"> PAGEREF _Toc224063318 \h </w:instrText>
+              <w:instrText xml:space="preserve"> PAGEREF _Toc224071355 \h </w:instrText>
             </w:r>
             <w:r>
               <w:rPr>
@@ -3188,7 +3188,7 @@
               <w:lang w:eastAsia="en-GB"/>
             </w:rPr>
           </w:pPr>
-          <w:hyperlink w:anchor="_Toc224063319" w:history="1">
+          <w:hyperlink w:anchor="_Toc224071356" w:history="1">
             <w:r>
               <w:rPr>
                 <w:rStyle w:val="Hyperlink"/>
@@ -3215,7 +3215,7 @@
                 <w:noProof/>
                 <w:webHidden/>
               </w:rPr>
-              <w:instrText xml:space="preserve"> PAGEREF _Toc224063319 \h </w:instrText>
+              <w:instrText xml:space="preserve"> PAGEREF _Toc224071356 \h </w:instrText>
             </w:r>
             <w:r>
               <w:rPr>
@@ -3235,7 +3235,7 @@
                 <w:noProof/>
                 <w:webHidden/>
               </w:rPr>
-              <w:t>22</w:t>
+              <w:t>23</w:t>
             </w:r>
             <w:r>
               <w:rPr>
@@ -3260,7 +3260,7 @@
               <w:lang w:eastAsia="en-GB"/>
             </w:rPr>
           </w:pPr>
-          <w:hyperlink w:anchor="_Toc224063320" w:history="1">
+          <w:hyperlink w:anchor="_Toc224071357" w:history="1">
             <w:r>
               <w:rPr>
                 <w:rStyle w:val="Hyperlink"/>
@@ -3287,7 +3287,7 @@
                 <w:noProof/>
                 <w:webHidden/>
               </w:rPr>
-              <w:instrText xml:space="preserve"> PAGEREF _Toc224063320 \h </w:instrText>
+              <w:instrText xml:space="preserve"> PAGEREF _Toc224071357 \h </w:instrText>
             </w:r>
             <w:r>
               <w:rPr>
@@ -3332,7 +3332,7 @@
               <w:lang w:eastAsia="en-GB"/>
             </w:rPr>
           </w:pPr>
-          <w:hyperlink w:anchor="_Toc224063321" w:history="1">
+          <w:hyperlink w:anchor="_Toc224071358" w:history="1">
             <w:r>
               <w:rPr>
                 <w:rStyle w:val="Hyperlink"/>
@@ -3359,7 +3359,7 @@
                 <w:noProof/>
                 <w:webHidden/>
               </w:rPr>
-              <w:instrText xml:space="preserve"> PAGEREF _Toc224063321 \h </w:instrText>
+              <w:instrText xml:space="preserve"> PAGEREF _Toc224071358 \h </w:instrText>
             </w:r>
             <w:r>
               <w:rPr>
@@ -3404,7 +3404,7 @@
               <w:lang w:eastAsia="en-GB"/>
             </w:rPr>
           </w:pPr>
-          <w:hyperlink w:anchor="_Toc224063322" w:history="1">
+          <w:hyperlink w:anchor="_Toc224071359" w:history="1">
             <w:r>
               <w:rPr>
                 <w:rStyle w:val="Hyperlink"/>
@@ -3431,7 +3431,7 @@
                 <w:noProof/>
                 <w:webHidden/>
               </w:rPr>
-              <w:instrText xml:space="preserve"> PAGEREF _Toc224063322 \h </w:instrText>
+              <w:instrText xml:space="preserve"> PAGEREF _Toc224071359 \h </w:instrText>
             </w:r>
             <w:r>
               <w:rPr>
@@ -3476,7 +3476,7 @@
               <w:lang w:eastAsia="en-GB"/>
             </w:rPr>
           </w:pPr>
-          <w:hyperlink w:anchor="_Toc224063323" w:history="1">
+          <w:hyperlink w:anchor="_Toc224071360" w:history="1">
             <w:r>
               <w:rPr>
                 <w:rStyle w:val="Hyperlink"/>
@@ -3503,7 +3503,7 @@
                 <w:noProof/>
                 <w:webHidden/>
               </w:rPr>
-              <w:instrText xml:space="preserve"> PAGEREF _Toc224063323 \h </w:instrText>
+              <w:instrText xml:space="preserve"> PAGEREF _Toc224071360 \h </w:instrText>
             </w:r>
             <w:r>
               <w:rPr>
@@ -3548,7 +3548,7 @@
               <w:lang w:eastAsia="en-GB"/>
             </w:rPr>
           </w:pPr>
-          <w:hyperlink w:anchor="_Toc224063324" w:history="1">
+          <w:hyperlink w:anchor="_Toc224071361" w:history="1">
             <w:r>
               <w:rPr>
                 <w:rStyle w:val="Hyperlink"/>
@@ -3575,7 +3575,7 @@
                 <w:noProof/>
                 <w:webHidden/>
               </w:rPr>
-              <w:instrText xml:space="preserve"> PAGEREF _Toc224063324 \h </w:instrText>
+              <w:instrText xml:space="preserve"> PAGEREF _Toc224071361 \h </w:instrText>
             </w:r>
             <w:r>
               <w:rPr>
@@ -3620,7 +3620,7 @@
               <w:lang w:eastAsia="en-GB"/>
             </w:rPr>
           </w:pPr>
-          <w:hyperlink w:anchor="_Toc224063325" w:history="1">
+          <w:hyperlink w:anchor="_Toc224071362" w:history="1">
             <w:r>
               <w:rPr>
                 <w:rStyle w:val="Hyperlink"/>
@@ -3647,7 +3647,7 @@
                 <w:noProof/>
                 <w:webHidden/>
               </w:rPr>
-              <w:instrText xml:space="preserve"> PAGEREF _Toc224063325 \h </w:instrText>
+              <w:instrText xml:space="preserve"> PAGEREF _Toc224071362 \h </w:instrText>
             </w:r>
             <w:r>
               <w:rPr>
@@ -3692,7 +3692,7 @@
               <w:lang w:eastAsia="en-GB"/>
             </w:rPr>
           </w:pPr>
-          <w:hyperlink w:anchor="_Toc224063326" w:history="1">
+          <w:hyperlink w:anchor="_Toc224071363" w:history="1">
             <w:r>
               <w:rPr>
                 <w:rStyle w:val="Hyperlink"/>
@@ -3719,7 +3719,7 @@
                 <w:noProof/>
                 <w:webHidden/>
               </w:rPr>
-              <w:instrText xml:space="preserve"> PAGEREF _Toc224063326 \h </w:instrText>
+              <w:instrText xml:space="preserve"> PAGEREF _Toc224071363 \h </w:instrText>
             </w:r>
             <w:r>
               <w:rPr>
@@ -3764,7 +3764,7 @@
               <w:lang w:eastAsia="en-GB"/>
             </w:rPr>
           </w:pPr>
-          <w:hyperlink w:anchor="_Toc224063327" w:history="1">
+          <w:hyperlink w:anchor="_Toc224071364" w:history="1">
             <w:r>
               <w:rPr>
                 <w:rStyle w:val="Hyperlink"/>
@@ -3791,7 +3791,7 @@
                 <w:noProof/>
                 <w:webHidden/>
               </w:rPr>
-              <w:instrText xml:space="preserve"> PAGEREF _Toc224063327 \h </w:instrText>
+              <w:instrText xml:space="preserve"> PAGEREF _Toc224071364 \h </w:instrText>
             </w:r>
             <w:r>
               <w:rPr>
@@ -3836,7 +3836,7 @@
               <w:lang w:eastAsia="en-GB"/>
             </w:rPr>
           </w:pPr>
-          <w:hyperlink w:anchor="_Toc224063328" w:history="1">
+          <w:hyperlink w:anchor="_Toc224071365" w:history="1">
             <w:r>
               <w:rPr>
                 <w:rStyle w:val="Hyperlink"/>
@@ -3863,7 +3863,7 @@
                 <w:noProof/>
                 <w:webHidden/>
               </w:rPr>
-              <w:instrText xml:space="preserve"> PAGEREF _Toc224063328 \h </w:instrText>
+              <w:instrText xml:space="preserve"> PAGEREF _Toc224071365 \h </w:instrText>
             </w:r>
             <w:r>
               <w:rPr>
@@ -3908,7 +3908,7 @@
               <w:lang w:eastAsia="en-GB"/>
             </w:rPr>
           </w:pPr>
-          <w:hyperlink w:anchor="_Toc224063329" w:history="1">
+          <w:hyperlink w:anchor="_Toc224071366" w:history="1">
             <w:r>
               <w:rPr>
                 <w:rStyle w:val="Hyperlink"/>
@@ -3935,7 +3935,7 @@
                 <w:noProof/>
                 <w:webHidden/>
               </w:rPr>
-              <w:instrText xml:space="preserve"> PAGEREF _Toc224063329 \h </w:instrText>
+              <w:instrText xml:space="preserve"> PAGEREF _Toc224071366 \h </w:instrText>
             </w:r>
             <w:r>
               <w:rPr>
@@ -3980,7 +3980,7 @@
               <w:lang w:eastAsia="en-GB"/>
             </w:rPr>
           </w:pPr>
-          <w:hyperlink w:anchor="_Toc224063330" w:history="1">
+          <w:hyperlink w:anchor="_Toc224071367" w:history="1">
             <w:r>
               <w:rPr>
                 <w:rStyle w:val="Hyperlink"/>
@@ -4007,7 +4007,7 @@
                 <w:noProof/>
                 <w:webHidden/>
               </w:rPr>
-              <w:instrText xml:space="preserve"> PAGEREF _Toc224063330 \h </w:instrText>
+              <w:instrText xml:space="preserve"> PAGEREF _Toc224071367 \h </w:instrText>
             </w:r>
             <w:r>
               <w:rPr>
@@ -4027,7 +4027,7 @@
                 <w:noProof/>
                 <w:webHidden/>
               </w:rPr>
-              <w:t>28</w:t>
+              <w:t>29</w:t>
             </w:r>
             <w:r>
               <w:rPr>
@@ -4052,7 +4052,7 @@
               <w:lang w:eastAsia="en-GB"/>
             </w:rPr>
           </w:pPr>
-          <w:hyperlink w:anchor="_Toc224063331" w:history="1">
+          <w:hyperlink w:anchor="_Toc224071368" w:history="1">
             <w:r>
               <w:rPr>
                 <w:rStyle w:val="Hyperlink"/>
@@ -4079,7 +4079,7 @@
                 <w:noProof/>
                 <w:webHidden/>
               </w:rPr>
-              <w:instrText xml:space="preserve"> PAGEREF _Toc224063331 \h </w:instrText>
+              <w:instrText xml:space="preserve"> PAGEREF _Toc224071368 \h </w:instrText>
             </w:r>
             <w:r>
               <w:rPr>
@@ -4099,7 +4099,7 @@
                 <w:noProof/>
                 <w:webHidden/>
               </w:rPr>
-              <w:t>28</w:t>
+              <w:t>29</w:t>
             </w:r>
             <w:r>
               <w:rPr>
@@ -4124,7 +4124,7 @@
               <w:lang w:eastAsia="en-GB"/>
             </w:rPr>
           </w:pPr>
-          <w:hyperlink w:anchor="_Toc224063332" w:history="1">
+          <w:hyperlink w:anchor="_Toc224071369" w:history="1">
             <w:r>
               <w:rPr>
                 <w:rStyle w:val="Hyperlink"/>
@@ -4151,7 +4151,7 @@
                 <w:noProof/>
                 <w:webHidden/>
               </w:rPr>
-              <w:instrText xml:space="preserve"> PAGEREF _Toc224063332 \h </w:instrText>
+              <w:instrText xml:space="preserve"> PAGEREF _Toc224071369 \h </w:instrText>
             </w:r>
             <w:r>
               <w:rPr>
@@ -4171,7 +4171,7 @@
                 <w:noProof/>
                 <w:webHidden/>
               </w:rPr>
-              <w:t>28</w:t>
+              <w:t>29</w:t>
             </w:r>
             <w:r>
               <w:rPr>
@@ -4196,7 +4196,7 @@
               <w:lang w:eastAsia="en-GB"/>
             </w:rPr>
           </w:pPr>
-          <w:hyperlink w:anchor="_Toc224063333" w:history="1">
+          <w:hyperlink w:anchor="_Toc224071370" w:history="1">
             <w:r>
               <w:rPr>
                 <w:rStyle w:val="Hyperlink"/>
@@ -4223,7 +4223,7 @@
                 <w:noProof/>
                 <w:webHidden/>
               </w:rPr>
-              <w:instrText xml:space="preserve"> PAGEREF _Toc224063333 \h </w:instrText>
+              <w:instrText xml:space="preserve"> PAGEREF _Toc224071370 \h </w:instrText>
             </w:r>
             <w:r>
               <w:rPr>
@@ -4268,7 +4268,7 @@
               <w:lang w:eastAsia="en-GB"/>
             </w:rPr>
           </w:pPr>
-          <w:hyperlink w:anchor="_Toc224063334" w:history="1">
+          <w:hyperlink w:anchor="_Toc224071371" w:history="1">
             <w:r>
               <w:rPr>
                 <w:rStyle w:val="Hyperlink"/>
@@ -4295,7 +4295,7 @@
                 <w:noProof/>
                 <w:webHidden/>
               </w:rPr>
-              <w:instrText xml:space="preserve"> PAGEREF _Toc224063334 \h </w:instrText>
+              <w:instrText xml:space="preserve"> PAGEREF _Toc224071371 \h </w:instrText>
             </w:r>
             <w:r>
               <w:rPr>
@@ -4340,7 +4340,7 @@
               <w:lang w:eastAsia="en-GB"/>
             </w:rPr>
           </w:pPr>
-          <w:hyperlink w:anchor="_Toc224063335" w:history="1">
+          <w:hyperlink w:anchor="_Toc224071372" w:history="1">
             <w:r>
               <w:rPr>
                 <w:rStyle w:val="Hyperlink"/>
@@ -4367,7 +4367,7 @@
                 <w:noProof/>
                 <w:webHidden/>
               </w:rPr>
-              <w:instrText xml:space="preserve"> PAGEREF _Toc224063335 \h </w:instrText>
+              <w:instrText xml:space="preserve"> PAGEREF _Toc224071372 \h </w:instrText>
             </w:r>
             <w:r>
               <w:rPr>
@@ -4387,7 +4387,7 @@
                 <w:noProof/>
                 <w:webHidden/>
               </w:rPr>
-              <w:t>29</w:t>
+              <w:t>30</w:t>
             </w:r>
             <w:r>
               <w:rPr>
@@ -4412,7 +4412,7 @@
               <w:lang w:eastAsia="en-GB"/>
             </w:rPr>
           </w:pPr>
-          <w:hyperlink w:anchor="_Toc224063336" w:history="1">
+          <w:hyperlink w:anchor="_Toc224071373" w:history="1">
             <w:r>
               <w:rPr>
                 <w:rStyle w:val="Hyperlink"/>
@@ -4439,7 +4439,7 @@
                 <w:noProof/>
                 <w:webHidden/>
               </w:rPr>
-              <w:instrText xml:space="preserve"> PAGEREF _Toc224063336 \h </w:instrText>
+              <w:instrText xml:space="preserve"> PAGEREF _Toc224071373 \h </w:instrText>
             </w:r>
             <w:r>
               <w:rPr>
@@ -4484,7 +4484,7 @@
               <w:lang w:eastAsia="en-GB"/>
             </w:rPr>
           </w:pPr>
-          <w:hyperlink w:anchor="_Toc224063337" w:history="1">
+          <w:hyperlink w:anchor="_Toc224071374" w:history="1">
             <w:r>
               <w:rPr>
                 <w:rStyle w:val="Hyperlink"/>
@@ -4511,7 +4511,7 @@
                 <w:noProof/>
                 <w:webHidden/>
               </w:rPr>
-              <w:instrText xml:space="preserve"> PAGEREF _Toc224063337 \h </w:instrText>
+              <w:instrText xml:space="preserve"> PAGEREF _Toc224071374 \h </w:instrText>
             </w:r>
             <w:r>
               <w:rPr>
@@ -4556,7 +4556,7 @@
               <w:lang w:eastAsia="en-GB"/>
             </w:rPr>
           </w:pPr>
-          <w:hyperlink w:anchor="_Toc224063338" w:history="1">
+          <w:hyperlink w:anchor="_Toc224071375" w:history="1">
             <w:r>
               <w:rPr>
                 <w:rStyle w:val="Hyperlink"/>
@@ -4583,7 +4583,7 @@
                 <w:noProof/>
                 <w:webHidden/>
               </w:rPr>
-              <w:instrText xml:space="preserve"> PAGEREF _Toc224063338 \h </w:instrText>
+              <w:instrText xml:space="preserve"> PAGEREF _Toc224071375 \h </w:instrText>
             </w:r>
             <w:r>
               <w:rPr>
@@ -4603,7 +4603,7 @@
                 <w:noProof/>
                 <w:webHidden/>
               </w:rPr>
-              <w:t>30</w:t>
+              <w:t>31</w:t>
             </w:r>
             <w:r>
               <w:rPr>
@@ -4628,7 +4628,7 @@
               <w:lang w:eastAsia="en-GB"/>
             </w:rPr>
           </w:pPr>
-          <w:hyperlink w:anchor="_Toc224063339" w:history="1">
+          <w:hyperlink w:anchor="_Toc224071376" w:history="1">
             <w:r>
               <w:rPr>
                 <w:rStyle w:val="Hyperlink"/>
@@ -4655,7 +4655,7 @@
                 <w:noProof/>
                 <w:webHidden/>
               </w:rPr>
-              <w:instrText xml:space="preserve"> PAGEREF _Toc224063339 \h </w:instrText>
+              <w:instrText xml:space="preserve"> PAGEREF _Toc224071376 \h </w:instrText>
             </w:r>
             <w:r>
               <w:rPr>
@@ -4675,7 +4675,7 @@
                 <w:noProof/>
                 <w:webHidden/>
               </w:rPr>
-              <w:t>31</w:t>
+              <w:t>32</w:t>
             </w:r>
             <w:r>
               <w:rPr>
@@ -4700,7 +4700,7 @@
               <w:lang w:eastAsia="en-GB"/>
             </w:rPr>
           </w:pPr>
-          <w:hyperlink w:anchor="_Toc224063340" w:history="1">
+          <w:hyperlink w:anchor="_Toc224071377" w:history="1">
             <w:r>
               <w:rPr>
                 <w:rStyle w:val="Hyperlink"/>
@@ -4727,7 +4727,7 @@
                 <w:noProof/>
                 <w:webHidden/>
               </w:rPr>
-              <w:instrText xml:space="preserve"> PAGEREF _Toc224063340 \h </w:instrText>
+              <w:instrText xml:space="preserve"> PAGEREF _Toc224071377 \h </w:instrText>
             </w:r>
             <w:r>
               <w:rPr>
@@ -4747,7 +4747,7 @@
                 <w:noProof/>
                 <w:webHidden/>
               </w:rPr>
-              <w:t>32</w:t>
+              <w:t>33</w:t>
             </w:r>
             <w:r>
               <w:rPr>
@@ -4772,7 +4772,7 @@
               <w:lang w:eastAsia="en-GB"/>
             </w:rPr>
           </w:pPr>
-          <w:hyperlink w:anchor="_Toc224063341" w:history="1">
+          <w:hyperlink w:anchor="_Toc224071378" w:history="1">
             <w:r>
               <w:rPr>
                 <w:rStyle w:val="Hyperlink"/>
@@ -4799,7 +4799,7 @@
                 <w:noProof/>
                 <w:webHidden/>
               </w:rPr>
-              <w:instrText xml:space="preserve"> PAGEREF _Toc224063341 \h </w:instrText>
+              <w:instrText xml:space="preserve"> PAGEREF _Toc224071378 \h </w:instrText>
             </w:r>
             <w:r>
               <w:rPr>
@@ -4844,7 +4844,7 @@
               <w:lang w:eastAsia="en-GB"/>
             </w:rPr>
           </w:pPr>
-          <w:hyperlink w:anchor="_Toc224063342" w:history="1">
+          <w:hyperlink w:anchor="_Toc224071379" w:history="1">
             <w:r>
               <w:rPr>
                 <w:rStyle w:val="Hyperlink"/>
@@ -4871,7 +4871,7 @@
                 <w:noProof/>
                 <w:webHidden/>
               </w:rPr>
-              <w:instrText xml:space="preserve"> PAGEREF _Toc224063342 \h </w:instrText>
+              <w:instrText xml:space="preserve"> PAGEREF _Toc224071379 \h </w:instrText>
             </w:r>
             <w:r>
               <w:rPr>
@@ -4916,7 +4916,7 @@
               <w:lang w:eastAsia="en-GB"/>
             </w:rPr>
           </w:pPr>
-          <w:hyperlink w:anchor="_Toc224063343" w:history="1">
+          <w:hyperlink w:anchor="_Toc224071380" w:history="1">
             <w:r>
               <w:rPr>
                 <w:rStyle w:val="Hyperlink"/>
@@ -4943,7 +4943,7 @@
                 <w:noProof/>
                 <w:webHidden/>
               </w:rPr>
-              <w:instrText xml:space="preserve"> PAGEREF _Toc224063343 \h </w:instrText>
+              <w:instrText xml:space="preserve"> PAGEREF _Toc224071380 \h </w:instrText>
             </w:r>
             <w:r>
               <w:rPr>
@@ -5004,7 +5004,7 @@
       <w:pPr>
         <w:pStyle w:val="Heading1"/>
       </w:pPr>
-      <w:bookmarkStart w:id="0" w:name="_Toc224063278"/>
+      <w:bookmarkStart w:id="0" w:name="_Toc224071315"/>
       <w:r>
         <w:lastRenderedPageBreak/>
         <w:t>List of Acro</w:t>
@@ -5248,6 +5248,28 @@
           <w:p>
             <w:r>
               <w:t>First Person Shooter</w:t>
+            </w:r>
+          </w:p>
+        </w:tc>
+      </w:tr>
+      <w:tr>
+        <w:tc>
+          <w:tcPr>
+            <w:tcW w:w="4508" w:type="dxa"/>
+          </w:tcPr>
+          <w:p>
+            <w:r>
+              <w:t>UCD</w:t>
+            </w:r>
+          </w:p>
+        </w:tc>
+        <w:tc>
+          <w:tcPr>
+            <w:tcW w:w="4508" w:type="dxa"/>
+          </w:tcPr>
+          <w:p>
+            <w:r>
+              <w:t>User Centred Design</w:t>
             </w:r>
           </w:p>
         </w:tc>
@@ -5281,9 +5303,8 @@
       <w:pPr>
         <w:pStyle w:val="Heading1"/>
       </w:pPr>
-      <w:bookmarkStart w:id="1" w:name="_Toc224063279"/>
-      <w:r>
-        <w:lastRenderedPageBreak/>
+      <w:bookmarkStart w:id="1" w:name="_Toc224071316"/>
+      <w:r>
         <w:t>Abstract</w:t>
       </w:r>
       <w:bookmarkEnd w:id="1"/>
@@ -5481,7 +5502,7 @@
       <w:pPr>
         <w:pStyle w:val="Heading1"/>
       </w:pPr>
-      <w:bookmarkStart w:id="2" w:name="_Toc224063280"/>
+      <w:bookmarkStart w:id="2" w:name="_Toc224071317"/>
       <w:r>
         <w:lastRenderedPageBreak/>
         <w:t>Introduction</w:t>
@@ -5528,13 +5549,8 @@
       <w:r>
         <w:t xml:space="preserve">. </w:t>
       </w:r>
-      <w:proofErr w:type="spellStart"/>
-      <w:r>
-        <w:t>Porcar</w:t>
-      </w:r>
-      <w:proofErr w:type="spellEnd"/>
-      <w:r>
-        <w:t xml:space="preserve"> et al., </w:t>
+      <w:r>
+        <w:t xml:space="preserve">Porcar et al., </w:t>
       </w:r>
       <w:r>
         <w:t>(</w:t>
@@ -5574,13 +5590,8 @@
       <w:r>
         <w:t xml:space="preserve">Research conducted by </w:t>
       </w:r>
-      <w:proofErr w:type="spellStart"/>
-      <w:r>
-        <w:t>Cantó</w:t>
-      </w:r>
-      <w:proofErr w:type="spellEnd"/>
-      <w:r>
-        <w:t xml:space="preserve">-Sancho et al., </w:t>
+      <w:r>
+        <w:t xml:space="preserve">Cantó-Sancho et al., </w:t>
       </w:r>
       <w:r>
         <w:t>(</w:t>
@@ -6064,7 +6075,7 @@
       <w:pPr>
         <w:pStyle w:val="Heading1"/>
       </w:pPr>
-      <w:bookmarkStart w:id="3" w:name="_Toc224063281"/>
+      <w:bookmarkStart w:id="3" w:name="_Toc224071318"/>
       <w:r>
         <w:lastRenderedPageBreak/>
         <w:t>Project Aim</w:t>
@@ -6114,7 +6125,7 @@
           <w:rFonts w:asciiTheme="minorHAnsi" w:hAnsiTheme="minorHAnsi"/>
         </w:rPr>
       </w:pPr>
-      <w:bookmarkStart w:id="4" w:name="_Toc224063282"/>
+      <w:bookmarkStart w:id="4" w:name="_Toc224071319"/>
       <w:r>
         <w:rPr>
           <w:rFonts w:asciiTheme="minorHAnsi" w:hAnsiTheme="minorHAnsi"/>
@@ -6401,7 +6412,7 @@
       <w:pPr>
         <w:pStyle w:val="Heading1"/>
       </w:pPr>
-      <w:bookmarkStart w:id="5" w:name="_Toc224063283"/>
+      <w:bookmarkStart w:id="5" w:name="_Toc224071320"/>
       <w:r>
         <w:lastRenderedPageBreak/>
         <w:t>Project Planning</w:t>
@@ -6782,7 +6793,7 @@
           <w:rFonts w:asciiTheme="minorHAnsi" w:hAnsiTheme="minorHAnsi"/>
         </w:rPr>
       </w:pPr>
-      <w:bookmarkStart w:id="6" w:name="_Toc224063284"/>
+      <w:bookmarkStart w:id="6" w:name="_Toc224071321"/>
       <w:r>
         <w:rPr>
           <w:rFonts w:asciiTheme="minorHAnsi" w:hAnsiTheme="minorHAnsi"/>
@@ -6984,7 +6995,7 @@
           <w:rFonts w:asciiTheme="minorHAnsi" w:hAnsiTheme="minorHAnsi"/>
         </w:rPr>
       </w:pPr>
-      <w:bookmarkStart w:id="7" w:name="_Toc224063285"/>
+      <w:bookmarkStart w:id="7" w:name="_Toc224071322"/>
       <w:r>
         <w:rPr>
           <w:rFonts w:asciiTheme="minorHAnsi" w:hAnsiTheme="minorHAnsi"/>
@@ -7223,21 +7234,7 @@
         <w:rPr>
           <w:rFonts w:cs="Arial"/>
         </w:rPr>
-        <w:t xml:space="preserve">Clear </w:t>
-      </w:r>
-      <w:proofErr w:type="gramStart"/>
-      <w:r>
-        <w:rPr>
-          <w:rFonts w:cs="Arial"/>
-        </w:rPr>
-        <w:t>on screen</w:t>
-      </w:r>
-      <w:proofErr w:type="gramEnd"/>
-      <w:r>
-        <w:rPr>
-          <w:rFonts w:cs="Arial"/>
-        </w:rPr>
-        <w:t xml:space="preserve"> prompts to guide and support users that aren’t familiar with VR equipment</w:t>
+        <w:t>Clear on screen prompts to guide and support users that aren’t familiar with VR equipment</w:t>
       </w:r>
     </w:p>
     <w:p>
@@ -7265,7 +7262,7 @@
           <w:rFonts w:asciiTheme="minorHAnsi" w:hAnsiTheme="minorHAnsi"/>
         </w:rPr>
       </w:pPr>
-      <w:bookmarkStart w:id="8" w:name="_Toc224063286"/>
+      <w:bookmarkStart w:id="8" w:name="_Toc224071323"/>
       <w:r>
         <w:rPr>
           <w:rFonts w:asciiTheme="minorHAnsi" w:hAnsiTheme="minorHAnsi"/>
@@ -7282,7 +7279,7 @@
           <w:rFonts w:asciiTheme="minorHAnsi" w:hAnsiTheme="minorHAnsi"/>
         </w:rPr>
       </w:pPr>
-      <w:bookmarkStart w:id="9" w:name="_Toc224063287"/>
+      <w:bookmarkStart w:id="9" w:name="_Toc224071324"/>
       <w:r>
         <w:rPr>
           <w:rFonts w:asciiTheme="minorHAnsi" w:hAnsiTheme="minorHAnsi"/>
@@ -7366,7 +7363,7 @@
           <w:rFonts w:asciiTheme="minorHAnsi" w:hAnsiTheme="minorHAnsi"/>
         </w:rPr>
       </w:pPr>
-      <w:bookmarkStart w:id="10" w:name="_Toc224063288"/>
+      <w:bookmarkStart w:id="10" w:name="_Toc224071325"/>
       <w:r>
         <w:rPr>
           <w:rFonts w:asciiTheme="minorHAnsi" w:hAnsiTheme="minorHAnsi"/>
@@ -7379,8 +7376,7 @@
       <w:pPr>
         <w:pStyle w:val="Heading3"/>
       </w:pPr>
-      <w:bookmarkStart w:id="11" w:name="_Toc224063289"/>
-      <w:proofErr w:type="spellStart"/>
+      <w:bookmarkStart w:id="11" w:name="_Toc224071326"/>
       <w:r>
         <w:t>Ey</w:t>
       </w:r>
@@ -7391,7 +7387,6 @@
         <w:t>si</w:t>
       </w:r>
       <w:bookmarkEnd w:id="11"/>
-      <w:proofErr w:type="spellEnd"/>
     </w:p>
     <w:p>
       <w:r>
@@ -7406,11 +7401,9 @@
       <w:r>
         <w:t xml:space="preserve"> discussed </w:t>
       </w:r>
-      <w:proofErr w:type="spellStart"/>
       <w:r>
         <w:t>Eyesi</w:t>
       </w:r>
-      <w:proofErr w:type="spellEnd"/>
       <w:r>
         <w:t>,</w:t>
       </w:r>
@@ -7523,15 +7516,7 @@
         <w:t xml:space="preserve">In addition to this, there is an </w:t>
       </w:r>
       <w:r>
-        <w:t>online training portal (</w:t>
-      </w:r>
-      <w:proofErr w:type="spellStart"/>
-      <w:r>
-        <w:t>vrmnet</w:t>
-      </w:r>
-      <w:proofErr w:type="spellEnd"/>
-      <w:r>
-        <w:t xml:space="preserve">) </w:t>
+        <w:t xml:space="preserve">online training portal (vrmnet) </w:t>
       </w:r>
       <w:r>
         <w:t>allowing comparison between trainees</w:t>
@@ -7666,15 +7651,7 @@
         <w:t xml:space="preserve"> </w:t>
       </w:r>
       <w:r>
-        <w:t xml:space="preserve">While </w:t>
-      </w:r>
-      <w:proofErr w:type="spellStart"/>
-      <w:r>
-        <w:t>Eyesi</w:t>
-      </w:r>
-      <w:proofErr w:type="spellEnd"/>
-      <w:r>
-        <w:t xml:space="preserve"> is effective for medical training for medical professionals, </w:t>
+        <w:t xml:space="preserve">While Eyesi is effective for medical training for medical professionals, </w:t>
       </w:r>
       <w:r>
         <w:t xml:space="preserve">similar </w:t>
@@ -7696,13 +7673,11 @@
       <w:pPr>
         <w:pStyle w:val="Heading3"/>
       </w:pPr>
-      <w:bookmarkStart w:id="12" w:name="_Toc224063290"/>
-      <w:proofErr w:type="spellStart"/>
+      <w:bookmarkStart w:id="12" w:name="_Toc224071327"/>
       <w:r>
         <w:t>OntoPhaco</w:t>
       </w:r>
       <w:bookmarkEnd w:id="12"/>
-      <w:proofErr w:type="spellEnd"/>
     </w:p>
     <w:p>
       <w:r>
@@ -7721,15 +7696,7 @@
         <w:t>d</w:t>
       </w:r>
       <w:r>
-        <w:t xml:space="preserve"> </w:t>
-      </w:r>
-      <w:proofErr w:type="spellStart"/>
-      <w:r>
-        <w:t>OntoPhaco</w:t>
-      </w:r>
-      <w:proofErr w:type="spellEnd"/>
-      <w:r>
-        <w:t>, a</w:t>
+        <w:t xml:space="preserve"> OntoPhaco, a</w:t>
       </w:r>
       <w:r>
         <w:t>n</w:t>
@@ -7862,191 +7829,173 @@
           <w:rFonts w:cs="TimesLTStd-Roman"/>
           <w:kern w:val="0"/>
         </w:rPr>
-        <w:t xml:space="preserve">Since </w:t>
-      </w:r>
-      <w:proofErr w:type="spellStart"/>
+        <w:t>Since OntoPhaco</w:t>
+      </w:r>
       <w:r>
         <w:rPr>
           <w:rFonts w:cs="TimesLTStd-Roman"/>
           <w:kern w:val="0"/>
         </w:rPr>
-        <w:t>OntoPhaco</w:t>
+        <w:t>’s</w:t>
       </w:r>
       <w:r>
         <w:rPr>
           <w:rFonts w:cs="TimesLTStd-Roman"/>
           <w:kern w:val="0"/>
         </w:rPr>
-        <w:t>’s</w:t>
-      </w:r>
-      <w:proofErr w:type="spellEnd"/>
+        <w:t xml:space="preserve"> </w:t>
+      </w:r>
+      <w:r>
+        <w:t>s</w:t>
+      </w:r>
+      <w:r>
+        <w:t xml:space="preserve">ystematic verification and validation processes </w:t>
+      </w:r>
+      <w:r>
+        <w:t>include</w:t>
+      </w:r>
+      <w:r>
+        <w:t xml:space="preserve"> </w:t>
+      </w:r>
+      <w:r>
+        <w:t xml:space="preserve">theoretical </w:t>
+      </w:r>
+      <w:r>
+        <w:t>evaluat</w:t>
+      </w:r>
+      <w:r>
+        <w:t xml:space="preserve">ion </w:t>
+      </w:r>
+      <w:r>
+        <w:t>and expert feedback</w:t>
+      </w:r>
       <w:r>
         <w:rPr>
           <w:rFonts w:cs="TimesLTStd-Roman"/>
           <w:kern w:val="0"/>
         </w:rPr>
-        <w:t xml:space="preserve"> </w:t>
-      </w:r>
-      <w:r>
-        <w:t>s</w:t>
-      </w:r>
-      <w:r>
-        <w:t xml:space="preserve">ystematic verification and validation processes </w:t>
-      </w:r>
-      <w:r>
-        <w:t>include</w:t>
-      </w:r>
-      <w:r>
-        <w:t xml:space="preserve"> </w:t>
-      </w:r>
-      <w:r>
-        <w:t xml:space="preserve">theoretical </w:t>
-      </w:r>
-      <w:r>
-        <w:t>evaluat</w:t>
-      </w:r>
-      <w:r>
-        <w:t xml:space="preserve">ion </w:t>
-      </w:r>
-      <w:r>
-        <w:t>and expert feedback</w:t>
+        <w:t xml:space="preserve">, each change, minor or major </w:t>
       </w:r>
       <w:r>
         <w:rPr>
           <w:rFonts w:cs="TimesLTStd-Roman"/>
           <w:kern w:val="0"/>
         </w:rPr>
-        <w:t xml:space="preserve">, each change, minor or major </w:t>
+        <w:t>is</w:t>
       </w:r>
       <w:r>
         <w:rPr>
           <w:rFonts w:cs="TimesLTStd-Roman"/>
           <w:kern w:val="0"/>
         </w:rPr>
-        <w:t>is</w:t>
+        <w:t xml:space="preserve"> verified and validate</w:t>
       </w:r>
       <w:r>
         <w:rPr>
           <w:rFonts w:cs="TimesLTStd-Roman"/>
           <w:kern w:val="0"/>
         </w:rPr>
-        <w:t xml:space="preserve"> verified and validate</w:t>
+        <w:t>d</w:t>
+      </w:r>
+      <w:r>
+        <w:t>.</w:t>
       </w:r>
       <w:r>
         <w:rPr>
           <w:rFonts w:cs="TimesLTStd-Roman"/>
           <w:kern w:val="0"/>
         </w:rPr>
-        <w:t>d</w:t>
-      </w:r>
-      <w:r>
-        <w:t>.</w:t>
+        <w:t xml:space="preserve"> </w:t>
       </w:r>
       <w:r>
         <w:rPr>
           <w:rFonts w:cs="TimesLTStd-Roman"/>
           <w:kern w:val="0"/>
         </w:rPr>
-        <w:t xml:space="preserve"> </w:t>
-      </w:r>
-      <w:proofErr w:type="spellStart"/>
+        <w:t>OntoPhaco demonstrates VR</w:t>
+      </w:r>
       <w:r>
         <w:rPr>
           <w:rFonts w:cs="TimesLTStd-Roman"/>
           <w:kern w:val="0"/>
         </w:rPr>
-        <w:t>OntoPhaco</w:t>
-      </w:r>
-      <w:proofErr w:type="spellEnd"/>
+        <w:t>’</w:t>
+      </w:r>
       <w:r>
         <w:rPr>
           <w:rFonts w:cs="TimesLTStd-Roman"/>
           <w:kern w:val="0"/>
         </w:rPr>
-        <w:t xml:space="preserve"> demonstrates VR</w:t>
+        <w:t xml:space="preserve">s effectiveness </w:t>
       </w:r>
       <w:r>
         <w:rPr>
           <w:rFonts w:cs="TimesLTStd-Roman"/>
           <w:kern w:val="0"/>
         </w:rPr>
-        <w:t>’</w:t>
+        <w:t xml:space="preserve">paired </w:t>
       </w:r>
       <w:r>
         <w:rPr>
           <w:rFonts w:cs="TimesLTStd-Roman"/>
           <w:kern w:val="0"/>
         </w:rPr>
-        <w:t xml:space="preserve">s effectiveness </w:t>
+        <w:t>with ontology for medical training</w:t>
       </w:r>
       <w:r>
         <w:rPr>
           <w:rFonts w:cs="TimesLTStd-Roman"/>
           <w:kern w:val="0"/>
         </w:rPr>
-        <w:t xml:space="preserve">paired </w:t>
+        <w:t>. T</w:t>
       </w:r>
       <w:r>
         <w:rPr>
           <w:rFonts w:cs="TimesLTStd-Roman"/>
           <w:kern w:val="0"/>
         </w:rPr>
-        <w:t>with ontology for medical training</w:t>
+        <w:t>his project</w:t>
       </w:r>
       <w:r>
         <w:rPr>
           <w:rFonts w:cs="TimesLTStd-Roman"/>
           <w:kern w:val="0"/>
         </w:rPr>
-        <w:t>. T</w:t>
+        <w:t xml:space="preserve"> applies similar immersi</w:t>
       </w:r>
       <w:r>
         <w:rPr>
           <w:rFonts w:cs="TimesLTStd-Roman"/>
           <w:kern w:val="0"/>
         </w:rPr>
-        <w:t>his project</w:t>
+        <w:t>ve</w:t>
       </w:r>
       <w:r>
         <w:rPr>
           <w:rFonts w:cs="TimesLTStd-Roman"/>
           <w:kern w:val="0"/>
         </w:rPr>
-        <w:t xml:space="preserve"> applies similar immersi</w:t>
+        <w:t xml:space="preserve"> and educational knowledge </w:t>
       </w:r>
       <w:r>
         <w:rPr>
           <w:rFonts w:cs="TimesLTStd-Roman"/>
           <w:kern w:val="0"/>
         </w:rPr>
-        <w:t>ve</w:t>
+        <w:t xml:space="preserve">for DES to raise awareness, </w:t>
       </w:r>
       <w:r>
         <w:rPr>
           <w:rFonts w:cs="TimesLTStd-Roman"/>
           <w:kern w:val="0"/>
         </w:rPr>
-        <w:t xml:space="preserve"> and educational knowledge </w:t>
+        <w:t xml:space="preserve">spreading the </w:t>
       </w:r>
       <w:r>
         <w:rPr>
           <w:rFonts w:cs="TimesLTStd-Roman"/>
           <w:kern w:val="0"/>
         </w:rPr>
-        <w:t xml:space="preserve">for DES to raise awareness, </w:t>
-      </w:r>
-      <w:r>
-        <w:rPr>
-          <w:rFonts w:cs="TimesLTStd-Roman"/>
-          <w:kern w:val="0"/>
-        </w:rPr>
-        <w:t xml:space="preserve">spreading the </w:t>
-      </w:r>
-      <w:r>
-        <w:rPr>
-          <w:rFonts w:cs="TimesLTStd-Roman"/>
-          <w:kern w:val="0"/>
-        </w:rPr>
         <w:t>benefits of VR use in education beyond professional training.</w:t>
       </w:r>
     </w:p>
@@ -8054,7 +8003,7 @@
       <w:pPr>
         <w:pStyle w:val="Heading3"/>
       </w:pPr>
-      <w:bookmarkStart w:id="13" w:name="_Toc224063291"/>
+      <w:bookmarkStart w:id="13" w:name="_Toc224071328"/>
       <w:r>
         <w:lastRenderedPageBreak/>
         <w:t>I</w:t>
@@ -8250,7 +8199,7 @@
       <w:pPr>
         <w:pStyle w:val="Heading3"/>
       </w:pPr>
-      <w:bookmarkStart w:id="14" w:name="_Toc224063292"/>
+      <w:bookmarkStart w:id="14" w:name="_Toc224071329"/>
       <w:r>
         <w:t>Opportunities for innovation</w:t>
       </w:r>
@@ -8260,27 +8209,17 @@
       <w:r>
         <w:t xml:space="preserve">While </w:t>
       </w:r>
-      <w:proofErr w:type="spellStart"/>
-      <w:r>
-        <w:t>Eyesi</w:t>
-      </w:r>
-      <w:proofErr w:type="spellEnd"/>
-      <w:r>
-        <w:t xml:space="preserve"> focuses on hands on surgical practices</w:t>
+      <w:r>
+        <w:t>Eyesi focuses on hands on surgical practices</w:t>
       </w:r>
       <w:r>
         <w:t xml:space="preserve">, </w:t>
       </w:r>
-      <w:proofErr w:type="spellStart"/>
       <w:r>
         <w:t>O</w:t>
       </w:r>
       <w:r>
-        <w:t>ntoPhaco</w:t>
-      </w:r>
-      <w:proofErr w:type="spellEnd"/>
-      <w:r>
-        <w:t xml:space="preserve"> focuses on the way knowledge is represented and conceptual understanding</w:t>
+        <w:t>ntoPhaco focuses on the way knowledge is represented and conceptual understanding</w:t>
       </w:r>
       <w:r>
         <w:t xml:space="preserve">. </w:t>
@@ -8378,7 +8317,7 @@
           <w:rFonts w:asciiTheme="minorHAnsi" w:hAnsiTheme="minorHAnsi"/>
         </w:rPr>
       </w:pPr>
-      <w:bookmarkStart w:id="15" w:name="_Toc224063293"/>
+      <w:bookmarkStart w:id="15" w:name="_Toc224071330"/>
       <w:r>
         <w:rPr>
           <w:rFonts w:asciiTheme="minorHAnsi" w:hAnsiTheme="minorHAnsi"/>
@@ -8391,7 +8330,7 @@
       <w:pPr>
         <w:pStyle w:val="Heading3"/>
       </w:pPr>
-      <w:bookmarkStart w:id="16" w:name="_Toc224063294"/>
+      <w:bookmarkStart w:id="16" w:name="_Toc224071331"/>
       <w:r>
         <w:t>VR in medical education</w:t>
       </w:r>
@@ -8538,19 +8477,9 @@
       <w:r>
         <w:t xml:space="preserve">Examples such as </w:t>
       </w:r>
-      <w:proofErr w:type="spellStart"/>
-      <w:r>
-        <w:t>Mediverse</w:t>
-      </w:r>
-      <w:proofErr w:type="spellEnd"/>
-      <w:r>
-        <w:t xml:space="preserve"> by </w:t>
-      </w:r>
-      <w:proofErr w:type="spellStart"/>
-      <w:r>
-        <w:t>Goggleminds</w:t>
-      </w:r>
-      <w:proofErr w:type="spellEnd"/>
+      <w:r>
+        <w:t>Mediverse by Goggleminds</w:t>
+      </w:r>
       <w:r>
         <w:t xml:space="preserve"> </w:t>
       </w:r>
@@ -8564,38 +8493,25 @@
         <w:t xml:space="preserve"> to healthcare providers and medical schools</w:t>
       </w:r>
       <w:r>
+        <w:t>. ClassVR by Systems improve</w:t>
+      </w:r>
+      <w:r>
+        <w:t>s</w:t>
+      </w:r>
+      <w:r>
+        <w:t xml:space="preserve"> student engagement</w:t>
+      </w:r>
+      <w:r>
+        <w:t xml:space="preserve"> to help teachers with educating students on learning material</w:t>
+      </w:r>
+      <w:r>
         <w:t xml:space="preserve">. </w:t>
       </w:r>
-      <w:proofErr w:type="spellStart"/>
-      <w:r>
-        <w:t>ClassVR</w:t>
-      </w:r>
-      <w:proofErr w:type="spellEnd"/>
-      <w:r>
-        <w:t xml:space="preserve"> by Systems improve</w:t>
-      </w:r>
-      <w:r>
-        <w:t>s</w:t>
-      </w:r>
-      <w:r>
-        <w:t xml:space="preserve"> student engagement</w:t>
-      </w:r>
-      <w:r>
-        <w:t xml:space="preserve"> to help teachers with educating students on learning material</w:t>
-      </w:r>
-      <w:r>
-        <w:t xml:space="preserve">. </w:t>
-      </w:r>
-      <w:r>
-        <w:t xml:space="preserve"> </w:t>
-      </w:r>
-      <w:proofErr w:type="spellStart"/>
-      <w:r>
-        <w:t>PrismsVR</w:t>
-      </w:r>
-      <w:proofErr w:type="spellEnd"/>
-      <w:r>
-        <w:t xml:space="preserve"> </w:t>
+      <w:r>
+        <w:t xml:space="preserve"> </w:t>
+      </w:r>
+      <w:r>
+        <w:t xml:space="preserve">PrismsVR </w:t>
       </w:r>
       <w:r>
         <w:t xml:space="preserve">helps students grasp core concepts in algebra and geometry, by </w:t>
@@ -8681,7 +8597,7 @@
       <w:pPr>
         <w:pStyle w:val="Heading3"/>
       </w:pPr>
-      <w:bookmarkStart w:id="17" w:name="_Toc224063295"/>
+      <w:bookmarkStart w:id="17" w:name="_Toc224071332"/>
       <w:r>
         <w:lastRenderedPageBreak/>
         <w:t>VR in Health Awareness</w:t>
@@ -8874,7 +8790,7 @@
           <w:rFonts w:asciiTheme="minorHAnsi" w:hAnsiTheme="minorHAnsi"/>
         </w:rPr>
       </w:pPr>
-      <w:bookmarkStart w:id="18" w:name="_Toc224063296"/>
+      <w:bookmarkStart w:id="18" w:name="_Toc224071333"/>
       <w:r>
         <w:rPr>
           <w:rFonts w:asciiTheme="minorHAnsi" w:hAnsiTheme="minorHAnsi"/>
@@ -9094,7 +9010,7 @@
       <w:pPr>
         <w:pStyle w:val="Heading1"/>
       </w:pPr>
-      <w:bookmarkStart w:id="19" w:name="_Toc224063297"/>
+      <w:bookmarkStart w:id="19" w:name="_Toc224071334"/>
       <w:r>
         <w:lastRenderedPageBreak/>
         <w:t>Appendices</w:t>
@@ -9105,7 +9021,7 @@
       <w:pPr>
         <w:pStyle w:val="Heading2"/>
       </w:pPr>
-      <w:bookmarkStart w:id="20" w:name="_Toc224063298"/>
+      <w:bookmarkStart w:id="20" w:name="_Toc224071335"/>
       <w:r>
         <w:t>Ethics Checklist</w:t>
       </w:r>
@@ -9247,7 +9163,7 @@
       <w:pPr>
         <w:pStyle w:val="Heading2"/>
       </w:pPr>
-      <w:bookmarkStart w:id="21" w:name="_Toc224063299"/>
+      <w:bookmarkStart w:id="21" w:name="_Toc224071336"/>
       <w:r>
         <w:lastRenderedPageBreak/>
         <w:t>Project Timeline Gant</w:t>
@@ -9443,7 +9359,7 @@
       <w:pPr>
         <w:pStyle w:val="Heading1"/>
       </w:pPr>
-      <w:bookmarkStart w:id="22" w:name="_Toc224063300"/>
+      <w:bookmarkStart w:id="22" w:name="_Toc224071337"/>
       <w:r>
         <w:lastRenderedPageBreak/>
         <w:t>Methodology</w:t>
@@ -9454,7 +9370,7 @@
       <w:pPr>
         <w:pStyle w:val="Heading2"/>
       </w:pPr>
-      <w:bookmarkStart w:id="23" w:name="_Toc224063301"/>
+      <w:bookmarkStart w:id="23" w:name="_Toc224071338"/>
       <w:r>
         <w:t>Source Control</w:t>
       </w:r>
@@ -9553,7 +9469,7 @@
       <w:pPr>
         <w:pStyle w:val="Heading2"/>
       </w:pPr>
-      <w:bookmarkStart w:id="24" w:name="_Toc224063302"/>
+      <w:bookmarkStart w:id="24" w:name="_Toc224071339"/>
       <w:r>
         <w:t>Prototype Implementation</w:t>
       </w:r>
@@ -9563,7 +9479,7 @@
       <w:pPr>
         <w:pStyle w:val="Heading3"/>
       </w:pPr>
-      <w:bookmarkStart w:id="25" w:name="_Toc224063303"/>
+      <w:bookmarkStart w:id="25" w:name="_Toc224071340"/>
       <w:r>
         <w:t>Usability and Flow</w:t>
       </w:r>
@@ -9638,13 +9554,8 @@
       <w:r>
         <w:t xml:space="preserve"> </w:t>
       </w:r>
-      <w:proofErr w:type="spellStart"/>
-      <w:r>
-        <w:t>Looyestyn</w:t>
-      </w:r>
-      <w:proofErr w:type="spellEnd"/>
-      <w:r>
-        <w:t xml:space="preserve"> et al., </w:t>
+      <w:r>
+        <w:t xml:space="preserve">Looyestyn et al., </w:t>
       </w:r>
       <w:r>
         <w:t>(</w:t>
@@ -9705,7 +9616,7 @@
       <w:pPr>
         <w:pStyle w:val="Heading3"/>
       </w:pPr>
-      <w:bookmarkStart w:id="26" w:name="_Toc224063304"/>
+      <w:bookmarkStart w:id="26" w:name="_Toc224071341"/>
       <w:r>
         <w:t xml:space="preserve">Environment Design and </w:t>
       </w:r>
@@ -9901,7 +9812,7 @@
       <w:pPr>
         <w:pStyle w:val="Heading3"/>
       </w:pPr>
-      <w:bookmarkStart w:id="27" w:name="_Toc224063305"/>
+      <w:bookmarkStart w:id="27" w:name="_Toc224071342"/>
       <w:r>
         <w:lastRenderedPageBreak/>
         <w:t>Objective System Implementation</w:t>
@@ -9943,15 +9854,7 @@
         <w:t>ere</w:t>
       </w:r>
       <w:r>
-        <w:t xml:space="preserve"> stored within the </w:t>
-      </w:r>
-      <w:proofErr w:type="spellStart"/>
-      <w:r>
-        <w:t>VRGameMode</w:t>
-      </w:r>
-      <w:proofErr w:type="spellEnd"/>
-      <w:r>
-        <w:t xml:space="preserve"> blueprint, with objectives being updated during runtime as conditions were satisfied </w:t>
+        <w:t xml:space="preserve"> stored within the VRGameMode blueprint, with objectives being updated during runtime as conditions were satisfied </w:t>
       </w:r>
       <w:r>
         <w:t>during</w:t>
@@ -10015,7 +9918,7 @@
       <w:pPr>
         <w:pStyle w:val="Heading3"/>
       </w:pPr>
-      <w:bookmarkStart w:id="28" w:name="_Toc224063306"/>
+      <w:bookmarkStart w:id="28" w:name="_Toc224071343"/>
       <w:r>
         <w:t>User</w:t>
       </w:r>
@@ -10125,7 +10028,7 @@
       <w:pPr>
         <w:pStyle w:val="Heading3"/>
       </w:pPr>
-      <w:bookmarkStart w:id="29" w:name="_Toc224063307"/>
+      <w:bookmarkStart w:id="29" w:name="_Toc224071344"/>
       <w:r>
         <w:t>Objective Based Interact</w:t>
       </w:r>
@@ -10196,7 +10099,7 @@
       <w:pPr>
         <w:pStyle w:val="Heading3"/>
       </w:pPr>
-      <w:bookmarkStart w:id="30" w:name="_Toc224063308"/>
+      <w:bookmarkStart w:id="30" w:name="_Toc224071345"/>
       <w:r>
         <w:lastRenderedPageBreak/>
         <w:t>Post Processing Effects</w:t>
@@ -10345,15 +10248,7 @@
         <w:t xml:space="preserve"> simulated </w:t>
       </w:r>
       <w:r>
-        <w:t xml:space="preserve">were </w:t>
-      </w:r>
-      <w:proofErr w:type="gramStart"/>
-      <w:r>
-        <w:t>vignette</w:t>
-      </w:r>
-      <w:proofErr w:type="gramEnd"/>
-      <w:r>
-        <w:t xml:space="preserve"> to simulate eye fatigue, bloom for light sensitivity and blur for focus strain. Vignette and bloom post processing effects were triggered </w:t>
+        <w:t xml:space="preserve">were vignette to simulate eye fatigue, bloom for light sensitivity and blur for focus strain. Vignette and bloom post processing effects were triggered </w:t>
       </w:r>
       <w:r>
         <w:t>by</w:t>
@@ -10369,7 +10264,7 @@
       <w:pPr>
         <w:pStyle w:val="Heading3"/>
       </w:pPr>
-      <w:bookmarkStart w:id="31" w:name="_Toc224063309"/>
+      <w:bookmarkStart w:id="31" w:name="_Toc224071346"/>
       <w:r>
         <w:t>User</w:t>
       </w:r>
@@ -10437,7 +10332,7 @@
       <w:pPr>
         <w:pStyle w:val="Heading2"/>
       </w:pPr>
-      <w:bookmarkStart w:id="32" w:name="_Toc224063310"/>
+      <w:bookmarkStart w:id="32" w:name="_Toc224071347"/>
       <w:r>
         <w:lastRenderedPageBreak/>
         <w:t>Final Version</w:t>
@@ -10451,7 +10346,7 @@
       <w:pPr>
         <w:pStyle w:val="Heading3"/>
       </w:pPr>
-      <w:bookmarkStart w:id="33" w:name="_Toc224063311"/>
+      <w:bookmarkStart w:id="33" w:name="_Toc224071348"/>
       <w:r>
         <w:t>Environment Changes and Visual Modifications</w:t>
       </w:r>
@@ -10478,7 +10373,7 @@
       <w:pPr>
         <w:pStyle w:val="Heading3"/>
       </w:pPr>
-      <w:bookmarkStart w:id="34" w:name="_Toc224063312"/>
+      <w:bookmarkStart w:id="34" w:name="_Toc224071349"/>
       <w:r>
         <w:t>Interaction Improvements</w:t>
       </w:r>
@@ -10516,15 +10411,7 @@
         <w:t xml:space="preserve"> </w:t>
       </w:r>
       <w:r>
-        <w:t xml:space="preserve">A </w:t>
-      </w:r>
-      <w:proofErr w:type="spellStart"/>
-      <w:r>
-        <w:t>boolean</w:t>
-      </w:r>
-      <w:proofErr w:type="spellEnd"/>
-      <w:r>
-        <w:t xml:space="preserve"> variable would then dictate what state the light was in and whether to turn it on or off depending on that state.</w:t>
+        <w:t>A boolean variable would then dictate what state the light was in and whether to turn it on or off depending on that state.</w:t>
       </w:r>
     </w:p>
     <w:p>
@@ -10581,7 +10468,7 @@
       <w:pPr>
         <w:pStyle w:val="Heading3"/>
       </w:pPr>
-      <w:bookmarkStart w:id="35" w:name="_Toc224063313"/>
+      <w:bookmarkStart w:id="35" w:name="_Toc224071350"/>
       <w:r>
         <w:t>Flow Tweaks</w:t>
       </w:r>
@@ -10671,7 +10558,7 @@
       <w:pPr>
         <w:pStyle w:val="Heading3"/>
       </w:pPr>
-      <w:bookmarkStart w:id="36" w:name="_Toc224063314"/>
+      <w:bookmarkStart w:id="36" w:name="_Toc224071351"/>
       <w:r>
         <w:t>Gaze Detection Refinements</w:t>
       </w:r>
@@ -10720,13 +10607,8 @@
       <w:r>
         <w:t xml:space="preserve"> </w:t>
       </w:r>
-      <w:proofErr w:type="spellStart"/>
-      <w:r>
-        <w:t>Quesenbery</w:t>
-      </w:r>
-      <w:proofErr w:type="spellEnd"/>
-      <w:r>
-        <w:t xml:space="preserve">, </w:t>
+      <w:r>
+        <w:t xml:space="preserve">Quesenbery, </w:t>
       </w:r>
       <w:r>
         <w:t>(</w:t>
@@ -10817,7 +10699,7 @@
       <w:pPr>
         <w:pStyle w:val="Heading1"/>
       </w:pPr>
-      <w:bookmarkStart w:id="37" w:name="_Toc224063315"/>
+      <w:bookmarkStart w:id="37" w:name="_Toc224071352"/>
       <w:r>
         <w:lastRenderedPageBreak/>
         <w:t>Results</w:t>
@@ -10828,7 +10710,7 @@
       <w:pPr>
         <w:pStyle w:val="Heading2"/>
       </w:pPr>
-      <w:bookmarkStart w:id="38" w:name="_Toc224063316"/>
+      <w:bookmarkStart w:id="38" w:name="_Toc224071353"/>
       <w:r>
         <w:t>Prototype Tests</w:t>
       </w:r>
@@ -10854,7 +10736,52 @@
         <w:t>s</w:t>
       </w:r>
       <w:r>
-        <w:t>. The</w:t>
+        <w:t xml:space="preserve">. </w:t>
+      </w:r>
+      <w:r>
+        <w:t xml:space="preserve">As discussed by </w:t>
+      </w:r>
+      <w:r>
+        <w:t xml:space="preserve">Fu et al., </w:t>
+      </w:r>
+      <w:r>
+        <w:t>(</w:t>
+      </w:r>
+      <w:r>
+        <w:t>2002)</w:t>
+      </w:r>
+      <w:r>
+        <w:t xml:space="preserve"> user testing is commonly used</w:t>
+      </w:r>
+      <w:r>
+        <w:t xml:space="preserve"> to identify usability issues </w:t>
+      </w:r>
+      <w:r>
+        <w:t xml:space="preserve">within </w:t>
+      </w:r>
+      <w:r>
+        <w:t>software</w:t>
+      </w:r>
+      <w:r>
+        <w:t xml:space="preserve"> and</w:t>
+      </w:r>
+      <w:r>
+        <w:t xml:space="preserve"> how </w:t>
+      </w:r>
+      <w:r>
+        <w:t xml:space="preserve">effectively </w:t>
+      </w:r>
+      <w:r>
+        <w:t xml:space="preserve">users interact with </w:t>
+      </w:r>
+      <w:r>
+        <w:t>them</w:t>
+      </w:r>
+      <w:r>
+        <w:t>. T</w:t>
+      </w:r>
+      <w:r>
+        <w:t>he</w:t>
       </w:r>
       <w:r>
         <w:t xml:space="preserve"> aim of the</w:t>
@@ -10924,7 +10851,7 @@
       <w:pPr>
         <w:pStyle w:val="Heading3"/>
       </w:pPr>
-      <w:bookmarkStart w:id="39" w:name="_Toc224063317"/>
+      <w:bookmarkStart w:id="39" w:name="_Toc224071354"/>
       <w:r>
         <w:t>Interaction</w:t>
       </w:r>
@@ -11085,7 +11012,7 @@
       <w:pPr>
         <w:pStyle w:val="Heading3"/>
       </w:pPr>
-      <w:bookmarkStart w:id="40" w:name="_Toc224063318"/>
+      <w:bookmarkStart w:id="40" w:name="_Toc224071355"/>
       <w:r>
         <w:t>User Attention Detection</w:t>
       </w:r>
@@ -11138,12 +11065,16 @@
         <w:t xml:space="preserve"> channel trace to expand the area of detection to be more forgiving.</w:t>
       </w:r>
     </w:p>
+    <w:p/>
+    <w:p/>
+    <w:p/>
     <w:p>
       <w:pPr>
         <w:pStyle w:val="Heading3"/>
       </w:pPr>
-      <w:bookmarkStart w:id="41" w:name="_Toc224063319"/>
-      <w:r>
+      <w:bookmarkStart w:id="41" w:name="_Toc224071356"/>
+      <w:r>
+        <w:lastRenderedPageBreak/>
         <w:t>Symptom Simulations</w:t>
       </w:r>
       <w:bookmarkEnd w:id="41"/>
@@ -11228,11 +11159,7 @@
         <w:t xml:space="preserve">the </w:t>
       </w:r>
       <w:r>
-        <w:t xml:space="preserve">view becomes distorted and unclear as the eyes </w:t>
-      </w:r>
-      <w:r>
-        <w:lastRenderedPageBreak/>
-        <w:t>become more strained.</w:t>
+        <w:t>view becomes distorted and unclear as the eyes become more strained.</w:t>
       </w:r>
       <w:r>
         <w:t xml:space="preserve"> However, due to the limited number </w:t>
@@ -11284,7 +11211,7 @@
       <w:pPr>
         <w:pStyle w:val="Heading3"/>
       </w:pPr>
-      <w:bookmarkStart w:id="42" w:name="_Toc224063320"/>
+      <w:bookmarkStart w:id="42" w:name="_Toc224071357"/>
       <w:r>
         <w:t xml:space="preserve">Improvements to be </w:t>
       </w:r>
@@ -11334,7 +11261,7 @@
       <w:pPr>
         <w:pStyle w:val="Heading2"/>
       </w:pPr>
-      <w:bookmarkStart w:id="43" w:name="_Toc224063321"/>
+      <w:bookmarkStart w:id="43" w:name="_Toc224071358"/>
       <w:r>
         <w:lastRenderedPageBreak/>
         <w:t>Final Version Tests</w:t>
@@ -11349,7 +11276,90 @@
         <w:t>was</w:t>
       </w:r>
       <w:r>
-        <w:t xml:space="preserve"> carried out to ensure the improvements had made a positive impact on the experience instead of hindering it. The conducted tests were relatively the same </w:t>
+        <w:t xml:space="preserve"> carried out to ensure the improvements had made a positive impact on the experience instead of hindering it. </w:t>
+      </w:r>
+      <w:r>
+        <w:t xml:space="preserve">Gibson Kimutai and Förster, </w:t>
+      </w:r>
+      <w:r>
+        <w:t>(</w:t>
+      </w:r>
+      <w:r>
+        <w:t>2024)</w:t>
+      </w:r>
+      <w:r>
+        <w:t xml:space="preserve"> </w:t>
+      </w:r>
+      <w:r>
+        <w:t>examined</w:t>
+      </w:r>
+      <w:r>
+        <w:t xml:space="preserve"> </w:t>
+      </w:r>
+      <w:r>
+        <w:t xml:space="preserve">how </w:t>
+      </w:r>
+      <w:r>
+        <w:t>UCD (U</w:t>
+      </w:r>
+      <w:r>
+        <w:t xml:space="preserve">ser </w:t>
+      </w:r>
+      <w:r>
+        <w:t>C</w:t>
+      </w:r>
+      <w:r>
+        <w:t xml:space="preserve">entred </w:t>
+      </w:r>
+      <w:r>
+        <w:t>D</w:t>
+      </w:r>
+      <w:r>
+        <w:t>esign</w:t>
+      </w:r>
+      <w:r>
+        <w:t xml:space="preserve">) </w:t>
+      </w:r>
+      <w:r>
+        <w:t>plays</w:t>
+      </w:r>
+      <w:r>
+        <w:t xml:space="preserve"> a critical role in product development</w:t>
+      </w:r>
+      <w:r>
+        <w:t>,</w:t>
+      </w:r>
+      <w:r>
+        <w:t xml:space="preserve"> involv</w:t>
+      </w:r>
+      <w:r>
+        <w:t>ing</w:t>
+      </w:r>
+      <w:r>
+        <w:t xml:space="preserve"> users </w:t>
+      </w:r>
+      <w:r>
+        <w:t>throughout</w:t>
+      </w:r>
+      <w:r>
+        <w:t xml:space="preserve"> the development process buil</w:t>
+      </w:r>
+      <w:r>
+        <w:t>ding</w:t>
+      </w:r>
+      <w:r>
+        <w:t xml:space="preserve"> upon</w:t>
+      </w:r>
+      <w:r>
+        <w:t xml:space="preserve"> the feedback to refine the product</w:t>
+      </w:r>
+      <w:r>
+        <w:t>.</w:t>
+      </w:r>
+    </w:p>
+    <w:p>
+      <w:r>
+        <w:t xml:space="preserve">The conducted tests were relatively the same </w:t>
       </w:r>
       <w:r>
         <w:t>as</w:t>
@@ -11374,7 +11384,7 @@
       <w:pPr>
         <w:pStyle w:val="Heading3"/>
       </w:pPr>
-      <w:bookmarkStart w:id="44" w:name="_Toc224063322"/>
+      <w:bookmarkStart w:id="44" w:name="_Toc224071359"/>
       <w:r>
         <w:t>Interaction Objects and Objective Understanding</w:t>
       </w:r>
@@ -11428,7 +11438,7 @@
       <w:pPr>
         <w:pStyle w:val="Heading3"/>
       </w:pPr>
-      <w:bookmarkStart w:id="45" w:name="_Toc224063323"/>
+      <w:bookmarkStart w:id="45" w:name="_Toc224071360"/>
       <w:r>
         <w:t>User Attention Detection</w:t>
       </w:r>
@@ -11491,7 +11501,7 @@
       <w:pPr>
         <w:pStyle w:val="Heading3"/>
       </w:pPr>
-      <w:bookmarkStart w:id="46" w:name="_Toc224063324"/>
+      <w:bookmarkStart w:id="46" w:name="_Toc224071361"/>
       <w:r>
         <w:t>Symptom Simulation</w:t>
       </w:r>
@@ -11534,7 +11544,7 @@
       <w:pPr>
         <w:pStyle w:val="Heading1"/>
       </w:pPr>
-      <w:bookmarkStart w:id="47" w:name="_Toc224063325"/>
+      <w:bookmarkStart w:id="47" w:name="_Toc224071362"/>
       <w:r>
         <w:lastRenderedPageBreak/>
         <w:t>Critical Evaluation</w:t>
@@ -11588,7 +11598,7 @@
       <w:pPr>
         <w:pStyle w:val="Heading1"/>
       </w:pPr>
-      <w:bookmarkStart w:id="48" w:name="_Toc224063326"/>
+      <w:bookmarkStart w:id="48" w:name="_Toc224071363"/>
       <w:r>
         <w:lastRenderedPageBreak/>
         <w:t>Conclusions and Future Work</w:t>
@@ -11599,7 +11609,7 @@
       <w:pPr>
         <w:pStyle w:val="Heading2"/>
       </w:pPr>
-      <w:bookmarkStart w:id="49" w:name="_Toc224063327"/>
+      <w:bookmarkStart w:id="49" w:name="_Toc224071364"/>
       <w:r>
         <w:t>Conclusion</w:t>
       </w:r>
@@ -11610,7 +11620,7 @@
       <w:pPr>
         <w:pStyle w:val="Heading2"/>
       </w:pPr>
-      <w:bookmarkStart w:id="50" w:name="_Toc224063328"/>
+      <w:bookmarkStart w:id="50" w:name="_Toc224071365"/>
       <w:r>
         <w:t>Future Work</w:t>
       </w:r>
@@ -11695,7 +11705,7 @@
       <w:pPr>
         <w:pStyle w:val="Heading1"/>
       </w:pPr>
-      <w:bookmarkStart w:id="51" w:name="_Toc224063329"/>
+      <w:bookmarkStart w:id="51" w:name="_Toc224071366"/>
       <w:r>
         <w:lastRenderedPageBreak/>
         <w:t>References</w:t>
@@ -11704,45 +11714,17 @@
     </w:p>
     <w:p>
       <w:r>
-        <w:t xml:space="preserve">Atienza, R., </w:t>
-      </w:r>
-      <w:proofErr w:type="spellStart"/>
-      <w:r>
-        <w:t>Blonna</w:t>
-      </w:r>
-      <w:proofErr w:type="spellEnd"/>
-      <w:r>
-        <w:t xml:space="preserve">, R., Saludares, M.I., Casimiro, J. and Fuentes, V. (2016) ‘Interaction techniques using head gaze for virtual reality’. </w:t>
+        <w:t xml:space="preserve">Atienza, R., Blonna, R., Saludares, M.I., Casimiro, J. and Fuentes, V. (2016) ‘Interaction techniques using head gaze for virtual reality’. </w:t>
       </w:r>
       <w:r>
         <w:rPr>
           <w:i/>
           <w:iCs/>
         </w:rPr>
-        <w:t>2016 IEEE Region 10 Symposium (TENSYMP</w:t>
-      </w:r>
-      <w:proofErr w:type="gramStart"/>
-      <w:r>
-        <w:rPr>
-          <w:i/>
-          <w:iCs/>
-        </w:rPr>
-        <w:t>)</w:t>
-      </w:r>
-      <w:r>
-        <w:t xml:space="preserve"> .</w:t>
-      </w:r>
-      <w:proofErr w:type="gramEnd"/>
-      <w:r>
-        <w:t xml:space="preserve"> </w:t>
-      </w:r>
-      <w:proofErr w:type="spellStart"/>
-      <w:r>
-        <w:t>doi</w:t>
-      </w:r>
-      <w:proofErr w:type="spellEnd"/>
-      <w:r>
-        <w:t xml:space="preserve">: </w:t>
+        <w:t>2016 IEEE Region 10 Symposium (TENSYMP)</w:t>
+      </w:r>
+      <w:r>
+        <w:t xml:space="preserve"> . doi: </w:t>
       </w:r>
       <w:hyperlink r:id="rId15" w:history="1">
         <w:r>
@@ -11760,23 +11742,9 @@
       </w:r>
     </w:p>
     <w:p>
-      <w:proofErr w:type="spellStart"/>
-      <w:r>
-        <w:t>Cantó</w:t>
-      </w:r>
-      <w:proofErr w:type="spellEnd"/>
-      <w:r>
-        <w:t xml:space="preserve">-Sancho, N., </w:t>
-      </w:r>
-      <w:proofErr w:type="spellStart"/>
-      <w:r>
-        <w:t>Porru</w:t>
-      </w:r>
-      <w:proofErr w:type="spellEnd"/>
-      <w:r>
-        <w:t xml:space="preserve">, S., Casati, S., Ronda, E., Seguí-Crespo, M. and Carta, A. (2023) ‘Prevalence and risk factors of computer vision syndrome—assessed in office workers by a validated questionnaire’. </w:t>
-      </w:r>
-      <w:proofErr w:type="spellStart"/>
+      <w:r>
+        <w:t xml:space="preserve">Cantó-Sancho, N., Porru, S., Casati, S., Ronda, E., Seguí-Crespo, M. and Carta, A. (2023) ‘Prevalence and risk factors of computer vision syndrome—assessed in office workers by a validated questionnaire’. </w:t>
+      </w:r>
       <w:r>
         <w:rPr>
           <w:i/>
@@ -11784,7 +11752,6 @@
         </w:rPr>
         <w:t>PeerJ</w:t>
       </w:r>
-      <w:proofErr w:type="spellEnd"/>
       <w:r>
         <w:t xml:space="preserve"> 11, p. e14937. Available at: </w:t>
       </w:r>
@@ -11831,23 +11798,7 @@
     </w:p>
     <w:p>
       <w:r>
-        <w:t xml:space="preserve">Chandrasekhara, R.S., Low, C., Lim, Y., Low, L., Mardina, F. and </w:t>
-      </w:r>
-      <w:proofErr w:type="spellStart"/>
-      <w:r>
-        <w:t>Nursaleha</w:t>
-      </w:r>
-      <w:proofErr w:type="spellEnd"/>
-      <w:r>
-        <w:t xml:space="preserve">, M. (2013) ‘Computer vision syndrome: a study of knowledge and practices in university </w:t>
-      </w:r>
-      <w:proofErr w:type="gramStart"/>
-      <w:r>
-        <w:t>students’</w:t>
-      </w:r>
-      <w:proofErr w:type="gramEnd"/>
-      <w:r>
-        <w:t xml:space="preserve">. </w:t>
+        <w:t xml:space="preserve">Chandrasekhara, R.S., Low, C., Lim, Y., Low, L., Mardina, F. and Nursaleha, M. (2013) ‘Computer vision syndrome: a study of knowledge and practices in university students’. </w:t>
       </w:r>
       <w:r>
         <w:rPr>
@@ -11899,19 +11850,61 @@
     </w:p>
     <w:p>
       <w:r>
-        <w:t xml:space="preserve">GitHub (2024) </w:t>
+        <w:t xml:space="preserve">Fu, L., Salvendy, G. and Turley, L. (2002) ‘Effectiveness of user testing and heuristic evaluation as a function of performance classification’. </w:t>
       </w:r>
       <w:r>
         <w:rPr>
           <w:i/>
           <w:iCs/>
         </w:rPr>
+        <w:t>Behaviour &amp; Information Technology</w:t>
+      </w:r>
+      <w:r>
+        <w:t xml:space="preserve"> 21(2), pp. 137–143. doi: </w:t>
+      </w:r>
+      <w:hyperlink r:id="rId20" w:history="1">
+        <w:r>
+          <w:rPr>
+            <w:rStyle w:val="Hyperlink"/>
+          </w:rPr>
+          <w:t>https://doi.org/10.1080/02699050110113688</w:t>
+        </w:r>
+      </w:hyperlink>
+      <w:r>
+        <w:t>.</w:t>
+      </w:r>
+    </w:p>
+    <w:p>
+      <w:r>
+        <w:t xml:space="preserve">Gibson Kimutai and Förster, A. (2024) ‘A User-Centred Interaction Design: A Holistic Approach’., pp. 468–475. doi: </w:t>
+      </w:r>
+      <w:hyperlink r:id="rId21" w:history="1">
+        <w:r>
+          <w:rPr>
+            <w:rStyle w:val="Hyperlink"/>
+          </w:rPr>
+          <w:t>https://doi.org/10.1109/ghtc62424.2024.10771531</w:t>
+        </w:r>
+      </w:hyperlink>
+      <w:r>
+        <w:t>.</w:t>
+      </w:r>
+    </w:p>
+    <w:p>
+      <w:r>
+        <w:t xml:space="preserve">GitHub (2024) </w:t>
+      </w:r>
+      <w:r>
+        <w:rPr>
+          <w:i/>
+          <w:iCs/>
+        </w:rPr>
         <w:t>About GitHub and Git</w:t>
       </w:r>
       <w:r>
         <w:t xml:space="preserve">. Available at: </w:t>
       </w:r>
-      <w:hyperlink r:id="rId20" w:history="1">
+      <w:hyperlink r:id="rId22" w:history="1">
         <w:r>
           <w:rPr>
             <w:rStyle w:val="Hyperlink"/>
@@ -11932,42 +11925,26 @@
           <w:i/>
           <w:iCs/>
         </w:rPr>
-        <w:t xml:space="preserve">User-Centred Systems </w:t>
-      </w:r>
-      <w:proofErr w:type="gramStart"/>
+        <w:t>User-Centred Systems Design</w:t>
+      </w:r>
       <w:r>
         <w:rPr>
           <w:i/>
           <w:iCs/>
         </w:rPr>
-        <w:t>Design</w:t>
+        <w:t xml:space="preserve"> </w:t>
       </w:r>
       <w:r>
         <w:rPr>
           <w:i/>
           <w:iCs/>
         </w:rPr>
-        <w:t xml:space="preserve"> </w:t>
-      </w:r>
-      <w:r>
-        <w:rPr>
-          <w:i/>
-          <w:iCs/>
-        </w:rPr>
-        <w:t>:</w:t>
-      </w:r>
-      <w:proofErr w:type="gramEnd"/>
-      <w:r>
-        <w:rPr>
-          <w:i/>
-          <w:iCs/>
-        </w:rPr>
-        <w:t xml:space="preserve"> Designing Usable Interactive Systems in Practice</w:t>
+        <w:t>: Designing Usable Interactive Systems in Practice</w:t>
       </w:r>
       <w:r>
         <w:t xml:space="preserve">. Available at: </w:t>
       </w:r>
-      <w:hyperlink r:id="rId21" w:history="1">
+      <w:hyperlink r:id="rId23" w:history="1">
         <w:r>
           <w:rPr>
             <w:rStyle w:val="Hyperlink"/>
@@ -11983,21 +11960,8 @@
       </w:r>
     </w:p>
     <w:p>
-      <w:proofErr w:type="spellStart"/>
-      <w:r>
-        <w:t>Looyestyn</w:t>
-      </w:r>
-      <w:proofErr w:type="spellEnd"/>
-      <w:r>
-        <w:t xml:space="preserve">, J., Kernot, J., Boshoff, K., Ryan, J., Edney, S. and Maher, C. (2017) ‘Does gamification increase engagement with online programs? A systematic review’. </w:t>
-      </w:r>
-      <w:proofErr w:type="spellStart"/>
-      <w:r>
-        <w:t>Amblard</w:t>
-      </w:r>
-      <w:proofErr w:type="spellEnd"/>
-      <w:r>
-        <w:t xml:space="preserve">, F. (ed.). </w:t>
+      <w:r>
+        <w:t xml:space="preserve">Looyestyn, J., Kernot, J., Boshoff, K., Ryan, J., Edney, S. and Maher, C. (2017) ‘Does gamification increase engagement with online programs? A systematic review’. Amblard, F. (ed.). </w:t>
       </w:r>
       <w:r>
         <w:rPr>
@@ -12009,7 +11973,7 @@
       <w:r>
         <w:t xml:space="preserve"> 12(3), p. e0173403. Available at: </w:t>
       </w:r>
-      <w:hyperlink r:id="rId22" w:history="1">
+      <w:hyperlink r:id="rId24" w:history="1">
         <w:r>
           <w:rPr>
             <w:rStyle w:val="Hyperlink"/>
@@ -12026,15 +11990,7 @@
     </w:p>
     <w:p>
       <w:r>
-        <w:t xml:space="preserve">Muñoz, E.G., </w:t>
-      </w:r>
-      <w:proofErr w:type="spellStart"/>
-      <w:r>
-        <w:t>Fabregat</w:t>
-      </w:r>
-      <w:proofErr w:type="spellEnd"/>
-      <w:r>
-        <w:t xml:space="preserve">, R., Bacca-Acosta, J., Duque-Méndez, N. and Avila-Garzon, C. (2022) ‘Augmented Reality, Virtual Reality, and Game Technologies in Ophthalmology Training’. </w:t>
+        <w:t xml:space="preserve">Muñoz, E.G., Fabregat, R., Bacca-Acosta, J., Duque-Méndez, N. and Avila-Garzon, C. (2022) ‘Augmented Reality, Virtual Reality, and Game Technologies in Ophthalmology Training’. </w:t>
       </w:r>
       <w:r>
         <w:rPr>
@@ -12044,17 +12000,9 @@
         <w:t>Information</w:t>
       </w:r>
       <w:r>
-        <w:t xml:space="preserve"> 13(5), p. 222. </w:t>
-      </w:r>
-      <w:proofErr w:type="spellStart"/>
-      <w:r>
-        <w:t>doi</w:t>
-      </w:r>
-      <w:proofErr w:type="spellEnd"/>
-      <w:r>
-        <w:t xml:space="preserve">: </w:t>
-      </w:r>
-      <w:hyperlink r:id="rId23" w:history="1">
+        <w:t xml:space="preserve"> 13(5), p. 222. doi: </w:t>
+      </w:r>
+      <w:hyperlink r:id="rId25" w:history="1">
         <w:r>
           <w:rPr>
             <w:rStyle w:val="Hyperlink"/>
@@ -12068,15 +12016,7 @@
     </w:p>
     <w:p>
       <w:r>
-        <w:t xml:space="preserve">Newman, M., </w:t>
-      </w:r>
-      <w:proofErr w:type="spellStart"/>
-      <w:r>
-        <w:t>Gatersleben</w:t>
-      </w:r>
-      <w:proofErr w:type="spellEnd"/>
-      <w:r>
-        <w:t xml:space="preserve">, B., Wyles, K.J. and Ratcliffe, E. (2022) ‘The use of virtual reality in environment experiences and the importance of realism’. </w:t>
+        <w:t xml:space="preserve">Newman, M., Gatersleben, B., Wyles, K.J. and Ratcliffe, E. (2022) ‘The use of virtual reality in environment experiences and the importance of realism’. </w:t>
       </w:r>
       <w:r>
         <w:rPr>
@@ -12088,7 +12028,7 @@
       <w:r>
         <w:t xml:space="preserve"> 79, p. 101733. Available at: </w:t>
       </w:r>
-      <w:hyperlink r:id="rId24" w:history="1">
+      <w:hyperlink r:id="rId26" w:history="1">
         <w:r>
           <w:rPr>
             <w:rStyle w:val="Hyperlink"/>
@@ -12105,17 +12045,10 @@
     </w:p>
     <w:p>
       <w:r>
-        <w:t xml:space="preserve">Orji, J., Hernandez, A., Selema, B. and Orji, R. (2022) ‘Virtual and augmented reality applications for promoting safety and security: A systematic review’., pp. 1–7. </w:t>
-      </w:r>
-      <w:proofErr w:type="spellStart"/>
-      <w:r>
-        <w:t>doi</w:t>
-      </w:r>
-      <w:proofErr w:type="spellEnd"/>
-      <w:r>
-        <w:t xml:space="preserve">: </w:t>
-      </w:r>
-      <w:hyperlink r:id="rId25" w:history="1">
+        <w:lastRenderedPageBreak/>
+        <w:t xml:space="preserve">Orji, J., Hernandez, A., Selema, B. and Orji, R. (2022) ‘Virtual and augmented reality applications for promoting safety and security: A systematic review’., pp. 1–7. doi: </w:t>
+      </w:r>
+      <w:hyperlink r:id="rId27" w:history="1">
         <w:r>
           <w:rPr>
             <w:rStyle w:val="Hyperlink"/>
@@ -12128,21 +12061,8 @@
       </w:r>
     </w:p>
     <w:p>
-      <w:proofErr w:type="spellStart"/>
-      <w:r>
-        <w:t>Porcar</w:t>
-      </w:r>
-      <w:proofErr w:type="spellEnd"/>
-      <w:r>
-        <w:t xml:space="preserve">, E., Pons, A. and Lorente, A. (2016) ‘Visual and ocular effects from the use of flat-panel </w:t>
-      </w:r>
-      <w:proofErr w:type="gramStart"/>
-      <w:r>
-        <w:t>displays’</w:t>
-      </w:r>
-      <w:proofErr w:type="gramEnd"/>
-      <w:r>
-        <w:t xml:space="preserve">. </w:t>
+      <w:r>
+        <w:t xml:space="preserve">Porcar, E., Pons, A. and Lorente, A. (2016) ‘Visual and ocular effects from the use of flat-panel displays’. </w:t>
       </w:r>
       <w:r>
         <w:rPr>
@@ -12154,7 +12074,7 @@
       <w:r>
         <w:t xml:space="preserve"> 9(6), pp. 881–5. Available at: </w:t>
       </w:r>
-      <w:hyperlink r:id="rId26" w:history="1">
+      <w:hyperlink r:id="rId28" w:history="1">
         <w:r>
           <w:rPr>
             <w:rStyle w:val="Hyperlink"/>
@@ -12170,16 +12090,9 @@
       </w:r>
     </w:p>
     <w:p>
-      <w:proofErr w:type="spellStart"/>
-      <w:r>
-        <w:lastRenderedPageBreak/>
-        <w:t>Quesenbery</w:t>
-      </w:r>
-      <w:proofErr w:type="spellEnd"/>
-      <w:r>
-        <w:t xml:space="preserve">, W. (2004) ‘(PDF) Balancing the 5Es: Usability’. </w:t>
-      </w:r>
-      <w:proofErr w:type="gramStart"/>
+      <w:r>
+        <w:t xml:space="preserve">Quesenbery, W. (2004) ‘(PDF) Balancing the 5Es: Usability’. </w:t>
+      </w:r>
       <w:r>
         <w:rPr>
           <w:i/>
@@ -12188,13 +12101,9 @@
         <w:t>ResearchGate</w:t>
       </w:r>
       <w:r>
-        <w:t xml:space="preserve"> .</w:t>
-      </w:r>
-      <w:proofErr w:type="gramEnd"/>
-      <w:r>
-        <w:t xml:space="preserve"> Available at: </w:t>
-      </w:r>
-      <w:hyperlink r:id="rId27" w:history="1">
+        <w:t xml:space="preserve"> . Available at: </w:t>
+      </w:r>
+      <w:hyperlink r:id="rId29" w:history="1">
         <w:r>
           <w:rPr>
             <w:rStyle w:val="Hyperlink"/>
@@ -12208,23 +12117,7 @@
     </w:p>
     <w:p>
       <w:r>
-        <w:t xml:space="preserve">Santilli, T., Ceccacci, S., Mengoni, M. and Catia </w:t>
-      </w:r>
-      <w:proofErr w:type="spellStart"/>
-      <w:r>
-        <w:t>Giaconi</w:t>
-      </w:r>
-      <w:proofErr w:type="spellEnd"/>
-      <w:r>
-        <w:t xml:space="preserve"> (2025) ‘Virtual vs. traditional learning in higher education: A systematic review of comparative </w:t>
-      </w:r>
-      <w:proofErr w:type="gramStart"/>
-      <w:r>
-        <w:t>studies’</w:t>
-      </w:r>
-      <w:proofErr w:type="gramEnd"/>
-      <w:r>
-        <w:t xml:space="preserve">. </w:t>
+        <w:t xml:space="preserve">Santilli, T., Ceccacci, S., Mengoni, M. and Catia Giaconi (2025) ‘Virtual vs. traditional learning in higher education: A systematic review of comparative studies’. </w:t>
       </w:r>
       <w:r>
         <w:rPr>
@@ -12236,7 +12129,7 @@
       <w:r>
         <w:t xml:space="preserve"> 227(0360-1315), p. 105214. Available at: </w:t>
       </w:r>
-      <w:hyperlink r:id="rId28" w:history="1">
+      <w:hyperlink r:id="rId30" w:history="1">
         <w:r>
           <w:rPr>
             <w:rStyle w:val="Hyperlink"/>
@@ -12257,32 +12150,12 @@
           <w:i/>
           <w:iCs/>
         </w:rPr>
-        <w:t xml:space="preserve">Communications in computer and information </w:t>
-      </w:r>
-      <w:proofErr w:type="gramStart"/>
-      <w:r>
-        <w:rPr>
-          <w:i/>
-          <w:iCs/>
-        </w:rPr>
-        <w:t>science</w:t>
-      </w:r>
-      <w:r>
-        <w:t xml:space="preserve"> ,</w:t>
-      </w:r>
-      <w:proofErr w:type="gramEnd"/>
-      <w:r>
-        <w:t xml:space="preserve"> pp. 111–115. </w:t>
-      </w:r>
-      <w:proofErr w:type="spellStart"/>
-      <w:r>
-        <w:t>doi</w:t>
-      </w:r>
-      <w:proofErr w:type="spellEnd"/>
-      <w:r>
-        <w:t xml:space="preserve">: </w:t>
-      </w:r>
-      <w:hyperlink r:id="rId29" w:history="1">
+        <w:t>Communications in computer and information science</w:t>
+      </w:r>
+      <w:r>
+        <w:t xml:space="preserve"> , pp. 111–115. doi: </w:t>
+      </w:r>
+      <w:hyperlink r:id="rId31" w:history="1">
         <w:r>
           <w:rPr>
             <w:rStyle w:val="Hyperlink"/>
@@ -12298,7 +12171,7 @@
       <w:r>
         <w:t xml:space="preserve">Sharma, M., Kumar, P. and Singh, D.K. (2024) ‘The Role of Virtual Reality in Education: A Comprehensive Review of Research and Application’. Available at: </w:t>
       </w:r>
-      <w:hyperlink r:id="rId30" w:anchor="authors" w:history="1">
+      <w:hyperlink r:id="rId32" w:anchor="authors" w:history="1">
         <w:r>
           <w:rPr>
             <w:rStyle w:val="Hyperlink"/>
@@ -12327,7 +12200,7 @@
       <w:r>
         <w:t xml:space="preserve"> 3(1), p. e000146. Available at: </w:t>
       </w:r>
-      <w:hyperlink r:id="rId31" w:history="1">
+      <w:hyperlink r:id="rId33" w:history="1">
         <w:r>
           <w:rPr>
             <w:rStyle w:val="Hyperlink"/>
@@ -12341,25 +12214,9 @@
     </w:p>
     <w:p>
       <w:r>
-        <w:t>Vieira, F., Oliveira, E. and Rodrigues, N. (2019) ‘</w:t>
-      </w:r>
-      <w:proofErr w:type="spellStart"/>
-      <w:r>
-        <w:t>iSVC</w:t>
-      </w:r>
-      <w:proofErr w:type="spellEnd"/>
-      <w:r>
-        <w:t xml:space="preserve"> – digital platform for detection and prevention of computer vision syndrome’., pp. 1–7. </w:t>
-      </w:r>
-      <w:proofErr w:type="spellStart"/>
-      <w:r>
-        <w:t>doi</w:t>
-      </w:r>
-      <w:proofErr w:type="spellEnd"/>
-      <w:r>
-        <w:t xml:space="preserve">: </w:t>
-      </w:r>
-      <w:hyperlink r:id="rId32" w:history="1">
+        <w:t xml:space="preserve">Vieira, F., Oliveira, E. and Rodrigues, N. (2019) ‘iSVC – digital platform for detection and prevention of computer vision syndrome’., pp. 1–7. doi: </w:t>
+      </w:r>
+      <w:hyperlink r:id="rId34" w:history="1">
         <w:r>
           <w:rPr>
             <w:rStyle w:val="Hyperlink"/>
@@ -12383,17 +12240,9 @@
         <w:t>Annals of Emerging Technologies in Computing</w:t>
       </w:r>
       <w:r>
-        <w:t xml:space="preserve"> 9(3), pp. 50–68. </w:t>
-      </w:r>
-      <w:proofErr w:type="spellStart"/>
-      <w:r>
-        <w:t>doi</w:t>
-      </w:r>
-      <w:proofErr w:type="spellEnd"/>
-      <w:r>
-        <w:t xml:space="preserve">: </w:t>
-      </w:r>
-      <w:hyperlink r:id="rId33" w:history="1">
+        <w:t xml:space="preserve"> 9(3), pp. 50–68. doi: </w:t>
+      </w:r>
+      <w:hyperlink r:id="rId35" w:history="1">
         <w:r>
           <w:rPr>
             <w:rStyle w:val="Hyperlink"/>
@@ -12407,15 +12256,7 @@
     </w:p>
     <w:p>
       <w:r>
-        <w:t>Youcef, B., Ahmad, M.N. and Mustapha, M. (2021) ‘</w:t>
-      </w:r>
-      <w:proofErr w:type="spellStart"/>
-      <w:r>
-        <w:t>OntoPhaco</w:t>
-      </w:r>
-      <w:proofErr w:type="spellEnd"/>
-      <w:r>
-        <w:t xml:space="preserve">: An ontology for virtual reality training in ophthalmology Domain—A case study of cataract surgery’. </w:t>
+        <w:t xml:space="preserve">Youcef, B., Ahmad, M.N. and Mustapha, M. (2021) ‘OntoPhaco: An ontology for virtual reality training in ophthalmology Domain—A case study of cataract surgery’. </w:t>
       </w:r>
       <w:r>
         <w:rPr>
@@ -12425,17 +12266,9 @@
         <w:t>IEEE Access</w:t>
       </w:r>
       <w:r>
-        <w:t xml:space="preserve"> 9, pp. 152347–152378. </w:t>
-      </w:r>
-      <w:proofErr w:type="spellStart"/>
-      <w:r>
-        <w:t>doi</w:t>
-      </w:r>
-      <w:proofErr w:type="spellEnd"/>
-      <w:r>
-        <w:t xml:space="preserve">: </w:t>
-      </w:r>
-      <w:hyperlink r:id="rId34" w:history="1">
+        <w:t xml:space="preserve"> 9, pp. 152347–152378. doi: </w:t>
+      </w:r>
+      <w:hyperlink r:id="rId36" w:history="1">
         <w:r>
           <w:rPr>
             <w:rStyle w:val="Hyperlink"/>
@@ -12452,8 +12285,9 @@
       <w:pPr>
         <w:pStyle w:val="Heading1"/>
       </w:pPr>
-      <w:bookmarkStart w:id="52" w:name="_Toc224063330"/>
-      <w:r>
+      <w:bookmarkStart w:id="52" w:name="_Toc224071367"/>
+      <w:r>
+        <w:lastRenderedPageBreak/>
         <w:t>Appendix</w:t>
       </w:r>
       <w:bookmarkEnd w:id="52"/>
@@ -12462,7 +12296,7 @@
       <w:pPr>
         <w:pStyle w:val="Heading2"/>
       </w:pPr>
-      <w:bookmarkStart w:id="53" w:name="_Toc224063331"/>
+      <w:bookmarkStart w:id="53" w:name="_Toc224071368"/>
       <w:r>
         <w:t>Asset Licenses and Sources</w:t>
       </w:r>
@@ -12472,7 +12306,7 @@
       <w:pPr>
         <w:pStyle w:val="Heading3"/>
       </w:pPr>
-      <w:bookmarkStart w:id="54" w:name="_Toc224063332"/>
+      <w:bookmarkStart w:id="54" w:name="_Toc224071369"/>
       <w:r>
         <w:t>Modern Office Table</w:t>
       </w:r>
@@ -12499,7 +12333,7 @@
                     <pic:cNvPicPr/>
                   </pic:nvPicPr>
                   <pic:blipFill>
-                    <a:blip r:embed="rId35"/>
+                    <a:blip r:embed="rId37"/>
                     <a:stretch>
                       <a:fillRect/>
                     </a:stretch>
@@ -12524,7 +12358,7 @@
       <w:r>
         <w:t xml:space="preserve">Source: </w:t>
       </w:r>
-      <w:hyperlink r:id="rId36" w:history="1">
+      <w:hyperlink r:id="rId38" w:history="1">
         <w:r>
           <w:rPr>
             <w:rStyle w:val="Hyperlink"/>
@@ -12538,10 +12372,9 @@
     </w:p>
     <w:p>
       <w:r>
-        <w:lastRenderedPageBreak/>
         <w:t xml:space="preserve">License: </w:t>
       </w:r>
-      <w:hyperlink r:id="rId37" w:history="1">
+      <w:hyperlink r:id="rId39" w:history="1">
         <w:r>
           <w:rPr>
             <w:rStyle w:val="Hyperlink"/>
@@ -12557,7 +12390,7 @@
       <w:pPr>
         <w:pStyle w:val="Heading3"/>
       </w:pPr>
-      <w:bookmarkStart w:id="55" w:name="_Toc224063333"/>
+      <w:bookmarkStart w:id="55" w:name="_Toc224071370"/>
       <w:r>
         <w:t>Free Studio Starter Pack</w:t>
       </w:r>
@@ -12584,7 +12417,7 @@
                     <pic:cNvPicPr/>
                   </pic:nvPicPr>
                   <pic:blipFill>
-                    <a:blip r:embed="rId38"/>
+                    <a:blip r:embed="rId40"/>
                     <a:stretch>
                       <a:fillRect/>
                     </a:stretch>
@@ -12609,7 +12442,7 @@
       <w:r>
         <w:t xml:space="preserve">Source: </w:t>
       </w:r>
-      <w:hyperlink r:id="rId39" w:history="1">
+      <w:hyperlink r:id="rId41" w:history="1">
         <w:r>
           <w:rPr>
             <w:rStyle w:val="Hyperlink"/>
@@ -12625,7 +12458,7 @@
       <w:r>
         <w:t xml:space="preserve">License: </w:t>
       </w:r>
-      <w:hyperlink r:id="rId40" w:history="1">
+      <w:hyperlink r:id="rId42" w:history="1">
         <w:r>
           <w:rPr>
             <w:rStyle w:val="Hyperlink"/>
@@ -12641,7 +12474,7 @@
       <w:pPr>
         <w:pStyle w:val="Heading3"/>
       </w:pPr>
-      <w:bookmarkStart w:id="56" w:name="_Toc224063334"/>
+      <w:bookmarkStart w:id="56" w:name="_Toc224071371"/>
       <w:r>
         <w:t>General Desktop Bundle</w:t>
       </w:r>
@@ -12668,7 +12501,7 @@
                     <pic:cNvPicPr/>
                   </pic:nvPicPr>
                   <pic:blipFill>
-                    <a:blip r:embed="rId41"/>
+                    <a:blip r:embed="rId43"/>
                     <a:stretch>
                       <a:fillRect/>
                     </a:stretch>
@@ -12693,7 +12526,7 @@
       <w:r>
         <w:t xml:space="preserve">Source: </w:t>
       </w:r>
-      <w:hyperlink r:id="rId42" w:history="1">
+      <w:hyperlink r:id="rId44" w:history="1">
         <w:r>
           <w:rPr>
             <w:rStyle w:val="Hyperlink"/>
@@ -12709,7 +12542,7 @@
       <w:r>
         <w:t xml:space="preserve">License: </w:t>
       </w:r>
-      <w:hyperlink r:id="rId43" w:history="1">
+      <w:hyperlink r:id="rId45" w:history="1">
         <w:r>
           <w:rPr>
             <w:rStyle w:val="Hyperlink"/>
@@ -12725,8 +12558,9 @@
       <w:pPr>
         <w:pStyle w:val="Heading3"/>
       </w:pPr>
-      <w:bookmarkStart w:id="57" w:name="_Toc224063335"/>
-      <w:r>
+      <w:bookmarkStart w:id="57" w:name="_Toc224071372"/>
+      <w:r>
+        <w:lastRenderedPageBreak/>
         <w:t>General Gaming Headset</w:t>
       </w:r>
       <w:bookmarkEnd w:id="57"/>
@@ -12752,7 +12586,7 @@
                     <pic:cNvPicPr/>
                   </pic:nvPicPr>
                   <pic:blipFill>
-                    <a:blip r:embed="rId44"/>
+                    <a:blip r:embed="rId46"/>
                     <a:stretch>
                       <a:fillRect/>
                     </a:stretch>
@@ -12777,7 +12611,7 @@
       <w:r>
         <w:t xml:space="preserve">Source: </w:t>
       </w:r>
-      <w:hyperlink r:id="rId45" w:history="1">
+      <w:hyperlink r:id="rId47" w:history="1">
         <w:r>
           <w:rPr>
             <w:rStyle w:val="Hyperlink"/>
@@ -12793,7 +12627,7 @@
       <w:r>
         <w:t xml:space="preserve">License: </w:t>
       </w:r>
-      <w:hyperlink r:id="rId46" w:history="1">
+      <w:hyperlink r:id="rId48" w:history="1">
         <w:r>
           <w:rPr>
             <w:rStyle w:val="Hyperlink"/>
@@ -12809,9 +12643,8 @@
       <w:pPr>
         <w:pStyle w:val="Heading3"/>
       </w:pPr>
-      <w:bookmarkStart w:id="58" w:name="_Toc224063336"/>
-      <w:r>
-        <w:lastRenderedPageBreak/>
+      <w:bookmarkStart w:id="58" w:name="_Toc224071373"/>
+      <w:r>
         <w:t>General Gaming Chair</w:t>
       </w:r>
       <w:bookmarkEnd w:id="58"/>
@@ -12837,7 +12670,7 @@
                     <pic:cNvPicPr/>
                   </pic:nvPicPr>
                   <pic:blipFill>
-                    <a:blip r:embed="rId47"/>
+                    <a:blip r:embed="rId49"/>
                     <a:stretch>
                       <a:fillRect/>
                     </a:stretch>
@@ -12862,7 +12695,7 @@
       <w:r>
         <w:t xml:space="preserve">Source: </w:t>
       </w:r>
-      <w:hyperlink r:id="rId48" w:history="1">
+      <w:hyperlink r:id="rId50" w:history="1">
         <w:r>
           <w:rPr>
             <w:rStyle w:val="Hyperlink"/>
@@ -12878,7 +12711,7 @@
       <w:r>
         <w:t xml:space="preserve">License: </w:t>
       </w:r>
-      <w:hyperlink r:id="rId49" w:history="1">
+      <w:hyperlink r:id="rId51" w:history="1">
         <w:r>
           <w:rPr>
             <w:rStyle w:val="Hyperlink"/>
@@ -12894,7 +12727,7 @@
       <w:pPr>
         <w:pStyle w:val="Heading3"/>
       </w:pPr>
-      <w:bookmarkStart w:id="59" w:name="_Toc224063337"/>
+      <w:bookmarkStart w:id="59" w:name="_Toc224071374"/>
       <w:r>
         <w:t>Light Switch</w:t>
       </w:r>
@@ -12921,7 +12754,7 @@
                     <pic:cNvPicPr/>
                   </pic:nvPicPr>
                   <pic:blipFill rotWithShape="1">
-                    <a:blip r:embed="rId50"/>
+                    <a:blip r:embed="rId52"/>
                     <a:srcRect t="23971" b="7788"/>
                     <a:stretch>
                       <a:fillRect/>
@@ -12958,7 +12791,7 @@
       <w:r>
         <w:t xml:space="preserve"> </w:t>
       </w:r>
-      <w:hyperlink r:id="rId51" w:history="1">
+      <w:hyperlink r:id="rId53" w:history="1">
         <w:r>
           <w:rPr>
             <w:rStyle w:val="Hyperlink"/>
@@ -12974,7 +12807,7 @@
       <w:r>
         <w:t xml:space="preserve">License: </w:t>
       </w:r>
-      <w:hyperlink r:id="rId52" w:history="1">
+      <w:hyperlink r:id="rId54" w:history="1">
         <w:r>
           <w:rPr>
             <w:rStyle w:val="Hyperlink"/>
@@ -12992,8 +12825,9 @@
       <w:pPr>
         <w:pStyle w:val="Heading3"/>
       </w:pPr>
-      <w:bookmarkStart w:id="60" w:name="_Toc224063338"/>
-      <w:r>
+      <w:bookmarkStart w:id="60" w:name="_Toc224071375"/>
+      <w:r>
+        <w:lastRenderedPageBreak/>
         <w:t>Materials for General PC setup</w:t>
       </w:r>
       <w:r>
@@ -13005,7 +12839,7 @@
       <w:r>
         <w:t xml:space="preserve">Source: </w:t>
       </w:r>
-      <w:hyperlink r:id="rId53" w:history="1">
+      <w:hyperlink r:id="rId55" w:history="1">
         <w:r>
           <w:rPr>
             <w:rStyle w:val="Hyperlink"/>
@@ -13021,7 +12855,7 @@
       <w:r>
         <w:t xml:space="preserve">License: </w:t>
       </w:r>
-      <w:hyperlink r:id="rId54" w:history="1">
+      <w:hyperlink r:id="rId56" w:history="1">
         <w:r>
           <w:rPr>
             <w:rStyle w:val="Hyperlink"/>
@@ -13054,7 +12888,7 @@
                     <pic:cNvPicPr/>
                   </pic:nvPicPr>
                   <pic:blipFill>
-                    <a:blip r:embed="rId55"/>
+                    <a:blip r:embed="rId57"/>
                     <a:stretch>
                       <a:fillRect/>
                     </a:stretch>
@@ -13080,7 +12914,6 @@
         <w:rPr>
           <w:noProof/>
         </w:rPr>
-        <w:lastRenderedPageBreak/>
         <w:drawing>
           <wp:inline distT="0" distB="0" distL="0" distR="0" wp14:anchorId="3BB7987B" wp14:editId="0D618C24">
             <wp:extent cx="4152900" cy="5861733"/>
@@ -13097,7 +12930,7 @@
                     <pic:cNvPicPr/>
                   </pic:nvPicPr>
                   <pic:blipFill>
-                    <a:blip r:embed="rId56"/>
+                    <a:blip r:embed="rId58"/>
                     <a:stretch>
                       <a:fillRect/>
                     </a:stretch>
@@ -13122,8 +12955,9 @@
       <w:pPr>
         <w:pStyle w:val="Heading3"/>
       </w:pPr>
-      <w:bookmarkStart w:id="61" w:name="_Toc224063339"/>
-      <w:r>
+      <w:bookmarkStart w:id="61" w:name="_Toc224071376"/>
+      <w:r>
+        <w:lastRenderedPageBreak/>
         <w:t>Monitor background image</w:t>
       </w:r>
       <w:bookmarkEnd w:id="61"/>
@@ -13138,7 +12972,6 @@
         <w:rPr>
           <w:noProof/>
         </w:rPr>
-        <w:lastRenderedPageBreak/>
         <w:drawing>
           <wp:inline distT="0" distB="0" distL="0" distR="0" wp14:anchorId="7249F24E" wp14:editId="19E18124">
             <wp:extent cx="5400675" cy="4993799"/>
@@ -13155,7 +12988,7 @@
                     <pic:cNvPicPr/>
                   </pic:nvPicPr>
                   <pic:blipFill>
-                    <a:blip r:embed="rId57"/>
+                    <a:blip r:embed="rId59"/>
                     <a:stretch>
                       <a:fillRect/>
                     </a:stretch>
@@ -13180,7 +13013,7 @@
       <w:r>
         <w:t xml:space="preserve">Source: </w:t>
       </w:r>
-      <w:hyperlink r:id="rId58" w:history="1">
+      <w:hyperlink r:id="rId60" w:history="1">
         <w:r>
           <w:rPr>
             <w:rStyle w:val="Hyperlink"/>
@@ -13196,7 +13029,7 @@
       <w:r>
         <w:t xml:space="preserve">License: </w:t>
       </w:r>
-      <w:hyperlink r:id="rId59" w:history="1">
+      <w:hyperlink r:id="rId61" w:history="1">
         <w:r>
           <w:rPr>
             <w:rStyle w:val="Hyperlink"/>
@@ -13218,24 +13051,12 @@
       <w:pPr>
         <w:pStyle w:val="Heading3"/>
       </w:pPr>
-      <w:bookmarkStart w:id="62" w:name="_Toc224063340"/>
-      <w:r>
-        <w:t xml:space="preserve">Button Hover </w:t>
-      </w:r>
-      <w:proofErr w:type="spellStart"/>
-      <w:r>
-        <w:t>Sfx</w:t>
-      </w:r>
-      <w:proofErr w:type="spellEnd"/>
-      <w:r>
-        <w:t xml:space="preserve"> by </w:t>
-      </w:r>
-      <w:proofErr w:type="spellStart"/>
-      <w:r>
-        <w:t>Fachii</w:t>
+      <w:bookmarkStart w:id="62" w:name="_Toc224071377"/>
+      <w:r>
+        <w:lastRenderedPageBreak/>
+        <w:t>Button Hover Sfx by Fachii</w:t>
       </w:r>
       <w:bookmarkEnd w:id="62"/>
-      <w:proofErr w:type="spellEnd"/>
     </w:p>
     <w:p>
       <w:r>
@@ -13247,7 +13068,7 @@
             <wp:extent cx="5731510" cy="2659380"/>
             <wp:effectExtent l="0" t="0" r="2540" b="7620"/>
             <wp:docPr id="1819945004" name="Picture 2" descr="Image">
-              <a:hlinkClick xmlns:a="http://schemas.openxmlformats.org/drawingml/2006/main" r:id="rId60" tgtFrame="&quot;_blank&quot;"/>
+              <a:hlinkClick xmlns:a="http://schemas.openxmlformats.org/drawingml/2006/main" r:id="rId62" tgtFrame="&quot;_blank&quot;"/>
             </wp:docPr>
             <wp:cNvGraphicFramePr>
               <a:graphicFrameLocks xmlns:a="http://schemas.openxmlformats.org/drawingml/2006/main" noChangeAspect="1"/>
@@ -13257,14 +13078,14 @@
                 <pic:pic xmlns:pic="http://schemas.openxmlformats.org/drawingml/2006/picture">
                   <pic:nvPicPr>
                     <pic:cNvPr id="0" name="Picture 6" descr="Image">
-                      <a:hlinkClick r:id="rId60" tgtFrame="&quot;_blank&quot;"/>
+                      <a:hlinkClick r:id="rId62" tgtFrame="&quot;_blank&quot;"/>
                     </pic:cNvPr>
                     <pic:cNvPicPr>
                       <a:picLocks noChangeAspect="1" noChangeArrowheads="1"/>
                     </pic:cNvPicPr>
                   </pic:nvPicPr>
                   <pic:blipFill>
-                    <a:blip r:embed="rId61">
+                    <a:blip r:embed="rId63">
                       <a:extLst>
                         <a:ext uri="{28A0092B-C50C-407E-A947-70E740481C1C}">
                           <a14:useLocalDpi xmlns:a14="http://schemas.microsoft.com/office/drawing/2010/main" val="0"/>
@@ -13298,13 +13119,12 @@
     </w:p>
     <w:p>
       <w:r>
-        <w:lastRenderedPageBreak/>
         <w:t>Source:</w:t>
       </w:r>
       <w:r>
         <w:t> </w:t>
       </w:r>
-      <w:hyperlink r:id="rId62" w:history="1">
+      <w:hyperlink r:id="rId64" w:history="1">
         <w:r>
           <w:rPr>
             <w:rStyle w:val="Hyperlink"/>
@@ -13320,7 +13140,7 @@
       <w:r>
         <w:t xml:space="preserve"> </w:t>
       </w:r>
-      <w:hyperlink r:id="rId63" w:history="1">
+      <w:hyperlink r:id="rId65" w:history="1">
         <w:r>
           <w:rPr>
             <w:rStyle w:val="Hyperlink"/>
@@ -13331,36 +13151,14 @@
     </w:p>
     <w:p/>
     <w:p>
-      <w:bookmarkStart w:id="63" w:name="_Toc224063341"/>
+      <w:bookmarkStart w:id="63" w:name="_Toc224071378"/>
       <w:r>
         <w:rPr>
           <w:rStyle w:val="Heading3Char"/>
         </w:rPr>
-        <w:t xml:space="preserve">Button click </w:t>
-      </w:r>
-      <w:proofErr w:type="spellStart"/>
-      <w:r>
-        <w:rPr>
-          <w:rStyle w:val="Heading3Char"/>
-        </w:rPr>
-        <w:t>Sfx</w:t>
-      </w:r>
-      <w:proofErr w:type="spellEnd"/>
-      <w:r>
-        <w:rPr>
-          <w:rStyle w:val="Heading3Char"/>
-        </w:rPr>
-        <w:t xml:space="preserve"> by </w:t>
-      </w:r>
-      <w:proofErr w:type="spellStart"/>
-      <w:r>
-        <w:rPr>
-          <w:rStyle w:val="Heading3Char"/>
-        </w:rPr>
-        <w:t>AndrewEathan</w:t>
+        <w:t>Button click Sfx by AndrewEathan</w:t>
       </w:r>
       <w:bookmarkEnd w:id="63"/>
-      <w:proofErr w:type="spellEnd"/>
       <w:r>
         <w:t xml:space="preserve"> </w:t>
       </w:r>
@@ -13373,7 +13171,7 @@
             <wp:extent cx="5731510" cy="2298065"/>
             <wp:effectExtent l="0" t="0" r="2540" b="6985"/>
             <wp:docPr id="1391107064" name="Picture 4" descr="Image">
-              <a:hlinkClick xmlns:a="http://schemas.openxmlformats.org/drawingml/2006/main" r:id="rId64" tgtFrame="&quot;_blank&quot;"/>
+              <a:hlinkClick xmlns:a="http://schemas.openxmlformats.org/drawingml/2006/main" r:id="rId66" tgtFrame="&quot;_blank&quot;"/>
             </wp:docPr>
             <wp:cNvGraphicFramePr>
               <a:graphicFrameLocks xmlns:a="http://schemas.openxmlformats.org/drawingml/2006/main" noChangeAspect="1"/>
@@ -13383,14 +13181,14 @@
                 <pic:pic xmlns:pic="http://schemas.openxmlformats.org/drawingml/2006/picture">
                   <pic:nvPicPr>
                     <pic:cNvPr id="0" name="Picture 13" descr="Image">
-                      <a:hlinkClick r:id="rId64" tgtFrame="&quot;_blank&quot;"/>
+                      <a:hlinkClick r:id="rId66" tgtFrame="&quot;_blank&quot;"/>
                     </pic:cNvPr>
                     <pic:cNvPicPr>
                       <a:picLocks noChangeAspect="1" noChangeArrowheads="1"/>
                     </pic:cNvPicPr>
                   </pic:nvPicPr>
                   <pic:blipFill>
-                    <a:blip r:embed="rId65">
+                    <a:blip r:embed="rId67">
                       <a:extLst>
                         <a:ext uri="{28A0092B-C50C-407E-A947-70E740481C1C}">
                           <a14:useLocalDpi xmlns:a14="http://schemas.microsoft.com/office/drawing/2010/main" val="0"/>
@@ -13427,7 +13225,7 @@
       <w:r>
         <w:t> </w:t>
       </w:r>
-      <w:hyperlink r:id="rId66" w:history="1">
+      <w:hyperlink r:id="rId68" w:history="1">
         <w:r>
           <w:rPr>
             <w:rStyle w:val="Hyperlink"/>
@@ -13438,68 +13236,6 @@
     </w:p>
     <w:p>
       <w:r>
-        <w:t>License: </w:t>
-      </w:r>
-      <w:hyperlink r:id="rId67" w:history="1">
-        <w:r>
-          <w:rPr>
-            <w:rStyle w:val="Hyperlink"/>
-          </w:rPr>
-          <w:t>http://creativecommons.org/publicdomain/zero/1.0/</w:t>
-        </w:r>
-      </w:hyperlink>
-    </w:p>
-    <w:p>
-      <w:pPr>
-        <w:rPr>
-          <w:rFonts w:eastAsiaTheme="majorEastAsia" w:cstheme="majorBidi"/>
-          <w:color w:val="0F4761" w:themeColor="accent1" w:themeShade="BF"/>
-          <w:sz w:val="28"/>
-          <w:szCs w:val="28"/>
-        </w:rPr>
-      </w:pPr>
-      <w:r>
-        <w:br w:type="page"/>
-      </w:r>
-    </w:p>
-    <w:p>
-      <w:pPr>
-        <w:pStyle w:val="Heading3"/>
-      </w:pPr>
-      <w:bookmarkStart w:id="64" w:name="_Toc224063342"/>
-      <w:r>
-        <w:lastRenderedPageBreak/>
-        <w:t xml:space="preserve">Light Switch </w:t>
-      </w:r>
-      <w:proofErr w:type="gramStart"/>
-      <w:r>
-        <w:t>On</w:t>
-      </w:r>
-      <w:proofErr w:type="gramEnd"/>
-      <w:r>
-        <w:t xml:space="preserve"> </w:t>
-      </w:r>
-      <w:proofErr w:type="spellStart"/>
-      <w:r>
-        <w:t>Sfx</w:t>
-      </w:r>
-      <w:bookmarkEnd w:id="64"/>
-      <w:proofErr w:type="spellEnd"/>
-    </w:p>
-    <w:p>
-      <w:r>
-        <w:t>Source: </w:t>
-      </w:r>
-      <w:hyperlink r:id="rId68" w:history="1">
-        <w:r>
-          <w:rPr>
-            <w:rStyle w:val="Hyperlink"/>
-          </w:rPr>
-          <w:t>https://freesound.org/people/tbrook/sounds/348224/</w:t>
-        </w:r>
-      </w:hyperlink>
-      <w:r>
-        <w:br/>
         <w:t>License: </w:t>
       </w:r>
       <w:hyperlink r:id="rId69" w:history="1">
@@ -13512,6 +13248,55 @@
       </w:hyperlink>
     </w:p>
     <w:p>
+      <w:pPr>
+        <w:rPr>
+          <w:rFonts w:eastAsiaTheme="majorEastAsia" w:cstheme="majorBidi"/>
+          <w:color w:val="0F4761" w:themeColor="accent1" w:themeShade="BF"/>
+          <w:sz w:val="28"/>
+          <w:szCs w:val="28"/>
+        </w:rPr>
+      </w:pPr>
+      <w:r>
+        <w:br w:type="page"/>
+      </w:r>
+    </w:p>
+    <w:p>
+      <w:pPr>
+        <w:pStyle w:val="Heading3"/>
+      </w:pPr>
+      <w:bookmarkStart w:id="64" w:name="_Toc224071379"/>
+      <w:r>
+        <w:lastRenderedPageBreak/>
+        <w:t>Light Switch On Sfx</w:t>
+      </w:r>
+      <w:bookmarkEnd w:id="64"/>
+    </w:p>
+    <w:p>
+      <w:r>
+        <w:t>Source: </w:t>
+      </w:r>
+      <w:hyperlink r:id="rId70" w:history="1">
+        <w:r>
+          <w:rPr>
+            <w:rStyle w:val="Hyperlink"/>
+          </w:rPr>
+          <w:t>https://freesound.org/people/tbrook/sounds/348224/</w:t>
+        </w:r>
+      </w:hyperlink>
+      <w:r>
+        <w:br/>
+        <w:t>License: </w:t>
+      </w:r>
+      <w:hyperlink r:id="rId71" w:history="1">
+        <w:r>
+          <w:rPr>
+            <w:rStyle w:val="Hyperlink"/>
+          </w:rPr>
+          <w:t>http://creativecommons.org/publicdomain/zero/1.0/</w:t>
+        </w:r>
+      </w:hyperlink>
+    </w:p>
+    <w:p>
       <w:r>
         <w:rPr>
           <w:noProof/>
@@ -13521,7 +13306,7 @@
             <wp:extent cx="5731510" cy="2829560"/>
             <wp:effectExtent l="0" t="0" r="2540" b="8890"/>
             <wp:docPr id="300778054" name="Picture 2" descr="Image">
-              <a:hlinkClick xmlns:a="http://schemas.openxmlformats.org/drawingml/2006/main" r:id="rId70" tgtFrame="&quot;_blank&quot;"/>
+              <a:hlinkClick xmlns:a="http://schemas.openxmlformats.org/drawingml/2006/main" r:id="rId72" tgtFrame="&quot;_blank&quot;"/>
             </wp:docPr>
             <wp:cNvGraphicFramePr>
               <a:graphicFrameLocks xmlns:a="http://schemas.openxmlformats.org/drawingml/2006/main" noChangeAspect="1"/>
@@ -13531,14 +13316,14 @@
                 <pic:pic xmlns:pic="http://schemas.openxmlformats.org/drawingml/2006/picture">
                   <pic:nvPicPr>
                     <pic:cNvPr id="0" name="Picture 6" descr="Image">
-                      <a:hlinkClick r:id="rId70" tgtFrame="&quot;_blank&quot;"/>
+                      <a:hlinkClick r:id="rId72" tgtFrame="&quot;_blank&quot;"/>
                     </pic:cNvPr>
                     <pic:cNvPicPr>
                       <a:picLocks noChangeAspect="1" noChangeArrowheads="1"/>
                     </pic:cNvPicPr>
                   </pic:nvPicPr>
                   <pic:blipFill>
-                    <a:blip r:embed="rId71">
+                    <a:blip r:embed="rId73">
                       <a:extLst>
                         <a:ext uri="{28A0092B-C50C-407E-A947-70E740481C1C}">
                           <a14:useLocalDpi xmlns:a14="http://schemas.microsoft.com/office/drawing/2010/main" val="0"/>
@@ -13574,22 +13359,17 @@
       <w:pPr>
         <w:pStyle w:val="Heading3"/>
       </w:pPr>
-      <w:bookmarkStart w:id="65" w:name="_Toc224063343"/>
-      <w:r>
-        <w:t xml:space="preserve">Light Switch Off </w:t>
-      </w:r>
-      <w:proofErr w:type="spellStart"/>
-      <w:r>
-        <w:t>Sfx</w:t>
+      <w:bookmarkStart w:id="65" w:name="_Toc224071380"/>
+      <w:r>
+        <w:t>Light Switch Off Sfx</w:t>
       </w:r>
       <w:bookmarkEnd w:id="65"/>
-      <w:proofErr w:type="spellEnd"/>
     </w:p>
     <w:p>
       <w:r>
         <w:t>Source: </w:t>
       </w:r>
-      <w:hyperlink r:id="rId72" w:history="1">
+      <w:hyperlink r:id="rId74" w:history="1">
         <w:r>
           <w:rPr>
             <w:rStyle w:val="Hyperlink"/>
@@ -13601,7 +13381,7 @@
         <w:br/>
         <w:t>License: </w:t>
       </w:r>
-      <w:hyperlink r:id="rId73" w:history="1">
+      <w:hyperlink r:id="rId75" w:history="1">
         <w:r>
           <w:rPr>
             <w:rStyle w:val="Hyperlink"/>
@@ -13620,7 +13400,7 @@
             <wp:extent cx="5731510" cy="2783840"/>
             <wp:effectExtent l="0" t="0" r="2540" b="0"/>
             <wp:docPr id="1261778138" name="Picture 4" descr="Image">
-              <a:hlinkClick xmlns:a="http://schemas.openxmlformats.org/drawingml/2006/main" r:id="rId74" tgtFrame="&quot;_blank&quot;"/>
+              <a:hlinkClick xmlns:a="http://schemas.openxmlformats.org/drawingml/2006/main" r:id="rId76" tgtFrame="&quot;_blank&quot;"/>
             </wp:docPr>
             <wp:cNvGraphicFramePr>
               <a:graphicFrameLocks xmlns:a="http://schemas.openxmlformats.org/drawingml/2006/main" noChangeAspect="1"/>
@@ -13630,14 +13410,14 @@
                 <pic:pic xmlns:pic="http://schemas.openxmlformats.org/drawingml/2006/picture">
                   <pic:nvPicPr>
                     <pic:cNvPr id="0" name="Picture 13" descr="Image">
-                      <a:hlinkClick r:id="rId74" tgtFrame="&quot;_blank&quot;"/>
+                      <a:hlinkClick r:id="rId76" tgtFrame="&quot;_blank&quot;"/>
                     </pic:cNvPr>
                     <pic:cNvPicPr>
                       <a:picLocks noChangeAspect="1" noChangeArrowheads="1"/>
                     </pic:cNvPicPr>
                   </pic:nvPicPr>
                   <pic:blipFill>
-                    <a:blip r:embed="rId75">
+                    <a:blip r:embed="rId77">
                       <a:extLst>
                         <a:ext uri="{28A0092B-C50C-407E-A947-70E740481C1C}">
                           <a14:useLocalDpi xmlns:a14="http://schemas.microsoft.com/office/drawing/2010/main" val="0"/>
@@ -15649,7 +15429,6 @@
   <w:style w:type="character" w:default="1" w:styleId="DefaultParagraphFont">
     <w:name w:val="Default Paragraph Font"/>
     <w:uiPriority w:val="1"/>
-    <w:semiHidden/>
     <w:unhideWhenUsed/>
   </w:style>
   <w:style w:type="table" w:default="1" w:styleId="TableNormal">

</xml_diff>

<commit_message>
Mapped out conclusion and critical evaluation areas
</commit_message>
<xml_diff>
--- a/30077548Thesis.docx
+++ b/30077548Thesis.docx
@@ -236,7 +236,7 @@
           <w:r>
             <w:fldChar w:fldCharType="separate"/>
           </w:r>
-          <w:hyperlink w:anchor="_Toc224071315" w:history="1">
+          <w:hyperlink w:anchor="_Toc224073612" w:history="1">
             <w:r>
               <w:rPr>
                 <w:rStyle w:val="Hyperlink"/>
@@ -263,7 +263,7 @@
                 <w:noProof/>
                 <w:webHidden/>
               </w:rPr>
-              <w:instrText xml:space="preserve"> PAGEREF _Toc224071315 \h </w:instrText>
+              <w:instrText xml:space="preserve"> PAGEREF _Toc224073612 \h </w:instrText>
             </w:r>
             <w:r>
               <w:rPr>
@@ -308,7 +308,7 @@
               <w:lang w:eastAsia="en-GB"/>
             </w:rPr>
           </w:pPr>
-          <w:hyperlink w:anchor="_Toc224071316" w:history="1">
+          <w:hyperlink w:anchor="_Toc224073613" w:history="1">
             <w:r>
               <w:rPr>
                 <w:rStyle w:val="Hyperlink"/>
@@ -335,7 +335,7 @@
                 <w:noProof/>
                 <w:webHidden/>
               </w:rPr>
-              <w:instrText xml:space="preserve"> PAGEREF _Toc224071316 \h </w:instrText>
+              <w:instrText xml:space="preserve"> PAGEREF _Toc224073613 \h </w:instrText>
             </w:r>
             <w:r>
               <w:rPr>
@@ -380,7 +380,7 @@
               <w:lang w:eastAsia="en-GB"/>
             </w:rPr>
           </w:pPr>
-          <w:hyperlink w:anchor="_Toc224071317" w:history="1">
+          <w:hyperlink w:anchor="_Toc224073614" w:history="1">
             <w:r>
               <w:rPr>
                 <w:rStyle w:val="Hyperlink"/>
@@ -407,7 +407,7 @@
                 <w:noProof/>
                 <w:webHidden/>
               </w:rPr>
-              <w:instrText xml:space="preserve"> PAGEREF _Toc224071317 \h </w:instrText>
+              <w:instrText xml:space="preserve"> PAGEREF _Toc224073614 \h </w:instrText>
             </w:r>
             <w:r>
               <w:rPr>
@@ -452,7 +452,7 @@
               <w:lang w:eastAsia="en-GB"/>
             </w:rPr>
           </w:pPr>
-          <w:hyperlink w:anchor="_Toc224071318" w:history="1">
+          <w:hyperlink w:anchor="_Toc224073615" w:history="1">
             <w:r>
               <w:rPr>
                 <w:rStyle w:val="Hyperlink"/>
@@ -479,7 +479,7 @@
                 <w:noProof/>
                 <w:webHidden/>
               </w:rPr>
-              <w:instrText xml:space="preserve"> PAGEREF _Toc224071318 \h </w:instrText>
+              <w:instrText xml:space="preserve"> PAGEREF _Toc224073615 \h </w:instrText>
             </w:r>
             <w:r>
               <w:rPr>
@@ -524,7 +524,7 @@
               <w:lang w:eastAsia="en-GB"/>
             </w:rPr>
           </w:pPr>
-          <w:hyperlink w:anchor="_Toc224071319" w:history="1">
+          <w:hyperlink w:anchor="_Toc224073616" w:history="1">
             <w:r>
               <w:rPr>
                 <w:rStyle w:val="Hyperlink"/>
@@ -551,7 +551,7 @@
                 <w:noProof/>
                 <w:webHidden/>
               </w:rPr>
-              <w:instrText xml:space="preserve"> PAGEREF _Toc224071319 \h </w:instrText>
+              <w:instrText xml:space="preserve"> PAGEREF _Toc224073616 \h </w:instrText>
             </w:r>
             <w:r>
               <w:rPr>
@@ -596,7 +596,7 @@
               <w:lang w:eastAsia="en-GB"/>
             </w:rPr>
           </w:pPr>
-          <w:hyperlink w:anchor="_Toc224071320" w:history="1">
+          <w:hyperlink w:anchor="_Toc224073617" w:history="1">
             <w:r>
               <w:rPr>
                 <w:rStyle w:val="Hyperlink"/>
@@ -623,7 +623,7 @@
                 <w:noProof/>
                 <w:webHidden/>
               </w:rPr>
-              <w:instrText xml:space="preserve"> PAGEREF _Toc224071320 \h </w:instrText>
+              <w:instrText xml:space="preserve"> PAGEREF _Toc224073617 \h </w:instrText>
             </w:r>
             <w:r>
               <w:rPr>
@@ -668,7 +668,7 @@
               <w:lang w:eastAsia="en-GB"/>
             </w:rPr>
           </w:pPr>
-          <w:hyperlink w:anchor="_Toc224071321" w:history="1">
+          <w:hyperlink w:anchor="_Toc224073618" w:history="1">
             <w:r>
               <w:rPr>
                 <w:rStyle w:val="Hyperlink"/>
@@ -695,7 +695,7 @@
                 <w:noProof/>
                 <w:webHidden/>
               </w:rPr>
-              <w:instrText xml:space="preserve"> PAGEREF _Toc224071321 \h </w:instrText>
+              <w:instrText xml:space="preserve"> PAGEREF _Toc224073618 \h </w:instrText>
             </w:r>
             <w:r>
               <w:rPr>
@@ -740,7 +740,7 @@
               <w:lang w:eastAsia="en-GB"/>
             </w:rPr>
           </w:pPr>
-          <w:hyperlink w:anchor="_Toc224071322" w:history="1">
+          <w:hyperlink w:anchor="_Toc224073619" w:history="1">
             <w:r>
               <w:rPr>
                 <w:rStyle w:val="Hyperlink"/>
@@ -767,7 +767,7 @@
                 <w:noProof/>
                 <w:webHidden/>
               </w:rPr>
-              <w:instrText xml:space="preserve"> PAGEREF _Toc224071322 \h </w:instrText>
+              <w:instrText xml:space="preserve"> PAGEREF _Toc224073619 \h </w:instrText>
             </w:r>
             <w:r>
               <w:rPr>
@@ -812,7 +812,7 @@
               <w:lang w:eastAsia="en-GB"/>
             </w:rPr>
           </w:pPr>
-          <w:hyperlink w:anchor="_Toc224071323" w:history="1">
+          <w:hyperlink w:anchor="_Toc224073620" w:history="1">
             <w:r>
               <w:rPr>
                 <w:rStyle w:val="Hyperlink"/>
@@ -839,7 +839,7 @@
                 <w:noProof/>
                 <w:webHidden/>
               </w:rPr>
-              <w:instrText xml:space="preserve"> PAGEREF _Toc224071323 \h </w:instrText>
+              <w:instrText xml:space="preserve"> PAGEREF _Toc224073620 \h </w:instrText>
             </w:r>
             <w:r>
               <w:rPr>
@@ -884,7 +884,7 @@
               <w:lang w:eastAsia="en-GB"/>
             </w:rPr>
           </w:pPr>
-          <w:hyperlink w:anchor="_Toc224071324" w:history="1">
+          <w:hyperlink w:anchor="_Toc224073621" w:history="1">
             <w:r>
               <w:rPr>
                 <w:rStyle w:val="Hyperlink"/>
@@ -911,7 +911,7 @@
                 <w:noProof/>
                 <w:webHidden/>
               </w:rPr>
-              <w:instrText xml:space="preserve"> PAGEREF _Toc224071324 \h </w:instrText>
+              <w:instrText xml:space="preserve"> PAGEREF _Toc224073621 \h </w:instrText>
             </w:r>
             <w:r>
               <w:rPr>
@@ -956,7 +956,7 @@
               <w:lang w:eastAsia="en-GB"/>
             </w:rPr>
           </w:pPr>
-          <w:hyperlink w:anchor="_Toc224071325" w:history="1">
+          <w:hyperlink w:anchor="_Toc224073622" w:history="1">
             <w:r>
               <w:rPr>
                 <w:rStyle w:val="Hyperlink"/>
@@ -983,7 +983,7 @@
                 <w:noProof/>
                 <w:webHidden/>
               </w:rPr>
-              <w:instrText xml:space="preserve"> PAGEREF _Toc224071325 \h </w:instrText>
+              <w:instrText xml:space="preserve"> PAGEREF _Toc224073622 \h </w:instrText>
             </w:r>
             <w:r>
               <w:rPr>
@@ -1028,7 +1028,7 @@
               <w:lang w:eastAsia="en-GB"/>
             </w:rPr>
           </w:pPr>
-          <w:hyperlink w:anchor="_Toc224071326" w:history="1">
+          <w:hyperlink w:anchor="_Toc224073623" w:history="1">
             <w:r>
               <w:rPr>
                 <w:rStyle w:val="Hyperlink"/>
@@ -1055,7 +1055,7 @@
                 <w:noProof/>
                 <w:webHidden/>
               </w:rPr>
-              <w:instrText xml:space="preserve"> PAGEREF _Toc224071326 \h </w:instrText>
+              <w:instrText xml:space="preserve"> PAGEREF _Toc224073623 \h </w:instrText>
             </w:r>
             <w:r>
               <w:rPr>
@@ -1100,7 +1100,7 @@
               <w:lang w:eastAsia="en-GB"/>
             </w:rPr>
           </w:pPr>
-          <w:hyperlink w:anchor="_Toc224071327" w:history="1">
+          <w:hyperlink w:anchor="_Toc224073624" w:history="1">
             <w:r>
               <w:rPr>
                 <w:rStyle w:val="Hyperlink"/>
@@ -1127,7 +1127,7 @@
                 <w:noProof/>
                 <w:webHidden/>
               </w:rPr>
-              <w:instrText xml:space="preserve"> PAGEREF _Toc224071327 \h </w:instrText>
+              <w:instrText xml:space="preserve"> PAGEREF _Toc224073624 \h </w:instrText>
             </w:r>
             <w:r>
               <w:rPr>
@@ -1172,7 +1172,7 @@
               <w:lang w:eastAsia="en-GB"/>
             </w:rPr>
           </w:pPr>
-          <w:hyperlink w:anchor="_Toc224071328" w:history="1">
+          <w:hyperlink w:anchor="_Toc224073625" w:history="1">
             <w:r>
               <w:rPr>
                 <w:rStyle w:val="Hyperlink"/>
@@ -1199,7 +1199,7 @@
                 <w:noProof/>
                 <w:webHidden/>
               </w:rPr>
-              <w:instrText xml:space="preserve"> PAGEREF _Toc224071328 \h </w:instrText>
+              <w:instrText xml:space="preserve"> PAGEREF _Toc224073625 \h </w:instrText>
             </w:r>
             <w:r>
               <w:rPr>
@@ -1244,7 +1244,7 @@
               <w:lang w:eastAsia="en-GB"/>
             </w:rPr>
           </w:pPr>
-          <w:hyperlink w:anchor="_Toc224071329" w:history="1">
+          <w:hyperlink w:anchor="_Toc224073626" w:history="1">
             <w:r>
               <w:rPr>
                 <w:rStyle w:val="Hyperlink"/>
@@ -1271,7 +1271,7 @@
                 <w:noProof/>
                 <w:webHidden/>
               </w:rPr>
-              <w:instrText xml:space="preserve"> PAGEREF _Toc224071329 \h </w:instrText>
+              <w:instrText xml:space="preserve"> PAGEREF _Toc224073626 \h </w:instrText>
             </w:r>
             <w:r>
               <w:rPr>
@@ -1316,7 +1316,7 @@
               <w:lang w:eastAsia="en-GB"/>
             </w:rPr>
           </w:pPr>
-          <w:hyperlink w:anchor="_Toc224071330" w:history="1">
+          <w:hyperlink w:anchor="_Toc224073627" w:history="1">
             <w:r>
               <w:rPr>
                 <w:rStyle w:val="Hyperlink"/>
@@ -1343,7 +1343,7 @@
                 <w:noProof/>
                 <w:webHidden/>
               </w:rPr>
-              <w:instrText xml:space="preserve"> PAGEREF _Toc224071330 \h </w:instrText>
+              <w:instrText xml:space="preserve"> PAGEREF _Toc224073627 \h </w:instrText>
             </w:r>
             <w:r>
               <w:rPr>
@@ -1388,7 +1388,7 @@
               <w:lang w:eastAsia="en-GB"/>
             </w:rPr>
           </w:pPr>
-          <w:hyperlink w:anchor="_Toc224071331" w:history="1">
+          <w:hyperlink w:anchor="_Toc224073628" w:history="1">
             <w:r>
               <w:rPr>
                 <w:rStyle w:val="Hyperlink"/>
@@ -1415,7 +1415,7 @@
                 <w:noProof/>
                 <w:webHidden/>
               </w:rPr>
-              <w:instrText xml:space="preserve"> PAGEREF _Toc224071331 \h </w:instrText>
+              <w:instrText xml:space="preserve"> PAGEREF _Toc224073628 \h </w:instrText>
             </w:r>
             <w:r>
               <w:rPr>
@@ -1460,7 +1460,7 @@
               <w:lang w:eastAsia="en-GB"/>
             </w:rPr>
           </w:pPr>
-          <w:hyperlink w:anchor="_Toc224071332" w:history="1">
+          <w:hyperlink w:anchor="_Toc224073629" w:history="1">
             <w:r>
               <w:rPr>
                 <w:rStyle w:val="Hyperlink"/>
@@ -1487,7 +1487,7 @@
                 <w:noProof/>
                 <w:webHidden/>
               </w:rPr>
-              <w:instrText xml:space="preserve"> PAGEREF _Toc224071332 \h </w:instrText>
+              <w:instrText xml:space="preserve"> PAGEREF _Toc224073629 \h </w:instrText>
             </w:r>
             <w:r>
               <w:rPr>
@@ -1532,7 +1532,7 @@
               <w:lang w:eastAsia="en-GB"/>
             </w:rPr>
           </w:pPr>
-          <w:hyperlink w:anchor="_Toc224071333" w:history="1">
+          <w:hyperlink w:anchor="_Toc224073630" w:history="1">
             <w:r>
               <w:rPr>
                 <w:rStyle w:val="Hyperlink"/>
@@ -1559,7 +1559,7 @@
                 <w:noProof/>
                 <w:webHidden/>
               </w:rPr>
-              <w:instrText xml:space="preserve"> PAGEREF _Toc224071333 \h </w:instrText>
+              <w:instrText xml:space="preserve"> PAGEREF _Toc224073630 \h </w:instrText>
             </w:r>
             <w:r>
               <w:rPr>
@@ -1604,7 +1604,7 @@
               <w:lang w:eastAsia="en-GB"/>
             </w:rPr>
           </w:pPr>
-          <w:hyperlink w:anchor="_Toc224071334" w:history="1">
+          <w:hyperlink w:anchor="_Toc224073631" w:history="1">
             <w:r>
               <w:rPr>
                 <w:rStyle w:val="Hyperlink"/>
@@ -1631,7 +1631,7 @@
                 <w:noProof/>
                 <w:webHidden/>
               </w:rPr>
-              <w:instrText xml:space="preserve"> PAGEREF _Toc224071334 \h </w:instrText>
+              <w:instrText xml:space="preserve"> PAGEREF _Toc224073631 \h </w:instrText>
             </w:r>
             <w:r>
               <w:rPr>
@@ -1676,7 +1676,7 @@
               <w:lang w:eastAsia="en-GB"/>
             </w:rPr>
           </w:pPr>
-          <w:hyperlink w:anchor="_Toc224071335" w:history="1">
+          <w:hyperlink w:anchor="_Toc224073632" w:history="1">
             <w:r>
               <w:rPr>
                 <w:rStyle w:val="Hyperlink"/>
@@ -1703,7 +1703,7 @@
                 <w:noProof/>
                 <w:webHidden/>
               </w:rPr>
-              <w:instrText xml:space="preserve"> PAGEREF _Toc224071335 \h </w:instrText>
+              <w:instrText xml:space="preserve"> PAGEREF _Toc224073632 \h </w:instrText>
             </w:r>
             <w:r>
               <w:rPr>
@@ -1748,7 +1748,7 @@
               <w:lang w:eastAsia="en-GB"/>
             </w:rPr>
           </w:pPr>
-          <w:hyperlink w:anchor="_Toc224071336" w:history="1">
+          <w:hyperlink w:anchor="_Toc224073633" w:history="1">
             <w:r>
               <w:rPr>
                 <w:rStyle w:val="Hyperlink"/>
@@ -1775,7 +1775,7 @@
                 <w:noProof/>
                 <w:webHidden/>
               </w:rPr>
-              <w:instrText xml:space="preserve"> PAGEREF _Toc224071336 \h </w:instrText>
+              <w:instrText xml:space="preserve"> PAGEREF _Toc224073633 \h </w:instrText>
             </w:r>
             <w:r>
               <w:rPr>
@@ -1820,7 +1820,7 @@
               <w:lang w:eastAsia="en-GB"/>
             </w:rPr>
           </w:pPr>
-          <w:hyperlink w:anchor="_Toc224071337" w:history="1">
+          <w:hyperlink w:anchor="_Toc224073634" w:history="1">
             <w:r>
               <w:rPr>
                 <w:rStyle w:val="Hyperlink"/>
@@ -1847,7 +1847,7 @@
                 <w:noProof/>
                 <w:webHidden/>
               </w:rPr>
-              <w:instrText xml:space="preserve"> PAGEREF _Toc224071337 \h </w:instrText>
+              <w:instrText xml:space="preserve"> PAGEREF _Toc224073634 \h </w:instrText>
             </w:r>
             <w:r>
               <w:rPr>
@@ -1892,7 +1892,7 @@
               <w:lang w:eastAsia="en-GB"/>
             </w:rPr>
           </w:pPr>
-          <w:hyperlink w:anchor="_Toc224071338" w:history="1">
+          <w:hyperlink w:anchor="_Toc224073635" w:history="1">
             <w:r>
               <w:rPr>
                 <w:rStyle w:val="Hyperlink"/>
@@ -1919,7 +1919,7 @@
                 <w:noProof/>
                 <w:webHidden/>
               </w:rPr>
-              <w:instrText xml:space="preserve"> PAGEREF _Toc224071338 \h </w:instrText>
+              <w:instrText xml:space="preserve"> PAGEREF _Toc224073635 \h </w:instrText>
             </w:r>
             <w:r>
               <w:rPr>
@@ -1964,7 +1964,7 @@
               <w:lang w:eastAsia="en-GB"/>
             </w:rPr>
           </w:pPr>
-          <w:hyperlink w:anchor="_Toc224071339" w:history="1">
+          <w:hyperlink w:anchor="_Toc224073636" w:history="1">
             <w:r>
               <w:rPr>
                 <w:rStyle w:val="Hyperlink"/>
@@ -1991,7 +1991,7 @@
                 <w:noProof/>
                 <w:webHidden/>
               </w:rPr>
-              <w:instrText xml:space="preserve"> PAGEREF _Toc224071339 \h </w:instrText>
+              <w:instrText xml:space="preserve"> PAGEREF _Toc224073636 \h </w:instrText>
             </w:r>
             <w:r>
               <w:rPr>
@@ -2036,7 +2036,7 @@
               <w:lang w:eastAsia="en-GB"/>
             </w:rPr>
           </w:pPr>
-          <w:hyperlink w:anchor="_Toc224071340" w:history="1">
+          <w:hyperlink w:anchor="_Toc224073637" w:history="1">
             <w:r>
               <w:rPr>
                 <w:rStyle w:val="Hyperlink"/>
@@ -2063,7 +2063,7 @@
                 <w:noProof/>
                 <w:webHidden/>
               </w:rPr>
-              <w:instrText xml:space="preserve"> PAGEREF _Toc224071340 \h </w:instrText>
+              <w:instrText xml:space="preserve"> PAGEREF _Toc224073637 \h </w:instrText>
             </w:r>
             <w:r>
               <w:rPr>
@@ -2108,7 +2108,7 @@
               <w:lang w:eastAsia="en-GB"/>
             </w:rPr>
           </w:pPr>
-          <w:hyperlink w:anchor="_Toc224071341" w:history="1">
+          <w:hyperlink w:anchor="_Toc224073638" w:history="1">
             <w:r>
               <w:rPr>
                 <w:rStyle w:val="Hyperlink"/>
@@ -2135,7 +2135,7 @@
                 <w:noProof/>
                 <w:webHidden/>
               </w:rPr>
-              <w:instrText xml:space="preserve"> PAGEREF _Toc224071341 \h </w:instrText>
+              <w:instrText xml:space="preserve"> PAGEREF _Toc224073638 \h </w:instrText>
             </w:r>
             <w:r>
               <w:rPr>
@@ -2180,7 +2180,7 @@
               <w:lang w:eastAsia="en-GB"/>
             </w:rPr>
           </w:pPr>
-          <w:hyperlink w:anchor="_Toc224071342" w:history="1">
+          <w:hyperlink w:anchor="_Toc224073639" w:history="1">
             <w:r>
               <w:rPr>
                 <w:rStyle w:val="Hyperlink"/>
@@ -2207,7 +2207,7 @@
                 <w:noProof/>
                 <w:webHidden/>
               </w:rPr>
-              <w:instrText xml:space="preserve"> PAGEREF _Toc224071342 \h </w:instrText>
+              <w:instrText xml:space="preserve"> PAGEREF _Toc224073639 \h </w:instrText>
             </w:r>
             <w:r>
               <w:rPr>
@@ -2252,7 +2252,7 @@
               <w:lang w:eastAsia="en-GB"/>
             </w:rPr>
           </w:pPr>
-          <w:hyperlink w:anchor="_Toc224071343" w:history="1">
+          <w:hyperlink w:anchor="_Toc224073640" w:history="1">
             <w:r>
               <w:rPr>
                 <w:rStyle w:val="Hyperlink"/>
@@ -2279,7 +2279,7 @@
                 <w:noProof/>
                 <w:webHidden/>
               </w:rPr>
-              <w:instrText xml:space="preserve"> PAGEREF _Toc224071343 \h </w:instrText>
+              <w:instrText xml:space="preserve"> PAGEREF _Toc224073640 \h </w:instrText>
             </w:r>
             <w:r>
               <w:rPr>
@@ -2324,7 +2324,7 @@
               <w:lang w:eastAsia="en-GB"/>
             </w:rPr>
           </w:pPr>
-          <w:hyperlink w:anchor="_Toc224071344" w:history="1">
+          <w:hyperlink w:anchor="_Toc224073641" w:history="1">
             <w:r>
               <w:rPr>
                 <w:rStyle w:val="Hyperlink"/>
@@ -2351,7 +2351,7 @@
                 <w:noProof/>
                 <w:webHidden/>
               </w:rPr>
-              <w:instrText xml:space="preserve"> PAGEREF _Toc224071344 \h </w:instrText>
+              <w:instrText xml:space="preserve"> PAGEREF _Toc224073641 \h </w:instrText>
             </w:r>
             <w:r>
               <w:rPr>
@@ -2396,7 +2396,7 @@
               <w:lang w:eastAsia="en-GB"/>
             </w:rPr>
           </w:pPr>
-          <w:hyperlink w:anchor="_Toc224071345" w:history="1">
+          <w:hyperlink w:anchor="_Toc224073642" w:history="1">
             <w:r>
               <w:rPr>
                 <w:rStyle w:val="Hyperlink"/>
@@ -2423,7 +2423,7 @@
                 <w:noProof/>
                 <w:webHidden/>
               </w:rPr>
-              <w:instrText xml:space="preserve"> PAGEREF _Toc224071345 \h </w:instrText>
+              <w:instrText xml:space="preserve"> PAGEREF _Toc224073642 \h </w:instrText>
             </w:r>
             <w:r>
               <w:rPr>
@@ -2468,7 +2468,7 @@
               <w:lang w:eastAsia="en-GB"/>
             </w:rPr>
           </w:pPr>
-          <w:hyperlink w:anchor="_Toc224071346" w:history="1">
+          <w:hyperlink w:anchor="_Toc224073643" w:history="1">
             <w:r>
               <w:rPr>
                 <w:rStyle w:val="Hyperlink"/>
@@ -2495,7 +2495,7 @@
                 <w:noProof/>
                 <w:webHidden/>
               </w:rPr>
-              <w:instrText xml:space="preserve"> PAGEREF _Toc224071346 \h </w:instrText>
+              <w:instrText xml:space="preserve"> PAGEREF _Toc224073643 \h </w:instrText>
             </w:r>
             <w:r>
               <w:rPr>
@@ -2540,7 +2540,7 @@
               <w:lang w:eastAsia="en-GB"/>
             </w:rPr>
           </w:pPr>
-          <w:hyperlink w:anchor="_Toc224071347" w:history="1">
+          <w:hyperlink w:anchor="_Toc224073644" w:history="1">
             <w:r>
               <w:rPr>
                 <w:rStyle w:val="Hyperlink"/>
@@ -2567,7 +2567,7 @@
                 <w:noProof/>
                 <w:webHidden/>
               </w:rPr>
-              <w:instrText xml:space="preserve"> PAGEREF _Toc224071347 \h </w:instrText>
+              <w:instrText xml:space="preserve"> PAGEREF _Toc224073644 \h </w:instrText>
             </w:r>
             <w:r>
               <w:rPr>
@@ -2612,7 +2612,7 @@
               <w:lang w:eastAsia="en-GB"/>
             </w:rPr>
           </w:pPr>
-          <w:hyperlink w:anchor="_Toc224071348" w:history="1">
+          <w:hyperlink w:anchor="_Toc224073645" w:history="1">
             <w:r>
               <w:rPr>
                 <w:rStyle w:val="Hyperlink"/>
@@ -2639,7 +2639,7 @@
                 <w:noProof/>
                 <w:webHidden/>
               </w:rPr>
-              <w:instrText xml:space="preserve"> PAGEREF _Toc224071348 \h </w:instrText>
+              <w:instrText xml:space="preserve"> PAGEREF _Toc224073645 \h </w:instrText>
             </w:r>
             <w:r>
               <w:rPr>
@@ -2684,7 +2684,7 @@
               <w:lang w:eastAsia="en-GB"/>
             </w:rPr>
           </w:pPr>
-          <w:hyperlink w:anchor="_Toc224071349" w:history="1">
+          <w:hyperlink w:anchor="_Toc224073646" w:history="1">
             <w:r>
               <w:rPr>
                 <w:rStyle w:val="Hyperlink"/>
@@ -2711,7 +2711,7 @@
                 <w:noProof/>
                 <w:webHidden/>
               </w:rPr>
-              <w:instrText xml:space="preserve"> PAGEREF _Toc224071349 \h </w:instrText>
+              <w:instrText xml:space="preserve"> PAGEREF _Toc224073646 \h </w:instrText>
             </w:r>
             <w:r>
               <w:rPr>
@@ -2756,7 +2756,7 @@
               <w:lang w:eastAsia="en-GB"/>
             </w:rPr>
           </w:pPr>
-          <w:hyperlink w:anchor="_Toc224071350" w:history="1">
+          <w:hyperlink w:anchor="_Toc224073647" w:history="1">
             <w:r>
               <w:rPr>
                 <w:rStyle w:val="Hyperlink"/>
@@ -2783,7 +2783,7 @@
                 <w:noProof/>
                 <w:webHidden/>
               </w:rPr>
-              <w:instrText xml:space="preserve"> PAGEREF _Toc224071350 \h </w:instrText>
+              <w:instrText xml:space="preserve"> PAGEREF _Toc224073647 \h </w:instrText>
             </w:r>
             <w:r>
               <w:rPr>
@@ -2828,7 +2828,7 @@
               <w:lang w:eastAsia="en-GB"/>
             </w:rPr>
           </w:pPr>
-          <w:hyperlink w:anchor="_Toc224071351" w:history="1">
+          <w:hyperlink w:anchor="_Toc224073648" w:history="1">
             <w:r>
               <w:rPr>
                 <w:rStyle w:val="Hyperlink"/>
@@ -2855,7 +2855,7 @@
                 <w:noProof/>
                 <w:webHidden/>
               </w:rPr>
-              <w:instrText xml:space="preserve"> PAGEREF _Toc224071351 \h </w:instrText>
+              <w:instrText xml:space="preserve"> PAGEREF _Toc224073648 \h </w:instrText>
             </w:r>
             <w:r>
               <w:rPr>
@@ -2900,7 +2900,7 @@
               <w:lang w:eastAsia="en-GB"/>
             </w:rPr>
           </w:pPr>
-          <w:hyperlink w:anchor="_Toc224071352" w:history="1">
+          <w:hyperlink w:anchor="_Toc224073649" w:history="1">
             <w:r>
               <w:rPr>
                 <w:rStyle w:val="Hyperlink"/>
@@ -2927,7 +2927,7 @@
                 <w:noProof/>
                 <w:webHidden/>
               </w:rPr>
-              <w:instrText xml:space="preserve"> PAGEREF _Toc224071352 \h </w:instrText>
+              <w:instrText xml:space="preserve"> PAGEREF _Toc224073649 \h </w:instrText>
             </w:r>
             <w:r>
               <w:rPr>
@@ -2972,7 +2972,7 @@
               <w:lang w:eastAsia="en-GB"/>
             </w:rPr>
           </w:pPr>
-          <w:hyperlink w:anchor="_Toc224071353" w:history="1">
+          <w:hyperlink w:anchor="_Toc224073650" w:history="1">
             <w:r>
               <w:rPr>
                 <w:rStyle w:val="Hyperlink"/>
@@ -2999,7 +2999,7 @@
                 <w:noProof/>
                 <w:webHidden/>
               </w:rPr>
-              <w:instrText xml:space="preserve"> PAGEREF _Toc224071353 \h </w:instrText>
+              <w:instrText xml:space="preserve"> PAGEREF _Toc224073650 \h </w:instrText>
             </w:r>
             <w:r>
               <w:rPr>
@@ -3044,7 +3044,7 @@
               <w:lang w:eastAsia="en-GB"/>
             </w:rPr>
           </w:pPr>
-          <w:hyperlink w:anchor="_Toc224071354" w:history="1">
+          <w:hyperlink w:anchor="_Toc224073651" w:history="1">
             <w:r>
               <w:rPr>
                 <w:rStyle w:val="Hyperlink"/>
@@ -3071,7 +3071,7 @@
                 <w:noProof/>
                 <w:webHidden/>
               </w:rPr>
-              <w:instrText xml:space="preserve"> PAGEREF _Toc224071354 \h </w:instrText>
+              <w:instrText xml:space="preserve"> PAGEREF _Toc224073651 \h </w:instrText>
             </w:r>
             <w:r>
               <w:rPr>
@@ -3116,7 +3116,7 @@
               <w:lang w:eastAsia="en-GB"/>
             </w:rPr>
           </w:pPr>
-          <w:hyperlink w:anchor="_Toc224071355" w:history="1">
+          <w:hyperlink w:anchor="_Toc224073652" w:history="1">
             <w:r>
               <w:rPr>
                 <w:rStyle w:val="Hyperlink"/>
@@ -3143,7 +3143,7 @@
                 <w:noProof/>
                 <w:webHidden/>
               </w:rPr>
-              <w:instrText xml:space="preserve"> PAGEREF _Toc224071355 \h </w:instrText>
+              <w:instrText xml:space="preserve"> PAGEREF _Toc224073652 \h </w:instrText>
             </w:r>
             <w:r>
               <w:rPr>
@@ -3188,7 +3188,7 @@
               <w:lang w:eastAsia="en-GB"/>
             </w:rPr>
           </w:pPr>
-          <w:hyperlink w:anchor="_Toc224071356" w:history="1">
+          <w:hyperlink w:anchor="_Toc224073653" w:history="1">
             <w:r>
               <w:rPr>
                 <w:rStyle w:val="Hyperlink"/>
@@ -3215,7 +3215,7 @@
                 <w:noProof/>
                 <w:webHidden/>
               </w:rPr>
-              <w:instrText xml:space="preserve"> PAGEREF _Toc224071356 \h </w:instrText>
+              <w:instrText xml:space="preserve"> PAGEREF _Toc224073653 \h </w:instrText>
             </w:r>
             <w:r>
               <w:rPr>
@@ -3260,7 +3260,7 @@
               <w:lang w:eastAsia="en-GB"/>
             </w:rPr>
           </w:pPr>
-          <w:hyperlink w:anchor="_Toc224071357" w:history="1">
+          <w:hyperlink w:anchor="_Toc224073654" w:history="1">
             <w:r>
               <w:rPr>
                 <w:rStyle w:val="Hyperlink"/>
@@ -3287,7 +3287,7 @@
                 <w:noProof/>
                 <w:webHidden/>
               </w:rPr>
-              <w:instrText xml:space="preserve"> PAGEREF _Toc224071357 \h </w:instrText>
+              <w:instrText xml:space="preserve"> PAGEREF _Toc224073654 \h </w:instrText>
             </w:r>
             <w:r>
               <w:rPr>
@@ -3332,7 +3332,7 @@
               <w:lang w:eastAsia="en-GB"/>
             </w:rPr>
           </w:pPr>
-          <w:hyperlink w:anchor="_Toc224071358" w:history="1">
+          <w:hyperlink w:anchor="_Toc224073655" w:history="1">
             <w:r>
               <w:rPr>
                 <w:rStyle w:val="Hyperlink"/>
@@ -3359,7 +3359,7 @@
                 <w:noProof/>
                 <w:webHidden/>
               </w:rPr>
-              <w:instrText xml:space="preserve"> PAGEREF _Toc224071358 \h </w:instrText>
+              <w:instrText xml:space="preserve"> PAGEREF _Toc224073655 \h </w:instrText>
             </w:r>
             <w:r>
               <w:rPr>
@@ -3404,7 +3404,7 @@
               <w:lang w:eastAsia="en-GB"/>
             </w:rPr>
           </w:pPr>
-          <w:hyperlink w:anchor="_Toc224071359" w:history="1">
+          <w:hyperlink w:anchor="_Toc224073656" w:history="1">
             <w:r>
               <w:rPr>
                 <w:rStyle w:val="Hyperlink"/>
@@ -3431,7 +3431,7 @@
                 <w:noProof/>
                 <w:webHidden/>
               </w:rPr>
-              <w:instrText xml:space="preserve"> PAGEREF _Toc224071359 \h </w:instrText>
+              <w:instrText xml:space="preserve"> PAGEREF _Toc224073656 \h </w:instrText>
             </w:r>
             <w:r>
               <w:rPr>
@@ -3476,7 +3476,7 @@
               <w:lang w:eastAsia="en-GB"/>
             </w:rPr>
           </w:pPr>
-          <w:hyperlink w:anchor="_Toc224071360" w:history="1">
+          <w:hyperlink w:anchor="_Toc224073657" w:history="1">
             <w:r>
               <w:rPr>
                 <w:rStyle w:val="Hyperlink"/>
@@ -3503,7 +3503,7 @@
                 <w:noProof/>
                 <w:webHidden/>
               </w:rPr>
-              <w:instrText xml:space="preserve"> PAGEREF _Toc224071360 \h </w:instrText>
+              <w:instrText xml:space="preserve"> PAGEREF _Toc224073657 \h </w:instrText>
             </w:r>
             <w:r>
               <w:rPr>
@@ -3548,7 +3548,7 @@
               <w:lang w:eastAsia="en-GB"/>
             </w:rPr>
           </w:pPr>
-          <w:hyperlink w:anchor="_Toc224071361" w:history="1">
+          <w:hyperlink w:anchor="_Toc224073658" w:history="1">
             <w:r>
               <w:rPr>
                 <w:rStyle w:val="Hyperlink"/>
@@ -3575,7 +3575,7 @@
                 <w:noProof/>
                 <w:webHidden/>
               </w:rPr>
-              <w:instrText xml:space="preserve"> PAGEREF _Toc224071361 \h </w:instrText>
+              <w:instrText xml:space="preserve"> PAGEREF _Toc224073658 \h </w:instrText>
             </w:r>
             <w:r>
               <w:rPr>
@@ -3620,7 +3620,7 @@
               <w:lang w:eastAsia="en-GB"/>
             </w:rPr>
           </w:pPr>
-          <w:hyperlink w:anchor="_Toc224071362" w:history="1">
+          <w:hyperlink w:anchor="_Toc224073659" w:history="1">
             <w:r>
               <w:rPr>
                 <w:rStyle w:val="Hyperlink"/>
@@ -3647,7 +3647,7 @@
                 <w:noProof/>
                 <w:webHidden/>
               </w:rPr>
-              <w:instrText xml:space="preserve"> PAGEREF _Toc224071362 \h </w:instrText>
+              <w:instrText xml:space="preserve"> PAGEREF _Toc224073659 \h </w:instrText>
             </w:r>
             <w:r>
               <w:rPr>
@@ -3692,7 +3692,7 @@
               <w:lang w:eastAsia="en-GB"/>
             </w:rPr>
           </w:pPr>
-          <w:hyperlink w:anchor="_Toc224071363" w:history="1">
+          <w:hyperlink w:anchor="_Toc224073660" w:history="1">
             <w:r>
               <w:rPr>
                 <w:rStyle w:val="Hyperlink"/>
@@ -3719,7 +3719,7 @@
                 <w:noProof/>
                 <w:webHidden/>
               </w:rPr>
-              <w:instrText xml:space="preserve"> PAGEREF _Toc224071363 \h </w:instrText>
+              <w:instrText xml:space="preserve"> PAGEREF _Toc224073660 \h </w:instrText>
             </w:r>
             <w:r>
               <w:rPr>
@@ -3764,7 +3764,7 @@
               <w:lang w:eastAsia="en-GB"/>
             </w:rPr>
           </w:pPr>
-          <w:hyperlink w:anchor="_Toc224071364" w:history="1">
+          <w:hyperlink w:anchor="_Toc224073661" w:history="1">
             <w:r>
               <w:rPr>
                 <w:rStyle w:val="Hyperlink"/>
@@ -3791,7 +3791,7 @@
                 <w:noProof/>
                 <w:webHidden/>
               </w:rPr>
-              <w:instrText xml:space="preserve"> PAGEREF _Toc224071364 \h </w:instrText>
+              <w:instrText xml:space="preserve"> PAGEREF _Toc224073661 \h </w:instrText>
             </w:r>
             <w:r>
               <w:rPr>
@@ -3836,7 +3836,7 @@
               <w:lang w:eastAsia="en-GB"/>
             </w:rPr>
           </w:pPr>
-          <w:hyperlink w:anchor="_Toc224071365" w:history="1">
+          <w:hyperlink w:anchor="_Toc224073662" w:history="1">
             <w:r>
               <w:rPr>
                 <w:rStyle w:val="Hyperlink"/>
@@ -3863,7 +3863,7 @@
                 <w:noProof/>
                 <w:webHidden/>
               </w:rPr>
-              <w:instrText xml:space="preserve"> PAGEREF _Toc224071365 \h </w:instrText>
+              <w:instrText xml:space="preserve"> PAGEREF _Toc224073662 \h </w:instrText>
             </w:r>
             <w:r>
               <w:rPr>
@@ -3908,7 +3908,7 @@
               <w:lang w:eastAsia="en-GB"/>
             </w:rPr>
           </w:pPr>
-          <w:hyperlink w:anchor="_Toc224071366" w:history="1">
+          <w:hyperlink w:anchor="_Toc224073663" w:history="1">
             <w:r>
               <w:rPr>
                 <w:rStyle w:val="Hyperlink"/>
@@ -3935,7 +3935,7 @@
                 <w:noProof/>
                 <w:webHidden/>
               </w:rPr>
-              <w:instrText xml:space="preserve"> PAGEREF _Toc224071366 \h </w:instrText>
+              <w:instrText xml:space="preserve"> PAGEREF _Toc224073663 \h </w:instrText>
             </w:r>
             <w:r>
               <w:rPr>
@@ -3980,7 +3980,7 @@
               <w:lang w:eastAsia="en-GB"/>
             </w:rPr>
           </w:pPr>
-          <w:hyperlink w:anchor="_Toc224071367" w:history="1">
+          <w:hyperlink w:anchor="_Toc224073664" w:history="1">
             <w:r>
               <w:rPr>
                 <w:rStyle w:val="Hyperlink"/>
@@ -4007,7 +4007,7 @@
                 <w:noProof/>
                 <w:webHidden/>
               </w:rPr>
-              <w:instrText xml:space="preserve"> PAGEREF _Toc224071367 \h </w:instrText>
+              <w:instrText xml:space="preserve"> PAGEREF _Toc224073664 \h </w:instrText>
             </w:r>
             <w:r>
               <w:rPr>
@@ -4052,7 +4052,7 @@
               <w:lang w:eastAsia="en-GB"/>
             </w:rPr>
           </w:pPr>
-          <w:hyperlink w:anchor="_Toc224071368" w:history="1">
+          <w:hyperlink w:anchor="_Toc224073665" w:history="1">
             <w:r>
               <w:rPr>
                 <w:rStyle w:val="Hyperlink"/>
@@ -4079,7 +4079,7 @@
                 <w:noProof/>
                 <w:webHidden/>
               </w:rPr>
-              <w:instrText xml:space="preserve"> PAGEREF _Toc224071368 \h </w:instrText>
+              <w:instrText xml:space="preserve"> PAGEREF _Toc224073665 \h </w:instrText>
             </w:r>
             <w:r>
               <w:rPr>
@@ -4124,7 +4124,7 @@
               <w:lang w:eastAsia="en-GB"/>
             </w:rPr>
           </w:pPr>
-          <w:hyperlink w:anchor="_Toc224071369" w:history="1">
+          <w:hyperlink w:anchor="_Toc224073666" w:history="1">
             <w:r>
               <w:rPr>
                 <w:rStyle w:val="Hyperlink"/>
@@ -4151,7 +4151,7 @@
                 <w:noProof/>
                 <w:webHidden/>
               </w:rPr>
-              <w:instrText xml:space="preserve"> PAGEREF _Toc224071369 \h </w:instrText>
+              <w:instrText xml:space="preserve"> PAGEREF _Toc224073666 \h </w:instrText>
             </w:r>
             <w:r>
               <w:rPr>
@@ -4196,7 +4196,7 @@
               <w:lang w:eastAsia="en-GB"/>
             </w:rPr>
           </w:pPr>
-          <w:hyperlink w:anchor="_Toc224071370" w:history="1">
+          <w:hyperlink w:anchor="_Toc224073667" w:history="1">
             <w:r>
               <w:rPr>
                 <w:rStyle w:val="Hyperlink"/>
@@ -4223,7 +4223,7 @@
                 <w:noProof/>
                 <w:webHidden/>
               </w:rPr>
-              <w:instrText xml:space="preserve"> PAGEREF _Toc224071370 \h </w:instrText>
+              <w:instrText xml:space="preserve"> PAGEREF _Toc224073667 \h </w:instrText>
             </w:r>
             <w:r>
               <w:rPr>
@@ -4268,7 +4268,7 @@
               <w:lang w:eastAsia="en-GB"/>
             </w:rPr>
           </w:pPr>
-          <w:hyperlink w:anchor="_Toc224071371" w:history="1">
+          <w:hyperlink w:anchor="_Toc224073668" w:history="1">
             <w:r>
               <w:rPr>
                 <w:rStyle w:val="Hyperlink"/>
@@ -4295,7 +4295,7 @@
                 <w:noProof/>
                 <w:webHidden/>
               </w:rPr>
-              <w:instrText xml:space="preserve"> PAGEREF _Toc224071371 \h </w:instrText>
+              <w:instrText xml:space="preserve"> PAGEREF _Toc224073668 \h </w:instrText>
             </w:r>
             <w:r>
               <w:rPr>
@@ -4340,7 +4340,7 @@
               <w:lang w:eastAsia="en-GB"/>
             </w:rPr>
           </w:pPr>
-          <w:hyperlink w:anchor="_Toc224071372" w:history="1">
+          <w:hyperlink w:anchor="_Toc224073669" w:history="1">
             <w:r>
               <w:rPr>
                 <w:rStyle w:val="Hyperlink"/>
@@ -4367,7 +4367,7 @@
                 <w:noProof/>
                 <w:webHidden/>
               </w:rPr>
-              <w:instrText xml:space="preserve"> PAGEREF _Toc224071372 \h </w:instrText>
+              <w:instrText xml:space="preserve"> PAGEREF _Toc224073669 \h </w:instrText>
             </w:r>
             <w:r>
               <w:rPr>
@@ -4412,7 +4412,7 @@
               <w:lang w:eastAsia="en-GB"/>
             </w:rPr>
           </w:pPr>
-          <w:hyperlink w:anchor="_Toc224071373" w:history="1">
+          <w:hyperlink w:anchor="_Toc224073670" w:history="1">
             <w:r>
               <w:rPr>
                 <w:rStyle w:val="Hyperlink"/>
@@ -4439,7 +4439,7 @@
                 <w:noProof/>
                 <w:webHidden/>
               </w:rPr>
-              <w:instrText xml:space="preserve"> PAGEREF _Toc224071373 \h </w:instrText>
+              <w:instrText xml:space="preserve"> PAGEREF _Toc224073670 \h </w:instrText>
             </w:r>
             <w:r>
               <w:rPr>
@@ -4484,7 +4484,7 @@
               <w:lang w:eastAsia="en-GB"/>
             </w:rPr>
           </w:pPr>
-          <w:hyperlink w:anchor="_Toc224071374" w:history="1">
+          <w:hyperlink w:anchor="_Toc224073671" w:history="1">
             <w:r>
               <w:rPr>
                 <w:rStyle w:val="Hyperlink"/>
@@ -4511,7 +4511,7 @@
                 <w:noProof/>
                 <w:webHidden/>
               </w:rPr>
-              <w:instrText xml:space="preserve"> PAGEREF _Toc224071374 \h </w:instrText>
+              <w:instrText xml:space="preserve"> PAGEREF _Toc224073671 \h </w:instrText>
             </w:r>
             <w:r>
               <w:rPr>
@@ -4556,7 +4556,7 @@
               <w:lang w:eastAsia="en-GB"/>
             </w:rPr>
           </w:pPr>
-          <w:hyperlink w:anchor="_Toc224071375" w:history="1">
+          <w:hyperlink w:anchor="_Toc224073672" w:history="1">
             <w:r>
               <w:rPr>
                 <w:rStyle w:val="Hyperlink"/>
@@ -4583,7 +4583,7 @@
                 <w:noProof/>
                 <w:webHidden/>
               </w:rPr>
-              <w:instrText xml:space="preserve"> PAGEREF _Toc224071375 \h </w:instrText>
+              <w:instrText xml:space="preserve"> PAGEREF _Toc224073672 \h </w:instrText>
             </w:r>
             <w:r>
               <w:rPr>
@@ -4628,7 +4628,7 @@
               <w:lang w:eastAsia="en-GB"/>
             </w:rPr>
           </w:pPr>
-          <w:hyperlink w:anchor="_Toc224071376" w:history="1">
+          <w:hyperlink w:anchor="_Toc224073673" w:history="1">
             <w:r>
               <w:rPr>
                 <w:rStyle w:val="Hyperlink"/>
@@ -4655,7 +4655,7 @@
                 <w:noProof/>
                 <w:webHidden/>
               </w:rPr>
-              <w:instrText xml:space="preserve"> PAGEREF _Toc224071376 \h </w:instrText>
+              <w:instrText xml:space="preserve"> PAGEREF _Toc224073673 \h </w:instrText>
             </w:r>
             <w:r>
               <w:rPr>
@@ -4700,7 +4700,7 @@
               <w:lang w:eastAsia="en-GB"/>
             </w:rPr>
           </w:pPr>
-          <w:hyperlink w:anchor="_Toc224071377" w:history="1">
+          <w:hyperlink w:anchor="_Toc224073674" w:history="1">
             <w:r>
               <w:rPr>
                 <w:rStyle w:val="Hyperlink"/>
@@ -4727,7 +4727,7 @@
                 <w:noProof/>
                 <w:webHidden/>
               </w:rPr>
-              <w:instrText xml:space="preserve"> PAGEREF _Toc224071377 \h </w:instrText>
+              <w:instrText xml:space="preserve"> PAGEREF _Toc224073674 \h </w:instrText>
             </w:r>
             <w:r>
               <w:rPr>
@@ -4772,7 +4772,7 @@
               <w:lang w:eastAsia="en-GB"/>
             </w:rPr>
           </w:pPr>
-          <w:hyperlink w:anchor="_Toc224071378" w:history="1">
+          <w:hyperlink w:anchor="_Toc224073675" w:history="1">
             <w:r>
               <w:rPr>
                 <w:rStyle w:val="Hyperlink"/>
@@ -4799,7 +4799,7 @@
                 <w:noProof/>
                 <w:webHidden/>
               </w:rPr>
-              <w:instrText xml:space="preserve"> PAGEREF _Toc224071378 \h </w:instrText>
+              <w:instrText xml:space="preserve"> PAGEREF _Toc224073675 \h </w:instrText>
             </w:r>
             <w:r>
               <w:rPr>
@@ -4844,7 +4844,7 @@
               <w:lang w:eastAsia="en-GB"/>
             </w:rPr>
           </w:pPr>
-          <w:hyperlink w:anchor="_Toc224071379" w:history="1">
+          <w:hyperlink w:anchor="_Toc224073676" w:history="1">
             <w:r>
               <w:rPr>
                 <w:rStyle w:val="Hyperlink"/>
@@ -4871,7 +4871,7 @@
                 <w:noProof/>
                 <w:webHidden/>
               </w:rPr>
-              <w:instrText xml:space="preserve"> PAGEREF _Toc224071379 \h </w:instrText>
+              <w:instrText xml:space="preserve"> PAGEREF _Toc224073676 \h </w:instrText>
             </w:r>
             <w:r>
               <w:rPr>
@@ -4916,7 +4916,7 @@
               <w:lang w:eastAsia="en-GB"/>
             </w:rPr>
           </w:pPr>
-          <w:hyperlink w:anchor="_Toc224071380" w:history="1">
+          <w:hyperlink w:anchor="_Toc224073677" w:history="1">
             <w:r>
               <w:rPr>
                 <w:rStyle w:val="Hyperlink"/>
@@ -4943,7 +4943,7 @@
                 <w:noProof/>
                 <w:webHidden/>
               </w:rPr>
-              <w:instrText xml:space="preserve"> PAGEREF _Toc224071380 \h </w:instrText>
+              <w:instrText xml:space="preserve"> PAGEREF _Toc224073677 \h </w:instrText>
             </w:r>
             <w:r>
               <w:rPr>
@@ -5004,7 +5004,7 @@
       <w:pPr>
         <w:pStyle w:val="Heading1"/>
       </w:pPr>
-      <w:bookmarkStart w:id="0" w:name="_Toc224071315"/>
+      <w:bookmarkStart w:id="0" w:name="_Toc224073612"/>
       <w:r>
         <w:lastRenderedPageBreak/>
         <w:t>List of Acro</w:t>
@@ -5303,7 +5303,7 @@
       <w:pPr>
         <w:pStyle w:val="Heading1"/>
       </w:pPr>
-      <w:bookmarkStart w:id="1" w:name="_Toc224071316"/>
+      <w:bookmarkStart w:id="1" w:name="_Toc224073613"/>
       <w:r>
         <w:t>Abstract</w:t>
       </w:r>
@@ -5502,7 +5502,7 @@
       <w:pPr>
         <w:pStyle w:val="Heading1"/>
       </w:pPr>
-      <w:bookmarkStart w:id="2" w:name="_Toc224071317"/>
+      <w:bookmarkStart w:id="2" w:name="_Toc224073614"/>
       <w:r>
         <w:lastRenderedPageBreak/>
         <w:t>Introduction</w:t>
@@ -6075,7 +6075,7 @@
       <w:pPr>
         <w:pStyle w:val="Heading1"/>
       </w:pPr>
-      <w:bookmarkStart w:id="3" w:name="_Toc224071318"/>
+      <w:bookmarkStart w:id="3" w:name="_Toc224073615"/>
       <w:r>
         <w:lastRenderedPageBreak/>
         <w:t>Project Aim</w:t>
@@ -6125,7 +6125,7 @@
           <w:rFonts w:asciiTheme="minorHAnsi" w:hAnsiTheme="minorHAnsi"/>
         </w:rPr>
       </w:pPr>
-      <w:bookmarkStart w:id="4" w:name="_Toc224071319"/>
+      <w:bookmarkStart w:id="4" w:name="_Toc224073616"/>
       <w:r>
         <w:rPr>
           <w:rFonts w:asciiTheme="minorHAnsi" w:hAnsiTheme="minorHAnsi"/>
@@ -6412,7 +6412,7 @@
       <w:pPr>
         <w:pStyle w:val="Heading1"/>
       </w:pPr>
-      <w:bookmarkStart w:id="5" w:name="_Toc224071320"/>
+      <w:bookmarkStart w:id="5" w:name="_Toc224073617"/>
       <w:r>
         <w:lastRenderedPageBreak/>
         <w:t>Project Planning</w:t>
@@ -6793,7 +6793,7 @@
           <w:rFonts w:asciiTheme="minorHAnsi" w:hAnsiTheme="minorHAnsi"/>
         </w:rPr>
       </w:pPr>
-      <w:bookmarkStart w:id="6" w:name="_Toc224071321"/>
+      <w:bookmarkStart w:id="6" w:name="_Toc224073618"/>
       <w:r>
         <w:rPr>
           <w:rFonts w:asciiTheme="minorHAnsi" w:hAnsiTheme="minorHAnsi"/>
@@ -6995,7 +6995,7 @@
           <w:rFonts w:asciiTheme="minorHAnsi" w:hAnsiTheme="minorHAnsi"/>
         </w:rPr>
       </w:pPr>
-      <w:bookmarkStart w:id="7" w:name="_Toc224071322"/>
+      <w:bookmarkStart w:id="7" w:name="_Toc224073619"/>
       <w:r>
         <w:rPr>
           <w:rFonts w:asciiTheme="minorHAnsi" w:hAnsiTheme="minorHAnsi"/>
@@ -7262,7 +7262,7 @@
           <w:rFonts w:asciiTheme="minorHAnsi" w:hAnsiTheme="minorHAnsi"/>
         </w:rPr>
       </w:pPr>
-      <w:bookmarkStart w:id="8" w:name="_Toc224071323"/>
+      <w:bookmarkStart w:id="8" w:name="_Toc224073620"/>
       <w:r>
         <w:rPr>
           <w:rFonts w:asciiTheme="minorHAnsi" w:hAnsiTheme="minorHAnsi"/>
@@ -7279,7 +7279,7 @@
           <w:rFonts w:asciiTheme="minorHAnsi" w:hAnsiTheme="minorHAnsi"/>
         </w:rPr>
       </w:pPr>
-      <w:bookmarkStart w:id="9" w:name="_Toc224071324"/>
+      <w:bookmarkStart w:id="9" w:name="_Toc224073621"/>
       <w:r>
         <w:rPr>
           <w:rFonts w:asciiTheme="minorHAnsi" w:hAnsiTheme="minorHAnsi"/>
@@ -7363,7 +7363,7 @@
           <w:rFonts w:asciiTheme="minorHAnsi" w:hAnsiTheme="minorHAnsi"/>
         </w:rPr>
       </w:pPr>
-      <w:bookmarkStart w:id="10" w:name="_Toc224071325"/>
+      <w:bookmarkStart w:id="10" w:name="_Toc224073622"/>
       <w:r>
         <w:rPr>
           <w:rFonts w:asciiTheme="minorHAnsi" w:hAnsiTheme="minorHAnsi"/>
@@ -7376,7 +7376,7 @@
       <w:pPr>
         <w:pStyle w:val="Heading3"/>
       </w:pPr>
-      <w:bookmarkStart w:id="11" w:name="_Toc224071326"/>
+      <w:bookmarkStart w:id="11" w:name="_Toc224073623"/>
       <w:r>
         <w:t>Ey</w:t>
       </w:r>
@@ -7673,7 +7673,7 @@
       <w:pPr>
         <w:pStyle w:val="Heading3"/>
       </w:pPr>
-      <w:bookmarkStart w:id="12" w:name="_Toc224071327"/>
+      <w:bookmarkStart w:id="12" w:name="_Toc224073624"/>
       <w:r>
         <w:t>OntoPhaco</w:t>
       </w:r>
@@ -8003,7 +8003,7 @@
       <w:pPr>
         <w:pStyle w:val="Heading3"/>
       </w:pPr>
-      <w:bookmarkStart w:id="13" w:name="_Toc224071328"/>
+      <w:bookmarkStart w:id="13" w:name="_Toc224073625"/>
       <w:r>
         <w:lastRenderedPageBreak/>
         <w:t>I</w:t>
@@ -8199,7 +8199,7 @@
       <w:pPr>
         <w:pStyle w:val="Heading3"/>
       </w:pPr>
-      <w:bookmarkStart w:id="14" w:name="_Toc224071329"/>
+      <w:bookmarkStart w:id="14" w:name="_Toc224073626"/>
       <w:r>
         <w:t>Opportunities for innovation</w:t>
       </w:r>
@@ -8317,7 +8317,7 @@
           <w:rFonts w:asciiTheme="minorHAnsi" w:hAnsiTheme="minorHAnsi"/>
         </w:rPr>
       </w:pPr>
-      <w:bookmarkStart w:id="15" w:name="_Toc224071330"/>
+      <w:bookmarkStart w:id="15" w:name="_Toc224073627"/>
       <w:r>
         <w:rPr>
           <w:rFonts w:asciiTheme="minorHAnsi" w:hAnsiTheme="minorHAnsi"/>
@@ -8330,7 +8330,7 @@
       <w:pPr>
         <w:pStyle w:val="Heading3"/>
       </w:pPr>
-      <w:bookmarkStart w:id="16" w:name="_Toc224071331"/>
+      <w:bookmarkStart w:id="16" w:name="_Toc224073628"/>
       <w:r>
         <w:t>VR in medical education</w:t>
       </w:r>
@@ -8597,7 +8597,7 @@
       <w:pPr>
         <w:pStyle w:val="Heading3"/>
       </w:pPr>
-      <w:bookmarkStart w:id="17" w:name="_Toc224071332"/>
+      <w:bookmarkStart w:id="17" w:name="_Toc224073629"/>
       <w:r>
         <w:lastRenderedPageBreak/>
         <w:t>VR in Health Awareness</w:t>
@@ -8790,7 +8790,7 @@
           <w:rFonts w:asciiTheme="minorHAnsi" w:hAnsiTheme="minorHAnsi"/>
         </w:rPr>
       </w:pPr>
-      <w:bookmarkStart w:id="18" w:name="_Toc224071333"/>
+      <w:bookmarkStart w:id="18" w:name="_Toc224073630"/>
       <w:r>
         <w:rPr>
           <w:rFonts w:asciiTheme="minorHAnsi" w:hAnsiTheme="minorHAnsi"/>
@@ -9010,7 +9010,7 @@
       <w:pPr>
         <w:pStyle w:val="Heading1"/>
       </w:pPr>
-      <w:bookmarkStart w:id="19" w:name="_Toc224071334"/>
+      <w:bookmarkStart w:id="19" w:name="_Toc224073631"/>
       <w:r>
         <w:lastRenderedPageBreak/>
         <w:t>Appendices</w:t>
@@ -9021,7 +9021,7 @@
       <w:pPr>
         <w:pStyle w:val="Heading2"/>
       </w:pPr>
-      <w:bookmarkStart w:id="20" w:name="_Toc224071335"/>
+      <w:bookmarkStart w:id="20" w:name="_Toc224073632"/>
       <w:r>
         <w:t>Ethics Checklist</w:t>
       </w:r>
@@ -9163,7 +9163,7 @@
       <w:pPr>
         <w:pStyle w:val="Heading2"/>
       </w:pPr>
-      <w:bookmarkStart w:id="21" w:name="_Toc224071336"/>
+      <w:bookmarkStart w:id="21" w:name="_Toc224073633"/>
       <w:r>
         <w:lastRenderedPageBreak/>
         <w:t>Project Timeline Gant</w:t>
@@ -9359,7 +9359,7 @@
       <w:pPr>
         <w:pStyle w:val="Heading1"/>
       </w:pPr>
-      <w:bookmarkStart w:id="22" w:name="_Toc224071337"/>
+      <w:bookmarkStart w:id="22" w:name="_Toc224073634"/>
       <w:r>
         <w:lastRenderedPageBreak/>
         <w:t>Methodology</w:t>
@@ -9370,7 +9370,7 @@
       <w:pPr>
         <w:pStyle w:val="Heading2"/>
       </w:pPr>
-      <w:bookmarkStart w:id="23" w:name="_Toc224071338"/>
+      <w:bookmarkStart w:id="23" w:name="_Toc224073635"/>
       <w:r>
         <w:t>Source Control</w:t>
       </w:r>
@@ -9469,7 +9469,7 @@
       <w:pPr>
         <w:pStyle w:val="Heading2"/>
       </w:pPr>
-      <w:bookmarkStart w:id="24" w:name="_Toc224071339"/>
+      <w:bookmarkStart w:id="24" w:name="_Toc224073636"/>
       <w:r>
         <w:t>Prototype Implementation</w:t>
       </w:r>
@@ -9479,7 +9479,7 @@
       <w:pPr>
         <w:pStyle w:val="Heading3"/>
       </w:pPr>
-      <w:bookmarkStart w:id="25" w:name="_Toc224071340"/>
+      <w:bookmarkStart w:id="25" w:name="_Toc224073637"/>
       <w:r>
         <w:t>Usability and Flow</w:t>
       </w:r>
@@ -9616,7 +9616,7 @@
       <w:pPr>
         <w:pStyle w:val="Heading3"/>
       </w:pPr>
-      <w:bookmarkStart w:id="26" w:name="_Toc224071341"/>
+      <w:bookmarkStart w:id="26" w:name="_Toc224073638"/>
       <w:r>
         <w:t xml:space="preserve">Environment Design and </w:t>
       </w:r>
@@ -9812,7 +9812,7 @@
       <w:pPr>
         <w:pStyle w:val="Heading3"/>
       </w:pPr>
-      <w:bookmarkStart w:id="27" w:name="_Toc224071342"/>
+      <w:bookmarkStart w:id="27" w:name="_Toc224073639"/>
       <w:r>
         <w:lastRenderedPageBreak/>
         <w:t>Objective System Implementation</w:t>
@@ -9918,7 +9918,7 @@
       <w:pPr>
         <w:pStyle w:val="Heading3"/>
       </w:pPr>
-      <w:bookmarkStart w:id="28" w:name="_Toc224071343"/>
+      <w:bookmarkStart w:id="28" w:name="_Toc224073640"/>
       <w:r>
         <w:t>User</w:t>
       </w:r>
@@ -10028,7 +10028,7 @@
       <w:pPr>
         <w:pStyle w:val="Heading3"/>
       </w:pPr>
-      <w:bookmarkStart w:id="29" w:name="_Toc224071344"/>
+      <w:bookmarkStart w:id="29" w:name="_Toc224073641"/>
       <w:r>
         <w:t>Objective Based Interact</w:t>
       </w:r>
@@ -10099,7 +10099,7 @@
       <w:pPr>
         <w:pStyle w:val="Heading3"/>
       </w:pPr>
-      <w:bookmarkStart w:id="30" w:name="_Toc224071345"/>
+      <w:bookmarkStart w:id="30" w:name="_Toc224073642"/>
       <w:r>
         <w:lastRenderedPageBreak/>
         <w:t>Post Processing Effects</w:t>
@@ -10264,7 +10264,7 @@
       <w:pPr>
         <w:pStyle w:val="Heading3"/>
       </w:pPr>
-      <w:bookmarkStart w:id="31" w:name="_Toc224071346"/>
+      <w:bookmarkStart w:id="31" w:name="_Toc224073643"/>
       <w:r>
         <w:t>User</w:t>
       </w:r>
@@ -10332,7 +10332,7 @@
       <w:pPr>
         <w:pStyle w:val="Heading2"/>
       </w:pPr>
-      <w:bookmarkStart w:id="32" w:name="_Toc224071347"/>
+      <w:bookmarkStart w:id="32" w:name="_Toc224073644"/>
       <w:r>
         <w:lastRenderedPageBreak/>
         <w:t>Final Version</w:t>
@@ -10346,7 +10346,7 @@
       <w:pPr>
         <w:pStyle w:val="Heading3"/>
       </w:pPr>
-      <w:bookmarkStart w:id="33" w:name="_Toc224071348"/>
+      <w:bookmarkStart w:id="33" w:name="_Toc224073645"/>
       <w:r>
         <w:t>Environment Changes and Visual Modifications</w:t>
       </w:r>
@@ -10373,7 +10373,7 @@
       <w:pPr>
         <w:pStyle w:val="Heading3"/>
       </w:pPr>
-      <w:bookmarkStart w:id="34" w:name="_Toc224071349"/>
+      <w:bookmarkStart w:id="34" w:name="_Toc224073646"/>
       <w:r>
         <w:t>Interaction Improvements</w:t>
       </w:r>
@@ -10468,7 +10468,7 @@
       <w:pPr>
         <w:pStyle w:val="Heading3"/>
       </w:pPr>
-      <w:bookmarkStart w:id="35" w:name="_Toc224071350"/>
+      <w:bookmarkStart w:id="35" w:name="_Toc224073647"/>
       <w:r>
         <w:t>Flow Tweaks</w:t>
       </w:r>
@@ -10558,7 +10558,7 @@
       <w:pPr>
         <w:pStyle w:val="Heading3"/>
       </w:pPr>
-      <w:bookmarkStart w:id="36" w:name="_Toc224071351"/>
+      <w:bookmarkStart w:id="36" w:name="_Toc224073648"/>
       <w:r>
         <w:t>Gaze Detection Refinements</w:t>
       </w:r>
@@ -10699,7 +10699,7 @@
       <w:pPr>
         <w:pStyle w:val="Heading1"/>
       </w:pPr>
-      <w:bookmarkStart w:id="37" w:name="_Toc224071352"/>
+      <w:bookmarkStart w:id="37" w:name="_Toc224073649"/>
       <w:r>
         <w:lastRenderedPageBreak/>
         <w:t>Results</w:t>
@@ -10710,7 +10710,7 @@
       <w:pPr>
         <w:pStyle w:val="Heading2"/>
       </w:pPr>
-      <w:bookmarkStart w:id="38" w:name="_Toc224071353"/>
+      <w:bookmarkStart w:id="38" w:name="_Toc224073650"/>
       <w:r>
         <w:t>Prototype Tests</w:t>
       </w:r>
@@ -10751,10 +10751,7 @@
         <w:t>2002)</w:t>
       </w:r>
       <w:r>
-        <w:t xml:space="preserve"> user testing is commonly used</w:t>
-      </w:r>
-      <w:r>
-        <w:t xml:space="preserve"> to identify usability issues </w:t>
+        <w:t xml:space="preserve"> user testing is commonly used to identify usability issues </w:t>
       </w:r>
       <w:r>
         <w:t xml:space="preserve">within </w:t>
@@ -10851,7 +10848,7 @@
       <w:pPr>
         <w:pStyle w:val="Heading3"/>
       </w:pPr>
-      <w:bookmarkStart w:id="39" w:name="_Toc224071354"/>
+      <w:bookmarkStart w:id="39" w:name="_Toc224073651"/>
       <w:r>
         <w:t>Interaction</w:t>
       </w:r>
@@ -11012,7 +11009,7 @@
       <w:pPr>
         <w:pStyle w:val="Heading3"/>
       </w:pPr>
-      <w:bookmarkStart w:id="40" w:name="_Toc224071355"/>
+      <w:bookmarkStart w:id="40" w:name="_Toc224073652"/>
       <w:r>
         <w:t>User Attention Detection</w:t>
       </w:r>
@@ -11072,7 +11069,7 @@
       <w:pPr>
         <w:pStyle w:val="Heading3"/>
       </w:pPr>
-      <w:bookmarkStart w:id="41" w:name="_Toc224071356"/>
+      <w:bookmarkStart w:id="41" w:name="_Toc224073653"/>
       <w:r>
         <w:lastRenderedPageBreak/>
         <w:t>Symptom Simulations</w:t>
@@ -11211,7 +11208,7 @@
       <w:pPr>
         <w:pStyle w:val="Heading3"/>
       </w:pPr>
-      <w:bookmarkStart w:id="42" w:name="_Toc224071357"/>
+      <w:bookmarkStart w:id="42" w:name="_Toc224073654"/>
       <w:r>
         <w:t xml:space="preserve">Improvements to be </w:t>
       </w:r>
@@ -11261,7 +11258,7 @@
       <w:pPr>
         <w:pStyle w:val="Heading2"/>
       </w:pPr>
-      <w:bookmarkStart w:id="43" w:name="_Toc224071358"/>
+      <w:bookmarkStart w:id="43" w:name="_Toc224073655"/>
       <w:r>
         <w:lastRenderedPageBreak/>
         <w:t>Final Version Tests</w:t>
@@ -11384,7 +11381,7 @@
       <w:pPr>
         <w:pStyle w:val="Heading3"/>
       </w:pPr>
-      <w:bookmarkStart w:id="44" w:name="_Toc224071359"/>
+      <w:bookmarkStart w:id="44" w:name="_Toc224073656"/>
       <w:r>
         <w:t>Interaction Objects and Objective Understanding</w:t>
       </w:r>
@@ -11438,7 +11435,7 @@
       <w:pPr>
         <w:pStyle w:val="Heading3"/>
       </w:pPr>
-      <w:bookmarkStart w:id="45" w:name="_Toc224071360"/>
+      <w:bookmarkStart w:id="45" w:name="_Toc224073657"/>
       <w:r>
         <w:t>User Attention Detection</w:t>
       </w:r>
@@ -11501,7 +11498,7 @@
       <w:pPr>
         <w:pStyle w:val="Heading3"/>
       </w:pPr>
-      <w:bookmarkStart w:id="46" w:name="_Toc224071361"/>
+      <w:bookmarkStart w:id="46" w:name="_Toc224073658"/>
       <w:r>
         <w:t>Symptom Simulation</w:t>
       </w:r>
@@ -11544,7 +11541,7 @@
       <w:pPr>
         <w:pStyle w:val="Heading1"/>
       </w:pPr>
-      <w:bookmarkStart w:id="47" w:name="_Toc224071362"/>
+      <w:bookmarkStart w:id="47" w:name="_Toc224073659"/>
       <w:r>
         <w:lastRenderedPageBreak/>
         <w:t>Critical Evaluation</w:t>
@@ -11564,41 +11561,262 @@
         <w:t>Project Evaluation</w:t>
       </w:r>
     </w:p>
-    <w:p/>
+    <w:p>
+      <w:pPr>
+        <w:pStyle w:val="ListParagraph"/>
+        <w:numPr>
+          <w:ilvl w:val="0"/>
+          <w:numId w:val="14"/>
+        </w:numPr>
+      </w:pPr>
+      <w:r>
+        <w:t>Intro paragraph, discuss there were good and bads, highs and lows.</w:t>
+      </w:r>
+    </w:p>
     <w:p>
       <w:r>
         <w:t>Strengths</w:t>
       </w:r>
     </w:p>
-    <w:p/>
+    <w:p>
+      <w:pPr>
+        <w:pStyle w:val="ListParagraph"/>
+        <w:numPr>
+          <w:ilvl w:val="0"/>
+          <w:numId w:val="13"/>
+        </w:numPr>
+      </w:pPr>
+      <w:r>
+        <w:t>Effectively demonstrated eye strain symptoms in VR</w:t>
+      </w:r>
+    </w:p>
+    <w:p>
+      <w:pPr>
+        <w:pStyle w:val="ListParagraph"/>
+        <w:numPr>
+          <w:ilvl w:val="0"/>
+          <w:numId w:val="13"/>
+        </w:numPr>
+      </w:pPr>
+      <w:r>
+        <w:t>Objective based progression gamified the experience, increased interactivity</w:t>
+      </w:r>
+    </w:p>
+    <w:p>
+      <w:pPr>
+        <w:pStyle w:val="ListParagraph"/>
+        <w:numPr>
+          <w:ilvl w:val="0"/>
+          <w:numId w:val="13"/>
+        </w:numPr>
+      </w:pPr>
+      <w:r>
+        <w:t>Gaze interaction was an intuitive control method that didn’t need down time to be taught to be understood</w:t>
+      </w:r>
+    </w:p>
+    <w:p>
+      <w:pPr>
+        <w:pStyle w:val="ListParagraph"/>
+        <w:numPr>
+          <w:ilvl w:val="0"/>
+          <w:numId w:val="13"/>
+        </w:numPr>
+      </w:pPr>
+      <w:r>
+        <w:t>Using iterative testing improved usability</w:t>
+      </w:r>
+    </w:p>
     <w:p>
       <w:r>
         <w:t>Weaknesses</w:t>
       </w:r>
     </w:p>
-    <w:p/>
+    <w:p>
+      <w:pPr>
+        <w:pStyle w:val="ListParagraph"/>
+        <w:numPr>
+          <w:ilvl w:val="0"/>
+          <w:numId w:val="13"/>
+        </w:numPr>
+      </w:pPr>
+      <w:r>
+        <w:t>Small number and limited diversity of testers</w:t>
+      </w:r>
+    </w:p>
+    <w:p>
+      <w:pPr>
+        <w:pStyle w:val="ListParagraph"/>
+        <w:numPr>
+          <w:ilvl w:val="0"/>
+          <w:numId w:val="13"/>
+        </w:numPr>
+      </w:pPr>
+      <w:r>
+        <w:t>Only visual symptoms have been simulated, not the physiological feeling with those symptoms or physical ones</w:t>
+      </w:r>
+    </w:p>
+    <w:p>
+      <w:pPr>
+        <w:pStyle w:val="ListParagraph"/>
+        <w:numPr>
+          <w:ilvl w:val="0"/>
+          <w:numId w:val="13"/>
+        </w:numPr>
+      </w:pPr>
+      <w:r>
+        <w:t>Limited amount of interaction, gaze detection and turning a switch on and off, can be restrictive in certain perspectives</w:t>
+      </w:r>
+    </w:p>
+    <w:p>
+      <w:pPr>
+        <w:pStyle w:val="ListParagraph"/>
+        <w:numPr>
+          <w:ilvl w:val="0"/>
+          <w:numId w:val="13"/>
+        </w:numPr>
+      </w:pPr>
+      <w:r>
+        <w:t>No accessibility settings to accommodate different user groups</w:t>
+      </w:r>
+    </w:p>
     <w:p>
       <w:r>
         <w:t>Technical Challenges</w:t>
       </w:r>
     </w:p>
-    <w:p/>
-    <w:p>
-      <w:r>
-        <w:t>Limiting and External fact</w:t>
-      </w:r>
-      <w:r>
-        <w:t>ors</w:t>
-      </w:r>
-      <w:r>
-        <w:br w:type="page"/>
+    <w:p>
+      <w:pPr>
+        <w:pStyle w:val="ListParagraph"/>
+        <w:numPr>
+          <w:ilvl w:val="0"/>
+          <w:numId w:val="13"/>
+        </w:numPr>
+      </w:pPr>
+      <w:r>
+        <w:t>Learning curve for VR development within Unreal Engine, brief experience with VR in Unity however there were still gaps in areas of my knowledge within Unreal Engine and VR development.</w:t>
+      </w:r>
+    </w:p>
+    <w:p>
+      <w:pPr>
+        <w:pStyle w:val="ListParagraph"/>
+        <w:numPr>
+          <w:ilvl w:val="0"/>
+          <w:numId w:val="13"/>
+        </w:numPr>
+      </w:pPr>
+      <w:r>
+        <w:t>Balancing symptom simulation intensities so it could be appropriate to convey the message without causing harm to users.</w:t>
+      </w:r>
+    </w:p>
+    <w:p>
+      <w:pPr>
+        <w:pStyle w:val="ListParagraph"/>
+        <w:numPr>
+          <w:ilvl w:val="0"/>
+          <w:numId w:val="13"/>
+        </w:numPr>
+      </w:pPr>
+      <w:r>
+        <w:t>Diegetic UI implementation in the scene so that it didn’t just feel like a game on a screen.</w:t>
+      </w:r>
+    </w:p>
+    <w:p>
+      <w:pPr>
+        <w:pStyle w:val="ListParagraph"/>
+        <w:numPr>
+          <w:ilvl w:val="0"/>
+          <w:numId w:val="13"/>
+        </w:numPr>
+      </w:pPr>
+      <w:r>
+        <w:t>Lack of tutorials specific to what I was trying to implement meant a lot of trial and error.</w:t>
+      </w:r>
+    </w:p>
+    <w:p>
+      <w:r>
+        <w:t xml:space="preserve">Limiting </w:t>
+      </w:r>
+      <w:r>
+        <w:t xml:space="preserve">and </w:t>
+      </w:r>
+      <w:r>
+        <w:t>External factors</w:t>
+      </w:r>
+    </w:p>
+    <w:p>
+      <w:pPr>
+        <w:pStyle w:val="ListParagraph"/>
+        <w:numPr>
+          <w:ilvl w:val="0"/>
+          <w:numId w:val="13"/>
+        </w:numPr>
+      </w:pPr>
+      <w:r>
+        <w:t>A user’s</w:t>
+      </w:r>
+      <w:r>
+        <w:t xml:space="preserve"> </w:t>
+      </w:r>
+      <w:r>
+        <w:t>prior experience with VR</w:t>
+      </w:r>
+      <w:r>
+        <w:t xml:space="preserve"> could affect how easily they could understand the controls, so had to be simplified to an intuitive control and then a trigger control with the switch.</w:t>
+      </w:r>
+    </w:p>
+    <w:p>
+      <w:pPr>
+        <w:pStyle w:val="ListParagraph"/>
+        <w:numPr>
+          <w:ilvl w:val="0"/>
+          <w:numId w:val="13"/>
+        </w:numPr>
+      </w:pPr>
+      <w:r>
+        <w:t>Lack of testers and range of testers (technical and non technical)</w:t>
+      </w:r>
+    </w:p>
+    <w:p>
+      <w:pPr>
+        <w:pStyle w:val="ListParagraph"/>
+        <w:numPr>
+          <w:ilvl w:val="0"/>
+          <w:numId w:val="13"/>
+        </w:numPr>
+      </w:pPr>
+      <w:r>
+        <w:t>External life factors that were out of my control impacted the time that was able to be spent on this project, found ways around it but was still unfortunate to lose time I originally thought I had on this project.</w:t>
+      </w:r>
+    </w:p>
+    <w:p>
+      <w:pPr>
+        <w:pStyle w:val="ListParagraph"/>
+        <w:numPr>
+          <w:ilvl w:val="0"/>
+          <w:numId w:val="13"/>
+        </w:numPr>
+      </w:pPr>
+      <w:r>
+        <w:t>Lack of diverse hardware to test on, worked off a meta quest 3 so other devices have not been tested with the experience</w:t>
+      </w:r>
+    </w:p>
+    <w:p>
+      <w:pPr>
+        <w:pStyle w:val="ListParagraph"/>
+        <w:numPr>
+          <w:ilvl w:val="0"/>
+          <w:numId w:val="13"/>
+        </w:numPr>
+      </w:pPr>
+      <w:r>
+        <w:t>Eye strain symptoms vary between individuals and VR use is different for everyone so some users could find the experience too intense with the current settings</w:t>
       </w:r>
     </w:p>
     <w:p>
       <w:pPr>
         <w:pStyle w:val="Heading1"/>
       </w:pPr>
-      <w:bookmarkStart w:id="48" w:name="_Toc224071363"/>
+      <w:bookmarkStart w:id="48" w:name="_Toc224073660"/>
       <w:r>
         <w:lastRenderedPageBreak/>
         <w:t>Conclusions and Future Work</w:t>
@@ -11609,18 +11827,77 @@
       <w:pPr>
         <w:pStyle w:val="Heading2"/>
       </w:pPr>
-      <w:bookmarkStart w:id="49" w:name="_Toc224071364"/>
+      <w:bookmarkStart w:id="49" w:name="_Toc224073661"/>
       <w:r>
         <w:t>Conclusion</w:t>
       </w:r>
       <w:bookmarkEnd w:id="49"/>
     </w:p>
-    <w:p/>
+    <w:p>
+      <w:pPr>
+        <w:pStyle w:val="ListParagraph"/>
+        <w:numPr>
+          <w:ilvl w:val="0"/>
+          <w:numId w:val="13"/>
+        </w:numPr>
+      </w:pPr>
+      <w:r>
+        <w:t>VR experience to raise awareness of DES</w:t>
+      </w:r>
+    </w:p>
+    <w:p>
+      <w:pPr>
+        <w:pStyle w:val="ListParagraph"/>
+        <w:numPr>
+          <w:ilvl w:val="0"/>
+          <w:numId w:val="13"/>
+        </w:numPr>
+      </w:pPr>
+      <w:r>
+        <w:t>Implemented an objective based interactive experience</w:t>
+      </w:r>
+    </w:p>
+    <w:p>
+      <w:pPr>
+        <w:pStyle w:val="ListParagraph"/>
+        <w:numPr>
+          <w:ilvl w:val="0"/>
+          <w:numId w:val="13"/>
+        </w:numPr>
+      </w:pPr>
+      <w:r>
+        <w:t>It simulated symptoms by adjusting post processing effects within the post processing component of the camera.</w:t>
+      </w:r>
+    </w:p>
+    <w:p>
+      <w:pPr>
+        <w:pStyle w:val="ListParagraph"/>
+        <w:numPr>
+          <w:ilvl w:val="0"/>
+          <w:numId w:val="13"/>
+        </w:numPr>
+      </w:pPr>
+      <w:r>
+        <w:t>User testing phases helped with exponential growth of the experience to tackle areas that could have gone unchecked if deployed without any user testing feedback</w:t>
+      </w:r>
+    </w:p>
+    <w:p>
+      <w:pPr>
+        <w:pStyle w:val="ListParagraph"/>
+        <w:numPr>
+          <w:ilvl w:val="0"/>
+          <w:numId w:val="13"/>
+        </w:numPr>
+      </w:pPr>
+      <w:r>
+        <w:t>Overall, demonstrated effective symptom simulations, had a high user engagement and achieved the aims and objectives set out at the start of this project.</w:t>
+      </w:r>
+    </w:p>
     <w:p>
       <w:pPr>
         <w:pStyle w:val="Heading2"/>
       </w:pPr>
-      <w:bookmarkStart w:id="50" w:name="_Toc224071365"/>
+      <w:bookmarkStart w:id="50" w:name="_Toc224073662"/>
       <w:r>
         <w:t>Future Work</w:t>
       </w:r>
@@ -11697,6 +11974,45 @@
       <w:r>
         <w:t>Possibly adding eye tracking</w:t>
       </w:r>
+    </w:p>
+    <w:p>
+      <w:pPr>
+        <w:pStyle w:val="ListParagraph"/>
+        <w:numPr>
+          <w:ilvl w:val="0"/>
+          <w:numId w:val="11"/>
+        </w:numPr>
+      </w:pPr>
+      <w:r>
+        <w:t>Accessibility settings to accommodate different users, increase or decrease intensity of effects, other accessibility stuff</w:t>
+      </w:r>
+    </w:p>
+    <w:p>
+      <w:pPr>
+        <w:pStyle w:val="ListParagraph"/>
+        <w:numPr>
+          <w:ilvl w:val="0"/>
+          <w:numId w:val="11"/>
+        </w:numPr>
+      </w:pPr>
+      <w:r>
+        <w:t>Different environments for different users (classrooms, computer labs, gaming desk setups, workplace meetings</w:t>
+      </w:r>
+      <w:r>
+        <w:t>)</w:t>
+      </w:r>
+    </w:p>
+    <w:p>
+      <w:pPr>
+        <w:pStyle w:val="ListParagraph"/>
+        <w:numPr>
+          <w:ilvl w:val="0"/>
+          <w:numId w:val="11"/>
+        </w:numPr>
+      </w:pPr>
+      <w:r>
+        <w:t>Make the interaction with the light switch intuitive, have it where the button is flat, the user has collision within their hand or finger controller component and uses that to push the button which would turn the light switch on and off.</w:t>
+      </w:r>
       <w:r>
         <w:br w:type="page"/>
       </w:r>
@@ -11705,7 +12021,7 @@
       <w:pPr>
         <w:pStyle w:val="Heading1"/>
       </w:pPr>
-      <w:bookmarkStart w:id="51" w:name="_Toc224071366"/>
+      <w:bookmarkStart w:id="51" w:name="_Toc224073663"/>
       <w:r>
         <w:lastRenderedPageBreak/>
         <w:t>References</w:t>
@@ -12285,7 +12601,7 @@
       <w:pPr>
         <w:pStyle w:val="Heading1"/>
       </w:pPr>
-      <w:bookmarkStart w:id="52" w:name="_Toc224071367"/>
+      <w:bookmarkStart w:id="52" w:name="_Toc224073664"/>
       <w:r>
         <w:lastRenderedPageBreak/>
         <w:t>Appendix</w:t>
@@ -12296,7 +12612,7 @@
       <w:pPr>
         <w:pStyle w:val="Heading2"/>
       </w:pPr>
-      <w:bookmarkStart w:id="53" w:name="_Toc224071368"/>
+      <w:bookmarkStart w:id="53" w:name="_Toc224073665"/>
       <w:r>
         <w:t>Asset Licenses and Sources</w:t>
       </w:r>
@@ -12306,7 +12622,7 @@
       <w:pPr>
         <w:pStyle w:val="Heading3"/>
       </w:pPr>
-      <w:bookmarkStart w:id="54" w:name="_Toc224071369"/>
+      <w:bookmarkStart w:id="54" w:name="_Toc224073666"/>
       <w:r>
         <w:t>Modern Office Table</w:t>
       </w:r>
@@ -12390,7 +12706,7 @@
       <w:pPr>
         <w:pStyle w:val="Heading3"/>
       </w:pPr>
-      <w:bookmarkStart w:id="55" w:name="_Toc224071370"/>
+      <w:bookmarkStart w:id="55" w:name="_Toc224073667"/>
       <w:r>
         <w:t>Free Studio Starter Pack</w:t>
       </w:r>
@@ -12474,7 +12790,7 @@
       <w:pPr>
         <w:pStyle w:val="Heading3"/>
       </w:pPr>
-      <w:bookmarkStart w:id="56" w:name="_Toc224071371"/>
+      <w:bookmarkStart w:id="56" w:name="_Toc224073668"/>
       <w:r>
         <w:t>General Desktop Bundle</w:t>
       </w:r>
@@ -12558,7 +12874,7 @@
       <w:pPr>
         <w:pStyle w:val="Heading3"/>
       </w:pPr>
-      <w:bookmarkStart w:id="57" w:name="_Toc224071372"/>
+      <w:bookmarkStart w:id="57" w:name="_Toc224073669"/>
       <w:r>
         <w:lastRenderedPageBreak/>
         <w:t>General Gaming Headset</w:t>
@@ -12643,7 +12959,7 @@
       <w:pPr>
         <w:pStyle w:val="Heading3"/>
       </w:pPr>
-      <w:bookmarkStart w:id="58" w:name="_Toc224071373"/>
+      <w:bookmarkStart w:id="58" w:name="_Toc224073670"/>
       <w:r>
         <w:t>General Gaming Chair</w:t>
       </w:r>
@@ -12727,7 +13043,7 @@
       <w:pPr>
         <w:pStyle w:val="Heading3"/>
       </w:pPr>
-      <w:bookmarkStart w:id="59" w:name="_Toc224071374"/>
+      <w:bookmarkStart w:id="59" w:name="_Toc224073671"/>
       <w:r>
         <w:t>Light Switch</w:t>
       </w:r>
@@ -12825,7 +13141,7 @@
       <w:pPr>
         <w:pStyle w:val="Heading3"/>
       </w:pPr>
-      <w:bookmarkStart w:id="60" w:name="_Toc224071375"/>
+      <w:bookmarkStart w:id="60" w:name="_Toc224073672"/>
       <w:r>
         <w:lastRenderedPageBreak/>
         <w:t>Materials for General PC setup</w:t>
@@ -12955,7 +13271,7 @@
       <w:pPr>
         <w:pStyle w:val="Heading3"/>
       </w:pPr>
-      <w:bookmarkStart w:id="61" w:name="_Toc224071376"/>
+      <w:bookmarkStart w:id="61" w:name="_Toc224073673"/>
       <w:r>
         <w:lastRenderedPageBreak/>
         <w:t>Monitor background image</w:t>
@@ -13051,7 +13367,7 @@
       <w:pPr>
         <w:pStyle w:val="Heading3"/>
       </w:pPr>
-      <w:bookmarkStart w:id="62" w:name="_Toc224071377"/>
+      <w:bookmarkStart w:id="62" w:name="_Toc224073674"/>
       <w:r>
         <w:lastRenderedPageBreak/>
         <w:t>Button Hover Sfx by Fachii</w:t>
@@ -13151,7 +13467,7 @@
     </w:p>
     <w:p/>
     <w:p>
-      <w:bookmarkStart w:id="63" w:name="_Toc224071378"/>
+      <w:bookmarkStart w:id="63" w:name="_Toc224073675"/>
       <w:r>
         <w:rPr>
           <w:rStyle w:val="Heading3Char"/>
@@ -13264,7 +13580,7 @@
       <w:pPr>
         <w:pStyle w:val="Heading3"/>
       </w:pPr>
-      <w:bookmarkStart w:id="64" w:name="_Toc224071379"/>
+      <w:bookmarkStart w:id="64" w:name="_Toc224073676"/>
       <w:r>
         <w:lastRenderedPageBreak/>
         <w:t>Light Switch On Sfx</w:t>
@@ -13359,7 +13675,7 @@
       <w:pPr>
         <w:pStyle w:val="Heading3"/>
       </w:pPr>
-      <w:bookmarkStart w:id="65" w:name="_Toc224071380"/>
+      <w:bookmarkStart w:id="65" w:name="_Toc224073677"/>
       <w:r>
         <w:t>Light Switch Off Sfx</w:t>
       </w:r>
@@ -14700,6 +15016,230 @@
     </w:lvl>
   </w:abstractNum>
   <w:abstractNum w:abstractNumId="11" w15:restartNumberingAfterBreak="0">
+    <w:nsid w:val="669369F6"/>
+    <w:multiLevelType w:val="hybridMultilevel"/>
+    <w:tmpl w:val="51FEF034"/>
+    <w:lvl w:ilvl="0" w:tplc="8C760C26">
+      <w:numFmt w:val="bullet"/>
+      <w:lvlText w:val="-"/>
+      <w:lvlJc w:val="left"/>
+      <w:pPr>
+        <w:ind w:left="720" w:hanging="360"/>
+      </w:pPr>
+      <w:rPr>
+        <w:rFonts w:ascii="Aptos" w:eastAsiaTheme="minorHAnsi" w:hAnsi="Aptos" w:cstheme="minorBidi" w:hint="default"/>
+      </w:rPr>
+    </w:lvl>
+    <w:lvl w:ilvl="1" w:tplc="08090003" w:tentative="1">
+      <w:start w:val="1"/>
+      <w:numFmt w:val="bullet"/>
+      <w:lvlText w:val="o"/>
+      <w:lvlJc w:val="left"/>
+      <w:pPr>
+        <w:ind w:left="1440" w:hanging="360"/>
+      </w:pPr>
+      <w:rPr>
+        <w:rFonts w:ascii="Courier New" w:hAnsi="Courier New" w:cs="Courier New" w:hint="default"/>
+      </w:rPr>
+    </w:lvl>
+    <w:lvl w:ilvl="2" w:tplc="08090005" w:tentative="1">
+      <w:start w:val="1"/>
+      <w:numFmt w:val="bullet"/>
+      <w:lvlText w:val=""/>
+      <w:lvlJc w:val="left"/>
+      <w:pPr>
+        <w:ind w:left="2160" w:hanging="360"/>
+      </w:pPr>
+      <w:rPr>
+        <w:rFonts w:ascii="Wingdings" w:hAnsi="Wingdings" w:hint="default"/>
+      </w:rPr>
+    </w:lvl>
+    <w:lvl w:ilvl="3" w:tplc="08090001" w:tentative="1">
+      <w:start w:val="1"/>
+      <w:numFmt w:val="bullet"/>
+      <w:lvlText w:val=""/>
+      <w:lvlJc w:val="left"/>
+      <w:pPr>
+        <w:ind w:left="2880" w:hanging="360"/>
+      </w:pPr>
+      <w:rPr>
+        <w:rFonts w:ascii="Symbol" w:hAnsi="Symbol" w:hint="default"/>
+      </w:rPr>
+    </w:lvl>
+    <w:lvl w:ilvl="4" w:tplc="08090003" w:tentative="1">
+      <w:start w:val="1"/>
+      <w:numFmt w:val="bullet"/>
+      <w:lvlText w:val="o"/>
+      <w:lvlJc w:val="left"/>
+      <w:pPr>
+        <w:ind w:left="3600" w:hanging="360"/>
+      </w:pPr>
+      <w:rPr>
+        <w:rFonts w:ascii="Courier New" w:hAnsi="Courier New" w:cs="Courier New" w:hint="default"/>
+      </w:rPr>
+    </w:lvl>
+    <w:lvl w:ilvl="5" w:tplc="08090005" w:tentative="1">
+      <w:start w:val="1"/>
+      <w:numFmt w:val="bullet"/>
+      <w:lvlText w:val=""/>
+      <w:lvlJc w:val="left"/>
+      <w:pPr>
+        <w:ind w:left="4320" w:hanging="360"/>
+      </w:pPr>
+      <w:rPr>
+        <w:rFonts w:ascii="Wingdings" w:hAnsi="Wingdings" w:hint="default"/>
+      </w:rPr>
+    </w:lvl>
+    <w:lvl w:ilvl="6" w:tplc="08090001" w:tentative="1">
+      <w:start w:val="1"/>
+      <w:numFmt w:val="bullet"/>
+      <w:lvlText w:val=""/>
+      <w:lvlJc w:val="left"/>
+      <w:pPr>
+        <w:ind w:left="5040" w:hanging="360"/>
+      </w:pPr>
+      <w:rPr>
+        <w:rFonts w:ascii="Symbol" w:hAnsi="Symbol" w:hint="default"/>
+      </w:rPr>
+    </w:lvl>
+    <w:lvl w:ilvl="7" w:tplc="08090003" w:tentative="1">
+      <w:start w:val="1"/>
+      <w:numFmt w:val="bullet"/>
+      <w:lvlText w:val="o"/>
+      <w:lvlJc w:val="left"/>
+      <w:pPr>
+        <w:ind w:left="5760" w:hanging="360"/>
+      </w:pPr>
+      <w:rPr>
+        <w:rFonts w:ascii="Courier New" w:hAnsi="Courier New" w:cs="Courier New" w:hint="default"/>
+      </w:rPr>
+    </w:lvl>
+    <w:lvl w:ilvl="8" w:tplc="08090005" w:tentative="1">
+      <w:start w:val="1"/>
+      <w:numFmt w:val="bullet"/>
+      <w:lvlText w:val=""/>
+      <w:lvlJc w:val="left"/>
+      <w:pPr>
+        <w:ind w:left="6480" w:hanging="360"/>
+      </w:pPr>
+      <w:rPr>
+        <w:rFonts w:ascii="Wingdings" w:hAnsi="Wingdings" w:hint="default"/>
+      </w:rPr>
+    </w:lvl>
+  </w:abstractNum>
+  <w:abstractNum w:abstractNumId="12" w15:restartNumberingAfterBreak="0">
+    <w:nsid w:val="6A661DBA"/>
+    <w:multiLevelType w:val="hybridMultilevel"/>
+    <w:tmpl w:val="7ABE6DF8"/>
+    <w:lvl w:ilvl="0" w:tplc="A596E0E6">
+      <w:numFmt w:val="bullet"/>
+      <w:lvlText w:val="-"/>
+      <w:lvlJc w:val="left"/>
+      <w:pPr>
+        <w:ind w:left="720" w:hanging="360"/>
+      </w:pPr>
+      <w:rPr>
+        <w:rFonts w:ascii="Aptos" w:eastAsiaTheme="minorHAnsi" w:hAnsi="Aptos" w:cstheme="minorBidi" w:hint="default"/>
+      </w:rPr>
+    </w:lvl>
+    <w:lvl w:ilvl="1" w:tplc="08090003" w:tentative="1">
+      <w:start w:val="1"/>
+      <w:numFmt w:val="bullet"/>
+      <w:lvlText w:val="o"/>
+      <w:lvlJc w:val="left"/>
+      <w:pPr>
+        <w:ind w:left="1440" w:hanging="360"/>
+      </w:pPr>
+      <w:rPr>
+        <w:rFonts w:ascii="Courier New" w:hAnsi="Courier New" w:cs="Courier New" w:hint="default"/>
+      </w:rPr>
+    </w:lvl>
+    <w:lvl w:ilvl="2" w:tplc="08090005" w:tentative="1">
+      <w:start w:val="1"/>
+      <w:numFmt w:val="bullet"/>
+      <w:lvlText w:val=""/>
+      <w:lvlJc w:val="left"/>
+      <w:pPr>
+        <w:ind w:left="2160" w:hanging="360"/>
+      </w:pPr>
+      <w:rPr>
+        <w:rFonts w:ascii="Wingdings" w:hAnsi="Wingdings" w:hint="default"/>
+      </w:rPr>
+    </w:lvl>
+    <w:lvl w:ilvl="3" w:tplc="08090001" w:tentative="1">
+      <w:start w:val="1"/>
+      <w:numFmt w:val="bullet"/>
+      <w:lvlText w:val=""/>
+      <w:lvlJc w:val="left"/>
+      <w:pPr>
+        <w:ind w:left="2880" w:hanging="360"/>
+      </w:pPr>
+      <w:rPr>
+        <w:rFonts w:ascii="Symbol" w:hAnsi="Symbol" w:hint="default"/>
+      </w:rPr>
+    </w:lvl>
+    <w:lvl w:ilvl="4" w:tplc="08090003" w:tentative="1">
+      <w:start w:val="1"/>
+      <w:numFmt w:val="bullet"/>
+      <w:lvlText w:val="o"/>
+      <w:lvlJc w:val="left"/>
+      <w:pPr>
+        <w:ind w:left="3600" w:hanging="360"/>
+      </w:pPr>
+      <w:rPr>
+        <w:rFonts w:ascii="Courier New" w:hAnsi="Courier New" w:cs="Courier New" w:hint="default"/>
+      </w:rPr>
+    </w:lvl>
+    <w:lvl w:ilvl="5" w:tplc="08090005" w:tentative="1">
+      <w:start w:val="1"/>
+      <w:numFmt w:val="bullet"/>
+      <w:lvlText w:val=""/>
+      <w:lvlJc w:val="left"/>
+      <w:pPr>
+        <w:ind w:left="4320" w:hanging="360"/>
+      </w:pPr>
+      <w:rPr>
+        <w:rFonts w:ascii="Wingdings" w:hAnsi="Wingdings" w:hint="default"/>
+      </w:rPr>
+    </w:lvl>
+    <w:lvl w:ilvl="6" w:tplc="08090001" w:tentative="1">
+      <w:start w:val="1"/>
+      <w:numFmt w:val="bullet"/>
+      <w:lvlText w:val=""/>
+      <w:lvlJc w:val="left"/>
+      <w:pPr>
+        <w:ind w:left="5040" w:hanging="360"/>
+      </w:pPr>
+      <w:rPr>
+        <w:rFonts w:ascii="Symbol" w:hAnsi="Symbol" w:hint="default"/>
+      </w:rPr>
+    </w:lvl>
+    <w:lvl w:ilvl="7" w:tplc="08090003" w:tentative="1">
+      <w:start w:val="1"/>
+      <w:numFmt w:val="bullet"/>
+      <w:lvlText w:val="o"/>
+      <w:lvlJc w:val="left"/>
+      <w:pPr>
+        <w:ind w:left="5760" w:hanging="360"/>
+      </w:pPr>
+      <w:rPr>
+        <w:rFonts w:ascii="Courier New" w:hAnsi="Courier New" w:cs="Courier New" w:hint="default"/>
+      </w:rPr>
+    </w:lvl>
+    <w:lvl w:ilvl="8" w:tplc="08090005" w:tentative="1">
+      <w:start w:val="1"/>
+      <w:numFmt w:val="bullet"/>
+      <w:lvlText w:val=""/>
+      <w:lvlJc w:val="left"/>
+      <w:pPr>
+        <w:ind w:left="6480" w:hanging="360"/>
+      </w:pPr>
+      <w:rPr>
+        <w:rFonts w:ascii="Wingdings" w:hAnsi="Wingdings" w:hint="default"/>
+      </w:rPr>
+    </w:lvl>
+  </w:abstractNum>
+  <w:abstractNum w:abstractNumId="13" w15:restartNumberingAfterBreak="0">
     <w:nsid w:val="7EB9593C"/>
     <w:multiLevelType w:val="hybridMultilevel"/>
     <w:tmpl w:val="2AC89758"/>
@@ -14810,7 +15350,7 @@
     <w:abstractNumId w:val="3"/>
   </w:num>
   <w:num w:numId="8" w16cid:durableId="421604762">
-    <w:abstractNumId w:val="11"/>
+    <w:abstractNumId w:val="13"/>
   </w:num>
   <w:num w:numId="9" w16cid:durableId="1404716916">
     <w:abstractNumId w:val="2"/>
@@ -14823,6 +15363,12 @@
   </w:num>
   <w:num w:numId="12" w16cid:durableId="144246511">
     <w:abstractNumId w:val="7"/>
+  </w:num>
+  <w:num w:numId="13" w16cid:durableId="1206025329">
+    <w:abstractNumId w:val="11"/>
+  </w:num>
+  <w:num w:numId="14" w16cid:durableId="1129400246">
+    <w:abstractNumId w:val="12"/>
   </w:num>
 </w:numbering>
 </file>
@@ -15429,6 +15975,7 @@
   <w:style w:type="character" w:default="1" w:styleId="DefaultParagraphFont">
     <w:name w:val="Default Paragraph Font"/>
     <w:uiPriority w:val="1"/>
+    <w:semiHidden/>
     <w:unhideWhenUsed/>
   </w:style>
   <w:style w:type="table" w:default="1" w:styleId="TableNormal">

</xml_diff>

<commit_message>
Organised sections for critical evaluation, conclusion and future work
</commit_message>
<xml_diff>
--- a/30077548Thesis.docx
+++ b/30077548Thesis.docx
@@ -236,7 +236,7 @@
           <w:r>
             <w:fldChar w:fldCharType="separate"/>
           </w:r>
-          <w:hyperlink w:anchor="_Toc224073612" w:history="1">
+          <w:hyperlink w:anchor="_Toc224125418" w:history="1">
             <w:r>
               <w:rPr>
                 <w:rStyle w:val="Hyperlink"/>
@@ -263,7 +263,7 @@
                 <w:noProof/>
                 <w:webHidden/>
               </w:rPr>
-              <w:instrText xml:space="preserve"> PAGEREF _Toc224073612 \h </w:instrText>
+              <w:instrText xml:space="preserve"> PAGEREF _Toc224125418 \h </w:instrText>
             </w:r>
             <w:r>
               <w:rPr>
@@ -308,7 +308,7 @@
               <w:lang w:eastAsia="en-GB"/>
             </w:rPr>
           </w:pPr>
-          <w:hyperlink w:anchor="_Toc224073613" w:history="1">
+          <w:hyperlink w:anchor="_Toc224125419" w:history="1">
             <w:r>
               <w:rPr>
                 <w:rStyle w:val="Hyperlink"/>
@@ -335,7 +335,7 @@
                 <w:noProof/>
                 <w:webHidden/>
               </w:rPr>
-              <w:instrText xml:space="preserve"> PAGEREF _Toc224073613 \h </w:instrText>
+              <w:instrText xml:space="preserve"> PAGEREF _Toc224125419 \h </w:instrText>
             </w:r>
             <w:r>
               <w:rPr>
@@ -380,7 +380,7 @@
               <w:lang w:eastAsia="en-GB"/>
             </w:rPr>
           </w:pPr>
-          <w:hyperlink w:anchor="_Toc224073614" w:history="1">
+          <w:hyperlink w:anchor="_Toc224125420" w:history="1">
             <w:r>
               <w:rPr>
                 <w:rStyle w:val="Hyperlink"/>
@@ -407,7 +407,7 @@
                 <w:noProof/>
                 <w:webHidden/>
               </w:rPr>
-              <w:instrText xml:space="preserve"> PAGEREF _Toc224073614 \h </w:instrText>
+              <w:instrText xml:space="preserve"> PAGEREF _Toc224125420 \h </w:instrText>
             </w:r>
             <w:r>
               <w:rPr>
@@ -452,7 +452,7 @@
               <w:lang w:eastAsia="en-GB"/>
             </w:rPr>
           </w:pPr>
-          <w:hyperlink w:anchor="_Toc224073615" w:history="1">
+          <w:hyperlink w:anchor="_Toc224125421" w:history="1">
             <w:r>
               <w:rPr>
                 <w:rStyle w:val="Hyperlink"/>
@@ -479,7 +479,7 @@
                 <w:noProof/>
                 <w:webHidden/>
               </w:rPr>
-              <w:instrText xml:space="preserve"> PAGEREF _Toc224073615 \h </w:instrText>
+              <w:instrText xml:space="preserve"> PAGEREF _Toc224125421 \h </w:instrText>
             </w:r>
             <w:r>
               <w:rPr>
@@ -524,7 +524,7 @@
               <w:lang w:eastAsia="en-GB"/>
             </w:rPr>
           </w:pPr>
-          <w:hyperlink w:anchor="_Toc224073616" w:history="1">
+          <w:hyperlink w:anchor="_Toc224125422" w:history="1">
             <w:r>
               <w:rPr>
                 <w:rStyle w:val="Hyperlink"/>
@@ -551,7 +551,7 @@
                 <w:noProof/>
                 <w:webHidden/>
               </w:rPr>
-              <w:instrText xml:space="preserve"> PAGEREF _Toc224073616 \h </w:instrText>
+              <w:instrText xml:space="preserve"> PAGEREF _Toc224125422 \h </w:instrText>
             </w:r>
             <w:r>
               <w:rPr>
@@ -596,7 +596,7 @@
               <w:lang w:eastAsia="en-GB"/>
             </w:rPr>
           </w:pPr>
-          <w:hyperlink w:anchor="_Toc224073617" w:history="1">
+          <w:hyperlink w:anchor="_Toc224125423" w:history="1">
             <w:r>
               <w:rPr>
                 <w:rStyle w:val="Hyperlink"/>
@@ -623,7 +623,7 @@
                 <w:noProof/>
                 <w:webHidden/>
               </w:rPr>
-              <w:instrText xml:space="preserve"> PAGEREF _Toc224073617 \h </w:instrText>
+              <w:instrText xml:space="preserve"> PAGEREF _Toc224125423 \h </w:instrText>
             </w:r>
             <w:r>
               <w:rPr>
@@ -668,7 +668,7 @@
               <w:lang w:eastAsia="en-GB"/>
             </w:rPr>
           </w:pPr>
-          <w:hyperlink w:anchor="_Toc224073618" w:history="1">
+          <w:hyperlink w:anchor="_Toc224125424" w:history="1">
             <w:r>
               <w:rPr>
                 <w:rStyle w:val="Hyperlink"/>
@@ -695,7 +695,7 @@
                 <w:noProof/>
                 <w:webHidden/>
               </w:rPr>
-              <w:instrText xml:space="preserve"> PAGEREF _Toc224073618 \h </w:instrText>
+              <w:instrText xml:space="preserve"> PAGEREF _Toc224125424 \h </w:instrText>
             </w:r>
             <w:r>
               <w:rPr>
@@ -740,7 +740,7 @@
               <w:lang w:eastAsia="en-GB"/>
             </w:rPr>
           </w:pPr>
-          <w:hyperlink w:anchor="_Toc224073619" w:history="1">
+          <w:hyperlink w:anchor="_Toc224125425" w:history="1">
             <w:r>
               <w:rPr>
                 <w:rStyle w:val="Hyperlink"/>
@@ -767,7 +767,7 @@
                 <w:noProof/>
                 <w:webHidden/>
               </w:rPr>
-              <w:instrText xml:space="preserve"> PAGEREF _Toc224073619 \h </w:instrText>
+              <w:instrText xml:space="preserve"> PAGEREF _Toc224125425 \h </w:instrText>
             </w:r>
             <w:r>
               <w:rPr>
@@ -812,7 +812,7 @@
               <w:lang w:eastAsia="en-GB"/>
             </w:rPr>
           </w:pPr>
-          <w:hyperlink w:anchor="_Toc224073620" w:history="1">
+          <w:hyperlink w:anchor="_Toc224125426" w:history="1">
             <w:r>
               <w:rPr>
                 <w:rStyle w:val="Hyperlink"/>
@@ -839,7 +839,7 @@
                 <w:noProof/>
                 <w:webHidden/>
               </w:rPr>
-              <w:instrText xml:space="preserve"> PAGEREF _Toc224073620 \h </w:instrText>
+              <w:instrText xml:space="preserve"> PAGEREF _Toc224125426 \h </w:instrText>
             </w:r>
             <w:r>
               <w:rPr>
@@ -884,7 +884,7 @@
               <w:lang w:eastAsia="en-GB"/>
             </w:rPr>
           </w:pPr>
-          <w:hyperlink w:anchor="_Toc224073621" w:history="1">
+          <w:hyperlink w:anchor="_Toc224125427" w:history="1">
             <w:r>
               <w:rPr>
                 <w:rStyle w:val="Hyperlink"/>
@@ -911,7 +911,7 @@
                 <w:noProof/>
                 <w:webHidden/>
               </w:rPr>
-              <w:instrText xml:space="preserve"> PAGEREF _Toc224073621 \h </w:instrText>
+              <w:instrText xml:space="preserve"> PAGEREF _Toc224125427 \h </w:instrText>
             </w:r>
             <w:r>
               <w:rPr>
@@ -956,7 +956,7 @@
               <w:lang w:eastAsia="en-GB"/>
             </w:rPr>
           </w:pPr>
-          <w:hyperlink w:anchor="_Toc224073622" w:history="1">
+          <w:hyperlink w:anchor="_Toc224125428" w:history="1">
             <w:r>
               <w:rPr>
                 <w:rStyle w:val="Hyperlink"/>
@@ -983,7 +983,7 @@
                 <w:noProof/>
                 <w:webHidden/>
               </w:rPr>
-              <w:instrText xml:space="preserve"> PAGEREF _Toc224073622 \h </w:instrText>
+              <w:instrText xml:space="preserve"> PAGEREF _Toc224125428 \h </w:instrText>
             </w:r>
             <w:r>
               <w:rPr>
@@ -1028,7 +1028,7 @@
               <w:lang w:eastAsia="en-GB"/>
             </w:rPr>
           </w:pPr>
-          <w:hyperlink w:anchor="_Toc224073623" w:history="1">
+          <w:hyperlink w:anchor="_Toc224125429" w:history="1">
             <w:r>
               <w:rPr>
                 <w:rStyle w:val="Hyperlink"/>
@@ -1055,7 +1055,7 @@
                 <w:noProof/>
                 <w:webHidden/>
               </w:rPr>
-              <w:instrText xml:space="preserve"> PAGEREF _Toc224073623 \h </w:instrText>
+              <w:instrText xml:space="preserve"> PAGEREF _Toc224125429 \h </w:instrText>
             </w:r>
             <w:r>
               <w:rPr>
@@ -1100,7 +1100,7 @@
               <w:lang w:eastAsia="en-GB"/>
             </w:rPr>
           </w:pPr>
-          <w:hyperlink w:anchor="_Toc224073624" w:history="1">
+          <w:hyperlink w:anchor="_Toc224125430" w:history="1">
             <w:r>
               <w:rPr>
                 <w:rStyle w:val="Hyperlink"/>
@@ -1127,7 +1127,7 @@
                 <w:noProof/>
                 <w:webHidden/>
               </w:rPr>
-              <w:instrText xml:space="preserve"> PAGEREF _Toc224073624 \h </w:instrText>
+              <w:instrText xml:space="preserve"> PAGEREF _Toc224125430 \h </w:instrText>
             </w:r>
             <w:r>
               <w:rPr>
@@ -1172,7 +1172,7 @@
               <w:lang w:eastAsia="en-GB"/>
             </w:rPr>
           </w:pPr>
-          <w:hyperlink w:anchor="_Toc224073625" w:history="1">
+          <w:hyperlink w:anchor="_Toc224125431" w:history="1">
             <w:r>
               <w:rPr>
                 <w:rStyle w:val="Hyperlink"/>
@@ -1199,7 +1199,7 @@
                 <w:noProof/>
                 <w:webHidden/>
               </w:rPr>
-              <w:instrText xml:space="preserve"> PAGEREF _Toc224073625 \h </w:instrText>
+              <w:instrText xml:space="preserve"> PAGEREF _Toc224125431 \h </w:instrText>
             </w:r>
             <w:r>
               <w:rPr>
@@ -1244,7 +1244,7 @@
               <w:lang w:eastAsia="en-GB"/>
             </w:rPr>
           </w:pPr>
-          <w:hyperlink w:anchor="_Toc224073626" w:history="1">
+          <w:hyperlink w:anchor="_Toc224125432" w:history="1">
             <w:r>
               <w:rPr>
                 <w:rStyle w:val="Hyperlink"/>
@@ -1271,7 +1271,7 @@
                 <w:noProof/>
                 <w:webHidden/>
               </w:rPr>
-              <w:instrText xml:space="preserve"> PAGEREF _Toc224073626 \h </w:instrText>
+              <w:instrText xml:space="preserve"> PAGEREF _Toc224125432 \h </w:instrText>
             </w:r>
             <w:r>
               <w:rPr>
@@ -1316,7 +1316,7 @@
               <w:lang w:eastAsia="en-GB"/>
             </w:rPr>
           </w:pPr>
-          <w:hyperlink w:anchor="_Toc224073627" w:history="1">
+          <w:hyperlink w:anchor="_Toc224125433" w:history="1">
             <w:r>
               <w:rPr>
                 <w:rStyle w:val="Hyperlink"/>
@@ -1343,7 +1343,7 @@
                 <w:noProof/>
                 <w:webHidden/>
               </w:rPr>
-              <w:instrText xml:space="preserve"> PAGEREF _Toc224073627 \h </w:instrText>
+              <w:instrText xml:space="preserve"> PAGEREF _Toc224125433 \h </w:instrText>
             </w:r>
             <w:r>
               <w:rPr>
@@ -1388,7 +1388,7 @@
               <w:lang w:eastAsia="en-GB"/>
             </w:rPr>
           </w:pPr>
-          <w:hyperlink w:anchor="_Toc224073628" w:history="1">
+          <w:hyperlink w:anchor="_Toc224125434" w:history="1">
             <w:r>
               <w:rPr>
                 <w:rStyle w:val="Hyperlink"/>
@@ -1415,7 +1415,7 @@
                 <w:noProof/>
                 <w:webHidden/>
               </w:rPr>
-              <w:instrText xml:space="preserve"> PAGEREF _Toc224073628 \h </w:instrText>
+              <w:instrText xml:space="preserve"> PAGEREF _Toc224125434 \h </w:instrText>
             </w:r>
             <w:r>
               <w:rPr>
@@ -1460,7 +1460,7 @@
               <w:lang w:eastAsia="en-GB"/>
             </w:rPr>
           </w:pPr>
-          <w:hyperlink w:anchor="_Toc224073629" w:history="1">
+          <w:hyperlink w:anchor="_Toc224125435" w:history="1">
             <w:r>
               <w:rPr>
                 <w:rStyle w:val="Hyperlink"/>
@@ -1487,7 +1487,7 @@
                 <w:noProof/>
                 <w:webHidden/>
               </w:rPr>
-              <w:instrText xml:space="preserve"> PAGEREF _Toc224073629 \h </w:instrText>
+              <w:instrText xml:space="preserve"> PAGEREF _Toc224125435 \h </w:instrText>
             </w:r>
             <w:r>
               <w:rPr>
@@ -1532,7 +1532,7 @@
               <w:lang w:eastAsia="en-GB"/>
             </w:rPr>
           </w:pPr>
-          <w:hyperlink w:anchor="_Toc224073630" w:history="1">
+          <w:hyperlink w:anchor="_Toc224125436" w:history="1">
             <w:r>
               <w:rPr>
                 <w:rStyle w:val="Hyperlink"/>
@@ -1559,7 +1559,7 @@
                 <w:noProof/>
                 <w:webHidden/>
               </w:rPr>
-              <w:instrText xml:space="preserve"> PAGEREF _Toc224073630 \h </w:instrText>
+              <w:instrText xml:space="preserve"> PAGEREF _Toc224125436 \h </w:instrText>
             </w:r>
             <w:r>
               <w:rPr>
@@ -1604,7 +1604,7 @@
               <w:lang w:eastAsia="en-GB"/>
             </w:rPr>
           </w:pPr>
-          <w:hyperlink w:anchor="_Toc224073631" w:history="1">
+          <w:hyperlink w:anchor="_Toc224125437" w:history="1">
             <w:r>
               <w:rPr>
                 <w:rStyle w:val="Hyperlink"/>
@@ -1631,7 +1631,7 @@
                 <w:noProof/>
                 <w:webHidden/>
               </w:rPr>
-              <w:instrText xml:space="preserve"> PAGEREF _Toc224073631 \h </w:instrText>
+              <w:instrText xml:space="preserve"> PAGEREF _Toc224125437 \h </w:instrText>
             </w:r>
             <w:r>
               <w:rPr>
@@ -1676,7 +1676,7 @@
               <w:lang w:eastAsia="en-GB"/>
             </w:rPr>
           </w:pPr>
-          <w:hyperlink w:anchor="_Toc224073632" w:history="1">
+          <w:hyperlink w:anchor="_Toc224125438" w:history="1">
             <w:r>
               <w:rPr>
                 <w:rStyle w:val="Hyperlink"/>
@@ -1703,7 +1703,7 @@
                 <w:noProof/>
                 <w:webHidden/>
               </w:rPr>
-              <w:instrText xml:space="preserve"> PAGEREF _Toc224073632 \h </w:instrText>
+              <w:instrText xml:space="preserve"> PAGEREF _Toc224125438 \h </w:instrText>
             </w:r>
             <w:r>
               <w:rPr>
@@ -1748,7 +1748,7 @@
               <w:lang w:eastAsia="en-GB"/>
             </w:rPr>
           </w:pPr>
-          <w:hyperlink w:anchor="_Toc224073633" w:history="1">
+          <w:hyperlink w:anchor="_Toc224125439" w:history="1">
             <w:r>
               <w:rPr>
                 <w:rStyle w:val="Hyperlink"/>
@@ -1775,7 +1775,7 @@
                 <w:noProof/>
                 <w:webHidden/>
               </w:rPr>
-              <w:instrText xml:space="preserve"> PAGEREF _Toc224073633 \h </w:instrText>
+              <w:instrText xml:space="preserve"> PAGEREF _Toc224125439 \h </w:instrText>
             </w:r>
             <w:r>
               <w:rPr>
@@ -1820,7 +1820,7 @@
               <w:lang w:eastAsia="en-GB"/>
             </w:rPr>
           </w:pPr>
-          <w:hyperlink w:anchor="_Toc224073634" w:history="1">
+          <w:hyperlink w:anchor="_Toc224125440" w:history="1">
             <w:r>
               <w:rPr>
                 <w:rStyle w:val="Hyperlink"/>
@@ -1847,7 +1847,7 @@
                 <w:noProof/>
                 <w:webHidden/>
               </w:rPr>
-              <w:instrText xml:space="preserve"> PAGEREF _Toc224073634 \h </w:instrText>
+              <w:instrText xml:space="preserve"> PAGEREF _Toc224125440 \h </w:instrText>
             </w:r>
             <w:r>
               <w:rPr>
@@ -1892,7 +1892,7 @@
               <w:lang w:eastAsia="en-GB"/>
             </w:rPr>
           </w:pPr>
-          <w:hyperlink w:anchor="_Toc224073635" w:history="1">
+          <w:hyperlink w:anchor="_Toc224125441" w:history="1">
             <w:r>
               <w:rPr>
                 <w:rStyle w:val="Hyperlink"/>
@@ -1919,7 +1919,7 @@
                 <w:noProof/>
                 <w:webHidden/>
               </w:rPr>
-              <w:instrText xml:space="preserve"> PAGEREF _Toc224073635 \h </w:instrText>
+              <w:instrText xml:space="preserve"> PAGEREF _Toc224125441 \h </w:instrText>
             </w:r>
             <w:r>
               <w:rPr>
@@ -1964,7 +1964,7 @@
               <w:lang w:eastAsia="en-GB"/>
             </w:rPr>
           </w:pPr>
-          <w:hyperlink w:anchor="_Toc224073636" w:history="1">
+          <w:hyperlink w:anchor="_Toc224125442" w:history="1">
             <w:r>
               <w:rPr>
                 <w:rStyle w:val="Hyperlink"/>
@@ -1991,7 +1991,7 @@
                 <w:noProof/>
                 <w:webHidden/>
               </w:rPr>
-              <w:instrText xml:space="preserve"> PAGEREF _Toc224073636 \h </w:instrText>
+              <w:instrText xml:space="preserve"> PAGEREF _Toc224125442 \h </w:instrText>
             </w:r>
             <w:r>
               <w:rPr>
@@ -2036,7 +2036,7 @@
               <w:lang w:eastAsia="en-GB"/>
             </w:rPr>
           </w:pPr>
-          <w:hyperlink w:anchor="_Toc224073637" w:history="1">
+          <w:hyperlink w:anchor="_Toc224125443" w:history="1">
             <w:r>
               <w:rPr>
                 <w:rStyle w:val="Hyperlink"/>
@@ -2063,7 +2063,7 @@
                 <w:noProof/>
                 <w:webHidden/>
               </w:rPr>
-              <w:instrText xml:space="preserve"> PAGEREF _Toc224073637 \h </w:instrText>
+              <w:instrText xml:space="preserve"> PAGEREF _Toc224125443 \h </w:instrText>
             </w:r>
             <w:r>
               <w:rPr>
@@ -2108,7 +2108,7 @@
               <w:lang w:eastAsia="en-GB"/>
             </w:rPr>
           </w:pPr>
-          <w:hyperlink w:anchor="_Toc224073638" w:history="1">
+          <w:hyperlink w:anchor="_Toc224125444" w:history="1">
             <w:r>
               <w:rPr>
                 <w:rStyle w:val="Hyperlink"/>
@@ -2135,7 +2135,7 @@
                 <w:noProof/>
                 <w:webHidden/>
               </w:rPr>
-              <w:instrText xml:space="preserve"> PAGEREF _Toc224073638 \h </w:instrText>
+              <w:instrText xml:space="preserve"> PAGEREF _Toc224125444 \h </w:instrText>
             </w:r>
             <w:r>
               <w:rPr>
@@ -2180,7 +2180,7 @@
               <w:lang w:eastAsia="en-GB"/>
             </w:rPr>
           </w:pPr>
-          <w:hyperlink w:anchor="_Toc224073639" w:history="1">
+          <w:hyperlink w:anchor="_Toc224125445" w:history="1">
             <w:r>
               <w:rPr>
                 <w:rStyle w:val="Hyperlink"/>
@@ -2207,7 +2207,7 @@
                 <w:noProof/>
                 <w:webHidden/>
               </w:rPr>
-              <w:instrText xml:space="preserve"> PAGEREF _Toc224073639 \h </w:instrText>
+              <w:instrText xml:space="preserve"> PAGEREF _Toc224125445 \h </w:instrText>
             </w:r>
             <w:r>
               <w:rPr>
@@ -2252,7 +2252,7 @@
               <w:lang w:eastAsia="en-GB"/>
             </w:rPr>
           </w:pPr>
-          <w:hyperlink w:anchor="_Toc224073640" w:history="1">
+          <w:hyperlink w:anchor="_Toc224125446" w:history="1">
             <w:r>
               <w:rPr>
                 <w:rStyle w:val="Hyperlink"/>
@@ -2279,7 +2279,7 @@
                 <w:noProof/>
                 <w:webHidden/>
               </w:rPr>
-              <w:instrText xml:space="preserve"> PAGEREF _Toc224073640 \h </w:instrText>
+              <w:instrText xml:space="preserve"> PAGEREF _Toc224125446 \h </w:instrText>
             </w:r>
             <w:r>
               <w:rPr>
@@ -2324,7 +2324,7 @@
               <w:lang w:eastAsia="en-GB"/>
             </w:rPr>
           </w:pPr>
-          <w:hyperlink w:anchor="_Toc224073641" w:history="1">
+          <w:hyperlink w:anchor="_Toc224125447" w:history="1">
             <w:r>
               <w:rPr>
                 <w:rStyle w:val="Hyperlink"/>
@@ -2351,7 +2351,7 @@
                 <w:noProof/>
                 <w:webHidden/>
               </w:rPr>
-              <w:instrText xml:space="preserve"> PAGEREF _Toc224073641 \h </w:instrText>
+              <w:instrText xml:space="preserve"> PAGEREF _Toc224125447 \h </w:instrText>
             </w:r>
             <w:r>
               <w:rPr>
@@ -2396,7 +2396,7 @@
               <w:lang w:eastAsia="en-GB"/>
             </w:rPr>
           </w:pPr>
-          <w:hyperlink w:anchor="_Toc224073642" w:history="1">
+          <w:hyperlink w:anchor="_Toc224125448" w:history="1">
             <w:r>
               <w:rPr>
                 <w:rStyle w:val="Hyperlink"/>
@@ -2423,7 +2423,7 @@
                 <w:noProof/>
                 <w:webHidden/>
               </w:rPr>
-              <w:instrText xml:space="preserve"> PAGEREF _Toc224073642 \h </w:instrText>
+              <w:instrText xml:space="preserve"> PAGEREF _Toc224125448 \h </w:instrText>
             </w:r>
             <w:r>
               <w:rPr>
@@ -2468,7 +2468,7 @@
               <w:lang w:eastAsia="en-GB"/>
             </w:rPr>
           </w:pPr>
-          <w:hyperlink w:anchor="_Toc224073643" w:history="1">
+          <w:hyperlink w:anchor="_Toc224125449" w:history="1">
             <w:r>
               <w:rPr>
                 <w:rStyle w:val="Hyperlink"/>
@@ -2495,7 +2495,7 @@
                 <w:noProof/>
                 <w:webHidden/>
               </w:rPr>
-              <w:instrText xml:space="preserve"> PAGEREF _Toc224073643 \h </w:instrText>
+              <w:instrText xml:space="preserve"> PAGEREF _Toc224125449 \h </w:instrText>
             </w:r>
             <w:r>
               <w:rPr>
@@ -2540,7 +2540,7 @@
               <w:lang w:eastAsia="en-GB"/>
             </w:rPr>
           </w:pPr>
-          <w:hyperlink w:anchor="_Toc224073644" w:history="1">
+          <w:hyperlink w:anchor="_Toc224125450" w:history="1">
             <w:r>
               <w:rPr>
                 <w:rStyle w:val="Hyperlink"/>
@@ -2567,7 +2567,7 @@
                 <w:noProof/>
                 <w:webHidden/>
               </w:rPr>
-              <w:instrText xml:space="preserve"> PAGEREF _Toc224073644 \h </w:instrText>
+              <w:instrText xml:space="preserve"> PAGEREF _Toc224125450 \h </w:instrText>
             </w:r>
             <w:r>
               <w:rPr>
@@ -2612,7 +2612,7 @@
               <w:lang w:eastAsia="en-GB"/>
             </w:rPr>
           </w:pPr>
-          <w:hyperlink w:anchor="_Toc224073645" w:history="1">
+          <w:hyperlink w:anchor="_Toc224125451" w:history="1">
             <w:r>
               <w:rPr>
                 <w:rStyle w:val="Hyperlink"/>
@@ -2639,7 +2639,7 @@
                 <w:noProof/>
                 <w:webHidden/>
               </w:rPr>
-              <w:instrText xml:space="preserve"> PAGEREF _Toc224073645 \h </w:instrText>
+              <w:instrText xml:space="preserve"> PAGEREF _Toc224125451 \h </w:instrText>
             </w:r>
             <w:r>
               <w:rPr>
@@ -2684,7 +2684,7 @@
               <w:lang w:eastAsia="en-GB"/>
             </w:rPr>
           </w:pPr>
-          <w:hyperlink w:anchor="_Toc224073646" w:history="1">
+          <w:hyperlink w:anchor="_Toc224125452" w:history="1">
             <w:r>
               <w:rPr>
                 <w:rStyle w:val="Hyperlink"/>
@@ -2711,7 +2711,7 @@
                 <w:noProof/>
                 <w:webHidden/>
               </w:rPr>
-              <w:instrText xml:space="preserve"> PAGEREF _Toc224073646 \h </w:instrText>
+              <w:instrText xml:space="preserve"> PAGEREF _Toc224125452 \h </w:instrText>
             </w:r>
             <w:r>
               <w:rPr>
@@ -2756,7 +2756,7 @@
               <w:lang w:eastAsia="en-GB"/>
             </w:rPr>
           </w:pPr>
-          <w:hyperlink w:anchor="_Toc224073647" w:history="1">
+          <w:hyperlink w:anchor="_Toc224125453" w:history="1">
             <w:r>
               <w:rPr>
                 <w:rStyle w:val="Hyperlink"/>
@@ -2783,7 +2783,7 @@
                 <w:noProof/>
                 <w:webHidden/>
               </w:rPr>
-              <w:instrText xml:space="preserve"> PAGEREF _Toc224073647 \h </w:instrText>
+              <w:instrText xml:space="preserve"> PAGEREF _Toc224125453 \h </w:instrText>
             </w:r>
             <w:r>
               <w:rPr>
@@ -2828,7 +2828,7 @@
               <w:lang w:eastAsia="en-GB"/>
             </w:rPr>
           </w:pPr>
-          <w:hyperlink w:anchor="_Toc224073648" w:history="1">
+          <w:hyperlink w:anchor="_Toc224125454" w:history="1">
             <w:r>
               <w:rPr>
                 <w:rStyle w:val="Hyperlink"/>
@@ -2855,7 +2855,7 @@
                 <w:noProof/>
                 <w:webHidden/>
               </w:rPr>
-              <w:instrText xml:space="preserve"> PAGEREF _Toc224073648 \h </w:instrText>
+              <w:instrText xml:space="preserve"> PAGEREF _Toc224125454 \h </w:instrText>
             </w:r>
             <w:r>
               <w:rPr>
@@ -2900,7 +2900,7 @@
               <w:lang w:eastAsia="en-GB"/>
             </w:rPr>
           </w:pPr>
-          <w:hyperlink w:anchor="_Toc224073649" w:history="1">
+          <w:hyperlink w:anchor="_Toc224125455" w:history="1">
             <w:r>
               <w:rPr>
                 <w:rStyle w:val="Hyperlink"/>
@@ -2927,7 +2927,7 @@
                 <w:noProof/>
                 <w:webHidden/>
               </w:rPr>
-              <w:instrText xml:space="preserve"> PAGEREF _Toc224073649 \h </w:instrText>
+              <w:instrText xml:space="preserve"> PAGEREF _Toc224125455 \h </w:instrText>
             </w:r>
             <w:r>
               <w:rPr>
@@ -2972,7 +2972,7 @@
               <w:lang w:eastAsia="en-GB"/>
             </w:rPr>
           </w:pPr>
-          <w:hyperlink w:anchor="_Toc224073650" w:history="1">
+          <w:hyperlink w:anchor="_Toc224125456" w:history="1">
             <w:r>
               <w:rPr>
                 <w:rStyle w:val="Hyperlink"/>
@@ -2999,7 +2999,7 @@
                 <w:noProof/>
                 <w:webHidden/>
               </w:rPr>
-              <w:instrText xml:space="preserve"> PAGEREF _Toc224073650 \h </w:instrText>
+              <w:instrText xml:space="preserve"> PAGEREF _Toc224125456 \h </w:instrText>
             </w:r>
             <w:r>
               <w:rPr>
@@ -3044,7 +3044,7 @@
               <w:lang w:eastAsia="en-GB"/>
             </w:rPr>
           </w:pPr>
-          <w:hyperlink w:anchor="_Toc224073651" w:history="1">
+          <w:hyperlink w:anchor="_Toc224125457" w:history="1">
             <w:r>
               <w:rPr>
                 <w:rStyle w:val="Hyperlink"/>
@@ -3071,7 +3071,7 @@
                 <w:noProof/>
                 <w:webHidden/>
               </w:rPr>
-              <w:instrText xml:space="preserve"> PAGEREF _Toc224073651 \h </w:instrText>
+              <w:instrText xml:space="preserve"> PAGEREF _Toc224125457 \h </w:instrText>
             </w:r>
             <w:r>
               <w:rPr>
@@ -3116,7 +3116,7 @@
               <w:lang w:eastAsia="en-GB"/>
             </w:rPr>
           </w:pPr>
-          <w:hyperlink w:anchor="_Toc224073652" w:history="1">
+          <w:hyperlink w:anchor="_Toc224125458" w:history="1">
             <w:r>
               <w:rPr>
                 <w:rStyle w:val="Hyperlink"/>
@@ -3143,7 +3143,7 @@
                 <w:noProof/>
                 <w:webHidden/>
               </w:rPr>
-              <w:instrText xml:space="preserve"> PAGEREF _Toc224073652 \h </w:instrText>
+              <w:instrText xml:space="preserve"> PAGEREF _Toc224125458 \h </w:instrText>
             </w:r>
             <w:r>
               <w:rPr>
@@ -3188,7 +3188,7 @@
               <w:lang w:eastAsia="en-GB"/>
             </w:rPr>
           </w:pPr>
-          <w:hyperlink w:anchor="_Toc224073653" w:history="1">
+          <w:hyperlink w:anchor="_Toc224125459" w:history="1">
             <w:r>
               <w:rPr>
                 <w:rStyle w:val="Hyperlink"/>
@@ -3215,7 +3215,7 @@
                 <w:noProof/>
                 <w:webHidden/>
               </w:rPr>
-              <w:instrText xml:space="preserve"> PAGEREF _Toc224073653 \h </w:instrText>
+              <w:instrText xml:space="preserve"> PAGEREF _Toc224125459 \h </w:instrText>
             </w:r>
             <w:r>
               <w:rPr>
@@ -3260,7 +3260,7 @@
               <w:lang w:eastAsia="en-GB"/>
             </w:rPr>
           </w:pPr>
-          <w:hyperlink w:anchor="_Toc224073654" w:history="1">
+          <w:hyperlink w:anchor="_Toc224125460" w:history="1">
             <w:r>
               <w:rPr>
                 <w:rStyle w:val="Hyperlink"/>
@@ -3287,7 +3287,7 @@
                 <w:noProof/>
                 <w:webHidden/>
               </w:rPr>
-              <w:instrText xml:space="preserve"> PAGEREF _Toc224073654 \h </w:instrText>
+              <w:instrText xml:space="preserve"> PAGEREF _Toc224125460 \h </w:instrText>
             </w:r>
             <w:r>
               <w:rPr>
@@ -3332,7 +3332,7 @@
               <w:lang w:eastAsia="en-GB"/>
             </w:rPr>
           </w:pPr>
-          <w:hyperlink w:anchor="_Toc224073655" w:history="1">
+          <w:hyperlink w:anchor="_Toc224125461" w:history="1">
             <w:r>
               <w:rPr>
                 <w:rStyle w:val="Hyperlink"/>
@@ -3359,7 +3359,7 @@
                 <w:noProof/>
                 <w:webHidden/>
               </w:rPr>
-              <w:instrText xml:space="preserve"> PAGEREF _Toc224073655 \h </w:instrText>
+              <w:instrText xml:space="preserve"> PAGEREF _Toc224125461 \h </w:instrText>
             </w:r>
             <w:r>
               <w:rPr>
@@ -3404,7 +3404,7 @@
               <w:lang w:eastAsia="en-GB"/>
             </w:rPr>
           </w:pPr>
-          <w:hyperlink w:anchor="_Toc224073656" w:history="1">
+          <w:hyperlink w:anchor="_Toc224125462" w:history="1">
             <w:r>
               <w:rPr>
                 <w:rStyle w:val="Hyperlink"/>
@@ -3431,7 +3431,7 @@
                 <w:noProof/>
                 <w:webHidden/>
               </w:rPr>
-              <w:instrText xml:space="preserve"> PAGEREF _Toc224073656 \h </w:instrText>
+              <w:instrText xml:space="preserve"> PAGEREF _Toc224125462 \h </w:instrText>
             </w:r>
             <w:r>
               <w:rPr>
@@ -3476,7 +3476,7 @@
               <w:lang w:eastAsia="en-GB"/>
             </w:rPr>
           </w:pPr>
-          <w:hyperlink w:anchor="_Toc224073657" w:history="1">
+          <w:hyperlink w:anchor="_Toc224125463" w:history="1">
             <w:r>
               <w:rPr>
                 <w:rStyle w:val="Hyperlink"/>
@@ -3503,7 +3503,7 @@
                 <w:noProof/>
                 <w:webHidden/>
               </w:rPr>
-              <w:instrText xml:space="preserve"> PAGEREF _Toc224073657 \h </w:instrText>
+              <w:instrText xml:space="preserve"> PAGEREF _Toc224125463 \h </w:instrText>
             </w:r>
             <w:r>
               <w:rPr>
@@ -3548,7 +3548,7 @@
               <w:lang w:eastAsia="en-GB"/>
             </w:rPr>
           </w:pPr>
-          <w:hyperlink w:anchor="_Toc224073658" w:history="1">
+          <w:hyperlink w:anchor="_Toc224125464" w:history="1">
             <w:r>
               <w:rPr>
                 <w:rStyle w:val="Hyperlink"/>
@@ -3575,7 +3575,7 @@
                 <w:noProof/>
                 <w:webHidden/>
               </w:rPr>
-              <w:instrText xml:space="preserve"> PAGEREF _Toc224073658 \h </w:instrText>
+              <w:instrText xml:space="preserve"> PAGEREF _Toc224125464 \h </w:instrText>
             </w:r>
             <w:r>
               <w:rPr>
@@ -3620,7 +3620,7 @@
               <w:lang w:eastAsia="en-GB"/>
             </w:rPr>
           </w:pPr>
-          <w:hyperlink w:anchor="_Toc224073659" w:history="1">
+          <w:hyperlink w:anchor="_Toc224125465" w:history="1">
             <w:r>
               <w:rPr>
                 <w:rStyle w:val="Hyperlink"/>
@@ -3647,7 +3647,367 @@
                 <w:noProof/>
                 <w:webHidden/>
               </w:rPr>
-              <w:instrText xml:space="preserve"> PAGEREF _Toc224073659 \h </w:instrText>
+              <w:instrText xml:space="preserve"> PAGEREF _Toc224125465 \h </w:instrText>
+            </w:r>
+            <w:r>
+              <w:rPr>
+                <w:noProof/>
+                <w:webHidden/>
+              </w:rPr>
+            </w:r>
+            <w:r>
+              <w:rPr>
+                <w:noProof/>
+                <w:webHidden/>
+              </w:rPr>
+              <w:fldChar w:fldCharType="separate"/>
+            </w:r>
+            <w:r>
+              <w:rPr>
+                <w:noProof/>
+                <w:webHidden/>
+              </w:rPr>
+              <w:t>25</w:t>
+            </w:r>
+            <w:r>
+              <w:rPr>
+                <w:noProof/>
+                <w:webHidden/>
+              </w:rPr>
+              <w:fldChar w:fldCharType="end"/>
+            </w:r>
+          </w:hyperlink>
+        </w:p>
+        <w:p>
+          <w:pPr>
+            <w:pStyle w:val="TOC2"/>
+            <w:tabs>
+              <w:tab w:val="right" w:leader="dot" w:pos="9016"/>
+            </w:tabs>
+            <w:rPr>
+              <w:rFonts w:eastAsiaTheme="minorEastAsia"/>
+              <w:noProof/>
+              <w:sz w:val="24"/>
+              <w:szCs w:val="24"/>
+              <w:lang w:eastAsia="en-GB"/>
+            </w:rPr>
+          </w:pPr>
+          <w:hyperlink w:anchor="_Toc224125466" w:history="1">
+            <w:r>
+              <w:rPr>
+                <w:rStyle w:val="Hyperlink"/>
+                <w:noProof/>
+              </w:rPr>
+              <w:t>Project Evaluation</w:t>
+            </w:r>
+            <w:r>
+              <w:rPr>
+                <w:noProof/>
+                <w:webHidden/>
+              </w:rPr>
+              <w:tab/>
+            </w:r>
+            <w:r>
+              <w:rPr>
+                <w:noProof/>
+                <w:webHidden/>
+              </w:rPr>
+              <w:fldChar w:fldCharType="begin"/>
+            </w:r>
+            <w:r>
+              <w:rPr>
+                <w:noProof/>
+                <w:webHidden/>
+              </w:rPr>
+              <w:instrText xml:space="preserve"> PAGEREF _Toc224125466 \h </w:instrText>
+            </w:r>
+            <w:r>
+              <w:rPr>
+                <w:noProof/>
+                <w:webHidden/>
+              </w:rPr>
+            </w:r>
+            <w:r>
+              <w:rPr>
+                <w:noProof/>
+                <w:webHidden/>
+              </w:rPr>
+              <w:fldChar w:fldCharType="separate"/>
+            </w:r>
+            <w:r>
+              <w:rPr>
+                <w:noProof/>
+                <w:webHidden/>
+              </w:rPr>
+              <w:t>25</w:t>
+            </w:r>
+            <w:r>
+              <w:rPr>
+                <w:noProof/>
+                <w:webHidden/>
+              </w:rPr>
+              <w:fldChar w:fldCharType="end"/>
+            </w:r>
+          </w:hyperlink>
+        </w:p>
+        <w:p>
+          <w:pPr>
+            <w:pStyle w:val="TOC3"/>
+            <w:tabs>
+              <w:tab w:val="right" w:leader="dot" w:pos="9016"/>
+            </w:tabs>
+            <w:rPr>
+              <w:rFonts w:eastAsiaTheme="minorEastAsia"/>
+              <w:noProof/>
+              <w:sz w:val="24"/>
+              <w:szCs w:val="24"/>
+              <w:lang w:eastAsia="en-GB"/>
+            </w:rPr>
+          </w:pPr>
+          <w:hyperlink w:anchor="_Toc224125467" w:history="1">
+            <w:r>
+              <w:rPr>
+                <w:rStyle w:val="Hyperlink"/>
+                <w:noProof/>
+              </w:rPr>
+              <w:t>Strengths</w:t>
+            </w:r>
+            <w:r>
+              <w:rPr>
+                <w:noProof/>
+                <w:webHidden/>
+              </w:rPr>
+              <w:tab/>
+            </w:r>
+            <w:r>
+              <w:rPr>
+                <w:noProof/>
+                <w:webHidden/>
+              </w:rPr>
+              <w:fldChar w:fldCharType="begin"/>
+            </w:r>
+            <w:r>
+              <w:rPr>
+                <w:noProof/>
+                <w:webHidden/>
+              </w:rPr>
+              <w:instrText xml:space="preserve"> PAGEREF _Toc224125467 \h </w:instrText>
+            </w:r>
+            <w:r>
+              <w:rPr>
+                <w:noProof/>
+                <w:webHidden/>
+              </w:rPr>
+            </w:r>
+            <w:r>
+              <w:rPr>
+                <w:noProof/>
+                <w:webHidden/>
+              </w:rPr>
+              <w:fldChar w:fldCharType="separate"/>
+            </w:r>
+            <w:r>
+              <w:rPr>
+                <w:noProof/>
+                <w:webHidden/>
+              </w:rPr>
+              <w:t>25</w:t>
+            </w:r>
+            <w:r>
+              <w:rPr>
+                <w:noProof/>
+                <w:webHidden/>
+              </w:rPr>
+              <w:fldChar w:fldCharType="end"/>
+            </w:r>
+          </w:hyperlink>
+        </w:p>
+        <w:p>
+          <w:pPr>
+            <w:pStyle w:val="TOC3"/>
+            <w:tabs>
+              <w:tab w:val="right" w:leader="dot" w:pos="9016"/>
+            </w:tabs>
+            <w:rPr>
+              <w:rFonts w:eastAsiaTheme="minorEastAsia"/>
+              <w:noProof/>
+              <w:sz w:val="24"/>
+              <w:szCs w:val="24"/>
+              <w:lang w:eastAsia="en-GB"/>
+            </w:rPr>
+          </w:pPr>
+          <w:hyperlink w:anchor="_Toc224125468" w:history="1">
+            <w:r>
+              <w:rPr>
+                <w:rStyle w:val="Hyperlink"/>
+                <w:noProof/>
+              </w:rPr>
+              <w:t>Weaknesses</w:t>
+            </w:r>
+            <w:r>
+              <w:rPr>
+                <w:noProof/>
+                <w:webHidden/>
+              </w:rPr>
+              <w:tab/>
+            </w:r>
+            <w:r>
+              <w:rPr>
+                <w:noProof/>
+                <w:webHidden/>
+              </w:rPr>
+              <w:fldChar w:fldCharType="begin"/>
+            </w:r>
+            <w:r>
+              <w:rPr>
+                <w:noProof/>
+                <w:webHidden/>
+              </w:rPr>
+              <w:instrText xml:space="preserve"> PAGEREF _Toc224125468 \h </w:instrText>
+            </w:r>
+            <w:r>
+              <w:rPr>
+                <w:noProof/>
+                <w:webHidden/>
+              </w:rPr>
+            </w:r>
+            <w:r>
+              <w:rPr>
+                <w:noProof/>
+                <w:webHidden/>
+              </w:rPr>
+              <w:fldChar w:fldCharType="separate"/>
+            </w:r>
+            <w:r>
+              <w:rPr>
+                <w:noProof/>
+                <w:webHidden/>
+              </w:rPr>
+              <w:t>25</w:t>
+            </w:r>
+            <w:r>
+              <w:rPr>
+                <w:noProof/>
+                <w:webHidden/>
+              </w:rPr>
+              <w:fldChar w:fldCharType="end"/>
+            </w:r>
+          </w:hyperlink>
+        </w:p>
+        <w:p>
+          <w:pPr>
+            <w:pStyle w:val="TOC2"/>
+            <w:tabs>
+              <w:tab w:val="right" w:leader="dot" w:pos="9016"/>
+            </w:tabs>
+            <w:rPr>
+              <w:rFonts w:eastAsiaTheme="minorEastAsia"/>
+              <w:noProof/>
+              <w:sz w:val="24"/>
+              <w:szCs w:val="24"/>
+              <w:lang w:eastAsia="en-GB"/>
+            </w:rPr>
+          </w:pPr>
+          <w:hyperlink w:anchor="_Toc224125469" w:history="1">
+            <w:r>
+              <w:rPr>
+                <w:rStyle w:val="Hyperlink"/>
+                <w:noProof/>
+              </w:rPr>
+              <w:t>Technical Challenges</w:t>
+            </w:r>
+            <w:r>
+              <w:rPr>
+                <w:noProof/>
+                <w:webHidden/>
+              </w:rPr>
+              <w:tab/>
+            </w:r>
+            <w:r>
+              <w:rPr>
+                <w:noProof/>
+                <w:webHidden/>
+              </w:rPr>
+              <w:fldChar w:fldCharType="begin"/>
+            </w:r>
+            <w:r>
+              <w:rPr>
+                <w:noProof/>
+                <w:webHidden/>
+              </w:rPr>
+              <w:instrText xml:space="preserve"> PAGEREF _Toc224125469 \h </w:instrText>
+            </w:r>
+            <w:r>
+              <w:rPr>
+                <w:noProof/>
+                <w:webHidden/>
+              </w:rPr>
+            </w:r>
+            <w:r>
+              <w:rPr>
+                <w:noProof/>
+                <w:webHidden/>
+              </w:rPr>
+              <w:fldChar w:fldCharType="separate"/>
+            </w:r>
+            <w:r>
+              <w:rPr>
+                <w:noProof/>
+                <w:webHidden/>
+              </w:rPr>
+              <w:t>25</w:t>
+            </w:r>
+            <w:r>
+              <w:rPr>
+                <w:noProof/>
+                <w:webHidden/>
+              </w:rPr>
+              <w:fldChar w:fldCharType="end"/>
+            </w:r>
+          </w:hyperlink>
+        </w:p>
+        <w:p>
+          <w:pPr>
+            <w:pStyle w:val="TOC2"/>
+            <w:tabs>
+              <w:tab w:val="right" w:leader="dot" w:pos="9016"/>
+            </w:tabs>
+            <w:rPr>
+              <w:rFonts w:eastAsiaTheme="minorEastAsia"/>
+              <w:noProof/>
+              <w:sz w:val="24"/>
+              <w:szCs w:val="24"/>
+              <w:lang w:eastAsia="en-GB"/>
+            </w:rPr>
+          </w:pPr>
+          <w:hyperlink w:anchor="_Toc224125470" w:history="1">
+            <w:r>
+              <w:rPr>
+                <w:rStyle w:val="Hyperlink"/>
+                <w:noProof/>
+              </w:rPr>
+              <w:t>Limiting and External factors</w:t>
+            </w:r>
+            <w:r>
+              <w:rPr>
+                <w:noProof/>
+                <w:webHidden/>
+              </w:rPr>
+              <w:tab/>
+            </w:r>
+            <w:r>
+              <w:rPr>
+                <w:noProof/>
+                <w:webHidden/>
+              </w:rPr>
+              <w:fldChar w:fldCharType="begin"/>
+            </w:r>
+            <w:r>
+              <w:rPr>
+                <w:noProof/>
+                <w:webHidden/>
+              </w:rPr>
+              <w:instrText xml:space="preserve"> PAGEREF _Toc224125470 \h </w:instrText>
             </w:r>
             <w:r>
               <w:rPr>
@@ -3692,13 +4052,13 @@
               <w:lang w:eastAsia="en-GB"/>
             </w:rPr>
           </w:pPr>
-          <w:hyperlink w:anchor="_Toc224073660" w:history="1">
+          <w:hyperlink w:anchor="_Toc224125471" w:history="1">
             <w:r>
               <w:rPr>
                 <w:rStyle w:val="Hyperlink"/>
                 <w:noProof/>
               </w:rPr>
-              <w:t>Conclusions and Future Work</w:t>
+              <w:t>Conclusion</w:t>
             </w:r>
             <w:r>
               <w:rPr>
@@ -3719,7 +4079,7 @@
                 <w:noProof/>
                 <w:webHidden/>
               </w:rPr>
-              <w:instrText xml:space="preserve"> PAGEREF _Toc224073660 \h </w:instrText>
+              <w:instrText xml:space="preserve"> PAGEREF _Toc224125471 \h </w:instrText>
             </w:r>
             <w:r>
               <w:rPr>
@@ -3740,6 +4100,222 @@
                 <w:webHidden/>
               </w:rPr>
               <w:t>26</w:t>
+            </w:r>
+            <w:r>
+              <w:rPr>
+                <w:noProof/>
+                <w:webHidden/>
+              </w:rPr>
+              <w:fldChar w:fldCharType="end"/>
+            </w:r>
+          </w:hyperlink>
+        </w:p>
+        <w:p>
+          <w:pPr>
+            <w:pStyle w:val="TOC1"/>
+            <w:tabs>
+              <w:tab w:val="right" w:leader="dot" w:pos="9016"/>
+            </w:tabs>
+            <w:rPr>
+              <w:rFonts w:eastAsiaTheme="minorEastAsia"/>
+              <w:noProof/>
+              <w:sz w:val="24"/>
+              <w:szCs w:val="24"/>
+              <w:lang w:eastAsia="en-GB"/>
+            </w:rPr>
+          </w:pPr>
+          <w:hyperlink w:anchor="_Toc224125472" w:history="1">
+            <w:r>
+              <w:rPr>
+                <w:rStyle w:val="Hyperlink"/>
+                <w:noProof/>
+              </w:rPr>
+              <w:t>Future Work</w:t>
+            </w:r>
+            <w:r>
+              <w:rPr>
+                <w:noProof/>
+                <w:webHidden/>
+              </w:rPr>
+              <w:tab/>
+            </w:r>
+            <w:r>
+              <w:rPr>
+                <w:noProof/>
+                <w:webHidden/>
+              </w:rPr>
+              <w:fldChar w:fldCharType="begin"/>
+            </w:r>
+            <w:r>
+              <w:rPr>
+                <w:noProof/>
+                <w:webHidden/>
+              </w:rPr>
+              <w:instrText xml:space="preserve"> PAGEREF _Toc224125472 \h </w:instrText>
+            </w:r>
+            <w:r>
+              <w:rPr>
+                <w:noProof/>
+                <w:webHidden/>
+              </w:rPr>
+            </w:r>
+            <w:r>
+              <w:rPr>
+                <w:noProof/>
+                <w:webHidden/>
+              </w:rPr>
+              <w:fldChar w:fldCharType="separate"/>
+            </w:r>
+            <w:r>
+              <w:rPr>
+                <w:noProof/>
+                <w:webHidden/>
+              </w:rPr>
+              <w:t>26</w:t>
+            </w:r>
+            <w:r>
+              <w:rPr>
+                <w:noProof/>
+                <w:webHidden/>
+              </w:rPr>
+              <w:fldChar w:fldCharType="end"/>
+            </w:r>
+          </w:hyperlink>
+        </w:p>
+        <w:p>
+          <w:pPr>
+            <w:pStyle w:val="TOC1"/>
+            <w:tabs>
+              <w:tab w:val="right" w:leader="dot" w:pos="9016"/>
+            </w:tabs>
+            <w:rPr>
+              <w:rFonts w:eastAsiaTheme="minorEastAsia"/>
+              <w:noProof/>
+              <w:sz w:val="24"/>
+              <w:szCs w:val="24"/>
+              <w:lang w:eastAsia="en-GB"/>
+            </w:rPr>
+          </w:pPr>
+          <w:hyperlink w:anchor="_Toc224125473" w:history="1">
+            <w:r>
+              <w:rPr>
+                <w:rStyle w:val="Hyperlink"/>
+                <w:noProof/>
+              </w:rPr>
+              <w:t>References</w:t>
+            </w:r>
+            <w:r>
+              <w:rPr>
+                <w:noProof/>
+                <w:webHidden/>
+              </w:rPr>
+              <w:tab/>
+            </w:r>
+            <w:r>
+              <w:rPr>
+                <w:noProof/>
+                <w:webHidden/>
+              </w:rPr>
+              <w:fldChar w:fldCharType="begin"/>
+            </w:r>
+            <w:r>
+              <w:rPr>
+                <w:noProof/>
+                <w:webHidden/>
+              </w:rPr>
+              <w:instrText xml:space="preserve"> PAGEREF _Toc224125473 \h </w:instrText>
+            </w:r>
+            <w:r>
+              <w:rPr>
+                <w:noProof/>
+                <w:webHidden/>
+              </w:rPr>
+            </w:r>
+            <w:r>
+              <w:rPr>
+                <w:noProof/>
+                <w:webHidden/>
+              </w:rPr>
+              <w:fldChar w:fldCharType="separate"/>
+            </w:r>
+            <w:r>
+              <w:rPr>
+                <w:noProof/>
+                <w:webHidden/>
+              </w:rPr>
+              <w:t>27</w:t>
+            </w:r>
+            <w:r>
+              <w:rPr>
+                <w:noProof/>
+                <w:webHidden/>
+              </w:rPr>
+              <w:fldChar w:fldCharType="end"/>
+            </w:r>
+          </w:hyperlink>
+        </w:p>
+        <w:p>
+          <w:pPr>
+            <w:pStyle w:val="TOC1"/>
+            <w:tabs>
+              <w:tab w:val="right" w:leader="dot" w:pos="9016"/>
+            </w:tabs>
+            <w:rPr>
+              <w:rFonts w:eastAsiaTheme="minorEastAsia"/>
+              <w:noProof/>
+              <w:sz w:val="24"/>
+              <w:szCs w:val="24"/>
+              <w:lang w:eastAsia="en-GB"/>
+            </w:rPr>
+          </w:pPr>
+          <w:hyperlink w:anchor="_Toc224125474" w:history="1">
+            <w:r>
+              <w:rPr>
+                <w:rStyle w:val="Hyperlink"/>
+                <w:noProof/>
+              </w:rPr>
+              <w:t>Appendix</w:t>
+            </w:r>
+            <w:r>
+              <w:rPr>
+                <w:noProof/>
+                <w:webHidden/>
+              </w:rPr>
+              <w:tab/>
+            </w:r>
+            <w:r>
+              <w:rPr>
+                <w:noProof/>
+                <w:webHidden/>
+              </w:rPr>
+              <w:fldChar w:fldCharType="begin"/>
+            </w:r>
+            <w:r>
+              <w:rPr>
+                <w:noProof/>
+                <w:webHidden/>
+              </w:rPr>
+              <w:instrText xml:space="preserve"> PAGEREF _Toc224125474 \h </w:instrText>
+            </w:r>
+            <w:r>
+              <w:rPr>
+                <w:noProof/>
+                <w:webHidden/>
+              </w:rPr>
+            </w:r>
+            <w:r>
+              <w:rPr>
+                <w:noProof/>
+                <w:webHidden/>
+              </w:rPr>
+              <w:fldChar w:fldCharType="separate"/>
+            </w:r>
+            <w:r>
+              <w:rPr>
+                <w:noProof/>
+                <w:webHidden/>
+              </w:rPr>
+              <w:t>29</w:t>
             </w:r>
             <w:r>
               <w:rPr>
@@ -3764,13 +4340,13 @@
               <w:lang w:eastAsia="en-GB"/>
             </w:rPr>
           </w:pPr>
-          <w:hyperlink w:anchor="_Toc224073661" w:history="1">
+          <w:hyperlink w:anchor="_Toc224125475" w:history="1">
             <w:r>
               <w:rPr>
                 <w:rStyle w:val="Hyperlink"/>
                 <w:noProof/>
               </w:rPr>
-              <w:t>Conclusion</w:t>
+              <w:t>Asset Licenses and Sources</w:t>
             </w:r>
             <w:r>
               <w:rPr>
@@ -3791,295 +4367,7 @@
                 <w:noProof/>
                 <w:webHidden/>
               </w:rPr>
-              <w:instrText xml:space="preserve"> PAGEREF _Toc224073661 \h </w:instrText>
-            </w:r>
-            <w:r>
-              <w:rPr>
-                <w:noProof/>
-                <w:webHidden/>
-              </w:rPr>
-            </w:r>
-            <w:r>
-              <w:rPr>
-                <w:noProof/>
-                <w:webHidden/>
-              </w:rPr>
-              <w:fldChar w:fldCharType="separate"/>
-            </w:r>
-            <w:r>
-              <w:rPr>
-                <w:noProof/>
-                <w:webHidden/>
-              </w:rPr>
-              <w:t>26</w:t>
-            </w:r>
-            <w:r>
-              <w:rPr>
-                <w:noProof/>
-                <w:webHidden/>
-              </w:rPr>
-              <w:fldChar w:fldCharType="end"/>
-            </w:r>
-          </w:hyperlink>
-        </w:p>
-        <w:p>
-          <w:pPr>
-            <w:pStyle w:val="TOC2"/>
-            <w:tabs>
-              <w:tab w:val="right" w:leader="dot" w:pos="9016"/>
-            </w:tabs>
-            <w:rPr>
-              <w:rFonts w:eastAsiaTheme="minorEastAsia"/>
-              <w:noProof/>
-              <w:sz w:val="24"/>
-              <w:szCs w:val="24"/>
-              <w:lang w:eastAsia="en-GB"/>
-            </w:rPr>
-          </w:pPr>
-          <w:hyperlink w:anchor="_Toc224073662" w:history="1">
-            <w:r>
-              <w:rPr>
-                <w:rStyle w:val="Hyperlink"/>
-                <w:noProof/>
-              </w:rPr>
-              <w:t>Future Work</w:t>
-            </w:r>
-            <w:r>
-              <w:rPr>
-                <w:noProof/>
-                <w:webHidden/>
-              </w:rPr>
-              <w:tab/>
-            </w:r>
-            <w:r>
-              <w:rPr>
-                <w:noProof/>
-                <w:webHidden/>
-              </w:rPr>
-              <w:fldChar w:fldCharType="begin"/>
-            </w:r>
-            <w:r>
-              <w:rPr>
-                <w:noProof/>
-                <w:webHidden/>
-              </w:rPr>
-              <w:instrText xml:space="preserve"> PAGEREF _Toc224073662 \h </w:instrText>
-            </w:r>
-            <w:r>
-              <w:rPr>
-                <w:noProof/>
-                <w:webHidden/>
-              </w:rPr>
-            </w:r>
-            <w:r>
-              <w:rPr>
-                <w:noProof/>
-                <w:webHidden/>
-              </w:rPr>
-              <w:fldChar w:fldCharType="separate"/>
-            </w:r>
-            <w:r>
-              <w:rPr>
-                <w:noProof/>
-                <w:webHidden/>
-              </w:rPr>
-              <w:t>26</w:t>
-            </w:r>
-            <w:r>
-              <w:rPr>
-                <w:noProof/>
-                <w:webHidden/>
-              </w:rPr>
-              <w:fldChar w:fldCharType="end"/>
-            </w:r>
-          </w:hyperlink>
-        </w:p>
-        <w:p>
-          <w:pPr>
-            <w:pStyle w:val="TOC1"/>
-            <w:tabs>
-              <w:tab w:val="right" w:leader="dot" w:pos="9016"/>
-            </w:tabs>
-            <w:rPr>
-              <w:rFonts w:eastAsiaTheme="minorEastAsia"/>
-              <w:noProof/>
-              <w:sz w:val="24"/>
-              <w:szCs w:val="24"/>
-              <w:lang w:eastAsia="en-GB"/>
-            </w:rPr>
-          </w:pPr>
-          <w:hyperlink w:anchor="_Toc224073663" w:history="1">
-            <w:r>
-              <w:rPr>
-                <w:rStyle w:val="Hyperlink"/>
-                <w:noProof/>
-              </w:rPr>
-              <w:t>References</w:t>
-            </w:r>
-            <w:r>
-              <w:rPr>
-                <w:noProof/>
-                <w:webHidden/>
-              </w:rPr>
-              <w:tab/>
-            </w:r>
-            <w:r>
-              <w:rPr>
-                <w:noProof/>
-                <w:webHidden/>
-              </w:rPr>
-              <w:fldChar w:fldCharType="begin"/>
-            </w:r>
-            <w:r>
-              <w:rPr>
-                <w:noProof/>
-                <w:webHidden/>
-              </w:rPr>
-              <w:instrText xml:space="preserve"> PAGEREF _Toc224073663 \h </w:instrText>
-            </w:r>
-            <w:r>
-              <w:rPr>
-                <w:noProof/>
-                <w:webHidden/>
-              </w:rPr>
-            </w:r>
-            <w:r>
-              <w:rPr>
-                <w:noProof/>
-                <w:webHidden/>
-              </w:rPr>
-              <w:fldChar w:fldCharType="separate"/>
-            </w:r>
-            <w:r>
-              <w:rPr>
-                <w:noProof/>
-                <w:webHidden/>
-              </w:rPr>
-              <w:t>27</w:t>
-            </w:r>
-            <w:r>
-              <w:rPr>
-                <w:noProof/>
-                <w:webHidden/>
-              </w:rPr>
-              <w:fldChar w:fldCharType="end"/>
-            </w:r>
-          </w:hyperlink>
-        </w:p>
-        <w:p>
-          <w:pPr>
-            <w:pStyle w:val="TOC1"/>
-            <w:tabs>
-              <w:tab w:val="right" w:leader="dot" w:pos="9016"/>
-            </w:tabs>
-            <w:rPr>
-              <w:rFonts w:eastAsiaTheme="minorEastAsia"/>
-              <w:noProof/>
-              <w:sz w:val="24"/>
-              <w:szCs w:val="24"/>
-              <w:lang w:eastAsia="en-GB"/>
-            </w:rPr>
-          </w:pPr>
-          <w:hyperlink w:anchor="_Toc224073664" w:history="1">
-            <w:r>
-              <w:rPr>
-                <w:rStyle w:val="Hyperlink"/>
-                <w:noProof/>
-              </w:rPr>
-              <w:t>Appendix</w:t>
-            </w:r>
-            <w:r>
-              <w:rPr>
-                <w:noProof/>
-                <w:webHidden/>
-              </w:rPr>
-              <w:tab/>
-            </w:r>
-            <w:r>
-              <w:rPr>
-                <w:noProof/>
-                <w:webHidden/>
-              </w:rPr>
-              <w:fldChar w:fldCharType="begin"/>
-            </w:r>
-            <w:r>
-              <w:rPr>
-                <w:noProof/>
-                <w:webHidden/>
-              </w:rPr>
-              <w:instrText xml:space="preserve"> PAGEREF _Toc224073664 \h </w:instrText>
-            </w:r>
-            <w:r>
-              <w:rPr>
-                <w:noProof/>
-                <w:webHidden/>
-              </w:rPr>
-            </w:r>
-            <w:r>
-              <w:rPr>
-                <w:noProof/>
-                <w:webHidden/>
-              </w:rPr>
-              <w:fldChar w:fldCharType="separate"/>
-            </w:r>
-            <w:r>
-              <w:rPr>
-                <w:noProof/>
-                <w:webHidden/>
-              </w:rPr>
-              <w:t>29</w:t>
-            </w:r>
-            <w:r>
-              <w:rPr>
-                <w:noProof/>
-                <w:webHidden/>
-              </w:rPr>
-              <w:fldChar w:fldCharType="end"/>
-            </w:r>
-          </w:hyperlink>
-        </w:p>
-        <w:p>
-          <w:pPr>
-            <w:pStyle w:val="TOC2"/>
-            <w:tabs>
-              <w:tab w:val="right" w:leader="dot" w:pos="9016"/>
-            </w:tabs>
-            <w:rPr>
-              <w:rFonts w:eastAsiaTheme="minorEastAsia"/>
-              <w:noProof/>
-              <w:sz w:val="24"/>
-              <w:szCs w:val="24"/>
-              <w:lang w:eastAsia="en-GB"/>
-            </w:rPr>
-          </w:pPr>
-          <w:hyperlink w:anchor="_Toc224073665" w:history="1">
-            <w:r>
-              <w:rPr>
-                <w:rStyle w:val="Hyperlink"/>
-                <w:noProof/>
-              </w:rPr>
-              <w:t>Asset Licenses and Sources</w:t>
-            </w:r>
-            <w:r>
-              <w:rPr>
-                <w:noProof/>
-                <w:webHidden/>
-              </w:rPr>
-              <w:tab/>
-            </w:r>
-            <w:r>
-              <w:rPr>
-                <w:noProof/>
-                <w:webHidden/>
-              </w:rPr>
-              <w:fldChar w:fldCharType="begin"/>
-            </w:r>
-            <w:r>
-              <w:rPr>
-                <w:noProof/>
-                <w:webHidden/>
-              </w:rPr>
-              <w:instrText xml:space="preserve"> PAGEREF _Toc224073665 \h </w:instrText>
+              <w:instrText xml:space="preserve"> PAGEREF _Toc224125475 \h </w:instrText>
             </w:r>
             <w:r>
               <w:rPr>
@@ -4124,7 +4412,7 @@
               <w:lang w:eastAsia="en-GB"/>
             </w:rPr>
           </w:pPr>
-          <w:hyperlink w:anchor="_Toc224073666" w:history="1">
+          <w:hyperlink w:anchor="_Toc224125476" w:history="1">
             <w:r>
               <w:rPr>
                 <w:rStyle w:val="Hyperlink"/>
@@ -4151,7 +4439,7 @@
                 <w:noProof/>
                 <w:webHidden/>
               </w:rPr>
-              <w:instrText xml:space="preserve"> PAGEREF _Toc224073666 \h </w:instrText>
+              <w:instrText xml:space="preserve"> PAGEREF _Toc224125476 \h </w:instrText>
             </w:r>
             <w:r>
               <w:rPr>
@@ -4196,7 +4484,7 @@
               <w:lang w:eastAsia="en-GB"/>
             </w:rPr>
           </w:pPr>
-          <w:hyperlink w:anchor="_Toc224073667" w:history="1">
+          <w:hyperlink w:anchor="_Toc224125477" w:history="1">
             <w:r>
               <w:rPr>
                 <w:rStyle w:val="Hyperlink"/>
@@ -4223,7 +4511,7 @@
                 <w:noProof/>
                 <w:webHidden/>
               </w:rPr>
-              <w:instrText xml:space="preserve"> PAGEREF _Toc224073667 \h </w:instrText>
+              <w:instrText xml:space="preserve"> PAGEREF _Toc224125477 \h </w:instrText>
             </w:r>
             <w:r>
               <w:rPr>
@@ -4268,7 +4556,7 @@
               <w:lang w:eastAsia="en-GB"/>
             </w:rPr>
           </w:pPr>
-          <w:hyperlink w:anchor="_Toc224073668" w:history="1">
+          <w:hyperlink w:anchor="_Toc224125478" w:history="1">
             <w:r>
               <w:rPr>
                 <w:rStyle w:val="Hyperlink"/>
@@ -4295,7 +4583,7 @@
                 <w:noProof/>
                 <w:webHidden/>
               </w:rPr>
-              <w:instrText xml:space="preserve"> PAGEREF _Toc224073668 \h </w:instrText>
+              <w:instrText xml:space="preserve"> PAGEREF _Toc224125478 \h </w:instrText>
             </w:r>
             <w:r>
               <w:rPr>
@@ -4340,7 +4628,7 @@
               <w:lang w:eastAsia="en-GB"/>
             </w:rPr>
           </w:pPr>
-          <w:hyperlink w:anchor="_Toc224073669" w:history="1">
+          <w:hyperlink w:anchor="_Toc224125479" w:history="1">
             <w:r>
               <w:rPr>
                 <w:rStyle w:val="Hyperlink"/>
@@ -4367,7 +4655,7 @@
                 <w:noProof/>
                 <w:webHidden/>
               </w:rPr>
-              <w:instrText xml:space="preserve"> PAGEREF _Toc224073669 \h </w:instrText>
+              <w:instrText xml:space="preserve"> PAGEREF _Toc224125479 \h </w:instrText>
             </w:r>
             <w:r>
               <w:rPr>
@@ -4412,7 +4700,7 @@
               <w:lang w:eastAsia="en-GB"/>
             </w:rPr>
           </w:pPr>
-          <w:hyperlink w:anchor="_Toc224073670" w:history="1">
+          <w:hyperlink w:anchor="_Toc224125480" w:history="1">
             <w:r>
               <w:rPr>
                 <w:rStyle w:val="Hyperlink"/>
@@ -4439,7 +4727,7 @@
                 <w:noProof/>
                 <w:webHidden/>
               </w:rPr>
-              <w:instrText xml:space="preserve"> PAGEREF _Toc224073670 \h </w:instrText>
+              <w:instrText xml:space="preserve"> PAGEREF _Toc224125480 \h </w:instrText>
             </w:r>
             <w:r>
               <w:rPr>
@@ -4484,7 +4772,7 @@
               <w:lang w:eastAsia="en-GB"/>
             </w:rPr>
           </w:pPr>
-          <w:hyperlink w:anchor="_Toc224073671" w:history="1">
+          <w:hyperlink w:anchor="_Toc224125481" w:history="1">
             <w:r>
               <w:rPr>
                 <w:rStyle w:val="Hyperlink"/>
@@ -4511,7 +4799,7 @@
                 <w:noProof/>
                 <w:webHidden/>
               </w:rPr>
-              <w:instrText xml:space="preserve"> PAGEREF _Toc224073671 \h </w:instrText>
+              <w:instrText xml:space="preserve"> PAGEREF _Toc224125481 \h </w:instrText>
             </w:r>
             <w:r>
               <w:rPr>
@@ -4556,7 +4844,7 @@
               <w:lang w:eastAsia="en-GB"/>
             </w:rPr>
           </w:pPr>
-          <w:hyperlink w:anchor="_Toc224073672" w:history="1">
+          <w:hyperlink w:anchor="_Toc224125482" w:history="1">
             <w:r>
               <w:rPr>
                 <w:rStyle w:val="Hyperlink"/>
@@ -4583,7 +4871,7 @@
                 <w:noProof/>
                 <w:webHidden/>
               </w:rPr>
-              <w:instrText xml:space="preserve"> PAGEREF _Toc224073672 \h </w:instrText>
+              <w:instrText xml:space="preserve"> PAGEREF _Toc224125482 \h </w:instrText>
             </w:r>
             <w:r>
               <w:rPr>
@@ -4628,7 +4916,7 @@
               <w:lang w:eastAsia="en-GB"/>
             </w:rPr>
           </w:pPr>
-          <w:hyperlink w:anchor="_Toc224073673" w:history="1">
+          <w:hyperlink w:anchor="_Toc224125483" w:history="1">
             <w:r>
               <w:rPr>
                 <w:rStyle w:val="Hyperlink"/>
@@ -4655,7 +4943,7 @@
                 <w:noProof/>
                 <w:webHidden/>
               </w:rPr>
-              <w:instrText xml:space="preserve"> PAGEREF _Toc224073673 \h </w:instrText>
+              <w:instrText xml:space="preserve"> PAGEREF _Toc224125483 \h </w:instrText>
             </w:r>
             <w:r>
               <w:rPr>
@@ -4700,7 +4988,7 @@
               <w:lang w:eastAsia="en-GB"/>
             </w:rPr>
           </w:pPr>
-          <w:hyperlink w:anchor="_Toc224073674" w:history="1">
+          <w:hyperlink w:anchor="_Toc224125484" w:history="1">
             <w:r>
               <w:rPr>
                 <w:rStyle w:val="Hyperlink"/>
@@ -4727,7 +5015,7 @@
                 <w:noProof/>
                 <w:webHidden/>
               </w:rPr>
-              <w:instrText xml:space="preserve"> PAGEREF _Toc224073674 \h </w:instrText>
+              <w:instrText xml:space="preserve"> PAGEREF _Toc224125484 \h </w:instrText>
             </w:r>
             <w:r>
               <w:rPr>
@@ -4772,7 +5060,7 @@
               <w:lang w:eastAsia="en-GB"/>
             </w:rPr>
           </w:pPr>
-          <w:hyperlink w:anchor="_Toc224073675" w:history="1">
+          <w:hyperlink w:anchor="_Toc224125485" w:history="1">
             <w:r>
               <w:rPr>
                 <w:rStyle w:val="Hyperlink"/>
@@ -4799,7 +5087,7 @@
                 <w:noProof/>
                 <w:webHidden/>
               </w:rPr>
-              <w:instrText xml:space="preserve"> PAGEREF _Toc224073675 \h </w:instrText>
+              <w:instrText xml:space="preserve"> PAGEREF _Toc224125485 \h </w:instrText>
             </w:r>
             <w:r>
               <w:rPr>
@@ -4844,7 +5132,7 @@
               <w:lang w:eastAsia="en-GB"/>
             </w:rPr>
           </w:pPr>
-          <w:hyperlink w:anchor="_Toc224073676" w:history="1">
+          <w:hyperlink w:anchor="_Toc224125486" w:history="1">
             <w:r>
               <w:rPr>
                 <w:rStyle w:val="Hyperlink"/>
@@ -4871,7 +5159,7 @@
                 <w:noProof/>
                 <w:webHidden/>
               </w:rPr>
-              <w:instrText xml:space="preserve"> PAGEREF _Toc224073676 \h </w:instrText>
+              <w:instrText xml:space="preserve"> PAGEREF _Toc224125486 \h </w:instrText>
             </w:r>
             <w:r>
               <w:rPr>
@@ -4916,7 +5204,7 @@
               <w:lang w:eastAsia="en-GB"/>
             </w:rPr>
           </w:pPr>
-          <w:hyperlink w:anchor="_Toc224073677" w:history="1">
+          <w:hyperlink w:anchor="_Toc224125487" w:history="1">
             <w:r>
               <w:rPr>
                 <w:rStyle w:val="Hyperlink"/>
@@ -4943,7 +5231,7 @@
                 <w:noProof/>
                 <w:webHidden/>
               </w:rPr>
-              <w:instrText xml:space="preserve"> PAGEREF _Toc224073677 \h </w:instrText>
+              <w:instrText xml:space="preserve"> PAGEREF _Toc224125487 \h </w:instrText>
             </w:r>
             <w:r>
               <w:rPr>
@@ -4975,6 +5263,13 @@
           </w:hyperlink>
         </w:p>
         <w:p>
+          <w:pPr>
+            <w:rPr>
+              <w:b/>
+              <w:bCs/>
+              <w:noProof/>
+            </w:rPr>
+          </w:pPr>
           <w:r>
             <w:rPr>
               <w:b/>
@@ -4986,25 +5281,20 @@
         </w:p>
       </w:sdtContent>
     </w:sdt>
-    <w:p/>
-    <w:p>
-      <w:pPr>
-        <w:rPr>
-          <w:rFonts w:asciiTheme="majorHAnsi" w:eastAsiaTheme="majorEastAsia" w:hAnsiTheme="majorHAnsi" w:cstheme="majorBidi"/>
-          <w:color w:val="0F4761" w:themeColor="accent1" w:themeShade="BF"/>
-          <w:sz w:val="40"/>
-          <w:szCs w:val="40"/>
-        </w:rPr>
-      </w:pPr>
-      <w:r>
-        <w:br w:type="page"/>
-      </w:r>
-    </w:p>
     <w:p>
       <w:pPr>
         <w:pStyle w:val="Heading1"/>
-      </w:pPr>
-      <w:bookmarkStart w:id="0" w:name="_Toc224073612"/>
+        <w:rPr>
+          <w:rFonts w:asciiTheme="minorHAnsi" w:eastAsiaTheme="minorHAnsi" w:hAnsiTheme="minorHAnsi" w:cstheme="minorBidi"/>
+          <w:b/>
+          <w:bCs/>
+          <w:noProof/>
+          <w:color w:val="auto"/>
+          <w:sz w:val="22"/>
+          <w:szCs w:val="22"/>
+        </w:rPr>
+      </w:pPr>
+      <w:bookmarkStart w:id="0" w:name="_Toc224125418"/>
       <w:r>
         <w:lastRenderedPageBreak/>
         <w:t>List of Acro</w:t>
@@ -5303,7 +5593,7 @@
       <w:pPr>
         <w:pStyle w:val="Heading1"/>
       </w:pPr>
-      <w:bookmarkStart w:id="1" w:name="_Toc224073613"/>
+      <w:bookmarkStart w:id="1" w:name="_Toc224125419"/>
       <w:r>
         <w:t>Abstract</w:t>
       </w:r>
@@ -5502,7 +5792,7 @@
       <w:pPr>
         <w:pStyle w:val="Heading1"/>
       </w:pPr>
-      <w:bookmarkStart w:id="2" w:name="_Toc224073614"/>
+      <w:bookmarkStart w:id="2" w:name="_Toc224125420"/>
       <w:r>
         <w:lastRenderedPageBreak/>
         <w:t>Introduction</w:t>
@@ -5549,8 +5839,13 @@
       <w:r>
         <w:t xml:space="preserve">. </w:t>
       </w:r>
-      <w:r>
-        <w:t xml:space="preserve">Porcar et al., </w:t>
+      <w:proofErr w:type="spellStart"/>
+      <w:r>
+        <w:t>Porcar</w:t>
+      </w:r>
+      <w:proofErr w:type="spellEnd"/>
+      <w:r>
+        <w:t xml:space="preserve"> et al., </w:t>
       </w:r>
       <w:r>
         <w:t>(</w:t>
@@ -5590,8 +5885,13 @@
       <w:r>
         <w:t xml:space="preserve">Research conducted by </w:t>
       </w:r>
-      <w:r>
-        <w:t xml:space="preserve">Cantó-Sancho et al., </w:t>
+      <w:proofErr w:type="spellStart"/>
+      <w:r>
+        <w:t>Cantó</w:t>
+      </w:r>
+      <w:proofErr w:type="spellEnd"/>
+      <w:r>
+        <w:t xml:space="preserve">-Sancho et al., </w:t>
       </w:r>
       <w:r>
         <w:t>(</w:t>
@@ -6075,7 +6375,7 @@
       <w:pPr>
         <w:pStyle w:val="Heading1"/>
       </w:pPr>
-      <w:bookmarkStart w:id="3" w:name="_Toc224073615"/>
+      <w:bookmarkStart w:id="3" w:name="_Toc224125421"/>
       <w:r>
         <w:lastRenderedPageBreak/>
         <w:t>Project Aim</w:t>
@@ -6125,7 +6425,7 @@
           <w:rFonts w:asciiTheme="minorHAnsi" w:hAnsiTheme="minorHAnsi"/>
         </w:rPr>
       </w:pPr>
-      <w:bookmarkStart w:id="4" w:name="_Toc224073616"/>
+      <w:bookmarkStart w:id="4" w:name="_Toc224125422"/>
       <w:r>
         <w:rPr>
           <w:rFonts w:asciiTheme="minorHAnsi" w:hAnsiTheme="minorHAnsi"/>
@@ -6412,7 +6712,7 @@
       <w:pPr>
         <w:pStyle w:val="Heading1"/>
       </w:pPr>
-      <w:bookmarkStart w:id="5" w:name="_Toc224073617"/>
+      <w:bookmarkStart w:id="5" w:name="_Toc224125423"/>
       <w:r>
         <w:lastRenderedPageBreak/>
         <w:t>Project Planning</w:t>
@@ -6793,7 +7093,7 @@
           <w:rFonts w:asciiTheme="minorHAnsi" w:hAnsiTheme="minorHAnsi"/>
         </w:rPr>
       </w:pPr>
-      <w:bookmarkStart w:id="6" w:name="_Toc224073618"/>
+      <w:bookmarkStart w:id="6" w:name="_Toc224125424"/>
       <w:r>
         <w:rPr>
           <w:rFonts w:asciiTheme="minorHAnsi" w:hAnsiTheme="minorHAnsi"/>
@@ -6995,7 +7295,7 @@
           <w:rFonts w:asciiTheme="minorHAnsi" w:hAnsiTheme="minorHAnsi"/>
         </w:rPr>
       </w:pPr>
-      <w:bookmarkStart w:id="7" w:name="_Toc224073619"/>
+      <w:bookmarkStart w:id="7" w:name="_Toc224125425"/>
       <w:r>
         <w:rPr>
           <w:rFonts w:asciiTheme="minorHAnsi" w:hAnsiTheme="minorHAnsi"/>
@@ -7234,7 +7534,21 @@
         <w:rPr>
           <w:rFonts w:cs="Arial"/>
         </w:rPr>
-        <w:t>Clear on screen prompts to guide and support users that aren’t familiar with VR equipment</w:t>
+        <w:t xml:space="preserve">Clear </w:t>
+      </w:r>
+      <w:proofErr w:type="gramStart"/>
+      <w:r>
+        <w:rPr>
+          <w:rFonts w:cs="Arial"/>
+        </w:rPr>
+        <w:t>on screen</w:t>
+      </w:r>
+      <w:proofErr w:type="gramEnd"/>
+      <w:r>
+        <w:rPr>
+          <w:rFonts w:cs="Arial"/>
+        </w:rPr>
+        <w:t xml:space="preserve"> prompts to guide and support users that aren’t familiar with VR equipment</w:t>
       </w:r>
     </w:p>
     <w:p>
@@ -7262,7 +7576,7 @@
           <w:rFonts w:asciiTheme="minorHAnsi" w:hAnsiTheme="minorHAnsi"/>
         </w:rPr>
       </w:pPr>
-      <w:bookmarkStart w:id="8" w:name="_Toc224073620"/>
+      <w:bookmarkStart w:id="8" w:name="_Toc224125426"/>
       <w:r>
         <w:rPr>
           <w:rFonts w:asciiTheme="minorHAnsi" w:hAnsiTheme="minorHAnsi"/>
@@ -7279,7 +7593,7 @@
           <w:rFonts w:asciiTheme="minorHAnsi" w:hAnsiTheme="minorHAnsi"/>
         </w:rPr>
       </w:pPr>
-      <w:bookmarkStart w:id="9" w:name="_Toc224073621"/>
+      <w:bookmarkStart w:id="9" w:name="_Toc224125427"/>
       <w:r>
         <w:rPr>
           <w:rFonts w:asciiTheme="minorHAnsi" w:hAnsiTheme="minorHAnsi"/>
@@ -7363,7 +7677,7 @@
           <w:rFonts w:asciiTheme="minorHAnsi" w:hAnsiTheme="minorHAnsi"/>
         </w:rPr>
       </w:pPr>
-      <w:bookmarkStart w:id="10" w:name="_Toc224073622"/>
+      <w:bookmarkStart w:id="10" w:name="_Toc224125428"/>
       <w:r>
         <w:rPr>
           <w:rFonts w:asciiTheme="minorHAnsi" w:hAnsiTheme="minorHAnsi"/>
@@ -7376,7 +7690,8 @@
       <w:pPr>
         <w:pStyle w:val="Heading3"/>
       </w:pPr>
-      <w:bookmarkStart w:id="11" w:name="_Toc224073623"/>
+      <w:bookmarkStart w:id="11" w:name="_Toc224125429"/>
+      <w:proofErr w:type="spellStart"/>
       <w:r>
         <w:t>Ey</w:t>
       </w:r>
@@ -7387,6 +7702,7 @@
         <w:t>si</w:t>
       </w:r>
       <w:bookmarkEnd w:id="11"/>
+      <w:proofErr w:type="spellEnd"/>
     </w:p>
     <w:p>
       <w:r>
@@ -7401,9 +7717,11 @@
       <w:r>
         <w:t xml:space="preserve"> discussed </w:t>
       </w:r>
+      <w:proofErr w:type="spellStart"/>
       <w:r>
         <w:t>Eyesi</w:t>
       </w:r>
+      <w:proofErr w:type="spellEnd"/>
       <w:r>
         <w:t>,</w:t>
       </w:r>
@@ -7516,7 +7834,15 @@
         <w:t xml:space="preserve">In addition to this, there is an </w:t>
       </w:r>
       <w:r>
-        <w:t xml:space="preserve">online training portal (vrmnet) </w:t>
+        <w:t>online training portal (</w:t>
+      </w:r>
+      <w:proofErr w:type="spellStart"/>
+      <w:r>
+        <w:t>vrmnet</w:t>
+      </w:r>
+      <w:proofErr w:type="spellEnd"/>
+      <w:r>
+        <w:t xml:space="preserve">) </w:t>
       </w:r>
       <w:r>
         <w:t>allowing comparison between trainees</w:t>
@@ -7651,7 +7977,15 @@
         <w:t xml:space="preserve"> </w:t>
       </w:r>
       <w:r>
-        <w:t xml:space="preserve">While Eyesi is effective for medical training for medical professionals, </w:t>
+        <w:t xml:space="preserve">While </w:t>
+      </w:r>
+      <w:proofErr w:type="spellStart"/>
+      <w:r>
+        <w:t>Eyesi</w:t>
+      </w:r>
+      <w:proofErr w:type="spellEnd"/>
+      <w:r>
+        <w:t xml:space="preserve"> is effective for medical training for medical professionals, </w:t>
       </w:r>
       <w:r>
         <w:t xml:space="preserve">similar </w:t>
@@ -7673,11 +8007,13 @@
       <w:pPr>
         <w:pStyle w:val="Heading3"/>
       </w:pPr>
-      <w:bookmarkStart w:id="12" w:name="_Toc224073624"/>
+      <w:bookmarkStart w:id="12" w:name="_Toc224125430"/>
+      <w:proofErr w:type="spellStart"/>
       <w:r>
         <w:t>OntoPhaco</w:t>
       </w:r>
       <w:bookmarkEnd w:id="12"/>
+      <w:proofErr w:type="spellEnd"/>
     </w:p>
     <w:p>
       <w:r>
@@ -7696,7 +8032,15 @@
         <w:t>d</w:t>
       </w:r>
       <w:r>
-        <w:t xml:space="preserve"> OntoPhaco, a</w:t>
+        <w:t xml:space="preserve"> </w:t>
+      </w:r>
+      <w:proofErr w:type="spellStart"/>
+      <w:r>
+        <w:t>OntoPhaco</w:t>
+      </w:r>
+      <w:proofErr w:type="spellEnd"/>
+      <w:r>
+        <w:t>, a</w:t>
       </w:r>
       <w:r>
         <w:t>n</w:t>
@@ -7829,173 +8173,191 @@
           <w:rFonts w:cs="TimesLTStd-Roman"/>
           <w:kern w:val="0"/>
         </w:rPr>
-        <w:t>Since OntoPhaco</w:t>
-      </w:r>
+        <w:t xml:space="preserve">Since </w:t>
+      </w:r>
+      <w:proofErr w:type="spellStart"/>
       <w:r>
         <w:rPr>
           <w:rFonts w:cs="TimesLTStd-Roman"/>
           <w:kern w:val="0"/>
         </w:rPr>
-        <w:t>’s</w:t>
+        <w:t>OntoPhaco</w:t>
       </w:r>
       <w:r>
         <w:rPr>
           <w:rFonts w:cs="TimesLTStd-Roman"/>
           <w:kern w:val="0"/>
         </w:rPr>
-        <w:t xml:space="preserve"> </w:t>
-      </w:r>
-      <w:r>
-        <w:t>s</w:t>
-      </w:r>
-      <w:r>
-        <w:t xml:space="preserve">ystematic verification and validation processes </w:t>
-      </w:r>
-      <w:r>
-        <w:t>include</w:t>
-      </w:r>
-      <w:r>
-        <w:t xml:space="preserve"> </w:t>
-      </w:r>
-      <w:r>
-        <w:t xml:space="preserve">theoretical </w:t>
-      </w:r>
-      <w:r>
-        <w:t>evaluat</w:t>
-      </w:r>
-      <w:r>
-        <w:t xml:space="preserve">ion </w:t>
-      </w:r>
-      <w:r>
-        <w:t>and expert feedback</w:t>
-      </w:r>
+        <w:t>’s</w:t>
+      </w:r>
+      <w:proofErr w:type="spellEnd"/>
       <w:r>
         <w:rPr>
           <w:rFonts w:cs="TimesLTStd-Roman"/>
           <w:kern w:val="0"/>
         </w:rPr>
-        <w:t xml:space="preserve">, each change, minor or major </w:t>
+        <w:t xml:space="preserve"> </w:t>
+      </w:r>
+      <w:r>
+        <w:t>s</w:t>
+      </w:r>
+      <w:r>
+        <w:t xml:space="preserve">ystematic verification and validation processes </w:t>
+      </w:r>
+      <w:r>
+        <w:t>include</w:t>
+      </w:r>
+      <w:r>
+        <w:t xml:space="preserve"> </w:t>
+      </w:r>
+      <w:r>
+        <w:t xml:space="preserve">theoretical </w:t>
+      </w:r>
+      <w:r>
+        <w:t>evaluat</w:t>
+      </w:r>
+      <w:r>
+        <w:t xml:space="preserve">ion </w:t>
+      </w:r>
+      <w:r>
+        <w:t>and expert feedback</w:t>
       </w:r>
       <w:r>
         <w:rPr>
           <w:rFonts w:cs="TimesLTStd-Roman"/>
           <w:kern w:val="0"/>
         </w:rPr>
-        <w:t>is</w:t>
+        <w:t xml:space="preserve">, each change, minor or major </w:t>
       </w:r>
       <w:r>
         <w:rPr>
           <w:rFonts w:cs="TimesLTStd-Roman"/>
           <w:kern w:val="0"/>
         </w:rPr>
-        <w:t xml:space="preserve"> verified and validate</w:t>
+        <w:t>is</w:t>
       </w:r>
       <w:r>
         <w:rPr>
           <w:rFonts w:cs="TimesLTStd-Roman"/>
           <w:kern w:val="0"/>
         </w:rPr>
-        <w:t>d</w:t>
-      </w:r>
-      <w:r>
-        <w:t>.</w:t>
+        <w:t xml:space="preserve"> verified and validate</w:t>
       </w:r>
       <w:r>
         <w:rPr>
           <w:rFonts w:cs="TimesLTStd-Roman"/>
           <w:kern w:val="0"/>
         </w:rPr>
-        <w:t xml:space="preserve"> </w:t>
+        <w:t>d</w:t>
+      </w:r>
+      <w:r>
+        <w:t>.</w:t>
       </w:r>
       <w:r>
         <w:rPr>
           <w:rFonts w:cs="TimesLTStd-Roman"/>
           <w:kern w:val="0"/>
         </w:rPr>
-        <w:t>OntoPhaco demonstrates VR</w:t>
-      </w:r>
+        <w:t xml:space="preserve"> </w:t>
+      </w:r>
+      <w:proofErr w:type="spellStart"/>
       <w:r>
         <w:rPr>
           <w:rFonts w:cs="TimesLTStd-Roman"/>
           <w:kern w:val="0"/>
         </w:rPr>
-        <w:t>’</w:t>
-      </w:r>
+        <w:t>OntoPhaco</w:t>
+      </w:r>
+      <w:proofErr w:type="spellEnd"/>
       <w:r>
         <w:rPr>
           <w:rFonts w:cs="TimesLTStd-Roman"/>
           <w:kern w:val="0"/>
         </w:rPr>
-        <w:t xml:space="preserve">s effectiveness </w:t>
+        <w:t xml:space="preserve"> demonstrates VR</w:t>
       </w:r>
       <w:r>
         <w:rPr>
           <w:rFonts w:cs="TimesLTStd-Roman"/>
           <w:kern w:val="0"/>
         </w:rPr>
-        <w:t xml:space="preserve">paired </w:t>
+        <w:t>’</w:t>
       </w:r>
       <w:r>
         <w:rPr>
           <w:rFonts w:cs="TimesLTStd-Roman"/>
           <w:kern w:val="0"/>
         </w:rPr>
-        <w:t>with ontology for medical training</w:t>
+        <w:t xml:space="preserve">s effectiveness </w:t>
       </w:r>
       <w:r>
         <w:rPr>
           <w:rFonts w:cs="TimesLTStd-Roman"/>
           <w:kern w:val="0"/>
         </w:rPr>
-        <w:t>. T</w:t>
+        <w:t xml:space="preserve">paired </w:t>
       </w:r>
       <w:r>
         <w:rPr>
           <w:rFonts w:cs="TimesLTStd-Roman"/>
           <w:kern w:val="0"/>
         </w:rPr>
-        <w:t>his project</w:t>
+        <w:t>with ontology for medical training</w:t>
       </w:r>
       <w:r>
         <w:rPr>
           <w:rFonts w:cs="TimesLTStd-Roman"/>
           <w:kern w:val="0"/>
         </w:rPr>
-        <w:t xml:space="preserve"> applies similar immersi</w:t>
+        <w:t>. T</w:t>
       </w:r>
       <w:r>
         <w:rPr>
           <w:rFonts w:cs="TimesLTStd-Roman"/>
           <w:kern w:val="0"/>
         </w:rPr>
-        <w:t>ve</w:t>
+        <w:t>his project</w:t>
       </w:r>
       <w:r>
         <w:rPr>
           <w:rFonts w:cs="TimesLTStd-Roman"/>
           <w:kern w:val="0"/>
         </w:rPr>
-        <w:t xml:space="preserve"> and educational knowledge </w:t>
+        <w:t xml:space="preserve"> applies similar immersi</w:t>
       </w:r>
       <w:r>
         <w:rPr>
           <w:rFonts w:cs="TimesLTStd-Roman"/>
           <w:kern w:val="0"/>
         </w:rPr>
-        <w:t xml:space="preserve">for DES to raise awareness, </w:t>
+        <w:t>ve</w:t>
       </w:r>
       <w:r>
         <w:rPr>
           <w:rFonts w:cs="TimesLTStd-Roman"/>
           <w:kern w:val="0"/>
         </w:rPr>
-        <w:t xml:space="preserve">spreading the </w:t>
+        <w:t xml:space="preserve"> and educational knowledge </w:t>
       </w:r>
       <w:r>
         <w:rPr>
           <w:rFonts w:cs="TimesLTStd-Roman"/>
           <w:kern w:val="0"/>
         </w:rPr>
+        <w:t xml:space="preserve">for DES to raise awareness, </w:t>
+      </w:r>
+      <w:r>
+        <w:rPr>
+          <w:rFonts w:cs="TimesLTStd-Roman"/>
+          <w:kern w:val="0"/>
+        </w:rPr>
+        <w:t xml:space="preserve">spreading the </w:t>
+      </w:r>
+      <w:r>
+        <w:rPr>
+          <w:rFonts w:cs="TimesLTStd-Roman"/>
+          <w:kern w:val="0"/>
+        </w:rPr>
         <w:t>benefits of VR use in education beyond professional training.</w:t>
       </w:r>
     </w:p>
@@ -8003,7 +8365,7 @@
       <w:pPr>
         <w:pStyle w:val="Heading3"/>
       </w:pPr>
-      <w:bookmarkStart w:id="13" w:name="_Toc224073625"/>
+      <w:bookmarkStart w:id="13" w:name="_Toc224125431"/>
       <w:r>
         <w:lastRenderedPageBreak/>
         <w:t>I</w:t>
@@ -8199,7 +8561,7 @@
       <w:pPr>
         <w:pStyle w:val="Heading3"/>
       </w:pPr>
-      <w:bookmarkStart w:id="14" w:name="_Toc224073626"/>
+      <w:bookmarkStart w:id="14" w:name="_Toc224125432"/>
       <w:r>
         <w:t>Opportunities for innovation</w:t>
       </w:r>
@@ -8209,17 +8571,27 @@
       <w:r>
         <w:t xml:space="preserve">While </w:t>
       </w:r>
-      <w:r>
-        <w:t>Eyesi focuses on hands on surgical practices</w:t>
+      <w:proofErr w:type="spellStart"/>
+      <w:r>
+        <w:t>Eyesi</w:t>
+      </w:r>
+      <w:proofErr w:type="spellEnd"/>
+      <w:r>
+        <w:t xml:space="preserve"> focuses on hands on surgical practices</w:t>
       </w:r>
       <w:r>
         <w:t xml:space="preserve">, </w:t>
       </w:r>
+      <w:proofErr w:type="spellStart"/>
       <w:r>
         <w:t>O</w:t>
       </w:r>
       <w:r>
-        <w:t>ntoPhaco focuses on the way knowledge is represented and conceptual understanding</w:t>
+        <w:t>ntoPhaco</w:t>
+      </w:r>
+      <w:proofErr w:type="spellEnd"/>
+      <w:r>
+        <w:t xml:space="preserve"> focuses on the way knowledge is represented and conceptual understanding</w:t>
       </w:r>
       <w:r>
         <w:t xml:space="preserve">. </w:t>
@@ -8317,7 +8689,7 @@
           <w:rFonts w:asciiTheme="minorHAnsi" w:hAnsiTheme="minorHAnsi"/>
         </w:rPr>
       </w:pPr>
-      <w:bookmarkStart w:id="15" w:name="_Toc224073627"/>
+      <w:bookmarkStart w:id="15" w:name="_Toc224125433"/>
       <w:r>
         <w:rPr>
           <w:rFonts w:asciiTheme="minorHAnsi" w:hAnsiTheme="minorHAnsi"/>
@@ -8330,7 +8702,7 @@
       <w:pPr>
         <w:pStyle w:val="Heading3"/>
       </w:pPr>
-      <w:bookmarkStart w:id="16" w:name="_Toc224073628"/>
+      <w:bookmarkStart w:id="16" w:name="_Toc224125434"/>
       <w:r>
         <w:t>VR in medical education</w:t>
       </w:r>
@@ -8477,9 +8849,19 @@
       <w:r>
         <w:t xml:space="preserve">Examples such as </w:t>
       </w:r>
-      <w:r>
-        <w:t>Mediverse by Goggleminds</w:t>
-      </w:r>
+      <w:proofErr w:type="spellStart"/>
+      <w:r>
+        <w:t>Mediverse</w:t>
+      </w:r>
+      <w:proofErr w:type="spellEnd"/>
+      <w:r>
+        <w:t xml:space="preserve"> by </w:t>
+      </w:r>
+      <w:proofErr w:type="spellStart"/>
+      <w:r>
+        <w:t>Goggleminds</w:t>
+      </w:r>
+      <w:proofErr w:type="spellEnd"/>
       <w:r>
         <w:t xml:space="preserve"> </w:t>
       </w:r>
@@ -8493,7 +8875,15 @@
         <w:t xml:space="preserve"> to healthcare providers and medical schools</w:t>
       </w:r>
       <w:r>
-        <w:t>. ClassVR by Systems improve</w:t>
+        <w:t xml:space="preserve">. </w:t>
+      </w:r>
+      <w:proofErr w:type="spellStart"/>
+      <w:r>
+        <w:t>ClassVR</w:t>
+      </w:r>
+      <w:proofErr w:type="spellEnd"/>
+      <w:r>
+        <w:t xml:space="preserve"> by Systems improve</w:t>
       </w:r>
       <w:r>
         <w:t>s</w:t>
@@ -8510,8 +8900,13 @@
       <w:r>
         <w:t xml:space="preserve"> </w:t>
       </w:r>
-      <w:r>
-        <w:t xml:space="preserve">PrismsVR </w:t>
+      <w:proofErr w:type="spellStart"/>
+      <w:r>
+        <w:t>PrismsVR</w:t>
+      </w:r>
+      <w:proofErr w:type="spellEnd"/>
+      <w:r>
+        <w:t xml:space="preserve"> </w:t>
       </w:r>
       <w:r>
         <w:t xml:space="preserve">helps students grasp core concepts in algebra and geometry, by </w:t>
@@ -8597,7 +8992,7 @@
       <w:pPr>
         <w:pStyle w:val="Heading3"/>
       </w:pPr>
-      <w:bookmarkStart w:id="17" w:name="_Toc224073629"/>
+      <w:bookmarkStart w:id="17" w:name="_Toc224125435"/>
       <w:r>
         <w:lastRenderedPageBreak/>
         <w:t>VR in Health Awareness</w:t>
@@ -8790,7 +9185,7 @@
           <w:rFonts w:asciiTheme="minorHAnsi" w:hAnsiTheme="minorHAnsi"/>
         </w:rPr>
       </w:pPr>
-      <w:bookmarkStart w:id="18" w:name="_Toc224073630"/>
+      <w:bookmarkStart w:id="18" w:name="_Toc224125436"/>
       <w:r>
         <w:rPr>
           <w:rFonts w:asciiTheme="minorHAnsi" w:hAnsiTheme="minorHAnsi"/>
@@ -9010,7 +9405,7 @@
       <w:pPr>
         <w:pStyle w:val="Heading1"/>
       </w:pPr>
-      <w:bookmarkStart w:id="19" w:name="_Toc224073631"/>
+      <w:bookmarkStart w:id="19" w:name="_Toc224125437"/>
       <w:r>
         <w:lastRenderedPageBreak/>
         <w:t>Appendices</w:t>
@@ -9021,7 +9416,7 @@
       <w:pPr>
         <w:pStyle w:val="Heading2"/>
       </w:pPr>
-      <w:bookmarkStart w:id="20" w:name="_Toc224073632"/>
+      <w:bookmarkStart w:id="20" w:name="_Toc224125438"/>
       <w:r>
         <w:t>Ethics Checklist</w:t>
       </w:r>
@@ -9163,7 +9558,7 @@
       <w:pPr>
         <w:pStyle w:val="Heading2"/>
       </w:pPr>
-      <w:bookmarkStart w:id="21" w:name="_Toc224073633"/>
+      <w:bookmarkStart w:id="21" w:name="_Toc224125439"/>
       <w:r>
         <w:lastRenderedPageBreak/>
         <w:t>Project Timeline Gant</w:t>
@@ -9359,7 +9754,7 @@
       <w:pPr>
         <w:pStyle w:val="Heading1"/>
       </w:pPr>
-      <w:bookmarkStart w:id="22" w:name="_Toc224073634"/>
+      <w:bookmarkStart w:id="22" w:name="_Toc224125440"/>
       <w:r>
         <w:lastRenderedPageBreak/>
         <w:t>Methodology</w:t>
@@ -9370,7 +9765,7 @@
       <w:pPr>
         <w:pStyle w:val="Heading2"/>
       </w:pPr>
-      <w:bookmarkStart w:id="23" w:name="_Toc224073635"/>
+      <w:bookmarkStart w:id="23" w:name="_Toc224125441"/>
       <w:r>
         <w:t>Source Control</w:t>
       </w:r>
@@ -9469,7 +9864,7 @@
       <w:pPr>
         <w:pStyle w:val="Heading2"/>
       </w:pPr>
-      <w:bookmarkStart w:id="24" w:name="_Toc224073636"/>
+      <w:bookmarkStart w:id="24" w:name="_Toc224125442"/>
       <w:r>
         <w:t>Prototype Implementation</w:t>
       </w:r>
@@ -9479,7 +9874,7 @@
       <w:pPr>
         <w:pStyle w:val="Heading3"/>
       </w:pPr>
-      <w:bookmarkStart w:id="25" w:name="_Toc224073637"/>
+      <w:bookmarkStart w:id="25" w:name="_Toc224125443"/>
       <w:r>
         <w:t>Usability and Flow</w:t>
       </w:r>
@@ -9554,8 +9949,13 @@
       <w:r>
         <w:t xml:space="preserve"> </w:t>
       </w:r>
-      <w:r>
-        <w:t xml:space="preserve">Looyestyn et al., </w:t>
+      <w:proofErr w:type="spellStart"/>
+      <w:r>
+        <w:t>Looyestyn</w:t>
+      </w:r>
+      <w:proofErr w:type="spellEnd"/>
+      <w:r>
+        <w:t xml:space="preserve"> et al., </w:t>
       </w:r>
       <w:r>
         <w:t>(</w:t>
@@ -9616,7 +10016,7 @@
       <w:pPr>
         <w:pStyle w:val="Heading3"/>
       </w:pPr>
-      <w:bookmarkStart w:id="26" w:name="_Toc224073638"/>
+      <w:bookmarkStart w:id="26" w:name="_Toc224125444"/>
       <w:r>
         <w:t xml:space="preserve">Environment Design and </w:t>
       </w:r>
@@ -9812,7 +10212,7 @@
       <w:pPr>
         <w:pStyle w:val="Heading3"/>
       </w:pPr>
-      <w:bookmarkStart w:id="27" w:name="_Toc224073639"/>
+      <w:bookmarkStart w:id="27" w:name="_Toc224125445"/>
       <w:r>
         <w:lastRenderedPageBreak/>
         <w:t>Objective System Implementation</w:t>
@@ -9854,7 +10254,15 @@
         <w:t>ere</w:t>
       </w:r>
       <w:r>
-        <w:t xml:space="preserve"> stored within the VRGameMode blueprint, with objectives being updated during runtime as conditions were satisfied </w:t>
+        <w:t xml:space="preserve"> stored within the </w:t>
+      </w:r>
+      <w:proofErr w:type="spellStart"/>
+      <w:r>
+        <w:t>VRGameMode</w:t>
+      </w:r>
+      <w:proofErr w:type="spellEnd"/>
+      <w:r>
+        <w:t xml:space="preserve"> blueprint, with objectives being updated during runtime as conditions were satisfied </w:t>
       </w:r>
       <w:r>
         <w:t>during</w:t>
@@ -9918,7 +10326,7 @@
       <w:pPr>
         <w:pStyle w:val="Heading3"/>
       </w:pPr>
-      <w:bookmarkStart w:id="28" w:name="_Toc224073640"/>
+      <w:bookmarkStart w:id="28" w:name="_Toc224125446"/>
       <w:r>
         <w:t>User</w:t>
       </w:r>
@@ -10028,7 +10436,7 @@
       <w:pPr>
         <w:pStyle w:val="Heading3"/>
       </w:pPr>
-      <w:bookmarkStart w:id="29" w:name="_Toc224073641"/>
+      <w:bookmarkStart w:id="29" w:name="_Toc224125447"/>
       <w:r>
         <w:t>Objective Based Interact</w:t>
       </w:r>
@@ -10099,7 +10507,7 @@
       <w:pPr>
         <w:pStyle w:val="Heading3"/>
       </w:pPr>
-      <w:bookmarkStart w:id="30" w:name="_Toc224073642"/>
+      <w:bookmarkStart w:id="30" w:name="_Toc224125448"/>
       <w:r>
         <w:lastRenderedPageBreak/>
         <w:t>Post Processing Effects</w:t>
@@ -10248,7 +10656,15 @@
         <w:t xml:space="preserve"> simulated </w:t>
       </w:r>
       <w:r>
-        <w:t xml:space="preserve">were vignette to simulate eye fatigue, bloom for light sensitivity and blur for focus strain. Vignette and bloom post processing effects were triggered </w:t>
+        <w:t xml:space="preserve">were </w:t>
+      </w:r>
+      <w:proofErr w:type="gramStart"/>
+      <w:r>
+        <w:t>vignette</w:t>
+      </w:r>
+      <w:proofErr w:type="gramEnd"/>
+      <w:r>
+        <w:t xml:space="preserve"> to simulate eye fatigue, bloom for light sensitivity and blur for focus strain. Vignette and bloom post processing effects were triggered </w:t>
       </w:r>
       <w:r>
         <w:t>by</w:t>
@@ -10264,7 +10680,7 @@
       <w:pPr>
         <w:pStyle w:val="Heading3"/>
       </w:pPr>
-      <w:bookmarkStart w:id="31" w:name="_Toc224073643"/>
+      <w:bookmarkStart w:id="31" w:name="_Toc224125449"/>
       <w:r>
         <w:t>User</w:t>
       </w:r>
@@ -10332,7 +10748,7 @@
       <w:pPr>
         <w:pStyle w:val="Heading2"/>
       </w:pPr>
-      <w:bookmarkStart w:id="32" w:name="_Toc224073644"/>
+      <w:bookmarkStart w:id="32" w:name="_Toc224125450"/>
       <w:r>
         <w:lastRenderedPageBreak/>
         <w:t>Final Version</w:t>
@@ -10346,7 +10762,7 @@
       <w:pPr>
         <w:pStyle w:val="Heading3"/>
       </w:pPr>
-      <w:bookmarkStart w:id="33" w:name="_Toc224073645"/>
+      <w:bookmarkStart w:id="33" w:name="_Toc224125451"/>
       <w:r>
         <w:t>Environment Changes and Visual Modifications</w:t>
       </w:r>
@@ -10373,7 +10789,7 @@
       <w:pPr>
         <w:pStyle w:val="Heading3"/>
       </w:pPr>
-      <w:bookmarkStart w:id="34" w:name="_Toc224073646"/>
+      <w:bookmarkStart w:id="34" w:name="_Toc224125452"/>
       <w:r>
         <w:t>Interaction Improvements</w:t>
       </w:r>
@@ -10411,7 +10827,15 @@
         <w:t xml:space="preserve"> </w:t>
       </w:r>
       <w:r>
-        <w:t>A boolean variable would then dictate what state the light was in and whether to turn it on or off depending on that state.</w:t>
+        <w:t xml:space="preserve">A </w:t>
+      </w:r>
+      <w:proofErr w:type="spellStart"/>
+      <w:r>
+        <w:t>boolean</w:t>
+      </w:r>
+      <w:proofErr w:type="spellEnd"/>
+      <w:r>
+        <w:t xml:space="preserve"> variable would then dictate what state the light was in and whether to turn it on or off depending on that state.</w:t>
       </w:r>
     </w:p>
     <w:p>
@@ -10468,7 +10892,7 @@
       <w:pPr>
         <w:pStyle w:val="Heading3"/>
       </w:pPr>
-      <w:bookmarkStart w:id="35" w:name="_Toc224073647"/>
+      <w:bookmarkStart w:id="35" w:name="_Toc224125453"/>
       <w:r>
         <w:t>Flow Tweaks</w:t>
       </w:r>
@@ -10558,7 +10982,7 @@
       <w:pPr>
         <w:pStyle w:val="Heading3"/>
       </w:pPr>
-      <w:bookmarkStart w:id="36" w:name="_Toc224073648"/>
+      <w:bookmarkStart w:id="36" w:name="_Toc224125454"/>
       <w:r>
         <w:t>Gaze Detection Refinements</w:t>
       </w:r>
@@ -10607,8 +11031,13 @@
       <w:r>
         <w:t xml:space="preserve"> </w:t>
       </w:r>
-      <w:r>
-        <w:t xml:space="preserve">Quesenbery, </w:t>
+      <w:proofErr w:type="spellStart"/>
+      <w:r>
+        <w:t>Quesenbery</w:t>
+      </w:r>
+      <w:proofErr w:type="spellEnd"/>
+      <w:r>
+        <w:t xml:space="preserve">, </w:t>
       </w:r>
       <w:r>
         <w:t>(</w:t>
@@ -10699,7 +11128,7 @@
       <w:pPr>
         <w:pStyle w:val="Heading1"/>
       </w:pPr>
-      <w:bookmarkStart w:id="37" w:name="_Toc224073649"/>
+      <w:bookmarkStart w:id="37" w:name="_Toc224125455"/>
       <w:r>
         <w:lastRenderedPageBreak/>
         <w:t>Results</w:t>
@@ -10710,7 +11139,7 @@
       <w:pPr>
         <w:pStyle w:val="Heading2"/>
       </w:pPr>
-      <w:bookmarkStart w:id="38" w:name="_Toc224073650"/>
+      <w:bookmarkStart w:id="38" w:name="_Toc224125456"/>
       <w:r>
         <w:t>Prototype Tests</w:t>
       </w:r>
@@ -10848,7 +11277,7 @@
       <w:pPr>
         <w:pStyle w:val="Heading3"/>
       </w:pPr>
-      <w:bookmarkStart w:id="39" w:name="_Toc224073651"/>
+      <w:bookmarkStart w:id="39" w:name="_Toc224125457"/>
       <w:r>
         <w:t>Interaction</w:t>
       </w:r>
@@ -11009,7 +11438,7 @@
       <w:pPr>
         <w:pStyle w:val="Heading3"/>
       </w:pPr>
-      <w:bookmarkStart w:id="40" w:name="_Toc224073652"/>
+      <w:bookmarkStart w:id="40" w:name="_Toc224125458"/>
       <w:r>
         <w:t>User Attention Detection</w:t>
       </w:r>
@@ -11069,7 +11498,7 @@
       <w:pPr>
         <w:pStyle w:val="Heading3"/>
       </w:pPr>
-      <w:bookmarkStart w:id="41" w:name="_Toc224073653"/>
+      <w:bookmarkStart w:id="41" w:name="_Toc224125459"/>
       <w:r>
         <w:lastRenderedPageBreak/>
         <w:t>Symptom Simulations</w:t>
@@ -11208,7 +11637,7 @@
       <w:pPr>
         <w:pStyle w:val="Heading3"/>
       </w:pPr>
-      <w:bookmarkStart w:id="42" w:name="_Toc224073654"/>
+      <w:bookmarkStart w:id="42" w:name="_Toc224125460"/>
       <w:r>
         <w:t xml:space="preserve">Improvements to be </w:t>
       </w:r>
@@ -11258,7 +11687,7 @@
       <w:pPr>
         <w:pStyle w:val="Heading2"/>
       </w:pPr>
-      <w:bookmarkStart w:id="43" w:name="_Toc224073655"/>
+      <w:bookmarkStart w:id="43" w:name="_Toc224125461"/>
       <w:r>
         <w:lastRenderedPageBreak/>
         <w:t>Final Version Tests</w:t>
@@ -11381,7 +11810,7 @@
       <w:pPr>
         <w:pStyle w:val="Heading3"/>
       </w:pPr>
-      <w:bookmarkStart w:id="44" w:name="_Toc224073656"/>
+      <w:bookmarkStart w:id="44" w:name="_Toc224125462"/>
       <w:r>
         <w:t>Interaction Objects and Objective Understanding</w:t>
       </w:r>
@@ -11435,7 +11864,7 @@
       <w:pPr>
         <w:pStyle w:val="Heading3"/>
       </w:pPr>
-      <w:bookmarkStart w:id="45" w:name="_Toc224073657"/>
+      <w:bookmarkStart w:id="45" w:name="_Toc224125463"/>
       <w:r>
         <w:t>User Attention Detection</w:t>
       </w:r>
@@ -11498,7 +11927,7 @@
       <w:pPr>
         <w:pStyle w:val="Heading3"/>
       </w:pPr>
-      <w:bookmarkStart w:id="46" w:name="_Toc224073658"/>
+      <w:bookmarkStart w:id="46" w:name="_Toc224125464"/>
       <w:r>
         <w:t>Symptom Simulation</w:t>
       </w:r>
@@ -11541,25 +11970,12 @@
       <w:pPr>
         <w:pStyle w:val="Heading1"/>
       </w:pPr>
-      <w:bookmarkStart w:id="47" w:name="_Toc224073659"/>
+      <w:bookmarkStart w:id="47" w:name="_Toc224125465"/>
       <w:r>
         <w:lastRenderedPageBreak/>
         <w:t>Critical Evaluation</w:t>
       </w:r>
       <w:bookmarkEnd w:id="47"/>
-    </w:p>
-    <w:p>
-      <w:r>
-        <w:t>High word count for this, needs to be an in-depth evaluation, discuss in third person and cover all areas that help progress the project and other areas that dampened it such as outside life events etc.</w:t>
-      </w:r>
-      <w:r>
-        <w:br/>
-      </w:r>
-    </w:p>
-    <w:p>
-      <w:r>
-        <w:t>Project Evaluation</w:t>
-      </w:r>
     </w:p>
     <w:p>
       <w:pPr>
@@ -11574,9 +11990,24 @@
       </w:r>
     </w:p>
     <w:p>
+      <w:pPr>
+        <w:pStyle w:val="Heading2"/>
+      </w:pPr>
+      <w:bookmarkStart w:id="48" w:name="_Toc224125466"/>
+      <w:r>
+        <w:t>Project Evaluation</w:t>
+      </w:r>
+      <w:bookmarkEnd w:id="48"/>
+    </w:p>
+    <w:p>
+      <w:pPr>
+        <w:pStyle w:val="Heading3"/>
+      </w:pPr>
+      <w:bookmarkStart w:id="49" w:name="_Toc224125467"/>
       <w:r>
         <w:t>Strengths</w:t>
       </w:r>
+      <w:bookmarkEnd w:id="49"/>
     </w:p>
     <w:p>
       <w:pPr>
@@ -11627,9 +12058,14 @@
       </w:r>
     </w:p>
     <w:p>
+      <w:pPr>
+        <w:pStyle w:val="Heading3"/>
+      </w:pPr>
+      <w:bookmarkStart w:id="50" w:name="_Toc224125468"/>
       <w:r>
         <w:t>Weaknesses</w:t>
       </w:r>
+      <w:bookmarkEnd w:id="50"/>
     </w:p>
     <w:p>
       <w:pPr>
@@ -11680,9 +12116,14 @@
       </w:r>
     </w:p>
     <w:p>
+      <w:pPr>
+        <w:pStyle w:val="Heading2"/>
+      </w:pPr>
+      <w:bookmarkStart w:id="51" w:name="_Toc224125469"/>
       <w:r>
         <w:t>Technical Challenges</w:t>
       </w:r>
+      <w:bookmarkEnd w:id="51"/>
     </w:p>
     <w:p>
       <w:pPr>
@@ -11733,15 +12174,17 @@
       </w:r>
     </w:p>
     <w:p>
+      <w:pPr>
+        <w:pStyle w:val="Heading2"/>
+      </w:pPr>
+      <w:bookmarkStart w:id="52" w:name="_Toc224125470"/>
       <w:r>
         <w:t xml:space="preserve">Limiting </w:t>
       </w:r>
       <w:r>
-        <w:t xml:space="preserve">and </w:t>
-      </w:r>
-      <w:r>
-        <w:t>External factors</w:t>
-      </w:r>
+        <w:t>and External factors</w:t>
+      </w:r>
+      <w:bookmarkEnd w:id="52"/>
     </w:p>
     <w:p>
       <w:pPr>
@@ -11773,7 +12216,17 @@
         </w:numPr>
       </w:pPr>
       <w:r>
-        <w:t>Lack of testers and range of testers (technical and non technical)</w:t>
+        <w:t xml:space="preserve">Lack of testers and range of testers (technical and </w:t>
+      </w:r>
+      <w:proofErr w:type="spellStart"/>
+      <w:proofErr w:type="gramStart"/>
+      <w:r>
+        <w:t>non technical</w:t>
+      </w:r>
+      <w:proofErr w:type="spellEnd"/>
+      <w:proofErr w:type="gramEnd"/>
+      <w:r>
+        <w:t>)</w:t>
       </w:r>
     </w:p>
     <w:p>
@@ -11814,24 +12267,27 @@
     </w:p>
     <w:p>
       <w:pPr>
+        <w:rPr>
+          <w:rFonts w:asciiTheme="majorHAnsi" w:eastAsiaTheme="majorEastAsia" w:hAnsiTheme="majorHAnsi" w:cstheme="majorBidi"/>
+          <w:color w:val="0F4761" w:themeColor="accent1" w:themeShade="BF"/>
+          <w:sz w:val="32"/>
+          <w:szCs w:val="32"/>
+        </w:rPr>
+      </w:pPr>
+      <w:r>
+        <w:br w:type="page"/>
+      </w:r>
+    </w:p>
+    <w:p>
+      <w:pPr>
         <w:pStyle w:val="Heading1"/>
       </w:pPr>
-      <w:bookmarkStart w:id="48" w:name="_Toc224073660"/>
+      <w:bookmarkStart w:id="53" w:name="_Toc224125471"/>
       <w:r>
         <w:lastRenderedPageBreak/>
-        <w:t>Conclusions and Future Work</w:t>
-      </w:r>
-      <w:bookmarkEnd w:id="48"/>
-    </w:p>
-    <w:p>
-      <w:pPr>
-        <w:pStyle w:val="Heading2"/>
-      </w:pPr>
-      <w:bookmarkStart w:id="49" w:name="_Toc224073661"/>
-      <w:r>
         <w:t>Conclusion</w:t>
       </w:r>
-      <w:bookmarkEnd w:id="49"/>
+      <w:bookmarkEnd w:id="53"/>
     </w:p>
     <w:p>
       <w:pPr>
@@ -11895,13 +12351,13 @@
     </w:p>
     <w:p>
       <w:pPr>
-        <w:pStyle w:val="Heading2"/>
-      </w:pPr>
-      <w:bookmarkStart w:id="50" w:name="_Toc224073662"/>
+        <w:pStyle w:val="Heading1"/>
+      </w:pPr>
+      <w:bookmarkStart w:id="54" w:name="_Toc224125472"/>
       <w:r>
         <w:t>Future Work</w:t>
       </w:r>
-      <w:bookmarkEnd w:id="50"/>
+      <w:bookmarkEnd w:id="54"/>
     </w:p>
     <w:p>
       <w:pPr>
@@ -12021,26 +12477,54 @@
       <w:pPr>
         <w:pStyle w:val="Heading1"/>
       </w:pPr>
-      <w:bookmarkStart w:id="51" w:name="_Toc224073663"/>
+      <w:bookmarkStart w:id="55" w:name="_Toc224125473"/>
       <w:r>
         <w:lastRenderedPageBreak/>
         <w:t>References</w:t>
       </w:r>
-      <w:bookmarkEnd w:id="51"/>
-    </w:p>
-    <w:p>
-      <w:r>
-        <w:t xml:space="preserve">Atienza, R., Blonna, R., Saludares, M.I., Casimiro, J. and Fuentes, V. (2016) ‘Interaction techniques using head gaze for virtual reality’. </w:t>
+      <w:bookmarkEnd w:id="55"/>
+    </w:p>
+    <w:p>
+      <w:r>
+        <w:t xml:space="preserve">Atienza, R., </w:t>
+      </w:r>
+      <w:proofErr w:type="spellStart"/>
+      <w:r>
+        <w:t>Blonna</w:t>
+      </w:r>
+      <w:proofErr w:type="spellEnd"/>
+      <w:r>
+        <w:t xml:space="preserve">, R., Saludares, M.I., Casimiro, J. and Fuentes, V. (2016) ‘Interaction techniques using head gaze for virtual reality’. </w:t>
       </w:r>
       <w:r>
         <w:rPr>
           <w:i/>
           <w:iCs/>
         </w:rPr>
-        <w:t>2016 IEEE Region 10 Symposium (TENSYMP)</w:t>
-      </w:r>
-      <w:r>
-        <w:t xml:space="preserve"> . doi: </w:t>
+        <w:t>2016 IEEE Region 10 Symposium (TENSYMP</w:t>
+      </w:r>
+      <w:proofErr w:type="gramStart"/>
+      <w:r>
+        <w:rPr>
+          <w:i/>
+          <w:iCs/>
+        </w:rPr>
+        <w:t>)</w:t>
+      </w:r>
+      <w:r>
+        <w:t xml:space="preserve"> .</w:t>
+      </w:r>
+      <w:proofErr w:type="gramEnd"/>
+      <w:r>
+        <w:t xml:space="preserve"> </w:t>
+      </w:r>
+      <w:proofErr w:type="spellStart"/>
+      <w:r>
+        <w:t>doi</w:t>
+      </w:r>
+      <w:proofErr w:type="spellEnd"/>
+      <w:r>
+        <w:t xml:space="preserve">: </w:t>
       </w:r>
       <w:hyperlink r:id="rId15" w:history="1">
         <w:r>
@@ -12058,9 +12542,23 @@
       </w:r>
     </w:p>
     <w:p>
-      <w:r>
-        <w:t xml:space="preserve">Cantó-Sancho, N., Porru, S., Casati, S., Ronda, E., Seguí-Crespo, M. and Carta, A. (2023) ‘Prevalence and risk factors of computer vision syndrome—assessed in office workers by a validated questionnaire’. </w:t>
-      </w:r>
+      <w:proofErr w:type="spellStart"/>
+      <w:r>
+        <w:t>Cantó</w:t>
+      </w:r>
+      <w:proofErr w:type="spellEnd"/>
+      <w:r>
+        <w:t xml:space="preserve">-Sancho, N., </w:t>
+      </w:r>
+      <w:proofErr w:type="spellStart"/>
+      <w:r>
+        <w:t>Porru</w:t>
+      </w:r>
+      <w:proofErr w:type="spellEnd"/>
+      <w:r>
+        <w:t xml:space="preserve">, S., Casati, S., Ronda, E., Seguí-Crespo, M. and Carta, A. (2023) ‘Prevalence and risk factors of computer vision syndrome—assessed in office workers by a validated questionnaire’. </w:t>
+      </w:r>
+      <w:proofErr w:type="spellStart"/>
       <w:r>
         <w:rPr>
           <w:i/>
@@ -12068,6 +12566,7 @@
         </w:rPr>
         <w:t>PeerJ</w:t>
       </w:r>
+      <w:proofErr w:type="spellEnd"/>
       <w:r>
         <w:t xml:space="preserve"> 11, p. e14937. Available at: </w:t>
       </w:r>
@@ -12114,7 +12613,23 @@
     </w:p>
     <w:p>
       <w:r>
-        <w:t xml:space="preserve">Chandrasekhara, R.S., Low, C., Lim, Y., Low, L., Mardina, F. and Nursaleha, M. (2013) ‘Computer vision syndrome: a study of knowledge and practices in university students’. </w:t>
+        <w:t xml:space="preserve">Chandrasekhara, R.S., Low, C., Lim, Y., Low, L., Mardina, F. and </w:t>
+      </w:r>
+      <w:proofErr w:type="spellStart"/>
+      <w:r>
+        <w:t>Nursaleha</w:t>
+      </w:r>
+      <w:proofErr w:type="spellEnd"/>
+      <w:r>
+        <w:t xml:space="preserve">, M. (2013) ‘Computer vision syndrome: a study of knowledge and practices in university </w:t>
+      </w:r>
+      <w:proofErr w:type="gramStart"/>
+      <w:r>
+        <w:t>students’</w:t>
+      </w:r>
+      <w:proofErr w:type="gramEnd"/>
+      <w:r>
+        <w:t xml:space="preserve">. </w:t>
       </w:r>
       <w:r>
         <w:rPr>
@@ -12176,7 +12691,15 @@
         <w:t>Behaviour &amp; Information Technology</w:t>
       </w:r>
       <w:r>
-        <w:t xml:space="preserve"> 21(2), pp. 137–143. doi: </w:t>
+        <w:t xml:space="preserve"> 21(2), pp. 137–143. </w:t>
+      </w:r>
+      <w:proofErr w:type="spellStart"/>
+      <w:r>
+        <w:t>doi</w:t>
+      </w:r>
+      <w:proofErr w:type="spellEnd"/>
+      <w:r>
+        <w:t xml:space="preserve">: </w:t>
       </w:r>
       <w:hyperlink r:id="rId20" w:history="1">
         <w:r>
@@ -12192,7 +12715,15 @@
     </w:p>
     <w:p>
       <w:r>
-        <w:t xml:space="preserve">Gibson Kimutai and Förster, A. (2024) ‘A User-Centred Interaction Design: A Holistic Approach’., pp. 468–475. doi: </w:t>
+        <w:t xml:space="preserve">Gibson Kimutai and Förster, A. (2024) ‘A User-Centred Interaction Design: A Holistic Approach’., pp. 468–475. </w:t>
+      </w:r>
+      <w:proofErr w:type="spellStart"/>
+      <w:r>
+        <w:t>doi</w:t>
+      </w:r>
+      <w:proofErr w:type="spellEnd"/>
+      <w:r>
+        <w:t xml:space="preserve">: </w:t>
       </w:r>
       <w:hyperlink r:id="rId21" w:history="1">
         <w:r>
@@ -12241,21 +12772,37 @@
           <w:i/>
           <w:iCs/>
         </w:rPr>
-        <w:t>User-Centred Systems Design</w:t>
-      </w:r>
+        <w:t xml:space="preserve">User-Centred Systems </w:t>
+      </w:r>
+      <w:proofErr w:type="gramStart"/>
       <w:r>
         <w:rPr>
           <w:i/>
           <w:iCs/>
         </w:rPr>
-        <w:t xml:space="preserve"> </w:t>
+        <w:t>Design</w:t>
       </w:r>
       <w:r>
         <w:rPr>
           <w:i/>
           <w:iCs/>
         </w:rPr>
-        <w:t>: Designing Usable Interactive Systems in Practice</w:t>
+        <w:t xml:space="preserve"> </w:t>
+      </w:r>
+      <w:r>
+        <w:rPr>
+          <w:i/>
+          <w:iCs/>
+        </w:rPr>
+        <w:t>:</w:t>
+      </w:r>
+      <w:proofErr w:type="gramEnd"/>
+      <w:r>
+        <w:rPr>
+          <w:i/>
+          <w:iCs/>
+        </w:rPr>
+        <w:t xml:space="preserve"> Designing Usable Interactive Systems in Practice</w:t>
       </w:r>
       <w:r>
         <w:t xml:space="preserve">. Available at: </w:t>
@@ -12276,8 +12823,21 @@
       </w:r>
     </w:p>
     <w:p>
-      <w:r>
-        <w:t xml:space="preserve">Looyestyn, J., Kernot, J., Boshoff, K., Ryan, J., Edney, S. and Maher, C. (2017) ‘Does gamification increase engagement with online programs? A systematic review’. Amblard, F. (ed.). </w:t>
+      <w:proofErr w:type="spellStart"/>
+      <w:r>
+        <w:t>Looyestyn</w:t>
+      </w:r>
+      <w:proofErr w:type="spellEnd"/>
+      <w:r>
+        <w:t xml:space="preserve">, J., Kernot, J., Boshoff, K., Ryan, J., Edney, S. and Maher, C. (2017) ‘Does gamification increase engagement with online programs? A systematic review’. </w:t>
+      </w:r>
+      <w:proofErr w:type="spellStart"/>
+      <w:r>
+        <w:t>Amblard</w:t>
+      </w:r>
+      <w:proofErr w:type="spellEnd"/>
+      <w:r>
+        <w:t xml:space="preserve">, F. (ed.). </w:t>
       </w:r>
       <w:r>
         <w:rPr>
@@ -12306,7 +12866,15 @@
     </w:p>
     <w:p>
       <w:r>
-        <w:t xml:space="preserve">Muñoz, E.G., Fabregat, R., Bacca-Acosta, J., Duque-Méndez, N. and Avila-Garzon, C. (2022) ‘Augmented Reality, Virtual Reality, and Game Technologies in Ophthalmology Training’. </w:t>
+        <w:t xml:space="preserve">Muñoz, E.G., </w:t>
+      </w:r>
+      <w:proofErr w:type="spellStart"/>
+      <w:r>
+        <w:t>Fabregat</w:t>
+      </w:r>
+      <w:proofErr w:type="spellEnd"/>
+      <w:r>
+        <w:t xml:space="preserve">, R., Bacca-Acosta, J., Duque-Méndez, N. and Avila-Garzon, C. (2022) ‘Augmented Reality, Virtual Reality, and Game Technologies in Ophthalmology Training’. </w:t>
       </w:r>
       <w:r>
         <w:rPr>
@@ -12316,7 +12884,15 @@
         <w:t>Information</w:t>
       </w:r>
       <w:r>
-        <w:t xml:space="preserve"> 13(5), p. 222. doi: </w:t>
+        <w:t xml:space="preserve"> 13(5), p. 222. </w:t>
+      </w:r>
+      <w:proofErr w:type="spellStart"/>
+      <w:r>
+        <w:t>doi</w:t>
+      </w:r>
+      <w:proofErr w:type="spellEnd"/>
+      <w:r>
+        <w:t xml:space="preserve">: </w:t>
       </w:r>
       <w:hyperlink r:id="rId25" w:history="1">
         <w:r>
@@ -12332,7 +12908,15 @@
     </w:p>
     <w:p>
       <w:r>
-        <w:t xml:space="preserve">Newman, M., Gatersleben, B., Wyles, K.J. and Ratcliffe, E. (2022) ‘The use of virtual reality in environment experiences and the importance of realism’. </w:t>
+        <w:t xml:space="preserve">Newman, M., </w:t>
+      </w:r>
+      <w:proofErr w:type="spellStart"/>
+      <w:r>
+        <w:t>Gatersleben</w:t>
+      </w:r>
+      <w:proofErr w:type="spellEnd"/>
+      <w:r>
+        <w:t xml:space="preserve">, B., Wyles, K.J. and Ratcliffe, E. (2022) ‘The use of virtual reality in environment experiences and the importance of realism’. </w:t>
       </w:r>
       <w:r>
         <w:rPr>
@@ -12362,7 +12946,15 @@
     <w:p>
       <w:r>
         <w:lastRenderedPageBreak/>
-        <w:t xml:space="preserve">Orji, J., Hernandez, A., Selema, B. and Orji, R. (2022) ‘Virtual and augmented reality applications for promoting safety and security: A systematic review’., pp. 1–7. doi: </w:t>
+        <w:t xml:space="preserve">Orji, J., Hernandez, A., Selema, B. and Orji, R. (2022) ‘Virtual and augmented reality applications for promoting safety and security: A systematic review’., pp. 1–7. </w:t>
+      </w:r>
+      <w:proofErr w:type="spellStart"/>
+      <w:r>
+        <w:t>doi</w:t>
+      </w:r>
+      <w:proofErr w:type="spellEnd"/>
+      <w:r>
+        <w:t xml:space="preserve">: </w:t>
       </w:r>
       <w:hyperlink r:id="rId27" w:history="1">
         <w:r>
@@ -12377,8 +12969,21 @@
       </w:r>
     </w:p>
     <w:p>
-      <w:r>
-        <w:t xml:space="preserve">Porcar, E., Pons, A. and Lorente, A. (2016) ‘Visual and ocular effects from the use of flat-panel displays’. </w:t>
+      <w:proofErr w:type="spellStart"/>
+      <w:r>
+        <w:t>Porcar</w:t>
+      </w:r>
+      <w:proofErr w:type="spellEnd"/>
+      <w:r>
+        <w:t xml:space="preserve">, E., Pons, A. and Lorente, A. (2016) ‘Visual and ocular effects from the use of flat-panel </w:t>
+      </w:r>
+      <w:proofErr w:type="gramStart"/>
+      <w:r>
+        <w:t>displays’</w:t>
+      </w:r>
+      <w:proofErr w:type="gramEnd"/>
+      <w:r>
+        <w:t xml:space="preserve">. </w:t>
       </w:r>
       <w:r>
         <w:rPr>
@@ -12406,9 +13011,15 @@
       </w:r>
     </w:p>
     <w:p>
-      <w:r>
-        <w:t xml:space="preserve">Quesenbery, W. (2004) ‘(PDF) Balancing the 5Es: Usability’. </w:t>
-      </w:r>
+      <w:proofErr w:type="spellStart"/>
+      <w:r>
+        <w:t>Quesenbery</w:t>
+      </w:r>
+      <w:proofErr w:type="spellEnd"/>
+      <w:r>
+        <w:t xml:space="preserve">, W. (2004) ‘(PDF) Balancing the 5Es: Usability’. </w:t>
+      </w:r>
+      <w:proofErr w:type="gramStart"/>
       <w:r>
         <w:rPr>
           <w:i/>
@@ -12417,7 +13028,11 @@
         <w:t>ResearchGate</w:t>
       </w:r>
       <w:r>
-        <w:t xml:space="preserve"> . Available at: </w:t>
+        <w:t xml:space="preserve"> .</w:t>
+      </w:r>
+      <w:proofErr w:type="gramEnd"/>
+      <w:r>
+        <w:t xml:space="preserve"> Available at: </w:t>
       </w:r>
       <w:hyperlink r:id="rId29" w:history="1">
         <w:r>
@@ -12433,7 +13048,23 @@
     </w:p>
     <w:p>
       <w:r>
-        <w:t xml:space="preserve">Santilli, T., Ceccacci, S., Mengoni, M. and Catia Giaconi (2025) ‘Virtual vs. traditional learning in higher education: A systematic review of comparative studies’. </w:t>
+        <w:t xml:space="preserve">Santilli, T., Ceccacci, S., Mengoni, M. and Catia </w:t>
+      </w:r>
+      <w:proofErr w:type="spellStart"/>
+      <w:r>
+        <w:t>Giaconi</w:t>
+      </w:r>
+      <w:proofErr w:type="spellEnd"/>
+      <w:r>
+        <w:t xml:space="preserve"> (2025) ‘Virtual vs. traditional learning in higher education: A systematic review of comparative </w:t>
+      </w:r>
+      <w:proofErr w:type="gramStart"/>
+      <w:r>
+        <w:t>studies’</w:t>
+      </w:r>
+      <w:proofErr w:type="gramEnd"/>
+      <w:r>
+        <w:t xml:space="preserve">. </w:t>
       </w:r>
       <w:r>
         <w:rPr>
@@ -12466,10 +13097,30 @@
           <w:i/>
           <w:iCs/>
         </w:rPr>
-        <w:t>Communications in computer and information science</w:t>
-      </w:r>
-      <w:r>
-        <w:t xml:space="preserve"> , pp. 111–115. doi: </w:t>
+        <w:t xml:space="preserve">Communications in computer and information </w:t>
+      </w:r>
+      <w:proofErr w:type="gramStart"/>
+      <w:r>
+        <w:rPr>
+          <w:i/>
+          <w:iCs/>
+        </w:rPr>
+        <w:t>science</w:t>
+      </w:r>
+      <w:r>
+        <w:t xml:space="preserve"> ,</w:t>
+      </w:r>
+      <w:proofErr w:type="gramEnd"/>
+      <w:r>
+        <w:t xml:space="preserve"> pp. 111–115. </w:t>
+      </w:r>
+      <w:proofErr w:type="spellStart"/>
+      <w:r>
+        <w:t>doi</w:t>
+      </w:r>
+      <w:proofErr w:type="spellEnd"/>
+      <w:r>
+        <w:t xml:space="preserve">: </w:t>
       </w:r>
       <w:hyperlink r:id="rId31" w:history="1">
         <w:r>
@@ -12530,7 +13181,23 @@
     </w:p>
     <w:p>
       <w:r>
-        <w:t xml:space="preserve">Vieira, F., Oliveira, E. and Rodrigues, N. (2019) ‘iSVC – digital platform for detection and prevention of computer vision syndrome’., pp. 1–7. doi: </w:t>
+        <w:t>Vieira, F., Oliveira, E. and Rodrigues, N. (2019) ‘</w:t>
+      </w:r>
+      <w:proofErr w:type="spellStart"/>
+      <w:r>
+        <w:t>iSVC</w:t>
+      </w:r>
+      <w:proofErr w:type="spellEnd"/>
+      <w:r>
+        <w:t xml:space="preserve"> – digital platform for detection and prevention of computer vision syndrome’., pp. 1–7. </w:t>
+      </w:r>
+      <w:proofErr w:type="spellStart"/>
+      <w:r>
+        <w:t>doi</w:t>
+      </w:r>
+      <w:proofErr w:type="spellEnd"/>
+      <w:r>
+        <w:t xml:space="preserve">: </w:t>
       </w:r>
       <w:hyperlink r:id="rId34" w:history="1">
         <w:r>
@@ -12556,7 +13223,15 @@
         <w:t>Annals of Emerging Technologies in Computing</w:t>
       </w:r>
       <w:r>
-        <w:t xml:space="preserve"> 9(3), pp. 50–68. doi: </w:t>
+        <w:t xml:space="preserve"> 9(3), pp. 50–68. </w:t>
+      </w:r>
+      <w:proofErr w:type="spellStart"/>
+      <w:r>
+        <w:t>doi</w:t>
+      </w:r>
+      <w:proofErr w:type="spellEnd"/>
+      <w:r>
+        <w:t xml:space="preserve">: </w:t>
       </w:r>
       <w:hyperlink r:id="rId35" w:history="1">
         <w:r>
@@ -12572,7 +13247,15 @@
     </w:p>
     <w:p>
       <w:r>
-        <w:t xml:space="preserve">Youcef, B., Ahmad, M.N. and Mustapha, M. (2021) ‘OntoPhaco: An ontology for virtual reality training in ophthalmology Domain—A case study of cataract surgery’. </w:t>
+        <w:t>Youcef, B., Ahmad, M.N. and Mustapha, M. (2021) ‘</w:t>
+      </w:r>
+      <w:proofErr w:type="spellStart"/>
+      <w:r>
+        <w:t>OntoPhaco</w:t>
+      </w:r>
+      <w:proofErr w:type="spellEnd"/>
+      <w:r>
+        <w:t xml:space="preserve">: An ontology for virtual reality training in ophthalmology Domain—A case study of cataract surgery’. </w:t>
       </w:r>
       <w:r>
         <w:rPr>
@@ -12582,7 +13265,15 @@
         <w:t>IEEE Access</w:t>
       </w:r>
       <w:r>
-        <w:t xml:space="preserve"> 9, pp. 152347–152378. doi: </w:t>
+        <w:t xml:space="preserve"> 9, pp. 152347–152378. </w:t>
+      </w:r>
+      <w:proofErr w:type="spellStart"/>
+      <w:r>
+        <w:t>doi</w:t>
+      </w:r>
+      <w:proofErr w:type="spellEnd"/>
+      <w:r>
+        <w:t xml:space="preserve">: </w:t>
       </w:r>
       <w:hyperlink r:id="rId36" w:history="1">
         <w:r>
@@ -12601,32 +13292,32 @@
       <w:pPr>
         <w:pStyle w:val="Heading1"/>
       </w:pPr>
-      <w:bookmarkStart w:id="52" w:name="_Toc224073664"/>
+      <w:bookmarkStart w:id="56" w:name="_Toc224125474"/>
       <w:r>
         <w:lastRenderedPageBreak/>
         <w:t>Appendix</w:t>
       </w:r>
-      <w:bookmarkEnd w:id="52"/>
+      <w:bookmarkEnd w:id="56"/>
     </w:p>
     <w:p>
       <w:pPr>
         <w:pStyle w:val="Heading2"/>
       </w:pPr>
-      <w:bookmarkStart w:id="53" w:name="_Toc224073665"/>
+      <w:bookmarkStart w:id="57" w:name="_Toc224125475"/>
       <w:r>
         <w:t>Asset Licenses and Sources</w:t>
       </w:r>
-      <w:bookmarkEnd w:id="53"/>
+      <w:bookmarkEnd w:id="57"/>
     </w:p>
     <w:p>
       <w:pPr>
         <w:pStyle w:val="Heading3"/>
       </w:pPr>
-      <w:bookmarkStart w:id="54" w:name="_Toc224073666"/>
+      <w:bookmarkStart w:id="58" w:name="_Toc224125476"/>
       <w:r>
         <w:t>Modern Office Table</w:t>
       </w:r>
-      <w:bookmarkEnd w:id="54"/>
+      <w:bookmarkEnd w:id="58"/>
     </w:p>
     <w:p>
       <w:r>
@@ -12706,11 +13397,11 @@
       <w:pPr>
         <w:pStyle w:val="Heading3"/>
       </w:pPr>
-      <w:bookmarkStart w:id="55" w:name="_Toc224073667"/>
+      <w:bookmarkStart w:id="59" w:name="_Toc224125477"/>
       <w:r>
         <w:t>Free Studio Starter Pack</w:t>
       </w:r>
-      <w:bookmarkEnd w:id="55"/>
+      <w:bookmarkEnd w:id="59"/>
     </w:p>
     <w:p>
       <w:r>
@@ -12790,11 +13481,11 @@
       <w:pPr>
         <w:pStyle w:val="Heading3"/>
       </w:pPr>
-      <w:bookmarkStart w:id="56" w:name="_Toc224073668"/>
+      <w:bookmarkStart w:id="60" w:name="_Toc224125478"/>
       <w:r>
         <w:t>General Desktop Bundle</w:t>
       </w:r>
-      <w:bookmarkEnd w:id="56"/>
+      <w:bookmarkEnd w:id="60"/>
     </w:p>
     <w:p>
       <w:r>
@@ -12874,12 +13565,12 @@
       <w:pPr>
         <w:pStyle w:val="Heading3"/>
       </w:pPr>
-      <w:bookmarkStart w:id="57" w:name="_Toc224073669"/>
+      <w:bookmarkStart w:id="61" w:name="_Toc224125479"/>
       <w:r>
         <w:lastRenderedPageBreak/>
         <w:t>General Gaming Headset</w:t>
       </w:r>
-      <w:bookmarkEnd w:id="57"/>
+      <w:bookmarkEnd w:id="61"/>
     </w:p>
     <w:p>
       <w:r>
@@ -12959,11 +13650,11 @@
       <w:pPr>
         <w:pStyle w:val="Heading3"/>
       </w:pPr>
-      <w:bookmarkStart w:id="58" w:name="_Toc224073670"/>
+      <w:bookmarkStart w:id="62" w:name="_Toc224125480"/>
       <w:r>
         <w:t>General Gaming Chair</w:t>
       </w:r>
-      <w:bookmarkEnd w:id="58"/>
+      <w:bookmarkEnd w:id="62"/>
     </w:p>
     <w:p>
       <w:r>
@@ -13043,11 +13734,11 @@
       <w:pPr>
         <w:pStyle w:val="Heading3"/>
       </w:pPr>
-      <w:bookmarkStart w:id="59" w:name="_Toc224073671"/>
+      <w:bookmarkStart w:id="63" w:name="_Toc224125481"/>
       <w:r>
         <w:t>Light Switch</w:t>
       </w:r>
-      <w:bookmarkEnd w:id="59"/>
+      <w:bookmarkEnd w:id="63"/>
     </w:p>
     <w:p>
       <w:r>
@@ -13141,7 +13832,7 @@
       <w:pPr>
         <w:pStyle w:val="Heading3"/>
       </w:pPr>
-      <w:bookmarkStart w:id="60" w:name="_Toc224073672"/>
+      <w:bookmarkStart w:id="64" w:name="_Toc224125482"/>
       <w:r>
         <w:lastRenderedPageBreak/>
         <w:t>Materials for General PC setup</w:t>
@@ -13149,7 +13840,7 @@
       <w:r>
         <w:t xml:space="preserve"> and Scenes</w:t>
       </w:r>
-      <w:bookmarkEnd w:id="60"/>
+      <w:bookmarkEnd w:id="64"/>
     </w:p>
     <w:p>
       <w:r>
@@ -13271,12 +13962,12 @@
       <w:pPr>
         <w:pStyle w:val="Heading3"/>
       </w:pPr>
-      <w:bookmarkStart w:id="61" w:name="_Toc224073673"/>
+      <w:bookmarkStart w:id="65" w:name="_Toc224125483"/>
       <w:r>
         <w:lastRenderedPageBreak/>
         <w:t>Monitor background image</w:t>
       </w:r>
-      <w:bookmarkEnd w:id="61"/>
+      <w:bookmarkEnd w:id="65"/>
     </w:p>
     <w:p>
       <w:r>
@@ -13367,12 +14058,25 @@
       <w:pPr>
         <w:pStyle w:val="Heading3"/>
       </w:pPr>
-      <w:bookmarkStart w:id="62" w:name="_Toc224073674"/>
+      <w:bookmarkStart w:id="66" w:name="_Toc224125484"/>
       <w:r>
         <w:lastRenderedPageBreak/>
-        <w:t>Button Hover Sfx by Fachii</w:t>
-      </w:r>
-      <w:bookmarkEnd w:id="62"/>
+        <w:t xml:space="preserve">Button Hover </w:t>
+      </w:r>
+      <w:proofErr w:type="spellStart"/>
+      <w:r>
+        <w:t>Sfx</w:t>
+      </w:r>
+      <w:proofErr w:type="spellEnd"/>
+      <w:r>
+        <w:t xml:space="preserve"> by </w:t>
+      </w:r>
+      <w:proofErr w:type="spellStart"/>
+      <w:r>
+        <w:t>Fachii</w:t>
+      </w:r>
+      <w:bookmarkEnd w:id="66"/>
+      <w:proofErr w:type="spellEnd"/>
     </w:p>
     <w:p>
       <w:r>
@@ -13467,14 +14171,36 @@
     </w:p>
     <w:p/>
     <w:p>
-      <w:bookmarkStart w:id="63" w:name="_Toc224073675"/>
+      <w:bookmarkStart w:id="67" w:name="_Toc224125485"/>
       <w:r>
         <w:rPr>
           <w:rStyle w:val="Heading3Char"/>
         </w:rPr>
-        <w:t>Button click Sfx by AndrewEathan</w:t>
-      </w:r>
-      <w:bookmarkEnd w:id="63"/>
+        <w:t xml:space="preserve">Button click </w:t>
+      </w:r>
+      <w:proofErr w:type="spellStart"/>
+      <w:r>
+        <w:rPr>
+          <w:rStyle w:val="Heading3Char"/>
+        </w:rPr>
+        <w:t>Sfx</w:t>
+      </w:r>
+      <w:proofErr w:type="spellEnd"/>
+      <w:r>
+        <w:rPr>
+          <w:rStyle w:val="Heading3Char"/>
+        </w:rPr>
+        <w:t xml:space="preserve"> by </w:t>
+      </w:r>
+      <w:proofErr w:type="spellStart"/>
+      <w:r>
+        <w:rPr>
+          <w:rStyle w:val="Heading3Char"/>
+        </w:rPr>
+        <w:t>AndrewEathan</w:t>
+      </w:r>
+      <w:bookmarkEnd w:id="67"/>
+      <w:proofErr w:type="spellEnd"/>
       <w:r>
         <w:t xml:space="preserve"> </w:t>
       </w:r>
@@ -13580,12 +14306,25 @@
       <w:pPr>
         <w:pStyle w:val="Heading3"/>
       </w:pPr>
-      <w:bookmarkStart w:id="64" w:name="_Toc224073676"/>
+      <w:bookmarkStart w:id="68" w:name="_Toc224125486"/>
       <w:r>
         <w:lastRenderedPageBreak/>
-        <w:t>Light Switch On Sfx</w:t>
-      </w:r>
-      <w:bookmarkEnd w:id="64"/>
+        <w:t xml:space="preserve">Light Switch </w:t>
+      </w:r>
+      <w:proofErr w:type="gramStart"/>
+      <w:r>
+        <w:t>On</w:t>
+      </w:r>
+      <w:proofErr w:type="gramEnd"/>
+      <w:r>
+        <w:t xml:space="preserve"> </w:t>
+      </w:r>
+      <w:proofErr w:type="spellStart"/>
+      <w:r>
+        <w:t>Sfx</w:t>
+      </w:r>
+      <w:bookmarkEnd w:id="68"/>
+      <w:proofErr w:type="spellEnd"/>
     </w:p>
     <w:p>
       <w:r>
@@ -13675,11 +14414,16 @@
       <w:pPr>
         <w:pStyle w:val="Heading3"/>
       </w:pPr>
-      <w:bookmarkStart w:id="65" w:name="_Toc224073677"/>
-      <w:r>
-        <w:t>Light Switch Off Sfx</w:t>
-      </w:r>
-      <w:bookmarkEnd w:id="65"/>
+      <w:bookmarkStart w:id="69" w:name="_Toc224125487"/>
+      <w:r>
+        <w:t xml:space="preserve">Light Switch Off </w:t>
+      </w:r>
+      <w:proofErr w:type="spellStart"/>
+      <w:r>
+        <w:t>Sfx</w:t>
+      </w:r>
+      <w:bookmarkEnd w:id="69"/>
+      <w:proofErr w:type="spellEnd"/>
     </w:p>
     <w:p>
       <w:r>

</xml_diff>

<commit_message>
More work on the critical evaluation section
</commit_message>
<xml_diff>
--- a/30077548Thesis.docx
+++ b/30077548Thesis.docx
@@ -7534,21 +7534,7 @@
         <w:rPr>
           <w:rFonts w:cs="Arial"/>
         </w:rPr>
-        <w:t xml:space="preserve">Clear </w:t>
-      </w:r>
-      <w:proofErr w:type="gramStart"/>
-      <w:r>
-        <w:rPr>
-          <w:rFonts w:cs="Arial"/>
-        </w:rPr>
-        <w:t>on screen</w:t>
-      </w:r>
-      <w:proofErr w:type="gramEnd"/>
-      <w:r>
-        <w:rPr>
-          <w:rFonts w:cs="Arial"/>
-        </w:rPr>
-        <w:t xml:space="preserve"> prompts to guide and support users that aren’t familiar with VR equipment</w:t>
+        <w:t>Clear on screen prompts to guide and support users that aren’t familiar with VR equipment</w:t>
       </w:r>
     </w:p>
     <w:p>
@@ -10656,15 +10642,7 @@
         <w:t xml:space="preserve"> simulated </w:t>
       </w:r>
       <w:r>
-        <w:t xml:space="preserve">were </w:t>
-      </w:r>
-      <w:proofErr w:type="gramStart"/>
-      <w:r>
-        <w:t>vignette</w:t>
-      </w:r>
-      <w:proofErr w:type="gramEnd"/>
-      <w:r>
-        <w:t xml:space="preserve"> to simulate eye fatigue, bloom for light sensitivity and blur for focus strain. Vignette and bloom post processing effects were triggered </w:t>
+        <w:t xml:space="preserve">were vignette to simulate eye fatigue, bloom for light sensitivity and blur for focus strain. Vignette and bloom post processing effects were triggered </w:t>
       </w:r>
       <w:r>
         <w:t>by</w:t>
@@ -11978,15 +11956,56 @@
       <w:bookmarkEnd w:id="47"/>
     </w:p>
     <w:p>
-      <w:pPr>
-        <w:pStyle w:val="ListParagraph"/>
-        <w:numPr>
-          <w:ilvl w:val="0"/>
-          <w:numId w:val="14"/>
-        </w:numPr>
-      </w:pPr>
-      <w:r>
-        <w:t>Intro paragraph, discuss there were good and bads, highs and lows.</w:t>
+      <w:r>
+        <w:t>This section evaluates the development, outcome and other factors that affected the application</w:t>
+      </w:r>
+      <w:r>
+        <w:t xml:space="preserve"> </w:t>
+      </w:r>
+      <w:r>
+        <w:t>created to raise awareness of DES through simulating its symptoms and teaching preventative measures.</w:t>
+      </w:r>
+      <w:r>
+        <w:t xml:space="preserve"> </w:t>
+      </w:r>
+      <w:r>
+        <w:t>The result</w:t>
+      </w:r>
+      <w:r>
+        <w:t>s</w:t>
+      </w:r>
+      <w:r>
+        <w:t xml:space="preserve"> of the project</w:t>
+      </w:r>
+      <w:r>
+        <w:t xml:space="preserve"> are </w:t>
+      </w:r>
+      <w:r>
+        <w:t xml:space="preserve">considered and compared with the aims and objectives </w:t>
+      </w:r>
+      <w:r>
+        <w:t>established</w:t>
+      </w:r>
+      <w:r>
+        <w:t xml:space="preserve"> at the beginning. Strengths, limitations, challenges faced during the development process and other factors will be compared to give an overall unbiased evaluation of the success of the project. This critical evaluation aims to highlight areas for improvement</w:t>
+      </w:r>
+      <w:r>
+        <w:t>s</w:t>
+      </w:r>
+      <w:r>
+        <w:t xml:space="preserve"> in future work</w:t>
+      </w:r>
+      <w:r>
+        <w:t xml:space="preserve"> that</w:t>
+      </w:r>
+      <w:r>
+        <w:t xml:space="preserve"> could be explore</w:t>
+      </w:r>
+      <w:r>
+        <w:t>d</w:t>
+      </w:r>
+      <w:r>
+        <w:t>.</w:t>
       </w:r>
     </w:p>
     <w:p>
@@ -12022,6 +12041,11 @@
       </w:r>
     </w:p>
     <w:p>
+      <w:r>
+        <w:t xml:space="preserve">A prominent strength of the experience was that </w:t>
+      </w:r>
+    </w:p>
+    <w:p>
       <w:pPr>
         <w:pStyle w:val="ListParagraph"/>
         <w:numPr>
@@ -12033,6 +12057,7 @@
         <w:t>Objective based progression gamified the experience, increased interactivity</w:t>
       </w:r>
     </w:p>
+    <w:p/>
     <w:p>
       <w:pPr>
         <w:pStyle w:val="ListParagraph"/>
@@ -12045,6 +12070,7 @@
         <w:t>Gaze interaction was an intuitive control method that didn’t need down time to be taught to be understood</w:t>
       </w:r>
     </w:p>
+    <w:p/>
     <w:p>
       <w:pPr>
         <w:pStyle w:val="ListParagraph"/>
@@ -12057,6 +12083,7 @@
         <w:t>Using iterative testing improved usability</w:t>
       </w:r>
     </w:p>
+    <w:p/>
     <w:p>
       <w:pPr>
         <w:pStyle w:val="Heading3"/>
@@ -12079,6 +12106,7 @@
         <w:t>Small number and limited diversity of testers</w:t>
       </w:r>
     </w:p>
+    <w:p/>
     <w:p>
       <w:pPr>
         <w:pStyle w:val="ListParagraph"/>
@@ -12091,6 +12119,7 @@
         <w:t>Only visual symptoms have been simulated, not the physiological feeling with those symptoms or physical ones</w:t>
       </w:r>
     </w:p>
+    <w:p/>
     <w:p>
       <w:pPr>
         <w:pStyle w:val="ListParagraph"/>
@@ -12103,6 +12132,7 @@
         <w:t>Limited amount of interaction, gaze detection and turning a switch on and off, can be restrictive in certain perspectives</w:t>
       </w:r>
     </w:p>
+    <w:p/>
     <w:p>
       <w:pPr>
         <w:pStyle w:val="ListParagraph"/>
@@ -12115,6 +12145,7 @@
         <w:t>No accessibility settings to accommodate different user groups</w:t>
       </w:r>
     </w:p>
+    <w:p/>
     <w:p>
       <w:pPr>
         <w:pStyle w:val="Heading2"/>
@@ -12137,6 +12168,7 @@
         <w:t>Learning curve for VR development within Unreal Engine, brief experience with VR in Unity however there were still gaps in areas of my knowledge within Unreal Engine and VR development.</w:t>
       </w:r>
     </w:p>
+    <w:p/>
     <w:p>
       <w:pPr>
         <w:pStyle w:val="ListParagraph"/>
@@ -12149,6 +12181,7 @@
         <w:t>Balancing symptom simulation intensities so it could be appropriate to convey the message without causing harm to users.</w:t>
       </w:r>
     </w:p>
+    <w:p/>
     <w:p>
       <w:pPr>
         <w:pStyle w:val="ListParagraph"/>
@@ -12161,6 +12194,7 @@
         <w:t>Diegetic UI implementation in the scene so that it didn’t just feel like a game on a screen.</w:t>
       </w:r>
     </w:p>
+    <w:p/>
     <w:p>
       <w:pPr>
         <w:pStyle w:val="ListParagraph"/>
@@ -12173,6 +12207,7 @@
         <w:t>Lack of tutorials specific to what I was trying to implement meant a lot of trial and error.</w:t>
       </w:r>
     </w:p>
+    <w:p/>
     <w:p>
       <w:pPr>
         <w:pStyle w:val="Heading2"/>
@@ -12207,6 +12242,7 @@
         <w:t xml:space="preserve"> could affect how easily they could understand the controls, so had to be simplified to an intuitive control and then a trigger control with the switch.</w:t>
       </w:r>
     </w:p>
+    <w:p/>
     <w:p>
       <w:pPr>
         <w:pStyle w:val="ListParagraph"/>
@@ -12219,16 +12255,15 @@
         <w:t xml:space="preserve">Lack of testers and range of testers (technical and </w:t>
       </w:r>
       <w:proofErr w:type="spellStart"/>
-      <w:proofErr w:type="gramStart"/>
       <w:r>
         <w:t>non technical</w:t>
       </w:r>
       <w:proofErr w:type="spellEnd"/>
-      <w:proofErr w:type="gramEnd"/>
       <w:r>
         <w:t>)</w:t>
       </w:r>
     </w:p>
+    <w:p/>
     <w:p>
       <w:pPr>
         <w:pStyle w:val="ListParagraph"/>
@@ -12241,6 +12276,7 @@
         <w:t>External life factors that were out of my control impacted the time that was able to be spent on this project, found ways around it but was still unfortunate to lose time I originally thought I had on this project.</w:t>
       </w:r>
     </w:p>
+    <w:p/>
     <w:p>
       <w:pPr>
         <w:pStyle w:val="ListParagraph"/>
@@ -12253,6 +12289,7 @@
         <w:t>Lack of diverse hardware to test on, worked off a meta quest 3 so other devices have not been tested with the experience</w:t>
       </w:r>
     </w:p>
+    <w:p/>
     <w:p>
       <w:pPr>
         <w:pStyle w:val="ListParagraph"/>
@@ -12501,22 +12538,10 @@
           <w:i/>
           <w:iCs/>
         </w:rPr>
-        <w:t>2016 IEEE Region 10 Symposium (TENSYMP</w:t>
-      </w:r>
-      <w:proofErr w:type="gramStart"/>
-      <w:r>
-        <w:rPr>
-          <w:i/>
-          <w:iCs/>
-        </w:rPr>
-        <w:t>)</w:t>
-      </w:r>
-      <w:r>
-        <w:t xml:space="preserve"> .</w:t>
-      </w:r>
-      <w:proofErr w:type="gramEnd"/>
-      <w:r>
-        <w:t xml:space="preserve"> </w:t>
+        <w:t>2016 IEEE Region 10 Symposium (TENSYMP)</w:t>
+      </w:r>
+      <w:r>
+        <w:t xml:space="preserve"> . </w:t>
       </w:r>
       <w:proofErr w:type="spellStart"/>
       <w:r>
@@ -12621,15 +12646,7 @@
       </w:r>
       <w:proofErr w:type="spellEnd"/>
       <w:r>
-        <w:t xml:space="preserve">, M. (2013) ‘Computer vision syndrome: a study of knowledge and practices in university </w:t>
-      </w:r>
-      <w:proofErr w:type="gramStart"/>
-      <w:r>
-        <w:t>students’</w:t>
-      </w:r>
-      <w:proofErr w:type="gramEnd"/>
-      <w:r>
-        <w:t xml:space="preserve">. </w:t>
+        <w:t xml:space="preserve">, M. (2013) ‘Computer vision syndrome: a study of knowledge and practices in university students’. </w:t>
       </w:r>
       <w:r>
         <w:rPr>
@@ -12772,37 +12789,21 @@
           <w:i/>
           <w:iCs/>
         </w:rPr>
-        <w:t xml:space="preserve">User-Centred Systems </w:t>
-      </w:r>
-      <w:proofErr w:type="gramStart"/>
+        <w:t>User-Centred Systems Design</w:t>
+      </w:r>
       <w:r>
         <w:rPr>
           <w:i/>
           <w:iCs/>
         </w:rPr>
-        <w:t>Design</w:t>
+        <w:t xml:space="preserve"> </w:t>
       </w:r>
       <w:r>
         <w:rPr>
           <w:i/>
           <w:iCs/>
         </w:rPr>
-        <w:t xml:space="preserve"> </w:t>
-      </w:r>
-      <w:r>
-        <w:rPr>
-          <w:i/>
-          <w:iCs/>
-        </w:rPr>
-        <w:t>:</w:t>
-      </w:r>
-      <w:proofErr w:type="gramEnd"/>
-      <w:r>
-        <w:rPr>
-          <w:i/>
-          <w:iCs/>
-        </w:rPr>
-        <w:t xml:space="preserve"> Designing Usable Interactive Systems in Practice</w:t>
+        <w:t>: Designing Usable Interactive Systems in Practice</w:t>
       </w:r>
       <w:r>
         <w:t xml:space="preserve">. Available at: </w:t>
@@ -12975,15 +12976,7 @@
       </w:r>
       <w:proofErr w:type="spellEnd"/>
       <w:r>
-        <w:t xml:space="preserve">, E., Pons, A. and Lorente, A. (2016) ‘Visual and ocular effects from the use of flat-panel </w:t>
-      </w:r>
-      <w:proofErr w:type="gramStart"/>
-      <w:r>
-        <w:t>displays’</w:t>
-      </w:r>
-      <w:proofErr w:type="gramEnd"/>
-      <w:r>
-        <w:t xml:space="preserve">. </w:t>
+        <w:t xml:space="preserve">, E., Pons, A. and Lorente, A. (2016) ‘Visual and ocular effects from the use of flat-panel displays’. </w:t>
       </w:r>
       <w:r>
         <w:rPr>
@@ -13019,7 +13012,6 @@
       <w:r>
         <w:t xml:space="preserve">, W. (2004) ‘(PDF) Balancing the 5Es: Usability’. </w:t>
       </w:r>
-      <w:proofErr w:type="gramStart"/>
       <w:r>
         <w:rPr>
           <w:i/>
@@ -13028,11 +13020,7 @@
         <w:t>ResearchGate</w:t>
       </w:r>
       <w:r>
-        <w:t xml:space="preserve"> .</w:t>
-      </w:r>
-      <w:proofErr w:type="gramEnd"/>
-      <w:r>
-        <w:t xml:space="preserve"> Available at: </w:t>
+        <w:t xml:space="preserve"> . Available at: </w:t>
       </w:r>
       <w:hyperlink r:id="rId29" w:history="1">
         <w:r>
@@ -13056,15 +13044,7 @@
       </w:r>
       <w:proofErr w:type="spellEnd"/>
       <w:r>
-        <w:t xml:space="preserve"> (2025) ‘Virtual vs. traditional learning in higher education: A systematic review of comparative </w:t>
-      </w:r>
-      <w:proofErr w:type="gramStart"/>
-      <w:r>
-        <w:t>studies’</w:t>
-      </w:r>
-      <w:proofErr w:type="gramEnd"/>
-      <w:r>
-        <w:t xml:space="preserve">. </w:t>
+        <w:t xml:space="preserve"> (2025) ‘Virtual vs. traditional learning in higher education: A systematic review of comparative studies’. </w:t>
       </w:r>
       <w:r>
         <w:rPr>
@@ -13097,22 +13077,10 @@
           <w:i/>
           <w:iCs/>
         </w:rPr>
-        <w:t xml:space="preserve">Communications in computer and information </w:t>
-      </w:r>
-      <w:proofErr w:type="gramStart"/>
-      <w:r>
-        <w:rPr>
-          <w:i/>
-          <w:iCs/>
-        </w:rPr>
-        <w:t>science</w:t>
-      </w:r>
-      <w:r>
-        <w:t xml:space="preserve"> ,</w:t>
-      </w:r>
-      <w:proofErr w:type="gramEnd"/>
-      <w:r>
-        <w:t xml:space="preserve"> pp. 111–115. </w:t>
+        <w:t>Communications in computer and information science</w:t>
+      </w:r>
+      <w:r>
+        <w:t xml:space="preserve"> , pp. 111–115. </w:t>
       </w:r>
       <w:proofErr w:type="spellStart"/>
       <w:r>
@@ -14309,15 +14277,7 @@
       <w:bookmarkStart w:id="68" w:name="_Toc224125486"/>
       <w:r>
         <w:lastRenderedPageBreak/>
-        <w:t xml:space="preserve">Light Switch </w:t>
-      </w:r>
-      <w:proofErr w:type="gramStart"/>
-      <w:r>
-        <w:t>On</w:t>
-      </w:r>
-      <w:proofErr w:type="gramEnd"/>
-      <w:r>
-        <w:t xml:space="preserve"> </w:t>
+        <w:t xml:space="preserve">Light Switch On </w:t>
       </w:r>
       <w:proofErr w:type="spellStart"/>
       <w:r>

</xml_diff>

<commit_message>
Jotted down sentences for each of the points in the strengths section, and for first point in weaknesses section
</commit_message>
<xml_diff>
--- a/30077548Thesis.docx
+++ b/30077548Thesis.docx
@@ -5839,13 +5839,8 @@
       <w:r>
         <w:t xml:space="preserve">. </w:t>
       </w:r>
-      <w:proofErr w:type="spellStart"/>
-      <w:r>
-        <w:t>Porcar</w:t>
-      </w:r>
-      <w:proofErr w:type="spellEnd"/>
-      <w:r>
-        <w:t xml:space="preserve"> et al., </w:t>
+      <w:r>
+        <w:t xml:space="preserve">Porcar et al., </w:t>
       </w:r>
       <w:r>
         <w:t>(</w:t>
@@ -5885,13 +5880,8 @@
       <w:r>
         <w:t xml:space="preserve">Research conducted by </w:t>
       </w:r>
-      <w:proofErr w:type="spellStart"/>
-      <w:r>
-        <w:t>Cantó</w:t>
-      </w:r>
-      <w:proofErr w:type="spellEnd"/>
-      <w:r>
-        <w:t xml:space="preserve">-Sancho et al., </w:t>
+      <w:r>
+        <w:t xml:space="preserve">Cantó-Sancho et al., </w:t>
       </w:r>
       <w:r>
         <w:t>(</w:t>
@@ -7677,7 +7667,6 @@
         <w:pStyle w:val="Heading3"/>
       </w:pPr>
       <w:bookmarkStart w:id="11" w:name="_Toc224125429"/>
-      <w:proofErr w:type="spellStart"/>
       <w:r>
         <w:t>Ey</w:t>
       </w:r>
@@ -7688,7 +7677,6 @@
         <w:t>si</w:t>
       </w:r>
       <w:bookmarkEnd w:id="11"/>
-      <w:proofErr w:type="spellEnd"/>
     </w:p>
     <w:p>
       <w:r>
@@ -7703,11 +7691,9 @@
       <w:r>
         <w:t xml:space="preserve"> discussed </w:t>
       </w:r>
-      <w:proofErr w:type="spellStart"/>
       <w:r>
         <w:t>Eyesi</w:t>
       </w:r>
-      <w:proofErr w:type="spellEnd"/>
       <w:r>
         <w:t>,</w:t>
       </w:r>
@@ -7820,15 +7806,7 @@
         <w:t xml:space="preserve">In addition to this, there is an </w:t>
       </w:r>
       <w:r>
-        <w:t>online training portal (</w:t>
-      </w:r>
-      <w:proofErr w:type="spellStart"/>
-      <w:r>
-        <w:t>vrmnet</w:t>
-      </w:r>
-      <w:proofErr w:type="spellEnd"/>
-      <w:r>
-        <w:t xml:space="preserve">) </w:t>
+        <w:t xml:space="preserve">online training portal (vrmnet) </w:t>
       </w:r>
       <w:r>
         <w:t>allowing comparison between trainees</w:t>
@@ -7963,15 +7941,7 @@
         <w:t xml:space="preserve"> </w:t>
       </w:r>
       <w:r>
-        <w:t xml:space="preserve">While </w:t>
-      </w:r>
-      <w:proofErr w:type="spellStart"/>
-      <w:r>
-        <w:t>Eyesi</w:t>
-      </w:r>
-      <w:proofErr w:type="spellEnd"/>
-      <w:r>
-        <w:t xml:space="preserve"> is effective for medical training for medical professionals, </w:t>
+        <w:t xml:space="preserve">While Eyesi is effective for medical training for medical professionals, </w:t>
       </w:r>
       <w:r>
         <w:t xml:space="preserve">similar </w:t>
@@ -7994,12 +7964,10 @@
         <w:pStyle w:val="Heading3"/>
       </w:pPr>
       <w:bookmarkStart w:id="12" w:name="_Toc224125430"/>
-      <w:proofErr w:type="spellStart"/>
       <w:r>
         <w:t>OntoPhaco</w:t>
       </w:r>
       <w:bookmarkEnd w:id="12"/>
-      <w:proofErr w:type="spellEnd"/>
     </w:p>
     <w:p>
       <w:r>
@@ -8018,15 +7986,7 @@
         <w:t>d</w:t>
       </w:r>
       <w:r>
-        <w:t xml:space="preserve"> </w:t>
-      </w:r>
-      <w:proofErr w:type="spellStart"/>
-      <w:r>
-        <w:t>OntoPhaco</w:t>
-      </w:r>
-      <w:proofErr w:type="spellEnd"/>
-      <w:r>
-        <w:t>, a</w:t>
+        <w:t xml:space="preserve"> OntoPhaco, a</w:t>
       </w:r>
       <w:r>
         <w:t>n</w:t>
@@ -8159,191 +8119,173 @@
           <w:rFonts w:cs="TimesLTStd-Roman"/>
           <w:kern w:val="0"/>
         </w:rPr>
-        <w:t xml:space="preserve">Since </w:t>
-      </w:r>
-      <w:proofErr w:type="spellStart"/>
+        <w:t>Since OntoPhaco</w:t>
+      </w:r>
       <w:r>
         <w:rPr>
           <w:rFonts w:cs="TimesLTStd-Roman"/>
           <w:kern w:val="0"/>
         </w:rPr>
-        <w:t>OntoPhaco</w:t>
+        <w:t>’s</w:t>
       </w:r>
       <w:r>
         <w:rPr>
           <w:rFonts w:cs="TimesLTStd-Roman"/>
           <w:kern w:val="0"/>
         </w:rPr>
-        <w:t>’s</w:t>
-      </w:r>
-      <w:proofErr w:type="spellEnd"/>
+        <w:t xml:space="preserve"> </w:t>
+      </w:r>
+      <w:r>
+        <w:t>s</w:t>
+      </w:r>
+      <w:r>
+        <w:t xml:space="preserve">ystematic verification and validation processes </w:t>
+      </w:r>
+      <w:r>
+        <w:t>include</w:t>
+      </w:r>
+      <w:r>
+        <w:t xml:space="preserve"> </w:t>
+      </w:r>
+      <w:r>
+        <w:t xml:space="preserve">theoretical </w:t>
+      </w:r>
+      <w:r>
+        <w:t>evaluat</w:t>
+      </w:r>
+      <w:r>
+        <w:t xml:space="preserve">ion </w:t>
+      </w:r>
+      <w:r>
+        <w:t>and expert feedback</w:t>
+      </w:r>
       <w:r>
         <w:rPr>
           <w:rFonts w:cs="TimesLTStd-Roman"/>
           <w:kern w:val="0"/>
         </w:rPr>
-        <w:t xml:space="preserve"> </w:t>
-      </w:r>
-      <w:r>
-        <w:t>s</w:t>
-      </w:r>
-      <w:r>
-        <w:t xml:space="preserve">ystematic verification and validation processes </w:t>
-      </w:r>
-      <w:r>
-        <w:t>include</w:t>
-      </w:r>
-      <w:r>
-        <w:t xml:space="preserve"> </w:t>
-      </w:r>
-      <w:r>
-        <w:t xml:space="preserve">theoretical </w:t>
-      </w:r>
-      <w:r>
-        <w:t>evaluat</w:t>
-      </w:r>
-      <w:r>
-        <w:t xml:space="preserve">ion </w:t>
-      </w:r>
-      <w:r>
-        <w:t>and expert feedback</w:t>
+        <w:t xml:space="preserve">, each change, minor or major </w:t>
       </w:r>
       <w:r>
         <w:rPr>
           <w:rFonts w:cs="TimesLTStd-Roman"/>
           <w:kern w:val="0"/>
         </w:rPr>
-        <w:t xml:space="preserve">, each change, minor or major </w:t>
+        <w:t>is</w:t>
       </w:r>
       <w:r>
         <w:rPr>
           <w:rFonts w:cs="TimesLTStd-Roman"/>
           <w:kern w:val="0"/>
         </w:rPr>
-        <w:t>is</w:t>
+        <w:t xml:space="preserve"> verified and validate</w:t>
       </w:r>
       <w:r>
         <w:rPr>
           <w:rFonts w:cs="TimesLTStd-Roman"/>
           <w:kern w:val="0"/>
         </w:rPr>
-        <w:t xml:space="preserve"> verified and validate</w:t>
+        <w:t>d</w:t>
+      </w:r>
+      <w:r>
+        <w:t>.</w:t>
       </w:r>
       <w:r>
         <w:rPr>
           <w:rFonts w:cs="TimesLTStd-Roman"/>
           <w:kern w:val="0"/>
         </w:rPr>
-        <w:t>d</w:t>
-      </w:r>
-      <w:r>
-        <w:t>.</w:t>
+        <w:t xml:space="preserve"> </w:t>
       </w:r>
       <w:r>
         <w:rPr>
           <w:rFonts w:cs="TimesLTStd-Roman"/>
           <w:kern w:val="0"/>
         </w:rPr>
-        <w:t xml:space="preserve"> </w:t>
-      </w:r>
-      <w:proofErr w:type="spellStart"/>
+        <w:t>OntoPhaco demonstrates VR</w:t>
+      </w:r>
       <w:r>
         <w:rPr>
           <w:rFonts w:cs="TimesLTStd-Roman"/>
           <w:kern w:val="0"/>
         </w:rPr>
-        <w:t>OntoPhaco</w:t>
-      </w:r>
-      <w:proofErr w:type="spellEnd"/>
+        <w:t>’</w:t>
+      </w:r>
       <w:r>
         <w:rPr>
           <w:rFonts w:cs="TimesLTStd-Roman"/>
           <w:kern w:val="0"/>
         </w:rPr>
-        <w:t xml:space="preserve"> demonstrates VR</w:t>
+        <w:t xml:space="preserve">s effectiveness </w:t>
       </w:r>
       <w:r>
         <w:rPr>
           <w:rFonts w:cs="TimesLTStd-Roman"/>
           <w:kern w:val="0"/>
         </w:rPr>
-        <w:t>’</w:t>
+        <w:t xml:space="preserve">paired </w:t>
       </w:r>
       <w:r>
         <w:rPr>
           <w:rFonts w:cs="TimesLTStd-Roman"/>
           <w:kern w:val="0"/>
         </w:rPr>
-        <w:t xml:space="preserve">s effectiveness </w:t>
+        <w:t>with ontology for medical training</w:t>
       </w:r>
       <w:r>
         <w:rPr>
           <w:rFonts w:cs="TimesLTStd-Roman"/>
           <w:kern w:val="0"/>
         </w:rPr>
-        <w:t xml:space="preserve">paired </w:t>
+        <w:t>. T</w:t>
       </w:r>
       <w:r>
         <w:rPr>
           <w:rFonts w:cs="TimesLTStd-Roman"/>
           <w:kern w:val="0"/>
         </w:rPr>
-        <w:t>with ontology for medical training</w:t>
+        <w:t>his project</w:t>
       </w:r>
       <w:r>
         <w:rPr>
           <w:rFonts w:cs="TimesLTStd-Roman"/>
           <w:kern w:val="0"/>
         </w:rPr>
-        <w:t>. T</w:t>
+        <w:t xml:space="preserve"> applies similar immersi</w:t>
       </w:r>
       <w:r>
         <w:rPr>
           <w:rFonts w:cs="TimesLTStd-Roman"/>
           <w:kern w:val="0"/>
         </w:rPr>
-        <w:t>his project</w:t>
+        <w:t>ve</w:t>
       </w:r>
       <w:r>
         <w:rPr>
           <w:rFonts w:cs="TimesLTStd-Roman"/>
           <w:kern w:val="0"/>
         </w:rPr>
-        <w:t xml:space="preserve"> applies similar immersi</w:t>
+        <w:t xml:space="preserve"> and educational knowledge </w:t>
       </w:r>
       <w:r>
         <w:rPr>
           <w:rFonts w:cs="TimesLTStd-Roman"/>
           <w:kern w:val="0"/>
         </w:rPr>
-        <w:t>ve</w:t>
+        <w:t xml:space="preserve">for DES to raise awareness, </w:t>
       </w:r>
       <w:r>
         <w:rPr>
           <w:rFonts w:cs="TimesLTStd-Roman"/>
           <w:kern w:val="0"/>
         </w:rPr>
-        <w:t xml:space="preserve"> and educational knowledge </w:t>
+        <w:t xml:space="preserve">spreading the </w:t>
       </w:r>
       <w:r>
         <w:rPr>
           <w:rFonts w:cs="TimesLTStd-Roman"/>
           <w:kern w:val="0"/>
         </w:rPr>
-        <w:t xml:space="preserve">for DES to raise awareness, </w:t>
-      </w:r>
-      <w:r>
-        <w:rPr>
-          <w:rFonts w:cs="TimesLTStd-Roman"/>
-          <w:kern w:val="0"/>
-        </w:rPr>
-        <w:t xml:space="preserve">spreading the </w:t>
-      </w:r>
-      <w:r>
-        <w:rPr>
-          <w:rFonts w:cs="TimesLTStd-Roman"/>
-          <w:kern w:val="0"/>
-        </w:rPr>
         <w:t>benefits of VR use in education beyond professional training.</w:t>
       </w:r>
     </w:p>
@@ -8557,27 +8499,17 @@
       <w:r>
         <w:t xml:space="preserve">While </w:t>
       </w:r>
-      <w:proofErr w:type="spellStart"/>
-      <w:r>
-        <w:t>Eyesi</w:t>
-      </w:r>
-      <w:proofErr w:type="spellEnd"/>
-      <w:r>
-        <w:t xml:space="preserve"> focuses on hands on surgical practices</w:t>
+      <w:r>
+        <w:t>Eyesi focuses on hands on surgical practices</w:t>
       </w:r>
       <w:r>
         <w:t xml:space="preserve">, </w:t>
       </w:r>
-      <w:proofErr w:type="spellStart"/>
       <w:r>
         <w:t>O</w:t>
       </w:r>
       <w:r>
-        <w:t>ntoPhaco</w:t>
-      </w:r>
-      <w:proofErr w:type="spellEnd"/>
-      <w:r>
-        <w:t xml:space="preserve"> focuses on the way knowledge is represented and conceptual understanding</w:t>
+        <w:t>ntoPhaco focuses on the way knowledge is represented and conceptual understanding</w:t>
       </w:r>
       <w:r>
         <w:t xml:space="preserve">. </w:t>
@@ -8835,19 +8767,9 @@
       <w:r>
         <w:t xml:space="preserve">Examples such as </w:t>
       </w:r>
-      <w:proofErr w:type="spellStart"/>
-      <w:r>
-        <w:t>Mediverse</w:t>
-      </w:r>
-      <w:proofErr w:type="spellEnd"/>
-      <w:r>
-        <w:t xml:space="preserve"> by </w:t>
-      </w:r>
-      <w:proofErr w:type="spellStart"/>
-      <w:r>
-        <w:t>Goggleminds</w:t>
-      </w:r>
-      <w:proofErr w:type="spellEnd"/>
+      <w:r>
+        <w:t>Mediverse by Goggleminds</w:t>
+      </w:r>
       <w:r>
         <w:t xml:space="preserve"> </w:t>
       </w:r>
@@ -8861,38 +8783,25 @@
         <w:t xml:space="preserve"> to healthcare providers and medical schools</w:t>
       </w:r>
       <w:r>
+        <w:t>. ClassVR by Systems improve</w:t>
+      </w:r>
+      <w:r>
+        <w:t>s</w:t>
+      </w:r>
+      <w:r>
+        <w:t xml:space="preserve"> student engagement</w:t>
+      </w:r>
+      <w:r>
+        <w:t xml:space="preserve"> to help teachers with educating students on learning material</w:t>
+      </w:r>
+      <w:r>
         <w:t xml:space="preserve">. </w:t>
       </w:r>
-      <w:proofErr w:type="spellStart"/>
-      <w:r>
-        <w:t>ClassVR</w:t>
-      </w:r>
-      <w:proofErr w:type="spellEnd"/>
-      <w:r>
-        <w:t xml:space="preserve"> by Systems improve</w:t>
-      </w:r>
-      <w:r>
-        <w:t>s</w:t>
-      </w:r>
-      <w:r>
-        <w:t xml:space="preserve"> student engagement</w:t>
-      </w:r>
-      <w:r>
-        <w:t xml:space="preserve"> to help teachers with educating students on learning material</w:t>
-      </w:r>
-      <w:r>
-        <w:t xml:space="preserve">. </w:t>
-      </w:r>
-      <w:r>
-        <w:t xml:space="preserve"> </w:t>
-      </w:r>
-      <w:proofErr w:type="spellStart"/>
-      <w:r>
-        <w:t>PrismsVR</w:t>
-      </w:r>
-      <w:proofErr w:type="spellEnd"/>
-      <w:r>
-        <w:t xml:space="preserve"> </w:t>
+      <w:r>
+        <w:t xml:space="preserve"> </w:t>
+      </w:r>
+      <w:r>
+        <w:t xml:space="preserve">PrismsVR </w:t>
       </w:r>
       <w:r>
         <w:t xml:space="preserve">helps students grasp core concepts in algebra and geometry, by </w:t>
@@ -9935,13 +9844,8 @@
       <w:r>
         <w:t xml:space="preserve"> </w:t>
       </w:r>
-      <w:proofErr w:type="spellStart"/>
-      <w:r>
-        <w:t>Looyestyn</w:t>
-      </w:r>
-      <w:proofErr w:type="spellEnd"/>
-      <w:r>
-        <w:t xml:space="preserve"> et al., </w:t>
+      <w:r>
+        <w:t xml:space="preserve">Looyestyn et al., </w:t>
       </w:r>
       <w:r>
         <w:t>(</w:t>
@@ -10240,15 +10144,7 @@
         <w:t>ere</w:t>
       </w:r>
       <w:r>
-        <w:t xml:space="preserve"> stored within the </w:t>
-      </w:r>
-      <w:proofErr w:type="spellStart"/>
-      <w:r>
-        <w:t>VRGameMode</w:t>
-      </w:r>
-      <w:proofErr w:type="spellEnd"/>
-      <w:r>
-        <w:t xml:space="preserve"> blueprint, with objectives being updated during runtime as conditions were satisfied </w:t>
+        <w:t xml:space="preserve"> stored within the VRGameMode blueprint, with objectives being updated during runtime as conditions were satisfied </w:t>
       </w:r>
       <w:r>
         <w:t>during</w:t>
@@ -10805,15 +10701,7 @@
         <w:t xml:space="preserve"> </w:t>
       </w:r>
       <w:r>
-        <w:t xml:space="preserve">A </w:t>
-      </w:r>
-      <w:proofErr w:type="spellStart"/>
-      <w:r>
-        <w:t>boolean</w:t>
-      </w:r>
-      <w:proofErr w:type="spellEnd"/>
-      <w:r>
-        <w:t xml:space="preserve"> variable would then dictate what state the light was in and whether to turn it on or off depending on that state.</w:t>
+        <w:t>A boolean variable would then dictate what state the light was in and whether to turn it on or off depending on that state.</w:t>
       </w:r>
     </w:p>
     <w:p>
@@ -11009,13 +10897,8 @@
       <w:r>
         <w:t xml:space="preserve"> </w:t>
       </w:r>
-      <w:proofErr w:type="spellStart"/>
-      <w:r>
-        <w:t>Quesenbery</w:t>
-      </w:r>
-      <w:proofErr w:type="spellEnd"/>
-      <w:r>
-        <w:t xml:space="preserve">, </w:t>
+      <w:r>
+        <w:t xml:space="preserve">Quesenbery, </w:t>
       </w:r>
       <w:r>
         <w:t>(</w:t>
@@ -12044,6 +11927,18 @@
       <w:r>
         <w:t xml:space="preserve">A prominent strength of the experience was that </w:t>
       </w:r>
+      <w:r>
+        <w:t>DES</w:t>
+      </w:r>
+      <w:r>
+        <w:t xml:space="preserve"> symptoms were simulated effectively within the VR environment. By adjusting post processing effects </w:t>
+      </w:r>
+      <w:r>
+        <w:t>applied to</w:t>
+      </w:r>
+      <w:r>
+        <w:t xml:space="preserve"> the camera component attached to the user controller, the application was able to represent some of the symptoms experienced from DES. </w:t>
+      </w:r>
     </w:p>
     <w:p>
       <w:pPr>
@@ -12057,7 +11952,23 @@
         <w:t>Objective based progression gamified the experience, increased interactivity</w:t>
       </w:r>
     </w:p>
-    <w:p/>
+    <w:p>
+      <w:r>
+        <w:t xml:space="preserve">Implementing objective based progression strengthened the project by gamifying the experience, this in turn resulted in increased interaction, immersion and responsiveness </w:t>
+      </w:r>
+      <w:r>
+        <w:t>by users with</w:t>
+      </w:r>
+      <w:r>
+        <w:t xml:space="preserve"> </w:t>
+      </w:r>
+      <w:r>
+        <w:t>the application</w:t>
+      </w:r>
+      <w:r>
+        <w:t>.</w:t>
+      </w:r>
+    </w:p>
     <w:p>
       <w:pPr>
         <w:pStyle w:val="ListParagraph"/>
@@ -12070,7 +11981,11 @@
         <w:t>Gaze interaction was an intuitive control method that didn’t need down time to be taught to be understood</w:t>
       </w:r>
     </w:p>
-    <w:p/>
+    <w:p>
+      <w:r>
+        <w:t>Having gaze interaction as one of the controls reduced the downtime needed for users to understand how to use the experience before progressing with the material being taught within it. This also helped to keep a user’s focus primarily on the information being taught rather than having to keep a portion of their attention focused on remembering the controls.</w:t>
+      </w:r>
+    </w:p>
     <w:p>
       <w:pPr>
         <w:pStyle w:val="ListParagraph"/>
@@ -12083,7 +11998,11 @@
         <w:t>Using iterative testing improved usability</w:t>
       </w:r>
     </w:p>
-    <w:p/>
+    <w:p>
+      <w:r>
+        <w:t>Exponential results were seen through each iteration of user testing, minute changes that made vast differences to the experience were able to be applied with the feedback provided from each test set. As each new test set was carried out there a correlation was noticed between the usability of the experience increasing as the feedback was listened to, then implemented to adjust the experience for the needs of the users.</w:t>
+      </w:r>
+    </w:p>
     <w:p>
       <w:pPr>
         <w:pStyle w:val="Heading3"/>
@@ -12106,7 +12025,30 @@
         <w:t>Small number and limited diversity of testers</w:t>
       </w:r>
     </w:p>
-    <w:p/>
+    <w:p>
+      <w:r>
+        <w:t>Although the tests that were carried out were significantly helpful to the development process of the experience, there was still a weakness observed as the testers available were few and limited diversity between the types of users available.</w:t>
+      </w:r>
+      <w:r>
+        <w:t xml:space="preserve"> The development process could have seen a potentially larger improvement than already observed if further tests were carried out with a larger diverse group of testers. By having this, the simulations could reduce the possible errors or negative experiences had by users down to a minimum. </w:t>
+      </w:r>
+      <w:r>
+        <w:t>T</w:t>
+      </w:r>
+      <w:r>
+        <w:t xml:space="preserve">here will always be at least </w:t>
+      </w:r>
+      <w:r>
+        <w:lastRenderedPageBreak/>
+        <w:t>some users who are negatively impacted by an application, game or experience</w:t>
+      </w:r>
+      <w:r>
+        <w:t>. However, by</w:t>
+      </w:r>
+      <w:r>
+        <w:t xml:space="preserve"> having extensive testing to reduce how many will experience this greatly helps to bring the product nearer to a production worthy state.</w:t>
+      </w:r>
+    </w:p>
     <w:p>
       <w:pPr>
         <w:pStyle w:val="ListParagraph"/>
@@ -12252,15 +12194,7 @@
         </w:numPr>
       </w:pPr>
       <w:r>
-        <w:t xml:space="preserve">Lack of testers and range of testers (technical and </w:t>
-      </w:r>
-      <w:proofErr w:type="spellStart"/>
-      <w:r>
-        <w:t>non technical</w:t>
-      </w:r>
-      <w:proofErr w:type="spellEnd"/>
-      <w:r>
-        <w:t>)</w:t>
+        <w:t>Lack of testers and range of testers (technical and non technical)</w:t>
       </w:r>
     </w:p>
     <w:p/>
@@ -12286,6 +12220,7 @@
         </w:numPr>
       </w:pPr>
       <w:r>
+        <w:lastRenderedPageBreak/>
         <w:t>Lack of diverse hardware to test on, worked off a meta quest 3 so other devices have not been tested with the experience</w:t>
       </w:r>
     </w:p>
@@ -12523,15 +12458,7 @@
     </w:p>
     <w:p>
       <w:r>
-        <w:t xml:space="preserve">Atienza, R., </w:t>
-      </w:r>
-      <w:proofErr w:type="spellStart"/>
-      <w:r>
-        <w:t>Blonna</w:t>
-      </w:r>
-      <w:proofErr w:type="spellEnd"/>
-      <w:r>
-        <w:t xml:space="preserve">, R., Saludares, M.I., Casimiro, J. and Fuentes, V. (2016) ‘Interaction techniques using head gaze for virtual reality’. </w:t>
+        <w:t xml:space="preserve">Atienza, R., Blonna, R., Saludares, M.I., Casimiro, J. and Fuentes, V. (2016) ‘Interaction techniques using head gaze for virtual reality’. </w:t>
       </w:r>
       <w:r>
         <w:rPr>
@@ -12541,15 +12468,7 @@
         <w:t>2016 IEEE Region 10 Symposium (TENSYMP)</w:t>
       </w:r>
       <w:r>
-        <w:t xml:space="preserve"> . </w:t>
-      </w:r>
-      <w:proofErr w:type="spellStart"/>
-      <w:r>
-        <w:t>doi</w:t>
-      </w:r>
-      <w:proofErr w:type="spellEnd"/>
-      <w:r>
-        <w:t xml:space="preserve">: </w:t>
+        <w:t xml:space="preserve"> . doi: </w:t>
       </w:r>
       <w:hyperlink r:id="rId15" w:history="1">
         <w:r>
@@ -12567,23 +12486,9 @@
       </w:r>
     </w:p>
     <w:p>
-      <w:proofErr w:type="spellStart"/>
-      <w:r>
-        <w:t>Cantó</w:t>
-      </w:r>
-      <w:proofErr w:type="spellEnd"/>
-      <w:r>
-        <w:t xml:space="preserve">-Sancho, N., </w:t>
-      </w:r>
-      <w:proofErr w:type="spellStart"/>
-      <w:r>
-        <w:t>Porru</w:t>
-      </w:r>
-      <w:proofErr w:type="spellEnd"/>
-      <w:r>
-        <w:t xml:space="preserve">, S., Casati, S., Ronda, E., Seguí-Crespo, M. and Carta, A. (2023) ‘Prevalence and risk factors of computer vision syndrome—assessed in office workers by a validated questionnaire’. </w:t>
-      </w:r>
-      <w:proofErr w:type="spellStart"/>
+      <w:r>
+        <w:t xml:space="preserve">Cantó-Sancho, N., Porru, S., Casati, S., Ronda, E., Seguí-Crespo, M. and Carta, A. (2023) ‘Prevalence and risk factors of computer vision syndrome—assessed in office workers by a validated questionnaire’. </w:t>
+      </w:r>
       <w:r>
         <w:rPr>
           <w:i/>
@@ -12591,7 +12496,6 @@
         </w:rPr>
         <w:t>PeerJ</w:t>
       </w:r>
-      <w:proofErr w:type="spellEnd"/>
       <w:r>
         <w:t xml:space="preserve"> 11, p. e14937. Available at: </w:t>
       </w:r>
@@ -12638,15 +12542,7 @@
     </w:p>
     <w:p>
       <w:r>
-        <w:t xml:space="preserve">Chandrasekhara, R.S., Low, C., Lim, Y., Low, L., Mardina, F. and </w:t>
-      </w:r>
-      <w:proofErr w:type="spellStart"/>
-      <w:r>
-        <w:t>Nursaleha</w:t>
-      </w:r>
-      <w:proofErr w:type="spellEnd"/>
-      <w:r>
-        <w:t xml:space="preserve">, M. (2013) ‘Computer vision syndrome: a study of knowledge and practices in university students’. </w:t>
+        <w:t xml:space="preserve">Chandrasekhara, R.S., Low, C., Lim, Y., Low, L., Mardina, F. and Nursaleha, M. (2013) ‘Computer vision syndrome: a study of knowledge and practices in university students’. </w:t>
       </w:r>
       <w:r>
         <w:rPr>
@@ -12708,15 +12604,7 @@
         <w:t>Behaviour &amp; Information Technology</w:t>
       </w:r>
       <w:r>
-        <w:t xml:space="preserve"> 21(2), pp. 137–143. </w:t>
-      </w:r>
-      <w:proofErr w:type="spellStart"/>
-      <w:r>
-        <w:t>doi</w:t>
-      </w:r>
-      <w:proofErr w:type="spellEnd"/>
-      <w:r>
-        <w:t xml:space="preserve">: </w:t>
+        <w:t xml:space="preserve"> 21(2), pp. 137–143. doi: </w:t>
       </w:r>
       <w:hyperlink r:id="rId20" w:history="1">
         <w:r>
@@ -12732,15 +12620,7 @@
     </w:p>
     <w:p>
       <w:r>
-        <w:t xml:space="preserve">Gibson Kimutai and Förster, A. (2024) ‘A User-Centred Interaction Design: A Holistic Approach’., pp. 468–475. </w:t>
-      </w:r>
-      <w:proofErr w:type="spellStart"/>
-      <w:r>
-        <w:t>doi</w:t>
-      </w:r>
-      <w:proofErr w:type="spellEnd"/>
-      <w:r>
-        <w:t xml:space="preserve">: </w:t>
+        <w:t xml:space="preserve">Gibson Kimutai and Förster, A. (2024) ‘A User-Centred Interaction Design: A Holistic Approach’., pp. 468–475. doi: </w:t>
       </w:r>
       <w:hyperlink r:id="rId21" w:history="1">
         <w:r>
@@ -12824,21 +12704,8 @@
       </w:r>
     </w:p>
     <w:p>
-      <w:proofErr w:type="spellStart"/>
-      <w:r>
-        <w:t>Looyestyn</w:t>
-      </w:r>
-      <w:proofErr w:type="spellEnd"/>
-      <w:r>
-        <w:t xml:space="preserve">, J., Kernot, J., Boshoff, K., Ryan, J., Edney, S. and Maher, C. (2017) ‘Does gamification increase engagement with online programs? A systematic review’. </w:t>
-      </w:r>
-      <w:proofErr w:type="spellStart"/>
-      <w:r>
-        <w:t>Amblard</w:t>
-      </w:r>
-      <w:proofErr w:type="spellEnd"/>
-      <w:r>
-        <w:t xml:space="preserve">, F. (ed.). </w:t>
+      <w:r>
+        <w:t xml:space="preserve">Looyestyn, J., Kernot, J., Boshoff, K., Ryan, J., Edney, S. and Maher, C. (2017) ‘Does gamification increase engagement with online programs? A systematic review’. Amblard, F. (ed.). </w:t>
       </w:r>
       <w:r>
         <w:rPr>
@@ -12867,15 +12734,7 @@
     </w:p>
     <w:p>
       <w:r>
-        <w:t xml:space="preserve">Muñoz, E.G., </w:t>
-      </w:r>
-      <w:proofErr w:type="spellStart"/>
-      <w:r>
-        <w:t>Fabregat</w:t>
-      </w:r>
-      <w:proofErr w:type="spellEnd"/>
-      <w:r>
-        <w:t xml:space="preserve">, R., Bacca-Acosta, J., Duque-Méndez, N. and Avila-Garzon, C. (2022) ‘Augmented Reality, Virtual Reality, and Game Technologies in Ophthalmology Training’. </w:t>
+        <w:t xml:space="preserve">Muñoz, E.G., Fabregat, R., Bacca-Acosta, J., Duque-Méndez, N. and Avila-Garzon, C. (2022) ‘Augmented Reality, Virtual Reality, and Game Technologies in Ophthalmology Training’. </w:t>
       </w:r>
       <w:r>
         <w:rPr>
@@ -12885,15 +12744,7 @@
         <w:t>Information</w:t>
       </w:r>
       <w:r>
-        <w:t xml:space="preserve"> 13(5), p. 222. </w:t>
-      </w:r>
-      <w:proofErr w:type="spellStart"/>
-      <w:r>
-        <w:t>doi</w:t>
-      </w:r>
-      <w:proofErr w:type="spellEnd"/>
-      <w:r>
-        <w:t xml:space="preserve">: </w:t>
+        <w:t xml:space="preserve"> 13(5), p. 222. doi: </w:t>
       </w:r>
       <w:hyperlink r:id="rId25" w:history="1">
         <w:r>
@@ -12909,15 +12760,7 @@
     </w:p>
     <w:p>
       <w:r>
-        <w:t xml:space="preserve">Newman, M., </w:t>
-      </w:r>
-      <w:proofErr w:type="spellStart"/>
-      <w:r>
-        <w:t>Gatersleben</w:t>
-      </w:r>
-      <w:proofErr w:type="spellEnd"/>
-      <w:r>
-        <w:t xml:space="preserve">, B., Wyles, K.J. and Ratcliffe, E. (2022) ‘The use of virtual reality in environment experiences and the importance of realism’. </w:t>
+        <w:t xml:space="preserve">Newman, M., Gatersleben, B., Wyles, K.J. and Ratcliffe, E. (2022) ‘The use of virtual reality in environment experiences and the importance of realism’. </w:t>
       </w:r>
       <w:r>
         <w:rPr>
@@ -12947,15 +12790,7 @@
     <w:p>
       <w:r>
         <w:lastRenderedPageBreak/>
-        <w:t xml:space="preserve">Orji, J., Hernandez, A., Selema, B. and Orji, R. (2022) ‘Virtual and augmented reality applications for promoting safety and security: A systematic review’., pp. 1–7. </w:t>
-      </w:r>
-      <w:proofErr w:type="spellStart"/>
-      <w:r>
-        <w:t>doi</w:t>
-      </w:r>
-      <w:proofErr w:type="spellEnd"/>
-      <w:r>
-        <w:t xml:space="preserve">: </w:t>
+        <w:t xml:space="preserve">Orji, J., Hernandez, A., Selema, B. and Orji, R. (2022) ‘Virtual and augmented reality applications for promoting safety and security: A systematic review’., pp. 1–7. doi: </w:t>
       </w:r>
       <w:hyperlink r:id="rId27" w:history="1">
         <w:r>
@@ -12970,13 +12805,8 @@
       </w:r>
     </w:p>
     <w:p>
-      <w:proofErr w:type="spellStart"/>
-      <w:r>
-        <w:t>Porcar</w:t>
-      </w:r>
-      <w:proofErr w:type="spellEnd"/>
-      <w:r>
-        <w:t xml:space="preserve">, E., Pons, A. and Lorente, A. (2016) ‘Visual and ocular effects from the use of flat-panel displays’. </w:t>
+      <w:r>
+        <w:t xml:space="preserve">Porcar, E., Pons, A. and Lorente, A. (2016) ‘Visual and ocular effects from the use of flat-panel displays’. </w:t>
       </w:r>
       <w:r>
         <w:rPr>
@@ -13004,13 +12834,8 @@
       </w:r>
     </w:p>
     <w:p>
-      <w:proofErr w:type="spellStart"/>
-      <w:r>
-        <w:t>Quesenbery</w:t>
-      </w:r>
-      <w:proofErr w:type="spellEnd"/>
-      <w:r>
-        <w:t xml:space="preserve">, W. (2004) ‘(PDF) Balancing the 5Es: Usability’. </w:t>
+      <w:r>
+        <w:t xml:space="preserve">Quesenbery, W. (2004) ‘(PDF) Balancing the 5Es: Usability’. </w:t>
       </w:r>
       <w:r>
         <w:rPr>
@@ -13036,15 +12861,7 @@
     </w:p>
     <w:p>
       <w:r>
-        <w:t xml:space="preserve">Santilli, T., Ceccacci, S., Mengoni, M. and Catia </w:t>
-      </w:r>
-      <w:proofErr w:type="spellStart"/>
-      <w:r>
-        <w:t>Giaconi</w:t>
-      </w:r>
-      <w:proofErr w:type="spellEnd"/>
-      <w:r>
-        <w:t xml:space="preserve"> (2025) ‘Virtual vs. traditional learning in higher education: A systematic review of comparative studies’. </w:t>
+        <w:t xml:space="preserve">Santilli, T., Ceccacci, S., Mengoni, M. and Catia Giaconi (2025) ‘Virtual vs. traditional learning in higher education: A systematic review of comparative studies’. </w:t>
       </w:r>
       <w:r>
         <w:rPr>
@@ -13080,15 +12897,7 @@
         <w:t>Communications in computer and information science</w:t>
       </w:r>
       <w:r>
-        <w:t xml:space="preserve"> , pp. 111–115. </w:t>
-      </w:r>
-      <w:proofErr w:type="spellStart"/>
-      <w:r>
-        <w:t>doi</w:t>
-      </w:r>
-      <w:proofErr w:type="spellEnd"/>
-      <w:r>
-        <w:t xml:space="preserve">: </w:t>
+        <w:t xml:space="preserve"> , pp. 111–115. doi: </w:t>
       </w:r>
       <w:hyperlink r:id="rId31" w:history="1">
         <w:r>
@@ -13149,23 +12958,7 @@
     </w:p>
     <w:p>
       <w:r>
-        <w:t>Vieira, F., Oliveira, E. and Rodrigues, N. (2019) ‘</w:t>
-      </w:r>
-      <w:proofErr w:type="spellStart"/>
-      <w:r>
-        <w:t>iSVC</w:t>
-      </w:r>
-      <w:proofErr w:type="spellEnd"/>
-      <w:r>
-        <w:t xml:space="preserve"> – digital platform for detection and prevention of computer vision syndrome’., pp. 1–7. </w:t>
-      </w:r>
-      <w:proofErr w:type="spellStart"/>
-      <w:r>
-        <w:t>doi</w:t>
-      </w:r>
-      <w:proofErr w:type="spellEnd"/>
-      <w:r>
-        <w:t xml:space="preserve">: </w:t>
+        <w:t xml:space="preserve">Vieira, F., Oliveira, E. and Rodrigues, N. (2019) ‘iSVC – digital platform for detection and prevention of computer vision syndrome’., pp. 1–7. doi: </w:t>
       </w:r>
       <w:hyperlink r:id="rId34" w:history="1">
         <w:r>
@@ -13191,15 +12984,7 @@
         <w:t>Annals of Emerging Technologies in Computing</w:t>
       </w:r>
       <w:r>
-        <w:t xml:space="preserve"> 9(3), pp. 50–68. </w:t>
-      </w:r>
-      <w:proofErr w:type="spellStart"/>
-      <w:r>
-        <w:t>doi</w:t>
-      </w:r>
-      <w:proofErr w:type="spellEnd"/>
-      <w:r>
-        <w:t xml:space="preserve">: </w:t>
+        <w:t xml:space="preserve"> 9(3), pp. 50–68. doi: </w:t>
       </w:r>
       <w:hyperlink r:id="rId35" w:history="1">
         <w:r>
@@ -13215,15 +13000,7 @@
     </w:p>
     <w:p>
       <w:r>
-        <w:t>Youcef, B., Ahmad, M.N. and Mustapha, M. (2021) ‘</w:t>
-      </w:r>
-      <w:proofErr w:type="spellStart"/>
-      <w:r>
-        <w:t>OntoPhaco</w:t>
-      </w:r>
-      <w:proofErr w:type="spellEnd"/>
-      <w:r>
-        <w:t xml:space="preserve">: An ontology for virtual reality training in ophthalmology Domain—A case study of cataract surgery’. </w:t>
+        <w:t xml:space="preserve">Youcef, B., Ahmad, M.N. and Mustapha, M. (2021) ‘OntoPhaco: An ontology for virtual reality training in ophthalmology Domain—A case study of cataract surgery’. </w:t>
       </w:r>
       <w:r>
         <w:rPr>
@@ -13233,15 +13010,7 @@
         <w:t>IEEE Access</w:t>
       </w:r>
       <w:r>
-        <w:t xml:space="preserve"> 9, pp. 152347–152378. </w:t>
-      </w:r>
-      <w:proofErr w:type="spellStart"/>
-      <w:r>
-        <w:t>doi</w:t>
-      </w:r>
-      <w:proofErr w:type="spellEnd"/>
-      <w:r>
-        <w:t xml:space="preserve">: </w:t>
+        <w:t xml:space="preserve"> 9, pp. 152347–152378. doi: </w:t>
       </w:r>
       <w:hyperlink r:id="rId36" w:history="1">
         <w:r>
@@ -14029,22 +13798,9 @@
       <w:bookmarkStart w:id="66" w:name="_Toc224125484"/>
       <w:r>
         <w:lastRenderedPageBreak/>
-        <w:t xml:space="preserve">Button Hover </w:t>
-      </w:r>
-      <w:proofErr w:type="spellStart"/>
-      <w:r>
-        <w:t>Sfx</w:t>
-      </w:r>
-      <w:proofErr w:type="spellEnd"/>
-      <w:r>
-        <w:t xml:space="preserve"> by </w:t>
-      </w:r>
-      <w:proofErr w:type="spellStart"/>
-      <w:r>
-        <w:t>Fachii</w:t>
+        <w:t>Button Hover Sfx by Fachii</w:t>
       </w:r>
       <w:bookmarkEnd w:id="66"/>
-      <w:proofErr w:type="spellEnd"/>
     </w:p>
     <w:p>
       <w:r>
@@ -14144,31 +13900,9 @@
         <w:rPr>
           <w:rStyle w:val="Heading3Char"/>
         </w:rPr>
-        <w:t xml:space="preserve">Button click </w:t>
-      </w:r>
-      <w:proofErr w:type="spellStart"/>
-      <w:r>
-        <w:rPr>
-          <w:rStyle w:val="Heading3Char"/>
-        </w:rPr>
-        <w:t>Sfx</w:t>
-      </w:r>
-      <w:proofErr w:type="spellEnd"/>
-      <w:r>
-        <w:rPr>
-          <w:rStyle w:val="Heading3Char"/>
-        </w:rPr>
-        <w:t xml:space="preserve"> by </w:t>
-      </w:r>
-      <w:proofErr w:type="spellStart"/>
-      <w:r>
-        <w:rPr>
-          <w:rStyle w:val="Heading3Char"/>
-        </w:rPr>
-        <w:t>AndrewEathan</w:t>
+        <w:t>Button click Sfx by AndrewEathan</w:t>
       </w:r>
       <w:bookmarkEnd w:id="67"/>
-      <w:proofErr w:type="spellEnd"/>
       <w:r>
         <w:t xml:space="preserve"> </w:t>
       </w:r>
@@ -14277,14 +14011,9 @@
       <w:bookmarkStart w:id="68" w:name="_Toc224125486"/>
       <w:r>
         <w:lastRenderedPageBreak/>
-        <w:t xml:space="preserve">Light Switch On </w:t>
-      </w:r>
-      <w:proofErr w:type="spellStart"/>
-      <w:r>
-        <w:t>Sfx</w:t>
+        <w:t>Light Switch On Sfx</w:t>
       </w:r>
       <w:bookmarkEnd w:id="68"/>
-      <w:proofErr w:type="spellEnd"/>
     </w:p>
     <w:p>
       <w:r>
@@ -14376,14 +14105,9 @@
       </w:pPr>
       <w:bookmarkStart w:id="69" w:name="_Toc224125487"/>
       <w:r>
-        <w:t xml:space="preserve">Light Switch Off </w:t>
-      </w:r>
-      <w:proofErr w:type="spellStart"/>
-      <w:r>
-        <w:t>Sfx</w:t>
+        <w:t>Light Switch Off Sfx</w:t>
       </w:r>
       <w:bookmarkEnd w:id="69"/>
-      <w:proofErr w:type="spellEnd"/>
     </w:p>
     <w:p>
       <w:r>

</xml_diff>

<commit_message>
Added sub sub titles in, organised notes to reduce repetition
</commit_message>
<xml_diff>
--- a/30077548Thesis.docx
+++ b/30077548Thesis.docx
@@ -236,7 +236,7 @@
           <w:r>
             <w:fldChar w:fldCharType="separate"/>
           </w:r>
-          <w:hyperlink w:anchor="_Toc224125418" w:history="1">
+          <w:hyperlink w:anchor="_Toc224213899" w:history="1">
             <w:r>
               <w:rPr>
                 <w:rStyle w:val="Hyperlink"/>
@@ -263,7 +263,7 @@
                 <w:noProof/>
                 <w:webHidden/>
               </w:rPr>
-              <w:instrText xml:space="preserve"> PAGEREF _Toc224125418 \h </w:instrText>
+              <w:instrText xml:space="preserve"> PAGEREF _Toc224213899 \h </w:instrText>
             </w:r>
             <w:r>
               <w:rPr>
@@ -283,7 +283,7 @@
                 <w:noProof/>
                 <w:webHidden/>
               </w:rPr>
-              <w:t>4</w:t>
+              <w:t>5</w:t>
             </w:r>
             <w:r>
               <w:rPr>
@@ -308,7 +308,7 @@
               <w:lang w:eastAsia="en-GB"/>
             </w:rPr>
           </w:pPr>
-          <w:hyperlink w:anchor="_Toc224125419" w:history="1">
+          <w:hyperlink w:anchor="_Toc224213900" w:history="1">
             <w:r>
               <w:rPr>
                 <w:rStyle w:val="Hyperlink"/>
@@ -335,7 +335,7 @@
                 <w:noProof/>
                 <w:webHidden/>
               </w:rPr>
-              <w:instrText xml:space="preserve"> PAGEREF _Toc224125419 \h </w:instrText>
+              <w:instrText xml:space="preserve"> PAGEREF _Toc224213900 \h </w:instrText>
             </w:r>
             <w:r>
               <w:rPr>
@@ -355,7 +355,7 @@
                 <w:noProof/>
                 <w:webHidden/>
               </w:rPr>
-              <w:t>5</w:t>
+              <w:t>6</w:t>
             </w:r>
             <w:r>
               <w:rPr>
@@ -380,7 +380,7 @@
               <w:lang w:eastAsia="en-GB"/>
             </w:rPr>
           </w:pPr>
-          <w:hyperlink w:anchor="_Toc224125420" w:history="1">
+          <w:hyperlink w:anchor="_Toc224213901" w:history="1">
             <w:r>
               <w:rPr>
                 <w:rStyle w:val="Hyperlink"/>
@@ -407,7 +407,7 @@
                 <w:noProof/>
                 <w:webHidden/>
               </w:rPr>
-              <w:instrText xml:space="preserve"> PAGEREF _Toc224125420 \h </w:instrText>
+              <w:instrText xml:space="preserve"> PAGEREF _Toc224213901 \h </w:instrText>
             </w:r>
             <w:r>
               <w:rPr>
@@ -427,7 +427,7 @@
                 <w:noProof/>
                 <w:webHidden/>
               </w:rPr>
-              <w:t>6</w:t>
+              <w:t>7</w:t>
             </w:r>
             <w:r>
               <w:rPr>
@@ -452,7 +452,7 @@
               <w:lang w:eastAsia="en-GB"/>
             </w:rPr>
           </w:pPr>
-          <w:hyperlink w:anchor="_Toc224125421" w:history="1">
+          <w:hyperlink w:anchor="_Toc224213902" w:history="1">
             <w:r>
               <w:rPr>
                 <w:rStyle w:val="Hyperlink"/>
@@ -479,7 +479,7 @@
                 <w:noProof/>
                 <w:webHidden/>
               </w:rPr>
-              <w:instrText xml:space="preserve"> PAGEREF _Toc224125421 \h </w:instrText>
+              <w:instrText xml:space="preserve"> PAGEREF _Toc224213902 \h </w:instrText>
             </w:r>
             <w:r>
               <w:rPr>
@@ -499,7 +499,7 @@
                 <w:noProof/>
                 <w:webHidden/>
               </w:rPr>
-              <w:t>7</w:t>
+              <w:t>8</w:t>
             </w:r>
             <w:r>
               <w:rPr>
@@ -524,7 +524,7 @@
               <w:lang w:eastAsia="en-GB"/>
             </w:rPr>
           </w:pPr>
-          <w:hyperlink w:anchor="_Toc224125422" w:history="1">
+          <w:hyperlink w:anchor="_Toc224213903" w:history="1">
             <w:r>
               <w:rPr>
                 <w:rStyle w:val="Hyperlink"/>
@@ -551,7 +551,7 @@
                 <w:noProof/>
                 <w:webHidden/>
               </w:rPr>
-              <w:instrText xml:space="preserve"> PAGEREF _Toc224125422 \h </w:instrText>
+              <w:instrText xml:space="preserve"> PAGEREF _Toc224213903 \h </w:instrText>
             </w:r>
             <w:r>
               <w:rPr>
@@ -571,7 +571,7 @@
                 <w:noProof/>
                 <w:webHidden/>
               </w:rPr>
-              <w:t>7</w:t>
+              <w:t>8</w:t>
             </w:r>
             <w:r>
               <w:rPr>
@@ -596,7 +596,7 @@
               <w:lang w:eastAsia="en-GB"/>
             </w:rPr>
           </w:pPr>
-          <w:hyperlink w:anchor="_Toc224125423" w:history="1">
+          <w:hyperlink w:anchor="_Toc224213904" w:history="1">
             <w:r>
               <w:rPr>
                 <w:rStyle w:val="Hyperlink"/>
@@ -623,7 +623,7 @@
                 <w:noProof/>
                 <w:webHidden/>
               </w:rPr>
-              <w:instrText xml:space="preserve"> PAGEREF _Toc224125423 \h </w:instrText>
+              <w:instrText xml:space="preserve"> PAGEREF _Toc224213904 \h </w:instrText>
             </w:r>
             <w:r>
               <w:rPr>
@@ -643,7 +643,7 @@
                 <w:noProof/>
                 <w:webHidden/>
               </w:rPr>
-              <w:t>8</w:t>
+              <w:t>9</w:t>
             </w:r>
             <w:r>
               <w:rPr>
@@ -668,7 +668,7 @@
               <w:lang w:eastAsia="en-GB"/>
             </w:rPr>
           </w:pPr>
-          <w:hyperlink w:anchor="_Toc224125424" w:history="1">
+          <w:hyperlink w:anchor="_Toc224213905" w:history="1">
             <w:r>
               <w:rPr>
                 <w:rStyle w:val="Hyperlink"/>
@@ -695,7 +695,7 @@
                 <w:noProof/>
                 <w:webHidden/>
               </w:rPr>
-              <w:instrText xml:space="preserve"> PAGEREF _Toc224125424 \h </w:instrText>
+              <w:instrText xml:space="preserve"> PAGEREF _Toc224213905 \h </w:instrText>
             </w:r>
             <w:r>
               <w:rPr>
@@ -715,7 +715,7 @@
                 <w:noProof/>
                 <w:webHidden/>
               </w:rPr>
-              <w:t>9</w:t>
+              <w:t>10</w:t>
             </w:r>
             <w:r>
               <w:rPr>
@@ -740,7 +740,7 @@
               <w:lang w:eastAsia="en-GB"/>
             </w:rPr>
           </w:pPr>
-          <w:hyperlink w:anchor="_Toc224125425" w:history="1">
+          <w:hyperlink w:anchor="_Toc224213906" w:history="1">
             <w:r>
               <w:rPr>
                 <w:rStyle w:val="Hyperlink"/>
@@ -767,7 +767,7 @@
                 <w:noProof/>
                 <w:webHidden/>
               </w:rPr>
-              <w:instrText xml:space="preserve"> PAGEREF _Toc224125425 \h </w:instrText>
+              <w:instrText xml:space="preserve"> PAGEREF _Toc224213906 \h </w:instrText>
             </w:r>
             <w:r>
               <w:rPr>
@@ -787,7 +787,7 @@
                 <w:noProof/>
                 <w:webHidden/>
               </w:rPr>
-              <w:t>9</w:t>
+              <w:t>10</w:t>
             </w:r>
             <w:r>
               <w:rPr>
@@ -812,7 +812,7 @@
               <w:lang w:eastAsia="en-GB"/>
             </w:rPr>
           </w:pPr>
-          <w:hyperlink w:anchor="_Toc224125426" w:history="1">
+          <w:hyperlink w:anchor="_Toc224213907" w:history="1">
             <w:r>
               <w:rPr>
                 <w:rStyle w:val="Hyperlink"/>
@@ -839,7 +839,7 @@
                 <w:noProof/>
                 <w:webHidden/>
               </w:rPr>
-              <w:instrText xml:space="preserve"> PAGEREF _Toc224125426 \h </w:instrText>
+              <w:instrText xml:space="preserve"> PAGEREF _Toc224213907 \h </w:instrText>
             </w:r>
             <w:r>
               <w:rPr>
@@ -859,7 +859,7 @@
                 <w:noProof/>
                 <w:webHidden/>
               </w:rPr>
-              <w:t>10</w:t>
+              <w:t>11</w:t>
             </w:r>
             <w:r>
               <w:rPr>
@@ -884,7 +884,7 @@
               <w:lang w:eastAsia="en-GB"/>
             </w:rPr>
           </w:pPr>
-          <w:hyperlink w:anchor="_Toc224125427" w:history="1">
+          <w:hyperlink w:anchor="_Toc224213908" w:history="1">
             <w:r>
               <w:rPr>
                 <w:rStyle w:val="Hyperlink"/>
@@ -911,7 +911,7 @@
                 <w:noProof/>
                 <w:webHidden/>
               </w:rPr>
-              <w:instrText xml:space="preserve"> PAGEREF _Toc224125427 \h </w:instrText>
+              <w:instrText xml:space="preserve"> PAGEREF _Toc224213908 \h </w:instrText>
             </w:r>
             <w:r>
               <w:rPr>
@@ -931,7 +931,7 @@
                 <w:noProof/>
                 <w:webHidden/>
               </w:rPr>
-              <w:t>10</w:t>
+              <w:t>11</w:t>
             </w:r>
             <w:r>
               <w:rPr>
@@ -956,7 +956,7 @@
               <w:lang w:eastAsia="en-GB"/>
             </w:rPr>
           </w:pPr>
-          <w:hyperlink w:anchor="_Toc224125428" w:history="1">
+          <w:hyperlink w:anchor="_Toc224213909" w:history="1">
             <w:r>
               <w:rPr>
                 <w:rStyle w:val="Hyperlink"/>
@@ -983,7 +983,7 @@
                 <w:noProof/>
                 <w:webHidden/>
               </w:rPr>
-              <w:instrText xml:space="preserve"> PAGEREF _Toc224125428 \h </w:instrText>
+              <w:instrText xml:space="preserve"> PAGEREF _Toc224213909 \h </w:instrText>
             </w:r>
             <w:r>
               <w:rPr>
@@ -1003,7 +1003,7 @@
                 <w:noProof/>
                 <w:webHidden/>
               </w:rPr>
-              <w:t>10</w:t>
+              <w:t>11</w:t>
             </w:r>
             <w:r>
               <w:rPr>
@@ -1028,7 +1028,7 @@
               <w:lang w:eastAsia="en-GB"/>
             </w:rPr>
           </w:pPr>
-          <w:hyperlink w:anchor="_Toc224125429" w:history="1">
+          <w:hyperlink w:anchor="_Toc224213910" w:history="1">
             <w:r>
               <w:rPr>
                 <w:rStyle w:val="Hyperlink"/>
@@ -1055,7 +1055,7 @@
                 <w:noProof/>
                 <w:webHidden/>
               </w:rPr>
-              <w:instrText xml:space="preserve"> PAGEREF _Toc224125429 \h </w:instrText>
+              <w:instrText xml:space="preserve"> PAGEREF _Toc224213910 \h </w:instrText>
             </w:r>
             <w:r>
               <w:rPr>
@@ -1075,7 +1075,7 @@
                 <w:noProof/>
                 <w:webHidden/>
               </w:rPr>
-              <w:t>10</w:t>
+              <w:t>11</w:t>
             </w:r>
             <w:r>
               <w:rPr>
@@ -1100,7 +1100,7 @@
               <w:lang w:eastAsia="en-GB"/>
             </w:rPr>
           </w:pPr>
-          <w:hyperlink w:anchor="_Toc224125430" w:history="1">
+          <w:hyperlink w:anchor="_Toc224213911" w:history="1">
             <w:r>
               <w:rPr>
                 <w:rStyle w:val="Hyperlink"/>
@@ -1127,7 +1127,7 @@
                 <w:noProof/>
                 <w:webHidden/>
               </w:rPr>
-              <w:instrText xml:space="preserve"> PAGEREF _Toc224125430 \h </w:instrText>
+              <w:instrText xml:space="preserve"> PAGEREF _Toc224213911 \h </w:instrText>
             </w:r>
             <w:r>
               <w:rPr>
@@ -1147,7 +1147,7 @@
                 <w:noProof/>
                 <w:webHidden/>
               </w:rPr>
-              <w:t>10</w:t>
+              <w:t>11</w:t>
             </w:r>
             <w:r>
               <w:rPr>
@@ -1172,7 +1172,7 @@
               <w:lang w:eastAsia="en-GB"/>
             </w:rPr>
           </w:pPr>
-          <w:hyperlink w:anchor="_Toc224125431" w:history="1">
+          <w:hyperlink w:anchor="_Toc224213912" w:history="1">
             <w:r>
               <w:rPr>
                 <w:rStyle w:val="Hyperlink"/>
@@ -1199,7 +1199,7 @@
                 <w:noProof/>
                 <w:webHidden/>
               </w:rPr>
-              <w:instrText xml:space="preserve"> PAGEREF _Toc224125431 \h </w:instrText>
+              <w:instrText xml:space="preserve"> PAGEREF _Toc224213912 \h </w:instrText>
             </w:r>
             <w:r>
               <w:rPr>
@@ -1219,7 +1219,7 @@
                 <w:noProof/>
                 <w:webHidden/>
               </w:rPr>
-              <w:t>11</w:t>
+              <w:t>12</w:t>
             </w:r>
             <w:r>
               <w:rPr>
@@ -1244,7 +1244,7 @@
               <w:lang w:eastAsia="en-GB"/>
             </w:rPr>
           </w:pPr>
-          <w:hyperlink w:anchor="_Toc224125432" w:history="1">
+          <w:hyperlink w:anchor="_Toc224213913" w:history="1">
             <w:r>
               <w:rPr>
                 <w:rStyle w:val="Hyperlink"/>
@@ -1271,7 +1271,7 @@
                 <w:noProof/>
                 <w:webHidden/>
               </w:rPr>
-              <w:instrText xml:space="preserve"> PAGEREF _Toc224125432 \h </w:instrText>
+              <w:instrText xml:space="preserve"> PAGEREF _Toc224213913 \h </w:instrText>
             </w:r>
             <w:r>
               <w:rPr>
@@ -1291,7 +1291,7 @@
                 <w:noProof/>
                 <w:webHidden/>
               </w:rPr>
-              <w:t>11</w:t>
+              <w:t>12</w:t>
             </w:r>
             <w:r>
               <w:rPr>
@@ -1316,7 +1316,7 @@
               <w:lang w:eastAsia="en-GB"/>
             </w:rPr>
           </w:pPr>
-          <w:hyperlink w:anchor="_Toc224125433" w:history="1">
+          <w:hyperlink w:anchor="_Toc224213914" w:history="1">
             <w:r>
               <w:rPr>
                 <w:rStyle w:val="Hyperlink"/>
@@ -1343,7 +1343,7 @@
                 <w:noProof/>
                 <w:webHidden/>
               </w:rPr>
-              <w:instrText xml:space="preserve"> PAGEREF _Toc224125433 \h </w:instrText>
+              <w:instrText xml:space="preserve"> PAGEREF _Toc224213914 \h </w:instrText>
             </w:r>
             <w:r>
               <w:rPr>
@@ -1363,7 +1363,7 @@
                 <w:noProof/>
                 <w:webHidden/>
               </w:rPr>
-              <w:t>11</w:t>
+              <w:t>12</w:t>
             </w:r>
             <w:r>
               <w:rPr>
@@ -1388,7 +1388,7 @@
               <w:lang w:eastAsia="en-GB"/>
             </w:rPr>
           </w:pPr>
-          <w:hyperlink w:anchor="_Toc224125434" w:history="1">
+          <w:hyperlink w:anchor="_Toc224213915" w:history="1">
             <w:r>
               <w:rPr>
                 <w:rStyle w:val="Hyperlink"/>
@@ -1415,7 +1415,7 @@
                 <w:noProof/>
                 <w:webHidden/>
               </w:rPr>
-              <w:instrText xml:space="preserve"> PAGEREF _Toc224125434 \h </w:instrText>
+              <w:instrText xml:space="preserve"> PAGEREF _Toc224213915 \h </w:instrText>
             </w:r>
             <w:r>
               <w:rPr>
@@ -1435,7 +1435,7 @@
                 <w:noProof/>
                 <w:webHidden/>
               </w:rPr>
-              <w:t>11</w:t>
+              <w:t>12</w:t>
             </w:r>
             <w:r>
               <w:rPr>
@@ -1460,7 +1460,7 @@
               <w:lang w:eastAsia="en-GB"/>
             </w:rPr>
           </w:pPr>
-          <w:hyperlink w:anchor="_Toc224125435" w:history="1">
+          <w:hyperlink w:anchor="_Toc224213916" w:history="1">
             <w:r>
               <w:rPr>
                 <w:rStyle w:val="Hyperlink"/>
@@ -1487,7 +1487,7 @@
                 <w:noProof/>
                 <w:webHidden/>
               </w:rPr>
-              <w:instrText xml:space="preserve"> PAGEREF _Toc224125435 \h </w:instrText>
+              <w:instrText xml:space="preserve"> PAGEREF _Toc224213916 \h </w:instrText>
             </w:r>
             <w:r>
               <w:rPr>
@@ -1507,7 +1507,7 @@
                 <w:noProof/>
                 <w:webHidden/>
               </w:rPr>
-              <w:t>12</w:t>
+              <w:t>13</w:t>
             </w:r>
             <w:r>
               <w:rPr>
@@ -1532,7 +1532,7 @@
               <w:lang w:eastAsia="en-GB"/>
             </w:rPr>
           </w:pPr>
-          <w:hyperlink w:anchor="_Toc224125436" w:history="1">
+          <w:hyperlink w:anchor="_Toc224213917" w:history="1">
             <w:r>
               <w:rPr>
                 <w:rStyle w:val="Hyperlink"/>
@@ -1559,7 +1559,7 @@
                 <w:noProof/>
                 <w:webHidden/>
               </w:rPr>
-              <w:instrText xml:space="preserve"> PAGEREF _Toc224125436 \h </w:instrText>
+              <w:instrText xml:space="preserve"> PAGEREF _Toc224213917 \h </w:instrText>
             </w:r>
             <w:r>
               <w:rPr>
@@ -1579,7 +1579,7 @@
                 <w:noProof/>
                 <w:webHidden/>
               </w:rPr>
-              <w:t>12</w:t>
+              <w:t>13</w:t>
             </w:r>
             <w:r>
               <w:rPr>
@@ -1604,7 +1604,7 @@
               <w:lang w:eastAsia="en-GB"/>
             </w:rPr>
           </w:pPr>
-          <w:hyperlink w:anchor="_Toc224125437" w:history="1">
+          <w:hyperlink w:anchor="_Toc224213918" w:history="1">
             <w:r>
               <w:rPr>
                 <w:rStyle w:val="Hyperlink"/>
@@ -1631,7 +1631,7 @@
                 <w:noProof/>
                 <w:webHidden/>
               </w:rPr>
-              <w:instrText xml:space="preserve"> PAGEREF _Toc224125437 \h </w:instrText>
+              <w:instrText xml:space="preserve"> PAGEREF _Toc224213918 \h </w:instrText>
             </w:r>
             <w:r>
               <w:rPr>
@@ -1651,7 +1651,7 @@
                 <w:noProof/>
                 <w:webHidden/>
               </w:rPr>
-              <w:t>13</w:t>
+              <w:t>14</w:t>
             </w:r>
             <w:r>
               <w:rPr>
@@ -1676,7 +1676,7 @@
               <w:lang w:eastAsia="en-GB"/>
             </w:rPr>
           </w:pPr>
-          <w:hyperlink w:anchor="_Toc224125438" w:history="1">
+          <w:hyperlink w:anchor="_Toc224213919" w:history="1">
             <w:r>
               <w:rPr>
                 <w:rStyle w:val="Hyperlink"/>
@@ -1703,7 +1703,7 @@
                 <w:noProof/>
                 <w:webHidden/>
               </w:rPr>
-              <w:instrText xml:space="preserve"> PAGEREF _Toc224125438 \h </w:instrText>
+              <w:instrText xml:space="preserve"> PAGEREF _Toc224213919 \h </w:instrText>
             </w:r>
             <w:r>
               <w:rPr>
@@ -1723,7 +1723,7 @@
                 <w:noProof/>
                 <w:webHidden/>
               </w:rPr>
-              <w:t>13</w:t>
+              <w:t>14</w:t>
             </w:r>
             <w:r>
               <w:rPr>
@@ -1748,7 +1748,7 @@
               <w:lang w:eastAsia="en-GB"/>
             </w:rPr>
           </w:pPr>
-          <w:hyperlink w:anchor="_Toc224125439" w:history="1">
+          <w:hyperlink w:anchor="_Toc224213920" w:history="1">
             <w:r>
               <w:rPr>
                 <w:rStyle w:val="Hyperlink"/>
@@ -1775,7 +1775,7 @@
                 <w:noProof/>
                 <w:webHidden/>
               </w:rPr>
-              <w:instrText xml:space="preserve"> PAGEREF _Toc224125439 \h </w:instrText>
+              <w:instrText xml:space="preserve"> PAGEREF _Toc224213920 \h </w:instrText>
             </w:r>
             <w:r>
               <w:rPr>
@@ -1795,7 +1795,7 @@
                 <w:noProof/>
                 <w:webHidden/>
               </w:rPr>
-              <w:t>16</w:t>
+              <w:t>17</w:t>
             </w:r>
             <w:r>
               <w:rPr>
@@ -1820,7 +1820,7 @@
               <w:lang w:eastAsia="en-GB"/>
             </w:rPr>
           </w:pPr>
-          <w:hyperlink w:anchor="_Toc224125440" w:history="1">
+          <w:hyperlink w:anchor="_Toc224213921" w:history="1">
             <w:r>
               <w:rPr>
                 <w:rStyle w:val="Hyperlink"/>
@@ -1847,7 +1847,7 @@
                 <w:noProof/>
                 <w:webHidden/>
               </w:rPr>
-              <w:instrText xml:space="preserve"> PAGEREF _Toc224125440 \h </w:instrText>
+              <w:instrText xml:space="preserve"> PAGEREF _Toc224213921 \h </w:instrText>
             </w:r>
             <w:r>
               <w:rPr>
@@ -1867,7 +1867,7 @@
                 <w:noProof/>
                 <w:webHidden/>
               </w:rPr>
-              <w:t>18</w:t>
+              <w:t>19</w:t>
             </w:r>
             <w:r>
               <w:rPr>
@@ -1892,7 +1892,7 @@
               <w:lang w:eastAsia="en-GB"/>
             </w:rPr>
           </w:pPr>
-          <w:hyperlink w:anchor="_Toc224125441" w:history="1">
+          <w:hyperlink w:anchor="_Toc224213922" w:history="1">
             <w:r>
               <w:rPr>
                 <w:rStyle w:val="Hyperlink"/>
@@ -1919,7 +1919,7 @@
                 <w:noProof/>
                 <w:webHidden/>
               </w:rPr>
-              <w:instrText xml:space="preserve"> PAGEREF _Toc224125441 \h </w:instrText>
+              <w:instrText xml:space="preserve"> PAGEREF _Toc224213922 \h </w:instrText>
             </w:r>
             <w:r>
               <w:rPr>
@@ -1939,7 +1939,7 @@
                 <w:noProof/>
                 <w:webHidden/>
               </w:rPr>
-              <w:t>18</w:t>
+              <w:t>19</w:t>
             </w:r>
             <w:r>
               <w:rPr>
@@ -1964,7 +1964,7 @@
               <w:lang w:eastAsia="en-GB"/>
             </w:rPr>
           </w:pPr>
-          <w:hyperlink w:anchor="_Toc224125442" w:history="1">
+          <w:hyperlink w:anchor="_Toc224213923" w:history="1">
             <w:r>
               <w:rPr>
                 <w:rStyle w:val="Hyperlink"/>
@@ -1991,7 +1991,7 @@
                 <w:noProof/>
                 <w:webHidden/>
               </w:rPr>
-              <w:instrText xml:space="preserve"> PAGEREF _Toc224125442 \h </w:instrText>
+              <w:instrText xml:space="preserve"> PAGEREF _Toc224213923 \h </w:instrText>
             </w:r>
             <w:r>
               <w:rPr>
@@ -2011,7 +2011,7 @@
                 <w:noProof/>
                 <w:webHidden/>
               </w:rPr>
-              <w:t>18</w:t>
+              <w:t>19</w:t>
             </w:r>
             <w:r>
               <w:rPr>
@@ -2036,7 +2036,7 @@
               <w:lang w:eastAsia="en-GB"/>
             </w:rPr>
           </w:pPr>
-          <w:hyperlink w:anchor="_Toc224125443" w:history="1">
+          <w:hyperlink w:anchor="_Toc224213924" w:history="1">
             <w:r>
               <w:rPr>
                 <w:rStyle w:val="Hyperlink"/>
@@ -2063,7 +2063,7 @@
                 <w:noProof/>
                 <w:webHidden/>
               </w:rPr>
-              <w:instrText xml:space="preserve"> PAGEREF _Toc224125443 \h </w:instrText>
+              <w:instrText xml:space="preserve"> PAGEREF _Toc224213924 \h </w:instrText>
             </w:r>
             <w:r>
               <w:rPr>
@@ -2083,7 +2083,7 @@
                 <w:noProof/>
                 <w:webHidden/>
               </w:rPr>
-              <w:t>18</w:t>
+              <w:t>19</w:t>
             </w:r>
             <w:r>
               <w:rPr>
@@ -2108,7 +2108,7 @@
               <w:lang w:eastAsia="en-GB"/>
             </w:rPr>
           </w:pPr>
-          <w:hyperlink w:anchor="_Toc224125444" w:history="1">
+          <w:hyperlink w:anchor="_Toc224213925" w:history="1">
             <w:r>
               <w:rPr>
                 <w:rStyle w:val="Hyperlink"/>
@@ -2135,7 +2135,7 @@
                 <w:noProof/>
                 <w:webHidden/>
               </w:rPr>
-              <w:instrText xml:space="preserve"> PAGEREF _Toc224125444 \h </w:instrText>
+              <w:instrText xml:space="preserve"> PAGEREF _Toc224213925 \h </w:instrText>
             </w:r>
             <w:r>
               <w:rPr>
@@ -2155,7 +2155,7 @@
                 <w:noProof/>
                 <w:webHidden/>
               </w:rPr>
-              <w:t>18</w:t>
+              <w:t>19</w:t>
             </w:r>
             <w:r>
               <w:rPr>
@@ -2180,7 +2180,7 @@
               <w:lang w:eastAsia="en-GB"/>
             </w:rPr>
           </w:pPr>
-          <w:hyperlink w:anchor="_Toc224125445" w:history="1">
+          <w:hyperlink w:anchor="_Toc224213926" w:history="1">
             <w:r>
               <w:rPr>
                 <w:rStyle w:val="Hyperlink"/>
@@ -2207,7 +2207,7 @@
                 <w:noProof/>
                 <w:webHidden/>
               </w:rPr>
-              <w:instrText xml:space="preserve"> PAGEREF _Toc224125445 \h </w:instrText>
+              <w:instrText xml:space="preserve"> PAGEREF _Toc224213926 \h </w:instrText>
             </w:r>
             <w:r>
               <w:rPr>
@@ -2227,7 +2227,7 @@
                 <w:noProof/>
                 <w:webHidden/>
               </w:rPr>
-              <w:t>19</w:t>
+              <w:t>20</w:t>
             </w:r>
             <w:r>
               <w:rPr>
@@ -2252,7 +2252,7 @@
               <w:lang w:eastAsia="en-GB"/>
             </w:rPr>
           </w:pPr>
-          <w:hyperlink w:anchor="_Toc224125446" w:history="1">
+          <w:hyperlink w:anchor="_Toc224213927" w:history="1">
             <w:r>
               <w:rPr>
                 <w:rStyle w:val="Hyperlink"/>
@@ -2279,7 +2279,7 @@
                 <w:noProof/>
                 <w:webHidden/>
               </w:rPr>
-              <w:instrText xml:space="preserve"> PAGEREF _Toc224125446 \h </w:instrText>
+              <w:instrText xml:space="preserve"> PAGEREF _Toc224213927 \h </w:instrText>
             </w:r>
             <w:r>
               <w:rPr>
@@ -2299,7 +2299,7 @@
                 <w:noProof/>
                 <w:webHidden/>
               </w:rPr>
-              <w:t>19</w:t>
+              <w:t>20</w:t>
             </w:r>
             <w:r>
               <w:rPr>
@@ -2324,7 +2324,7 @@
               <w:lang w:eastAsia="en-GB"/>
             </w:rPr>
           </w:pPr>
-          <w:hyperlink w:anchor="_Toc224125447" w:history="1">
+          <w:hyperlink w:anchor="_Toc224213928" w:history="1">
             <w:r>
               <w:rPr>
                 <w:rStyle w:val="Hyperlink"/>
@@ -2351,7 +2351,7 @@
                 <w:noProof/>
                 <w:webHidden/>
               </w:rPr>
-              <w:instrText xml:space="preserve"> PAGEREF _Toc224125447 \h </w:instrText>
+              <w:instrText xml:space="preserve"> PAGEREF _Toc224213928 \h </w:instrText>
             </w:r>
             <w:r>
               <w:rPr>
@@ -2371,7 +2371,7 @@
                 <w:noProof/>
                 <w:webHidden/>
               </w:rPr>
-              <w:t>19</w:t>
+              <w:t>20</w:t>
             </w:r>
             <w:r>
               <w:rPr>
@@ -2396,7 +2396,7 @@
               <w:lang w:eastAsia="en-GB"/>
             </w:rPr>
           </w:pPr>
-          <w:hyperlink w:anchor="_Toc224125448" w:history="1">
+          <w:hyperlink w:anchor="_Toc224213929" w:history="1">
             <w:r>
               <w:rPr>
                 <w:rStyle w:val="Hyperlink"/>
@@ -2423,7 +2423,7 @@
                 <w:noProof/>
                 <w:webHidden/>
               </w:rPr>
-              <w:instrText xml:space="preserve"> PAGEREF _Toc224125448 \h </w:instrText>
+              <w:instrText xml:space="preserve"> PAGEREF _Toc224213929 \h </w:instrText>
             </w:r>
             <w:r>
               <w:rPr>
@@ -2443,7 +2443,7 @@
                 <w:noProof/>
                 <w:webHidden/>
               </w:rPr>
-              <w:t>20</w:t>
+              <w:t>21</w:t>
             </w:r>
             <w:r>
               <w:rPr>
@@ -2468,7 +2468,7 @@
               <w:lang w:eastAsia="en-GB"/>
             </w:rPr>
           </w:pPr>
-          <w:hyperlink w:anchor="_Toc224125449" w:history="1">
+          <w:hyperlink w:anchor="_Toc224213930" w:history="1">
             <w:r>
               <w:rPr>
                 <w:rStyle w:val="Hyperlink"/>
@@ -2495,7 +2495,7 @@
                 <w:noProof/>
                 <w:webHidden/>
               </w:rPr>
-              <w:instrText xml:space="preserve"> PAGEREF _Toc224125449 \h </w:instrText>
+              <w:instrText xml:space="preserve"> PAGEREF _Toc224213930 \h </w:instrText>
             </w:r>
             <w:r>
               <w:rPr>
@@ -2515,7 +2515,7 @@
                 <w:noProof/>
                 <w:webHidden/>
               </w:rPr>
-              <w:t>20</w:t>
+              <w:t>21</w:t>
             </w:r>
             <w:r>
               <w:rPr>
@@ -2540,7 +2540,7 @@
               <w:lang w:eastAsia="en-GB"/>
             </w:rPr>
           </w:pPr>
-          <w:hyperlink w:anchor="_Toc224125450" w:history="1">
+          <w:hyperlink w:anchor="_Toc224213931" w:history="1">
             <w:r>
               <w:rPr>
                 <w:rStyle w:val="Hyperlink"/>
@@ -2567,7 +2567,7 @@
                 <w:noProof/>
                 <w:webHidden/>
               </w:rPr>
-              <w:instrText xml:space="preserve"> PAGEREF _Toc224125450 \h </w:instrText>
+              <w:instrText xml:space="preserve"> PAGEREF _Toc224213931 \h </w:instrText>
             </w:r>
             <w:r>
               <w:rPr>
@@ -2587,7 +2587,7 @@
                 <w:noProof/>
                 <w:webHidden/>
               </w:rPr>
-              <w:t>21</w:t>
+              <w:t>22</w:t>
             </w:r>
             <w:r>
               <w:rPr>
@@ -2612,7 +2612,7 @@
               <w:lang w:eastAsia="en-GB"/>
             </w:rPr>
           </w:pPr>
-          <w:hyperlink w:anchor="_Toc224125451" w:history="1">
+          <w:hyperlink w:anchor="_Toc224213932" w:history="1">
             <w:r>
               <w:rPr>
                 <w:rStyle w:val="Hyperlink"/>
@@ -2639,7 +2639,7 @@
                 <w:noProof/>
                 <w:webHidden/>
               </w:rPr>
-              <w:instrText xml:space="preserve"> PAGEREF _Toc224125451 \h </w:instrText>
+              <w:instrText xml:space="preserve"> PAGEREF _Toc224213932 \h </w:instrText>
             </w:r>
             <w:r>
               <w:rPr>
@@ -2659,7 +2659,7 @@
                 <w:noProof/>
                 <w:webHidden/>
               </w:rPr>
-              <w:t>21</w:t>
+              <w:t>22</w:t>
             </w:r>
             <w:r>
               <w:rPr>
@@ -2684,7 +2684,7 @@
               <w:lang w:eastAsia="en-GB"/>
             </w:rPr>
           </w:pPr>
-          <w:hyperlink w:anchor="_Toc224125452" w:history="1">
+          <w:hyperlink w:anchor="_Toc224213933" w:history="1">
             <w:r>
               <w:rPr>
                 <w:rStyle w:val="Hyperlink"/>
@@ -2711,7 +2711,7 @@
                 <w:noProof/>
                 <w:webHidden/>
               </w:rPr>
-              <w:instrText xml:space="preserve"> PAGEREF _Toc224125452 \h </w:instrText>
+              <w:instrText xml:space="preserve"> PAGEREF _Toc224213933 \h </w:instrText>
             </w:r>
             <w:r>
               <w:rPr>
@@ -2731,7 +2731,7 @@
                 <w:noProof/>
                 <w:webHidden/>
               </w:rPr>
-              <w:t>21</w:t>
+              <w:t>22</w:t>
             </w:r>
             <w:r>
               <w:rPr>
@@ -2756,7 +2756,7 @@
               <w:lang w:eastAsia="en-GB"/>
             </w:rPr>
           </w:pPr>
-          <w:hyperlink w:anchor="_Toc224125453" w:history="1">
+          <w:hyperlink w:anchor="_Toc224213934" w:history="1">
             <w:r>
               <w:rPr>
                 <w:rStyle w:val="Hyperlink"/>
@@ -2783,7 +2783,7 @@
                 <w:noProof/>
                 <w:webHidden/>
               </w:rPr>
-              <w:instrText xml:space="preserve"> PAGEREF _Toc224125453 \h </w:instrText>
+              <w:instrText xml:space="preserve"> PAGEREF _Toc224213934 \h </w:instrText>
             </w:r>
             <w:r>
               <w:rPr>
@@ -2803,7 +2803,7 @@
                 <w:noProof/>
                 <w:webHidden/>
               </w:rPr>
-              <w:t>21</w:t>
+              <w:t>22</w:t>
             </w:r>
             <w:r>
               <w:rPr>
@@ -2828,7 +2828,7 @@
               <w:lang w:eastAsia="en-GB"/>
             </w:rPr>
           </w:pPr>
-          <w:hyperlink w:anchor="_Toc224125454" w:history="1">
+          <w:hyperlink w:anchor="_Toc224213935" w:history="1">
             <w:r>
               <w:rPr>
                 <w:rStyle w:val="Hyperlink"/>
@@ -2855,7 +2855,7 @@
                 <w:noProof/>
                 <w:webHidden/>
               </w:rPr>
-              <w:instrText xml:space="preserve"> PAGEREF _Toc224125454 \h </w:instrText>
+              <w:instrText xml:space="preserve"> PAGEREF _Toc224213935 \h </w:instrText>
             </w:r>
             <w:r>
               <w:rPr>
@@ -2875,7 +2875,7 @@
                 <w:noProof/>
                 <w:webHidden/>
               </w:rPr>
-              <w:t>21</w:t>
+              <w:t>22</w:t>
             </w:r>
             <w:r>
               <w:rPr>
@@ -2900,7 +2900,7 @@
               <w:lang w:eastAsia="en-GB"/>
             </w:rPr>
           </w:pPr>
-          <w:hyperlink w:anchor="_Toc224125455" w:history="1">
+          <w:hyperlink w:anchor="_Toc224213936" w:history="1">
             <w:r>
               <w:rPr>
                 <w:rStyle w:val="Hyperlink"/>
@@ -2927,7 +2927,7 @@
                 <w:noProof/>
                 <w:webHidden/>
               </w:rPr>
-              <w:instrText xml:space="preserve"> PAGEREF _Toc224125455 \h </w:instrText>
+              <w:instrText xml:space="preserve"> PAGEREF _Toc224213936 \h </w:instrText>
             </w:r>
             <w:r>
               <w:rPr>
@@ -2947,7 +2947,7 @@
                 <w:noProof/>
                 <w:webHidden/>
               </w:rPr>
-              <w:t>22</w:t>
+              <w:t>23</w:t>
             </w:r>
             <w:r>
               <w:rPr>
@@ -2972,7 +2972,7 @@
               <w:lang w:eastAsia="en-GB"/>
             </w:rPr>
           </w:pPr>
-          <w:hyperlink w:anchor="_Toc224125456" w:history="1">
+          <w:hyperlink w:anchor="_Toc224213937" w:history="1">
             <w:r>
               <w:rPr>
                 <w:rStyle w:val="Hyperlink"/>
@@ -2999,7 +2999,7 @@
                 <w:noProof/>
                 <w:webHidden/>
               </w:rPr>
-              <w:instrText xml:space="preserve"> PAGEREF _Toc224125456 \h </w:instrText>
+              <w:instrText xml:space="preserve"> PAGEREF _Toc224213937 \h </w:instrText>
             </w:r>
             <w:r>
               <w:rPr>
@@ -3019,7 +3019,7 @@
                 <w:noProof/>
                 <w:webHidden/>
               </w:rPr>
-              <w:t>22</w:t>
+              <w:t>23</w:t>
             </w:r>
             <w:r>
               <w:rPr>
@@ -3044,7 +3044,7 @@
               <w:lang w:eastAsia="en-GB"/>
             </w:rPr>
           </w:pPr>
-          <w:hyperlink w:anchor="_Toc224125457" w:history="1">
+          <w:hyperlink w:anchor="_Toc224213938" w:history="1">
             <w:r>
               <w:rPr>
                 <w:rStyle w:val="Hyperlink"/>
@@ -3071,7 +3071,7 @@
                 <w:noProof/>
                 <w:webHidden/>
               </w:rPr>
-              <w:instrText xml:space="preserve"> PAGEREF _Toc224125457 \h </w:instrText>
+              <w:instrText xml:space="preserve"> PAGEREF _Toc224213938 \h </w:instrText>
             </w:r>
             <w:r>
               <w:rPr>
@@ -3091,7 +3091,7 @@
                 <w:noProof/>
                 <w:webHidden/>
               </w:rPr>
-              <w:t>22</w:t>
+              <w:t>23</w:t>
             </w:r>
             <w:r>
               <w:rPr>
@@ -3116,7 +3116,7 @@
               <w:lang w:eastAsia="en-GB"/>
             </w:rPr>
           </w:pPr>
-          <w:hyperlink w:anchor="_Toc224125458" w:history="1">
+          <w:hyperlink w:anchor="_Toc224213939" w:history="1">
             <w:r>
               <w:rPr>
                 <w:rStyle w:val="Hyperlink"/>
@@ -3143,7 +3143,7 @@
                 <w:noProof/>
                 <w:webHidden/>
               </w:rPr>
-              <w:instrText xml:space="preserve"> PAGEREF _Toc224125458 \h </w:instrText>
+              <w:instrText xml:space="preserve"> PAGEREF _Toc224213939 \h </w:instrText>
             </w:r>
             <w:r>
               <w:rPr>
@@ -3163,7 +3163,7 @@
                 <w:noProof/>
                 <w:webHidden/>
               </w:rPr>
-              <w:t>22</w:t>
+              <w:t>23</w:t>
             </w:r>
             <w:r>
               <w:rPr>
@@ -3188,7 +3188,7 @@
               <w:lang w:eastAsia="en-GB"/>
             </w:rPr>
           </w:pPr>
-          <w:hyperlink w:anchor="_Toc224125459" w:history="1">
+          <w:hyperlink w:anchor="_Toc224213940" w:history="1">
             <w:r>
               <w:rPr>
                 <w:rStyle w:val="Hyperlink"/>
@@ -3215,7 +3215,7 @@
                 <w:noProof/>
                 <w:webHidden/>
               </w:rPr>
-              <w:instrText xml:space="preserve"> PAGEREF _Toc224125459 \h </w:instrText>
+              <w:instrText xml:space="preserve"> PAGEREF _Toc224213940 \h </w:instrText>
             </w:r>
             <w:r>
               <w:rPr>
@@ -3235,7 +3235,7 @@
                 <w:noProof/>
                 <w:webHidden/>
               </w:rPr>
-              <w:t>23</w:t>
+              <w:t>24</w:t>
             </w:r>
             <w:r>
               <w:rPr>
@@ -3260,7 +3260,7 @@
               <w:lang w:eastAsia="en-GB"/>
             </w:rPr>
           </w:pPr>
-          <w:hyperlink w:anchor="_Toc224125460" w:history="1">
+          <w:hyperlink w:anchor="_Toc224213941" w:history="1">
             <w:r>
               <w:rPr>
                 <w:rStyle w:val="Hyperlink"/>
@@ -3287,7 +3287,7 @@
                 <w:noProof/>
                 <w:webHidden/>
               </w:rPr>
-              <w:instrText xml:space="preserve"> PAGEREF _Toc224125460 \h </w:instrText>
+              <w:instrText xml:space="preserve"> PAGEREF _Toc224213941 \h </w:instrText>
             </w:r>
             <w:r>
               <w:rPr>
@@ -3307,7 +3307,7 @@
                 <w:noProof/>
                 <w:webHidden/>
               </w:rPr>
-              <w:t>23</w:t>
+              <w:t>24</w:t>
             </w:r>
             <w:r>
               <w:rPr>
@@ -3332,7 +3332,7 @@
               <w:lang w:eastAsia="en-GB"/>
             </w:rPr>
           </w:pPr>
-          <w:hyperlink w:anchor="_Toc224125461" w:history="1">
+          <w:hyperlink w:anchor="_Toc224213942" w:history="1">
             <w:r>
               <w:rPr>
                 <w:rStyle w:val="Hyperlink"/>
@@ -3359,7 +3359,7 @@
                 <w:noProof/>
                 <w:webHidden/>
               </w:rPr>
-              <w:instrText xml:space="preserve"> PAGEREF _Toc224125461 \h </w:instrText>
+              <w:instrText xml:space="preserve"> PAGEREF _Toc224213942 \h </w:instrText>
             </w:r>
             <w:r>
               <w:rPr>
@@ -3379,7 +3379,7 @@
                 <w:noProof/>
                 <w:webHidden/>
               </w:rPr>
-              <w:t>24</w:t>
+              <w:t>25</w:t>
             </w:r>
             <w:r>
               <w:rPr>
@@ -3404,7 +3404,7 @@
               <w:lang w:eastAsia="en-GB"/>
             </w:rPr>
           </w:pPr>
-          <w:hyperlink w:anchor="_Toc224125462" w:history="1">
+          <w:hyperlink w:anchor="_Toc224213943" w:history="1">
             <w:r>
               <w:rPr>
                 <w:rStyle w:val="Hyperlink"/>
@@ -3431,7 +3431,7 @@
                 <w:noProof/>
                 <w:webHidden/>
               </w:rPr>
-              <w:instrText xml:space="preserve"> PAGEREF _Toc224125462 \h </w:instrText>
+              <w:instrText xml:space="preserve"> PAGEREF _Toc224213943 \h </w:instrText>
             </w:r>
             <w:r>
               <w:rPr>
@@ -3451,7 +3451,7 @@
                 <w:noProof/>
                 <w:webHidden/>
               </w:rPr>
-              <w:t>24</w:t>
+              <w:t>25</w:t>
             </w:r>
             <w:r>
               <w:rPr>
@@ -3476,7 +3476,7 @@
               <w:lang w:eastAsia="en-GB"/>
             </w:rPr>
           </w:pPr>
-          <w:hyperlink w:anchor="_Toc224125463" w:history="1">
+          <w:hyperlink w:anchor="_Toc224213944" w:history="1">
             <w:r>
               <w:rPr>
                 <w:rStyle w:val="Hyperlink"/>
@@ -3503,7 +3503,7 @@
                 <w:noProof/>
                 <w:webHidden/>
               </w:rPr>
-              <w:instrText xml:space="preserve"> PAGEREF _Toc224125463 \h </w:instrText>
+              <w:instrText xml:space="preserve"> PAGEREF _Toc224213944 \h </w:instrText>
             </w:r>
             <w:r>
               <w:rPr>
@@ -3523,7 +3523,7 @@
                 <w:noProof/>
                 <w:webHidden/>
               </w:rPr>
-              <w:t>24</w:t>
+              <w:t>25</w:t>
             </w:r>
             <w:r>
               <w:rPr>
@@ -3548,7 +3548,7 @@
               <w:lang w:eastAsia="en-GB"/>
             </w:rPr>
           </w:pPr>
-          <w:hyperlink w:anchor="_Toc224125464" w:history="1">
+          <w:hyperlink w:anchor="_Toc224213945" w:history="1">
             <w:r>
               <w:rPr>
                 <w:rStyle w:val="Hyperlink"/>
@@ -3575,7 +3575,7 @@
                 <w:noProof/>
                 <w:webHidden/>
               </w:rPr>
-              <w:instrText xml:space="preserve"> PAGEREF _Toc224125464 \h </w:instrText>
+              <w:instrText xml:space="preserve"> PAGEREF _Toc224213945 \h </w:instrText>
             </w:r>
             <w:r>
               <w:rPr>
@@ -3595,7 +3595,7 @@
                 <w:noProof/>
                 <w:webHidden/>
               </w:rPr>
-              <w:t>24</w:t>
+              <w:t>25</w:t>
             </w:r>
             <w:r>
               <w:rPr>
@@ -3620,7 +3620,7 @@
               <w:lang w:eastAsia="en-GB"/>
             </w:rPr>
           </w:pPr>
-          <w:hyperlink w:anchor="_Toc224125465" w:history="1">
+          <w:hyperlink w:anchor="_Toc224213946" w:history="1">
             <w:r>
               <w:rPr>
                 <w:rStyle w:val="Hyperlink"/>
@@ -3647,7 +3647,7 @@
                 <w:noProof/>
                 <w:webHidden/>
               </w:rPr>
-              <w:instrText xml:space="preserve"> PAGEREF _Toc224125465 \h </w:instrText>
+              <w:instrText xml:space="preserve"> PAGEREF _Toc224213946 \h </w:instrText>
             </w:r>
             <w:r>
               <w:rPr>
@@ -3667,7 +3667,7 @@
                 <w:noProof/>
                 <w:webHidden/>
               </w:rPr>
-              <w:t>25</w:t>
+              <w:t>26</w:t>
             </w:r>
             <w:r>
               <w:rPr>
@@ -3692,7 +3692,7 @@
               <w:lang w:eastAsia="en-GB"/>
             </w:rPr>
           </w:pPr>
-          <w:hyperlink w:anchor="_Toc224125466" w:history="1">
+          <w:hyperlink w:anchor="_Toc224213947" w:history="1">
             <w:r>
               <w:rPr>
                 <w:rStyle w:val="Hyperlink"/>
@@ -3719,7 +3719,7 @@
                 <w:noProof/>
                 <w:webHidden/>
               </w:rPr>
-              <w:instrText xml:space="preserve"> PAGEREF _Toc224125466 \h </w:instrText>
+              <w:instrText xml:space="preserve"> PAGEREF _Toc224213947 \h </w:instrText>
             </w:r>
             <w:r>
               <w:rPr>
@@ -3739,7 +3739,7 @@
                 <w:noProof/>
                 <w:webHidden/>
               </w:rPr>
-              <w:t>25</w:t>
+              <w:t>26</w:t>
             </w:r>
             <w:r>
               <w:rPr>
@@ -3764,7 +3764,7 @@
               <w:lang w:eastAsia="en-GB"/>
             </w:rPr>
           </w:pPr>
-          <w:hyperlink w:anchor="_Toc224125467" w:history="1">
+          <w:hyperlink w:anchor="_Toc224213948" w:history="1">
             <w:r>
               <w:rPr>
                 <w:rStyle w:val="Hyperlink"/>
@@ -3791,7 +3791,7 @@
                 <w:noProof/>
                 <w:webHidden/>
               </w:rPr>
-              <w:instrText xml:space="preserve"> PAGEREF _Toc224125467 \h </w:instrText>
+              <w:instrText xml:space="preserve"> PAGEREF _Toc224213948 \h </w:instrText>
             </w:r>
             <w:r>
               <w:rPr>
@@ -3811,7 +3811,7 @@
                 <w:noProof/>
                 <w:webHidden/>
               </w:rPr>
-              <w:t>25</w:t>
+              <w:t>26</w:t>
             </w:r>
             <w:r>
               <w:rPr>
@@ -3836,7 +3836,7 @@
               <w:lang w:eastAsia="en-GB"/>
             </w:rPr>
           </w:pPr>
-          <w:hyperlink w:anchor="_Toc224125468" w:history="1">
+          <w:hyperlink w:anchor="_Toc224213949" w:history="1">
             <w:r>
               <w:rPr>
                 <w:rStyle w:val="Hyperlink"/>
@@ -3863,7 +3863,7 @@
                 <w:noProof/>
                 <w:webHidden/>
               </w:rPr>
-              <w:instrText xml:space="preserve"> PAGEREF _Toc224125468 \h </w:instrText>
+              <w:instrText xml:space="preserve"> PAGEREF _Toc224213949 \h </w:instrText>
             </w:r>
             <w:r>
               <w:rPr>
@@ -3883,7 +3883,7 @@
                 <w:noProof/>
                 <w:webHidden/>
               </w:rPr>
-              <w:t>25</w:t>
+              <w:t>27</w:t>
             </w:r>
             <w:r>
               <w:rPr>
@@ -3908,7 +3908,7 @@
               <w:lang w:eastAsia="en-GB"/>
             </w:rPr>
           </w:pPr>
-          <w:hyperlink w:anchor="_Toc224125469" w:history="1">
+          <w:hyperlink w:anchor="_Toc224213950" w:history="1">
             <w:r>
               <w:rPr>
                 <w:rStyle w:val="Hyperlink"/>
@@ -3935,7 +3935,7 @@
                 <w:noProof/>
                 <w:webHidden/>
               </w:rPr>
-              <w:instrText xml:space="preserve"> PAGEREF _Toc224125469 \h </w:instrText>
+              <w:instrText xml:space="preserve"> PAGEREF _Toc224213950 \h </w:instrText>
             </w:r>
             <w:r>
               <w:rPr>
@@ -3955,7 +3955,7 @@
                 <w:noProof/>
                 <w:webHidden/>
               </w:rPr>
-              <w:t>25</w:t>
+              <w:t>27</w:t>
             </w:r>
             <w:r>
               <w:rPr>
@@ -3980,7 +3980,7 @@
               <w:lang w:eastAsia="en-GB"/>
             </w:rPr>
           </w:pPr>
-          <w:hyperlink w:anchor="_Toc224125470" w:history="1">
+          <w:hyperlink w:anchor="_Toc224213951" w:history="1">
             <w:r>
               <w:rPr>
                 <w:rStyle w:val="Hyperlink"/>
@@ -4007,7 +4007,7 @@
                 <w:noProof/>
                 <w:webHidden/>
               </w:rPr>
-              <w:instrText xml:space="preserve"> PAGEREF _Toc224125470 \h </w:instrText>
+              <w:instrText xml:space="preserve"> PAGEREF _Toc224213951 \h </w:instrText>
             </w:r>
             <w:r>
               <w:rPr>
@@ -4027,7 +4027,7 @@
                 <w:noProof/>
                 <w:webHidden/>
               </w:rPr>
-              <w:t>25</w:t>
+              <w:t>27</w:t>
             </w:r>
             <w:r>
               <w:rPr>
@@ -4052,7 +4052,7 @@
               <w:lang w:eastAsia="en-GB"/>
             </w:rPr>
           </w:pPr>
-          <w:hyperlink w:anchor="_Toc224125471" w:history="1">
+          <w:hyperlink w:anchor="_Toc224213952" w:history="1">
             <w:r>
               <w:rPr>
                 <w:rStyle w:val="Hyperlink"/>
@@ -4079,7 +4079,7 @@
                 <w:noProof/>
                 <w:webHidden/>
               </w:rPr>
-              <w:instrText xml:space="preserve"> PAGEREF _Toc224125471 \h </w:instrText>
+              <w:instrText xml:space="preserve"> PAGEREF _Toc224213952 \h </w:instrText>
             </w:r>
             <w:r>
               <w:rPr>
@@ -4099,7 +4099,7 @@
                 <w:noProof/>
                 <w:webHidden/>
               </w:rPr>
-              <w:t>26</w:t>
+              <w:t>29</w:t>
             </w:r>
             <w:r>
               <w:rPr>
@@ -4124,7 +4124,7 @@
               <w:lang w:eastAsia="en-GB"/>
             </w:rPr>
           </w:pPr>
-          <w:hyperlink w:anchor="_Toc224125472" w:history="1">
+          <w:hyperlink w:anchor="_Toc224213953" w:history="1">
             <w:r>
               <w:rPr>
                 <w:rStyle w:val="Hyperlink"/>
@@ -4151,7 +4151,7 @@
                 <w:noProof/>
                 <w:webHidden/>
               </w:rPr>
-              <w:instrText xml:space="preserve"> PAGEREF _Toc224125472 \h </w:instrText>
+              <w:instrText xml:space="preserve"> PAGEREF _Toc224213953 \h </w:instrText>
             </w:r>
             <w:r>
               <w:rPr>
@@ -4171,7 +4171,583 @@
                 <w:noProof/>
                 <w:webHidden/>
               </w:rPr>
-              <w:t>26</w:t>
+              <w:t>29</w:t>
+            </w:r>
+            <w:r>
+              <w:rPr>
+                <w:noProof/>
+                <w:webHidden/>
+              </w:rPr>
+              <w:fldChar w:fldCharType="end"/>
+            </w:r>
+          </w:hyperlink>
+        </w:p>
+        <w:p>
+          <w:pPr>
+            <w:pStyle w:val="TOC2"/>
+            <w:tabs>
+              <w:tab w:val="right" w:leader="dot" w:pos="9016"/>
+            </w:tabs>
+            <w:rPr>
+              <w:rFonts w:eastAsiaTheme="minorEastAsia"/>
+              <w:noProof/>
+              <w:sz w:val="24"/>
+              <w:szCs w:val="24"/>
+              <w:lang w:eastAsia="en-GB"/>
+            </w:rPr>
+          </w:pPr>
+          <w:hyperlink w:anchor="_Toc224213954" w:history="1">
+            <w:r>
+              <w:rPr>
+                <w:rStyle w:val="Hyperlink"/>
+                <w:noProof/>
+              </w:rPr>
+              <w:t>Narration Within the Experience</w:t>
+            </w:r>
+            <w:r>
+              <w:rPr>
+                <w:noProof/>
+                <w:webHidden/>
+              </w:rPr>
+              <w:tab/>
+            </w:r>
+            <w:r>
+              <w:rPr>
+                <w:noProof/>
+                <w:webHidden/>
+              </w:rPr>
+              <w:fldChar w:fldCharType="begin"/>
+            </w:r>
+            <w:r>
+              <w:rPr>
+                <w:noProof/>
+                <w:webHidden/>
+              </w:rPr>
+              <w:instrText xml:space="preserve"> PAGEREF _Toc224213954 \h </w:instrText>
+            </w:r>
+            <w:r>
+              <w:rPr>
+                <w:noProof/>
+                <w:webHidden/>
+              </w:rPr>
+            </w:r>
+            <w:r>
+              <w:rPr>
+                <w:noProof/>
+                <w:webHidden/>
+              </w:rPr>
+              <w:fldChar w:fldCharType="separate"/>
+            </w:r>
+            <w:r>
+              <w:rPr>
+                <w:noProof/>
+                <w:webHidden/>
+              </w:rPr>
+              <w:t>29</w:t>
+            </w:r>
+            <w:r>
+              <w:rPr>
+                <w:noProof/>
+                <w:webHidden/>
+              </w:rPr>
+              <w:fldChar w:fldCharType="end"/>
+            </w:r>
+          </w:hyperlink>
+        </w:p>
+        <w:p>
+          <w:pPr>
+            <w:pStyle w:val="TOC2"/>
+            <w:tabs>
+              <w:tab w:val="right" w:leader="dot" w:pos="9016"/>
+            </w:tabs>
+            <w:rPr>
+              <w:rFonts w:eastAsiaTheme="minorEastAsia"/>
+              <w:noProof/>
+              <w:sz w:val="24"/>
+              <w:szCs w:val="24"/>
+              <w:lang w:eastAsia="en-GB"/>
+            </w:rPr>
+          </w:pPr>
+          <w:hyperlink w:anchor="_Toc224213955" w:history="1">
+            <w:r>
+              <w:rPr>
+                <w:rStyle w:val="Hyperlink"/>
+                <w:noProof/>
+              </w:rPr>
+              <w:t>Adding Tutorials</w:t>
+            </w:r>
+            <w:r>
+              <w:rPr>
+                <w:noProof/>
+                <w:webHidden/>
+              </w:rPr>
+              <w:tab/>
+            </w:r>
+            <w:r>
+              <w:rPr>
+                <w:noProof/>
+                <w:webHidden/>
+              </w:rPr>
+              <w:fldChar w:fldCharType="begin"/>
+            </w:r>
+            <w:r>
+              <w:rPr>
+                <w:noProof/>
+                <w:webHidden/>
+              </w:rPr>
+              <w:instrText xml:space="preserve"> PAGEREF _Toc224213955 \h </w:instrText>
+            </w:r>
+            <w:r>
+              <w:rPr>
+                <w:noProof/>
+                <w:webHidden/>
+              </w:rPr>
+            </w:r>
+            <w:r>
+              <w:rPr>
+                <w:noProof/>
+                <w:webHidden/>
+              </w:rPr>
+              <w:fldChar w:fldCharType="separate"/>
+            </w:r>
+            <w:r>
+              <w:rPr>
+                <w:noProof/>
+                <w:webHidden/>
+              </w:rPr>
+              <w:t>29</w:t>
+            </w:r>
+            <w:r>
+              <w:rPr>
+                <w:noProof/>
+                <w:webHidden/>
+              </w:rPr>
+              <w:fldChar w:fldCharType="end"/>
+            </w:r>
+          </w:hyperlink>
+        </w:p>
+        <w:p>
+          <w:pPr>
+            <w:pStyle w:val="TOC2"/>
+            <w:tabs>
+              <w:tab w:val="right" w:leader="dot" w:pos="9016"/>
+            </w:tabs>
+            <w:rPr>
+              <w:rFonts w:eastAsiaTheme="minorEastAsia"/>
+              <w:noProof/>
+              <w:sz w:val="24"/>
+              <w:szCs w:val="24"/>
+              <w:lang w:eastAsia="en-GB"/>
+            </w:rPr>
+          </w:pPr>
+          <w:hyperlink w:anchor="_Toc224213956" w:history="1">
+            <w:r>
+              <w:rPr>
+                <w:rStyle w:val="Hyperlink"/>
+                <w:noProof/>
+              </w:rPr>
+              <w:t>Accessibility Settings</w:t>
+            </w:r>
+            <w:r>
+              <w:rPr>
+                <w:noProof/>
+                <w:webHidden/>
+              </w:rPr>
+              <w:tab/>
+            </w:r>
+            <w:r>
+              <w:rPr>
+                <w:noProof/>
+                <w:webHidden/>
+              </w:rPr>
+              <w:fldChar w:fldCharType="begin"/>
+            </w:r>
+            <w:r>
+              <w:rPr>
+                <w:noProof/>
+                <w:webHidden/>
+              </w:rPr>
+              <w:instrText xml:space="preserve"> PAGEREF _Toc224213956 \h </w:instrText>
+            </w:r>
+            <w:r>
+              <w:rPr>
+                <w:noProof/>
+                <w:webHidden/>
+              </w:rPr>
+            </w:r>
+            <w:r>
+              <w:rPr>
+                <w:noProof/>
+                <w:webHidden/>
+              </w:rPr>
+              <w:fldChar w:fldCharType="separate"/>
+            </w:r>
+            <w:r>
+              <w:rPr>
+                <w:noProof/>
+                <w:webHidden/>
+              </w:rPr>
+              <w:t>29</w:t>
+            </w:r>
+            <w:r>
+              <w:rPr>
+                <w:noProof/>
+                <w:webHidden/>
+              </w:rPr>
+              <w:fldChar w:fldCharType="end"/>
+            </w:r>
+          </w:hyperlink>
+        </w:p>
+        <w:p>
+          <w:pPr>
+            <w:pStyle w:val="TOC2"/>
+            <w:tabs>
+              <w:tab w:val="right" w:leader="dot" w:pos="9016"/>
+            </w:tabs>
+            <w:rPr>
+              <w:rFonts w:eastAsiaTheme="minorEastAsia"/>
+              <w:noProof/>
+              <w:sz w:val="24"/>
+              <w:szCs w:val="24"/>
+              <w:lang w:eastAsia="en-GB"/>
+            </w:rPr>
+          </w:pPr>
+          <w:hyperlink w:anchor="_Toc224213957" w:history="1">
+            <w:r>
+              <w:rPr>
+                <w:rStyle w:val="Hyperlink"/>
+                <w:noProof/>
+              </w:rPr>
+              <w:t>Additional Preventative Measures</w:t>
+            </w:r>
+            <w:r>
+              <w:rPr>
+                <w:noProof/>
+                <w:webHidden/>
+              </w:rPr>
+              <w:tab/>
+            </w:r>
+            <w:r>
+              <w:rPr>
+                <w:noProof/>
+                <w:webHidden/>
+              </w:rPr>
+              <w:fldChar w:fldCharType="begin"/>
+            </w:r>
+            <w:r>
+              <w:rPr>
+                <w:noProof/>
+                <w:webHidden/>
+              </w:rPr>
+              <w:instrText xml:space="preserve"> PAGEREF _Toc224213957 \h </w:instrText>
+            </w:r>
+            <w:r>
+              <w:rPr>
+                <w:noProof/>
+                <w:webHidden/>
+              </w:rPr>
+            </w:r>
+            <w:r>
+              <w:rPr>
+                <w:noProof/>
+                <w:webHidden/>
+              </w:rPr>
+              <w:fldChar w:fldCharType="separate"/>
+            </w:r>
+            <w:r>
+              <w:rPr>
+                <w:noProof/>
+                <w:webHidden/>
+              </w:rPr>
+              <w:t>29</w:t>
+            </w:r>
+            <w:r>
+              <w:rPr>
+                <w:noProof/>
+                <w:webHidden/>
+              </w:rPr>
+              <w:fldChar w:fldCharType="end"/>
+            </w:r>
+          </w:hyperlink>
+        </w:p>
+        <w:p>
+          <w:pPr>
+            <w:pStyle w:val="TOC2"/>
+            <w:tabs>
+              <w:tab w:val="right" w:leader="dot" w:pos="9016"/>
+            </w:tabs>
+            <w:rPr>
+              <w:rFonts w:eastAsiaTheme="minorEastAsia"/>
+              <w:noProof/>
+              <w:sz w:val="24"/>
+              <w:szCs w:val="24"/>
+              <w:lang w:eastAsia="en-GB"/>
+            </w:rPr>
+          </w:pPr>
+          <w:hyperlink w:anchor="_Toc224213958" w:history="1">
+            <w:r>
+              <w:rPr>
+                <w:rStyle w:val="Hyperlink"/>
+                <w:noProof/>
+              </w:rPr>
+              <w:t>Implementation of Larger and Diverse Testing Groups</w:t>
+            </w:r>
+            <w:r>
+              <w:rPr>
+                <w:noProof/>
+                <w:webHidden/>
+              </w:rPr>
+              <w:tab/>
+            </w:r>
+            <w:r>
+              <w:rPr>
+                <w:noProof/>
+                <w:webHidden/>
+              </w:rPr>
+              <w:fldChar w:fldCharType="begin"/>
+            </w:r>
+            <w:r>
+              <w:rPr>
+                <w:noProof/>
+                <w:webHidden/>
+              </w:rPr>
+              <w:instrText xml:space="preserve"> PAGEREF _Toc224213958 \h </w:instrText>
+            </w:r>
+            <w:r>
+              <w:rPr>
+                <w:noProof/>
+                <w:webHidden/>
+              </w:rPr>
+            </w:r>
+            <w:r>
+              <w:rPr>
+                <w:noProof/>
+                <w:webHidden/>
+              </w:rPr>
+              <w:fldChar w:fldCharType="separate"/>
+            </w:r>
+            <w:r>
+              <w:rPr>
+                <w:noProof/>
+                <w:webHidden/>
+              </w:rPr>
+              <w:t>29</w:t>
+            </w:r>
+            <w:r>
+              <w:rPr>
+                <w:noProof/>
+                <w:webHidden/>
+              </w:rPr>
+              <w:fldChar w:fldCharType="end"/>
+            </w:r>
+          </w:hyperlink>
+        </w:p>
+        <w:p>
+          <w:pPr>
+            <w:pStyle w:val="TOC2"/>
+            <w:tabs>
+              <w:tab w:val="right" w:leader="dot" w:pos="9016"/>
+            </w:tabs>
+            <w:rPr>
+              <w:rFonts w:eastAsiaTheme="minorEastAsia"/>
+              <w:noProof/>
+              <w:sz w:val="24"/>
+              <w:szCs w:val="24"/>
+              <w:lang w:eastAsia="en-GB"/>
+            </w:rPr>
+          </w:pPr>
+          <w:hyperlink w:anchor="_Toc224213959" w:history="1">
+            <w:r>
+              <w:rPr>
+                <w:rStyle w:val="Hyperlink"/>
+                <w:noProof/>
+              </w:rPr>
+              <w:t>Changing Gaze Detection to Use Eye Tracking</w:t>
+            </w:r>
+            <w:r>
+              <w:rPr>
+                <w:noProof/>
+                <w:webHidden/>
+              </w:rPr>
+              <w:tab/>
+            </w:r>
+            <w:r>
+              <w:rPr>
+                <w:noProof/>
+                <w:webHidden/>
+              </w:rPr>
+              <w:fldChar w:fldCharType="begin"/>
+            </w:r>
+            <w:r>
+              <w:rPr>
+                <w:noProof/>
+                <w:webHidden/>
+              </w:rPr>
+              <w:instrText xml:space="preserve"> PAGEREF _Toc224213959 \h </w:instrText>
+            </w:r>
+            <w:r>
+              <w:rPr>
+                <w:noProof/>
+                <w:webHidden/>
+              </w:rPr>
+            </w:r>
+            <w:r>
+              <w:rPr>
+                <w:noProof/>
+                <w:webHidden/>
+              </w:rPr>
+              <w:fldChar w:fldCharType="separate"/>
+            </w:r>
+            <w:r>
+              <w:rPr>
+                <w:noProof/>
+                <w:webHidden/>
+              </w:rPr>
+              <w:t>29</w:t>
+            </w:r>
+            <w:r>
+              <w:rPr>
+                <w:noProof/>
+                <w:webHidden/>
+              </w:rPr>
+              <w:fldChar w:fldCharType="end"/>
+            </w:r>
+          </w:hyperlink>
+        </w:p>
+        <w:p>
+          <w:pPr>
+            <w:pStyle w:val="TOC2"/>
+            <w:tabs>
+              <w:tab w:val="right" w:leader="dot" w:pos="9016"/>
+            </w:tabs>
+            <w:rPr>
+              <w:rFonts w:eastAsiaTheme="minorEastAsia"/>
+              <w:noProof/>
+              <w:sz w:val="24"/>
+              <w:szCs w:val="24"/>
+              <w:lang w:eastAsia="en-GB"/>
+            </w:rPr>
+          </w:pPr>
+          <w:hyperlink w:anchor="_Toc224213960" w:history="1">
+            <w:r>
+              <w:rPr>
+                <w:rStyle w:val="Hyperlink"/>
+                <w:noProof/>
+              </w:rPr>
+              <w:t>Increasing the Number of Environments</w:t>
+            </w:r>
+            <w:r>
+              <w:rPr>
+                <w:noProof/>
+                <w:webHidden/>
+              </w:rPr>
+              <w:tab/>
+            </w:r>
+            <w:r>
+              <w:rPr>
+                <w:noProof/>
+                <w:webHidden/>
+              </w:rPr>
+              <w:fldChar w:fldCharType="begin"/>
+            </w:r>
+            <w:r>
+              <w:rPr>
+                <w:noProof/>
+                <w:webHidden/>
+              </w:rPr>
+              <w:instrText xml:space="preserve"> PAGEREF _Toc224213960 \h </w:instrText>
+            </w:r>
+            <w:r>
+              <w:rPr>
+                <w:noProof/>
+                <w:webHidden/>
+              </w:rPr>
+            </w:r>
+            <w:r>
+              <w:rPr>
+                <w:noProof/>
+                <w:webHidden/>
+              </w:rPr>
+              <w:fldChar w:fldCharType="separate"/>
+            </w:r>
+            <w:r>
+              <w:rPr>
+                <w:noProof/>
+                <w:webHidden/>
+              </w:rPr>
+              <w:t>29</w:t>
+            </w:r>
+            <w:r>
+              <w:rPr>
+                <w:noProof/>
+                <w:webHidden/>
+              </w:rPr>
+              <w:fldChar w:fldCharType="end"/>
+            </w:r>
+          </w:hyperlink>
+        </w:p>
+        <w:p>
+          <w:pPr>
+            <w:pStyle w:val="TOC2"/>
+            <w:tabs>
+              <w:tab w:val="right" w:leader="dot" w:pos="9016"/>
+            </w:tabs>
+            <w:rPr>
+              <w:rFonts w:eastAsiaTheme="minorEastAsia"/>
+              <w:noProof/>
+              <w:sz w:val="24"/>
+              <w:szCs w:val="24"/>
+              <w:lang w:eastAsia="en-GB"/>
+            </w:rPr>
+          </w:pPr>
+          <w:hyperlink w:anchor="_Toc224213961" w:history="1">
+            <w:r>
+              <w:rPr>
+                <w:rStyle w:val="Hyperlink"/>
+                <w:noProof/>
+              </w:rPr>
+              <w:t>Making the Light Switch Interaction Intuitive</w:t>
+            </w:r>
+            <w:r>
+              <w:rPr>
+                <w:noProof/>
+                <w:webHidden/>
+              </w:rPr>
+              <w:tab/>
+            </w:r>
+            <w:r>
+              <w:rPr>
+                <w:noProof/>
+                <w:webHidden/>
+              </w:rPr>
+              <w:fldChar w:fldCharType="begin"/>
+            </w:r>
+            <w:r>
+              <w:rPr>
+                <w:noProof/>
+                <w:webHidden/>
+              </w:rPr>
+              <w:instrText xml:space="preserve"> PAGEREF _Toc224213961 \h </w:instrText>
+            </w:r>
+            <w:r>
+              <w:rPr>
+                <w:noProof/>
+                <w:webHidden/>
+              </w:rPr>
+            </w:r>
+            <w:r>
+              <w:rPr>
+                <w:noProof/>
+                <w:webHidden/>
+              </w:rPr>
+              <w:fldChar w:fldCharType="separate"/>
+            </w:r>
+            <w:r>
+              <w:rPr>
+                <w:noProof/>
+                <w:webHidden/>
+              </w:rPr>
+              <w:t>29</w:t>
             </w:r>
             <w:r>
               <w:rPr>
@@ -4196,7 +4772,7 @@
               <w:lang w:eastAsia="en-GB"/>
             </w:rPr>
           </w:pPr>
-          <w:hyperlink w:anchor="_Toc224125473" w:history="1">
+          <w:hyperlink w:anchor="_Toc224213962" w:history="1">
             <w:r>
               <w:rPr>
                 <w:rStyle w:val="Hyperlink"/>
@@ -4223,7 +4799,7 @@
                 <w:noProof/>
                 <w:webHidden/>
               </w:rPr>
-              <w:instrText xml:space="preserve"> PAGEREF _Toc224125473 \h </w:instrText>
+              <w:instrText xml:space="preserve"> PAGEREF _Toc224213962 \h </w:instrText>
             </w:r>
             <w:r>
               <w:rPr>
@@ -4243,7 +4819,7 @@
                 <w:noProof/>
                 <w:webHidden/>
               </w:rPr>
-              <w:t>27</w:t>
+              <w:t>30</w:t>
             </w:r>
             <w:r>
               <w:rPr>
@@ -4268,7 +4844,7 @@
               <w:lang w:eastAsia="en-GB"/>
             </w:rPr>
           </w:pPr>
-          <w:hyperlink w:anchor="_Toc224125474" w:history="1">
+          <w:hyperlink w:anchor="_Toc224213963" w:history="1">
             <w:r>
               <w:rPr>
                 <w:rStyle w:val="Hyperlink"/>
@@ -4295,7 +4871,7 @@
                 <w:noProof/>
                 <w:webHidden/>
               </w:rPr>
-              <w:instrText xml:space="preserve"> PAGEREF _Toc224125474 \h </w:instrText>
+              <w:instrText xml:space="preserve"> PAGEREF _Toc224213963 \h </w:instrText>
             </w:r>
             <w:r>
               <w:rPr>
@@ -4315,7 +4891,7 @@
                 <w:noProof/>
                 <w:webHidden/>
               </w:rPr>
-              <w:t>29</w:t>
+              <w:t>32</w:t>
             </w:r>
             <w:r>
               <w:rPr>
@@ -4340,7 +4916,7 @@
               <w:lang w:eastAsia="en-GB"/>
             </w:rPr>
           </w:pPr>
-          <w:hyperlink w:anchor="_Toc224125475" w:history="1">
+          <w:hyperlink w:anchor="_Toc224213964" w:history="1">
             <w:r>
               <w:rPr>
                 <w:rStyle w:val="Hyperlink"/>
@@ -4367,7 +4943,7 @@
                 <w:noProof/>
                 <w:webHidden/>
               </w:rPr>
-              <w:instrText xml:space="preserve"> PAGEREF _Toc224125475 \h </w:instrText>
+              <w:instrText xml:space="preserve"> PAGEREF _Toc224213964 \h </w:instrText>
             </w:r>
             <w:r>
               <w:rPr>
@@ -4387,7 +4963,7 @@
                 <w:noProof/>
                 <w:webHidden/>
               </w:rPr>
-              <w:t>29</w:t>
+              <w:t>32</w:t>
             </w:r>
             <w:r>
               <w:rPr>
@@ -4412,7 +4988,7 @@
               <w:lang w:eastAsia="en-GB"/>
             </w:rPr>
           </w:pPr>
-          <w:hyperlink w:anchor="_Toc224125476" w:history="1">
+          <w:hyp